<commit_message>
Episode 1 prompts: strict rule that only the narrator speaks, no vocal sound effects
Co-Authored-By: Claude Sonnet 5.5 <noreply@anthropic.com>
Claude-Session: https://claude.ai/code/session_01S29WeDgsXUpbHNWdisiPFj
</commit_message>
<xml_diff>
--- a/The_Last_Day_of_Ancient_Egypt_Ep1_FLOW_PROMPTS_READY.docx
+++ b/The_Last_Day_of_Ancient_Egypt_Ep1_FLOW_PROMPTS_READY.docx
@@ -62,7 +62,7 @@
           <w:sz w:val="21"/>
           <w:szCs w:val="21"/>
         </w:rPr>
-        <w:t xml:space="preserve">In Flow: Veo 3.1 Quality (the full model, not Fast), 16:9, audio on.</w:t>
+        <w:t xml:space="preserve">GOLDEN RULE: only the narrator speaks. No character ever speaks or makes a voice sound; characters act with their faces and body gestures only. This rule is written at the start and the end of every prompt.</w:t>
       </w:r>
     </w:p>
     <w:p>
@@ -80,7 +80,7 @@
           <w:sz w:val="21"/>
           <w:szCs w:val="21"/>
         </w:rPr>
-        <w:t xml:space="preserve">For each shot: attach the listed image files, set the duration shown, then paste the whole prompt exactly as written.</w:t>
+        <w:t xml:space="preserve">In Flow: Veo 3.1 Quality (the full model, not Fast), 16:9, audio on.</w:t>
       </w:r>
     </w:p>
     <w:p>
@@ -98,7 +98,7 @@
           <w:sz w:val="21"/>
           <w:szCs w:val="21"/>
         </w:rPr>
-        <w:t xml:space="preserve">Do not edit the prompt. Everything is inside it.</w:t>
+        <w:t xml:space="preserve">For each shot: attach the listed image files, set the duration shown, then paste the whole prompt exactly as written.</w:t>
       </w:r>
     </w:p>
     <w:p>
@@ -116,7 +116,7 @@
           <w:sz w:val="21"/>
           <w:szCs w:val="21"/>
         </w:rPr>
-        <w:t xml:space="preserve">Shot 1 is already generated. Do not regenerate it.</w:t>
+        <w:t xml:space="preserve">Do not edit the prompt. Everything is inside it.</w:t>
       </w:r>
     </w:p>
     <w:p>
@@ -134,7 +134,7 @@
           <w:sz w:val="21"/>
           <w:szCs w:val="21"/>
         </w:rPr>
-        <w:t xml:space="preserve">Test shots 2, 3 and 4 first and play them back to back with shot 1. If the narrator voice or the music changes noticeably, regenerate that clip before making more.</w:t>
+        <w:t xml:space="preserve">Shot 1 is already generated. Do not regenerate it.</w:t>
       </w:r>
     </w:p>
     <w:p>
@@ -152,7 +152,7 @@
           <w:sz w:val="21"/>
           <w:szCs w:val="21"/>
         </w:rPr>
-        <w:t xml:space="preserve">In the final edit, play shot 44 right after shot 25 (the Octavian fact comes before the dancing).</w:t>
+        <w:t xml:space="preserve">Test shots 2, 3 and 4 first and play them back to back with shot 1. If the narrator voice or the music changes noticeably, regenerate that clip before making more.</w:t>
       </w:r>
     </w:p>
     <w:p>
@@ -170,6 +170,24 @@
           <w:sz w:val="21"/>
           <w:szCs w:val="21"/>
         </w:rPr>
+        <w:t xml:space="preserve">In the final edit, play shot 44 right after shot 25 (the Octavian fact comes before the dancing).</w:t>
+      </w:r>
+    </w:p>
+    <w:p>
+      <w:pPr>
+        <w:pStyle w:val="ListParagraph"/>
+        <w:numPr>
+          <w:ilvl w:val="0"/>
+          <w:numId w:val="2"/>
+        </w:numPr>
+        <w:spacing w:after="60"/>
+      </w:pPr>
+      <w:r>
+        <w:rPr>
+          <w:rFonts w:ascii="Arial" w:cs="Arial" w:eastAsia="Arial" w:hAnsi="Arial"/>
+          <w:sz w:val="21"/>
+          <w:szCs w:val="21"/>
+        </w:rPr>
         <w:t xml:space="preserve">If a clip moves the camera, changes a face or costume, or prints any text, regenerate it.</w:t>
       </w:r>
     </w:p>
@@ -512,7 +530,7 @@
           <w:sz w:val="20"/>
           <w:szCs w:val="20"/>
         </w:rPr>
-        <w:t xml:space="preserve">Attached reference images, in order: the wedding courtyard, the Egyptian wedding guests. 2D hand-drawn stickman cartoon in the exact style of the reference images: thin black outlines, large expressive heads, thin stick arms, flat warm colors, playful documentary-comedy tone, 16:9. Setting: sunny daytime wedding courtyard in ancient Alexandria, sandstone columns with painted blue-and-gold bands, long tables with white cloths and clay jars, orange cloth awnings, and a tall wooden entrance gate at the back-center that opens onto the street. Dancers fill the floor, fully visible from feet to heads, clapping and spinning. At about 2 seconds every dancer pauses for half a beat. One guest turns his head toward the open gate at the back; the others resume dancing a moment later. Camera: locked-off and perfectly still, eye-level medium-wide shot, the dancers fully visible from feet to heads (NOT a feet close-up); the framing never changes (no tilt, pan, zoom or rising camera). Audio: off-screen British male narrator, warm and dry, begins speaking within half a second and says: “Then, for half a beat, the dancing stopped. Nobody noticed. Except one guest.” Music: light ancient-Mediterranean wedding music (frame drums, reed flute, plucked strings) with a faint uneasy undertone, same theme in every clip, low under the voice. Sound effects: dancing feet on stone, one tiny pause, faint distant thump. Characters keep their exact reference designs. Nobody on screen speaks. No text, captions or logos in the frame.</w:t>
+        <w:t xml:space="preserve">ABSOLUTE RULE: only the off-screen narrator has a voice. No character on screen speaks, talks, shouts, whispers, sings or lip-syncs, and no character voices or crowd voices are heard. Characters act only with facial expressions, eye movements and body and hand gestures; their mouths may move silently for a smile, laugh or gasp, with no sound. Attached reference images, in order: the wedding courtyard, the Egyptian wedding guests. 2D hand-drawn stickman cartoon in the exact style of the reference images: thin black outlines, large expressive heads, thin stick arms, flat warm colors, playful documentary-comedy tone, 16:9. Setting: sunny daytime wedding courtyard in ancient Alexandria, sandstone columns with painted blue-and-gold bands, long tables with white cloths and clay jars, orange cloth awnings, and a tall wooden entrance gate at the back-center that opens onto the street. Dancers fill the floor, fully visible from feet to heads, clapping and spinning. At about 2 seconds every dancer pauses for half a beat. One guest turns his head toward the open gate at the back; the others resume dancing a moment later. Camera: locked-off and perfectly still, eye-level medium-wide shot, the dancers fully visible from feet to heads (NOT a feet close-up); the framing never changes (no tilt, pan, zoom or rising camera). Audio: off-screen British male narrator, warm and dry, begins speaking within half a second and says: “Then, for half a beat, the dancing stopped. Nobody noticed. Except one guest.” Music: light ancient-Mediterranean wedding music (frame drums, reed flute, plucked strings) with a faint uneasy undertone, same theme in every clip, low under the voice. Sound effects: dancing feet on stone, one tiny pause, faint distant thump. Characters keep their exact reference designs. Final reminder: no character speaks or makes any voice sound; only the off-screen narrator speaks. No text, captions or logos in the frame.</w:t>
       </w:r>
     </w:p>
     <w:p>
@@ -585,7 +603,7 @@
           <w:sz w:val="20"/>
           <w:szCs w:val="20"/>
         </w:rPr>
-        <w:t xml:space="preserve">Attached reference images, in order: the Alexandria harbor. 2D hand-drawn cartoon in the exact style of the reference image: flat warm colors, soft cel shading, playful documentary-comedy tone, 16:9. Setting: ancient Alexandria harbor in bright daylight. Wide establishing view of the harbor and city: sailboats gliding on blue water, gulls crossing the sky, the great lighthouse and white monumental buildings behind, palms at the edge of the frame. Only tiny distant figures on the quays. Camera: wide establishing shot, horizon level; fixed except for an almost imperceptible 5% slow push-in, no tilt or pan. Audio: off-screen British male narrator, warm and dry, begins speaking within half a second and says: “Alexandria, 30 BC. A huge, busy city, about to have a strange evening.” Music: light ancient-Mediterranean wedding music (frame drums, reed flute, plucked strings), same theme in every clip, low under the voice. Sound effects: gulls, harbor water, distant market noise. No text, captions or logos in the frame.</w:t>
+        <w:t xml:space="preserve">ABSOLUTE RULE: only the off-screen narrator has a voice. No character on screen speaks, talks, shouts, whispers, sings or lip-syncs, and no character voices or crowd voices are heard. Characters act only with facial expressions, eye movements and body and hand gestures; their mouths may move silently for a smile, laugh or gasp, with no sound. Attached reference images, in order: the Alexandria harbor. 2D hand-drawn cartoon in the exact style of the reference image: flat warm colors, soft cel shading, playful documentary-comedy tone, 16:9. Setting: ancient Alexandria harbor in bright daylight. Wide establishing view of the harbor and city: sailboats gliding on blue water, gulls crossing the sky, the great lighthouse and white monumental buildings behind, palms at the edge of the frame. Only tiny distant figures on the quays. Camera: wide establishing shot, horizon level; fixed except for an almost imperceptible 5% slow push-in, no tilt or pan. Audio: off-screen British male narrator, warm and dry, begins speaking within half a second and says: “Alexandria, 30 BC. A huge, busy city, about to have a strange evening.” Music: light ancient-Mediterranean wedding music (frame drums, reed flute, plucked strings), same theme in every clip, low under the voice. Sound effects: gulls, harbor water, distant market clatter with no voices. Final reminder: no character speaks or makes any voice sound; only the off-screen narrator speaks. No text, captions or logos in the frame.</w:t>
       </w:r>
     </w:p>
     <w:p>
@@ -658,7 +676,7 @@
           <w:sz w:val="20"/>
           <w:szCs w:val="20"/>
         </w:rPr>
-        <w:t xml:space="preserve">Attached reference images, in order: the wedding courtyard. 2D hand-drawn stickman cartoon in the exact style of the reference images: thin black outlines, large expressive heads, thin stick arms, flat warm colors, playful documentary-comedy tone, 16:9. Setting: sunny daytime wedding courtyard in ancient Alexandria, sandstone columns with painted blue-and-gold bands, long tables with white cloths and clay jars, orange cloth awnings, and a tall wooden entrance gate at the back-center that opens onto the street. The wedding goes on as if nothing is wrong: guests dance and clap, Senbi and the bride among them. Keep the upper third of the frame calm and uncluttered. Camera: locked-off and perfectly still, eye-level medium-wide shot of the wedding courtyard; the framing never changes (no tilt, pan, zoom or rising camera). Audio: off-screen British male narrator, warm and dry, begins speaking within half a second and says: ““Last day of Ancient Egypt”? Relax. Egypt survived. Its queen, less so.” Music: light ancient-Mediterranean wedding music (frame drums, reed flute, plucked strings), same theme in every clip, low under the voice. Sound effects: wedding crowd chatter, one short comic sting. Characters keep their exact reference designs. Nobody on screen speaks. No text, captions or logos in the frame.</w:t>
+        <w:t xml:space="preserve">ABSOLUTE RULE: only the off-screen narrator has a voice. No character on screen speaks, talks, shouts, whispers, sings or lip-syncs, and no character voices or crowd voices are heard. Characters act only with facial expressions, eye movements and body and hand gestures; their mouths may move silently for a smile, laugh or gasp, with no sound. Attached reference images, in order: the wedding courtyard. 2D hand-drawn stickman cartoon in the exact style of the reference images: thin black outlines, large expressive heads, thin stick arms, flat warm colors, playful documentary-comedy tone, 16:9. Setting: sunny daytime wedding courtyard in ancient Alexandria, sandstone columns with painted blue-and-gold bands, long tables with white cloths and clay jars, orange cloth awnings, and a tall wooden entrance gate at the back-center that opens onto the street. The wedding goes on as if nothing is wrong: guests dance and clap, Senbi and the bride among them. Keep the upper third of the frame calm and uncluttered. Camera: locked-off and perfectly still, eye-level medium-wide shot of the wedding courtyard; the framing never changes (no tilt, pan, zoom or rising camera). Audio: off-screen British male narrator, warm and dry, begins speaking within half a second and says: ““Last day of Ancient Egypt”? Relax. Egypt survived. Its queen, less so.” Music: light ancient-Mediterranean wedding music (frame drums, reed flute, plucked strings), same theme in every clip, low under the voice. Sound effects: wedding ambient room tone with no voices, one short comic sting. Characters keep their exact reference designs. Final reminder: no character speaks or makes any voice sound; only the off-screen narrator speaks. No text, captions or logos in the frame.</w:t>
       </w:r>
     </w:p>
     <w:p>
@@ -731,7 +749,7 @@
           <w:sz w:val="20"/>
           <w:szCs w:val="20"/>
         </w:rPr>
-        <w:t xml:space="preserve">Attached reference images, in order: Senbi, the groom, the wedding courtyard. 2D hand-drawn stickman cartoon in the exact style of the reference images: thin black outlines, large expressive heads, thin stick arms, flat warm colors, playful documentary-comedy tone, 16:9. Setting: a shaded sandstone alcove beside the wedding courtyard, painted columns, warm daylight. Senbi stands before a bronze mirror. He straightens his blue-and-gold collar, checks his sash, practices a proud smile, then wipes his forehead with the back of his hand. Camera: eye-level medium shot of Senbi at the mirror; fixed except for an almost imperceptible 5% slow push-in, no tilt or pan. Audio: off-screen British male narrator, warm and dry, begins speaking within half a second and says: “Meet Senbi. He's getting married today, and has checked the mirror forty times.” Music: light ancient-Mediterranean wedding music (frame drums, reed flute, plucked strings), same theme in every clip, low under the voice. Sound effects: small fabric rustle, soft room tone. Characters keep their exact reference designs. Nobody on screen speaks. No text, captions or logos in the frame.</w:t>
+        <w:t xml:space="preserve">ABSOLUTE RULE: only the off-screen narrator has a voice. No character on screen speaks, talks, shouts, whispers, sings or lip-syncs, and no character voices or crowd voices are heard. Characters act only with facial expressions, eye movements and body and hand gestures; their mouths may move silently for a smile, laugh or gasp, with no sound. Attached reference images, in order: Senbi, the groom, the wedding courtyard. 2D hand-drawn stickman cartoon in the exact style of the reference images: thin black outlines, large expressive heads, thin stick arms, flat warm colors, playful documentary-comedy tone, 16:9. Setting: a shaded sandstone alcove beside the wedding courtyard, painted columns, warm daylight. Senbi stands before a bronze mirror. He straightens his blue-and-gold collar, checks his sash, practices a proud smile, then wipes his forehead with the back of his hand. Camera: eye-level medium shot of Senbi at the mirror; fixed except for an almost imperceptible 5% slow push-in, no tilt or pan. Audio: off-screen British male narrator, warm and dry, begins speaking within half a second and says: “Meet Senbi. He's getting married today, and has checked the mirror forty times.” Music: light ancient-Mediterranean wedding music (frame drums, reed flute, plucked strings), same theme in every clip, low under the voice. Sound effects: small fabric rustle, soft room tone. Characters keep their exact reference designs. Final reminder: no character speaks or makes any voice sound; only the off-screen narrator speaks. No text, captions or logos in the frame.</w:t>
       </w:r>
     </w:p>
     <w:p>
@@ -804,7 +822,7 @@
           <w:sz w:val="20"/>
           <w:szCs w:val="20"/>
         </w:rPr>
-        <w:t xml:space="preserve">Attached reference images, in order: Senbi, the groom. 2D hand-drawn stickman cartoon in the exact style of the reference images: thin black outlines, large expressive heads, thin stick arms, flat warm colors, playful documentary-comedy tone, 16:9. Setting: a shaded sandstone alcove beside the wedding courtyard, painted columns, warm daylight. Senbi, full body. First he inspects a small bronze razor and runs a hand over his chin. Then he straightens his headband. Finally he adjusts his collar and strikes an overconfident hands-on-hips pose. Camera: locked-off and perfectly still, eye-level full-body medium shot of Senbi; all three actions happen inside the same frame; the framing never changes (no tilt, pan, zoom or rising camera). Audio: off-screen British male narrator, warm and dry, begins speaking within half a second and says: “Every groom has one job: look incredible, and pretend it took no effort.” Music: playful comic percussion over the wedding rhythm, low under the voice. Sound effects: light razor scrape, one comic boing. Characters keep their exact reference designs. Nobody on screen speaks. No text, captions or logos in the frame.</w:t>
+        <w:t xml:space="preserve">ABSOLUTE RULE: only the off-screen narrator has a voice. No character on screen speaks, talks, shouts, whispers, sings or lip-syncs, and no character voices or crowd voices are heard. Characters act only with facial expressions, eye movements and body and hand gestures; their mouths may move silently for a smile, laugh or gasp, with no sound. Attached reference images, in order: Senbi, the groom. 2D hand-drawn stickman cartoon in the exact style of the reference images: thin black outlines, large expressive heads, thin stick arms, flat warm colors, playful documentary-comedy tone, 16:9. Setting: a shaded sandstone alcove beside the wedding courtyard, painted columns, warm daylight. Senbi, full body. First he inspects a small bronze razor and runs a hand over his chin. Then he straightens his headband. Finally he adjusts his collar and strikes an overconfident hands-on-hips pose. Camera: locked-off and perfectly still, eye-level full-body medium shot of Senbi; all three actions happen inside the same frame; the framing never changes (no tilt, pan, zoom or rising camera). Audio: off-screen British male narrator, warm and dry, begins speaking within half a second and says: “Every groom has one job: look incredible, and pretend it took no effort.” Music: playful comic percussion over the wedding rhythm, low under the voice. Sound effects: light razor scrape, one comic boing. Characters keep their exact reference designs. Final reminder: no character speaks or makes any voice sound; only the off-screen narrator speaks. No text, captions or logos in the frame.</w:t>
       </w:r>
     </w:p>
     <w:p>
@@ -877,7 +895,7 @@
           <w:sz w:val="20"/>
           <w:szCs w:val="20"/>
         </w:rPr>
-        <w:t xml:space="preserve">Attached reference images, in order: the bride, the wedding courtyard. 2D hand-drawn stickman cartoon in the exact style of the reference images: thin black outlines, large expressive heads, thin stick arms, flat warm colors, playful documentary-comedy tone, 16:9. Setting: a shaded sandstone alcove beside the wedding courtyard, painted columns, warm daylight. The bride stands at a bronze mirror. She adjusts her gold headband, touches her dark eye makeup, then gives herself a calm, confident nod. Camera: eye-level medium shot of the bride at the mirror; fixed except for an almost imperceptible 5% slow push-in, no tilt or pan. Audio: off-screen British male narrator, warm and dry, begins speaking within half a second and says: “His bride had been ready for an hour. She was the calm one.” Music: light ancient-Mediterranean wedding music (frame drums, reed flute, plucked strings), same theme in every clip, low under the voice. Sound effects: soft jewelry jingle. Characters keep their exact reference designs. Nobody on screen speaks. No text, captions or logos in the frame.</w:t>
+        <w:t xml:space="preserve">ABSOLUTE RULE: only the off-screen narrator has a voice. No character on screen speaks, talks, shouts, whispers, sings or lip-syncs, and no character voices or crowd voices are heard. Characters act only with facial expressions, eye movements and body and hand gestures; their mouths may move silently for a smile, laugh or gasp, with no sound. Attached reference images, in order: the bride, the wedding courtyard. 2D hand-drawn stickman cartoon in the exact style of the reference images: thin black outlines, large expressive heads, thin stick arms, flat warm colors, playful documentary-comedy tone, 16:9. Setting: a shaded sandstone alcove beside the wedding courtyard, painted columns, warm daylight. The bride stands at a bronze mirror. She adjusts her gold headband, touches her dark eye makeup, then gives herself a calm, confident nod. Camera: eye-level medium shot of the bride at the mirror; fixed except for an almost imperceptible 5% slow push-in, no tilt or pan. Audio: off-screen British male narrator, warm and dry, begins speaking within half a second and says: “His bride had been ready for an hour. She was the calm one.” Music: light ancient-Mediterranean wedding music (frame drums, reed flute, plucked strings), same theme in every clip, low under the voice. Sound effects: soft jewelry jingle. Characters keep their exact reference designs. Final reminder: no character speaks or makes any voice sound; only the off-screen narrator speaks. No text, captions or logos in the frame.</w:t>
       </w:r>
     </w:p>
     <w:p>
@@ -950,7 +968,7 @@
           <w:sz w:val="20"/>
           <w:szCs w:val="20"/>
         </w:rPr>
-        <w:t xml:space="preserve">Attached reference images, in order: the bride, the bride's relatives, the wedding courtyard. 2D hand-drawn stickman cartoon in the exact style of the reference images: thin black outlines, large expressive heads, thin stick arms, flat warm colors, playful documentary-comedy tone, 16:9. Setting: a shaded sandstone alcove beside the wedding courtyard, painted columns, warm daylight. A scribe unrolls a papyrus on a low table. The bride points at one line while her father nods gravely. She then gives a small, satisfied smile. The papyrus shows only abstract hieroglyph-like marks. Camera: locked-off and perfectly still, eye-level medium two-shot: the scribe, the papyrus and the bride all in the same frame; the framing never changes (no tilt, pan, zoom or rising camera). Audio: off-screen British male narrator, warm and dry, begins speaking within half a second and says: “Then, paperwork. Real contracts survive: property, money, who owes what. Romance, with receipts.” Music: light ancient-Mediterranean wedding music (frame drums, reed flute, plucked strings), same theme in every clip, low under the voice. Sound effects: papyrus rustle, quill scratching. Characters keep their exact reference designs. Nobody on screen speaks. No text, captions or logos in the frame.</w:t>
+        <w:t xml:space="preserve">ABSOLUTE RULE: only the off-screen narrator has a voice. No character on screen speaks, talks, shouts, whispers, sings or lip-syncs, and no character voices or crowd voices are heard. Characters act only with facial expressions, eye movements and body and hand gestures; their mouths may move silently for a smile, laugh or gasp, with no sound. Attached reference images, in order: the bride, the bride's relatives, the wedding courtyard. 2D hand-drawn stickman cartoon in the exact style of the reference images: thin black outlines, large expressive heads, thin stick arms, flat warm colors, playful documentary-comedy tone, 16:9. Setting: a shaded sandstone alcove beside the wedding courtyard, painted columns, warm daylight. A scribe unrolls a papyrus on a low table. The bride points at one line while her father nods gravely. She then gives a small, satisfied smile. The papyrus shows only abstract hieroglyph-like marks. Camera: locked-off and perfectly still, eye-level medium two-shot: the scribe, the papyrus and the bride all in the same frame; the framing never changes (no tilt, pan, zoom or rising camera). Audio: off-screen British male narrator, warm and dry, begins speaking within half a second and says: “Then, paperwork. Real contracts survive: property, money, who owes what. Romance, with receipts.” Music: light ancient-Mediterranean wedding music (frame drums, reed flute, plucked strings), same theme in every clip, low under the voice. Sound effects: papyrus rustle, quill scratching. Characters keep their exact reference designs. Final reminder: no character speaks or makes any voice sound; only the off-screen narrator speaks. No text, captions or logos in the frame.</w:t>
       </w:r>
     </w:p>
     <w:p>
@@ -1023,7 +1041,7 @@
           <w:sz w:val="20"/>
           <w:szCs w:val="20"/>
         </w:rPr>
-        <w:t xml:space="preserve">Attached reference images, in order: the Egyptian wedding guests, the wedding courtyard. 2D hand-drawn stickman cartoon in the exact style of the reference images: thin black outlines, large expressive heads, thin stick arms, flat warm colors, playful documentary-comedy tone, 16:9. Setting: sunny daytime wedding courtyard in ancient Alexandria, sandstone columns with painted blue-and-gold bands, long tables with white cloths and clay jars, orange cloth awnings, and a tall wooden entrance gate at the back-center that opens onto the street. A long feast table in full daylight, loaded with flatbread, roast goose, figs, dates and clay beer jugs, guests eating. At the far end one guest tiptoes up, hides a fig behind his back, and is spotted by an unimpressed aunt. Camera: locked-off and perfectly still, eye-level wide-medium shot of the whole feast table; the sneaky guest stays in frame; the framing never changes (no tilt, pan, zoom or rising camera). Audio: off-screen British male narrator, warm and dry, begins speaking within half a second and says: “Bread, figs, roast goose, and beer, basically a food group. Someone was stealing.” Music: light ancient-Mediterranean wedding music (frame drums, reed flute, plucked strings), same theme in every clip, low under the voice. Sound effects: plates, cups, cheerful chatter. Characters keep their exact reference designs. Nobody on screen speaks. No text, captions or logos in the frame.</w:t>
+        <w:t xml:space="preserve">ABSOLUTE RULE: only the off-screen narrator has a voice. No character on screen speaks, talks, shouts, whispers, sings or lip-syncs, and no character voices or crowd voices are heard. Characters act only with facial expressions, eye movements and body and hand gestures; their mouths may move silently for a smile, laugh or gasp, with no sound. Attached reference images, in order: the Egyptian wedding guests, the wedding courtyard. 2D hand-drawn stickman cartoon in the exact style of the reference images: thin black outlines, large expressive heads, thin stick arms, flat warm colors, playful documentary-comedy tone, 16:9. Setting: sunny daytime wedding courtyard in ancient Alexandria, sandstone columns with painted blue-and-gold bands, long tables with white cloths and clay jars, orange cloth awnings, and a tall wooden entrance gate at the back-center that opens onto the street. A long feast table in full daylight, loaded with flatbread, roast goose, figs, dates and clay beer jugs, guests eating. At the far end one guest tiptoes up, hides a fig behind his back, and is spotted by an unimpressed aunt. Camera: locked-off and perfectly still, eye-level wide-medium shot of the whole feast table; the sneaky guest stays in frame; the framing never changes (no tilt, pan, zoom or rising camera). Audio: off-screen British male narrator, warm and dry, begins speaking within half a second and says: “Bread, figs, roast goose, and beer, basically a food group. Someone was stealing.” Music: light ancient-Mediterranean wedding music (frame drums, reed flute, plucked strings), same theme in every clip, low under the voice. Sound effects: plates, cups, cheerful ambience with no voices. Characters keep their exact reference designs. Final reminder: no character speaks or makes any voice sound; only the off-screen narrator speaks. No text, captions or logos in the frame.</w:t>
       </w:r>
     </w:p>
     <w:p>
@@ -1096,7 +1114,7 @@
           <w:sz w:val="20"/>
           <w:szCs w:val="20"/>
         </w:rPr>
-        <w:t xml:space="preserve">Attached reference images, in order: the black cat, the wedding courtyard. 2D hand-drawn stickman cartoon in the exact style of the reference images: thin black outlines, large expressive heads, thin stick arms, flat warm colors, playful documentary-comedy tone, 16:9. Setting: sunny daytime wedding courtyard in ancient Alexandria, sandstone columns with painted blue-and-gold bands, long tables with white cloths and clay jars, orange cloth awnings, and a tall wooden entrance gate at the back-center that opens onto the street. A black cat with a small gold collar sits upright on a cushion at the head of the feast table. A guest bows deeply in front of it. The cat looks away and licks its paw. Camera: locked-off and perfectly still, eye-level medium shot with the cat and the bowing guest both in frame; the framing never changes (no tilt, pan, zoom or rising camera). Audio: off-screen British male narrator, warm and dry, begins speaking within half a second and says: “Egyptians adored cats. This one knew it. A guest bowed. The cat shrugged.” Music: playful comic percussion over the wedding rhythm, low under the voice. Sound effects: tiny comic sting, soft cat purr. Characters keep their exact reference designs. Nobody on screen speaks. No text, captions or logos in the frame.</w:t>
+        <w:t xml:space="preserve">ABSOLUTE RULE: only the off-screen narrator has a voice. No character on screen speaks, talks, shouts, whispers, sings or lip-syncs, and no character voices or crowd voices are heard. Characters act only with facial expressions, eye movements and body and hand gestures; their mouths may move silently for a smile, laugh or gasp, with no sound. Attached reference images, in order: the black cat, the wedding courtyard. 2D hand-drawn stickman cartoon in the exact style of the reference images: thin black outlines, large expressive heads, thin stick arms, flat warm colors, playful documentary-comedy tone, 16:9. Setting: sunny daytime wedding courtyard in ancient Alexandria, sandstone columns with painted blue-and-gold bands, long tables with white cloths and clay jars, orange cloth awnings, and a tall wooden entrance gate at the back-center that opens onto the street. A black cat with a small gold collar sits upright on a cushion at the head of the feast table. A guest bows deeply in front of it. The cat looks away and licks its paw. Camera: locked-off and perfectly still, eye-level medium shot with the cat and the bowing guest both in frame; the framing never changes (no tilt, pan, zoom or rising camera). Audio: off-screen British male narrator, warm and dry, begins speaking within half a second and says: “Egyptians adored cats. This one knew it. A guest bowed. The cat shrugged.” Music: playful comic percussion over the wedding rhythm, low under the voice. Sound effects: tiny comic sting, soft cat purr. Characters keep their exact reference designs. Final reminder: no character speaks or makes any voice sound; only the off-screen narrator speaks. No text, captions or logos in the frame.</w:t>
       </w:r>
     </w:p>
     <w:p>
@@ -1169,7 +1187,7 @@
           <w:sz w:val="20"/>
           <w:szCs w:val="20"/>
         </w:rPr>
-        <w:t xml:space="preserve">Attached reference images, in order: the Egyptian wedding guests, the wedding courtyard. 2D hand-drawn stickman cartoon in the exact style of the reference images: thin black outlines, large expressive heads, thin stick arms, flat warm colors, playful documentary-comedy tone, 16:9. Setting: sunny daytime wedding courtyard in ancient Alexandria, sandstone columns with painted blue-and-gold bands, long tables with white cloths and clay jars, orange cloth awnings, and a tall wooden entrance gate at the back-center that opens onto the street. Musicians seated at the side tables play harp, frame drum and reed flute while guests dance in the center. Senbi steps into the dance area with a confident grin. Camera: locked-off and perfectly still, eye-level wide shot of the musicians and dancers; the framing never changes (no tilt, pan, zoom or rising camera). Audio: off-screen British male narrator, warm and dry, begins speaking within half a second and says: “Then the music began, and Senbi decided this was his moment.” Music: light ancient-Mediterranean wedding music (frame drums, reed flute, plucked strings), same theme in every clip, low under the voice. Sound effects: harp and drums swelling, clapping. Characters keep their exact reference designs. Nobody on screen speaks. No text, captions or logos in the frame.</w:t>
+        <w:t xml:space="preserve">ABSOLUTE RULE: only the off-screen narrator has a voice. No character on screen speaks, talks, shouts, whispers, sings or lip-syncs, and no character voices or crowd voices are heard. Characters act only with facial expressions, eye movements and body and hand gestures; their mouths may move silently for a smile, laugh or gasp, with no sound. Attached reference images, in order: the Egyptian wedding guests, the wedding courtyard. 2D hand-drawn stickman cartoon in the exact style of the reference images: thin black outlines, large expressive heads, thin stick arms, flat warm colors, playful documentary-comedy tone, 16:9. Setting: sunny daytime wedding courtyard in ancient Alexandria, sandstone columns with painted blue-and-gold bands, long tables with white cloths and clay jars, orange cloth awnings, and a tall wooden entrance gate at the back-center that opens onto the street. Musicians seated at the side tables play harp, frame drum and reed flute while guests dance in the center. Senbi steps into the dance area with a confident grin. Camera: locked-off and perfectly still, eye-level wide shot of the musicians and dancers; the framing never changes (no tilt, pan, zoom or rising camera). Audio: off-screen British male narrator, warm and dry, begins speaking within half a second and says: “Then the music began, and Senbi decided this was his moment.” Music: light ancient-Mediterranean wedding music (frame drums, reed flute, plucked strings), same theme in every clip, low under the voice. Sound effects: harp and drums swelling, clapping. Characters keep their exact reference designs. Final reminder: no character speaks or makes any voice sound; only the off-screen narrator speaks. No text, captions or logos in the frame.</w:t>
       </w:r>
     </w:p>
     <w:p>
@@ -1242,7 +1260,7 @@
           <w:sz w:val="20"/>
           <w:szCs w:val="20"/>
         </w:rPr>
-        <w:t xml:space="preserve">Attached reference images, in order: Senbi, the groom, the wedding courtyard. 2D hand-drawn stickman cartoon in the exact style of the reference images: thin black outlines, large expressive heads, thin stick arms, flat warm colors, playful documentary-comedy tone, 16:9. Setting: sunny daytime wedding courtyard in ancient Alexandria, sandstone columns with painted blue-and-gold bands, long tables with white cloths and clay jars, orange cloth awnings, and a tall wooden entrance gate at the back-center that opens onto the street. Senbi dances with huge confidence, loses his balance for a moment, recovers, and freezes in a proud pose as if the stumble was choreography. Camera: locked-off and perfectly still, eye-level medium shot of Senbi, full body in frame; the framing never changes (no tilt, pan, zoom or rising camera). Audio: off-screen British male narrator, warm and dry, begins speaking within half a second and says: “Senbi nearly fell, recovered, and pretended that was the choreography. Nobody believed him.” Music: playful comic percussion over the wedding rhythm, low under the voice. Sound effects: foot scuff, comic wobble, laughter. Characters keep their exact reference designs. Nobody on screen speaks. No text, captions or logos in the frame.</w:t>
+        <w:t xml:space="preserve">ABSOLUTE RULE: only the off-screen narrator has a voice. No character on screen speaks, talks, shouts, whispers, sings or lip-syncs, and no character voices or crowd voices are heard. Characters act only with facial expressions, eye movements and body and hand gestures; their mouths may move silently for a smile, laugh or gasp, with no sound. Attached reference images, in order: Senbi, the groom, the wedding courtyard. 2D hand-drawn stickman cartoon in the exact style of the reference images: thin black outlines, large expressive heads, thin stick arms, flat warm colors, playful documentary-comedy tone, 16:9. Setting: sunny daytime wedding courtyard in ancient Alexandria, sandstone columns with painted blue-and-gold bands, long tables with white cloths and clay jars, orange cloth awnings, and a tall wooden entrance gate at the back-center that opens onto the street. Senbi dances with huge confidence, loses his balance for a moment, recovers, and freezes in a proud pose as if the stumble was choreography. Camera: locked-off and perfectly still, eye-level medium shot of Senbi, full body in frame; the framing never changes (no tilt, pan, zoom or rising camera). Audio: off-screen British male narrator, warm and dry, begins speaking within half a second and says: “Senbi nearly fell, recovered, and pretended that was the choreography. Nobody believed him.” Music: playful comic percussion over the wedding rhythm, low under the voice. Sound effects: foot scuff, comic wobble, hand claps. Characters keep their exact reference designs. Final reminder: no character speaks or makes any voice sound; only the off-screen narrator speaks. No text, captions or logos in the frame.</w:t>
       </w:r>
     </w:p>
     <w:p>
@@ -1315,7 +1333,7 @@
           <w:sz w:val="20"/>
           <w:szCs w:val="20"/>
         </w:rPr>
-        <w:t xml:space="preserve">Attached reference images, in order: the bride, the wedding courtyard. 2D hand-drawn stickman cartoon in the exact style of the reference images: thin black outlines, large expressive heads, thin stick arms, flat warm colors, playful documentary-comedy tone, 16:9. Setting: sunny daytime wedding courtyard in ancient Alexandria, sandstone columns with painted blue-and-gold bands, long tables with white cloths and clay jars, orange cloth awnings, and a tall wooden entrance gate at the back-center that opens onto the street. The bride watches Senbi dance, amused. She tries to stay composed, then hides her smile behind her hand. Camera: locked-off and perfectly still, eye-level close-up of the bride's face; the framing never changes (no tilt, pan, zoom or rising camera). Audio: off-screen British male narrator, warm and dry, begins speaking within half a second and says: “His bride was trying very hard not to laugh. She loved him. Mostly.” Music: light ancient-Mediterranean wedding music (frame drums, reed flute, plucked strings), same theme in every clip, low under the voice. Sound effects: suppressed giggle. Characters keep their exact reference designs. Nobody on screen speaks. No text, captions or logos in the frame.</w:t>
+        <w:t xml:space="preserve">ABSOLUTE RULE: only the off-screen narrator has a voice. No character on screen speaks, talks, shouts, whispers, sings or lip-syncs, and no character voices or crowd voices are heard. Characters act only with facial expressions, eye movements and body and hand gestures; their mouths may move silently for a smile, laugh or gasp, with no sound. Attached reference images, in order: the bride, the wedding courtyard. 2D hand-drawn stickman cartoon in the exact style of the reference images: thin black outlines, large expressive heads, thin stick arms, flat warm colors, playful documentary-comedy tone, 16:9. Setting: sunny daytime wedding courtyard in ancient Alexandria, sandstone columns with painted blue-and-gold bands, long tables with white cloths and clay jars, orange cloth awnings, and a tall wooden entrance gate at the back-center that opens onto the street. The bride watches Senbi dance, amused. She tries to stay composed, then hides her smile behind her hand. Camera: locked-off and perfectly still, eye-level close-up of the bride's face; the framing never changes (no tilt, pan, zoom or rising camera). Audio: off-screen British male narrator, warm and dry, begins speaking within half a second and says: “His bride was trying very hard not to laugh. She loved him. Mostly.” Music: light ancient-Mediterranean wedding music (frame drums, reed flute, plucked strings), same theme in every clip, low under the voice. Sound effects: soft cloth rustle. Characters keep their exact reference designs. Final reminder: no character speaks or makes any voice sound; only the off-screen narrator speaks. No text, captions or logos in the frame.</w:t>
       </w:r>
     </w:p>
     <w:p>
@@ -1388,7 +1406,7 @@
           <w:sz w:val="20"/>
           <w:szCs w:val="20"/>
         </w:rPr>
-        <w:t xml:space="preserve">Attached reference images, in order: the Egyptian wedding guests, the wedding courtyard. 2D hand-drawn stickman cartoon in the exact style of the reference images: thin black outlines, large expressive heads, thin stick arms, flat warm colors, playful documentary-comedy tone, 16:9. Setting: sunny daytime wedding courtyard in ancient Alexandria, sandstone columns with painted blue-and-gold bands, long tables with white cloths and clay jars, orange cloth awnings, and a tall wooden entrance gate at the back-center that opens onto the street. Young and old guests clap, dance and raise clay cups in a joyful crowd. Camera: locked-off and perfectly still, eye-level wide-medium shot with several guests in frame; the framing never changes (no tilt, pan, zoom or rising camera). Audio: off-screen British male narrator, warm and dry, begins speaking within half a second and says: “Everyone danced and raised a cup, the one thing every wedding agrees on.” Music: light ancient-Mediterranean wedding music (frame drums, reed flute, plucked strings), same theme in every clip, low under the voice. Sound effects: clapping, cups clinking, laughter. Characters keep their exact reference designs. Nobody on screen speaks. No text, captions or logos in the frame.</w:t>
+        <w:t xml:space="preserve">ABSOLUTE RULE: only the off-screen narrator has a voice. No character on screen speaks, talks, shouts, whispers, sings or lip-syncs, and no character voices or crowd voices are heard. Characters act only with facial expressions, eye movements and body and hand gestures; their mouths may move silently for a smile, laugh or gasp, with no sound. Attached reference images, in order: the Egyptian wedding guests, the wedding courtyard. 2D hand-drawn stickman cartoon in the exact style of the reference images: thin black outlines, large expressive heads, thin stick arms, flat warm colors, playful documentary-comedy tone, 16:9. Setting: sunny daytime wedding courtyard in ancient Alexandria, sandstone columns with painted blue-and-gold bands, long tables with white cloths and clay jars, orange cloth awnings, and a tall wooden entrance gate at the back-center that opens onto the street. Young and old guests clap, dance and raise clay cups in a joyful crowd. Camera: locked-off and perfectly still, eye-level wide-medium shot with several guests in frame; the framing never changes (no tilt, pan, zoom or rising camera). Audio: off-screen British male narrator, warm and dry, begins speaking within half a second and says: “Everyone danced and raised a cup, the one thing every wedding agrees on.” Music: light ancient-Mediterranean wedding music (frame drums, reed flute, plucked strings), same theme in every clip, low under the voice. Sound effects: clapping, cups clinking. Characters keep their exact reference designs. Final reminder: no character speaks or makes any voice sound; only the off-screen narrator speaks. No text, captions or logos in the frame.</w:t>
       </w:r>
     </w:p>
     <w:p>
@@ -1461,7 +1479,7 @@
           <w:sz w:val="20"/>
           <w:szCs w:val="20"/>
         </w:rPr>
-        <w:t xml:space="preserve">Attached reference images, in order: the Egyptian wedding guests, the wedding courtyard. 2D hand-drawn stickman cartoon in the exact style of the reference images: thin black outlines, large expressive heads, thin stick arms, flat warm colors, playful documentary-comedy tone, 16:9. Setting: sunny daytime wedding courtyard in ancient Alexandria, sandstone columns with painted blue-and-gold bands, long tables with white cloths and clay jars, orange cloth awnings, and a tall wooden entrance gate at the back-center that opens onto the street. An older woman at the feast table inspects a dish with exaggerated seriousness, tastes it, narrows her eyes, then gives a reluctant nod. Camera: locked-off and perfectly still, eye-level close-up of the woman's face and the dish; the framing never changes (no tilt, pan, zoom or rising camera). Audio: off-screen British male narrator, warm and dry, begins speaking within half a second and says: “One aunt inspected the food like a tax auditor. Verdict: suspicious, but edible.” Music: playful comic percussion over the wedding rhythm, low under the voice. Sound effects: spoon tapping a bowl, suspicious hum. Characters keep their exact reference designs. Nobody on screen speaks. No text, captions or logos in the frame.</w:t>
+        <w:t xml:space="preserve">ABSOLUTE RULE: only the off-screen narrator has a voice. No character on screen speaks, talks, shouts, whispers, sings or lip-syncs, and no character voices or crowd voices are heard. Characters act only with facial expressions, eye movements and body and hand gestures; their mouths may move silently for a smile, laugh or gasp, with no sound. Attached reference images, in order: the Egyptian wedding guests, the wedding courtyard. 2D hand-drawn stickman cartoon in the exact style of the reference images: thin black outlines, large expressive heads, thin stick arms, flat warm colors, playful documentary-comedy tone, 16:9. Setting: sunny daytime wedding courtyard in ancient Alexandria, sandstone columns with painted blue-and-gold bands, long tables with white cloths and clay jars, orange cloth awnings, and a tall wooden entrance gate at the back-center that opens onto the street. An older woman at the feast table inspects a dish with exaggerated seriousness, tastes it, narrows her eyes, then gives a reluctant nod. Camera: locked-off and perfectly still, eye-level close-up of the woman's face and the dish; the framing never changes (no tilt, pan, zoom or rising camera). Audio: off-screen British male narrator, warm and dry, begins speaking within half a second and says: “One aunt inspected the food like a tax auditor. Verdict: suspicious, but edible.” Music: playful comic percussion over the wedding rhythm, low under the voice. Sound effects: spoon tapping a bowl, suspicious hum. Characters keep their exact reference designs. Final reminder: no character speaks or makes any voice sound; only the off-screen narrator speaks. No text, captions or logos in the frame.</w:t>
       </w:r>
     </w:p>
     <w:p>
@@ -1534,7 +1552,7 @@
           <w:sz w:val="20"/>
           <w:szCs w:val="20"/>
         </w:rPr>
-        <w:t xml:space="preserve">Attached reference images, in order: Senbi, the groom, the bride's relatives, the wedding courtyard. 2D hand-drawn stickman cartoon in the exact style of the reference images: thin black outlines, large expressive heads, thin stick arms, flat warm colors, playful documentary-comedy tone, 16:9. Setting: sunny daytime wedding courtyard in ancient Alexandria, sandstone columns with painted blue-and-gold bands, long tables with white cloths and clay jars, orange cloth awnings, and a tall wooden entrance gate at the back-center that opens onto the street. The bride's father proudly presents Senbi with a wooden headrest. Senbi accepts it with a polite smile, glances at it, and his smile tightens with concern. Camera: locked-off and perfectly still, eye-level medium two-shot of Senbi and the father; the framing never changes (no tilt, pan, zoom or rising camera). Audio: off-screen British male narrator, warm and dry, begins speaking within half a second and says: “Then, the gift: a wooden headrest. Egyptians really did sleep on these.” Music: light ancient-Mediterranean wedding music (frame drums, reed flute, plucked strings), same theme in every clip, low under the voice. Sound effects: one wooden knock. Characters keep their exact reference designs. Nobody on screen speaks. No text, captions or logos in the frame.</w:t>
+        <w:t xml:space="preserve">ABSOLUTE RULE: only the off-screen narrator has a voice. No character on screen speaks, talks, shouts, whispers, sings or lip-syncs, and no character voices or crowd voices are heard. Characters act only with facial expressions, eye movements and body and hand gestures; their mouths may move silently for a smile, laugh or gasp, with no sound. Attached reference images, in order: Senbi, the groom, the bride's relatives, the wedding courtyard. 2D hand-drawn stickman cartoon in the exact style of the reference images: thin black outlines, large expressive heads, thin stick arms, flat warm colors, playful documentary-comedy tone, 16:9. Setting: sunny daytime wedding courtyard in ancient Alexandria, sandstone columns with painted blue-and-gold bands, long tables with white cloths and clay jars, orange cloth awnings, and a tall wooden entrance gate at the back-center that opens onto the street. The bride's father proudly presents Senbi with a wooden headrest. Senbi accepts it with a polite smile, glances at it, and his smile tightens with concern. Camera: locked-off and perfectly still, eye-level medium two-shot of Senbi and the father; the framing never changes (no tilt, pan, zoom or rising camera). Audio: off-screen British male narrator, warm and dry, begins speaking within half a second and says: “Then, the gift: a wooden headrest. Egyptians really did sleep on these.” Music: light ancient-Mediterranean wedding music (frame drums, reed flute, plucked strings), same theme in every clip, low under the voice. Sound effects: one wooden knock. Characters keep their exact reference designs. Final reminder: no character speaks or makes any voice sound; only the off-screen narrator speaks. No text, captions or logos in the frame.</w:t>
       </w:r>
     </w:p>
     <w:p>
@@ -1607,7 +1625,7 @@
           <w:sz w:val="20"/>
           <w:szCs w:val="20"/>
         </w:rPr>
-        <w:t xml:space="preserve">Attached reference images, in order: Senbi, the groom. 2D hand-drawn stickman cartoon in the exact style of the reference images: thin black outlines, large expressive heads, thin stick arms, flat warm colors, playful documentary-comedy tone, 16:9. Setting: sunny daytime wedding courtyard in ancient Alexandria, sandstone columns with painted blue-and-gold bands, long tables with white cloths and clay jars, orange cloth awnings, and a tall wooden entrance gate at the back-center that opens onto the street. Senbi sits on a reed mat and tries resting his neck on the wooden headrest. He freezes in discomfort, then gives a stiff thumbs-up. Camera: locked-off and perfectly still, eye-level medium shot of Senbi with the headrest; the framing never changes (no tilt, pan, zoom or rising camera). Audio: off-screen British male narrator, warm and dry, begins speaking within half a second and says: “Senbi lay down. His neck filed a formal complaint. His thumbs-up said otherwise.” Music: playful comic percussion over the wedding rhythm, low under the voice. Sound effects: comic wooden creak. Characters keep their exact reference designs. Nobody on screen speaks. No text, captions or logos in the frame.</w:t>
+        <w:t xml:space="preserve">ABSOLUTE RULE: only the off-screen narrator has a voice. No character on screen speaks, talks, shouts, whispers, sings or lip-syncs, and no character voices or crowd voices are heard. Characters act only with facial expressions, eye movements and body and hand gestures; their mouths may move silently for a smile, laugh or gasp, with no sound. Attached reference images, in order: Senbi, the groom. 2D hand-drawn stickman cartoon in the exact style of the reference images: thin black outlines, large expressive heads, thin stick arms, flat warm colors, playful documentary-comedy tone, 16:9. Setting: sunny daytime wedding courtyard in ancient Alexandria, sandstone columns with painted blue-and-gold bands, long tables with white cloths and clay jars, orange cloth awnings, and a tall wooden entrance gate at the back-center that opens onto the street. Senbi sits on a reed mat and tries resting his neck on the wooden headrest. He freezes in discomfort, then gives a stiff thumbs-up. Camera: locked-off and perfectly still, eye-level medium shot of Senbi with the headrest; the framing never changes (no tilt, pan, zoom or rising camera). Audio: off-screen British male narrator, warm and dry, begins speaking within half a second and says: “Senbi lay down. His neck filed a formal complaint. His thumbs-up said otherwise.” Music: playful comic percussion over the wedding rhythm, low under the voice. Sound effects: comic wooden creak. Characters keep their exact reference designs. Final reminder: no character speaks or makes any voice sound; only the off-screen narrator speaks. No text, captions or logos in the frame.</w:t>
       </w:r>
     </w:p>
     <w:p>
@@ -1680,7 +1698,7 @@
           <w:sz w:val="20"/>
           <w:szCs w:val="20"/>
         </w:rPr>
-        <w:t xml:space="preserve">Attached reference images, in order: the Egyptian wedding guests, the bride, Senbi, the groom. 2D hand-drawn stickman cartoon in the exact style of the reference images: thin black outlines, large expressive heads, thin stick arms, flat warm colors, playful documentary-comedy tone, 16:9. Setting: sunny daytime wedding courtyard in ancient Alexandria, sandstone columns with painted blue-and-gold bands, long tables with white cloths and clay jars, orange cloth awnings, and a tall wooden entrance gate at the back-center that opens onto the street. The wedding at its happiest: Senbi and the bride together, musicians playing, guests dancing, banners and flowers swaying lightly in the breeze, warm sunlight. Camera: wide shot of the whole courtyard at eye level; fixed except for an almost imperceptible 5% slow push-in, no tilt or pan. Audio: off-screen British male narrator, warm and dry, begins speaking within half a second and says: “For a few perfect minutes, everything was exactly right. Enjoy this part.” Music: light ancient-Mediterranean wedding music (frame drums, reed flute, plucked strings), same theme in every clip, low under the voice. Sound effects: applause, drums, wind in the banners. Characters keep their exact reference designs. Nobody on screen speaks. No text, captions or logos in the frame.</w:t>
+        <w:t xml:space="preserve">ABSOLUTE RULE: only the off-screen narrator has a voice. No character on screen speaks, talks, shouts, whispers, sings or lip-syncs, and no character voices or crowd voices are heard. Characters act only with facial expressions, eye movements and body and hand gestures; their mouths may move silently for a smile, laugh or gasp, with no sound. Attached reference images, in order: the Egyptian wedding guests, the bride, Senbi, the groom. 2D hand-drawn stickman cartoon in the exact style of the reference images: thin black outlines, large expressive heads, thin stick arms, flat warm colors, playful documentary-comedy tone, 16:9. Setting: sunny daytime wedding courtyard in ancient Alexandria, sandstone columns with painted blue-and-gold bands, long tables with white cloths and clay jars, orange cloth awnings, and a tall wooden entrance gate at the back-center that opens onto the street. The wedding at its happiest: Senbi and the bride together, musicians playing, guests dancing, banners and flowers swaying lightly in the breeze, warm sunlight. Camera: wide shot of the whole courtyard at eye level; fixed except for an almost imperceptible 5% slow push-in, no tilt or pan. Audio: off-screen British male narrator, warm and dry, begins speaking within half a second and says: “For a few perfect minutes, everything was exactly right. Enjoy this part.” Music: light ancient-Mediterranean wedding music (frame drums, reed flute, plucked strings), same theme in every clip, low under the voice. Sound effects: applause, drums, wind in the banners. Characters keep their exact reference designs. Final reminder: no character speaks or makes any voice sound; only the off-screen narrator speaks. No text, captions or logos in the frame.</w:t>
       </w:r>
     </w:p>
     <w:p>
@@ -1753,7 +1771,7 @@
           <w:sz w:val="20"/>
           <w:szCs w:val="20"/>
         </w:rPr>
-        <w:t xml:space="preserve">Attached reference images, in order: the wedding courtyard. 2D hand-drawn stickman cartoon in the exact style of the reference images: thin black outlines, large expressive heads, thin stick arms, flat warm colors, playful documentary-comedy tone, 16:9. Setting: sunny daytime wedding courtyard in ancient Alexandria, sandstone columns with painted blue-and-gold bands, long tables with white cloths and clay jars, orange cloth awnings, and a tall wooden entrance gate at the back-center that opens onto the street. A small clay cup on a wedding table trembles slightly, as if from distant footsteps. Out-of-focus guests dance behind it, unaware. Camera: locked-off and perfectly still, extreme close-up of the cup; only the cup vibrates, the camera does not; the framing never changes (no tilt, pan, zoom or rising camera). Audio: off-screen British male narrator, warm and dry, begins speaking within half a second and says: “Then a small cup on the table began to tremble. Nobody noticed.” Music: light ancient-Mediterranean wedding music (frame drums, reed flute, plucked strings) with a faint uneasy undertone, same theme in every clip, low under the voice. Sound effects: ceramic cup rattling, faint rumble. Characters keep their exact reference designs. Nobody on screen speaks. No text, captions or logos in the frame.</w:t>
+        <w:t xml:space="preserve">ABSOLUTE RULE: only the off-screen narrator has a voice. No character on screen speaks, talks, shouts, whispers, sings or lip-syncs, and no character voices or crowd voices are heard. Characters act only with facial expressions, eye movements and body and hand gestures; their mouths may move silently for a smile, laugh or gasp, with no sound. Attached reference images, in order: the wedding courtyard. 2D hand-drawn stickman cartoon in the exact style of the reference images: thin black outlines, large expressive heads, thin stick arms, flat warm colors, playful documentary-comedy tone, 16:9. Setting: sunny daytime wedding courtyard in ancient Alexandria, sandstone columns with painted blue-and-gold bands, long tables with white cloths and clay jars, orange cloth awnings, and a tall wooden entrance gate at the back-center that opens onto the street. A small clay cup on a wedding table trembles slightly, as if from distant footsteps. Out-of-focus guests dance behind it, unaware. Camera: locked-off and perfectly still, extreme close-up of the cup; only the cup vibrates, the camera does not; the framing never changes (no tilt, pan, zoom or rising camera). Audio: off-screen British male narrator, warm and dry, begins speaking within half a second and says: “Then a small cup on the table began to tremble. Nobody noticed.” Music: light ancient-Mediterranean wedding music (frame drums, reed flute, plucked strings) with a faint uneasy undertone, same theme in every clip, low under the voice. Sound effects: ceramic cup rattling, faint rumble. Characters keep their exact reference designs. Final reminder: no character speaks or makes any voice sound; only the off-screen narrator speaks. No text, captions or logos in the frame.</w:t>
       </w:r>
     </w:p>
     <w:p>
@@ -1826,7 +1844,7 @@
           <w:sz w:val="20"/>
           <w:szCs w:val="20"/>
         </w:rPr>
-        <w:t xml:space="preserve">Attached reference images, in order: the Egyptian wedding guests, the wedding courtyard. 2D hand-drawn stickman cartoon in the exact style of the reference images: thin black outlines, large expressive heads, thin stick arms, flat warm colors, playful documentary-comedy tone, 16:9. Setting: sunny daytime wedding courtyard in ancient Alexandria, sandstone columns with painted blue-and-gold bands, long tables with white cloths and clay jars, orange cloth awnings, and a tall wooden entrance gate at the back-center that opens onto the street. An Egyptian musician suddenly stops playing and looks toward the open gate visible behind him; his joy turns to alertness. The dancers behind him keep dancing for one more beat. Camera: locked-off and perfectly still, eye-level medium shot of the musician with the entrance visible behind him; the framing never changes (no tilt, pan, zoom or rising camera). Audio: off-screen British male narrator, warm and dry, begins speaking within half a second and says: “The musician noticed. He stopped. Everyone else danced one more beat, blissfully unaware.” Music: music nearly silent. Sound effects: music and drums cut out, one drum stops. Characters keep their exact reference designs. Nobody on screen speaks. No text, captions or logos in the frame.</w:t>
+        <w:t xml:space="preserve">ABSOLUTE RULE: only the off-screen narrator has a voice. No character on screen speaks, talks, shouts, whispers, sings or lip-syncs, and no character voices or crowd voices are heard. Characters act only with facial expressions, eye movements and body and hand gestures; their mouths may move silently for a smile, laugh or gasp, with no sound. Attached reference images, in order: the Egyptian wedding guests, the wedding courtyard. 2D hand-drawn stickman cartoon in the exact style of the reference images: thin black outlines, large expressive heads, thin stick arms, flat warm colors, playful documentary-comedy tone, 16:9. Setting: sunny daytime wedding courtyard in ancient Alexandria, sandstone columns with painted blue-and-gold bands, long tables with white cloths and clay jars, orange cloth awnings, and a tall wooden entrance gate at the back-center that opens onto the street. An Egyptian musician suddenly stops playing and looks toward the open gate visible behind him; his joy turns to alertness. The dancers behind him keep dancing for one more beat. Camera: locked-off and perfectly still, eye-level medium shot of the musician with the entrance visible behind him; the framing never changes (no tilt, pan, zoom or rising camera). Audio: off-screen British male narrator, warm and dry, begins speaking within half a second and says: “The musician noticed. He stopped. Everyone else danced one more beat, blissfully unaware.” Music: music nearly silent. Sound effects: music and drums cut out, one drum stops. Characters keep their exact reference designs. Final reminder: no character speaks or makes any voice sound; only the off-screen narrator speaks. No text, captions or logos in the frame.</w:t>
       </w:r>
     </w:p>
     <w:p>
@@ -1899,7 +1917,7 @@
           <w:sz w:val="20"/>
           <w:szCs w:val="20"/>
         </w:rPr>
-        <w:t xml:space="preserve">Attached reference image (use only for the art style and colors; do not copy its layout or characters): the Shot 1 courtyard frame. 2D hand-drawn stickman cartoon in the exact style of the reference images: thin black outlines, large expressive heads, thin stick arms, flat warm colors, playful documentary-comedy tone, 16:9. Setting: sunlit street of ancient Alexandria outside the wedding house, sandstone walls, palms, market stalls with red and blue awnings. The busy street goes quiet. Civilians notice something at the far end, step aside and clear the road. Nothing is visible yet except settling dust; show no soldiers even if the reference image contains some. Camera: locked-off and perfectly still, eye-level wide shot of the street; the framing never changes (no tilt, pan, zoom or rising camera). Audio: off-screen British male narrator, warm and dry, begins speaking within half a second and says: “Outside, the street went quiet. In a busy city, that's never good.” Music: low sustained tension with distant marching drums, almost silent. Sound effects: street ambience fading, distant boots. Characters keep their exact reference designs. Nobody on screen speaks. No text, captions or logos in the frame.</w:t>
+        <w:t xml:space="preserve">ABSOLUTE RULE: only the off-screen narrator has a voice. No character on screen speaks, talks, shouts, whispers, sings or lip-syncs, and no character voices or crowd voices are heard. Characters act only with facial expressions, eye movements and body and hand gestures; their mouths may move silently for a smile, laugh or gasp, with no sound. Attached reference image (use only for the art style and colors; do not copy its layout or characters): the Shot 1 courtyard frame. 2D hand-drawn stickman cartoon in the exact style of the reference images: thin black outlines, large expressive heads, thin stick arms, flat warm colors, playful documentary-comedy tone, 16:9. Setting: sunlit street of ancient Alexandria outside the wedding house, sandstone walls, palms, market stalls with red and blue awnings. The busy street goes quiet. Civilians notice something at the far end, step aside and clear the road. Nothing is visible yet except settling dust; show no soldiers even if the reference image contains some. Camera: locked-off and perfectly still, eye-level wide shot of the street; the framing never changes (no tilt, pan, zoom or rising camera). Audio: off-screen British male narrator, warm and dry, begins speaking within half a second and says: “Outside, the street went quiet. In a busy city, that's never good.” Music: low sustained tension with distant marching drums, almost silent. Sound effects: street ambience fading, distant boots. Characters keep their exact reference designs. Final reminder: no character speaks or makes any voice sound; only the off-screen narrator speaks. No text, captions or logos in the frame.</w:t>
       </w:r>
     </w:p>
     <w:p>
@@ -1972,7 +1990,7 @@
           <w:sz w:val="20"/>
           <w:szCs w:val="20"/>
         </w:rPr>
-        <w:t xml:space="preserve">Attached reference images, in order: the Roman soldiers. 2D hand-drawn stickman cartoon in the exact style of the reference images: thin black outlines, large expressive heads, thin stick arms, flat warm colors, playful documentary-comedy tone, 16:9. Setting: sunlit street of ancient Alexandria outside the wedding house, sandstone walls, palms, market stalls with red and blue awnings. At ground level, three heavy Roman boots step into the frame one after another from the side, kicking up a little dust. Only boots and lower legs are visible. Camera: locked-off and perfectly still, fixed ground-level frame on the street; the boots step into frame from the side and the camera never rises; the framing never changes (no tilt, pan, zoom or rising camera). Audio: no narration and no speech. Sound effects: heavy boot steps with metal clank. Music: low sustained tension with distant marching drums, almost silent. Characters keep their exact reference designs. Nobody on screen speaks. No text, captions or logos in the frame.</w:t>
+        <w:t xml:space="preserve">ABSOLUTE RULE: nobody speaks and no voice of any kind is heard in this clip; this is a sound-effects-only beat. Attached reference images, in order: the Roman soldiers. 2D hand-drawn stickman cartoon in the exact style of the reference images: thin black outlines, large expressive heads, thin stick arms, flat warm colors, playful documentary-comedy tone, 16:9. Setting: sunlit street of ancient Alexandria outside the wedding house, sandstone walls, palms, market stalls with red and blue awnings. At ground level, three heavy Roman boots step into the frame one after another from the side, kicking up a little dust. Only boots and lower legs are visible. Camera: locked-off and perfectly still, fixed ground-level frame on the street; the boots step into frame from the side and the camera never rises; the framing never changes (no tilt, pan, zoom or rising camera). Audio: no narration and no speech. Sound effects: heavy boot steps with metal clank. Music: low sustained tension with distant marching drums, almost silent. Characters keep their exact reference designs. Final reminder: no voice of any kind in this clip. No text, captions or logos in the frame.</w:t>
       </w:r>
     </w:p>
     <w:p>
@@ -2045,7 +2063,7 @@
           <w:sz w:val="20"/>
           <w:szCs w:val="20"/>
         </w:rPr>
-        <w:t xml:space="preserve">Attached reference images, in order: the Roman soldiers. 2D hand-drawn stickman cartoon in the exact style of the reference images: thin black outlines, large expressive heads, thin stick arms, flat warm colors, playful documentary-comedy tone, 16:9. Setting: sunlit street of ancient Alexandria outside the wedding house, sandstone walls, palms, market stalls with red and blue awnings. Several Roman soldiers appear as small silhouettes far away and march steadily toward the camera in formation; helmets and shields are recognizable but tiny. Camera: eye-level wide street view; fixed except for an almost imperceptible 5% slow push-in, no tilt or pan. Audio: off-screen British male narrator, warm and dry, begins speaking within half a second and says: “Clank. Clank. Clank. Marching men. Lots of them.” Music: low sustained tension with distant marching drums, almost silent. Sound effects: marching boots in rhythm, metal clinks. Characters keep their exact reference designs. Nobody on screen speaks. No text, captions or logos in the frame.</w:t>
+        <w:t xml:space="preserve">ABSOLUTE RULE: only the off-screen narrator has a voice. No character on screen speaks, talks, shouts, whispers, sings or lip-syncs, and no character voices or crowd voices are heard. Characters act only with facial expressions, eye movements and body and hand gestures; their mouths may move silently for a smile, laugh or gasp, with no sound. Attached reference images, in order: the Roman soldiers. 2D hand-drawn stickman cartoon in the exact style of the reference images: thin black outlines, large expressive heads, thin stick arms, flat warm colors, playful documentary-comedy tone, 16:9. Setting: sunlit street of ancient Alexandria outside the wedding house, sandstone walls, palms, market stalls with red and blue awnings. Several Roman soldiers appear as small silhouettes far away and march steadily toward the camera in formation; helmets and shields are recognizable but tiny. Camera: eye-level wide street view; fixed except for an almost imperceptible 5% slow push-in, no tilt or pan. Audio: off-screen British male narrator, warm and dry, begins speaking within half a second and says: “Clank. Clank. Clank. Marching men. Lots of them.” Music: low sustained tension with distant marching drums, almost silent. Sound effects: marching boots in rhythm, metal clinks. Characters keep their exact reference designs. Final reminder: no character speaks or makes any voice sound; only the off-screen narrator speaks. No text, captions or logos in the frame.</w:t>
       </w:r>
     </w:p>
     <w:p>
@@ -2118,7 +2136,7 @@
           <w:sz w:val="20"/>
           <w:szCs w:val="20"/>
         </w:rPr>
-        <w:t xml:space="preserve">Attached reference images, in order: the wedding courtyard, Senbi, the groom, the bride. 2D hand-drawn stickman cartoon in the exact style of the reference images: thin black outlines, large expressive heads, thin stick arms, flat warm colors, playful documentary-comedy tone, 16:9. Setting: sunny daytime wedding courtyard in ancient Alexandria, sandstone columns with painted blue-and-gold bands, long tables with white cloths and clay jars, orange cloth awnings, and a tall wooden entrance gate at the back-center that opens onto the street. Guests dance and laugh; Senbi spins happily in the center, completely unaware. The open gate at the back stays calm. Camera: locked-off and perfectly still, eye-level medium-wide shot of the courtyard; the framing never changes (no tilt, pan, zoom or rising camera). Audio: off-screen British male narrator, warm and dry, begins speaking within half a second and says: “Inside, nobody had a clue. Senbi was busy spinning.” Music: light ancient-Mediterranean wedding music (frame drums, reed flute, plucked strings) with a faint uneasy undertone, same theme in every clip, low under the voice. Sound effects: wedding music muffled, faint thump. Characters keep their exact reference designs. Nobody on screen speaks. No text, captions or logos in the frame.</w:t>
+        <w:t xml:space="preserve">ABSOLUTE RULE: only the off-screen narrator has a voice. No character on screen speaks, talks, shouts, whispers, sings or lip-syncs, and no character voices or crowd voices are heard. Characters act only with facial expressions, eye movements and body and hand gestures; their mouths may move silently for a smile, laugh or gasp, with no sound. Attached reference images, in order: the wedding courtyard, Senbi, the groom, the bride. 2D hand-drawn stickman cartoon in the exact style of the reference images: thin black outlines, large expressive heads, thin stick arms, flat warm colors, playful documentary-comedy tone, 16:9. Setting: sunny daytime wedding courtyard in ancient Alexandria, sandstone columns with painted blue-and-gold bands, long tables with white cloths and clay jars, orange cloth awnings, and a tall wooden entrance gate at the back-center that opens onto the street. Guests dance and laugh; Senbi spins happily in the center, completely unaware. The open gate at the back stays calm. Camera: locked-off and perfectly still, eye-level medium-wide shot of the courtyard; the framing never changes (no tilt, pan, zoom or rising camera). Audio: off-screen British male narrator, warm and dry, begins speaking within half a second and says: “Inside, nobody had a clue. Senbi was busy spinning.” Music: light ancient-Mediterranean wedding music (frame drums, reed flute, plucked strings) with a faint uneasy undertone, same theme in every clip, low under the voice. Sound effects: wedding music muffled, faint thump. Characters keep their exact reference designs. Final reminder: no character speaks or makes any voice sound; only the off-screen narrator speaks. No text, captions or logos in the frame.</w:t>
       </w:r>
     </w:p>
     <w:p>
@@ -2191,7 +2209,7 @@
           <w:sz w:val="20"/>
           <w:szCs w:val="20"/>
         </w:rPr>
-        <w:t xml:space="preserve">Attached reference images, in order: the Roman soldiers. 2D hand-drawn stickman cartoon in the exact style of the reference images: thin black outlines, large expressive heads, thin stick arms, flat warm colors, playful documentary-comedy tone, 16:9. Setting: sunlit street of ancient Alexandria outside the wedding house, sandstone walls, palms, market stalls with red and blue awnings. Two tired, dusty Roman legionaries walk into the street in front of the wedding house, shields and spears in hand. They stop and look around, confused rather than menacing. Camera: locked-off and perfectly still, eye-level medium-wide shot of the street; the soldiers walk into the frame; the framing never changes (no tilt, pan, zoom or rising camera). Audio: off-screen British male narrator, warm and dry, begins speaking within half a second and says: “And then Rome arrived. Tired, dusty, and looking for the right address.” Music: low sustained tension with distant marching drums, almost silent. Sound effects: armor clank, dust, a tired sigh. Characters keep their exact reference designs. Nobody on screen speaks. No text, captions or logos in the frame.</w:t>
+        <w:t xml:space="preserve">ABSOLUTE RULE: only the off-screen narrator has a voice. No character on screen speaks, talks, shouts, whispers, sings or lip-syncs, and no character voices or crowd voices are heard. Characters act only with facial expressions, eye movements and body and hand gestures; their mouths may move silently for a smile, laugh or gasp, with no sound. Attached reference images, in order: the Roman soldiers. 2D hand-drawn stickman cartoon in the exact style of the reference images: thin black outlines, large expressive heads, thin stick arms, flat warm colors, playful documentary-comedy tone, 16:9. Setting: sunlit street of ancient Alexandria outside the wedding house, sandstone walls, palms, market stalls with red and blue awnings. Two tired, dusty Roman legionaries walk into the street in front of the wedding house, shields and spears in hand. They stop and look around, confused rather than menacing. Camera: locked-off and perfectly still, eye-level medium-wide shot of the street; the soldiers walk into the frame; the framing never changes (no tilt, pan, zoom or rising camera). Audio: off-screen British male narrator, warm and dry, begins speaking within half a second and says: “And then Rome arrived. Tired, dusty, and looking for the right address.” Music: low sustained tension with distant marching drums, almost silent. Sound effects: armor clank, dust, tired footsteps. Characters keep their exact reference designs. Final reminder: no character speaks or makes any voice sound; only the off-screen narrator speaks. No text, captions or logos in the frame.</w:t>
       </w:r>
     </w:p>
     <w:p>
@@ -2264,7 +2282,7 @@
           <w:sz w:val="20"/>
           <w:szCs w:val="20"/>
         </w:rPr>
-        <w:t xml:space="preserve">Attached reference images, in order: the Egyptian wedding guests, the Roman soldiers, the wedding courtyard. 2D hand-drawn stickman cartoon in the exact style of the reference images: thin black outlines, large expressive heads, thin stick arms, flat warm colors, playful documentary-comedy tone, 16:9. Setting: sunlit street of ancient Alexandria outside the wedding house, sandstone walls, palms, market stalls with red and blue awnings. Three guests peek out of the doorway at the same time: one frightened, one confused, one grinning as if the soldiers are the entertainment. Camera: locked-off and perfectly still, eye-level medium-wide shot of the doorway with all three guests peeking in the same frame; the framing never changes (no tilt, pan, zoom or rising camera). Audio: off-screen British male narrator, warm and dry, begins speaking within half a second and says: “The guests peeked out. One terrified. One confused. One assumed it was entertainment.” Music: music nearly silent. Sound effects: murmurs, nervous cough. Characters keep their exact reference designs. Nobody on screen speaks. No text, captions or logos in the frame.</w:t>
+        <w:t xml:space="preserve">ABSOLUTE RULE: only the off-screen narrator has a voice. No character on screen speaks, talks, shouts, whispers, sings or lip-syncs, and no character voices or crowd voices are heard. Characters act only with facial expressions, eye movements and body and hand gestures; their mouths may move silently for a smile, laugh or gasp, with no sound. Attached reference images, in order: the Egyptian wedding guests, the Roman soldiers, the wedding courtyard. 2D hand-drawn stickman cartoon in the exact style of the reference images: thin black outlines, large expressive heads, thin stick arms, flat warm colors, playful documentary-comedy tone, 16:9. Setting: sunlit street of ancient Alexandria outside the wedding house, sandstone walls, palms, market stalls with red and blue awnings. Three guests peek out of the doorway at the same time: one frightened, one confused, one grinning as if the soldiers are the entertainment. Camera: locked-off and perfectly still, eye-level medium-wide shot of the doorway with all three guests peeking in the same frame; the framing never changes (no tilt, pan, zoom or rising camera). Audio: off-screen British male narrator, warm and dry, begins speaking within half a second and says: “The guests peeked out. One terrified. One confused. One assumed it was entertainment.” Music: music nearly silent. Sound effects: tense silence, a few cloth rustles. Characters keep their exact reference designs. Final reminder: no character speaks or makes any voice sound; only the off-screen narrator speaks. No text, captions or logos in the frame.</w:t>
       </w:r>
     </w:p>
     <w:p>
@@ -2337,7 +2355,7 @@
           <w:sz w:val="20"/>
           <w:szCs w:val="20"/>
         </w:rPr>
-        <w:t xml:space="preserve">Attached reference images, in order: the bride's relatives, the Roman soldiers, the wedding courtyard. 2D hand-drawn stickman cartoon in the exact style of the reference images: thin black outlines, large expressive heads, thin stick arms, flat warm colors, playful documentary-comedy tone, 16:9. Setting: sunlit street of ancient Alexandria outside the wedding house, sandstone walls, palms, market stalls with red and blue awnings. A cheerful, slightly tipsy older uncle grabs a clay beer cup and walks confidently across the frame toward the Roman soldiers, as if greeting ordinary guests. Camera: locked-off and perfectly still, eye-level medium-wide shot; the uncle walks across the frame; the framing never changes (no tilt, pan, zoom or rising camera). Audio: off-screen British male narrator, warm and dry, begins speaking within half a second and says: “Then one uncle, a man with absolutely no fear, grabbed a beer.” Music: playful comic percussion over the wedding rhythm, low under the voice. Sound effects: cup clink. Characters keep their exact reference designs. Nobody on screen speaks. No text, captions or logos in the frame.</w:t>
+        <w:t xml:space="preserve">ABSOLUTE RULE: only the off-screen narrator has a voice. No character on screen speaks, talks, shouts, whispers, sings or lip-syncs, and no character voices or crowd voices are heard. Characters act only with facial expressions, eye movements and body and hand gestures; their mouths may move silently for a smile, laugh or gasp, with no sound. Attached reference images, in order: the bride's relatives, the Roman soldiers, the wedding courtyard. 2D hand-drawn stickman cartoon in the exact style of the reference images: thin black outlines, large expressive heads, thin stick arms, flat warm colors, playful documentary-comedy tone, 16:9. Setting: sunlit street of ancient Alexandria outside the wedding house, sandstone walls, palms, market stalls with red and blue awnings. A cheerful, slightly tipsy older uncle grabs a clay beer cup and walks confidently across the frame toward the Roman soldiers, as if greeting ordinary guests. Camera: locked-off and perfectly still, eye-level medium-wide shot; the uncle walks across the frame; the framing never changes (no tilt, pan, zoom or rising camera). Audio: off-screen British male narrator, warm and dry, begins speaking within half a second and says: “Then one uncle, a man with absolutely no fear, grabbed a beer.” Music: playful comic percussion over the wedding rhythm, low under the voice. Sound effects: cup clink. Characters keep their exact reference designs. Final reminder: no character speaks or makes any voice sound; only the off-screen narrator speaks. No text, captions or logos in the frame.</w:t>
       </w:r>
     </w:p>
     <w:p>
@@ -2410,7 +2428,7 @@
           <w:sz w:val="20"/>
           <w:szCs w:val="20"/>
         </w:rPr>
-        <w:t xml:space="preserve">Attached reference images, in order: the bride's relatives, the Roman soldiers. 2D hand-drawn stickman cartoon in the exact style of the reference images: thin black outlines, large expressive heads, thin stick arms, flat warm colors, playful documentary-comedy tone, 16:9. Setting: sunlit street of ancient Alexandria outside the wedding house, sandstone walls, palms, market stalls with red and blue awnings. The uncle offers the cup with a big smile. A Roman soldier looks at the cup, then at the uncle, and does not move. Camera: locked-off and perfectly still, eye-level medium two-shot; the framing never changes (no tilt, pan, zoom or rising camera). Audio: off-screen British male narrator, warm and dry, begins speaking within half a second and says: “He offered it to a Roman. As if it were completely normal.” Music: music nearly silent. Sound effects: cup clink, awkward silence. Characters keep their exact reference designs. Nobody on screen speaks. No text, captions or logos in the frame.</w:t>
+        <w:t xml:space="preserve">ABSOLUTE RULE: only the off-screen narrator has a voice. No character on screen speaks, talks, shouts, whispers, sings or lip-syncs, and no character voices or crowd voices are heard. Characters act only with facial expressions, eye movements and body and hand gestures; their mouths may move silently for a smile, laugh or gasp, with no sound. Attached reference images, in order: the bride's relatives, the Roman soldiers. 2D hand-drawn stickman cartoon in the exact style of the reference images: thin black outlines, large expressive heads, thin stick arms, flat warm colors, playful documentary-comedy tone, 16:9. Setting: sunlit street of ancient Alexandria outside the wedding house, sandstone walls, palms, market stalls with red and blue awnings. The uncle offers the cup with a big smile. A Roman soldier looks at the cup, then at the uncle, and does not move. Camera: locked-off and perfectly still, eye-level medium two-shot; the framing never changes (no tilt, pan, zoom or rising camera). Audio: off-screen British male narrator, warm and dry, begins speaking within half a second and says: “He offered it to a Roman. As if it were completely normal.” Music: music nearly silent. Sound effects: cup clink, awkward silence. Characters keep their exact reference designs. Final reminder: no character speaks or makes any voice sound; only the off-screen narrator speaks. No text, captions or logos in the frame.</w:t>
       </w:r>
     </w:p>
     <w:p>
@@ -2483,7 +2501,7 @@
           <w:sz w:val="20"/>
           <w:szCs w:val="20"/>
         </w:rPr>
-        <w:t xml:space="preserve">Attached reference images, in order: the Roman soldiers. 2D hand-drawn stickman cartoon in the exact style of the reference images: thin black outlines, large expressive heads, thin stick arms, flat warm colors, playful documentary-comedy tone, 16:9. Setting: sunlit street of ancient Alexandria outside the wedding house, sandstone walls, palms, market stalls with red and blue awnings. Close-up of the Roman soldier's confused face. He looks from the cup to the smiling uncle, cautiously takes the cup, and his eyes slide sideways toward his comrades. Camera: eye-level medium close-up of the soldier; fixed except for an almost imperceptible 5% slow push-in, no tilt or pan. Audio: off-screen British male narrator, warm and dry, begins speaking within half a second and says: “The soldier stared at the cup, then the uncle. A trap? Or hospitality?” Music: music nearly silent. Sound effects: tiny gulp, uneasy hum. Characters keep their exact reference designs. Nobody on screen speaks. No text, captions or logos in the frame.</w:t>
+        <w:t xml:space="preserve">ABSOLUTE RULE: only the off-screen narrator has a voice. No character on screen speaks, talks, shouts, whispers, sings or lip-syncs, and no character voices or crowd voices are heard. Characters act only with facial expressions, eye movements and body and hand gestures; their mouths may move silently for a smile, laugh or gasp, with no sound. Attached reference images, in order: the Roman soldiers. 2D hand-drawn stickman cartoon in the exact style of the reference images: thin black outlines, large expressive heads, thin stick arms, flat warm colors, playful documentary-comedy tone, 16:9. Setting: sunlit street of ancient Alexandria outside the wedding house, sandstone walls, palms, market stalls with red and blue awnings. Close-up of the Roman soldier's confused face. He looks from the cup to the smiling uncle, cautiously takes the cup, and his eyes slide sideways toward his comrades. Camera: eye-level medium close-up of the soldier; fixed except for an almost imperceptible 5% slow push-in, no tilt or pan. Audio: off-screen British male narrator, warm and dry, begins speaking within half a second and says: “The soldier stared at the cup, then the uncle. A trap? Or hospitality?” Music: music nearly silent. Sound effects: tiny gulp. Characters keep their exact reference designs. Final reminder: no character speaks or makes any voice sound; only the off-screen narrator speaks. No text, captions or logos in the frame.</w:t>
       </w:r>
     </w:p>
     <w:p>
@@ -2556,7 +2574,7 @@
           <w:sz w:val="20"/>
           <w:szCs w:val="20"/>
         </w:rPr>
-        <w:t xml:space="preserve">Attached reference images, in order: the Roman soldiers, the wedding courtyard. 2D hand-drawn stickman cartoon in the exact style of the reference images: thin black outlines, large expressive heads, thin stick arms, flat warm colors, playful documentary-comedy tone, 16:9. Setting: sunny daytime wedding courtyard in ancient Alexandria, sandstone columns with painted blue-and-gold bands, long tables with white cloths and clay jars, orange cloth awnings, and a tall wooden entrance gate at the back-center that opens onto the street. Two Roman soldiers in the foreground, the feast table with roast goose, bread and fruit behind them. Their serious faces soften as they turn their heads toward the food; one leans slightly forward. Camera: locked-off and perfectly still, eye-level wide-medium shot: the soldiers in the foreground, the feast table behind them; they turn their heads toward it; the framing never changes (no tilt, pan, zoom or rising camera). Audio: off-screen British male narrator, warm and dry, begins speaking within half a second and says: “Then the Romans saw the food. Military discipline lasted about four seconds.” Music: playful comic percussion over the wedding rhythm, low under the voice. Sound effects: stomach growl, sniff. Characters keep their exact reference designs. Nobody on screen speaks. No text, captions or logos in the frame.</w:t>
+        <w:t xml:space="preserve">ABSOLUTE RULE: only the off-screen narrator has a voice. No character on screen speaks, talks, shouts, whispers, sings or lip-syncs, and no character voices or crowd voices are heard. Characters act only with facial expressions, eye movements and body and hand gestures; their mouths may move silently for a smile, laugh or gasp, with no sound. Attached reference images, in order: the Roman soldiers, the wedding courtyard. 2D hand-drawn stickman cartoon in the exact style of the reference images: thin black outlines, large expressive heads, thin stick arms, flat warm colors, playful documentary-comedy tone, 16:9. Setting: sunny daytime wedding courtyard in ancient Alexandria, sandstone columns with painted blue-and-gold bands, long tables with white cloths and clay jars, orange cloth awnings, and a tall wooden entrance gate at the back-center that opens onto the street. Two Roman soldiers in the foreground, the feast table with roast goose, bread and fruit behind them. Their serious faces soften as they turn their heads toward the food; one leans slightly forward. Camera: locked-off and perfectly still, eye-level wide-medium shot: the soldiers in the foreground, the feast table behind them; they turn their heads toward it; the framing never changes (no tilt, pan, zoom or rising camera). Audio: off-screen British male narrator, warm and dry, begins speaking within half a second and says: “Then the Romans saw the food. Military discipline lasted about four seconds.” Music: playful comic percussion over the wedding rhythm, low under the voice. Sound effects: stomach growl. Characters keep their exact reference designs. Final reminder: no character speaks or makes any voice sound; only the off-screen narrator speaks. No text, captions or logos in the frame.</w:t>
       </w:r>
     </w:p>
     <w:p>
@@ -2629,7 +2647,7 @@
           <w:sz w:val="20"/>
           <w:szCs w:val="20"/>
         </w:rPr>
-        <w:t xml:space="preserve">Attached reference images, in order: the Roman soldiers, the Egyptian wedding guests, the wedding courtyard. 2D hand-drawn stickman cartoon in the exact style of the reference images: thin black outlines, large expressive heads, thin stick arms, flat warm colors, playful documentary-comedy tone, 16:9. Setting: sunny daytime wedding courtyard in ancient Alexandria, sandstone columns with painted blue-and-gold bands, long tables with white cloths and clay jars, orange cloth awnings, and a tall wooden entrance gate at the back-center that opens onto the street. One Roman soldier steps awkwardly onto the dance floor. The Egyptian guests stare in silence. Then one guest begins to copy his stiff step. Camera: locked-off and perfectly still, eye-level wide shot; the framing never changes (no tilt, pan, zoom or rising camera). Audio: off-screen British male narrator, warm and dry, begins speaking within half a second and says: “One soldier stepped into the dance. Nobody stopped him. Somehow, it worked.” Music: playful comic percussion over the wedding rhythm, low under the voice. Sound effects: shield tap blending into the rhythm, clapping. Characters keep their exact reference designs. Nobody on screen speaks. No text, captions or logos in the frame.</w:t>
+        <w:t xml:space="preserve">ABSOLUTE RULE: only the off-screen narrator has a voice. No character on screen speaks, talks, shouts, whispers, sings or lip-syncs, and no character voices or crowd voices are heard. Characters act only with facial expressions, eye movements and body and hand gestures; their mouths may move silently for a smile, laugh or gasp, with no sound. Attached reference images, in order: the Roman soldiers, the Egyptian wedding guests, the wedding courtyard. 2D hand-drawn stickman cartoon in the exact style of the reference images: thin black outlines, large expressive heads, thin stick arms, flat warm colors, playful documentary-comedy tone, 16:9. Setting: sunny daytime wedding courtyard in ancient Alexandria, sandstone columns with painted blue-and-gold bands, long tables with white cloths and clay jars, orange cloth awnings, and a tall wooden entrance gate at the back-center that opens onto the street. One Roman soldier steps awkwardly onto the dance floor. The Egyptian guests stare in silence. Then one guest begins to copy his stiff step. Camera: locked-off and perfectly still, eye-level wide shot; the framing never changes (no tilt, pan, zoom or rising camera). Audio: off-screen British male narrator, warm and dry, begins speaking within half a second and says: “One soldier stepped into the dance. Nobody stopped him. Somehow, it worked.” Music: playful comic percussion over the wedding rhythm, low under the voice. Sound effects: shield tap blending into the rhythm, clapping. Characters keep their exact reference designs. Final reminder: no character speaks or makes any voice sound; only the off-screen narrator speaks. No text, captions or logos in the frame.</w:t>
       </w:r>
     </w:p>
     <w:p>
@@ -2702,7 +2720,7 @@
           <w:sz w:val="20"/>
           <w:szCs w:val="20"/>
         </w:rPr>
-        <w:t xml:space="preserve">Attached reference images, in order: the Roman soldiers, the Egyptian wedding guests, the wedding courtyard. 2D hand-drawn stickman cartoon in the exact style of the reference images: thin black outlines, large expressive heads, thin stick arms, flat warm colors, playful documentary-comedy tone, 16:9. Setting: sunny daytime wedding courtyard in ancient Alexandria, sandstone columns with painted blue-and-gold bands, long tables with white cloths and clay jars, orange cloth awnings, and a tall wooden entrance gate at the back-center that opens onto the street. Three Roman soldiers in full armor attempt the Egyptian dance, stiff but strangely synchronized, capes swaying; Egyptian dancers around them smile and clap. Camera: locked-off and perfectly still, eye-level wide shot of the dancing Romans; the framing never changes (no tilt, pan, zoom or rising camera). Audio: off-screen British male narrator, warm and dry, begins speaking within half a second and says: “Roman engineering changed the world. Roman dancing did not.” Music: playful comic percussion over the wedding rhythm, low under the voice. Sound effects: armor clanking out of rhythm. Characters keep their exact reference designs. Nobody on screen speaks. No text, captions or logos in the frame.</w:t>
+        <w:t xml:space="preserve">ABSOLUTE RULE: only the off-screen narrator has a voice. No character on screen speaks, talks, shouts, whispers, sings or lip-syncs, and no character voices or crowd voices are heard. Characters act only with facial expressions, eye movements and body and hand gestures; their mouths may move silently for a smile, laugh or gasp, with no sound. Attached reference images, in order: the Roman soldiers, the Egyptian wedding guests, the wedding courtyard. 2D hand-drawn stickman cartoon in the exact style of the reference images: thin black outlines, large expressive heads, thin stick arms, flat warm colors, playful documentary-comedy tone, 16:9. Setting: sunny daytime wedding courtyard in ancient Alexandria, sandstone columns with painted blue-and-gold bands, long tables with white cloths and clay jars, orange cloth awnings, and a tall wooden entrance gate at the back-center that opens onto the street. Three Roman soldiers in full armor attempt the Egyptian dance, stiff but strangely synchronized, capes swaying; Egyptian dancers around them smile and clap. Camera: locked-off and perfectly still, eye-level wide shot of the dancing Romans; the framing never changes (no tilt, pan, zoom or rising camera). Audio: off-screen British male narrator, warm and dry, begins speaking within half a second and says: “Roman engineering changed the world. Roman dancing did not.” Music: playful comic percussion over the wedding rhythm, low under the voice. Sound effects: armor clanking out of rhythm. Characters keep their exact reference designs. Final reminder: no character speaks or makes any voice sound; only the off-screen narrator speaks. No text, captions or logos in the frame.</w:t>
       </w:r>
     </w:p>
     <w:p>
@@ -2775,7 +2793,7 @@
           <w:sz w:val="20"/>
           <w:szCs w:val="20"/>
         </w:rPr>
-        <w:t xml:space="preserve">Attached reference images, in order: Senbi, the groom, the Roman soldiers, the wedding courtyard. 2D hand-drawn stickman cartoon in the exact style of the reference images: thin black outlines, large expressive heads, thin stick arms, flat warm colors, playful documentary-comedy tone, 16:9. Setting: sunny daytime wedding courtyard in ancient Alexandria, sandstone columns with painted blue-and-gold bands, long tables with white cloths and clay jars, orange cloth awnings, and a tall wooden entrance gate at the back-center that opens onto the street. Senbi dances proudly beside a Roman soldier and gestures for him to follow. The soldier hesitates, then copies Senbi's arm movement. Camera: locked-off and perfectly still, eye-level medium two-shot; the framing never changes (no tilt, pan, zoom or rising camera). Audio: off-screen British male narrator, warm and dry, begins speaking within half a second and says: “Senbi, ever the host, invited one to join. Of course he did.” Music: playful comic percussion over the wedding rhythm, low under the voice. Sound effects: laughter, hand claps. Characters keep their exact reference designs. Nobody on screen speaks. No text, captions or logos in the frame.</w:t>
+        <w:t xml:space="preserve">ABSOLUTE RULE: only the off-screen narrator has a voice. No character on screen speaks, talks, shouts, whispers, sings or lip-syncs, and no character voices or crowd voices are heard. Characters act only with facial expressions, eye movements and body and hand gestures; their mouths may move silently for a smile, laugh or gasp, with no sound. Attached reference images, in order: Senbi, the groom, the Roman soldiers, the wedding courtyard. 2D hand-drawn stickman cartoon in the exact style of the reference images: thin black outlines, large expressive heads, thin stick arms, flat warm colors, playful documentary-comedy tone, 16:9. Setting: sunny daytime wedding courtyard in ancient Alexandria, sandstone columns with painted blue-and-gold bands, long tables with white cloths and clay jars, orange cloth awnings, and a tall wooden entrance gate at the back-center that opens onto the street. Senbi dances proudly beside a Roman soldier and gestures for him to follow. The soldier hesitates, then copies Senbi's arm movement. Camera: locked-off and perfectly still, eye-level medium two-shot; the framing never changes (no tilt, pan, zoom or rising camera). Audio: off-screen British male narrator, warm and dry, begins speaking within half a second and says: “Senbi, ever the host, invited one to join. Of course he did.” Music: playful comic percussion over the wedding rhythm, low under the voice. Sound effects: hand claps. Characters keep their exact reference designs. Final reminder: no character speaks or makes any voice sound; only the off-screen narrator speaks. No text, captions or logos in the frame.</w:t>
       </w:r>
     </w:p>
     <w:p>
@@ -2848,7 +2866,7 @@
           <w:sz w:val="20"/>
           <w:szCs w:val="20"/>
         </w:rPr>
-        <w:t xml:space="preserve">Attached reference images, in order: the bride, Senbi, the groom, the Roman soldiers. 2D hand-drawn stickman cartoon in the exact style of the reference images: thin black outlines, large expressive heads, thin stick arms, flat warm colors, playful documentary-comedy tone, 16:9. Setting: sunny daytime wedding courtyard in ancient Alexandria, sandstone columns with painted blue-and-gold bands, long tables with white cloths and clay jars, orange cloth awnings, and a tall wooden entrance gate at the back-center that opens onto the street. The bride watches Senbi dancing with the Romans. She slowly covers her face with her hand. Camera: locked-off and perfectly still, eye-level medium close-up of the bride; the framing never changes (no tilt, pan, zoom or rising camera). Audio: off-screen British male narrator, warm and dry, begins speaking within half a second and says: “His bride slowly covered her face. This was not in the contract.” Music: playful comic percussion over the wedding rhythm, low under the voice. Sound effects: gasp, muffled laugh. Characters keep their exact reference designs. Nobody on screen speaks. No text, captions or logos in the frame.</w:t>
+        <w:t xml:space="preserve">ABSOLUTE RULE: only the off-screen narrator has a voice. No character on screen speaks, talks, shouts, whispers, sings or lip-syncs, and no character voices or crowd voices are heard. Characters act only with facial expressions, eye movements and body and hand gestures; their mouths may move silently for a smile, laugh or gasp, with no sound. Attached reference images, in order: the bride, Senbi, the groom, the Roman soldiers. 2D hand-drawn stickman cartoon in the exact style of the reference images: thin black outlines, large expressive heads, thin stick arms, flat warm colors, playful documentary-comedy tone, 16:9. Setting: sunny daytime wedding courtyard in ancient Alexandria, sandstone columns with painted blue-and-gold bands, long tables with white cloths and clay jars, orange cloth awnings, and a tall wooden entrance gate at the back-center that opens onto the street. The bride watches Senbi dancing with the Romans. She slowly covers her face with her hand. Camera: locked-off and perfectly still, eye-level medium close-up of the bride; the framing never changes (no tilt, pan, zoom or rising camera). Audio: off-screen British male narrator, warm and dry, begins speaking within half a second and says: “His bride slowly covered her face. This was not in the contract.” Music: playful comic percussion over the wedding rhythm, low under the voice. Sound effects: cloth rustle. Characters keep their exact reference designs. Final reminder: no character speaks or makes any voice sound; only the off-screen narrator speaks. No text, captions or logos in the frame.</w:t>
       </w:r>
     </w:p>
     <w:p>
@@ -2921,7 +2939,7 @@
           <w:sz w:val="20"/>
           <w:szCs w:val="20"/>
         </w:rPr>
-        <w:t xml:space="preserve">Attached reference images, in order: Senbi, the groom, the bride, the Egyptian wedding guests. 2D hand-drawn stickman cartoon in the exact style of the reference images: thin black outlines, large expressive heads, thin stick arms, flat warm colors, playful documentary-comedy tone, 16:9. Setting: sunny daytime wedding courtyard in ancient Alexandria, sandstone columns with painted blue-and-gold bands, long tables with white cloths and clay jars, orange cloth awnings, and a tall wooden entrance gate at the back-center that opens onto the street. Joyful chaos: Egyptians and Romans dance together, musicians struggle to keep the rhythm, a plate of food is passed along. Senbi is delighted; the bride looks overwhelmed. Keep no more than eight characters visible. Camera: locked-off and perfectly still, eye-level wide shot of the whole courtyard; the framing never changes (no tilt, pan, zoom or rising camera). Audio: off-screen British male narrator, warm and dry, begins speaking within half a second and says: “Soon, Egyptians and Romans were passing food and stepping on each other's feet.” Music: playful comic percussion over the wedding rhythm, low under the voice. Sound effects: laughter, plates, music chaos. Characters keep their exact reference designs. Nobody on screen speaks. No text, captions or logos in the frame.</w:t>
+        <w:t xml:space="preserve">ABSOLUTE RULE: only the off-screen narrator has a voice. No character on screen speaks, talks, shouts, whispers, sings or lip-syncs, and no character voices or crowd voices are heard. Characters act only with facial expressions, eye movements and body and hand gestures; their mouths may move silently for a smile, laugh or gasp, with no sound. Attached reference images, in order: Senbi, the groom, the bride, the Egyptian wedding guests. 2D hand-drawn stickman cartoon in the exact style of the reference images: thin black outlines, large expressive heads, thin stick arms, flat warm colors, playful documentary-comedy tone, 16:9. Setting: sunny daytime wedding courtyard in ancient Alexandria, sandstone columns with painted blue-and-gold bands, long tables with white cloths and clay jars, orange cloth awnings, and a tall wooden entrance gate at the back-center that opens onto the street. Joyful chaos: Egyptians and Romans dance together, musicians struggle to keep the rhythm, a plate of food is passed along. Senbi is delighted; the bride looks overwhelmed. Keep no more than eight characters visible. Camera: locked-off and perfectly still, eye-level wide shot of the whole courtyard; the framing never changes (no tilt, pan, zoom or rising camera). Audio: off-screen British male narrator, warm and dry, begins speaking within half a second and says: “Soon, Egyptians and Romans were passing food and stepping on each other's feet.” Music: playful comic percussion over the wedding rhythm, low under the voice. Sound effects: plates, music chaos. Characters keep their exact reference designs. Final reminder: no character speaks or makes any voice sound; only the off-screen narrator speaks. No text, captions or logos in the frame.</w:t>
       </w:r>
     </w:p>
     <w:p>
@@ -2994,7 +3012,7 @@
           <w:sz w:val="20"/>
           <w:szCs w:val="20"/>
         </w:rPr>
-        <w:t xml:space="preserve">Attached reference images, in order: the Egyptian wedding guests, the Roman soldiers, the wedding courtyard. 2D hand-drawn stickman cartoon in the exact style of the reference images: thin black outlines, large expressive heads, thin stick arms, flat warm colors, playful documentary-comedy tone, 16:9. Setting: sunny daytime wedding courtyard in ancient Alexandria, sandstone columns with painted blue-and-gold bands, long tables with white cloths and clay jars, orange cloth awnings, and a tall wooden entrance gate at the back-center that opens onto the street. A sharp horn blast: everyone freezes mid-step, Egyptians and Romans together, in a comic tableau. Camera: locked-off and perfectly still, eye-level wide shot; the framing never changes (no tilt, pan, zoom or rising camera). Audio: off-screen British male narrator, warm and dry, begins speaking within half a second and says: “Then a horn cut through the music, and everyone froze mid-step.” Music: music nearly silent. Sound effects: sharp military horn, then silence. Characters keep their exact reference designs. Nobody on screen speaks. No text, captions or logos in the frame.</w:t>
+        <w:t xml:space="preserve">ABSOLUTE RULE: only the off-screen narrator has a voice. No character on screen speaks, talks, shouts, whispers, sings or lip-syncs, and no character voices or crowd voices are heard. Characters act only with facial expressions, eye movements and body and hand gestures; their mouths may move silently for a smile, laugh or gasp, with no sound. Attached reference images, in order: the Egyptian wedding guests, the Roman soldiers, the wedding courtyard. 2D hand-drawn stickman cartoon in the exact style of the reference images: thin black outlines, large expressive heads, thin stick arms, flat warm colors, playful documentary-comedy tone, 16:9. Setting: sunny daytime wedding courtyard in ancient Alexandria, sandstone columns with painted blue-and-gold bands, long tables with white cloths and clay jars, orange cloth awnings, and a tall wooden entrance gate at the back-center that opens onto the street. A sharp horn blast: everyone freezes mid-step, Egyptians and Romans together, in a comic tableau. Camera: locked-off and perfectly still, eye-level wide shot; the framing never changes (no tilt, pan, zoom or rising camera). Audio: off-screen British male narrator, warm and dry, begins speaking within half a second and says: “Then a horn cut through the music, and everyone froze mid-step.” Music: music nearly silent. Sound effects: sharp military horn, then silence. Characters keep their exact reference designs. Final reminder: no character speaks or makes any voice sound; only the off-screen narrator speaks. No text, captions or logos in the frame.</w:t>
       </w:r>
     </w:p>
     <w:p>
@@ -3067,7 +3085,7 @@
           <w:sz w:val="20"/>
           <w:szCs w:val="20"/>
         </w:rPr>
-        <w:t xml:space="preserve">Attached reference images, in order: the Roman commander, the Roman soldiers, the wedding courtyard. 2D hand-drawn stickman cartoon in the exact style of the reference images: thin black outlines, large expressive heads, thin stick arms, flat warm colors, playful documentary-comedy tone, 16:9. Setting: sunny daytime wedding courtyard in ancient Alexandria, sandstone columns with painted blue-and-gold bands, long tables with white cloths and clay jars, orange cloth awnings, and a tall wooden entrance gate at the back-center that opens onto the street. A Roman commander in bronze-and-gold armor walks calmly through the open gate holding a scroll. The dancing soldiers step aside. The courtyard falls silent. The commander wears a gold laurel wreath and a red cloak; no banner, no lettering. Camera: locked-off and perfectly still, fixed, slightly low angle that never tilts, on the commander walking in; the framing never changes (no tilt, pan, zoom or rising camera). Audio: off-screen British male narrator, warm and dry, begins speaking within half a second and says: “And in walked the commander. The only adult in the building.” Music: low sustained tension with distant marching drums, almost silent. Sound effects: slow footsteps, cloak rustle. Characters keep their exact reference designs. Nobody on screen speaks. No text, captions or logos in the frame.</w:t>
+        <w:t xml:space="preserve">ABSOLUTE RULE: only the off-screen narrator has a voice. No character on screen speaks, talks, shouts, whispers, sings or lip-syncs, and no character voices or crowd voices are heard. Characters act only with facial expressions, eye movements and body and hand gestures; their mouths may move silently for a smile, laugh or gasp, with no sound. Attached reference images, in order: the Roman commander, the Roman soldiers, the wedding courtyard. 2D hand-drawn stickman cartoon in the exact style of the reference images: thin black outlines, large expressive heads, thin stick arms, flat warm colors, playful documentary-comedy tone, 16:9. Setting: sunny daytime wedding courtyard in ancient Alexandria, sandstone columns with painted blue-and-gold bands, long tables with white cloths and clay jars, orange cloth awnings, and a tall wooden entrance gate at the back-center that opens onto the street. A Roman commander in bronze-and-gold armor walks calmly through the open gate holding a scroll. The dancing soldiers step aside. The courtyard falls silent. The commander wears a gold laurel wreath and a red cloak; no banner, no lettering. Camera: locked-off and perfectly still, fixed, slightly low angle that never tilts, on the commander walking in; the framing never changes (no tilt, pan, zoom or rising camera). Audio: off-screen British male narrator, warm and dry, begins speaking within half a second and says: “And in walked the commander. The only adult in the building.” Music: low sustained tension with distant marching drums, almost silent. Sound effects: slow footsteps, cloak rustle. Characters keep their exact reference designs. Final reminder: no character speaks or makes any voice sound; only the off-screen narrator speaks. No text, captions or logos in the frame.</w:t>
       </w:r>
     </w:p>
     <w:p>
@@ -3140,7 +3158,7 @@
           <w:sz w:val="20"/>
           <w:szCs w:val="20"/>
         </w:rPr>
-        <w:t xml:space="preserve">Attached reference images, in order: the Roman commander, Senbi, the groom, the bride. 2D hand-drawn stickman cartoon in the exact style of the reference images: thin black outlines, large expressive heads, thin stick arms, flat warm colors, playful documentary-comedy tone, 16:9. Setting: sunny daytime wedding courtyard in ancient Alexandria, sandstone columns with painted blue-and-gold bands, long tables with white cloths and clay jars, orange cloth awnings, and a tall wooden entrance gate at the back-center that opens onto the street. The commander stands serious and still. He slowly turns his head: the dancing soldiers, the food, the bride and groom, the decorations. He stays completely serious. The commander wears a gold laurel wreath and a red cloak; no banner, no lettering. Camera: locked-off and perfectly still, eye-level medium shot of the commander; he turns his head, the camera does not pan; the framing never changes (no tilt, pan, zoom or rising camera). Audio: off-screen British male narrator, warm and dry, begins speaking within half a second and says: “He saw his soldiers dancing. The food. The bride. The groom. The cat.” Music: music nearly silent. Sound effects: quiet room tone, fire crackle. Characters keep their exact reference designs. Nobody on screen speaks. No text, captions or logos in the frame.</w:t>
+        <w:t xml:space="preserve">ABSOLUTE RULE: only the off-screen narrator has a voice. No character on screen speaks, talks, shouts, whispers, sings or lip-syncs, and no character voices or crowd voices are heard. Characters act only with facial expressions, eye movements and body and hand gestures; their mouths may move silently for a smile, laugh or gasp, with no sound. Attached reference images, in order: the Roman commander, Senbi, the groom, the bride. 2D hand-drawn stickman cartoon in the exact style of the reference images: thin black outlines, large expressive heads, thin stick arms, flat warm colors, playful documentary-comedy tone, 16:9. Setting: sunny daytime wedding courtyard in ancient Alexandria, sandstone columns with painted blue-and-gold bands, long tables with white cloths and clay jars, orange cloth awnings, and a tall wooden entrance gate at the back-center that opens onto the street. The commander stands serious and still. He slowly turns his head: the dancing soldiers, the food, the bride and groom, the decorations. He stays completely serious. The commander wears a gold laurel wreath and a red cloak; no banner, no lettering. Camera: locked-off and perfectly still, eye-level medium shot of the commander; he turns his head, the camera does not pan; the framing never changes (no tilt, pan, zoom or rising camera). Audio: off-screen British male narrator, warm and dry, begins speaking within half a second and says: “He saw his soldiers dancing. The food. The bride. The groom. The cat.” Music: music nearly silent. Sound effects: quiet room tone, fire crackle. Characters keep their exact reference designs. Final reminder: no character speaks or makes any voice sound; only the off-screen narrator speaks. No text, captions or logos in the frame.</w:t>
       </w:r>
     </w:p>
     <w:p>
@@ -3213,7 +3231,7 @@
           <w:sz w:val="20"/>
           <w:szCs w:val="20"/>
         </w:rPr>
-        <w:t xml:space="preserve">Attached reference images, in order: the Roman commander, the black cat. 2D hand-drawn stickman cartoon in the exact style of the reference images: thin black outlines, large expressive heads, thin stick arms, flat warm colors, playful documentary-comedy tone, 16:9. Setting: sunny daytime wedding courtyard in ancient Alexandria, sandstone columns with painted blue-and-gold bands, long tables with white cloths and clay jars, orange cloth awnings, and a tall wooden entrance gate at the back-center that opens onto the street. The commander stands in the foreground; behind him on the table the black cat with a small gold collar stares straight at him, unmoved. The commander's serious face twitches slightly. The commander wears a gold laurel wreath and a red cloak; no banner, no lettering. Camera: locked-off and perfectly still, eye-level medium two-shot: the commander in the foreground, the cat on the table behind him; no cutting; the framing never changes (no tilt, pan, zoom or rising camera). Audio: off-screen British male narrator, warm and dry, begins speaking within half a second and says: “The cat looked back. The cat was not impressed by the Roman Empire.” Music: music nearly silent. Sound effects: cat meow, tiny sting. Characters keep their exact reference designs. Nobody on screen speaks. No text, captions or logos in the frame.</w:t>
+        <w:t xml:space="preserve">ABSOLUTE RULE: only the off-screen narrator has a voice. No character on screen speaks, talks, shouts, whispers, sings or lip-syncs, and no character voices or crowd voices are heard. Characters act only with facial expressions, eye movements and body and hand gestures; their mouths may move silently for a smile, laugh or gasp, with no sound. Attached reference images, in order: the Roman commander, the black cat. 2D hand-drawn stickman cartoon in the exact style of the reference images: thin black outlines, large expressive heads, thin stick arms, flat warm colors, playful documentary-comedy tone, 16:9. Setting: sunny daytime wedding courtyard in ancient Alexandria, sandstone columns with painted blue-and-gold bands, long tables with white cloths and clay jars, orange cloth awnings, and a tall wooden entrance gate at the back-center that opens onto the street. The commander stands in the foreground; behind him on the table the black cat with a small gold collar stares straight at him, unmoved. The commander's serious face twitches slightly. The commander wears a gold laurel wreath and a red cloak; no banner, no lettering. Camera: locked-off and perfectly still, eye-level medium two-shot: the commander in the foreground, the cat on the table behind him; no cutting; the framing never changes (no tilt, pan, zoom or rising camera). Audio: off-screen British male narrator, warm and dry, begins speaking within half a second and says: “The cat looked back. The cat was not impressed by the Roman Empire.” Music: music nearly silent. Sound effects: cat meow, tiny sting. Characters keep their exact reference designs. Final reminder: no character speaks or makes any voice sound; only the off-screen narrator speaks. No text, captions or logos in the frame.</w:t>
       </w:r>
     </w:p>
     <w:p>
@@ -3286,7 +3304,7 @@
           <w:sz w:val="20"/>
           <w:szCs w:val="20"/>
         </w:rPr>
-        <w:t xml:space="preserve">Attached reference images, in order: the Roman commander, the Egyptian wedding guests, Senbi, the groom. 2D hand-drawn stickman cartoon in the exact style of the reference images: thin black outlines, large expressive heads, thin stick arms, flat warm colors, playful documentary-comedy tone, 16:9. Setting: sunny daytime wedding courtyard in ancient Alexandria, sandstone columns with painted blue-and-gold bands, long tables with white cloths and clay jars, orange cloth awnings, and a tall wooden entrance gate at the back-center that opens onto the street. Symmetrical composition: the commander at the center unrolls his scroll while Egyptians and Romans stand silent on both sides. The commander wears a gold laurel wreath and a red cloak; no banner, no lettering. Camera: locked-off and perfectly still, symmetrical eye-level medium-wide shot; the framing never changes (no tilt, pan, zoom or rising camera). Audio: off-screen British male narrator, warm and dry, begins speaking within half a second and says: “He unrolled the scroll. Message received: Egypt has new management.” Music: low sustained tension with distant marching drums, almost silent. Sound effects: scroll unrolling, one dramatic drum hit. Characters keep their exact reference designs. Nobody on screen speaks. No text, captions or logos in the frame.</w:t>
+        <w:t xml:space="preserve">ABSOLUTE RULE: only the off-screen narrator has a voice. No character on screen speaks, talks, shouts, whispers, sings or lip-syncs, and no character voices or crowd voices are heard. Characters act only with facial expressions, eye movements and body and hand gestures; their mouths may move silently for a smile, laugh or gasp, with no sound. Attached reference images, in order: the Roman commander, the Egyptian wedding guests, Senbi, the groom. 2D hand-drawn stickman cartoon in the exact style of the reference images: thin black outlines, large expressive heads, thin stick arms, flat warm colors, playful documentary-comedy tone, 16:9. Setting: sunny daytime wedding courtyard in ancient Alexandria, sandstone columns with painted blue-and-gold bands, long tables with white cloths and clay jars, orange cloth awnings, and a tall wooden entrance gate at the back-center that opens onto the street. Symmetrical composition: the commander at the center unrolls his scroll while Egyptians and Romans stand silent on both sides. The commander wears a gold laurel wreath and a red cloak; no banner, no lettering. Camera: locked-off and perfectly still, symmetrical eye-level medium-wide shot; the framing never changes (no tilt, pan, zoom or rising camera). Audio: off-screen British male narrator, warm and dry, begins speaking within half a second and says: “He unrolled the scroll. Message received: Egypt has new management.” Music: low sustained tension with distant marching drums, almost silent. Sound effects: scroll unrolling, one dramatic drum hit. Characters keep their exact reference designs. Final reminder: no character speaks or makes any voice sound; only the off-screen narrator speaks. No text, captions or logos in the frame.</w:t>
       </w:r>
     </w:p>
     <w:p>
@@ -3359,7 +3377,7 @@
           <w:sz w:val="20"/>
           <w:szCs w:val="20"/>
         </w:rPr>
-        <w:t xml:space="preserve">Attached reference images, in order: Senbi, the groom, the bride, the Egyptian wedding guests. 2D hand-drawn stickman cartoon in the exact style of the reference images: thin black outlines, large expressive heads, thin stick arms, flat warm colors, playful documentary-comedy tone, 16:9. Setting: sunny daytime wedding courtyard in ancient Alexandria, sandstone columns with painted blue-and-gold bands, long tables with white cloths and clay jars, orange cloth awnings, and a tall wooden entrance gate at the back-center that opens onto the street. Senbi turns slowly toward the bride; she looks back at him. Both realize the wedding has taken a very strange turn. Camera: locked-off and perfectly still, eye-level medium two-shot of Senbi and the bride; the framing never changes (no tilt, pan, zoom or rising camera). Audio: off-screen British male narrator, warm and dry, begins speaking within half a second and says: “Senbi looked at his bride. Same question, silently: is the wedding still on?” Music: low sustained tension with distant marching drums, almost silent. Sound effects: nervous breath, single drum. Characters keep their exact reference designs. Nobody on screen speaks. No text, captions or logos in the frame.</w:t>
+        <w:t xml:space="preserve">ABSOLUTE RULE: only the off-screen narrator has a voice. No character on screen speaks, talks, shouts, whispers, sings or lip-syncs, and no character voices or crowd voices are heard. Characters act only with facial expressions, eye movements and body and hand gestures; their mouths may move silently for a smile, laugh or gasp, with no sound. Attached reference images, in order: Senbi, the groom, the bride, the Egyptian wedding guests. 2D hand-drawn stickman cartoon in the exact style of the reference images: thin black outlines, large expressive heads, thin stick arms, flat warm colors, playful documentary-comedy tone, 16:9. Setting: sunny daytime wedding courtyard in ancient Alexandria, sandstone columns with painted blue-and-gold bands, long tables with white cloths and clay jars, orange cloth awnings, and a tall wooden entrance gate at the back-center that opens onto the street. Senbi turns slowly toward the bride; she looks back at him. Both realize the wedding has taken a very strange turn. Camera: locked-off and perfectly still, eye-level medium two-shot of Senbi and the bride; the framing never changes (no tilt, pan, zoom or rising camera). Audio: off-screen British male narrator, warm and dry, begins speaking within half a second and says: “Senbi looked at his bride. Same question, silently: is the wedding still on?” Music: low sustained tension with distant marching drums, almost silent. Sound effects: single drum. Characters keep their exact reference designs. Final reminder: no character speaks or makes any voice sound; only the off-screen narrator speaks. No text, captions or logos in the frame.</w:t>
       </w:r>
     </w:p>
     <w:p>
@@ -3432,7 +3450,7 @@
           <w:sz w:val="20"/>
           <w:szCs w:val="20"/>
         </w:rPr>
-        <w:t xml:space="preserve">Attached reference images, in order: the Alexandria harbor, the Roman soldiers. 2D hand-drawn stickman cartoon in the exact style of the reference images: thin black outlines, large expressive heads, thin stick arms, flat warm colors, playful documentary-comedy tone, 16:9. Setting: sunlit street of ancient Alexandria outside the wedding house, sandstone walls, palms, market stalls with red and blue awnings. Roman soldiers walk through the streets of Alexandria while Egyptian civilians watch from the sides. The mood turns briefly serious. Camera: locked-off and perfectly still, eye-level wide shot of Alexandria with Roman soldiers in the streets; the framing never changes (no tilt, pan, zoom or rising camera). Audio: off-screen British male narrator, warm and dry, begins speaking within half a second and says: “Outside, the city was changing hands. Inside, there was still a wedding.” Music: music nearly silent. Sound effects: harbor ambience, distant boots. Characters keep their exact reference designs. Nobody on screen speaks. No text, captions or logos in the frame.</w:t>
+        <w:t xml:space="preserve">ABSOLUTE RULE: only the off-screen narrator has a voice. No character on screen speaks, talks, shouts, whispers, sings or lip-syncs, and no character voices or crowd voices are heard. Characters act only with facial expressions, eye movements and body and hand gestures; their mouths may move silently for a smile, laugh or gasp, with no sound. Attached reference images, in order: the Alexandria harbor, the Roman soldiers. 2D hand-drawn stickman cartoon in the exact style of the reference images: thin black outlines, large expressive heads, thin stick arms, flat warm colors, playful documentary-comedy tone, 16:9. Setting: sunlit street of ancient Alexandria outside the wedding house, sandstone walls, palms, market stalls with red and blue awnings. Roman soldiers walk through the streets of Alexandria while Egyptian civilians watch from the sides. The mood turns briefly serious. Camera: locked-off and perfectly still, eye-level wide shot of Alexandria with Roman soldiers in the streets; the framing never changes (no tilt, pan, zoom or rising camera). Audio: off-screen British male narrator, warm and dry, begins speaking within half a second and says: “Outside, the city was changing hands. Inside, there was still a wedding.” Music: music nearly silent. Sound effects: harbor ambience, distant boots. Characters keep their exact reference designs. Final reminder: no character speaks or makes any voice sound; only the off-screen narrator speaks. No text, captions or logos in the frame.</w:t>
       </w:r>
     </w:p>
     <w:p>
@@ -3505,7 +3523,7 @@
           <w:sz w:val="20"/>
           <w:szCs w:val="20"/>
         </w:rPr>
-        <w:t xml:space="preserve">Attached reference images, in order: the Alexandria harbor, the Roman soldiers. 2D hand-drawn stickman cartoon in the exact style of the reference images: thin black outlines, large expressive heads, thin stick arms, flat warm colors, playful documentary-comedy tone, 16:9. Setting: sunlit street of ancient Alexandria outside the wedding house, sandstone walls, palms, market stalls with red and blue awnings. A few Roman soldiers pass through while ordinary Egyptians keep going about their day: carrying baskets, bargaining, hauling jars. The scene signals real history around the fictional wedding. Camera: locked-off and perfectly still, eye-level wide observational shot of Alexandria; the framing never changes (no tilt, pan, zoom or rising camera). Audio: off-screen British male narrator, warm and dry, begins speaking within half a second and says: “To be clear: Senbi and his wedding are fiction. The cat, sadly, too.” Music: music nearly silent. Sound effects: calm city ambience. Characters keep their exact reference designs. Nobody on screen speaks. No text, captions or logos in the frame.</w:t>
+        <w:t xml:space="preserve">ABSOLUTE RULE: only the off-screen narrator has a voice. No character on screen speaks, talks, shouts, whispers, sings or lip-syncs, and no character voices or crowd voices are heard. Characters act only with facial expressions, eye movements and body and hand gestures; their mouths may move silently for a smile, laugh or gasp, with no sound. Attached reference images, in order: the Alexandria harbor, the Roman soldiers. 2D hand-drawn stickman cartoon in the exact style of the reference images: thin black outlines, large expressive heads, thin stick arms, flat warm colors, playful documentary-comedy tone, 16:9. Setting: sunlit street of ancient Alexandria outside the wedding house, sandstone walls, palms, market stalls with red and blue awnings. A few Roman soldiers pass through while ordinary Egyptians keep going about their day: carrying baskets, bargaining, hauling jars. The scene signals real history around the fictional wedding. Camera: locked-off and perfectly still, eye-level wide observational shot of Alexandria; the framing never changes (no tilt, pan, zoom or rising camera). Audio: off-screen British male narrator, warm and dry, begins speaking within half a second and says: “To be clear: Senbi and his wedding are fiction. The cat, sadly, too.” Music: music nearly silent. Sound effects: calm city ambience. Characters keep their exact reference designs. Final reminder: no character speaks or makes any voice sound; only the off-screen narrator speaks. No text, captions or logos in the frame.</w:t>
       </w:r>
     </w:p>
     <w:p>
@@ -3578,7 +3596,7 @@
           <w:sz w:val="20"/>
           <w:szCs w:val="20"/>
         </w:rPr>
-        <w:t xml:space="preserve">Attached reference images, in order: the Alexandria harbor, the Roman soldiers. 2D hand-drawn stickman cartoon in the exact style of the reference images: thin black outlines, large expressive heads, thin stick arms, flat warm colors, playful documentary-comedy tone, 16:9. Setting: ancient Alexandria harbor. Stylized historical tableau at the moment Roman authority takes over: Roman ships entering the harbor, soldiers on the quay, civilians watching. Do not depict the wedding. Camera: wide shot of the Alexandria harbor and city, horizon level; fixed except for an almost imperceptible 5% slow push-in, no tilt or pan. Audio: off-screen British male narrator, warm and dry, begins speaking within half a second and says: “The setting is real: in 30 BC, Octavian took Alexandria. Egypt became Roman.” Music: music nearly silent. Sound effects: calm city ambience. Characters keep their exact reference designs. Nobody on screen speaks. No text, captions or logos in the frame.</w:t>
+        <w:t xml:space="preserve">ABSOLUTE RULE: only the off-screen narrator has a voice. No character on screen speaks, talks, shouts, whispers, sings or lip-syncs, and no character voices or crowd voices are heard. Characters act only with facial expressions, eye movements and body and hand gestures; their mouths may move silently for a smile, laugh or gasp, with no sound. Attached reference images, in order: the Alexandria harbor, the Roman soldiers. 2D hand-drawn stickman cartoon in the exact style of the reference images: thin black outlines, large expressive heads, thin stick arms, flat warm colors, playful documentary-comedy tone, 16:9. Setting: ancient Alexandria harbor. Stylized historical tableau at the moment Roman authority takes over: Roman ships entering the harbor, soldiers on the quay, civilians watching. Do not depict the wedding. Camera: wide shot of the Alexandria harbor and city, horizon level; fixed except for an almost imperceptible 5% slow push-in, no tilt or pan. Audio: off-screen British male narrator, warm and dry, begins speaking within half a second and says: “The setting is real: in 30 BC, Octavian took Alexandria. Egypt became Roman.” Music: music nearly silent. Sound effects: calm city ambience. Characters keep their exact reference designs. Final reminder: no character speaks or makes any voice sound; only the off-screen narrator speaks. No text, captions or logos in the frame.</w:t>
       </w:r>
     </w:p>
     <w:p>
@@ -3651,7 +3669,7 @@
           <w:sz w:val="20"/>
           <w:szCs w:val="20"/>
         </w:rPr>
-        <w:t xml:space="preserve">Attached reference images, in order: Senbi, the groom, the bride's relatives. 2D hand-drawn stickman cartoon in the exact style of the reference images: thin black outlines, large expressive heads, thin stick arms, flat warm colors, playful documentary-comedy tone, 16:9. Setting: sunny daytime wedding courtyard in ancient Alexandria, sandstone columns with painted blue-and-gold bands, long tables with white cloths and clay jars, orange cloth awnings, and a tall wooden entrance gate at the back-center that opens onto the street. Senbi holds the wooden headrest in his hands and looks down at it, then slowly looks off to the side toward the Roman commander with a tired, deadpan expression. Camera: locked-off and perfectly still, eye-level medium close-up with the headrest in Senbi's hands and his face both in frame; the framing never changes (no tilt, pan, zoom or rising camera). Audio: off-screen British male narrator, warm and dry, begins speaking within half a second and says: “Headrest, then commander. Neither came with a return policy.” Music: playful comic percussion over the wedding rhythm, low under the voice. Sound effects: wood knock, comic sting. Characters keep their exact reference designs. Nobody on screen speaks. No text, captions or logos in the frame.</w:t>
+        <w:t xml:space="preserve">ABSOLUTE RULE: only the off-screen narrator has a voice. No character on screen speaks, talks, shouts, whispers, sings or lip-syncs, and no character voices or crowd voices are heard. Characters act only with facial expressions, eye movements and body and hand gestures; their mouths may move silently for a smile, laugh or gasp, with no sound. Attached reference images, in order: Senbi, the groom, the bride's relatives. 2D hand-drawn stickman cartoon in the exact style of the reference images: thin black outlines, large expressive heads, thin stick arms, flat warm colors, playful documentary-comedy tone, 16:9. Setting: sunny daytime wedding courtyard in ancient Alexandria, sandstone columns with painted blue-and-gold bands, long tables with white cloths and clay jars, orange cloth awnings, and a tall wooden entrance gate at the back-center that opens onto the street. Senbi holds the wooden headrest in his hands and looks down at it, then slowly looks off to the side toward the Roman commander with a tired, deadpan expression. Camera: locked-off and perfectly still, eye-level medium close-up with the headrest in Senbi's hands and his face both in frame; the framing never changes (no tilt, pan, zoom or rising camera). Audio: off-screen British male narrator, warm and dry, begins speaking within half a second and says: “Headrest, then commander. Neither came with a return policy.” Music: playful comic percussion over the wedding rhythm, low under the voice. Sound effects: wood knock, comic sting. Characters keep their exact reference designs. Final reminder: no character speaks or makes any voice sound; only the off-screen narrator speaks. No text, captions or logos in the frame.</w:t>
       </w:r>
     </w:p>
     <w:p>
@@ -3724,7 +3742,7 @@
           <w:sz w:val="20"/>
           <w:szCs w:val="20"/>
         </w:rPr>
-        <w:t xml:space="preserve">Attached reference images, in order: the bride, Senbi, the groom, the wedding courtyard. 2D hand-drawn stickman cartoon in the exact style of the reference images: thin black outlines, large expressive heads, thin stick arms, flat warm colors, playful documentary-comedy tone, 16:9. Setting: sunny daytime wedding courtyard in ancient Alexandria, sandstone columns with painted blue-and-gold bands, long tables with white cloths and clay jars, orange cloth awnings, and a tall wooden entrance gate at the back-center that opens onto the street. The bride finally laughs at the absurdity. Senbi looks at her, then starts laughing too. The tension releases. Camera: locked-off and perfectly still, eye-level medium two-shot of Senbi and the bride; the framing never changes (no tilt, pan, zoom or rising camera). Audio: off-screen British male narrator, warm and dry, begins speaking within half a second and says: “Senbi thought he was getting married.” Music: warm gentle resolution with the same flute and strings, low under the voice. Sound effects: bride laughter, Senbi laughter. Characters keep their exact reference designs. Nobody on screen speaks. No text, captions or logos in the frame.</w:t>
+        <w:t xml:space="preserve">ABSOLUTE RULE: only the off-screen narrator has a voice. No character on screen speaks, talks, shouts, whispers, sings or lip-syncs, and no character voices or crowd voices are heard. Characters act only with facial expressions, eye movements and body and hand gestures; their mouths may move silently for a smile, laugh or gasp, with no sound. Attached reference images, in order: the bride, Senbi, the groom, the wedding courtyard. 2D hand-drawn stickman cartoon in the exact style of the reference images: thin black outlines, large expressive heads, thin stick arms, flat warm colors, playful documentary-comedy tone, 16:9. Setting: sunny daytime wedding courtyard in ancient Alexandria, sandstone columns with painted blue-and-gold bands, long tables with white cloths and clay jars, orange cloth awnings, and a tall wooden entrance gate at the back-center that opens onto the street. The bride finally laughs at the absurdity. Senbi looks at her, then starts laughing too. The tension releases. Camera: locked-off and perfectly still, eye-level medium two-shot of Senbi and the bride; the framing never changes (no tilt, pan, zoom or rising camera). Audio: off-screen British male narrator, warm and dry, begins speaking within half a second and says: “Senbi thought he was getting married.” Music: warm gentle resolution with the same flute and strings, low under the voice. Sound effects: warm music swell. Characters keep their exact reference designs. Final reminder: no character speaks or makes any voice sound; only the off-screen narrator speaks. No text, captions or logos in the frame.</w:t>
       </w:r>
     </w:p>
     <w:p>
@@ -3797,7 +3815,7 @@
           <w:sz w:val="20"/>
           <w:szCs w:val="20"/>
         </w:rPr>
-        <w:t xml:space="preserve">Attached reference images, in order: Senbi, the groom. 2D hand-drawn stickman cartoon in the exact style of the reference images: thin black outlines, large expressive heads, thin stick arms, flat warm colors, playful documentary-comedy tone, 16:9. Setting: a quiet room of the wedding house at night, warm torchlight, painted columns, cushions on the floor; Senbi is alone in the room. Senbi lies awkwardly asleep with his neck on the wooden headrest. Distant marching is heard; he opens one eye, listens, and closes it again. Camera: eye-level medium close-up of Senbi's face; fixed except for an almost imperceptible 5% slow push-in, no tilt or pan. Audio: off-screen British male narrator, warm and dry, begins speaking within half a second and says: “He was.” Music: warm gentle resolution with the same flute and strings, low under the voice. Sound effects: distant marching, soft snore. Characters keep their exact reference designs. Nobody on screen speaks. No text, captions or logos in the frame.</w:t>
+        <w:t xml:space="preserve">ABSOLUTE RULE: only the off-screen narrator has a voice. No character on screen speaks, talks, shouts, whispers, sings or lip-syncs, and no character voices or crowd voices are heard. Characters act only with facial expressions, eye movements and body and hand gestures; their mouths may move silently for a smile, laugh or gasp, with no sound. Attached reference images, in order: Senbi, the groom. 2D hand-drawn stickman cartoon in the exact style of the reference images: thin black outlines, large expressive heads, thin stick arms, flat warm colors, playful documentary-comedy tone, 16:9. Setting: a quiet room of the wedding house at night, warm torchlight, painted columns, cushions on the floor; Senbi is alone in the room. Senbi lies awkwardly asleep with his neck on the wooden headrest. Distant marching is heard; he opens one eye, listens, and closes it again. Camera: eye-level medium close-up of Senbi's face; fixed except for an almost imperceptible 5% slow push-in, no tilt or pan. Audio: off-screen British male narrator, warm and dry, begins speaking within half a second and says: “He was.” Music: warm gentle resolution with the same flute and strings, low under the voice. Sound effects: distant marching, soft cloth rustle. Characters keep their exact reference designs. Final reminder: no character speaks or makes any voice sound; only the off-screen narrator speaks. No text, captions or logos in the frame.</w:t>
       </w:r>
     </w:p>
     <w:p>
@@ -3870,7 +3888,7 @@
           <w:sz w:val="20"/>
           <w:szCs w:val="20"/>
         </w:rPr>
-        <w:t xml:space="preserve">Attached reference images, in order: Senbi, the groom, the bride, the Alexandria harbor. 2D hand-drawn stickman cartoon in the exact style of the reference images: thin black outlines, large expressive heads, thin stick arms, flat warm colors, playful documentary-comedy tone, 16:9. Setting: sunny daytime wedding courtyard in ancient Alexandria, sandstone columns with painted blue-and-gold bands, long tables with white cloths and clay jars, orange cloth awnings, and a tall wooden entrance gate at the back-center that opens onto the street. Final composition in warm evening light: Senbi and the bride in the foreground, Alexandria behind them, Roman soldiers as small figures in the distance. Camera: locked-off and perfectly still, wide shot of Senbi and the bride in the foreground with Alexandria behind them; the framing never changes (no tilt, pan, zoom or rising camera). Audio: off-screen British male narrator, warm and dry, begins speaking within half a second and says: “He just hadn't noticed he was also getting a new government.” Music: warm gentle resolution with the same flute and strings, low under the voice. Sound effects: gentle music, silence at the very end. Characters keep their exact reference designs. Nobody on screen speaks. No text, captions or logos in the frame.</w:t>
+        <w:t xml:space="preserve">ABSOLUTE RULE: only the off-screen narrator has a voice. No character on screen speaks, talks, shouts, whispers, sings or lip-syncs, and no character voices or crowd voices are heard. Characters act only with facial expressions, eye movements and body and hand gestures; their mouths may move silently for a smile, laugh or gasp, with no sound. Attached reference images, in order: Senbi, the groom, the bride, the Alexandria harbor. 2D hand-drawn stickman cartoon in the exact style of the reference images: thin black outlines, large expressive heads, thin stick arms, flat warm colors, playful documentary-comedy tone, 16:9. Setting: sunny daytime wedding courtyard in ancient Alexandria, sandstone columns with painted blue-and-gold bands, long tables with white cloths and clay jars, orange cloth awnings, and a tall wooden entrance gate at the back-center that opens onto the street. Final composition in warm evening light: Senbi and the bride in the foreground, Alexandria behind them, Roman soldiers as small figures in the distance. Camera: locked-off and perfectly still, wide shot of Senbi and the bride in the foreground with Alexandria behind them; the framing never changes (no tilt, pan, zoom or rising camera). Audio: off-screen British male narrator, warm and dry, begins speaking within half a second and says: “He just hadn't noticed he was also getting a new government.” Music: warm gentle resolution with the same flute and strings, low under the voice. Sound effects: gentle music, silence at the very end. Characters keep their exact reference designs. Final reminder: no character speaks or makes any voice sound; only the off-screen narrator speaks. No text, captions or logos in the frame.</w:t>
       </w:r>
     </w:p>
     <w:p>

</xml_diff>

<commit_message>
Episode 1 prompts: voice rule allows natural non-verbal sounds, per-shot character lock
Co-Authored-By: Claude Sonnet 5.5 <noreply@anthropic.com>
Claude-Session: https://claude.ai/code/session_01S29WeDgsXUpbHNWdisiPFj
</commit_message>
<xml_diff>
--- a/The_Last_Day_of_Ancient_Egypt_Ep1_FLOW_PROMPTS_READY.docx
+++ b/The_Last_Day_of_Ancient_Egypt_Ep1_FLOW_PROMPTS_READY.docx
@@ -62,7 +62,7 @@
           <w:sz w:val="21"/>
           <w:szCs w:val="21"/>
         </w:rPr>
-        <w:t xml:space="preserve">GOLDEN RULE: only the narrator speaks. No character ever speaks or makes a voice sound; characters act with their faces and body gestures only. This rule is written at the start and the end of every prompt.</w:t>
+        <w:t xml:space="preserve">GOLDEN RULE: only the narrator speaks words. No character ever says a word; characters act with their faces and body gestures. Natural non-verbal sounds (laughing, gasping, sighing, cheering) are allowed and should sound real. The rule is written at the start and the end of every prompt.</w:t>
       </w:r>
     </w:p>
     <w:p>
@@ -80,7 +80,7 @@
           <w:sz w:val="21"/>
           <w:szCs w:val="21"/>
         </w:rPr>
-        <w:t xml:space="preserve">In Flow: Veo 3.1 Quality (the full model, not Fast), 16:9, audio on.</w:t>
+        <w:t xml:space="preserve">CHARACTER LOCK: every prompt describes each character who appears (Senbi, the bride, the commander, the soldiers, the cat, the guests) exactly as they look in the approved Shot 1 and the references, so the designs stay identical in every clip.</w:t>
       </w:r>
     </w:p>
     <w:p>
@@ -98,7 +98,7 @@
           <w:sz w:val="21"/>
           <w:szCs w:val="21"/>
         </w:rPr>
-        <w:t xml:space="preserve">For each shot: attach the listed image files, set the duration shown, then paste the whole prompt exactly as written.</w:t>
+        <w:t xml:space="preserve">In Flow: Veo 3.1 Quality (the full model, not Fast), 16:9, audio on.</w:t>
       </w:r>
     </w:p>
     <w:p>
@@ -116,7 +116,7 @@
           <w:sz w:val="21"/>
           <w:szCs w:val="21"/>
         </w:rPr>
-        <w:t xml:space="preserve">Do not edit the prompt. Everything is inside it.</w:t>
+        <w:t xml:space="preserve">For each shot: attach the listed image files, set the duration shown, then paste the whole prompt exactly as written.</w:t>
       </w:r>
     </w:p>
     <w:p>
@@ -134,7 +134,7 @@
           <w:sz w:val="21"/>
           <w:szCs w:val="21"/>
         </w:rPr>
-        <w:t xml:space="preserve">Shot 1 is already generated. Do not regenerate it.</w:t>
+        <w:t xml:space="preserve">Do not edit the prompt. Everything is inside it.</w:t>
       </w:r>
     </w:p>
     <w:p>
@@ -152,7 +152,7 @@
           <w:sz w:val="21"/>
           <w:szCs w:val="21"/>
         </w:rPr>
-        <w:t xml:space="preserve">Test shots 2, 3 and 4 first and play them back to back with shot 1. If the narrator voice or the music changes noticeably, regenerate that clip before making more.</w:t>
+        <w:t xml:space="preserve">Shot 1 is already generated. Do not regenerate it.</w:t>
       </w:r>
     </w:p>
     <w:p>
@@ -170,7 +170,7 @@
           <w:sz w:val="21"/>
           <w:szCs w:val="21"/>
         </w:rPr>
-        <w:t xml:space="preserve">In the final edit, play shot 44 right after shot 25 (the Octavian fact comes before the dancing).</w:t>
+        <w:t xml:space="preserve">Test shots 2, 3 and 4 first and play them back to back with shot 1. If the narrator voice or the music changes noticeably, regenerate that clip before making more.</w:t>
       </w:r>
     </w:p>
     <w:p>
@@ -188,6 +188,24 @@
           <w:sz w:val="21"/>
           <w:szCs w:val="21"/>
         </w:rPr>
+        <w:t xml:space="preserve">In the final edit, play shot 44 right after shot 25 (the Octavian fact comes before the dancing).</w:t>
+      </w:r>
+    </w:p>
+    <w:p>
+      <w:pPr>
+        <w:pStyle w:val="ListParagraph"/>
+        <w:numPr>
+          <w:ilvl w:val="0"/>
+          <w:numId w:val="2"/>
+        </w:numPr>
+        <w:spacing w:after="60"/>
+      </w:pPr>
+      <w:r>
+        <w:rPr>
+          <w:rFonts w:ascii="Arial" w:cs="Arial" w:eastAsia="Arial" w:hAnsi="Arial"/>
+          <w:sz w:val="21"/>
+          <w:szCs w:val="21"/>
+        </w:rPr>
         <w:t xml:space="preserve">If a clip moves the camera, changes a face or costume, or prints any text, regenerate it.</w:t>
       </w:r>
     </w:p>
@@ -530,7 +548,7 @@
           <w:sz w:val="20"/>
           <w:szCs w:val="20"/>
         </w:rPr>
-        <w:t xml:space="preserve">ABSOLUTE RULE: only the off-screen narrator has a voice. No character on screen speaks, talks, shouts, whispers, sings or lip-syncs, and no character voices or crowd voices are heard. Characters act only with facial expressions, eye movements and body and hand gestures; their mouths may move silently for a smile, laugh or gasp, with no sound. Attached reference images, in order: the wedding courtyard, the Egyptian wedding guests. 2D hand-drawn stickman cartoon in the exact style of the reference images: thin black outlines, large expressive heads, thin stick arms, flat warm colors, playful documentary-comedy tone, 16:9. Setting: sunny daytime wedding courtyard in ancient Alexandria, sandstone columns with painted blue-and-gold bands, long tables with white cloths and clay jars, orange cloth awnings, and a tall wooden entrance gate at the back-center that opens onto the street. Dancers fill the floor, fully visible from feet to heads, clapping and spinning. At about 2 seconds every dancer pauses for half a beat. One guest turns his head toward the open gate at the back; the others resume dancing a moment later. Camera: locked-off and perfectly still, eye-level medium-wide shot, the dancers fully visible from feet to heads (NOT a feet close-up); the framing never changes (no tilt, pan, zoom or rising camera). Audio: off-screen British male narrator, warm and dry, begins speaking within half a second and says: “Then, for half a beat, the dancing stopped. Nobody noticed. Except one guest.” Music: light ancient-Mediterranean wedding music (frame drums, reed flute, plucked strings) with a faint uneasy undertone, same theme in every clip, low under the voice. Sound effects: dancing feet on stone, one tiny pause, faint distant thump. Characters keep their exact reference designs. Final reminder: no character speaks or makes any voice sound; only the off-screen narrator speaks. No text, captions or logos in the frame.</w:t>
+        <w:t xml:space="preserve">VOICE RULE: only the off-screen narrator speaks words. No character says any word and no one on screen lip-syncs to speech; characters communicate with facial expressions and body gestures. Natural non-verbal sounds are allowed and should sound real: laughing, giggling, gasping, sighing, groaning, cheering, coughing. Attached reference images, in order: the wedding courtyard, the Egyptian wedding guests. 2D hand-drawn stickman cartoon in the exact style of the reference images: thin black outlines, large expressive heads, thin stick arms, flat warm colors, playful documentary-comedy tone, 16:9. Characters, identical in every frame: the guests: Egyptian wedding guests in white linen with blue-and-gold collars and gold headbands, black bob hairstyles, some in white striped headdresses. Setting: sunny daytime wedding courtyard in ancient Alexandria, sandstone columns with painted blue-and-gold bands, long tables with white cloths and clay jars, orange cloth awnings, and a tall wooden entrance gate at the back-center that opens onto the street. Dancers fill the floor, fully visible from feet to heads, clapping and spinning. At about 2 seconds every dancer pauses for half a beat. One guest turns his head toward the open gate at the back; the others resume dancing a moment later. Camera: locked-off and perfectly still, eye-level medium-wide shot, the dancers fully visible from feet to heads (NOT a feet close-up); the framing never changes (no tilt, pan, zoom or rising camera). Audio: off-screen British male narrator, warm and dry, begins speaking within half a second and says: “Then, for half a beat, the dancing stopped. Nobody noticed. Except one guest.” Music: light ancient-Mediterranean wedding music (frame drums, reed flute, plucked strings) with a faint uneasy undertone, same theme in every clip, low under the voice. Sound effects: dancing feet on stone, one tiny pause, faint distant thump. Final reminder: no character says any word; only the off-screen narrator speaks. Natural laughs, gasps and sighs are fine. No text, captions or logos in the frame.</w:t>
       </w:r>
     </w:p>
     <w:p>
@@ -603,7 +621,7 @@
           <w:sz w:val="20"/>
           <w:szCs w:val="20"/>
         </w:rPr>
-        <w:t xml:space="preserve">ABSOLUTE RULE: only the off-screen narrator has a voice. No character on screen speaks, talks, shouts, whispers, sings or lip-syncs, and no character voices or crowd voices are heard. Characters act only with facial expressions, eye movements and body and hand gestures; their mouths may move silently for a smile, laugh or gasp, with no sound. Attached reference images, in order: the Alexandria harbor. 2D hand-drawn cartoon in the exact style of the reference image: flat warm colors, soft cel shading, playful documentary-comedy tone, 16:9. Setting: ancient Alexandria harbor in bright daylight. Wide establishing view of the harbor and city: sailboats gliding on blue water, gulls crossing the sky, the great lighthouse and white monumental buildings behind, palms at the edge of the frame. Only tiny distant figures on the quays. Camera: wide establishing shot, horizon level; fixed except for an almost imperceptible 5% slow push-in, no tilt or pan. Audio: off-screen British male narrator, warm and dry, begins speaking within half a second and says: “Alexandria, 30 BC. A huge, busy city, about to have a strange evening.” Music: light ancient-Mediterranean wedding music (frame drums, reed flute, plucked strings), same theme in every clip, low under the voice. Sound effects: gulls, harbor water, distant market clatter with no voices. Final reminder: no character speaks or makes any voice sound; only the off-screen narrator speaks. No text, captions or logos in the frame.</w:t>
+        <w:t xml:space="preserve">VOICE RULE: only the off-screen narrator speaks words. No character says any word and no one on screen lip-syncs to speech; characters communicate with facial expressions and body gestures. Natural non-verbal sounds are allowed and should sound real: laughing, giggling, gasping, sighing, groaning, cheering, coughing. Attached reference images, in order: the Alexandria harbor. 2D hand-drawn cartoon in the exact style of the reference image: flat warm colors, soft cel shading, playful documentary-comedy tone, 16:9. Setting: ancient Alexandria harbor in bright daylight. Wide establishing view of the harbor and city: sailboats gliding on blue water, gulls crossing the sky, the great lighthouse and white monumental buildings behind, palms at the edge of the frame. Only tiny distant figures on the quays. Camera: wide establishing shot, horizon level; fixed except for an almost imperceptible 5% slow push-in, no tilt or pan. Audio: off-screen British male narrator, warm and dry, begins speaking within half a second and says: “Alexandria, 30 BC. A huge, busy city, about to have a strange evening.” Music: light ancient-Mediterranean wedding music (frame drums, reed flute, plucked strings), same theme in every clip, low under the voice. Sound effects: gulls, harbor water, distant market clatter, no words. Final reminder: no character says any word; only the off-screen narrator speaks. Natural laughs, gasps and sighs are fine. No text, captions or logos in the frame.</w:t>
       </w:r>
     </w:p>
     <w:p>
@@ -676,7 +694,7 @@
           <w:sz w:val="20"/>
           <w:szCs w:val="20"/>
         </w:rPr>
-        <w:t xml:space="preserve">ABSOLUTE RULE: only the off-screen narrator has a voice. No character on screen speaks, talks, shouts, whispers, sings or lip-syncs, and no character voices or crowd voices are heard. Characters act only with facial expressions, eye movements and body and hand gestures; their mouths may move silently for a smile, laugh or gasp, with no sound. Attached reference images, in order: the wedding courtyard. 2D hand-drawn stickman cartoon in the exact style of the reference images: thin black outlines, large expressive heads, thin stick arms, flat warm colors, playful documentary-comedy tone, 16:9. Setting: sunny daytime wedding courtyard in ancient Alexandria, sandstone columns with painted blue-and-gold bands, long tables with white cloths and clay jars, orange cloth awnings, and a tall wooden entrance gate at the back-center that opens onto the street. The wedding goes on as if nothing is wrong: guests dance and clap, Senbi and the bride among them. Keep the upper third of the frame calm and uncluttered. Camera: locked-off and perfectly still, eye-level medium-wide shot of the wedding courtyard; the framing never changes (no tilt, pan, zoom or rising camera). Audio: off-screen British male narrator, warm and dry, begins speaking within half a second and says: ““Last day of Ancient Egypt”? Relax. Egypt survived. Its queen, less so.” Music: light ancient-Mediterranean wedding music (frame drums, reed flute, plucked strings), same theme in every clip, low under the voice. Sound effects: wedding ambient room tone with no voices, one short comic sting. Characters keep their exact reference designs. Final reminder: no character speaks or makes any voice sound; only the off-screen narrator speaks. No text, captions or logos in the frame.</w:t>
+        <w:t xml:space="preserve">VOICE RULE: only the off-screen narrator speaks words. No character says any word and no one on screen lip-syncs to speech; characters communicate with facial expressions and body gestures. Natural non-verbal sounds are allowed and should sound real: laughing, giggling, gasping, sighing, groaning, cheering, coughing. Attached reference images, in order: the wedding courtyard. 2D hand-drawn stickman cartoon in the exact style of the reference images: thin black outlines, large expressive heads, thin stick arms, flat warm colors, playful documentary-comedy tone, 16:9. Characters, identical in every frame: Senbi the groom: young man, straight black bowl-cut hair with bangs, gold headband with a gold cobra, bare chest, blue-and-gold broad collar, gold bracers, white kilt with a blue-and-gold sash, brown sandals, thin black stick arms. the bride: black bob hair with straight bangs, gold headband with a red gem, white dress, blue-and-gold collar, gold sash, gold arm cuffs, light veil. the guests: Egyptian wedding guests in white linen with blue-and-gold collars and gold headbands, black bob hairstyles, some in white striped headdresses. Setting: sunny daytime wedding courtyard in ancient Alexandria, sandstone columns with painted blue-and-gold bands, long tables with white cloths and clay jars, orange cloth awnings, and a tall wooden entrance gate at the back-center that opens onto the street. The wedding goes on as if nothing is wrong: guests dance and clap, Senbi and the bride among them. Keep the upper third of the frame calm and uncluttered. Camera: locked-off and perfectly still, eye-level medium-wide shot of the wedding courtyard; the framing never changes (no tilt, pan, zoom or rising camera). Audio: off-screen British male narrator, warm and dry, begins speaking within half a second and says: ““Last day of Ancient Egypt”? Relax. Egypt survived. Its queen, less so.” Music: light ancient-Mediterranean wedding music (frame drums, reed flute, plucked strings), same theme in every clip, low under the voice. Sound effects: wedding crowd reactions without any words, one short comic sting. Final reminder: no character says any word; only the off-screen narrator speaks. Natural laughs, gasps and sighs are fine. No text, captions or logos in the frame.</w:t>
       </w:r>
     </w:p>
     <w:p>
@@ -749,7 +767,7 @@
           <w:sz w:val="20"/>
           <w:szCs w:val="20"/>
         </w:rPr>
-        <w:t xml:space="preserve">ABSOLUTE RULE: only the off-screen narrator has a voice. No character on screen speaks, talks, shouts, whispers, sings or lip-syncs, and no character voices or crowd voices are heard. Characters act only with facial expressions, eye movements and body and hand gestures; their mouths may move silently for a smile, laugh or gasp, with no sound. Attached reference images, in order: Senbi, the groom, the wedding courtyard. 2D hand-drawn stickman cartoon in the exact style of the reference images: thin black outlines, large expressive heads, thin stick arms, flat warm colors, playful documentary-comedy tone, 16:9. Setting: a shaded sandstone alcove beside the wedding courtyard, painted columns, warm daylight. Senbi stands before a bronze mirror. He straightens his blue-and-gold collar, checks his sash, practices a proud smile, then wipes his forehead with the back of his hand. Camera: eye-level medium shot of Senbi at the mirror; fixed except for an almost imperceptible 5% slow push-in, no tilt or pan. Audio: off-screen British male narrator, warm and dry, begins speaking within half a second and says: “Meet Senbi. He's getting married today, and has checked the mirror forty times.” Music: light ancient-Mediterranean wedding music (frame drums, reed flute, plucked strings), same theme in every clip, low under the voice. Sound effects: small fabric rustle, soft room tone. Characters keep their exact reference designs. Final reminder: no character speaks or makes any voice sound; only the off-screen narrator speaks. No text, captions or logos in the frame.</w:t>
+        <w:t xml:space="preserve">VOICE RULE: only the off-screen narrator speaks words. No character says any word and no one on screen lip-syncs to speech; characters communicate with facial expressions and body gestures. Natural non-verbal sounds are allowed and should sound real: laughing, giggling, gasping, sighing, groaning, cheering, coughing. Attached reference images, in order: Senbi, the groom, the wedding courtyard. 2D hand-drawn stickman cartoon in the exact style of the reference images: thin black outlines, large expressive heads, thin stick arms, flat warm colors, playful documentary-comedy tone, 16:9. Characters, identical in every frame: Senbi the groom: young man, straight black bowl-cut hair with bangs, gold headband with a gold cobra, bare chest, blue-and-gold broad collar, gold bracers, white kilt with a blue-and-gold sash, brown sandals, thin black stick arms. Setting: a shaded sandstone alcove beside the wedding courtyard, painted columns, warm daylight. Senbi stands before a bronze mirror. He straightens his blue-and-gold collar, checks his sash, practices a proud smile, then wipes his forehead with the back of his hand. Camera: eye-level medium shot of Senbi at the mirror; fixed except for an almost imperceptible 5% slow push-in, no tilt or pan. Audio: off-screen British male narrator, warm and dry, begins speaking within half a second and says: “Meet Senbi. He's getting married today, and has checked the mirror forty times.” Music: light ancient-Mediterranean wedding music (frame drums, reed flute, plucked strings), same theme in every clip, low under the voice. Sound effects: small fabric rustle, soft room tone. Final reminder: no character says any word; only the off-screen narrator speaks. Natural laughs, gasps and sighs are fine. No text, captions or logos in the frame.</w:t>
       </w:r>
     </w:p>
     <w:p>
@@ -822,7 +840,7 @@
           <w:sz w:val="20"/>
           <w:szCs w:val="20"/>
         </w:rPr>
-        <w:t xml:space="preserve">ABSOLUTE RULE: only the off-screen narrator has a voice. No character on screen speaks, talks, shouts, whispers, sings or lip-syncs, and no character voices or crowd voices are heard. Characters act only with facial expressions, eye movements and body and hand gestures; their mouths may move silently for a smile, laugh or gasp, with no sound. Attached reference images, in order: Senbi, the groom. 2D hand-drawn stickman cartoon in the exact style of the reference images: thin black outlines, large expressive heads, thin stick arms, flat warm colors, playful documentary-comedy tone, 16:9. Setting: a shaded sandstone alcove beside the wedding courtyard, painted columns, warm daylight. Senbi, full body. First he inspects a small bronze razor and runs a hand over his chin. Then he straightens his headband. Finally he adjusts his collar and strikes an overconfident hands-on-hips pose. Camera: locked-off and perfectly still, eye-level full-body medium shot of Senbi; all three actions happen inside the same frame; the framing never changes (no tilt, pan, zoom or rising camera). Audio: off-screen British male narrator, warm and dry, begins speaking within half a second and says: “Every groom has one job: look incredible, and pretend it took no effort.” Music: playful comic percussion over the wedding rhythm, low under the voice. Sound effects: light razor scrape, one comic boing. Characters keep their exact reference designs. Final reminder: no character speaks or makes any voice sound; only the off-screen narrator speaks. No text, captions or logos in the frame.</w:t>
+        <w:t xml:space="preserve">VOICE RULE: only the off-screen narrator speaks words. No character says any word and no one on screen lip-syncs to speech; characters communicate with facial expressions and body gestures. Natural non-verbal sounds are allowed and should sound real: laughing, giggling, gasping, sighing, groaning, cheering, coughing. Attached reference images, in order: Senbi, the groom. 2D hand-drawn stickman cartoon in the exact style of the reference images: thin black outlines, large expressive heads, thin stick arms, flat warm colors, playful documentary-comedy tone, 16:9. Characters, identical in every frame: Senbi the groom: young man, straight black bowl-cut hair with bangs, gold headband with a gold cobra, bare chest, blue-and-gold broad collar, gold bracers, white kilt with a blue-and-gold sash, brown sandals, thin black stick arms. Setting: a shaded sandstone alcove beside the wedding courtyard, painted columns, warm daylight. Senbi, full body. First he inspects a small bronze razor and runs a hand over his chin. Then he straightens his headband. Finally he adjusts his collar and strikes an overconfident hands-on-hips pose. Camera: locked-off and perfectly still, eye-level full-body medium shot of Senbi; all three actions happen inside the same frame; the framing never changes (no tilt, pan, zoom or rising camera). Audio: off-screen British male narrator, warm and dry, begins speaking within half a second and says: “Every groom has one job: look incredible, and pretend it took no effort.” Music: playful comic percussion over the wedding rhythm, low under the voice. Sound effects: light razor scrape, one comic boing. Final reminder: no character says any word; only the off-screen narrator speaks. Natural laughs, gasps and sighs are fine. No text, captions or logos in the frame.</w:t>
       </w:r>
     </w:p>
     <w:p>
@@ -895,7 +913,7 @@
           <w:sz w:val="20"/>
           <w:szCs w:val="20"/>
         </w:rPr>
-        <w:t xml:space="preserve">ABSOLUTE RULE: only the off-screen narrator has a voice. No character on screen speaks, talks, shouts, whispers, sings or lip-syncs, and no character voices or crowd voices are heard. Characters act only with facial expressions, eye movements and body and hand gestures; their mouths may move silently for a smile, laugh or gasp, with no sound. Attached reference images, in order: the bride, the wedding courtyard. 2D hand-drawn stickman cartoon in the exact style of the reference images: thin black outlines, large expressive heads, thin stick arms, flat warm colors, playful documentary-comedy tone, 16:9. Setting: a shaded sandstone alcove beside the wedding courtyard, painted columns, warm daylight. The bride stands at a bronze mirror. She adjusts her gold headband, touches her dark eye makeup, then gives herself a calm, confident nod. Camera: eye-level medium shot of the bride at the mirror; fixed except for an almost imperceptible 5% slow push-in, no tilt or pan. Audio: off-screen British male narrator, warm and dry, begins speaking within half a second and says: “His bride had been ready for an hour. She was the calm one.” Music: light ancient-Mediterranean wedding music (frame drums, reed flute, plucked strings), same theme in every clip, low under the voice. Sound effects: soft jewelry jingle. Characters keep their exact reference designs. Final reminder: no character speaks or makes any voice sound; only the off-screen narrator speaks. No text, captions or logos in the frame.</w:t>
+        <w:t xml:space="preserve">VOICE RULE: only the off-screen narrator speaks words. No character says any word and no one on screen lip-syncs to speech; characters communicate with facial expressions and body gestures. Natural non-verbal sounds are allowed and should sound real: laughing, giggling, gasping, sighing, groaning, cheering, coughing. Attached reference images, in order: the bride, the wedding courtyard. 2D hand-drawn stickman cartoon in the exact style of the reference images: thin black outlines, large expressive heads, thin stick arms, flat warm colors, playful documentary-comedy tone, 16:9. Characters, identical in every frame: the bride: black bob hair with straight bangs, gold headband with a red gem, white dress, blue-and-gold collar, gold sash, gold arm cuffs, light veil. Setting: a shaded sandstone alcove beside the wedding courtyard, painted columns, warm daylight. The bride stands at a bronze mirror. She adjusts her gold headband, touches her dark eye makeup, then gives herself a calm, confident nod. Camera: eye-level medium shot of the bride at the mirror; fixed except for an almost imperceptible 5% slow push-in, no tilt or pan. Audio: off-screen British male narrator, warm and dry, begins speaking within half a second and says: “His bride had been ready for an hour. She was the calm one.” Music: light ancient-Mediterranean wedding music (frame drums, reed flute, plucked strings), same theme in every clip, low under the voice. Sound effects: soft jewelry jingle. Final reminder: no character says any word; only the off-screen narrator speaks. Natural laughs, gasps and sighs are fine. No text, captions or logos in the frame.</w:t>
       </w:r>
     </w:p>
     <w:p>
@@ -968,7 +986,7 @@
           <w:sz w:val="20"/>
           <w:szCs w:val="20"/>
         </w:rPr>
-        <w:t xml:space="preserve">ABSOLUTE RULE: only the off-screen narrator has a voice. No character on screen speaks, talks, shouts, whispers, sings or lip-syncs, and no character voices or crowd voices are heard. Characters act only with facial expressions, eye movements and body and hand gestures; their mouths may move silently for a smile, laugh or gasp, with no sound. Attached reference images, in order: the bride, the bride's relatives, the wedding courtyard. 2D hand-drawn stickman cartoon in the exact style of the reference images: thin black outlines, large expressive heads, thin stick arms, flat warm colors, playful documentary-comedy tone, 16:9. Setting: a shaded sandstone alcove beside the wedding courtyard, painted columns, warm daylight. A scribe unrolls a papyrus on a low table. The bride points at one line while her father nods gravely. She then gives a small, satisfied smile. The papyrus shows only abstract hieroglyph-like marks. Camera: locked-off and perfectly still, eye-level medium two-shot: the scribe, the papyrus and the bride all in the same frame; the framing never changes (no tilt, pan, zoom or rising camera). Audio: off-screen British male narrator, warm and dry, begins speaking within half a second and says: “Then, paperwork. Real contracts survive: property, money, who owes what. Romance, with receipts.” Music: light ancient-Mediterranean wedding music (frame drums, reed flute, plucked strings), same theme in every clip, low under the voice. Sound effects: papyrus rustle, quill scratching. Characters keep their exact reference designs. Final reminder: no character speaks or makes any voice sound; only the off-screen narrator speaks. No text, captions or logos in the frame.</w:t>
+        <w:t xml:space="preserve">VOICE RULE: only the off-screen narrator speaks words. No character says any word and no one on screen lip-syncs to speech; characters communicate with facial expressions and body gestures. Natural non-verbal sounds are allowed and should sound real: laughing, giggling, gasping, sighing, groaning, cheering, coughing. Attached reference images, in order: the bride, the bride's relatives, the wedding courtyard. 2D hand-drawn stickman cartoon in the exact style of the reference images: thin black outlines, large expressive heads, thin stick arms, flat warm colors, playful documentary-comedy tone, 16:9. Characters, identical in every frame: the bride: black bob hair with straight bangs, gold headband with a red gem, white dress, blue-and-gold collar, gold sash, gold arm cuffs, light veil. the bride's father: bearded middle-aged man in a beige tunic with a purple sash. the scribe: older man in plain white linen holding a reed pen. Setting: a shaded sandstone alcove beside the wedding courtyard, painted columns, warm daylight. A scribe unrolls a papyrus on a low table. The bride points at one line while her father nods gravely. She then gives a small, satisfied smile. The papyrus shows only abstract hieroglyph-like marks. Camera: locked-off and perfectly still, eye-level medium two-shot: the scribe, the papyrus and the bride all in the same frame; the framing never changes (no tilt, pan, zoom or rising camera). Audio: off-screen British male narrator, warm and dry, begins speaking within half a second and says: “Then, paperwork. Real contracts survive: property, money, who owes what. Romance, with receipts.” Music: light ancient-Mediterranean wedding music (frame drums, reed flute, plucked strings), same theme in every clip, low under the voice. Sound effects: papyrus rustle, quill scratching. Final reminder: no character says any word; only the off-screen narrator speaks. Natural laughs, gasps and sighs are fine. No text, captions or logos in the frame.</w:t>
       </w:r>
     </w:p>
     <w:p>
@@ -1041,7 +1059,7 @@
           <w:sz w:val="20"/>
           <w:szCs w:val="20"/>
         </w:rPr>
-        <w:t xml:space="preserve">ABSOLUTE RULE: only the off-screen narrator has a voice. No character on screen speaks, talks, shouts, whispers, sings or lip-syncs, and no character voices or crowd voices are heard. Characters act only with facial expressions, eye movements and body and hand gestures; their mouths may move silently for a smile, laugh or gasp, with no sound. Attached reference images, in order: the Egyptian wedding guests, the wedding courtyard. 2D hand-drawn stickman cartoon in the exact style of the reference images: thin black outlines, large expressive heads, thin stick arms, flat warm colors, playful documentary-comedy tone, 16:9. Setting: sunny daytime wedding courtyard in ancient Alexandria, sandstone columns with painted blue-and-gold bands, long tables with white cloths and clay jars, orange cloth awnings, and a tall wooden entrance gate at the back-center that opens onto the street. A long feast table in full daylight, loaded with flatbread, roast goose, figs, dates and clay beer jugs, guests eating. At the far end one guest tiptoes up, hides a fig behind his back, and is spotted by an unimpressed aunt. Camera: locked-off and perfectly still, eye-level wide-medium shot of the whole feast table; the sneaky guest stays in frame; the framing never changes (no tilt, pan, zoom or rising camera). Audio: off-screen British male narrator, warm and dry, begins speaking within half a second and says: “Bread, figs, roast goose, and beer, basically a food group. Someone was stealing.” Music: light ancient-Mediterranean wedding music (frame drums, reed flute, plucked strings), same theme in every clip, low under the voice. Sound effects: plates, cups, cheerful ambience with no voices. Characters keep their exact reference designs. Final reminder: no character speaks or makes any voice sound; only the off-screen narrator speaks. No text, captions or logos in the frame.</w:t>
+        <w:t xml:space="preserve">VOICE RULE: only the off-screen narrator speaks words. No character says any word and no one on screen lip-syncs to speech; characters communicate with facial expressions and body gestures. Natural non-verbal sounds are allowed and should sound real: laughing, giggling, gasping, sighing, groaning, cheering, coughing. Attached reference images, in order: the Egyptian wedding guests, the wedding courtyard. 2D hand-drawn stickman cartoon in the exact style of the reference images: thin black outlines, large expressive heads, thin stick arms, flat warm colors, playful documentary-comedy tone, 16:9. Characters, identical in every frame: the guests: Egyptian wedding guests in white linen with blue-and-gold collars and gold headbands, black bob hairstyles, some in white striped headdresses. the older woman: middle-aged woman in white linen with a red-orange sash. Setting: sunny daytime wedding courtyard in ancient Alexandria, sandstone columns with painted blue-and-gold bands, long tables with white cloths and clay jars, orange cloth awnings, and a tall wooden entrance gate at the back-center that opens onto the street. A long feast table in full daylight, loaded with flatbread, roast goose, figs, dates and clay beer jugs, guests eating. At the far end one guest tiptoes up, hides a fig behind his back, and is spotted by an unimpressed aunt. Camera: locked-off and perfectly still, eye-level wide-medium shot of the whole feast table; the sneaky guest stays in frame; the framing never changes (no tilt, pan, zoom or rising camera). Audio: off-screen British male narrator, warm and dry, begins speaking within half a second and says: “Bread, figs, roast goose, and beer, basically a food group. Someone was stealing.” Music: light ancient-Mediterranean wedding music (frame drums, reed flute, plucked strings), same theme in every clip, low under the voice. Sound effects: plates, cups, cheerful ambience, no words. Final reminder: no character says any word; only the off-screen narrator speaks. Natural laughs, gasps and sighs are fine. No text, captions or logos in the frame.</w:t>
       </w:r>
     </w:p>
     <w:p>
@@ -1114,7 +1132,7 @@
           <w:sz w:val="20"/>
           <w:szCs w:val="20"/>
         </w:rPr>
-        <w:t xml:space="preserve">ABSOLUTE RULE: only the off-screen narrator has a voice. No character on screen speaks, talks, shouts, whispers, sings or lip-syncs, and no character voices or crowd voices are heard. Characters act only with facial expressions, eye movements and body and hand gestures; their mouths may move silently for a smile, laugh or gasp, with no sound. Attached reference images, in order: the black cat, the wedding courtyard. 2D hand-drawn stickman cartoon in the exact style of the reference images: thin black outlines, large expressive heads, thin stick arms, flat warm colors, playful documentary-comedy tone, 16:9. Setting: sunny daytime wedding courtyard in ancient Alexandria, sandstone columns with painted blue-and-gold bands, long tables with white cloths and clay jars, orange cloth awnings, and a tall wooden entrance gate at the back-center that opens onto the street. A black cat with a small gold collar sits upright on a cushion at the head of the feast table. A guest bows deeply in front of it. The cat looks away and licks its paw. Camera: locked-off and perfectly still, eye-level medium shot with the cat and the bowing guest both in frame; the framing never changes (no tilt, pan, zoom or rising camera). Audio: off-screen British male narrator, warm and dry, begins speaking within half a second and says: “Egyptians adored cats. This one knew it. A guest bowed. The cat shrugged.” Music: playful comic percussion over the wedding rhythm, low under the voice. Sound effects: tiny comic sting, soft cat purr. Characters keep their exact reference designs. Final reminder: no character speaks or makes any voice sound; only the off-screen narrator speaks. No text, captions or logos in the frame.</w:t>
+        <w:t xml:space="preserve">VOICE RULE: only the off-screen narrator speaks words. No character says any word and no one on screen lip-syncs to speech; characters communicate with facial expressions and body gestures. Natural non-verbal sounds are allowed and should sound real: laughing, giggling, gasping, sighing, groaning, cheering, coughing. Attached reference images, in order: the black cat, the wedding courtyard. 2D hand-drawn stickman cartoon in the exact style of the reference images: thin black outlines, large expressive heads, thin stick arms, flat warm colors, playful documentary-comedy tone, 16:9. Characters, identical in every frame: the cat: black with a small gold collar. the guests: Egyptian wedding guests in white linen with blue-and-gold collars and gold headbands, black bob hairstyles, some in white striped headdresses. Setting: sunny daytime wedding courtyard in ancient Alexandria, sandstone columns with painted blue-and-gold bands, long tables with white cloths and clay jars, orange cloth awnings, and a tall wooden entrance gate at the back-center that opens onto the street. A black cat with a small gold collar sits upright on a cushion at the head of the feast table. A guest bows deeply in front of it. The cat looks away and licks its paw. Camera: locked-off and perfectly still, eye-level medium shot with the cat and the bowing guest both in frame; the framing never changes (no tilt, pan, zoom or rising camera). Audio: off-screen British male narrator, warm and dry, begins speaking within half a second and says: “Egyptians adored cats. This one knew it. A guest bowed. The cat shrugged.” Music: playful comic percussion over the wedding rhythm, low under the voice. Sound effects: tiny comic sting, soft cat purr. Final reminder: no character says any word; only the off-screen narrator speaks. Natural laughs, gasps and sighs are fine. No text, captions or logos in the frame.</w:t>
       </w:r>
     </w:p>
     <w:p>
@@ -1187,7 +1205,7 @@
           <w:sz w:val="20"/>
           <w:szCs w:val="20"/>
         </w:rPr>
-        <w:t xml:space="preserve">ABSOLUTE RULE: only the off-screen narrator has a voice. No character on screen speaks, talks, shouts, whispers, sings or lip-syncs, and no character voices or crowd voices are heard. Characters act only with facial expressions, eye movements and body and hand gestures; their mouths may move silently for a smile, laugh or gasp, with no sound. Attached reference images, in order: the Egyptian wedding guests, the wedding courtyard. 2D hand-drawn stickman cartoon in the exact style of the reference images: thin black outlines, large expressive heads, thin stick arms, flat warm colors, playful documentary-comedy tone, 16:9. Setting: sunny daytime wedding courtyard in ancient Alexandria, sandstone columns with painted blue-and-gold bands, long tables with white cloths and clay jars, orange cloth awnings, and a tall wooden entrance gate at the back-center that opens onto the street. Musicians seated at the side tables play harp, frame drum and reed flute while guests dance in the center. Senbi steps into the dance area with a confident grin. Camera: locked-off and perfectly still, eye-level wide shot of the musicians and dancers; the framing never changes (no tilt, pan, zoom or rising camera). Audio: off-screen British male narrator, warm and dry, begins speaking within half a second and says: “Then the music began, and Senbi decided this was his moment.” Music: light ancient-Mediterranean wedding music (frame drums, reed flute, plucked strings), same theme in every clip, low under the voice. Sound effects: harp and drums swelling, clapping. Characters keep their exact reference designs. Final reminder: no character speaks or makes any voice sound; only the off-screen narrator speaks. No text, captions or logos in the frame.</w:t>
+        <w:t xml:space="preserve">VOICE RULE: only the off-screen narrator speaks words. No character says any word and no one on screen lip-syncs to speech; characters communicate with facial expressions and body gestures. Natural non-verbal sounds are allowed and should sound real: laughing, giggling, gasping, sighing, groaning, cheering, coughing. Attached reference images, in order: the Egyptian wedding guests, the wedding courtyard. 2D hand-drawn stickman cartoon in the exact style of the reference images: thin black outlines, large expressive heads, thin stick arms, flat warm colors, playful documentary-comedy tone, 16:9. Characters, identical in every frame: Senbi the groom: young man, straight black bowl-cut hair with bangs, gold headband with a gold cobra, bare chest, blue-and-gold broad collar, gold bracers, white kilt with a blue-and-gold sash, brown sandals, thin black stick arms. the guests: Egyptian wedding guests in white linen with blue-and-gold collars and gold headbands, black bob hairstyles, some in white striped headdresses. Setting: sunny daytime wedding courtyard in ancient Alexandria, sandstone columns with painted blue-and-gold bands, long tables with white cloths and clay jars, orange cloth awnings, and a tall wooden entrance gate at the back-center that opens onto the street. Musicians seated at the side tables play harp, frame drum and reed flute while guests dance in the center. Senbi steps into the dance area with a confident grin. Camera: locked-off and perfectly still, eye-level wide shot of the musicians and dancers; the framing never changes (no tilt, pan, zoom or rising camera). Audio: off-screen British male narrator, warm and dry, begins speaking within half a second and says: “Then the music began, and Senbi decided this was his moment.” Music: light ancient-Mediterranean wedding music (frame drums, reed flute, plucked strings), same theme in every clip, low under the voice. Sound effects: harp and drums swelling, clapping. Final reminder: no character says any word; only the off-screen narrator speaks. Natural laughs, gasps and sighs are fine. No text, captions or logos in the frame.</w:t>
       </w:r>
     </w:p>
     <w:p>
@@ -1260,7 +1278,7 @@
           <w:sz w:val="20"/>
           <w:szCs w:val="20"/>
         </w:rPr>
-        <w:t xml:space="preserve">ABSOLUTE RULE: only the off-screen narrator has a voice. No character on screen speaks, talks, shouts, whispers, sings or lip-syncs, and no character voices or crowd voices are heard. Characters act only with facial expressions, eye movements and body and hand gestures; their mouths may move silently for a smile, laugh or gasp, with no sound. Attached reference images, in order: Senbi, the groom, the wedding courtyard. 2D hand-drawn stickman cartoon in the exact style of the reference images: thin black outlines, large expressive heads, thin stick arms, flat warm colors, playful documentary-comedy tone, 16:9. Setting: sunny daytime wedding courtyard in ancient Alexandria, sandstone columns with painted blue-and-gold bands, long tables with white cloths and clay jars, orange cloth awnings, and a tall wooden entrance gate at the back-center that opens onto the street. Senbi dances with huge confidence, loses his balance for a moment, recovers, and freezes in a proud pose as if the stumble was choreography. Camera: locked-off and perfectly still, eye-level medium shot of Senbi, full body in frame; the framing never changes (no tilt, pan, zoom or rising camera). Audio: off-screen British male narrator, warm and dry, begins speaking within half a second and says: “Senbi nearly fell, recovered, and pretended that was the choreography. Nobody believed him.” Music: playful comic percussion over the wedding rhythm, low under the voice. Sound effects: foot scuff, comic wobble, hand claps. Characters keep their exact reference designs. Final reminder: no character speaks or makes any voice sound; only the off-screen narrator speaks. No text, captions or logos in the frame.</w:t>
+        <w:t xml:space="preserve">VOICE RULE: only the off-screen narrator speaks words. No character says any word and no one on screen lip-syncs to speech; characters communicate with facial expressions and body gestures. Natural non-verbal sounds are allowed and should sound real: laughing, giggling, gasping, sighing, groaning, cheering, coughing. Attached reference images, in order: Senbi, the groom, the wedding courtyard. 2D hand-drawn stickman cartoon in the exact style of the reference images: thin black outlines, large expressive heads, thin stick arms, flat warm colors, playful documentary-comedy tone, 16:9. Characters, identical in every frame: Senbi the groom: young man, straight black bowl-cut hair with bangs, gold headband with a gold cobra, bare chest, blue-and-gold broad collar, gold bracers, white kilt with a blue-and-gold sash, brown sandals, thin black stick arms. Setting: sunny daytime wedding courtyard in ancient Alexandria, sandstone columns with painted blue-and-gold bands, long tables with white cloths and clay jars, orange cloth awnings, and a tall wooden entrance gate at the back-center that opens onto the street. Senbi dances with huge confidence, loses his balance for a moment, recovers, and freezes in a proud pose as if the stumble was choreography. Camera: locked-off and perfectly still, eye-level medium shot of Senbi, full body in frame; the framing never changes (no tilt, pan, zoom or rising camera). Audio: off-screen British male narrator, warm and dry, begins speaking within half a second and says: “Senbi nearly fell, recovered, and pretended that was the choreography. Nobody believed him.” Music: playful comic percussion over the wedding rhythm, low under the voice. Sound effects: foot scuff, comic wobble, laughter. Final reminder: no character says any word; only the off-screen narrator speaks. Natural laughs, gasps and sighs are fine. No text, captions or logos in the frame.</w:t>
       </w:r>
     </w:p>
     <w:p>
@@ -1333,7 +1351,7 @@
           <w:sz w:val="20"/>
           <w:szCs w:val="20"/>
         </w:rPr>
-        <w:t xml:space="preserve">ABSOLUTE RULE: only the off-screen narrator has a voice. No character on screen speaks, talks, shouts, whispers, sings or lip-syncs, and no character voices or crowd voices are heard. Characters act only with facial expressions, eye movements and body and hand gestures; their mouths may move silently for a smile, laugh or gasp, with no sound. Attached reference images, in order: the bride, the wedding courtyard. 2D hand-drawn stickman cartoon in the exact style of the reference images: thin black outlines, large expressive heads, thin stick arms, flat warm colors, playful documentary-comedy tone, 16:9. Setting: sunny daytime wedding courtyard in ancient Alexandria, sandstone columns with painted blue-and-gold bands, long tables with white cloths and clay jars, orange cloth awnings, and a tall wooden entrance gate at the back-center that opens onto the street. The bride watches Senbi dance, amused. She tries to stay composed, then hides her smile behind her hand. Camera: locked-off and perfectly still, eye-level close-up of the bride's face; the framing never changes (no tilt, pan, zoom or rising camera). Audio: off-screen British male narrator, warm and dry, begins speaking within half a second and says: “His bride was trying very hard not to laugh. She loved him. Mostly.” Music: light ancient-Mediterranean wedding music (frame drums, reed flute, plucked strings), same theme in every clip, low under the voice. Sound effects: soft cloth rustle. Characters keep their exact reference designs. Final reminder: no character speaks or makes any voice sound; only the off-screen narrator speaks. No text, captions or logos in the frame.</w:t>
+        <w:t xml:space="preserve">VOICE RULE: only the off-screen narrator speaks words. No character says any word and no one on screen lip-syncs to speech; characters communicate with facial expressions and body gestures. Natural non-verbal sounds are allowed and should sound real: laughing, giggling, gasping, sighing, groaning, cheering, coughing. Attached reference images, in order: the bride, the wedding courtyard. 2D hand-drawn stickman cartoon in the exact style of the reference images: thin black outlines, large expressive heads, thin stick arms, flat warm colors, playful documentary-comedy tone, 16:9. Characters, identical in every frame: Senbi the groom: young man, straight black bowl-cut hair with bangs, gold headband with a gold cobra, bare chest, blue-and-gold broad collar, gold bracers, white kilt with a blue-and-gold sash, brown sandals, thin black stick arms. the bride: black bob hair with straight bangs, gold headband with a red gem, white dress, blue-and-gold collar, gold sash, gold arm cuffs, light veil. Setting: sunny daytime wedding courtyard in ancient Alexandria, sandstone columns with painted blue-and-gold bands, long tables with white cloths and clay jars, orange cloth awnings, and a tall wooden entrance gate at the back-center that opens onto the street. The bride watches Senbi dance, amused. She tries to stay composed, then hides her smile behind her hand. Camera: locked-off and perfectly still, eye-level close-up of the bride's face; the framing never changes (no tilt, pan, zoom or rising camera). Audio: off-screen British male narrator, warm and dry, begins speaking within half a second and says: “His bride was trying very hard not to laugh. She loved him. Mostly.” Music: light ancient-Mediterranean wedding music (frame drums, reed flute, plucked strings), same theme in every clip, low under the voice. Sound effects: suppressed giggle. Final reminder: no character says any word; only the off-screen narrator speaks. Natural laughs, gasps and sighs are fine. No text, captions or logos in the frame.</w:t>
       </w:r>
     </w:p>
     <w:p>
@@ -1406,7 +1424,7 @@
           <w:sz w:val="20"/>
           <w:szCs w:val="20"/>
         </w:rPr>
-        <w:t xml:space="preserve">ABSOLUTE RULE: only the off-screen narrator has a voice. No character on screen speaks, talks, shouts, whispers, sings or lip-syncs, and no character voices or crowd voices are heard. Characters act only with facial expressions, eye movements and body and hand gestures; their mouths may move silently for a smile, laugh or gasp, with no sound. Attached reference images, in order: the Egyptian wedding guests, the wedding courtyard. 2D hand-drawn stickman cartoon in the exact style of the reference images: thin black outlines, large expressive heads, thin stick arms, flat warm colors, playful documentary-comedy tone, 16:9. Setting: sunny daytime wedding courtyard in ancient Alexandria, sandstone columns with painted blue-and-gold bands, long tables with white cloths and clay jars, orange cloth awnings, and a tall wooden entrance gate at the back-center that opens onto the street. Young and old guests clap, dance and raise clay cups in a joyful crowd. Camera: locked-off and perfectly still, eye-level wide-medium shot with several guests in frame; the framing never changes (no tilt, pan, zoom or rising camera). Audio: off-screen British male narrator, warm and dry, begins speaking within half a second and says: “Everyone danced and raised a cup, the one thing every wedding agrees on.” Music: light ancient-Mediterranean wedding music (frame drums, reed flute, plucked strings), same theme in every clip, low under the voice. Sound effects: clapping, cups clinking. Characters keep their exact reference designs. Final reminder: no character speaks or makes any voice sound; only the off-screen narrator speaks. No text, captions or logos in the frame.</w:t>
+        <w:t xml:space="preserve">VOICE RULE: only the off-screen narrator speaks words. No character says any word and no one on screen lip-syncs to speech; characters communicate with facial expressions and body gestures. Natural non-verbal sounds are allowed and should sound real: laughing, giggling, gasping, sighing, groaning, cheering, coughing. Attached reference images, in order: the Egyptian wedding guests, the wedding courtyard. 2D hand-drawn stickman cartoon in the exact style of the reference images: thin black outlines, large expressive heads, thin stick arms, flat warm colors, playful documentary-comedy tone, 16:9. Characters, identical in every frame: the guests: Egyptian wedding guests in white linen with blue-and-gold collars and gold headbands, black bob hairstyles, some in white striped headdresses. Setting: sunny daytime wedding courtyard in ancient Alexandria, sandstone columns with painted blue-and-gold bands, long tables with white cloths and clay jars, orange cloth awnings, and a tall wooden entrance gate at the back-center that opens onto the street. Young and old guests clap, dance and raise clay cups in a joyful crowd. Camera: locked-off and perfectly still, eye-level wide-medium shot with several guests in frame; the framing never changes (no tilt, pan, zoom or rising camera). Audio: off-screen British male narrator, warm and dry, begins speaking within half a second and says: “Everyone danced and raised a cup, the one thing every wedding agrees on.” Music: light ancient-Mediterranean wedding music (frame drums, reed flute, plucked strings), same theme in every clip, low under the voice. Sound effects: clapping, cups clinking, laughter. Final reminder: no character says any word; only the off-screen narrator speaks. Natural laughs, gasps and sighs are fine. No text, captions or logos in the frame.</w:t>
       </w:r>
     </w:p>
     <w:p>
@@ -1479,7 +1497,7 @@
           <w:sz w:val="20"/>
           <w:szCs w:val="20"/>
         </w:rPr>
-        <w:t xml:space="preserve">ABSOLUTE RULE: only the off-screen narrator has a voice. No character on screen speaks, talks, shouts, whispers, sings or lip-syncs, and no character voices or crowd voices are heard. Characters act only with facial expressions, eye movements and body and hand gestures; their mouths may move silently for a smile, laugh or gasp, with no sound. Attached reference images, in order: the Egyptian wedding guests, the wedding courtyard. 2D hand-drawn stickman cartoon in the exact style of the reference images: thin black outlines, large expressive heads, thin stick arms, flat warm colors, playful documentary-comedy tone, 16:9. Setting: sunny daytime wedding courtyard in ancient Alexandria, sandstone columns with painted blue-and-gold bands, long tables with white cloths and clay jars, orange cloth awnings, and a tall wooden entrance gate at the back-center that opens onto the street. An older woman at the feast table inspects a dish with exaggerated seriousness, tastes it, narrows her eyes, then gives a reluctant nod. Camera: locked-off and perfectly still, eye-level close-up of the woman's face and the dish; the framing never changes (no tilt, pan, zoom or rising camera). Audio: off-screen British male narrator, warm and dry, begins speaking within half a second and says: “One aunt inspected the food like a tax auditor. Verdict: suspicious, but edible.” Music: playful comic percussion over the wedding rhythm, low under the voice. Sound effects: spoon tapping a bowl, suspicious hum. Characters keep their exact reference designs. Final reminder: no character speaks or makes any voice sound; only the off-screen narrator speaks. No text, captions or logos in the frame.</w:t>
+        <w:t xml:space="preserve">VOICE RULE: only the off-screen narrator speaks words. No character says any word and no one on screen lip-syncs to speech; characters communicate with facial expressions and body gestures. Natural non-verbal sounds are allowed and should sound real: laughing, giggling, gasping, sighing, groaning, cheering, coughing. Attached reference images, in order: the Egyptian wedding guests, the wedding courtyard. 2D hand-drawn stickman cartoon in the exact style of the reference images: thin black outlines, large expressive heads, thin stick arms, flat warm colors, playful documentary-comedy tone, 16:9. Characters, identical in every frame: the older woman: middle-aged woman in white linen with a red-orange sash. Setting: sunny daytime wedding courtyard in ancient Alexandria, sandstone columns with painted blue-and-gold bands, long tables with white cloths and clay jars, orange cloth awnings, and a tall wooden entrance gate at the back-center that opens onto the street. An older woman at the feast table inspects a dish with exaggerated seriousness, tastes it, narrows her eyes, then gives a reluctant nod. Camera: locked-off and perfectly still, eye-level close-up of the woman's face and the dish; the framing never changes (no tilt, pan, zoom or rising camera). Audio: off-screen British male narrator, warm and dry, begins speaking within half a second and says: “One aunt inspected the food like a tax auditor. Verdict: suspicious, but edible.” Music: playful comic percussion over the wedding rhythm, low under the voice. Sound effects: spoon tapping a bowl, suspicious hum. Final reminder: no character says any word; only the off-screen narrator speaks. Natural laughs, gasps and sighs are fine. No text, captions or logos in the frame.</w:t>
       </w:r>
     </w:p>
     <w:p>
@@ -1552,7 +1570,7 @@
           <w:sz w:val="20"/>
           <w:szCs w:val="20"/>
         </w:rPr>
-        <w:t xml:space="preserve">ABSOLUTE RULE: only the off-screen narrator has a voice. No character on screen speaks, talks, shouts, whispers, sings or lip-syncs, and no character voices or crowd voices are heard. Characters act only with facial expressions, eye movements and body and hand gestures; their mouths may move silently for a smile, laugh or gasp, with no sound. Attached reference images, in order: Senbi, the groom, the bride's relatives, the wedding courtyard. 2D hand-drawn stickman cartoon in the exact style of the reference images: thin black outlines, large expressive heads, thin stick arms, flat warm colors, playful documentary-comedy tone, 16:9. Setting: sunny daytime wedding courtyard in ancient Alexandria, sandstone columns with painted blue-and-gold bands, long tables with white cloths and clay jars, orange cloth awnings, and a tall wooden entrance gate at the back-center that opens onto the street. The bride's father proudly presents Senbi with a wooden headrest. Senbi accepts it with a polite smile, glances at it, and his smile tightens with concern. Camera: locked-off and perfectly still, eye-level medium two-shot of Senbi and the father; the framing never changes (no tilt, pan, zoom or rising camera). Audio: off-screen British male narrator, warm and dry, begins speaking within half a second and says: “Then, the gift: a wooden headrest. Egyptians really did sleep on these.” Music: light ancient-Mediterranean wedding music (frame drums, reed flute, plucked strings), same theme in every clip, low under the voice. Sound effects: one wooden knock. Characters keep their exact reference designs. Final reminder: no character speaks or makes any voice sound; only the off-screen narrator speaks. No text, captions or logos in the frame.</w:t>
+        <w:t xml:space="preserve">VOICE RULE: only the off-screen narrator speaks words. No character says any word and no one on screen lip-syncs to speech; characters communicate with facial expressions and body gestures. Natural non-verbal sounds are allowed and should sound real: laughing, giggling, gasping, sighing, groaning, cheering, coughing. Attached reference images, in order: Senbi, the groom, the bride's relatives, the wedding courtyard. 2D hand-drawn stickman cartoon in the exact style of the reference images: thin black outlines, large expressive heads, thin stick arms, flat warm colors, playful documentary-comedy tone, 16:9. Characters, identical in every frame: Senbi the groom: young man, straight black bowl-cut hair with bangs, gold headband with a gold cobra, bare chest, blue-and-gold broad collar, gold bracers, white kilt with a blue-and-gold sash, brown sandals, thin black stick arms. the bride's father: bearded middle-aged man in a beige tunic with a purple sash. Setting: sunny daytime wedding courtyard in ancient Alexandria, sandstone columns with painted blue-and-gold bands, long tables with white cloths and clay jars, orange cloth awnings, and a tall wooden entrance gate at the back-center that opens onto the street. The bride's father proudly presents Senbi with a wooden headrest. Senbi accepts it with a polite smile, glances at it, and his smile tightens with concern. Camera: locked-off and perfectly still, eye-level medium two-shot of Senbi and the father; the framing never changes (no tilt, pan, zoom or rising camera). Audio: off-screen British male narrator, warm and dry, begins speaking within half a second and says: “Then, the gift: a wooden headrest. Egyptians really did sleep on these.” Music: light ancient-Mediterranean wedding music (frame drums, reed flute, plucked strings), same theme in every clip, low under the voice. Sound effects: one wooden knock. Final reminder: no character says any word; only the off-screen narrator speaks. Natural laughs, gasps and sighs are fine. No text, captions or logos in the frame.</w:t>
       </w:r>
     </w:p>
     <w:p>
@@ -1625,7 +1643,7 @@
           <w:sz w:val="20"/>
           <w:szCs w:val="20"/>
         </w:rPr>
-        <w:t xml:space="preserve">ABSOLUTE RULE: only the off-screen narrator has a voice. No character on screen speaks, talks, shouts, whispers, sings or lip-syncs, and no character voices or crowd voices are heard. Characters act only with facial expressions, eye movements and body and hand gestures; their mouths may move silently for a smile, laugh or gasp, with no sound. Attached reference images, in order: Senbi, the groom. 2D hand-drawn stickman cartoon in the exact style of the reference images: thin black outlines, large expressive heads, thin stick arms, flat warm colors, playful documentary-comedy tone, 16:9. Setting: sunny daytime wedding courtyard in ancient Alexandria, sandstone columns with painted blue-and-gold bands, long tables with white cloths and clay jars, orange cloth awnings, and a tall wooden entrance gate at the back-center that opens onto the street. Senbi sits on a reed mat and tries resting his neck on the wooden headrest. He freezes in discomfort, then gives a stiff thumbs-up. Camera: locked-off and perfectly still, eye-level medium shot of Senbi with the headrest; the framing never changes (no tilt, pan, zoom or rising camera). Audio: off-screen British male narrator, warm and dry, begins speaking within half a second and says: “Senbi lay down. His neck filed a formal complaint. His thumbs-up said otherwise.” Music: playful comic percussion over the wedding rhythm, low under the voice. Sound effects: comic wooden creak. Characters keep their exact reference designs. Final reminder: no character speaks or makes any voice sound; only the off-screen narrator speaks. No text, captions or logos in the frame.</w:t>
+        <w:t xml:space="preserve">VOICE RULE: only the off-screen narrator speaks words. No character says any word and no one on screen lip-syncs to speech; characters communicate with facial expressions and body gestures. Natural non-verbal sounds are allowed and should sound real: laughing, giggling, gasping, sighing, groaning, cheering, coughing. Attached reference images, in order: Senbi, the groom. 2D hand-drawn stickman cartoon in the exact style of the reference images: thin black outlines, large expressive heads, thin stick arms, flat warm colors, playful documentary-comedy tone, 16:9. Characters, identical in every frame: Senbi the groom: young man, straight black bowl-cut hair with bangs, gold headband with a gold cobra, bare chest, blue-and-gold broad collar, gold bracers, white kilt with a blue-and-gold sash, brown sandals, thin black stick arms. Setting: sunny daytime wedding courtyard in ancient Alexandria, sandstone columns with painted blue-and-gold bands, long tables with white cloths and clay jars, orange cloth awnings, and a tall wooden entrance gate at the back-center that opens onto the street. Senbi sits on a reed mat and tries resting his neck on the wooden headrest. He freezes in discomfort, then gives a stiff thumbs-up. Camera: locked-off and perfectly still, eye-level medium shot of Senbi with the headrest; the framing never changes (no tilt, pan, zoom or rising camera). Audio: off-screen British male narrator, warm and dry, begins speaking within half a second and says: “Senbi lay down. His neck filed a formal complaint. His thumbs-up said otherwise.” Music: playful comic percussion over the wedding rhythm, low under the voice. Sound effects: comic wooden creak. Final reminder: no character says any word; only the off-screen narrator speaks. Natural laughs, gasps and sighs are fine. No text, captions or logos in the frame.</w:t>
       </w:r>
     </w:p>
     <w:p>
@@ -1698,7 +1716,7 @@
           <w:sz w:val="20"/>
           <w:szCs w:val="20"/>
         </w:rPr>
-        <w:t xml:space="preserve">ABSOLUTE RULE: only the off-screen narrator has a voice. No character on screen speaks, talks, shouts, whispers, sings or lip-syncs, and no character voices or crowd voices are heard. Characters act only with facial expressions, eye movements and body and hand gestures; their mouths may move silently for a smile, laugh or gasp, with no sound. Attached reference images, in order: the Egyptian wedding guests, the bride, Senbi, the groom. 2D hand-drawn stickman cartoon in the exact style of the reference images: thin black outlines, large expressive heads, thin stick arms, flat warm colors, playful documentary-comedy tone, 16:9. Setting: sunny daytime wedding courtyard in ancient Alexandria, sandstone columns with painted blue-and-gold bands, long tables with white cloths and clay jars, orange cloth awnings, and a tall wooden entrance gate at the back-center that opens onto the street. The wedding at its happiest: Senbi and the bride together, musicians playing, guests dancing, banners and flowers swaying lightly in the breeze, warm sunlight. Camera: wide shot of the whole courtyard at eye level; fixed except for an almost imperceptible 5% slow push-in, no tilt or pan. Audio: off-screen British male narrator, warm and dry, begins speaking within half a second and says: “For a few perfect minutes, everything was exactly right. Enjoy this part.” Music: light ancient-Mediterranean wedding music (frame drums, reed flute, plucked strings), same theme in every clip, low under the voice. Sound effects: applause, drums, wind in the banners. Characters keep their exact reference designs. Final reminder: no character speaks or makes any voice sound; only the off-screen narrator speaks. No text, captions or logos in the frame.</w:t>
+        <w:t xml:space="preserve">VOICE RULE: only the off-screen narrator speaks words. No character says any word and no one on screen lip-syncs to speech; characters communicate with facial expressions and body gestures. Natural non-verbal sounds are allowed and should sound real: laughing, giggling, gasping, sighing, groaning, cheering, coughing. Attached reference images, in order: the Egyptian wedding guests, the bride, Senbi, the groom. 2D hand-drawn stickman cartoon in the exact style of the reference images: thin black outlines, large expressive heads, thin stick arms, flat warm colors, playful documentary-comedy tone, 16:9. Characters, identical in every frame: Senbi the groom: young man, straight black bowl-cut hair with bangs, gold headband with a gold cobra, bare chest, blue-and-gold broad collar, gold bracers, white kilt with a blue-and-gold sash, brown sandals, thin black stick arms. the bride: black bob hair with straight bangs, gold headband with a red gem, white dress, blue-and-gold collar, gold sash, gold arm cuffs, light veil. the guests: Egyptian wedding guests in white linen with blue-and-gold collars and gold headbands, black bob hairstyles, some in white striped headdresses. the musicians: guests in white linen playing harp, frame drum and reed flute. Setting: sunny daytime wedding courtyard in ancient Alexandria, sandstone columns with painted blue-and-gold bands, long tables with white cloths and clay jars, orange cloth awnings, and a tall wooden entrance gate at the back-center that opens onto the street. The wedding at its happiest: Senbi and the bride together, musicians playing, guests dancing, banners and flowers swaying lightly in the breeze, warm sunlight. Camera: wide shot of the whole courtyard at eye level; fixed except for an almost imperceptible 5% slow push-in, no tilt or pan. Audio: off-screen British male narrator, warm and dry, begins speaking within half a second and says: “For a few perfect minutes, everything was exactly right. Enjoy this part.” Music: light ancient-Mediterranean wedding music (frame drums, reed flute, plucked strings), same theme in every clip, low under the voice. Sound effects: applause, drums, wind in the banners. Final reminder: no character says any word; only the off-screen narrator speaks. Natural laughs, gasps and sighs are fine. No text, captions or logos in the frame.</w:t>
       </w:r>
     </w:p>
     <w:p>
@@ -1771,7 +1789,7 @@
           <w:sz w:val="20"/>
           <w:szCs w:val="20"/>
         </w:rPr>
-        <w:t xml:space="preserve">ABSOLUTE RULE: only the off-screen narrator has a voice. No character on screen speaks, talks, shouts, whispers, sings or lip-syncs, and no character voices or crowd voices are heard. Characters act only with facial expressions, eye movements and body and hand gestures; their mouths may move silently for a smile, laugh or gasp, with no sound. Attached reference images, in order: the wedding courtyard. 2D hand-drawn stickman cartoon in the exact style of the reference images: thin black outlines, large expressive heads, thin stick arms, flat warm colors, playful documentary-comedy tone, 16:9. Setting: sunny daytime wedding courtyard in ancient Alexandria, sandstone columns with painted blue-and-gold bands, long tables with white cloths and clay jars, orange cloth awnings, and a tall wooden entrance gate at the back-center that opens onto the street. A small clay cup on a wedding table trembles slightly, as if from distant footsteps. Out-of-focus guests dance behind it, unaware. Camera: locked-off and perfectly still, extreme close-up of the cup; only the cup vibrates, the camera does not; the framing never changes (no tilt, pan, zoom or rising camera). Audio: off-screen British male narrator, warm and dry, begins speaking within half a second and says: “Then a small cup on the table began to tremble. Nobody noticed.” Music: light ancient-Mediterranean wedding music (frame drums, reed flute, plucked strings) with a faint uneasy undertone, same theme in every clip, low under the voice. Sound effects: ceramic cup rattling, faint rumble. Characters keep their exact reference designs. Final reminder: no character speaks or makes any voice sound; only the off-screen narrator speaks. No text, captions or logos in the frame.</w:t>
+        <w:t xml:space="preserve">VOICE RULE: only the off-screen narrator speaks words. No character says any word and no one on screen lip-syncs to speech; characters communicate with facial expressions and body gestures. Natural non-verbal sounds are allowed and should sound real: laughing, giggling, gasping, sighing, groaning, cheering, coughing. Attached reference images, in order: the wedding courtyard. 2D hand-drawn stickman cartoon in the exact style of the reference images: thin black outlines, large expressive heads, thin stick arms, flat warm colors, playful documentary-comedy tone, 16:9. Characters, identical in every frame: the guests: Egyptian wedding guests in white linen with blue-and-gold collars and gold headbands, black bob hairstyles, some in white striped headdresses. Setting: sunny daytime wedding courtyard in ancient Alexandria, sandstone columns with painted blue-and-gold bands, long tables with white cloths and clay jars, orange cloth awnings, and a tall wooden entrance gate at the back-center that opens onto the street. A small clay cup on a wedding table trembles slightly, as if from distant footsteps. Out-of-focus guests dance behind it, unaware. Camera: locked-off and perfectly still, extreme close-up of the cup; only the cup vibrates, the camera does not; the framing never changes (no tilt, pan, zoom or rising camera). Audio: off-screen British male narrator, warm and dry, begins speaking within half a second and says: “Then a small cup on the table began to tremble. Nobody noticed.” Music: light ancient-Mediterranean wedding music (frame drums, reed flute, plucked strings) with a faint uneasy undertone, same theme in every clip, low under the voice. Sound effects: ceramic cup rattling, faint rumble. Final reminder: no character says any word; only the off-screen narrator speaks. Natural laughs, gasps and sighs are fine. No text, captions or logos in the frame.</w:t>
       </w:r>
     </w:p>
     <w:p>
@@ -1844,7 +1862,7 @@
           <w:sz w:val="20"/>
           <w:szCs w:val="20"/>
         </w:rPr>
-        <w:t xml:space="preserve">ABSOLUTE RULE: only the off-screen narrator has a voice. No character on screen speaks, talks, shouts, whispers, sings or lip-syncs, and no character voices or crowd voices are heard. Characters act only with facial expressions, eye movements and body and hand gestures; their mouths may move silently for a smile, laugh or gasp, with no sound. Attached reference images, in order: the Egyptian wedding guests, the wedding courtyard. 2D hand-drawn stickman cartoon in the exact style of the reference images: thin black outlines, large expressive heads, thin stick arms, flat warm colors, playful documentary-comedy tone, 16:9. Setting: sunny daytime wedding courtyard in ancient Alexandria, sandstone columns with painted blue-and-gold bands, long tables with white cloths and clay jars, orange cloth awnings, and a tall wooden entrance gate at the back-center that opens onto the street. An Egyptian musician suddenly stops playing and looks toward the open gate visible behind him; his joy turns to alertness. The dancers behind him keep dancing for one more beat. Camera: locked-off and perfectly still, eye-level medium shot of the musician with the entrance visible behind him; the framing never changes (no tilt, pan, zoom or rising camera). Audio: off-screen British male narrator, warm and dry, begins speaking within half a second and says: “The musician noticed. He stopped. Everyone else danced one more beat, blissfully unaware.” Music: music nearly silent. Sound effects: music and drums cut out, one drum stops. Characters keep their exact reference designs. Final reminder: no character speaks or makes any voice sound; only the off-screen narrator speaks. No text, captions or logos in the frame.</w:t>
+        <w:t xml:space="preserve">VOICE RULE: only the off-screen narrator speaks words. No character says any word and no one on screen lip-syncs to speech; characters communicate with facial expressions and body gestures. Natural non-verbal sounds are allowed and should sound real: laughing, giggling, gasping, sighing, groaning, cheering, coughing. Attached reference images, in order: the Egyptian wedding guests, the wedding courtyard. 2D hand-drawn stickman cartoon in the exact style of the reference images: thin black outlines, large expressive heads, thin stick arms, flat warm colors, playful documentary-comedy tone, 16:9. Characters, identical in every frame: the guests: Egyptian wedding guests in white linen with blue-and-gold collars and gold headbands, black bob hairstyles, some in white striped headdresses. the musicians: guests in white linen playing harp, frame drum and reed flute. Setting: sunny daytime wedding courtyard in ancient Alexandria, sandstone columns with painted blue-and-gold bands, long tables with white cloths and clay jars, orange cloth awnings, and a tall wooden entrance gate at the back-center that opens onto the street. An Egyptian musician suddenly stops playing and looks toward the open gate visible behind him; his joy turns to alertness. The dancers behind him keep dancing for one more beat. Camera: locked-off and perfectly still, eye-level medium shot of the musician with the entrance visible behind him; the framing never changes (no tilt, pan, zoom or rising camera). Audio: off-screen British male narrator, warm and dry, begins speaking within half a second and says: “The musician noticed. He stopped. Everyone else danced one more beat, blissfully unaware.” Music: music nearly silent. Sound effects: music and drums cut out, one drum stops. Final reminder: no character says any word; only the off-screen narrator speaks. Natural laughs, gasps and sighs are fine. No text, captions or logos in the frame.</w:t>
       </w:r>
     </w:p>
     <w:p>
@@ -1917,7 +1935,7 @@
           <w:sz w:val="20"/>
           <w:szCs w:val="20"/>
         </w:rPr>
-        <w:t xml:space="preserve">ABSOLUTE RULE: only the off-screen narrator has a voice. No character on screen speaks, talks, shouts, whispers, sings or lip-syncs, and no character voices or crowd voices are heard. Characters act only with facial expressions, eye movements and body and hand gestures; their mouths may move silently for a smile, laugh or gasp, with no sound. Attached reference image (use only for the art style and colors; do not copy its layout or characters): the Shot 1 courtyard frame. 2D hand-drawn stickman cartoon in the exact style of the reference images: thin black outlines, large expressive heads, thin stick arms, flat warm colors, playful documentary-comedy tone, 16:9. Setting: sunlit street of ancient Alexandria outside the wedding house, sandstone walls, palms, market stalls with red and blue awnings. The busy street goes quiet. Civilians notice something at the far end, step aside and clear the road. Nothing is visible yet except settling dust; show no soldiers even if the reference image contains some. Camera: locked-off and perfectly still, eye-level wide shot of the street; the framing never changes (no tilt, pan, zoom or rising camera). Audio: off-screen British male narrator, warm and dry, begins speaking within half a second and says: “Outside, the street went quiet. In a busy city, that's never good.” Music: low sustained tension with distant marching drums, almost silent. Sound effects: street ambience fading, distant boots. Characters keep their exact reference designs. Final reminder: no character speaks or makes any voice sound; only the off-screen narrator speaks. No text, captions or logos in the frame.</w:t>
+        <w:t xml:space="preserve">VOICE RULE: only the off-screen narrator speaks words. No character says any word and no one on screen lip-syncs to speech; characters communicate with facial expressions and body gestures. Natural non-verbal sounds are allowed and should sound real: laughing, giggling, gasping, sighing, groaning, cheering, coughing. Attached reference image (use only for the art style and colors; do not copy its layout or characters): the Shot 1 courtyard frame. 2D hand-drawn stickman cartoon in the exact style of the reference images: thin black outlines, large expressive heads, thin stick arms, flat warm colors, playful documentary-comedy tone, 16:9. Characters, identical in every frame: the Roman soldiers: crimson plumed helmets, steel armor, red cloaks, rectangular red shields. Setting: sunlit street of ancient Alexandria outside the wedding house, sandstone walls, palms, market stalls with red and blue awnings. The busy street goes quiet. Civilians notice something at the far end, step aside and clear the road. Nothing is visible yet except settling dust; show no soldiers even if the reference image contains some. Camera: locked-off and perfectly still, eye-level wide shot of the street; the framing never changes (no tilt, pan, zoom or rising camera). Audio: off-screen British male narrator, warm and dry, begins speaking within half a second and says: “Outside, the street went quiet. In a busy city, that's never good.” Music: low sustained tension with distant marching drums, almost silent. Sound effects: street ambience fading, distant boots. Final reminder: no character says any word; only the off-screen narrator speaks. Natural laughs, gasps and sighs are fine. No text, captions or logos in the frame.</w:t>
       </w:r>
     </w:p>
     <w:p>
@@ -1990,7 +2008,7 @@
           <w:sz w:val="20"/>
           <w:szCs w:val="20"/>
         </w:rPr>
-        <w:t xml:space="preserve">ABSOLUTE RULE: nobody speaks and no voice of any kind is heard in this clip; this is a sound-effects-only beat. Attached reference images, in order: the Roman soldiers. 2D hand-drawn stickman cartoon in the exact style of the reference images: thin black outlines, large expressive heads, thin stick arms, flat warm colors, playful documentary-comedy tone, 16:9. Setting: sunlit street of ancient Alexandria outside the wedding house, sandstone walls, palms, market stalls with red and blue awnings. At ground level, three heavy Roman boots step into the frame one after another from the side, kicking up a little dust. Only boots and lower legs are visible. Camera: locked-off and perfectly still, fixed ground-level frame on the street; the boots step into frame from the side and the camera never rises; the framing never changes (no tilt, pan, zoom or rising camera). Audio: no narration and no speech. Sound effects: heavy boot steps with metal clank. Music: low sustained tension with distant marching drums, almost silent. Characters keep their exact reference designs. Final reminder: no voice of any kind in this clip. No text, captions or logos in the frame.</w:t>
+        <w:t xml:space="preserve">VOICE RULE: nobody speaks and no voice of any kind is heard in this clip; it is a sound-effects-only beat. Attached reference images, in order: the Roman soldiers. 2D hand-drawn stickman cartoon in the exact style of the reference images: thin black outlines, large expressive heads, thin stick arms, flat warm colors, playful documentary-comedy tone, 16:9. Setting: sunlit street of ancient Alexandria outside the wedding house, sandstone walls, palms, market stalls with red and blue awnings. At ground level, three heavy Roman boots step into the frame one after another from the side, kicking up a little dust. Only boots and lower legs are visible. Camera: locked-off and perfectly still, fixed ground-level frame on the street; the boots step into frame from the side and the camera never rises; the framing never changes (no tilt, pan, zoom or rising camera). Audio: no narration and no speech. Sound effects: heavy boot steps with metal clank. Music: low sustained tension with distant marching drums, almost silent. Final reminder: no voice of any kind in this clip. No text, captions or logos in the frame.</w:t>
       </w:r>
     </w:p>
     <w:p>
@@ -2063,7 +2081,7 @@
           <w:sz w:val="20"/>
           <w:szCs w:val="20"/>
         </w:rPr>
-        <w:t xml:space="preserve">ABSOLUTE RULE: only the off-screen narrator has a voice. No character on screen speaks, talks, shouts, whispers, sings or lip-syncs, and no character voices or crowd voices are heard. Characters act only with facial expressions, eye movements and body and hand gestures; their mouths may move silently for a smile, laugh or gasp, with no sound. Attached reference images, in order: the Roman soldiers. 2D hand-drawn stickman cartoon in the exact style of the reference images: thin black outlines, large expressive heads, thin stick arms, flat warm colors, playful documentary-comedy tone, 16:9. Setting: sunlit street of ancient Alexandria outside the wedding house, sandstone walls, palms, market stalls with red and blue awnings. Several Roman soldiers appear as small silhouettes far away and march steadily toward the camera in formation; helmets and shields are recognizable but tiny. Camera: eye-level wide street view; fixed except for an almost imperceptible 5% slow push-in, no tilt or pan. Audio: off-screen British male narrator, warm and dry, begins speaking within half a second and says: “Clank. Clank. Clank. Marching men. Lots of them.” Music: low sustained tension with distant marching drums, almost silent. Sound effects: marching boots in rhythm, metal clinks. Characters keep their exact reference designs. Final reminder: no character speaks or makes any voice sound; only the off-screen narrator speaks. No text, captions or logos in the frame.</w:t>
+        <w:t xml:space="preserve">VOICE RULE: only the off-screen narrator speaks words. No character says any word and no one on screen lip-syncs to speech; characters communicate with facial expressions and body gestures. Natural non-verbal sounds are allowed and should sound real: laughing, giggling, gasping, sighing, groaning, cheering, coughing. Attached reference images, in order: the Roman soldiers. 2D hand-drawn stickman cartoon in the exact style of the reference images: thin black outlines, large expressive heads, thin stick arms, flat warm colors, playful documentary-comedy tone, 16:9. Characters, identical in every frame: the Roman soldiers: crimson plumed helmets, steel armor, red cloaks, rectangular red shields. Setting: sunlit street of ancient Alexandria outside the wedding house, sandstone walls, palms, market stalls with red and blue awnings. Several Roman soldiers appear as small silhouettes far away and march steadily toward the camera in formation; helmets and shields are recognizable but tiny. Camera: eye-level wide street view; fixed except for an almost imperceptible 5% slow push-in, no tilt or pan. Audio: off-screen British male narrator, warm and dry, begins speaking within half a second and says: “Clank. Clank. Clank. Marching men. Lots of them.” Music: low sustained tension with distant marching drums, almost silent. Sound effects: marching boots in rhythm, metal clinks. Final reminder: no character says any word; only the off-screen narrator speaks. Natural laughs, gasps and sighs are fine. No text, captions or logos in the frame.</w:t>
       </w:r>
     </w:p>
     <w:p>
@@ -2136,7 +2154,7 @@
           <w:sz w:val="20"/>
           <w:szCs w:val="20"/>
         </w:rPr>
-        <w:t xml:space="preserve">ABSOLUTE RULE: only the off-screen narrator has a voice. No character on screen speaks, talks, shouts, whispers, sings or lip-syncs, and no character voices or crowd voices are heard. Characters act only with facial expressions, eye movements and body and hand gestures; their mouths may move silently for a smile, laugh or gasp, with no sound. Attached reference images, in order: the wedding courtyard, Senbi, the groom, the bride. 2D hand-drawn stickman cartoon in the exact style of the reference images: thin black outlines, large expressive heads, thin stick arms, flat warm colors, playful documentary-comedy tone, 16:9. Setting: sunny daytime wedding courtyard in ancient Alexandria, sandstone columns with painted blue-and-gold bands, long tables with white cloths and clay jars, orange cloth awnings, and a tall wooden entrance gate at the back-center that opens onto the street. Guests dance and laugh; Senbi spins happily in the center, completely unaware. The open gate at the back stays calm. Camera: locked-off and perfectly still, eye-level medium-wide shot of the courtyard; the framing never changes (no tilt, pan, zoom or rising camera). Audio: off-screen British male narrator, warm and dry, begins speaking within half a second and says: “Inside, nobody had a clue. Senbi was busy spinning.” Music: light ancient-Mediterranean wedding music (frame drums, reed flute, plucked strings) with a faint uneasy undertone, same theme in every clip, low under the voice. Sound effects: wedding music muffled, faint thump. Characters keep their exact reference designs. Final reminder: no character speaks or makes any voice sound; only the off-screen narrator speaks. No text, captions or logos in the frame.</w:t>
+        <w:t xml:space="preserve">VOICE RULE: only the off-screen narrator speaks words. No character says any word and no one on screen lip-syncs to speech; characters communicate with facial expressions and body gestures. Natural non-verbal sounds are allowed and should sound real: laughing, giggling, gasping, sighing, groaning, cheering, coughing. Attached reference images, in order: the wedding courtyard, Senbi, the groom, the bride. 2D hand-drawn stickman cartoon in the exact style of the reference images: thin black outlines, large expressive heads, thin stick arms, flat warm colors, playful documentary-comedy tone, 16:9. Characters, identical in every frame: Senbi the groom: young man, straight black bowl-cut hair with bangs, gold headband with a gold cobra, bare chest, blue-and-gold broad collar, gold bracers, white kilt with a blue-and-gold sash, brown sandals, thin black stick arms. Setting: sunny daytime wedding courtyard in ancient Alexandria, sandstone columns with painted blue-and-gold bands, long tables with white cloths and clay jars, orange cloth awnings, and a tall wooden entrance gate at the back-center that opens onto the street. Guests dance and laugh; Senbi spins happily in the center, completely unaware. The open gate at the back stays calm. Camera: locked-off and perfectly still, eye-level medium-wide shot of the courtyard; the framing never changes (no tilt, pan, zoom or rising camera). Audio: off-screen British male narrator, warm and dry, begins speaking within half a second and says: “Inside, nobody had a clue. Senbi was busy spinning.” Music: light ancient-Mediterranean wedding music (frame drums, reed flute, plucked strings) with a faint uneasy undertone, same theme in every clip, low under the voice. Sound effects: wedding music muffled, faint thump. Final reminder: no character says any word; only the off-screen narrator speaks. Natural laughs, gasps and sighs are fine. No text, captions or logos in the frame.</w:t>
       </w:r>
     </w:p>
     <w:p>
@@ -2209,7 +2227,7 @@
           <w:sz w:val="20"/>
           <w:szCs w:val="20"/>
         </w:rPr>
-        <w:t xml:space="preserve">ABSOLUTE RULE: only the off-screen narrator has a voice. No character on screen speaks, talks, shouts, whispers, sings or lip-syncs, and no character voices or crowd voices are heard. Characters act only with facial expressions, eye movements and body and hand gestures; their mouths may move silently for a smile, laugh or gasp, with no sound. Attached reference images, in order: the Roman soldiers. 2D hand-drawn stickman cartoon in the exact style of the reference images: thin black outlines, large expressive heads, thin stick arms, flat warm colors, playful documentary-comedy tone, 16:9. Setting: sunlit street of ancient Alexandria outside the wedding house, sandstone walls, palms, market stalls with red and blue awnings. Two tired, dusty Roman legionaries walk into the street in front of the wedding house, shields and spears in hand. They stop and look around, confused rather than menacing. Camera: locked-off and perfectly still, eye-level medium-wide shot of the street; the soldiers walk into the frame; the framing never changes (no tilt, pan, zoom or rising camera). Audio: off-screen British male narrator, warm and dry, begins speaking within half a second and says: “And then Rome arrived. Tired, dusty, and looking for the right address.” Music: low sustained tension with distant marching drums, almost silent. Sound effects: armor clank, dust, tired footsteps. Characters keep their exact reference designs. Final reminder: no character speaks or makes any voice sound; only the off-screen narrator speaks. No text, captions or logos in the frame.</w:t>
+        <w:t xml:space="preserve">VOICE RULE: only the off-screen narrator speaks words. No character says any word and no one on screen lip-syncs to speech; characters communicate with facial expressions and body gestures. Natural non-verbal sounds are allowed and should sound real: laughing, giggling, gasping, sighing, groaning, cheering, coughing. Attached reference images, in order: the Roman soldiers. 2D hand-drawn stickman cartoon in the exact style of the reference images: thin black outlines, large expressive heads, thin stick arms, flat warm colors, playful documentary-comedy tone, 16:9. Characters, identical in every frame: the Roman soldiers: crimson plumed helmets, steel armor, red cloaks, rectangular red shields. Setting: sunlit street of ancient Alexandria outside the wedding house, sandstone walls, palms, market stalls with red and blue awnings. Two tired, dusty Roman legionaries walk into the street in front of the wedding house, shields and spears in hand. They stop and look around, confused rather than menacing. Camera: locked-off and perfectly still, eye-level medium-wide shot of the street; the soldiers walk into the frame; the framing never changes (no tilt, pan, zoom or rising camera). Audio: off-screen British male narrator, warm and dry, begins speaking within half a second and says: “And then Rome arrived. Tired, dusty, and looking for the right address.” Music: low sustained tension with distant marching drums, almost silent. Sound effects: armor clank, dust, a tired sigh. Final reminder: no character says any word; only the off-screen narrator speaks. Natural laughs, gasps and sighs are fine. No text, captions or logos in the frame.</w:t>
       </w:r>
     </w:p>
     <w:p>
@@ -2282,7 +2300,7 @@
           <w:sz w:val="20"/>
           <w:szCs w:val="20"/>
         </w:rPr>
-        <w:t xml:space="preserve">ABSOLUTE RULE: only the off-screen narrator has a voice. No character on screen speaks, talks, shouts, whispers, sings or lip-syncs, and no character voices or crowd voices are heard. Characters act only with facial expressions, eye movements and body and hand gestures; their mouths may move silently for a smile, laugh or gasp, with no sound. Attached reference images, in order: the Egyptian wedding guests, the Roman soldiers, the wedding courtyard. 2D hand-drawn stickman cartoon in the exact style of the reference images: thin black outlines, large expressive heads, thin stick arms, flat warm colors, playful documentary-comedy tone, 16:9. Setting: sunlit street of ancient Alexandria outside the wedding house, sandstone walls, palms, market stalls with red and blue awnings. Three guests peek out of the doorway at the same time: one frightened, one confused, one grinning as if the soldiers are the entertainment. Camera: locked-off and perfectly still, eye-level medium-wide shot of the doorway with all three guests peeking in the same frame; the framing never changes (no tilt, pan, zoom or rising camera). Audio: off-screen British male narrator, warm and dry, begins speaking within half a second and says: “The guests peeked out. One terrified. One confused. One assumed it was entertainment.” Music: music nearly silent. Sound effects: tense silence, a few cloth rustles. Characters keep their exact reference designs. Final reminder: no character speaks or makes any voice sound; only the off-screen narrator speaks. No text, captions or logos in the frame.</w:t>
+        <w:t xml:space="preserve">VOICE RULE: only the off-screen narrator speaks words. No character says any word and no one on screen lip-syncs to speech; characters communicate with facial expressions and body gestures. Natural non-verbal sounds are allowed and should sound real: laughing, giggling, gasping, sighing, groaning, cheering, coughing. Attached reference images, in order: the Egyptian wedding guests, the Roman soldiers, the wedding courtyard. 2D hand-drawn stickman cartoon in the exact style of the reference images: thin black outlines, large expressive heads, thin stick arms, flat warm colors, playful documentary-comedy tone, 16:9. Characters, identical in every frame: the Roman soldiers: crimson plumed helmets, steel armor, red cloaks, rectangular red shields. the guests: Egyptian wedding guests in white linen with blue-and-gold collars and gold headbands, black bob hairstyles, some in white striped headdresses. Setting: sunlit street of ancient Alexandria outside the wedding house, sandstone walls, palms, market stalls with red and blue awnings. Three guests peek out of the doorway at the same time: one frightened, one confused, one grinning as if the soldiers are the entertainment. Camera: locked-off and perfectly still, eye-level medium-wide shot of the doorway with all three guests peeking in the same frame; the framing never changes (no tilt, pan, zoom or rising camera). Audio: off-screen British male narrator, warm and dry, begins speaking within half a second and says: “The guests peeked out. One terrified. One confused. One assumed it was entertainment.” Music: music nearly silent. Sound effects: nervous coughs and gasps, no words. Final reminder: no character says any word; only the off-screen narrator speaks. Natural laughs, gasps and sighs are fine. No text, captions or logos in the frame.</w:t>
       </w:r>
     </w:p>
     <w:p>
@@ -2355,7 +2373,7 @@
           <w:sz w:val="20"/>
           <w:szCs w:val="20"/>
         </w:rPr>
-        <w:t xml:space="preserve">ABSOLUTE RULE: only the off-screen narrator has a voice. No character on screen speaks, talks, shouts, whispers, sings or lip-syncs, and no character voices or crowd voices are heard. Characters act only with facial expressions, eye movements and body and hand gestures; their mouths may move silently for a smile, laugh or gasp, with no sound. Attached reference images, in order: the bride's relatives, the Roman soldiers, the wedding courtyard. 2D hand-drawn stickman cartoon in the exact style of the reference images: thin black outlines, large expressive heads, thin stick arms, flat warm colors, playful documentary-comedy tone, 16:9. Setting: sunlit street of ancient Alexandria outside the wedding house, sandstone walls, palms, market stalls with red and blue awnings. A cheerful, slightly tipsy older uncle grabs a clay beer cup and walks confidently across the frame toward the Roman soldiers, as if greeting ordinary guests. Camera: locked-off and perfectly still, eye-level medium-wide shot; the uncle walks across the frame; the framing never changes (no tilt, pan, zoom or rising camera). Audio: off-screen British male narrator, warm and dry, begins speaking within half a second and says: “Then one uncle, a man with absolutely no fear, grabbed a beer.” Music: playful comic percussion over the wedding rhythm, low under the voice. Sound effects: cup clink. Characters keep their exact reference designs. Final reminder: no character speaks or makes any voice sound; only the off-screen narrator speaks. No text, captions or logos in the frame.</w:t>
+        <w:t xml:space="preserve">VOICE RULE: only the off-screen narrator speaks words. No character says any word and no one on screen lip-syncs to speech; characters communicate with facial expressions and body gestures. Natural non-verbal sounds are allowed and should sound real: laughing, giggling, gasping, sighing, groaning, cheering, coughing. Attached reference images, in order: the bride's relatives, the Roman soldiers, the wedding courtyard. 2D hand-drawn stickman cartoon in the exact style of the reference images: thin black outlines, large expressive heads, thin stick arms, flat warm colors, playful documentary-comedy tone, 16:9. Characters, identical in every frame: the Roman soldiers: crimson plumed helmets, steel armor, red cloaks, rectangular red shields. the guests: Egyptian wedding guests in white linen with blue-and-gold collars and gold headbands, black bob hairstyles, some in white striped headdresses. the uncle: cheerful bearded middle-aged man in plain white linen. Setting: sunlit street of ancient Alexandria outside the wedding house, sandstone walls, palms, market stalls with red and blue awnings. A cheerful, slightly tipsy older uncle grabs a clay beer cup and walks confidently across the frame toward the Roman soldiers, as if greeting ordinary guests. Camera: locked-off and perfectly still, eye-level medium-wide shot; the uncle walks across the frame; the framing never changes (no tilt, pan, zoom or rising camera). Audio: off-screen British male narrator, warm and dry, begins speaking within half a second and says: “Then one uncle, a man with absolutely no fear, grabbed a beer.” Music: playful comic percussion over the wedding rhythm, low under the voice. Sound effects: cup clink. Final reminder: no character says any word; only the off-screen narrator speaks. Natural laughs, gasps and sighs are fine. No text, captions or logos in the frame.</w:t>
       </w:r>
     </w:p>
     <w:p>
@@ -2428,7 +2446,7 @@
           <w:sz w:val="20"/>
           <w:szCs w:val="20"/>
         </w:rPr>
-        <w:t xml:space="preserve">ABSOLUTE RULE: only the off-screen narrator has a voice. No character on screen speaks, talks, shouts, whispers, sings or lip-syncs, and no character voices or crowd voices are heard. Characters act only with facial expressions, eye movements and body and hand gestures; their mouths may move silently for a smile, laugh or gasp, with no sound. Attached reference images, in order: the bride's relatives, the Roman soldiers. 2D hand-drawn stickman cartoon in the exact style of the reference images: thin black outlines, large expressive heads, thin stick arms, flat warm colors, playful documentary-comedy tone, 16:9. Setting: sunlit street of ancient Alexandria outside the wedding house, sandstone walls, palms, market stalls with red and blue awnings. The uncle offers the cup with a big smile. A Roman soldier looks at the cup, then at the uncle, and does not move. Camera: locked-off and perfectly still, eye-level medium two-shot; the framing never changes (no tilt, pan, zoom or rising camera). Audio: off-screen British male narrator, warm and dry, begins speaking within half a second and says: “He offered it to a Roman. As if it were completely normal.” Music: music nearly silent. Sound effects: cup clink, awkward silence. Characters keep their exact reference designs. Final reminder: no character speaks or makes any voice sound; only the off-screen narrator speaks. No text, captions or logos in the frame.</w:t>
+        <w:t xml:space="preserve">VOICE RULE: only the off-screen narrator speaks words. No character says any word and no one on screen lip-syncs to speech; characters communicate with facial expressions and body gestures. Natural non-verbal sounds are allowed and should sound real: laughing, giggling, gasping, sighing, groaning, cheering, coughing. Attached reference images, in order: the bride's relatives, the Roman soldiers. 2D hand-drawn stickman cartoon in the exact style of the reference images: thin black outlines, large expressive heads, thin stick arms, flat warm colors, playful documentary-comedy tone, 16:9. Characters, identical in every frame: the Roman soldiers: crimson plumed helmets, steel armor, red cloaks, rectangular red shields. the uncle: cheerful bearded middle-aged man in plain white linen. Setting: sunlit street of ancient Alexandria outside the wedding house, sandstone walls, palms, market stalls with red and blue awnings. The uncle offers the cup with a big smile. A Roman soldier looks at the cup, then at the uncle, and does not move. Camera: locked-off and perfectly still, eye-level medium two-shot; the framing never changes (no tilt, pan, zoom or rising camera). Audio: off-screen British male narrator, warm and dry, begins speaking within half a second and says: “He offered it to a Roman. As if it were completely normal.” Music: music nearly silent. Sound effects: cup clink, awkward silence. Final reminder: no character says any word; only the off-screen narrator speaks. Natural laughs, gasps and sighs are fine. No text, captions or logos in the frame.</w:t>
       </w:r>
     </w:p>
     <w:p>
@@ -2501,7 +2519,7 @@
           <w:sz w:val="20"/>
           <w:szCs w:val="20"/>
         </w:rPr>
-        <w:t xml:space="preserve">ABSOLUTE RULE: only the off-screen narrator has a voice. No character on screen speaks, talks, shouts, whispers, sings or lip-syncs, and no character voices or crowd voices are heard. Characters act only with facial expressions, eye movements and body and hand gestures; their mouths may move silently for a smile, laugh or gasp, with no sound. Attached reference images, in order: the Roman soldiers. 2D hand-drawn stickman cartoon in the exact style of the reference images: thin black outlines, large expressive heads, thin stick arms, flat warm colors, playful documentary-comedy tone, 16:9. Setting: sunlit street of ancient Alexandria outside the wedding house, sandstone walls, palms, market stalls with red and blue awnings. Close-up of the Roman soldier's confused face. He looks from the cup to the smiling uncle, cautiously takes the cup, and his eyes slide sideways toward his comrades. Camera: eye-level medium close-up of the soldier; fixed except for an almost imperceptible 5% slow push-in, no tilt or pan. Audio: off-screen British male narrator, warm and dry, begins speaking within half a second and says: “The soldier stared at the cup, then the uncle. A trap? Or hospitality?” Music: music nearly silent. Sound effects: tiny gulp. Characters keep their exact reference designs. Final reminder: no character speaks or makes any voice sound; only the off-screen narrator speaks. No text, captions or logos in the frame.</w:t>
+        <w:t xml:space="preserve">VOICE RULE: only the off-screen narrator speaks words. No character says any word and no one on screen lip-syncs to speech; characters communicate with facial expressions and body gestures. Natural non-verbal sounds are allowed and should sound real: laughing, giggling, gasping, sighing, groaning, cheering, coughing. Attached reference images, in order: the Roman soldiers. 2D hand-drawn stickman cartoon in the exact style of the reference images: thin black outlines, large expressive heads, thin stick arms, flat warm colors, playful documentary-comedy tone, 16:9. Characters, identical in every frame: the Roman soldiers: crimson plumed helmets, steel armor, red cloaks, rectangular red shields. the uncle: cheerful bearded middle-aged man in plain white linen. Setting: sunlit street of ancient Alexandria outside the wedding house, sandstone walls, palms, market stalls with red and blue awnings. Close-up of the Roman soldier's confused face. He looks from the cup to the smiling uncle, cautiously takes the cup, and his eyes slide sideways toward his comrades. Camera: eye-level medium close-up of the soldier; fixed except for an almost imperceptible 5% slow push-in, no tilt or pan. Audio: off-screen British male narrator, warm and dry, begins speaking within half a second and says: “The soldier stared at the cup, then the uncle. A trap? Or hospitality?” Music: music nearly silent. Sound effects: tiny gulp, uneasy hum. Final reminder: no character says any word; only the off-screen narrator speaks. Natural laughs, gasps and sighs are fine. No text, captions or logos in the frame.</w:t>
       </w:r>
     </w:p>
     <w:p>
@@ -2574,7 +2592,7 @@
           <w:sz w:val="20"/>
           <w:szCs w:val="20"/>
         </w:rPr>
-        <w:t xml:space="preserve">ABSOLUTE RULE: only the off-screen narrator has a voice. No character on screen speaks, talks, shouts, whispers, sings or lip-syncs, and no character voices or crowd voices are heard. Characters act only with facial expressions, eye movements and body and hand gestures; their mouths may move silently for a smile, laugh or gasp, with no sound. Attached reference images, in order: the Roman soldiers, the wedding courtyard. 2D hand-drawn stickman cartoon in the exact style of the reference images: thin black outlines, large expressive heads, thin stick arms, flat warm colors, playful documentary-comedy tone, 16:9. Setting: sunny daytime wedding courtyard in ancient Alexandria, sandstone columns with painted blue-and-gold bands, long tables with white cloths and clay jars, orange cloth awnings, and a tall wooden entrance gate at the back-center that opens onto the street. Two Roman soldiers in the foreground, the feast table with roast goose, bread and fruit behind them. Their serious faces soften as they turn their heads toward the food; one leans slightly forward. Camera: locked-off and perfectly still, eye-level wide-medium shot: the soldiers in the foreground, the feast table behind them; they turn their heads toward it; the framing never changes (no tilt, pan, zoom or rising camera). Audio: off-screen British male narrator, warm and dry, begins speaking within half a second and says: “Then the Romans saw the food. Military discipline lasted about four seconds.” Music: playful comic percussion over the wedding rhythm, low under the voice. Sound effects: stomach growl. Characters keep their exact reference designs. Final reminder: no character speaks or makes any voice sound; only the off-screen narrator speaks. No text, captions or logos in the frame.</w:t>
+        <w:t xml:space="preserve">VOICE RULE: only the off-screen narrator speaks words. No character says any word and no one on screen lip-syncs to speech; characters communicate with facial expressions and body gestures. Natural non-verbal sounds are allowed and should sound real: laughing, giggling, gasping, sighing, groaning, cheering, coughing. Attached reference images, in order: the Roman soldiers, the wedding courtyard. 2D hand-drawn stickman cartoon in the exact style of the reference images: thin black outlines, large expressive heads, thin stick arms, flat warm colors, playful documentary-comedy tone, 16:9. Characters, identical in every frame: the Roman soldiers: crimson plumed helmets, steel armor, red cloaks, rectangular red shields. Setting: sunny daytime wedding courtyard in ancient Alexandria, sandstone columns with painted blue-and-gold bands, long tables with white cloths and clay jars, orange cloth awnings, and a tall wooden entrance gate at the back-center that opens onto the street. Two Roman soldiers in the foreground, the feast table with roast goose, bread and fruit behind them. Their serious faces soften as they turn their heads toward the food; one leans slightly forward. Camera: locked-off and perfectly still, eye-level wide-medium shot: the soldiers in the foreground, the feast table behind them; they turn their heads toward it; the framing never changes (no tilt, pan, zoom or rising camera). Audio: off-screen British male narrator, warm and dry, begins speaking within half a second and says: “Then the Romans saw the food. Military discipline lasted about four seconds.” Music: playful comic percussion over the wedding rhythm, low under the voice. Sound effects: stomach growl, sniff. Final reminder: no character says any word; only the off-screen narrator speaks. Natural laughs, gasps and sighs are fine. No text, captions or logos in the frame.</w:t>
       </w:r>
     </w:p>
     <w:p>
@@ -2647,7 +2665,7 @@
           <w:sz w:val="20"/>
           <w:szCs w:val="20"/>
         </w:rPr>
-        <w:t xml:space="preserve">ABSOLUTE RULE: only the off-screen narrator has a voice. No character on screen speaks, talks, shouts, whispers, sings or lip-syncs, and no character voices or crowd voices are heard. Characters act only with facial expressions, eye movements and body and hand gestures; their mouths may move silently for a smile, laugh or gasp, with no sound. Attached reference images, in order: the Roman soldiers, the Egyptian wedding guests, the wedding courtyard. 2D hand-drawn stickman cartoon in the exact style of the reference images: thin black outlines, large expressive heads, thin stick arms, flat warm colors, playful documentary-comedy tone, 16:9. Setting: sunny daytime wedding courtyard in ancient Alexandria, sandstone columns with painted blue-and-gold bands, long tables with white cloths and clay jars, orange cloth awnings, and a tall wooden entrance gate at the back-center that opens onto the street. One Roman soldier steps awkwardly onto the dance floor. The Egyptian guests stare in silence. Then one guest begins to copy his stiff step. Camera: locked-off and perfectly still, eye-level wide shot; the framing never changes (no tilt, pan, zoom or rising camera). Audio: off-screen British male narrator, warm and dry, begins speaking within half a second and says: “One soldier stepped into the dance. Nobody stopped him. Somehow, it worked.” Music: playful comic percussion over the wedding rhythm, low under the voice. Sound effects: shield tap blending into the rhythm, clapping. Characters keep their exact reference designs. Final reminder: no character speaks or makes any voice sound; only the off-screen narrator speaks. No text, captions or logos in the frame.</w:t>
+        <w:t xml:space="preserve">VOICE RULE: only the off-screen narrator speaks words. No character says any word and no one on screen lip-syncs to speech; characters communicate with facial expressions and body gestures. Natural non-verbal sounds are allowed and should sound real: laughing, giggling, gasping, sighing, groaning, cheering, coughing. Attached reference images, in order: the Roman soldiers, the Egyptian wedding guests, the wedding courtyard. 2D hand-drawn stickman cartoon in the exact style of the reference images: thin black outlines, large expressive heads, thin stick arms, flat warm colors, playful documentary-comedy tone, 16:9. Characters, identical in every frame: the Roman soldiers: crimson plumed helmets, steel armor, red cloaks, rectangular red shields. the guests: Egyptian wedding guests in white linen with blue-and-gold collars and gold headbands, black bob hairstyles, some in white striped headdresses. Setting: sunny daytime wedding courtyard in ancient Alexandria, sandstone columns with painted blue-and-gold bands, long tables with white cloths and clay jars, orange cloth awnings, and a tall wooden entrance gate at the back-center that opens onto the street. One Roman soldier steps awkwardly onto the dance floor. The Egyptian guests stare in silence. Then one guest begins to copy his stiff step. Camera: locked-off and perfectly still, eye-level wide shot; the framing never changes (no tilt, pan, zoom or rising camera). Audio: off-screen British male narrator, warm and dry, begins speaking within half a second and says: “One soldier stepped into the dance. Nobody stopped him. Somehow, it worked.” Music: playful comic percussion over the wedding rhythm, low under the voice. Sound effects: shield tap blending into the rhythm, clapping. Final reminder: no character says any word; only the off-screen narrator speaks. Natural laughs, gasps and sighs are fine. No text, captions or logos in the frame.</w:t>
       </w:r>
     </w:p>
     <w:p>
@@ -2720,7 +2738,7 @@
           <w:sz w:val="20"/>
           <w:szCs w:val="20"/>
         </w:rPr>
-        <w:t xml:space="preserve">ABSOLUTE RULE: only the off-screen narrator has a voice. No character on screen speaks, talks, shouts, whispers, sings or lip-syncs, and no character voices or crowd voices are heard. Characters act only with facial expressions, eye movements and body and hand gestures; their mouths may move silently for a smile, laugh or gasp, with no sound. Attached reference images, in order: the Roman soldiers, the Egyptian wedding guests, the wedding courtyard. 2D hand-drawn stickman cartoon in the exact style of the reference images: thin black outlines, large expressive heads, thin stick arms, flat warm colors, playful documentary-comedy tone, 16:9. Setting: sunny daytime wedding courtyard in ancient Alexandria, sandstone columns with painted blue-and-gold bands, long tables with white cloths and clay jars, orange cloth awnings, and a tall wooden entrance gate at the back-center that opens onto the street. Three Roman soldiers in full armor attempt the Egyptian dance, stiff but strangely synchronized, capes swaying; Egyptian dancers around them smile and clap. Camera: locked-off and perfectly still, eye-level wide shot of the dancing Romans; the framing never changes (no tilt, pan, zoom or rising camera). Audio: off-screen British male narrator, warm and dry, begins speaking within half a second and says: “Roman engineering changed the world. Roman dancing did not.” Music: playful comic percussion over the wedding rhythm, low under the voice. Sound effects: armor clanking out of rhythm. Characters keep their exact reference designs. Final reminder: no character speaks or makes any voice sound; only the off-screen narrator speaks. No text, captions or logos in the frame.</w:t>
+        <w:t xml:space="preserve">VOICE RULE: only the off-screen narrator speaks words. No character says any word and no one on screen lip-syncs to speech; characters communicate with facial expressions and body gestures. Natural non-verbal sounds are allowed and should sound real: laughing, giggling, gasping, sighing, groaning, cheering, coughing. Attached reference images, in order: the Roman soldiers, the Egyptian wedding guests, the wedding courtyard. 2D hand-drawn stickman cartoon in the exact style of the reference images: thin black outlines, large expressive heads, thin stick arms, flat warm colors, playful documentary-comedy tone, 16:9. Characters, identical in every frame: the Roman soldiers: crimson plumed helmets, steel armor, red cloaks, rectangular red shields. the guests: Egyptian wedding guests in white linen with blue-and-gold collars and gold headbands, black bob hairstyles, some in white striped headdresses. Setting: sunny daytime wedding courtyard in ancient Alexandria, sandstone columns with painted blue-and-gold bands, long tables with white cloths and clay jars, orange cloth awnings, and a tall wooden entrance gate at the back-center that opens onto the street. Three Roman soldiers in full armor attempt the Egyptian dance, stiff but strangely synchronized, capes swaying; Egyptian dancers around them smile and clap. Camera: locked-off and perfectly still, eye-level wide shot of the dancing Romans; the framing never changes (no tilt, pan, zoom or rising camera). Audio: off-screen British male narrator, warm and dry, begins speaking within half a second and says: “Roman engineering changed the world. Roman dancing did not.” Music: playful comic percussion over the wedding rhythm, low under the voice. Sound effects: armor clanking out of rhythm. Final reminder: no character says any word; only the off-screen narrator speaks. Natural laughs, gasps and sighs are fine. No text, captions or logos in the frame.</w:t>
       </w:r>
     </w:p>
     <w:p>
@@ -2793,7 +2811,7 @@
           <w:sz w:val="20"/>
           <w:szCs w:val="20"/>
         </w:rPr>
-        <w:t xml:space="preserve">ABSOLUTE RULE: only the off-screen narrator has a voice. No character on screen speaks, talks, shouts, whispers, sings or lip-syncs, and no character voices or crowd voices are heard. Characters act only with facial expressions, eye movements and body and hand gestures; their mouths may move silently for a smile, laugh or gasp, with no sound. Attached reference images, in order: Senbi, the groom, the Roman soldiers, the wedding courtyard. 2D hand-drawn stickman cartoon in the exact style of the reference images: thin black outlines, large expressive heads, thin stick arms, flat warm colors, playful documentary-comedy tone, 16:9. Setting: sunny daytime wedding courtyard in ancient Alexandria, sandstone columns with painted blue-and-gold bands, long tables with white cloths and clay jars, orange cloth awnings, and a tall wooden entrance gate at the back-center that opens onto the street. Senbi dances proudly beside a Roman soldier and gestures for him to follow. The soldier hesitates, then copies Senbi's arm movement. Camera: locked-off and perfectly still, eye-level medium two-shot; the framing never changes (no tilt, pan, zoom or rising camera). Audio: off-screen British male narrator, warm and dry, begins speaking within half a second and says: “Senbi, ever the host, invited one to join. Of course he did.” Music: playful comic percussion over the wedding rhythm, low under the voice. Sound effects: hand claps. Characters keep their exact reference designs. Final reminder: no character speaks or makes any voice sound; only the off-screen narrator speaks. No text, captions or logos in the frame.</w:t>
+        <w:t xml:space="preserve">VOICE RULE: only the off-screen narrator speaks words. No character says any word and no one on screen lip-syncs to speech; characters communicate with facial expressions and body gestures. Natural non-verbal sounds are allowed and should sound real: laughing, giggling, gasping, sighing, groaning, cheering, coughing. Attached reference images, in order: Senbi, the groom, the Roman soldiers, the wedding courtyard. 2D hand-drawn stickman cartoon in the exact style of the reference images: thin black outlines, large expressive heads, thin stick arms, flat warm colors, playful documentary-comedy tone, 16:9. Characters, identical in every frame: Senbi the groom: young man, straight black bowl-cut hair with bangs, gold headband with a gold cobra, bare chest, blue-and-gold broad collar, gold bracers, white kilt with a blue-and-gold sash, brown sandals, thin black stick arms. the Roman soldiers: crimson plumed helmets, steel armor, red cloaks, rectangular red shields. Setting: sunny daytime wedding courtyard in ancient Alexandria, sandstone columns with painted blue-and-gold bands, long tables with white cloths and clay jars, orange cloth awnings, and a tall wooden entrance gate at the back-center that opens onto the street. Senbi dances proudly beside a Roman soldier and gestures for him to follow. The soldier hesitates, then copies Senbi's arm movement. Camera: locked-off and perfectly still, eye-level medium two-shot; the framing never changes (no tilt, pan, zoom or rising camera). Audio: off-screen British male narrator, warm and dry, begins speaking within half a second and says: “Senbi, ever the host, invited one to join. Of course he did.” Music: playful comic percussion over the wedding rhythm, low under the voice. Sound effects: laughter, hand claps. Final reminder: no character says any word; only the off-screen narrator speaks. Natural laughs, gasps and sighs are fine. No text, captions or logos in the frame.</w:t>
       </w:r>
     </w:p>
     <w:p>
@@ -2866,7 +2884,7 @@
           <w:sz w:val="20"/>
           <w:szCs w:val="20"/>
         </w:rPr>
-        <w:t xml:space="preserve">ABSOLUTE RULE: only the off-screen narrator has a voice. No character on screen speaks, talks, shouts, whispers, sings or lip-syncs, and no character voices or crowd voices are heard. Characters act only with facial expressions, eye movements and body and hand gestures; their mouths may move silently for a smile, laugh or gasp, with no sound. Attached reference images, in order: the bride, Senbi, the groom, the Roman soldiers. 2D hand-drawn stickman cartoon in the exact style of the reference images: thin black outlines, large expressive heads, thin stick arms, flat warm colors, playful documentary-comedy tone, 16:9. Setting: sunny daytime wedding courtyard in ancient Alexandria, sandstone columns with painted blue-and-gold bands, long tables with white cloths and clay jars, orange cloth awnings, and a tall wooden entrance gate at the back-center that opens onto the street. The bride watches Senbi dancing with the Romans. She slowly covers her face with her hand. Camera: locked-off and perfectly still, eye-level medium close-up of the bride; the framing never changes (no tilt, pan, zoom or rising camera). Audio: off-screen British male narrator, warm and dry, begins speaking within half a second and says: “His bride slowly covered her face. This was not in the contract.” Music: playful comic percussion over the wedding rhythm, low under the voice. Sound effects: cloth rustle. Characters keep their exact reference designs. Final reminder: no character speaks or makes any voice sound; only the off-screen narrator speaks. No text, captions or logos in the frame.</w:t>
+        <w:t xml:space="preserve">VOICE RULE: only the off-screen narrator speaks words. No character says any word and no one on screen lip-syncs to speech; characters communicate with facial expressions and body gestures. Natural non-verbal sounds are allowed and should sound real: laughing, giggling, gasping, sighing, groaning, cheering, coughing. Attached reference images, in order: the bride, Senbi, the groom, the Roman soldiers. 2D hand-drawn stickman cartoon in the exact style of the reference images: thin black outlines, large expressive heads, thin stick arms, flat warm colors, playful documentary-comedy tone, 16:9. Characters, identical in every frame: Senbi the groom: young man, straight black bowl-cut hair with bangs, gold headband with a gold cobra, bare chest, blue-and-gold broad collar, gold bracers, white kilt with a blue-and-gold sash, brown sandals, thin black stick arms. the bride: black bob hair with straight bangs, gold headband with a red gem, white dress, blue-and-gold collar, gold sash, gold arm cuffs, light veil. the Roman soldiers: crimson plumed helmets, steel armor, red cloaks, rectangular red shields. Setting: sunny daytime wedding courtyard in ancient Alexandria, sandstone columns with painted blue-and-gold bands, long tables with white cloths and clay jars, orange cloth awnings, and a tall wooden entrance gate at the back-center that opens onto the street. The bride watches Senbi dancing with the Romans. She slowly covers her face with her hand. Camera: locked-off and perfectly still, eye-level medium close-up of the bride; the framing never changes (no tilt, pan, zoom or rising camera). Audio: off-screen British male narrator, warm and dry, begins speaking within half a second and says: “His bride slowly covered her face. This was not in the contract.” Music: playful comic percussion over the wedding rhythm, low under the voice. Sound effects: gasp, muffled laugh. Final reminder: no character says any word; only the off-screen narrator speaks. Natural laughs, gasps and sighs are fine. No text, captions or logos in the frame.</w:t>
       </w:r>
     </w:p>
     <w:p>
@@ -2939,7 +2957,7 @@
           <w:sz w:val="20"/>
           <w:szCs w:val="20"/>
         </w:rPr>
-        <w:t xml:space="preserve">ABSOLUTE RULE: only the off-screen narrator has a voice. No character on screen speaks, talks, shouts, whispers, sings or lip-syncs, and no character voices or crowd voices are heard. Characters act only with facial expressions, eye movements and body and hand gestures; their mouths may move silently for a smile, laugh or gasp, with no sound. Attached reference images, in order: Senbi, the groom, the bride, the Egyptian wedding guests. 2D hand-drawn stickman cartoon in the exact style of the reference images: thin black outlines, large expressive heads, thin stick arms, flat warm colors, playful documentary-comedy tone, 16:9. Setting: sunny daytime wedding courtyard in ancient Alexandria, sandstone columns with painted blue-and-gold bands, long tables with white cloths and clay jars, orange cloth awnings, and a tall wooden entrance gate at the back-center that opens onto the street. Joyful chaos: Egyptians and Romans dance together, musicians struggle to keep the rhythm, a plate of food is passed along. Senbi is delighted; the bride looks overwhelmed. Keep no more than eight characters visible. Camera: locked-off and perfectly still, eye-level wide shot of the whole courtyard; the framing never changes (no tilt, pan, zoom or rising camera). Audio: off-screen British male narrator, warm and dry, begins speaking within half a second and says: “Soon, Egyptians and Romans were passing food and stepping on each other's feet.” Music: playful comic percussion over the wedding rhythm, low under the voice. Sound effects: plates, music chaos. Characters keep their exact reference designs. Final reminder: no character speaks or makes any voice sound; only the off-screen narrator speaks. No text, captions or logos in the frame.</w:t>
+        <w:t xml:space="preserve">VOICE RULE: only the off-screen narrator speaks words. No character says any word and no one on screen lip-syncs to speech; characters communicate with facial expressions and body gestures. Natural non-verbal sounds are allowed and should sound real: laughing, giggling, gasping, sighing, groaning, cheering, coughing. Attached reference images, in order: Senbi, the groom, the bride, the Egyptian wedding guests. 2D hand-drawn stickman cartoon in the exact style of the reference images: thin black outlines, large expressive heads, thin stick arms, flat warm colors, playful documentary-comedy tone, 16:9. Characters, identical in every frame: Senbi the groom: young man, straight black bowl-cut hair with bangs, gold headband with a gold cobra, bare chest, blue-and-gold broad collar, gold bracers, white kilt with a blue-and-gold sash, brown sandals, thin black stick arms. the bride: black bob hair with straight bangs, gold headband with a red gem, white dress, blue-and-gold collar, gold sash, gold arm cuffs, light veil. the Roman soldiers: crimson plumed helmets, steel armor, red cloaks, rectangular red shields. the guests: Egyptian wedding guests in white linen with blue-and-gold collars and gold headbands, black bob hairstyles, some in white striped headdresses. the musicians: guests in white linen playing harp, frame drum and reed flute. Setting: sunny daytime wedding courtyard in ancient Alexandria, sandstone columns with painted blue-and-gold bands, long tables with white cloths and clay jars, orange cloth awnings, and a tall wooden entrance gate at the back-center that opens onto the street. Joyful chaos: Egyptians and Romans dance together, musicians struggle to keep the rhythm, a plate of food is passed along. Senbi is delighted; the bride looks overwhelmed. Keep no more than eight characters visible. Camera: locked-off and perfectly still, eye-level wide shot of the whole courtyard; the framing never changes (no tilt, pan, zoom or rising camera). Audio: off-screen British male narrator, warm and dry, begins speaking within half a second and says: “Soon, Egyptians and Romans were passing food and stepping on each other's feet.” Music: playful comic percussion over the wedding rhythm, low under the voice. Sound effects: laughter, plates, music chaos. Final reminder: no character says any word; only the off-screen narrator speaks. Natural laughs, gasps and sighs are fine. No text, captions or logos in the frame.</w:t>
       </w:r>
     </w:p>
     <w:p>
@@ -3012,7 +3030,7 @@
           <w:sz w:val="20"/>
           <w:szCs w:val="20"/>
         </w:rPr>
-        <w:t xml:space="preserve">ABSOLUTE RULE: only the off-screen narrator has a voice. No character on screen speaks, talks, shouts, whispers, sings or lip-syncs, and no character voices or crowd voices are heard. Characters act only with facial expressions, eye movements and body and hand gestures; their mouths may move silently for a smile, laugh or gasp, with no sound. Attached reference images, in order: the Egyptian wedding guests, the Roman soldiers, the wedding courtyard. 2D hand-drawn stickman cartoon in the exact style of the reference images: thin black outlines, large expressive heads, thin stick arms, flat warm colors, playful documentary-comedy tone, 16:9. Setting: sunny daytime wedding courtyard in ancient Alexandria, sandstone columns with painted blue-and-gold bands, long tables with white cloths and clay jars, orange cloth awnings, and a tall wooden entrance gate at the back-center that opens onto the street. A sharp horn blast: everyone freezes mid-step, Egyptians and Romans together, in a comic tableau. Camera: locked-off and perfectly still, eye-level wide shot; the framing never changes (no tilt, pan, zoom or rising camera). Audio: off-screen British male narrator, warm and dry, begins speaking within half a second and says: “Then a horn cut through the music, and everyone froze mid-step.” Music: music nearly silent. Sound effects: sharp military horn, then silence. Characters keep their exact reference designs. Final reminder: no character speaks or makes any voice sound; only the off-screen narrator speaks. No text, captions or logos in the frame.</w:t>
+        <w:t xml:space="preserve">VOICE RULE: only the off-screen narrator speaks words. No character says any word and no one on screen lip-syncs to speech; characters communicate with facial expressions and body gestures. Natural non-verbal sounds are allowed and should sound real: laughing, giggling, gasping, sighing, groaning, cheering, coughing. Attached reference images, in order: the Egyptian wedding guests, the Roman soldiers, the wedding courtyard. 2D hand-drawn stickman cartoon in the exact style of the reference images: thin black outlines, large expressive heads, thin stick arms, flat warm colors, playful documentary-comedy tone, 16:9. Characters, identical in every frame: the Roman soldiers: crimson plumed helmets, steel armor, red cloaks, rectangular red shields. the guests: Egyptian wedding guests in white linen with blue-and-gold collars and gold headbands, black bob hairstyles, some in white striped headdresses. Setting: sunny daytime wedding courtyard in ancient Alexandria, sandstone columns with painted blue-and-gold bands, long tables with white cloths and clay jars, orange cloth awnings, and a tall wooden entrance gate at the back-center that opens onto the street. A sharp horn blast: everyone freezes mid-step, Egyptians and Romans together, in a comic tableau. Camera: locked-off and perfectly still, eye-level wide shot; the framing never changes (no tilt, pan, zoom or rising camera). Audio: off-screen British male narrator, warm and dry, begins speaking within half a second and says: “Then a horn cut through the music, and everyone froze mid-step.” Music: music nearly silent. Sound effects: sharp military horn, then silence. Final reminder: no character says any word; only the off-screen narrator speaks. Natural laughs, gasps and sighs are fine. No text, captions or logos in the frame.</w:t>
       </w:r>
     </w:p>
     <w:p>
@@ -3085,7 +3103,7 @@
           <w:sz w:val="20"/>
           <w:szCs w:val="20"/>
         </w:rPr>
-        <w:t xml:space="preserve">ABSOLUTE RULE: only the off-screen narrator has a voice. No character on screen speaks, talks, shouts, whispers, sings or lip-syncs, and no character voices or crowd voices are heard. Characters act only with facial expressions, eye movements and body and hand gestures; their mouths may move silently for a smile, laugh or gasp, with no sound. Attached reference images, in order: the Roman commander, the Roman soldiers, the wedding courtyard. 2D hand-drawn stickman cartoon in the exact style of the reference images: thin black outlines, large expressive heads, thin stick arms, flat warm colors, playful documentary-comedy tone, 16:9. Setting: sunny daytime wedding courtyard in ancient Alexandria, sandstone columns with painted blue-and-gold bands, long tables with white cloths and clay jars, orange cloth awnings, and a tall wooden entrance gate at the back-center that opens onto the street. A Roman commander in bronze-and-gold armor walks calmly through the open gate holding a scroll. The dancing soldiers step aside. The courtyard falls silent. The commander wears a gold laurel wreath and a red cloak; no banner, no lettering. Camera: locked-off and perfectly still, fixed, slightly low angle that never tilts, on the commander walking in; the framing never changes (no tilt, pan, zoom or rising camera). Audio: off-screen British male narrator, warm and dry, begins speaking within half a second and says: “And in walked the commander. The only adult in the building.” Music: low sustained tension with distant marching drums, almost silent. Sound effects: slow footsteps, cloak rustle. Characters keep their exact reference designs. Final reminder: no character speaks or makes any voice sound; only the off-screen narrator speaks. No text, captions or logos in the frame.</w:t>
+        <w:t xml:space="preserve">VOICE RULE: only the off-screen narrator speaks words. No character says any word and no one on screen lip-syncs to speech; characters communicate with facial expressions and body gestures. Natural non-verbal sounds are allowed and should sound real: laughing, giggling, gasping, sighing, groaning, cheering, coughing. Attached reference images, in order: the Roman commander, the Roman soldiers, the wedding courtyard. 2D hand-drawn stickman cartoon in the exact style of the reference images: thin black outlines, large expressive heads, thin stick arms, flat warm colors, playful documentary-comedy tone, 16:9. Characters, identical in every frame: the Roman commander: dark curly gray-streaked hair, gold laurel wreath, bronze-and-gold armor, red cloak. the Roman soldiers: crimson plumed helmets, steel armor, red cloaks, rectangular red shields. Setting: sunny daytime wedding courtyard in ancient Alexandria, sandstone columns with painted blue-and-gold bands, long tables with white cloths and clay jars, orange cloth awnings, and a tall wooden entrance gate at the back-center that opens onto the street. A Roman commander in bronze-and-gold armor walks calmly through the open gate holding a scroll. The dancing soldiers step aside. The courtyard falls silent. The commander wears a gold laurel wreath and a red cloak; no banner, no lettering. Camera: locked-off and perfectly still, fixed, slightly low angle that never tilts, on the commander walking in; the framing never changes (no tilt, pan, zoom or rising camera). Audio: off-screen British male narrator, warm and dry, begins speaking within half a second and says: “And in walked the commander. The only adult in the building.” Music: low sustained tension with distant marching drums, almost silent. Sound effects: slow footsteps, cloak rustle. Final reminder: no character says any word; only the off-screen narrator speaks. Natural laughs, gasps and sighs are fine. No text, captions or logos in the frame.</w:t>
       </w:r>
     </w:p>
     <w:p>
@@ -3158,7 +3176,7 @@
           <w:sz w:val="20"/>
           <w:szCs w:val="20"/>
         </w:rPr>
-        <w:t xml:space="preserve">ABSOLUTE RULE: only the off-screen narrator has a voice. No character on screen speaks, talks, shouts, whispers, sings or lip-syncs, and no character voices or crowd voices are heard. Characters act only with facial expressions, eye movements and body and hand gestures; their mouths may move silently for a smile, laugh or gasp, with no sound. Attached reference images, in order: the Roman commander, Senbi, the groom, the bride. 2D hand-drawn stickman cartoon in the exact style of the reference images: thin black outlines, large expressive heads, thin stick arms, flat warm colors, playful documentary-comedy tone, 16:9. Setting: sunny daytime wedding courtyard in ancient Alexandria, sandstone columns with painted blue-and-gold bands, long tables with white cloths and clay jars, orange cloth awnings, and a tall wooden entrance gate at the back-center that opens onto the street. The commander stands serious and still. He slowly turns his head: the dancing soldiers, the food, the bride and groom, the decorations. He stays completely serious. The commander wears a gold laurel wreath and a red cloak; no banner, no lettering. Camera: locked-off and perfectly still, eye-level medium shot of the commander; he turns his head, the camera does not pan; the framing never changes (no tilt, pan, zoom or rising camera). Audio: off-screen British male narrator, warm and dry, begins speaking within half a second and says: “He saw his soldiers dancing. The food. The bride. The groom. The cat.” Music: music nearly silent. Sound effects: quiet room tone, fire crackle. Characters keep their exact reference designs. Final reminder: no character speaks or makes any voice sound; only the off-screen narrator speaks. No text, captions or logos in the frame.</w:t>
+        <w:t xml:space="preserve">VOICE RULE: only the off-screen narrator speaks words. No character says any word and no one on screen lip-syncs to speech; characters communicate with facial expressions and body gestures. Natural non-verbal sounds are allowed and should sound real: laughing, giggling, gasping, sighing, groaning, cheering, coughing. Attached reference images, in order: the Roman commander, Senbi, the groom, the bride. 2D hand-drawn stickman cartoon in the exact style of the reference images: thin black outlines, large expressive heads, thin stick arms, flat warm colors, playful documentary-comedy tone, 16:9. Characters, identical in every frame: the bride: black bob hair with straight bangs, gold headband with a red gem, white dress, blue-and-gold collar, gold sash, gold arm cuffs, light veil. the Roman commander: dark curly gray-streaked hair, gold laurel wreath, bronze-and-gold armor, red cloak. the Roman soldiers: crimson plumed helmets, steel armor, red cloaks, rectangular red shields. Setting: sunny daytime wedding courtyard in ancient Alexandria, sandstone columns with painted blue-and-gold bands, long tables with white cloths and clay jars, orange cloth awnings, and a tall wooden entrance gate at the back-center that opens onto the street. The commander stands serious and still. He slowly turns his head: the dancing soldiers, the food, the bride and groom, the decorations. He stays completely serious. The commander wears a gold laurel wreath and a red cloak; no banner, no lettering. Camera: locked-off and perfectly still, eye-level medium shot of the commander; he turns his head, the camera does not pan; the framing never changes (no tilt, pan, zoom or rising camera). Audio: off-screen British male narrator, warm and dry, begins speaking within half a second and says: “He saw his soldiers dancing. The food. The bride. The groom. The cat.” Music: music nearly silent. Sound effects: quiet room tone, fire crackle. Final reminder: no character says any word; only the off-screen narrator speaks. Natural laughs, gasps and sighs are fine. No text, captions or logos in the frame.</w:t>
       </w:r>
     </w:p>
     <w:p>
@@ -3231,7 +3249,7 @@
           <w:sz w:val="20"/>
           <w:szCs w:val="20"/>
         </w:rPr>
-        <w:t xml:space="preserve">ABSOLUTE RULE: only the off-screen narrator has a voice. No character on screen speaks, talks, shouts, whispers, sings or lip-syncs, and no character voices or crowd voices are heard. Characters act only with facial expressions, eye movements and body and hand gestures; their mouths may move silently for a smile, laugh or gasp, with no sound. Attached reference images, in order: the Roman commander, the black cat. 2D hand-drawn stickman cartoon in the exact style of the reference images: thin black outlines, large expressive heads, thin stick arms, flat warm colors, playful documentary-comedy tone, 16:9. Setting: sunny daytime wedding courtyard in ancient Alexandria, sandstone columns with painted blue-and-gold bands, long tables with white cloths and clay jars, orange cloth awnings, and a tall wooden entrance gate at the back-center that opens onto the street. The commander stands in the foreground; behind him on the table the black cat with a small gold collar stares straight at him, unmoved. The commander's serious face twitches slightly. The commander wears a gold laurel wreath and a red cloak; no banner, no lettering. Camera: locked-off and perfectly still, eye-level medium two-shot: the commander in the foreground, the cat on the table behind him; no cutting; the framing never changes (no tilt, pan, zoom or rising camera). Audio: off-screen British male narrator, warm and dry, begins speaking within half a second and says: “The cat looked back. The cat was not impressed by the Roman Empire.” Music: music nearly silent. Sound effects: cat meow, tiny sting. Characters keep their exact reference designs. Final reminder: no character speaks or makes any voice sound; only the off-screen narrator speaks. No text, captions or logos in the frame.</w:t>
+        <w:t xml:space="preserve">VOICE RULE: only the off-screen narrator speaks words. No character says any word and no one on screen lip-syncs to speech; characters communicate with facial expressions and body gestures. Natural non-verbal sounds are allowed and should sound real: laughing, giggling, gasping, sighing, groaning, cheering, coughing. Attached reference images, in order: the Roman commander, the black cat. 2D hand-drawn stickman cartoon in the exact style of the reference images: thin black outlines, large expressive heads, thin stick arms, flat warm colors, playful documentary-comedy tone, 16:9. Characters, identical in every frame: the Roman commander: dark curly gray-streaked hair, gold laurel wreath, bronze-and-gold armor, red cloak. the cat: black with a small gold collar. Setting: sunny daytime wedding courtyard in ancient Alexandria, sandstone columns with painted blue-and-gold bands, long tables with white cloths and clay jars, orange cloth awnings, and a tall wooden entrance gate at the back-center that opens onto the street. The commander stands in the foreground; behind him on the table the black cat with a small gold collar stares straight at him, unmoved. The commander's serious face twitches slightly. The commander wears a gold laurel wreath and a red cloak; no banner, no lettering. Camera: locked-off and perfectly still, eye-level medium two-shot: the commander in the foreground, the cat on the table behind him; no cutting; the framing never changes (no tilt, pan, zoom or rising camera). Audio: off-screen British male narrator, warm and dry, begins speaking within half a second and says: “The cat looked back. The cat was not impressed by the Roman Empire.” Music: music nearly silent. Sound effects: cat meow, tiny sting. Final reminder: no character says any word; only the off-screen narrator speaks. Natural laughs, gasps and sighs are fine. No text, captions or logos in the frame.</w:t>
       </w:r>
     </w:p>
     <w:p>
@@ -3304,7 +3322,7 @@
           <w:sz w:val="20"/>
           <w:szCs w:val="20"/>
         </w:rPr>
-        <w:t xml:space="preserve">ABSOLUTE RULE: only the off-screen narrator has a voice. No character on screen speaks, talks, shouts, whispers, sings or lip-syncs, and no character voices or crowd voices are heard. Characters act only with facial expressions, eye movements and body and hand gestures; their mouths may move silently for a smile, laugh or gasp, with no sound. Attached reference images, in order: the Roman commander, the Egyptian wedding guests, Senbi, the groom. 2D hand-drawn stickman cartoon in the exact style of the reference images: thin black outlines, large expressive heads, thin stick arms, flat warm colors, playful documentary-comedy tone, 16:9. Setting: sunny daytime wedding courtyard in ancient Alexandria, sandstone columns with painted blue-and-gold bands, long tables with white cloths and clay jars, orange cloth awnings, and a tall wooden entrance gate at the back-center that opens onto the street. Symmetrical composition: the commander at the center unrolls his scroll while Egyptians and Romans stand silent on both sides. The commander wears a gold laurel wreath and a red cloak; no banner, no lettering. Camera: locked-off and perfectly still, symmetrical eye-level medium-wide shot; the framing never changes (no tilt, pan, zoom or rising camera). Audio: off-screen British male narrator, warm and dry, begins speaking within half a second and says: “He unrolled the scroll. Message received: Egypt has new management.” Music: low sustained tension with distant marching drums, almost silent. Sound effects: scroll unrolling, one dramatic drum hit. Characters keep their exact reference designs. Final reminder: no character speaks or makes any voice sound; only the off-screen narrator speaks. No text, captions or logos in the frame.</w:t>
+        <w:t xml:space="preserve">VOICE RULE: only the off-screen narrator speaks words. No character says any word and no one on screen lip-syncs to speech; characters communicate with facial expressions and body gestures. Natural non-verbal sounds are allowed and should sound real: laughing, giggling, gasping, sighing, groaning, cheering, coughing. Attached reference images, in order: the Roman commander, the Egyptian wedding guests, Senbi, the groom. 2D hand-drawn stickman cartoon in the exact style of the reference images: thin black outlines, large expressive heads, thin stick arms, flat warm colors, playful documentary-comedy tone, 16:9. Characters, identical in every frame: the Roman commander: dark curly gray-streaked hair, gold laurel wreath, bronze-and-gold armor, red cloak. the Roman soldiers: crimson plumed helmets, steel armor, red cloaks, rectangular red shields. the guests: Egyptian wedding guests in white linen with blue-and-gold collars and gold headbands, black bob hairstyles, some in white striped headdresses. Setting: sunny daytime wedding courtyard in ancient Alexandria, sandstone columns with painted blue-and-gold bands, long tables with white cloths and clay jars, orange cloth awnings, and a tall wooden entrance gate at the back-center that opens onto the street. Symmetrical composition: the commander at the center unrolls his scroll while Egyptians and Romans stand silent on both sides. The commander wears a gold laurel wreath and a red cloak; no banner, no lettering. Camera: locked-off and perfectly still, symmetrical eye-level medium-wide shot; the framing never changes (no tilt, pan, zoom or rising camera). Audio: off-screen British male narrator, warm and dry, begins speaking within half a second and says: “He unrolled the scroll. Message received: Egypt has new management.” Music: low sustained tension with distant marching drums, almost silent. Sound effects: scroll unrolling, one dramatic drum hit. Final reminder: no character says any word; only the off-screen narrator speaks. Natural laughs, gasps and sighs are fine. No text, captions or logos in the frame.</w:t>
       </w:r>
     </w:p>
     <w:p>
@@ -3377,7 +3395,7 @@
           <w:sz w:val="20"/>
           <w:szCs w:val="20"/>
         </w:rPr>
-        <w:t xml:space="preserve">ABSOLUTE RULE: only the off-screen narrator has a voice. No character on screen speaks, talks, shouts, whispers, sings or lip-syncs, and no character voices or crowd voices are heard. Characters act only with facial expressions, eye movements and body and hand gestures; their mouths may move silently for a smile, laugh or gasp, with no sound. Attached reference images, in order: Senbi, the groom, the bride, the Egyptian wedding guests. 2D hand-drawn stickman cartoon in the exact style of the reference images: thin black outlines, large expressive heads, thin stick arms, flat warm colors, playful documentary-comedy tone, 16:9. Setting: sunny daytime wedding courtyard in ancient Alexandria, sandstone columns with painted blue-and-gold bands, long tables with white cloths and clay jars, orange cloth awnings, and a tall wooden entrance gate at the back-center that opens onto the street. Senbi turns slowly toward the bride; she looks back at him. Both realize the wedding has taken a very strange turn. Camera: locked-off and perfectly still, eye-level medium two-shot of Senbi and the bride; the framing never changes (no tilt, pan, zoom or rising camera). Audio: off-screen British male narrator, warm and dry, begins speaking within half a second and says: “Senbi looked at his bride. Same question, silently: is the wedding still on?” Music: low sustained tension with distant marching drums, almost silent. Sound effects: single drum. Characters keep their exact reference designs. Final reminder: no character speaks or makes any voice sound; only the off-screen narrator speaks. No text, captions or logos in the frame.</w:t>
+        <w:t xml:space="preserve">VOICE RULE: only the off-screen narrator speaks words. No character says any word and no one on screen lip-syncs to speech; characters communicate with facial expressions and body gestures. Natural non-verbal sounds are allowed and should sound real: laughing, giggling, gasping, sighing, groaning, cheering, coughing. Attached reference images, in order: Senbi, the groom, the bride, the Egyptian wedding guests. 2D hand-drawn stickman cartoon in the exact style of the reference images: thin black outlines, large expressive heads, thin stick arms, flat warm colors, playful documentary-comedy tone, 16:9. Characters, identical in every frame: Senbi the groom: young man, straight black bowl-cut hair with bangs, gold headband with a gold cobra, bare chest, blue-and-gold broad collar, gold bracers, white kilt with a blue-and-gold sash, brown sandals, thin black stick arms. the bride: black bob hair with straight bangs, gold headband with a red gem, white dress, blue-and-gold collar, gold sash, gold arm cuffs, light veil. Setting: sunny daytime wedding courtyard in ancient Alexandria, sandstone columns with painted blue-and-gold bands, long tables with white cloths and clay jars, orange cloth awnings, and a tall wooden entrance gate at the back-center that opens onto the street. Senbi turns slowly toward the bride; she looks back at him. Both realize the wedding has taken a very strange turn. Camera: locked-off and perfectly still, eye-level medium two-shot of Senbi and the bride; the framing never changes (no tilt, pan, zoom or rising camera). Audio: off-screen British male narrator, warm and dry, begins speaking within half a second and says: “Senbi looked at his bride. Same question, silently: is the wedding still on?” Music: low sustained tension with distant marching drums, almost silent. Sound effects: nervous breath, single drum. Final reminder: no character says any word; only the off-screen narrator speaks. Natural laughs, gasps and sighs are fine. No text, captions or logos in the frame.</w:t>
       </w:r>
     </w:p>
     <w:p>
@@ -3450,7 +3468,7 @@
           <w:sz w:val="20"/>
           <w:szCs w:val="20"/>
         </w:rPr>
-        <w:t xml:space="preserve">ABSOLUTE RULE: only the off-screen narrator has a voice. No character on screen speaks, talks, shouts, whispers, sings or lip-syncs, and no character voices or crowd voices are heard. Characters act only with facial expressions, eye movements and body and hand gestures; their mouths may move silently for a smile, laugh or gasp, with no sound. Attached reference images, in order: the Alexandria harbor, the Roman soldiers. 2D hand-drawn stickman cartoon in the exact style of the reference images: thin black outlines, large expressive heads, thin stick arms, flat warm colors, playful documentary-comedy tone, 16:9. Setting: sunlit street of ancient Alexandria outside the wedding house, sandstone walls, palms, market stalls with red and blue awnings. Roman soldiers walk through the streets of Alexandria while Egyptian civilians watch from the sides. The mood turns briefly serious. Camera: locked-off and perfectly still, eye-level wide shot of Alexandria with Roman soldiers in the streets; the framing never changes (no tilt, pan, zoom or rising camera). Audio: off-screen British male narrator, warm and dry, begins speaking within half a second and says: “Outside, the city was changing hands. Inside, there was still a wedding.” Music: music nearly silent. Sound effects: harbor ambience, distant boots. Characters keep their exact reference designs. Final reminder: no character speaks or makes any voice sound; only the off-screen narrator speaks. No text, captions or logos in the frame.</w:t>
+        <w:t xml:space="preserve">VOICE RULE: only the off-screen narrator speaks words. No character says any word and no one on screen lip-syncs to speech; characters communicate with facial expressions and body gestures. Natural non-verbal sounds are allowed and should sound real: laughing, giggling, gasping, sighing, groaning, cheering, coughing. Attached reference images, in order: the Alexandria harbor, the Roman soldiers. 2D hand-drawn stickman cartoon in the exact style of the reference images: thin black outlines, large expressive heads, thin stick arms, flat warm colors, playful documentary-comedy tone, 16:9. Characters, identical in every frame: the Roman soldiers: crimson plumed helmets, steel armor, red cloaks, rectangular red shields. Setting: sunlit street of ancient Alexandria outside the wedding house, sandstone walls, palms, market stalls with red and blue awnings. Roman soldiers walk through the streets of Alexandria while Egyptian civilians watch from the sides. The mood turns briefly serious. Camera: locked-off and perfectly still, eye-level wide shot of Alexandria with Roman soldiers in the streets; the framing never changes (no tilt, pan, zoom or rising camera). Audio: off-screen British male narrator, warm and dry, begins speaking within half a second and says: “Outside, the city was changing hands. Inside, there was still a wedding.” Music: music nearly silent. Sound effects: harbor ambience, distant boots. Final reminder: no character says any word; only the off-screen narrator speaks. Natural laughs, gasps and sighs are fine. No text, captions or logos in the frame.</w:t>
       </w:r>
     </w:p>
     <w:p>
@@ -3523,7 +3541,7 @@
           <w:sz w:val="20"/>
           <w:szCs w:val="20"/>
         </w:rPr>
-        <w:t xml:space="preserve">ABSOLUTE RULE: only the off-screen narrator has a voice. No character on screen speaks, talks, shouts, whispers, sings or lip-syncs, and no character voices or crowd voices are heard. Characters act only with facial expressions, eye movements and body and hand gestures; their mouths may move silently for a smile, laugh or gasp, with no sound. Attached reference images, in order: the Alexandria harbor, the Roman soldiers. 2D hand-drawn stickman cartoon in the exact style of the reference images: thin black outlines, large expressive heads, thin stick arms, flat warm colors, playful documentary-comedy tone, 16:9. Setting: sunlit street of ancient Alexandria outside the wedding house, sandstone walls, palms, market stalls with red and blue awnings. A few Roman soldiers pass through while ordinary Egyptians keep going about their day: carrying baskets, bargaining, hauling jars. The scene signals real history around the fictional wedding. Camera: locked-off and perfectly still, eye-level wide observational shot of Alexandria; the framing never changes (no tilt, pan, zoom or rising camera). Audio: off-screen British male narrator, warm and dry, begins speaking within half a second and says: “To be clear: Senbi and his wedding are fiction. The cat, sadly, too.” Music: music nearly silent. Sound effects: calm city ambience. Characters keep their exact reference designs. Final reminder: no character speaks or makes any voice sound; only the off-screen narrator speaks. No text, captions or logos in the frame.</w:t>
+        <w:t xml:space="preserve">VOICE RULE: only the off-screen narrator speaks words. No character says any word and no one on screen lip-syncs to speech; characters communicate with facial expressions and body gestures. Natural non-verbal sounds are allowed and should sound real: laughing, giggling, gasping, sighing, groaning, cheering, coughing. Attached reference images, in order: the Alexandria harbor, the Roman soldiers. 2D hand-drawn stickman cartoon in the exact style of the reference images: thin black outlines, large expressive heads, thin stick arms, flat warm colors, playful documentary-comedy tone, 16:9. Characters, identical in every frame: the Roman soldiers: crimson plumed helmets, steel armor, red cloaks, rectangular red shields. the guests: Egyptian wedding guests in white linen with blue-and-gold collars and gold headbands, black bob hairstyles, some in white striped headdresses. Setting: sunlit street of ancient Alexandria outside the wedding house, sandstone walls, palms, market stalls with red and blue awnings. A few Roman soldiers pass through while ordinary Egyptians keep going about their day: carrying baskets, bargaining, hauling jars. The scene signals real history around the fictional wedding. Camera: locked-off and perfectly still, eye-level wide observational shot of Alexandria; the framing never changes (no tilt, pan, zoom or rising camera). Audio: off-screen British male narrator, warm and dry, begins speaking within half a second and says: “To be clear: Senbi and his wedding are fiction. The cat, sadly, too.” Music: music nearly silent. Sound effects: calm city ambience. Final reminder: no character says any word; only the off-screen narrator speaks. Natural laughs, gasps and sighs are fine. No text, captions or logos in the frame.</w:t>
       </w:r>
     </w:p>
     <w:p>
@@ -3596,7 +3614,7 @@
           <w:sz w:val="20"/>
           <w:szCs w:val="20"/>
         </w:rPr>
-        <w:t xml:space="preserve">ABSOLUTE RULE: only the off-screen narrator has a voice. No character on screen speaks, talks, shouts, whispers, sings or lip-syncs, and no character voices or crowd voices are heard. Characters act only with facial expressions, eye movements and body and hand gestures; their mouths may move silently for a smile, laugh or gasp, with no sound. Attached reference images, in order: the Alexandria harbor, the Roman soldiers. 2D hand-drawn stickman cartoon in the exact style of the reference images: thin black outlines, large expressive heads, thin stick arms, flat warm colors, playful documentary-comedy tone, 16:9. Setting: ancient Alexandria harbor. Stylized historical tableau at the moment Roman authority takes over: Roman ships entering the harbor, soldiers on the quay, civilians watching. Do not depict the wedding. Camera: wide shot of the Alexandria harbor and city, horizon level; fixed except for an almost imperceptible 5% slow push-in, no tilt or pan. Audio: off-screen British male narrator, warm and dry, begins speaking within half a second and says: “The setting is real: in 30 BC, Octavian took Alexandria. Egypt became Roman.” Music: music nearly silent. Sound effects: calm city ambience. Characters keep their exact reference designs. Final reminder: no character speaks or makes any voice sound; only the off-screen narrator speaks. No text, captions or logos in the frame.</w:t>
+        <w:t xml:space="preserve">VOICE RULE: only the off-screen narrator speaks words. No character says any word and no one on screen lip-syncs to speech; characters communicate with facial expressions and body gestures. Natural non-verbal sounds are allowed and should sound real: laughing, giggling, gasping, sighing, groaning, cheering, coughing. Attached reference images, in order: the Alexandria harbor, the Roman soldiers. 2D hand-drawn stickman cartoon in the exact style of the reference images: thin black outlines, large expressive heads, thin stick arms, flat warm colors, playful documentary-comedy tone, 16:9. Characters, identical in every frame: the Roman soldiers: crimson plumed helmets, steel armor, red cloaks, rectangular red shields. Setting: ancient Alexandria harbor. Stylized historical tableau at the moment Roman authority takes over: Roman ships entering the harbor, soldiers on the quay, civilians watching. Do not depict the wedding. Camera: wide shot of the Alexandria harbor and city, horizon level; fixed except for an almost imperceptible 5% slow push-in, no tilt or pan. Audio: off-screen British male narrator, warm and dry, begins speaking within half a second and says: “The setting is real: in 30 BC, Octavian took Alexandria. Egypt became Roman.” Music: music nearly silent. Sound effects: calm city ambience. Final reminder: no character says any word; only the off-screen narrator speaks. Natural laughs, gasps and sighs are fine. No text, captions or logos in the frame.</w:t>
       </w:r>
     </w:p>
     <w:p>
@@ -3669,7 +3687,7 @@
           <w:sz w:val="20"/>
           <w:szCs w:val="20"/>
         </w:rPr>
-        <w:t xml:space="preserve">ABSOLUTE RULE: only the off-screen narrator has a voice. No character on screen speaks, talks, shouts, whispers, sings or lip-syncs, and no character voices or crowd voices are heard. Characters act only with facial expressions, eye movements and body and hand gestures; their mouths may move silently for a smile, laugh or gasp, with no sound. Attached reference images, in order: Senbi, the groom, the bride's relatives. 2D hand-drawn stickman cartoon in the exact style of the reference images: thin black outlines, large expressive heads, thin stick arms, flat warm colors, playful documentary-comedy tone, 16:9. Setting: sunny daytime wedding courtyard in ancient Alexandria, sandstone columns with painted blue-and-gold bands, long tables with white cloths and clay jars, orange cloth awnings, and a tall wooden entrance gate at the back-center that opens onto the street. Senbi holds the wooden headrest in his hands and looks down at it, then slowly looks off to the side toward the Roman commander with a tired, deadpan expression. Camera: locked-off and perfectly still, eye-level medium close-up with the headrest in Senbi's hands and his face both in frame; the framing never changes (no tilt, pan, zoom or rising camera). Audio: off-screen British male narrator, warm and dry, begins speaking within half a second and says: “Headrest, then commander. Neither came with a return policy.” Music: playful comic percussion over the wedding rhythm, low under the voice. Sound effects: wood knock, comic sting. Characters keep their exact reference designs. Final reminder: no character speaks or makes any voice sound; only the off-screen narrator speaks. No text, captions or logos in the frame.</w:t>
+        <w:t xml:space="preserve">VOICE RULE: only the off-screen narrator speaks words. No character says any word and no one on screen lip-syncs to speech; characters communicate with facial expressions and body gestures. Natural non-verbal sounds are allowed and should sound real: laughing, giggling, gasping, sighing, groaning, cheering, coughing. Attached reference images, in order: Senbi, the groom, the bride's relatives. 2D hand-drawn stickman cartoon in the exact style of the reference images: thin black outlines, large expressive heads, thin stick arms, flat warm colors, playful documentary-comedy tone, 16:9. Characters, identical in every frame: Senbi the groom: young man, straight black bowl-cut hair with bangs, gold headband with a gold cobra, bare chest, blue-and-gold broad collar, gold bracers, white kilt with a blue-and-gold sash, brown sandals, thin black stick arms. the Roman commander: dark curly gray-streaked hair, gold laurel wreath, bronze-and-gold armor, red cloak. Setting: sunny daytime wedding courtyard in ancient Alexandria, sandstone columns with painted blue-and-gold bands, long tables with white cloths and clay jars, orange cloth awnings, and a tall wooden entrance gate at the back-center that opens onto the street. Senbi holds the wooden headrest in his hands and looks down at it, then slowly looks off to the side toward the Roman commander with a tired, deadpan expression. Camera: locked-off and perfectly still, eye-level medium close-up with the headrest in Senbi's hands and his face both in frame; the framing never changes (no tilt, pan, zoom or rising camera). Audio: off-screen British male narrator, warm and dry, begins speaking within half a second and says: “Headrest, then commander. Neither came with a return policy.” Music: playful comic percussion over the wedding rhythm, low under the voice. Sound effects: wood knock, comic sting. Final reminder: no character says any word; only the off-screen narrator speaks. Natural laughs, gasps and sighs are fine. No text, captions or logos in the frame.</w:t>
       </w:r>
     </w:p>
     <w:p>
@@ -3742,7 +3760,7 @@
           <w:sz w:val="20"/>
           <w:szCs w:val="20"/>
         </w:rPr>
-        <w:t xml:space="preserve">ABSOLUTE RULE: only the off-screen narrator has a voice. No character on screen speaks, talks, shouts, whispers, sings or lip-syncs, and no character voices or crowd voices are heard. Characters act only with facial expressions, eye movements and body and hand gestures; their mouths may move silently for a smile, laugh or gasp, with no sound. Attached reference images, in order: the bride, Senbi, the groom, the wedding courtyard. 2D hand-drawn stickman cartoon in the exact style of the reference images: thin black outlines, large expressive heads, thin stick arms, flat warm colors, playful documentary-comedy tone, 16:9. Setting: sunny daytime wedding courtyard in ancient Alexandria, sandstone columns with painted blue-and-gold bands, long tables with white cloths and clay jars, orange cloth awnings, and a tall wooden entrance gate at the back-center that opens onto the street. The bride finally laughs at the absurdity. Senbi looks at her, then starts laughing too. The tension releases. Camera: locked-off and perfectly still, eye-level medium two-shot of Senbi and the bride; the framing never changes (no tilt, pan, zoom or rising camera). Audio: off-screen British male narrator, warm and dry, begins speaking within half a second and says: “Senbi thought he was getting married.” Music: warm gentle resolution with the same flute and strings, low under the voice. Sound effects: warm music swell. Characters keep their exact reference designs. Final reminder: no character speaks or makes any voice sound; only the off-screen narrator speaks. No text, captions or logos in the frame.</w:t>
+        <w:t xml:space="preserve">VOICE RULE: only the off-screen narrator speaks words. No character says any word and no one on screen lip-syncs to speech; characters communicate with facial expressions and body gestures. Natural non-verbal sounds are allowed and should sound real: laughing, giggling, gasping, sighing, groaning, cheering, coughing. Attached reference images, in order: the bride, Senbi, the groom, the wedding courtyard. 2D hand-drawn stickman cartoon in the exact style of the reference images: thin black outlines, large expressive heads, thin stick arms, flat warm colors, playful documentary-comedy tone, 16:9. Characters, identical in every frame: Senbi the groom: young man, straight black bowl-cut hair with bangs, gold headband with a gold cobra, bare chest, blue-and-gold broad collar, gold bracers, white kilt with a blue-and-gold sash, brown sandals, thin black stick arms. the bride: black bob hair with straight bangs, gold headband with a red gem, white dress, blue-and-gold collar, gold sash, gold arm cuffs, light veil. Setting: sunny daytime wedding courtyard in ancient Alexandria, sandstone columns with painted blue-and-gold bands, long tables with white cloths and clay jars, orange cloth awnings, and a tall wooden entrance gate at the back-center that opens onto the street. The bride finally laughs at the absurdity. Senbi looks at her, then starts laughing too. The tension releases. Camera: locked-off and perfectly still, eye-level medium two-shot of Senbi and the bride; the framing never changes (no tilt, pan, zoom or rising camera). Audio: off-screen British male narrator, warm and dry, begins speaking within half a second and says: “Senbi thought he was getting married.” Music: warm gentle resolution with the same flute and strings, low under the voice. Sound effects: bride laughter, Senbi laughter. Final reminder: no character says any word; only the off-screen narrator speaks. Natural laughs, gasps and sighs are fine. No text, captions or logos in the frame.</w:t>
       </w:r>
     </w:p>
     <w:p>
@@ -3815,7 +3833,7 @@
           <w:sz w:val="20"/>
           <w:szCs w:val="20"/>
         </w:rPr>
-        <w:t xml:space="preserve">ABSOLUTE RULE: only the off-screen narrator has a voice. No character on screen speaks, talks, shouts, whispers, sings or lip-syncs, and no character voices or crowd voices are heard. Characters act only with facial expressions, eye movements and body and hand gestures; their mouths may move silently for a smile, laugh or gasp, with no sound. Attached reference images, in order: Senbi, the groom. 2D hand-drawn stickman cartoon in the exact style of the reference images: thin black outlines, large expressive heads, thin stick arms, flat warm colors, playful documentary-comedy tone, 16:9. Setting: a quiet room of the wedding house at night, warm torchlight, painted columns, cushions on the floor; Senbi is alone in the room. Senbi lies awkwardly asleep with his neck on the wooden headrest. Distant marching is heard; he opens one eye, listens, and closes it again. Camera: eye-level medium close-up of Senbi's face; fixed except for an almost imperceptible 5% slow push-in, no tilt or pan. Audio: off-screen British male narrator, warm and dry, begins speaking within half a second and says: “He was.” Music: warm gentle resolution with the same flute and strings, low under the voice. Sound effects: distant marching, soft cloth rustle. Characters keep their exact reference designs. Final reminder: no character speaks or makes any voice sound; only the off-screen narrator speaks. No text, captions or logos in the frame.</w:t>
+        <w:t xml:space="preserve">VOICE RULE: only the off-screen narrator speaks words. No character says any word and no one on screen lip-syncs to speech; characters communicate with facial expressions and body gestures. Natural non-verbal sounds are allowed and should sound real: laughing, giggling, gasping, sighing, groaning, cheering, coughing. Attached reference images, in order: Senbi, the groom. 2D hand-drawn stickman cartoon in the exact style of the reference images: thin black outlines, large expressive heads, thin stick arms, flat warm colors, playful documentary-comedy tone, 16:9. Characters, identical in every frame: Senbi the groom: young man, straight black bowl-cut hair with bangs, gold headband with a gold cobra, bare chest, blue-and-gold broad collar, gold bracers, white kilt with a blue-and-gold sash, brown sandals, thin black stick arms. Setting: a quiet room of the wedding house at night, warm torchlight, painted columns, cushions on the floor; Senbi is alone in the room. Senbi lies awkwardly asleep with his neck on the wooden headrest. Distant marching is heard; he opens one eye, listens, and closes it again. Camera: eye-level medium close-up of Senbi's face; fixed except for an almost imperceptible 5% slow push-in, no tilt or pan. Audio: off-screen British male narrator, warm and dry, begins speaking within half a second and says: “He was.” Music: warm gentle resolution with the same flute and strings, low under the voice. Sound effects: distant marching, soft snore. Final reminder: no character says any word; only the off-screen narrator speaks. Natural laughs, gasps and sighs are fine. No text, captions or logos in the frame.</w:t>
       </w:r>
     </w:p>
     <w:p>
@@ -3888,7 +3906,7 @@
           <w:sz w:val="20"/>
           <w:szCs w:val="20"/>
         </w:rPr>
-        <w:t xml:space="preserve">ABSOLUTE RULE: only the off-screen narrator has a voice. No character on screen speaks, talks, shouts, whispers, sings or lip-syncs, and no character voices or crowd voices are heard. Characters act only with facial expressions, eye movements and body and hand gestures; their mouths may move silently for a smile, laugh or gasp, with no sound. Attached reference images, in order: Senbi, the groom, the bride, the Alexandria harbor. 2D hand-drawn stickman cartoon in the exact style of the reference images: thin black outlines, large expressive heads, thin stick arms, flat warm colors, playful documentary-comedy tone, 16:9. Setting: sunny daytime wedding courtyard in ancient Alexandria, sandstone columns with painted blue-and-gold bands, long tables with white cloths and clay jars, orange cloth awnings, and a tall wooden entrance gate at the back-center that opens onto the street. Final composition in warm evening light: Senbi and the bride in the foreground, Alexandria behind them, Roman soldiers as small figures in the distance. Camera: locked-off and perfectly still, wide shot of Senbi and the bride in the foreground with Alexandria behind them; the framing never changes (no tilt, pan, zoom or rising camera). Audio: off-screen British male narrator, warm and dry, begins speaking within half a second and says: “He just hadn't noticed he was also getting a new government.” Music: warm gentle resolution with the same flute and strings, low under the voice. Sound effects: gentle music, silence at the very end. Characters keep their exact reference designs. Final reminder: no character speaks or makes any voice sound; only the off-screen narrator speaks. No text, captions or logos in the frame.</w:t>
+        <w:t xml:space="preserve">VOICE RULE: only the off-screen narrator speaks words. No character says any word and no one on screen lip-syncs to speech; characters communicate with facial expressions and body gestures. Natural non-verbal sounds are allowed and should sound real: laughing, giggling, gasping, sighing, groaning, cheering, coughing. Attached reference images, in order: Senbi, the groom, the bride, the Alexandria harbor. 2D hand-drawn stickman cartoon in the exact style of the reference images: thin black outlines, large expressive heads, thin stick arms, flat warm colors, playful documentary-comedy tone, 16:9. Characters, identical in every frame: Senbi the groom: young man, straight black bowl-cut hair with bangs, gold headband with a gold cobra, bare chest, blue-and-gold broad collar, gold bracers, white kilt with a blue-and-gold sash, brown sandals, thin black stick arms. the bride: black bob hair with straight bangs, gold headband with a red gem, white dress, blue-and-gold collar, gold sash, gold arm cuffs, light veil. the Roman soldiers: crimson plumed helmets, steel armor, red cloaks, rectangular red shields. Setting: sunny daytime wedding courtyard in ancient Alexandria, sandstone columns with painted blue-and-gold bands, long tables with white cloths and clay jars, orange cloth awnings, and a tall wooden entrance gate at the back-center that opens onto the street. Final composition in warm evening light: Senbi and the bride in the foreground, Alexandria behind them, Roman soldiers as small figures in the distance. Camera: locked-off and perfectly still, wide shot of Senbi and the bride in the foreground with Alexandria behind them; the framing never changes (no tilt, pan, zoom or rising camera). Audio: off-screen British male narrator, warm and dry, begins speaking within half a second and says: “He just hadn't noticed he was also getting a new government.” Music: warm gentle resolution with the same flute and strings, low under the voice. Sound effects: gentle music, silence at the very end. Final reminder: no character says any word; only the off-screen narrator speaks. Natural laughs, gasps and sighs are fine. No text, captions or logos in the frame.</w:t>
       </w:r>
     </w:p>
     <w:p>

</xml_diff>

<commit_message>
Episode 1 prompts: narrator is voice-over only; fix character lock on close-ups
Co-Authored-By: Claude Sonnet 5.5 <noreply@anthropic.com>
Claude-Session: https://claude.ai/code/session_01S29WeDgsXUpbHNWdisiPFj
</commit_message>
<xml_diff>
--- a/The_Last_Day_of_Ancient_Egypt_Ep1_FLOW_PROMPTS_READY.docx
+++ b/The_Last_Day_of_Ancient_Egypt_Ep1_FLOW_PROMPTS_READY.docx
@@ -62,7 +62,7 @@
           <w:sz w:val="21"/>
           <w:szCs w:val="21"/>
         </w:rPr>
-        <w:t xml:space="preserve">GOLDEN RULE: only the narrator speaks words. No character ever says a word; characters act with their faces and body gestures. Natural non-verbal sounds (laughing, gasping, sighing, cheering) are allowed and should sound real. The rule is written at the start and the end of every prompt.</w:t>
+        <w:t xml:space="preserve">GOLDEN RULE: only the voice-over narration speaks words. The narrator is a voice only: nobody on screen is the narrator. No character ever says a word; characters act with their faces and body gestures. Natural non-verbal sounds (laughing, gasping, sighing, cheering) are allowed and should sound real. The rule is written at the start and the end of every prompt.</w:t>
       </w:r>
     </w:p>
     <w:p>
@@ -548,7 +548,7 @@
           <w:sz w:val="20"/>
           <w:szCs w:val="20"/>
         </w:rPr>
-        <w:t xml:space="preserve">VOICE RULE: only the off-screen narrator speaks words. No character says any word and no one on screen lip-syncs to speech; characters communicate with facial expressions and body gestures. Natural non-verbal sounds are allowed and should sound real: laughing, giggling, gasping, sighing, groaning, cheering, coughing. Attached reference images, in order: the wedding courtyard, the Egyptian wedding guests. 2D hand-drawn stickman cartoon in the exact style of the reference images: thin black outlines, large expressive heads, thin stick arms, flat warm colors, playful documentary-comedy tone, 16:9. Characters, identical in every frame: the guests: Egyptian wedding guests in white linen with blue-and-gold collars and gold headbands, black bob hairstyles, some in white striped headdresses. Setting: sunny daytime wedding courtyard in ancient Alexandria, sandstone columns with painted blue-and-gold bands, long tables with white cloths and clay jars, orange cloth awnings, and a tall wooden entrance gate at the back-center that opens onto the street. Dancers fill the floor, fully visible from feet to heads, clapping and spinning. At about 2 seconds every dancer pauses for half a beat. One guest turns his head toward the open gate at the back; the others resume dancing a moment later. Camera: locked-off and perfectly still, eye-level medium-wide shot, the dancers fully visible from feet to heads (NOT a feet close-up); the framing never changes (no tilt, pan, zoom or rising camera). Audio: off-screen British male narrator, warm and dry, begins speaking within half a second and says: “Then, for half a beat, the dancing stopped. Nobody noticed. Except one guest.” Music: light ancient-Mediterranean wedding music (frame drums, reed flute, plucked strings) with a faint uneasy undertone, same theme in every clip, low under the voice. Sound effects: dancing feet on stone, one tiny pause, faint distant thump. Final reminder: no character says any word; only the off-screen narrator speaks. Natural laughs, gasps and sighs are fine. No text, captions or logos in the frame.</w:t>
+        <w:t xml:space="preserve">VOICE RULE: only the voice-over narration speaks words; it is a voice only, never a person or character on screen. No character says any word and no one on screen lip-syncs to speech; characters communicate with facial expressions and body gestures. Natural non-verbal sounds are allowed and should sound real: laughing, giggling, gasping, sighing, groaning, cheering, coughing. Attached reference images, in order: the wedding courtyard, the Egyptian wedding guests. 2D hand-drawn stickman cartoon in the exact style of the reference images: thin black outlines, large expressive heads, thin stick arms, flat warm colors, playful documentary-comedy tone, 16:9. Characters, identical in every frame: the guests: Egyptian wedding guests in white linen with blue-and-gold collars and gold headbands, black bob hairstyles, some in white striped headdresses. Setting: sunny daytime wedding courtyard in ancient Alexandria, sandstone columns with painted blue-and-gold bands, long tables with white cloths and clay jars, orange cloth awnings, and a tall wooden entrance gate at the back-center that opens onto the street. Dancers fill the floor, fully visible from feet to heads, clapping and spinning. At about 2 seconds every dancer pauses for half a beat. One guest turns his head toward the open gate at the back; the others resume dancing a moment later. Camera: locked-off and perfectly still, eye-level medium-wide shot, the dancers fully visible from feet to heads (NOT a feet close-up); the framing never changes (no tilt, pan, zoom or rising camera). Audio: voice-over narration only (a voice, never shown on screen; no narrator character appears): a British male voice, warm and dry, begins speaking within half a second and says: “Then, for half a beat, the dancing stopped. Nobody noticed. Except one guest.” Music: light ancient-Mediterranean wedding music (frame drums, reed flute, plucked strings) with a faint uneasy undertone, same theme in every clip, low under the voice. Sound effects: dancing feet on stone, one tiny pause, faint distant thump. Final reminder: no character says any word; only the voice-over narration speaks (voice only, nobody on screen is the narrator). Natural laughs, gasps and sighs are fine. No text, captions or logos in the frame.</w:t>
       </w:r>
     </w:p>
     <w:p>
@@ -621,7 +621,7 @@
           <w:sz w:val="20"/>
           <w:szCs w:val="20"/>
         </w:rPr>
-        <w:t xml:space="preserve">VOICE RULE: only the off-screen narrator speaks words. No character says any word and no one on screen lip-syncs to speech; characters communicate with facial expressions and body gestures. Natural non-verbal sounds are allowed and should sound real: laughing, giggling, gasping, sighing, groaning, cheering, coughing. Attached reference images, in order: the Alexandria harbor. 2D hand-drawn cartoon in the exact style of the reference image: flat warm colors, soft cel shading, playful documentary-comedy tone, 16:9. Setting: ancient Alexandria harbor in bright daylight. Wide establishing view of the harbor and city: sailboats gliding on blue water, gulls crossing the sky, the great lighthouse and white monumental buildings behind, palms at the edge of the frame. Only tiny distant figures on the quays. Camera: wide establishing shot, horizon level; fixed except for an almost imperceptible 5% slow push-in, no tilt or pan. Audio: off-screen British male narrator, warm and dry, begins speaking within half a second and says: “Alexandria, 30 BC. A huge, busy city, about to have a strange evening.” Music: light ancient-Mediterranean wedding music (frame drums, reed flute, plucked strings), same theme in every clip, low under the voice. Sound effects: gulls, harbor water, distant market clatter, no words. Final reminder: no character says any word; only the off-screen narrator speaks. Natural laughs, gasps and sighs are fine. No text, captions or logos in the frame.</w:t>
+        <w:t xml:space="preserve">VOICE RULE: only the voice-over narration speaks words; it is a voice only, never a person or character on screen. No character says any word and no one on screen lip-syncs to speech; characters communicate with facial expressions and body gestures. Natural non-verbal sounds are allowed and should sound real: laughing, giggling, gasping, sighing, groaning, cheering, coughing. Attached reference images, in order: the Alexandria harbor. 2D hand-drawn cartoon in the exact style of the reference image: flat warm colors, soft cel shading, playful documentary-comedy tone, 16:9. Setting: ancient Alexandria harbor in bright daylight. Wide establishing view of the harbor and city: sailboats gliding on blue water, gulls crossing the sky, the great lighthouse and white monumental buildings behind, palms at the edge of the frame. Only tiny distant figures on the quays. Camera: wide establishing shot, horizon level; fixed except for an almost imperceptible 5% slow push-in, no tilt or pan. Audio: voice-over narration only (a voice, never shown on screen; no narrator character appears): a British male voice, warm and dry, begins speaking within half a second and says: “Alexandria, 30 BC. A huge, busy city, about to have a strange evening.” Music: light ancient-Mediterranean wedding music (frame drums, reed flute, plucked strings), same theme in every clip, low under the voice. Sound effects: gulls, harbor water, distant market clatter, no words. Final reminder: no character says any word; only the voice-over narration speaks (voice only, nobody on screen is the narrator). Natural laughs, gasps and sighs are fine. No text, captions or logos in the frame.</w:t>
       </w:r>
     </w:p>
     <w:p>
@@ -694,7 +694,7 @@
           <w:sz w:val="20"/>
           <w:szCs w:val="20"/>
         </w:rPr>
-        <w:t xml:space="preserve">VOICE RULE: only the off-screen narrator speaks words. No character says any word and no one on screen lip-syncs to speech; characters communicate with facial expressions and body gestures. Natural non-verbal sounds are allowed and should sound real: laughing, giggling, gasping, sighing, groaning, cheering, coughing. Attached reference images, in order: the wedding courtyard. 2D hand-drawn stickman cartoon in the exact style of the reference images: thin black outlines, large expressive heads, thin stick arms, flat warm colors, playful documentary-comedy tone, 16:9. Characters, identical in every frame: Senbi the groom: young man, straight black bowl-cut hair with bangs, gold headband with a gold cobra, bare chest, blue-and-gold broad collar, gold bracers, white kilt with a blue-and-gold sash, brown sandals, thin black stick arms. the bride: black bob hair with straight bangs, gold headband with a red gem, white dress, blue-and-gold collar, gold sash, gold arm cuffs, light veil. the guests: Egyptian wedding guests in white linen with blue-and-gold collars and gold headbands, black bob hairstyles, some in white striped headdresses. Setting: sunny daytime wedding courtyard in ancient Alexandria, sandstone columns with painted blue-and-gold bands, long tables with white cloths and clay jars, orange cloth awnings, and a tall wooden entrance gate at the back-center that opens onto the street. The wedding goes on as if nothing is wrong: guests dance and clap, Senbi and the bride among them. Keep the upper third of the frame calm and uncluttered. Camera: locked-off and perfectly still, eye-level medium-wide shot of the wedding courtyard; the framing never changes (no tilt, pan, zoom or rising camera). Audio: off-screen British male narrator, warm and dry, begins speaking within half a second and says: ““Last day of Ancient Egypt”? Relax. Egypt survived. Its queen, less so.” Music: light ancient-Mediterranean wedding music (frame drums, reed flute, plucked strings), same theme in every clip, low under the voice. Sound effects: wedding crowd reactions without any words, one short comic sting. Final reminder: no character says any word; only the off-screen narrator speaks. Natural laughs, gasps and sighs are fine. No text, captions or logos in the frame.</w:t>
+        <w:t xml:space="preserve">VOICE RULE: only the voice-over narration speaks words; it is a voice only, never a person or character on screen. No character says any word and no one on screen lip-syncs to speech; characters communicate with facial expressions and body gestures. Natural non-verbal sounds are allowed and should sound real: laughing, giggling, gasping, sighing, groaning, cheering, coughing. Attached reference images, in order: the wedding courtyard. 2D hand-drawn stickman cartoon in the exact style of the reference images: thin black outlines, large expressive heads, thin stick arms, flat warm colors, playful documentary-comedy tone, 16:9. Characters, identical in every frame: Senbi the groom: young man, straight black bowl-cut hair with bangs, gold headband with a gold cobra, bare chest, blue-and-gold broad collar, gold bracers, white kilt with a blue-and-gold sash, brown sandals, thin black stick arms. the bride: black bob hair with straight bangs, gold headband with a red gem, white dress, blue-and-gold collar, gold sash, gold arm cuffs, light veil. the guests: Egyptian wedding guests in white linen with blue-and-gold collars and gold headbands, black bob hairstyles, some in white striped headdresses. Setting: sunny daytime wedding courtyard in ancient Alexandria, sandstone columns with painted blue-and-gold bands, long tables with white cloths and clay jars, orange cloth awnings, and a tall wooden entrance gate at the back-center that opens onto the street. The wedding goes on as if nothing is wrong: guests dance and clap, Senbi and the bride among them. Keep the upper third of the frame calm and uncluttered. Camera: locked-off and perfectly still, eye-level medium-wide shot of the wedding courtyard; the framing never changes (no tilt, pan, zoom or rising camera). Audio: voice-over narration only (a voice, never shown on screen; no narrator character appears): a British male voice, warm and dry, begins speaking within half a second and says: ““Last day of Ancient Egypt”? Relax. Egypt survived. Its queen, less so.” Music: light ancient-Mediterranean wedding music (frame drums, reed flute, plucked strings), same theme in every clip, low under the voice. Sound effects: wedding crowd reactions without any words, one short comic sting. Final reminder: no character says any word; only the voice-over narration speaks (voice only, nobody on screen is the narrator). Natural laughs, gasps and sighs are fine. No text, captions or logos in the frame.</w:t>
       </w:r>
     </w:p>
     <w:p>
@@ -767,7 +767,7 @@
           <w:sz w:val="20"/>
           <w:szCs w:val="20"/>
         </w:rPr>
-        <w:t xml:space="preserve">VOICE RULE: only the off-screen narrator speaks words. No character says any word and no one on screen lip-syncs to speech; characters communicate with facial expressions and body gestures. Natural non-verbal sounds are allowed and should sound real: laughing, giggling, gasping, sighing, groaning, cheering, coughing. Attached reference images, in order: Senbi, the groom, the wedding courtyard. 2D hand-drawn stickman cartoon in the exact style of the reference images: thin black outlines, large expressive heads, thin stick arms, flat warm colors, playful documentary-comedy tone, 16:9. Characters, identical in every frame: Senbi the groom: young man, straight black bowl-cut hair with bangs, gold headband with a gold cobra, bare chest, blue-and-gold broad collar, gold bracers, white kilt with a blue-and-gold sash, brown sandals, thin black stick arms. Setting: a shaded sandstone alcove beside the wedding courtyard, painted columns, warm daylight. Senbi stands before a bronze mirror. He straightens his blue-and-gold collar, checks his sash, practices a proud smile, then wipes his forehead with the back of his hand. Camera: eye-level medium shot of Senbi at the mirror; fixed except for an almost imperceptible 5% slow push-in, no tilt or pan. Audio: off-screen British male narrator, warm and dry, begins speaking within half a second and says: “Meet Senbi. He's getting married today, and has checked the mirror forty times.” Music: light ancient-Mediterranean wedding music (frame drums, reed flute, plucked strings), same theme in every clip, low under the voice. Sound effects: small fabric rustle, soft room tone. Final reminder: no character says any word; only the off-screen narrator speaks. Natural laughs, gasps and sighs are fine. No text, captions or logos in the frame.</w:t>
+        <w:t xml:space="preserve">VOICE RULE: only the voice-over narration speaks words; it is a voice only, never a person or character on screen. No character says any word and no one on screen lip-syncs to speech; characters communicate with facial expressions and body gestures. Natural non-verbal sounds are allowed and should sound real: laughing, giggling, gasping, sighing, groaning, cheering, coughing. Attached reference images, in order: Senbi, the groom, the wedding courtyard. 2D hand-drawn stickman cartoon in the exact style of the reference images: thin black outlines, large expressive heads, thin stick arms, flat warm colors, playful documentary-comedy tone, 16:9. Characters, identical in every frame: Senbi the groom: young man, straight black bowl-cut hair with bangs, gold headband with a gold cobra, bare chest, blue-and-gold broad collar, gold bracers, white kilt with a blue-and-gold sash, brown sandals, thin black stick arms. Setting: a shaded sandstone alcove beside the wedding courtyard, painted columns, warm daylight. Senbi stands before a bronze mirror. He straightens his blue-and-gold collar, checks his sash, practices a proud smile, then wipes his forehead with the back of his hand. Camera: eye-level medium shot of Senbi at the mirror; fixed except for an almost imperceptible 5% slow push-in, no tilt or pan. Audio: voice-over narration only (a voice, never shown on screen; no narrator character appears): a British male voice, warm and dry, begins speaking within half a second and says: “Meet Senbi. He's getting married today, and has checked the mirror forty times.” Music: light ancient-Mediterranean wedding music (frame drums, reed flute, plucked strings), same theme in every clip, low under the voice. Sound effects: small fabric rustle, soft room tone. Final reminder: no character says any word; only the voice-over narration speaks (voice only, nobody on screen is the narrator). Natural laughs, gasps and sighs are fine. No text, captions or logos in the frame.</w:t>
       </w:r>
     </w:p>
     <w:p>
@@ -840,7 +840,7 @@
           <w:sz w:val="20"/>
           <w:szCs w:val="20"/>
         </w:rPr>
-        <w:t xml:space="preserve">VOICE RULE: only the off-screen narrator speaks words. No character says any word and no one on screen lip-syncs to speech; characters communicate with facial expressions and body gestures. Natural non-verbal sounds are allowed and should sound real: laughing, giggling, gasping, sighing, groaning, cheering, coughing. Attached reference images, in order: Senbi, the groom. 2D hand-drawn stickman cartoon in the exact style of the reference images: thin black outlines, large expressive heads, thin stick arms, flat warm colors, playful documentary-comedy tone, 16:9. Characters, identical in every frame: Senbi the groom: young man, straight black bowl-cut hair with bangs, gold headband with a gold cobra, bare chest, blue-and-gold broad collar, gold bracers, white kilt with a blue-and-gold sash, brown sandals, thin black stick arms. Setting: a shaded sandstone alcove beside the wedding courtyard, painted columns, warm daylight. Senbi, full body. First he inspects a small bronze razor and runs a hand over his chin. Then he straightens his headband. Finally he adjusts his collar and strikes an overconfident hands-on-hips pose. Camera: locked-off and perfectly still, eye-level full-body medium shot of Senbi; all three actions happen inside the same frame; the framing never changes (no tilt, pan, zoom or rising camera). Audio: off-screen British male narrator, warm and dry, begins speaking within half a second and says: “Every groom has one job: look incredible, and pretend it took no effort.” Music: playful comic percussion over the wedding rhythm, low under the voice. Sound effects: light razor scrape, one comic boing. Final reminder: no character says any word; only the off-screen narrator speaks. Natural laughs, gasps and sighs are fine. No text, captions or logos in the frame.</w:t>
+        <w:t xml:space="preserve">VOICE RULE: only the voice-over narration speaks words; it is a voice only, never a person or character on screen. No character says any word and no one on screen lip-syncs to speech; characters communicate with facial expressions and body gestures. Natural non-verbal sounds are allowed and should sound real: laughing, giggling, gasping, sighing, groaning, cheering, coughing. Attached reference images, in order: Senbi, the groom. 2D hand-drawn stickman cartoon in the exact style of the reference images: thin black outlines, large expressive heads, thin stick arms, flat warm colors, playful documentary-comedy tone, 16:9. Characters, identical in every frame: Senbi the groom: young man, straight black bowl-cut hair with bangs, gold headband with a gold cobra, bare chest, blue-and-gold broad collar, gold bracers, white kilt with a blue-and-gold sash, brown sandals, thin black stick arms. Setting: a shaded sandstone alcove beside the wedding courtyard, painted columns, warm daylight. Senbi, full body. First he inspects a small bronze razor and runs a hand over his chin. Then he straightens his headband. Finally he adjusts his collar and strikes an overconfident hands-on-hips pose. Camera: locked-off and perfectly still, eye-level full-body medium shot of Senbi; all three actions happen inside the same frame; the framing never changes (no tilt, pan, zoom or rising camera). Audio: voice-over narration only (a voice, never shown on screen; no narrator character appears): a British male voice, warm and dry, begins speaking within half a second and says: “Every groom has one job: look incredible, and pretend it took no effort.” Music: playful comic percussion over the wedding rhythm, low under the voice. Sound effects: light razor scrape, one comic boing. Final reminder: no character says any word; only the voice-over narration speaks (voice only, nobody on screen is the narrator). Natural laughs, gasps and sighs are fine. No text, captions or logos in the frame.</w:t>
       </w:r>
     </w:p>
     <w:p>
@@ -913,7 +913,7 @@
           <w:sz w:val="20"/>
           <w:szCs w:val="20"/>
         </w:rPr>
-        <w:t xml:space="preserve">VOICE RULE: only the off-screen narrator speaks words. No character says any word and no one on screen lip-syncs to speech; characters communicate with facial expressions and body gestures. Natural non-verbal sounds are allowed and should sound real: laughing, giggling, gasping, sighing, groaning, cheering, coughing. Attached reference images, in order: the bride, the wedding courtyard. 2D hand-drawn stickman cartoon in the exact style of the reference images: thin black outlines, large expressive heads, thin stick arms, flat warm colors, playful documentary-comedy tone, 16:9. Characters, identical in every frame: the bride: black bob hair with straight bangs, gold headband with a red gem, white dress, blue-and-gold collar, gold sash, gold arm cuffs, light veil. Setting: a shaded sandstone alcove beside the wedding courtyard, painted columns, warm daylight. The bride stands at a bronze mirror. She adjusts her gold headband, touches her dark eye makeup, then gives herself a calm, confident nod. Camera: eye-level medium shot of the bride at the mirror; fixed except for an almost imperceptible 5% slow push-in, no tilt or pan. Audio: off-screen British male narrator, warm and dry, begins speaking within half a second and says: “His bride had been ready for an hour. She was the calm one.” Music: light ancient-Mediterranean wedding music (frame drums, reed flute, plucked strings), same theme in every clip, low under the voice. Sound effects: soft jewelry jingle. Final reminder: no character says any word; only the off-screen narrator speaks. Natural laughs, gasps and sighs are fine. No text, captions or logos in the frame.</w:t>
+        <w:t xml:space="preserve">VOICE RULE: only the voice-over narration speaks words; it is a voice only, never a person or character on screen. No character says any word and no one on screen lip-syncs to speech; characters communicate with facial expressions and body gestures. Natural non-verbal sounds are allowed and should sound real: laughing, giggling, gasping, sighing, groaning, cheering, coughing. Attached reference images, in order: the bride, the wedding courtyard. 2D hand-drawn stickman cartoon in the exact style of the reference images: thin black outlines, large expressive heads, thin stick arms, flat warm colors, playful documentary-comedy tone, 16:9. Characters, identical in every frame: the bride: black bob hair with straight bangs, gold headband with a red gem, white dress, blue-and-gold collar, gold sash, gold arm cuffs, light veil. Setting: a shaded sandstone alcove beside the wedding courtyard, painted columns, warm daylight. The bride stands at a bronze mirror. She adjusts her gold headband, touches her dark eye makeup, then gives herself a calm, confident nod. Camera: eye-level medium shot of the bride at the mirror; fixed except for an almost imperceptible 5% slow push-in, no tilt or pan. Audio: voice-over narration only (a voice, never shown on screen; no narrator character appears): a British male voice, warm and dry, begins speaking within half a second and says: “His bride had been ready for an hour. She was the calm one.” Music: light ancient-Mediterranean wedding music (frame drums, reed flute, plucked strings), same theme in every clip, low under the voice. Sound effects: soft jewelry jingle. Final reminder: no character says any word; only the voice-over narration speaks (voice only, nobody on screen is the narrator). Natural laughs, gasps and sighs are fine. No text, captions or logos in the frame.</w:t>
       </w:r>
     </w:p>
     <w:p>
@@ -986,7 +986,7 @@
           <w:sz w:val="20"/>
           <w:szCs w:val="20"/>
         </w:rPr>
-        <w:t xml:space="preserve">VOICE RULE: only the off-screen narrator speaks words. No character says any word and no one on screen lip-syncs to speech; characters communicate with facial expressions and body gestures. Natural non-verbal sounds are allowed and should sound real: laughing, giggling, gasping, sighing, groaning, cheering, coughing. Attached reference images, in order: the bride, the bride's relatives, the wedding courtyard. 2D hand-drawn stickman cartoon in the exact style of the reference images: thin black outlines, large expressive heads, thin stick arms, flat warm colors, playful documentary-comedy tone, 16:9. Characters, identical in every frame: the bride: black bob hair with straight bangs, gold headband with a red gem, white dress, blue-and-gold collar, gold sash, gold arm cuffs, light veil. the bride's father: bearded middle-aged man in a beige tunic with a purple sash. the scribe: older man in plain white linen holding a reed pen. Setting: a shaded sandstone alcove beside the wedding courtyard, painted columns, warm daylight. A scribe unrolls a papyrus on a low table. The bride points at one line while her father nods gravely. She then gives a small, satisfied smile. The papyrus shows only abstract hieroglyph-like marks. Camera: locked-off and perfectly still, eye-level medium two-shot: the scribe, the papyrus and the bride all in the same frame; the framing never changes (no tilt, pan, zoom or rising camera). Audio: off-screen British male narrator, warm and dry, begins speaking within half a second and says: “Then, paperwork. Real contracts survive: property, money, who owes what. Romance, with receipts.” Music: light ancient-Mediterranean wedding music (frame drums, reed flute, plucked strings), same theme in every clip, low under the voice. Sound effects: papyrus rustle, quill scratching. Final reminder: no character says any word; only the off-screen narrator speaks. Natural laughs, gasps and sighs are fine. No text, captions or logos in the frame.</w:t>
+        <w:t xml:space="preserve">VOICE RULE: only the voice-over narration speaks words; it is a voice only, never a person or character on screen. No character says any word and no one on screen lip-syncs to speech; characters communicate with facial expressions and body gestures. Natural non-verbal sounds are allowed and should sound real: laughing, giggling, gasping, sighing, groaning, cheering, coughing. Attached reference images, in order: the bride, the bride's relatives, the wedding courtyard. 2D hand-drawn stickman cartoon in the exact style of the reference images: thin black outlines, large expressive heads, thin stick arms, flat warm colors, playful documentary-comedy tone, 16:9. Characters, identical in every frame: the bride: black bob hair with straight bangs, gold headband with a red gem, white dress, blue-and-gold collar, gold sash, gold arm cuffs, light veil. the bride's father: bearded middle-aged man in a beige tunic with a purple sash. the scribe: older man in plain white linen holding a reed pen. Setting: a shaded sandstone alcove beside the wedding courtyard, painted columns, warm daylight. A scribe unrolls a papyrus on a low table. The bride points at one line while her father nods gravely. She then gives a small, satisfied smile. The papyrus shows only abstract hieroglyph-like marks. Camera: locked-off and perfectly still, eye-level medium two-shot: the scribe, the papyrus and the bride all in the same frame; the framing never changes (no tilt, pan, zoom or rising camera). Audio: voice-over narration only (a voice, never shown on screen; no narrator character appears): a British male voice, warm and dry, begins speaking within half a second and says: “Then, paperwork. Real contracts survive: property, money, who owes what. Romance, with receipts.” Music: light ancient-Mediterranean wedding music (frame drums, reed flute, plucked strings), same theme in every clip, low under the voice. Sound effects: papyrus rustle, quill scratching. Final reminder: no character says any word; only the voice-over narration speaks (voice only, nobody on screen is the narrator). Natural laughs, gasps and sighs are fine. No text, captions or logos in the frame.</w:t>
       </w:r>
     </w:p>
     <w:p>
@@ -1059,7 +1059,7 @@
           <w:sz w:val="20"/>
           <w:szCs w:val="20"/>
         </w:rPr>
-        <w:t xml:space="preserve">VOICE RULE: only the off-screen narrator speaks words. No character says any word and no one on screen lip-syncs to speech; characters communicate with facial expressions and body gestures. Natural non-verbal sounds are allowed and should sound real: laughing, giggling, gasping, sighing, groaning, cheering, coughing. Attached reference images, in order: the Egyptian wedding guests, the wedding courtyard. 2D hand-drawn stickman cartoon in the exact style of the reference images: thin black outlines, large expressive heads, thin stick arms, flat warm colors, playful documentary-comedy tone, 16:9. Characters, identical in every frame: the guests: Egyptian wedding guests in white linen with blue-and-gold collars and gold headbands, black bob hairstyles, some in white striped headdresses. the older woman: middle-aged woman in white linen with a red-orange sash. Setting: sunny daytime wedding courtyard in ancient Alexandria, sandstone columns with painted blue-and-gold bands, long tables with white cloths and clay jars, orange cloth awnings, and a tall wooden entrance gate at the back-center that opens onto the street. A long feast table in full daylight, loaded with flatbread, roast goose, figs, dates and clay beer jugs, guests eating. At the far end one guest tiptoes up, hides a fig behind his back, and is spotted by an unimpressed aunt. Camera: locked-off and perfectly still, eye-level wide-medium shot of the whole feast table; the sneaky guest stays in frame; the framing never changes (no tilt, pan, zoom or rising camera). Audio: off-screen British male narrator, warm and dry, begins speaking within half a second and says: “Bread, figs, roast goose, and beer, basically a food group. Someone was stealing.” Music: light ancient-Mediterranean wedding music (frame drums, reed flute, plucked strings), same theme in every clip, low under the voice. Sound effects: plates, cups, cheerful ambience, no words. Final reminder: no character says any word; only the off-screen narrator speaks. Natural laughs, gasps and sighs are fine. No text, captions or logos in the frame.</w:t>
+        <w:t xml:space="preserve">VOICE RULE: only the voice-over narration speaks words; it is a voice only, never a person or character on screen. No character says any word and no one on screen lip-syncs to speech; characters communicate with facial expressions and body gestures. Natural non-verbal sounds are allowed and should sound real: laughing, giggling, gasping, sighing, groaning, cheering, coughing. Attached reference images, in order: the Egyptian wedding guests, the wedding courtyard. 2D hand-drawn stickman cartoon in the exact style of the reference images: thin black outlines, large expressive heads, thin stick arms, flat warm colors, playful documentary-comedy tone, 16:9. Characters, identical in every frame: the guests: Egyptian wedding guests in white linen with blue-and-gold collars and gold headbands, black bob hairstyles, some in white striped headdresses. the older woman: middle-aged woman in white linen with a red-orange sash. Setting: sunny daytime wedding courtyard in ancient Alexandria, sandstone columns with painted blue-and-gold bands, long tables with white cloths and clay jars, orange cloth awnings, and a tall wooden entrance gate at the back-center that opens onto the street. A long feast table in full daylight, loaded with flatbread, roast goose, figs, dates and clay beer jugs, guests eating. At the far end one guest tiptoes up, hides a fig behind his back, and is spotted by an unimpressed aunt. Camera: locked-off and perfectly still, eye-level wide-medium shot of the whole feast table; the sneaky guest stays in frame; the framing never changes (no tilt, pan, zoom or rising camera). Audio: voice-over narration only (a voice, never shown on screen; no narrator character appears): a British male voice, warm and dry, begins speaking within half a second and says: “Bread, figs, roast goose, and beer, basically a food group. Someone was stealing.” Music: light ancient-Mediterranean wedding music (frame drums, reed flute, plucked strings), same theme in every clip, low under the voice. Sound effects: plates, cups, cheerful ambience, no words. Final reminder: no character says any word; only the voice-over narration speaks (voice only, nobody on screen is the narrator). Natural laughs, gasps and sighs are fine. No text, captions or logos in the frame.</w:t>
       </w:r>
     </w:p>
     <w:p>
@@ -1132,7 +1132,7 @@
           <w:sz w:val="20"/>
           <w:szCs w:val="20"/>
         </w:rPr>
-        <w:t xml:space="preserve">VOICE RULE: only the off-screen narrator speaks words. No character says any word and no one on screen lip-syncs to speech; characters communicate with facial expressions and body gestures. Natural non-verbal sounds are allowed and should sound real: laughing, giggling, gasping, sighing, groaning, cheering, coughing. Attached reference images, in order: the black cat, the wedding courtyard. 2D hand-drawn stickman cartoon in the exact style of the reference images: thin black outlines, large expressive heads, thin stick arms, flat warm colors, playful documentary-comedy tone, 16:9. Characters, identical in every frame: the cat: black with a small gold collar. the guests: Egyptian wedding guests in white linen with blue-and-gold collars and gold headbands, black bob hairstyles, some in white striped headdresses. Setting: sunny daytime wedding courtyard in ancient Alexandria, sandstone columns with painted blue-and-gold bands, long tables with white cloths and clay jars, orange cloth awnings, and a tall wooden entrance gate at the back-center that opens onto the street. A black cat with a small gold collar sits upright on a cushion at the head of the feast table. A guest bows deeply in front of it. The cat looks away and licks its paw. Camera: locked-off and perfectly still, eye-level medium shot with the cat and the bowing guest both in frame; the framing never changes (no tilt, pan, zoom or rising camera). Audio: off-screen British male narrator, warm and dry, begins speaking within half a second and says: “Egyptians adored cats. This one knew it. A guest bowed. The cat shrugged.” Music: playful comic percussion over the wedding rhythm, low under the voice. Sound effects: tiny comic sting, soft cat purr. Final reminder: no character says any word; only the off-screen narrator speaks. Natural laughs, gasps and sighs are fine. No text, captions or logos in the frame.</w:t>
+        <w:t xml:space="preserve">VOICE RULE: only the voice-over narration speaks words; it is a voice only, never a person or character on screen. No character says any word and no one on screen lip-syncs to speech; characters communicate with facial expressions and body gestures. Natural non-verbal sounds are allowed and should sound real: laughing, giggling, gasping, sighing, groaning, cheering, coughing. Attached reference images, in order: the black cat, the wedding courtyard. 2D hand-drawn stickman cartoon in the exact style of the reference images: thin black outlines, large expressive heads, thin stick arms, flat warm colors, playful documentary-comedy tone, 16:9. Characters, identical in every frame: the cat: black with a small gold collar. the guests: Egyptian wedding guests in white linen with blue-and-gold collars and gold headbands, black bob hairstyles, some in white striped headdresses. Setting: sunny daytime wedding courtyard in ancient Alexandria, sandstone columns with painted blue-and-gold bands, long tables with white cloths and clay jars, orange cloth awnings, and a tall wooden entrance gate at the back-center that opens onto the street. A black cat with a small gold collar sits upright on a cushion at the head of the feast table. A guest bows deeply in front of it. The cat looks away and licks its paw. Camera: locked-off and perfectly still, eye-level medium shot with the cat and the bowing guest both in frame; the framing never changes (no tilt, pan, zoom or rising camera). Audio: voice-over narration only (a voice, never shown on screen; no narrator character appears): a British male voice, warm and dry, begins speaking within half a second and says: “Egyptians adored cats. This one knew it. A guest bowed. The cat shrugged.” Music: playful comic percussion over the wedding rhythm, low under the voice. Sound effects: tiny comic sting, soft cat purr. Final reminder: no character says any word; only the voice-over narration speaks (voice only, nobody on screen is the narrator). Natural laughs, gasps and sighs are fine. No text, captions or logos in the frame.</w:t>
       </w:r>
     </w:p>
     <w:p>
@@ -1205,7 +1205,7 @@
           <w:sz w:val="20"/>
           <w:szCs w:val="20"/>
         </w:rPr>
-        <w:t xml:space="preserve">VOICE RULE: only the off-screen narrator speaks words. No character says any word and no one on screen lip-syncs to speech; characters communicate with facial expressions and body gestures. Natural non-verbal sounds are allowed and should sound real: laughing, giggling, gasping, sighing, groaning, cheering, coughing. Attached reference images, in order: the Egyptian wedding guests, the wedding courtyard. 2D hand-drawn stickman cartoon in the exact style of the reference images: thin black outlines, large expressive heads, thin stick arms, flat warm colors, playful documentary-comedy tone, 16:9. Characters, identical in every frame: Senbi the groom: young man, straight black bowl-cut hair with bangs, gold headband with a gold cobra, bare chest, blue-and-gold broad collar, gold bracers, white kilt with a blue-and-gold sash, brown sandals, thin black stick arms. the guests: Egyptian wedding guests in white linen with blue-and-gold collars and gold headbands, black bob hairstyles, some in white striped headdresses. Setting: sunny daytime wedding courtyard in ancient Alexandria, sandstone columns with painted blue-and-gold bands, long tables with white cloths and clay jars, orange cloth awnings, and a tall wooden entrance gate at the back-center that opens onto the street. Musicians seated at the side tables play harp, frame drum and reed flute while guests dance in the center. Senbi steps into the dance area with a confident grin. Camera: locked-off and perfectly still, eye-level wide shot of the musicians and dancers; the framing never changes (no tilt, pan, zoom or rising camera). Audio: off-screen British male narrator, warm and dry, begins speaking within half a second and says: “Then the music began, and Senbi decided this was his moment.” Music: light ancient-Mediterranean wedding music (frame drums, reed flute, plucked strings), same theme in every clip, low under the voice. Sound effects: harp and drums swelling, clapping. Final reminder: no character says any word; only the off-screen narrator speaks. Natural laughs, gasps and sighs are fine. No text, captions or logos in the frame.</w:t>
+        <w:t xml:space="preserve">VOICE RULE: only the voice-over narration speaks words; it is a voice only, never a person or character on screen. No character says any word and no one on screen lip-syncs to speech; characters communicate with facial expressions and body gestures. Natural non-verbal sounds are allowed and should sound real: laughing, giggling, gasping, sighing, groaning, cheering, coughing. Attached reference images, in order: the Egyptian wedding guests, the wedding courtyard. 2D hand-drawn stickman cartoon in the exact style of the reference images: thin black outlines, large expressive heads, thin stick arms, flat warm colors, playful documentary-comedy tone, 16:9. Characters, identical in every frame: Senbi the groom: young man, straight black bowl-cut hair with bangs, gold headband with a gold cobra, bare chest, blue-and-gold broad collar, gold bracers, white kilt with a blue-and-gold sash, brown sandals, thin black stick arms. the guests: Egyptian wedding guests in white linen with blue-and-gold collars and gold headbands, black bob hairstyles, some in white striped headdresses. Setting: sunny daytime wedding courtyard in ancient Alexandria, sandstone columns with painted blue-and-gold bands, long tables with white cloths and clay jars, orange cloth awnings, and a tall wooden entrance gate at the back-center that opens onto the street. Musicians seated at the side tables play harp, frame drum and reed flute while guests dance in the center. Senbi steps into the dance area with a confident grin. Camera: locked-off and perfectly still, eye-level wide shot of the musicians and dancers; the framing never changes (no tilt, pan, zoom or rising camera). Audio: voice-over narration only (a voice, never shown on screen; no narrator character appears): a British male voice, warm and dry, begins speaking within half a second and says: “Then the music began, and Senbi decided this was his moment.” Music: light ancient-Mediterranean wedding music (frame drums, reed flute, plucked strings), same theme in every clip, low under the voice. Sound effects: harp and drums swelling, clapping. Final reminder: no character says any word; only the voice-over narration speaks (voice only, nobody on screen is the narrator). Natural laughs, gasps and sighs are fine. No text, captions or logos in the frame.</w:t>
       </w:r>
     </w:p>
     <w:p>
@@ -1278,7 +1278,7 @@
           <w:sz w:val="20"/>
           <w:szCs w:val="20"/>
         </w:rPr>
-        <w:t xml:space="preserve">VOICE RULE: only the off-screen narrator speaks words. No character says any word and no one on screen lip-syncs to speech; characters communicate with facial expressions and body gestures. Natural non-verbal sounds are allowed and should sound real: laughing, giggling, gasping, sighing, groaning, cheering, coughing. Attached reference images, in order: Senbi, the groom, the wedding courtyard. 2D hand-drawn stickman cartoon in the exact style of the reference images: thin black outlines, large expressive heads, thin stick arms, flat warm colors, playful documentary-comedy tone, 16:9. Characters, identical in every frame: Senbi the groom: young man, straight black bowl-cut hair with bangs, gold headband with a gold cobra, bare chest, blue-and-gold broad collar, gold bracers, white kilt with a blue-and-gold sash, brown sandals, thin black stick arms. Setting: sunny daytime wedding courtyard in ancient Alexandria, sandstone columns with painted blue-and-gold bands, long tables with white cloths and clay jars, orange cloth awnings, and a tall wooden entrance gate at the back-center that opens onto the street. Senbi dances with huge confidence, loses his balance for a moment, recovers, and freezes in a proud pose as if the stumble was choreography. Camera: locked-off and perfectly still, eye-level medium shot of Senbi, full body in frame; the framing never changes (no tilt, pan, zoom or rising camera). Audio: off-screen British male narrator, warm and dry, begins speaking within half a second and says: “Senbi nearly fell, recovered, and pretended that was the choreography. Nobody believed him.” Music: playful comic percussion over the wedding rhythm, low under the voice. Sound effects: foot scuff, comic wobble, laughter. Final reminder: no character says any word; only the off-screen narrator speaks. Natural laughs, gasps and sighs are fine. No text, captions or logos in the frame.</w:t>
+        <w:t xml:space="preserve">VOICE RULE: only the voice-over narration speaks words; it is a voice only, never a person or character on screen. No character says any word and no one on screen lip-syncs to speech; characters communicate with facial expressions and body gestures. Natural non-verbal sounds are allowed and should sound real: laughing, giggling, gasping, sighing, groaning, cheering, coughing. Attached reference images, in order: Senbi, the groom, the wedding courtyard. 2D hand-drawn stickman cartoon in the exact style of the reference images: thin black outlines, large expressive heads, thin stick arms, flat warm colors, playful documentary-comedy tone, 16:9. Characters, identical in every frame: Senbi the groom: young man, straight black bowl-cut hair with bangs, gold headband with a gold cobra, bare chest, blue-and-gold broad collar, gold bracers, white kilt with a blue-and-gold sash, brown sandals, thin black stick arms. Setting: sunny daytime wedding courtyard in ancient Alexandria, sandstone columns with painted blue-and-gold bands, long tables with white cloths and clay jars, orange cloth awnings, and a tall wooden entrance gate at the back-center that opens onto the street. Senbi dances with huge confidence, loses his balance for a moment, recovers, and freezes in a proud pose as if the stumble was choreography. Camera: locked-off and perfectly still, eye-level medium shot of Senbi, full body in frame; the framing never changes (no tilt, pan, zoom or rising camera). Audio: voice-over narration only (a voice, never shown on screen; no narrator character appears): a British male voice, warm and dry, begins speaking within half a second and says: “Senbi nearly fell, recovered, and pretended that was the choreography. Nobody believed him.” Music: playful comic percussion over the wedding rhythm, low under the voice. Sound effects: foot scuff, comic wobble, laughter. Final reminder: no character says any word; only the voice-over narration speaks (voice only, nobody on screen is the narrator). Natural laughs, gasps and sighs are fine. No text, captions or logos in the frame.</w:t>
       </w:r>
     </w:p>
     <w:p>
@@ -1351,7 +1351,7 @@
           <w:sz w:val="20"/>
           <w:szCs w:val="20"/>
         </w:rPr>
-        <w:t xml:space="preserve">VOICE RULE: only the off-screen narrator speaks words. No character says any word and no one on screen lip-syncs to speech; characters communicate with facial expressions and body gestures. Natural non-verbal sounds are allowed and should sound real: laughing, giggling, gasping, sighing, groaning, cheering, coughing. Attached reference images, in order: the bride, the wedding courtyard. 2D hand-drawn stickman cartoon in the exact style of the reference images: thin black outlines, large expressive heads, thin stick arms, flat warm colors, playful documentary-comedy tone, 16:9. Characters, identical in every frame: Senbi the groom: young man, straight black bowl-cut hair with bangs, gold headband with a gold cobra, bare chest, blue-and-gold broad collar, gold bracers, white kilt with a blue-and-gold sash, brown sandals, thin black stick arms. the bride: black bob hair with straight bangs, gold headband with a red gem, white dress, blue-and-gold collar, gold sash, gold arm cuffs, light veil. Setting: sunny daytime wedding courtyard in ancient Alexandria, sandstone columns with painted blue-and-gold bands, long tables with white cloths and clay jars, orange cloth awnings, and a tall wooden entrance gate at the back-center that opens onto the street. The bride watches Senbi dance, amused. She tries to stay composed, then hides her smile behind her hand. Camera: locked-off and perfectly still, eye-level close-up of the bride's face; the framing never changes (no tilt, pan, zoom or rising camera). Audio: off-screen British male narrator, warm and dry, begins speaking within half a second and says: “His bride was trying very hard not to laugh. She loved him. Mostly.” Music: light ancient-Mediterranean wedding music (frame drums, reed flute, plucked strings), same theme in every clip, low under the voice. Sound effects: suppressed giggle. Final reminder: no character says any word; only the off-screen narrator speaks. Natural laughs, gasps and sighs are fine. No text, captions or logos in the frame.</w:t>
+        <w:t xml:space="preserve">VOICE RULE: only the voice-over narration speaks words; it is a voice only, never a person or character on screen. No character says any word and no one on screen lip-syncs to speech; characters communicate with facial expressions and body gestures. Natural non-verbal sounds are allowed and should sound real: laughing, giggling, gasping, sighing, groaning, cheering, coughing. Attached reference images, in order: the bride, the wedding courtyard. 2D hand-drawn stickman cartoon in the exact style of the reference images: thin black outlines, large expressive heads, thin stick arms, flat warm colors, playful documentary-comedy tone, 16:9. Characters, identical in every frame: the bride: black bob hair with straight bangs, gold headband with a red gem, white dress, blue-and-gold collar, gold sash, gold arm cuffs, light veil. Setting: sunny daytime wedding courtyard in ancient Alexandria, sandstone columns with painted blue-and-gold bands, long tables with white cloths and clay jars, orange cloth awnings, and a tall wooden entrance gate at the back-center that opens onto the street. The bride watches Senbi dance, amused. She tries to stay composed, then hides her smile behind her hand. Camera: locked-off and perfectly still, eye-level close-up of the bride's face; the framing never changes (no tilt, pan, zoom or rising camera). Audio: voice-over narration only (a voice, never shown on screen; no narrator character appears): a British male voice, warm and dry, begins speaking within half a second and says: “His bride was trying very hard not to laugh. She loved him. Mostly.” Music: light ancient-Mediterranean wedding music (frame drums, reed flute, plucked strings), same theme in every clip, low under the voice. Sound effects: suppressed giggle. Final reminder: no character says any word; only the voice-over narration speaks (voice only, nobody on screen is the narrator). Natural laughs, gasps and sighs are fine. No text, captions or logos in the frame.</w:t>
       </w:r>
     </w:p>
     <w:p>
@@ -1424,7 +1424,7 @@
           <w:sz w:val="20"/>
           <w:szCs w:val="20"/>
         </w:rPr>
-        <w:t xml:space="preserve">VOICE RULE: only the off-screen narrator speaks words. No character says any word and no one on screen lip-syncs to speech; characters communicate with facial expressions and body gestures. Natural non-verbal sounds are allowed and should sound real: laughing, giggling, gasping, sighing, groaning, cheering, coughing. Attached reference images, in order: the Egyptian wedding guests, the wedding courtyard. 2D hand-drawn stickman cartoon in the exact style of the reference images: thin black outlines, large expressive heads, thin stick arms, flat warm colors, playful documentary-comedy tone, 16:9. Characters, identical in every frame: the guests: Egyptian wedding guests in white linen with blue-and-gold collars and gold headbands, black bob hairstyles, some in white striped headdresses. Setting: sunny daytime wedding courtyard in ancient Alexandria, sandstone columns with painted blue-and-gold bands, long tables with white cloths and clay jars, orange cloth awnings, and a tall wooden entrance gate at the back-center that opens onto the street. Young and old guests clap, dance and raise clay cups in a joyful crowd. Camera: locked-off and perfectly still, eye-level wide-medium shot with several guests in frame; the framing never changes (no tilt, pan, zoom or rising camera). Audio: off-screen British male narrator, warm and dry, begins speaking within half a second and says: “Everyone danced and raised a cup, the one thing every wedding agrees on.” Music: light ancient-Mediterranean wedding music (frame drums, reed flute, plucked strings), same theme in every clip, low under the voice. Sound effects: clapping, cups clinking, laughter. Final reminder: no character says any word; only the off-screen narrator speaks. Natural laughs, gasps and sighs are fine. No text, captions or logos in the frame.</w:t>
+        <w:t xml:space="preserve">VOICE RULE: only the voice-over narration speaks words; it is a voice only, never a person or character on screen. No character says any word and no one on screen lip-syncs to speech; characters communicate with facial expressions and body gestures. Natural non-verbal sounds are allowed and should sound real: laughing, giggling, gasping, sighing, groaning, cheering, coughing. Attached reference images, in order: the Egyptian wedding guests, the wedding courtyard. 2D hand-drawn stickman cartoon in the exact style of the reference images: thin black outlines, large expressive heads, thin stick arms, flat warm colors, playful documentary-comedy tone, 16:9. Characters, identical in every frame: the guests: Egyptian wedding guests in white linen with blue-and-gold collars and gold headbands, black bob hairstyles, some in white striped headdresses. Setting: sunny daytime wedding courtyard in ancient Alexandria, sandstone columns with painted blue-and-gold bands, long tables with white cloths and clay jars, orange cloth awnings, and a tall wooden entrance gate at the back-center that opens onto the street. Young and old guests clap, dance and raise clay cups in a joyful crowd. Camera: locked-off and perfectly still, eye-level wide-medium shot with several guests in frame; the framing never changes (no tilt, pan, zoom or rising camera). Audio: voice-over narration only (a voice, never shown on screen; no narrator character appears): a British male voice, warm and dry, begins speaking within half a second and says: “Everyone danced and raised a cup, the one thing every wedding agrees on.” Music: light ancient-Mediterranean wedding music (frame drums, reed flute, plucked strings), same theme in every clip, low under the voice. Sound effects: clapping, cups clinking, laughter. Final reminder: no character says any word; only the voice-over narration speaks (voice only, nobody on screen is the narrator). Natural laughs, gasps and sighs are fine. No text, captions or logos in the frame.</w:t>
       </w:r>
     </w:p>
     <w:p>
@@ -1497,7 +1497,7 @@
           <w:sz w:val="20"/>
           <w:szCs w:val="20"/>
         </w:rPr>
-        <w:t xml:space="preserve">VOICE RULE: only the off-screen narrator speaks words. No character says any word and no one on screen lip-syncs to speech; characters communicate with facial expressions and body gestures. Natural non-verbal sounds are allowed and should sound real: laughing, giggling, gasping, sighing, groaning, cheering, coughing. Attached reference images, in order: the Egyptian wedding guests, the wedding courtyard. 2D hand-drawn stickman cartoon in the exact style of the reference images: thin black outlines, large expressive heads, thin stick arms, flat warm colors, playful documentary-comedy tone, 16:9. Characters, identical in every frame: the older woman: middle-aged woman in white linen with a red-orange sash. Setting: sunny daytime wedding courtyard in ancient Alexandria, sandstone columns with painted blue-and-gold bands, long tables with white cloths and clay jars, orange cloth awnings, and a tall wooden entrance gate at the back-center that opens onto the street. An older woman at the feast table inspects a dish with exaggerated seriousness, tastes it, narrows her eyes, then gives a reluctant nod. Camera: locked-off and perfectly still, eye-level close-up of the woman's face and the dish; the framing never changes (no tilt, pan, zoom or rising camera). Audio: off-screen British male narrator, warm and dry, begins speaking within half a second and says: “One aunt inspected the food like a tax auditor. Verdict: suspicious, but edible.” Music: playful comic percussion over the wedding rhythm, low under the voice. Sound effects: spoon tapping a bowl, suspicious hum. Final reminder: no character says any word; only the off-screen narrator speaks. Natural laughs, gasps and sighs are fine. No text, captions or logos in the frame.</w:t>
+        <w:t xml:space="preserve">VOICE RULE: only the voice-over narration speaks words; it is a voice only, never a person or character on screen. No character says any word and no one on screen lip-syncs to speech; characters communicate with facial expressions and body gestures. Natural non-verbal sounds are allowed and should sound real: laughing, giggling, gasping, sighing, groaning, cheering, coughing. Attached reference images, in order: the Egyptian wedding guests, the wedding courtyard. 2D hand-drawn stickman cartoon in the exact style of the reference images: thin black outlines, large expressive heads, thin stick arms, flat warm colors, playful documentary-comedy tone, 16:9. Characters, identical in every frame: the older woman: middle-aged woman in white linen with a red-orange sash. Setting: sunny daytime wedding courtyard in ancient Alexandria, sandstone columns with painted blue-and-gold bands, long tables with white cloths and clay jars, orange cloth awnings, and a tall wooden entrance gate at the back-center that opens onto the street. An older woman at the feast table inspects a dish with exaggerated seriousness, tastes it, narrows her eyes, then gives a reluctant nod. Camera: locked-off and perfectly still, eye-level close-up of the woman's face and the dish; the framing never changes (no tilt, pan, zoom or rising camera). Audio: voice-over narration only (a voice, never shown on screen; no narrator character appears): a British male voice, warm and dry, begins speaking within half a second and says: “One aunt inspected the food like a tax auditor. Verdict: suspicious, but edible.” Music: playful comic percussion over the wedding rhythm, low under the voice. Sound effects: spoon tapping a bowl, suspicious hum. Final reminder: no character says any word; only the voice-over narration speaks (voice only, nobody on screen is the narrator). Natural laughs, gasps and sighs are fine. No text, captions or logos in the frame.</w:t>
       </w:r>
     </w:p>
     <w:p>
@@ -1570,7 +1570,7 @@
           <w:sz w:val="20"/>
           <w:szCs w:val="20"/>
         </w:rPr>
-        <w:t xml:space="preserve">VOICE RULE: only the off-screen narrator speaks words. No character says any word and no one on screen lip-syncs to speech; characters communicate with facial expressions and body gestures. Natural non-verbal sounds are allowed and should sound real: laughing, giggling, gasping, sighing, groaning, cheering, coughing. Attached reference images, in order: Senbi, the groom, the bride's relatives, the wedding courtyard. 2D hand-drawn stickman cartoon in the exact style of the reference images: thin black outlines, large expressive heads, thin stick arms, flat warm colors, playful documentary-comedy tone, 16:9. Characters, identical in every frame: Senbi the groom: young man, straight black bowl-cut hair with bangs, gold headband with a gold cobra, bare chest, blue-and-gold broad collar, gold bracers, white kilt with a blue-and-gold sash, brown sandals, thin black stick arms. the bride's father: bearded middle-aged man in a beige tunic with a purple sash. Setting: sunny daytime wedding courtyard in ancient Alexandria, sandstone columns with painted blue-and-gold bands, long tables with white cloths and clay jars, orange cloth awnings, and a tall wooden entrance gate at the back-center that opens onto the street. The bride's father proudly presents Senbi with a wooden headrest. Senbi accepts it with a polite smile, glances at it, and his smile tightens with concern. Camera: locked-off and perfectly still, eye-level medium two-shot of Senbi and the father; the framing never changes (no tilt, pan, zoom or rising camera). Audio: off-screen British male narrator, warm and dry, begins speaking within half a second and says: “Then, the gift: a wooden headrest. Egyptians really did sleep on these.” Music: light ancient-Mediterranean wedding music (frame drums, reed flute, plucked strings), same theme in every clip, low under the voice. Sound effects: one wooden knock. Final reminder: no character says any word; only the off-screen narrator speaks. Natural laughs, gasps and sighs are fine. No text, captions or logos in the frame.</w:t>
+        <w:t xml:space="preserve">VOICE RULE: only the voice-over narration speaks words; it is a voice only, never a person or character on screen. No character says any word and no one on screen lip-syncs to speech; characters communicate with facial expressions and body gestures. Natural non-verbal sounds are allowed and should sound real: laughing, giggling, gasping, sighing, groaning, cheering, coughing. Attached reference images, in order: Senbi, the groom, the bride's relatives, the wedding courtyard. 2D hand-drawn stickman cartoon in the exact style of the reference images: thin black outlines, large expressive heads, thin stick arms, flat warm colors, playful documentary-comedy tone, 16:9. Characters, identical in every frame: Senbi the groom: young man, straight black bowl-cut hair with bangs, gold headband with a gold cobra, bare chest, blue-and-gold broad collar, gold bracers, white kilt with a blue-and-gold sash, brown sandals, thin black stick arms. the bride's father: bearded middle-aged man in a beige tunic with a purple sash. Setting: sunny daytime wedding courtyard in ancient Alexandria, sandstone columns with painted blue-and-gold bands, long tables with white cloths and clay jars, orange cloth awnings, and a tall wooden entrance gate at the back-center that opens onto the street. The bride's father proudly presents Senbi with a wooden headrest. Senbi accepts it with a polite smile, glances at it, and his smile tightens with concern. Camera: locked-off and perfectly still, eye-level medium two-shot of Senbi and the father; the framing never changes (no tilt, pan, zoom or rising camera). Audio: voice-over narration only (a voice, never shown on screen; no narrator character appears): a British male voice, warm and dry, begins speaking within half a second and says: “Then, the gift: a wooden headrest. Egyptians really did sleep on these.” Music: light ancient-Mediterranean wedding music (frame drums, reed flute, plucked strings), same theme in every clip, low under the voice. Sound effects: one wooden knock. Final reminder: no character says any word; only the voice-over narration speaks (voice only, nobody on screen is the narrator). Natural laughs, gasps and sighs are fine. No text, captions or logos in the frame.</w:t>
       </w:r>
     </w:p>
     <w:p>
@@ -1643,7 +1643,7 @@
           <w:sz w:val="20"/>
           <w:szCs w:val="20"/>
         </w:rPr>
-        <w:t xml:space="preserve">VOICE RULE: only the off-screen narrator speaks words. No character says any word and no one on screen lip-syncs to speech; characters communicate with facial expressions and body gestures. Natural non-verbal sounds are allowed and should sound real: laughing, giggling, gasping, sighing, groaning, cheering, coughing. Attached reference images, in order: Senbi, the groom. 2D hand-drawn stickman cartoon in the exact style of the reference images: thin black outlines, large expressive heads, thin stick arms, flat warm colors, playful documentary-comedy tone, 16:9. Characters, identical in every frame: Senbi the groom: young man, straight black bowl-cut hair with bangs, gold headband with a gold cobra, bare chest, blue-and-gold broad collar, gold bracers, white kilt with a blue-and-gold sash, brown sandals, thin black stick arms. Setting: sunny daytime wedding courtyard in ancient Alexandria, sandstone columns with painted blue-and-gold bands, long tables with white cloths and clay jars, orange cloth awnings, and a tall wooden entrance gate at the back-center that opens onto the street. Senbi sits on a reed mat and tries resting his neck on the wooden headrest. He freezes in discomfort, then gives a stiff thumbs-up. Camera: locked-off and perfectly still, eye-level medium shot of Senbi with the headrest; the framing never changes (no tilt, pan, zoom or rising camera). Audio: off-screen British male narrator, warm and dry, begins speaking within half a second and says: “Senbi lay down. His neck filed a formal complaint. His thumbs-up said otherwise.” Music: playful comic percussion over the wedding rhythm, low under the voice. Sound effects: comic wooden creak. Final reminder: no character says any word; only the off-screen narrator speaks. Natural laughs, gasps and sighs are fine. No text, captions or logos in the frame.</w:t>
+        <w:t xml:space="preserve">VOICE RULE: only the voice-over narration speaks words; it is a voice only, never a person or character on screen. No character says any word and no one on screen lip-syncs to speech; characters communicate with facial expressions and body gestures. Natural non-verbal sounds are allowed and should sound real: laughing, giggling, gasping, sighing, groaning, cheering, coughing. Attached reference images, in order: Senbi, the groom. 2D hand-drawn stickman cartoon in the exact style of the reference images: thin black outlines, large expressive heads, thin stick arms, flat warm colors, playful documentary-comedy tone, 16:9. Characters, identical in every frame: Senbi the groom: young man, straight black bowl-cut hair with bangs, gold headband with a gold cobra, bare chest, blue-and-gold broad collar, gold bracers, white kilt with a blue-and-gold sash, brown sandals, thin black stick arms. Setting: sunny daytime wedding courtyard in ancient Alexandria, sandstone columns with painted blue-and-gold bands, long tables with white cloths and clay jars, orange cloth awnings, and a tall wooden entrance gate at the back-center that opens onto the street. Senbi sits on a reed mat and tries resting his neck on the wooden headrest. He freezes in discomfort, then gives a stiff thumbs-up. Camera: locked-off and perfectly still, eye-level medium shot of Senbi with the headrest; the framing never changes (no tilt, pan, zoom or rising camera). Audio: voice-over narration only (a voice, never shown on screen; no narrator character appears): a British male voice, warm and dry, begins speaking within half a second and says: “Senbi lay down. His neck filed a formal complaint. His thumbs-up said otherwise.” Music: playful comic percussion over the wedding rhythm, low under the voice. Sound effects: comic wooden creak. Final reminder: no character says any word; only the voice-over narration speaks (voice only, nobody on screen is the narrator). Natural laughs, gasps and sighs are fine. No text, captions or logos in the frame.</w:t>
       </w:r>
     </w:p>
     <w:p>
@@ -1716,7 +1716,7 @@
           <w:sz w:val="20"/>
           <w:szCs w:val="20"/>
         </w:rPr>
-        <w:t xml:space="preserve">VOICE RULE: only the off-screen narrator speaks words. No character says any word and no one on screen lip-syncs to speech; characters communicate with facial expressions and body gestures. Natural non-verbal sounds are allowed and should sound real: laughing, giggling, gasping, sighing, groaning, cheering, coughing. Attached reference images, in order: the Egyptian wedding guests, the bride, Senbi, the groom. 2D hand-drawn stickman cartoon in the exact style of the reference images: thin black outlines, large expressive heads, thin stick arms, flat warm colors, playful documentary-comedy tone, 16:9. Characters, identical in every frame: Senbi the groom: young man, straight black bowl-cut hair with bangs, gold headband with a gold cobra, bare chest, blue-and-gold broad collar, gold bracers, white kilt with a blue-and-gold sash, brown sandals, thin black stick arms. the bride: black bob hair with straight bangs, gold headband with a red gem, white dress, blue-and-gold collar, gold sash, gold arm cuffs, light veil. the guests: Egyptian wedding guests in white linen with blue-and-gold collars and gold headbands, black bob hairstyles, some in white striped headdresses. the musicians: guests in white linen playing harp, frame drum and reed flute. Setting: sunny daytime wedding courtyard in ancient Alexandria, sandstone columns with painted blue-and-gold bands, long tables with white cloths and clay jars, orange cloth awnings, and a tall wooden entrance gate at the back-center that opens onto the street. The wedding at its happiest: Senbi and the bride together, musicians playing, guests dancing, banners and flowers swaying lightly in the breeze, warm sunlight. Camera: wide shot of the whole courtyard at eye level; fixed except for an almost imperceptible 5% slow push-in, no tilt or pan. Audio: off-screen British male narrator, warm and dry, begins speaking within half a second and says: “For a few perfect minutes, everything was exactly right. Enjoy this part.” Music: light ancient-Mediterranean wedding music (frame drums, reed flute, plucked strings), same theme in every clip, low under the voice. Sound effects: applause, drums, wind in the banners. Final reminder: no character says any word; only the off-screen narrator speaks. Natural laughs, gasps and sighs are fine. No text, captions or logos in the frame.</w:t>
+        <w:t xml:space="preserve">VOICE RULE: only the voice-over narration speaks words; it is a voice only, never a person or character on screen. No character says any word and no one on screen lip-syncs to speech; characters communicate with facial expressions and body gestures. Natural non-verbal sounds are allowed and should sound real: laughing, giggling, gasping, sighing, groaning, cheering, coughing. Attached reference images, in order: the Egyptian wedding guests, the bride, Senbi, the groom. 2D hand-drawn stickman cartoon in the exact style of the reference images: thin black outlines, large expressive heads, thin stick arms, flat warm colors, playful documentary-comedy tone, 16:9. Characters, identical in every frame: Senbi the groom: young man, straight black bowl-cut hair with bangs, gold headband with a gold cobra, bare chest, blue-and-gold broad collar, gold bracers, white kilt with a blue-and-gold sash, brown sandals, thin black stick arms. the bride: black bob hair with straight bangs, gold headband with a red gem, white dress, blue-and-gold collar, gold sash, gold arm cuffs, light veil. the guests: Egyptian wedding guests in white linen with blue-and-gold collars and gold headbands, black bob hairstyles, some in white striped headdresses. the musicians: guests in white linen playing harp, frame drum and reed flute. Setting: sunny daytime wedding courtyard in ancient Alexandria, sandstone columns with painted blue-and-gold bands, long tables with white cloths and clay jars, orange cloth awnings, and a tall wooden entrance gate at the back-center that opens onto the street. The wedding at its happiest: Senbi and the bride together, musicians playing, guests dancing, banners and flowers swaying lightly in the breeze, warm sunlight. Camera: wide shot of the whole courtyard at eye level; fixed except for an almost imperceptible 5% slow push-in, no tilt or pan. Audio: voice-over narration only (a voice, never shown on screen; no narrator character appears): a British male voice, warm and dry, begins speaking within half a second and says: “For a few perfect minutes, everything was exactly right. Enjoy this part.” Music: light ancient-Mediterranean wedding music (frame drums, reed flute, plucked strings), same theme in every clip, low under the voice. Sound effects: applause, drums, wind in the banners. Final reminder: no character says any word; only the voice-over narration speaks (voice only, nobody on screen is the narrator). Natural laughs, gasps and sighs are fine. No text, captions or logos in the frame.</w:t>
       </w:r>
     </w:p>
     <w:p>
@@ -1789,7 +1789,7 @@
           <w:sz w:val="20"/>
           <w:szCs w:val="20"/>
         </w:rPr>
-        <w:t xml:space="preserve">VOICE RULE: only the off-screen narrator speaks words. No character says any word and no one on screen lip-syncs to speech; characters communicate with facial expressions and body gestures. Natural non-verbal sounds are allowed and should sound real: laughing, giggling, gasping, sighing, groaning, cheering, coughing. Attached reference images, in order: the wedding courtyard. 2D hand-drawn stickman cartoon in the exact style of the reference images: thin black outlines, large expressive heads, thin stick arms, flat warm colors, playful documentary-comedy tone, 16:9. Characters, identical in every frame: the guests: Egyptian wedding guests in white linen with blue-and-gold collars and gold headbands, black bob hairstyles, some in white striped headdresses. Setting: sunny daytime wedding courtyard in ancient Alexandria, sandstone columns with painted blue-and-gold bands, long tables with white cloths and clay jars, orange cloth awnings, and a tall wooden entrance gate at the back-center that opens onto the street. A small clay cup on a wedding table trembles slightly, as if from distant footsteps. Out-of-focus guests dance behind it, unaware. Camera: locked-off and perfectly still, extreme close-up of the cup; only the cup vibrates, the camera does not; the framing never changes (no tilt, pan, zoom or rising camera). Audio: off-screen British male narrator, warm and dry, begins speaking within half a second and says: “Then a small cup on the table began to tremble. Nobody noticed.” Music: light ancient-Mediterranean wedding music (frame drums, reed flute, plucked strings) with a faint uneasy undertone, same theme in every clip, low under the voice. Sound effects: ceramic cup rattling, faint rumble. Final reminder: no character says any word; only the off-screen narrator speaks. Natural laughs, gasps and sighs are fine. No text, captions or logos in the frame.</w:t>
+        <w:t xml:space="preserve">VOICE RULE: only the voice-over narration speaks words; it is a voice only, never a person or character on screen. No character says any word and no one on screen lip-syncs to speech; characters communicate with facial expressions and body gestures. Natural non-verbal sounds are allowed and should sound real: laughing, giggling, gasping, sighing, groaning, cheering, coughing. Attached reference images, in order: the wedding courtyard. 2D hand-drawn stickman cartoon in the exact style of the reference images: thin black outlines, large expressive heads, thin stick arms, flat warm colors, playful documentary-comedy tone, 16:9. Characters, identical in every frame: the guests: Egyptian wedding guests in white linen with blue-and-gold collars and gold headbands, black bob hairstyles, some in white striped headdresses. Setting: sunny daytime wedding courtyard in ancient Alexandria, sandstone columns with painted blue-and-gold bands, long tables with white cloths and clay jars, orange cloth awnings, and a tall wooden entrance gate at the back-center that opens onto the street. A small clay cup on a wedding table trembles slightly, as if from distant footsteps. Out-of-focus guests dance behind it, unaware. Camera: locked-off and perfectly still, extreme close-up of the cup; only the cup vibrates, the camera does not; the framing never changes (no tilt, pan, zoom or rising camera). Audio: voice-over narration only (a voice, never shown on screen; no narrator character appears): a British male voice, warm and dry, begins speaking within half a second and says: “Then a small cup on the table began to tremble. Nobody noticed.” Music: light ancient-Mediterranean wedding music (frame drums, reed flute, plucked strings) with a faint uneasy undertone, same theme in every clip, low under the voice. Sound effects: ceramic cup rattling, faint rumble. Final reminder: no character says any word; only the voice-over narration speaks (voice only, nobody on screen is the narrator). Natural laughs, gasps and sighs are fine. No text, captions or logos in the frame.</w:t>
       </w:r>
     </w:p>
     <w:p>
@@ -1862,7 +1862,7 @@
           <w:sz w:val="20"/>
           <w:szCs w:val="20"/>
         </w:rPr>
-        <w:t xml:space="preserve">VOICE RULE: only the off-screen narrator speaks words. No character says any word and no one on screen lip-syncs to speech; characters communicate with facial expressions and body gestures. Natural non-verbal sounds are allowed and should sound real: laughing, giggling, gasping, sighing, groaning, cheering, coughing. Attached reference images, in order: the Egyptian wedding guests, the wedding courtyard. 2D hand-drawn stickman cartoon in the exact style of the reference images: thin black outlines, large expressive heads, thin stick arms, flat warm colors, playful documentary-comedy tone, 16:9. Characters, identical in every frame: the guests: Egyptian wedding guests in white linen with blue-and-gold collars and gold headbands, black bob hairstyles, some in white striped headdresses. the musicians: guests in white linen playing harp, frame drum and reed flute. Setting: sunny daytime wedding courtyard in ancient Alexandria, sandstone columns with painted blue-and-gold bands, long tables with white cloths and clay jars, orange cloth awnings, and a tall wooden entrance gate at the back-center that opens onto the street. An Egyptian musician suddenly stops playing and looks toward the open gate visible behind him; his joy turns to alertness. The dancers behind him keep dancing for one more beat. Camera: locked-off and perfectly still, eye-level medium shot of the musician with the entrance visible behind him; the framing never changes (no tilt, pan, zoom or rising camera). Audio: off-screen British male narrator, warm and dry, begins speaking within half a second and says: “The musician noticed. He stopped. Everyone else danced one more beat, blissfully unaware.” Music: music nearly silent. Sound effects: music and drums cut out, one drum stops. Final reminder: no character says any word; only the off-screen narrator speaks. Natural laughs, gasps and sighs are fine. No text, captions or logos in the frame.</w:t>
+        <w:t xml:space="preserve">VOICE RULE: only the voice-over narration speaks words; it is a voice only, never a person or character on screen. No character says any word and no one on screen lip-syncs to speech; characters communicate with facial expressions and body gestures. Natural non-verbal sounds are allowed and should sound real: laughing, giggling, gasping, sighing, groaning, cheering, coughing. Attached reference images, in order: the Egyptian wedding guests, the wedding courtyard. 2D hand-drawn stickman cartoon in the exact style of the reference images: thin black outlines, large expressive heads, thin stick arms, flat warm colors, playful documentary-comedy tone, 16:9. Characters, identical in every frame: the guests: Egyptian wedding guests in white linen with blue-and-gold collars and gold headbands, black bob hairstyles, some in white striped headdresses. the musicians: guests in white linen playing harp, frame drum and reed flute. Setting: sunny daytime wedding courtyard in ancient Alexandria, sandstone columns with painted blue-and-gold bands, long tables with white cloths and clay jars, orange cloth awnings, and a tall wooden entrance gate at the back-center that opens onto the street. An Egyptian musician suddenly stops playing and looks toward the open gate visible behind him; his joy turns to alertness. The dancers behind him keep dancing for one more beat. Camera: locked-off and perfectly still, eye-level medium shot of the musician with the entrance visible behind him; the framing never changes (no tilt, pan, zoom or rising camera). Audio: voice-over narration only (a voice, never shown on screen; no narrator character appears): a British male voice, warm and dry, begins speaking within half a second and says: “The musician noticed. He stopped. Everyone else danced one more beat, blissfully unaware.” Music: music nearly silent. Sound effects: music and drums cut out, one drum stops. Final reminder: no character says any word; only the voice-over narration speaks (voice only, nobody on screen is the narrator). Natural laughs, gasps and sighs are fine. No text, captions or logos in the frame.</w:t>
       </w:r>
     </w:p>
     <w:p>
@@ -1935,7 +1935,7 @@
           <w:sz w:val="20"/>
           <w:szCs w:val="20"/>
         </w:rPr>
-        <w:t xml:space="preserve">VOICE RULE: only the off-screen narrator speaks words. No character says any word and no one on screen lip-syncs to speech; characters communicate with facial expressions and body gestures. Natural non-verbal sounds are allowed and should sound real: laughing, giggling, gasping, sighing, groaning, cheering, coughing. Attached reference image (use only for the art style and colors; do not copy its layout or characters): the Shot 1 courtyard frame. 2D hand-drawn stickman cartoon in the exact style of the reference images: thin black outlines, large expressive heads, thin stick arms, flat warm colors, playful documentary-comedy tone, 16:9. Characters, identical in every frame: the Roman soldiers: crimson plumed helmets, steel armor, red cloaks, rectangular red shields. Setting: sunlit street of ancient Alexandria outside the wedding house, sandstone walls, palms, market stalls with red and blue awnings. The busy street goes quiet. Civilians notice something at the far end, step aside and clear the road. Nothing is visible yet except settling dust; show no soldiers even if the reference image contains some. Camera: locked-off and perfectly still, eye-level wide shot of the street; the framing never changes (no tilt, pan, zoom or rising camera). Audio: off-screen British male narrator, warm and dry, begins speaking within half a second and says: “Outside, the street went quiet. In a busy city, that's never good.” Music: low sustained tension with distant marching drums, almost silent. Sound effects: street ambience fading, distant boots. Final reminder: no character says any word; only the off-screen narrator speaks. Natural laughs, gasps and sighs are fine. No text, captions or logos in the frame.</w:t>
+        <w:t xml:space="preserve">VOICE RULE: only the voice-over narration speaks words; it is a voice only, never a person or character on screen. No character says any word and no one on screen lip-syncs to speech; characters communicate with facial expressions and body gestures. Natural non-verbal sounds are allowed and should sound real: laughing, giggling, gasping, sighing, groaning, cheering, coughing. Attached reference image (use only for the art style and colors; do not copy its layout or characters): the Shot 1 courtyard frame. 2D hand-drawn stickman cartoon in the exact style of the reference images: thin black outlines, large expressive heads, thin stick arms, flat warm colors, playful documentary-comedy tone, 16:9. Characters, identical in every frame: the Roman soldiers: crimson plumed helmets, steel armor, red cloaks, rectangular red shields. Setting: sunlit street of ancient Alexandria outside the wedding house, sandstone walls, palms, market stalls with red and blue awnings. The busy street goes quiet. Civilians notice something at the far end, step aside and clear the road. Nothing is visible yet except settling dust; show no soldiers even if the reference image contains some. Camera: locked-off and perfectly still, eye-level wide shot of the street; the framing never changes (no tilt, pan, zoom or rising camera). Audio: voice-over narration only (a voice, never shown on screen; no narrator character appears): a British male voice, warm and dry, begins speaking within half a second and says: “Outside, the street went quiet. In a busy city, that's never good.” Music: low sustained tension with distant marching drums, almost silent. Sound effects: street ambience fading, distant boots. Final reminder: no character says any word; only the voice-over narration speaks (voice only, nobody on screen is the narrator). Natural laughs, gasps and sighs are fine. No text, captions or logos in the frame.</w:t>
       </w:r>
     </w:p>
     <w:p>
@@ -2081,7 +2081,7 @@
           <w:sz w:val="20"/>
           <w:szCs w:val="20"/>
         </w:rPr>
-        <w:t xml:space="preserve">VOICE RULE: only the off-screen narrator speaks words. No character says any word and no one on screen lip-syncs to speech; characters communicate with facial expressions and body gestures. Natural non-verbal sounds are allowed and should sound real: laughing, giggling, gasping, sighing, groaning, cheering, coughing. Attached reference images, in order: the Roman soldiers. 2D hand-drawn stickman cartoon in the exact style of the reference images: thin black outlines, large expressive heads, thin stick arms, flat warm colors, playful documentary-comedy tone, 16:9. Characters, identical in every frame: the Roman soldiers: crimson plumed helmets, steel armor, red cloaks, rectangular red shields. Setting: sunlit street of ancient Alexandria outside the wedding house, sandstone walls, palms, market stalls with red and blue awnings. Several Roman soldiers appear as small silhouettes far away and march steadily toward the camera in formation; helmets and shields are recognizable but tiny. Camera: eye-level wide street view; fixed except for an almost imperceptible 5% slow push-in, no tilt or pan. Audio: off-screen British male narrator, warm and dry, begins speaking within half a second and says: “Clank. Clank. Clank. Marching men. Lots of them.” Music: low sustained tension with distant marching drums, almost silent. Sound effects: marching boots in rhythm, metal clinks. Final reminder: no character says any word; only the off-screen narrator speaks. Natural laughs, gasps and sighs are fine. No text, captions or logos in the frame.</w:t>
+        <w:t xml:space="preserve">VOICE RULE: only the voice-over narration speaks words; it is a voice only, never a person or character on screen. No character says any word and no one on screen lip-syncs to speech; characters communicate with facial expressions and body gestures. Natural non-verbal sounds are allowed and should sound real: laughing, giggling, gasping, sighing, groaning, cheering, coughing. Attached reference images, in order: the Roman soldiers. 2D hand-drawn stickman cartoon in the exact style of the reference images: thin black outlines, large expressive heads, thin stick arms, flat warm colors, playful documentary-comedy tone, 16:9. Characters, identical in every frame: the Roman soldiers: crimson plumed helmets, steel armor, red cloaks, rectangular red shields. Setting: sunlit street of ancient Alexandria outside the wedding house, sandstone walls, palms, market stalls with red and blue awnings. Several Roman soldiers appear as small silhouettes far away and march steadily toward the camera in formation; helmets and shields are recognizable but tiny. Camera: eye-level wide street view; fixed except for an almost imperceptible 5% slow push-in, no tilt or pan. Audio: voice-over narration only (a voice, never shown on screen; no narrator character appears): a British male voice, warm and dry, begins speaking within half a second and says: “Clank. Clank. Clank. Marching men. Lots of them.” Music: low sustained tension with distant marching drums, almost silent. Sound effects: marching boots in rhythm, metal clinks. Final reminder: no character says any word; only the voice-over narration speaks (voice only, nobody on screen is the narrator). Natural laughs, gasps and sighs are fine. No text, captions or logos in the frame.</w:t>
       </w:r>
     </w:p>
     <w:p>
@@ -2154,7 +2154,7 @@
           <w:sz w:val="20"/>
           <w:szCs w:val="20"/>
         </w:rPr>
-        <w:t xml:space="preserve">VOICE RULE: only the off-screen narrator speaks words. No character says any word and no one on screen lip-syncs to speech; characters communicate with facial expressions and body gestures. Natural non-verbal sounds are allowed and should sound real: laughing, giggling, gasping, sighing, groaning, cheering, coughing. Attached reference images, in order: the wedding courtyard, Senbi, the groom, the bride. 2D hand-drawn stickman cartoon in the exact style of the reference images: thin black outlines, large expressive heads, thin stick arms, flat warm colors, playful documentary-comedy tone, 16:9. Characters, identical in every frame: Senbi the groom: young man, straight black bowl-cut hair with bangs, gold headband with a gold cobra, bare chest, blue-and-gold broad collar, gold bracers, white kilt with a blue-and-gold sash, brown sandals, thin black stick arms. Setting: sunny daytime wedding courtyard in ancient Alexandria, sandstone columns with painted blue-and-gold bands, long tables with white cloths and clay jars, orange cloth awnings, and a tall wooden entrance gate at the back-center that opens onto the street. Guests dance and laugh; Senbi spins happily in the center, completely unaware. The open gate at the back stays calm. Camera: locked-off and perfectly still, eye-level medium-wide shot of the courtyard; the framing never changes (no tilt, pan, zoom or rising camera). Audio: off-screen British male narrator, warm and dry, begins speaking within half a second and says: “Inside, nobody had a clue. Senbi was busy spinning.” Music: light ancient-Mediterranean wedding music (frame drums, reed flute, plucked strings) with a faint uneasy undertone, same theme in every clip, low under the voice. Sound effects: wedding music muffled, faint thump. Final reminder: no character says any word; only the off-screen narrator speaks. Natural laughs, gasps and sighs are fine. No text, captions or logos in the frame.</w:t>
+        <w:t xml:space="preserve">VOICE RULE: only the voice-over narration speaks words; it is a voice only, never a person or character on screen. No character says any word and no one on screen lip-syncs to speech; characters communicate with facial expressions and body gestures. Natural non-verbal sounds are allowed and should sound real: laughing, giggling, gasping, sighing, groaning, cheering, coughing. Attached reference images, in order: the wedding courtyard, Senbi, the groom, the bride. 2D hand-drawn stickman cartoon in the exact style of the reference images: thin black outlines, large expressive heads, thin stick arms, flat warm colors, playful documentary-comedy tone, 16:9. Characters, identical in every frame: Senbi the groom: young man, straight black bowl-cut hair with bangs, gold headband with a gold cobra, bare chest, blue-and-gold broad collar, gold bracers, white kilt with a blue-and-gold sash, brown sandals, thin black stick arms. Setting: sunny daytime wedding courtyard in ancient Alexandria, sandstone columns with painted blue-and-gold bands, long tables with white cloths and clay jars, orange cloth awnings, and a tall wooden entrance gate at the back-center that opens onto the street. Guests dance and laugh; Senbi spins happily in the center, completely unaware. The open gate at the back stays calm. Camera: locked-off and perfectly still, eye-level medium-wide shot of the courtyard; the framing never changes (no tilt, pan, zoom or rising camera). Audio: voice-over narration only (a voice, never shown on screen; no narrator character appears): a British male voice, warm and dry, begins speaking within half a second and says: “Inside, nobody had a clue. Senbi was busy spinning.” Music: light ancient-Mediterranean wedding music (frame drums, reed flute, plucked strings) with a faint uneasy undertone, same theme in every clip, low under the voice. Sound effects: wedding music muffled, faint thump. Final reminder: no character says any word; only the voice-over narration speaks (voice only, nobody on screen is the narrator). Natural laughs, gasps and sighs are fine. No text, captions or logos in the frame.</w:t>
       </w:r>
     </w:p>
     <w:p>
@@ -2227,7 +2227,7 @@
           <w:sz w:val="20"/>
           <w:szCs w:val="20"/>
         </w:rPr>
-        <w:t xml:space="preserve">VOICE RULE: only the off-screen narrator speaks words. No character says any word and no one on screen lip-syncs to speech; characters communicate with facial expressions and body gestures. Natural non-verbal sounds are allowed and should sound real: laughing, giggling, gasping, sighing, groaning, cheering, coughing. Attached reference images, in order: the Roman soldiers. 2D hand-drawn stickman cartoon in the exact style of the reference images: thin black outlines, large expressive heads, thin stick arms, flat warm colors, playful documentary-comedy tone, 16:9. Characters, identical in every frame: the Roman soldiers: crimson plumed helmets, steel armor, red cloaks, rectangular red shields. Setting: sunlit street of ancient Alexandria outside the wedding house, sandstone walls, palms, market stalls with red and blue awnings. Two tired, dusty Roman legionaries walk into the street in front of the wedding house, shields and spears in hand. They stop and look around, confused rather than menacing. Camera: locked-off and perfectly still, eye-level medium-wide shot of the street; the soldiers walk into the frame; the framing never changes (no tilt, pan, zoom or rising camera). Audio: off-screen British male narrator, warm and dry, begins speaking within half a second and says: “And then Rome arrived. Tired, dusty, and looking for the right address.” Music: low sustained tension with distant marching drums, almost silent. Sound effects: armor clank, dust, a tired sigh. Final reminder: no character says any word; only the off-screen narrator speaks. Natural laughs, gasps and sighs are fine. No text, captions or logos in the frame.</w:t>
+        <w:t xml:space="preserve">VOICE RULE: only the voice-over narration speaks words; it is a voice only, never a person or character on screen. No character says any word and no one on screen lip-syncs to speech; characters communicate with facial expressions and body gestures. Natural non-verbal sounds are allowed and should sound real: laughing, giggling, gasping, sighing, groaning, cheering, coughing. Attached reference images, in order: the Roman soldiers. 2D hand-drawn stickman cartoon in the exact style of the reference images: thin black outlines, large expressive heads, thin stick arms, flat warm colors, playful documentary-comedy tone, 16:9. Characters, identical in every frame: the Roman soldiers: crimson plumed helmets, steel armor, red cloaks, rectangular red shields. Setting: sunlit street of ancient Alexandria outside the wedding house, sandstone walls, palms, market stalls with red and blue awnings. Two tired, dusty Roman legionaries walk into the street in front of the wedding house, shields and spears in hand. They stop and look around, confused rather than menacing. Camera: locked-off and perfectly still, eye-level medium-wide shot of the street; the soldiers walk into the frame; the framing never changes (no tilt, pan, zoom or rising camera). Audio: voice-over narration only (a voice, never shown on screen; no narrator character appears): a British male voice, warm and dry, begins speaking within half a second and says: “And then Rome arrived. Tired, dusty, and looking for the right address.” Music: low sustained tension with distant marching drums, almost silent. Sound effects: armor clank, dust, a tired sigh. Final reminder: no character says any word; only the voice-over narration speaks (voice only, nobody on screen is the narrator). Natural laughs, gasps and sighs are fine. No text, captions or logos in the frame.</w:t>
       </w:r>
     </w:p>
     <w:p>
@@ -2300,7 +2300,7 @@
           <w:sz w:val="20"/>
           <w:szCs w:val="20"/>
         </w:rPr>
-        <w:t xml:space="preserve">VOICE RULE: only the off-screen narrator speaks words. No character says any word and no one on screen lip-syncs to speech; characters communicate with facial expressions and body gestures. Natural non-verbal sounds are allowed and should sound real: laughing, giggling, gasping, sighing, groaning, cheering, coughing. Attached reference images, in order: the Egyptian wedding guests, the Roman soldiers, the wedding courtyard. 2D hand-drawn stickman cartoon in the exact style of the reference images: thin black outlines, large expressive heads, thin stick arms, flat warm colors, playful documentary-comedy tone, 16:9. Characters, identical in every frame: the Roman soldiers: crimson plumed helmets, steel armor, red cloaks, rectangular red shields. the guests: Egyptian wedding guests in white linen with blue-and-gold collars and gold headbands, black bob hairstyles, some in white striped headdresses. Setting: sunlit street of ancient Alexandria outside the wedding house, sandstone walls, palms, market stalls with red and blue awnings. Three guests peek out of the doorway at the same time: one frightened, one confused, one grinning as if the soldiers are the entertainment. Camera: locked-off and perfectly still, eye-level medium-wide shot of the doorway with all three guests peeking in the same frame; the framing never changes (no tilt, pan, zoom or rising camera). Audio: off-screen British male narrator, warm and dry, begins speaking within half a second and says: “The guests peeked out. One terrified. One confused. One assumed it was entertainment.” Music: music nearly silent. Sound effects: nervous coughs and gasps, no words. Final reminder: no character says any word; only the off-screen narrator speaks. Natural laughs, gasps and sighs are fine. No text, captions or logos in the frame.</w:t>
+        <w:t xml:space="preserve">VOICE RULE: only the voice-over narration speaks words; it is a voice only, never a person or character on screen. No character says any word and no one on screen lip-syncs to speech; characters communicate with facial expressions and body gestures. Natural non-verbal sounds are allowed and should sound real: laughing, giggling, gasping, sighing, groaning, cheering, coughing. Attached reference images, in order: the Egyptian wedding guests, the Roman soldiers, the wedding courtyard. 2D hand-drawn stickman cartoon in the exact style of the reference images: thin black outlines, large expressive heads, thin stick arms, flat warm colors, playful documentary-comedy tone, 16:9. Characters, identical in every frame: the Roman soldiers: crimson plumed helmets, steel armor, red cloaks, rectangular red shields. the guests: Egyptian wedding guests in white linen with blue-and-gold collars and gold headbands, black bob hairstyles, some in white striped headdresses. Setting: sunlit street of ancient Alexandria outside the wedding house, sandstone walls, palms, market stalls with red and blue awnings. Three guests peek out of the doorway at the same time: one frightened, one confused, one grinning as if the soldiers are the entertainment. Camera: locked-off and perfectly still, eye-level medium-wide shot of the doorway with all three guests peeking in the same frame; the framing never changes (no tilt, pan, zoom or rising camera). Audio: voice-over narration only (a voice, never shown on screen; no narrator character appears): a British male voice, warm and dry, begins speaking within half a second and says: “The guests peeked out. One terrified. One confused. One assumed it was entertainment.” Music: music nearly silent. Sound effects: nervous coughs and gasps, no words. Final reminder: no character says any word; only the voice-over narration speaks (voice only, nobody on screen is the narrator). Natural laughs, gasps and sighs are fine. No text, captions or logos in the frame.</w:t>
       </w:r>
     </w:p>
     <w:p>
@@ -2373,7 +2373,7 @@
           <w:sz w:val="20"/>
           <w:szCs w:val="20"/>
         </w:rPr>
-        <w:t xml:space="preserve">VOICE RULE: only the off-screen narrator speaks words. No character says any word and no one on screen lip-syncs to speech; characters communicate with facial expressions and body gestures. Natural non-verbal sounds are allowed and should sound real: laughing, giggling, gasping, sighing, groaning, cheering, coughing. Attached reference images, in order: the bride's relatives, the Roman soldiers, the wedding courtyard. 2D hand-drawn stickman cartoon in the exact style of the reference images: thin black outlines, large expressive heads, thin stick arms, flat warm colors, playful documentary-comedy tone, 16:9. Characters, identical in every frame: the Roman soldiers: crimson plumed helmets, steel armor, red cloaks, rectangular red shields. the guests: Egyptian wedding guests in white linen with blue-and-gold collars and gold headbands, black bob hairstyles, some in white striped headdresses. the uncle: cheerful bearded middle-aged man in plain white linen. Setting: sunlit street of ancient Alexandria outside the wedding house, sandstone walls, palms, market stalls with red and blue awnings. A cheerful, slightly tipsy older uncle grabs a clay beer cup and walks confidently across the frame toward the Roman soldiers, as if greeting ordinary guests. Camera: locked-off and perfectly still, eye-level medium-wide shot; the uncle walks across the frame; the framing never changes (no tilt, pan, zoom or rising camera). Audio: off-screen British male narrator, warm and dry, begins speaking within half a second and says: “Then one uncle, a man with absolutely no fear, grabbed a beer.” Music: playful comic percussion over the wedding rhythm, low under the voice. Sound effects: cup clink. Final reminder: no character says any word; only the off-screen narrator speaks. Natural laughs, gasps and sighs are fine. No text, captions or logos in the frame.</w:t>
+        <w:t xml:space="preserve">VOICE RULE: only the voice-over narration speaks words; it is a voice only, never a person or character on screen. No character says any word and no one on screen lip-syncs to speech; characters communicate with facial expressions and body gestures. Natural non-verbal sounds are allowed and should sound real: laughing, giggling, gasping, sighing, groaning, cheering, coughing. Attached reference images, in order: the bride's relatives, the Roman soldiers, the wedding courtyard. 2D hand-drawn stickman cartoon in the exact style of the reference images: thin black outlines, large expressive heads, thin stick arms, flat warm colors, playful documentary-comedy tone, 16:9. Characters, identical in every frame: the Roman soldiers: crimson plumed helmets, steel armor, red cloaks, rectangular red shields. the guests: Egyptian wedding guests in white linen with blue-and-gold collars and gold headbands, black bob hairstyles, some in white striped headdresses. the uncle: cheerful bearded middle-aged man in plain white linen. Setting: sunlit street of ancient Alexandria outside the wedding house, sandstone walls, palms, market stalls with red and blue awnings. A cheerful, slightly tipsy older uncle grabs a clay beer cup and walks confidently across the frame toward the Roman soldiers, as if greeting ordinary guests. Camera: locked-off and perfectly still, eye-level medium-wide shot; the uncle walks across the frame; the framing never changes (no tilt, pan, zoom or rising camera). Audio: voice-over narration only (a voice, never shown on screen; no narrator character appears): a British male voice, warm and dry, begins speaking within half a second and says: “Then one uncle, a man with absolutely no fear, grabbed a beer.” Music: playful comic percussion over the wedding rhythm, low under the voice. Sound effects: cup clink. Final reminder: no character says any word; only the voice-over narration speaks (voice only, nobody on screen is the narrator). Natural laughs, gasps and sighs are fine. No text, captions or logos in the frame.</w:t>
       </w:r>
     </w:p>
     <w:p>
@@ -2446,7 +2446,7 @@
           <w:sz w:val="20"/>
           <w:szCs w:val="20"/>
         </w:rPr>
-        <w:t xml:space="preserve">VOICE RULE: only the off-screen narrator speaks words. No character says any word and no one on screen lip-syncs to speech; characters communicate with facial expressions and body gestures. Natural non-verbal sounds are allowed and should sound real: laughing, giggling, gasping, sighing, groaning, cheering, coughing. Attached reference images, in order: the bride's relatives, the Roman soldiers. 2D hand-drawn stickman cartoon in the exact style of the reference images: thin black outlines, large expressive heads, thin stick arms, flat warm colors, playful documentary-comedy tone, 16:9. Characters, identical in every frame: the Roman soldiers: crimson plumed helmets, steel armor, red cloaks, rectangular red shields. the uncle: cheerful bearded middle-aged man in plain white linen. Setting: sunlit street of ancient Alexandria outside the wedding house, sandstone walls, palms, market stalls with red and blue awnings. The uncle offers the cup with a big smile. A Roman soldier looks at the cup, then at the uncle, and does not move. Camera: locked-off and perfectly still, eye-level medium two-shot; the framing never changes (no tilt, pan, zoom or rising camera). Audio: off-screen British male narrator, warm and dry, begins speaking within half a second and says: “He offered it to a Roman. As if it were completely normal.” Music: music nearly silent. Sound effects: cup clink, awkward silence. Final reminder: no character says any word; only the off-screen narrator speaks. Natural laughs, gasps and sighs are fine. No text, captions or logos in the frame.</w:t>
+        <w:t xml:space="preserve">VOICE RULE: only the voice-over narration speaks words; it is a voice only, never a person or character on screen. No character says any word and no one on screen lip-syncs to speech; characters communicate with facial expressions and body gestures. Natural non-verbal sounds are allowed and should sound real: laughing, giggling, gasping, sighing, groaning, cheering, coughing. Attached reference images, in order: the bride's relatives, the Roman soldiers. 2D hand-drawn stickman cartoon in the exact style of the reference images: thin black outlines, large expressive heads, thin stick arms, flat warm colors, playful documentary-comedy tone, 16:9. Characters, identical in every frame: the Roman soldiers: crimson plumed helmets, steel armor, red cloaks, rectangular red shields. the uncle: cheerful bearded middle-aged man in plain white linen. Setting: sunlit street of ancient Alexandria outside the wedding house, sandstone walls, palms, market stalls with red and blue awnings. The uncle offers the cup with a big smile. A Roman soldier looks at the cup, then at the uncle, and does not move. Camera: locked-off and perfectly still, eye-level medium two-shot; the framing never changes (no tilt, pan, zoom or rising camera). Audio: voice-over narration only (a voice, never shown on screen; no narrator character appears): a British male voice, warm and dry, begins speaking within half a second and says: “He offered it to a Roman. As if it were completely normal.” Music: music nearly silent. Sound effects: cup clink, awkward silence. Final reminder: no character says any word; only the voice-over narration speaks (voice only, nobody on screen is the narrator). Natural laughs, gasps and sighs are fine. No text, captions or logos in the frame.</w:t>
       </w:r>
     </w:p>
     <w:p>
@@ -2519,7 +2519,7 @@
           <w:sz w:val="20"/>
           <w:szCs w:val="20"/>
         </w:rPr>
-        <w:t xml:space="preserve">VOICE RULE: only the off-screen narrator speaks words. No character says any word and no one on screen lip-syncs to speech; characters communicate with facial expressions and body gestures. Natural non-verbal sounds are allowed and should sound real: laughing, giggling, gasping, sighing, groaning, cheering, coughing. Attached reference images, in order: the Roman soldiers. 2D hand-drawn stickman cartoon in the exact style of the reference images: thin black outlines, large expressive heads, thin stick arms, flat warm colors, playful documentary-comedy tone, 16:9. Characters, identical in every frame: the Roman soldiers: crimson plumed helmets, steel armor, red cloaks, rectangular red shields. the uncle: cheerful bearded middle-aged man in plain white linen. Setting: sunlit street of ancient Alexandria outside the wedding house, sandstone walls, palms, market stalls with red and blue awnings. Close-up of the Roman soldier's confused face. He looks from the cup to the smiling uncle, cautiously takes the cup, and his eyes slide sideways toward his comrades. Camera: eye-level medium close-up of the soldier; fixed except for an almost imperceptible 5% slow push-in, no tilt or pan. Audio: off-screen British male narrator, warm and dry, begins speaking within half a second and says: “The soldier stared at the cup, then the uncle. A trap? Or hospitality?” Music: music nearly silent. Sound effects: tiny gulp, uneasy hum. Final reminder: no character says any word; only the off-screen narrator speaks. Natural laughs, gasps and sighs are fine. No text, captions or logos in the frame.</w:t>
+        <w:t xml:space="preserve">VOICE RULE: only the voice-over narration speaks words; it is a voice only, never a person or character on screen. No character says any word and no one on screen lip-syncs to speech; characters communicate with facial expressions and body gestures. Natural non-verbal sounds are allowed and should sound real: laughing, giggling, gasping, sighing, groaning, cheering, coughing. Attached reference images, in order: the Roman soldiers. 2D hand-drawn stickman cartoon in the exact style of the reference images: thin black outlines, large expressive heads, thin stick arms, flat warm colors, playful documentary-comedy tone, 16:9. Characters, identical in every frame: the Roman soldiers: crimson plumed helmets, steel armor, red cloaks, rectangular red shields. the uncle: cheerful bearded middle-aged man in plain white linen. Setting: sunlit street of ancient Alexandria outside the wedding house, sandstone walls, palms, market stalls with red and blue awnings. Close-up of the Roman soldier's confused face. He looks from the cup to the smiling uncle, cautiously takes the cup, and his eyes slide sideways toward his comrades. Camera: eye-level medium close-up of the soldier; fixed except for an almost imperceptible 5% slow push-in, no tilt or pan. Audio: voice-over narration only (a voice, never shown on screen; no narrator character appears): a British male voice, warm and dry, begins speaking within half a second and says: “The soldier stared at the cup, then the uncle. A trap? Or hospitality?” Music: music nearly silent. Sound effects: tiny gulp, uneasy hum. Final reminder: no character says any word; only the voice-over narration speaks (voice only, nobody on screen is the narrator). Natural laughs, gasps and sighs are fine. No text, captions or logos in the frame.</w:t>
       </w:r>
     </w:p>
     <w:p>
@@ -2592,7 +2592,7 @@
           <w:sz w:val="20"/>
           <w:szCs w:val="20"/>
         </w:rPr>
-        <w:t xml:space="preserve">VOICE RULE: only the off-screen narrator speaks words. No character says any word and no one on screen lip-syncs to speech; characters communicate with facial expressions and body gestures. Natural non-verbal sounds are allowed and should sound real: laughing, giggling, gasping, sighing, groaning, cheering, coughing. Attached reference images, in order: the Roman soldiers, the wedding courtyard. 2D hand-drawn stickman cartoon in the exact style of the reference images: thin black outlines, large expressive heads, thin stick arms, flat warm colors, playful documentary-comedy tone, 16:9. Characters, identical in every frame: the Roman soldiers: crimson plumed helmets, steel armor, red cloaks, rectangular red shields. Setting: sunny daytime wedding courtyard in ancient Alexandria, sandstone columns with painted blue-and-gold bands, long tables with white cloths and clay jars, orange cloth awnings, and a tall wooden entrance gate at the back-center that opens onto the street. Two Roman soldiers in the foreground, the feast table with roast goose, bread and fruit behind them. Their serious faces soften as they turn their heads toward the food; one leans slightly forward. Camera: locked-off and perfectly still, eye-level wide-medium shot: the soldiers in the foreground, the feast table behind them; they turn their heads toward it; the framing never changes (no tilt, pan, zoom or rising camera). Audio: off-screen British male narrator, warm and dry, begins speaking within half a second and says: “Then the Romans saw the food. Military discipline lasted about four seconds.” Music: playful comic percussion over the wedding rhythm, low under the voice. Sound effects: stomach growl, sniff. Final reminder: no character says any word; only the off-screen narrator speaks. Natural laughs, gasps and sighs are fine. No text, captions or logos in the frame.</w:t>
+        <w:t xml:space="preserve">VOICE RULE: only the voice-over narration speaks words; it is a voice only, never a person or character on screen. No character says any word and no one on screen lip-syncs to speech; characters communicate with facial expressions and body gestures. Natural non-verbal sounds are allowed and should sound real: laughing, giggling, gasping, sighing, groaning, cheering, coughing. Attached reference images, in order: the Roman soldiers, the wedding courtyard. 2D hand-drawn stickman cartoon in the exact style of the reference images: thin black outlines, large expressive heads, thin stick arms, flat warm colors, playful documentary-comedy tone, 16:9. Characters, identical in every frame: the Roman soldiers: crimson plumed helmets, steel armor, red cloaks, rectangular red shields. Setting: sunny daytime wedding courtyard in ancient Alexandria, sandstone columns with painted blue-and-gold bands, long tables with white cloths and clay jars, orange cloth awnings, and a tall wooden entrance gate at the back-center that opens onto the street. Two Roman soldiers in the foreground, the feast table with roast goose, bread and fruit behind them. Their serious faces soften as they turn their heads toward the food; one leans slightly forward. Camera: locked-off and perfectly still, eye-level wide-medium shot: the soldiers in the foreground, the feast table behind them; they turn their heads toward it; the framing never changes (no tilt, pan, zoom or rising camera). Audio: voice-over narration only (a voice, never shown on screen; no narrator character appears): a British male voice, warm and dry, begins speaking within half a second and says: “Then the Romans saw the food. Military discipline lasted about four seconds.” Music: playful comic percussion over the wedding rhythm, low under the voice. Sound effects: stomach growl, sniff. Final reminder: no character says any word; only the voice-over narration speaks (voice only, nobody on screen is the narrator). Natural laughs, gasps and sighs are fine. No text, captions or logos in the frame.</w:t>
       </w:r>
     </w:p>
     <w:p>
@@ -2665,7 +2665,7 @@
           <w:sz w:val="20"/>
           <w:szCs w:val="20"/>
         </w:rPr>
-        <w:t xml:space="preserve">VOICE RULE: only the off-screen narrator speaks words. No character says any word and no one on screen lip-syncs to speech; characters communicate with facial expressions and body gestures. Natural non-verbal sounds are allowed and should sound real: laughing, giggling, gasping, sighing, groaning, cheering, coughing. Attached reference images, in order: the Roman soldiers, the Egyptian wedding guests, the wedding courtyard. 2D hand-drawn stickman cartoon in the exact style of the reference images: thin black outlines, large expressive heads, thin stick arms, flat warm colors, playful documentary-comedy tone, 16:9. Characters, identical in every frame: the Roman soldiers: crimson plumed helmets, steel armor, red cloaks, rectangular red shields. the guests: Egyptian wedding guests in white linen with blue-and-gold collars and gold headbands, black bob hairstyles, some in white striped headdresses. Setting: sunny daytime wedding courtyard in ancient Alexandria, sandstone columns with painted blue-and-gold bands, long tables with white cloths and clay jars, orange cloth awnings, and a tall wooden entrance gate at the back-center that opens onto the street. One Roman soldier steps awkwardly onto the dance floor. The Egyptian guests stare in silence. Then one guest begins to copy his stiff step. Camera: locked-off and perfectly still, eye-level wide shot; the framing never changes (no tilt, pan, zoom or rising camera). Audio: off-screen British male narrator, warm and dry, begins speaking within half a second and says: “One soldier stepped into the dance. Nobody stopped him. Somehow, it worked.” Music: playful comic percussion over the wedding rhythm, low under the voice. Sound effects: shield tap blending into the rhythm, clapping. Final reminder: no character says any word; only the off-screen narrator speaks. Natural laughs, gasps and sighs are fine. No text, captions or logos in the frame.</w:t>
+        <w:t xml:space="preserve">VOICE RULE: only the voice-over narration speaks words; it is a voice only, never a person or character on screen. No character says any word and no one on screen lip-syncs to speech; characters communicate with facial expressions and body gestures. Natural non-verbal sounds are allowed and should sound real: laughing, giggling, gasping, sighing, groaning, cheering, coughing. Attached reference images, in order: the Roman soldiers, the Egyptian wedding guests, the wedding courtyard. 2D hand-drawn stickman cartoon in the exact style of the reference images: thin black outlines, large expressive heads, thin stick arms, flat warm colors, playful documentary-comedy tone, 16:9. Characters, identical in every frame: the Roman soldiers: crimson plumed helmets, steel armor, red cloaks, rectangular red shields. the guests: Egyptian wedding guests in white linen with blue-and-gold collars and gold headbands, black bob hairstyles, some in white striped headdresses. Setting: sunny daytime wedding courtyard in ancient Alexandria, sandstone columns with painted blue-and-gold bands, long tables with white cloths and clay jars, orange cloth awnings, and a tall wooden entrance gate at the back-center that opens onto the street. One Roman soldier steps awkwardly onto the dance floor. The Egyptian guests stare in silence. Then one guest begins to copy his stiff step. Camera: locked-off and perfectly still, eye-level wide shot; the framing never changes (no tilt, pan, zoom or rising camera). Audio: voice-over narration only (a voice, never shown on screen; no narrator character appears): a British male voice, warm and dry, begins speaking within half a second and says: “One soldier stepped into the dance. Nobody stopped him. Somehow, it worked.” Music: playful comic percussion over the wedding rhythm, low under the voice. Sound effects: shield tap blending into the rhythm, clapping. Final reminder: no character says any word; only the voice-over narration speaks (voice only, nobody on screen is the narrator). Natural laughs, gasps and sighs are fine. No text, captions or logos in the frame.</w:t>
       </w:r>
     </w:p>
     <w:p>
@@ -2738,7 +2738,7 @@
           <w:sz w:val="20"/>
           <w:szCs w:val="20"/>
         </w:rPr>
-        <w:t xml:space="preserve">VOICE RULE: only the off-screen narrator speaks words. No character says any word and no one on screen lip-syncs to speech; characters communicate with facial expressions and body gestures. Natural non-verbal sounds are allowed and should sound real: laughing, giggling, gasping, sighing, groaning, cheering, coughing. Attached reference images, in order: the Roman soldiers, the Egyptian wedding guests, the wedding courtyard. 2D hand-drawn stickman cartoon in the exact style of the reference images: thin black outlines, large expressive heads, thin stick arms, flat warm colors, playful documentary-comedy tone, 16:9. Characters, identical in every frame: the Roman soldiers: crimson plumed helmets, steel armor, red cloaks, rectangular red shields. the guests: Egyptian wedding guests in white linen with blue-and-gold collars and gold headbands, black bob hairstyles, some in white striped headdresses. Setting: sunny daytime wedding courtyard in ancient Alexandria, sandstone columns with painted blue-and-gold bands, long tables with white cloths and clay jars, orange cloth awnings, and a tall wooden entrance gate at the back-center that opens onto the street. Three Roman soldiers in full armor attempt the Egyptian dance, stiff but strangely synchronized, capes swaying; Egyptian dancers around them smile and clap. Camera: locked-off and perfectly still, eye-level wide shot of the dancing Romans; the framing never changes (no tilt, pan, zoom or rising camera). Audio: off-screen British male narrator, warm and dry, begins speaking within half a second and says: “Roman engineering changed the world. Roman dancing did not.” Music: playful comic percussion over the wedding rhythm, low under the voice. Sound effects: armor clanking out of rhythm. Final reminder: no character says any word; only the off-screen narrator speaks. Natural laughs, gasps and sighs are fine. No text, captions or logos in the frame.</w:t>
+        <w:t xml:space="preserve">VOICE RULE: only the voice-over narration speaks words; it is a voice only, never a person or character on screen. No character says any word and no one on screen lip-syncs to speech; characters communicate with facial expressions and body gestures. Natural non-verbal sounds are allowed and should sound real: laughing, giggling, gasping, sighing, groaning, cheering, coughing. Attached reference images, in order: the Roman soldiers, the Egyptian wedding guests, the wedding courtyard. 2D hand-drawn stickman cartoon in the exact style of the reference images: thin black outlines, large expressive heads, thin stick arms, flat warm colors, playful documentary-comedy tone, 16:9. Characters, identical in every frame: the Roman soldiers: crimson plumed helmets, steel armor, red cloaks, rectangular red shields. the guests: Egyptian wedding guests in white linen with blue-and-gold collars and gold headbands, black bob hairstyles, some in white striped headdresses. Setting: sunny daytime wedding courtyard in ancient Alexandria, sandstone columns with painted blue-and-gold bands, long tables with white cloths and clay jars, orange cloth awnings, and a tall wooden entrance gate at the back-center that opens onto the street. Three Roman soldiers in full armor attempt the Egyptian dance, stiff but strangely synchronized, capes swaying; Egyptian dancers around them smile and clap. Camera: locked-off and perfectly still, eye-level wide shot of the dancing Romans; the framing never changes (no tilt, pan, zoom or rising camera). Audio: voice-over narration only (a voice, never shown on screen; no narrator character appears): a British male voice, warm and dry, begins speaking within half a second and says: “Roman engineering changed the world. Roman dancing did not.” Music: playful comic percussion over the wedding rhythm, low under the voice. Sound effects: armor clanking out of rhythm. Final reminder: no character says any word; only the voice-over narration speaks (voice only, nobody on screen is the narrator). Natural laughs, gasps and sighs are fine. No text, captions or logos in the frame.</w:t>
       </w:r>
     </w:p>
     <w:p>
@@ -2811,7 +2811,7 @@
           <w:sz w:val="20"/>
           <w:szCs w:val="20"/>
         </w:rPr>
-        <w:t xml:space="preserve">VOICE RULE: only the off-screen narrator speaks words. No character says any word and no one on screen lip-syncs to speech; characters communicate with facial expressions and body gestures. Natural non-verbal sounds are allowed and should sound real: laughing, giggling, gasping, sighing, groaning, cheering, coughing. Attached reference images, in order: Senbi, the groom, the Roman soldiers, the wedding courtyard. 2D hand-drawn stickman cartoon in the exact style of the reference images: thin black outlines, large expressive heads, thin stick arms, flat warm colors, playful documentary-comedy tone, 16:9. Characters, identical in every frame: Senbi the groom: young man, straight black bowl-cut hair with bangs, gold headband with a gold cobra, bare chest, blue-and-gold broad collar, gold bracers, white kilt with a blue-and-gold sash, brown sandals, thin black stick arms. the Roman soldiers: crimson plumed helmets, steel armor, red cloaks, rectangular red shields. Setting: sunny daytime wedding courtyard in ancient Alexandria, sandstone columns with painted blue-and-gold bands, long tables with white cloths and clay jars, orange cloth awnings, and a tall wooden entrance gate at the back-center that opens onto the street. Senbi dances proudly beside a Roman soldier and gestures for him to follow. The soldier hesitates, then copies Senbi's arm movement. Camera: locked-off and perfectly still, eye-level medium two-shot; the framing never changes (no tilt, pan, zoom or rising camera). Audio: off-screen British male narrator, warm and dry, begins speaking within half a second and says: “Senbi, ever the host, invited one to join. Of course he did.” Music: playful comic percussion over the wedding rhythm, low under the voice. Sound effects: laughter, hand claps. Final reminder: no character says any word; only the off-screen narrator speaks. Natural laughs, gasps and sighs are fine. No text, captions or logos in the frame.</w:t>
+        <w:t xml:space="preserve">VOICE RULE: only the voice-over narration speaks words; it is a voice only, never a person or character on screen. No character says any word and no one on screen lip-syncs to speech; characters communicate with facial expressions and body gestures. Natural non-verbal sounds are allowed and should sound real: laughing, giggling, gasping, sighing, groaning, cheering, coughing. Attached reference images, in order: Senbi, the groom, the Roman soldiers, the wedding courtyard. 2D hand-drawn stickman cartoon in the exact style of the reference images: thin black outlines, large expressive heads, thin stick arms, flat warm colors, playful documentary-comedy tone, 16:9. Characters, identical in every frame: Senbi the groom: young man, straight black bowl-cut hair with bangs, gold headband with a gold cobra, bare chest, blue-and-gold broad collar, gold bracers, white kilt with a blue-and-gold sash, brown sandals, thin black stick arms. the Roman soldiers: crimson plumed helmets, steel armor, red cloaks, rectangular red shields. Setting: sunny daytime wedding courtyard in ancient Alexandria, sandstone columns with painted blue-and-gold bands, long tables with white cloths and clay jars, orange cloth awnings, and a tall wooden entrance gate at the back-center that opens onto the street. Senbi dances proudly beside a Roman soldier and gestures for him to follow. The soldier hesitates, then copies Senbi's arm movement. Camera: locked-off and perfectly still, eye-level medium two-shot; the framing never changes (no tilt, pan, zoom or rising camera). Audio: voice-over narration only (a voice, never shown on screen; no narrator character appears): a British male voice, warm and dry, begins speaking within half a second and says: “Senbi, ever the host, invited one to join. Of course he did.” Music: playful comic percussion over the wedding rhythm, low under the voice. Sound effects: laughter, hand claps. Final reminder: no character says any word; only the voice-over narration speaks (voice only, nobody on screen is the narrator). Natural laughs, gasps and sighs are fine. No text, captions or logos in the frame.</w:t>
       </w:r>
     </w:p>
     <w:p>
@@ -2884,7 +2884,7 @@
           <w:sz w:val="20"/>
           <w:szCs w:val="20"/>
         </w:rPr>
-        <w:t xml:space="preserve">VOICE RULE: only the off-screen narrator speaks words. No character says any word and no one on screen lip-syncs to speech; characters communicate with facial expressions and body gestures. Natural non-verbal sounds are allowed and should sound real: laughing, giggling, gasping, sighing, groaning, cheering, coughing. Attached reference images, in order: the bride, Senbi, the groom, the Roman soldiers. 2D hand-drawn stickman cartoon in the exact style of the reference images: thin black outlines, large expressive heads, thin stick arms, flat warm colors, playful documentary-comedy tone, 16:9. Characters, identical in every frame: Senbi the groom: young man, straight black bowl-cut hair with bangs, gold headband with a gold cobra, bare chest, blue-and-gold broad collar, gold bracers, white kilt with a blue-and-gold sash, brown sandals, thin black stick arms. the bride: black bob hair with straight bangs, gold headband with a red gem, white dress, blue-and-gold collar, gold sash, gold arm cuffs, light veil. the Roman soldiers: crimson plumed helmets, steel armor, red cloaks, rectangular red shields. Setting: sunny daytime wedding courtyard in ancient Alexandria, sandstone columns with painted blue-and-gold bands, long tables with white cloths and clay jars, orange cloth awnings, and a tall wooden entrance gate at the back-center that opens onto the street. The bride watches Senbi dancing with the Romans. She slowly covers her face with her hand. Camera: locked-off and perfectly still, eye-level medium close-up of the bride; the framing never changes (no tilt, pan, zoom or rising camera). Audio: off-screen British male narrator, warm and dry, begins speaking within half a second and says: “His bride slowly covered her face. This was not in the contract.” Music: playful comic percussion over the wedding rhythm, low under the voice. Sound effects: gasp, muffled laugh. Final reminder: no character says any word; only the off-screen narrator speaks. Natural laughs, gasps and sighs are fine. No text, captions or logos in the frame.</w:t>
+        <w:t xml:space="preserve">VOICE RULE: only the voice-over narration speaks words; it is a voice only, never a person or character on screen. No character says any word and no one on screen lip-syncs to speech; characters communicate with facial expressions and body gestures. Natural non-verbal sounds are allowed and should sound real: laughing, giggling, gasping, sighing, groaning, cheering, coughing. Attached reference images, in order: the bride, Senbi, the groom, the Roman soldiers. 2D hand-drawn stickman cartoon in the exact style of the reference images: thin black outlines, large expressive heads, thin stick arms, flat warm colors, playful documentary-comedy tone, 16:9. Characters, identical in every frame: the bride: black bob hair with straight bangs, gold headband with a red gem, white dress, blue-and-gold collar, gold sash, gold arm cuffs, light veil. Setting: sunny daytime wedding courtyard in ancient Alexandria, sandstone columns with painted blue-and-gold bands, long tables with white cloths and clay jars, orange cloth awnings, and a tall wooden entrance gate at the back-center that opens onto the street. The bride watches Senbi dancing with the Romans. She slowly covers her face with her hand. Camera: locked-off and perfectly still, eye-level medium close-up of the bride; the framing never changes (no tilt, pan, zoom or rising camera). Audio: voice-over narration only (a voice, never shown on screen; no narrator character appears): a British male voice, warm and dry, begins speaking within half a second and says: “His bride slowly covered her face. This was not in the contract.” Music: playful comic percussion over the wedding rhythm, low under the voice. Sound effects: gasp, muffled laugh. Final reminder: no character says any word; only the voice-over narration speaks (voice only, nobody on screen is the narrator). Natural laughs, gasps and sighs are fine. No text, captions or logos in the frame.</w:t>
       </w:r>
     </w:p>
     <w:p>
@@ -2957,7 +2957,7 @@
           <w:sz w:val="20"/>
           <w:szCs w:val="20"/>
         </w:rPr>
-        <w:t xml:space="preserve">VOICE RULE: only the off-screen narrator speaks words. No character says any word and no one on screen lip-syncs to speech; characters communicate with facial expressions and body gestures. Natural non-verbal sounds are allowed and should sound real: laughing, giggling, gasping, sighing, groaning, cheering, coughing. Attached reference images, in order: Senbi, the groom, the bride, the Egyptian wedding guests. 2D hand-drawn stickman cartoon in the exact style of the reference images: thin black outlines, large expressive heads, thin stick arms, flat warm colors, playful documentary-comedy tone, 16:9. Characters, identical in every frame: Senbi the groom: young man, straight black bowl-cut hair with bangs, gold headband with a gold cobra, bare chest, blue-and-gold broad collar, gold bracers, white kilt with a blue-and-gold sash, brown sandals, thin black stick arms. the bride: black bob hair with straight bangs, gold headband with a red gem, white dress, blue-and-gold collar, gold sash, gold arm cuffs, light veil. the Roman soldiers: crimson plumed helmets, steel armor, red cloaks, rectangular red shields. the guests: Egyptian wedding guests in white linen with blue-and-gold collars and gold headbands, black bob hairstyles, some in white striped headdresses. the musicians: guests in white linen playing harp, frame drum and reed flute. Setting: sunny daytime wedding courtyard in ancient Alexandria, sandstone columns with painted blue-and-gold bands, long tables with white cloths and clay jars, orange cloth awnings, and a tall wooden entrance gate at the back-center that opens onto the street. Joyful chaos: Egyptians and Romans dance together, musicians struggle to keep the rhythm, a plate of food is passed along. Senbi is delighted; the bride looks overwhelmed. Keep no more than eight characters visible. Camera: locked-off and perfectly still, eye-level wide shot of the whole courtyard; the framing never changes (no tilt, pan, zoom or rising camera). Audio: off-screen British male narrator, warm and dry, begins speaking within half a second and says: “Soon, Egyptians and Romans were passing food and stepping on each other's feet.” Music: playful comic percussion over the wedding rhythm, low under the voice. Sound effects: laughter, plates, music chaos. Final reminder: no character says any word; only the off-screen narrator speaks. Natural laughs, gasps and sighs are fine. No text, captions or logos in the frame.</w:t>
+        <w:t xml:space="preserve">VOICE RULE: only the voice-over narration speaks words; it is a voice only, never a person or character on screen. No character says any word and no one on screen lip-syncs to speech; characters communicate with facial expressions and body gestures. Natural non-verbal sounds are allowed and should sound real: laughing, giggling, gasping, sighing, groaning, cheering, coughing. Attached reference images, in order: Senbi, the groom, the bride, the Egyptian wedding guests. 2D hand-drawn stickman cartoon in the exact style of the reference images: thin black outlines, large expressive heads, thin stick arms, flat warm colors, playful documentary-comedy tone, 16:9. Characters, identical in every frame: Senbi the groom: young man, straight black bowl-cut hair with bangs, gold headband with a gold cobra, bare chest, blue-and-gold broad collar, gold bracers, white kilt with a blue-and-gold sash, brown sandals, thin black stick arms. the bride: black bob hair with straight bangs, gold headband with a red gem, white dress, blue-and-gold collar, gold sash, gold arm cuffs, light veil. the Roman soldiers: crimson plumed helmets, steel armor, red cloaks, rectangular red shields. the guests: Egyptian wedding guests in white linen with blue-and-gold collars and gold headbands, black bob hairstyles, some in white striped headdresses. the musicians: guests in white linen playing harp, frame drum and reed flute. Setting: sunny daytime wedding courtyard in ancient Alexandria, sandstone columns with painted blue-and-gold bands, long tables with white cloths and clay jars, orange cloth awnings, and a tall wooden entrance gate at the back-center that opens onto the street. Joyful chaos: Egyptians and Romans dance together, musicians struggle to keep the rhythm, a plate of food is passed along. Senbi is delighted; the bride looks overwhelmed. Keep no more than eight characters visible. Camera: locked-off and perfectly still, eye-level wide shot of the whole courtyard; the framing never changes (no tilt, pan, zoom or rising camera). Audio: voice-over narration only (a voice, never shown on screen; no narrator character appears): a British male voice, warm and dry, begins speaking within half a second and says: “Soon, Egyptians and Romans were passing food and stepping on each other's feet.” Music: playful comic percussion over the wedding rhythm, low under the voice. Sound effects: laughter, plates, music chaos. Final reminder: no character says any word; only the voice-over narration speaks (voice only, nobody on screen is the narrator). Natural laughs, gasps and sighs are fine. No text, captions or logos in the frame.</w:t>
       </w:r>
     </w:p>
     <w:p>
@@ -3030,7 +3030,7 @@
           <w:sz w:val="20"/>
           <w:szCs w:val="20"/>
         </w:rPr>
-        <w:t xml:space="preserve">VOICE RULE: only the off-screen narrator speaks words. No character says any word and no one on screen lip-syncs to speech; characters communicate with facial expressions and body gestures. Natural non-verbal sounds are allowed and should sound real: laughing, giggling, gasping, sighing, groaning, cheering, coughing. Attached reference images, in order: the Egyptian wedding guests, the Roman soldiers, the wedding courtyard. 2D hand-drawn stickman cartoon in the exact style of the reference images: thin black outlines, large expressive heads, thin stick arms, flat warm colors, playful documentary-comedy tone, 16:9. Characters, identical in every frame: the Roman soldiers: crimson plumed helmets, steel armor, red cloaks, rectangular red shields. the guests: Egyptian wedding guests in white linen with blue-and-gold collars and gold headbands, black bob hairstyles, some in white striped headdresses. Setting: sunny daytime wedding courtyard in ancient Alexandria, sandstone columns with painted blue-and-gold bands, long tables with white cloths and clay jars, orange cloth awnings, and a tall wooden entrance gate at the back-center that opens onto the street. A sharp horn blast: everyone freezes mid-step, Egyptians and Romans together, in a comic tableau. Camera: locked-off and perfectly still, eye-level wide shot; the framing never changes (no tilt, pan, zoom or rising camera). Audio: off-screen British male narrator, warm and dry, begins speaking within half a second and says: “Then a horn cut through the music, and everyone froze mid-step.” Music: music nearly silent. Sound effects: sharp military horn, then silence. Final reminder: no character says any word; only the off-screen narrator speaks. Natural laughs, gasps and sighs are fine. No text, captions or logos in the frame.</w:t>
+        <w:t xml:space="preserve">VOICE RULE: only the voice-over narration speaks words; it is a voice only, never a person or character on screen. No character says any word and no one on screen lip-syncs to speech; characters communicate with facial expressions and body gestures. Natural non-verbal sounds are allowed and should sound real: laughing, giggling, gasping, sighing, groaning, cheering, coughing. Attached reference images, in order: the Egyptian wedding guests, the Roman soldiers, the wedding courtyard. 2D hand-drawn stickman cartoon in the exact style of the reference images: thin black outlines, large expressive heads, thin stick arms, flat warm colors, playful documentary-comedy tone, 16:9. Characters, identical in every frame: the Roman soldiers: crimson plumed helmets, steel armor, red cloaks, rectangular red shields. the guests: Egyptian wedding guests in white linen with blue-and-gold collars and gold headbands, black bob hairstyles, some in white striped headdresses. Setting: sunny daytime wedding courtyard in ancient Alexandria, sandstone columns with painted blue-and-gold bands, long tables with white cloths and clay jars, orange cloth awnings, and a tall wooden entrance gate at the back-center that opens onto the street. A sharp horn blast: everyone freezes mid-step, Egyptians and Romans together, in a comic tableau. Camera: locked-off and perfectly still, eye-level wide shot; the framing never changes (no tilt, pan, zoom or rising camera). Audio: voice-over narration only (a voice, never shown on screen; no narrator character appears): a British male voice, warm and dry, begins speaking within half a second and says: “Then a horn cut through the music, and everyone froze mid-step.” Music: music nearly silent. Sound effects: sharp military horn, then silence. Final reminder: no character says any word; only the voice-over narration speaks (voice only, nobody on screen is the narrator). Natural laughs, gasps and sighs are fine. No text, captions or logos in the frame.</w:t>
       </w:r>
     </w:p>
     <w:p>
@@ -3103,7 +3103,7 @@
           <w:sz w:val="20"/>
           <w:szCs w:val="20"/>
         </w:rPr>
-        <w:t xml:space="preserve">VOICE RULE: only the off-screen narrator speaks words. No character says any word and no one on screen lip-syncs to speech; characters communicate with facial expressions and body gestures. Natural non-verbal sounds are allowed and should sound real: laughing, giggling, gasping, sighing, groaning, cheering, coughing. Attached reference images, in order: the Roman commander, the Roman soldiers, the wedding courtyard. 2D hand-drawn stickman cartoon in the exact style of the reference images: thin black outlines, large expressive heads, thin stick arms, flat warm colors, playful documentary-comedy tone, 16:9. Characters, identical in every frame: the Roman commander: dark curly gray-streaked hair, gold laurel wreath, bronze-and-gold armor, red cloak. the Roman soldiers: crimson plumed helmets, steel armor, red cloaks, rectangular red shields. Setting: sunny daytime wedding courtyard in ancient Alexandria, sandstone columns with painted blue-and-gold bands, long tables with white cloths and clay jars, orange cloth awnings, and a tall wooden entrance gate at the back-center that opens onto the street. A Roman commander in bronze-and-gold armor walks calmly through the open gate holding a scroll. The dancing soldiers step aside. The courtyard falls silent. The commander wears a gold laurel wreath and a red cloak; no banner, no lettering. Camera: locked-off and perfectly still, fixed, slightly low angle that never tilts, on the commander walking in; the framing never changes (no tilt, pan, zoom or rising camera). Audio: off-screen British male narrator, warm and dry, begins speaking within half a second and says: “And in walked the commander. The only adult in the building.” Music: low sustained tension with distant marching drums, almost silent. Sound effects: slow footsteps, cloak rustle. Final reminder: no character says any word; only the off-screen narrator speaks. Natural laughs, gasps and sighs are fine. No text, captions or logos in the frame.</w:t>
+        <w:t xml:space="preserve">VOICE RULE: only the voice-over narration speaks words; it is a voice only, never a person or character on screen. No character says any word and no one on screen lip-syncs to speech; characters communicate with facial expressions and body gestures. Natural non-verbal sounds are allowed and should sound real: laughing, giggling, gasping, sighing, groaning, cheering, coughing. Attached reference images, in order: the Roman commander, the Roman soldiers, the wedding courtyard. 2D hand-drawn stickman cartoon in the exact style of the reference images: thin black outlines, large expressive heads, thin stick arms, flat warm colors, playful documentary-comedy tone, 16:9. Characters, identical in every frame: the Roman commander: dark curly gray-streaked hair, gold laurel wreath, bronze-and-gold armor, red cloak. the Roman soldiers: crimson plumed helmets, steel armor, red cloaks, rectangular red shields. Setting: sunny daytime wedding courtyard in ancient Alexandria, sandstone columns with painted blue-and-gold bands, long tables with white cloths and clay jars, orange cloth awnings, and a tall wooden entrance gate at the back-center that opens onto the street. A Roman commander in bronze-and-gold armor walks calmly through the open gate holding a scroll. The dancing soldiers step aside. The courtyard falls silent. The commander wears a gold laurel wreath and a red cloak; no banner, no lettering. Camera: locked-off and perfectly still, fixed, slightly low angle that never tilts, on the commander walking in; the framing never changes (no tilt, pan, zoom or rising camera). Audio: voice-over narration only (a voice, never shown on screen; no narrator character appears): a British male voice, warm and dry, begins speaking within half a second and says: “And in walked the commander. The only adult in the building.” Music: low sustained tension with distant marching drums, almost silent. Sound effects: slow footsteps, cloak rustle. Final reminder: no character says any word; only the voice-over narration speaks (voice only, nobody on screen is the narrator). Natural laughs, gasps and sighs are fine. No text, captions or logos in the frame.</w:t>
       </w:r>
     </w:p>
     <w:p>
@@ -3176,7 +3176,7 @@
           <w:sz w:val="20"/>
           <w:szCs w:val="20"/>
         </w:rPr>
-        <w:t xml:space="preserve">VOICE RULE: only the off-screen narrator speaks words. No character says any word and no one on screen lip-syncs to speech; characters communicate with facial expressions and body gestures. Natural non-verbal sounds are allowed and should sound real: laughing, giggling, gasping, sighing, groaning, cheering, coughing. Attached reference images, in order: the Roman commander, Senbi, the groom, the bride. 2D hand-drawn stickman cartoon in the exact style of the reference images: thin black outlines, large expressive heads, thin stick arms, flat warm colors, playful documentary-comedy tone, 16:9. Characters, identical in every frame: the bride: black bob hair with straight bangs, gold headband with a red gem, white dress, blue-and-gold collar, gold sash, gold arm cuffs, light veil. the Roman commander: dark curly gray-streaked hair, gold laurel wreath, bronze-and-gold armor, red cloak. the Roman soldiers: crimson plumed helmets, steel armor, red cloaks, rectangular red shields. Setting: sunny daytime wedding courtyard in ancient Alexandria, sandstone columns with painted blue-and-gold bands, long tables with white cloths and clay jars, orange cloth awnings, and a tall wooden entrance gate at the back-center that opens onto the street. The commander stands serious and still. He slowly turns his head: the dancing soldiers, the food, the bride and groom, the decorations. He stays completely serious. The commander wears a gold laurel wreath and a red cloak; no banner, no lettering. Camera: locked-off and perfectly still, eye-level medium shot of the commander; he turns his head, the camera does not pan; the framing never changes (no tilt, pan, zoom or rising camera). Audio: off-screen British male narrator, warm and dry, begins speaking within half a second and says: “He saw his soldiers dancing. The food. The bride. The groom. The cat.” Music: music nearly silent. Sound effects: quiet room tone, fire crackle. Final reminder: no character says any word; only the off-screen narrator speaks. Natural laughs, gasps and sighs are fine. No text, captions or logos in the frame.</w:t>
+        <w:t xml:space="preserve">VOICE RULE: only the voice-over narration speaks words; it is a voice only, never a person or character on screen. No character says any word and no one on screen lip-syncs to speech; characters communicate with facial expressions and body gestures. Natural non-verbal sounds are allowed and should sound real: laughing, giggling, gasping, sighing, groaning, cheering, coughing. Attached reference images, in order: the Roman commander, Senbi, the groom, the bride. 2D hand-drawn stickman cartoon in the exact style of the reference images: thin black outlines, large expressive heads, thin stick arms, flat warm colors, playful documentary-comedy tone, 16:9. Characters, identical in every frame: the Roman commander: dark curly gray-streaked hair, gold laurel wreath, bronze-and-gold armor, red cloak. Setting: sunny daytime wedding courtyard in ancient Alexandria, sandstone columns with painted blue-and-gold bands, long tables with white cloths and clay jars, orange cloth awnings, and a tall wooden entrance gate at the back-center that opens onto the street. The commander stands serious and still. He slowly turns his head: the dancing soldiers, the food, the bride and groom, the decorations. He stays completely serious. The commander wears a gold laurel wreath and a red cloak; no banner, no lettering. Camera: locked-off and perfectly still, eye-level medium shot of the commander; he turns his head, the camera does not pan; the framing never changes (no tilt, pan, zoom or rising camera). Audio: voice-over narration only (a voice, never shown on screen; no narrator character appears): a British male voice, warm and dry, begins speaking within half a second and says: “He saw his soldiers dancing. The food. The bride. The groom. The cat.” Music: music nearly silent. Sound effects: quiet room tone, fire crackle. Final reminder: no character says any word; only the voice-over narration speaks (voice only, nobody on screen is the narrator). Natural laughs, gasps and sighs are fine. No text, captions or logos in the frame.</w:t>
       </w:r>
     </w:p>
     <w:p>
@@ -3249,7 +3249,7 @@
           <w:sz w:val="20"/>
           <w:szCs w:val="20"/>
         </w:rPr>
-        <w:t xml:space="preserve">VOICE RULE: only the off-screen narrator speaks words. No character says any word and no one on screen lip-syncs to speech; characters communicate with facial expressions and body gestures. Natural non-verbal sounds are allowed and should sound real: laughing, giggling, gasping, sighing, groaning, cheering, coughing. Attached reference images, in order: the Roman commander, the black cat. 2D hand-drawn stickman cartoon in the exact style of the reference images: thin black outlines, large expressive heads, thin stick arms, flat warm colors, playful documentary-comedy tone, 16:9. Characters, identical in every frame: the Roman commander: dark curly gray-streaked hair, gold laurel wreath, bronze-and-gold armor, red cloak. the cat: black with a small gold collar. Setting: sunny daytime wedding courtyard in ancient Alexandria, sandstone columns with painted blue-and-gold bands, long tables with white cloths and clay jars, orange cloth awnings, and a tall wooden entrance gate at the back-center that opens onto the street. The commander stands in the foreground; behind him on the table the black cat with a small gold collar stares straight at him, unmoved. The commander's serious face twitches slightly. The commander wears a gold laurel wreath and a red cloak; no banner, no lettering. Camera: locked-off and perfectly still, eye-level medium two-shot: the commander in the foreground, the cat on the table behind him; no cutting; the framing never changes (no tilt, pan, zoom or rising camera). Audio: off-screen British male narrator, warm and dry, begins speaking within half a second and says: “The cat looked back. The cat was not impressed by the Roman Empire.” Music: music nearly silent. Sound effects: cat meow, tiny sting. Final reminder: no character says any word; only the off-screen narrator speaks. Natural laughs, gasps and sighs are fine. No text, captions or logos in the frame.</w:t>
+        <w:t xml:space="preserve">VOICE RULE: only the voice-over narration speaks words; it is a voice only, never a person or character on screen. No character says any word and no one on screen lip-syncs to speech; characters communicate with facial expressions and body gestures. Natural non-verbal sounds are allowed and should sound real: laughing, giggling, gasping, sighing, groaning, cheering, coughing. Attached reference images, in order: the Roman commander, the black cat. 2D hand-drawn stickman cartoon in the exact style of the reference images: thin black outlines, large expressive heads, thin stick arms, flat warm colors, playful documentary-comedy tone, 16:9. Characters, identical in every frame: the Roman commander: dark curly gray-streaked hair, gold laurel wreath, bronze-and-gold armor, red cloak. the cat: black with a small gold collar. Setting: sunny daytime wedding courtyard in ancient Alexandria, sandstone columns with painted blue-and-gold bands, long tables with white cloths and clay jars, orange cloth awnings, and a tall wooden entrance gate at the back-center that opens onto the street. The commander stands in the foreground; behind him on the table the black cat with a small gold collar stares straight at him, unmoved. The commander's serious face twitches slightly. The commander wears a gold laurel wreath and a red cloak; no banner, no lettering. Camera: locked-off and perfectly still, eye-level medium two-shot: the commander in the foreground, the cat on the table behind him; no cutting; the framing never changes (no tilt, pan, zoom or rising camera). Audio: voice-over narration only (a voice, never shown on screen; no narrator character appears): a British male voice, warm and dry, begins speaking within half a second and says: “The cat looked back. The cat was not impressed by the Roman Empire.” Music: music nearly silent. Sound effects: cat meow, tiny sting. Final reminder: no character says any word; only the voice-over narration speaks (voice only, nobody on screen is the narrator). Natural laughs, gasps and sighs are fine. No text, captions or logos in the frame.</w:t>
       </w:r>
     </w:p>
     <w:p>
@@ -3322,7 +3322,7 @@
           <w:sz w:val="20"/>
           <w:szCs w:val="20"/>
         </w:rPr>
-        <w:t xml:space="preserve">VOICE RULE: only the off-screen narrator speaks words. No character says any word and no one on screen lip-syncs to speech; characters communicate with facial expressions and body gestures. Natural non-verbal sounds are allowed and should sound real: laughing, giggling, gasping, sighing, groaning, cheering, coughing. Attached reference images, in order: the Roman commander, the Egyptian wedding guests, Senbi, the groom. 2D hand-drawn stickman cartoon in the exact style of the reference images: thin black outlines, large expressive heads, thin stick arms, flat warm colors, playful documentary-comedy tone, 16:9. Characters, identical in every frame: the Roman commander: dark curly gray-streaked hair, gold laurel wreath, bronze-and-gold armor, red cloak. the Roman soldiers: crimson plumed helmets, steel armor, red cloaks, rectangular red shields. the guests: Egyptian wedding guests in white linen with blue-and-gold collars and gold headbands, black bob hairstyles, some in white striped headdresses. Setting: sunny daytime wedding courtyard in ancient Alexandria, sandstone columns with painted blue-and-gold bands, long tables with white cloths and clay jars, orange cloth awnings, and a tall wooden entrance gate at the back-center that opens onto the street. Symmetrical composition: the commander at the center unrolls his scroll while Egyptians and Romans stand silent on both sides. The commander wears a gold laurel wreath and a red cloak; no banner, no lettering. Camera: locked-off and perfectly still, symmetrical eye-level medium-wide shot; the framing never changes (no tilt, pan, zoom or rising camera). Audio: off-screen British male narrator, warm and dry, begins speaking within half a second and says: “He unrolled the scroll. Message received: Egypt has new management.” Music: low sustained tension with distant marching drums, almost silent. Sound effects: scroll unrolling, one dramatic drum hit. Final reminder: no character says any word; only the off-screen narrator speaks. Natural laughs, gasps and sighs are fine. No text, captions or logos in the frame.</w:t>
+        <w:t xml:space="preserve">VOICE RULE: only the voice-over narration speaks words; it is a voice only, never a person or character on screen. No character says any word and no one on screen lip-syncs to speech; characters communicate with facial expressions and body gestures. Natural non-verbal sounds are allowed and should sound real: laughing, giggling, gasping, sighing, groaning, cheering, coughing. Attached reference images, in order: the Roman commander, the Egyptian wedding guests, Senbi, the groom. 2D hand-drawn stickman cartoon in the exact style of the reference images: thin black outlines, large expressive heads, thin stick arms, flat warm colors, playful documentary-comedy tone, 16:9. Characters, identical in every frame: the Roman commander: dark curly gray-streaked hair, gold laurel wreath, bronze-and-gold armor, red cloak. the Roman soldiers: crimson plumed helmets, steel armor, red cloaks, rectangular red shields. the guests: Egyptian wedding guests in white linen with blue-and-gold collars and gold headbands, black bob hairstyles, some in white striped headdresses. Setting: sunny daytime wedding courtyard in ancient Alexandria, sandstone columns with painted blue-and-gold bands, long tables with white cloths and clay jars, orange cloth awnings, and a tall wooden entrance gate at the back-center that opens onto the street. Symmetrical composition: the commander at the center unrolls his scroll while Egyptians and Romans stand silent on both sides. The commander wears a gold laurel wreath and a red cloak; no banner, no lettering. Camera: locked-off and perfectly still, symmetrical eye-level medium-wide shot; the framing never changes (no tilt, pan, zoom or rising camera). Audio: voice-over narration only (a voice, never shown on screen; no narrator character appears): a British male voice, warm and dry, begins speaking within half a second and says: “He unrolled the scroll. Message received: Egypt has new management.” Music: low sustained tension with distant marching drums, almost silent. Sound effects: scroll unrolling, one dramatic drum hit. Final reminder: no character says any word; only the voice-over narration speaks (voice only, nobody on screen is the narrator). Natural laughs, gasps and sighs are fine. No text, captions or logos in the frame.</w:t>
       </w:r>
     </w:p>
     <w:p>
@@ -3395,7 +3395,7 @@
           <w:sz w:val="20"/>
           <w:szCs w:val="20"/>
         </w:rPr>
-        <w:t xml:space="preserve">VOICE RULE: only the off-screen narrator speaks words. No character says any word and no one on screen lip-syncs to speech; characters communicate with facial expressions and body gestures. Natural non-verbal sounds are allowed and should sound real: laughing, giggling, gasping, sighing, groaning, cheering, coughing. Attached reference images, in order: Senbi, the groom, the bride, the Egyptian wedding guests. 2D hand-drawn stickman cartoon in the exact style of the reference images: thin black outlines, large expressive heads, thin stick arms, flat warm colors, playful documentary-comedy tone, 16:9. Characters, identical in every frame: Senbi the groom: young man, straight black bowl-cut hair with bangs, gold headband with a gold cobra, bare chest, blue-and-gold broad collar, gold bracers, white kilt with a blue-and-gold sash, brown sandals, thin black stick arms. the bride: black bob hair with straight bangs, gold headband with a red gem, white dress, blue-and-gold collar, gold sash, gold arm cuffs, light veil. Setting: sunny daytime wedding courtyard in ancient Alexandria, sandstone columns with painted blue-and-gold bands, long tables with white cloths and clay jars, orange cloth awnings, and a tall wooden entrance gate at the back-center that opens onto the street. Senbi turns slowly toward the bride; she looks back at him. Both realize the wedding has taken a very strange turn. Camera: locked-off and perfectly still, eye-level medium two-shot of Senbi and the bride; the framing never changes (no tilt, pan, zoom or rising camera). Audio: off-screen British male narrator, warm and dry, begins speaking within half a second and says: “Senbi looked at his bride. Same question, silently: is the wedding still on?” Music: low sustained tension with distant marching drums, almost silent. Sound effects: nervous breath, single drum. Final reminder: no character says any word; only the off-screen narrator speaks. Natural laughs, gasps and sighs are fine. No text, captions or logos in the frame.</w:t>
+        <w:t xml:space="preserve">VOICE RULE: only the voice-over narration speaks words; it is a voice only, never a person or character on screen. No character says any word and no one on screen lip-syncs to speech; characters communicate with facial expressions and body gestures. Natural non-verbal sounds are allowed and should sound real: laughing, giggling, gasping, sighing, groaning, cheering, coughing. Attached reference images, in order: Senbi, the groom, the bride, the Egyptian wedding guests. 2D hand-drawn stickman cartoon in the exact style of the reference images: thin black outlines, large expressive heads, thin stick arms, flat warm colors, playful documentary-comedy tone, 16:9. Characters, identical in every frame: Senbi the groom: young man, straight black bowl-cut hair with bangs, gold headband with a gold cobra, bare chest, blue-and-gold broad collar, gold bracers, white kilt with a blue-and-gold sash, brown sandals, thin black stick arms. the bride: black bob hair with straight bangs, gold headband with a red gem, white dress, blue-and-gold collar, gold sash, gold arm cuffs, light veil. Setting: sunny daytime wedding courtyard in ancient Alexandria, sandstone columns with painted blue-and-gold bands, long tables with white cloths and clay jars, orange cloth awnings, and a tall wooden entrance gate at the back-center that opens onto the street. Senbi turns slowly toward the bride; she looks back at him. Both realize the wedding has taken a very strange turn. Camera: locked-off and perfectly still, eye-level medium two-shot of Senbi and the bride; the framing never changes (no tilt, pan, zoom or rising camera). Audio: voice-over narration only (a voice, never shown on screen; no narrator character appears): a British male voice, warm and dry, begins speaking within half a second and says: “Senbi looked at his bride. Same question, silently: is the wedding still on?” Music: low sustained tension with distant marching drums, almost silent. Sound effects: nervous breath, single drum. Final reminder: no character says any word; only the voice-over narration speaks (voice only, nobody on screen is the narrator). Natural laughs, gasps and sighs are fine. No text, captions or logos in the frame.</w:t>
       </w:r>
     </w:p>
     <w:p>
@@ -3468,7 +3468,7 @@
           <w:sz w:val="20"/>
           <w:szCs w:val="20"/>
         </w:rPr>
-        <w:t xml:space="preserve">VOICE RULE: only the off-screen narrator speaks words. No character says any word and no one on screen lip-syncs to speech; characters communicate with facial expressions and body gestures. Natural non-verbal sounds are allowed and should sound real: laughing, giggling, gasping, sighing, groaning, cheering, coughing. Attached reference images, in order: the Alexandria harbor, the Roman soldiers. 2D hand-drawn stickman cartoon in the exact style of the reference images: thin black outlines, large expressive heads, thin stick arms, flat warm colors, playful documentary-comedy tone, 16:9. Characters, identical in every frame: the Roman soldiers: crimson plumed helmets, steel armor, red cloaks, rectangular red shields. Setting: sunlit street of ancient Alexandria outside the wedding house, sandstone walls, palms, market stalls with red and blue awnings. Roman soldiers walk through the streets of Alexandria while Egyptian civilians watch from the sides. The mood turns briefly serious. Camera: locked-off and perfectly still, eye-level wide shot of Alexandria with Roman soldiers in the streets; the framing never changes (no tilt, pan, zoom or rising camera). Audio: off-screen British male narrator, warm and dry, begins speaking within half a second and says: “Outside, the city was changing hands. Inside, there was still a wedding.” Music: music nearly silent. Sound effects: harbor ambience, distant boots. Final reminder: no character says any word; only the off-screen narrator speaks. Natural laughs, gasps and sighs are fine. No text, captions or logos in the frame.</w:t>
+        <w:t xml:space="preserve">VOICE RULE: only the voice-over narration speaks words; it is a voice only, never a person or character on screen. No character says any word and no one on screen lip-syncs to speech; characters communicate with facial expressions and body gestures. Natural non-verbal sounds are allowed and should sound real: laughing, giggling, gasping, sighing, groaning, cheering, coughing. Attached reference images, in order: the Alexandria harbor, the Roman soldiers. 2D hand-drawn stickman cartoon in the exact style of the reference images: thin black outlines, large expressive heads, thin stick arms, flat warm colors, playful documentary-comedy tone, 16:9. Characters, identical in every frame: the Roman soldiers: crimson plumed helmets, steel armor, red cloaks, rectangular red shields. Setting: sunlit street of ancient Alexandria outside the wedding house, sandstone walls, palms, market stalls with red and blue awnings. Roman soldiers walk through the streets of Alexandria while Egyptian civilians watch from the sides. The mood turns briefly serious. Camera: locked-off and perfectly still, eye-level wide shot of Alexandria with Roman soldiers in the streets; the framing never changes (no tilt, pan, zoom or rising camera). Audio: voice-over narration only (a voice, never shown on screen; no narrator character appears): a British male voice, warm and dry, begins speaking within half a second and says: “Outside, the city was changing hands. Inside, there was still a wedding.” Music: music nearly silent. Sound effects: harbor ambience, distant boots. Final reminder: no character says any word; only the voice-over narration speaks (voice only, nobody on screen is the narrator). Natural laughs, gasps and sighs are fine. No text, captions or logos in the frame.</w:t>
       </w:r>
     </w:p>
     <w:p>
@@ -3541,7 +3541,7 @@
           <w:sz w:val="20"/>
           <w:szCs w:val="20"/>
         </w:rPr>
-        <w:t xml:space="preserve">VOICE RULE: only the off-screen narrator speaks words. No character says any word and no one on screen lip-syncs to speech; characters communicate with facial expressions and body gestures. Natural non-verbal sounds are allowed and should sound real: laughing, giggling, gasping, sighing, groaning, cheering, coughing. Attached reference images, in order: the Alexandria harbor, the Roman soldiers. 2D hand-drawn stickman cartoon in the exact style of the reference images: thin black outlines, large expressive heads, thin stick arms, flat warm colors, playful documentary-comedy tone, 16:9. Characters, identical in every frame: the Roman soldiers: crimson plumed helmets, steel armor, red cloaks, rectangular red shields. the guests: Egyptian wedding guests in white linen with blue-and-gold collars and gold headbands, black bob hairstyles, some in white striped headdresses. Setting: sunlit street of ancient Alexandria outside the wedding house, sandstone walls, palms, market stalls with red and blue awnings. A few Roman soldiers pass through while ordinary Egyptians keep going about their day: carrying baskets, bargaining, hauling jars. The scene signals real history around the fictional wedding. Camera: locked-off and perfectly still, eye-level wide observational shot of Alexandria; the framing never changes (no tilt, pan, zoom or rising camera). Audio: off-screen British male narrator, warm and dry, begins speaking within half a second and says: “To be clear: Senbi and his wedding are fiction. The cat, sadly, too.” Music: music nearly silent. Sound effects: calm city ambience. Final reminder: no character says any word; only the off-screen narrator speaks. Natural laughs, gasps and sighs are fine. No text, captions or logos in the frame.</w:t>
+        <w:t xml:space="preserve">VOICE RULE: only the voice-over narration speaks words; it is a voice only, never a person or character on screen. No character says any word and no one on screen lip-syncs to speech; characters communicate with facial expressions and body gestures. Natural non-verbal sounds are allowed and should sound real: laughing, giggling, gasping, sighing, groaning, cheering, coughing. Attached reference images, in order: the Alexandria harbor, the Roman soldiers. 2D hand-drawn stickman cartoon in the exact style of the reference images: thin black outlines, large expressive heads, thin stick arms, flat warm colors, playful documentary-comedy tone, 16:9. Characters, identical in every frame: the Roman soldiers: crimson plumed helmets, steel armor, red cloaks, rectangular red shields. the guests: Egyptian wedding guests in white linen with blue-and-gold collars and gold headbands, black bob hairstyles, some in white striped headdresses. Setting: sunlit street of ancient Alexandria outside the wedding house, sandstone walls, palms, market stalls with red and blue awnings. A few Roman soldiers pass through while ordinary Egyptians keep going about their day: carrying baskets, bargaining, hauling jars. The scene signals real history around the fictional wedding. Camera: locked-off and perfectly still, eye-level wide observational shot of Alexandria; the framing never changes (no tilt, pan, zoom or rising camera). Audio: voice-over narration only (a voice, never shown on screen; no narrator character appears): a British male voice, warm and dry, begins speaking within half a second and says: “To be clear: Senbi and his wedding are fiction. The cat, sadly, too.” Music: music nearly silent. Sound effects: calm city ambience. Final reminder: no character says any word; only the voice-over narration speaks (voice only, nobody on screen is the narrator). Natural laughs, gasps and sighs are fine. No text, captions or logos in the frame.</w:t>
       </w:r>
     </w:p>
     <w:p>
@@ -3614,7 +3614,7 @@
           <w:sz w:val="20"/>
           <w:szCs w:val="20"/>
         </w:rPr>
-        <w:t xml:space="preserve">VOICE RULE: only the off-screen narrator speaks words. No character says any word and no one on screen lip-syncs to speech; characters communicate with facial expressions and body gestures. Natural non-verbal sounds are allowed and should sound real: laughing, giggling, gasping, sighing, groaning, cheering, coughing. Attached reference images, in order: the Alexandria harbor, the Roman soldiers. 2D hand-drawn stickman cartoon in the exact style of the reference images: thin black outlines, large expressive heads, thin stick arms, flat warm colors, playful documentary-comedy tone, 16:9. Characters, identical in every frame: the Roman soldiers: crimson plumed helmets, steel armor, red cloaks, rectangular red shields. Setting: ancient Alexandria harbor. Stylized historical tableau at the moment Roman authority takes over: Roman ships entering the harbor, soldiers on the quay, civilians watching. Do not depict the wedding. Camera: wide shot of the Alexandria harbor and city, horizon level; fixed except for an almost imperceptible 5% slow push-in, no tilt or pan. Audio: off-screen British male narrator, warm and dry, begins speaking within half a second and says: “The setting is real: in 30 BC, Octavian took Alexandria. Egypt became Roman.” Music: music nearly silent. Sound effects: calm city ambience. Final reminder: no character says any word; only the off-screen narrator speaks. Natural laughs, gasps and sighs are fine. No text, captions or logos in the frame.</w:t>
+        <w:t xml:space="preserve">VOICE RULE: only the voice-over narration speaks words; it is a voice only, never a person or character on screen. No character says any word and no one on screen lip-syncs to speech; characters communicate with facial expressions and body gestures. Natural non-verbal sounds are allowed and should sound real: laughing, giggling, gasping, sighing, groaning, cheering, coughing. Attached reference images, in order: the Alexandria harbor, the Roman soldiers. 2D hand-drawn stickman cartoon in the exact style of the reference images: thin black outlines, large expressive heads, thin stick arms, flat warm colors, playful documentary-comedy tone, 16:9. Characters, identical in every frame: the Roman soldiers: crimson plumed helmets, steel armor, red cloaks, rectangular red shields. Setting: ancient Alexandria harbor. Stylized historical tableau at the moment Roman authority takes over: Roman ships entering the harbor, soldiers on the quay, civilians watching. Do not depict the wedding. Camera: wide shot of the Alexandria harbor and city, horizon level; fixed except for an almost imperceptible 5% slow push-in, no tilt or pan. Audio: voice-over narration only (a voice, never shown on screen; no narrator character appears): a British male voice, warm and dry, begins speaking within half a second and says: “The setting is real: in 30 BC, Octavian took Alexandria. Egypt became Roman.” Music: music nearly silent. Sound effects: calm city ambience. Final reminder: no character says any word; only the voice-over narration speaks (voice only, nobody on screen is the narrator). Natural laughs, gasps and sighs are fine. No text, captions or logos in the frame.</w:t>
       </w:r>
     </w:p>
     <w:p>
@@ -3687,7 +3687,7 @@
           <w:sz w:val="20"/>
           <w:szCs w:val="20"/>
         </w:rPr>
-        <w:t xml:space="preserve">VOICE RULE: only the off-screen narrator speaks words. No character says any word and no one on screen lip-syncs to speech; characters communicate with facial expressions and body gestures. Natural non-verbal sounds are allowed and should sound real: laughing, giggling, gasping, sighing, groaning, cheering, coughing. Attached reference images, in order: Senbi, the groom, the bride's relatives. 2D hand-drawn stickman cartoon in the exact style of the reference images: thin black outlines, large expressive heads, thin stick arms, flat warm colors, playful documentary-comedy tone, 16:9. Characters, identical in every frame: Senbi the groom: young man, straight black bowl-cut hair with bangs, gold headband with a gold cobra, bare chest, blue-and-gold broad collar, gold bracers, white kilt with a blue-and-gold sash, brown sandals, thin black stick arms. the Roman commander: dark curly gray-streaked hair, gold laurel wreath, bronze-and-gold armor, red cloak. Setting: sunny daytime wedding courtyard in ancient Alexandria, sandstone columns with painted blue-and-gold bands, long tables with white cloths and clay jars, orange cloth awnings, and a tall wooden entrance gate at the back-center that opens onto the street. Senbi holds the wooden headrest in his hands and looks down at it, then slowly looks off to the side toward the Roman commander with a tired, deadpan expression. Camera: locked-off and perfectly still, eye-level medium close-up with the headrest in Senbi's hands and his face both in frame; the framing never changes (no tilt, pan, zoom or rising camera). Audio: off-screen British male narrator, warm and dry, begins speaking within half a second and says: “Headrest, then commander. Neither came with a return policy.” Music: playful comic percussion over the wedding rhythm, low under the voice. Sound effects: wood knock, comic sting. Final reminder: no character says any word; only the off-screen narrator speaks. Natural laughs, gasps and sighs are fine. No text, captions or logos in the frame.</w:t>
+        <w:t xml:space="preserve">VOICE RULE: only the voice-over narration speaks words; it is a voice only, never a person or character on screen. No character says any word and no one on screen lip-syncs to speech; characters communicate with facial expressions and body gestures. Natural non-verbal sounds are allowed and should sound real: laughing, giggling, gasping, sighing, groaning, cheering, coughing. Attached reference images, in order: Senbi, the groom, the bride's relatives. 2D hand-drawn stickman cartoon in the exact style of the reference images: thin black outlines, large expressive heads, thin stick arms, flat warm colors, playful documentary-comedy tone, 16:9. Characters, identical in every frame: Senbi the groom: young man, straight black bowl-cut hair with bangs, gold headband with a gold cobra, bare chest, blue-and-gold broad collar, gold bracers, white kilt with a blue-and-gold sash, brown sandals, thin black stick arms. Setting: sunny daytime wedding courtyard in ancient Alexandria, sandstone columns with painted blue-and-gold bands, long tables with white cloths and clay jars, orange cloth awnings, and a tall wooden entrance gate at the back-center that opens onto the street. Senbi holds the wooden headrest in his hands and looks down at it, then slowly looks off to the side toward the Roman commander with a tired, deadpan expression. Camera: locked-off and perfectly still, eye-level medium close-up with the headrest in Senbi's hands and his face both in frame; the framing never changes (no tilt, pan, zoom or rising camera). Audio: voice-over narration only (a voice, never shown on screen; no narrator character appears): a British male voice, warm and dry, begins speaking within half a second and says: “Headrest, then commander. Neither came with a return policy.” Music: playful comic percussion over the wedding rhythm, low under the voice. Sound effects: wood knock, comic sting. Final reminder: no character says any word; only the voice-over narration speaks (voice only, nobody on screen is the narrator). Natural laughs, gasps and sighs are fine. No text, captions or logos in the frame.</w:t>
       </w:r>
     </w:p>
     <w:p>
@@ -3760,7 +3760,7 @@
           <w:sz w:val="20"/>
           <w:szCs w:val="20"/>
         </w:rPr>
-        <w:t xml:space="preserve">VOICE RULE: only the off-screen narrator speaks words. No character says any word and no one on screen lip-syncs to speech; characters communicate with facial expressions and body gestures. Natural non-verbal sounds are allowed and should sound real: laughing, giggling, gasping, sighing, groaning, cheering, coughing. Attached reference images, in order: the bride, Senbi, the groom, the wedding courtyard. 2D hand-drawn stickman cartoon in the exact style of the reference images: thin black outlines, large expressive heads, thin stick arms, flat warm colors, playful documentary-comedy tone, 16:9. Characters, identical in every frame: Senbi the groom: young man, straight black bowl-cut hair with bangs, gold headband with a gold cobra, bare chest, blue-and-gold broad collar, gold bracers, white kilt with a blue-and-gold sash, brown sandals, thin black stick arms. the bride: black bob hair with straight bangs, gold headband with a red gem, white dress, blue-and-gold collar, gold sash, gold arm cuffs, light veil. Setting: sunny daytime wedding courtyard in ancient Alexandria, sandstone columns with painted blue-and-gold bands, long tables with white cloths and clay jars, orange cloth awnings, and a tall wooden entrance gate at the back-center that opens onto the street. The bride finally laughs at the absurdity. Senbi looks at her, then starts laughing too. The tension releases. Camera: locked-off and perfectly still, eye-level medium two-shot of Senbi and the bride; the framing never changes (no tilt, pan, zoom or rising camera). Audio: off-screen British male narrator, warm and dry, begins speaking within half a second and says: “Senbi thought he was getting married.” Music: warm gentle resolution with the same flute and strings, low under the voice. Sound effects: bride laughter, Senbi laughter. Final reminder: no character says any word; only the off-screen narrator speaks. Natural laughs, gasps and sighs are fine. No text, captions or logos in the frame.</w:t>
+        <w:t xml:space="preserve">VOICE RULE: only the voice-over narration speaks words; it is a voice only, never a person or character on screen. No character says any word and no one on screen lip-syncs to speech; characters communicate with facial expressions and body gestures. Natural non-verbal sounds are allowed and should sound real: laughing, giggling, gasping, sighing, groaning, cheering, coughing. Attached reference images, in order: the bride, Senbi, the groom, the wedding courtyard. 2D hand-drawn stickman cartoon in the exact style of the reference images: thin black outlines, large expressive heads, thin stick arms, flat warm colors, playful documentary-comedy tone, 16:9. Characters, identical in every frame: Senbi the groom: young man, straight black bowl-cut hair with bangs, gold headband with a gold cobra, bare chest, blue-and-gold broad collar, gold bracers, white kilt with a blue-and-gold sash, brown sandals, thin black stick arms. the bride: black bob hair with straight bangs, gold headband with a red gem, white dress, blue-and-gold collar, gold sash, gold arm cuffs, light veil. Setting: sunny daytime wedding courtyard in ancient Alexandria, sandstone columns with painted blue-and-gold bands, long tables with white cloths and clay jars, orange cloth awnings, and a tall wooden entrance gate at the back-center that opens onto the street. The bride finally laughs at the absurdity. Senbi looks at her, then starts laughing too. The tension releases. Camera: locked-off and perfectly still, eye-level medium two-shot of Senbi and the bride; the framing never changes (no tilt, pan, zoom or rising camera). Audio: voice-over narration only (a voice, never shown on screen; no narrator character appears): a British male voice, warm and dry, begins speaking within half a second and says: “Senbi thought he was getting married.” Music: warm gentle resolution with the same flute and strings, low under the voice. Sound effects: bride laughter, Senbi laughter. Final reminder: no character says any word; only the voice-over narration speaks (voice only, nobody on screen is the narrator). Natural laughs, gasps and sighs are fine. No text, captions or logos in the frame.</w:t>
       </w:r>
     </w:p>
     <w:p>
@@ -3833,7 +3833,7 @@
           <w:sz w:val="20"/>
           <w:szCs w:val="20"/>
         </w:rPr>
-        <w:t xml:space="preserve">VOICE RULE: only the off-screen narrator speaks words. No character says any word and no one on screen lip-syncs to speech; characters communicate with facial expressions and body gestures. Natural non-verbal sounds are allowed and should sound real: laughing, giggling, gasping, sighing, groaning, cheering, coughing. Attached reference images, in order: Senbi, the groom. 2D hand-drawn stickman cartoon in the exact style of the reference images: thin black outlines, large expressive heads, thin stick arms, flat warm colors, playful documentary-comedy tone, 16:9. Characters, identical in every frame: Senbi the groom: young man, straight black bowl-cut hair with bangs, gold headband with a gold cobra, bare chest, blue-and-gold broad collar, gold bracers, white kilt with a blue-and-gold sash, brown sandals, thin black stick arms. Setting: a quiet room of the wedding house at night, warm torchlight, painted columns, cushions on the floor; Senbi is alone in the room. Senbi lies awkwardly asleep with his neck on the wooden headrest. Distant marching is heard; he opens one eye, listens, and closes it again. Camera: eye-level medium close-up of Senbi's face; fixed except for an almost imperceptible 5% slow push-in, no tilt or pan. Audio: off-screen British male narrator, warm and dry, begins speaking within half a second and says: “He was.” Music: warm gentle resolution with the same flute and strings, low under the voice. Sound effects: distant marching, soft snore. Final reminder: no character says any word; only the off-screen narrator speaks. Natural laughs, gasps and sighs are fine. No text, captions or logos in the frame.</w:t>
+        <w:t xml:space="preserve">VOICE RULE: only the voice-over narration speaks words; it is a voice only, never a person or character on screen. No character says any word and no one on screen lip-syncs to speech; characters communicate with facial expressions and body gestures. Natural non-verbal sounds are allowed and should sound real: laughing, giggling, gasping, sighing, groaning, cheering, coughing. Attached reference images, in order: Senbi, the groom. 2D hand-drawn stickman cartoon in the exact style of the reference images: thin black outlines, large expressive heads, thin stick arms, flat warm colors, playful documentary-comedy tone, 16:9. Characters, identical in every frame: Senbi the groom: young man, straight black bowl-cut hair with bangs, gold headband with a gold cobra, bare chest, blue-and-gold broad collar, gold bracers, white kilt with a blue-and-gold sash, brown sandals, thin black stick arms. Setting: a quiet room of the wedding house at night, warm torchlight, painted columns, cushions on the floor; Senbi is alone in the room. Senbi lies awkwardly asleep with his neck on the wooden headrest. Distant marching is heard; he opens one eye, listens, and closes it again. Camera: eye-level medium close-up of Senbi's face; fixed except for an almost imperceptible 5% slow push-in, no tilt or pan. Audio: voice-over narration only (a voice, never shown on screen; no narrator character appears): a British male voice, warm and dry, begins speaking within half a second and says: “He was.” Music: warm gentle resolution with the same flute and strings, low under the voice. Sound effects: distant marching, soft snore. Final reminder: no character says any word; only the voice-over narration speaks (voice only, nobody on screen is the narrator). Natural laughs, gasps and sighs are fine. No text, captions or logos in the frame.</w:t>
       </w:r>
     </w:p>
     <w:p>
@@ -3906,7 +3906,7 @@
           <w:sz w:val="20"/>
           <w:szCs w:val="20"/>
         </w:rPr>
-        <w:t xml:space="preserve">VOICE RULE: only the off-screen narrator speaks words. No character says any word and no one on screen lip-syncs to speech; characters communicate with facial expressions and body gestures. Natural non-verbal sounds are allowed and should sound real: laughing, giggling, gasping, sighing, groaning, cheering, coughing. Attached reference images, in order: Senbi, the groom, the bride, the Alexandria harbor. 2D hand-drawn stickman cartoon in the exact style of the reference images: thin black outlines, large expressive heads, thin stick arms, flat warm colors, playful documentary-comedy tone, 16:9. Characters, identical in every frame: Senbi the groom: young man, straight black bowl-cut hair with bangs, gold headband with a gold cobra, bare chest, blue-and-gold broad collar, gold bracers, white kilt with a blue-and-gold sash, brown sandals, thin black stick arms. the bride: black bob hair with straight bangs, gold headband with a red gem, white dress, blue-and-gold collar, gold sash, gold arm cuffs, light veil. the Roman soldiers: crimson plumed helmets, steel armor, red cloaks, rectangular red shields. Setting: sunny daytime wedding courtyard in ancient Alexandria, sandstone columns with painted blue-and-gold bands, long tables with white cloths and clay jars, orange cloth awnings, and a tall wooden entrance gate at the back-center that opens onto the street. Final composition in warm evening light: Senbi and the bride in the foreground, Alexandria behind them, Roman soldiers as small figures in the distance. Camera: locked-off and perfectly still, wide shot of Senbi and the bride in the foreground with Alexandria behind them; the framing never changes (no tilt, pan, zoom or rising camera). Audio: off-screen British male narrator, warm and dry, begins speaking within half a second and says: “He just hadn't noticed he was also getting a new government.” Music: warm gentle resolution with the same flute and strings, low under the voice. Sound effects: gentle music, silence at the very end. Final reminder: no character says any word; only the off-screen narrator speaks. Natural laughs, gasps and sighs are fine. No text, captions or logos in the frame.</w:t>
+        <w:t xml:space="preserve">VOICE RULE: only the voice-over narration speaks words; it is a voice only, never a person or character on screen. No character says any word and no one on screen lip-syncs to speech; characters communicate with facial expressions and body gestures. Natural non-verbal sounds are allowed and should sound real: laughing, giggling, gasping, sighing, groaning, cheering, coughing. Attached reference images, in order: Senbi, the groom, the bride, the Alexandria harbor. 2D hand-drawn stickman cartoon in the exact style of the reference images: thin black outlines, large expressive heads, thin stick arms, flat warm colors, playful documentary-comedy tone, 16:9. Characters, identical in every frame: Senbi the groom: young man, straight black bowl-cut hair with bangs, gold headband with a gold cobra, bare chest, blue-and-gold broad collar, gold bracers, white kilt with a blue-and-gold sash, brown sandals, thin black stick arms. the bride: black bob hair with straight bangs, gold headband with a red gem, white dress, blue-and-gold collar, gold sash, gold arm cuffs, light veil. the Roman soldiers: crimson plumed helmets, steel armor, red cloaks, rectangular red shields. Setting: sunny daytime wedding courtyard in ancient Alexandria, sandstone columns with painted blue-and-gold bands, long tables with white cloths and clay jars, orange cloth awnings, and a tall wooden entrance gate at the back-center that opens onto the street. Final composition in warm evening light: Senbi and the bride in the foreground, Alexandria behind them, Roman soldiers as small figures in the distance. Camera: locked-off and perfectly still, wide shot of Senbi and the bride in the foreground with Alexandria behind them; the framing never changes (no tilt, pan, zoom or rising camera). Audio: voice-over narration only (a voice, never shown on screen; no narrator character appears): a British male voice, warm and dry, begins speaking within half a second and says: “He just hadn't noticed he was also getting a new government.” Music: warm gentle resolution with the same flute and strings, low under the voice. Sound effects: gentle music, silence at the very end. Final reminder: no character says any word; only the voice-over narration speaks (voice only, nobody on screen is the narrator). Natural laughs, gasps and sighs are fine. No text, captions or logos in the frame.</w:t>
       </w:r>
     </w:p>
     <w:p>

</xml_diff>

<commit_message>
Episode 1 prompts: rich timed action timelines, lighting, ambience and per-shot character lock
Co-Authored-By: Claude Sonnet 5.5 <noreply@anthropic.com>
Claude-Session: https://claude.ai/code/session_01S29WeDgsXUpbHNWdisiPFj
</commit_message>
<xml_diff>
--- a/The_Last_Day_of_Ancient_Egypt_Ep1_FLOW_PROMPTS_READY.docx
+++ b/The_Last_Day_of_Ancient_Egypt_Ep1_FLOW_PROMPTS_READY.docx
@@ -548,7 +548,7 @@
           <w:sz w:val="20"/>
           <w:szCs w:val="20"/>
         </w:rPr>
-        <w:t xml:space="preserve">VOICE RULE: only the voice-over narration speaks words; it is a voice only, never a person or character on screen. No character says any word and no one on screen lip-syncs to speech; characters communicate with facial expressions and body gestures. Natural non-verbal sounds are allowed and should sound real: laughing, giggling, gasping, sighing, groaning, cheering, coughing. Attached reference images, in order: the wedding courtyard, the Egyptian wedding guests. 2D hand-drawn stickman cartoon in the exact style of the reference images: thin black outlines, large expressive heads, thin stick arms, flat warm colors, playful documentary-comedy tone, 16:9. Characters, identical in every frame: the guests: Egyptian wedding guests in white linen with blue-and-gold collars and gold headbands, black bob hairstyles, some in white striped headdresses. Setting: sunny daytime wedding courtyard in ancient Alexandria, sandstone columns with painted blue-and-gold bands, long tables with white cloths and clay jars, orange cloth awnings, and a tall wooden entrance gate at the back-center that opens onto the street. Dancers fill the floor, fully visible from feet to heads, clapping and spinning. At about 2 seconds every dancer pauses for half a beat. One guest turns his head toward the open gate at the back; the others resume dancing a moment later. Camera: locked-off and perfectly still, eye-level medium-wide shot, the dancers fully visible from feet to heads (NOT a feet close-up); the framing never changes (no tilt, pan, zoom or rising camera). Audio: voice-over narration only (a voice, never shown on screen; no narrator character appears): a British male voice, warm and dry, begins speaking within half a second and says: “Then, for half a beat, the dancing stopped. Nobody noticed. Except one guest.” Music: light ancient-Mediterranean wedding music (frame drums, reed flute, plucked strings) with a faint uneasy undertone, same theme in every clip, low under the voice. Sound effects: dancing feet on stone, one tiny pause, faint distant thump. Final reminder: no character says any word; only the voice-over narration speaks (voice only, nobody on screen is the narrator). Natural laughs, gasps and sighs are fine. No text, captions or logos in the frame.</w:t>
+        <w:t xml:space="preserve">VOICE RULE: only the voice-over narration speaks words; it is a voice only, never a person or character on screen. No character says any word and no one on screen lip-syncs to speech; characters communicate with facial expressions and body gestures. Natural non-verbal sounds are allowed and should sound real: laughing, giggling, gasping, sighing, groaning, cheering, coughing. Attached reference images, in order: the wedding courtyard, the Egyptian wedding guests. 2D hand-drawn stickman cartoon in the exact style of the reference images: thin black outlines, large expressive heads, thin stick arms, flat warm colors, playful documentary-comedy tone, 16:9. Characters, identical in every frame: the guests: Egyptian wedding guests in white linen with blue-and-gold collars and gold headbands, black bob hairstyles, some in white striped headdresses. Setting: sunny daytime wedding courtyard in ancient Alexandria, sandstone columns with painted blue-and-gold bands, long tables with white cloths and clay jars, orange cloth awnings, and a tall wooden entrance gate at the back-center that opens onto the street. Lighting: warm bright afternoon sunlight, soft shadows, rich saturated colors. ACTION TIMELINE (8 seconds): 0–2 s: guests dance joyfully in the middle of the courtyard, clapping and spinning, kilts and dresses swinging, big happy smiles. 2–3 s: every dancer freezes for half a beat mid-step, smiles still on their faces. 3–5.5 s: one guest slowly turns his head toward the tall gate at the back with a puzzled, alert face while the others unfreeze and keep dancing, unaware. 5.5–8 s: the guest keeps staring at the gate, brow furrowed, then slowly looks back and shrugs it off with a small smile. Camera: locked-off and perfectly still, eye-level medium-wide shot, the dancers fully visible from feet to heads (NOT a feet close-up); the framing never changes (no tilt, pan, zoom or rising camera). Audio: voice-over narration only (a voice, never shown on screen; no narrator character appears): a British male voice, warm and dry, begins speaking within half a second and says: “Then, for half a beat, the dancing stopped. Nobody noticed. Except one guest.” The line takes about 5.2 seconds; leave the last second free of speech so the moment can land. Music: light ancient-Mediterranean wedding music (frame drums, reed flute, plucked strings) with a faint uneasy undertone, same theme in every clip, low under the voice. Sound effects: dancing feet on stone, one tiny pause, faint distant thump, timed to the action. Ambience: light courtyard ambience: clinking cups, footsteps on stone, a soft breeze, no words. Final reminder: no character says any word; only the voice-over narration speaks (voice only, nobody on screen is the narrator). Natural laughs, gasps and sighs are fine. No text, captions or logos in the frame.</w:t>
       </w:r>
     </w:p>
     <w:p>
@@ -621,7 +621,7 @@
           <w:sz w:val="20"/>
           <w:szCs w:val="20"/>
         </w:rPr>
-        <w:t xml:space="preserve">VOICE RULE: only the voice-over narration speaks words; it is a voice only, never a person or character on screen. No character says any word and no one on screen lip-syncs to speech; characters communicate with facial expressions and body gestures. Natural non-verbal sounds are allowed and should sound real: laughing, giggling, gasping, sighing, groaning, cheering, coughing. Attached reference images, in order: the Alexandria harbor. 2D hand-drawn cartoon in the exact style of the reference image: flat warm colors, soft cel shading, playful documentary-comedy tone, 16:9. Setting: ancient Alexandria harbor in bright daylight. Wide establishing view of the harbor and city: sailboats gliding on blue water, gulls crossing the sky, the great lighthouse and white monumental buildings behind, palms at the edge of the frame. Only tiny distant figures on the quays. Camera: wide establishing shot, horizon level; fixed except for an almost imperceptible 5% slow push-in, no tilt or pan. Audio: voice-over narration only (a voice, never shown on screen; no narrator character appears): a British male voice, warm and dry, begins speaking within half a second and says: “Alexandria, 30 BC. A huge, busy city, about to have a strange evening.” Music: light ancient-Mediterranean wedding music (frame drums, reed flute, plucked strings), same theme in every clip, low under the voice. Sound effects: gulls, harbor water, distant market clatter, no words. Final reminder: no character says any word; only the voice-over narration speaks (voice only, nobody on screen is the narrator). Natural laughs, gasps and sighs are fine. No text, captions or logos in the frame.</w:t>
+        <w:t xml:space="preserve">VOICE RULE: only the voice-over narration speaks words; it is a voice only, never a person or character on screen. No character says any word and no one on screen lip-syncs to speech; characters communicate with facial expressions and body gestures. Natural non-verbal sounds are allowed and should sound real: laughing, giggling, gasping, sighing, groaning, cheering, coughing. Attached reference images, in order: the Alexandria harbor. 2D hand-drawn cartoon in the exact style of the reference image: flat warm colors, soft cel shading, playful documentary-comedy tone, 16:9. Setting: ancient Alexandria harbor in bright daylight. Lighting: bright clear daylight, sparkling water. ACTION TIMELINE (8 seconds): 0–2.5 s: sailboats glide slowly across the blue water, sails filling with wind, gulls crossing the sky. 2.5–5.5 s: the great lighthouse stands tall on the right while palms sway gently at the left edge. 5.5–8 s: more sails drift across the harbor, tiny figures on the quays carry baskets and jars, sunlight sparkles on the water. Camera: wide establishing shot, horizon level; fixed except for an almost imperceptible 5% slow push-in, no tilt or pan. Audio: voice-over narration only (a voice, never shown on screen; no narrator character appears): a British male voice, warm and dry, begins speaking within half a second and says: “Alexandria, 30 BC. A huge, busy city, about to have a strange evening.” The line takes about 5.2 seconds; leave the last second free of speech so the moment can land. Music: light ancient-Mediterranean wedding music (frame drums, reed flute, plucked strings), same theme in every clip, low under the voice. Sound effects: gulls, harbor water, distant market clatter, no words, timed to the action. Ambience: gulls, lapping water and creaking ropes, no words. Final reminder: no character says any word; only the voice-over narration speaks (voice only, nobody on screen is the narrator). Natural laughs, gasps and sighs are fine. No text, captions or logos in the frame.</w:t>
       </w:r>
     </w:p>
     <w:p>
@@ -694,7 +694,7 @@
           <w:sz w:val="20"/>
           <w:szCs w:val="20"/>
         </w:rPr>
-        <w:t xml:space="preserve">VOICE RULE: only the voice-over narration speaks words; it is a voice only, never a person or character on screen. No character says any word and no one on screen lip-syncs to speech; characters communicate with facial expressions and body gestures. Natural non-verbal sounds are allowed and should sound real: laughing, giggling, gasping, sighing, groaning, cheering, coughing. Attached reference images, in order: the wedding courtyard. 2D hand-drawn stickman cartoon in the exact style of the reference images: thin black outlines, large expressive heads, thin stick arms, flat warm colors, playful documentary-comedy tone, 16:9. Characters, identical in every frame: Senbi the groom: young man, straight black bowl-cut hair with bangs, gold headband with a gold cobra, bare chest, blue-and-gold broad collar, gold bracers, white kilt with a blue-and-gold sash, brown sandals, thin black stick arms. the bride: black bob hair with straight bangs, gold headband with a red gem, white dress, blue-and-gold collar, gold sash, gold arm cuffs, light veil. the guests: Egyptian wedding guests in white linen with blue-and-gold collars and gold headbands, black bob hairstyles, some in white striped headdresses. Setting: sunny daytime wedding courtyard in ancient Alexandria, sandstone columns with painted blue-and-gold bands, long tables with white cloths and clay jars, orange cloth awnings, and a tall wooden entrance gate at the back-center that opens onto the street. The wedding goes on as if nothing is wrong: guests dance and clap, Senbi and the bride among them. Keep the upper third of the frame calm and uncluttered. Camera: locked-off and perfectly still, eye-level medium-wide shot of the wedding courtyard; the framing never changes (no tilt, pan, zoom or rising camera). Audio: voice-over narration only (a voice, never shown on screen; no narrator character appears): a British male voice, warm and dry, begins speaking within half a second and says: ““Last day of Ancient Egypt”? Relax. Egypt survived. Its queen, less so.” Music: light ancient-Mediterranean wedding music (frame drums, reed flute, plucked strings), same theme in every clip, low under the voice. Sound effects: wedding crowd reactions without any words, one short comic sting. Final reminder: no character says any word; only the voice-over narration speaks (voice only, nobody on screen is the narrator). Natural laughs, gasps and sighs are fine. No text, captions or logos in the frame.</w:t>
+        <w:t xml:space="preserve">VOICE RULE: only the voice-over narration speaks words; it is a voice only, never a person or character on screen. No character says any word and no one on screen lip-syncs to speech; characters communicate with facial expressions and body gestures. Natural non-verbal sounds are allowed and should sound real: laughing, giggling, gasping, sighing, groaning, cheering, coughing. Attached reference images, in order: the wedding courtyard. 2D hand-drawn stickman cartoon in the exact style of the reference images: thin black outlines, large expressive heads, thin stick arms, flat warm colors, playful documentary-comedy tone, 16:9. Characters, identical in every frame: Senbi the groom: young man, straight black bowl-cut hair with bangs, gold headband with a gold cobra, bare chest, blue-and-gold broad collar, gold bracers, white kilt with a blue-and-gold sash, brown sandals, thin black stick arms. the bride: black bob hair with straight bangs, gold headband with a red gem, white dress, blue-and-gold collar, gold sash, gold arm cuffs, light veil. the guests: Egyptian wedding guests in white linen with blue-and-gold collars and gold headbands, black bob hairstyles, some in white striped headdresses. Setting: sunny daytime wedding courtyard in ancient Alexandria, sandstone columns with painted blue-and-gold bands, long tables with white cloths and clay jars, orange cloth awnings, and a tall wooden entrance gate at the back-center that opens onto the street. Lighting: warm bright afternoon sunlight, soft shadows, rich saturated colors. ACTION TIMELINE (8 seconds): 0–2.5 s: guests dance and clap in a cheerful rhythm, Senbi and the bride dance together in the center, beaming. 2.5–5.5 s: a guest raises a clay cup in a toast and the others clap along; everything looks perfectly normal. 5.5–8 s: the happy scene holds; a little dust floats in the sunlight. Camera: locked-off and perfectly still, eye-level medium-wide shot of the wedding courtyard; the framing never changes (no tilt, pan, zoom or rising camera). Audio: voice-over narration only (a voice, never shown on screen; no narrator character appears): a British male voice, warm and dry, begins speaking within half a second and says: ““Last day of Ancient Egypt”? Relax. Egypt survived. Its queen, less so.” The line takes about 4.8 seconds; leave the last second free of speech so the moment can land. Music: light ancient-Mediterranean wedding music (frame drums, reed flute, plucked strings), same theme in every clip, low under the voice. Sound effects: wedding crowd reactions without any words, one short comic sting, timed to the action. Ambience: light courtyard ambience: clinking cups, footsteps on stone, a soft breeze, no words. Final reminder: no character says any word; only the voice-over narration speaks (voice only, nobody on screen is the narrator). Natural laughs, gasps and sighs are fine. No text, captions or logos in the frame.</w:t>
       </w:r>
     </w:p>
     <w:p>
@@ -767,7 +767,7 @@
           <w:sz w:val="20"/>
           <w:szCs w:val="20"/>
         </w:rPr>
-        <w:t xml:space="preserve">VOICE RULE: only the voice-over narration speaks words; it is a voice only, never a person or character on screen. No character says any word and no one on screen lip-syncs to speech; characters communicate with facial expressions and body gestures. Natural non-verbal sounds are allowed and should sound real: laughing, giggling, gasping, sighing, groaning, cheering, coughing. Attached reference images, in order: Senbi, the groom, the wedding courtyard. 2D hand-drawn stickman cartoon in the exact style of the reference images: thin black outlines, large expressive heads, thin stick arms, flat warm colors, playful documentary-comedy tone, 16:9. Characters, identical in every frame: Senbi the groom: young man, straight black bowl-cut hair with bangs, gold headband with a gold cobra, bare chest, blue-and-gold broad collar, gold bracers, white kilt with a blue-and-gold sash, brown sandals, thin black stick arms. Setting: a shaded sandstone alcove beside the wedding courtyard, painted columns, warm daylight. Senbi stands before a bronze mirror. He straightens his blue-and-gold collar, checks his sash, practices a proud smile, then wipes his forehead with the back of his hand. Camera: eye-level medium shot of Senbi at the mirror; fixed except for an almost imperceptible 5% slow push-in, no tilt or pan. Audio: voice-over narration only (a voice, never shown on screen; no narrator character appears): a British male voice, warm and dry, begins speaking within half a second and says: “Meet Senbi. He's getting married today, and has checked the mirror forty times.” Music: light ancient-Mediterranean wedding music (frame drums, reed flute, plucked strings), same theme in every clip, low under the voice. Sound effects: small fabric rustle, soft room tone. Final reminder: no character says any word; only the voice-over narration speaks (voice only, nobody on screen is the narrator). Natural laughs, gasps and sighs are fine. No text, captions or logos in the frame.</w:t>
+        <w:t xml:space="preserve">VOICE RULE: only the voice-over narration speaks words; it is a voice only, never a person or character on screen. No character says any word and no one on screen lip-syncs to speech; characters communicate with facial expressions and body gestures. Natural non-verbal sounds are allowed and should sound real: laughing, giggling, gasping, sighing, groaning, cheering, coughing. Attached reference images, in order: Senbi, the groom, the wedding courtyard. 2D hand-drawn stickman cartoon in the exact style of the reference images: thin black outlines, large expressive heads, thin stick arms, flat warm colors, playful documentary-comedy tone, 16:9. Characters, identical in every frame: Senbi the groom: young man, straight black bowl-cut hair with bangs, gold headband with a gold cobra, bare chest, blue-and-gold broad collar, gold bracers, white kilt with a blue-and-gold sash, brown sandals, thin black stick arms. Setting: a shaded sandstone alcove beside the wedding courtyard, painted columns, warm daylight. Lighting: warm bright afternoon sunlight, soft shadows, rich saturated colors. ACTION TIMELINE (8 seconds): 0–2.5 s: Senbi stands in front of a bronze mirror on a stand, seen from the side, and straightens his blue-and-gold collar with both hands. 2.5–5.5 s: he tugs his sash neat, then practices a proud, wide smile at his reflection. 5.5–8 s: the smile wobbles into a nervous twitch; he wipes his forehead with the back of his hand and takes a deep breath. Camera: eye-level medium shot of Senbi at the mirror; fixed except for an almost imperceptible 5% slow push-in, no tilt or pan. Audio: voice-over narration only (a voice, never shown on screen; no narrator character appears): a British male voice, warm and dry, begins speaking within half a second and says: “Meet Senbi. He's getting married today, and has checked the mirror forty times.” The line takes about 5.2 seconds; leave the last second free of speech so the moment can land. Music: light ancient-Mediterranean wedding music (frame drums, reed flute, plucked strings), same theme in every clip, low under the voice. Sound effects: small fabric rustle, soft room tone, timed to the action. Ambience: light courtyard ambience: clinking cups, footsteps on stone, a soft breeze, no words. Final reminder: no character says any word; only the voice-over narration speaks (voice only, nobody on screen is the narrator). Natural laughs, gasps and sighs are fine. No text, captions or logos in the frame.</w:t>
       </w:r>
     </w:p>
     <w:p>
@@ -840,7 +840,7 @@
           <w:sz w:val="20"/>
           <w:szCs w:val="20"/>
         </w:rPr>
-        <w:t xml:space="preserve">VOICE RULE: only the voice-over narration speaks words; it is a voice only, never a person or character on screen. No character says any word and no one on screen lip-syncs to speech; characters communicate with facial expressions and body gestures. Natural non-verbal sounds are allowed and should sound real: laughing, giggling, gasping, sighing, groaning, cheering, coughing. Attached reference images, in order: Senbi, the groom. 2D hand-drawn stickman cartoon in the exact style of the reference images: thin black outlines, large expressive heads, thin stick arms, flat warm colors, playful documentary-comedy tone, 16:9. Characters, identical in every frame: Senbi the groom: young man, straight black bowl-cut hair with bangs, gold headband with a gold cobra, bare chest, blue-and-gold broad collar, gold bracers, white kilt with a blue-and-gold sash, brown sandals, thin black stick arms. Setting: a shaded sandstone alcove beside the wedding courtyard, painted columns, warm daylight. Senbi, full body. First he inspects a small bronze razor and runs a hand over his chin. Then he straightens his headband. Finally he adjusts his collar and strikes an overconfident hands-on-hips pose. Camera: locked-off and perfectly still, eye-level full-body medium shot of Senbi; all three actions happen inside the same frame; the framing never changes (no tilt, pan, zoom or rising camera). Audio: voice-over narration only (a voice, never shown on screen; no narrator character appears): a British male voice, warm and dry, begins speaking within half a second and says: “Every groom has one job: look incredible, and pretend it took no effort.” Music: playful comic percussion over the wedding rhythm, low under the voice. Sound effects: light razor scrape, one comic boing. Final reminder: no character says any word; only the voice-over narration speaks (voice only, nobody on screen is the narrator). Natural laughs, gasps and sighs are fine. No text, captions or logos in the frame.</w:t>
+        <w:t xml:space="preserve">VOICE RULE: only the voice-over narration speaks words; it is a voice only, never a person or character on screen. No character says any word and no one on screen lip-syncs to speech; characters communicate with facial expressions and body gestures. Natural non-verbal sounds are allowed and should sound real: laughing, giggling, gasping, sighing, groaning, cheering, coughing. Attached reference images, in order: Senbi, the groom. 2D hand-drawn stickman cartoon in the exact style of the reference images: thin black outlines, large expressive heads, thin stick arms, flat warm colors, playful documentary-comedy tone, 16:9. Characters, identical in every frame: Senbi the groom: young man, straight black bowl-cut hair with bangs, gold headband with a gold cobra, bare chest, blue-and-gold broad collar, gold bracers, white kilt with a blue-and-gold sash, brown sandals, thin black stick arms. Setting: a shaded sandstone alcove beside the wedding courtyard, painted columns, warm daylight. Lighting: warm bright afternoon sunlight, soft shadows, rich saturated colors. ACTION TIMELINE (8 seconds): 0–2.5 s: Senbi lifts a small bronze razor, inspects the edge, runs a hand over his chin and nods, satisfied. 2.5–5.5 s: he straightens his gold headband with both hands, checking his profile. 5.5–8 s: he adjusts his collar and strikes an overconfident pose, hands on hips, chest out, chin up, and holds it. Camera: locked-off and perfectly still, eye-level full-body medium shot of Senbi; all three actions happen inside the same frame; the framing never changes (no tilt, pan, zoom or rising camera). Audio: voice-over narration only (a voice, never shown on screen; no narrator character appears): a British male voice, warm and dry, begins speaking within half a second and says: “Every groom has one job: look incredible, and pretend it took no effort.” The line takes about 5.2 seconds; leave the last second free of speech so the moment can land. Music: playful comic percussion over the wedding rhythm, low under the voice. Sound effects: light razor scrape, one comic boing, timed to the action. Ambience: light courtyard ambience: clinking cups, footsteps on stone, a soft breeze, no words. Final reminder: no character says any word; only the voice-over narration speaks (voice only, nobody on screen is the narrator). Natural laughs, gasps and sighs are fine. No text, captions or logos in the frame.</w:t>
       </w:r>
     </w:p>
     <w:p>
@@ -913,7 +913,7 @@
           <w:sz w:val="20"/>
           <w:szCs w:val="20"/>
         </w:rPr>
-        <w:t xml:space="preserve">VOICE RULE: only the voice-over narration speaks words; it is a voice only, never a person or character on screen. No character says any word and no one on screen lip-syncs to speech; characters communicate with facial expressions and body gestures. Natural non-verbal sounds are allowed and should sound real: laughing, giggling, gasping, sighing, groaning, cheering, coughing. Attached reference images, in order: the bride, the wedding courtyard. 2D hand-drawn stickman cartoon in the exact style of the reference images: thin black outlines, large expressive heads, thin stick arms, flat warm colors, playful documentary-comedy tone, 16:9. Characters, identical in every frame: the bride: black bob hair with straight bangs, gold headband with a red gem, white dress, blue-and-gold collar, gold sash, gold arm cuffs, light veil. Setting: a shaded sandstone alcove beside the wedding courtyard, painted columns, warm daylight. The bride stands at a bronze mirror. She adjusts her gold headband, touches her dark eye makeup, then gives herself a calm, confident nod. Camera: eye-level medium shot of the bride at the mirror; fixed except for an almost imperceptible 5% slow push-in, no tilt or pan. Audio: voice-over narration only (a voice, never shown on screen; no narrator character appears): a British male voice, warm and dry, begins speaking within half a second and says: “His bride had been ready for an hour. She was the calm one.” Music: light ancient-Mediterranean wedding music (frame drums, reed flute, plucked strings), same theme in every clip, low under the voice. Sound effects: soft jewelry jingle. Final reminder: no character says any word; only the voice-over narration speaks (voice only, nobody on screen is the narrator). Natural laughs, gasps and sighs are fine. No text, captions or logos in the frame.</w:t>
+        <w:t xml:space="preserve">VOICE RULE: only the voice-over narration speaks words; it is a voice only, never a person or character on screen. No character says any word and no one on screen lip-syncs to speech; characters communicate with facial expressions and body gestures. Natural non-verbal sounds are allowed and should sound real: laughing, giggling, gasping, sighing, groaning, cheering, coughing. Attached reference images, in order: the bride, the wedding courtyard. 2D hand-drawn stickman cartoon in the exact style of the reference images: thin black outlines, large expressive heads, thin stick arms, flat warm colors, playful documentary-comedy tone, 16:9. Characters, identical in every frame: the bride: black bob hair with straight bangs, gold headband with a red gem, white dress, blue-and-gold collar, gold sash, gold arm cuffs, light veil. Setting: a shaded sandstone alcove beside the wedding courtyard, painted columns, warm daylight. Lighting: warm bright afternoon sunlight, soft shadows, rich saturated colors. ACTION TIMELINE (8 seconds): 0–2.5 s: the bride adjusts her gold headband with the red gem in front of a bronze mirror. 2.5–5.5 s: she touches the corner of her dark eye makeup with a fingertip, tilting her head. 5.5–8 s: she looks herself in the eye, gives a calm confident nod and a small smile, and holds. Camera: eye-level medium shot of the bride at the mirror; fixed except for an almost imperceptible 5% slow push-in, no tilt or pan. Audio: voice-over narration only (a voice, never shown on screen; no narrator character appears): a British male voice, warm and dry, begins speaking within half a second and says: “His bride had been ready for an hour. She was the calm one.” The line takes about 5.2 seconds; leave the last second free of speech so the moment can land. Music: light ancient-Mediterranean wedding music (frame drums, reed flute, plucked strings), same theme in every clip, low under the voice. Sound effects: soft jewelry jingle, timed to the action. Ambience: light courtyard ambience: clinking cups, footsteps on stone, a soft breeze, no words. Final reminder: no character says any word; only the voice-over narration speaks (voice only, nobody on screen is the narrator). Natural laughs, gasps and sighs are fine. No text, captions or logos in the frame.</w:t>
       </w:r>
     </w:p>
     <w:p>
@@ -986,7 +986,7 @@
           <w:sz w:val="20"/>
           <w:szCs w:val="20"/>
         </w:rPr>
-        <w:t xml:space="preserve">VOICE RULE: only the voice-over narration speaks words; it is a voice only, never a person or character on screen. No character says any word and no one on screen lip-syncs to speech; characters communicate with facial expressions and body gestures. Natural non-verbal sounds are allowed and should sound real: laughing, giggling, gasping, sighing, groaning, cheering, coughing. Attached reference images, in order: the bride, the bride's relatives, the wedding courtyard. 2D hand-drawn stickman cartoon in the exact style of the reference images: thin black outlines, large expressive heads, thin stick arms, flat warm colors, playful documentary-comedy tone, 16:9. Characters, identical in every frame: the bride: black bob hair with straight bangs, gold headband with a red gem, white dress, blue-and-gold collar, gold sash, gold arm cuffs, light veil. the bride's father: bearded middle-aged man in a beige tunic with a purple sash. the scribe: older man in plain white linen holding a reed pen. Setting: a shaded sandstone alcove beside the wedding courtyard, painted columns, warm daylight. A scribe unrolls a papyrus on a low table. The bride points at one line while her father nods gravely. She then gives a small, satisfied smile. The papyrus shows only abstract hieroglyph-like marks. Camera: locked-off and perfectly still, eye-level medium two-shot: the scribe, the papyrus and the bride all in the same frame; the framing never changes (no tilt, pan, zoom or rising camera). Audio: voice-over narration only (a voice, never shown on screen; no narrator character appears): a British male voice, warm and dry, begins speaking within half a second and says: “Then, paperwork. Real contracts survive: property, money, who owes what. Romance, with receipts.” Music: light ancient-Mediterranean wedding music (frame drums, reed flute, plucked strings), same theme in every clip, low under the voice. Sound effects: papyrus rustle, quill scratching. Final reminder: no character says any word; only the voice-over narration speaks (voice only, nobody on screen is the narrator). Natural laughs, gasps and sighs are fine. No text, captions or logos in the frame.</w:t>
+        <w:t xml:space="preserve">VOICE RULE: only the voice-over narration speaks words; it is a voice only, never a person or character on screen. No character says any word and no one on screen lip-syncs to speech; characters communicate with facial expressions and body gestures. Natural non-verbal sounds are allowed and should sound real: laughing, giggling, gasping, sighing, groaning, cheering, coughing. Attached reference images, in order: the bride, the bride's relatives, the wedding courtyard. 2D hand-drawn stickman cartoon in the exact style of the reference images: thin black outlines, large expressive heads, thin stick arms, flat warm colors, playful documentary-comedy tone, 16:9. Characters, identical in every frame: the scribe: older man in plain white linen holding a reed pen. the bride: black bob hair with straight bangs, gold headband with a red gem, white dress, blue-and-gold collar, gold sash, gold arm cuffs, light veil. the bride's father: bearded middle-aged man in a beige tunic with a purple sash. Setting: a shaded sandstone alcove beside the wedding courtyard, painted columns, warm daylight. Lighting: warm bright afternoon sunlight, soft shadows, rich saturated colors. ACTION TIMELINE (8 seconds): 0–2.5 s: a scribe sitting behind a low table unrolls a papyrus with careful hands; the bride stands at the right and her bearded father stands behind her, arms folded. 2.5–5.5 s: the bride leans in and points at one line with a finger while her father nods gravely. 5.5–8 s: the bride straightens up with a small satisfied smile and her father allows himself a tiny proud nod. Camera: locked-off and perfectly still, eye-level medium two-shot: the scribe, the papyrus and the bride all in the same frame; the framing never changes (no tilt, pan, zoom or rising camera). Audio: voice-over narration only (a voice, never shown on screen; no narrator character appears): a British male voice, warm and dry, begins speaking within half a second and says: “Then, paperwork. Real contracts survive: property, money, who owes what. Romance, with receipts.” The line takes about 5.2 seconds; leave the last second free of speech so the moment can land. Music: light ancient-Mediterranean wedding music (frame drums, reed flute, plucked strings), same theme in every clip, low under the voice. Sound effects: papyrus rustle, quill scratching, timed to the action. Ambience: light courtyard ambience: clinking cups, footsteps on stone, a soft breeze, no words. Final reminder: no character says any word; only the voice-over narration speaks (voice only, nobody on screen is the narrator). Natural laughs, gasps and sighs are fine. No text, captions or logos in the frame.</w:t>
       </w:r>
     </w:p>
     <w:p>
@@ -1059,7 +1059,7 @@
           <w:sz w:val="20"/>
           <w:szCs w:val="20"/>
         </w:rPr>
-        <w:t xml:space="preserve">VOICE RULE: only the voice-over narration speaks words; it is a voice only, never a person or character on screen. No character says any word and no one on screen lip-syncs to speech; characters communicate with facial expressions and body gestures. Natural non-verbal sounds are allowed and should sound real: laughing, giggling, gasping, sighing, groaning, cheering, coughing. Attached reference images, in order: the Egyptian wedding guests, the wedding courtyard. 2D hand-drawn stickman cartoon in the exact style of the reference images: thin black outlines, large expressive heads, thin stick arms, flat warm colors, playful documentary-comedy tone, 16:9. Characters, identical in every frame: the guests: Egyptian wedding guests in white linen with blue-and-gold collars and gold headbands, black bob hairstyles, some in white striped headdresses. the older woman: middle-aged woman in white linen with a red-orange sash. Setting: sunny daytime wedding courtyard in ancient Alexandria, sandstone columns with painted blue-and-gold bands, long tables with white cloths and clay jars, orange cloth awnings, and a tall wooden entrance gate at the back-center that opens onto the street. A long feast table in full daylight, loaded with flatbread, roast goose, figs, dates and clay beer jugs, guests eating. At the far end one guest tiptoes up, hides a fig behind his back, and is spotted by an unimpressed aunt. Camera: locked-off and perfectly still, eye-level wide-medium shot of the whole feast table; the sneaky guest stays in frame; the framing never changes (no tilt, pan, zoom or rising camera). Audio: voice-over narration only (a voice, never shown on screen; no narrator character appears): a British male voice, warm and dry, begins speaking within half a second and says: “Bread, figs, roast goose, and beer, basically a food group. Someone was stealing.” Music: light ancient-Mediterranean wedding music (frame drums, reed flute, plucked strings), same theme in every clip, low under the voice. Sound effects: plates, cups, cheerful ambience, no words. Final reminder: no character says any word; only the voice-over narration speaks (voice only, nobody on screen is the narrator). Natural laughs, gasps and sighs are fine. No text, captions or logos in the frame.</w:t>
+        <w:t xml:space="preserve">VOICE RULE: only the voice-over narration speaks words; it is a voice only, never a person or character on screen. No character says any word and no one on screen lip-syncs to speech; characters communicate with facial expressions and body gestures. Natural non-verbal sounds are allowed and should sound real: laughing, giggling, gasping, sighing, groaning, cheering, coughing. Attached reference images, in order: the Egyptian wedding guests, the wedding courtyard. 2D hand-drawn stickman cartoon in the exact style of the reference images: thin black outlines, large expressive heads, thin stick arms, flat warm colors, playful documentary-comedy tone, 16:9. Characters, identical in every frame: the guests: Egyptian wedding guests in white linen with blue-and-gold collars and gold headbands, black bob hairstyles, some in white striped headdresses. the older woman: middle-aged woman in white linen with a red-orange sash. Setting: sunny daytime wedding courtyard in ancient Alexandria, sandstone columns with painted blue-and-gold bands, long tables with white cloths and clay jars, orange cloth awnings, and a tall wooden entrance gate at the back-center that opens onto the street. Lighting: warm bright afternoon sunlight, soft shadows, rich saturated colors. ACTION TIMELINE (8 seconds): 0–2.5 s: guests seated on both sides of the long table eat happily and pass bowls of figs, dates and flatbread. 2.5–5.5 s: at the far end one guest tiptoes up, grabs a fig and hides it behind his back with an innocent face. 5.5–8 s: an unimpressed older woman beside him turns, crosses her arms and gives him a flat stare; he freezes with wide eyes. Camera: locked-off and perfectly still, eye-level wide-medium shot of the whole feast table; the sneaky guest stays in frame; the framing never changes (no tilt, pan, zoom or rising camera). Audio: voice-over narration only (a voice, never shown on screen; no narrator character appears): a British male voice, warm and dry, begins speaking within half a second and says: “Bread, figs, roast goose, and beer, basically a food group. Someone was stealing.” The line takes about 5.2 seconds; leave the last second free of speech so the moment can land. Music: light ancient-Mediterranean wedding music (frame drums, reed flute, plucked strings), same theme in every clip, low under the voice. Sound effects: plates, cups, cheerful ambience, no words, timed to the action. Ambience: light courtyard ambience: clinking cups, footsteps on stone, a soft breeze, no words. Final reminder: no character says any word; only the voice-over narration speaks (voice only, nobody on screen is the narrator). Natural laughs, gasps and sighs are fine. No text, captions or logos in the frame.</w:t>
       </w:r>
     </w:p>
     <w:p>
@@ -1132,7 +1132,7 @@
           <w:sz w:val="20"/>
           <w:szCs w:val="20"/>
         </w:rPr>
-        <w:t xml:space="preserve">VOICE RULE: only the voice-over narration speaks words; it is a voice only, never a person or character on screen. No character says any word and no one on screen lip-syncs to speech; characters communicate with facial expressions and body gestures. Natural non-verbal sounds are allowed and should sound real: laughing, giggling, gasping, sighing, groaning, cheering, coughing. Attached reference images, in order: the black cat, the wedding courtyard. 2D hand-drawn stickman cartoon in the exact style of the reference images: thin black outlines, large expressive heads, thin stick arms, flat warm colors, playful documentary-comedy tone, 16:9. Characters, identical in every frame: the cat: black with a small gold collar. the guests: Egyptian wedding guests in white linen with blue-and-gold collars and gold headbands, black bob hairstyles, some in white striped headdresses. Setting: sunny daytime wedding courtyard in ancient Alexandria, sandstone columns with painted blue-and-gold bands, long tables with white cloths and clay jars, orange cloth awnings, and a tall wooden entrance gate at the back-center that opens onto the street. A black cat with a small gold collar sits upright on a cushion at the head of the feast table. A guest bows deeply in front of it. The cat looks away and licks its paw. Camera: locked-off and perfectly still, eye-level medium shot with the cat and the bowing guest both in frame; the framing never changes (no tilt, pan, zoom or rising camera). Audio: voice-over narration only (a voice, never shown on screen; no narrator character appears): a British male voice, warm and dry, begins speaking within half a second and says: “Egyptians adored cats. This one knew it. A guest bowed. The cat shrugged.” Music: playful comic percussion over the wedding rhythm, low under the voice. Sound effects: tiny comic sting, soft cat purr. Final reminder: no character says any word; only the voice-over narration speaks (voice only, nobody on screen is the narrator). Natural laughs, gasps and sighs are fine. No text, captions or logos in the frame.</w:t>
+        <w:t xml:space="preserve">VOICE RULE: only the voice-over narration speaks words; it is a voice only, never a person or character on screen. No character says any word and no one on screen lip-syncs to speech; characters communicate with facial expressions and body gestures. Natural non-verbal sounds are allowed and should sound real: laughing, giggling, gasping, sighing, groaning, cheering, coughing. Attached reference images, in order: the black cat, the wedding courtyard. 2D hand-drawn stickman cartoon in the exact style of the reference images: thin black outlines, large expressive heads, thin stick arms, flat warm colors, playful documentary-comedy tone, 16:9. Characters, identical in every frame: the cat: black with a small gold collar. the guests: Egyptian wedding guests in white linen with blue-and-gold collars and gold headbands, black bob hairstyles, some in white striped headdresses. Setting: sunny daytime wedding courtyard in ancient Alexandria, sandstone columns with painted blue-and-gold bands, long tables with white cloths and clay jars, orange cloth awnings, and a tall wooden entrance gate at the back-center that opens onto the street. Lighting: warm bright afternoon sunlight, soft shadows, rich saturated colors. ACTION TIMELINE (8 seconds): 0–2.5 s: the black cat sits upright on a red cushion at the head of the feast table, tail curled, gold collar glinting. 2.5–5.5 s: a guest approaches and bows deeply, almost to the floor, with great ceremony. 5.5–8 s: the cat looks away, lifts a paw and licks it; the guest stays bowed, then peeks up hopefully. Camera: locked-off and perfectly still, eye-level medium shot with the cat and the bowing guest both in frame; the framing never changes (no tilt, pan, zoom or rising camera). Audio: voice-over narration only (a voice, never shown on screen; no narrator character appears): a British male voice, warm and dry, begins speaking within half a second and says: “Egyptians adored cats. This one knew it. A guest bowed. The cat shrugged.” The line takes about 5.2 seconds; leave the last second free of speech so the moment can land. Music: playful comic percussion over the wedding rhythm, low under the voice. Sound effects: tiny comic sting, soft cat purr, timed to the action. Ambience: light courtyard ambience: clinking cups, footsteps on stone, a soft breeze, no words. Final reminder: no character says any word; only the voice-over narration speaks (voice only, nobody on screen is the narrator). Natural laughs, gasps and sighs are fine. No text, captions or logos in the frame.</w:t>
       </w:r>
     </w:p>
     <w:p>
@@ -1205,7 +1205,7 @@
           <w:sz w:val="20"/>
           <w:szCs w:val="20"/>
         </w:rPr>
-        <w:t xml:space="preserve">VOICE RULE: only the voice-over narration speaks words; it is a voice only, never a person or character on screen. No character says any word and no one on screen lip-syncs to speech; characters communicate with facial expressions and body gestures. Natural non-verbal sounds are allowed and should sound real: laughing, giggling, gasping, sighing, groaning, cheering, coughing. Attached reference images, in order: the Egyptian wedding guests, the wedding courtyard. 2D hand-drawn stickman cartoon in the exact style of the reference images: thin black outlines, large expressive heads, thin stick arms, flat warm colors, playful documentary-comedy tone, 16:9. Characters, identical in every frame: Senbi the groom: young man, straight black bowl-cut hair with bangs, gold headband with a gold cobra, bare chest, blue-and-gold broad collar, gold bracers, white kilt with a blue-and-gold sash, brown sandals, thin black stick arms. the guests: Egyptian wedding guests in white linen with blue-and-gold collars and gold headbands, black bob hairstyles, some in white striped headdresses. Setting: sunny daytime wedding courtyard in ancient Alexandria, sandstone columns with painted blue-and-gold bands, long tables with white cloths and clay jars, orange cloth awnings, and a tall wooden entrance gate at the back-center that opens onto the street. Musicians seated at the side tables play harp, frame drum and reed flute while guests dance in the center. Senbi steps into the dance area with a confident grin. Camera: locked-off and perfectly still, eye-level wide shot of the musicians and dancers; the framing never changes (no tilt, pan, zoom or rising camera). Audio: voice-over narration only (a voice, never shown on screen; no narrator character appears): a British male voice, warm and dry, begins speaking within half a second and says: “Then the music began, and Senbi decided this was his moment.” Music: light ancient-Mediterranean wedding music (frame drums, reed flute, plucked strings), same theme in every clip, low under the voice. Sound effects: harp and drums swelling, clapping. Final reminder: no character says any word; only the voice-over narration speaks (voice only, nobody on screen is the narrator). Natural laughs, gasps and sighs are fine. No text, captions or logos in the frame.</w:t>
+        <w:t xml:space="preserve">VOICE RULE: only the voice-over narration speaks words; it is a voice only, never a person or character on screen. No character says any word and no one on screen lip-syncs to speech; characters communicate with facial expressions and body gestures. Natural non-verbal sounds are allowed and should sound real: laughing, giggling, gasping, sighing, groaning, cheering, coughing. Attached reference images, in order: the Egyptian wedding guests, the wedding courtyard. 2D hand-drawn stickman cartoon in the exact style of the reference images: thin black outlines, large expressive heads, thin stick arms, flat warm colors, playful documentary-comedy tone, 16:9. Characters, identical in every frame: the musicians: guests in white linen playing harp, frame drum and reed flute. the guests: Egyptian wedding guests in white linen with blue-and-gold collars and gold headbands, black bob hairstyles, some in white striped headdresses. Senbi the groom: young man, straight black bowl-cut hair with bangs, gold headband with a gold cobra, bare chest, blue-and-gold broad collar, gold bracers, white kilt with a blue-and-gold sash, brown sandals, thin black stick arms. Setting: sunny daytime wedding courtyard in ancient Alexandria, sandstone columns with painted blue-and-gold bands, long tables with white cloths and clay jars, orange cloth awnings, and a tall wooden entrance gate at the back-center that opens onto the street. Lighting: warm bright afternoon sunlight, soft shadows, rich saturated colors. ACTION TIMELINE (8 seconds): 0–2.5 s: musicians seated at the side tables play harp, frame drum and reed flute, nodding with the rhythm while guests spin and clap in the center. 2.5–5.5 s: Senbi walks onto the dance floor from the left with a confident grin, rolling his shoulders. 5.5–8 s: he opens his arms wide as if presenting himself and nearby guests react with delighted cheers and claps. Camera: locked-off and perfectly still, eye-level wide shot of the musicians and dancers; the framing never changes (no tilt, pan, zoom or rising camera). Audio: voice-over narration only (a voice, never shown on screen; no narrator character appears): a British male voice, warm and dry, begins speaking within half a second and says: “Then the music began, and Senbi decided this was his moment.” The line takes about 4.4 seconds; leave the last second free of speech so the moment can land. Music: light ancient-Mediterranean wedding music (frame drums, reed flute, plucked strings), same theme in every clip, low under the voice. Sound effects: harp and drums swelling, clapping, timed to the action. Ambience: light courtyard ambience: clinking cups, footsteps on stone, a soft breeze, no words. Final reminder: no character says any word; only the voice-over narration speaks (voice only, nobody on screen is the narrator). Natural laughs, gasps and sighs are fine. No text, captions or logos in the frame.</w:t>
       </w:r>
     </w:p>
     <w:p>
@@ -1278,7 +1278,7 @@
           <w:sz w:val="20"/>
           <w:szCs w:val="20"/>
         </w:rPr>
-        <w:t xml:space="preserve">VOICE RULE: only the voice-over narration speaks words; it is a voice only, never a person or character on screen. No character says any word and no one on screen lip-syncs to speech; characters communicate with facial expressions and body gestures. Natural non-verbal sounds are allowed and should sound real: laughing, giggling, gasping, sighing, groaning, cheering, coughing. Attached reference images, in order: Senbi, the groom, the wedding courtyard. 2D hand-drawn stickman cartoon in the exact style of the reference images: thin black outlines, large expressive heads, thin stick arms, flat warm colors, playful documentary-comedy tone, 16:9. Characters, identical in every frame: Senbi the groom: young man, straight black bowl-cut hair with bangs, gold headband with a gold cobra, bare chest, blue-and-gold broad collar, gold bracers, white kilt with a blue-and-gold sash, brown sandals, thin black stick arms. Setting: sunny daytime wedding courtyard in ancient Alexandria, sandstone columns with painted blue-and-gold bands, long tables with white cloths and clay jars, orange cloth awnings, and a tall wooden entrance gate at the back-center that opens onto the street. Senbi dances with huge confidence, loses his balance for a moment, recovers, and freezes in a proud pose as if the stumble was choreography. Camera: locked-off and perfectly still, eye-level medium shot of Senbi, full body in frame; the framing never changes (no tilt, pan, zoom or rising camera). Audio: voice-over narration only (a voice, never shown on screen; no narrator character appears): a British male voice, warm and dry, begins speaking within half a second and says: “Senbi nearly fell, recovered, and pretended that was the choreography. Nobody believed him.” Music: playful comic percussion over the wedding rhythm, low under the voice. Sound effects: foot scuff, comic wobble, laughter. Final reminder: no character says any word; only the voice-over narration speaks (voice only, nobody on screen is the narrator). Natural laughs, gasps and sighs are fine. No text, captions or logos in the frame.</w:t>
+        <w:t xml:space="preserve">VOICE RULE: only the voice-over narration speaks words; it is a voice only, never a person or character on screen. No character says any word and no one on screen lip-syncs to speech; characters communicate with facial expressions and body gestures. Natural non-verbal sounds are allowed and should sound real: laughing, giggling, gasping, sighing, groaning, cheering, coughing. Attached reference images, in order: Senbi, the groom, the wedding courtyard. 2D hand-drawn stickman cartoon in the exact style of the reference images: thin black outlines, large expressive heads, thin stick arms, flat warm colors, playful documentary-comedy tone, 16:9. Characters, identical in every frame: Senbi the groom: young man, straight black bowl-cut hair with bangs, gold headband with a gold cobra, bare chest, blue-and-gold broad collar, gold bracers, white kilt with a blue-and-gold sash, brown sandals, thin black stick arms. Setting: sunny daytime wedding courtyard in ancient Alexandria, sandstone columns with painted blue-and-gold bands, long tables with white cloths and clay jars, orange cloth awnings, and a tall wooden entrance gate at the back-center that opens onto the street. Lighting: warm bright afternoon sunlight, soft shadows, rich saturated colors. ACTION TIMELINE (8 seconds): 0–2.5 s: Senbi dances with huge confidence, big arm swings, chin up. 2.5–5.5 s: he loses his balance, arms windmilling, one foot wobbling. 5.5–8 s: he snaps upright and freezes in a proud pose with one arm raised as if the stumble was choreography; his eyes slide sideways to check whether anyone saw. Camera: locked-off and perfectly still, eye-level medium shot of Senbi, full body in frame; the framing never changes (no tilt, pan, zoom or rising camera). Audio: voice-over narration only (a voice, never shown on screen; no narrator character appears): a British male voice, warm and dry, begins speaking within half a second and says: “Senbi nearly fell, recovered, and pretended that was the choreography. Nobody believed him.” The line takes about 5.2 seconds; leave the last second free of speech so the moment can land. Music: playful comic percussion over the wedding rhythm, low under the voice. Sound effects: foot scuff, comic wobble, laughter, timed to the action. Ambience: light courtyard ambience: clinking cups, footsteps on stone, a soft breeze, no words. Final reminder: no character says any word; only the voice-over narration speaks (voice only, nobody on screen is the narrator). Natural laughs, gasps and sighs are fine. No text, captions or logos in the frame.</w:t>
       </w:r>
     </w:p>
     <w:p>
@@ -1351,7 +1351,7 @@
           <w:sz w:val="20"/>
           <w:szCs w:val="20"/>
         </w:rPr>
-        <w:t xml:space="preserve">VOICE RULE: only the voice-over narration speaks words; it is a voice only, never a person or character on screen. No character says any word and no one on screen lip-syncs to speech; characters communicate with facial expressions and body gestures. Natural non-verbal sounds are allowed and should sound real: laughing, giggling, gasping, sighing, groaning, cheering, coughing. Attached reference images, in order: the bride, the wedding courtyard. 2D hand-drawn stickman cartoon in the exact style of the reference images: thin black outlines, large expressive heads, thin stick arms, flat warm colors, playful documentary-comedy tone, 16:9. Characters, identical in every frame: the bride: black bob hair with straight bangs, gold headband with a red gem, white dress, blue-and-gold collar, gold sash, gold arm cuffs, light veil. Setting: sunny daytime wedding courtyard in ancient Alexandria, sandstone columns with painted blue-and-gold bands, long tables with white cloths and clay jars, orange cloth awnings, and a tall wooden entrance gate at the back-center that opens onto the street. The bride watches Senbi dance, amused. She tries to stay composed, then hides her smile behind her hand. Camera: locked-off and perfectly still, eye-level close-up of the bride's face; the framing never changes (no tilt, pan, zoom or rising camera). Audio: voice-over narration only (a voice, never shown on screen; no narrator character appears): a British male voice, warm and dry, begins speaking within half a second and says: “His bride was trying very hard not to laugh. She loved him. Mostly.” Music: light ancient-Mediterranean wedding music (frame drums, reed flute, plucked strings), same theme in every clip, low under the voice. Sound effects: suppressed giggle. Final reminder: no character says any word; only the voice-over narration speaks (voice only, nobody on screen is the narrator). Natural laughs, gasps and sighs are fine. No text, captions or logos in the frame.</w:t>
+        <w:t xml:space="preserve">VOICE RULE: only the voice-over narration speaks words; it is a voice only, never a person or character on screen. No character says any word and no one on screen lip-syncs to speech; characters communicate with facial expressions and body gestures. Natural non-verbal sounds are allowed and should sound real: laughing, giggling, gasping, sighing, groaning, cheering, coughing. Attached reference images, in order: the bride, the wedding courtyard. 2D hand-drawn stickman cartoon in the exact style of the reference images: thin black outlines, large expressive heads, thin stick arms, flat warm colors, playful documentary-comedy tone, 16:9. Characters, identical in every frame: the bride: black bob hair with straight bangs, gold headband with a red gem, white dress, blue-and-gold collar, gold sash, gold arm cuffs, light veil. Setting: sunny daytime wedding courtyard in ancient Alexandria, sandstone columns with painted blue-and-gold bands, long tables with white cloths and clay jars, orange cloth awnings, and a tall wooden entrance gate at the back-center that opens onto the street. Lighting: warm bright afternoon sunlight, soft shadows, rich saturated colors. ACTION TIMELINE (8 seconds): 0–2.5 s: the bride watches, amused, with sparkling eyes. 2.5–5.5 s: she presses her lips together to look composed while her shoulders start to shake. 5.5–8 s: she raises a hand and hides her smile behind it, eyes crinkled, and a small suppressed giggle escapes. Camera: locked-off and perfectly still, eye-level close-up of the bride's face; the framing never changes (no tilt, pan, zoom or rising camera). Audio: voice-over narration only (a voice, never shown on screen; no narrator character appears): a British male voice, warm and dry, begins speaking within half a second and says: “His bride was trying very hard not to laugh. She loved him. Mostly.” The line takes about 5.2 seconds; leave the last second free of speech so the moment can land. Music: light ancient-Mediterranean wedding music (frame drums, reed flute, plucked strings), same theme in every clip, low under the voice. Sound effects: suppressed giggle, timed to the action. Ambience: light courtyard ambience: clinking cups, footsteps on stone, a soft breeze, no words. Final reminder: no character says any word; only the voice-over narration speaks (voice only, nobody on screen is the narrator). Natural laughs, gasps and sighs are fine. No text, captions or logos in the frame.</w:t>
       </w:r>
     </w:p>
     <w:p>
@@ -1424,7 +1424,7 @@
           <w:sz w:val="20"/>
           <w:szCs w:val="20"/>
         </w:rPr>
-        <w:t xml:space="preserve">VOICE RULE: only the voice-over narration speaks words; it is a voice only, never a person or character on screen. No character says any word and no one on screen lip-syncs to speech; characters communicate with facial expressions and body gestures. Natural non-verbal sounds are allowed and should sound real: laughing, giggling, gasping, sighing, groaning, cheering, coughing. Attached reference images, in order: the Egyptian wedding guests, the wedding courtyard. 2D hand-drawn stickman cartoon in the exact style of the reference images: thin black outlines, large expressive heads, thin stick arms, flat warm colors, playful documentary-comedy tone, 16:9. Characters, identical in every frame: the guests: Egyptian wedding guests in white linen with blue-and-gold collars and gold headbands, black bob hairstyles, some in white striped headdresses. Setting: sunny daytime wedding courtyard in ancient Alexandria, sandstone columns with painted blue-and-gold bands, long tables with white cloths and clay jars, orange cloth awnings, and a tall wooden entrance gate at the back-center that opens onto the street. Young and old guests clap, dance and raise clay cups in a joyful crowd. Camera: locked-off and perfectly still, eye-level wide-medium shot with several guests in frame; the framing never changes (no tilt, pan, zoom or rising camera). Audio: voice-over narration only (a voice, never shown on screen; no narrator character appears): a British male voice, warm and dry, begins speaking within half a second and says: “Everyone danced and raised a cup, the one thing every wedding agrees on.” Music: light ancient-Mediterranean wedding music (frame drums, reed flute, plucked strings), same theme in every clip, low under the voice. Sound effects: clapping, cups clinking, laughter. Final reminder: no character says any word; only the voice-over narration speaks (voice only, nobody on screen is the narrator). Natural laughs, gasps and sighs are fine. No text, captions or logos in the frame.</w:t>
+        <w:t xml:space="preserve">VOICE RULE: only the voice-over narration speaks words; it is a voice only, never a person or character on screen. No character says any word and no one on screen lip-syncs to speech; characters communicate with facial expressions and body gestures. Natural non-verbal sounds are allowed and should sound real: laughing, giggling, gasping, sighing, groaning, cheering, coughing. Attached reference images, in order: the Egyptian wedding guests, the wedding courtyard. 2D hand-drawn stickman cartoon in the exact style of the reference images: thin black outlines, large expressive heads, thin stick arms, flat warm colors, playful documentary-comedy tone, 16:9. Characters, identical in every frame: the guests: Egyptian wedding guests in white linen with blue-and-gold collars and gold headbands, black bob hairstyles, some in white striped headdresses. Setting: sunny daytime wedding courtyard in ancient Alexandria, sandstone columns with painted blue-and-gold bands, long tables with white cloths and clay jars, orange cloth awnings, and a tall wooden entrance gate at the back-center that opens onto the street. Lighting: warm bright afternoon sunlight, soft shadows, rich saturated colors. ACTION TIMELINE (8 seconds): 0–2.5 s: young and old guests clap and dance in a joyful crowd. 2.5–5.5 s: several guests raise clay cups together. 5.5–8 s: they cheer and clink cups; an old man stomps along with the rhythm. Camera: locked-off and perfectly still, eye-level wide-medium shot with several guests in frame; the framing never changes (no tilt, pan, zoom or rising camera). Audio: voice-over narration only (a voice, never shown on screen; no narrator character appears): a British male voice, warm and dry, begins speaking within half a second and says: “Everyone danced and raised a cup, the one thing every wedding agrees on.” The line takes about 5.2 seconds; leave the last second free of speech so the moment can land. Music: light ancient-Mediterranean wedding music (frame drums, reed flute, plucked strings), same theme in every clip, low under the voice. Sound effects: clapping, cups clinking, laughter, timed to the action. Ambience: light courtyard ambience: clinking cups, footsteps on stone, a soft breeze, no words. Final reminder: no character says any word; only the voice-over narration speaks (voice only, nobody on screen is the narrator). Natural laughs, gasps and sighs are fine. No text, captions or logos in the frame.</w:t>
       </w:r>
     </w:p>
     <w:p>
@@ -1497,7 +1497,7 @@
           <w:sz w:val="20"/>
           <w:szCs w:val="20"/>
         </w:rPr>
-        <w:t xml:space="preserve">VOICE RULE: only the voice-over narration speaks words; it is a voice only, never a person or character on screen. No character says any word and no one on screen lip-syncs to speech; characters communicate with facial expressions and body gestures. Natural non-verbal sounds are allowed and should sound real: laughing, giggling, gasping, sighing, groaning, cheering, coughing. Attached reference images, in order: the Egyptian wedding guests, the wedding courtyard. 2D hand-drawn stickman cartoon in the exact style of the reference images: thin black outlines, large expressive heads, thin stick arms, flat warm colors, playful documentary-comedy tone, 16:9. Characters, identical in every frame: the older woman: middle-aged woman in white linen with a red-orange sash. Setting: sunny daytime wedding courtyard in ancient Alexandria, sandstone columns with painted blue-and-gold bands, long tables with white cloths and clay jars, orange cloth awnings, and a tall wooden entrance gate at the back-center that opens onto the street. An older woman at the feast table inspects a dish with exaggerated seriousness, tastes it, narrows her eyes, then gives a reluctant nod. Camera: locked-off and perfectly still, eye-level close-up of the woman's face and the dish; the framing never changes (no tilt, pan, zoom or rising camera). Audio: voice-over narration only (a voice, never shown on screen; no narrator character appears): a British male voice, warm and dry, begins speaking within half a second and says: “One aunt inspected the food like a tax auditor. Verdict: suspicious, but edible.” Music: playful comic percussion over the wedding rhythm, low under the voice. Sound effects: spoon tapping a bowl, suspicious hum. Final reminder: no character says any word; only the voice-over narration speaks (voice only, nobody on screen is the narrator). Natural laughs, gasps and sighs are fine. No text, captions or logos in the frame.</w:t>
+        <w:t xml:space="preserve">VOICE RULE: only the voice-over narration speaks words; it is a voice only, never a person or character on screen. No character says any word and no one on screen lip-syncs to speech; characters communicate with facial expressions and body gestures. Natural non-verbal sounds are allowed and should sound real: laughing, giggling, gasping, sighing, groaning, cheering, coughing. Attached reference images, in order: the Egyptian wedding guests, the wedding courtyard. 2D hand-drawn stickman cartoon in the exact style of the reference images: thin black outlines, large expressive heads, thin stick arms, flat warm colors, playful documentary-comedy tone, 16:9. Characters, identical in every frame: the older woman: middle-aged woman in white linen with a red-orange sash. Setting: sunny daytime wedding courtyard in ancient Alexandria, sandstone columns with painted blue-and-gold bands, long tables with white cloths and clay jars, orange cloth awnings, and a tall wooden entrance gate at the back-center that opens onto the street. Lighting: warm bright afternoon sunlight, soft shadows, rich saturated colors. ACTION TIMELINE (8 seconds): 0–2.5 s: an older woman at the feast table lifts a spoonful from a dish and inspects it with exaggerated seriousness, squinting. 2.5–5.5 s: she tastes it and chews slowly, eyes narrowed. 5.5–8 s: after a long pause she gives a reluctant nod, lips pursed, as if grudgingly approving. Camera: locked-off and perfectly still, eye-level close-up of the woman's face and the dish; the framing never changes (no tilt, pan, zoom or rising camera). Audio: voice-over narration only (a voice, never shown on screen; no narrator character appears): a British male voice, warm and dry, begins speaking within half a second and says: “One aunt inspected the food like a tax auditor. Verdict: suspicious, but edible.” The line takes about 5.2 seconds; leave the last second free of speech so the moment can land. Music: playful comic percussion over the wedding rhythm, low under the voice. Sound effects: spoon tapping a bowl, suspicious hum, timed to the action. Ambience: light courtyard ambience: clinking cups, footsteps on stone, a soft breeze, no words. Final reminder: no character says any word; only the voice-over narration speaks (voice only, nobody on screen is the narrator). Natural laughs, gasps and sighs are fine. No text, captions or logos in the frame.</w:t>
       </w:r>
     </w:p>
     <w:p>
@@ -1570,7 +1570,7 @@
           <w:sz w:val="20"/>
           <w:szCs w:val="20"/>
         </w:rPr>
-        <w:t xml:space="preserve">VOICE RULE: only the voice-over narration speaks words; it is a voice only, never a person or character on screen. No character says any word and no one on screen lip-syncs to speech; characters communicate with facial expressions and body gestures. Natural non-verbal sounds are allowed and should sound real: laughing, giggling, gasping, sighing, groaning, cheering, coughing. Attached reference images, in order: Senbi, the groom, the bride's relatives, the wedding courtyard. 2D hand-drawn stickman cartoon in the exact style of the reference images: thin black outlines, large expressive heads, thin stick arms, flat warm colors, playful documentary-comedy tone, 16:9. Characters, identical in every frame: Senbi the groom: young man, straight black bowl-cut hair with bangs, gold headband with a gold cobra, bare chest, blue-and-gold broad collar, gold bracers, white kilt with a blue-and-gold sash, brown sandals, thin black stick arms. the bride's father: bearded middle-aged man in a beige tunic with a purple sash. Setting: sunny daytime wedding courtyard in ancient Alexandria, sandstone columns with painted blue-and-gold bands, long tables with white cloths and clay jars, orange cloth awnings, and a tall wooden entrance gate at the back-center that opens onto the street. The bride's father proudly presents Senbi with a wooden headrest. Senbi accepts it with a polite smile, glances at it, and his smile tightens with concern. Camera: locked-off and perfectly still, eye-level medium two-shot of Senbi and the father; the framing never changes (no tilt, pan, zoom or rising camera). Audio: voice-over narration only (a voice, never shown on screen; no narrator character appears): a British male voice, warm and dry, begins speaking within half a second and says: “Then, the gift: a wooden headrest. Egyptians really did sleep on these.” Music: light ancient-Mediterranean wedding music (frame drums, reed flute, plucked strings), same theme in every clip, low under the voice. Sound effects: one wooden knock. Final reminder: no character says any word; only the voice-over narration speaks (voice only, nobody on screen is the narrator). Natural laughs, gasps and sighs are fine. No text, captions or logos in the frame.</w:t>
+        <w:t xml:space="preserve">VOICE RULE: only the voice-over narration speaks words; it is a voice only, never a person or character on screen. No character says any word and no one on screen lip-syncs to speech; characters communicate with facial expressions and body gestures. Natural non-verbal sounds are allowed and should sound real: laughing, giggling, gasping, sighing, groaning, cheering, coughing. Attached reference images, in order: Senbi, the groom, the bride's relatives, the wedding courtyard. 2D hand-drawn stickman cartoon in the exact style of the reference images: thin black outlines, large expressive heads, thin stick arms, flat warm colors, playful documentary-comedy tone, 16:9. Characters, identical in every frame: the bride's father: bearded middle-aged man in a beige tunic with a purple sash. Senbi the groom: young man, straight black bowl-cut hair with bangs, gold headband with a gold cobra, bare chest, blue-and-gold broad collar, gold bracers, white kilt with a blue-and-gold sash, brown sandals, thin black stick arms. Setting: sunny daytime wedding courtyard in ancient Alexandria, sandstone columns with painted blue-and-gold bands, long tables with white cloths and clay jars, orange cloth awnings, and a tall wooden entrance gate at the back-center that opens onto the street. Lighting: warm bright afternoon sunlight, soft shadows, rich saturated colors. ACTION TIMELINE (8 seconds): 0–2.5 s: the bride's bearded father steps in, holding a carved wooden headrest proudly in both hands, beaming. 2.5–5.5 s: Senbi accepts it with a polite smile and a nod of thanks. 5.5–8 s: he glances down at the object, his smile tightens and his eyebrows lift in concern while the father keeps beaming. Camera: locked-off and perfectly still, eye-level medium two-shot of Senbi and the father; the framing never changes (no tilt, pan, zoom or rising camera). Audio: voice-over narration only (a voice, never shown on screen; no narrator character appears): a British male voice, warm and dry, begins speaking within half a second and says: “Then, the gift: a wooden headrest. Egyptians really did sleep on these.” The line takes about 4.8 seconds; leave the last second free of speech so the moment can land. Music: light ancient-Mediterranean wedding music (frame drums, reed flute, plucked strings), same theme in every clip, low under the voice. Sound effects: one wooden knock, timed to the action. Ambience: light courtyard ambience: clinking cups, footsteps on stone, a soft breeze, no words. Final reminder: no character says any word; only the voice-over narration speaks (voice only, nobody on screen is the narrator). Natural laughs, gasps and sighs are fine. No text, captions or logos in the frame.</w:t>
       </w:r>
     </w:p>
     <w:p>
@@ -1643,7 +1643,7 @@
           <w:sz w:val="20"/>
           <w:szCs w:val="20"/>
         </w:rPr>
-        <w:t xml:space="preserve">VOICE RULE: only the voice-over narration speaks words; it is a voice only, never a person or character on screen. No character says any word and no one on screen lip-syncs to speech; characters communicate with facial expressions and body gestures. Natural non-verbal sounds are allowed and should sound real: laughing, giggling, gasping, sighing, groaning, cheering, coughing. Attached reference images, in order: Senbi, the groom. 2D hand-drawn stickman cartoon in the exact style of the reference images: thin black outlines, large expressive heads, thin stick arms, flat warm colors, playful documentary-comedy tone, 16:9. Characters, identical in every frame: Senbi the groom: young man, straight black bowl-cut hair with bangs, gold headband with a gold cobra, bare chest, blue-and-gold broad collar, gold bracers, white kilt with a blue-and-gold sash, brown sandals, thin black stick arms. Setting: sunny daytime wedding courtyard in ancient Alexandria, sandstone columns with painted blue-and-gold bands, long tables with white cloths and clay jars, orange cloth awnings, and a tall wooden entrance gate at the back-center that opens onto the street. Senbi sits on a reed mat and tries resting his neck on the wooden headrest. He freezes in discomfort, then gives a stiff thumbs-up. Camera: locked-off and perfectly still, eye-level medium shot of Senbi with the headrest; the framing never changes (no tilt, pan, zoom or rising camera). Audio: voice-over narration only (a voice, never shown on screen; no narrator character appears): a British male voice, warm and dry, begins speaking within half a second and says: “Senbi lay down. His neck filed a formal complaint. His thumbs-up said otherwise.” Music: playful comic percussion over the wedding rhythm, low under the voice. Sound effects: comic wooden creak. Final reminder: no character says any word; only the voice-over narration speaks (voice only, nobody on screen is the narrator). Natural laughs, gasps and sighs are fine. No text, captions or logos in the frame.</w:t>
+        <w:t xml:space="preserve">VOICE RULE: only the voice-over narration speaks words; it is a voice only, never a person or character on screen. No character says any word and no one on screen lip-syncs to speech; characters communicate with facial expressions and body gestures. Natural non-verbal sounds are allowed and should sound real: laughing, giggling, gasping, sighing, groaning, cheering, coughing. Attached reference images, in order: Senbi, the groom. 2D hand-drawn stickman cartoon in the exact style of the reference images: thin black outlines, large expressive heads, thin stick arms, flat warm colors, playful documentary-comedy tone, 16:9. Characters, identical in every frame: Senbi the groom: young man, straight black bowl-cut hair with bangs, gold headband with a gold cobra, bare chest, blue-and-gold broad collar, gold bracers, white kilt with a blue-and-gold sash, brown sandals, thin black stick arms. Setting: sunny daytime wedding courtyard in ancient Alexandria, sandstone columns with painted blue-and-gold bands, long tables with white cloths and clay jars, orange cloth awnings, and a tall wooden entrance gate at the back-center that opens onto the street. Lighting: warm bright afternoon sunlight, soft shadows, rich saturated colors. ACTION TIMELINE (8 seconds): 0–2.5 s: Senbi sits on a reed mat and places the wooden headrest under his neck. 2.5–5.5 s: he lowers his head onto it and freezes, eyes wide, mouth a tight line, a bead of sweat on his temple. 5.5–8 s: he gives a stiff thumbs-up to someone off-screen, his forced smile trembling. Camera: locked-off and perfectly still, eye-level medium shot of Senbi with the headrest; the framing never changes (no tilt, pan, zoom or rising camera). Audio: voice-over narration only (a voice, never shown on screen; no narrator character appears): a British male voice, warm and dry, begins speaking within half a second and says: “Senbi lay down. His neck filed a formal complaint. His thumbs-up said otherwise.” The line takes about 5.2 seconds; leave the last second free of speech so the moment can land. Music: playful comic percussion over the wedding rhythm, low under the voice. Sound effects: comic wooden creak, timed to the action. Ambience: light courtyard ambience: clinking cups, footsteps on stone, a soft breeze, no words. Final reminder: no character says any word; only the voice-over narration speaks (voice only, nobody on screen is the narrator). Natural laughs, gasps and sighs are fine. No text, captions or logos in the frame.</w:t>
       </w:r>
     </w:p>
     <w:p>
@@ -1716,7 +1716,7 @@
           <w:sz w:val="20"/>
           <w:szCs w:val="20"/>
         </w:rPr>
-        <w:t xml:space="preserve">VOICE RULE: only the voice-over narration speaks words; it is a voice only, never a person or character on screen. No character says any word and no one on screen lip-syncs to speech; characters communicate with facial expressions and body gestures. Natural non-verbal sounds are allowed and should sound real: laughing, giggling, gasping, sighing, groaning, cheering, coughing. Attached reference images, in order: the Egyptian wedding guests, the bride, Senbi, the groom. 2D hand-drawn stickman cartoon in the exact style of the reference images: thin black outlines, large expressive heads, thin stick arms, flat warm colors, playful documentary-comedy tone, 16:9. Characters, identical in every frame: Senbi the groom: young man, straight black bowl-cut hair with bangs, gold headband with a gold cobra, bare chest, blue-and-gold broad collar, gold bracers, white kilt with a blue-and-gold sash, brown sandals, thin black stick arms. the bride: black bob hair with straight bangs, gold headband with a red gem, white dress, blue-and-gold collar, gold sash, gold arm cuffs, light veil. the guests: Egyptian wedding guests in white linen with blue-and-gold collars and gold headbands, black bob hairstyles, some in white striped headdresses. the musicians: guests in white linen playing harp, frame drum and reed flute. Setting: sunny daytime wedding courtyard in ancient Alexandria, sandstone columns with painted blue-and-gold bands, long tables with white cloths and clay jars, orange cloth awnings, and a tall wooden entrance gate at the back-center that opens onto the street. The wedding at its happiest: Senbi and the bride together, musicians playing, guests dancing, banners and flowers swaying lightly in the breeze, warm sunlight. Camera: wide shot of the whole courtyard at eye level; fixed except for an almost imperceptible 5% slow push-in, no tilt or pan. Audio: voice-over narration only (a voice, never shown on screen; no narrator character appears): a British male voice, warm and dry, begins speaking within half a second and says: “For a few perfect minutes, everything was exactly right. Enjoy this part.” Music: light ancient-Mediterranean wedding music (frame drums, reed flute, plucked strings), same theme in every clip, low under the voice. Sound effects: applause, drums, wind in the banners. Final reminder: no character says any word; only the voice-over narration speaks (voice only, nobody on screen is the narrator). Natural laughs, gasps and sighs are fine. No text, captions or logos in the frame.</w:t>
+        <w:t xml:space="preserve">VOICE RULE: only the voice-over narration speaks words; it is a voice only, never a person or character on screen. No character says any word and no one on screen lip-syncs to speech; characters communicate with facial expressions and body gestures. Natural non-verbal sounds are allowed and should sound real: laughing, giggling, gasping, sighing, groaning, cheering, coughing. Attached reference images, in order: the Egyptian wedding guests, the bride, Senbi, the groom. 2D hand-drawn stickman cartoon in the exact style of the reference images: thin black outlines, large expressive heads, thin stick arms, flat warm colors, playful documentary-comedy tone, 16:9. Characters, identical in every frame: Senbi the groom: young man, straight black bowl-cut hair with bangs, gold headband with a gold cobra, bare chest, blue-and-gold broad collar, gold bracers, white kilt with a blue-and-gold sash, brown sandals, thin black stick arms. the bride: black bob hair with straight bangs, gold headband with a red gem, white dress, blue-and-gold collar, gold sash, gold arm cuffs, light veil. the guests: Egyptian wedding guests in white linen with blue-and-gold collars and gold headbands, black bob hairstyles, some in white striped headdresses. the musicians: guests in white linen playing harp, frame drum and reed flute. Setting: sunny daytime wedding courtyard in ancient Alexandria, sandstone columns with painted blue-and-gold bands, long tables with white cloths and clay jars, orange cloth awnings, and a tall wooden entrance gate at the back-center that opens onto the street. Lighting: warm bright afternoon sunlight, soft shadows, rich saturated colors. ACTION TIMELINE (8 seconds): 0–2.5 s: Senbi and the bride stand together at the center holding hands while musicians play and guests dance around them. 2.5–5.5 s: banners and flower garlands sway lightly in the breeze, couples spin, children run past. 5.5–8 s: Senbi and the bride exchange a loving look; everything is perfectly joyful. Camera: wide shot of the whole courtyard at eye level; fixed except for an almost imperceptible 5% slow push-in, no tilt or pan. Audio: voice-over narration only (a voice, never shown on screen; no narrator character appears): a British male voice, warm and dry, begins speaking within half a second and says: “For a few perfect minutes, everything was exactly right. Enjoy this part.” The line takes about 4.8 seconds; leave the last second free of speech so the moment can land. Music: light ancient-Mediterranean wedding music (frame drums, reed flute, plucked strings), same theme in every clip, low under the voice. Sound effects: applause, drums, wind in the banners, timed to the action. Ambience: light courtyard ambience: clinking cups, footsteps on stone, a soft breeze, no words. Final reminder: no character says any word; only the voice-over narration speaks (voice only, nobody on screen is the narrator). Natural laughs, gasps and sighs are fine. No text, captions or logos in the frame.</w:t>
       </w:r>
     </w:p>
     <w:p>
@@ -1789,7 +1789,7 @@
           <w:sz w:val="20"/>
           <w:szCs w:val="20"/>
         </w:rPr>
-        <w:t xml:space="preserve">VOICE RULE: only the voice-over narration speaks words; it is a voice only, never a person or character on screen. No character says any word and no one on screen lip-syncs to speech; characters communicate with facial expressions and body gestures. Natural non-verbal sounds are allowed and should sound real: laughing, giggling, gasping, sighing, groaning, cheering, coughing. Attached reference images, in order: the wedding courtyard. 2D hand-drawn stickman cartoon in the exact style of the reference images: thin black outlines, large expressive heads, thin stick arms, flat warm colors, playful documentary-comedy tone, 16:9. Characters, identical in every frame: the guests: Egyptian wedding guests in white linen with blue-and-gold collars and gold headbands, black bob hairstyles, some in white striped headdresses. Setting: sunny daytime wedding courtyard in ancient Alexandria, sandstone columns with painted blue-and-gold bands, long tables with white cloths and clay jars, orange cloth awnings, and a tall wooden entrance gate at the back-center that opens onto the street. A small clay cup on a wedding table trembles slightly, as if from distant footsteps. Out-of-focus guests dance behind it, unaware. Camera: locked-off and perfectly still, extreme close-up of the cup; only the cup vibrates, the camera does not; the framing never changes (no tilt, pan, zoom or rising camera). Audio: voice-over narration only (a voice, never shown on screen; no narrator character appears): a British male voice, warm and dry, begins speaking within half a second and says: “Then a small cup on the table began to tremble. Nobody noticed.” Music: light ancient-Mediterranean wedding music (frame drums, reed flute, plucked strings) with a faint uneasy undertone, same theme in every clip, low under the voice. Sound effects: ceramic cup rattling, faint rumble. Final reminder: no character says any word; only the voice-over narration speaks (voice only, nobody on screen is the narrator). Natural laughs, gasps and sighs are fine. No text, captions or logos in the frame.</w:t>
+        <w:t xml:space="preserve">VOICE RULE: only the voice-over narration speaks words; it is a voice only, never a person or character on screen. No character says any word and no one on screen lip-syncs to speech; characters communicate with facial expressions and body gestures. Natural non-verbal sounds are allowed and should sound real: laughing, giggling, gasping, sighing, groaning, cheering, coughing. Attached reference images, in order: the wedding courtyard. 2D hand-drawn stickman cartoon in the exact style of the reference images: thin black outlines, large expressive heads, thin stick arms, flat warm colors, playful documentary-comedy tone, 16:9. Setting: sunny daytime wedding courtyard in ancient Alexandria, sandstone columns with painted blue-and-gold bands, long tables with white cloths and clay jars, orange cloth awnings, and a tall wooden entrance gate at the back-center that opens onto the street. Lighting: warm bright afternoon sunlight, soft shadows, rich saturated colors. ACTION TIMELINE (8 seconds): 0–2 s: a small clay cup stands still on a wedding table, out-of-focus guests dancing behind it. 2–4.5 s: the cup begins to tremble slightly, tiny ripples in the drink. 4.5–8 s: the tremble repeats rhythmically like distant footsteps, building, while the guests behind keep dancing, unaware. Camera: locked-off and perfectly still, extreme close-up of the cup; only the cup vibrates, the camera does not; the framing never changes (no tilt, pan, zoom or rising camera). Audio: voice-over narration only (a voice, never shown on screen; no narrator character appears): a British male voice, warm and dry, begins speaking within half a second and says: “Then a small cup on the table began to tremble. Nobody noticed.” The line takes about 4.8 seconds; leave the last second free of speech so the moment can land. Music: light ancient-Mediterranean wedding music (frame drums, reed flute, plucked strings) with a faint uneasy undertone, same theme in every clip, low under the voice. Sound effects: ceramic cup rattling, faint rumble, timed to the action. Ambience: light courtyard ambience: clinking cups, footsteps on stone, a soft breeze, no words. Final reminder: no character says any word; only the voice-over narration speaks (voice only, nobody on screen is the narrator). Natural laughs, gasps and sighs are fine. No text, captions or logos in the frame.</w:t>
       </w:r>
     </w:p>
     <w:p>
@@ -1862,7 +1862,7 @@
           <w:sz w:val="20"/>
           <w:szCs w:val="20"/>
         </w:rPr>
-        <w:t xml:space="preserve">VOICE RULE: only the voice-over narration speaks words; it is a voice only, never a person or character on screen. No character says any word and no one on screen lip-syncs to speech; characters communicate with facial expressions and body gestures. Natural non-verbal sounds are allowed and should sound real: laughing, giggling, gasping, sighing, groaning, cheering, coughing. Attached reference images, in order: the Egyptian wedding guests, the wedding courtyard. 2D hand-drawn stickman cartoon in the exact style of the reference images: thin black outlines, large expressive heads, thin stick arms, flat warm colors, playful documentary-comedy tone, 16:9. Characters, identical in every frame: the guests: Egyptian wedding guests in white linen with blue-and-gold collars and gold headbands, black bob hairstyles, some in white striped headdresses. the musicians: guests in white linen playing harp, frame drum and reed flute. Setting: sunny daytime wedding courtyard in ancient Alexandria, sandstone columns with painted blue-and-gold bands, long tables with white cloths and clay jars, orange cloth awnings, and a tall wooden entrance gate at the back-center that opens onto the street. An Egyptian musician suddenly stops playing and looks toward the open gate visible behind him; his joy turns to alertness. The dancers behind him keep dancing for one more beat. Camera: locked-off and perfectly still, eye-level medium shot of the musician with the entrance visible behind him; the framing never changes (no tilt, pan, zoom or rising camera). Audio: voice-over narration only (a voice, never shown on screen; no narrator character appears): a British male voice, warm and dry, begins speaking within half a second and says: “The musician noticed. He stopped. Everyone else danced one more beat, blissfully unaware.” Music: music nearly silent. Sound effects: music and drums cut out, one drum stops. Final reminder: no character says any word; only the voice-over narration speaks (voice only, nobody on screen is the narrator). Natural laughs, gasps and sighs are fine. No text, captions or logos in the frame.</w:t>
+        <w:t xml:space="preserve">VOICE RULE: only the voice-over narration speaks words; it is a voice only, never a person or character on screen. No character says any word and no one on screen lip-syncs to speech; characters communicate with facial expressions and body gestures. Natural non-verbal sounds are allowed and should sound real: laughing, giggling, gasping, sighing, groaning, cheering, coughing. Attached reference images, in order: the Egyptian wedding guests, the wedding courtyard. 2D hand-drawn stickman cartoon in the exact style of the reference images: thin black outlines, large expressive heads, thin stick arms, flat warm colors, playful documentary-comedy tone, 16:9. Characters, identical in every frame: the musicians: guests in white linen playing harp, frame drum and reed flute. the guests: Egyptian wedding guests in white linen with blue-and-gold collars and gold headbands, black bob hairstyles, some in white striped headdresses. Setting: sunny daytime wedding courtyard in ancient Alexandria, sandstone columns with painted blue-and-gold bands, long tables with white cloths and clay jars, orange cloth awnings, and a tall wooden entrance gate at the back-center that opens onto the street. Lighting: warm bright afternoon sunlight, soft shadows, rich saturated colors. ACTION TIMELINE (8 seconds): 0–2.5 s: an Egyptian musician plays the reed flute joyfully, eyes closed, the open gate visible behind him. 2.5–5.5 s: he stops abruptly, eyes opening, flute lowered, his expression turning alert. 5.5–8 s: he turns his head toward the gate, brow furrowed, listening, while the dancers behind him dance one more beat and then slow down. Camera: locked-off and perfectly still, eye-level medium shot of the musician with the entrance visible behind him; the framing never changes (no tilt, pan, zoom or rising camera). Audio: voice-over narration only (a voice, never shown on screen; no narrator character appears): a British male voice, warm and dry, begins speaking within half a second and says: “The musician noticed. He stopped. Everyone else danced one more beat, blissfully unaware.” The line takes about 5.2 seconds; leave the last second free of speech so the moment can land. Music: music nearly silent. Sound effects: music and drums cut out, one drum stops, timed to the action. Ambience: light courtyard ambience: clinking cups, footsteps on stone, a soft breeze, no words. Final reminder: no character says any word; only the voice-over narration speaks (voice only, nobody on screen is the narrator). Natural laughs, gasps and sighs are fine. No text, captions or logos in the frame.</w:t>
       </w:r>
     </w:p>
     <w:p>
@@ -1935,7 +1935,7 @@
           <w:sz w:val="20"/>
           <w:szCs w:val="20"/>
         </w:rPr>
-        <w:t xml:space="preserve">VOICE RULE: only the voice-over narration speaks words; it is a voice only, never a person or character on screen. No character says any word and no one on screen lip-syncs to speech; characters communicate with facial expressions and body gestures. Natural non-verbal sounds are allowed and should sound real: laughing, giggling, gasping, sighing, groaning, cheering, coughing. Attached reference image (use only for the art style and colors; do not copy its layout or characters): the Shot 1 courtyard frame. 2D hand-drawn stickman cartoon in the exact style of the reference images: thin black outlines, large expressive heads, thin stick arms, flat warm colors, playful documentary-comedy tone, 16:9. Characters, identical in every frame: the Roman soldiers: crimson plumed helmets, steel armor, red cloaks, rectangular red shields. Setting: sunlit street of ancient Alexandria outside the wedding house, sandstone walls, palms, market stalls with red and blue awnings. The busy street goes quiet. Civilians notice something at the far end, step aside and clear the road. Nothing is visible yet except settling dust; show no soldiers even if the reference image contains some. Camera: locked-off and perfectly still, eye-level wide shot of the street; the framing never changes (no tilt, pan, zoom or rising camera). Audio: voice-over narration only (a voice, never shown on screen; no narrator character appears): a British male voice, warm and dry, begins speaking within half a second and says: “Outside, the street went quiet. In a busy city, that's never good.” Music: low sustained tension with distant marching drums, almost silent. Sound effects: street ambience fading, distant boots. Final reminder: no character says any word; only the voice-over narration speaks (voice only, nobody on screen is the narrator). Natural laughs, gasps and sighs are fine. No text, captions or logos in the frame.</w:t>
+        <w:t xml:space="preserve">VOICE RULE: only the voice-over narration speaks words; it is a voice only, never a person or character on screen. No character says any word and no one on screen lip-syncs to speech; characters communicate with facial expressions and body gestures. Natural non-verbal sounds are allowed and should sound real: laughing, giggling, gasping, sighing, groaning, cheering, coughing. Attached reference image (use only for the art style and colors; do not copy its layout or characters): the Shot 1 courtyard frame. 2D hand-drawn stickman cartoon in the exact style of the reference images: thin black outlines, large expressive heads, thin stick arms, flat warm colors, playful documentary-comedy tone, 16:9. Setting: sunlit street of ancient Alexandria outside the wedding house, sandstone walls, palms, market stalls with red and blue awnings. Lighting: warm bright sunlight, soft shadows. ACTION TIMELINE (8 seconds): 0–2.5 s: the street is busy: vendors, women with baskets, children walking about. 2.5–5.5 s: people stop and look toward the far end of the street, expressions uneasy. 5.5–8 s: they step aside and clear the middle of the road, pulling children close; settling dust hangs in the air and the street goes quiet; no soldiers are visible. Camera: locked-off and perfectly still, eye-level wide shot of the street; the framing never changes (no tilt, pan, zoom or rising camera). Audio: voice-over narration only (a voice, never shown on screen; no narrator character appears): a British male voice, warm and dry, begins speaking within half a second and says: “Outside, the street went quiet. In a busy city, that's never good.” The line takes about 4.8 seconds; leave the last second free of speech so the moment can land. Music: low sustained tension with distant marching drums, almost silent. Sound effects: street ambience fading, distant boots, timed to the action. Ambience: sunlit street ambience: wind and distant clatter, no words. Final reminder: no character says any word; only the voice-over narration speaks (voice only, nobody on screen is the narrator). Natural laughs, gasps and sighs are fine. No text, captions or logos in the frame.</w:t>
       </w:r>
     </w:p>
     <w:p>
@@ -2008,7 +2008,7 @@
           <w:sz w:val="20"/>
           <w:szCs w:val="20"/>
         </w:rPr>
-        <w:t xml:space="preserve">VOICE RULE: nobody speaks and no voice of any kind is heard in this clip; it is a sound-effects-only beat. Attached reference images, in order: the Roman soldiers. 2D hand-drawn stickman cartoon in the exact style of the reference images: thin black outlines, large expressive heads, thin stick arms, flat warm colors, playful documentary-comedy tone, 16:9. Setting: sunlit street of ancient Alexandria outside the wedding house, sandstone walls, palms, market stalls with red and blue awnings. At ground level, three heavy Roman boots step into the frame one after another from the side, kicking up a little dust. Only boots and lower legs are visible. Camera: locked-off and perfectly still, fixed ground-level frame on the street; the boots step into frame from the side and the camera never rises; the framing never changes (no tilt, pan, zoom or rising camera). Audio: no narration and no speech. Sound effects: heavy boot steps with metal clank. Music: low sustained tension with distant marching drums, almost silent. Final reminder: no voice of any kind in this clip. No text, captions or logos in the frame.</w:t>
+        <w:t xml:space="preserve">VOICE RULE: nobody speaks and no voice of any kind is heard in this clip; it is a sound-effects-only beat. Attached reference images, in order: the Roman soldiers. 2D hand-drawn stickman cartoon in the exact style of the reference images: thin black outlines, large expressive heads, thin stick arms, flat warm colors, playful documentary-comedy tone, 16:9. Characters, identical in every frame: the Roman soldiers: crimson plumed helmets, steel armor, red cloaks, rectangular red shields. Setting: sunlit street of ancient Alexandria outside the wedding house, sandstone walls, palms, market stalls with red and blue awnings. Lighting: warm bright sunlight, soft shadows. ACTION TIMELINE (4 seconds): 0–1 s: empty sunlit stone paving, dust drifting. 1–2 s: the first heavy Roman boot steps into frame from the side, the hem of a red cloak visible, dust puffing. 2–3 s: the second boot follows. 3–4 s: a third step lands; only boots and lower legs are ever visible. Camera: locked-off and perfectly still, fixed ground-level frame on the street; the boots step into frame from the side and the camera never rises; the framing never changes (no tilt, pan, zoom or rising camera). Audio: no narration and no speech. Music: low sustained tension with distant marching drums, almost silent. Sound effects: heavy boot steps with metal clank, timed to each step. Ambience: sunlit street ambience: wind and distant clatter, no words. Final reminder: no voice of any kind in this clip. No text, captions or logos in the frame.</w:t>
       </w:r>
     </w:p>
     <w:p>
@@ -2081,7 +2081,7 @@
           <w:sz w:val="20"/>
           <w:szCs w:val="20"/>
         </w:rPr>
-        <w:t xml:space="preserve">VOICE RULE: only the voice-over narration speaks words; it is a voice only, never a person or character on screen. No character says any word and no one on screen lip-syncs to speech; characters communicate with facial expressions and body gestures. Natural non-verbal sounds are allowed and should sound real: laughing, giggling, gasping, sighing, groaning, cheering, coughing. Attached reference images, in order: the Roman soldiers. 2D hand-drawn stickman cartoon in the exact style of the reference images: thin black outlines, large expressive heads, thin stick arms, flat warm colors, playful documentary-comedy tone, 16:9. Characters, identical in every frame: the Roman soldiers: crimson plumed helmets, steel armor, red cloaks, rectangular red shields. Setting: sunlit street of ancient Alexandria outside the wedding house, sandstone walls, palms, market stalls with red and blue awnings. Several Roman soldiers appear as small silhouettes far away and march steadily toward the camera in formation; helmets and shields are recognizable but tiny. Camera: eye-level wide street view; fixed except for an almost imperceptible 5% slow push-in, no tilt or pan. Audio: voice-over narration only (a voice, never shown on screen; no narrator character appears): a British male voice, warm and dry, begins speaking within half a second and says: “Clank. Clank. Clank. Marching men. Lots of them.” Music: low sustained tension with distant marching drums, almost silent. Sound effects: marching boots in rhythm, metal clinks. Final reminder: no character says any word; only the voice-over narration speaks (voice only, nobody on screen is the narrator). Natural laughs, gasps and sighs are fine. No text, captions or logos in the frame.</w:t>
+        <w:t xml:space="preserve">VOICE RULE: only the voice-over narration speaks words; it is a voice only, never a person or character on screen. No character says any word and no one on screen lip-syncs to speech; characters communicate with facial expressions and body gestures. Natural non-verbal sounds are allowed and should sound real: laughing, giggling, gasping, sighing, groaning, cheering, coughing. Attached reference images, in order: the Roman soldiers. 2D hand-drawn stickman cartoon in the exact style of the reference images: thin black outlines, large expressive heads, thin stick arms, flat warm colors, playful documentary-comedy tone, 16:9. Characters, identical in every frame: the Roman soldiers: crimson plumed helmets, steel armor, red cloaks, rectangular red shields. Setting: sunlit street of ancient Alexandria outside the wedding house, sandstone walls, palms, market stalls with red and blue awnings. Lighting: warm bright sunlight, soft shadows. ACTION TIMELINE (6 seconds): 0–2 s: far at the end of the street, small dark silhouettes of soldiers appear, shields and plumes recognizable but tiny. 2–4 s: they march steadily in formation toward the camera, getting slightly larger. 4–6 s: dust rises behind them while civilians at the sides watch, motionless. Camera: eye-level wide street view; fixed except for an almost imperceptible 5% slow push-in, no tilt or pan. Audio: voice-over narration only (a voice, never shown on screen; no narrator character appears): a British male voice, warm and dry, begins speaking within half a second and says: “Clank. Clank. Clank. Marching men. Lots of them.” The line takes about 3.2 seconds; leave the last second free of speech so the moment can land. Music: low sustained tension with distant marching drums, almost silent. Sound effects: marching boots in rhythm, metal clinks, timed to the action. Ambience: sunlit street ambience: wind and distant clatter, no words. Final reminder: no character says any word; only the voice-over narration speaks (voice only, nobody on screen is the narrator). Natural laughs, gasps and sighs are fine. No text, captions or logos in the frame.</w:t>
       </w:r>
     </w:p>
     <w:p>
@@ -2154,7 +2154,7 @@
           <w:sz w:val="20"/>
           <w:szCs w:val="20"/>
         </w:rPr>
-        <w:t xml:space="preserve">VOICE RULE: only the voice-over narration speaks words; it is a voice only, never a person or character on screen. No character says any word and no one on screen lip-syncs to speech; characters communicate with facial expressions and body gestures. Natural non-verbal sounds are allowed and should sound real: laughing, giggling, gasping, sighing, groaning, cheering, coughing. Attached reference images, in order: the wedding courtyard, Senbi, the groom, the bride. 2D hand-drawn stickman cartoon in the exact style of the reference images: thin black outlines, large expressive heads, thin stick arms, flat warm colors, playful documentary-comedy tone, 16:9. Characters, identical in every frame: Senbi the groom: young man, straight black bowl-cut hair with bangs, gold headband with a gold cobra, bare chest, blue-and-gold broad collar, gold bracers, white kilt with a blue-and-gold sash, brown sandals, thin black stick arms. Setting: sunny daytime wedding courtyard in ancient Alexandria, sandstone columns with painted blue-and-gold bands, long tables with white cloths and clay jars, orange cloth awnings, and a tall wooden entrance gate at the back-center that opens onto the street. Guests dance and laugh; Senbi spins happily in the center, completely unaware. The open gate at the back stays calm. Camera: locked-off and perfectly still, eye-level medium-wide shot of the courtyard; the framing never changes (no tilt, pan, zoom or rising camera). Audio: voice-over narration only (a voice, never shown on screen; no narrator character appears): a British male voice, warm and dry, begins speaking within half a second and says: “Inside, nobody had a clue. Senbi was busy spinning.” Music: light ancient-Mediterranean wedding music (frame drums, reed flute, plucked strings) with a faint uneasy undertone, same theme in every clip, low under the voice. Sound effects: wedding music muffled, faint thump. Final reminder: no character says any word; only the voice-over narration speaks (voice only, nobody on screen is the narrator). Natural laughs, gasps and sighs are fine. No text, captions or logos in the frame.</w:t>
+        <w:t xml:space="preserve">VOICE RULE: only the voice-over narration speaks words; it is a voice only, never a person or character on screen. No character says any word and no one on screen lip-syncs to speech; characters communicate with facial expressions and body gestures. Natural non-verbal sounds are allowed and should sound real: laughing, giggling, gasping, sighing, groaning, cheering, coughing. Attached reference images, in order: the wedding courtyard, Senbi, the groom, the bride. 2D hand-drawn stickman cartoon in the exact style of the reference images: thin black outlines, large expressive heads, thin stick arms, flat warm colors, playful documentary-comedy tone, 16:9. Characters, identical in every frame: Senbi the groom: young man, straight black bowl-cut hair with bangs, gold headband with a gold cobra, bare chest, blue-and-gold broad collar, gold bracers, white kilt with a blue-and-gold sash, brown sandals, thin black stick arms. the bride: black bob hair with straight bangs, gold headband with a red gem, white dress, blue-and-gold collar, gold sash, gold arm cuffs, light veil. the guests: Egyptian wedding guests in white linen with blue-and-gold collars and gold headbands, black bob hairstyles, some in white striped headdresses. Setting: sunny daytime wedding courtyard in ancient Alexandria, sandstone columns with painted blue-and-gold bands, long tables with white cloths and clay jars, orange cloth awnings, and a tall wooden entrance gate at the back-center that opens onto the street. Lighting: warm bright afternoon sunlight, soft shadows, rich saturated colors. ACTION TIMELINE (6 seconds): 0–2 s: guests dance and laugh while Senbi spins happily in the center, arms out. 2–4 s: the bride claps in rhythm beside him. 4–6 s: Senbi keeps spinning, eyes closed in bliss; the gate behind them stays calm. Camera: locked-off and perfectly still, eye-level medium-wide shot of the courtyard; the framing never changes (no tilt, pan, zoom or rising camera). Audio: voice-over narration only (a voice, never shown on screen; no narrator character appears): a British male voice, warm and dry, begins speaking within half a second and says: “Inside, nobody had a clue. Senbi was busy spinning.” The line takes about 3.6 seconds; leave the last second free of speech so the moment can land. Music: light ancient-Mediterranean wedding music (frame drums, reed flute, plucked strings) with a faint uneasy undertone, same theme in every clip, low under the voice. Sound effects: wedding music muffled, faint thump, timed to the action. Ambience: light courtyard ambience: clinking cups, footsteps on stone, a soft breeze, no words. Final reminder: no character says any word; only the voice-over narration speaks (voice only, nobody on screen is the narrator). Natural laughs, gasps and sighs are fine. No text, captions or logos in the frame.</w:t>
       </w:r>
     </w:p>
     <w:p>
@@ -2227,7 +2227,7 @@
           <w:sz w:val="20"/>
           <w:szCs w:val="20"/>
         </w:rPr>
-        <w:t xml:space="preserve">VOICE RULE: only the voice-over narration speaks words; it is a voice only, never a person or character on screen. No character says any word and no one on screen lip-syncs to speech; characters communicate with facial expressions and body gestures. Natural non-verbal sounds are allowed and should sound real: laughing, giggling, gasping, sighing, groaning, cheering, coughing. Attached reference images, in order: the Roman soldiers. 2D hand-drawn stickman cartoon in the exact style of the reference images: thin black outlines, large expressive heads, thin stick arms, flat warm colors, playful documentary-comedy tone, 16:9. Characters, identical in every frame: the Roman soldiers: crimson plumed helmets, steel armor, red cloaks, rectangular red shields. Setting: sunlit street of ancient Alexandria outside the wedding house, sandstone walls, palms, market stalls with red and blue awnings. Two tired, dusty Roman legionaries walk into the street in front of the wedding house, shields and spears in hand. They stop and look around, confused rather than menacing. Camera: locked-off and perfectly still, eye-level medium-wide shot of the street; the soldiers walk into the frame; the framing never changes (no tilt, pan, zoom or rising camera). Audio: voice-over narration only (a voice, never shown on screen; no narrator character appears): a British male voice, warm and dry, begins speaking within half a second and says: “And then Rome arrived. Tired, dusty, and looking for the right address.” Music: low sustained tension with distant marching drums, almost silent. Sound effects: armor clank, dust, a tired sigh. Final reminder: no character says any word; only the voice-over narration speaks (voice only, nobody on screen is the narrator). Natural laughs, gasps and sighs are fine. No text, captions or logos in the frame.</w:t>
+        <w:t xml:space="preserve">VOICE RULE: only the voice-over narration speaks words; it is a voice only, never a person or character on screen. No character says any word and no one on screen lip-syncs to speech; characters communicate with facial expressions and body gestures. Natural non-verbal sounds are allowed and should sound real: laughing, giggling, gasping, sighing, groaning, cheering, coughing. Attached reference images, in order: the Roman soldiers. 2D hand-drawn stickman cartoon in the exact style of the reference images: thin black outlines, large expressive heads, thin stick arms, flat warm colors, playful documentary-comedy tone, 16:9. Characters, identical in every frame: the Roman soldiers: crimson plumed helmets, steel armor, red cloaks, rectangular red shields. Setting: sunlit street of ancient Alexandria outside the wedding house, sandstone walls, palms, market stalls with red and blue awnings. Lighting: warm bright sunlight, soft shadows. ACTION TIMELINE (8 seconds): 0–2.5 s: the street is empty and the sound of boots grows. 2.5–5.5 s: two tired, dusty Roman legionaries walk into frame, shields and spears in hand, shoulders slumped, dust on their armor. 5.5–8 s: they stop in front of the wedding house and look around, then at each other, confused; one scratches under his helmet. Camera: locked-off and perfectly still, eye-level medium-wide shot of the street; the soldiers walk into the frame; the framing never changes (no tilt, pan, zoom or rising camera). Audio: voice-over narration only (a voice, never shown on screen; no narrator character appears): a British male voice, warm and dry, begins speaking within half a second and says: “And then Rome arrived. Tired, dusty, and looking for the right address.” The line takes about 4.8 seconds; leave the last second free of speech so the moment can land. Music: low sustained tension with distant marching drums, almost silent. Sound effects: armor clank, dust, a tired sigh, timed to the action. Ambience: sunlit street ambience: wind and distant clatter, no words. Final reminder: no character says any word; only the voice-over narration speaks (voice only, nobody on screen is the narrator). Natural laughs, gasps and sighs are fine. No text, captions or logos in the frame.</w:t>
       </w:r>
     </w:p>
     <w:p>
@@ -2300,7 +2300,7 @@
           <w:sz w:val="20"/>
           <w:szCs w:val="20"/>
         </w:rPr>
-        <w:t xml:space="preserve">VOICE RULE: only the voice-over narration speaks words; it is a voice only, never a person or character on screen. No character says any word and no one on screen lip-syncs to speech; characters communicate with facial expressions and body gestures. Natural non-verbal sounds are allowed and should sound real: laughing, giggling, gasping, sighing, groaning, cheering, coughing. Attached reference images, in order: the Egyptian wedding guests, the Roman soldiers, the wedding courtyard. 2D hand-drawn stickman cartoon in the exact style of the reference images: thin black outlines, large expressive heads, thin stick arms, flat warm colors, playful documentary-comedy tone, 16:9. Characters, identical in every frame: the Roman soldiers: crimson plumed helmets, steel armor, red cloaks, rectangular red shields. the guests: Egyptian wedding guests in white linen with blue-and-gold collars and gold headbands, black bob hairstyles, some in white striped headdresses. Setting: sunlit street of ancient Alexandria outside the wedding house, sandstone walls, palms, market stalls with red and blue awnings. Three guests peek out of the doorway at the same time: one frightened, one confused, one grinning as if the soldiers are the entertainment. Camera: locked-off and perfectly still, eye-level medium-wide shot of the doorway with all three guests peeking in the same frame; the framing never changes (no tilt, pan, zoom or rising camera). Audio: voice-over narration only (a voice, never shown on screen; no narrator character appears): a British male voice, warm and dry, begins speaking within half a second and says: “The guests peeked out. One terrified. One confused. One assumed it was entertainment.” Music: music nearly silent. Sound effects: nervous coughs and gasps, no words. Final reminder: no character says any word; only the voice-over narration speaks (voice only, nobody on screen is the narrator). Natural laughs, gasps and sighs are fine. No text, captions or logos in the frame.</w:t>
+        <w:t xml:space="preserve">VOICE RULE: only the voice-over narration speaks words; it is a voice only, never a person or character on screen. No character says any word and no one on screen lip-syncs to speech; characters communicate with facial expressions and body gestures. Natural non-verbal sounds are allowed and should sound real: laughing, giggling, gasping, sighing, groaning, cheering, coughing. Attached reference images, in order: the Egyptian wedding guests, the Roman soldiers, the wedding courtyard. 2D hand-drawn stickman cartoon in the exact style of the reference images: thin black outlines, large expressive heads, thin stick arms, flat warm colors, playful documentary-comedy tone, 16:9. Characters, identical in every frame: the guests: Egyptian wedding guests in white linen with blue-and-gold collars and gold headbands, black bob hairstyles, some in white striped headdresses. Setting: sunlit street of ancient Alexandria outside the wedding house, sandstone walls, palms, market stalls with red and blue awnings. Lighting: warm bright sunlight, soft shadows. ACTION TIMELINE (8 seconds): 0–2.5 s: three guests peek out of the doorway at the same time: the left one terrified with wide eyes and hands on cheeks, the center one confused with a tilted head and one raised eyebrow, the right one grinning and clapping softly as if watching entertainers. 2.5–5.5 s: the terrified one ducks back and peeks out again. 5.5–8 s: the grinning one nudges the confused one and points, delighted, while the confused one squints. Camera: locked-off and perfectly still, eye-level medium-wide shot of the doorway with all three guests peeking in the same frame; the framing never changes (no tilt, pan, zoom or rising camera). Audio: voice-over narration only (a voice, never shown on screen; no narrator character appears): a British male voice, warm and dry, begins speaking within half a second and says: “The guests peeked out. One terrified. One confused. One assumed it was entertainment.” The line takes about 5.2 seconds; leave the last second free of speech so the moment can land. Music: music nearly silent. Sound effects: nervous coughs and gasps, no words, timed to the action. Ambience: sunlit street ambience: wind and distant clatter, no words. Final reminder: no character says any word; only the voice-over narration speaks (voice only, nobody on screen is the narrator). Natural laughs, gasps and sighs are fine. No text, captions or logos in the frame.</w:t>
       </w:r>
     </w:p>
     <w:p>
@@ -2373,7 +2373,7 @@
           <w:sz w:val="20"/>
           <w:szCs w:val="20"/>
         </w:rPr>
-        <w:t xml:space="preserve">VOICE RULE: only the voice-over narration speaks words; it is a voice only, never a person or character on screen. No character says any word and no one on screen lip-syncs to speech; characters communicate with facial expressions and body gestures. Natural non-verbal sounds are allowed and should sound real: laughing, giggling, gasping, sighing, groaning, cheering, coughing. Attached reference images, in order: the bride's relatives, the Roman soldiers, the wedding courtyard. 2D hand-drawn stickman cartoon in the exact style of the reference images: thin black outlines, large expressive heads, thin stick arms, flat warm colors, playful documentary-comedy tone, 16:9. Characters, identical in every frame: the Roman soldiers: crimson plumed helmets, steel armor, red cloaks, rectangular red shields. the guests: Egyptian wedding guests in white linen with blue-and-gold collars and gold headbands, black bob hairstyles, some in white striped headdresses. the uncle: cheerful bearded middle-aged man in plain white linen. Setting: sunlit street of ancient Alexandria outside the wedding house, sandstone walls, palms, market stalls with red and blue awnings. A cheerful, slightly tipsy older uncle grabs a clay beer cup and walks confidently across the frame toward the Roman soldiers, as if greeting ordinary guests. Camera: locked-off and perfectly still, eye-level medium-wide shot; the uncle walks across the frame; the framing never changes (no tilt, pan, zoom or rising camera). Audio: voice-over narration only (a voice, never shown on screen; no narrator character appears): a British male voice, warm and dry, begins speaking within half a second and says: “Then one uncle, a man with absolutely no fear, grabbed a beer.” Music: playful comic percussion over the wedding rhythm, low under the voice. Sound effects: cup clink. Final reminder: no character says any word; only the voice-over narration speaks (voice only, nobody on screen is the narrator). Natural laughs, gasps and sighs are fine. No text, captions or logos in the frame.</w:t>
+        <w:t xml:space="preserve">VOICE RULE: only the voice-over narration speaks words; it is a voice only, never a person or character on screen. No character says any word and no one on screen lip-syncs to speech; characters communicate with facial expressions and body gestures. Natural non-verbal sounds are allowed and should sound real: laughing, giggling, gasping, sighing, groaning, cheering, coughing. Attached reference images, in order: the bride's relatives, the Roman soldiers, the wedding courtyard. 2D hand-drawn stickman cartoon in the exact style of the reference images: thin black outlines, large expressive heads, thin stick arms, flat warm colors, playful documentary-comedy tone, 16:9. Characters, identical in every frame: the uncle: cheerful bearded middle-aged man in plain white linen. the Roman soldiers: crimson plumed helmets, steel armor, red cloaks, rectangular red shields. Setting: sunlit street of ancient Alexandria outside the wedding house, sandstone walls, palms, market stalls with red and blue awnings. Lighting: warm bright sunlight, soft shadows. ACTION TIMELINE (8 seconds): 0–2.5 s: a cheerful, slightly tipsy bearded uncle sways with a clay beer cup in hand, cheeks rosy, two Roman soldiers waiting at the right edge of the frame. 2.5–5.5 s: he strides confidently across the frame toward the soldiers, cup raised in greeting. 5.5–8 s: he arrives and extends the cup with a wide smile. Camera: locked-off and perfectly still, eye-level medium-wide shot; the uncle walks across the frame; the framing never changes (no tilt, pan, zoom or rising camera). Audio: voice-over narration only (a voice, never shown on screen; no narrator character appears): a British male voice, warm and dry, begins speaking within half a second and says: “Then one uncle, a man with absolutely no fear, grabbed a beer.” The line takes about 4.8 seconds; leave the last second free of speech so the moment can land. Music: playful comic percussion over the wedding rhythm, low under the voice. Sound effects: cup clink, timed to the action. Ambience: sunlit street ambience: wind and distant clatter, no words. Final reminder: no character says any word; only the voice-over narration speaks (voice only, nobody on screen is the narrator). Natural laughs, gasps and sighs are fine. No text, captions or logos in the frame.</w:t>
       </w:r>
     </w:p>
     <w:p>
@@ -2446,7 +2446,7 @@
           <w:sz w:val="20"/>
           <w:szCs w:val="20"/>
         </w:rPr>
-        <w:t xml:space="preserve">VOICE RULE: only the voice-over narration speaks words; it is a voice only, never a person or character on screen. No character says any word and no one on screen lip-syncs to speech; characters communicate with facial expressions and body gestures. Natural non-verbal sounds are allowed and should sound real: laughing, giggling, gasping, sighing, groaning, cheering, coughing. Attached reference images, in order: the bride's relatives, the Roman soldiers. 2D hand-drawn stickman cartoon in the exact style of the reference images: thin black outlines, large expressive heads, thin stick arms, flat warm colors, playful documentary-comedy tone, 16:9. Characters, identical in every frame: the Roman soldiers: crimson plumed helmets, steel armor, red cloaks, rectangular red shields. the uncle: cheerful bearded middle-aged man in plain white linen. Setting: sunlit street of ancient Alexandria outside the wedding house, sandstone walls, palms, market stalls with red and blue awnings. The uncle offers the cup with a big smile. A Roman soldier looks at the cup, then at the uncle, and does not move. Camera: locked-off and perfectly still, eye-level medium two-shot; the framing never changes (no tilt, pan, zoom or rising camera). Audio: voice-over narration only (a voice, never shown on screen; no narrator character appears): a British male voice, warm and dry, begins speaking within half a second and says: “He offered it to a Roman. As if it were completely normal.” Music: music nearly silent. Sound effects: cup clink, awkward silence. Final reminder: no character says any word; only the voice-over narration speaks (voice only, nobody on screen is the narrator). Natural laughs, gasps and sighs are fine. No text, captions or logos in the frame.</w:t>
+        <w:t xml:space="preserve">VOICE RULE: only the voice-over narration speaks words; it is a voice only, never a person or character on screen. No character says any word and no one on screen lip-syncs to speech; characters communicate with facial expressions and body gestures. Natural non-verbal sounds are allowed and should sound real: laughing, giggling, gasping, sighing, groaning, cheering, coughing. Attached reference images, in order: the bride's relatives, the Roman soldiers. 2D hand-drawn stickman cartoon in the exact style of the reference images: thin black outlines, large expressive heads, thin stick arms, flat warm colors, playful documentary-comedy tone, 16:9. Characters, identical in every frame: the uncle: cheerful bearded middle-aged man in plain white linen. the Roman soldiers: crimson plumed helmets, steel armor, red cloaks, rectangular red shields. Setting: sunlit street of ancient Alexandria outside the wedding house, sandstone walls, palms, market stalls with red and blue awnings. Lighting: warm bright sunlight, soft shadows. ACTION TIMELINE (8 seconds): 0–2.5 s: the uncle holds out the cup with a big beaming smile. 2.5–5.5 s: a Roman soldier looks at the cup, then at the uncle, expression flat and baffled, and does not move. 5.5–8 s: the uncle's smile stays fixed, the cup trembling slightly as he waits; the soldier blinks slowly. Camera: locked-off and perfectly still, eye-level medium two-shot; the framing never changes (no tilt, pan, zoom or rising camera). Audio: voice-over narration only (a voice, never shown on screen; no narrator character appears): a British male voice, warm and dry, begins speaking within half a second and says: “He offered it to a Roman. As if it were completely normal.” The line takes about 4.8 seconds; leave the last second free of speech so the moment can land. Music: music nearly silent. Sound effects: cup clink, awkward silence, timed to the action. Ambience: sunlit street ambience: wind and distant clatter, no words. Final reminder: no character says any word; only the voice-over narration speaks (voice only, nobody on screen is the narrator). Natural laughs, gasps and sighs are fine. No text, captions or logos in the frame.</w:t>
       </w:r>
     </w:p>
     <w:p>
@@ -2519,7 +2519,7 @@
           <w:sz w:val="20"/>
           <w:szCs w:val="20"/>
         </w:rPr>
-        <w:t xml:space="preserve">VOICE RULE: only the voice-over narration speaks words; it is a voice only, never a person or character on screen. No character says any word and no one on screen lip-syncs to speech; characters communicate with facial expressions and body gestures. Natural non-verbal sounds are allowed and should sound real: laughing, giggling, gasping, sighing, groaning, cheering, coughing. Attached reference images, in order: the Roman soldiers. 2D hand-drawn stickman cartoon in the exact style of the reference images: thin black outlines, large expressive heads, thin stick arms, flat warm colors, playful documentary-comedy tone, 16:9. Characters, identical in every frame: the Roman soldiers: crimson plumed helmets, steel armor, red cloaks, rectangular red shields. the uncle: cheerful bearded middle-aged man in plain white linen. Setting: sunlit street of ancient Alexandria outside the wedding house, sandstone walls, palms, market stalls with red and blue awnings. Close-up of the Roman soldier's confused face. He looks from the cup to the smiling uncle, cautiously takes the cup, and his eyes slide sideways toward his comrades. Camera: eye-level medium close-up of the soldier; fixed except for an almost imperceptible 5% slow push-in, no tilt or pan. Audio: voice-over narration only (a voice, never shown on screen; no narrator character appears): a British male voice, warm and dry, begins speaking within half a second and says: “The soldier stared at the cup, then the uncle. A trap? Or hospitality?” Music: music nearly silent. Sound effects: tiny gulp, uneasy hum. Final reminder: no character says any word; only the voice-over narration speaks (voice only, nobody on screen is the narrator). Natural laughs, gasps and sighs are fine. No text, captions or logos in the frame.</w:t>
+        <w:t xml:space="preserve">VOICE RULE: only the voice-over narration speaks words; it is a voice only, never a person or character on screen. No character says any word and no one on screen lip-syncs to speech; characters communicate with facial expressions and body gestures. Natural non-verbal sounds are allowed and should sound real: laughing, giggling, gasping, sighing, groaning, cheering, coughing. Attached reference images, in order: the Roman soldiers. 2D hand-drawn stickman cartoon in the exact style of the reference images: thin black outlines, large expressive heads, thin stick arms, flat warm colors, playful documentary-comedy tone, 16:9. Characters, identical in every frame: the Roman soldiers: crimson plumed helmets, steel armor, red cloaks, rectangular red shields. Setting: sunlit street of ancient Alexandria outside the wedding house, sandstone walls, palms, market stalls with red and blue awnings. Lighting: warm bright sunlight, soft shadows. ACTION TIMELINE (8 seconds): 0–2.5 s: the soldier's confused face looks at the beer cup. 2.5–5.5 s: he looks up at the uncle's smiling face off-screen and back to the cup, then cautiously takes it. 5.5–8 s: his eyes slide sideways toward his comrades in a silent plea of 'what do I do?'; he sniffs the cup. Camera: eye-level medium close-up of the soldier; fixed except for an almost imperceptible 5% slow push-in, no tilt or pan. Audio: voice-over narration only (a voice, never shown on screen; no narrator character appears): a British male voice, warm and dry, begins speaking within half a second and says: “The soldier stared at the cup, then the uncle. A trap? Or hospitality?” The line takes about 5.2 seconds; leave the last second free of speech so the moment can land. Music: music nearly silent. Sound effects: tiny gulp, uneasy hum, timed to the action. Ambience: sunlit street ambience: wind and distant clatter, no words. Final reminder: no character says any word; only the voice-over narration speaks (voice only, nobody on screen is the narrator). Natural laughs, gasps and sighs are fine. No text, captions or logos in the frame.</w:t>
       </w:r>
     </w:p>
     <w:p>
@@ -2592,7 +2592,7 @@
           <w:sz w:val="20"/>
           <w:szCs w:val="20"/>
         </w:rPr>
-        <w:t xml:space="preserve">VOICE RULE: only the voice-over narration speaks words; it is a voice only, never a person or character on screen. No character says any word and no one on screen lip-syncs to speech; characters communicate with facial expressions and body gestures. Natural non-verbal sounds are allowed and should sound real: laughing, giggling, gasping, sighing, groaning, cheering, coughing. Attached reference images, in order: the Roman soldiers, the wedding courtyard. 2D hand-drawn stickman cartoon in the exact style of the reference images: thin black outlines, large expressive heads, thin stick arms, flat warm colors, playful documentary-comedy tone, 16:9. Characters, identical in every frame: the Roman soldiers: crimson plumed helmets, steel armor, red cloaks, rectangular red shields. Setting: sunny daytime wedding courtyard in ancient Alexandria, sandstone columns with painted blue-and-gold bands, long tables with white cloths and clay jars, orange cloth awnings, and a tall wooden entrance gate at the back-center that opens onto the street. Two Roman soldiers in the foreground, the feast table with roast goose, bread and fruit behind them. Their serious faces soften as they turn their heads toward the food; one leans slightly forward. Camera: locked-off and perfectly still, eye-level wide-medium shot: the soldiers in the foreground, the feast table behind them; they turn their heads toward it; the framing never changes (no tilt, pan, zoom or rising camera). Audio: voice-over narration only (a voice, never shown on screen; no narrator character appears): a British male voice, warm and dry, begins speaking within half a second and says: “Then the Romans saw the food. Military discipline lasted about four seconds.” Music: playful comic percussion over the wedding rhythm, low under the voice. Sound effects: stomach growl, sniff. Final reminder: no character says any word; only the voice-over narration speaks (voice only, nobody on screen is the narrator). Natural laughs, gasps and sighs are fine. No text, captions or logos in the frame.</w:t>
+        <w:t xml:space="preserve">VOICE RULE: only the voice-over narration speaks words; it is a voice only, never a person or character on screen. No character says any word and no one on screen lip-syncs to speech; characters communicate with facial expressions and body gestures. Natural non-verbal sounds are allowed and should sound real: laughing, giggling, gasping, sighing, groaning, cheering, coughing. Attached reference images, in order: the Roman soldiers, the wedding courtyard. 2D hand-drawn stickman cartoon in the exact style of the reference images: thin black outlines, large expressive heads, thin stick arms, flat warm colors, playful documentary-comedy tone, 16:9. Characters, identical in every frame: the Roman soldiers: crimson plumed helmets, steel armor, red cloaks, rectangular red shields. Setting: sunny daytime wedding courtyard in ancient Alexandria, sandstone columns with painted blue-and-gold bands, long tables with white cloths and clay jars, orange cloth awnings, and a tall wooden entrance gate at the back-center that opens onto the street. Lighting: warm bright afternoon sunlight, soft shadows, rich saturated colors. ACTION TIMELINE (8 seconds): 0–2.5 s: two Roman soldiers in the foreground scan the area with serious faces, the feast table behind them. 2.5–5.5 s: they turn their heads toward the roast goose, bread and fruit and their expressions soften. 5.5–8 s: one leans slightly forward, nostrils flaring, his stomach growls and the other glances at him. Camera: locked-off and perfectly still, eye-level wide-medium shot: the soldiers in the foreground, the feast table behind them; they turn their heads toward it; the framing never changes (no tilt, pan, zoom or rising camera). Audio: voice-over narration only (a voice, never shown on screen; no narrator character appears): a British male voice, warm and dry, begins speaking within half a second and says: “Then the Romans saw the food. Military discipline lasted about four seconds.” The line takes about 4.8 seconds; leave the last second free of speech so the moment can land. Music: playful comic percussion over the wedding rhythm, low under the voice. Sound effects: stomach growl, sniff, timed to the action. Ambience: light courtyard ambience: clinking cups, footsteps on stone, a soft breeze, no words. Final reminder: no character says any word; only the voice-over narration speaks (voice only, nobody on screen is the narrator). Natural laughs, gasps and sighs are fine. No text, captions or logos in the frame.</w:t>
       </w:r>
     </w:p>
     <w:p>
@@ -2665,7 +2665,7 @@
           <w:sz w:val="20"/>
           <w:szCs w:val="20"/>
         </w:rPr>
-        <w:t xml:space="preserve">VOICE RULE: only the voice-over narration speaks words; it is a voice only, never a person or character on screen. No character says any word and no one on screen lip-syncs to speech; characters communicate with facial expressions and body gestures. Natural non-verbal sounds are allowed and should sound real: laughing, giggling, gasping, sighing, groaning, cheering, coughing. Attached reference images, in order: the Roman soldiers, the Egyptian wedding guests, the wedding courtyard. 2D hand-drawn stickman cartoon in the exact style of the reference images: thin black outlines, large expressive heads, thin stick arms, flat warm colors, playful documentary-comedy tone, 16:9. Characters, identical in every frame: the Roman soldiers: crimson plumed helmets, steel armor, red cloaks, rectangular red shields. the guests: Egyptian wedding guests in white linen with blue-and-gold collars and gold headbands, black bob hairstyles, some in white striped headdresses. Setting: sunny daytime wedding courtyard in ancient Alexandria, sandstone columns with painted blue-and-gold bands, long tables with white cloths and clay jars, orange cloth awnings, and a tall wooden entrance gate at the back-center that opens onto the street. One Roman soldier steps awkwardly onto the dance floor. The Egyptian guests stare in silence. Then one guest begins to copy his stiff step. Camera: locked-off and perfectly still, eye-level wide shot; the framing never changes (no tilt, pan, zoom or rising camera). Audio: voice-over narration only (a voice, never shown on screen; no narrator character appears): a British male voice, warm and dry, begins speaking within half a second and says: “One soldier stepped into the dance. Nobody stopped him. Somehow, it worked.” Music: playful comic percussion over the wedding rhythm, low under the voice. Sound effects: shield tap blending into the rhythm, clapping. Final reminder: no character says any word; only the voice-over narration speaks (voice only, nobody on screen is the narrator). Natural laughs, gasps and sighs are fine. No text, captions or logos in the frame.</w:t>
+        <w:t xml:space="preserve">VOICE RULE: only the voice-over narration speaks words; it is a voice only, never a person or character on screen. No character says any word and no one on screen lip-syncs to speech; characters communicate with facial expressions and body gestures. Natural non-verbal sounds are allowed and should sound real: laughing, giggling, gasping, sighing, groaning, cheering, coughing. Attached reference images, in order: the Roman soldiers, the Egyptian wedding guests, the wedding courtyard. 2D hand-drawn stickman cartoon in the exact style of the reference images: thin black outlines, large expressive heads, thin stick arms, flat warm colors, playful documentary-comedy tone, 16:9. Characters, identical in every frame: the guests: Egyptian wedding guests in white linen with blue-and-gold collars and gold headbands, black bob hairstyles, some in white striped headdresses. the Roman soldiers: crimson plumed helmets, steel armor, red cloaks, rectangular red shields. Setting: sunny daytime wedding courtyard in ancient Alexandria, sandstone columns with painted blue-and-gold bands, long tables with white cloths and clay jars, orange cloth awnings, and a tall wooden entrance gate at the back-center that opens onto the street. Lighting: warm bright afternoon sunlight, soft shadows, rich saturated colors. ACTION TIMELINE (8 seconds): 0–2.5 s: Egyptian guests dance in the courtyard. 2.5–5.5 s: one Roman soldier steps awkwardly onto the dance floor, stiff as a board; the guests freeze and stare. 5.5–8 s: one guest begins to copy his stiff step and the others hesitate, then join in. Camera: locked-off and perfectly still, eye-level wide shot; the framing never changes (no tilt, pan, zoom or rising camera). Audio: voice-over narration only (a voice, never shown on screen; no narrator character appears): a British male voice, warm and dry, begins speaking within half a second and says: “One soldier stepped into the dance. Nobody stopped him. Somehow, it worked.” The line takes about 4.8 seconds; leave the last second free of speech so the moment can land. Music: playful comic percussion over the wedding rhythm, low under the voice. Sound effects: shield tap blending into the rhythm, clapping, timed to the action. Ambience: light courtyard ambience: clinking cups, footsteps on stone, a soft breeze, no words. Final reminder: no character says any word; only the voice-over narration speaks (voice only, nobody on screen is the narrator). Natural laughs, gasps and sighs are fine. No text, captions or logos in the frame.</w:t>
       </w:r>
     </w:p>
     <w:p>
@@ -2738,7 +2738,7 @@
           <w:sz w:val="20"/>
           <w:szCs w:val="20"/>
         </w:rPr>
-        <w:t xml:space="preserve">VOICE RULE: only the voice-over narration speaks words; it is a voice only, never a person or character on screen. No character says any word and no one on screen lip-syncs to speech; characters communicate with facial expressions and body gestures. Natural non-verbal sounds are allowed and should sound real: laughing, giggling, gasping, sighing, groaning, cheering, coughing. Attached reference images, in order: the Roman soldiers, the Egyptian wedding guests, the wedding courtyard. 2D hand-drawn stickman cartoon in the exact style of the reference images: thin black outlines, large expressive heads, thin stick arms, flat warm colors, playful documentary-comedy tone, 16:9. Characters, identical in every frame: the Roman soldiers: crimson plumed helmets, steel armor, red cloaks, rectangular red shields. the guests: Egyptian wedding guests in white linen with blue-and-gold collars and gold headbands, black bob hairstyles, some in white striped headdresses. Setting: sunny daytime wedding courtyard in ancient Alexandria, sandstone columns with painted blue-and-gold bands, long tables with white cloths and clay jars, orange cloth awnings, and a tall wooden entrance gate at the back-center that opens onto the street. Three Roman soldiers in full armor attempt the Egyptian dance, stiff but strangely synchronized, capes swaying; Egyptian dancers around them smile and clap. Camera: locked-off and perfectly still, eye-level wide shot of the dancing Romans; the framing never changes (no tilt, pan, zoom or rising camera). Audio: voice-over narration only (a voice, never shown on screen; no narrator character appears): a British male voice, warm and dry, begins speaking within half a second and says: “Roman engineering changed the world. Roman dancing did not.” Music: playful comic percussion over the wedding rhythm, low under the voice. Sound effects: armor clanking out of rhythm. Final reminder: no character says any word; only the voice-over narration speaks (voice only, nobody on screen is the narrator). Natural laughs, gasps and sighs are fine. No text, captions or logos in the frame.</w:t>
+        <w:t xml:space="preserve">VOICE RULE: only the voice-over narration speaks words; it is a voice only, never a person or character on screen. No character says any word and no one on screen lip-syncs to speech; characters communicate with facial expressions and body gestures. Natural non-verbal sounds are allowed and should sound real: laughing, giggling, gasping, sighing, groaning, cheering, coughing. Attached reference images, in order: the Roman soldiers, the Egyptian wedding guests, the wedding courtyard. 2D hand-drawn stickman cartoon in the exact style of the reference images: thin black outlines, large expressive heads, thin stick arms, flat warm colors, playful documentary-comedy tone, 16:9. Characters, identical in every frame: the Roman soldiers: crimson plumed helmets, steel armor, red cloaks, rectangular red shields. the guests: Egyptian wedding guests in white linen with blue-and-gold collars and gold headbands, black bob hairstyles, some in white striped headdresses. Setting: sunny daytime wedding courtyard in ancient Alexandria, sandstone columns with painted blue-and-gold bands, long tables with white cloths and clay jars, orange cloth awnings, and a tall wooden entrance gate at the back-center that opens onto the street. Lighting: warm bright afternoon sunlight, soft shadows, rich saturated colors. ACTION TIMELINE (6 seconds): 0–2 s: three Roman soldiers in full armor step to the right in a row, stiff but strangely synchronized, capes swaying, Egyptian dancers around them smiling and clapping. 2–4 s: they step to the left in unison. 4–6 s: all three raise one arm together in perfect unison, then stare at each other, confused. Camera: locked-off and perfectly still, eye-level wide shot of the dancing Romans; the framing never changes (no tilt, pan, zoom or rising camera). Audio: voice-over narration only (a voice, never shown on screen; no narrator character appears): a British male voice, warm and dry, begins speaking within half a second and says: “Roman engineering changed the world. Roman dancing did not.” The line takes about 3.6 seconds; leave the last second free of speech so the moment can land. Music: playful comic percussion over the wedding rhythm, low under the voice. Sound effects: armor clanking out of rhythm, timed to the action. Ambience: light courtyard ambience: clinking cups, footsteps on stone, a soft breeze, no words. Final reminder: no character says any word; only the voice-over narration speaks (voice only, nobody on screen is the narrator). Natural laughs, gasps and sighs are fine. No text, captions or logos in the frame.</w:t>
       </w:r>
     </w:p>
     <w:p>
@@ -2811,7 +2811,7 @@
           <w:sz w:val="20"/>
           <w:szCs w:val="20"/>
         </w:rPr>
-        <w:t xml:space="preserve">VOICE RULE: only the voice-over narration speaks words; it is a voice only, never a person or character on screen. No character says any word and no one on screen lip-syncs to speech; characters communicate with facial expressions and body gestures. Natural non-verbal sounds are allowed and should sound real: laughing, giggling, gasping, sighing, groaning, cheering, coughing. Attached reference images, in order: Senbi, the groom, the Roman soldiers, the wedding courtyard. 2D hand-drawn stickman cartoon in the exact style of the reference images: thin black outlines, large expressive heads, thin stick arms, flat warm colors, playful documentary-comedy tone, 16:9. Characters, identical in every frame: Senbi the groom: young man, straight black bowl-cut hair with bangs, gold headband with a gold cobra, bare chest, blue-and-gold broad collar, gold bracers, white kilt with a blue-and-gold sash, brown sandals, thin black stick arms. the Roman soldiers: crimson plumed helmets, steel armor, red cloaks, rectangular red shields. Setting: sunny daytime wedding courtyard in ancient Alexandria, sandstone columns with painted blue-and-gold bands, long tables with white cloths and clay jars, orange cloth awnings, and a tall wooden entrance gate at the back-center that opens onto the street. Senbi dances proudly beside a Roman soldier and gestures for him to follow. The soldier hesitates, then copies Senbi's arm movement. Camera: locked-off and perfectly still, eye-level medium two-shot; the framing never changes (no tilt, pan, zoom or rising camera). Audio: voice-over narration only (a voice, never shown on screen; no narrator character appears): a British male voice, warm and dry, begins speaking within half a second and says: “Senbi, ever the host, invited one to join. Of course he did.” Music: playful comic percussion over the wedding rhythm, low under the voice. Sound effects: laughter, hand claps. Final reminder: no character says any word; only the voice-over narration speaks (voice only, nobody on screen is the narrator). Natural laughs, gasps and sighs are fine. No text, captions or logos in the frame.</w:t>
+        <w:t xml:space="preserve">VOICE RULE: only the voice-over narration speaks words; it is a voice only, never a person or character on screen. No character says any word and no one on screen lip-syncs to speech; characters communicate with facial expressions and body gestures. Natural non-verbal sounds are allowed and should sound real: laughing, giggling, gasping, sighing, groaning, cheering, coughing. Attached reference images, in order: Senbi, the groom, the Roman soldiers, the wedding courtyard. 2D hand-drawn stickman cartoon in the exact style of the reference images: thin black outlines, large expressive heads, thin stick arms, flat warm colors, playful documentary-comedy tone, 16:9. Characters, identical in every frame: Senbi the groom: young man, straight black bowl-cut hair with bangs, gold headband with a gold cobra, bare chest, blue-and-gold broad collar, gold bracers, white kilt with a blue-and-gold sash, brown sandals, thin black stick arms. the Roman soldiers: crimson plumed helmets, steel armor, red cloaks, rectangular red shields. Setting: sunny daytime wedding courtyard in ancient Alexandria, sandstone columns with painted blue-and-gold bands, long tables with white cloths and clay jars, orange cloth awnings, and a tall wooden entrance gate at the back-center that opens onto the street. Lighting: warm bright afternoon sunlight, soft shadows, rich saturated colors. ACTION TIMELINE (8 seconds): 0–2.5 s: Senbi dances proudly beside a Roman soldier, beaming. 2.5–5.5 s: he waves his arm wildly, gesturing for the soldier to follow. 5.5–8 s: the soldier hesitates, then copies Senbi's arm movement stiffly with a flicker of a smile. Camera: locked-off and perfectly still, eye-level medium two-shot; the framing never changes (no tilt, pan, zoom or rising camera). Audio: voice-over narration only (a voice, never shown on screen; no narrator character appears): a British male voice, warm and dry, begins speaking within half a second and says: “Senbi, ever the host, invited one to join. Of course he did.” The line takes about 4.8 seconds; leave the last second free of speech so the moment can land. Music: playful comic percussion over the wedding rhythm, low under the voice. Sound effects: laughter, hand claps, timed to the action. Ambience: light courtyard ambience: clinking cups, footsteps on stone, a soft breeze, no words. Final reminder: no character says any word; only the voice-over narration speaks (voice only, nobody on screen is the narrator). Natural laughs, gasps and sighs are fine. No text, captions or logos in the frame.</w:t>
       </w:r>
     </w:p>
     <w:p>
@@ -2884,7 +2884,7 @@
           <w:sz w:val="20"/>
           <w:szCs w:val="20"/>
         </w:rPr>
-        <w:t xml:space="preserve">VOICE RULE: only the voice-over narration speaks words; it is a voice only, never a person or character on screen. No character says any word and no one on screen lip-syncs to speech; characters communicate with facial expressions and body gestures. Natural non-verbal sounds are allowed and should sound real: laughing, giggling, gasping, sighing, groaning, cheering, coughing. Attached reference images, in order: the bride, Senbi, the groom, the Roman soldiers. 2D hand-drawn stickman cartoon in the exact style of the reference images: thin black outlines, large expressive heads, thin stick arms, flat warm colors, playful documentary-comedy tone, 16:9. Characters, identical in every frame: the bride: black bob hair with straight bangs, gold headband with a red gem, white dress, blue-and-gold collar, gold sash, gold arm cuffs, light veil. Setting: sunny daytime wedding courtyard in ancient Alexandria, sandstone columns with painted blue-and-gold bands, long tables with white cloths and clay jars, orange cloth awnings, and a tall wooden entrance gate at the back-center that opens onto the street. The bride watches Senbi dancing with the Romans. She slowly covers her face with her hand. Camera: locked-off and perfectly still, eye-level medium close-up of the bride; the framing never changes (no tilt, pan, zoom or rising camera). Audio: voice-over narration only (a voice, never shown on screen; no narrator character appears): a British male voice, warm and dry, begins speaking within half a second and says: “His bride slowly covered her face. This was not in the contract.” Music: playful comic percussion over the wedding rhythm, low under the voice. Sound effects: gasp, muffled laugh. Final reminder: no character says any word; only the voice-over narration speaks (voice only, nobody on screen is the narrator). Natural laughs, gasps and sighs are fine. No text, captions or logos in the frame.</w:t>
+        <w:t xml:space="preserve">VOICE RULE: only the voice-over narration speaks words; it is a voice only, never a person or character on screen. No character says any word and no one on screen lip-syncs to speech; characters communicate with facial expressions and body gestures. Natural non-verbal sounds are allowed and should sound real: laughing, giggling, gasping, sighing, groaning, cheering, coughing. Attached reference images, in order: the bride, Senbi, the groom, the Roman soldiers. 2D hand-drawn stickman cartoon in the exact style of the reference images: thin black outlines, large expressive heads, thin stick arms, flat warm colors, playful documentary-comedy tone, 16:9. Characters, identical in every frame: the bride: black bob hair with straight bangs, gold headband with a red gem, white dress, blue-and-gold collar, gold sash, gold arm cuffs, light veil. Setting: sunny daytime wedding courtyard in ancient Alexandria, sandstone columns with painted blue-and-gold bands, long tables with white cloths and clay jars, orange cloth awnings, and a tall wooden entrance gate at the back-center that opens onto the street. Lighting: warm bright afternoon sunlight, soft shadows, rich saturated colors. ACTION TIMELINE (8 seconds): 0–2.5 s: the bride watches, amused, with polite delight. 2.5–5.5 s: her smile freezes as she sees Senbi dancing with the Romans. 5.5–8 s: she slowly lifts a hand and covers her face, shoulders shaking. Camera: locked-off and perfectly still, eye-level medium close-up of the bride; the framing never changes (no tilt, pan, zoom or rising camera). Audio: voice-over narration only (a voice, never shown on screen; no narrator character appears): a British male voice, warm and dry, begins speaking within half a second and says: “His bride slowly covered her face. This was not in the contract.” The line takes about 4.8 seconds; leave the last second free of speech so the moment can land. Music: playful comic percussion over the wedding rhythm, low under the voice. Sound effects: gasp, muffled laugh, timed to the action. Ambience: light courtyard ambience: clinking cups, footsteps on stone, a soft breeze, no words. Final reminder: no character says any word; only the voice-over narration speaks (voice only, nobody on screen is the narrator). Natural laughs, gasps and sighs are fine. No text, captions or logos in the frame.</w:t>
       </w:r>
     </w:p>
     <w:p>
@@ -2957,7 +2957,7 @@
           <w:sz w:val="20"/>
           <w:szCs w:val="20"/>
         </w:rPr>
-        <w:t xml:space="preserve">VOICE RULE: only the voice-over narration speaks words; it is a voice only, never a person or character on screen. No character says any word and no one on screen lip-syncs to speech; characters communicate with facial expressions and body gestures. Natural non-verbal sounds are allowed and should sound real: laughing, giggling, gasping, sighing, groaning, cheering, coughing. Attached reference images, in order: Senbi, the groom, the bride, the Egyptian wedding guests. 2D hand-drawn stickman cartoon in the exact style of the reference images: thin black outlines, large expressive heads, thin stick arms, flat warm colors, playful documentary-comedy tone, 16:9. Characters, identical in every frame: Senbi the groom: young man, straight black bowl-cut hair with bangs, gold headband with a gold cobra, bare chest, blue-and-gold broad collar, gold bracers, white kilt with a blue-and-gold sash, brown sandals, thin black stick arms. the bride: black bob hair with straight bangs, gold headband with a red gem, white dress, blue-and-gold collar, gold sash, gold arm cuffs, light veil. the Roman soldiers: crimson plumed helmets, steel armor, red cloaks, rectangular red shields. the guests: Egyptian wedding guests in white linen with blue-and-gold collars and gold headbands, black bob hairstyles, some in white striped headdresses. the musicians: guests in white linen playing harp, frame drum and reed flute. Setting: sunny daytime wedding courtyard in ancient Alexandria, sandstone columns with painted blue-and-gold bands, long tables with white cloths and clay jars, orange cloth awnings, and a tall wooden entrance gate at the back-center that opens onto the street. Joyful chaos: Egyptians and Romans dance together, musicians struggle to keep the rhythm, a plate of food is passed along. Senbi is delighted; the bride looks overwhelmed. Keep no more than eight characters visible. Camera: locked-off and perfectly still, eye-level wide shot of the whole courtyard; the framing never changes (no tilt, pan, zoom or rising camera). Audio: voice-over narration only (a voice, never shown on screen; no narrator character appears): a British male voice, warm and dry, begins speaking within half a second and says: “Soon, Egyptians and Romans were passing food and stepping on each other's feet.” Music: playful comic percussion over the wedding rhythm, low under the voice. Sound effects: laughter, plates, music chaos. Final reminder: no character says any word; only the voice-over narration speaks (voice only, nobody on screen is the narrator). Natural laughs, gasps and sighs are fine. No text, captions or logos in the frame.</w:t>
+        <w:t xml:space="preserve">VOICE RULE: only the voice-over narration speaks words; it is a voice only, never a person or character on screen. No character says any word and no one on screen lip-syncs to speech; characters communicate with facial expressions and body gestures. Natural non-verbal sounds are allowed and should sound real: laughing, giggling, gasping, sighing, groaning, cheering, coughing. Attached reference images, in order: Senbi, the groom, the bride, the Egyptian wedding guests. 2D hand-drawn stickman cartoon in the exact style of the reference images: thin black outlines, large expressive heads, thin stick arms, flat warm colors, playful documentary-comedy tone, 16:9. Characters, identical in every frame: Senbi the groom: young man, straight black bowl-cut hair with bangs, gold headband with a gold cobra, bare chest, blue-and-gold broad collar, gold bracers, white kilt with a blue-and-gold sash, brown sandals, thin black stick arms. the bride: black bob hair with straight bangs, gold headband with a red gem, white dress, blue-and-gold collar, gold sash, gold arm cuffs, light veil. the guests: Egyptian wedding guests in white linen with blue-and-gold collars and gold headbands, black bob hairstyles, some in white striped headdresses. the Roman soldiers: crimson plumed helmets, steel armor, red cloaks, rectangular red shields. the musicians: guests in white linen playing harp, frame drum and reed flute. Setting: sunny daytime wedding courtyard in ancient Alexandria, sandstone columns with painted blue-and-gold bands, long tables with white cloths and clay jars, orange cloth awnings, and a tall wooden entrance gate at the back-center that opens onto the street. Lighting: warm bright afternoon sunlight, soft shadows, rich saturated colors. ACTION TIMELINE (8 seconds): 0–2.5 s: Egyptians and Romans dance together off the beat while musicians struggle to keep the rhythm. 2.5–5.5 s: a plate of food is passed hand to hand and a soldier takes a fig. 5.5–8 s: Senbi is delighted in the center while the bride at the side holds her forehead, overwhelmed. Camera: locked-off and perfectly still, eye-level wide shot of the whole courtyard; the framing never changes (no tilt, pan, zoom or rising camera). Audio: voice-over narration only (a voice, never shown on screen; no narrator character appears): a British male voice, warm and dry, begins speaking within half a second and says: “Soon, Egyptians and Romans were passing food and stepping on each other's feet.” The line takes about 5.2 seconds; leave the last second free of speech so the moment can land. Music: playful comic percussion over the wedding rhythm, low under the voice. Sound effects: laughter, plates, music chaos, timed to the action. Ambience: light courtyard ambience: clinking cups, footsteps on stone, a soft breeze, no words. Final reminder: no character says any word; only the voice-over narration speaks (voice only, nobody on screen is the narrator). Natural laughs, gasps and sighs are fine. No text, captions or logos in the frame.</w:t>
       </w:r>
     </w:p>
     <w:p>
@@ -3030,7 +3030,7 @@
           <w:sz w:val="20"/>
           <w:szCs w:val="20"/>
         </w:rPr>
-        <w:t xml:space="preserve">VOICE RULE: only the voice-over narration speaks words; it is a voice only, never a person or character on screen. No character says any word and no one on screen lip-syncs to speech; characters communicate with facial expressions and body gestures. Natural non-verbal sounds are allowed and should sound real: laughing, giggling, gasping, sighing, groaning, cheering, coughing. Attached reference images, in order: the Egyptian wedding guests, the Roman soldiers, the wedding courtyard. 2D hand-drawn stickman cartoon in the exact style of the reference images: thin black outlines, large expressive heads, thin stick arms, flat warm colors, playful documentary-comedy tone, 16:9. Characters, identical in every frame: the Roman soldiers: crimson plumed helmets, steel armor, red cloaks, rectangular red shields. the guests: Egyptian wedding guests in white linen with blue-and-gold collars and gold headbands, black bob hairstyles, some in white striped headdresses. Setting: sunny daytime wedding courtyard in ancient Alexandria, sandstone columns with painted blue-and-gold bands, long tables with white cloths and clay jars, orange cloth awnings, and a tall wooden entrance gate at the back-center that opens onto the street. A sharp horn blast: everyone freezes mid-step, Egyptians and Romans together, in a comic tableau. Camera: locked-off and perfectly still, eye-level wide shot; the framing never changes (no tilt, pan, zoom or rising camera). Audio: voice-over narration only (a voice, never shown on screen; no narrator character appears): a British male voice, warm and dry, begins speaking within half a second and says: “Then a horn cut through the music, and everyone froze mid-step.” Music: music nearly silent. Sound effects: sharp military horn, then silence. Final reminder: no character says any word; only the voice-over narration speaks (voice only, nobody on screen is the narrator). Natural laughs, gasps and sighs are fine. No text, captions or logos in the frame.</w:t>
+        <w:t xml:space="preserve">VOICE RULE: only the voice-over narration speaks words; it is a voice only, never a person or character on screen. No character says any word and no one on screen lip-syncs to speech; characters communicate with facial expressions and body gestures. Natural non-verbal sounds are allowed and should sound real: laughing, giggling, gasping, sighing, groaning, cheering, coughing. Attached reference images, in order: the Egyptian wedding guests, the Roman soldiers, the wedding courtyard. 2D hand-drawn stickman cartoon in the exact style of the reference images: thin black outlines, large expressive heads, thin stick arms, flat warm colors, playful documentary-comedy tone, 16:9. Characters, identical in every frame: Senbi the groom: young man, straight black bowl-cut hair with bangs, gold headband with a gold cobra, bare chest, blue-and-gold broad collar, gold bracers, white kilt with a blue-and-gold sash, brown sandals, thin black stick arms. the guests: Egyptian wedding guests in white linen with blue-and-gold collars and gold headbands, black bob hairstyles, some in white striped headdresses. the Roman soldiers: crimson plumed helmets, steel armor, red cloaks, rectangular red shields. Setting: sunny daytime wedding courtyard in ancient Alexandria, sandstone columns with painted blue-and-gold bands, long tables with white cloths and clay jars, orange cloth awnings, and a tall wooden entrance gate at the back-center that opens onto the street. Lighting: warm bright afternoon sunlight, soft shadows, rich saturated colors. ACTION TIMELINE (8 seconds): 0–2 s: the dance is in full swing. 2–3 s: a sharp military horn blasts. 3–8 s: everyone freezes mid-step, Egyptians and Romans together, in a comic tableau: a soldier on one leg, a guest mid-spin, Senbi with arms raised, eyes darting toward the gate; hold completely still. Camera: locked-off and perfectly still, eye-level wide shot; the framing never changes (no tilt, pan, zoom or rising camera). Audio: voice-over narration only (a voice, never shown on screen; no narrator character appears): a British male voice, warm and dry, begins speaking within half a second and says: “Then a horn cut through the music, and everyone froze mid-step.” The line takes about 4.4 seconds; leave the last second free of speech so the moment can land. Music: music nearly silent. Sound effects: sharp military horn, then silence, timed to the action. Ambience: light courtyard ambience: clinking cups, footsteps on stone, a soft breeze, no words. Final reminder: no character says any word; only the voice-over narration speaks (voice only, nobody on screen is the narrator). Natural laughs, gasps and sighs are fine. No text, captions or logos in the frame.</w:t>
       </w:r>
     </w:p>
     <w:p>
@@ -3103,7 +3103,7 @@
           <w:sz w:val="20"/>
           <w:szCs w:val="20"/>
         </w:rPr>
-        <w:t xml:space="preserve">VOICE RULE: only the voice-over narration speaks words; it is a voice only, never a person or character on screen. No character says any word and no one on screen lip-syncs to speech; characters communicate with facial expressions and body gestures. Natural non-verbal sounds are allowed and should sound real: laughing, giggling, gasping, sighing, groaning, cheering, coughing. Attached reference images, in order: the Roman commander, the Roman soldiers, the wedding courtyard. 2D hand-drawn stickman cartoon in the exact style of the reference images: thin black outlines, large expressive heads, thin stick arms, flat warm colors, playful documentary-comedy tone, 16:9. Characters, identical in every frame: the Roman commander: dark curly gray-streaked hair, gold laurel wreath, bronze-and-gold armor, red cloak. the Roman soldiers: crimson plumed helmets, steel armor, red cloaks, rectangular red shields. Setting: sunny daytime wedding courtyard in ancient Alexandria, sandstone columns with painted blue-and-gold bands, long tables with white cloths and clay jars, orange cloth awnings, and a tall wooden entrance gate at the back-center that opens onto the street. A Roman commander in bronze-and-gold armor walks calmly through the open gate holding a scroll. The dancing soldiers step aside. The courtyard falls silent. The commander wears a gold laurel wreath and a red cloak; no banner, no lettering. Camera: locked-off and perfectly still, fixed, slightly low angle that never tilts, on the commander walking in; the framing never changes (no tilt, pan, zoom or rising camera). Audio: voice-over narration only (a voice, never shown on screen; no narrator character appears): a British male voice, warm and dry, begins speaking within half a second and says: “And in walked the commander. The only adult in the building.” Music: low sustained tension with distant marching drums, almost silent. Sound effects: slow footsteps, cloak rustle. Final reminder: no character says any word; only the voice-over narration speaks (voice only, nobody on screen is the narrator). Natural laughs, gasps and sighs are fine. No text, captions or logos in the frame.</w:t>
+        <w:t xml:space="preserve">VOICE RULE: only the voice-over narration speaks words; it is a voice only, never a person or character on screen. No character says any word and no one on screen lip-syncs to speech; characters communicate with facial expressions and body gestures. Natural non-verbal sounds are allowed and should sound real: laughing, giggling, gasping, sighing, groaning, cheering, coughing. Attached reference images, in order: the Roman commander, the Roman soldiers, the wedding courtyard. 2D hand-drawn stickman cartoon in the exact style of the reference images: thin black outlines, large expressive heads, thin stick arms, flat warm colors, playful documentary-comedy tone, 16:9. Characters, identical in every frame: the Roman commander: dark curly gray-streaked hair, gold laurel wreath, bronze-and-gold armor, red cloak. the Roman soldiers: crimson plumed helmets, steel armor, red cloaks, rectangular red shields. Setting: sunny daytime wedding courtyard in ancient Alexandria, sandstone columns with painted blue-and-gold bands, long tables with white cloths and clay jars, orange cloth awnings, and a tall wooden entrance gate at the back-center that opens onto the street. Lighting: warm bright afternoon sunlight, soft shadows, rich saturated colors. ACTION TIMELINE (8 seconds): 0–2 s: the tall wooden gate swings fully open. 2–5 s: the Roman commander walks calmly through, scroll in hand, red cloak swaying, while the dancing soldiers step aside. 5–8 s: he stops in the center and the courtyard falls silent, everyone looking at him. Camera: locked-off and perfectly still, fixed, slightly low angle that never tilts, on the commander walking in; the framing never changes (no tilt, pan, zoom or rising camera). Audio: voice-over narration only (a voice, never shown on screen; no narrator character appears): a British male voice, warm and dry, begins speaking within half a second and says: “And in walked the commander. The only adult in the building.” The line takes about 4.4 seconds; leave the last second free of speech so the moment can land. Music: low sustained tension with distant marching drums, almost silent. Sound effects: slow footsteps, cloak rustle, timed to the action. Ambience: light courtyard ambience: clinking cups, footsteps on stone, a soft breeze, no words. Final reminder: no character says any word; only the voice-over narration speaks (voice only, nobody on screen is the narrator). Natural laughs, gasps and sighs are fine. No text, captions or logos in the frame.</w:t>
       </w:r>
     </w:p>
     <w:p>
@@ -3176,7 +3176,7 @@
           <w:sz w:val="20"/>
           <w:szCs w:val="20"/>
         </w:rPr>
-        <w:t xml:space="preserve">VOICE RULE: only the voice-over narration speaks words; it is a voice only, never a person or character on screen. No character says any word and no one on screen lip-syncs to speech; characters communicate with facial expressions and body gestures. Natural non-verbal sounds are allowed and should sound real: laughing, giggling, gasping, sighing, groaning, cheering, coughing. Attached reference images, in order: the Roman commander, Senbi, the groom, the bride. 2D hand-drawn stickman cartoon in the exact style of the reference images: thin black outlines, large expressive heads, thin stick arms, flat warm colors, playful documentary-comedy tone, 16:9. Characters, identical in every frame: the Roman commander: dark curly gray-streaked hair, gold laurel wreath, bronze-and-gold armor, red cloak. Setting: sunny daytime wedding courtyard in ancient Alexandria, sandstone columns with painted blue-and-gold bands, long tables with white cloths and clay jars, orange cloth awnings, and a tall wooden entrance gate at the back-center that opens onto the street. The commander stands serious and still. He slowly turns his head: the dancing soldiers, the food, the bride and groom, the decorations. He stays completely serious. The commander wears a gold laurel wreath and a red cloak; no banner, no lettering. Camera: locked-off and perfectly still, eye-level medium shot of the commander; he turns his head, the camera does not pan; the framing never changes (no tilt, pan, zoom or rising camera). Audio: voice-over narration only (a voice, never shown on screen; no narrator character appears): a British male voice, warm and dry, begins speaking within half a second and says: “He saw his soldiers dancing. The food. The bride. The groom. The cat.” Music: music nearly silent. Sound effects: quiet room tone, fire crackle. Final reminder: no character says any word; only the voice-over narration speaks (voice only, nobody on screen is the narrator). Natural laughs, gasps and sighs are fine. No text, captions or logos in the frame.</w:t>
+        <w:t xml:space="preserve">VOICE RULE: only the voice-over narration speaks words; it is a voice only, never a person or character on screen. No character says any word and no one on screen lip-syncs to speech; characters communicate with facial expressions and body gestures. Natural non-verbal sounds are allowed and should sound real: laughing, giggling, gasping, sighing, groaning, cheering, coughing. Attached reference images, in order: the Roman commander, Senbi, the groom, the bride. 2D hand-drawn stickman cartoon in the exact style of the reference images: thin black outlines, large expressive heads, thin stick arms, flat warm colors, playful documentary-comedy tone, 16:9. Characters, identical in every frame: the Roman commander: dark curly gray-streaked hair, gold laurel wreath, bronze-and-gold armor, red cloak. Setting: sunny daytime wedding courtyard in ancient Alexandria, sandstone columns with painted blue-and-gold bands, long tables with white cloths and clay jars, orange cloth awnings, and a tall wooden entrance gate at the back-center that opens onto the street. Lighting: warm bright afternoon sunlight, soft shadows, rich saturated colors. ACTION TIMELINE (8 seconds): 0–2.5 s: the commander stands serious and still, scroll in hand. 2.5–5.5 s: he slowly turns his head to the left toward the dancing soldiers. 5.5–8 s: he turns toward the food table, then toward the decorations on the right; his face never changes except for one tiny eyebrow twitch. Camera: locked-off and perfectly still, eye-level medium shot of the commander; he turns his head, the camera does not pan; the framing never changes (no tilt, pan, zoom or rising camera). Audio: voice-over narration only (a voice, never shown on screen; no narrator character appears): a British male voice, warm and dry, begins speaking within half a second and says: “He saw his soldiers dancing. The food. The bride. The groom. The cat.” The line takes about 5.2 seconds; leave the last second free of speech so the moment can land. Music: music nearly silent. Sound effects: quiet room tone, fire crackle, timed to the action. Ambience: light courtyard ambience: clinking cups, footsteps on stone, a soft breeze, no words. Final reminder: no character says any word; only the voice-over narration speaks (voice only, nobody on screen is the narrator). Natural laughs, gasps and sighs are fine. No text, captions or logos in the frame.</w:t>
       </w:r>
     </w:p>
     <w:p>
@@ -3249,7 +3249,7 @@
           <w:sz w:val="20"/>
           <w:szCs w:val="20"/>
         </w:rPr>
-        <w:t xml:space="preserve">VOICE RULE: only the voice-over narration speaks words; it is a voice only, never a person or character on screen. No character says any word and no one on screen lip-syncs to speech; characters communicate with facial expressions and body gestures. Natural non-verbal sounds are allowed and should sound real: laughing, giggling, gasping, sighing, groaning, cheering, coughing. Attached reference images, in order: the Roman commander, the black cat. 2D hand-drawn stickman cartoon in the exact style of the reference images: thin black outlines, large expressive heads, thin stick arms, flat warm colors, playful documentary-comedy tone, 16:9. Characters, identical in every frame: the Roman commander: dark curly gray-streaked hair, gold laurel wreath, bronze-and-gold armor, red cloak. the cat: black with a small gold collar. Setting: sunny daytime wedding courtyard in ancient Alexandria, sandstone columns with painted blue-and-gold bands, long tables with white cloths and clay jars, orange cloth awnings, and a tall wooden entrance gate at the back-center that opens onto the street. The commander stands in the foreground; behind him on the table the black cat with a small gold collar stares straight at him, unmoved. The commander's serious face twitches slightly. The commander wears a gold laurel wreath and a red cloak; no banner, no lettering. Camera: locked-off and perfectly still, eye-level medium two-shot: the commander in the foreground, the cat on the table behind him; no cutting; the framing never changes (no tilt, pan, zoom or rising camera). Audio: voice-over narration only (a voice, never shown on screen; no narrator character appears): a British male voice, warm and dry, begins speaking within half a second and says: “The cat looked back. The cat was not impressed by the Roman Empire.” Music: music nearly silent. Sound effects: cat meow, tiny sting. Final reminder: no character says any word; only the voice-over narration speaks (voice only, nobody on screen is the narrator). Natural laughs, gasps and sighs are fine. No text, captions or logos in the frame.</w:t>
+        <w:t xml:space="preserve">VOICE RULE: only the voice-over narration speaks words; it is a voice only, never a person or character on screen. No character says any word and no one on screen lip-syncs to speech; characters communicate with facial expressions and body gestures. Natural non-verbal sounds are allowed and should sound real: laughing, giggling, gasping, sighing, groaning, cheering, coughing. Attached reference images, in order: the Roman commander, the black cat. 2D hand-drawn stickman cartoon in the exact style of the reference images: thin black outlines, large expressive heads, thin stick arms, flat warm colors, playful documentary-comedy tone, 16:9. Characters, identical in every frame: the Roman commander: dark curly gray-streaked hair, gold laurel wreath, bronze-and-gold armor, red cloak. the cat: black with a small gold collar. Setting: sunny daytime wedding courtyard in ancient Alexandria, sandstone columns with painted blue-and-gold bands, long tables with white cloths and clay jars, orange cloth awnings, and a tall wooden entrance gate at the back-center that opens onto the street. Lighting: warm bright afternoon sunlight, soft shadows, rich saturated colors. ACTION TIMELINE (8 seconds): 0–2.5 s: the commander in the foreground; his eyes land on the black cat on the table behind him. 2.5–5.5 s: the cat stares straight back, unblinking. 5.5–8 s: a muscle in the commander's jaw twitches and he looks away first. Camera: locked-off and perfectly still, eye-level medium two-shot: the commander in the foreground, the cat on the table behind him; no cutting; the framing never changes (no tilt, pan, zoom or rising camera). Audio: voice-over narration only (a voice, never shown on screen; no narrator character appears): a British male voice, warm and dry, begins speaking within half a second and says: “The cat looked back. The cat was not impressed by the Roman Empire.” The line takes about 5.2 seconds; leave the last second free of speech so the moment can land. Music: music nearly silent. Sound effects: cat meow, tiny sting, timed to the action. Ambience: light courtyard ambience: clinking cups, footsteps on stone, a soft breeze, no words. Final reminder: no character says any word; only the voice-over narration speaks (voice only, nobody on screen is the narrator). Natural laughs, gasps and sighs are fine. No text, captions or logos in the frame.</w:t>
       </w:r>
     </w:p>
     <w:p>
@@ -3322,7 +3322,7 @@
           <w:sz w:val="20"/>
           <w:szCs w:val="20"/>
         </w:rPr>
-        <w:t xml:space="preserve">VOICE RULE: only the voice-over narration speaks words; it is a voice only, never a person or character on screen. No character says any word and no one on screen lip-syncs to speech; characters communicate with facial expressions and body gestures. Natural non-verbal sounds are allowed and should sound real: laughing, giggling, gasping, sighing, groaning, cheering, coughing. Attached reference images, in order: the Roman commander, the Egyptian wedding guests, Senbi, the groom. 2D hand-drawn stickman cartoon in the exact style of the reference images: thin black outlines, large expressive heads, thin stick arms, flat warm colors, playful documentary-comedy tone, 16:9. Characters, identical in every frame: the Roman commander: dark curly gray-streaked hair, gold laurel wreath, bronze-and-gold armor, red cloak. the Roman soldiers: crimson plumed helmets, steel armor, red cloaks, rectangular red shields. the guests: Egyptian wedding guests in white linen with blue-and-gold collars and gold headbands, black bob hairstyles, some in white striped headdresses. Setting: sunny daytime wedding courtyard in ancient Alexandria, sandstone columns with painted blue-and-gold bands, long tables with white cloths and clay jars, orange cloth awnings, and a tall wooden entrance gate at the back-center that opens onto the street. Symmetrical composition: the commander at the center unrolls his scroll while Egyptians and Romans stand silent on both sides. The commander wears a gold laurel wreath and a red cloak; no banner, no lettering. Camera: locked-off and perfectly still, symmetrical eye-level medium-wide shot; the framing never changes (no tilt, pan, zoom or rising camera). Audio: voice-over narration only (a voice, never shown on screen; no narrator character appears): a British male voice, warm and dry, begins speaking within half a second and says: “He unrolled the scroll. Message received: Egypt has new management.” Music: low sustained tension with distant marching drums, almost silent. Sound effects: scroll unrolling, one dramatic drum hit. Final reminder: no character says any word; only the voice-over narration speaks (voice only, nobody on screen is the narrator). Natural laughs, gasps and sighs are fine. No text, captions or logos in the frame.</w:t>
+        <w:t xml:space="preserve">VOICE RULE: only the voice-over narration speaks words; it is a voice only, never a person or character on screen. No character says any word and no one on screen lip-syncs to speech; characters communicate with facial expressions and body gestures. Natural non-verbal sounds are allowed and should sound real: laughing, giggling, gasping, sighing, groaning, cheering, coughing. Attached reference images, in order: the Roman commander, the Egyptian wedding guests, Senbi, the groom. 2D hand-drawn stickman cartoon in the exact style of the reference images: thin black outlines, large expressive heads, thin stick arms, flat warm colors, playful documentary-comedy tone, 16:9. Characters, identical in every frame: the Roman commander: dark curly gray-streaked hair, gold laurel wreath, bronze-and-gold armor, red cloak. the guests: Egyptian wedding guests in white linen with blue-and-gold collars and gold headbands, black bob hairstyles, some in white striped headdresses. the Roman soldiers: crimson plumed helmets, steel armor, red cloaks, rectangular red shields. Setting: sunny daytime wedding courtyard in ancient Alexandria, sandstone columns with painted blue-and-gold bands, long tables with white cloths and clay jars, orange cloth awnings, and a tall wooden entrance gate at the back-center that opens onto the street. Lighting: warm bright afternoon sunlight, soft shadows, rich saturated colors. ACTION TIMELINE (8 seconds): 0–2.5 s: the commander at the center lifts the scroll with both hands, Egyptians on his left and Romans on his right standing silent and still. 2.5–5.5 s: he unrolls it slowly, papyrus falling to his waist, only abstract marks on it. 5.5–8 s: he lifts his chin as if about to read; everyone is silent. Camera: locked-off and perfectly still, symmetrical eye-level medium-wide shot; the framing never changes (no tilt, pan, zoom or rising camera). Audio: voice-over narration only (a voice, never shown on screen; no narrator character appears): a British male voice, warm and dry, begins speaking within half a second and says: “He unrolled the scroll. Message received: Egypt has new management.” The line takes about 4.0 seconds; leave the last second free of speech so the moment can land. Music: low sustained tension with distant marching drums, almost silent. Sound effects: scroll unrolling, one dramatic drum hit, timed to the action. Ambience: light courtyard ambience: clinking cups, footsteps on stone, a soft breeze, no words. Final reminder: no character says any word; only the voice-over narration speaks (voice only, nobody on screen is the narrator). Natural laughs, gasps and sighs are fine. No text, captions or logos in the frame.</w:t>
       </w:r>
     </w:p>
     <w:p>
@@ -3395,7 +3395,7 @@
           <w:sz w:val="20"/>
           <w:szCs w:val="20"/>
         </w:rPr>
-        <w:t xml:space="preserve">VOICE RULE: only the voice-over narration speaks words; it is a voice only, never a person or character on screen. No character says any word and no one on screen lip-syncs to speech; characters communicate with facial expressions and body gestures. Natural non-verbal sounds are allowed and should sound real: laughing, giggling, gasping, sighing, groaning, cheering, coughing. Attached reference images, in order: Senbi, the groom, the bride, the Egyptian wedding guests. 2D hand-drawn stickman cartoon in the exact style of the reference images: thin black outlines, large expressive heads, thin stick arms, flat warm colors, playful documentary-comedy tone, 16:9. Characters, identical in every frame: Senbi the groom: young man, straight black bowl-cut hair with bangs, gold headband with a gold cobra, bare chest, blue-and-gold broad collar, gold bracers, white kilt with a blue-and-gold sash, brown sandals, thin black stick arms. the bride: black bob hair with straight bangs, gold headband with a red gem, white dress, blue-and-gold collar, gold sash, gold arm cuffs, light veil. Setting: sunny daytime wedding courtyard in ancient Alexandria, sandstone columns with painted blue-and-gold bands, long tables with white cloths and clay jars, orange cloth awnings, and a tall wooden entrance gate at the back-center that opens onto the street. Senbi turns slowly toward the bride; she looks back at him. Both realize the wedding has taken a very strange turn. Camera: locked-off and perfectly still, eye-level medium two-shot of Senbi and the bride; the framing never changes (no tilt, pan, zoom or rising camera). Audio: voice-over narration only (a voice, never shown on screen; no narrator character appears): a British male voice, warm and dry, begins speaking within half a second and says: “Senbi looked at his bride. Same question, silently: is the wedding still on?” Music: low sustained tension with distant marching drums, almost silent. Sound effects: nervous breath, single drum. Final reminder: no character says any word; only the voice-over narration speaks (voice only, nobody on screen is the narrator). Natural laughs, gasps and sighs are fine. No text, captions or logos in the frame.</w:t>
+        <w:t xml:space="preserve">VOICE RULE: only the voice-over narration speaks words; it is a voice only, never a person or character on screen. No character says any word and no one on screen lip-syncs to speech; characters communicate with facial expressions and body gestures. Natural non-verbal sounds are allowed and should sound real: laughing, giggling, gasping, sighing, groaning, cheering, coughing. Attached reference images, in order: Senbi, the groom, the bride, the Egyptian wedding guests. 2D hand-drawn stickman cartoon in the exact style of the reference images: thin black outlines, large expressive heads, thin stick arms, flat warm colors, playful documentary-comedy tone, 16:9. Characters, identical in every frame: Senbi the groom: young man, straight black bowl-cut hair with bangs, gold headband with a gold cobra, bare chest, blue-and-gold broad collar, gold bracers, white kilt with a blue-and-gold sash, brown sandals, thin black stick arms. the bride: black bob hair with straight bangs, gold headband with a red gem, white dress, blue-and-gold collar, gold sash, gold arm cuffs, light veil. Setting: sunny daytime wedding courtyard in ancient Alexandria, sandstone columns with painted blue-and-gold bands, long tables with white cloths and clay jars, orange cloth awnings, and a tall wooden entrance gate at the back-center that opens onto the street. Lighting: warm bright afternoon sunlight, soft shadows, rich saturated colors. ACTION TIMELINE (8 seconds): 0–2.5 s: Senbi and the bride look forward, shocked. 2.5–5.5 s: Senbi slowly turns his head toward the bride. 5.5–8 s: the bride turns to him, they exchange a wide-eyed look and Senbi forces a smile. Camera: locked-off and perfectly still, eye-level medium two-shot of Senbi and the bride; the framing never changes (no tilt, pan, zoom or rising camera). Audio: voice-over narration only (a voice, never shown on screen; no narrator character appears): a British male voice, warm and dry, begins speaking within half a second and says: “Senbi looked at his bride. Same question, silently: is the wedding still on?” The line takes about 5.2 seconds; leave the last second free of speech so the moment can land. Music: low sustained tension with distant marching drums, almost silent. Sound effects: nervous breath, single drum, timed to the action. Ambience: light courtyard ambience: clinking cups, footsteps on stone, a soft breeze, no words. Final reminder: no character says any word; only the voice-over narration speaks (voice only, nobody on screen is the narrator). Natural laughs, gasps and sighs are fine. No text, captions or logos in the frame.</w:t>
       </w:r>
     </w:p>
     <w:p>
@@ -3468,7 +3468,7 @@
           <w:sz w:val="20"/>
           <w:szCs w:val="20"/>
         </w:rPr>
-        <w:t xml:space="preserve">VOICE RULE: only the voice-over narration speaks words; it is a voice only, never a person or character on screen. No character says any word and no one on screen lip-syncs to speech; characters communicate with facial expressions and body gestures. Natural non-verbal sounds are allowed and should sound real: laughing, giggling, gasping, sighing, groaning, cheering, coughing. Attached reference images, in order: the Alexandria harbor, the Roman soldiers. 2D hand-drawn stickman cartoon in the exact style of the reference images: thin black outlines, large expressive heads, thin stick arms, flat warm colors, playful documentary-comedy tone, 16:9. Characters, identical in every frame: the Roman soldiers: crimson plumed helmets, steel armor, red cloaks, rectangular red shields. Setting: sunlit street of ancient Alexandria outside the wedding house, sandstone walls, palms, market stalls with red and blue awnings. Roman soldiers walk through the streets of Alexandria while Egyptian civilians watch from the sides. The mood turns briefly serious. Camera: locked-off and perfectly still, eye-level wide shot of Alexandria with Roman soldiers in the streets; the framing never changes (no tilt, pan, zoom or rising camera). Audio: voice-over narration only (a voice, never shown on screen; no narrator character appears): a British male voice, warm and dry, begins speaking within half a second and says: “Outside, the city was changing hands. Inside, there was still a wedding.” Music: music nearly silent. Sound effects: harbor ambience, distant boots. Final reminder: no character says any word; only the voice-over narration speaks (voice only, nobody on screen is the narrator). Natural laughs, gasps and sighs are fine. No text, captions or logos in the frame.</w:t>
+        <w:t xml:space="preserve">VOICE RULE: only the voice-over narration speaks words; it is a voice only, never a person or character on screen. No character says any word and no one on screen lip-syncs to speech; characters communicate with facial expressions and body gestures. Natural non-verbal sounds are allowed and should sound real: laughing, giggling, gasping, sighing, groaning, cheering, coughing. Attached reference images, in order: the Alexandria harbor, the Roman soldiers. 2D hand-drawn stickman cartoon in the exact style of the reference images: thin black outlines, large expressive heads, thin stick arms, flat warm colors, playful documentary-comedy tone, 16:9. Characters, identical in every frame: the Roman soldiers: crimson plumed helmets, steel armor, red cloaks, rectangular red shields. Setting: sunlit street of ancient Alexandria outside the wedding house, sandstone walls, palms, market stalls with red and blue awnings. Lighting: warm bright sunlight, soft shadows. ACTION TIMELINE (8 seconds): 0–2.5 s: Roman soldiers march through the streets of Alexandria in formation while Egyptian civilians watch from the sides. 2.5–5.5 s: a merchant slowly lowers his basket. 5.5–8 s: the mood is serious; a banner stirs in the wind. Camera: locked-off and perfectly still, eye-level wide shot of Alexandria with Roman soldiers in the streets; the framing never changes (no tilt, pan, zoom or rising camera). Audio: voice-over narration only (a voice, never shown on screen; no narrator character appears): a British male voice, warm and dry, begins speaking within half a second and says: “Outside, the city was changing hands. Inside, there was still a wedding.” The line takes about 4.8 seconds; leave the last second free of speech so the moment can land. Music: music nearly silent. Sound effects: harbor ambience, distant boots, timed to the action. Ambience: sunlit street ambience: wind and distant clatter, no words. Final reminder: no character says any word; only the voice-over narration speaks (voice only, nobody on screen is the narrator). Natural laughs, gasps and sighs are fine. No text, captions or logos in the frame.</w:t>
       </w:r>
     </w:p>
     <w:p>
@@ -3541,7 +3541,7 @@
           <w:sz w:val="20"/>
           <w:szCs w:val="20"/>
         </w:rPr>
-        <w:t xml:space="preserve">VOICE RULE: only the voice-over narration speaks words; it is a voice only, never a person or character on screen. No character says any word and no one on screen lip-syncs to speech; characters communicate with facial expressions and body gestures. Natural non-verbal sounds are allowed and should sound real: laughing, giggling, gasping, sighing, groaning, cheering, coughing. Attached reference images, in order: the Alexandria harbor, the Roman soldiers. 2D hand-drawn stickman cartoon in the exact style of the reference images: thin black outlines, large expressive heads, thin stick arms, flat warm colors, playful documentary-comedy tone, 16:9. Characters, identical in every frame: the Roman soldiers: crimson plumed helmets, steel armor, red cloaks, rectangular red shields. the guests: Egyptian wedding guests in white linen with blue-and-gold collars and gold headbands, black bob hairstyles, some in white striped headdresses. Setting: sunlit street of ancient Alexandria outside the wedding house, sandstone walls, palms, market stalls with red and blue awnings. A few Roman soldiers pass through while ordinary Egyptians keep going about their day: carrying baskets, bargaining, hauling jars. The scene signals real history around the fictional wedding. Camera: locked-off and perfectly still, eye-level wide observational shot of Alexandria; the framing never changes (no tilt, pan, zoom or rising camera). Audio: voice-over narration only (a voice, never shown on screen; no narrator character appears): a British male voice, warm and dry, begins speaking within half a second and says: “To be clear: Senbi and his wedding are fiction. The cat, sadly, too.” Music: music nearly silent. Sound effects: calm city ambience. Final reminder: no character says any word; only the voice-over narration speaks (voice only, nobody on screen is the narrator). Natural laughs, gasps and sighs are fine. No text, captions or logos in the frame.</w:t>
+        <w:t xml:space="preserve">VOICE RULE: only the voice-over narration speaks words; it is a voice only, never a person or character on screen. No character says any word and no one on screen lip-syncs to speech; characters communicate with facial expressions and body gestures. Natural non-verbal sounds are allowed and should sound real: laughing, giggling, gasping, sighing, groaning, cheering, coughing. Attached reference images, in order: the Alexandria harbor, the Roman soldiers. 2D hand-drawn stickman cartoon in the exact style of the reference images: thin black outlines, large expressive heads, thin stick arms, flat warm colors, playful documentary-comedy tone, 16:9. Characters, identical in every frame: the Roman soldiers: crimson plumed helmets, steel armor, red cloaks, rectangular red shields. Setting: sunlit street of ancient Alexandria outside the wedding house, sandstone walls, palms, market stalls with red and blue awnings. Lighting: warm bright sunlight, soft shadows. ACTION TIMELINE (8 seconds): 0–2.5 s: a few Roman soldiers pass through the street. 2.5–5.5 s: ordinary Egyptians carry baskets, bargain and haul jars as usual. 5.5–8 s: a boy runs across the frame; life goes on. Camera: locked-off and perfectly still, eye-level wide observational shot of Alexandria; the framing never changes (no tilt, pan, zoom or rising camera). Audio: voice-over narration only (a voice, never shown on screen; no narrator character appears): a British male voice, warm and dry, begins speaking within half a second and says: “To be clear: Senbi and his wedding are fiction. The cat, sadly, too.” The line takes about 5.2 seconds; leave the last second free of speech so the moment can land. Music: music nearly silent. Sound effects: calm city ambience, timed to the action. Ambience: sunlit street ambience: wind and distant clatter, no words. Final reminder: no character says any word; only the voice-over narration speaks (voice only, nobody on screen is the narrator). Natural laughs, gasps and sighs are fine. No text, captions or logos in the frame.</w:t>
       </w:r>
     </w:p>
     <w:p>
@@ -3614,7 +3614,7 @@
           <w:sz w:val="20"/>
           <w:szCs w:val="20"/>
         </w:rPr>
-        <w:t xml:space="preserve">VOICE RULE: only the voice-over narration speaks words; it is a voice only, never a person or character on screen. No character says any word and no one on screen lip-syncs to speech; characters communicate with facial expressions and body gestures. Natural non-verbal sounds are allowed and should sound real: laughing, giggling, gasping, sighing, groaning, cheering, coughing. Attached reference images, in order: the Alexandria harbor, the Roman soldiers. 2D hand-drawn stickman cartoon in the exact style of the reference images: thin black outlines, large expressive heads, thin stick arms, flat warm colors, playful documentary-comedy tone, 16:9. Characters, identical in every frame: the Roman soldiers: crimson plumed helmets, steel armor, red cloaks, rectangular red shields. Setting: ancient Alexandria harbor. Stylized historical tableau at the moment Roman authority takes over: Roman ships entering the harbor, soldiers on the quay, civilians watching. Do not depict the wedding. Camera: wide shot of the Alexandria harbor and city, horizon level; fixed except for an almost imperceptible 5% slow push-in, no tilt or pan. Audio: voice-over narration only (a voice, never shown on screen; no narrator character appears): a British male voice, warm and dry, begins speaking within half a second and says: “The setting is real: in 30 BC, Octavian took Alexandria. Egypt became Roman.” Music: music nearly silent. Sound effects: calm city ambience. Final reminder: no character says any word; only the voice-over narration speaks (voice only, nobody on screen is the narrator). Natural laughs, gasps and sighs are fine. No text, captions or logos in the frame.</w:t>
+        <w:t xml:space="preserve">VOICE RULE: only the voice-over narration speaks words; it is a voice only, never a person or character on screen. No character says any word and no one on screen lip-syncs to speech; characters communicate with facial expressions and body gestures. Natural non-verbal sounds are allowed and should sound real: laughing, giggling, gasping, sighing, groaning, cheering, coughing. Attached reference images, in order: the Alexandria harbor, the Roman soldiers. 2D hand-drawn stickman cartoon in the exact style of the reference images: thin black outlines, large expressive heads, thin stick arms, flat warm colors, playful documentary-comedy tone, 16:9. Setting: ancient Alexandria harbor. Lighting: bright clear daylight, sparkling water. ACTION TIMELINE (8 seconds): 0–2.5 s: Roman ships enter the harbor, sails filling with wind. 2.5–5.5 s: soldiers stand on the quay while civilians watch. 5.5–8 s: the lighthouse in the background, a flag fluttering slowly; the wedding is not shown. Camera: wide shot of the Alexandria harbor and city, horizon level; fixed except for an almost imperceptible 5% slow push-in, no tilt or pan. Audio: voice-over narration only (a voice, never shown on screen; no narrator character appears): a British male voice, warm and dry, begins speaking within half a second and says: “The setting is real: in 30 BC, Octavian took Alexandria. Egypt became Roman.” The line takes about 5.2 seconds; leave the last second free of speech so the moment can land. Music: music nearly silent. Sound effects: calm city ambience, timed to the action. Ambience: gulls, lapping water and creaking ropes, no words. Final reminder: no character says any word; only the voice-over narration speaks (voice only, nobody on screen is the narrator). Natural laughs, gasps and sighs are fine. No text, captions or logos in the frame.</w:t>
       </w:r>
     </w:p>
     <w:p>
@@ -3687,7 +3687,7 @@
           <w:sz w:val="20"/>
           <w:szCs w:val="20"/>
         </w:rPr>
-        <w:t xml:space="preserve">VOICE RULE: only the voice-over narration speaks words; it is a voice only, never a person or character on screen. No character says any word and no one on screen lip-syncs to speech; characters communicate with facial expressions and body gestures. Natural non-verbal sounds are allowed and should sound real: laughing, giggling, gasping, sighing, groaning, cheering, coughing. Attached reference images, in order: Senbi, the groom, the bride's relatives. 2D hand-drawn stickman cartoon in the exact style of the reference images: thin black outlines, large expressive heads, thin stick arms, flat warm colors, playful documentary-comedy tone, 16:9. Characters, identical in every frame: Senbi the groom: young man, straight black bowl-cut hair with bangs, gold headband with a gold cobra, bare chest, blue-and-gold broad collar, gold bracers, white kilt with a blue-and-gold sash, brown sandals, thin black stick arms. Setting: sunny daytime wedding courtyard in ancient Alexandria, sandstone columns with painted blue-and-gold bands, long tables with white cloths and clay jars, orange cloth awnings, and a tall wooden entrance gate at the back-center that opens onto the street. Senbi holds the wooden headrest in his hands and looks down at it, then slowly looks off to the side toward the Roman commander with a tired, deadpan expression. Camera: locked-off and perfectly still, eye-level medium close-up with the headrest in Senbi's hands and his face both in frame; the framing never changes (no tilt, pan, zoom or rising camera). Audio: voice-over narration only (a voice, never shown on screen; no narrator character appears): a British male voice, warm and dry, begins speaking within half a second and says: “Headrest, then commander. Neither came with a return policy.” Music: playful comic percussion over the wedding rhythm, low under the voice. Sound effects: wood knock, comic sting. Final reminder: no character says any word; only the voice-over narration speaks (voice only, nobody on screen is the narrator). Natural laughs, gasps and sighs are fine. No text, captions or logos in the frame.</w:t>
+        <w:t xml:space="preserve">VOICE RULE: only the voice-over narration speaks words; it is a voice only, never a person or character on screen. No character says any word and no one on screen lip-syncs to speech; characters communicate with facial expressions and body gestures. Natural non-verbal sounds are allowed and should sound real: laughing, giggling, gasping, sighing, groaning, cheering, coughing. Attached reference images, in order: Senbi, the groom, the bride's relatives. 2D hand-drawn stickman cartoon in the exact style of the reference images: thin black outlines, large expressive heads, thin stick arms, flat warm colors, playful documentary-comedy tone, 16:9. Characters, identical in every frame: Senbi the groom: young man, straight black bowl-cut hair with bangs, gold headband with a gold cobra, bare chest, blue-and-gold broad collar, gold bracers, white kilt with a blue-and-gold sash, brown sandals, thin black stick arms. Setting: sunny daytime wedding courtyard in ancient Alexandria, sandstone columns with painted blue-and-gold bands, long tables with white cloths and clay jars, orange cloth awnings, and a tall wooden entrance gate at the back-center that opens onto the street. Lighting: warm bright afternoon sunlight, soft shadows, rich saturated colors. ACTION TIMELINE (6 seconds): 0–2 s: Senbi looks down at the wooden headrest in his hands, turning it over. 2–4 s: he slowly lifts his gaze toward the Roman commander off-screen to the right. 4–6 s: a tired deadpan stare, a long slow blink, his shoulders drop. Camera: locked-off and perfectly still, eye-level medium close-up with the headrest in Senbi's hands and his face both in frame; the framing never changes (no tilt, pan, zoom or rising camera). Audio: voice-over narration only (a voice, never shown on screen; no narrator character appears): a British male voice, warm and dry, begins speaking within half a second and says: “Headrest, then commander. Neither came with a return policy.” The line takes about 3.6 seconds; leave the last second free of speech so the moment can land. Music: playful comic percussion over the wedding rhythm, low under the voice. Sound effects: wood knock, comic sting, timed to the action. Ambience: light courtyard ambience: clinking cups, footsteps on stone, a soft breeze, no words. Final reminder: no character says any word; only the voice-over narration speaks (voice only, nobody on screen is the narrator). Natural laughs, gasps and sighs are fine. No text, captions or logos in the frame.</w:t>
       </w:r>
     </w:p>
     <w:p>
@@ -3760,7 +3760,7 @@
           <w:sz w:val="20"/>
           <w:szCs w:val="20"/>
         </w:rPr>
-        <w:t xml:space="preserve">VOICE RULE: only the voice-over narration speaks words; it is a voice only, never a person or character on screen. No character says any word and no one on screen lip-syncs to speech; characters communicate with facial expressions and body gestures. Natural non-verbal sounds are allowed and should sound real: laughing, giggling, gasping, sighing, groaning, cheering, coughing. Attached reference images, in order: the bride, Senbi, the groom, the wedding courtyard. 2D hand-drawn stickman cartoon in the exact style of the reference images: thin black outlines, large expressive heads, thin stick arms, flat warm colors, playful documentary-comedy tone, 16:9. Characters, identical in every frame: Senbi the groom: young man, straight black bowl-cut hair with bangs, gold headband with a gold cobra, bare chest, blue-and-gold broad collar, gold bracers, white kilt with a blue-and-gold sash, brown sandals, thin black stick arms. the bride: black bob hair with straight bangs, gold headband with a red gem, white dress, blue-and-gold collar, gold sash, gold arm cuffs, light veil. Setting: sunny daytime wedding courtyard in ancient Alexandria, sandstone columns with painted blue-and-gold bands, long tables with white cloths and clay jars, orange cloth awnings, and a tall wooden entrance gate at the back-center that opens onto the street. The bride finally laughs at the absurdity. Senbi looks at her, then starts laughing too. The tension releases. Camera: locked-off and perfectly still, eye-level medium two-shot of Senbi and the bride; the framing never changes (no tilt, pan, zoom or rising camera). Audio: voice-over narration only (a voice, never shown on screen; no narrator character appears): a British male voice, warm and dry, begins speaking within half a second and says: “Senbi thought he was getting married.” Music: warm gentle resolution with the same flute and strings, low under the voice. Sound effects: bride laughter, Senbi laughter. Final reminder: no character says any word; only the voice-over narration speaks (voice only, nobody on screen is the narrator). Natural laughs, gasps and sighs are fine. No text, captions or logos in the frame.</w:t>
+        <w:t xml:space="preserve">VOICE RULE: only the voice-over narration speaks words; it is a voice only, never a person or character on screen. No character says any word and no one on screen lip-syncs to speech; characters communicate with facial expressions and body gestures. Natural non-verbal sounds are allowed and should sound real: laughing, giggling, gasping, sighing, groaning, cheering, coughing. Attached reference images, in order: the bride, Senbi, the groom, the wedding courtyard. 2D hand-drawn stickman cartoon in the exact style of the reference images: thin black outlines, large expressive heads, thin stick arms, flat warm colors, playful documentary-comedy tone, 16:9. Characters, identical in every frame: Senbi the groom: young man, straight black bowl-cut hair with bangs, gold headband with a gold cobra, bare chest, blue-and-gold broad collar, gold bracers, white kilt with a blue-and-gold sash, brown sandals, thin black stick arms. the bride: black bob hair with straight bangs, gold headband with a red gem, white dress, blue-and-gold collar, gold sash, gold arm cuffs, light veil. Setting: sunny daytime wedding courtyard in ancient Alexandria, sandstone columns with painted blue-and-gold bands, long tables with white cloths and clay jars, orange cloth awnings, and a tall wooden entrance gate at the back-center that opens onto the street. Lighting: warm bright afternoon sunlight, soft shadows, rich saturated colors. ACTION TIMELINE (6 seconds): 0–2 s: the bride's shoulders begin to shake. 2–4 s: she bursts out laughing, a hand on her chest. 4–6 s: Senbi looks at her, then starts laughing too, tears in his eyes, and they lean on each other. Camera: locked-off and perfectly still, eye-level medium two-shot of Senbi and the bride; the framing never changes (no tilt, pan, zoom or rising camera). Audio: voice-over narration only (a voice, never shown on screen; no narrator character appears): a British male voice, warm and dry, begins speaking within half a second and says: “Senbi thought he was getting married.” The line takes about 2.4 seconds; leave the last second free of speech so the moment can land. Music: warm gentle resolution with the same flute and strings, low under the voice. Sound effects: bride laughter, Senbi laughter, timed to the action. Ambience: light courtyard ambience: clinking cups, footsteps on stone, a soft breeze, no words. Final reminder: no character says any word; only the voice-over narration speaks (voice only, nobody on screen is the narrator). Natural laughs, gasps and sighs are fine. No text, captions or logos in the frame.</w:t>
       </w:r>
     </w:p>
     <w:p>
@@ -3833,7 +3833,7 @@
           <w:sz w:val="20"/>
           <w:szCs w:val="20"/>
         </w:rPr>
-        <w:t xml:space="preserve">VOICE RULE: only the voice-over narration speaks words; it is a voice only, never a person or character on screen. No character says any word and no one on screen lip-syncs to speech; characters communicate with facial expressions and body gestures. Natural non-verbal sounds are allowed and should sound real: laughing, giggling, gasping, sighing, groaning, cheering, coughing. Attached reference images, in order: Senbi, the groom. 2D hand-drawn stickman cartoon in the exact style of the reference images: thin black outlines, large expressive heads, thin stick arms, flat warm colors, playful documentary-comedy tone, 16:9. Characters, identical in every frame: Senbi the groom: young man, straight black bowl-cut hair with bangs, gold headband with a gold cobra, bare chest, blue-and-gold broad collar, gold bracers, white kilt with a blue-and-gold sash, brown sandals, thin black stick arms. Setting: a quiet room of the wedding house at night, warm torchlight, painted columns, cushions on the floor; Senbi is alone in the room. Senbi lies awkwardly asleep with his neck on the wooden headrest. Distant marching is heard; he opens one eye, listens, and closes it again. Camera: eye-level medium close-up of Senbi's face; fixed except for an almost imperceptible 5% slow push-in, no tilt or pan. Audio: voice-over narration only (a voice, never shown on screen; no narrator character appears): a British male voice, warm and dry, begins speaking within half a second and says: “He was.” Music: warm gentle resolution with the same flute and strings, low under the voice. Sound effects: distant marching, soft snore. Final reminder: no character says any word; only the voice-over narration speaks (voice only, nobody on screen is the narrator). Natural laughs, gasps and sighs are fine. No text, captions or logos in the frame.</w:t>
+        <w:t xml:space="preserve">VOICE RULE: only the voice-over narration speaks words; it is a voice only, never a person or character on screen. No character says any word and no one on screen lip-syncs to speech; characters communicate with facial expressions and body gestures. Natural non-verbal sounds are allowed and should sound real: laughing, giggling, gasping, sighing, groaning, cheering, coughing. Attached reference images, in order: Senbi, the groom. 2D hand-drawn stickman cartoon in the exact style of the reference images: thin black outlines, large expressive heads, thin stick arms, flat warm colors, playful documentary-comedy tone, 16:9. Characters, identical in every frame: Senbi the groom: young man, straight black bowl-cut hair with bangs, gold headband with a gold cobra, bare chest, blue-and-gold broad collar, gold bracers, white kilt with a blue-and-gold sash, brown sandals, thin black stick arms. Setting: a quiet room of the wedding house at night, warm torchlight, painted columns, cushions on the floor, Senbi alone in the room. Lighting: warm flickering torchlight, deep soft shadows. ACTION TIMELINE (4 seconds): 0–1 s: Senbi lies asleep, neck awkwardly bent on the wooden headrest, mouth slightly open, face scrunched. 1–2 s: distant marching begins. 2–3 s: one eye opens and he listens. 3–4 s: the eye closes again with a tired sigh and he turns his face away. Camera: eye-level medium close-up of Senbi's face; fixed except for an almost imperceptible 5% slow push-in, no tilt or pan. Audio: voice-over narration only (a voice, never shown on screen; no narrator character appears): a British male voice, warm and dry, begins speaking within half a second and says: “He was.” The line takes about 0.8 seconds; leave the last second free of speech so the moment can land. Music: warm gentle resolution with the same flute and strings, low under the voice. Sound effects: distant marching, soft snore, timed to the action. Ambience: quiet night room tone and a crackling torch, no words. Final reminder: no character says any word; only the voice-over narration speaks (voice only, nobody on screen is the narrator). Natural laughs, gasps and sighs are fine. No text, captions or logos in the frame.</w:t>
       </w:r>
     </w:p>
     <w:p>
@@ -3906,7 +3906,7 @@
           <w:sz w:val="20"/>
           <w:szCs w:val="20"/>
         </w:rPr>
-        <w:t xml:space="preserve">VOICE RULE: only the voice-over narration speaks words; it is a voice only, never a person or character on screen. No character says any word and no one on screen lip-syncs to speech; characters communicate with facial expressions and body gestures. Natural non-verbal sounds are allowed and should sound real: laughing, giggling, gasping, sighing, groaning, cheering, coughing. Attached reference images, in order: Senbi, the groom, the bride, the Alexandria harbor. 2D hand-drawn stickman cartoon in the exact style of the reference images: thin black outlines, large expressive heads, thin stick arms, flat warm colors, playful documentary-comedy tone, 16:9. Characters, identical in every frame: Senbi the groom: young man, straight black bowl-cut hair with bangs, gold headband with a gold cobra, bare chest, blue-and-gold broad collar, gold bracers, white kilt with a blue-and-gold sash, brown sandals, thin black stick arms. the bride: black bob hair with straight bangs, gold headband with a red gem, white dress, blue-and-gold collar, gold sash, gold arm cuffs, light veil. the Roman soldiers: crimson plumed helmets, steel armor, red cloaks, rectangular red shields. Setting: sunny daytime wedding courtyard in ancient Alexandria, sandstone columns with painted blue-and-gold bands, long tables with white cloths and clay jars, orange cloth awnings, and a tall wooden entrance gate at the back-center that opens onto the street. Final composition in warm evening light: Senbi and the bride in the foreground, Alexandria behind them, Roman soldiers as small figures in the distance. Camera: locked-off and perfectly still, wide shot of Senbi and the bride in the foreground with Alexandria behind them; the framing never changes (no tilt, pan, zoom or rising camera). Audio: voice-over narration only (a voice, never shown on screen; no narrator character appears): a British male voice, warm and dry, begins speaking within half a second and says: “He just hadn't noticed he was also getting a new government.” Music: warm gentle resolution with the same flute and strings, low under the voice. Sound effects: gentle music, silence at the very end. Final reminder: no character says any word; only the voice-over narration speaks (voice only, nobody on screen is the narrator). Natural laughs, gasps and sighs are fine. No text, captions or logos in the frame.</w:t>
+        <w:t xml:space="preserve">VOICE RULE: only the voice-over narration speaks words; it is a voice only, never a person or character on screen. No character says any word and no one on screen lip-syncs to speech; characters communicate with facial expressions and body gestures. Natural non-verbal sounds are allowed and should sound real: laughing, giggling, gasping, sighing, groaning, cheering, coughing. Attached reference images, in order: Senbi, the groom, the bride, the Alexandria harbor. 2D hand-drawn stickman cartoon in the exact style of the reference images: thin black outlines, large expressive heads, thin stick arms, flat warm colors, playful documentary-comedy tone, 16:9. Characters, identical in every frame: Senbi the groom: young man, straight black bowl-cut hair with bangs, gold headband with a gold cobra, bare chest, blue-and-gold broad collar, gold bracers, white kilt with a blue-and-gold sash, brown sandals, thin black stick arms. the bride: black bob hair with straight bangs, gold headband with a red gem, white dress, blue-and-gold collar, gold sash, gold arm cuffs, light veil. the Roman soldiers: crimson plumed helmets, steel armor, red cloaks, rectangular red shields. Setting: sunny daytime wedding courtyard in ancient Alexandria, sandstone columns with painted blue-and-gold bands, long tables with white cloths and clay jars, orange cloth awnings, and a tall wooden entrance gate at the back-center that opens onto the street. Lighting: warm bright afternoon sunlight, soft shadows, rich saturated colors. ACTION TIMELINE (8 seconds): 0–2.5 s: warm evening light over Alexandria, Senbi and the bride in the foreground looking out at the city. 2.5–5.5 s: Roman soldiers are small figures in the distance, lights flickering on in the harbor. 5.5–8 s: the couple lean toward each other; the scene holds and slowly settles. Camera: locked-off and perfectly still, wide shot of Senbi and the bride in the foreground with Alexandria behind them; the framing never changes (no tilt, pan, zoom or rising camera). Audio: voice-over narration only (a voice, never shown on screen; no narrator character appears): a British male voice, warm and dry, begins speaking within half a second and says: “He just hadn't noticed he was also getting a new government.” The line takes about 4.4 seconds; leave the last second free of speech so the moment can land. Music: warm gentle resolution with the same flute and strings, low under the voice. Sound effects: gentle music, silence at the very end, timed to the action. Ambience: light courtyard ambience: clinking cups, footsteps on stone, a soft breeze, no words. Final reminder: no character says any word; only the voice-over narration speaks (voice only, nobody on screen is the narrator). Natural laughs, gasps and sighs are fine. No text, captions or logos in the frame.</w:t>
       </w:r>
     </w:p>
     <w:p>

</xml_diff>

<commit_message>
Episode 1: cut 9 shots, new hook for shot 1, shot 44 after 25
Co-Authored-By: Claude Sonnet 5.5 <noreply@anthropic.com>
Claude-Session: https://claude.ai/code/session_01S29WeDgsXUpbHNWdisiPFj
</commit_message>
<xml_diff>
--- a/The_Last_Day_of_Ancient_Egypt_Ep1_FLOW_PROMPTS_READY.docx
+++ b/The_Last_Day_of_Ancient_Egypt_Ep1_FLOW_PROMPTS_READY.docx
@@ -29,7 +29,7 @@
           <w:sz w:val="22"/>
           <w:szCs w:val="22"/>
         </w:rPr>
-        <w:t xml:space="preserve">Ready-to-paste Google Flow prompts. 48 shots. Each prompt already contains the picture, camera, narrator line, music and sound effects.</w:t>
+        <w:t xml:space="preserve">Ready-to-paste Google Flow prompts. 39 shots. Each prompt already contains the picture, camera, narrator line, music and sound effects.</w:t>
       </w:r>
     </w:p>
     <w:p>
@@ -152,7 +152,7 @@
           <w:sz w:val="21"/>
           <w:szCs w:val="21"/>
         </w:rPr>
-        <w:t xml:space="preserve">Shot 1 is already generated. Do not regenerate it.</w:t>
+        <w:t xml:space="preserve">Shot 1 is regenerated with the new hook line. Use Shot1_first_frame.png as the start frame so it looks like the approved version.</w:t>
       </w:r>
     </w:p>
     <w:p>
@@ -170,7 +170,7 @@
           <w:sz w:val="21"/>
           <w:szCs w:val="21"/>
         </w:rPr>
-        <w:t xml:space="preserve">Test shots 2, 3 and 4 first and play them back to back with shot 1. If the narrator voice or the music changes noticeably, regenerate that clip before making more.</w:t>
+        <w:t xml:space="preserve">Cut shots (6, 11, 14, 21, 23, 28, 35, 38, 42) are removed from this file. The remaining shots keep their original numbers so nothing gets confused.</w:t>
       </w:r>
     </w:p>
     <w:p>
@@ -188,7 +188,7 @@
           <w:sz w:val="21"/>
           <w:szCs w:val="21"/>
         </w:rPr>
-        <w:t xml:space="preserve">In the final edit, play shot 44 right after shot 25 (the Octavian fact comes before the dancing).</w:t>
+        <w:t xml:space="preserve">Test shots 2, 3 and 4 first and play them back to back with shot 1. If the narrator voice or the music changes noticeably, regenerate that clip before making more.</w:t>
       </w:r>
     </w:p>
     <w:p>
@@ -206,6 +206,24 @@
           <w:sz w:val="21"/>
           <w:szCs w:val="21"/>
         </w:rPr>
+        <w:t xml:space="preserve">In the final edit, play shot 44 right after shot 25 (the Octavian fact comes before the dancing).</w:t>
+      </w:r>
+    </w:p>
+    <w:p>
+      <w:pPr>
+        <w:pStyle w:val="ListParagraph"/>
+        <w:numPr>
+          <w:ilvl w:val="0"/>
+          <w:numId w:val="2"/>
+        </w:numPr>
+        <w:spacing w:after="60"/>
+      </w:pPr>
+      <w:r>
+        <w:rPr>
+          <w:rFonts w:ascii="Arial" w:cs="Arial" w:eastAsia="Arial" w:hAnsi="Arial"/>
+          <w:sz w:val="21"/>
+          <w:szCs w:val="21"/>
+        </w:rPr>
         <w:t xml:space="preserve">If a clip moves the camera, changes a face or costume, or prints any text, regenerate it.</w:t>
       </w:r>
     </w:p>
@@ -462,20 +480,80 @@
           <w:sz w:val="26"/>
           <w:szCs w:val="26"/>
         </w:rPr>
-        <w:t xml:space="preserve">SHOT 01 — Cold open</w:t>
-      </w:r>
-    </w:p>
-    <w:p>
-      <w:pPr>
+        <w:t xml:space="preserve">SHOT 01 — Cold open (new hook)</w:t>
+      </w:r>
+    </w:p>
+    <w:p>
+      <w:pPr>
+        <w:keepNext/>
+        <w:spacing w:after="40" w:before="0"/>
+      </w:pPr>
+      <w:r>
+        <w:rPr>
+          <w:rFonts w:ascii="Arial" w:cs="Arial" w:eastAsia="Arial" w:hAnsi="Arial"/>
+          <w:i/>
+          <w:iCs/>
+          <w:color w:val="555555"/>
+          <w:sz w:val="19"/>
+          <w:szCs w:val="19"/>
+        </w:rPr>
+        <w:t xml:space="preserve">Use Frames to Video with Shot1_first_frame.png as the START frame, so the look stays identical to the approved version. If your Flow mode only accepts reference images, attach Senbi_from_Shot1.png, Bride_from_Shot1.png and Courtyard_from_Shot1.png instead.</w:t>
+      </w:r>
+    </w:p>
+    <w:p>
+      <w:pPr>
+        <w:keepNext/>
         <w:spacing w:after="60" w:before="0"/>
       </w:pPr>
       <w:r>
         <w:rPr>
           <w:rFonts w:ascii="Arial" w:cs="Arial" w:eastAsia="Arial" w:hAnsi="Arial"/>
-          <w:sz w:val="21"/>
-          <w:szCs w:val="21"/>
-        </w:rPr>
-        <w:t xml:space="preserve">Already generated and approved. Do not regenerate.  Narrator line in the video: “Today is supposed to be the happiest day in Senbi's life.”</w:t>
+          <w:b/>
+          <w:bCs/>
+          <w:sz w:val="21"/>
+          <w:szCs w:val="21"/>
+        </w:rPr>
+        <w:t xml:space="preserve">Attach: </w:t>
+      </w:r>
+      <w:r>
+        <w:rPr>
+          <w:rFonts w:ascii="Arial" w:cs="Arial" w:eastAsia="Arial" w:hAnsi="Arial"/>
+          <w:sz w:val="21"/>
+          <w:szCs w:val="21"/>
+        </w:rPr>
+        <w:t xml:space="preserve">Shot1_first_frame.png</w:t>
+      </w:r>
+      <w:r>
+        <w:rPr>
+          <w:rFonts w:ascii="Arial" w:cs="Arial" w:eastAsia="Arial" w:hAnsi="Arial"/>
+          <w:b/>
+          <w:bCs/>
+          <w:sz w:val="21"/>
+          <w:szCs w:val="21"/>
+        </w:rPr>
+        <w:t xml:space="preserve">      Duration: </w:t>
+      </w:r>
+      <w:r>
+        <w:rPr>
+          <w:rFonts w:ascii="Arial" w:cs="Arial" w:eastAsia="Arial" w:hAnsi="Arial"/>
+          <w:sz w:val="21"/>
+          <w:szCs w:val="21"/>
+        </w:rPr>
+        <w:t xml:space="preserve">8 sec</w:t>
+      </w:r>
+    </w:p>
+    <w:p>
+      <w:pPr>
+        <w:shd w:fill="F2F2F2" w:val="clear"/>
+        <w:spacing w:after="80"/>
+      </w:pPr>
+      <w:r>
+        <w:rPr>
+          <w:rFonts w:ascii="Arial" w:cs="Arial" w:eastAsia="Arial" w:hAnsi="Arial"/>
+          <w:sz w:val="20"/>
+          <w:szCs w:val="20"/>
+        </w:rPr>
+        <w:t xml:space="preserve">VOICE RULE: only the voice-over narration speaks words; it is a voice only, never a person or character on screen. No character says any word and no one on screen lip-syncs to speech; characters communicate with facial expressions and body gestures. Natural non-verbal sounds are allowed and should sound real: laughing, giggling, gasping, sighing, groaning, cheering, coughing. Starting frame (attached): keep exactly this composition, these characters and this background at the start. 2D hand-drawn stickman cartoon in the exact style of the starting frame: thin black outlines, large expressive heads, thin black stick arms and legs, flat warm colors, playful documentary-comedy tone, 16:9. Characters, identical in every frame: Senbi the groom: young man, straight black bowl-cut hair with bangs, gold headband with a gold cobra, bare chest, blue-and-gold broad collar, gold bracers, white kilt with a blue-and-gold sash, brown sandals, thin black stick arms. the bride: black bob hair with straight bangs, gold headband with a red gem, white dress, blue-and-gold collar, gold sash, gold arm cuffs, light veil. the guests: Egyptian wedding guests in white linen with blue-and-gold collars and gold headbands, black bob hairstyles, some in white striped headdresses. Setting: sunny daytime wedding courtyard in ancient Alexandria, sandstone columns with painted blue-and-gold bands, long tables with white cloths, fruit and clay jars, orange cloth awnings, and a tall wooden entrance gate at the back-center that opens onto the street; in the street beyond the gate, a row of Roman soldier silhouettes with spears stands motionless, small but clear. Lighting: warm bright afternoon sunlight, soft shadows, rich saturated colors. ACTION TIMELINE (8 seconds): 0–2.5 s: Senbi and the bride dance joyfully in the center of the courtyard, fists pumping, eyes closed, big laughing smiles; guests at the tables clap, a guest plays a reed flute, another beats a frame drum; the Roman silhouettes stand perfectly still in the gate behind them. 2.5–5.5 s: the dance continues, the couple's joy growing, guests clapping along. 5.5–8 s: the camera has drifted closer so the laughing couple fills the frame in a medium close-up, Senbi's fist raised, the bride's arms up; the silhouettes remain still in the background. Camera: eye-level, starts as a medium-wide shot and makes one slow, smooth push-in toward the couple, ending in a medium close-up; no tilt, no pan, no rising camera. Audio: voice-over narration only (a voice, never shown on screen; no narrator character appears): a British male voice, warm and dry, begins speaking within half a second and says: “Senbi had planned everything for his wedding. Everything except the Roman army.” The line takes about 4.8 seconds; leave the last second free of speech so the moment can land. Music: light ancient-Mediterranean wedding music (frame drums, reed flute, plucked strings), same theme in every clip, low under the voice. Sound effects: clapping, cups clinking, a few cheerful cheers from the guests without words, timed to the action. Ambience: light courtyard ambience: footsteps on stone, a soft breeze, no words. Final reminder: no character says any word; only the voice-over narration speaks (voice only, nobody on screen is the narrator). Natural laughs, gasps and sighs are fine. No text, captions or logos in the frame.</w:t>
       </w:r>
     </w:p>
     <w:p>
@@ -784,7 +862,7 @@
           <w:sz w:val="26"/>
           <w:szCs w:val="26"/>
         </w:rPr>
-        <w:t xml:space="preserve">SHOT 06 — Groom preparation</w:t>
+        <w:t xml:space="preserve">SHOT 07 — Bride reveal</w:t>
       </w:r>
     </w:p>
     <w:p>
@@ -808,7 +886,7 @@
           <w:sz w:val="21"/>
           <w:szCs w:val="21"/>
         </w:rPr>
-        <w:t xml:space="preserve">Senbi_from_Shot1.png</w:t>
+        <w:t xml:space="preserve">Bride_from_Shot1.png,  Courtyard_from_Shot1.png</w:t>
       </w:r>
       <w:r>
         <w:rPr>
@@ -840,7 +918,7 @@
           <w:sz w:val="20"/>
           <w:szCs w:val="20"/>
         </w:rPr>
-        <w:t xml:space="preserve">VOICE RULE: only the voice-over narration speaks words; it is a voice only, never a person or character on screen. No character says any word and no one on screen lip-syncs to speech; characters communicate with facial expressions and body gestures. Natural non-verbal sounds are allowed and should sound real: laughing, giggling, gasping, sighing, groaning, cheering, coughing. Attached reference images, in order: Senbi, the groom. 2D hand-drawn stickman cartoon in the exact style of the reference images: thin black outlines, large expressive heads, thin stick arms, flat warm colors, playful documentary-comedy tone, 16:9. Characters, identical in every frame: Senbi the groom: young man, straight black bowl-cut hair with bangs, gold headband with a gold cobra, bare chest, blue-and-gold broad collar, gold bracers, white kilt with a blue-and-gold sash, brown sandals, thin black stick arms. Setting: a shaded sandstone alcove beside the wedding courtyard, painted columns, warm daylight. Lighting: warm bright afternoon sunlight, soft shadows, rich saturated colors. ACTION TIMELINE (8 seconds): 0–2.5 s: Senbi lifts a small bronze razor, inspects the edge, runs a hand over his chin and nods, satisfied. 2.5–5.5 s: he straightens his gold headband with both hands, checking his profile. 5.5–8 s: he adjusts his collar and strikes an overconfident pose, hands on hips, chest out, chin up, and holds it. Camera: locked-off and perfectly still, eye-level full-body medium shot of Senbi; all three actions happen inside the same frame; the framing never changes (no tilt, pan, zoom or rising camera). Audio: voice-over narration only (a voice, never shown on screen; no narrator character appears): a British male voice, warm and dry, begins speaking within half a second and says: “Every groom has one job: look incredible, and pretend it took no effort.” The line takes about 5.2 seconds; leave the last second free of speech so the moment can land. Music: playful comic percussion over the wedding rhythm, low under the voice. Sound effects: light razor scrape, one comic boing, timed to the action. Ambience: light courtyard ambience: clinking cups, footsteps on stone, a soft breeze, no words. Final reminder: no character says any word; only the voice-over narration speaks (voice only, nobody on screen is the narrator). Natural laughs, gasps and sighs are fine. No text, captions or logos in the frame.</w:t>
+        <w:t xml:space="preserve">VOICE RULE: only the voice-over narration speaks words; it is a voice only, never a person or character on screen. No character says any word and no one on screen lip-syncs to speech; characters communicate with facial expressions and body gestures. Natural non-verbal sounds are allowed and should sound real: laughing, giggling, gasping, sighing, groaning, cheering, coughing. Attached reference images, in order: the bride, the wedding courtyard. 2D hand-drawn stickman cartoon in the exact style of the reference images: thin black outlines, large expressive heads, thin stick arms, flat warm colors, playful documentary-comedy tone, 16:9. Characters, identical in every frame: the bride: black bob hair with straight bangs, gold headband with a red gem, white dress, blue-and-gold collar, gold sash, gold arm cuffs, light veil. Setting: a shaded sandstone alcove beside the wedding courtyard, painted columns, warm daylight. Lighting: warm bright afternoon sunlight, soft shadows, rich saturated colors. ACTION TIMELINE (8 seconds): 0–2.5 s: the bride adjusts her gold headband with the red gem in front of a bronze mirror. 2.5–5.5 s: she touches the corner of her dark eye makeup with a fingertip, tilting her head. 5.5–8 s: she looks herself in the eye, gives a calm confident nod and a small smile, and holds. Camera: eye-level medium shot of the bride at the mirror; fixed except for an almost imperceptible 5% slow push-in, no tilt or pan. Audio: voice-over narration only (a voice, never shown on screen; no narrator character appears): a British male voice, warm and dry, begins speaking within half a second and says: “His bride had been ready for an hour. She was the calm one.” The line takes about 5.2 seconds; leave the last second free of speech so the moment can land. Music: light ancient-Mediterranean wedding music (frame drums, reed flute, plucked strings), same theme in every clip, low under the voice. Sound effects: soft jewelry jingle, timed to the action. Ambience: light courtyard ambience: clinking cups, footsteps on stone, a soft breeze, no words. Final reminder: no character says any word; only the voice-over narration speaks (voice only, nobody on screen is the narrator). Natural laughs, gasps and sighs are fine. No text, captions or logos in the frame.</w:t>
       </w:r>
     </w:p>
     <w:p>
@@ -857,7 +935,7 @@
           <w:sz w:val="26"/>
           <w:szCs w:val="26"/>
         </w:rPr>
-        <w:t xml:space="preserve">SHOT 07 — Bride reveal</w:t>
+        <w:t xml:space="preserve">SHOT 08 — Marriage contract</w:t>
       </w:r>
     </w:p>
     <w:p>
@@ -881,7 +959,7 @@
           <w:sz w:val="21"/>
           <w:szCs w:val="21"/>
         </w:rPr>
-        <w:t xml:space="preserve">Bride_from_Shot1.png,  Courtyard_from_Shot1.png</w:t>
+        <w:t xml:space="preserve">Bride_from_Shot1.png,  Relatives_group.png,  Courtyard_from_Shot1.png</w:t>
       </w:r>
       <w:r>
         <w:rPr>
@@ -913,7 +991,7 @@
           <w:sz w:val="20"/>
           <w:szCs w:val="20"/>
         </w:rPr>
-        <w:t xml:space="preserve">VOICE RULE: only the voice-over narration speaks words; it is a voice only, never a person or character on screen. No character says any word and no one on screen lip-syncs to speech; characters communicate with facial expressions and body gestures. Natural non-verbal sounds are allowed and should sound real: laughing, giggling, gasping, sighing, groaning, cheering, coughing. Attached reference images, in order: the bride, the wedding courtyard. 2D hand-drawn stickman cartoon in the exact style of the reference images: thin black outlines, large expressive heads, thin stick arms, flat warm colors, playful documentary-comedy tone, 16:9. Characters, identical in every frame: the bride: black bob hair with straight bangs, gold headband with a red gem, white dress, blue-and-gold collar, gold sash, gold arm cuffs, light veil. Setting: a shaded sandstone alcove beside the wedding courtyard, painted columns, warm daylight. Lighting: warm bright afternoon sunlight, soft shadows, rich saturated colors. ACTION TIMELINE (8 seconds): 0–2.5 s: the bride adjusts her gold headband with the red gem in front of a bronze mirror. 2.5–5.5 s: she touches the corner of her dark eye makeup with a fingertip, tilting her head. 5.5–8 s: she looks herself in the eye, gives a calm confident nod and a small smile, and holds. Camera: eye-level medium shot of the bride at the mirror; fixed except for an almost imperceptible 5% slow push-in, no tilt or pan. Audio: voice-over narration only (a voice, never shown on screen; no narrator character appears): a British male voice, warm and dry, begins speaking within half a second and says: “His bride had been ready for an hour. She was the calm one.” The line takes about 5.2 seconds; leave the last second free of speech so the moment can land. Music: light ancient-Mediterranean wedding music (frame drums, reed flute, plucked strings), same theme in every clip, low under the voice. Sound effects: soft jewelry jingle, timed to the action. Ambience: light courtyard ambience: clinking cups, footsteps on stone, a soft breeze, no words. Final reminder: no character says any word; only the voice-over narration speaks (voice only, nobody on screen is the narrator). Natural laughs, gasps and sighs are fine. No text, captions or logos in the frame.</w:t>
+        <w:t xml:space="preserve">VOICE RULE: only the voice-over narration speaks words; it is a voice only, never a person or character on screen. No character says any word and no one on screen lip-syncs to speech; characters communicate with facial expressions and body gestures. Natural non-verbal sounds are allowed and should sound real: laughing, giggling, gasping, sighing, groaning, cheering, coughing. Attached reference images, in order: the bride, the bride's relatives, the wedding courtyard. 2D hand-drawn stickman cartoon in the exact style of the reference images: thin black outlines, large expressive heads, thin stick arms, flat warm colors, playful documentary-comedy tone, 16:9. Characters, identical in every frame: the scribe: older man in plain white linen holding a reed pen. the bride: black bob hair with straight bangs, gold headband with a red gem, white dress, blue-and-gold collar, gold sash, gold arm cuffs, light veil. the bride's father: bearded middle-aged man in a beige tunic with a purple sash. Setting: a shaded sandstone alcove beside the wedding courtyard, painted columns, warm daylight. Lighting: warm bright afternoon sunlight, soft shadows, rich saturated colors. ACTION TIMELINE (8 seconds): 0–2.5 s: a scribe sitting behind a low table unrolls a papyrus with careful hands; the bride stands at the right and her bearded father stands behind her, arms folded. 2.5–5.5 s: the bride leans in and points at one line with a finger while her father nods gravely. 5.5–8 s: the bride straightens up with a small satisfied smile and her father allows himself a tiny proud nod. Camera: locked-off and perfectly still, eye-level medium two-shot: the scribe, the papyrus and the bride all in the same frame; the framing never changes (no tilt, pan, zoom or rising camera). Audio: voice-over narration only (a voice, never shown on screen; no narrator character appears): a British male voice, warm and dry, begins speaking within half a second and says: “Then, paperwork. Real contracts survive: property, money, who owes what. Romance, with receipts.” The line takes about 5.2 seconds; leave the last second free of speech so the moment can land. Music: light ancient-Mediterranean wedding music (frame drums, reed flute, plucked strings), same theme in every clip, low under the voice. Sound effects: papyrus rustle, quill scratching, timed to the action. Ambience: light courtyard ambience: clinking cups, footsteps on stone, a soft breeze, no words. Final reminder: no character says any word; only the voice-over narration speaks (voice only, nobody on screen is the narrator). Natural laughs, gasps and sighs are fine. No text, captions or logos in the frame.</w:t>
       </w:r>
     </w:p>
     <w:p>
@@ -930,7 +1008,7 @@
           <w:sz w:val="26"/>
           <w:szCs w:val="26"/>
         </w:rPr>
-        <w:t xml:space="preserve">SHOT 08 — Marriage contract</w:t>
+        <w:t xml:space="preserve">SHOT 09 — The feast</w:t>
       </w:r>
     </w:p>
     <w:p>
@@ -954,7 +1032,7 @@
           <w:sz w:val="21"/>
           <w:szCs w:val="21"/>
         </w:rPr>
-        <w:t xml:space="preserve">Bride_from_Shot1.png,  Relatives_group.png,  Courtyard_from_Shot1.png</w:t>
+        <w:t xml:space="preserve">Guests_group.png,  Courtyard_from_Shot1.png</w:t>
       </w:r>
       <w:r>
         <w:rPr>
@@ -986,7 +1064,7 @@
           <w:sz w:val="20"/>
           <w:szCs w:val="20"/>
         </w:rPr>
-        <w:t xml:space="preserve">VOICE RULE: only the voice-over narration speaks words; it is a voice only, never a person or character on screen. No character says any word and no one on screen lip-syncs to speech; characters communicate with facial expressions and body gestures. Natural non-verbal sounds are allowed and should sound real: laughing, giggling, gasping, sighing, groaning, cheering, coughing. Attached reference images, in order: the bride, the bride's relatives, the wedding courtyard. 2D hand-drawn stickman cartoon in the exact style of the reference images: thin black outlines, large expressive heads, thin stick arms, flat warm colors, playful documentary-comedy tone, 16:9. Characters, identical in every frame: the scribe: older man in plain white linen holding a reed pen. the bride: black bob hair with straight bangs, gold headband with a red gem, white dress, blue-and-gold collar, gold sash, gold arm cuffs, light veil. the bride's father: bearded middle-aged man in a beige tunic with a purple sash. Setting: a shaded sandstone alcove beside the wedding courtyard, painted columns, warm daylight. Lighting: warm bright afternoon sunlight, soft shadows, rich saturated colors. ACTION TIMELINE (8 seconds): 0–2.5 s: a scribe sitting behind a low table unrolls a papyrus with careful hands; the bride stands at the right and her bearded father stands behind her, arms folded. 2.5–5.5 s: the bride leans in and points at one line with a finger while her father nods gravely. 5.5–8 s: the bride straightens up with a small satisfied smile and her father allows himself a tiny proud nod. Camera: locked-off and perfectly still, eye-level medium two-shot: the scribe, the papyrus and the bride all in the same frame; the framing never changes (no tilt, pan, zoom or rising camera). Audio: voice-over narration only (a voice, never shown on screen; no narrator character appears): a British male voice, warm and dry, begins speaking within half a second and says: “Then, paperwork. Real contracts survive: property, money, who owes what. Romance, with receipts.” The line takes about 5.2 seconds; leave the last second free of speech so the moment can land. Music: light ancient-Mediterranean wedding music (frame drums, reed flute, plucked strings), same theme in every clip, low under the voice. Sound effects: papyrus rustle, quill scratching, timed to the action. Ambience: light courtyard ambience: clinking cups, footsteps on stone, a soft breeze, no words. Final reminder: no character says any word; only the voice-over narration speaks (voice only, nobody on screen is the narrator). Natural laughs, gasps and sighs are fine. No text, captions or logos in the frame.</w:t>
+        <w:t xml:space="preserve">VOICE RULE: only the voice-over narration speaks words; it is a voice only, never a person or character on screen. No character says any word and no one on screen lip-syncs to speech; characters communicate with facial expressions and body gestures. Natural non-verbal sounds are allowed and should sound real: laughing, giggling, gasping, sighing, groaning, cheering, coughing. Attached reference images, in order: the Egyptian wedding guests, the wedding courtyard. 2D hand-drawn stickman cartoon in the exact style of the reference images: thin black outlines, large expressive heads, thin stick arms, flat warm colors, playful documentary-comedy tone, 16:9. Characters, identical in every frame: the guests: Egyptian wedding guests in white linen with blue-and-gold collars and gold headbands, black bob hairstyles, some in white striped headdresses. the older woman: middle-aged woman in white linen with a red-orange sash. Setting: sunny daytime wedding courtyard in ancient Alexandria, sandstone columns with painted blue-and-gold bands, long tables with white cloths and clay jars, orange cloth awnings, and a tall wooden entrance gate at the back-center that opens onto the street. Lighting: warm bright afternoon sunlight, soft shadows, rich saturated colors. ACTION TIMELINE (8 seconds): 0–2.5 s: guests seated on both sides of the long table eat happily and pass bowls of figs, dates and flatbread. 2.5–5.5 s: at the far end one guest tiptoes up, grabs a fig and hides it behind his back with an innocent face. 5.5–8 s: an unimpressed older woman beside him turns, crosses her arms and gives him a flat stare; he freezes with wide eyes. Camera: locked-off and perfectly still, eye-level wide-medium shot of the whole feast table; the sneaky guest stays in frame; the framing never changes (no tilt, pan, zoom or rising camera). Audio: voice-over narration only (a voice, never shown on screen; no narrator character appears): a British male voice, warm and dry, begins speaking within half a second and says: “Bread, figs, roast goose, and beer, basically a food group. Someone was stealing.” The line takes about 5.2 seconds; leave the last second free of speech so the moment can land. Music: light ancient-Mediterranean wedding music (frame drums, reed flute, plucked strings), same theme in every clip, low under the voice. Sound effects: plates, cups, cheerful ambience, no words, timed to the action. Ambience: light courtyard ambience: clinking cups, footsteps on stone, a soft breeze, no words. Final reminder: no character says any word; only the voice-over narration speaks (voice only, nobody on screen is the narrator). Natural laughs, gasps and sighs are fine. No text, captions or logos in the frame.</w:t>
       </w:r>
     </w:p>
     <w:p>
@@ -1003,7 +1081,7 @@
           <w:sz w:val="26"/>
           <w:szCs w:val="26"/>
         </w:rPr>
-        <w:t xml:space="preserve">SHOT 09 — The feast</w:t>
+        <w:t xml:space="preserve">SHOT 10 — The cat</w:t>
       </w:r>
     </w:p>
     <w:p>
@@ -1027,7 +1105,7 @@
           <w:sz w:val="21"/>
           <w:szCs w:val="21"/>
         </w:rPr>
-        <w:t xml:space="preserve">Guests_group.png,  Courtyard_from_Shot1.png</w:t>
+        <w:t xml:space="preserve">Black_cat.png,  Courtyard_from_Shot1.png</w:t>
       </w:r>
       <w:r>
         <w:rPr>
@@ -1059,7 +1137,7 @@
           <w:sz w:val="20"/>
           <w:szCs w:val="20"/>
         </w:rPr>
-        <w:t xml:space="preserve">VOICE RULE: only the voice-over narration speaks words; it is a voice only, never a person or character on screen. No character says any word and no one on screen lip-syncs to speech; characters communicate with facial expressions and body gestures. Natural non-verbal sounds are allowed and should sound real: laughing, giggling, gasping, sighing, groaning, cheering, coughing. Attached reference images, in order: the Egyptian wedding guests, the wedding courtyard. 2D hand-drawn stickman cartoon in the exact style of the reference images: thin black outlines, large expressive heads, thin stick arms, flat warm colors, playful documentary-comedy tone, 16:9. Characters, identical in every frame: the guests: Egyptian wedding guests in white linen with blue-and-gold collars and gold headbands, black bob hairstyles, some in white striped headdresses. the older woman: middle-aged woman in white linen with a red-orange sash. Setting: sunny daytime wedding courtyard in ancient Alexandria, sandstone columns with painted blue-and-gold bands, long tables with white cloths and clay jars, orange cloth awnings, and a tall wooden entrance gate at the back-center that opens onto the street. Lighting: warm bright afternoon sunlight, soft shadows, rich saturated colors. ACTION TIMELINE (8 seconds): 0–2.5 s: guests seated on both sides of the long table eat happily and pass bowls of figs, dates and flatbread. 2.5–5.5 s: at the far end one guest tiptoes up, grabs a fig and hides it behind his back with an innocent face. 5.5–8 s: an unimpressed older woman beside him turns, crosses her arms and gives him a flat stare; he freezes with wide eyes. Camera: locked-off and perfectly still, eye-level wide-medium shot of the whole feast table; the sneaky guest stays in frame; the framing never changes (no tilt, pan, zoom or rising camera). Audio: voice-over narration only (a voice, never shown on screen; no narrator character appears): a British male voice, warm and dry, begins speaking within half a second and says: “Bread, figs, roast goose, and beer, basically a food group. Someone was stealing.” The line takes about 5.2 seconds; leave the last second free of speech so the moment can land. Music: light ancient-Mediterranean wedding music (frame drums, reed flute, plucked strings), same theme in every clip, low under the voice. Sound effects: plates, cups, cheerful ambience, no words, timed to the action. Ambience: light courtyard ambience: clinking cups, footsteps on stone, a soft breeze, no words. Final reminder: no character says any word; only the voice-over narration speaks (voice only, nobody on screen is the narrator). Natural laughs, gasps and sighs are fine. No text, captions or logos in the frame.</w:t>
+        <w:t xml:space="preserve">VOICE RULE: only the voice-over narration speaks words; it is a voice only, never a person or character on screen. No character says any word and no one on screen lip-syncs to speech; characters communicate with facial expressions and body gestures. Natural non-verbal sounds are allowed and should sound real: laughing, giggling, gasping, sighing, groaning, cheering, coughing. Attached reference images, in order: the black cat, the wedding courtyard. 2D hand-drawn stickman cartoon in the exact style of the reference images: thin black outlines, large expressive heads, thin stick arms, flat warm colors, playful documentary-comedy tone, 16:9. Characters, identical in every frame: the cat: black with a small gold collar. the guests: Egyptian wedding guests in white linen with blue-and-gold collars and gold headbands, black bob hairstyles, some in white striped headdresses. Setting: sunny daytime wedding courtyard in ancient Alexandria, sandstone columns with painted blue-and-gold bands, long tables with white cloths and clay jars, orange cloth awnings, and a tall wooden entrance gate at the back-center that opens onto the street. Lighting: warm bright afternoon sunlight, soft shadows, rich saturated colors. ACTION TIMELINE (8 seconds): 0–2.5 s: the black cat sits upright on a red cushion at the head of the feast table, tail curled, gold collar glinting. 2.5–5.5 s: a guest approaches and bows deeply, almost to the floor, with great ceremony. 5.5–8 s: the cat looks away, lifts a paw and licks it; the guest stays bowed, then peeks up hopefully. Camera: locked-off and perfectly still, eye-level medium shot with the cat and the bowing guest both in frame; the framing never changes (no tilt, pan, zoom or rising camera). Audio: voice-over narration only (a voice, never shown on screen; no narrator character appears): a British male voice, warm and dry, begins speaking within half a second and says: “Egyptians adored cats. This one knew it. A guest bowed. The cat shrugged.” The line takes about 5.2 seconds; leave the last second free of speech so the moment can land. Music: playful comic percussion over the wedding rhythm, low under the voice. Sound effects: tiny comic sting, soft cat purr, timed to the action. Ambience: light courtyard ambience: clinking cups, footsteps on stone, a soft breeze, no words. Final reminder: no character says any word; only the voice-over narration speaks (voice only, nobody on screen is the narrator). Natural laughs, gasps and sighs are fine. No text, captions or logos in the frame.</w:t>
       </w:r>
     </w:p>
     <w:p>
@@ -1076,7 +1154,7 @@
           <w:sz w:val="26"/>
           <w:szCs w:val="26"/>
         </w:rPr>
-        <w:t xml:space="preserve">SHOT 10 — The cat</w:t>
+        <w:t xml:space="preserve">SHOT 12 — Senbi's confidence</w:t>
       </w:r>
     </w:p>
     <w:p>
@@ -1100,7 +1178,7 @@
           <w:sz w:val="21"/>
           <w:szCs w:val="21"/>
         </w:rPr>
-        <w:t xml:space="preserve">Black_cat.png,  Courtyard_from_Shot1.png</w:t>
+        <w:t xml:space="preserve">Senbi_from_Shot1.png,  Courtyard_from_Shot1.png</w:t>
       </w:r>
       <w:r>
         <w:rPr>
@@ -1132,7 +1210,7 @@
           <w:sz w:val="20"/>
           <w:szCs w:val="20"/>
         </w:rPr>
-        <w:t xml:space="preserve">VOICE RULE: only the voice-over narration speaks words; it is a voice only, never a person or character on screen. No character says any word and no one on screen lip-syncs to speech; characters communicate with facial expressions and body gestures. Natural non-verbal sounds are allowed and should sound real: laughing, giggling, gasping, sighing, groaning, cheering, coughing. Attached reference images, in order: the black cat, the wedding courtyard. 2D hand-drawn stickman cartoon in the exact style of the reference images: thin black outlines, large expressive heads, thin stick arms, flat warm colors, playful documentary-comedy tone, 16:9. Characters, identical in every frame: the cat: black with a small gold collar. the guests: Egyptian wedding guests in white linen with blue-and-gold collars and gold headbands, black bob hairstyles, some in white striped headdresses. Setting: sunny daytime wedding courtyard in ancient Alexandria, sandstone columns with painted blue-and-gold bands, long tables with white cloths and clay jars, orange cloth awnings, and a tall wooden entrance gate at the back-center that opens onto the street. Lighting: warm bright afternoon sunlight, soft shadows, rich saturated colors. ACTION TIMELINE (8 seconds): 0–2.5 s: the black cat sits upright on a red cushion at the head of the feast table, tail curled, gold collar glinting. 2.5–5.5 s: a guest approaches and bows deeply, almost to the floor, with great ceremony. 5.5–8 s: the cat looks away, lifts a paw and licks it; the guest stays bowed, then peeks up hopefully. Camera: locked-off and perfectly still, eye-level medium shot with the cat and the bowing guest both in frame; the framing never changes (no tilt, pan, zoom or rising camera). Audio: voice-over narration only (a voice, never shown on screen; no narrator character appears): a British male voice, warm and dry, begins speaking within half a second and says: “Egyptians adored cats. This one knew it. A guest bowed. The cat shrugged.” The line takes about 5.2 seconds; leave the last second free of speech so the moment can land. Music: playful comic percussion over the wedding rhythm, low under the voice. Sound effects: tiny comic sting, soft cat purr, timed to the action. Ambience: light courtyard ambience: clinking cups, footsteps on stone, a soft breeze, no words. Final reminder: no character says any word; only the voice-over narration speaks (voice only, nobody on screen is the narrator). Natural laughs, gasps and sighs are fine. No text, captions or logos in the frame.</w:t>
+        <w:t xml:space="preserve">VOICE RULE: only the voice-over narration speaks words; it is a voice only, never a person or character on screen. No character says any word and no one on screen lip-syncs to speech; characters communicate with facial expressions and body gestures. Natural non-verbal sounds are allowed and should sound real: laughing, giggling, gasping, sighing, groaning, cheering, coughing. Attached reference images, in order: Senbi, the groom, the wedding courtyard. 2D hand-drawn stickman cartoon in the exact style of the reference images: thin black outlines, large expressive heads, thin stick arms, flat warm colors, playful documentary-comedy tone, 16:9. Characters, identical in every frame: Senbi the groom: young man, straight black bowl-cut hair with bangs, gold headband with a gold cobra, bare chest, blue-and-gold broad collar, gold bracers, white kilt with a blue-and-gold sash, brown sandals, thin black stick arms. Setting: sunny daytime wedding courtyard in ancient Alexandria, sandstone columns with painted blue-and-gold bands, long tables with white cloths and clay jars, orange cloth awnings, and a tall wooden entrance gate at the back-center that opens onto the street. Lighting: warm bright afternoon sunlight, soft shadows, rich saturated colors. ACTION TIMELINE (8 seconds): 0–2.5 s: Senbi dances with huge confidence, big arm swings, chin up. 2.5–5.5 s: he loses his balance, arms windmilling, one foot wobbling. 5.5–8 s: he snaps upright and freezes in a proud pose with one arm raised as if the stumble was choreography; his eyes slide sideways to check whether anyone saw. Camera: locked-off and perfectly still, eye-level medium shot of Senbi, full body in frame; the framing never changes (no tilt, pan, zoom or rising camera). Audio: voice-over narration only (a voice, never shown on screen; no narrator character appears): a British male voice, warm and dry, begins speaking within half a second and says: “Senbi nearly fell, recovered, and pretended that was the choreography. Nobody believed him.” The line takes about 5.2 seconds; leave the last second free of speech so the moment can land. Music: playful comic percussion over the wedding rhythm, low under the voice. Sound effects: foot scuff, comic wobble, laughter, timed to the action. Ambience: light courtyard ambience: clinking cups, footsteps on stone, a soft breeze, no words. Final reminder: no character says any word; only the voice-over narration speaks (voice only, nobody on screen is the narrator). Natural laughs, gasps and sighs are fine. No text, captions or logos in the frame.</w:t>
       </w:r>
     </w:p>
     <w:p>
@@ -1149,7 +1227,7 @@
           <w:sz w:val="26"/>
           <w:szCs w:val="26"/>
         </w:rPr>
-        <w:t xml:space="preserve">SHOT 11 — Music begins</w:t>
+        <w:t xml:space="preserve">SHOT 13 — Bride reaction</w:t>
       </w:r>
     </w:p>
     <w:p>
@@ -1173,7 +1251,7 @@
           <w:sz w:val="21"/>
           <w:szCs w:val="21"/>
         </w:rPr>
-        <w:t xml:space="preserve">Guests_group.png,  Courtyard_from_Shot1.png</w:t>
+        <w:t xml:space="preserve">Bride_from_Shot1.png,  Courtyard_from_Shot1.png</w:t>
       </w:r>
       <w:r>
         <w:rPr>
@@ -1205,7 +1283,7 @@
           <w:sz w:val="20"/>
           <w:szCs w:val="20"/>
         </w:rPr>
-        <w:t xml:space="preserve">VOICE RULE: only the voice-over narration speaks words; it is a voice only, never a person or character on screen. No character says any word and no one on screen lip-syncs to speech; characters communicate with facial expressions and body gestures. Natural non-verbal sounds are allowed and should sound real: laughing, giggling, gasping, sighing, groaning, cheering, coughing. Attached reference images, in order: the Egyptian wedding guests, the wedding courtyard. 2D hand-drawn stickman cartoon in the exact style of the reference images: thin black outlines, large expressive heads, thin stick arms, flat warm colors, playful documentary-comedy tone, 16:9. Characters, identical in every frame: the musicians: guests in white linen playing harp, frame drum and reed flute. the guests: Egyptian wedding guests in white linen with blue-and-gold collars and gold headbands, black bob hairstyles, some in white striped headdresses. Senbi the groom: young man, straight black bowl-cut hair with bangs, gold headband with a gold cobra, bare chest, blue-and-gold broad collar, gold bracers, white kilt with a blue-and-gold sash, brown sandals, thin black stick arms. Setting: sunny daytime wedding courtyard in ancient Alexandria, sandstone columns with painted blue-and-gold bands, long tables with white cloths and clay jars, orange cloth awnings, and a tall wooden entrance gate at the back-center that opens onto the street. Lighting: warm bright afternoon sunlight, soft shadows, rich saturated colors. ACTION TIMELINE (8 seconds): 0–2.5 s: musicians seated at the side tables play harp, frame drum and reed flute, nodding with the rhythm while guests spin and clap in the center. 2.5–5.5 s: Senbi walks onto the dance floor from the left with a confident grin, rolling his shoulders. 5.5–8 s: he opens his arms wide as if presenting himself and nearby guests react with delighted cheers and claps. Camera: locked-off and perfectly still, eye-level wide shot of the musicians and dancers; the framing never changes (no tilt, pan, zoom or rising camera). Audio: voice-over narration only (a voice, never shown on screen; no narrator character appears): a British male voice, warm and dry, begins speaking within half a second and says: “Then the music began, and Senbi decided this was his moment.” The line takes about 4.4 seconds; leave the last second free of speech so the moment can land. Music: light ancient-Mediterranean wedding music (frame drums, reed flute, plucked strings), same theme in every clip, low under the voice. Sound effects: harp and drums swelling, clapping, timed to the action. Ambience: light courtyard ambience: clinking cups, footsteps on stone, a soft breeze, no words. Final reminder: no character says any word; only the voice-over narration speaks (voice only, nobody on screen is the narrator). Natural laughs, gasps and sighs are fine. No text, captions or logos in the frame.</w:t>
+        <w:t xml:space="preserve">VOICE RULE: only the voice-over narration speaks words; it is a voice only, never a person or character on screen. No character says any word and no one on screen lip-syncs to speech; characters communicate with facial expressions and body gestures. Natural non-verbal sounds are allowed and should sound real: laughing, giggling, gasping, sighing, groaning, cheering, coughing. Attached reference images, in order: the bride, the wedding courtyard. 2D hand-drawn stickman cartoon in the exact style of the reference images: thin black outlines, large expressive heads, thin stick arms, flat warm colors, playful documentary-comedy tone, 16:9. Characters, identical in every frame: the bride: black bob hair with straight bangs, gold headband with a red gem, white dress, blue-and-gold collar, gold sash, gold arm cuffs, light veil. Setting: sunny daytime wedding courtyard in ancient Alexandria, sandstone columns with painted blue-and-gold bands, long tables with white cloths and clay jars, orange cloth awnings, and a tall wooden entrance gate at the back-center that opens onto the street. Lighting: warm bright afternoon sunlight, soft shadows, rich saturated colors. ACTION TIMELINE (8 seconds): 0–2.5 s: the bride watches, amused, with sparkling eyes. 2.5–5.5 s: she presses her lips together to look composed while her shoulders start to shake. 5.5–8 s: she raises a hand and hides her smile behind it, eyes crinkled, and a small suppressed giggle escapes. Camera: locked-off and perfectly still, eye-level close-up of the bride's face; the framing never changes (no tilt, pan, zoom or rising camera). Audio: voice-over narration only (a voice, never shown on screen; no narrator character appears): a British male voice, warm and dry, begins speaking within half a second and says: “His bride was trying very hard not to laugh. She loved him. Mostly.” The line takes about 5.2 seconds; leave the last second free of speech so the moment can land. Music: light ancient-Mediterranean wedding music (frame drums, reed flute, plucked strings), same theme in every clip, low under the voice. Sound effects: suppressed giggle, timed to the action. Ambience: light courtyard ambience: clinking cups, footsteps on stone, a soft breeze, no words. Final reminder: no character says any word; only the voice-over narration speaks (voice only, nobody on screen is the narrator). Natural laughs, gasps and sighs are fine. No text, captions or logos in the frame.</w:t>
       </w:r>
     </w:p>
     <w:p>
@@ -1222,7 +1300,24 @@
           <w:sz w:val="26"/>
           <w:szCs w:val="26"/>
         </w:rPr>
-        <w:t xml:space="preserve">SHOT 12 — Senbi's confidence</w:t>
+        <w:t xml:space="preserve">SHOT 15 — Food judge   (optional)</w:t>
+      </w:r>
+    </w:p>
+    <w:p>
+      <w:pPr>
+        <w:keepNext/>
+        <w:spacing w:after="40" w:before="0"/>
+      </w:pPr>
+      <w:r>
+        <w:rPr>
+          <w:rFonts w:ascii="Arial" w:cs="Arial" w:eastAsia="Arial" w:hAnsi="Arial"/>
+          <w:i/>
+          <w:iCs/>
+          <w:color w:val="555555"/>
+          <w:sz w:val="19"/>
+          <w:szCs w:val="19"/>
+        </w:rPr>
+        <w:t xml:space="preserve">Optional: skip this shot to make the video faster.</w:t>
       </w:r>
     </w:p>
     <w:p>
@@ -1246,7 +1341,7 @@
           <w:sz w:val="21"/>
           <w:szCs w:val="21"/>
         </w:rPr>
-        <w:t xml:space="preserve">Senbi_from_Shot1.png,  Courtyard_from_Shot1.png</w:t>
+        <w:t xml:space="preserve">Guests_group.png,  Courtyard_from_Shot1.png</w:t>
       </w:r>
       <w:r>
         <w:rPr>
@@ -1278,7 +1373,7 @@
           <w:sz w:val="20"/>
           <w:szCs w:val="20"/>
         </w:rPr>
-        <w:t xml:space="preserve">VOICE RULE: only the voice-over narration speaks words; it is a voice only, never a person or character on screen. No character says any word and no one on screen lip-syncs to speech; characters communicate with facial expressions and body gestures. Natural non-verbal sounds are allowed and should sound real: laughing, giggling, gasping, sighing, groaning, cheering, coughing. Attached reference images, in order: Senbi, the groom, the wedding courtyard. 2D hand-drawn stickman cartoon in the exact style of the reference images: thin black outlines, large expressive heads, thin stick arms, flat warm colors, playful documentary-comedy tone, 16:9. Characters, identical in every frame: Senbi the groom: young man, straight black bowl-cut hair with bangs, gold headband with a gold cobra, bare chest, blue-and-gold broad collar, gold bracers, white kilt with a blue-and-gold sash, brown sandals, thin black stick arms. Setting: sunny daytime wedding courtyard in ancient Alexandria, sandstone columns with painted blue-and-gold bands, long tables with white cloths and clay jars, orange cloth awnings, and a tall wooden entrance gate at the back-center that opens onto the street. Lighting: warm bright afternoon sunlight, soft shadows, rich saturated colors. ACTION TIMELINE (8 seconds): 0–2.5 s: Senbi dances with huge confidence, big arm swings, chin up. 2.5–5.5 s: he loses his balance, arms windmilling, one foot wobbling. 5.5–8 s: he snaps upright and freezes in a proud pose with one arm raised as if the stumble was choreography; his eyes slide sideways to check whether anyone saw. Camera: locked-off and perfectly still, eye-level medium shot of Senbi, full body in frame; the framing never changes (no tilt, pan, zoom or rising camera). Audio: voice-over narration only (a voice, never shown on screen; no narrator character appears): a British male voice, warm and dry, begins speaking within half a second and says: “Senbi nearly fell, recovered, and pretended that was the choreography. Nobody believed him.” The line takes about 5.2 seconds; leave the last second free of speech so the moment can land. Music: playful comic percussion over the wedding rhythm, low under the voice. Sound effects: foot scuff, comic wobble, laughter, timed to the action. Ambience: light courtyard ambience: clinking cups, footsteps on stone, a soft breeze, no words. Final reminder: no character says any word; only the voice-over narration speaks (voice only, nobody on screen is the narrator). Natural laughs, gasps and sighs are fine. No text, captions or logos in the frame.</w:t>
+        <w:t xml:space="preserve">VOICE RULE: only the voice-over narration speaks words; it is a voice only, never a person or character on screen. No character says any word and no one on screen lip-syncs to speech; characters communicate with facial expressions and body gestures. Natural non-verbal sounds are allowed and should sound real: laughing, giggling, gasping, sighing, groaning, cheering, coughing. Attached reference images, in order: the Egyptian wedding guests, the wedding courtyard. 2D hand-drawn stickman cartoon in the exact style of the reference images: thin black outlines, large expressive heads, thin stick arms, flat warm colors, playful documentary-comedy tone, 16:9. Characters, identical in every frame: the older woman: middle-aged woman in white linen with a red-orange sash. Setting: sunny daytime wedding courtyard in ancient Alexandria, sandstone columns with painted blue-and-gold bands, long tables with white cloths and clay jars, orange cloth awnings, and a tall wooden entrance gate at the back-center that opens onto the street. Lighting: warm bright afternoon sunlight, soft shadows, rich saturated colors. ACTION TIMELINE (8 seconds): 0–2.5 s: an older woman at the feast table lifts a spoonful from a dish and inspects it with exaggerated seriousness, squinting. 2.5–5.5 s: she tastes it and chews slowly, eyes narrowed. 5.5–8 s: after a long pause she gives a reluctant nod, lips pursed, as if grudgingly approving. Camera: locked-off and perfectly still, eye-level close-up of the woman's face and the dish; the framing never changes (no tilt, pan, zoom or rising camera). Audio: voice-over narration only (a voice, never shown on screen; no narrator character appears): a British male voice, warm and dry, begins speaking within half a second and says: “One aunt inspected the food like a tax auditor. Verdict: suspicious, but edible.” The line takes about 5.2 seconds; leave the last second free of speech so the moment can land. Music: playful comic percussion over the wedding rhythm, low under the voice. Sound effects: spoon tapping a bowl, suspicious hum, timed to the action. Ambience: light courtyard ambience: clinking cups, footsteps on stone, a soft breeze, no words. Final reminder: no character says any word; only the voice-over narration speaks (voice only, nobody on screen is the narrator). Natural laughs, gasps and sighs are fine. No text, captions or logos in the frame.</w:t>
       </w:r>
     </w:p>
     <w:p>
@@ -1295,7 +1390,7 @@
           <w:sz w:val="26"/>
           <w:szCs w:val="26"/>
         </w:rPr>
-        <w:t xml:space="preserve">SHOT 13 — Bride reaction</w:t>
+        <w:t xml:space="preserve">SHOT 16 — Headrest gift</w:t>
       </w:r>
     </w:p>
     <w:p>
@@ -1319,7 +1414,7 @@
           <w:sz w:val="21"/>
           <w:szCs w:val="21"/>
         </w:rPr>
-        <w:t xml:space="preserve">Bride_from_Shot1.png,  Courtyard_from_Shot1.png</w:t>
+        <w:t xml:space="preserve">Senbi_from_Shot1.png,  Relatives_group.png,  Courtyard_from_Shot1.png</w:t>
       </w:r>
       <w:r>
         <w:rPr>
@@ -1351,7 +1446,7 @@
           <w:sz w:val="20"/>
           <w:szCs w:val="20"/>
         </w:rPr>
-        <w:t xml:space="preserve">VOICE RULE: only the voice-over narration speaks words; it is a voice only, never a person or character on screen. No character says any word and no one on screen lip-syncs to speech; characters communicate with facial expressions and body gestures. Natural non-verbal sounds are allowed and should sound real: laughing, giggling, gasping, sighing, groaning, cheering, coughing. Attached reference images, in order: the bride, the wedding courtyard. 2D hand-drawn stickman cartoon in the exact style of the reference images: thin black outlines, large expressive heads, thin stick arms, flat warm colors, playful documentary-comedy tone, 16:9. Characters, identical in every frame: the bride: black bob hair with straight bangs, gold headband with a red gem, white dress, blue-and-gold collar, gold sash, gold arm cuffs, light veil. Setting: sunny daytime wedding courtyard in ancient Alexandria, sandstone columns with painted blue-and-gold bands, long tables with white cloths and clay jars, orange cloth awnings, and a tall wooden entrance gate at the back-center that opens onto the street. Lighting: warm bright afternoon sunlight, soft shadows, rich saturated colors. ACTION TIMELINE (8 seconds): 0–2.5 s: the bride watches, amused, with sparkling eyes. 2.5–5.5 s: she presses her lips together to look composed while her shoulders start to shake. 5.5–8 s: she raises a hand and hides her smile behind it, eyes crinkled, and a small suppressed giggle escapes. Camera: locked-off and perfectly still, eye-level close-up of the bride's face; the framing never changes (no tilt, pan, zoom or rising camera). Audio: voice-over narration only (a voice, never shown on screen; no narrator character appears): a British male voice, warm and dry, begins speaking within half a second and says: “His bride was trying very hard not to laugh. She loved him. Mostly.” The line takes about 5.2 seconds; leave the last second free of speech so the moment can land. Music: light ancient-Mediterranean wedding music (frame drums, reed flute, plucked strings), same theme in every clip, low under the voice. Sound effects: suppressed giggle, timed to the action. Ambience: light courtyard ambience: clinking cups, footsteps on stone, a soft breeze, no words. Final reminder: no character says any word; only the voice-over narration speaks (voice only, nobody on screen is the narrator). Natural laughs, gasps and sighs are fine. No text, captions or logos in the frame.</w:t>
+        <w:t xml:space="preserve">VOICE RULE: only the voice-over narration speaks words; it is a voice only, never a person or character on screen. No character says any word and no one on screen lip-syncs to speech; characters communicate with facial expressions and body gestures. Natural non-verbal sounds are allowed and should sound real: laughing, giggling, gasping, sighing, groaning, cheering, coughing. Attached reference images, in order: Senbi, the groom, the bride's relatives, the wedding courtyard. 2D hand-drawn stickman cartoon in the exact style of the reference images: thin black outlines, large expressive heads, thin stick arms, flat warm colors, playful documentary-comedy tone, 16:9. Characters, identical in every frame: the bride's father: bearded middle-aged man in a beige tunic with a purple sash. Senbi the groom: young man, straight black bowl-cut hair with bangs, gold headband with a gold cobra, bare chest, blue-and-gold broad collar, gold bracers, white kilt with a blue-and-gold sash, brown sandals, thin black stick arms. Setting: sunny daytime wedding courtyard in ancient Alexandria, sandstone columns with painted blue-and-gold bands, long tables with white cloths and clay jars, orange cloth awnings, and a tall wooden entrance gate at the back-center that opens onto the street. Lighting: warm bright afternoon sunlight, soft shadows, rich saturated colors. ACTION TIMELINE (8 seconds): 0–2.5 s: the bride's bearded father steps in, holding a carved wooden headrest proudly in both hands, beaming. 2.5–5.5 s: Senbi accepts it with a polite smile and a nod of thanks. 5.5–8 s: he glances down at the object, his smile tightens and his eyebrows lift in concern while the father keeps beaming. Camera: locked-off and perfectly still, eye-level medium two-shot of Senbi and the father; the framing never changes (no tilt, pan, zoom or rising camera). Audio: voice-over narration only (a voice, never shown on screen; no narrator character appears): a British male voice, warm and dry, begins speaking within half a second and says: “Then, the gift: a wooden headrest. Egyptians really did sleep on these.” The line takes about 4.8 seconds; leave the last second free of speech so the moment can land. Music: light ancient-Mediterranean wedding music (frame drums, reed flute, plucked strings), same theme in every clip, low under the voice. Sound effects: one wooden knock, timed to the action. Ambience: light courtyard ambience: clinking cups, footsteps on stone, a soft breeze, no words. Final reminder: no character says any word; only the voice-over narration speaks (voice only, nobody on screen is the narrator). Natural laughs, gasps and sighs are fine. No text, captions or logos in the frame.</w:t>
       </w:r>
     </w:p>
     <w:p>
@@ -1368,7 +1463,7 @@
           <w:sz w:val="26"/>
           <w:szCs w:val="26"/>
         </w:rPr>
-        <w:t xml:space="preserve">SHOT 14 — Guests celebrate</w:t>
+        <w:t xml:space="preserve">SHOT 17 — Trying the headrest</w:t>
       </w:r>
     </w:p>
     <w:p>
@@ -1392,7 +1487,7 @@
           <w:sz w:val="21"/>
           <w:szCs w:val="21"/>
         </w:rPr>
-        <w:t xml:space="preserve">Guests_group.png,  Courtyard_from_Shot1.png</w:t>
+        <w:t xml:space="preserve">Senbi_from_Shot1.png</w:t>
       </w:r>
       <w:r>
         <w:rPr>
@@ -1424,7 +1519,7 @@
           <w:sz w:val="20"/>
           <w:szCs w:val="20"/>
         </w:rPr>
-        <w:t xml:space="preserve">VOICE RULE: only the voice-over narration speaks words; it is a voice only, never a person or character on screen. No character says any word and no one on screen lip-syncs to speech; characters communicate with facial expressions and body gestures. Natural non-verbal sounds are allowed and should sound real: laughing, giggling, gasping, sighing, groaning, cheering, coughing. Attached reference images, in order: the Egyptian wedding guests, the wedding courtyard. 2D hand-drawn stickman cartoon in the exact style of the reference images: thin black outlines, large expressive heads, thin stick arms, flat warm colors, playful documentary-comedy tone, 16:9. Characters, identical in every frame: the guests: Egyptian wedding guests in white linen with blue-and-gold collars and gold headbands, black bob hairstyles, some in white striped headdresses. Setting: sunny daytime wedding courtyard in ancient Alexandria, sandstone columns with painted blue-and-gold bands, long tables with white cloths and clay jars, orange cloth awnings, and a tall wooden entrance gate at the back-center that opens onto the street. Lighting: warm bright afternoon sunlight, soft shadows, rich saturated colors. ACTION TIMELINE (8 seconds): 0–2.5 s: young and old guests clap and dance in a joyful crowd. 2.5–5.5 s: several guests raise clay cups together. 5.5–8 s: they cheer and clink cups; an old man stomps along with the rhythm. Camera: locked-off and perfectly still, eye-level wide-medium shot with several guests in frame; the framing never changes (no tilt, pan, zoom or rising camera). Audio: voice-over narration only (a voice, never shown on screen; no narrator character appears): a British male voice, warm and dry, begins speaking within half a second and says: “Everyone danced and raised a cup, the one thing every wedding agrees on.” The line takes about 5.2 seconds; leave the last second free of speech so the moment can land. Music: light ancient-Mediterranean wedding music (frame drums, reed flute, plucked strings), same theme in every clip, low under the voice. Sound effects: clapping, cups clinking, laughter, timed to the action. Ambience: light courtyard ambience: clinking cups, footsteps on stone, a soft breeze, no words. Final reminder: no character says any word; only the voice-over narration speaks (voice only, nobody on screen is the narrator). Natural laughs, gasps and sighs are fine. No text, captions or logos in the frame.</w:t>
+        <w:t xml:space="preserve">VOICE RULE: only the voice-over narration speaks words; it is a voice only, never a person or character on screen. No character says any word and no one on screen lip-syncs to speech; characters communicate with facial expressions and body gestures. Natural non-verbal sounds are allowed and should sound real: laughing, giggling, gasping, sighing, groaning, cheering, coughing. Attached reference images, in order: Senbi, the groom. 2D hand-drawn stickman cartoon in the exact style of the reference images: thin black outlines, large expressive heads, thin stick arms, flat warm colors, playful documentary-comedy tone, 16:9. Characters, identical in every frame: Senbi the groom: young man, straight black bowl-cut hair with bangs, gold headband with a gold cobra, bare chest, blue-and-gold broad collar, gold bracers, white kilt with a blue-and-gold sash, brown sandals, thin black stick arms. Setting: sunny daytime wedding courtyard in ancient Alexandria, sandstone columns with painted blue-and-gold bands, long tables with white cloths and clay jars, orange cloth awnings, and a tall wooden entrance gate at the back-center that opens onto the street. Lighting: warm bright afternoon sunlight, soft shadows, rich saturated colors. ACTION TIMELINE (8 seconds): 0–2.5 s: Senbi sits on a reed mat and places the wooden headrest under his neck. 2.5–5.5 s: he lowers his head onto it and freezes, eyes wide, mouth a tight line, a bead of sweat on his temple. 5.5–8 s: he gives a stiff thumbs-up to someone off-screen, his forced smile trembling. Camera: locked-off and perfectly still, eye-level medium shot of Senbi with the headrest; the framing never changes (no tilt, pan, zoom or rising camera). Audio: voice-over narration only (a voice, never shown on screen; no narrator character appears): a British male voice, warm and dry, begins speaking within half a second and says: “Senbi lay down. His neck filed a formal complaint. His thumbs-up said otherwise.” The line takes about 5.2 seconds; leave the last second free of speech so the moment can land. Music: playful comic percussion over the wedding rhythm, low under the voice. Sound effects: comic wooden creak, timed to the action. Ambience: light courtyard ambience: clinking cups, footsteps on stone, a soft breeze, no words. Final reminder: no character says any word; only the voice-over narration speaks (voice only, nobody on screen is the narrator). Natural laughs, gasps and sighs are fine. No text, captions or logos in the frame.</w:t>
       </w:r>
     </w:p>
     <w:p>
@@ -1441,7 +1536,7 @@
           <w:sz w:val="26"/>
           <w:szCs w:val="26"/>
         </w:rPr>
-        <w:t xml:space="preserve">SHOT 15 — Food judge</w:t>
+        <w:t xml:space="preserve">SHOT 18 — Wedding peak</w:t>
       </w:r>
     </w:p>
     <w:p>
@@ -1465,7 +1560,7 @@
           <w:sz w:val="21"/>
           <w:szCs w:val="21"/>
         </w:rPr>
-        <w:t xml:space="preserve">Guests_group.png,  Courtyard_from_Shot1.png</w:t>
+        <w:t xml:space="preserve">Guests_group.png,  Bride_from_Shot1.png,  Senbi_from_Shot1.png</w:t>
       </w:r>
       <w:r>
         <w:rPr>
@@ -1497,7 +1592,7 @@
           <w:sz w:val="20"/>
           <w:szCs w:val="20"/>
         </w:rPr>
-        <w:t xml:space="preserve">VOICE RULE: only the voice-over narration speaks words; it is a voice only, never a person or character on screen. No character says any word and no one on screen lip-syncs to speech; characters communicate with facial expressions and body gestures. Natural non-verbal sounds are allowed and should sound real: laughing, giggling, gasping, sighing, groaning, cheering, coughing. Attached reference images, in order: the Egyptian wedding guests, the wedding courtyard. 2D hand-drawn stickman cartoon in the exact style of the reference images: thin black outlines, large expressive heads, thin stick arms, flat warm colors, playful documentary-comedy tone, 16:9. Characters, identical in every frame: the older woman: middle-aged woman in white linen with a red-orange sash. Setting: sunny daytime wedding courtyard in ancient Alexandria, sandstone columns with painted blue-and-gold bands, long tables with white cloths and clay jars, orange cloth awnings, and a tall wooden entrance gate at the back-center that opens onto the street. Lighting: warm bright afternoon sunlight, soft shadows, rich saturated colors. ACTION TIMELINE (8 seconds): 0–2.5 s: an older woman at the feast table lifts a spoonful from a dish and inspects it with exaggerated seriousness, squinting. 2.5–5.5 s: she tastes it and chews slowly, eyes narrowed. 5.5–8 s: after a long pause she gives a reluctant nod, lips pursed, as if grudgingly approving. Camera: locked-off and perfectly still, eye-level close-up of the woman's face and the dish; the framing never changes (no tilt, pan, zoom or rising camera). Audio: voice-over narration only (a voice, never shown on screen; no narrator character appears): a British male voice, warm and dry, begins speaking within half a second and says: “One aunt inspected the food like a tax auditor. Verdict: suspicious, but edible.” The line takes about 5.2 seconds; leave the last second free of speech so the moment can land. Music: playful comic percussion over the wedding rhythm, low under the voice. Sound effects: spoon tapping a bowl, suspicious hum, timed to the action. Ambience: light courtyard ambience: clinking cups, footsteps on stone, a soft breeze, no words. Final reminder: no character says any word; only the voice-over narration speaks (voice only, nobody on screen is the narrator). Natural laughs, gasps and sighs are fine. No text, captions or logos in the frame.</w:t>
+        <w:t xml:space="preserve">VOICE RULE: only the voice-over narration speaks words; it is a voice only, never a person or character on screen. No character says any word and no one on screen lip-syncs to speech; characters communicate with facial expressions and body gestures. Natural non-verbal sounds are allowed and should sound real: laughing, giggling, gasping, sighing, groaning, cheering, coughing. Attached reference images, in order: the Egyptian wedding guests, the bride, Senbi, the groom. 2D hand-drawn stickman cartoon in the exact style of the reference images: thin black outlines, large expressive heads, thin stick arms, flat warm colors, playful documentary-comedy tone, 16:9. Characters, identical in every frame: Senbi the groom: young man, straight black bowl-cut hair with bangs, gold headband with a gold cobra, bare chest, blue-and-gold broad collar, gold bracers, white kilt with a blue-and-gold sash, brown sandals, thin black stick arms. the bride: black bob hair with straight bangs, gold headband with a red gem, white dress, blue-and-gold collar, gold sash, gold arm cuffs, light veil. the guests: Egyptian wedding guests in white linen with blue-and-gold collars and gold headbands, black bob hairstyles, some in white striped headdresses. the musicians: guests in white linen playing harp, frame drum and reed flute. Setting: sunny daytime wedding courtyard in ancient Alexandria, sandstone columns with painted blue-and-gold bands, long tables with white cloths and clay jars, orange cloth awnings, and a tall wooden entrance gate at the back-center that opens onto the street. Lighting: warm bright afternoon sunlight, soft shadows, rich saturated colors. ACTION TIMELINE (8 seconds): 0–2.5 s: Senbi and the bride stand together at the center holding hands while musicians play and guests dance around them. 2.5–5.5 s: banners and flower garlands sway lightly in the breeze, couples spin, children run past. 5.5–8 s: Senbi and the bride exchange a loving look; everything is perfectly joyful. Camera: wide shot of the whole courtyard at eye level; fixed except for an almost imperceptible 5% slow push-in, no tilt or pan. Audio: voice-over narration only (a voice, never shown on screen; no narrator character appears): a British male voice, warm and dry, begins speaking within half a second and says: “For a few perfect minutes, everything was exactly right. Enjoy this part.” The line takes about 4.8 seconds; leave the last second free of speech so the moment can land. Music: light ancient-Mediterranean wedding music (frame drums, reed flute, plucked strings), same theme in every clip, low under the voice. Sound effects: applause, drums, wind in the banners, timed to the action. Ambience: light courtyard ambience: clinking cups, footsteps on stone, a soft breeze, no words. Final reminder: no character says any word; only the voice-over narration speaks (voice only, nobody on screen is the narrator). Natural laughs, gasps and sighs are fine. No text, captions or logos in the frame.</w:t>
       </w:r>
     </w:p>
     <w:p>
@@ -1514,7 +1609,7 @@
           <w:sz w:val="26"/>
           <w:szCs w:val="26"/>
         </w:rPr>
-        <w:t xml:space="preserve">SHOT 16 — Headrest gift</w:t>
+        <w:t xml:space="preserve">SHOT 19 — First warning</w:t>
       </w:r>
     </w:p>
     <w:p>
@@ -1538,7 +1633,7 @@
           <w:sz w:val="21"/>
           <w:szCs w:val="21"/>
         </w:rPr>
-        <w:t xml:space="preserve">Senbi_from_Shot1.png,  Relatives_group.png,  Courtyard_from_Shot1.png</w:t>
+        <w:t xml:space="preserve">Courtyard_from_Shot1.png</w:t>
       </w:r>
       <w:r>
         <w:rPr>
@@ -1570,7 +1665,7 @@
           <w:sz w:val="20"/>
           <w:szCs w:val="20"/>
         </w:rPr>
-        <w:t xml:space="preserve">VOICE RULE: only the voice-over narration speaks words; it is a voice only, never a person or character on screen. No character says any word and no one on screen lip-syncs to speech; characters communicate with facial expressions and body gestures. Natural non-verbal sounds are allowed and should sound real: laughing, giggling, gasping, sighing, groaning, cheering, coughing. Attached reference images, in order: Senbi, the groom, the bride's relatives, the wedding courtyard. 2D hand-drawn stickman cartoon in the exact style of the reference images: thin black outlines, large expressive heads, thin stick arms, flat warm colors, playful documentary-comedy tone, 16:9. Characters, identical in every frame: the bride's father: bearded middle-aged man in a beige tunic with a purple sash. Senbi the groom: young man, straight black bowl-cut hair with bangs, gold headband with a gold cobra, bare chest, blue-and-gold broad collar, gold bracers, white kilt with a blue-and-gold sash, brown sandals, thin black stick arms. Setting: sunny daytime wedding courtyard in ancient Alexandria, sandstone columns with painted blue-and-gold bands, long tables with white cloths and clay jars, orange cloth awnings, and a tall wooden entrance gate at the back-center that opens onto the street. Lighting: warm bright afternoon sunlight, soft shadows, rich saturated colors. ACTION TIMELINE (8 seconds): 0–2.5 s: the bride's bearded father steps in, holding a carved wooden headrest proudly in both hands, beaming. 2.5–5.5 s: Senbi accepts it with a polite smile and a nod of thanks. 5.5–8 s: he glances down at the object, his smile tightens and his eyebrows lift in concern while the father keeps beaming. Camera: locked-off and perfectly still, eye-level medium two-shot of Senbi and the father; the framing never changes (no tilt, pan, zoom or rising camera). Audio: voice-over narration only (a voice, never shown on screen; no narrator character appears): a British male voice, warm and dry, begins speaking within half a second and says: “Then, the gift: a wooden headrest. Egyptians really did sleep on these.” The line takes about 4.8 seconds; leave the last second free of speech so the moment can land. Music: light ancient-Mediterranean wedding music (frame drums, reed flute, plucked strings), same theme in every clip, low under the voice. Sound effects: one wooden knock, timed to the action. Ambience: light courtyard ambience: clinking cups, footsteps on stone, a soft breeze, no words. Final reminder: no character says any word; only the voice-over narration speaks (voice only, nobody on screen is the narrator). Natural laughs, gasps and sighs are fine. No text, captions or logos in the frame.</w:t>
+        <w:t xml:space="preserve">VOICE RULE: only the voice-over narration speaks words; it is a voice only, never a person or character on screen. No character says any word and no one on screen lip-syncs to speech; characters communicate with facial expressions and body gestures. Natural non-verbal sounds are allowed and should sound real: laughing, giggling, gasping, sighing, groaning, cheering, coughing. Attached reference images, in order: the wedding courtyard. 2D hand-drawn stickman cartoon in the exact style of the reference images: thin black outlines, large expressive heads, thin stick arms, flat warm colors, playful documentary-comedy tone, 16:9. Setting: sunny daytime wedding courtyard in ancient Alexandria, sandstone columns with painted blue-and-gold bands, long tables with white cloths and clay jars, orange cloth awnings, and a tall wooden entrance gate at the back-center that opens onto the street. Lighting: warm bright afternoon sunlight, soft shadows, rich saturated colors. ACTION TIMELINE (8 seconds): 0–2 s: a small clay cup stands still on a wedding table, out-of-focus guests dancing behind it. 2–4.5 s: the cup begins to tremble slightly, tiny ripples in the drink. 4.5–8 s: the tremble repeats rhythmically like distant footsteps, building, while the guests behind keep dancing, unaware. Camera: locked-off and perfectly still, extreme close-up of the cup; only the cup vibrates, the camera does not; the framing never changes (no tilt, pan, zoom or rising camera). Audio: voice-over narration only (a voice, never shown on screen; no narrator character appears): a British male voice, warm and dry, begins speaking within half a second and says: “Then a small cup on the table began to tremble. Nobody noticed.” The line takes about 4.8 seconds; leave the last second free of speech so the moment can land. Music: light ancient-Mediterranean wedding music (frame drums, reed flute, plucked strings) with a faint uneasy undertone, same theme in every clip, low under the voice. Sound effects: ceramic cup rattling, faint rumble, timed to the action. Ambience: light courtyard ambience: clinking cups, footsteps on stone, a soft breeze, no words. Final reminder: no character says any word; only the voice-over narration speaks (voice only, nobody on screen is the narrator). Natural laughs, gasps and sighs are fine. No text, captions or logos in the frame.</w:t>
       </w:r>
     </w:p>
     <w:p>
@@ -1587,7 +1682,7 @@
           <w:sz w:val="26"/>
           <w:szCs w:val="26"/>
         </w:rPr>
-        <w:t xml:space="preserve">SHOT 17 — Trying the headrest</w:t>
+        <w:t xml:space="preserve">SHOT 20 — Musician hears it</w:t>
       </w:r>
     </w:p>
     <w:p>
@@ -1611,7 +1706,7 @@
           <w:sz w:val="21"/>
           <w:szCs w:val="21"/>
         </w:rPr>
-        <w:t xml:space="preserve">Senbi_from_Shot1.png</w:t>
+        <w:t xml:space="preserve">Guests_group.png,  Courtyard_from_Shot1.png</w:t>
       </w:r>
       <w:r>
         <w:rPr>
@@ -1643,7 +1738,7 @@
           <w:sz w:val="20"/>
           <w:szCs w:val="20"/>
         </w:rPr>
-        <w:t xml:space="preserve">VOICE RULE: only the voice-over narration speaks words; it is a voice only, never a person or character on screen. No character says any word and no one on screen lip-syncs to speech; characters communicate with facial expressions and body gestures. Natural non-verbal sounds are allowed and should sound real: laughing, giggling, gasping, sighing, groaning, cheering, coughing. Attached reference images, in order: Senbi, the groom. 2D hand-drawn stickman cartoon in the exact style of the reference images: thin black outlines, large expressive heads, thin stick arms, flat warm colors, playful documentary-comedy tone, 16:9. Characters, identical in every frame: Senbi the groom: young man, straight black bowl-cut hair with bangs, gold headband with a gold cobra, bare chest, blue-and-gold broad collar, gold bracers, white kilt with a blue-and-gold sash, brown sandals, thin black stick arms. Setting: sunny daytime wedding courtyard in ancient Alexandria, sandstone columns with painted blue-and-gold bands, long tables with white cloths and clay jars, orange cloth awnings, and a tall wooden entrance gate at the back-center that opens onto the street. Lighting: warm bright afternoon sunlight, soft shadows, rich saturated colors. ACTION TIMELINE (8 seconds): 0–2.5 s: Senbi sits on a reed mat and places the wooden headrest under his neck. 2.5–5.5 s: he lowers his head onto it and freezes, eyes wide, mouth a tight line, a bead of sweat on his temple. 5.5–8 s: he gives a stiff thumbs-up to someone off-screen, his forced smile trembling. Camera: locked-off and perfectly still, eye-level medium shot of Senbi with the headrest; the framing never changes (no tilt, pan, zoom or rising camera). Audio: voice-over narration only (a voice, never shown on screen; no narrator character appears): a British male voice, warm and dry, begins speaking within half a second and says: “Senbi lay down. His neck filed a formal complaint. His thumbs-up said otherwise.” The line takes about 5.2 seconds; leave the last second free of speech so the moment can land. Music: playful comic percussion over the wedding rhythm, low under the voice. Sound effects: comic wooden creak, timed to the action. Ambience: light courtyard ambience: clinking cups, footsteps on stone, a soft breeze, no words. Final reminder: no character says any word; only the voice-over narration speaks (voice only, nobody on screen is the narrator). Natural laughs, gasps and sighs are fine. No text, captions or logos in the frame.</w:t>
+        <w:t xml:space="preserve">VOICE RULE: only the voice-over narration speaks words; it is a voice only, never a person or character on screen. No character says any word and no one on screen lip-syncs to speech; characters communicate with facial expressions and body gestures. Natural non-verbal sounds are allowed and should sound real: laughing, giggling, gasping, sighing, groaning, cheering, coughing. Attached reference images, in order: the Egyptian wedding guests, the wedding courtyard. 2D hand-drawn stickman cartoon in the exact style of the reference images: thin black outlines, large expressive heads, thin stick arms, flat warm colors, playful documentary-comedy tone, 16:9. Characters, identical in every frame: the musicians: guests in white linen playing harp, frame drum and reed flute. the guests: Egyptian wedding guests in white linen with blue-and-gold collars and gold headbands, black bob hairstyles, some in white striped headdresses. Setting: sunny daytime wedding courtyard in ancient Alexandria, sandstone columns with painted blue-and-gold bands, long tables with white cloths and clay jars, orange cloth awnings, and a tall wooden entrance gate at the back-center that opens onto the street. Lighting: warm bright afternoon sunlight, soft shadows, rich saturated colors. ACTION TIMELINE (8 seconds): 0–2.5 s: an Egyptian musician plays the reed flute joyfully, eyes closed, the open gate visible behind him. 2.5–5.5 s: he stops abruptly, eyes opening, flute lowered, his expression turning alert. 5.5–8 s: he turns his head toward the gate, brow furrowed, listening, while the dancers behind him dance one more beat and then slow down. Camera: locked-off and perfectly still, eye-level medium shot of the musician with the entrance visible behind him; the framing never changes (no tilt, pan, zoom or rising camera). Audio: voice-over narration only (a voice, never shown on screen; no narrator character appears): a British male voice, warm and dry, begins speaking within half a second and says: “The musician noticed. He stopped. Everyone else danced one more beat, blissfully unaware.” The line takes about 5.2 seconds; leave the last second free of speech so the moment can land. Music: music nearly silent. Sound effects: music and drums cut out, one drum stops, timed to the action. Ambience: light courtyard ambience: clinking cups, footsteps on stone, a soft breeze, no words. Final reminder: no character says any word; only the voice-over narration speaks (voice only, nobody on screen is the narrator). Natural laughs, gasps and sighs are fine. No text, captions or logos in the frame.</w:t>
       </w:r>
     </w:p>
     <w:p>
@@ -1660,7 +1755,7 @@
           <w:sz w:val="26"/>
           <w:szCs w:val="26"/>
         </w:rPr>
-        <w:t xml:space="preserve">SHOT 18 — Wedding peak</w:t>
+        <w:t xml:space="preserve">SHOT 22 — First Roman step</w:t>
       </w:r>
     </w:p>
     <w:p>
@@ -1684,7 +1779,7 @@
           <w:sz w:val="21"/>
           <w:szCs w:val="21"/>
         </w:rPr>
-        <w:t xml:space="preserve">Guests_group.png,  Bride_from_Shot1.png,  Senbi_from_Shot1.png</w:t>
+        <w:t xml:space="preserve">Roman_soldiers.png</w:t>
       </w:r>
       <w:r>
         <w:rPr>
@@ -1702,7 +1797,7 @@
           <w:sz w:val="21"/>
           <w:szCs w:val="21"/>
         </w:rPr>
-        <w:t xml:space="preserve">8 sec</w:t>
+        <w:t xml:space="preserve">4 sec</w:t>
       </w:r>
     </w:p>
     <w:p>
@@ -1716,7 +1811,7 @@
           <w:sz w:val="20"/>
           <w:szCs w:val="20"/>
         </w:rPr>
-        <w:t xml:space="preserve">VOICE RULE: only the voice-over narration speaks words; it is a voice only, never a person or character on screen. No character says any word and no one on screen lip-syncs to speech; characters communicate with facial expressions and body gestures. Natural non-verbal sounds are allowed and should sound real: laughing, giggling, gasping, sighing, groaning, cheering, coughing. Attached reference images, in order: the Egyptian wedding guests, the bride, Senbi, the groom. 2D hand-drawn stickman cartoon in the exact style of the reference images: thin black outlines, large expressive heads, thin stick arms, flat warm colors, playful documentary-comedy tone, 16:9. Characters, identical in every frame: Senbi the groom: young man, straight black bowl-cut hair with bangs, gold headband with a gold cobra, bare chest, blue-and-gold broad collar, gold bracers, white kilt with a blue-and-gold sash, brown sandals, thin black stick arms. the bride: black bob hair with straight bangs, gold headband with a red gem, white dress, blue-and-gold collar, gold sash, gold arm cuffs, light veil. the guests: Egyptian wedding guests in white linen with blue-and-gold collars and gold headbands, black bob hairstyles, some in white striped headdresses. the musicians: guests in white linen playing harp, frame drum and reed flute. Setting: sunny daytime wedding courtyard in ancient Alexandria, sandstone columns with painted blue-and-gold bands, long tables with white cloths and clay jars, orange cloth awnings, and a tall wooden entrance gate at the back-center that opens onto the street. Lighting: warm bright afternoon sunlight, soft shadows, rich saturated colors. ACTION TIMELINE (8 seconds): 0–2.5 s: Senbi and the bride stand together at the center holding hands while musicians play and guests dance around them. 2.5–5.5 s: banners and flower garlands sway lightly in the breeze, couples spin, children run past. 5.5–8 s: Senbi and the bride exchange a loving look; everything is perfectly joyful. Camera: wide shot of the whole courtyard at eye level; fixed except for an almost imperceptible 5% slow push-in, no tilt or pan. Audio: voice-over narration only (a voice, never shown on screen; no narrator character appears): a British male voice, warm and dry, begins speaking within half a second and says: “For a few perfect minutes, everything was exactly right. Enjoy this part.” The line takes about 4.8 seconds; leave the last second free of speech so the moment can land. Music: light ancient-Mediterranean wedding music (frame drums, reed flute, plucked strings), same theme in every clip, low under the voice. Sound effects: applause, drums, wind in the banners, timed to the action. Ambience: light courtyard ambience: clinking cups, footsteps on stone, a soft breeze, no words. Final reminder: no character says any word; only the voice-over narration speaks (voice only, nobody on screen is the narrator). Natural laughs, gasps and sighs are fine. No text, captions or logos in the frame.</w:t>
+        <w:t xml:space="preserve">VOICE RULE: nobody speaks and no voice of any kind is heard in this clip; it is a sound-effects-only beat. Attached reference images, in order: the Roman soldiers. 2D hand-drawn stickman cartoon in the exact style of the reference images: thin black outlines, large expressive heads, thin stick arms, flat warm colors, playful documentary-comedy tone, 16:9. Characters, identical in every frame: the Roman soldiers: crimson plumed helmets, steel armor, red cloaks, rectangular red shields. Setting: sunlit street of ancient Alexandria outside the wedding house, sandstone walls, palms, market stalls with red and blue awnings. Lighting: warm bright sunlight, soft shadows. ACTION TIMELINE (4 seconds): 0–1 s: empty sunlit stone paving, dust drifting. 1–2 s: the first heavy Roman boot steps into frame from the side, the hem of a red cloak visible, dust puffing. 2–3 s: the second boot follows. 3–4 s: a third step lands; only boots and lower legs are ever visible. Camera: locked-off and perfectly still, fixed ground-level frame on the street; the boots step into frame from the side and the camera never rises; the framing never changes (no tilt, pan, zoom or rising camera). Audio: no narration and no speech. Music: low sustained tension with distant marching drums, almost silent. Sound effects: heavy boot steps with metal clank, timed to each step. Ambience: sunlit street ambience: wind and distant clatter, no words. Final reminder: no voice of any kind in this clip. No text, captions or logos in the frame.</w:t>
       </w:r>
     </w:p>
     <w:p>
@@ -1733,7 +1828,7 @@
           <w:sz w:val="26"/>
           <w:szCs w:val="26"/>
         </w:rPr>
-        <w:t xml:space="preserve">SHOT 19 — First warning</w:t>
+        <w:t xml:space="preserve">SHOT 24 — Wedding oblivious</w:t>
       </w:r>
     </w:p>
     <w:p>
@@ -1757,7 +1852,7 @@
           <w:sz w:val="21"/>
           <w:szCs w:val="21"/>
         </w:rPr>
-        <w:t xml:space="preserve">Courtyard_from_Shot1.png</w:t>
+        <w:t xml:space="preserve">Courtyard_from_Shot1.png,  Senbi_from_Shot1.png,  Bride_from_Shot1.png</w:t>
       </w:r>
       <w:r>
         <w:rPr>
@@ -1775,7 +1870,7 @@
           <w:sz w:val="21"/>
           <w:szCs w:val="21"/>
         </w:rPr>
-        <w:t xml:space="preserve">8 sec</w:t>
+        <w:t xml:space="preserve">6 sec</w:t>
       </w:r>
     </w:p>
     <w:p>
@@ -1789,7 +1884,7 @@
           <w:sz w:val="20"/>
           <w:szCs w:val="20"/>
         </w:rPr>
-        <w:t xml:space="preserve">VOICE RULE: only the voice-over narration speaks words; it is a voice only, never a person or character on screen. No character says any word and no one on screen lip-syncs to speech; characters communicate with facial expressions and body gestures. Natural non-verbal sounds are allowed and should sound real: laughing, giggling, gasping, sighing, groaning, cheering, coughing. Attached reference images, in order: the wedding courtyard. 2D hand-drawn stickman cartoon in the exact style of the reference images: thin black outlines, large expressive heads, thin stick arms, flat warm colors, playful documentary-comedy tone, 16:9. Setting: sunny daytime wedding courtyard in ancient Alexandria, sandstone columns with painted blue-and-gold bands, long tables with white cloths and clay jars, orange cloth awnings, and a tall wooden entrance gate at the back-center that opens onto the street. Lighting: warm bright afternoon sunlight, soft shadows, rich saturated colors. ACTION TIMELINE (8 seconds): 0–2 s: a small clay cup stands still on a wedding table, out-of-focus guests dancing behind it. 2–4.5 s: the cup begins to tremble slightly, tiny ripples in the drink. 4.5–8 s: the tremble repeats rhythmically like distant footsteps, building, while the guests behind keep dancing, unaware. Camera: locked-off and perfectly still, extreme close-up of the cup; only the cup vibrates, the camera does not; the framing never changes (no tilt, pan, zoom or rising camera). Audio: voice-over narration only (a voice, never shown on screen; no narrator character appears): a British male voice, warm and dry, begins speaking within half a second and says: “Then a small cup on the table began to tremble. Nobody noticed.” The line takes about 4.8 seconds; leave the last second free of speech so the moment can land. Music: light ancient-Mediterranean wedding music (frame drums, reed flute, plucked strings) with a faint uneasy undertone, same theme in every clip, low under the voice. Sound effects: ceramic cup rattling, faint rumble, timed to the action. Ambience: light courtyard ambience: clinking cups, footsteps on stone, a soft breeze, no words. Final reminder: no character says any word; only the voice-over narration speaks (voice only, nobody on screen is the narrator). Natural laughs, gasps and sighs are fine. No text, captions or logos in the frame.</w:t>
+        <w:t xml:space="preserve">VOICE RULE: only the voice-over narration speaks words; it is a voice only, never a person or character on screen. No character says any word and no one on screen lip-syncs to speech; characters communicate with facial expressions and body gestures. Natural non-verbal sounds are allowed and should sound real: laughing, giggling, gasping, sighing, groaning, cheering, coughing. Attached reference images, in order: the wedding courtyard, Senbi, the groom, the bride. 2D hand-drawn stickman cartoon in the exact style of the reference images: thin black outlines, large expressive heads, thin stick arms, flat warm colors, playful documentary-comedy tone, 16:9. Characters, identical in every frame: Senbi the groom: young man, straight black bowl-cut hair with bangs, gold headband with a gold cobra, bare chest, blue-and-gold broad collar, gold bracers, white kilt with a blue-and-gold sash, brown sandals, thin black stick arms. the bride: black bob hair with straight bangs, gold headband with a red gem, white dress, blue-and-gold collar, gold sash, gold arm cuffs, light veil. the guests: Egyptian wedding guests in white linen with blue-and-gold collars and gold headbands, black bob hairstyles, some in white striped headdresses. Setting: sunny daytime wedding courtyard in ancient Alexandria, sandstone columns with painted blue-and-gold bands, long tables with white cloths and clay jars, orange cloth awnings, and a tall wooden entrance gate at the back-center that opens onto the street. Lighting: warm bright afternoon sunlight, soft shadows, rich saturated colors. ACTION TIMELINE (6 seconds): 0–2 s: guests dance and laugh while Senbi spins happily in the center, arms out. 2–4 s: the bride claps in rhythm beside him. 4–6 s: Senbi keeps spinning, eyes closed in bliss; the gate behind them stays calm. Camera: locked-off and perfectly still, eye-level medium-wide shot of the courtyard; the framing never changes (no tilt, pan, zoom or rising camera). Audio: voice-over narration only (a voice, never shown on screen; no narrator character appears): a British male voice, warm and dry, begins speaking within half a second and says: “Inside, nobody had a clue. Senbi was busy spinning.” The line takes about 3.6 seconds; leave the last second free of speech so the moment can land. Music: light ancient-Mediterranean wedding music (frame drums, reed flute, plucked strings) with a faint uneasy undertone, same theme in every clip, low under the voice. Sound effects: wedding music muffled, faint thump, timed to the action. Ambience: light courtyard ambience: clinking cups, footsteps on stone, a soft breeze, no words. Final reminder: no character says any word; only the voice-over narration speaks (voice only, nobody on screen is the narrator). Natural laughs, gasps and sighs are fine. No text, captions or logos in the frame.</w:t>
       </w:r>
     </w:p>
     <w:p>
@@ -1806,7 +1901,7 @@
           <w:sz w:val="26"/>
           <w:szCs w:val="26"/>
         </w:rPr>
-        <w:t xml:space="preserve">SHOT 20 — Musician hears it</w:t>
+        <w:t xml:space="preserve">SHOT 25 — Roman reveal</w:t>
       </w:r>
     </w:p>
     <w:p>
@@ -1830,7 +1925,7 @@
           <w:sz w:val="21"/>
           <w:szCs w:val="21"/>
         </w:rPr>
-        <w:t xml:space="preserve">Guests_group.png,  Courtyard_from_Shot1.png</w:t>
+        <w:t xml:space="preserve">Roman_soldiers.png</w:t>
       </w:r>
       <w:r>
         <w:rPr>
@@ -1862,7 +1957,7 @@
           <w:sz w:val="20"/>
           <w:szCs w:val="20"/>
         </w:rPr>
-        <w:t xml:space="preserve">VOICE RULE: only the voice-over narration speaks words; it is a voice only, never a person or character on screen. No character says any word and no one on screen lip-syncs to speech; characters communicate with facial expressions and body gestures. Natural non-verbal sounds are allowed and should sound real: laughing, giggling, gasping, sighing, groaning, cheering, coughing. Attached reference images, in order: the Egyptian wedding guests, the wedding courtyard. 2D hand-drawn stickman cartoon in the exact style of the reference images: thin black outlines, large expressive heads, thin stick arms, flat warm colors, playful documentary-comedy tone, 16:9. Characters, identical in every frame: the musicians: guests in white linen playing harp, frame drum and reed flute. the guests: Egyptian wedding guests in white linen with blue-and-gold collars and gold headbands, black bob hairstyles, some in white striped headdresses. Setting: sunny daytime wedding courtyard in ancient Alexandria, sandstone columns with painted blue-and-gold bands, long tables with white cloths and clay jars, orange cloth awnings, and a tall wooden entrance gate at the back-center that opens onto the street. Lighting: warm bright afternoon sunlight, soft shadows, rich saturated colors. ACTION TIMELINE (8 seconds): 0–2.5 s: an Egyptian musician plays the reed flute joyfully, eyes closed, the open gate visible behind him. 2.5–5.5 s: he stops abruptly, eyes opening, flute lowered, his expression turning alert. 5.5–8 s: he turns his head toward the gate, brow furrowed, listening, while the dancers behind him dance one more beat and then slow down. Camera: locked-off and perfectly still, eye-level medium shot of the musician with the entrance visible behind him; the framing never changes (no tilt, pan, zoom or rising camera). Audio: voice-over narration only (a voice, never shown on screen; no narrator character appears): a British male voice, warm and dry, begins speaking within half a second and says: “The musician noticed. He stopped. Everyone else danced one more beat, blissfully unaware.” The line takes about 5.2 seconds; leave the last second free of speech so the moment can land. Music: music nearly silent. Sound effects: music and drums cut out, one drum stops, timed to the action. Ambience: light courtyard ambience: clinking cups, footsteps on stone, a soft breeze, no words. Final reminder: no character says any word; only the voice-over narration speaks (voice only, nobody on screen is the narrator). Natural laughs, gasps and sighs are fine. No text, captions or logos in the frame.</w:t>
+        <w:t xml:space="preserve">VOICE RULE: only the voice-over narration speaks words; it is a voice only, never a person or character on screen. No character says any word and no one on screen lip-syncs to speech; characters communicate with facial expressions and body gestures. Natural non-verbal sounds are allowed and should sound real: laughing, giggling, gasping, sighing, groaning, cheering, coughing. Attached reference images, in order: the Roman soldiers. 2D hand-drawn stickman cartoon in the exact style of the reference images: thin black outlines, large expressive heads, thin stick arms, flat warm colors, playful documentary-comedy tone, 16:9. Characters, identical in every frame: the Roman soldiers: crimson plumed helmets, steel armor, red cloaks, rectangular red shields. Setting: sunlit street of ancient Alexandria outside the wedding house, sandstone walls, palms, market stalls with red and blue awnings. Lighting: warm bright sunlight, soft shadows. ACTION TIMELINE (8 seconds): 0–2.5 s: the street is empty and the sound of boots grows. 2.5–5.5 s: two tired, dusty Roman legionaries walk into frame, shields and spears in hand, shoulders slumped, dust on their armor. 5.5–8 s: they stop in front of the wedding house and look around, then at each other, confused; one scratches under his helmet. Camera: locked-off and perfectly still, eye-level medium-wide shot of the street; the soldiers walk into the frame; the framing never changes (no tilt, pan, zoom or rising camera). Audio: voice-over narration only (a voice, never shown on screen; no narrator character appears): a British male voice, warm and dry, begins speaking within half a second and says: “And then Rome arrived. Tired, dusty, and looking for the right address.” The line takes about 4.8 seconds; leave the last second free of speech so the moment can land. Music: low sustained tension with distant marching drums, almost silent. Sound effects: armor clank, dust, a tired sigh, timed to the action. Ambience: sunlit street ambience: wind and distant clatter, no words. Final reminder: no character says any word; only the voice-over narration speaks (voice only, nobody on screen is the narrator). Natural laughs, gasps and sighs are fine. No text, captions or logos in the frame.</w:t>
       </w:r>
     </w:p>
     <w:p>
@@ -1879,7 +1974,7 @@
           <w:sz w:val="26"/>
           <w:szCs w:val="26"/>
         </w:rPr>
-        <w:t xml:space="preserve">SHOT 21 — Street empties</w:t>
+        <w:t xml:space="preserve">SHOT 26 — Egyptians stare</w:t>
       </w:r>
     </w:p>
     <w:p>
@@ -1903,7 +1998,7 @@
           <w:sz w:val="21"/>
           <w:szCs w:val="21"/>
         </w:rPr>
-        <w:t xml:space="preserve">Courtyard_from_Shot1.png</w:t>
+        <w:t xml:space="preserve">Guests_group.png,  Roman_soldiers.png,  Courtyard_from_Shot1.png</w:t>
       </w:r>
       <w:r>
         <w:rPr>
@@ -1935,7 +2030,7 @@
           <w:sz w:val="20"/>
           <w:szCs w:val="20"/>
         </w:rPr>
-        <w:t xml:space="preserve">VOICE RULE: only the voice-over narration speaks words; it is a voice only, never a person or character on screen. No character says any word and no one on screen lip-syncs to speech; characters communicate with facial expressions and body gestures. Natural non-verbal sounds are allowed and should sound real: laughing, giggling, gasping, sighing, groaning, cheering, coughing. Attached reference image (use only for the art style and colors; do not copy its layout or characters): the Shot 1 courtyard frame. 2D hand-drawn stickman cartoon in the exact style of the reference images: thin black outlines, large expressive heads, thin stick arms, flat warm colors, playful documentary-comedy tone, 16:9. Setting: sunlit street of ancient Alexandria outside the wedding house, sandstone walls, palms, market stalls with red and blue awnings. Lighting: warm bright sunlight, soft shadows. ACTION TIMELINE (8 seconds): 0–2.5 s: the street is busy: vendors, women with baskets, children walking about. 2.5–5.5 s: people stop and look toward the far end of the street, expressions uneasy. 5.5–8 s: they step aside and clear the middle of the road, pulling children close; settling dust hangs in the air and the street goes quiet; no soldiers are visible. Camera: locked-off and perfectly still, eye-level wide shot of the street; the framing never changes (no tilt, pan, zoom or rising camera). Audio: voice-over narration only (a voice, never shown on screen; no narrator character appears): a British male voice, warm and dry, begins speaking within half a second and says: “Outside, the street went quiet. In a busy city, that's never good.” The line takes about 4.8 seconds; leave the last second free of speech so the moment can land. Music: low sustained tension with distant marching drums, almost silent. Sound effects: street ambience fading, distant boots, timed to the action. Ambience: sunlit street ambience: wind and distant clatter, no words. Final reminder: no character says any word; only the voice-over narration speaks (voice only, nobody on screen is the narrator). Natural laughs, gasps and sighs are fine. No text, captions or logos in the frame.</w:t>
+        <w:t xml:space="preserve">VOICE RULE: only the voice-over narration speaks words; it is a voice only, never a person or character on screen. No character says any word and no one on screen lip-syncs to speech; characters communicate with facial expressions and body gestures. Natural non-verbal sounds are allowed and should sound real: laughing, giggling, gasping, sighing, groaning, cheering, coughing. Attached reference images, in order: the Egyptian wedding guests, the Roman soldiers, the wedding courtyard. 2D hand-drawn stickman cartoon in the exact style of the reference images: thin black outlines, large expressive heads, thin stick arms, flat warm colors, playful documentary-comedy tone, 16:9. Characters, identical in every frame: the guests: Egyptian wedding guests in white linen with blue-and-gold collars and gold headbands, black bob hairstyles, some in white striped headdresses. Setting: sunlit street of ancient Alexandria outside the wedding house, sandstone walls, palms, market stalls with red and blue awnings. Lighting: warm bright sunlight, soft shadows. ACTION TIMELINE (8 seconds): 0–2.5 s: three guests peek out of the doorway at the same time: the left one terrified with wide eyes and hands on cheeks, the center one confused with a tilted head and one raised eyebrow, the right one grinning and clapping softly as if watching entertainers. 2.5–5.5 s: the terrified one ducks back and peeks out again. 5.5–8 s: the grinning one nudges the confused one and points, delighted, while the confused one squints. Camera: locked-off and perfectly still, eye-level medium-wide shot of the doorway with all three guests peeking in the same frame; the framing never changes (no tilt, pan, zoom or rising camera). Audio: voice-over narration only (a voice, never shown on screen; no narrator character appears): a British male voice, warm and dry, begins speaking within half a second and says: “The guests peeked out. One terrified. One confused. One assumed it was entertainment.” The line takes about 5.2 seconds; leave the last second free of speech so the moment can land. Music: music nearly silent. Sound effects: nervous coughs and gasps, no words, timed to the action. Ambience: sunlit street ambience: wind and distant clatter, no words. Final reminder: no character says any word; only the voice-over narration speaks (voice only, nobody on screen is the narrator). Natural laughs, gasps and sighs are fine. No text, captions or logos in the frame.</w:t>
       </w:r>
     </w:p>
     <w:p>
@@ -1952,7 +2047,7 @@
           <w:sz w:val="26"/>
           <w:szCs w:val="26"/>
         </w:rPr>
-        <w:t xml:space="preserve">SHOT 22 — First Roman step</w:t>
+        <w:t xml:space="preserve">SHOT 27 — Drunk uncle</w:t>
       </w:r>
     </w:p>
     <w:p>
@@ -1976,7 +2071,7 @@
           <w:sz w:val="21"/>
           <w:szCs w:val="21"/>
         </w:rPr>
-        <w:t xml:space="preserve">Roman_soldiers.png</w:t>
+        <w:t xml:space="preserve">Relatives_group.png,  Roman_soldiers.png,  Courtyard_from_Shot1.png</w:t>
       </w:r>
       <w:r>
         <w:rPr>
@@ -1994,7 +2089,7 @@
           <w:sz w:val="21"/>
           <w:szCs w:val="21"/>
         </w:rPr>
-        <w:t xml:space="preserve">4 sec</w:t>
+        <w:t xml:space="preserve">8 sec</w:t>
       </w:r>
     </w:p>
     <w:p>
@@ -2008,7 +2103,7 @@
           <w:sz w:val="20"/>
           <w:szCs w:val="20"/>
         </w:rPr>
-        <w:t xml:space="preserve">VOICE RULE: nobody speaks and no voice of any kind is heard in this clip; it is a sound-effects-only beat. Attached reference images, in order: the Roman soldiers. 2D hand-drawn stickman cartoon in the exact style of the reference images: thin black outlines, large expressive heads, thin stick arms, flat warm colors, playful documentary-comedy tone, 16:9. Characters, identical in every frame: the Roman soldiers: crimson plumed helmets, steel armor, red cloaks, rectangular red shields. Setting: sunlit street of ancient Alexandria outside the wedding house, sandstone walls, palms, market stalls with red and blue awnings. Lighting: warm bright sunlight, soft shadows. ACTION TIMELINE (4 seconds): 0–1 s: empty sunlit stone paving, dust drifting. 1–2 s: the first heavy Roman boot steps into frame from the side, the hem of a red cloak visible, dust puffing. 2–3 s: the second boot follows. 3–4 s: a third step lands; only boots and lower legs are ever visible. Camera: locked-off and perfectly still, fixed ground-level frame on the street; the boots step into frame from the side and the camera never rises; the framing never changes (no tilt, pan, zoom or rising camera). Audio: no narration and no speech. Music: low sustained tension with distant marching drums, almost silent. Sound effects: heavy boot steps with metal clank, timed to each step. Ambience: sunlit street ambience: wind and distant clatter, no words. Final reminder: no voice of any kind in this clip. No text, captions or logos in the frame.</w:t>
+        <w:t xml:space="preserve">VOICE RULE: only the voice-over narration speaks words; it is a voice only, never a person or character on screen. No character says any word and no one on screen lip-syncs to speech; characters communicate with facial expressions and body gestures. Natural non-verbal sounds are allowed and should sound real: laughing, giggling, gasping, sighing, groaning, cheering, coughing. Attached reference images, in order: the bride's relatives, the Roman soldiers, the wedding courtyard. 2D hand-drawn stickman cartoon in the exact style of the reference images: thin black outlines, large expressive heads, thin stick arms, flat warm colors, playful documentary-comedy tone, 16:9. Characters, identical in every frame: the uncle: cheerful bearded middle-aged man in plain white linen. the Roman soldiers: crimson plumed helmets, steel armor, red cloaks, rectangular red shields. Setting: sunlit street of ancient Alexandria outside the wedding house, sandstone walls, palms, market stalls with red and blue awnings. Lighting: warm bright sunlight, soft shadows. ACTION TIMELINE (8 seconds): 0–2.5 s: a cheerful, slightly tipsy bearded uncle sways with a clay beer cup in hand, cheeks rosy, two Roman soldiers waiting at the right edge of the frame. 2.5–5.5 s: he strides confidently across the frame toward the soldiers, cup raised in greeting. 5.5–8 s: he arrives and extends the cup with a wide smile. Camera: locked-off and perfectly still, eye-level medium-wide shot; the uncle walks across the frame; the framing never changes (no tilt, pan, zoom or rising camera). Audio: voice-over narration only (a voice, never shown on screen; no narrator character appears): a British male voice, warm and dry, begins speaking within half a second and says: “Then one uncle, a man with absolutely no fear, grabbed a beer.” The line takes about 4.8 seconds; leave the last second free of speech so the moment can land. Music: playful comic percussion over the wedding rhythm, low under the voice. Sound effects: cup clink, timed to the action. Ambience: sunlit street ambience: wind and distant clatter, no words. Final reminder: no character says any word; only the voice-over narration speaks (voice only, nobody on screen is the narrator). Natural laughs, gasps and sighs are fine. No text, captions or logos in the frame.</w:t>
       </w:r>
     </w:p>
     <w:p>
@@ -2025,7 +2120,7 @@
           <w:sz w:val="26"/>
           <w:szCs w:val="26"/>
         </w:rPr>
-        <w:t xml:space="preserve">SHOT 23 — Roman silhouettes</w:t>
+        <w:t xml:space="preserve">SHOT 29 — Roman confusion</w:t>
       </w:r>
     </w:p>
     <w:p>
@@ -2067,7 +2162,7 @@
           <w:sz w:val="21"/>
           <w:szCs w:val="21"/>
         </w:rPr>
-        <w:t xml:space="preserve">6 sec</w:t>
+        <w:t xml:space="preserve">8 sec</w:t>
       </w:r>
     </w:p>
     <w:p>
@@ -2081,7 +2176,7 @@
           <w:sz w:val="20"/>
           <w:szCs w:val="20"/>
         </w:rPr>
-        <w:t xml:space="preserve">VOICE RULE: only the voice-over narration speaks words; it is a voice only, never a person or character on screen. No character says any word and no one on screen lip-syncs to speech; characters communicate with facial expressions and body gestures. Natural non-verbal sounds are allowed and should sound real: laughing, giggling, gasping, sighing, groaning, cheering, coughing. Attached reference images, in order: the Roman soldiers. 2D hand-drawn stickman cartoon in the exact style of the reference images: thin black outlines, large expressive heads, thin stick arms, flat warm colors, playful documentary-comedy tone, 16:9. Characters, identical in every frame: the Roman soldiers: crimson plumed helmets, steel armor, red cloaks, rectangular red shields. Setting: sunlit street of ancient Alexandria outside the wedding house, sandstone walls, palms, market stalls with red and blue awnings. Lighting: warm bright sunlight, soft shadows. ACTION TIMELINE (6 seconds): 0–2 s: far at the end of the street, small dark silhouettes of soldiers appear, shields and plumes recognizable but tiny. 2–4 s: they march steadily in formation toward the camera, getting slightly larger. 4–6 s: dust rises behind them while civilians at the sides watch, motionless. Camera: eye-level wide street view; fixed except for an almost imperceptible 5% slow push-in, no tilt or pan. Audio: voice-over narration only (a voice, never shown on screen; no narrator character appears): a British male voice, warm and dry, begins speaking within half a second and says: “Clank. Clank. Clank. Marching men. Lots of them.” The line takes about 3.2 seconds; leave the last second free of speech so the moment can land. Music: low sustained tension with distant marching drums, almost silent. Sound effects: marching boots in rhythm, metal clinks, timed to the action. Ambience: sunlit street ambience: wind and distant clatter, no words. Final reminder: no character says any word; only the voice-over narration speaks (voice only, nobody on screen is the narrator). Natural laughs, gasps and sighs are fine. No text, captions or logos in the frame.</w:t>
+        <w:t xml:space="preserve">VOICE RULE: only the voice-over narration speaks words; it is a voice only, never a person or character on screen. No character says any word and no one on screen lip-syncs to speech; characters communicate with facial expressions and body gestures. Natural non-verbal sounds are allowed and should sound real: laughing, giggling, gasping, sighing, groaning, cheering, coughing. Attached reference images, in order: the Roman soldiers. 2D hand-drawn stickman cartoon in the exact style of the reference images: thin black outlines, large expressive heads, thin stick arms, flat warm colors, playful documentary-comedy tone, 16:9. Characters, identical in every frame: the Roman soldiers: crimson plumed helmets, steel armor, red cloaks, rectangular red shields. Setting: sunlit street of ancient Alexandria outside the wedding house, sandstone walls, palms, market stalls with red and blue awnings. Lighting: warm bright sunlight, soft shadows. ACTION TIMELINE (8 seconds): 0–2.5 s: the soldier's confused face looks at the beer cup. 2.5–5.5 s: he looks up at the uncle's smiling face off-screen and back to the cup, then cautiously takes it. 5.5–8 s: his eyes slide sideways toward his comrades in a silent plea of 'what do I do?'; he sniffs the cup. Camera: eye-level medium close-up of the soldier; fixed except for an almost imperceptible 5% slow push-in, no tilt or pan. Audio: voice-over narration only (a voice, never shown on screen; no narrator character appears): a British male voice, warm and dry, begins speaking within half a second and says: “The soldier stared at the cup, then the uncle. A trap? Or hospitality?” The line takes about 5.2 seconds; leave the last second free of speech so the moment can land. Music: music nearly silent. Sound effects: tiny gulp, uneasy hum, timed to the action. Ambience: sunlit street ambience: wind and distant clatter, no words. Final reminder: no character says any word; only the voice-over narration speaks (voice only, nobody on screen is the narrator). Natural laughs, gasps and sighs are fine. No text, captions or logos in the frame.</w:t>
       </w:r>
     </w:p>
     <w:p>
@@ -2098,7 +2193,7 @@
           <w:sz w:val="26"/>
           <w:szCs w:val="26"/>
         </w:rPr>
-        <w:t xml:space="preserve">SHOT 24 — Wedding oblivious</w:t>
+        <w:t xml:space="preserve">SHOT 30 — Food wins</w:t>
       </w:r>
     </w:p>
     <w:p>
@@ -2122,7 +2217,7 @@
           <w:sz w:val="21"/>
           <w:szCs w:val="21"/>
         </w:rPr>
-        <w:t xml:space="preserve">Courtyard_from_Shot1.png,  Senbi_from_Shot1.png,  Bride_from_Shot1.png</w:t>
+        <w:t xml:space="preserve">Roman_soldiers.png,  Courtyard_from_Shot1.png</w:t>
       </w:r>
       <w:r>
         <w:rPr>
@@ -2140,7 +2235,7 @@
           <w:sz w:val="21"/>
           <w:szCs w:val="21"/>
         </w:rPr>
-        <w:t xml:space="preserve">6 sec</w:t>
+        <w:t xml:space="preserve">8 sec</w:t>
       </w:r>
     </w:p>
     <w:p>
@@ -2154,7 +2249,7 @@
           <w:sz w:val="20"/>
           <w:szCs w:val="20"/>
         </w:rPr>
-        <w:t xml:space="preserve">VOICE RULE: only the voice-over narration speaks words; it is a voice only, never a person or character on screen. No character says any word and no one on screen lip-syncs to speech; characters communicate with facial expressions and body gestures. Natural non-verbal sounds are allowed and should sound real: laughing, giggling, gasping, sighing, groaning, cheering, coughing. Attached reference images, in order: the wedding courtyard, Senbi, the groom, the bride. 2D hand-drawn stickman cartoon in the exact style of the reference images: thin black outlines, large expressive heads, thin stick arms, flat warm colors, playful documentary-comedy tone, 16:9. Characters, identical in every frame: Senbi the groom: young man, straight black bowl-cut hair with bangs, gold headband with a gold cobra, bare chest, blue-and-gold broad collar, gold bracers, white kilt with a blue-and-gold sash, brown sandals, thin black stick arms. the bride: black bob hair with straight bangs, gold headband with a red gem, white dress, blue-and-gold collar, gold sash, gold arm cuffs, light veil. the guests: Egyptian wedding guests in white linen with blue-and-gold collars and gold headbands, black bob hairstyles, some in white striped headdresses. Setting: sunny daytime wedding courtyard in ancient Alexandria, sandstone columns with painted blue-and-gold bands, long tables with white cloths and clay jars, orange cloth awnings, and a tall wooden entrance gate at the back-center that opens onto the street. Lighting: warm bright afternoon sunlight, soft shadows, rich saturated colors. ACTION TIMELINE (6 seconds): 0–2 s: guests dance and laugh while Senbi spins happily in the center, arms out. 2–4 s: the bride claps in rhythm beside him. 4–6 s: Senbi keeps spinning, eyes closed in bliss; the gate behind them stays calm. Camera: locked-off and perfectly still, eye-level medium-wide shot of the courtyard; the framing never changes (no tilt, pan, zoom or rising camera). Audio: voice-over narration only (a voice, never shown on screen; no narrator character appears): a British male voice, warm and dry, begins speaking within half a second and says: “Inside, nobody had a clue. Senbi was busy spinning.” The line takes about 3.6 seconds; leave the last second free of speech so the moment can land. Music: light ancient-Mediterranean wedding music (frame drums, reed flute, plucked strings) with a faint uneasy undertone, same theme in every clip, low under the voice. Sound effects: wedding music muffled, faint thump, timed to the action. Ambience: light courtyard ambience: clinking cups, footsteps on stone, a soft breeze, no words. Final reminder: no character says any word; only the voice-over narration speaks (voice only, nobody on screen is the narrator). Natural laughs, gasps and sighs are fine. No text, captions or logos in the frame.</w:t>
+        <w:t xml:space="preserve">VOICE RULE: only the voice-over narration speaks words; it is a voice only, never a person or character on screen. No character says any word and no one on screen lip-syncs to speech; characters communicate with facial expressions and body gestures. Natural non-verbal sounds are allowed and should sound real: laughing, giggling, gasping, sighing, groaning, cheering, coughing. Attached reference images, in order: the Roman soldiers, the wedding courtyard. 2D hand-drawn stickman cartoon in the exact style of the reference images: thin black outlines, large expressive heads, thin stick arms, flat warm colors, playful documentary-comedy tone, 16:9. Characters, identical in every frame: the Roman soldiers: crimson plumed helmets, steel armor, red cloaks, rectangular red shields. Setting: sunny daytime wedding courtyard in ancient Alexandria, sandstone columns with painted blue-and-gold bands, long tables with white cloths and clay jars, orange cloth awnings, and a tall wooden entrance gate at the back-center that opens onto the street. Lighting: warm bright afternoon sunlight, soft shadows, rich saturated colors. ACTION TIMELINE (8 seconds): 0–2.5 s: two Roman soldiers in the foreground scan the area with serious faces, the feast table behind them. 2.5–5.5 s: they turn their heads toward the roast goose, bread and fruit and their expressions soften. 5.5–8 s: one leans slightly forward, nostrils flaring, his stomach growls and the other glances at him. Camera: locked-off and perfectly still, eye-level wide-medium shot: the soldiers in the foreground, the feast table behind them; they turn their heads toward it; the framing never changes (no tilt, pan, zoom or rising camera). Audio: voice-over narration only (a voice, never shown on screen; no narrator character appears): a British male voice, warm and dry, begins speaking within half a second and says: “Then the Romans saw the food. Military discipline lasted about four seconds.” The line takes about 4.8 seconds; leave the last second free of speech so the moment can land. Music: playful comic percussion over the wedding rhythm, low under the voice. Sound effects: stomach growl, sniff, timed to the action. Ambience: light courtyard ambience: clinking cups, footsteps on stone, a soft breeze, no words. Final reminder: no character says any word; only the voice-over narration speaks (voice only, nobody on screen is the narrator). Natural laughs, gasps and sighs are fine. No text, captions or logos in the frame.</w:t>
       </w:r>
     </w:p>
     <w:p>
@@ -2171,7 +2266,7 @@
           <w:sz w:val="26"/>
           <w:szCs w:val="26"/>
         </w:rPr>
-        <w:t xml:space="preserve">SHOT 25 — Roman reveal</w:t>
+        <w:t xml:space="preserve">SHOT 31 — Accidental party</w:t>
       </w:r>
     </w:p>
     <w:p>
@@ -2195,7 +2290,7 @@
           <w:sz w:val="21"/>
           <w:szCs w:val="21"/>
         </w:rPr>
-        <w:t xml:space="preserve">Roman_soldiers.png</w:t>
+        <w:t xml:space="preserve">Roman_soldiers.png,  Guests_group.png,  Courtyard_from_Shot1.png</w:t>
       </w:r>
       <w:r>
         <w:rPr>
@@ -2227,7 +2322,7 @@
           <w:sz w:val="20"/>
           <w:szCs w:val="20"/>
         </w:rPr>
-        <w:t xml:space="preserve">VOICE RULE: only the voice-over narration speaks words; it is a voice only, never a person or character on screen. No character says any word and no one on screen lip-syncs to speech; characters communicate with facial expressions and body gestures. Natural non-verbal sounds are allowed and should sound real: laughing, giggling, gasping, sighing, groaning, cheering, coughing. Attached reference images, in order: the Roman soldiers. 2D hand-drawn stickman cartoon in the exact style of the reference images: thin black outlines, large expressive heads, thin stick arms, flat warm colors, playful documentary-comedy tone, 16:9. Characters, identical in every frame: the Roman soldiers: crimson plumed helmets, steel armor, red cloaks, rectangular red shields. Setting: sunlit street of ancient Alexandria outside the wedding house, sandstone walls, palms, market stalls with red and blue awnings. Lighting: warm bright sunlight, soft shadows. ACTION TIMELINE (8 seconds): 0–2.5 s: the street is empty and the sound of boots grows. 2.5–5.5 s: two tired, dusty Roman legionaries walk into frame, shields and spears in hand, shoulders slumped, dust on their armor. 5.5–8 s: they stop in front of the wedding house and look around, then at each other, confused; one scratches under his helmet. Camera: locked-off and perfectly still, eye-level medium-wide shot of the street; the soldiers walk into the frame; the framing never changes (no tilt, pan, zoom or rising camera). Audio: voice-over narration only (a voice, never shown on screen; no narrator character appears): a British male voice, warm and dry, begins speaking within half a second and says: “And then Rome arrived. Tired, dusty, and looking for the right address.” The line takes about 4.8 seconds; leave the last second free of speech so the moment can land. Music: low sustained tension with distant marching drums, almost silent. Sound effects: armor clank, dust, a tired sigh, timed to the action. Ambience: sunlit street ambience: wind and distant clatter, no words. Final reminder: no character says any word; only the voice-over narration speaks (voice only, nobody on screen is the narrator). Natural laughs, gasps and sighs are fine. No text, captions or logos in the frame.</w:t>
+        <w:t xml:space="preserve">VOICE RULE: only the voice-over narration speaks words; it is a voice only, never a person or character on screen. No character says any word and no one on screen lip-syncs to speech; characters communicate with facial expressions and body gestures. Natural non-verbal sounds are allowed and should sound real: laughing, giggling, gasping, sighing, groaning, cheering, coughing. Attached reference images, in order: the Roman soldiers, the Egyptian wedding guests, the wedding courtyard. 2D hand-drawn stickman cartoon in the exact style of the reference images: thin black outlines, large expressive heads, thin stick arms, flat warm colors, playful documentary-comedy tone, 16:9. Characters, identical in every frame: the guests: Egyptian wedding guests in white linen with blue-and-gold collars and gold headbands, black bob hairstyles, some in white striped headdresses. the Roman soldiers: crimson plumed helmets, steel armor, red cloaks, rectangular red shields. Setting: sunny daytime wedding courtyard in ancient Alexandria, sandstone columns with painted blue-and-gold bands, long tables with white cloths and clay jars, orange cloth awnings, and a tall wooden entrance gate at the back-center that opens onto the street. Lighting: warm bright afternoon sunlight, soft shadows, rich saturated colors. ACTION TIMELINE (8 seconds): 0–2.5 s: Egyptian guests dance in the courtyard. 2.5–5.5 s: one Roman soldier steps awkwardly onto the dance floor, stiff as a board; the guests freeze and stare. 5.5–8 s: one guest begins to copy his stiff step and the others hesitate, then join in. Camera: locked-off and perfectly still, eye-level wide shot; the framing never changes (no tilt, pan, zoom or rising camera). Audio: voice-over narration only (a voice, never shown on screen; no narrator character appears): a British male voice, warm and dry, begins speaking within half a second and says: “One soldier stepped into the dance. Nobody stopped him. Somehow, it worked.” The line takes about 4.8 seconds; leave the last second free of speech so the moment can land. Music: playful comic percussion over the wedding rhythm, low under the voice. Sound effects: shield tap blending into the rhythm, clapping, timed to the action. Ambience: light courtyard ambience: clinking cups, footsteps on stone, a soft breeze, no words. Final reminder: no character says any word; only the voice-over narration speaks (voice only, nobody on screen is the narrator). Natural laughs, gasps and sighs are fine. No text, captions or logos in the frame.</w:t>
       </w:r>
     </w:p>
     <w:p>
@@ -2244,7 +2339,7 @@
           <w:sz w:val="26"/>
           <w:szCs w:val="26"/>
         </w:rPr>
-        <w:t xml:space="preserve">SHOT 26 — Egyptians stare</w:t>
+        <w:t xml:space="preserve">SHOT 32 — Armor dance</w:t>
       </w:r>
     </w:p>
     <w:p>
@@ -2268,7 +2363,7 @@
           <w:sz w:val="21"/>
           <w:szCs w:val="21"/>
         </w:rPr>
-        <w:t xml:space="preserve">Guests_group.png,  Roman_soldiers.png,  Courtyard_from_Shot1.png</w:t>
+        <w:t xml:space="preserve">Roman_soldiers.png,  Guests_group.png,  Courtyard_from_Shot1.png</w:t>
       </w:r>
       <w:r>
         <w:rPr>
@@ -2286,7 +2381,7 @@
           <w:sz w:val="21"/>
           <w:szCs w:val="21"/>
         </w:rPr>
-        <w:t xml:space="preserve">8 sec</w:t>
+        <w:t xml:space="preserve">6 sec</w:t>
       </w:r>
     </w:p>
     <w:p>
@@ -2300,7 +2395,7 @@
           <w:sz w:val="20"/>
           <w:szCs w:val="20"/>
         </w:rPr>
-        <w:t xml:space="preserve">VOICE RULE: only the voice-over narration speaks words; it is a voice only, never a person or character on screen. No character says any word and no one on screen lip-syncs to speech; characters communicate with facial expressions and body gestures. Natural non-verbal sounds are allowed and should sound real: laughing, giggling, gasping, sighing, groaning, cheering, coughing. Attached reference images, in order: the Egyptian wedding guests, the Roman soldiers, the wedding courtyard. 2D hand-drawn stickman cartoon in the exact style of the reference images: thin black outlines, large expressive heads, thin stick arms, flat warm colors, playful documentary-comedy tone, 16:9. Characters, identical in every frame: the guests: Egyptian wedding guests in white linen with blue-and-gold collars and gold headbands, black bob hairstyles, some in white striped headdresses. Setting: sunlit street of ancient Alexandria outside the wedding house, sandstone walls, palms, market stalls with red and blue awnings. Lighting: warm bright sunlight, soft shadows. ACTION TIMELINE (8 seconds): 0–2.5 s: three guests peek out of the doorway at the same time: the left one terrified with wide eyes and hands on cheeks, the center one confused with a tilted head and one raised eyebrow, the right one grinning and clapping softly as if watching entertainers. 2.5–5.5 s: the terrified one ducks back and peeks out again. 5.5–8 s: the grinning one nudges the confused one and points, delighted, while the confused one squints. Camera: locked-off and perfectly still, eye-level medium-wide shot of the doorway with all three guests peeking in the same frame; the framing never changes (no tilt, pan, zoom or rising camera). Audio: voice-over narration only (a voice, never shown on screen; no narrator character appears): a British male voice, warm and dry, begins speaking within half a second and says: “The guests peeked out. One terrified. One confused. One assumed it was entertainment.” The line takes about 5.2 seconds; leave the last second free of speech so the moment can land. Music: music nearly silent. Sound effects: nervous coughs and gasps, no words, timed to the action. Ambience: sunlit street ambience: wind and distant clatter, no words. Final reminder: no character says any word; only the voice-over narration speaks (voice only, nobody on screen is the narrator). Natural laughs, gasps and sighs are fine. No text, captions or logos in the frame.</w:t>
+        <w:t xml:space="preserve">VOICE RULE: only the voice-over narration speaks words; it is a voice only, never a person or character on screen. No character says any word and no one on screen lip-syncs to speech; characters communicate with facial expressions and body gestures. Natural non-verbal sounds are allowed and should sound real: laughing, giggling, gasping, sighing, groaning, cheering, coughing. Attached reference images, in order: the Roman soldiers, the Egyptian wedding guests, the wedding courtyard. 2D hand-drawn stickman cartoon in the exact style of the reference images: thin black outlines, large expressive heads, thin stick arms, flat warm colors, playful documentary-comedy tone, 16:9. Characters, identical in every frame: the Roman soldiers: crimson plumed helmets, steel armor, red cloaks, rectangular red shields. the guests: Egyptian wedding guests in white linen with blue-and-gold collars and gold headbands, black bob hairstyles, some in white striped headdresses. Setting: sunny daytime wedding courtyard in ancient Alexandria, sandstone columns with painted blue-and-gold bands, long tables with white cloths and clay jars, orange cloth awnings, and a tall wooden entrance gate at the back-center that opens onto the street. Lighting: warm bright afternoon sunlight, soft shadows, rich saturated colors. ACTION TIMELINE (6 seconds): 0–2 s: three Roman soldiers in full armor step to the right in a row, stiff but strangely synchronized, capes swaying, Egyptian dancers around them smiling and clapping. 2–4 s: they step to the left in unison. 4–6 s: all three raise one arm together in perfect unison, then stare at each other, confused. Camera: locked-off and perfectly still, eye-level wide shot of the dancing Romans; the framing never changes (no tilt, pan, zoom or rising camera). Audio: voice-over narration only (a voice, never shown on screen; no narrator character appears): a British male voice, warm and dry, begins speaking within half a second and says: “Roman engineering changed the world. Roman dancing did not.” The line takes about 3.6 seconds; leave the last second free of speech so the moment can land. Music: playful comic percussion over the wedding rhythm, low under the voice. Sound effects: armor clanking out of rhythm, timed to the action. Ambience: light courtyard ambience: clinking cups, footsteps on stone, a soft breeze, no words. Final reminder: no character says any word; only the voice-over narration speaks (voice only, nobody on screen is the narrator). Natural laughs, gasps and sighs are fine. No text, captions or logos in the frame.</w:t>
       </w:r>
     </w:p>
     <w:p>
@@ -2317,7 +2412,7 @@
           <w:sz w:val="26"/>
           <w:szCs w:val="26"/>
         </w:rPr>
-        <w:t xml:space="preserve">SHOT 27 — Drunk uncle</w:t>
+        <w:t xml:space="preserve">SHOT 33 — Senbi joins</w:t>
       </w:r>
     </w:p>
     <w:p>
@@ -2341,7 +2436,7 @@
           <w:sz w:val="21"/>
           <w:szCs w:val="21"/>
         </w:rPr>
-        <w:t xml:space="preserve">Relatives_group.png,  Roman_soldiers.png,  Courtyard_from_Shot1.png</w:t>
+        <w:t xml:space="preserve">Senbi_from_Shot1.png,  Roman_soldiers.png,  Courtyard_from_Shot1.png</w:t>
       </w:r>
       <w:r>
         <w:rPr>
@@ -2373,7 +2468,7 @@
           <w:sz w:val="20"/>
           <w:szCs w:val="20"/>
         </w:rPr>
-        <w:t xml:space="preserve">VOICE RULE: only the voice-over narration speaks words; it is a voice only, never a person or character on screen. No character says any word and no one on screen lip-syncs to speech; characters communicate with facial expressions and body gestures. Natural non-verbal sounds are allowed and should sound real: laughing, giggling, gasping, sighing, groaning, cheering, coughing. Attached reference images, in order: the bride's relatives, the Roman soldiers, the wedding courtyard. 2D hand-drawn stickman cartoon in the exact style of the reference images: thin black outlines, large expressive heads, thin stick arms, flat warm colors, playful documentary-comedy tone, 16:9. Characters, identical in every frame: the uncle: cheerful bearded middle-aged man in plain white linen. the Roman soldiers: crimson plumed helmets, steel armor, red cloaks, rectangular red shields. Setting: sunlit street of ancient Alexandria outside the wedding house, sandstone walls, palms, market stalls with red and blue awnings. Lighting: warm bright sunlight, soft shadows. ACTION TIMELINE (8 seconds): 0–2.5 s: a cheerful, slightly tipsy bearded uncle sways with a clay beer cup in hand, cheeks rosy, two Roman soldiers waiting at the right edge of the frame. 2.5–5.5 s: he strides confidently across the frame toward the soldiers, cup raised in greeting. 5.5–8 s: he arrives and extends the cup with a wide smile. Camera: locked-off and perfectly still, eye-level medium-wide shot; the uncle walks across the frame; the framing never changes (no tilt, pan, zoom or rising camera). Audio: voice-over narration only (a voice, never shown on screen; no narrator character appears): a British male voice, warm and dry, begins speaking within half a second and says: “Then one uncle, a man with absolutely no fear, grabbed a beer.” The line takes about 4.8 seconds; leave the last second free of speech so the moment can land. Music: playful comic percussion over the wedding rhythm, low under the voice. Sound effects: cup clink, timed to the action. Ambience: sunlit street ambience: wind and distant clatter, no words. Final reminder: no character says any word; only the voice-over narration speaks (voice only, nobody on screen is the narrator). Natural laughs, gasps and sighs are fine. No text, captions or logos in the frame.</w:t>
+        <w:t xml:space="preserve">VOICE RULE: only the voice-over narration speaks words; it is a voice only, never a person or character on screen. No character says any word and no one on screen lip-syncs to speech; characters communicate with facial expressions and body gestures. Natural non-verbal sounds are allowed and should sound real: laughing, giggling, gasping, sighing, groaning, cheering, coughing. Attached reference images, in order: Senbi, the groom, the Roman soldiers, the wedding courtyard. 2D hand-drawn stickman cartoon in the exact style of the reference images: thin black outlines, large expressive heads, thin stick arms, flat warm colors, playful documentary-comedy tone, 16:9. Characters, identical in every frame: Senbi the groom: young man, straight black bowl-cut hair with bangs, gold headband with a gold cobra, bare chest, blue-and-gold broad collar, gold bracers, white kilt with a blue-and-gold sash, brown sandals, thin black stick arms. the Roman soldiers: crimson plumed helmets, steel armor, red cloaks, rectangular red shields. Setting: sunny daytime wedding courtyard in ancient Alexandria, sandstone columns with painted blue-and-gold bands, long tables with white cloths and clay jars, orange cloth awnings, and a tall wooden entrance gate at the back-center that opens onto the street. Lighting: warm bright afternoon sunlight, soft shadows, rich saturated colors. ACTION TIMELINE (8 seconds): 0–2.5 s: Senbi dances proudly beside a Roman soldier, beaming. 2.5–5.5 s: he waves his arm wildly, gesturing for the soldier to follow. 5.5–8 s: the soldier hesitates, then copies Senbi's arm movement stiffly with a flicker of a smile. Camera: locked-off and perfectly still, eye-level medium two-shot; the framing never changes (no tilt, pan, zoom or rising camera). Audio: voice-over narration only (a voice, never shown on screen; no narrator character appears): a British male voice, warm and dry, begins speaking within half a second and says: “Senbi, ever the host, invited one to join. Of course he did.” The line takes about 4.8 seconds; leave the last second free of speech so the moment can land. Music: playful comic percussion over the wedding rhythm, low under the voice. Sound effects: laughter, hand claps, timed to the action. Ambience: light courtyard ambience: clinking cups, footsteps on stone, a soft breeze, no words. Final reminder: no character says any word; only the voice-over narration speaks (voice only, nobody on screen is the narrator). Natural laughs, gasps and sighs are fine. No text, captions or logos in the frame.</w:t>
       </w:r>
     </w:p>
     <w:p>
@@ -2390,7 +2485,7 @@
           <w:sz w:val="26"/>
           <w:szCs w:val="26"/>
         </w:rPr>
-        <w:t xml:space="preserve">SHOT 28 — Offering beer</w:t>
+        <w:t xml:space="preserve">SHOT 34 — Bride disbelief</w:t>
       </w:r>
     </w:p>
     <w:p>
@@ -2414,7 +2509,7 @@
           <w:sz w:val="21"/>
           <w:szCs w:val="21"/>
         </w:rPr>
-        <w:t xml:space="preserve">Relatives_group.png,  Roman_soldiers.png</w:t>
+        <w:t xml:space="preserve">Bride_from_Shot1.png,  Senbi_from_Shot1.png,  Roman_soldiers.png</w:t>
       </w:r>
       <w:r>
         <w:rPr>
@@ -2446,7 +2541,7 @@
           <w:sz w:val="20"/>
           <w:szCs w:val="20"/>
         </w:rPr>
-        <w:t xml:space="preserve">VOICE RULE: only the voice-over narration speaks words; it is a voice only, never a person or character on screen. No character says any word and no one on screen lip-syncs to speech; characters communicate with facial expressions and body gestures. Natural non-verbal sounds are allowed and should sound real: laughing, giggling, gasping, sighing, groaning, cheering, coughing. Attached reference images, in order: the bride's relatives, the Roman soldiers. 2D hand-drawn stickman cartoon in the exact style of the reference images: thin black outlines, large expressive heads, thin stick arms, flat warm colors, playful documentary-comedy tone, 16:9. Characters, identical in every frame: the uncle: cheerful bearded middle-aged man in plain white linen. the Roman soldiers: crimson plumed helmets, steel armor, red cloaks, rectangular red shields. Setting: sunlit street of ancient Alexandria outside the wedding house, sandstone walls, palms, market stalls with red and blue awnings. Lighting: warm bright sunlight, soft shadows. ACTION TIMELINE (8 seconds): 0–2.5 s: the uncle holds out the cup with a big beaming smile. 2.5–5.5 s: a Roman soldier looks at the cup, then at the uncle, expression flat and baffled, and does not move. 5.5–8 s: the uncle's smile stays fixed, the cup trembling slightly as he waits; the soldier blinks slowly. Camera: locked-off and perfectly still, eye-level medium two-shot; the framing never changes (no tilt, pan, zoom or rising camera). Audio: voice-over narration only (a voice, never shown on screen; no narrator character appears): a British male voice, warm and dry, begins speaking within half a second and says: “He offered it to a Roman. As if it were completely normal.” The line takes about 4.8 seconds; leave the last second free of speech so the moment can land. Music: music nearly silent. Sound effects: cup clink, awkward silence, timed to the action. Ambience: sunlit street ambience: wind and distant clatter, no words. Final reminder: no character says any word; only the voice-over narration speaks (voice only, nobody on screen is the narrator). Natural laughs, gasps and sighs are fine. No text, captions or logos in the frame.</w:t>
+        <w:t xml:space="preserve">VOICE RULE: only the voice-over narration speaks words; it is a voice only, never a person or character on screen. No character says any word and no one on screen lip-syncs to speech; characters communicate with facial expressions and body gestures. Natural non-verbal sounds are allowed and should sound real: laughing, giggling, gasping, sighing, groaning, cheering, coughing. Attached reference images, in order: the bride, Senbi, the groom, the Roman soldiers. 2D hand-drawn stickman cartoon in the exact style of the reference images: thin black outlines, large expressive heads, thin stick arms, flat warm colors, playful documentary-comedy tone, 16:9. Characters, identical in every frame: the bride: black bob hair with straight bangs, gold headband with a red gem, white dress, blue-and-gold collar, gold sash, gold arm cuffs, light veil. Setting: sunny daytime wedding courtyard in ancient Alexandria, sandstone columns with painted blue-and-gold bands, long tables with white cloths and clay jars, orange cloth awnings, and a tall wooden entrance gate at the back-center that opens onto the street. Lighting: warm bright afternoon sunlight, soft shadows, rich saturated colors. ACTION TIMELINE (8 seconds): 0–2.5 s: the bride watches, amused, with polite delight. 2.5–5.5 s: her smile freezes as she sees Senbi dancing with the Romans. 5.5–8 s: she slowly lifts a hand and covers her face, shoulders shaking. Camera: locked-off and perfectly still, eye-level medium close-up of the bride; the framing never changes (no tilt, pan, zoom or rising camera). Audio: voice-over narration only (a voice, never shown on screen; no narrator character appears): a British male voice, warm and dry, begins speaking within half a second and says: “His bride slowly covered her face. This was not in the contract.” The line takes about 4.8 seconds; leave the last second free of speech so the moment can land. Music: playful comic percussion over the wedding rhythm, low under the voice. Sound effects: gasp, muffled laugh, timed to the action. Ambience: light courtyard ambience: clinking cups, footsteps on stone, a soft breeze, no words. Final reminder: no character says any word; only the voice-over narration speaks (voice only, nobody on screen is the narrator). Natural laughs, gasps and sighs are fine. No text, captions or logos in the frame.</w:t>
       </w:r>
     </w:p>
     <w:p>
@@ -2463,7 +2558,7 @@
           <w:sz w:val="26"/>
           <w:szCs w:val="26"/>
         </w:rPr>
-        <w:t xml:space="preserve">SHOT 29 — Roman confusion</w:t>
+        <w:t xml:space="preserve">SHOT 36 — Music stops</w:t>
       </w:r>
     </w:p>
     <w:p>
@@ -2487,7 +2582,7 @@
           <w:sz w:val="21"/>
           <w:szCs w:val="21"/>
         </w:rPr>
-        <w:t xml:space="preserve">Roman_soldiers.png</w:t>
+        <w:t xml:space="preserve">Guests_group.png,  Roman_soldiers.png,  Courtyard_from_Shot1.png</w:t>
       </w:r>
       <w:r>
         <w:rPr>
@@ -2519,7 +2614,7 @@
           <w:sz w:val="20"/>
           <w:szCs w:val="20"/>
         </w:rPr>
-        <w:t xml:space="preserve">VOICE RULE: only the voice-over narration speaks words; it is a voice only, never a person or character on screen. No character says any word and no one on screen lip-syncs to speech; characters communicate with facial expressions and body gestures. Natural non-verbal sounds are allowed and should sound real: laughing, giggling, gasping, sighing, groaning, cheering, coughing. Attached reference images, in order: the Roman soldiers. 2D hand-drawn stickman cartoon in the exact style of the reference images: thin black outlines, large expressive heads, thin stick arms, flat warm colors, playful documentary-comedy tone, 16:9. Characters, identical in every frame: the Roman soldiers: crimson plumed helmets, steel armor, red cloaks, rectangular red shields. Setting: sunlit street of ancient Alexandria outside the wedding house, sandstone walls, palms, market stalls with red and blue awnings. Lighting: warm bright sunlight, soft shadows. ACTION TIMELINE (8 seconds): 0–2.5 s: the soldier's confused face looks at the beer cup. 2.5–5.5 s: he looks up at the uncle's smiling face off-screen and back to the cup, then cautiously takes it. 5.5–8 s: his eyes slide sideways toward his comrades in a silent plea of 'what do I do?'; he sniffs the cup. Camera: eye-level medium close-up of the soldier; fixed except for an almost imperceptible 5% slow push-in, no tilt or pan. Audio: voice-over narration only (a voice, never shown on screen; no narrator character appears): a British male voice, warm and dry, begins speaking within half a second and says: “The soldier stared at the cup, then the uncle. A trap? Or hospitality?” The line takes about 5.2 seconds; leave the last second free of speech so the moment can land. Music: music nearly silent. Sound effects: tiny gulp, uneasy hum, timed to the action. Ambience: sunlit street ambience: wind and distant clatter, no words. Final reminder: no character says any word; only the voice-over narration speaks (voice only, nobody on screen is the narrator). Natural laughs, gasps and sighs are fine. No text, captions or logos in the frame.</w:t>
+        <w:t xml:space="preserve">VOICE RULE: only the voice-over narration speaks words; it is a voice only, never a person or character on screen. No character says any word and no one on screen lip-syncs to speech; characters communicate with facial expressions and body gestures. Natural non-verbal sounds are allowed and should sound real: laughing, giggling, gasping, sighing, groaning, cheering, coughing. Attached reference images, in order: the Egyptian wedding guests, the Roman soldiers, the wedding courtyard. 2D hand-drawn stickman cartoon in the exact style of the reference images: thin black outlines, large expressive heads, thin stick arms, flat warm colors, playful documentary-comedy tone, 16:9. Characters, identical in every frame: Senbi the groom: young man, straight black bowl-cut hair with bangs, gold headband with a gold cobra, bare chest, blue-and-gold broad collar, gold bracers, white kilt with a blue-and-gold sash, brown sandals, thin black stick arms. the guests: Egyptian wedding guests in white linen with blue-and-gold collars and gold headbands, black bob hairstyles, some in white striped headdresses. the Roman soldiers: crimson plumed helmets, steel armor, red cloaks, rectangular red shields. Setting: sunny daytime wedding courtyard in ancient Alexandria, sandstone columns with painted blue-and-gold bands, long tables with white cloths and clay jars, orange cloth awnings, and a tall wooden entrance gate at the back-center that opens onto the street. Lighting: warm bright afternoon sunlight, soft shadows, rich saturated colors. ACTION TIMELINE (8 seconds): 0–2 s: the dance is in full swing. 2–3 s: a sharp military horn blasts. 3–8 s: everyone freezes mid-step, Egyptians and Romans together, in a comic tableau: a soldier on one leg, a guest mid-spin, Senbi with arms raised, eyes darting toward the gate; hold completely still. Camera: locked-off and perfectly still, eye-level wide shot; the framing never changes (no tilt, pan, zoom or rising camera). Audio: voice-over narration only (a voice, never shown on screen; no narrator character appears): a British male voice, warm and dry, begins speaking within half a second and says: “Then a horn cut through the music, and everyone froze mid-step.” The line takes about 4.4 seconds; leave the last second free of speech so the moment can land. Music: music nearly silent. Sound effects: sharp military horn, then silence, timed to the action. Ambience: light courtyard ambience: clinking cups, footsteps on stone, a soft breeze, no words. Final reminder: no character says any word; only the voice-over narration speaks (voice only, nobody on screen is the narrator). Natural laughs, gasps and sighs are fine. No text, captions or logos in the frame.</w:t>
       </w:r>
     </w:p>
     <w:p>
@@ -2536,7 +2631,7 @@
           <w:sz w:val="26"/>
           <w:szCs w:val="26"/>
         </w:rPr>
-        <w:t xml:space="preserve">SHOT 30 — Food wins</w:t>
+        <w:t xml:space="preserve">SHOT 37 — Commander entrance</w:t>
       </w:r>
     </w:p>
     <w:p>
@@ -2560,7 +2655,7 @@
           <w:sz w:val="21"/>
           <w:szCs w:val="21"/>
         </w:rPr>
-        <w:t xml:space="preserve">Roman_soldiers.png,  Courtyard_from_Shot1.png</w:t>
+        <w:t xml:space="preserve">Commander_front.png,  Roman_soldiers.png,  Courtyard_from_Shot1.png</w:t>
       </w:r>
       <w:r>
         <w:rPr>
@@ -2592,7 +2687,7 @@
           <w:sz w:val="20"/>
           <w:szCs w:val="20"/>
         </w:rPr>
-        <w:t xml:space="preserve">VOICE RULE: only the voice-over narration speaks words; it is a voice only, never a person or character on screen. No character says any word and no one on screen lip-syncs to speech; characters communicate with facial expressions and body gestures. Natural non-verbal sounds are allowed and should sound real: laughing, giggling, gasping, sighing, groaning, cheering, coughing. Attached reference images, in order: the Roman soldiers, the wedding courtyard. 2D hand-drawn stickman cartoon in the exact style of the reference images: thin black outlines, large expressive heads, thin stick arms, flat warm colors, playful documentary-comedy tone, 16:9. Characters, identical in every frame: the Roman soldiers: crimson plumed helmets, steel armor, red cloaks, rectangular red shields. Setting: sunny daytime wedding courtyard in ancient Alexandria, sandstone columns with painted blue-and-gold bands, long tables with white cloths and clay jars, orange cloth awnings, and a tall wooden entrance gate at the back-center that opens onto the street. Lighting: warm bright afternoon sunlight, soft shadows, rich saturated colors. ACTION TIMELINE (8 seconds): 0–2.5 s: two Roman soldiers in the foreground scan the area with serious faces, the feast table behind them. 2.5–5.5 s: they turn their heads toward the roast goose, bread and fruit and their expressions soften. 5.5–8 s: one leans slightly forward, nostrils flaring, his stomach growls and the other glances at him. Camera: locked-off and perfectly still, eye-level wide-medium shot: the soldiers in the foreground, the feast table behind them; they turn their heads toward it; the framing never changes (no tilt, pan, zoom or rising camera). Audio: voice-over narration only (a voice, never shown on screen; no narrator character appears): a British male voice, warm and dry, begins speaking within half a second and says: “Then the Romans saw the food. Military discipline lasted about four seconds.” The line takes about 4.8 seconds; leave the last second free of speech so the moment can land. Music: playful comic percussion over the wedding rhythm, low under the voice. Sound effects: stomach growl, sniff, timed to the action. Ambience: light courtyard ambience: clinking cups, footsteps on stone, a soft breeze, no words. Final reminder: no character says any word; only the voice-over narration speaks (voice only, nobody on screen is the narrator). Natural laughs, gasps and sighs are fine. No text, captions or logos in the frame.</w:t>
+        <w:t xml:space="preserve">VOICE RULE: only the voice-over narration speaks words; it is a voice only, never a person or character on screen. No character says any word and no one on screen lip-syncs to speech; characters communicate with facial expressions and body gestures. Natural non-verbal sounds are allowed and should sound real: laughing, giggling, gasping, sighing, groaning, cheering, coughing. Attached reference images, in order: the Roman commander, the Roman soldiers, the wedding courtyard. 2D hand-drawn stickman cartoon in the exact style of the reference images: thin black outlines, large expressive heads, thin stick arms, flat warm colors, playful documentary-comedy tone, 16:9. Characters, identical in every frame: the Roman commander: dark curly gray-streaked hair, gold laurel wreath, bronze-and-gold armor, red cloak. the Roman soldiers: crimson plumed helmets, steel armor, red cloaks, rectangular red shields. Setting: sunny daytime wedding courtyard in ancient Alexandria, sandstone columns with painted blue-and-gold bands, long tables with white cloths and clay jars, orange cloth awnings, and a tall wooden entrance gate at the back-center that opens onto the street. Lighting: warm bright afternoon sunlight, soft shadows, rich saturated colors. ACTION TIMELINE (8 seconds): 0–2 s: the tall wooden gate swings fully open. 2–5 s: the Roman commander walks calmly through, scroll in hand, red cloak swaying, while the dancing soldiers step aside. 5–8 s: he stops in the center and the courtyard falls silent, everyone looking at him. Camera: locked-off and perfectly still, fixed, slightly low angle that never tilts, on the commander walking in; the framing never changes (no tilt, pan, zoom or rising camera). Audio: voice-over narration only (a voice, never shown on screen; no narrator character appears): a British male voice, warm and dry, begins speaking within half a second and says: “And in walked the commander. The only adult in the building.” The line takes about 4.4 seconds; leave the last second free of speech so the moment can land. Music: low sustained tension with distant marching drums, almost silent. Sound effects: slow footsteps, cloak rustle, timed to the action. Ambience: light courtyard ambience: clinking cups, footsteps on stone, a soft breeze, no words. Final reminder: no character says any word; only the voice-over narration speaks (voice only, nobody on screen is the narrator). Natural laughs, gasps and sighs are fine. No text, captions or logos in the frame.</w:t>
       </w:r>
     </w:p>
     <w:p>
@@ -2609,7 +2704,7 @@
           <w:sz w:val="26"/>
           <w:szCs w:val="26"/>
         </w:rPr>
-        <w:t xml:space="preserve">SHOT 31 — Accidental party</w:t>
+        <w:t xml:space="preserve">SHOT 39 — Cat stare</w:t>
       </w:r>
     </w:p>
     <w:p>
@@ -2633,7 +2728,7 @@
           <w:sz w:val="21"/>
           <w:szCs w:val="21"/>
         </w:rPr>
-        <w:t xml:space="preserve">Roman_soldiers.png,  Guests_group.png,  Courtyard_from_Shot1.png</w:t>
+        <w:t xml:space="preserve">Commander_front.png,  Black_cat.png</w:t>
       </w:r>
       <w:r>
         <w:rPr>
@@ -2665,7 +2760,7 @@
           <w:sz w:val="20"/>
           <w:szCs w:val="20"/>
         </w:rPr>
-        <w:t xml:space="preserve">VOICE RULE: only the voice-over narration speaks words; it is a voice only, never a person or character on screen. No character says any word and no one on screen lip-syncs to speech; characters communicate with facial expressions and body gestures. Natural non-verbal sounds are allowed and should sound real: laughing, giggling, gasping, sighing, groaning, cheering, coughing. Attached reference images, in order: the Roman soldiers, the Egyptian wedding guests, the wedding courtyard. 2D hand-drawn stickman cartoon in the exact style of the reference images: thin black outlines, large expressive heads, thin stick arms, flat warm colors, playful documentary-comedy tone, 16:9. Characters, identical in every frame: the guests: Egyptian wedding guests in white linen with blue-and-gold collars and gold headbands, black bob hairstyles, some in white striped headdresses. the Roman soldiers: crimson plumed helmets, steel armor, red cloaks, rectangular red shields. Setting: sunny daytime wedding courtyard in ancient Alexandria, sandstone columns with painted blue-and-gold bands, long tables with white cloths and clay jars, orange cloth awnings, and a tall wooden entrance gate at the back-center that opens onto the street. Lighting: warm bright afternoon sunlight, soft shadows, rich saturated colors. ACTION TIMELINE (8 seconds): 0–2.5 s: Egyptian guests dance in the courtyard. 2.5–5.5 s: one Roman soldier steps awkwardly onto the dance floor, stiff as a board; the guests freeze and stare. 5.5–8 s: one guest begins to copy his stiff step and the others hesitate, then join in. Camera: locked-off and perfectly still, eye-level wide shot; the framing never changes (no tilt, pan, zoom or rising camera). Audio: voice-over narration only (a voice, never shown on screen; no narrator character appears): a British male voice, warm and dry, begins speaking within half a second and says: “One soldier stepped into the dance. Nobody stopped him. Somehow, it worked.” The line takes about 4.8 seconds; leave the last second free of speech so the moment can land. Music: playful comic percussion over the wedding rhythm, low under the voice. Sound effects: shield tap blending into the rhythm, clapping, timed to the action. Ambience: light courtyard ambience: clinking cups, footsteps on stone, a soft breeze, no words. Final reminder: no character says any word; only the voice-over narration speaks (voice only, nobody on screen is the narrator). Natural laughs, gasps and sighs are fine. No text, captions or logos in the frame.</w:t>
+        <w:t xml:space="preserve">VOICE RULE: only the voice-over narration speaks words; it is a voice only, never a person or character on screen. No character says any word and no one on screen lip-syncs to speech; characters communicate with facial expressions and body gestures. Natural non-verbal sounds are allowed and should sound real: laughing, giggling, gasping, sighing, groaning, cheering, coughing. Attached reference images, in order: the Roman commander, the black cat. 2D hand-drawn stickman cartoon in the exact style of the reference images: thin black outlines, large expressive heads, thin stick arms, flat warm colors, playful documentary-comedy tone, 16:9. Characters, identical in every frame: the Roman commander: dark curly gray-streaked hair, gold laurel wreath, bronze-and-gold armor, red cloak. the cat: black with a small gold collar. Setting: sunny daytime wedding courtyard in ancient Alexandria, sandstone columns with painted blue-and-gold bands, long tables with white cloths and clay jars, orange cloth awnings, and a tall wooden entrance gate at the back-center that opens onto the street. Lighting: warm bright afternoon sunlight, soft shadows, rich saturated colors. ACTION TIMELINE (8 seconds): 0–2.5 s: the commander in the foreground; his eyes land on the black cat on the table behind him. 2.5–5.5 s: the cat stares straight back, unblinking. 5.5–8 s: a muscle in the commander's jaw twitches and he looks away first. Camera: locked-off and perfectly still, eye-level medium two-shot: the commander in the foreground, the cat on the table behind him; no cutting; the framing never changes (no tilt, pan, zoom or rising camera). Audio: voice-over narration only (a voice, never shown on screen; no narrator character appears): a British male voice, warm and dry, begins speaking within half a second and says: “The cat looked back. The cat was not impressed by the Roman Empire.” The line takes about 5.2 seconds; leave the last second free of speech so the moment can land. Music: music nearly silent. Sound effects: cat meow, tiny sting, timed to the action. Ambience: light courtyard ambience: clinking cups, footsteps on stone, a soft breeze, no words. Final reminder: no character says any word; only the voice-over narration speaks (voice only, nobody on screen is the narrator). Natural laughs, gasps and sighs are fine. No text, captions or logos in the frame.</w:t>
       </w:r>
     </w:p>
     <w:p>
@@ -2682,7 +2777,7 @@
           <w:sz w:val="26"/>
           <w:szCs w:val="26"/>
         </w:rPr>
-        <w:t xml:space="preserve">SHOT 32 — Armor dance</w:t>
+        <w:t xml:space="preserve">SHOT 40 — Announcement</w:t>
       </w:r>
     </w:p>
     <w:p>
@@ -2706,7 +2801,7 @@
           <w:sz w:val="21"/>
           <w:szCs w:val="21"/>
         </w:rPr>
-        <w:t xml:space="preserve">Roman_soldiers.png,  Guests_group.png,  Courtyard_from_Shot1.png</w:t>
+        <w:t xml:space="preserve">Commander_front.png,  Guests_group.png,  Senbi_from_Shot1.png</w:t>
       </w:r>
       <w:r>
         <w:rPr>
@@ -2724,7 +2819,7 @@
           <w:sz w:val="21"/>
           <w:szCs w:val="21"/>
         </w:rPr>
-        <w:t xml:space="preserve">6 sec</w:t>
+        <w:t xml:space="preserve">8 sec</w:t>
       </w:r>
     </w:p>
     <w:p>
@@ -2738,7 +2833,7 @@
           <w:sz w:val="20"/>
           <w:szCs w:val="20"/>
         </w:rPr>
-        <w:t xml:space="preserve">VOICE RULE: only the voice-over narration speaks words; it is a voice only, never a person or character on screen. No character says any word and no one on screen lip-syncs to speech; characters communicate with facial expressions and body gestures. Natural non-verbal sounds are allowed and should sound real: laughing, giggling, gasping, sighing, groaning, cheering, coughing. Attached reference images, in order: the Roman soldiers, the Egyptian wedding guests, the wedding courtyard. 2D hand-drawn stickman cartoon in the exact style of the reference images: thin black outlines, large expressive heads, thin stick arms, flat warm colors, playful documentary-comedy tone, 16:9. Characters, identical in every frame: the Roman soldiers: crimson plumed helmets, steel armor, red cloaks, rectangular red shields. the guests: Egyptian wedding guests in white linen with blue-and-gold collars and gold headbands, black bob hairstyles, some in white striped headdresses. Setting: sunny daytime wedding courtyard in ancient Alexandria, sandstone columns with painted blue-and-gold bands, long tables with white cloths and clay jars, orange cloth awnings, and a tall wooden entrance gate at the back-center that opens onto the street. Lighting: warm bright afternoon sunlight, soft shadows, rich saturated colors. ACTION TIMELINE (6 seconds): 0–2 s: three Roman soldiers in full armor step to the right in a row, stiff but strangely synchronized, capes swaying, Egyptian dancers around them smiling and clapping. 2–4 s: they step to the left in unison. 4–6 s: all three raise one arm together in perfect unison, then stare at each other, confused. Camera: locked-off and perfectly still, eye-level wide shot of the dancing Romans; the framing never changes (no tilt, pan, zoom or rising camera). Audio: voice-over narration only (a voice, never shown on screen; no narrator character appears): a British male voice, warm and dry, begins speaking within half a second and says: “Roman engineering changed the world. Roman dancing did not.” The line takes about 3.6 seconds; leave the last second free of speech so the moment can land. Music: playful comic percussion over the wedding rhythm, low under the voice. Sound effects: armor clanking out of rhythm, timed to the action. Ambience: light courtyard ambience: clinking cups, footsteps on stone, a soft breeze, no words. Final reminder: no character says any word; only the voice-over narration speaks (voice only, nobody on screen is the narrator). Natural laughs, gasps and sighs are fine. No text, captions or logos in the frame.</w:t>
+        <w:t xml:space="preserve">VOICE RULE: only the voice-over narration speaks words; it is a voice only, never a person or character on screen. No character says any word and no one on screen lip-syncs to speech; characters communicate with facial expressions and body gestures. Natural non-verbal sounds are allowed and should sound real: laughing, giggling, gasping, sighing, groaning, cheering, coughing. Attached reference images, in order: the Roman commander, the Egyptian wedding guests, Senbi, the groom. 2D hand-drawn stickman cartoon in the exact style of the reference images: thin black outlines, large expressive heads, thin stick arms, flat warm colors, playful documentary-comedy tone, 16:9. Characters, identical in every frame: the Roman commander: dark curly gray-streaked hair, gold laurel wreath, bronze-and-gold armor, red cloak. the guests: Egyptian wedding guests in white linen with blue-and-gold collars and gold headbands, black bob hairstyles, some in white striped headdresses. the Roman soldiers: crimson plumed helmets, steel armor, red cloaks, rectangular red shields. Setting: sunny daytime wedding courtyard in ancient Alexandria, sandstone columns with painted blue-and-gold bands, long tables with white cloths and clay jars, orange cloth awnings, and a tall wooden entrance gate at the back-center that opens onto the street. Lighting: warm bright afternoon sunlight, soft shadows, rich saturated colors. ACTION TIMELINE (8 seconds): 0–2.5 s: the commander at the center lifts the scroll with both hands, Egyptians on his left and Romans on his right standing silent and still. 2.5–5.5 s: he unrolls it slowly, papyrus falling to his waist, only abstract marks on it. 5.5–8 s: he lifts his chin as if about to read; everyone is silent. Camera: locked-off and perfectly still, symmetrical eye-level medium-wide shot; the framing never changes (no tilt, pan, zoom or rising camera). Audio: voice-over narration only (a voice, never shown on screen; no narrator character appears): a British male voice, warm and dry, begins speaking within half a second and says: “He unrolled the scroll. Message received: Egypt has new management.” The line takes about 4.0 seconds; leave the last second free of speech so the moment can land. Music: low sustained tension with distant marching drums, almost silent. Sound effects: scroll unrolling, one dramatic drum hit, timed to the action. Ambience: light courtyard ambience: clinking cups, footsteps on stone, a soft breeze, no words. Final reminder: no character says any word; only the voice-over narration speaks (voice only, nobody on screen is the narrator). Natural laughs, gasps and sighs are fine. No text, captions or logos in the frame.</w:t>
       </w:r>
     </w:p>
     <w:p>
@@ -2755,7 +2850,7 @@
           <w:sz w:val="26"/>
           <w:szCs w:val="26"/>
         </w:rPr>
-        <w:t xml:space="preserve">SHOT 33 — Senbi joins</w:t>
+        <w:t xml:space="preserve">SHOT 41 — Senbi and bride</w:t>
       </w:r>
     </w:p>
     <w:p>
@@ -2779,7 +2874,7 @@
           <w:sz w:val="21"/>
           <w:szCs w:val="21"/>
         </w:rPr>
-        <w:t xml:space="preserve">Senbi_from_Shot1.png,  Roman_soldiers.png,  Courtyard_from_Shot1.png</w:t>
+        <w:t xml:space="preserve">Senbi_from_Shot1.png,  Bride_from_Shot1.png,  Guests_group.png</w:t>
       </w:r>
       <w:r>
         <w:rPr>
@@ -2811,7 +2906,7 @@
           <w:sz w:val="20"/>
           <w:szCs w:val="20"/>
         </w:rPr>
-        <w:t xml:space="preserve">VOICE RULE: only the voice-over narration speaks words; it is a voice only, never a person or character on screen. No character says any word and no one on screen lip-syncs to speech; characters communicate with facial expressions and body gestures. Natural non-verbal sounds are allowed and should sound real: laughing, giggling, gasping, sighing, groaning, cheering, coughing. Attached reference images, in order: Senbi, the groom, the Roman soldiers, the wedding courtyard. 2D hand-drawn stickman cartoon in the exact style of the reference images: thin black outlines, large expressive heads, thin stick arms, flat warm colors, playful documentary-comedy tone, 16:9. Characters, identical in every frame: Senbi the groom: young man, straight black bowl-cut hair with bangs, gold headband with a gold cobra, bare chest, blue-and-gold broad collar, gold bracers, white kilt with a blue-and-gold sash, brown sandals, thin black stick arms. the Roman soldiers: crimson plumed helmets, steel armor, red cloaks, rectangular red shields. Setting: sunny daytime wedding courtyard in ancient Alexandria, sandstone columns with painted blue-and-gold bands, long tables with white cloths and clay jars, orange cloth awnings, and a tall wooden entrance gate at the back-center that opens onto the street. Lighting: warm bright afternoon sunlight, soft shadows, rich saturated colors. ACTION TIMELINE (8 seconds): 0–2.5 s: Senbi dances proudly beside a Roman soldier, beaming. 2.5–5.5 s: he waves his arm wildly, gesturing for the soldier to follow. 5.5–8 s: the soldier hesitates, then copies Senbi's arm movement stiffly with a flicker of a smile. Camera: locked-off and perfectly still, eye-level medium two-shot; the framing never changes (no tilt, pan, zoom or rising camera). Audio: voice-over narration only (a voice, never shown on screen; no narrator character appears): a British male voice, warm and dry, begins speaking within half a second and says: “Senbi, ever the host, invited one to join. Of course he did.” The line takes about 4.8 seconds; leave the last second free of speech so the moment can land. Music: playful comic percussion over the wedding rhythm, low under the voice. Sound effects: laughter, hand claps, timed to the action. Ambience: light courtyard ambience: clinking cups, footsteps on stone, a soft breeze, no words. Final reminder: no character says any word; only the voice-over narration speaks (voice only, nobody on screen is the narrator). Natural laughs, gasps and sighs are fine. No text, captions or logos in the frame.</w:t>
+        <w:t xml:space="preserve">VOICE RULE: only the voice-over narration speaks words; it is a voice only, never a person or character on screen. No character says any word and no one on screen lip-syncs to speech; characters communicate with facial expressions and body gestures. Natural non-verbal sounds are allowed and should sound real: laughing, giggling, gasping, sighing, groaning, cheering, coughing. Attached reference images, in order: Senbi, the groom, the bride, the Egyptian wedding guests. 2D hand-drawn stickman cartoon in the exact style of the reference images: thin black outlines, large expressive heads, thin stick arms, flat warm colors, playful documentary-comedy tone, 16:9. Characters, identical in every frame: Senbi the groom: young man, straight black bowl-cut hair with bangs, gold headband with a gold cobra, bare chest, blue-and-gold broad collar, gold bracers, white kilt with a blue-and-gold sash, brown sandals, thin black stick arms. the bride: black bob hair with straight bangs, gold headband with a red gem, white dress, blue-and-gold collar, gold sash, gold arm cuffs, light veil. Setting: sunny daytime wedding courtyard in ancient Alexandria, sandstone columns with painted blue-and-gold bands, long tables with white cloths and clay jars, orange cloth awnings, and a tall wooden entrance gate at the back-center that opens onto the street. Lighting: warm bright afternoon sunlight, soft shadows, rich saturated colors. ACTION TIMELINE (8 seconds): 0–2.5 s: Senbi and the bride look forward, shocked. 2.5–5.5 s: Senbi slowly turns his head toward the bride. 5.5–8 s: the bride turns to him, they exchange a wide-eyed look and Senbi forces a smile. Camera: locked-off and perfectly still, eye-level medium two-shot of Senbi and the bride; the framing never changes (no tilt, pan, zoom or rising camera). Audio: voice-over narration only (a voice, never shown on screen; no narrator character appears): a British male voice, warm and dry, begins speaking within half a second and says: “Senbi looked at his bride. Same question, silently: is the wedding still on?” The line takes about 5.2 seconds; leave the last second free of speech so the moment can land. Music: low sustained tension with distant marching drums, almost silent. Sound effects: nervous breath, single drum, timed to the action. Ambience: light courtyard ambience: clinking cups, footsteps on stone, a soft breeze, no words. Final reminder: no character says any word; only the voice-over narration speaks (voice only, nobody on screen is the narrator). Natural laughs, gasps and sighs are fine. No text, captions or logos in the frame.</w:t>
       </w:r>
     </w:p>
     <w:p>
@@ -2828,7 +2923,7 @@
           <w:sz w:val="26"/>
           <w:szCs w:val="26"/>
         </w:rPr>
-        <w:t xml:space="preserve">SHOT 34 — Bride disbelief</w:t>
+        <w:t xml:space="preserve">SHOT 43 — Clarification</w:t>
       </w:r>
     </w:p>
     <w:p>
@@ -2852,7 +2947,7 @@
           <w:sz w:val="21"/>
           <w:szCs w:val="21"/>
         </w:rPr>
-        <w:t xml:space="preserve">Bride_from_Shot1.png,  Senbi_from_Shot1.png,  Roman_soldiers.png</w:t>
+        <w:t xml:space="preserve">Alexandria_Harbor_from_ref08.png,  Roman_soldiers.png</w:t>
       </w:r>
       <w:r>
         <w:rPr>
@@ -2884,7 +2979,7 @@
           <w:sz w:val="20"/>
           <w:szCs w:val="20"/>
         </w:rPr>
-        <w:t xml:space="preserve">VOICE RULE: only the voice-over narration speaks words; it is a voice only, never a person or character on screen. No character says any word and no one on screen lip-syncs to speech; characters communicate with facial expressions and body gestures. Natural non-verbal sounds are allowed and should sound real: laughing, giggling, gasping, sighing, groaning, cheering, coughing. Attached reference images, in order: the bride, Senbi, the groom, the Roman soldiers. 2D hand-drawn stickman cartoon in the exact style of the reference images: thin black outlines, large expressive heads, thin stick arms, flat warm colors, playful documentary-comedy tone, 16:9. Characters, identical in every frame: the bride: black bob hair with straight bangs, gold headband with a red gem, white dress, blue-and-gold collar, gold sash, gold arm cuffs, light veil. Setting: sunny daytime wedding courtyard in ancient Alexandria, sandstone columns with painted blue-and-gold bands, long tables with white cloths and clay jars, orange cloth awnings, and a tall wooden entrance gate at the back-center that opens onto the street. Lighting: warm bright afternoon sunlight, soft shadows, rich saturated colors. ACTION TIMELINE (8 seconds): 0–2.5 s: the bride watches, amused, with polite delight. 2.5–5.5 s: her smile freezes as she sees Senbi dancing with the Romans. 5.5–8 s: she slowly lifts a hand and covers her face, shoulders shaking. Camera: locked-off and perfectly still, eye-level medium close-up of the bride; the framing never changes (no tilt, pan, zoom or rising camera). Audio: voice-over narration only (a voice, never shown on screen; no narrator character appears): a British male voice, warm and dry, begins speaking within half a second and says: “His bride slowly covered her face. This was not in the contract.” The line takes about 4.8 seconds; leave the last second free of speech so the moment can land. Music: playful comic percussion over the wedding rhythm, low under the voice. Sound effects: gasp, muffled laugh, timed to the action. Ambience: light courtyard ambience: clinking cups, footsteps on stone, a soft breeze, no words. Final reminder: no character says any word; only the voice-over narration speaks (voice only, nobody on screen is the narrator). Natural laughs, gasps and sighs are fine. No text, captions or logos in the frame.</w:t>
+        <w:t xml:space="preserve">VOICE RULE: only the voice-over narration speaks words; it is a voice only, never a person or character on screen. No character says any word and no one on screen lip-syncs to speech; characters communicate with facial expressions and body gestures. Natural non-verbal sounds are allowed and should sound real: laughing, giggling, gasping, sighing, groaning, cheering, coughing. Attached reference images, in order: the Alexandria harbor, the Roman soldiers. 2D hand-drawn stickman cartoon in the exact style of the reference images: thin black outlines, large expressive heads, thin stick arms, flat warm colors, playful documentary-comedy tone, 16:9. Characters, identical in every frame: the Roman soldiers: crimson plumed helmets, steel armor, red cloaks, rectangular red shields. Setting: sunlit street of ancient Alexandria outside the wedding house, sandstone walls, palms, market stalls with red and blue awnings. Lighting: warm bright sunlight, soft shadows. ACTION TIMELINE (8 seconds): 0–2.5 s: a few Roman soldiers pass through the street. 2.5–5.5 s: ordinary Egyptians carry baskets, bargain and haul jars as usual. 5.5–8 s: a boy runs across the frame; life goes on. Camera: locked-off and perfectly still, eye-level wide observational shot of Alexandria; the framing never changes (no tilt, pan, zoom or rising camera). Audio: voice-over narration only (a voice, never shown on screen; no narrator character appears): a British male voice, warm and dry, begins speaking within half a second and says: “To be clear: Senbi and his wedding are fiction. The cat, sadly, too.” The line takes about 5.2 seconds; leave the last second free of speech so the moment can land. Music: music nearly silent. Sound effects: calm city ambience, timed to the action. Ambience: sunlit street ambience: wind and distant clatter, no words. Final reminder: no character says any word; only the voice-over narration speaks (voice only, nobody on screen is the narrator). Natural laughs, gasps and sighs are fine. No text, captions or logos in the frame.</w:t>
       </w:r>
     </w:p>
     <w:p>
@@ -2901,664 +2996,24 @@
           <w:sz w:val="26"/>
           <w:szCs w:val="26"/>
         </w:rPr>
-        <w:t xml:space="preserve">SHOT 35 — Controlled chaos</w:t>
-      </w:r>
-    </w:p>
-    <w:p>
-      <w:pPr>
-        <w:keepNext/>
-        <w:spacing w:after="60" w:before="0"/>
-      </w:pPr>
-      <w:r>
-        <w:rPr>
-          <w:rFonts w:ascii="Arial" w:cs="Arial" w:eastAsia="Arial" w:hAnsi="Arial"/>
-          <w:b/>
-          <w:bCs/>
-          <w:sz w:val="21"/>
-          <w:szCs w:val="21"/>
-        </w:rPr>
-        <w:t xml:space="preserve">Attach: </w:t>
-      </w:r>
-      <w:r>
-        <w:rPr>
-          <w:rFonts w:ascii="Arial" w:cs="Arial" w:eastAsia="Arial" w:hAnsi="Arial"/>
-          <w:sz w:val="21"/>
-          <w:szCs w:val="21"/>
-        </w:rPr>
-        <w:t xml:space="preserve">Senbi_from_Shot1.png,  Bride_from_Shot1.png,  Guests_group.png</w:t>
-      </w:r>
-      <w:r>
-        <w:rPr>
-          <w:rFonts w:ascii="Arial" w:cs="Arial" w:eastAsia="Arial" w:hAnsi="Arial"/>
-          <w:b/>
-          <w:bCs/>
-          <w:sz w:val="21"/>
-          <w:szCs w:val="21"/>
-        </w:rPr>
-        <w:t xml:space="preserve">      Duration: </w:t>
-      </w:r>
-      <w:r>
-        <w:rPr>
-          <w:rFonts w:ascii="Arial" w:cs="Arial" w:eastAsia="Arial" w:hAnsi="Arial"/>
-          <w:sz w:val="21"/>
-          <w:szCs w:val="21"/>
-        </w:rPr>
-        <w:t xml:space="preserve">8 sec</w:t>
-      </w:r>
-    </w:p>
-    <w:p>
-      <w:pPr>
-        <w:shd w:fill="F2F2F2" w:val="clear"/>
-        <w:spacing w:after="80"/>
-      </w:pPr>
-      <w:r>
-        <w:rPr>
-          <w:rFonts w:ascii="Arial" w:cs="Arial" w:eastAsia="Arial" w:hAnsi="Arial"/>
-          <w:sz w:val="20"/>
-          <w:szCs w:val="20"/>
-        </w:rPr>
-        <w:t xml:space="preserve">VOICE RULE: only the voice-over narration speaks words; it is a voice only, never a person or character on screen. No character says any word and no one on screen lip-syncs to speech; characters communicate with facial expressions and body gestures. Natural non-verbal sounds are allowed and should sound real: laughing, giggling, gasping, sighing, groaning, cheering, coughing. Attached reference images, in order: Senbi, the groom, the bride, the Egyptian wedding guests. 2D hand-drawn stickman cartoon in the exact style of the reference images: thin black outlines, large expressive heads, thin stick arms, flat warm colors, playful documentary-comedy tone, 16:9. Characters, identical in every frame: Senbi the groom: young man, straight black bowl-cut hair with bangs, gold headband with a gold cobra, bare chest, blue-and-gold broad collar, gold bracers, white kilt with a blue-and-gold sash, brown sandals, thin black stick arms. the bride: black bob hair with straight bangs, gold headband with a red gem, white dress, blue-and-gold collar, gold sash, gold arm cuffs, light veil. the guests: Egyptian wedding guests in white linen with blue-and-gold collars and gold headbands, black bob hairstyles, some in white striped headdresses. the Roman soldiers: crimson plumed helmets, steel armor, red cloaks, rectangular red shields. the musicians: guests in white linen playing harp, frame drum and reed flute. Setting: sunny daytime wedding courtyard in ancient Alexandria, sandstone columns with painted blue-and-gold bands, long tables with white cloths and clay jars, orange cloth awnings, and a tall wooden entrance gate at the back-center that opens onto the street. Lighting: warm bright afternoon sunlight, soft shadows, rich saturated colors. ACTION TIMELINE (8 seconds): 0–2.5 s: Egyptians and Romans dance together off the beat while musicians struggle to keep the rhythm. 2.5–5.5 s: a plate of food is passed hand to hand and a soldier takes a fig. 5.5–8 s: Senbi is delighted in the center while the bride at the side holds her forehead, overwhelmed. Camera: locked-off and perfectly still, eye-level wide shot of the whole courtyard; the framing never changes (no tilt, pan, zoom or rising camera). Audio: voice-over narration only (a voice, never shown on screen; no narrator character appears): a British male voice, warm and dry, begins speaking within half a second and says: “Soon, Egyptians and Romans were passing food and stepping on each other's feet.” The line takes about 5.2 seconds; leave the last second free of speech so the moment can land. Music: playful comic percussion over the wedding rhythm, low under the voice. Sound effects: laughter, plates, music chaos, timed to the action. Ambience: light courtyard ambience: clinking cups, footsteps on stone, a soft breeze, no words. Final reminder: no character says any word; only the voice-over narration speaks (voice only, nobody on screen is the narrator). Natural laughs, gasps and sighs are fine. No text, captions or logos in the frame.</w:t>
-      </w:r>
-    </w:p>
-    <w:p>
-      <w:pPr>
-        <w:pStyle w:val="Heading2"/>
-        <w:keepNext/>
-        <w:spacing w:after="60" w:before="260"/>
-      </w:pPr>
-      <w:r>
-        <w:rPr>
-          <w:rFonts w:ascii="Arial" w:cs="Arial" w:eastAsia="Arial" w:hAnsi="Arial"/>
-          <w:b/>
-          <w:bCs/>
-          <w:sz w:val="26"/>
-          <w:szCs w:val="26"/>
-        </w:rPr>
-        <w:t xml:space="preserve">SHOT 36 — Music stops</w:t>
-      </w:r>
-    </w:p>
-    <w:p>
-      <w:pPr>
-        <w:keepNext/>
-        <w:spacing w:after="60" w:before="0"/>
-      </w:pPr>
-      <w:r>
-        <w:rPr>
-          <w:rFonts w:ascii="Arial" w:cs="Arial" w:eastAsia="Arial" w:hAnsi="Arial"/>
-          <w:b/>
-          <w:bCs/>
-          <w:sz w:val="21"/>
-          <w:szCs w:val="21"/>
-        </w:rPr>
-        <w:t xml:space="preserve">Attach: </w:t>
-      </w:r>
-      <w:r>
-        <w:rPr>
-          <w:rFonts w:ascii="Arial" w:cs="Arial" w:eastAsia="Arial" w:hAnsi="Arial"/>
-          <w:sz w:val="21"/>
-          <w:szCs w:val="21"/>
-        </w:rPr>
-        <w:t xml:space="preserve">Guests_group.png,  Roman_soldiers.png,  Courtyard_from_Shot1.png</w:t>
-      </w:r>
-      <w:r>
-        <w:rPr>
-          <w:rFonts w:ascii="Arial" w:cs="Arial" w:eastAsia="Arial" w:hAnsi="Arial"/>
-          <w:b/>
-          <w:bCs/>
-          <w:sz w:val="21"/>
-          <w:szCs w:val="21"/>
-        </w:rPr>
-        <w:t xml:space="preserve">      Duration: </w:t>
-      </w:r>
-      <w:r>
-        <w:rPr>
-          <w:rFonts w:ascii="Arial" w:cs="Arial" w:eastAsia="Arial" w:hAnsi="Arial"/>
-          <w:sz w:val="21"/>
-          <w:szCs w:val="21"/>
-        </w:rPr>
-        <w:t xml:space="preserve">8 sec</w:t>
-      </w:r>
-    </w:p>
-    <w:p>
-      <w:pPr>
-        <w:shd w:fill="F2F2F2" w:val="clear"/>
-        <w:spacing w:after="80"/>
-      </w:pPr>
-      <w:r>
-        <w:rPr>
-          <w:rFonts w:ascii="Arial" w:cs="Arial" w:eastAsia="Arial" w:hAnsi="Arial"/>
-          <w:sz w:val="20"/>
-          <w:szCs w:val="20"/>
-        </w:rPr>
-        <w:t xml:space="preserve">VOICE RULE: only the voice-over narration speaks words; it is a voice only, never a person or character on screen. No character says any word and no one on screen lip-syncs to speech; characters communicate with facial expressions and body gestures. Natural non-verbal sounds are allowed and should sound real: laughing, giggling, gasping, sighing, groaning, cheering, coughing. Attached reference images, in order: the Egyptian wedding guests, the Roman soldiers, the wedding courtyard. 2D hand-drawn stickman cartoon in the exact style of the reference images: thin black outlines, large expressive heads, thin stick arms, flat warm colors, playful documentary-comedy tone, 16:9. Characters, identical in every frame: Senbi the groom: young man, straight black bowl-cut hair with bangs, gold headband with a gold cobra, bare chest, blue-and-gold broad collar, gold bracers, white kilt with a blue-and-gold sash, brown sandals, thin black stick arms. the guests: Egyptian wedding guests in white linen with blue-and-gold collars and gold headbands, black bob hairstyles, some in white striped headdresses. the Roman soldiers: crimson plumed helmets, steel armor, red cloaks, rectangular red shields. Setting: sunny daytime wedding courtyard in ancient Alexandria, sandstone columns with painted blue-and-gold bands, long tables with white cloths and clay jars, orange cloth awnings, and a tall wooden entrance gate at the back-center that opens onto the street. Lighting: warm bright afternoon sunlight, soft shadows, rich saturated colors. ACTION TIMELINE (8 seconds): 0–2 s: the dance is in full swing. 2–3 s: a sharp military horn blasts. 3–8 s: everyone freezes mid-step, Egyptians and Romans together, in a comic tableau: a soldier on one leg, a guest mid-spin, Senbi with arms raised, eyes darting toward the gate; hold completely still. Camera: locked-off and perfectly still, eye-level wide shot; the framing never changes (no tilt, pan, zoom or rising camera). Audio: voice-over narration only (a voice, never shown on screen; no narrator character appears): a British male voice, warm and dry, begins speaking within half a second and says: “Then a horn cut through the music, and everyone froze mid-step.” The line takes about 4.4 seconds; leave the last second free of speech so the moment can land. Music: music nearly silent. Sound effects: sharp military horn, then silence, timed to the action. Ambience: light courtyard ambience: clinking cups, footsteps on stone, a soft breeze, no words. Final reminder: no character says any word; only the voice-over narration speaks (voice only, nobody on screen is the narrator). Natural laughs, gasps and sighs are fine. No text, captions or logos in the frame.</w:t>
-      </w:r>
-    </w:p>
-    <w:p>
-      <w:pPr>
-        <w:pStyle w:val="Heading2"/>
-        <w:keepNext/>
-        <w:spacing w:after="60" w:before="260"/>
-      </w:pPr>
-      <w:r>
-        <w:rPr>
-          <w:rFonts w:ascii="Arial" w:cs="Arial" w:eastAsia="Arial" w:hAnsi="Arial"/>
-          <w:b/>
-          <w:bCs/>
-          <w:sz w:val="26"/>
-          <w:szCs w:val="26"/>
-        </w:rPr>
-        <w:t xml:space="preserve">SHOT 37 — Commander entrance</w:t>
-      </w:r>
-    </w:p>
-    <w:p>
-      <w:pPr>
-        <w:keepNext/>
-        <w:spacing w:after="60" w:before="0"/>
-      </w:pPr>
-      <w:r>
-        <w:rPr>
-          <w:rFonts w:ascii="Arial" w:cs="Arial" w:eastAsia="Arial" w:hAnsi="Arial"/>
-          <w:b/>
-          <w:bCs/>
-          <w:sz w:val="21"/>
-          <w:szCs w:val="21"/>
-        </w:rPr>
-        <w:t xml:space="preserve">Attach: </w:t>
-      </w:r>
-      <w:r>
-        <w:rPr>
-          <w:rFonts w:ascii="Arial" w:cs="Arial" w:eastAsia="Arial" w:hAnsi="Arial"/>
-          <w:sz w:val="21"/>
-          <w:szCs w:val="21"/>
-        </w:rPr>
-        <w:t xml:space="preserve">Commander_front.png,  Roman_soldiers.png,  Courtyard_from_Shot1.png</w:t>
-      </w:r>
-      <w:r>
-        <w:rPr>
-          <w:rFonts w:ascii="Arial" w:cs="Arial" w:eastAsia="Arial" w:hAnsi="Arial"/>
-          <w:b/>
-          <w:bCs/>
-          <w:sz w:val="21"/>
-          <w:szCs w:val="21"/>
-        </w:rPr>
-        <w:t xml:space="preserve">      Duration: </w:t>
-      </w:r>
-      <w:r>
-        <w:rPr>
-          <w:rFonts w:ascii="Arial" w:cs="Arial" w:eastAsia="Arial" w:hAnsi="Arial"/>
-          <w:sz w:val="21"/>
-          <w:szCs w:val="21"/>
-        </w:rPr>
-        <w:t xml:space="preserve">8 sec</w:t>
-      </w:r>
-    </w:p>
-    <w:p>
-      <w:pPr>
-        <w:shd w:fill="F2F2F2" w:val="clear"/>
-        <w:spacing w:after="80"/>
-      </w:pPr>
-      <w:r>
-        <w:rPr>
-          <w:rFonts w:ascii="Arial" w:cs="Arial" w:eastAsia="Arial" w:hAnsi="Arial"/>
-          <w:sz w:val="20"/>
-          <w:szCs w:val="20"/>
-        </w:rPr>
-        <w:t xml:space="preserve">VOICE RULE: only the voice-over narration speaks words; it is a voice only, never a person or character on screen. No character says any word and no one on screen lip-syncs to speech; characters communicate with facial expressions and body gestures. Natural non-verbal sounds are allowed and should sound real: laughing, giggling, gasping, sighing, groaning, cheering, coughing. Attached reference images, in order: the Roman commander, the Roman soldiers, the wedding courtyard. 2D hand-drawn stickman cartoon in the exact style of the reference images: thin black outlines, large expressive heads, thin stick arms, flat warm colors, playful documentary-comedy tone, 16:9. Characters, identical in every frame: the Roman commander: dark curly gray-streaked hair, gold laurel wreath, bronze-and-gold armor, red cloak. the Roman soldiers: crimson plumed helmets, steel armor, red cloaks, rectangular red shields. Setting: sunny daytime wedding courtyard in ancient Alexandria, sandstone columns with painted blue-and-gold bands, long tables with white cloths and clay jars, orange cloth awnings, and a tall wooden entrance gate at the back-center that opens onto the street. Lighting: warm bright afternoon sunlight, soft shadows, rich saturated colors. ACTION TIMELINE (8 seconds): 0–2 s: the tall wooden gate swings fully open. 2–5 s: the Roman commander walks calmly through, scroll in hand, red cloak swaying, while the dancing soldiers step aside. 5–8 s: he stops in the center and the courtyard falls silent, everyone looking at him. Camera: locked-off and perfectly still, fixed, slightly low angle that never tilts, on the commander walking in; the framing never changes (no tilt, pan, zoom or rising camera). Audio: voice-over narration only (a voice, never shown on screen; no narrator character appears): a British male voice, warm and dry, begins speaking within half a second and says: “And in walked the commander. The only adult in the building.” The line takes about 4.4 seconds; leave the last second free of speech so the moment can land. Music: low sustained tension with distant marching drums, almost silent. Sound effects: slow footsteps, cloak rustle, timed to the action. Ambience: light courtyard ambience: clinking cups, footsteps on stone, a soft breeze, no words. Final reminder: no character says any word; only the voice-over narration speaks (voice only, nobody on screen is the narrator). Natural laughs, gasps and sighs are fine. No text, captions or logos in the frame.</w:t>
-      </w:r>
-    </w:p>
-    <w:p>
-      <w:pPr>
-        <w:pStyle w:val="Heading2"/>
-        <w:keepNext/>
-        <w:spacing w:after="60" w:before="260"/>
-      </w:pPr>
-      <w:r>
-        <w:rPr>
-          <w:rFonts w:ascii="Arial" w:cs="Arial" w:eastAsia="Arial" w:hAnsi="Arial"/>
-          <w:b/>
-          <w:bCs/>
-          <w:sz w:val="26"/>
-          <w:szCs w:val="26"/>
-        </w:rPr>
-        <w:t xml:space="preserve">SHOT 38 — Commander scans</w:t>
-      </w:r>
-    </w:p>
-    <w:p>
-      <w:pPr>
-        <w:keepNext/>
-        <w:spacing w:after="60" w:before="0"/>
-      </w:pPr>
-      <w:r>
-        <w:rPr>
-          <w:rFonts w:ascii="Arial" w:cs="Arial" w:eastAsia="Arial" w:hAnsi="Arial"/>
-          <w:b/>
-          <w:bCs/>
-          <w:sz w:val="21"/>
-          <w:szCs w:val="21"/>
-        </w:rPr>
-        <w:t xml:space="preserve">Attach: </w:t>
-      </w:r>
-      <w:r>
-        <w:rPr>
-          <w:rFonts w:ascii="Arial" w:cs="Arial" w:eastAsia="Arial" w:hAnsi="Arial"/>
-          <w:sz w:val="21"/>
-          <w:szCs w:val="21"/>
-        </w:rPr>
-        <w:t xml:space="preserve">Commander_front.png,  Senbi_from_Shot1.png,  Bride_from_Shot1.png</w:t>
-      </w:r>
-      <w:r>
-        <w:rPr>
-          <w:rFonts w:ascii="Arial" w:cs="Arial" w:eastAsia="Arial" w:hAnsi="Arial"/>
-          <w:b/>
-          <w:bCs/>
-          <w:sz w:val="21"/>
-          <w:szCs w:val="21"/>
-        </w:rPr>
-        <w:t xml:space="preserve">      Duration: </w:t>
-      </w:r>
-      <w:r>
-        <w:rPr>
-          <w:rFonts w:ascii="Arial" w:cs="Arial" w:eastAsia="Arial" w:hAnsi="Arial"/>
-          <w:sz w:val="21"/>
-          <w:szCs w:val="21"/>
-        </w:rPr>
-        <w:t xml:space="preserve">8 sec</w:t>
-      </w:r>
-    </w:p>
-    <w:p>
-      <w:pPr>
-        <w:shd w:fill="F2F2F2" w:val="clear"/>
-        <w:spacing w:after="80"/>
-      </w:pPr>
-      <w:r>
-        <w:rPr>
-          <w:rFonts w:ascii="Arial" w:cs="Arial" w:eastAsia="Arial" w:hAnsi="Arial"/>
-          <w:sz w:val="20"/>
-          <w:szCs w:val="20"/>
-        </w:rPr>
-        <w:t xml:space="preserve">VOICE RULE: only the voice-over narration speaks words; it is a voice only, never a person or character on screen. No character says any word and no one on screen lip-syncs to speech; characters communicate with facial expressions and body gestures. Natural non-verbal sounds are allowed and should sound real: laughing, giggling, gasping, sighing, groaning, cheering, coughing. Attached reference images, in order: the Roman commander, Senbi, the groom, the bride. 2D hand-drawn stickman cartoon in the exact style of the reference images: thin black outlines, large expressive heads, thin stick arms, flat warm colors, playful documentary-comedy tone, 16:9. Characters, identical in every frame: the Roman commander: dark curly gray-streaked hair, gold laurel wreath, bronze-and-gold armor, red cloak. Setting: sunny daytime wedding courtyard in ancient Alexandria, sandstone columns with painted blue-and-gold bands, long tables with white cloths and clay jars, orange cloth awnings, and a tall wooden entrance gate at the back-center that opens onto the street. Lighting: warm bright afternoon sunlight, soft shadows, rich saturated colors. ACTION TIMELINE (8 seconds): 0–2.5 s: the commander stands serious and still, scroll in hand. 2.5–5.5 s: he slowly turns his head to the left toward the dancing soldiers. 5.5–8 s: he turns toward the food table, then toward the decorations on the right; his face never changes except for one tiny eyebrow twitch. Camera: locked-off and perfectly still, eye-level medium shot of the commander; he turns his head, the camera does not pan; the framing never changes (no tilt, pan, zoom or rising camera). Audio: voice-over narration only (a voice, never shown on screen; no narrator character appears): a British male voice, warm and dry, begins speaking within half a second and says: “He saw his soldiers dancing. The food. The bride. The groom. The cat.” The line takes about 5.2 seconds; leave the last second free of speech so the moment can land. Music: music nearly silent. Sound effects: quiet room tone, fire crackle, timed to the action. Ambience: light courtyard ambience: clinking cups, footsteps on stone, a soft breeze, no words. Final reminder: no character says any word; only the voice-over narration speaks (voice only, nobody on screen is the narrator). Natural laughs, gasps and sighs are fine. No text, captions or logos in the frame.</w:t>
-      </w:r>
-    </w:p>
-    <w:p>
-      <w:pPr>
-        <w:pStyle w:val="Heading2"/>
-        <w:keepNext/>
-        <w:spacing w:after="60" w:before="260"/>
-      </w:pPr>
-      <w:r>
-        <w:rPr>
-          <w:rFonts w:ascii="Arial" w:cs="Arial" w:eastAsia="Arial" w:hAnsi="Arial"/>
-          <w:b/>
-          <w:bCs/>
-          <w:sz w:val="26"/>
-          <w:szCs w:val="26"/>
-        </w:rPr>
-        <w:t xml:space="preserve">SHOT 39 — Cat stare</w:t>
-      </w:r>
-    </w:p>
-    <w:p>
-      <w:pPr>
-        <w:keepNext/>
-        <w:spacing w:after="60" w:before="0"/>
-      </w:pPr>
-      <w:r>
-        <w:rPr>
-          <w:rFonts w:ascii="Arial" w:cs="Arial" w:eastAsia="Arial" w:hAnsi="Arial"/>
-          <w:b/>
-          <w:bCs/>
-          <w:sz w:val="21"/>
-          <w:szCs w:val="21"/>
-        </w:rPr>
-        <w:t xml:space="preserve">Attach: </w:t>
-      </w:r>
-      <w:r>
-        <w:rPr>
-          <w:rFonts w:ascii="Arial" w:cs="Arial" w:eastAsia="Arial" w:hAnsi="Arial"/>
-          <w:sz w:val="21"/>
-          <w:szCs w:val="21"/>
-        </w:rPr>
-        <w:t xml:space="preserve">Commander_front.png,  Black_cat.png</w:t>
-      </w:r>
-      <w:r>
-        <w:rPr>
-          <w:rFonts w:ascii="Arial" w:cs="Arial" w:eastAsia="Arial" w:hAnsi="Arial"/>
-          <w:b/>
-          <w:bCs/>
-          <w:sz w:val="21"/>
-          <w:szCs w:val="21"/>
-        </w:rPr>
-        <w:t xml:space="preserve">      Duration: </w:t>
-      </w:r>
-      <w:r>
-        <w:rPr>
-          <w:rFonts w:ascii="Arial" w:cs="Arial" w:eastAsia="Arial" w:hAnsi="Arial"/>
-          <w:sz w:val="21"/>
-          <w:szCs w:val="21"/>
-        </w:rPr>
-        <w:t xml:space="preserve">8 sec</w:t>
-      </w:r>
-    </w:p>
-    <w:p>
-      <w:pPr>
-        <w:shd w:fill="F2F2F2" w:val="clear"/>
-        <w:spacing w:after="80"/>
-      </w:pPr>
-      <w:r>
-        <w:rPr>
-          <w:rFonts w:ascii="Arial" w:cs="Arial" w:eastAsia="Arial" w:hAnsi="Arial"/>
-          <w:sz w:val="20"/>
-          <w:szCs w:val="20"/>
-        </w:rPr>
-        <w:t xml:space="preserve">VOICE RULE: only the voice-over narration speaks words; it is a voice only, never a person or character on screen. No character says any word and no one on screen lip-syncs to speech; characters communicate with facial expressions and body gestures. Natural non-verbal sounds are allowed and should sound real: laughing, giggling, gasping, sighing, groaning, cheering, coughing. Attached reference images, in order: the Roman commander, the black cat. 2D hand-drawn stickman cartoon in the exact style of the reference images: thin black outlines, large expressive heads, thin stick arms, flat warm colors, playful documentary-comedy tone, 16:9. Characters, identical in every frame: the Roman commander: dark curly gray-streaked hair, gold laurel wreath, bronze-and-gold armor, red cloak. the cat: black with a small gold collar. Setting: sunny daytime wedding courtyard in ancient Alexandria, sandstone columns with painted blue-and-gold bands, long tables with white cloths and clay jars, orange cloth awnings, and a tall wooden entrance gate at the back-center that opens onto the street. Lighting: warm bright afternoon sunlight, soft shadows, rich saturated colors. ACTION TIMELINE (8 seconds): 0–2.5 s: the commander in the foreground; his eyes land on the black cat on the table behind him. 2.5–5.5 s: the cat stares straight back, unblinking. 5.5–8 s: a muscle in the commander's jaw twitches and he looks away first. Camera: locked-off and perfectly still, eye-level medium two-shot: the commander in the foreground, the cat on the table behind him; no cutting; the framing never changes (no tilt, pan, zoom or rising camera). Audio: voice-over narration only (a voice, never shown on screen; no narrator character appears): a British male voice, warm and dry, begins speaking within half a second and says: “The cat looked back. The cat was not impressed by the Roman Empire.” The line takes about 5.2 seconds; leave the last second free of speech so the moment can land. Music: music nearly silent. Sound effects: cat meow, tiny sting, timed to the action. Ambience: light courtyard ambience: clinking cups, footsteps on stone, a soft breeze, no words. Final reminder: no character says any word; only the voice-over narration speaks (voice only, nobody on screen is the narrator). Natural laughs, gasps and sighs are fine. No text, captions or logos in the frame.</w:t>
-      </w:r>
-    </w:p>
-    <w:p>
-      <w:pPr>
-        <w:pStyle w:val="Heading2"/>
-        <w:keepNext/>
-        <w:spacing w:after="60" w:before="260"/>
-      </w:pPr>
-      <w:r>
-        <w:rPr>
-          <w:rFonts w:ascii="Arial" w:cs="Arial" w:eastAsia="Arial" w:hAnsi="Arial"/>
-          <w:b/>
-          <w:bCs/>
-          <w:sz w:val="26"/>
-          <w:szCs w:val="26"/>
-        </w:rPr>
-        <w:t xml:space="preserve">SHOT 40 — Announcement</w:t>
-      </w:r>
-    </w:p>
-    <w:p>
-      <w:pPr>
-        <w:keepNext/>
-        <w:spacing w:after="60" w:before="0"/>
-      </w:pPr>
-      <w:r>
-        <w:rPr>
-          <w:rFonts w:ascii="Arial" w:cs="Arial" w:eastAsia="Arial" w:hAnsi="Arial"/>
-          <w:b/>
-          <w:bCs/>
-          <w:sz w:val="21"/>
-          <w:szCs w:val="21"/>
-        </w:rPr>
-        <w:t xml:space="preserve">Attach: </w:t>
-      </w:r>
-      <w:r>
-        <w:rPr>
-          <w:rFonts w:ascii="Arial" w:cs="Arial" w:eastAsia="Arial" w:hAnsi="Arial"/>
-          <w:sz w:val="21"/>
-          <w:szCs w:val="21"/>
-        </w:rPr>
-        <w:t xml:space="preserve">Commander_front.png,  Guests_group.png,  Senbi_from_Shot1.png</w:t>
-      </w:r>
-      <w:r>
-        <w:rPr>
-          <w:rFonts w:ascii="Arial" w:cs="Arial" w:eastAsia="Arial" w:hAnsi="Arial"/>
-          <w:b/>
-          <w:bCs/>
-          <w:sz w:val="21"/>
-          <w:szCs w:val="21"/>
-        </w:rPr>
-        <w:t xml:space="preserve">      Duration: </w:t>
-      </w:r>
-      <w:r>
-        <w:rPr>
-          <w:rFonts w:ascii="Arial" w:cs="Arial" w:eastAsia="Arial" w:hAnsi="Arial"/>
-          <w:sz w:val="21"/>
-          <w:szCs w:val="21"/>
-        </w:rPr>
-        <w:t xml:space="preserve">8 sec</w:t>
-      </w:r>
-    </w:p>
-    <w:p>
-      <w:pPr>
-        <w:shd w:fill="F2F2F2" w:val="clear"/>
-        <w:spacing w:after="80"/>
-      </w:pPr>
-      <w:r>
-        <w:rPr>
-          <w:rFonts w:ascii="Arial" w:cs="Arial" w:eastAsia="Arial" w:hAnsi="Arial"/>
-          <w:sz w:val="20"/>
-          <w:szCs w:val="20"/>
-        </w:rPr>
-        <w:t xml:space="preserve">VOICE RULE: only the voice-over narration speaks words; it is a voice only, never a person or character on screen. No character says any word and no one on screen lip-syncs to speech; characters communicate with facial expressions and body gestures. Natural non-verbal sounds are allowed and should sound real: laughing, giggling, gasping, sighing, groaning, cheering, coughing. Attached reference images, in order: the Roman commander, the Egyptian wedding guests, Senbi, the groom. 2D hand-drawn stickman cartoon in the exact style of the reference images: thin black outlines, large expressive heads, thin stick arms, flat warm colors, playful documentary-comedy tone, 16:9. Characters, identical in every frame: the Roman commander: dark curly gray-streaked hair, gold laurel wreath, bronze-and-gold armor, red cloak. the guests: Egyptian wedding guests in white linen with blue-and-gold collars and gold headbands, black bob hairstyles, some in white striped headdresses. the Roman soldiers: crimson plumed helmets, steel armor, red cloaks, rectangular red shields. Setting: sunny daytime wedding courtyard in ancient Alexandria, sandstone columns with painted blue-and-gold bands, long tables with white cloths and clay jars, orange cloth awnings, and a tall wooden entrance gate at the back-center that opens onto the street. Lighting: warm bright afternoon sunlight, soft shadows, rich saturated colors. ACTION TIMELINE (8 seconds): 0–2.5 s: the commander at the center lifts the scroll with both hands, Egyptians on his left and Romans on his right standing silent and still. 2.5–5.5 s: he unrolls it slowly, papyrus falling to his waist, only abstract marks on it. 5.5–8 s: he lifts his chin as if about to read; everyone is silent. Camera: locked-off and perfectly still, symmetrical eye-level medium-wide shot; the framing never changes (no tilt, pan, zoom or rising camera). Audio: voice-over narration only (a voice, never shown on screen; no narrator character appears): a British male voice, warm and dry, begins speaking within half a second and says: “He unrolled the scroll. Message received: Egypt has new management.” The line takes about 4.0 seconds; leave the last second free of speech so the moment can land. Music: low sustained tension with distant marching drums, almost silent. Sound effects: scroll unrolling, one dramatic drum hit, timed to the action. Ambience: light courtyard ambience: clinking cups, footsteps on stone, a soft breeze, no words. Final reminder: no character says any word; only the voice-over narration speaks (voice only, nobody on screen is the narrator). Natural laughs, gasps and sighs are fine. No text, captions or logos in the frame.</w:t>
-      </w:r>
-    </w:p>
-    <w:p>
-      <w:pPr>
-        <w:pStyle w:val="Heading2"/>
-        <w:keepNext/>
-        <w:spacing w:after="60" w:before="260"/>
-      </w:pPr>
-      <w:r>
-        <w:rPr>
-          <w:rFonts w:ascii="Arial" w:cs="Arial" w:eastAsia="Arial" w:hAnsi="Arial"/>
-          <w:b/>
-          <w:bCs/>
-          <w:sz w:val="26"/>
-          <w:szCs w:val="26"/>
-        </w:rPr>
-        <w:t xml:space="preserve">SHOT 41 — Senbi and bride</w:t>
-      </w:r>
-    </w:p>
-    <w:p>
-      <w:pPr>
-        <w:keepNext/>
-        <w:spacing w:after="60" w:before="0"/>
-      </w:pPr>
-      <w:r>
-        <w:rPr>
-          <w:rFonts w:ascii="Arial" w:cs="Arial" w:eastAsia="Arial" w:hAnsi="Arial"/>
-          <w:b/>
-          <w:bCs/>
-          <w:sz w:val="21"/>
-          <w:szCs w:val="21"/>
-        </w:rPr>
-        <w:t xml:space="preserve">Attach: </w:t>
-      </w:r>
-      <w:r>
-        <w:rPr>
-          <w:rFonts w:ascii="Arial" w:cs="Arial" w:eastAsia="Arial" w:hAnsi="Arial"/>
-          <w:sz w:val="21"/>
-          <w:szCs w:val="21"/>
-        </w:rPr>
-        <w:t xml:space="preserve">Senbi_from_Shot1.png,  Bride_from_Shot1.png,  Guests_group.png</w:t>
-      </w:r>
-      <w:r>
-        <w:rPr>
-          <w:rFonts w:ascii="Arial" w:cs="Arial" w:eastAsia="Arial" w:hAnsi="Arial"/>
-          <w:b/>
-          <w:bCs/>
-          <w:sz w:val="21"/>
-          <w:szCs w:val="21"/>
-        </w:rPr>
-        <w:t xml:space="preserve">      Duration: </w:t>
-      </w:r>
-      <w:r>
-        <w:rPr>
-          <w:rFonts w:ascii="Arial" w:cs="Arial" w:eastAsia="Arial" w:hAnsi="Arial"/>
-          <w:sz w:val="21"/>
-          <w:szCs w:val="21"/>
-        </w:rPr>
-        <w:t xml:space="preserve">8 sec</w:t>
-      </w:r>
-    </w:p>
-    <w:p>
-      <w:pPr>
-        <w:shd w:fill="F2F2F2" w:val="clear"/>
-        <w:spacing w:after="80"/>
-      </w:pPr>
-      <w:r>
-        <w:rPr>
-          <w:rFonts w:ascii="Arial" w:cs="Arial" w:eastAsia="Arial" w:hAnsi="Arial"/>
-          <w:sz w:val="20"/>
-          <w:szCs w:val="20"/>
-        </w:rPr>
-        <w:t xml:space="preserve">VOICE RULE: only the voice-over narration speaks words; it is a voice only, never a person or character on screen. No character says any word and no one on screen lip-syncs to speech; characters communicate with facial expressions and body gestures. Natural non-verbal sounds are allowed and should sound real: laughing, giggling, gasping, sighing, groaning, cheering, coughing. Attached reference images, in order: Senbi, the groom, the bride, the Egyptian wedding guests. 2D hand-drawn stickman cartoon in the exact style of the reference images: thin black outlines, large expressive heads, thin stick arms, flat warm colors, playful documentary-comedy tone, 16:9. Characters, identical in every frame: Senbi the groom: young man, straight black bowl-cut hair with bangs, gold headband with a gold cobra, bare chest, blue-and-gold broad collar, gold bracers, white kilt with a blue-and-gold sash, brown sandals, thin black stick arms. the bride: black bob hair with straight bangs, gold headband with a red gem, white dress, blue-and-gold collar, gold sash, gold arm cuffs, light veil. Setting: sunny daytime wedding courtyard in ancient Alexandria, sandstone columns with painted blue-and-gold bands, long tables with white cloths and clay jars, orange cloth awnings, and a tall wooden entrance gate at the back-center that opens onto the street. Lighting: warm bright afternoon sunlight, soft shadows, rich saturated colors. ACTION TIMELINE (8 seconds): 0–2.5 s: Senbi and the bride look forward, shocked. 2.5–5.5 s: Senbi slowly turns his head toward the bride. 5.5–8 s: the bride turns to him, they exchange a wide-eyed look and Senbi forces a smile. Camera: locked-off and perfectly still, eye-level medium two-shot of Senbi and the bride; the framing never changes (no tilt, pan, zoom or rising camera). Audio: voice-over narration only (a voice, never shown on screen; no narrator character appears): a British male voice, warm and dry, begins speaking within half a second and says: “Senbi looked at his bride. Same question, silently: is the wedding still on?” The line takes about 5.2 seconds; leave the last second free of speech so the moment can land. Music: low sustained tension with distant marching drums, almost silent. Sound effects: nervous breath, single drum, timed to the action. Ambience: light courtyard ambience: clinking cups, footsteps on stone, a soft breeze, no words. Final reminder: no character says any word; only the voice-over narration speaks (voice only, nobody on screen is the narrator). Natural laughs, gasps and sighs are fine. No text, captions or logos in the frame.</w:t>
-      </w:r>
-    </w:p>
-    <w:p>
-      <w:pPr>
-        <w:pStyle w:val="Heading2"/>
-        <w:keepNext/>
-        <w:spacing w:after="60" w:before="260"/>
-      </w:pPr>
-      <w:r>
-        <w:rPr>
-          <w:rFonts w:ascii="Arial" w:cs="Arial" w:eastAsia="Arial" w:hAnsi="Arial"/>
-          <w:b/>
-          <w:bCs/>
-          <w:sz w:val="26"/>
-          <w:szCs w:val="26"/>
-        </w:rPr>
-        <w:t xml:space="preserve">SHOT 42 — City transition</w:t>
-      </w:r>
-    </w:p>
-    <w:p>
-      <w:pPr>
-        <w:keepNext/>
-        <w:spacing w:after="60" w:before="0"/>
-      </w:pPr>
-      <w:r>
-        <w:rPr>
-          <w:rFonts w:ascii="Arial" w:cs="Arial" w:eastAsia="Arial" w:hAnsi="Arial"/>
-          <w:b/>
-          <w:bCs/>
-          <w:sz w:val="21"/>
-          <w:szCs w:val="21"/>
-        </w:rPr>
-        <w:t xml:space="preserve">Attach: </w:t>
-      </w:r>
-      <w:r>
-        <w:rPr>
-          <w:rFonts w:ascii="Arial" w:cs="Arial" w:eastAsia="Arial" w:hAnsi="Arial"/>
-          <w:sz w:val="21"/>
-          <w:szCs w:val="21"/>
-        </w:rPr>
-        <w:t xml:space="preserve">Alexandria_Harbor_from_ref08.png,  Roman_soldiers.png</w:t>
-      </w:r>
-      <w:r>
-        <w:rPr>
-          <w:rFonts w:ascii="Arial" w:cs="Arial" w:eastAsia="Arial" w:hAnsi="Arial"/>
-          <w:b/>
-          <w:bCs/>
-          <w:sz w:val="21"/>
-          <w:szCs w:val="21"/>
-        </w:rPr>
-        <w:t xml:space="preserve">      Duration: </w:t>
-      </w:r>
-      <w:r>
-        <w:rPr>
-          <w:rFonts w:ascii="Arial" w:cs="Arial" w:eastAsia="Arial" w:hAnsi="Arial"/>
-          <w:sz w:val="21"/>
-          <w:szCs w:val="21"/>
-        </w:rPr>
-        <w:t xml:space="preserve">8 sec</w:t>
-      </w:r>
-    </w:p>
-    <w:p>
-      <w:pPr>
-        <w:shd w:fill="F2F2F2" w:val="clear"/>
-        <w:spacing w:after="80"/>
-      </w:pPr>
-      <w:r>
-        <w:rPr>
-          <w:rFonts w:ascii="Arial" w:cs="Arial" w:eastAsia="Arial" w:hAnsi="Arial"/>
-          <w:sz w:val="20"/>
-          <w:szCs w:val="20"/>
-        </w:rPr>
-        <w:t xml:space="preserve">VOICE RULE: only the voice-over narration speaks words; it is a voice only, never a person or character on screen. No character says any word and no one on screen lip-syncs to speech; characters communicate with facial expressions and body gestures. Natural non-verbal sounds are allowed and should sound real: laughing, giggling, gasping, sighing, groaning, cheering, coughing. Attached reference images, in order: the Alexandria harbor, the Roman soldiers. 2D hand-drawn stickman cartoon in the exact style of the reference images: thin black outlines, large expressive heads, thin stick arms, flat warm colors, playful documentary-comedy tone, 16:9. Characters, identical in every frame: the Roman soldiers: crimson plumed helmets, steel armor, red cloaks, rectangular red shields. Setting: sunlit street of ancient Alexandria outside the wedding house, sandstone walls, palms, market stalls with red and blue awnings. Lighting: warm bright sunlight, soft shadows. ACTION TIMELINE (8 seconds): 0–2.5 s: Roman soldiers march through the streets of Alexandria in formation while Egyptian civilians watch from the sides. 2.5–5.5 s: a merchant slowly lowers his basket. 5.5–8 s: the mood is serious; a banner stirs in the wind. Camera: locked-off and perfectly still, eye-level wide shot of Alexandria with Roman soldiers in the streets; the framing never changes (no tilt, pan, zoom or rising camera). Audio: voice-over narration only (a voice, never shown on screen; no narrator character appears): a British male voice, warm and dry, begins speaking within half a second and says: “Outside, the city was changing hands. Inside, there was still a wedding.” The line takes about 4.8 seconds; leave the last second free of speech so the moment can land. Music: music nearly silent. Sound effects: harbor ambience, distant boots, timed to the action. Ambience: sunlit street ambience: wind and distant clatter, no words. Final reminder: no character says any word; only the voice-over narration speaks (voice only, nobody on screen is the narrator). Natural laughs, gasps and sighs are fine. No text, captions or logos in the frame.</w:t>
-      </w:r>
-    </w:p>
-    <w:p>
-      <w:pPr>
-        <w:pStyle w:val="Heading2"/>
-        <w:keepNext/>
-        <w:spacing w:after="60" w:before="260"/>
-      </w:pPr>
-      <w:r>
-        <w:rPr>
-          <w:rFonts w:ascii="Arial" w:cs="Arial" w:eastAsia="Arial" w:hAnsi="Arial"/>
-          <w:b/>
-          <w:bCs/>
-          <w:sz w:val="26"/>
-          <w:szCs w:val="26"/>
-        </w:rPr>
-        <w:t xml:space="preserve">SHOT 43 — Clarification</w:t>
-      </w:r>
-    </w:p>
-    <w:p>
-      <w:pPr>
-        <w:keepNext/>
-        <w:spacing w:after="60" w:before="0"/>
-      </w:pPr>
-      <w:r>
-        <w:rPr>
-          <w:rFonts w:ascii="Arial" w:cs="Arial" w:eastAsia="Arial" w:hAnsi="Arial"/>
-          <w:b/>
-          <w:bCs/>
-          <w:sz w:val="21"/>
-          <w:szCs w:val="21"/>
-        </w:rPr>
-        <w:t xml:space="preserve">Attach: </w:t>
-      </w:r>
-      <w:r>
-        <w:rPr>
-          <w:rFonts w:ascii="Arial" w:cs="Arial" w:eastAsia="Arial" w:hAnsi="Arial"/>
-          <w:sz w:val="21"/>
-          <w:szCs w:val="21"/>
-        </w:rPr>
-        <w:t xml:space="preserve">Alexandria_Harbor_from_ref08.png,  Roman_soldiers.png</w:t>
-      </w:r>
-      <w:r>
-        <w:rPr>
-          <w:rFonts w:ascii="Arial" w:cs="Arial" w:eastAsia="Arial" w:hAnsi="Arial"/>
-          <w:b/>
-          <w:bCs/>
-          <w:sz w:val="21"/>
-          <w:szCs w:val="21"/>
-        </w:rPr>
-        <w:t xml:space="preserve">      Duration: </w:t>
-      </w:r>
-      <w:r>
-        <w:rPr>
-          <w:rFonts w:ascii="Arial" w:cs="Arial" w:eastAsia="Arial" w:hAnsi="Arial"/>
-          <w:sz w:val="21"/>
-          <w:szCs w:val="21"/>
-        </w:rPr>
-        <w:t xml:space="preserve">8 sec</w:t>
-      </w:r>
-    </w:p>
-    <w:p>
-      <w:pPr>
-        <w:shd w:fill="F2F2F2" w:val="clear"/>
-        <w:spacing w:after="80"/>
-      </w:pPr>
-      <w:r>
-        <w:rPr>
-          <w:rFonts w:ascii="Arial" w:cs="Arial" w:eastAsia="Arial" w:hAnsi="Arial"/>
-          <w:sz w:val="20"/>
-          <w:szCs w:val="20"/>
-        </w:rPr>
-        <w:t xml:space="preserve">VOICE RULE: only the voice-over narration speaks words; it is a voice only, never a person or character on screen. No character says any word and no one on screen lip-syncs to speech; characters communicate with facial expressions and body gestures. Natural non-verbal sounds are allowed and should sound real: laughing, giggling, gasping, sighing, groaning, cheering, coughing. Attached reference images, in order: the Alexandria harbor, the Roman soldiers. 2D hand-drawn stickman cartoon in the exact style of the reference images: thin black outlines, large expressive heads, thin stick arms, flat warm colors, playful documentary-comedy tone, 16:9. Characters, identical in every frame: the Roman soldiers: crimson plumed helmets, steel armor, red cloaks, rectangular red shields. Setting: sunlit street of ancient Alexandria outside the wedding house, sandstone walls, palms, market stalls with red and blue awnings. Lighting: warm bright sunlight, soft shadows. ACTION TIMELINE (8 seconds): 0–2.5 s: a few Roman soldiers pass through the street. 2.5–5.5 s: ordinary Egyptians carry baskets, bargain and haul jars as usual. 5.5–8 s: a boy runs across the frame; life goes on. Camera: locked-off and perfectly still, eye-level wide observational shot of Alexandria; the framing never changes (no tilt, pan, zoom or rising camera). Audio: voice-over narration only (a voice, never shown on screen; no narrator character appears): a British male voice, warm and dry, begins speaking within half a second and says: “To be clear: Senbi and his wedding are fiction. The cat, sadly, too.” The line takes about 5.2 seconds; leave the last second free of speech so the moment can land. Music: music nearly silent. Sound effects: calm city ambience, timed to the action. Ambience: sunlit street ambience: wind and distant clatter, no words. Final reminder: no character says any word; only the voice-over narration speaks (voice only, nobody on screen is the narrator). Natural laughs, gasps and sighs are fine. No text, captions or logos in the frame.</w:t>
-      </w:r>
-    </w:p>
-    <w:p>
-      <w:pPr>
-        <w:pStyle w:val="Heading2"/>
-        <w:keepNext/>
-        <w:spacing w:after="60" w:before="260"/>
-      </w:pPr>
-      <w:r>
-        <w:rPr>
-          <w:rFonts w:ascii="Arial" w:cs="Arial" w:eastAsia="Arial" w:hAnsi="Arial"/>
-          <w:b/>
-          <w:bCs/>
-          <w:sz w:val="26"/>
-          <w:szCs w:val="26"/>
-        </w:rPr>
         <w:t xml:space="preserve">SHOT 44 — Historical anchor   (edit: place after shot 25)</w:t>
+      </w:r>
+    </w:p>
+    <w:p>
+      <w:pPr>
+        <w:keepNext/>
+        <w:spacing w:after="40" w:before="0"/>
+      </w:pPr>
+      <w:r>
+        <w:rPr>
+          <w:rFonts w:ascii="Arial" w:cs="Arial" w:eastAsia="Arial" w:hAnsi="Arial"/>
+          <w:i/>
+          <w:iCs/>
+          <w:color w:val="555555"/>
+          <w:sz w:val="19"/>
+          <w:szCs w:val="19"/>
+        </w:rPr>
+        <w:t xml:space="preserve">In the edit, play this shot right after shot 25.</w:t>
       </w:r>
     </w:p>
     <w:p>
@@ -3957,7 +3412,7 @@
           <w:sz w:val="21"/>
           <w:szCs w:val="21"/>
         </w:rPr>
-        <w:t xml:space="preserve">Today is supposed to be the happiest day in Senbi's life.</w:t>
+        <w:t xml:space="preserve">Senbi had planned everything for his wedding. Everything except the Roman army.</w:t>
       </w:r>
     </w:p>
     <w:p>
@@ -4119,15 +3574,15 @@
           <w:sz w:val="21"/>
           <w:szCs w:val="21"/>
         </w:rPr>
-        <w:t xml:space="preserve">Shot 6:  </w:t>
-      </w:r>
-      <w:r>
-        <w:rPr>
-          <w:rFonts w:ascii="Arial" w:cs="Arial" w:eastAsia="Arial" w:hAnsi="Arial"/>
-          <w:sz w:val="21"/>
-          <w:szCs w:val="21"/>
-        </w:rPr>
-        <w:t xml:space="preserve">Every groom has one job: look incredible, and pretend it took no effort.</w:t>
+        <w:t xml:space="preserve">Shot 7:  </w:t>
+      </w:r>
+      <w:r>
+        <w:rPr>
+          <w:rFonts w:ascii="Arial" w:cs="Arial" w:eastAsia="Arial" w:hAnsi="Arial"/>
+          <w:sz w:val="21"/>
+          <w:szCs w:val="21"/>
+        </w:rPr>
+        <w:t xml:space="preserve">His bride had been ready for an hour. She was the calm one.</w:t>
       </w:r>
     </w:p>
     <w:p>
@@ -4153,15 +3608,15 @@
           <w:sz w:val="21"/>
           <w:szCs w:val="21"/>
         </w:rPr>
-        <w:t xml:space="preserve">Shot 7:  </w:t>
-      </w:r>
-      <w:r>
-        <w:rPr>
-          <w:rFonts w:ascii="Arial" w:cs="Arial" w:eastAsia="Arial" w:hAnsi="Arial"/>
-          <w:sz w:val="21"/>
-          <w:szCs w:val="21"/>
-        </w:rPr>
-        <w:t xml:space="preserve">His bride had been ready for an hour. She was the calm one.</w:t>
+        <w:t xml:space="preserve">Shot 8:  </w:t>
+      </w:r>
+      <w:r>
+        <w:rPr>
+          <w:rFonts w:ascii="Arial" w:cs="Arial" w:eastAsia="Arial" w:hAnsi="Arial"/>
+          <w:sz w:val="21"/>
+          <w:szCs w:val="21"/>
+        </w:rPr>
+        <w:t xml:space="preserve">Then, paperwork. Real contracts survive: property, money, who owes what. Romance, with receipts.</w:t>
       </w:r>
     </w:p>
     <w:p>
@@ -4187,15 +3642,15 @@
           <w:sz w:val="21"/>
           <w:szCs w:val="21"/>
         </w:rPr>
-        <w:t xml:space="preserve">Shot 8:  </w:t>
-      </w:r>
-      <w:r>
-        <w:rPr>
-          <w:rFonts w:ascii="Arial" w:cs="Arial" w:eastAsia="Arial" w:hAnsi="Arial"/>
-          <w:sz w:val="21"/>
-          <w:szCs w:val="21"/>
-        </w:rPr>
-        <w:t xml:space="preserve">Then, paperwork. Real contracts survive: property, money, who owes what. Romance, with receipts.</w:t>
+        <w:t xml:space="preserve">Shot 9:  </w:t>
+      </w:r>
+      <w:r>
+        <w:rPr>
+          <w:rFonts w:ascii="Arial" w:cs="Arial" w:eastAsia="Arial" w:hAnsi="Arial"/>
+          <w:sz w:val="21"/>
+          <w:szCs w:val="21"/>
+        </w:rPr>
+        <w:t xml:space="preserve">Bread, figs, roast goose, and beer, basically a food group. Someone was stealing.</w:t>
       </w:r>
     </w:p>
     <w:p>
@@ -4221,15 +3676,15 @@
           <w:sz w:val="21"/>
           <w:szCs w:val="21"/>
         </w:rPr>
-        <w:t xml:space="preserve">Shot 9:  </w:t>
-      </w:r>
-      <w:r>
-        <w:rPr>
-          <w:rFonts w:ascii="Arial" w:cs="Arial" w:eastAsia="Arial" w:hAnsi="Arial"/>
-          <w:sz w:val="21"/>
-          <w:szCs w:val="21"/>
-        </w:rPr>
-        <w:t xml:space="preserve">Bread, figs, roast goose, and beer, basically a food group. Someone was stealing.</w:t>
+        <w:t xml:space="preserve">Shot 10:  </w:t>
+      </w:r>
+      <w:r>
+        <w:rPr>
+          <w:rFonts w:ascii="Arial" w:cs="Arial" w:eastAsia="Arial" w:hAnsi="Arial"/>
+          <w:sz w:val="21"/>
+          <w:szCs w:val="21"/>
+        </w:rPr>
+        <w:t xml:space="preserve">Egyptians adored cats. This one knew it. A guest bowed. The cat shrugged.</w:t>
       </w:r>
     </w:p>
     <w:p>
@@ -4255,15 +3710,15 @@
           <w:sz w:val="21"/>
           <w:szCs w:val="21"/>
         </w:rPr>
-        <w:t xml:space="preserve">Shot 10:  </w:t>
-      </w:r>
-      <w:r>
-        <w:rPr>
-          <w:rFonts w:ascii="Arial" w:cs="Arial" w:eastAsia="Arial" w:hAnsi="Arial"/>
-          <w:sz w:val="21"/>
-          <w:szCs w:val="21"/>
-        </w:rPr>
-        <w:t xml:space="preserve">Egyptians adored cats. This one knew it. A guest bowed. The cat shrugged.</w:t>
+        <w:t xml:space="preserve">Shot 12:  </w:t>
+      </w:r>
+      <w:r>
+        <w:rPr>
+          <w:rFonts w:ascii="Arial" w:cs="Arial" w:eastAsia="Arial" w:hAnsi="Arial"/>
+          <w:sz w:val="21"/>
+          <w:szCs w:val="21"/>
+        </w:rPr>
+        <w:t xml:space="preserve">Senbi nearly fell, recovered, and pretended that was the choreography. Nobody believed him.</w:t>
       </w:r>
     </w:p>
     <w:p>
@@ -4289,15 +3744,15 @@
           <w:sz w:val="21"/>
           <w:szCs w:val="21"/>
         </w:rPr>
-        <w:t xml:space="preserve">Shot 11:  </w:t>
-      </w:r>
-      <w:r>
-        <w:rPr>
-          <w:rFonts w:ascii="Arial" w:cs="Arial" w:eastAsia="Arial" w:hAnsi="Arial"/>
-          <w:sz w:val="21"/>
-          <w:szCs w:val="21"/>
-        </w:rPr>
-        <w:t xml:space="preserve">Then the music began, and Senbi decided this was his moment.</w:t>
+        <w:t xml:space="preserve">Shot 13:  </w:t>
+      </w:r>
+      <w:r>
+        <w:rPr>
+          <w:rFonts w:ascii="Arial" w:cs="Arial" w:eastAsia="Arial" w:hAnsi="Arial"/>
+          <w:sz w:val="21"/>
+          <w:szCs w:val="21"/>
+        </w:rPr>
+        <w:t xml:space="preserve">His bride was trying very hard not to laugh. She loved him. Mostly.</w:t>
       </w:r>
     </w:p>
     <w:p>
@@ -4323,15 +3778,15 @@
           <w:sz w:val="21"/>
           <w:szCs w:val="21"/>
         </w:rPr>
-        <w:t xml:space="preserve">Shot 12:  </w:t>
-      </w:r>
-      <w:r>
-        <w:rPr>
-          <w:rFonts w:ascii="Arial" w:cs="Arial" w:eastAsia="Arial" w:hAnsi="Arial"/>
-          <w:sz w:val="21"/>
-          <w:szCs w:val="21"/>
-        </w:rPr>
-        <w:t xml:space="preserve">Senbi nearly fell, recovered, and pretended that was the choreography. Nobody believed him.</w:t>
+        <w:t xml:space="preserve">Shot 15:  </w:t>
+      </w:r>
+      <w:r>
+        <w:rPr>
+          <w:rFonts w:ascii="Arial" w:cs="Arial" w:eastAsia="Arial" w:hAnsi="Arial"/>
+          <w:sz w:val="21"/>
+          <w:szCs w:val="21"/>
+        </w:rPr>
+        <w:t xml:space="preserve">One aunt inspected the food like a tax auditor. Verdict: suspicious, but edible.</w:t>
       </w:r>
     </w:p>
     <w:p>
@@ -4357,15 +3812,15 @@
           <w:sz w:val="21"/>
           <w:szCs w:val="21"/>
         </w:rPr>
-        <w:t xml:space="preserve">Shot 13:  </w:t>
-      </w:r>
-      <w:r>
-        <w:rPr>
-          <w:rFonts w:ascii="Arial" w:cs="Arial" w:eastAsia="Arial" w:hAnsi="Arial"/>
-          <w:sz w:val="21"/>
-          <w:szCs w:val="21"/>
-        </w:rPr>
-        <w:t xml:space="preserve">His bride was trying very hard not to laugh. She loved him. Mostly.</w:t>
+        <w:t xml:space="preserve">Shot 16:  </w:t>
+      </w:r>
+      <w:r>
+        <w:rPr>
+          <w:rFonts w:ascii="Arial" w:cs="Arial" w:eastAsia="Arial" w:hAnsi="Arial"/>
+          <w:sz w:val="21"/>
+          <w:szCs w:val="21"/>
+        </w:rPr>
+        <w:t xml:space="preserve">Then, the gift: a wooden headrest. Egyptians really did sleep on these.</w:t>
       </w:r>
     </w:p>
     <w:p>
@@ -4391,15 +3846,15 @@
           <w:sz w:val="21"/>
           <w:szCs w:val="21"/>
         </w:rPr>
-        <w:t xml:space="preserve">Shot 14:  </w:t>
-      </w:r>
-      <w:r>
-        <w:rPr>
-          <w:rFonts w:ascii="Arial" w:cs="Arial" w:eastAsia="Arial" w:hAnsi="Arial"/>
-          <w:sz w:val="21"/>
-          <w:szCs w:val="21"/>
-        </w:rPr>
-        <w:t xml:space="preserve">Everyone danced and raised a cup, the one thing every wedding agrees on.</w:t>
+        <w:t xml:space="preserve">Shot 17:  </w:t>
+      </w:r>
+      <w:r>
+        <w:rPr>
+          <w:rFonts w:ascii="Arial" w:cs="Arial" w:eastAsia="Arial" w:hAnsi="Arial"/>
+          <w:sz w:val="21"/>
+          <w:szCs w:val="21"/>
+        </w:rPr>
+        <w:t xml:space="preserve">Senbi lay down. His neck filed a formal complaint. His thumbs-up said otherwise.</w:t>
       </w:r>
     </w:p>
     <w:p>
@@ -4425,15 +3880,15 @@
           <w:sz w:val="21"/>
           <w:szCs w:val="21"/>
         </w:rPr>
-        <w:t xml:space="preserve">Shot 15:  </w:t>
-      </w:r>
-      <w:r>
-        <w:rPr>
-          <w:rFonts w:ascii="Arial" w:cs="Arial" w:eastAsia="Arial" w:hAnsi="Arial"/>
-          <w:sz w:val="21"/>
-          <w:szCs w:val="21"/>
-        </w:rPr>
-        <w:t xml:space="preserve">One aunt inspected the food like a tax auditor. Verdict: suspicious, but edible.</w:t>
+        <w:t xml:space="preserve">Shot 18:  </w:t>
+      </w:r>
+      <w:r>
+        <w:rPr>
+          <w:rFonts w:ascii="Arial" w:cs="Arial" w:eastAsia="Arial" w:hAnsi="Arial"/>
+          <w:sz w:val="21"/>
+          <w:szCs w:val="21"/>
+        </w:rPr>
+        <w:t xml:space="preserve">For a few perfect minutes, everything was exactly right. Enjoy this part.</w:t>
       </w:r>
     </w:p>
     <w:p>
@@ -4459,15 +3914,15 @@
           <w:sz w:val="21"/>
           <w:szCs w:val="21"/>
         </w:rPr>
-        <w:t xml:space="preserve">Shot 16:  </w:t>
-      </w:r>
-      <w:r>
-        <w:rPr>
-          <w:rFonts w:ascii="Arial" w:cs="Arial" w:eastAsia="Arial" w:hAnsi="Arial"/>
-          <w:sz w:val="21"/>
-          <w:szCs w:val="21"/>
-        </w:rPr>
-        <w:t xml:space="preserve">Then, the gift: a wooden headrest. Egyptians really did sleep on these.</w:t>
+        <w:t xml:space="preserve">Shot 19:  </w:t>
+      </w:r>
+      <w:r>
+        <w:rPr>
+          <w:rFonts w:ascii="Arial" w:cs="Arial" w:eastAsia="Arial" w:hAnsi="Arial"/>
+          <w:sz w:val="21"/>
+          <w:szCs w:val="21"/>
+        </w:rPr>
+        <w:t xml:space="preserve">Then a small cup on the table began to tremble. Nobody noticed.</w:t>
       </w:r>
     </w:p>
     <w:p>
@@ -4493,15 +3948,15 @@
           <w:sz w:val="21"/>
           <w:szCs w:val="21"/>
         </w:rPr>
-        <w:t xml:space="preserve">Shot 17:  </w:t>
-      </w:r>
-      <w:r>
-        <w:rPr>
-          <w:rFonts w:ascii="Arial" w:cs="Arial" w:eastAsia="Arial" w:hAnsi="Arial"/>
-          <w:sz w:val="21"/>
-          <w:szCs w:val="21"/>
-        </w:rPr>
-        <w:t xml:space="preserve">Senbi lay down. His neck filed a formal complaint. His thumbs-up said otherwise.</w:t>
+        <w:t xml:space="preserve">Shot 20:  </w:t>
+      </w:r>
+      <w:r>
+        <w:rPr>
+          <w:rFonts w:ascii="Arial" w:cs="Arial" w:eastAsia="Arial" w:hAnsi="Arial"/>
+          <w:sz w:val="21"/>
+          <w:szCs w:val="21"/>
+        </w:rPr>
+        <w:t xml:space="preserve">The musician noticed. He stopped. Everyone else danced one more beat, blissfully unaware.</w:t>
       </w:r>
     </w:p>
     <w:p>
@@ -4527,15 +3982,15 @@
           <w:sz w:val="21"/>
           <w:szCs w:val="21"/>
         </w:rPr>
-        <w:t xml:space="preserve">Shot 18:  </w:t>
-      </w:r>
-      <w:r>
-        <w:rPr>
-          <w:rFonts w:ascii="Arial" w:cs="Arial" w:eastAsia="Arial" w:hAnsi="Arial"/>
-          <w:sz w:val="21"/>
-          <w:szCs w:val="21"/>
-        </w:rPr>
-        <w:t xml:space="preserve">For a few perfect minutes, everything was exactly right. Enjoy this part.</w:t>
+        <w:t xml:space="preserve">Shot 22:  </w:t>
+      </w:r>
+      <w:r>
+        <w:rPr>
+          <w:rFonts w:ascii="Arial" w:cs="Arial" w:eastAsia="Arial" w:hAnsi="Arial"/>
+          <w:sz w:val="21"/>
+          <w:szCs w:val="21"/>
+        </w:rPr>
+        <w:t xml:space="preserve">(no narration, boot steps and metal clank)</w:t>
       </w:r>
     </w:p>
     <w:p>
@@ -4561,15 +4016,15 @@
           <w:sz w:val="21"/>
           <w:szCs w:val="21"/>
         </w:rPr>
-        <w:t xml:space="preserve">Shot 19:  </w:t>
-      </w:r>
-      <w:r>
-        <w:rPr>
-          <w:rFonts w:ascii="Arial" w:cs="Arial" w:eastAsia="Arial" w:hAnsi="Arial"/>
-          <w:sz w:val="21"/>
-          <w:szCs w:val="21"/>
-        </w:rPr>
-        <w:t xml:space="preserve">Then a small cup on the table began to tremble. Nobody noticed.</w:t>
+        <w:t xml:space="preserve">Shot 24:  </w:t>
+      </w:r>
+      <w:r>
+        <w:rPr>
+          <w:rFonts w:ascii="Arial" w:cs="Arial" w:eastAsia="Arial" w:hAnsi="Arial"/>
+          <w:sz w:val="21"/>
+          <w:szCs w:val="21"/>
+        </w:rPr>
+        <w:t xml:space="preserve">Inside, nobody had a clue. Senbi was busy spinning.</w:t>
       </w:r>
     </w:p>
     <w:p>
@@ -4595,15 +4050,15 @@
           <w:sz w:val="21"/>
           <w:szCs w:val="21"/>
         </w:rPr>
-        <w:t xml:space="preserve">Shot 20:  </w:t>
-      </w:r>
-      <w:r>
-        <w:rPr>
-          <w:rFonts w:ascii="Arial" w:cs="Arial" w:eastAsia="Arial" w:hAnsi="Arial"/>
-          <w:sz w:val="21"/>
-          <w:szCs w:val="21"/>
-        </w:rPr>
-        <w:t xml:space="preserve">The musician noticed. He stopped. Everyone else danced one more beat, blissfully unaware.</w:t>
+        <w:t xml:space="preserve">Shot 25:  </w:t>
+      </w:r>
+      <w:r>
+        <w:rPr>
+          <w:rFonts w:ascii="Arial" w:cs="Arial" w:eastAsia="Arial" w:hAnsi="Arial"/>
+          <w:sz w:val="21"/>
+          <w:szCs w:val="21"/>
+        </w:rPr>
+        <w:t xml:space="preserve">And then Rome arrived. Tired, dusty, and looking for the right address.</w:t>
       </w:r>
     </w:p>
     <w:p>
@@ -4629,15 +4084,15 @@
           <w:sz w:val="21"/>
           <w:szCs w:val="21"/>
         </w:rPr>
-        <w:t xml:space="preserve">Shot 21:  </w:t>
-      </w:r>
-      <w:r>
-        <w:rPr>
-          <w:rFonts w:ascii="Arial" w:cs="Arial" w:eastAsia="Arial" w:hAnsi="Arial"/>
-          <w:sz w:val="21"/>
-          <w:szCs w:val="21"/>
-        </w:rPr>
-        <w:t xml:space="preserve">Outside, the street went quiet. In a busy city, that's never good.</w:t>
+        <w:t xml:space="preserve">Shot 44:  </w:t>
+      </w:r>
+      <w:r>
+        <w:rPr>
+          <w:rFonts w:ascii="Arial" w:cs="Arial" w:eastAsia="Arial" w:hAnsi="Arial"/>
+          <w:sz w:val="21"/>
+          <w:szCs w:val="21"/>
+        </w:rPr>
+        <w:t xml:space="preserve">The setting is real: in 30 BC, Octavian took Alexandria. Egypt became Roman.</w:t>
       </w:r>
     </w:p>
     <w:p>
@@ -4663,15 +4118,15 @@
           <w:sz w:val="21"/>
           <w:szCs w:val="21"/>
         </w:rPr>
-        <w:t xml:space="preserve">Shot 22:  </w:t>
-      </w:r>
-      <w:r>
-        <w:rPr>
-          <w:rFonts w:ascii="Arial" w:cs="Arial" w:eastAsia="Arial" w:hAnsi="Arial"/>
-          <w:sz w:val="21"/>
-          <w:szCs w:val="21"/>
-        </w:rPr>
-        <w:t xml:space="preserve">(no narration, boot steps and metal clank)</w:t>
+        <w:t xml:space="preserve">Shot 26:  </w:t>
+      </w:r>
+      <w:r>
+        <w:rPr>
+          <w:rFonts w:ascii="Arial" w:cs="Arial" w:eastAsia="Arial" w:hAnsi="Arial"/>
+          <w:sz w:val="21"/>
+          <w:szCs w:val="21"/>
+        </w:rPr>
+        <w:t xml:space="preserve">The guests peeked out. One terrified. One confused. One assumed it was entertainment.</w:t>
       </w:r>
     </w:p>
     <w:p>
@@ -4697,15 +4152,15 @@
           <w:sz w:val="21"/>
           <w:szCs w:val="21"/>
         </w:rPr>
-        <w:t xml:space="preserve">Shot 23:  </w:t>
-      </w:r>
-      <w:r>
-        <w:rPr>
-          <w:rFonts w:ascii="Arial" w:cs="Arial" w:eastAsia="Arial" w:hAnsi="Arial"/>
-          <w:sz w:val="21"/>
-          <w:szCs w:val="21"/>
-        </w:rPr>
-        <w:t xml:space="preserve">Clank. Clank. Clank. Marching men. Lots of them.</w:t>
+        <w:t xml:space="preserve">Shot 27:  </w:t>
+      </w:r>
+      <w:r>
+        <w:rPr>
+          <w:rFonts w:ascii="Arial" w:cs="Arial" w:eastAsia="Arial" w:hAnsi="Arial"/>
+          <w:sz w:val="21"/>
+          <w:szCs w:val="21"/>
+        </w:rPr>
+        <w:t xml:space="preserve">Then one uncle, a man with absolutely no fear, grabbed a beer.</w:t>
       </w:r>
     </w:p>
     <w:p>
@@ -4731,15 +4186,15 @@
           <w:sz w:val="21"/>
           <w:szCs w:val="21"/>
         </w:rPr>
-        <w:t xml:space="preserve">Shot 24:  </w:t>
-      </w:r>
-      <w:r>
-        <w:rPr>
-          <w:rFonts w:ascii="Arial" w:cs="Arial" w:eastAsia="Arial" w:hAnsi="Arial"/>
-          <w:sz w:val="21"/>
-          <w:szCs w:val="21"/>
-        </w:rPr>
-        <w:t xml:space="preserve">Inside, nobody had a clue. Senbi was busy spinning.</w:t>
+        <w:t xml:space="preserve">Shot 29:  </w:t>
+      </w:r>
+      <w:r>
+        <w:rPr>
+          <w:rFonts w:ascii="Arial" w:cs="Arial" w:eastAsia="Arial" w:hAnsi="Arial"/>
+          <w:sz w:val="21"/>
+          <w:szCs w:val="21"/>
+        </w:rPr>
+        <w:t xml:space="preserve">The soldier stared at the cup, then the uncle. A trap? Or hospitality?</w:t>
       </w:r>
     </w:p>
     <w:p>
@@ -4765,15 +4220,15 @@
           <w:sz w:val="21"/>
           <w:szCs w:val="21"/>
         </w:rPr>
-        <w:t xml:space="preserve">Shot 25:  </w:t>
-      </w:r>
-      <w:r>
-        <w:rPr>
-          <w:rFonts w:ascii="Arial" w:cs="Arial" w:eastAsia="Arial" w:hAnsi="Arial"/>
-          <w:sz w:val="21"/>
-          <w:szCs w:val="21"/>
-        </w:rPr>
-        <w:t xml:space="preserve">And then Rome arrived. Tired, dusty, and looking for the right address.</w:t>
+        <w:t xml:space="preserve">Shot 30:  </w:t>
+      </w:r>
+      <w:r>
+        <w:rPr>
+          <w:rFonts w:ascii="Arial" w:cs="Arial" w:eastAsia="Arial" w:hAnsi="Arial"/>
+          <w:sz w:val="21"/>
+          <w:szCs w:val="21"/>
+        </w:rPr>
+        <w:t xml:space="preserve">Then the Romans saw the food. Military discipline lasted about four seconds.</w:t>
       </w:r>
     </w:p>
     <w:p>
@@ -4799,15 +4254,15 @@
           <w:sz w:val="21"/>
           <w:szCs w:val="21"/>
         </w:rPr>
-        <w:t xml:space="preserve">Shot 44:  </w:t>
-      </w:r>
-      <w:r>
-        <w:rPr>
-          <w:rFonts w:ascii="Arial" w:cs="Arial" w:eastAsia="Arial" w:hAnsi="Arial"/>
-          <w:sz w:val="21"/>
-          <w:szCs w:val="21"/>
-        </w:rPr>
-        <w:t xml:space="preserve">The setting is real: in 30 BC, Octavian took Alexandria. Egypt became Roman.</w:t>
+        <w:t xml:space="preserve">Shot 31:  </w:t>
+      </w:r>
+      <w:r>
+        <w:rPr>
+          <w:rFonts w:ascii="Arial" w:cs="Arial" w:eastAsia="Arial" w:hAnsi="Arial"/>
+          <w:sz w:val="21"/>
+          <w:szCs w:val="21"/>
+        </w:rPr>
+        <w:t xml:space="preserve">One soldier stepped into the dance. Nobody stopped him. Somehow, it worked.</w:t>
       </w:r>
     </w:p>
     <w:p>
@@ -4833,15 +4288,15 @@
           <w:sz w:val="21"/>
           <w:szCs w:val="21"/>
         </w:rPr>
-        <w:t xml:space="preserve">Shot 26:  </w:t>
-      </w:r>
-      <w:r>
-        <w:rPr>
-          <w:rFonts w:ascii="Arial" w:cs="Arial" w:eastAsia="Arial" w:hAnsi="Arial"/>
-          <w:sz w:val="21"/>
-          <w:szCs w:val="21"/>
-        </w:rPr>
-        <w:t xml:space="preserve">The guests peeked out. One terrified. One confused. One assumed it was entertainment.</w:t>
+        <w:t xml:space="preserve">Shot 32:  </w:t>
+      </w:r>
+      <w:r>
+        <w:rPr>
+          <w:rFonts w:ascii="Arial" w:cs="Arial" w:eastAsia="Arial" w:hAnsi="Arial"/>
+          <w:sz w:val="21"/>
+          <w:szCs w:val="21"/>
+        </w:rPr>
+        <w:t xml:space="preserve">Roman engineering changed the world. Roman dancing did not.</w:t>
       </w:r>
     </w:p>
     <w:p>
@@ -4867,15 +4322,15 @@
           <w:sz w:val="21"/>
           <w:szCs w:val="21"/>
         </w:rPr>
-        <w:t xml:space="preserve">Shot 27:  </w:t>
-      </w:r>
-      <w:r>
-        <w:rPr>
-          <w:rFonts w:ascii="Arial" w:cs="Arial" w:eastAsia="Arial" w:hAnsi="Arial"/>
-          <w:sz w:val="21"/>
-          <w:szCs w:val="21"/>
-        </w:rPr>
-        <w:t xml:space="preserve">Then one uncle, a man with absolutely no fear, grabbed a beer.</w:t>
+        <w:t xml:space="preserve">Shot 33:  </w:t>
+      </w:r>
+      <w:r>
+        <w:rPr>
+          <w:rFonts w:ascii="Arial" w:cs="Arial" w:eastAsia="Arial" w:hAnsi="Arial"/>
+          <w:sz w:val="21"/>
+          <w:szCs w:val="21"/>
+        </w:rPr>
+        <w:t xml:space="preserve">Senbi, ever the host, invited one to join. Of course he did.</w:t>
       </w:r>
     </w:p>
     <w:p>
@@ -4901,15 +4356,15 @@
           <w:sz w:val="21"/>
           <w:szCs w:val="21"/>
         </w:rPr>
-        <w:t xml:space="preserve">Shot 28:  </w:t>
-      </w:r>
-      <w:r>
-        <w:rPr>
-          <w:rFonts w:ascii="Arial" w:cs="Arial" w:eastAsia="Arial" w:hAnsi="Arial"/>
-          <w:sz w:val="21"/>
-          <w:szCs w:val="21"/>
-        </w:rPr>
-        <w:t xml:space="preserve">He offered it to a Roman. As if it were completely normal.</w:t>
+        <w:t xml:space="preserve">Shot 34:  </w:t>
+      </w:r>
+      <w:r>
+        <w:rPr>
+          <w:rFonts w:ascii="Arial" w:cs="Arial" w:eastAsia="Arial" w:hAnsi="Arial"/>
+          <w:sz w:val="21"/>
+          <w:szCs w:val="21"/>
+        </w:rPr>
+        <w:t xml:space="preserve">His bride slowly covered her face. This was not in the contract.</w:t>
       </w:r>
     </w:p>
     <w:p>
@@ -4935,15 +4390,15 @@
           <w:sz w:val="21"/>
           <w:szCs w:val="21"/>
         </w:rPr>
-        <w:t xml:space="preserve">Shot 29:  </w:t>
-      </w:r>
-      <w:r>
-        <w:rPr>
-          <w:rFonts w:ascii="Arial" w:cs="Arial" w:eastAsia="Arial" w:hAnsi="Arial"/>
-          <w:sz w:val="21"/>
-          <w:szCs w:val="21"/>
-        </w:rPr>
-        <w:t xml:space="preserve">The soldier stared at the cup, then the uncle. A trap? Or hospitality?</w:t>
+        <w:t xml:space="preserve">Shot 36:  </w:t>
+      </w:r>
+      <w:r>
+        <w:rPr>
+          <w:rFonts w:ascii="Arial" w:cs="Arial" w:eastAsia="Arial" w:hAnsi="Arial"/>
+          <w:sz w:val="21"/>
+          <w:szCs w:val="21"/>
+        </w:rPr>
+        <w:t xml:space="preserve">Then a horn cut through the music, and everyone froze mid-step.</w:t>
       </w:r>
     </w:p>
     <w:p>
@@ -4969,15 +4424,15 @@
           <w:sz w:val="21"/>
           <w:szCs w:val="21"/>
         </w:rPr>
-        <w:t xml:space="preserve">Shot 30:  </w:t>
-      </w:r>
-      <w:r>
-        <w:rPr>
-          <w:rFonts w:ascii="Arial" w:cs="Arial" w:eastAsia="Arial" w:hAnsi="Arial"/>
-          <w:sz w:val="21"/>
-          <w:szCs w:val="21"/>
-        </w:rPr>
-        <w:t xml:space="preserve">Then the Romans saw the food. Military discipline lasted about four seconds.</w:t>
+        <w:t xml:space="preserve">Shot 37:  </w:t>
+      </w:r>
+      <w:r>
+        <w:rPr>
+          <w:rFonts w:ascii="Arial" w:cs="Arial" w:eastAsia="Arial" w:hAnsi="Arial"/>
+          <w:sz w:val="21"/>
+          <w:szCs w:val="21"/>
+        </w:rPr>
+        <w:t xml:space="preserve">And in walked the commander. The only adult in the building.</w:t>
       </w:r>
     </w:p>
     <w:p>
@@ -5003,15 +4458,15 @@
           <w:sz w:val="21"/>
           <w:szCs w:val="21"/>
         </w:rPr>
-        <w:t xml:space="preserve">Shot 31:  </w:t>
-      </w:r>
-      <w:r>
-        <w:rPr>
-          <w:rFonts w:ascii="Arial" w:cs="Arial" w:eastAsia="Arial" w:hAnsi="Arial"/>
-          <w:sz w:val="21"/>
-          <w:szCs w:val="21"/>
-        </w:rPr>
-        <w:t xml:space="preserve">One soldier stepped into the dance. Nobody stopped him. Somehow, it worked.</w:t>
+        <w:t xml:space="preserve">Shot 39:  </w:t>
+      </w:r>
+      <w:r>
+        <w:rPr>
+          <w:rFonts w:ascii="Arial" w:cs="Arial" w:eastAsia="Arial" w:hAnsi="Arial"/>
+          <w:sz w:val="21"/>
+          <w:szCs w:val="21"/>
+        </w:rPr>
+        <w:t xml:space="preserve">The cat looked back. The cat was not impressed by the Roman Empire.</w:t>
       </w:r>
     </w:p>
     <w:p>
@@ -5037,15 +4492,15 @@
           <w:sz w:val="21"/>
           <w:szCs w:val="21"/>
         </w:rPr>
-        <w:t xml:space="preserve">Shot 32:  </w:t>
-      </w:r>
-      <w:r>
-        <w:rPr>
-          <w:rFonts w:ascii="Arial" w:cs="Arial" w:eastAsia="Arial" w:hAnsi="Arial"/>
-          <w:sz w:val="21"/>
-          <w:szCs w:val="21"/>
-        </w:rPr>
-        <w:t xml:space="preserve">Roman engineering changed the world. Roman dancing did not.</w:t>
+        <w:t xml:space="preserve">Shot 40:  </w:t>
+      </w:r>
+      <w:r>
+        <w:rPr>
+          <w:rFonts w:ascii="Arial" w:cs="Arial" w:eastAsia="Arial" w:hAnsi="Arial"/>
+          <w:sz w:val="21"/>
+          <w:szCs w:val="21"/>
+        </w:rPr>
+        <w:t xml:space="preserve">He unrolled the scroll. Message received: Egypt has new management.</w:t>
       </w:r>
     </w:p>
     <w:p>
@@ -5071,15 +4526,15 @@
           <w:sz w:val="21"/>
           <w:szCs w:val="21"/>
         </w:rPr>
-        <w:t xml:space="preserve">Shot 33:  </w:t>
-      </w:r>
-      <w:r>
-        <w:rPr>
-          <w:rFonts w:ascii="Arial" w:cs="Arial" w:eastAsia="Arial" w:hAnsi="Arial"/>
-          <w:sz w:val="21"/>
-          <w:szCs w:val="21"/>
-        </w:rPr>
-        <w:t xml:space="preserve">Senbi, ever the host, invited one to join. Of course he did.</w:t>
+        <w:t xml:space="preserve">Shot 41:  </w:t>
+      </w:r>
+      <w:r>
+        <w:rPr>
+          <w:rFonts w:ascii="Arial" w:cs="Arial" w:eastAsia="Arial" w:hAnsi="Arial"/>
+          <w:sz w:val="21"/>
+          <w:szCs w:val="21"/>
+        </w:rPr>
+        <w:t xml:space="preserve">Senbi looked at his bride. Same question, silently: is the wedding still on?</w:t>
       </w:r>
     </w:p>
     <w:p>
@@ -5105,15 +4560,15 @@
           <w:sz w:val="21"/>
           <w:szCs w:val="21"/>
         </w:rPr>
-        <w:t xml:space="preserve">Shot 34:  </w:t>
-      </w:r>
-      <w:r>
-        <w:rPr>
-          <w:rFonts w:ascii="Arial" w:cs="Arial" w:eastAsia="Arial" w:hAnsi="Arial"/>
-          <w:sz w:val="21"/>
-          <w:szCs w:val="21"/>
-        </w:rPr>
-        <w:t xml:space="preserve">His bride slowly covered her face. This was not in the contract.</w:t>
+        <w:t xml:space="preserve">Shot 43:  </w:t>
+      </w:r>
+      <w:r>
+        <w:rPr>
+          <w:rFonts w:ascii="Arial" w:cs="Arial" w:eastAsia="Arial" w:hAnsi="Arial"/>
+          <w:sz w:val="21"/>
+          <w:szCs w:val="21"/>
+        </w:rPr>
+        <w:t xml:space="preserve">To be clear: Senbi and his wedding are fiction. The cat, sadly, too.</w:t>
       </w:r>
     </w:p>
     <w:p>
@@ -5139,15 +4594,15 @@
           <w:sz w:val="21"/>
           <w:szCs w:val="21"/>
         </w:rPr>
-        <w:t xml:space="preserve">Shot 35:  </w:t>
-      </w:r>
-      <w:r>
-        <w:rPr>
-          <w:rFonts w:ascii="Arial" w:cs="Arial" w:eastAsia="Arial" w:hAnsi="Arial"/>
-          <w:sz w:val="21"/>
-          <w:szCs w:val="21"/>
-        </w:rPr>
-        <w:t xml:space="preserve">Soon, Egyptians and Romans were passing food and stepping on each other's feet.</w:t>
+        <w:t xml:space="preserve">Shot 45:  </w:t>
+      </w:r>
+      <w:r>
+        <w:rPr>
+          <w:rFonts w:ascii="Arial" w:cs="Arial" w:eastAsia="Arial" w:hAnsi="Arial"/>
+          <w:sz w:val="21"/>
+          <w:szCs w:val="21"/>
+        </w:rPr>
+        <w:t xml:space="preserve">Headrest, then commander. Neither came with a return policy.</w:t>
       </w:r>
     </w:p>
     <w:p>
@@ -5173,15 +4628,15 @@
           <w:sz w:val="21"/>
           <w:szCs w:val="21"/>
         </w:rPr>
-        <w:t xml:space="preserve">Shot 36:  </w:t>
-      </w:r>
-      <w:r>
-        <w:rPr>
-          <w:rFonts w:ascii="Arial" w:cs="Arial" w:eastAsia="Arial" w:hAnsi="Arial"/>
-          <w:sz w:val="21"/>
-          <w:szCs w:val="21"/>
-        </w:rPr>
-        <w:t xml:space="preserve">Then a horn cut through the music, and everyone froze mid-step.</w:t>
+        <w:t xml:space="preserve">Shot 46:  </w:t>
+      </w:r>
+      <w:r>
+        <w:rPr>
+          <w:rFonts w:ascii="Arial" w:cs="Arial" w:eastAsia="Arial" w:hAnsi="Arial"/>
+          <w:sz w:val="21"/>
+          <w:szCs w:val="21"/>
+        </w:rPr>
+        <w:t xml:space="preserve">Senbi thought he was getting married.</w:t>
       </w:r>
     </w:p>
     <w:p>
@@ -5207,15 +4662,15 @@
           <w:sz w:val="21"/>
           <w:szCs w:val="21"/>
         </w:rPr>
-        <w:t xml:space="preserve">Shot 37:  </w:t>
-      </w:r>
-      <w:r>
-        <w:rPr>
-          <w:rFonts w:ascii="Arial" w:cs="Arial" w:eastAsia="Arial" w:hAnsi="Arial"/>
-          <w:sz w:val="21"/>
-          <w:szCs w:val="21"/>
-        </w:rPr>
-        <w:t xml:space="preserve">And in walked the commander. The only adult in the building.</w:t>
+        <w:t xml:space="preserve">Shot 47:  </w:t>
+      </w:r>
+      <w:r>
+        <w:rPr>
+          <w:rFonts w:ascii="Arial" w:cs="Arial" w:eastAsia="Arial" w:hAnsi="Arial"/>
+          <w:sz w:val="21"/>
+          <w:szCs w:val="21"/>
+        </w:rPr>
+        <w:t xml:space="preserve">He was.</w:t>
       </w:r>
     </w:p>
     <w:p>
@@ -5232,312 +4687,6 @@
           <w:szCs w:val="21"/>
         </w:rPr>
         <w:t xml:space="preserve">39  </w:t>
-      </w:r>
-      <w:r>
-        <w:rPr>
-          <w:rFonts w:ascii="Arial" w:cs="Arial" w:eastAsia="Arial" w:hAnsi="Arial"/>
-          <w:b/>
-          <w:bCs/>
-          <w:sz w:val="21"/>
-          <w:szCs w:val="21"/>
-        </w:rPr>
-        <w:t xml:space="preserve">Shot 38:  </w:t>
-      </w:r>
-      <w:r>
-        <w:rPr>
-          <w:rFonts w:ascii="Arial" w:cs="Arial" w:eastAsia="Arial" w:hAnsi="Arial"/>
-          <w:sz w:val="21"/>
-          <w:szCs w:val="21"/>
-        </w:rPr>
-        <w:t xml:space="preserve">He saw his soldiers dancing. The food. The bride. The groom. The cat.</w:t>
-      </w:r>
-    </w:p>
-    <w:p>
-      <w:pPr>
-        <w:spacing w:after="40" w:before="0"/>
-      </w:pPr>
-      <w:r>
-        <w:rPr>
-          <w:rFonts w:ascii="Arial" w:cs="Arial" w:eastAsia="Arial" w:hAnsi="Arial"/>
-          <w:b/>
-          <w:bCs/>
-          <w:color w:val="888888"/>
-          <w:sz w:val="21"/>
-          <w:szCs w:val="21"/>
-        </w:rPr>
-        <w:t xml:space="preserve">40  </w:t>
-      </w:r>
-      <w:r>
-        <w:rPr>
-          <w:rFonts w:ascii="Arial" w:cs="Arial" w:eastAsia="Arial" w:hAnsi="Arial"/>
-          <w:b/>
-          <w:bCs/>
-          <w:sz w:val="21"/>
-          <w:szCs w:val="21"/>
-        </w:rPr>
-        <w:t xml:space="preserve">Shot 39:  </w:t>
-      </w:r>
-      <w:r>
-        <w:rPr>
-          <w:rFonts w:ascii="Arial" w:cs="Arial" w:eastAsia="Arial" w:hAnsi="Arial"/>
-          <w:sz w:val="21"/>
-          <w:szCs w:val="21"/>
-        </w:rPr>
-        <w:t xml:space="preserve">The cat looked back. The cat was not impressed by the Roman Empire.</w:t>
-      </w:r>
-    </w:p>
-    <w:p>
-      <w:pPr>
-        <w:spacing w:after="40" w:before="0"/>
-      </w:pPr>
-      <w:r>
-        <w:rPr>
-          <w:rFonts w:ascii="Arial" w:cs="Arial" w:eastAsia="Arial" w:hAnsi="Arial"/>
-          <w:b/>
-          <w:bCs/>
-          <w:color w:val="888888"/>
-          <w:sz w:val="21"/>
-          <w:szCs w:val="21"/>
-        </w:rPr>
-        <w:t xml:space="preserve">41  </w:t>
-      </w:r>
-      <w:r>
-        <w:rPr>
-          <w:rFonts w:ascii="Arial" w:cs="Arial" w:eastAsia="Arial" w:hAnsi="Arial"/>
-          <w:b/>
-          <w:bCs/>
-          <w:sz w:val="21"/>
-          <w:szCs w:val="21"/>
-        </w:rPr>
-        <w:t xml:space="preserve">Shot 40:  </w:t>
-      </w:r>
-      <w:r>
-        <w:rPr>
-          <w:rFonts w:ascii="Arial" w:cs="Arial" w:eastAsia="Arial" w:hAnsi="Arial"/>
-          <w:sz w:val="21"/>
-          <w:szCs w:val="21"/>
-        </w:rPr>
-        <w:t xml:space="preserve">He unrolled the scroll. Message received: Egypt has new management.</w:t>
-      </w:r>
-    </w:p>
-    <w:p>
-      <w:pPr>
-        <w:spacing w:after="40" w:before="0"/>
-      </w:pPr>
-      <w:r>
-        <w:rPr>
-          <w:rFonts w:ascii="Arial" w:cs="Arial" w:eastAsia="Arial" w:hAnsi="Arial"/>
-          <w:b/>
-          <w:bCs/>
-          <w:color w:val="888888"/>
-          <w:sz w:val="21"/>
-          <w:szCs w:val="21"/>
-        </w:rPr>
-        <w:t xml:space="preserve">42  </w:t>
-      </w:r>
-      <w:r>
-        <w:rPr>
-          <w:rFonts w:ascii="Arial" w:cs="Arial" w:eastAsia="Arial" w:hAnsi="Arial"/>
-          <w:b/>
-          <w:bCs/>
-          <w:sz w:val="21"/>
-          <w:szCs w:val="21"/>
-        </w:rPr>
-        <w:t xml:space="preserve">Shot 41:  </w:t>
-      </w:r>
-      <w:r>
-        <w:rPr>
-          <w:rFonts w:ascii="Arial" w:cs="Arial" w:eastAsia="Arial" w:hAnsi="Arial"/>
-          <w:sz w:val="21"/>
-          <w:szCs w:val="21"/>
-        </w:rPr>
-        <w:t xml:space="preserve">Senbi looked at his bride. Same question, silently: is the wedding still on?</w:t>
-      </w:r>
-    </w:p>
-    <w:p>
-      <w:pPr>
-        <w:spacing w:after="40" w:before="0"/>
-      </w:pPr>
-      <w:r>
-        <w:rPr>
-          <w:rFonts w:ascii="Arial" w:cs="Arial" w:eastAsia="Arial" w:hAnsi="Arial"/>
-          <w:b/>
-          <w:bCs/>
-          <w:color w:val="888888"/>
-          <w:sz w:val="21"/>
-          <w:szCs w:val="21"/>
-        </w:rPr>
-        <w:t xml:space="preserve">43  </w:t>
-      </w:r>
-      <w:r>
-        <w:rPr>
-          <w:rFonts w:ascii="Arial" w:cs="Arial" w:eastAsia="Arial" w:hAnsi="Arial"/>
-          <w:b/>
-          <w:bCs/>
-          <w:sz w:val="21"/>
-          <w:szCs w:val="21"/>
-        </w:rPr>
-        <w:t xml:space="preserve">Shot 42:  </w:t>
-      </w:r>
-      <w:r>
-        <w:rPr>
-          <w:rFonts w:ascii="Arial" w:cs="Arial" w:eastAsia="Arial" w:hAnsi="Arial"/>
-          <w:sz w:val="21"/>
-          <w:szCs w:val="21"/>
-        </w:rPr>
-        <w:t xml:space="preserve">Outside, the city was changing hands. Inside, there was still a wedding.</w:t>
-      </w:r>
-    </w:p>
-    <w:p>
-      <w:pPr>
-        <w:spacing w:after="40" w:before="0"/>
-      </w:pPr>
-      <w:r>
-        <w:rPr>
-          <w:rFonts w:ascii="Arial" w:cs="Arial" w:eastAsia="Arial" w:hAnsi="Arial"/>
-          <w:b/>
-          <w:bCs/>
-          <w:color w:val="888888"/>
-          <w:sz w:val="21"/>
-          <w:szCs w:val="21"/>
-        </w:rPr>
-        <w:t xml:space="preserve">44  </w:t>
-      </w:r>
-      <w:r>
-        <w:rPr>
-          <w:rFonts w:ascii="Arial" w:cs="Arial" w:eastAsia="Arial" w:hAnsi="Arial"/>
-          <w:b/>
-          <w:bCs/>
-          <w:sz w:val="21"/>
-          <w:szCs w:val="21"/>
-        </w:rPr>
-        <w:t xml:space="preserve">Shot 43:  </w:t>
-      </w:r>
-      <w:r>
-        <w:rPr>
-          <w:rFonts w:ascii="Arial" w:cs="Arial" w:eastAsia="Arial" w:hAnsi="Arial"/>
-          <w:sz w:val="21"/>
-          <w:szCs w:val="21"/>
-        </w:rPr>
-        <w:t xml:space="preserve">To be clear: Senbi and his wedding are fiction. The cat, sadly, too.</w:t>
-      </w:r>
-    </w:p>
-    <w:p>
-      <w:pPr>
-        <w:spacing w:after="40" w:before="0"/>
-      </w:pPr>
-      <w:r>
-        <w:rPr>
-          <w:rFonts w:ascii="Arial" w:cs="Arial" w:eastAsia="Arial" w:hAnsi="Arial"/>
-          <w:b/>
-          <w:bCs/>
-          <w:color w:val="888888"/>
-          <w:sz w:val="21"/>
-          <w:szCs w:val="21"/>
-        </w:rPr>
-        <w:t xml:space="preserve">45  </w:t>
-      </w:r>
-      <w:r>
-        <w:rPr>
-          <w:rFonts w:ascii="Arial" w:cs="Arial" w:eastAsia="Arial" w:hAnsi="Arial"/>
-          <w:b/>
-          <w:bCs/>
-          <w:sz w:val="21"/>
-          <w:szCs w:val="21"/>
-        </w:rPr>
-        <w:t xml:space="preserve">Shot 45:  </w:t>
-      </w:r>
-      <w:r>
-        <w:rPr>
-          <w:rFonts w:ascii="Arial" w:cs="Arial" w:eastAsia="Arial" w:hAnsi="Arial"/>
-          <w:sz w:val="21"/>
-          <w:szCs w:val="21"/>
-        </w:rPr>
-        <w:t xml:space="preserve">Headrest, then commander. Neither came with a return policy.</w:t>
-      </w:r>
-    </w:p>
-    <w:p>
-      <w:pPr>
-        <w:spacing w:after="40" w:before="0"/>
-      </w:pPr>
-      <w:r>
-        <w:rPr>
-          <w:rFonts w:ascii="Arial" w:cs="Arial" w:eastAsia="Arial" w:hAnsi="Arial"/>
-          <w:b/>
-          <w:bCs/>
-          <w:color w:val="888888"/>
-          <w:sz w:val="21"/>
-          <w:szCs w:val="21"/>
-        </w:rPr>
-        <w:t xml:space="preserve">46  </w:t>
-      </w:r>
-      <w:r>
-        <w:rPr>
-          <w:rFonts w:ascii="Arial" w:cs="Arial" w:eastAsia="Arial" w:hAnsi="Arial"/>
-          <w:b/>
-          <w:bCs/>
-          <w:sz w:val="21"/>
-          <w:szCs w:val="21"/>
-        </w:rPr>
-        <w:t xml:space="preserve">Shot 46:  </w:t>
-      </w:r>
-      <w:r>
-        <w:rPr>
-          <w:rFonts w:ascii="Arial" w:cs="Arial" w:eastAsia="Arial" w:hAnsi="Arial"/>
-          <w:sz w:val="21"/>
-          <w:szCs w:val="21"/>
-        </w:rPr>
-        <w:t xml:space="preserve">Senbi thought he was getting married.</w:t>
-      </w:r>
-    </w:p>
-    <w:p>
-      <w:pPr>
-        <w:spacing w:after="40" w:before="0"/>
-      </w:pPr>
-      <w:r>
-        <w:rPr>
-          <w:rFonts w:ascii="Arial" w:cs="Arial" w:eastAsia="Arial" w:hAnsi="Arial"/>
-          <w:b/>
-          <w:bCs/>
-          <w:color w:val="888888"/>
-          <w:sz w:val="21"/>
-          <w:szCs w:val="21"/>
-        </w:rPr>
-        <w:t xml:space="preserve">47  </w:t>
-      </w:r>
-      <w:r>
-        <w:rPr>
-          <w:rFonts w:ascii="Arial" w:cs="Arial" w:eastAsia="Arial" w:hAnsi="Arial"/>
-          <w:b/>
-          <w:bCs/>
-          <w:sz w:val="21"/>
-          <w:szCs w:val="21"/>
-        </w:rPr>
-        <w:t xml:space="preserve">Shot 47:  </w:t>
-      </w:r>
-      <w:r>
-        <w:rPr>
-          <w:rFonts w:ascii="Arial" w:cs="Arial" w:eastAsia="Arial" w:hAnsi="Arial"/>
-          <w:sz w:val="21"/>
-          <w:szCs w:val="21"/>
-        </w:rPr>
-        <w:t xml:space="preserve">He was.</w:t>
-      </w:r>
-    </w:p>
-    <w:p>
-      <w:pPr>
-        <w:spacing w:after="40" w:before="0"/>
-      </w:pPr>
-      <w:r>
-        <w:rPr>
-          <w:rFonts w:ascii="Arial" w:cs="Arial" w:eastAsia="Arial" w:hAnsi="Arial"/>
-          <w:b/>
-          <w:bCs/>
-          <w:color w:val="888888"/>
-          <w:sz w:val="21"/>
-          <w:szCs w:val="21"/>
-        </w:rPr>
-        <w:t xml:space="preserve">48  </w:t>
       </w:r>
       <w:r>
         <w:rPr>

</xml_diff>

<commit_message>
Episode 1 prompts: Egyptian-only architecture wording, shot 1 start-frame prompt, no togas
Co-Authored-By: Claude Sonnet 5.5 <noreply@anthropic.com>
Claude-Session: https://claude.ai/code/session_01S29WeDgsXUpbHNWdisiPFj
</commit_message>
<xml_diff>
--- a/The_Last_Day_of_Ancient_Egypt_Ep1_FLOW_PROMPTS_READY.docx
+++ b/The_Last_Day_of_Ancient_Egypt_Ep1_FLOW_PROMPTS_READY.docx
@@ -497,7 +497,7 @@
           <w:sz w:val="19"/>
           <w:szCs w:val="19"/>
         </w:rPr>
-        <w:t xml:space="preserve">Use Frames to Video with Shot1_first_frame.png as the START frame, so the look stays identical to the approved version. If your Flow mode only accepts reference images, attach Senbi_from_Shot1.png, Bride_from_Shot1.png and Courtyard_from_Shot1.png instead.</w:t>
+        <w:t xml:space="preserve">Two ways to generate Shot 1. OPTION A (best): Frames to Video with Shot1_first_frame.png as the START frame, using the short prompt A below: the image carries the look, the prompt only adds motion and sound. OPTION B: if you can only attach reference images, attach Senbi_from_Shot1.png, Bride_from_Shot1.png and Courtyard_from_Shot1.png and use the long prompt B.</w:t>
       </w:r>
     </w:p>
     <w:p>
@@ -540,6 +540,22 @@
           <w:szCs w:val="21"/>
         </w:rPr>
         <w:t xml:space="preserve">8 sec</w:t>
+      </w:r>
+    </w:p>
+    <w:p>
+      <w:pPr>
+        <w:keepNext/>
+        <w:spacing w:after="40" w:before="120"/>
+      </w:pPr>
+      <w:r>
+        <w:rPr>
+          <w:rFonts w:ascii="Arial" w:cs="Arial" w:eastAsia="Arial" w:hAnsi="Arial"/>
+          <w:b/>
+          <w:bCs/>
+          <w:sz w:val="21"/>
+          <w:szCs w:val="21"/>
+        </w:rPr>
+        <w:t xml:space="preserve">PROMPT A (Frames to Video, start frame attached) — copy all:</w:t>
       </w:r>
     </w:p>
     <w:p>
@@ -553,7 +569,37 @@
           <w:sz w:val="20"/>
           <w:szCs w:val="20"/>
         </w:rPr>
-        <w:t xml:space="preserve">VOICE RULE: only the voice-over narration speaks words; it is a voice only, never a person or character on screen. No character says any word and no one on screen lip-syncs to speech; characters communicate with facial expressions and body gestures. Natural non-verbal sounds are allowed and should sound real: laughing, giggling, gasping, sighing, groaning, cheering, coughing. Starting frame (attached): keep exactly this composition, these characters and this background at the start. 2D hand-drawn stickman cartoon in the exact style of the starting frame: thin black outlines, large expressive heads, thin black stick arms and legs, flat warm colors, playful documentary-comedy tone, 16:9. Characters, identical in every frame: Senbi the groom: young man, straight black bowl-cut hair with bangs, gold headband with a gold cobra, bare chest, blue-and-gold broad collar, gold bracers, white kilt with a blue-and-gold sash, brown sandals, thin black stick arms. the bride: black bob hair with straight bangs, gold headband with a red gem, white dress, blue-and-gold collar, gold sash, gold arm cuffs, light veil. the guests: Egyptian wedding guests in white linen with blue-and-gold collars and gold headbands, black bob hairstyles, some in white striped headdresses. Setting: sunny daytime wedding courtyard in ancient Alexandria, sandstone columns with painted blue-and-gold bands, long tables with white cloths, fruit and clay jars, orange cloth awnings, and a tall wooden entrance gate at the back-center that opens onto the street; in the street beyond the gate, a row of Roman soldier silhouettes with spears stands motionless, small but clear. Lighting: warm bright afternoon sunlight, soft shadows, rich saturated colors. ACTION TIMELINE (8 seconds): 0–2.5 s: Senbi and the bride dance joyfully in the center of the courtyard, fists pumping, eyes closed, big laughing smiles; guests at the tables clap, a guest plays a reed flute, another beats a frame drum; the Roman silhouettes stand perfectly still in the gate behind them. 2.5–5.5 s: the dance continues, the couple's joy growing, guests clapping along. 5.5–8 s: the camera has drifted closer so the laughing couple fills the frame in a medium close-up, Senbi's fist raised, the bride's arms up; the silhouettes remain still in the background. Camera: eye-level, starts as a medium-wide shot and makes one slow, smooth push-in toward the couple, ending in a medium close-up; no tilt, no pan, no rising camera. Audio: voice-over narration only (a voice, never shown on screen; no narrator character appears): a British male voice, warm and dry, begins speaking within half a second and says: “Senbi had planned everything for his wedding. Everything except the Roman army.” The line takes about 4.8 seconds; leave the last second free of speech so the moment can land. Music: light ancient-Mediterranean wedding music (frame drums, reed flute, plucked strings), same theme in every clip, low under the voice. Sound effects: clapping, cups clinking, a few cheerful cheers from the guests without words, timed to the action. Ambience: light courtyard ambience: footsteps on stone, a soft breeze, no words. Final reminder: no character says any word; only the voice-over narration speaks (voice only, nobody on screen is the narrator). Natural laughs, gasps and sighs are fine. No text, captions or logos in the frame.</w:t>
+        <w:t xml:space="preserve">VOICE RULE: only the voice-over narration speaks words; it is a voice only, never a person on screen. No character says any word and no one lip-syncs; natural laughs, gasps and sighs are allowed and should sound real. Keep the starting image exactly as it is: the same two dancers, the same Egyptian courtyard and the same row of dark armored figures standing in the open gate. Do not redraw, restyle or change anything in the scene; only animate it. ACTION TIMELINE (8 seconds): 0–2.5 s: the couple dance joyfully, fists pumping, eyes closed, big laughing smiles; guests at the tables clap, one beats a frame drum; the dark figures in the gate stand perfectly still. 2.5–5.5 s: the dance continues, the couple's joy growing. 5.5–8 s: the camera drifts slightly closer to a medium close-up of the laughing couple while the figures stay still behind them. Camera: one slow, smooth push-in; no tilt, no pan, no rising camera. Audio: voice-over narration only (a voice, never shown on screen): a British male voice, warm and dry, begins speaking within half a second and says: “Senbi had planned everything for his wedding. Everything except the Roman army.” Say the first sentence warmly, pause briefly, then say the second sentence dryly and deadpan. The line takes about 5.2 seconds; leave the last second free of speech. Music: light ancient-Mediterranean wedding music (frame drums, reed flute, plucked strings), cheerful, low under the voice. Sound effects: clapping, cups clinking, cheers without words, timed to the action. Ambience: light courtyard ambience, no words. Final reminder: no character says any word; only the voice-over narration speaks (voice only, nobody on screen is the narrator). Natural laughs, gasps and sighs are fine. No text, captions or logos in the frame.</w:t>
+      </w:r>
+    </w:p>
+    <w:p>
+      <w:pPr>
+        <w:keepNext/>
+        <w:spacing w:after="40" w:before="120"/>
+      </w:pPr>
+      <w:r>
+        <w:rPr>
+          <w:rFonts w:ascii="Arial" w:cs="Arial" w:eastAsia="Arial" w:hAnsi="Arial"/>
+          <w:b/>
+          <w:bCs/>
+          <w:sz w:val="21"/>
+          <w:szCs w:val="21"/>
+        </w:rPr>
+        <w:t xml:space="preserve">PROMPT B (reference images only) — copy all:</w:t>
+      </w:r>
+    </w:p>
+    <w:p>
+      <w:pPr>
+        <w:shd w:fill="F2F2F2" w:val="clear"/>
+        <w:spacing w:after="80"/>
+      </w:pPr>
+      <w:r>
+        <w:rPr>
+          <w:rFonts w:ascii="Arial" w:cs="Arial" w:eastAsia="Arial" w:hAnsi="Arial"/>
+          <w:sz w:val="20"/>
+          <w:szCs w:val="20"/>
+        </w:rPr>
+        <w:t xml:space="preserve">VOICE RULE: only the voice-over narration speaks words; it is a voice only, never a person on screen. No character says any word and no one lip-syncs; natural laughs, gasps and sighs are allowed and should sound real. Attached reference images, in order: Senbi, the groom, the bride, the wedding courtyard. 2D hand-drawn stickman cartoon in the exact style of the reference images: thin black outlines, large expressive heads, thin black stick arms and legs, flat warm colors, playful documentary-comedy tone, 16:9. Characters, identical in every frame: Senbi the groom: young man, straight black bowl-cut hair with bangs, gold headband with a gold cobra, bare chest, blue-and-gold broad collar, gold bracers, white kilt with a blue-and-gold sash, brown sandals, thin black stick arms. the bride: black bob hair with straight bangs, gold headband with a red gem, white dress, blue-and-gold collar, gold sash, gold arm cuffs, light veil. the guests: Egyptian wedding guests in white linen with blue-and-gold collars and gold headbands, black bob hairstyles, some in white striped headdresses. They wear only short white kilts or simple white dresses: no togas, no draped robes. Setting: sunny daytime ancient Egyptian wedding courtyard in Alexandria: flat-roofed sandstone mud-brick buildings, tall Egyptian columns with lotus-bud capitals painted in blue-and-gold bands, hieroglyph-style carvings on the walls, long tables with white cloths and clay jars, orange cloth awnings, and a tall wooden entrance gate at the back-center that opens onto the street. Egyptian architecture only: no Greek or Roman architecture, no triangular pediments, no domes, no red tile roofs, no cypress trees. In the open gate, a row of dark armored figures with spears and plumed helmets stands motionless against the bright street, small but clear. Lighting: warm bright afternoon sunlight, soft shadows, rich saturated colors. ACTION TIMELINE (8 seconds): 0–2.5 s: Senbi and the bride dance joyfully in the center of the courtyard, fists pumping, eyes closed, big laughing smiles; guests at the tables clap, one plays a reed flute, another beats a frame drum; the dark figures stand perfectly still in the gate behind them. 2.5–5.5 s: the dance continues, the couple's joy growing. 5.5–8 s: the camera has drifted closer so the laughing couple fills the frame in a medium close-up, Senbi's fist raised, the bride's arms up; the figures remain still in the background. Camera: eye-level, starts as a medium-wide shot and makes one slow, smooth push-in toward the couple, ending in a medium close-up; no tilt, no pan, no rising camera. Audio: voice-over narration only (a voice, never shown on screen; no narrator character appears): a British male voice, warm and dry, begins speaking within half a second and says: “Senbi had planned everything for his wedding. Everything except the Roman army.” Say the first sentence warmly, pause briefly, then say the second sentence dryly and deadpan. The line takes about 5.2 seconds; leave the last second free of speech. Music: light ancient-Mediterranean wedding music (frame drums, reed flute, plucked strings), cheerful, low under the voice. Sound effects: clapping, cups clinking, cheers without words, timed to the action. Ambience: light courtyard ambience: footsteps on stone, a soft breeze, no words. Final reminder: no character says any word; only the voice-over narration speaks (voice only, nobody on screen is the narrator). Natural laughs, gasps and sighs are fine. No text, captions or logos in the frame.</w:t>
       </w:r>
     </w:p>
     <w:p>
@@ -626,7 +672,7 @@
           <w:sz w:val="20"/>
           <w:szCs w:val="20"/>
         </w:rPr>
-        <w:t xml:space="preserve">VOICE RULE: only the voice-over narration speaks words; it is a voice only, never a person or character on screen. No character says any word and no one on screen lip-syncs to speech; characters communicate with facial expressions and body gestures. Natural non-verbal sounds are allowed and should sound real: laughing, giggling, gasping, sighing, groaning, cheering, coughing. Attached reference images, in order: the wedding courtyard, the Egyptian wedding guests. 2D hand-drawn stickman cartoon in the exact style of the reference images: thin black outlines, large expressive heads, thin stick arms, flat warm colors, playful documentary-comedy tone, 16:9. Characters, identical in every frame: the guests: Egyptian wedding guests in white linen with blue-and-gold collars and gold headbands, black bob hairstyles, some in white striped headdresses. Setting: sunny daytime wedding courtyard in ancient Alexandria, sandstone columns with painted blue-and-gold bands, long tables with white cloths and clay jars, orange cloth awnings, and a tall wooden entrance gate at the back-center that opens onto the street. Lighting: warm bright afternoon sunlight, soft shadows, rich saturated colors. ACTION TIMELINE (8 seconds): 0–2 s: guests dance joyfully in the middle of the courtyard, clapping and spinning, kilts and dresses swinging, big happy smiles. 2–3 s: every dancer freezes for half a beat mid-step, smiles still on their faces. 3–5.5 s: one guest slowly turns his head toward the tall gate at the back with a puzzled, alert face while the others unfreeze and keep dancing, unaware. 5.5–8 s: the guest keeps staring at the gate, brow furrowed, then slowly looks back and shrugs it off with a small smile. Camera: locked-off and perfectly still, eye-level medium-wide shot, the dancers fully visible from feet to heads (NOT a feet close-up); the framing never changes (no tilt, pan, zoom or rising camera). Audio: voice-over narration only (a voice, never shown on screen; no narrator character appears): a British male voice, warm and dry, begins speaking within half a second and says: “Then, for half a beat, the dancing stopped. Nobody noticed. Except one guest.” The line takes about 5.2 seconds; leave the last second free of speech so the moment can land. Music: light ancient-Mediterranean wedding music (frame drums, reed flute, plucked strings) with a faint uneasy undertone, same theme in every clip, low under the voice. Sound effects: dancing feet on stone, one tiny pause, faint distant thump, timed to the action. Ambience: light courtyard ambience: clinking cups, footsteps on stone, a soft breeze, no words. Final reminder: no character says any word; only the voice-over narration speaks (voice only, nobody on screen is the narrator). Natural laughs, gasps and sighs are fine. No text, captions or logos in the frame.</w:t>
+        <w:t xml:space="preserve">VOICE RULE: only the voice-over narration speaks words; it is a voice only, never a person or character on screen. No character says any word and no one on screen lip-syncs to speech; characters communicate with facial expressions and body gestures. Natural non-verbal sounds are allowed and should sound real: laughing, giggling, gasping, sighing, groaning, cheering, coughing. Attached reference images, in order: the wedding courtyard, the Egyptian wedding guests. 2D hand-drawn stickman cartoon in the exact style of the reference images: thin black outlines, large expressive heads, thin stick arms, flat warm colors, playful documentary-comedy tone, 16:9. Characters, identical in every frame: the guests: Egyptian wedding guests in white linen with blue-and-gold collars and gold headbands, black bob hairstyles, some in white striped headdresses. They wear only short white kilts or simple white dresses: no togas, no draped robes. Setting: sunny daytime ancient Egyptian wedding courtyard in Alexandria: flat-roofed sandstone mud-brick buildings, tall Egyptian columns with lotus-bud capitals painted in blue-and-gold bands, hieroglyph-style carvings on the walls, long tables with white cloths and clay jars, orange cloth awnings, and a tall wooden entrance gate at the back-center that opens onto the street. Egyptian architecture only: no Greek or Roman architecture, no triangular pediments, no domes, no red tile roofs, no cypress trees. Lighting: warm bright afternoon sunlight, soft shadows, rich saturated colors. ACTION TIMELINE (8 seconds): 0–2 s: guests dance joyfully in the middle of the courtyard, clapping and spinning, kilts and dresses swinging, big happy smiles. 2–3 s: every dancer freezes for half a beat mid-step, smiles still on their faces. 3–5.5 s: one guest slowly turns his head toward the tall gate at the back with a puzzled, alert face while the others unfreeze and keep dancing, unaware. 5.5–8 s: the guest keeps staring at the gate, brow furrowed, then slowly looks back and shrugs it off with a small smile. Camera: locked-off and perfectly still, eye-level medium-wide shot, the dancers fully visible from feet to heads (NOT a feet close-up); the framing never changes (no tilt, pan, zoom or rising camera). Audio: voice-over narration only (a voice, never shown on screen; no narrator character appears): a British male voice, warm and dry, begins speaking within half a second and says: “Then, for half a beat, the dancing stopped. Nobody noticed. Except one guest.” The line takes about 5.2 seconds; leave the last second free of speech so the moment can land. Music: light ancient-Mediterranean wedding music (frame drums, reed flute, plucked strings) with a faint uneasy undertone, same theme in every clip, low under the voice. Sound effects: dancing feet on stone, one tiny pause, faint distant thump, timed to the action. Ambience: light courtyard ambience: clinking cups, footsteps on stone, a soft breeze, no words. Final reminder: no character says any word; only the voice-over narration speaks (voice only, nobody on screen is the narrator). Natural laughs, gasps and sighs are fine. No text, captions or logos in the frame.</w:t>
       </w:r>
     </w:p>
     <w:p>
@@ -772,7 +818,7 @@
           <w:sz w:val="20"/>
           <w:szCs w:val="20"/>
         </w:rPr>
-        <w:t xml:space="preserve">VOICE RULE: only the voice-over narration speaks words; it is a voice only, never a person or character on screen. No character says any word and no one on screen lip-syncs to speech; characters communicate with facial expressions and body gestures. Natural non-verbal sounds are allowed and should sound real: laughing, giggling, gasping, sighing, groaning, cheering, coughing. Attached reference images, in order: the wedding courtyard. 2D hand-drawn stickman cartoon in the exact style of the reference images: thin black outlines, large expressive heads, thin stick arms, flat warm colors, playful documentary-comedy tone, 16:9. Characters, identical in every frame: Senbi the groom: young man, straight black bowl-cut hair with bangs, gold headband with a gold cobra, bare chest, blue-and-gold broad collar, gold bracers, white kilt with a blue-and-gold sash, brown sandals, thin black stick arms. the bride: black bob hair with straight bangs, gold headband with a red gem, white dress, blue-and-gold collar, gold sash, gold arm cuffs, light veil. the guests: Egyptian wedding guests in white linen with blue-and-gold collars and gold headbands, black bob hairstyles, some in white striped headdresses. Setting: sunny daytime wedding courtyard in ancient Alexandria, sandstone columns with painted blue-and-gold bands, long tables with white cloths and clay jars, orange cloth awnings, and a tall wooden entrance gate at the back-center that opens onto the street. Lighting: warm bright afternoon sunlight, soft shadows, rich saturated colors. ACTION TIMELINE (8 seconds): 0–2.5 s: guests dance and clap in a cheerful rhythm, Senbi and the bride dance together in the center, beaming. 2.5–5.5 s: a guest raises a clay cup in a toast and the others clap along; everything looks perfectly normal. 5.5–8 s: the happy scene holds; a little dust floats in the sunlight. Camera: locked-off and perfectly still, eye-level medium-wide shot of the wedding courtyard; the framing never changes (no tilt, pan, zoom or rising camera). Audio: voice-over narration only (a voice, never shown on screen; no narrator character appears): a British male voice, warm and dry, begins speaking within half a second and says: ““Last day of Ancient Egypt”? Relax. Egypt survived. Its queen, less so.” The line takes about 4.8 seconds; leave the last second free of speech so the moment can land. Music: light ancient-Mediterranean wedding music (frame drums, reed flute, plucked strings), same theme in every clip, low under the voice. Sound effects: wedding crowd reactions without any words, one short comic sting, timed to the action. Ambience: light courtyard ambience: clinking cups, footsteps on stone, a soft breeze, no words. Final reminder: no character says any word; only the voice-over narration speaks (voice only, nobody on screen is the narrator). Natural laughs, gasps and sighs are fine. No text, captions or logos in the frame.</w:t>
+        <w:t xml:space="preserve">VOICE RULE: only the voice-over narration speaks words; it is a voice only, never a person or character on screen. No character says any word and no one on screen lip-syncs to speech; characters communicate with facial expressions and body gestures. Natural non-verbal sounds are allowed and should sound real: laughing, giggling, gasping, sighing, groaning, cheering, coughing. Attached reference images, in order: the wedding courtyard. 2D hand-drawn stickman cartoon in the exact style of the reference images: thin black outlines, large expressive heads, thin stick arms, flat warm colors, playful documentary-comedy tone, 16:9. Characters, identical in every frame: Senbi the groom: young man, straight black bowl-cut hair with bangs, gold headband with a gold cobra, bare chest, blue-and-gold broad collar, gold bracers, white kilt with a blue-and-gold sash, brown sandals, thin black stick arms. the bride: black bob hair with straight bangs, gold headband with a red gem, white dress, blue-and-gold collar, gold sash, gold arm cuffs, light veil. the guests: Egyptian wedding guests in white linen with blue-and-gold collars and gold headbands, black bob hairstyles, some in white striped headdresses. They wear only short white kilts or simple white dresses: no togas, no draped robes. Setting: sunny daytime ancient Egyptian wedding courtyard in Alexandria: flat-roofed sandstone mud-brick buildings, tall Egyptian columns with lotus-bud capitals painted in blue-and-gold bands, hieroglyph-style carvings on the walls, long tables with white cloths and clay jars, orange cloth awnings, and a tall wooden entrance gate at the back-center that opens onto the street. Egyptian architecture only: no Greek or Roman architecture, no triangular pediments, no domes, no red tile roofs, no cypress trees. Lighting: warm bright afternoon sunlight, soft shadows, rich saturated colors. ACTION TIMELINE (8 seconds): 0–2.5 s: guests dance and clap in a cheerful rhythm, Senbi and the bride dance together in the center, beaming. 2.5–5.5 s: a guest raises a clay cup in a toast and the others clap along; everything looks perfectly normal. 5.5–8 s: the happy scene holds; a little dust floats in the sunlight. Camera: locked-off and perfectly still, eye-level medium-wide shot of the wedding courtyard; the framing never changes (no tilt, pan, zoom or rising camera). Audio: voice-over narration only (a voice, never shown on screen; no narrator character appears): a British male voice, warm and dry, begins speaking within half a second and says: ““Last day of Ancient Egypt”? Relax. Egypt survived. Its queen, less so.” The line takes about 4.8 seconds; leave the last second free of speech so the moment can land. Music: light ancient-Mediterranean wedding music (frame drums, reed flute, plucked strings), same theme in every clip, low under the voice. Sound effects: wedding crowd reactions without any words, one short comic sting, timed to the action. Ambience: light courtyard ambience: clinking cups, footsteps on stone, a soft breeze, no words. Final reminder: no character says any word; only the voice-over narration speaks (voice only, nobody on screen is the narrator). Natural laughs, gasps and sighs are fine. No text, captions or logos in the frame.</w:t>
       </w:r>
     </w:p>
     <w:p>
@@ -1064,7 +1110,7 @@
           <w:sz w:val="20"/>
           <w:szCs w:val="20"/>
         </w:rPr>
-        <w:t xml:space="preserve">VOICE RULE: only the voice-over narration speaks words; it is a voice only, never a person or character on screen. No character says any word and no one on screen lip-syncs to speech; characters communicate with facial expressions and body gestures. Natural non-verbal sounds are allowed and should sound real: laughing, giggling, gasping, sighing, groaning, cheering, coughing. Attached reference images, in order: the Egyptian wedding guests, the wedding courtyard. 2D hand-drawn stickman cartoon in the exact style of the reference images: thin black outlines, large expressive heads, thin stick arms, flat warm colors, playful documentary-comedy tone, 16:9. Characters, identical in every frame: the guests: Egyptian wedding guests in white linen with blue-and-gold collars and gold headbands, black bob hairstyles, some in white striped headdresses. the older woman: middle-aged woman in white linen with a red-orange sash. Setting: sunny daytime wedding courtyard in ancient Alexandria, sandstone columns with painted blue-and-gold bands, long tables with white cloths and clay jars, orange cloth awnings, and a tall wooden entrance gate at the back-center that opens onto the street. Lighting: warm bright afternoon sunlight, soft shadows, rich saturated colors. ACTION TIMELINE (8 seconds): 0–2.5 s: guests seated on both sides of the long table eat happily and pass bowls of figs, dates and flatbread. 2.5–5.5 s: at the far end one guest tiptoes up, grabs a fig and hides it behind his back with an innocent face. 5.5–8 s: an unimpressed older woman beside him turns, crosses her arms and gives him a flat stare; he freezes with wide eyes. Camera: locked-off and perfectly still, eye-level wide-medium shot of the whole feast table; the sneaky guest stays in frame; the framing never changes (no tilt, pan, zoom or rising camera). Audio: voice-over narration only (a voice, never shown on screen; no narrator character appears): a British male voice, warm and dry, begins speaking within half a second and says: “Bread, figs, roast goose, and beer, basically a food group. Someone was stealing.” The line takes about 5.2 seconds; leave the last second free of speech so the moment can land. Music: light ancient-Mediterranean wedding music (frame drums, reed flute, plucked strings), same theme in every clip, low under the voice. Sound effects: plates, cups, cheerful ambience, no words, timed to the action. Ambience: light courtyard ambience: clinking cups, footsteps on stone, a soft breeze, no words. Final reminder: no character says any word; only the voice-over narration speaks (voice only, nobody on screen is the narrator). Natural laughs, gasps and sighs are fine. No text, captions or logos in the frame.</w:t>
+        <w:t xml:space="preserve">VOICE RULE: only the voice-over narration speaks words; it is a voice only, never a person or character on screen. No character says any word and no one on screen lip-syncs to speech; characters communicate with facial expressions and body gestures. Natural non-verbal sounds are allowed and should sound real: laughing, giggling, gasping, sighing, groaning, cheering, coughing. Attached reference images, in order: the Egyptian wedding guests, the wedding courtyard. 2D hand-drawn stickman cartoon in the exact style of the reference images: thin black outlines, large expressive heads, thin stick arms, flat warm colors, playful documentary-comedy tone, 16:9. Characters, identical in every frame: the guests: Egyptian wedding guests in white linen with blue-and-gold collars and gold headbands, black bob hairstyles, some in white striped headdresses. They wear only short white kilts or simple white dresses: no togas, no draped robes. the older woman: middle-aged woman in white linen with a red-orange sash. Setting: sunny daytime ancient Egyptian wedding courtyard in Alexandria: flat-roofed sandstone mud-brick buildings, tall Egyptian columns with lotus-bud capitals painted in blue-and-gold bands, hieroglyph-style carvings on the walls, long tables with white cloths and clay jars, orange cloth awnings, and a tall wooden entrance gate at the back-center that opens onto the street. Egyptian architecture only: no Greek or Roman architecture, no triangular pediments, no domes, no red tile roofs, no cypress trees. Lighting: warm bright afternoon sunlight, soft shadows, rich saturated colors. ACTION TIMELINE (8 seconds): 0–2.5 s: guests seated on both sides of the long table eat happily and pass bowls of figs, dates and flatbread. 2.5–5.5 s: at the far end one guest tiptoes up, grabs a fig and hides it behind his back with an innocent face. 5.5–8 s: an unimpressed older woman beside him turns, crosses her arms and gives him a flat stare; he freezes with wide eyes. Camera: locked-off and perfectly still, eye-level wide-medium shot of the whole feast table; the sneaky guest stays in frame; the framing never changes (no tilt, pan, zoom or rising camera). Audio: voice-over narration only (a voice, never shown on screen; no narrator character appears): a British male voice, warm and dry, begins speaking within half a second and says: “Bread, figs, roast goose, and beer, basically a food group. Someone was stealing.” The line takes about 5.2 seconds; leave the last second free of speech so the moment can land. Music: light ancient-Mediterranean wedding music (frame drums, reed flute, plucked strings), same theme in every clip, low under the voice. Sound effects: plates, cups, cheerful ambience, no words, timed to the action. Ambience: light courtyard ambience: clinking cups, footsteps on stone, a soft breeze, no words. Final reminder: no character says any word; only the voice-over narration speaks (voice only, nobody on screen is the narrator). Natural laughs, gasps and sighs are fine. No text, captions or logos in the frame.</w:t>
       </w:r>
     </w:p>
     <w:p>
@@ -1137,7 +1183,7 @@
           <w:sz w:val="20"/>
           <w:szCs w:val="20"/>
         </w:rPr>
-        <w:t xml:space="preserve">VOICE RULE: only the voice-over narration speaks words; it is a voice only, never a person or character on screen. No character says any word and no one on screen lip-syncs to speech; characters communicate with facial expressions and body gestures. Natural non-verbal sounds are allowed and should sound real: laughing, giggling, gasping, sighing, groaning, cheering, coughing. Attached reference images, in order: the black cat, the wedding courtyard. 2D hand-drawn stickman cartoon in the exact style of the reference images: thin black outlines, large expressive heads, thin stick arms, flat warm colors, playful documentary-comedy tone, 16:9. Characters, identical in every frame: the cat: black with a small gold collar. the guests: Egyptian wedding guests in white linen with blue-and-gold collars and gold headbands, black bob hairstyles, some in white striped headdresses. Setting: sunny daytime wedding courtyard in ancient Alexandria, sandstone columns with painted blue-and-gold bands, long tables with white cloths and clay jars, orange cloth awnings, and a tall wooden entrance gate at the back-center that opens onto the street. Lighting: warm bright afternoon sunlight, soft shadows, rich saturated colors. ACTION TIMELINE (8 seconds): 0–2.5 s: the black cat sits upright on a red cushion at the head of the feast table, tail curled, gold collar glinting. 2.5–5.5 s: a guest approaches and bows deeply, almost to the floor, with great ceremony. 5.5–8 s: the cat looks away, lifts a paw and licks it; the guest stays bowed, then peeks up hopefully. Camera: locked-off and perfectly still, eye-level medium shot with the cat and the bowing guest both in frame; the framing never changes (no tilt, pan, zoom or rising camera). Audio: voice-over narration only (a voice, never shown on screen; no narrator character appears): a British male voice, warm and dry, begins speaking within half a second and says: “Egyptians adored cats. This one knew it. A guest bowed. The cat shrugged.” The line takes about 5.2 seconds; leave the last second free of speech so the moment can land. Music: playful comic percussion over the wedding rhythm, low under the voice. Sound effects: tiny comic sting, soft cat purr, timed to the action. Ambience: light courtyard ambience: clinking cups, footsteps on stone, a soft breeze, no words. Final reminder: no character says any word; only the voice-over narration speaks (voice only, nobody on screen is the narrator). Natural laughs, gasps and sighs are fine. No text, captions or logos in the frame.</w:t>
+        <w:t xml:space="preserve">VOICE RULE: only the voice-over narration speaks words; it is a voice only, never a person or character on screen. No character says any word and no one on screen lip-syncs to speech; characters communicate with facial expressions and body gestures. Natural non-verbal sounds are allowed and should sound real: laughing, giggling, gasping, sighing, groaning, cheering, coughing. Attached reference images, in order: the black cat, the wedding courtyard. 2D hand-drawn stickman cartoon in the exact style of the reference images: thin black outlines, large expressive heads, thin stick arms, flat warm colors, playful documentary-comedy tone, 16:9. Characters, identical in every frame: the cat: black with a small gold collar. the guests: Egyptian wedding guests in white linen with blue-and-gold collars and gold headbands, black bob hairstyles, some in white striped headdresses. They wear only short white kilts or simple white dresses: no togas, no draped robes. Setting: sunny daytime ancient Egyptian wedding courtyard in Alexandria: flat-roofed sandstone mud-brick buildings, tall Egyptian columns with lotus-bud capitals painted in blue-and-gold bands, hieroglyph-style carvings on the walls, long tables with white cloths and clay jars, orange cloth awnings, and a tall wooden entrance gate at the back-center that opens onto the street. Egyptian architecture only: no Greek or Roman architecture, no triangular pediments, no domes, no red tile roofs, no cypress trees. Lighting: warm bright afternoon sunlight, soft shadows, rich saturated colors. ACTION TIMELINE (8 seconds): 0–2.5 s: the black cat sits upright on a red cushion at the head of the feast table, tail curled, gold collar glinting. 2.5–5.5 s: a guest approaches and bows deeply, almost to the floor, with great ceremony. 5.5–8 s: the cat looks away, lifts a paw and licks it; the guest stays bowed, then peeks up hopefully. Camera: locked-off and perfectly still, eye-level medium shot with the cat and the bowing guest both in frame; the framing never changes (no tilt, pan, zoom or rising camera). Audio: voice-over narration only (a voice, never shown on screen; no narrator character appears): a British male voice, warm and dry, begins speaking within half a second and says: “Egyptians adored cats. This one knew it. A guest bowed. The cat shrugged.” The line takes about 5.2 seconds; leave the last second free of speech so the moment can land. Music: playful comic percussion over the wedding rhythm, low under the voice. Sound effects: tiny comic sting, soft cat purr, timed to the action. Ambience: light courtyard ambience: clinking cups, footsteps on stone, a soft breeze, no words. Final reminder: no character says any word; only the voice-over narration speaks (voice only, nobody on screen is the narrator). Natural laughs, gasps and sighs are fine. No text, captions or logos in the frame.</w:t>
       </w:r>
     </w:p>
     <w:p>
@@ -1210,7 +1256,7 @@
           <w:sz w:val="20"/>
           <w:szCs w:val="20"/>
         </w:rPr>
-        <w:t xml:space="preserve">VOICE RULE: only the voice-over narration speaks words; it is a voice only, never a person or character on screen. No character says any word and no one on screen lip-syncs to speech; characters communicate with facial expressions and body gestures. Natural non-verbal sounds are allowed and should sound real: laughing, giggling, gasping, sighing, groaning, cheering, coughing. Attached reference images, in order: Senbi, the groom, the wedding courtyard. 2D hand-drawn stickman cartoon in the exact style of the reference images: thin black outlines, large expressive heads, thin stick arms, flat warm colors, playful documentary-comedy tone, 16:9. Characters, identical in every frame: Senbi the groom: young man, straight black bowl-cut hair with bangs, gold headband with a gold cobra, bare chest, blue-and-gold broad collar, gold bracers, white kilt with a blue-and-gold sash, brown sandals, thin black stick arms. Setting: sunny daytime wedding courtyard in ancient Alexandria, sandstone columns with painted blue-and-gold bands, long tables with white cloths and clay jars, orange cloth awnings, and a tall wooden entrance gate at the back-center that opens onto the street. Lighting: warm bright afternoon sunlight, soft shadows, rich saturated colors. ACTION TIMELINE (8 seconds): 0–2.5 s: Senbi dances with huge confidence, big arm swings, chin up. 2.5–5.5 s: he loses his balance, arms windmilling, one foot wobbling. 5.5–8 s: he snaps upright and freezes in a proud pose with one arm raised as if the stumble was choreography; his eyes slide sideways to check whether anyone saw. Camera: locked-off and perfectly still, eye-level medium shot of Senbi, full body in frame; the framing never changes (no tilt, pan, zoom or rising camera). Audio: voice-over narration only (a voice, never shown on screen; no narrator character appears): a British male voice, warm and dry, begins speaking within half a second and says: “Senbi nearly fell, recovered, and pretended that was the choreography. Nobody believed him.” The line takes about 5.2 seconds; leave the last second free of speech so the moment can land. Music: playful comic percussion over the wedding rhythm, low under the voice. Sound effects: foot scuff, comic wobble, laughter, timed to the action. Ambience: light courtyard ambience: clinking cups, footsteps on stone, a soft breeze, no words. Final reminder: no character says any word; only the voice-over narration speaks (voice only, nobody on screen is the narrator). Natural laughs, gasps and sighs are fine. No text, captions or logos in the frame.</w:t>
+        <w:t xml:space="preserve">VOICE RULE: only the voice-over narration speaks words; it is a voice only, never a person or character on screen. No character says any word and no one on screen lip-syncs to speech; characters communicate with facial expressions and body gestures. Natural non-verbal sounds are allowed and should sound real: laughing, giggling, gasping, sighing, groaning, cheering, coughing. Attached reference images, in order: Senbi, the groom, the wedding courtyard. 2D hand-drawn stickman cartoon in the exact style of the reference images: thin black outlines, large expressive heads, thin stick arms, flat warm colors, playful documentary-comedy tone, 16:9. Characters, identical in every frame: Senbi the groom: young man, straight black bowl-cut hair with bangs, gold headband with a gold cobra, bare chest, blue-and-gold broad collar, gold bracers, white kilt with a blue-and-gold sash, brown sandals, thin black stick arms. Setting: sunny daytime ancient Egyptian wedding courtyard in Alexandria: flat-roofed sandstone mud-brick buildings, tall Egyptian columns with lotus-bud capitals painted in blue-and-gold bands, hieroglyph-style carvings on the walls, long tables with white cloths and clay jars, orange cloth awnings, and a tall wooden entrance gate at the back-center that opens onto the street. Egyptian architecture only: no Greek or Roman architecture, no triangular pediments, no domes, no red tile roofs, no cypress trees. Lighting: warm bright afternoon sunlight, soft shadows, rich saturated colors. ACTION TIMELINE (8 seconds): 0–2.5 s: Senbi dances with huge confidence, big arm swings, chin up. 2.5–5.5 s: he loses his balance, arms windmilling, one foot wobbling. 5.5–8 s: he snaps upright and freezes in a proud pose with one arm raised as if the stumble was choreography; his eyes slide sideways to check whether anyone saw. Camera: locked-off and perfectly still, eye-level medium shot of Senbi, full body in frame; the framing never changes (no tilt, pan, zoom or rising camera). Audio: voice-over narration only (a voice, never shown on screen; no narrator character appears): a British male voice, warm and dry, begins speaking within half a second and says: “Senbi nearly fell, recovered, and pretended that was the choreography. Nobody believed him.” The line takes about 5.2 seconds; leave the last second free of speech so the moment can land. Music: playful comic percussion over the wedding rhythm, low under the voice. Sound effects: foot scuff, comic wobble, laughter, timed to the action. Ambience: light courtyard ambience: clinking cups, footsteps on stone, a soft breeze, no words. Final reminder: no character says any word; only the voice-over narration speaks (voice only, nobody on screen is the narrator). Natural laughs, gasps and sighs are fine. No text, captions or logos in the frame.</w:t>
       </w:r>
     </w:p>
     <w:p>
@@ -1283,7 +1329,7 @@
           <w:sz w:val="20"/>
           <w:szCs w:val="20"/>
         </w:rPr>
-        <w:t xml:space="preserve">VOICE RULE: only the voice-over narration speaks words; it is a voice only, never a person or character on screen. No character says any word and no one on screen lip-syncs to speech; characters communicate with facial expressions and body gestures. Natural non-verbal sounds are allowed and should sound real: laughing, giggling, gasping, sighing, groaning, cheering, coughing. Attached reference images, in order: the bride, the wedding courtyard. 2D hand-drawn stickman cartoon in the exact style of the reference images: thin black outlines, large expressive heads, thin stick arms, flat warm colors, playful documentary-comedy tone, 16:9. Characters, identical in every frame: the bride: black bob hair with straight bangs, gold headband with a red gem, white dress, blue-and-gold collar, gold sash, gold arm cuffs, light veil. Setting: sunny daytime wedding courtyard in ancient Alexandria, sandstone columns with painted blue-and-gold bands, long tables with white cloths and clay jars, orange cloth awnings, and a tall wooden entrance gate at the back-center that opens onto the street. Lighting: warm bright afternoon sunlight, soft shadows, rich saturated colors. ACTION TIMELINE (8 seconds): 0–2.5 s: the bride watches, amused, with sparkling eyes. 2.5–5.5 s: she presses her lips together to look composed while her shoulders start to shake. 5.5–8 s: she raises a hand and hides her smile behind it, eyes crinkled, and a small suppressed giggle escapes. Camera: locked-off and perfectly still, eye-level close-up of the bride's face; the framing never changes (no tilt, pan, zoom or rising camera). Audio: voice-over narration only (a voice, never shown on screen; no narrator character appears): a British male voice, warm and dry, begins speaking within half a second and says: “His bride was trying very hard not to laugh. She loved him. Mostly.” The line takes about 5.2 seconds; leave the last second free of speech so the moment can land. Music: light ancient-Mediterranean wedding music (frame drums, reed flute, plucked strings), same theme in every clip, low under the voice. Sound effects: suppressed giggle, timed to the action. Ambience: light courtyard ambience: clinking cups, footsteps on stone, a soft breeze, no words. Final reminder: no character says any word; only the voice-over narration speaks (voice only, nobody on screen is the narrator). Natural laughs, gasps and sighs are fine. No text, captions or logos in the frame.</w:t>
+        <w:t xml:space="preserve">VOICE RULE: only the voice-over narration speaks words; it is a voice only, never a person or character on screen. No character says any word and no one on screen lip-syncs to speech; characters communicate with facial expressions and body gestures. Natural non-verbal sounds are allowed and should sound real: laughing, giggling, gasping, sighing, groaning, cheering, coughing. Attached reference images, in order: the bride, the wedding courtyard. 2D hand-drawn stickman cartoon in the exact style of the reference images: thin black outlines, large expressive heads, thin stick arms, flat warm colors, playful documentary-comedy tone, 16:9. Characters, identical in every frame: the bride: black bob hair with straight bangs, gold headband with a red gem, white dress, blue-and-gold collar, gold sash, gold arm cuffs, light veil. Setting: sunny daytime ancient Egyptian wedding courtyard in Alexandria: flat-roofed sandstone mud-brick buildings, tall Egyptian columns with lotus-bud capitals painted in blue-and-gold bands, hieroglyph-style carvings on the walls, long tables with white cloths and clay jars, orange cloth awnings, and a tall wooden entrance gate at the back-center that opens onto the street. Egyptian architecture only: no Greek or Roman architecture, no triangular pediments, no domes, no red tile roofs, no cypress trees. Lighting: warm bright afternoon sunlight, soft shadows, rich saturated colors. ACTION TIMELINE (8 seconds): 0–2.5 s: the bride watches, amused, with sparkling eyes. 2.5–5.5 s: she presses her lips together to look composed while her shoulders start to shake. 5.5–8 s: she raises a hand and hides her smile behind it, eyes crinkled, and a small suppressed giggle escapes. Camera: locked-off and perfectly still, eye-level close-up of the bride's face; the framing never changes (no tilt, pan, zoom or rising camera). Audio: voice-over narration only (a voice, never shown on screen; no narrator character appears): a British male voice, warm and dry, begins speaking within half a second and says: “His bride was trying very hard not to laugh. She loved him. Mostly.” The line takes about 5.2 seconds; leave the last second free of speech so the moment can land. Music: light ancient-Mediterranean wedding music (frame drums, reed flute, plucked strings), same theme in every clip, low under the voice. Sound effects: suppressed giggle, timed to the action. Ambience: light courtyard ambience: clinking cups, footsteps on stone, a soft breeze, no words. Final reminder: no character says any word; only the voice-over narration speaks (voice only, nobody on screen is the narrator). Natural laughs, gasps and sighs are fine. No text, captions or logos in the frame.</w:t>
       </w:r>
     </w:p>
     <w:p>
@@ -1373,7 +1419,7 @@
           <w:sz w:val="20"/>
           <w:szCs w:val="20"/>
         </w:rPr>
-        <w:t xml:space="preserve">VOICE RULE: only the voice-over narration speaks words; it is a voice only, never a person or character on screen. No character says any word and no one on screen lip-syncs to speech; characters communicate with facial expressions and body gestures. Natural non-verbal sounds are allowed and should sound real: laughing, giggling, gasping, sighing, groaning, cheering, coughing. Attached reference images, in order: the Egyptian wedding guests, the wedding courtyard. 2D hand-drawn stickman cartoon in the exact style of the reference images: thin black outlines, large expressive heads, thin stick arms, flat warm colors, playful documentary-comedy tone, 16:9. Characters, identical in every frame: the older woman: middle-aged woman in white linen with a red-orange sash. Setting: sunny daytime wedding courtyard in ancient Alexandria, sandstone columns with painted blue-and-gold bands, long tables with white cloths and clay jars, orange cloth awnings, and a tall wooden entrance gate at the back-center that opens onto the street. Lighting: warm bright afternoon sunlight, soft shadows, rich saturated colors. ACTION TIMELINE (8 seconds): 0–2.5 s: an older woman at the feast table lifts a spoonful from a dish and inspects it with exaggerated seriousness, squinting. 2.5–5.5 s: she tastes it and chews slowly, eyes narrowed. 5.5–8 s: after a long pause she gives a reluctant nod, lips pursed, as if grudgingly approving. Camera: locked-off and perfectly still, eye-level close-up of the woman's face and the dish; the framing never changes (no tilt, pan, zoom or rising camera). Audio: voice-over narration only (a voice, never shown on screen; no narrator character appears): a British male voice, warm and dry, begins speaking within half a second and says: “One aunt inspected the food like a tax auditor. Verdict: suspicious, but edible.” The line takes about 5.2 seconds; leave the last second free of speech so the moment can land. Music: playful comic percussion over the wedding rhythm, low under the voice. Sound effects: spoon tapping a bowl, suspicious hum, timed to the action. Ambience: light courtyard ambience: clinking cups, footsteps on stone, a soft breeze, no words. Final reminder: no character says any word; only the voice-over narration speaks (voice only, nobody on screen is the narrator). Natural laughs, gasps and sighs are fine. No text, captions or logos in the frame.</w:t>
+        <w:t xml:space="preserve">VOICE RULE: only the voice-over narration speaks words; it is a voice only, never a person or character on screen. No character says any word and no one on screen lip-syncs to speech; characters communicate with facial expressions and body gestures. Natural non-verbal sounds are allowed and should sound real: laughing, giggling, gasping, sighing, groaning, cheering, coughing. Attached reference images, in order: the Egyptian wedding guests, the wedding courtyard. 2D hand-drawn stickman cartoon in the exact style of the reference images: thin black outlines, large expressive heads, thin stick arms, flat warm colors, playful documentary-comedy tone, 16:9. Characters, identical in every frame: the older woman: middle-aged woman in white linen with a red-orange sash. Setting: sunny daytime ancient Egyptian wedding courtyard in Alexandria: flat-roofed sandstone mud-brick buildings, tall Egyptian columns with lotus-bud capitals painted in blue-and-gold bands, hieroglyph-style carvings on the walls, long tables with white cloths and clay jars, orange cloth awnings, and a tall wooden entrance gate at the back-center that opens onto the street. Egyptian architecture only: no Greek or Roman architecture, no triangular pediments, no domes, no red tile roofs, no cypress trees. Lighting: warm bright afternoon sunlight, soft shadows, rich saturated colors. ACTION TIMELINE (8 seconds): 0–2.5 s: an older woman at the feast table lifts a spoonful from a dish and inspects it with exaggerated seriousness, squinting. 2.5–5.5 s: she tastes it and chews slowly, eyes narrowed. 5.5–8 s: after a long pause she gives a reluctant nod, lips pursed, as if grudgingly approving. Camera: locked-off and perfectly still, eye-level close-up of the woman's face and the dish; the framing never changes (no tilt, pan, zoom or rising camera). Audio: voice-over narration only (a voice, never shown on screen; no narrator character appears): a British male voice, warm and dry, begins speaking within half a second and says: “One aunt inspected the food like a tax auditor. Verdict: suspicious, but edible.” The line takes about 5.2 seconds; leave the last second free of speech so the moment can land. Music: playful comic percussion over the wedding rhythm, low under the voice. Sound effects: spoon tapping a bowl, suspicious hum, timed to the action. Ambience: light courtyard ambience: clinking cups, footsteps on stone, a soft breeze, no words. Final reminder: no character says any word; only the voice-over narration speaks (voice only, nobody on screen is the narrator). Natural laughs, gasps and sighs are fine. No text, captions or logos in the frame.</w:t>
       </w:r>
     </w:p>
     <w:p>
@@ -1446,7 +1492,7 @@
           <w:sz w:val="20"/>
           <w:szCs w:val="20"/>
         </w:rPr>
-        <w:t xml:space="preserve">VOICE RULE: only the voice-over narration speaks words; it is a voice only, never a person or character on screen. No character says any word and no one on screen lip-syncs to speech; characters communicate with facial expressions and body gestures. Natural non-verbal sounds are allowed and should sound real: laughing, giggling, gasping, sighing, groaning, cheering, coughing. Attached reference images, in order: Senbi, the groom, the bride's relatives, the wedding courtyard. 2D hand-drawn stickman cartoon in the exact style of the reference images: thin black outlines, large expressive heads, thin stick arms, flat warm colors, playful documentary-comedy tone, 16:9. Characters, identical in every frame: the bride's father: bearded middle-aged man in a beige tunic with a purple sash. Senbi the groom: young man, straight black bowl-cut hair with bangs, gold headband with a gold cobra, bare chest, blue-and-gold broad collar, gold bracers, white kilt with a blue-and-gold sash, brown sandals, thin black stick arms. Setting: sunny daytime wedding courtyard in ancient Alexandria, sandstone columns with painted blue-and-gold bands, long tables with white cloths and clay jars, orange cloth awnings, and a tall wooden entrance gate at the back-center that opens onto the street. Lighting: warm bright afternoon sunlight, soft shadows, rich saturated colors. ACTION TIMELINE (8 seconds): 0–2.5 s: the bride's bearded father steps in, holding a carved wooden headrest proudly in both hands, beaming. 2.5–5.5 s: Senbi accepts it with a polite smile and a nod of thanks. 5.5–8 s: he glances down at the object, his smile tightens and his eyebrows lift in concern while the father keeps beaming. Camera: locked-off and perfectly still, eye-level medium two-shot of Senbi and the father; the framing never changes (no tilt, pan, zoom or rising camera). Audio: voice-over narration only (a voice, never shown on screen; no narrator character appears): a British male voice, warm and dry, begins speaking within half a second and says: “Then, the gift: a wooden headrest. Egyptians really did sleep on these.” The line takes about 4.8 seconds; leave the last second free of speech so the moment can land. Music: light ancient-Mediterranean wedding music (frame drums, reed flute, plucked strings), same theme in every clip, low under the voice. Sound effects: one wooden knock, timed to the action. Ambience: light courtyard ambience: clinking cups, footsteps on stone, a soft breeze, no words. Final reminder: no character says any word; only the voice-over narration speaks (voice only, nobody on screen is the narrator). Natural laughs, gasps and sighs are fine. No text, captions or logos in the frame.</w:t>
+        <w:t xml:space="preserve">VOICE RULE: only the voice-over narration speaks words; it is a voice only, never a person or character on screen. No character says any word and no one on screen lip-syncs to speech; characters communicate with facial expressions and body gestures. Natural non-verbal sounds are allowed and should sound real: laughing, giggling, gasping, sighing, groaning, cheering, coughing. Attached reference images, in order: Senbi, the groom, the bride's relatives, the wedding courtyard. 2D hand-drawn stickman cartoon in the exact style of the reference images: thin black outlines, large expressive heads, thin stick arms, flat warm colors, playful documentary-comedy tone, 16:9. Characters, identical in every frame: the bride's father: bearded middle-aged man in a beige tunic with a purple sash. Senbi the groom: young man, straight black bowl-cut hair with bangs, gold headband with a gold cobra, bare chest, blue-and-gold broad collar, gold bracers, white kilt with a blue-and-gold sash, brown sandals, thin black stick arms. Setting: sunny daytime ancient Egyptian wedding courtyard in Alexandria: flat-roofed sandstone mud-brick buildings, tall Egyptian columns with lotus-bud capitals painted in blue-and-gold bands, hieroglyph-style carvings on the walls, long tables with white cloths and clay jars, orange cloth awnings, and a tall wooden entrance gate at the back-center that opens onto the street. Egyptian architecture only: no Greek or Roman architecture, no triangular pediments, no domes, no red tile roofs, no cypress trees. Lighting: warm bright afternoon sunlight, soft shadows, rich saturated colors. ACTION TIMELINE (8 seconds): 0–2.5 s: the bride's bearded father steps in, holding a carved wooden headrest proudly in both hands, beaming. 2.5–5.5 s: Senbi accepts it with a polite smile and a nod of thanks. 5.5–8 s: he glances down at the object, his smile tightens and his eyebrows lift in concern while the father keeps beaming. Camera: locked-off and perfectly still, eye-level medium two-shot of Senbi and the father; the framing never changes (no tilt, pan, zoom or rising camera). Audio: voice-over narration only (a voice, never shown on screen; no narrator character appears): a British male voice, warm and dry, begins speaking within half a second and says: “Then, the gift: a wooden headrest. Egyptians really did sleep on these.” The line takes about 4.8 seconds; leave the last second free of speech so the moment can land. Music: light ancient-Mediterranean wedding music (frame drums, reed flute, plucked strings), same theme in every clip, low under the voice. Sound effects: one wooden knock, timed to the action. Ambience: light courtyard ambience: clinking cups, footsteps on stone, a soft breeze, no words. Final reminder: no character says any word; only the voice-over narration speaks (voice only, nobody on screen is the narrator). Natural laughs, gasps and sighs are fine. No text, captions or logos in the frame.</w:t>
       </w:r>
     </w:p>
     <w:p>
@@ -1519,7 +1565,7 @@
           <w:sz w:val="20"/>
           <w:szCs w:val="20"/>
         </w:rPr>
-        <w:t xml:space="preserve">VOICE RULE: only the voice-over narration speaks words; it is a voice only, never a person or character on screen. No character says any word and no one on screen lip-syncs to speech; characters communicate with facial expressions and body gestures. Natural non-verbal sounds are allowed and should sound real: laughing, giggling, gasping, sighing, groaning, cheering, coughing. Attached reference images, in order: Senbi, the groom. 2D hand-drawn stickman cartoon in the exact style of the reference images: thin black outlines, large expressive heads, thin stick arms, flat warm colors, playful documentary-comedy tone, 16:9. Characters, identical in every frame: Senbi the groom: young man, straight black bowl-cut hair with bangs, gold headband with a gold cobra, bare chest, blue-and-gold broad collar, gold bracers, white kilt with a blue-and-gold sash, brown sandals, thin black stick arms. Setting: sunny daytime wedding courtyard in ancient Alexandria, sandstone columns with painted blue-and-gold bands, long tables with white cloths and clay jars, orange cloth awnings, and a tall wooden entrance gate at the back-center that opens onto the street. Lighting: warm bright afternoon sunlight, soft shadows, rich saturated colors. ACTION TIMELINE (8 seconds): 0–2.5 s: Senbi sits on a reed mat and places the wooden headrest under his neck. 2.5–5.5 s: he lowers his head onto it and freezes, eyes wide, mouth a tight line, a bead of sweat on his temple. 5.5–8 s: he gives a stiff thumbs-up to someone off-screen, his forced smile trembling. Camera: locked-off and perfectly still, eye-level medium shot of Senbi with the headrest; the framing never changes (no tilt, pan, zoom or rising camera). Audio: voice-over narration only (a voice, never shown on screen; no narrator character appears): a British male voice, warm and dry, begins speaking within half a second and says: “Senbi lay down. His neck filed a formal complaint. His thumbs-up said otherwise.” The line takes about 5.2 seconds; leave the last second free of speech so the moment can land. Music: playful comic percussion over the wedding rhythm, low under the voice. Sound effects: comic wooden creak, timed to the action. Ambience: light courtyard ambience: clinking cups, footsteps on stone, a soft breeze, no words. Final reminder: no character says any word; only the voice-over narration speaks (voice only, nobody on screen is the narrator). Natural laughs, gasps and sighs are fine. No text, captions or logos in the frame.</w:t>
+        <w:t xml:space="preserve">VOICE RULE: only the voice-over narration speaks words; it is a voice only, never a person or character on screen. No character says any word and no one on screen lip-syncs to speech; characters communicate with facial expressions and body gestures. Natural non-verbal sounds are allowed and should sound real: laughing, giggling, gasping, sighing, groaning, cheering, coughing. Attached reference images, in order: Senbi, the groom. 2D hand-drawn stickman cartoon in the exact style of the reference images: thin black outlines, large expressive heads, thin stick arms, flat warm colors, playful documentary-comedy tone, 16:9. Characters, identical in every frame: Senbi the groom: young man, straight black bowl-cut hair with bangs, gold headband with a gold cobra, bare chest, blue-and-gold broad collar, gold bracers, white kilt with a blue-and-gold sash, brown sandals, thin black stick arms. Setting: sunny daytime ancient Egyptian wedding courtyard in Alexandria: flat-roofed sandstone mud-brick buildings, tall Egyptian columns with lotus-bud capitals painted in blue-and-gold bands, hieroglyph-style carvings on the walls, long tables with white cloths and clay jars, orange cloth awnings, and a tall wooden entrance gate at the back-center that opens onto the street. Egyptian architecture only: no Greek or Roman architecture, no triangular pediments, no domes, no red tile roofs, no cypress trees. Lighting: warm bright afternoon sunlight, soft shadows, rich saturated colors. ACTION TIMELINE (8 seconds): 0–2.5 s: Senbi sits on a reed mat and places the wooden headrest under his neck. 2.5–5.5 s: he lowers his head onto it and freezes, eyes wide, mouth a tight line, a bead of sweat on his temple. 5.5–8 s: he gives a stiff thumbs-up to someone off-screen, his forced smile trembling. Camera: locked-off and perfectly still, eye-level medium shot of Senbi with the headrest; the framing never changes (no tilt, pan, zoom or rising camera). Audio: voice-over narration only (a voice, never shown on screen; no narrator character appears): a British male voice, warm and dry, begins speaking within half a second and says: “Senbi lay down. His neck filed a formal complaint. His thumbs-up said otherwise.” The line takes about 5.2 seconds; leave the last second free of speech so the moment can land. Music: playful comic percussion over the wedding rhythm, low under the voice. Sound effects: comic wooden creak, timed to the action. Ambience: light courtyard ambience: clinking cups, footsteps on stone, a soft breeze, no words. Final reminder: no character says any word; only the voice-over narration speaks (voice only, nobody on screen is the narrator). Natural laughs, gasps and sighs are fine. No text, captions or logos in the frame.</w:t>
       </w:r>
     </w:p>
     <w:p>
@@ -1592,7 +1638,7 @@
           <w:sz w:val="20"/>
           <w:szCs w:val="20"/>
         </w:rPr>
-        <w:t xml:space="preserve">VOICE RULE: only the voice-over narration speaks words; it is a voice only, never a person or character on screen. No character says any word and no one on screen lip-syncs to speech; characters communicate with facial expressions and body gestures. Natural non-verbal sounds are allowed and should sound real: laughing, giggling, gasping, sighing, groaning, cheering, coughing. Attached reference images, in order: the Egyptian wedding guests, the bride, Senbi, the groom. 2D hand-drawn stickman cartoon in the exact style of the reference images: thin black outlines, large expressive heads, thin stick arms, flat warm colors, playful documentary-comedy tone, 16:9. Characters, identical in every frame: Senbi the groom: young man, straight black bowl-cut hair with bangs, gold headband with a gold cobra, bare chest, blue-and-gold broad collar, gold bracers, white kilt with a blue-and-gold sash, brown sandals, thin black stick arms. the bride: black bob hair with straight bangs, gold headband with a red gem, white dress, blue-and-gold collar, gold sash, gold arm cuffs, light veil. the guests: Egyptian wedding guests in white linen with blue-and-gold collars and gold headbands, black bob hairstyles, some in white striped headdresses. the musicians: guests in white linen playing harp, frame drum and reed flute. Setting: sunny daytime wedding courtyard in ancient Alexandria, sandstone columns with painted blue-and-gold bands, long tables with white cloths and clay jars, orange cloth awnings, and a tall wooden entrance gate at the back-center that opens onto the street. Lighting: warm bright afternoon sunlight, soft shadows, rich saturated colors. ACTION TIMELINE (8 seconds): 0–2.5 s: Senbi and the bride stand together at the center holding hands while musicians play and guests dance around them. 2.5–5.5 s: banners and flower garlands sway lightly in the breeze, couples spin, children run past. 5.5–8 s: Senbi and the bride exchange a loving look; everything is perfectly joyful. Camera: wide shot of the whole courtyard at eye level; fixed except for an almost imperceptible 5% slow push-in, no tilt or pan. Audio: voice-over narration only (a voice, never shown on screen; no narrator character appears): a British male voice, warm and dry, begins speaking within half a second and says: “For a few perfect minutes, everything was exactly right. Enjoy this part.” The line takes about 4.8 seconds; leave the last second free of speech so the moment can land. Music: light ancient-Mediterranean wedding music (frame drums, reed flute, plucked strings), same theme in every clip, low under the voice. Sound effects: applause, drums, wind in the banners, timed to the action. Ambience: light courtyard ambience: clinking cups, footsteps on stone, a soft breeze, no words. Final reminder: no character says any word; only the voice-over narration speaks (voice only, nobody on screen is the narrator). Natural laughs, gasps and sighs are fine. No text, captions or logos in the frame.</w:t>
+        <w:t xml:space="preserve">VOICE RULE: only the voice-over narration speaks words; it is a voice only, never a person or character on screen. No character says any word and no one on screen lip-syncs to speech; characters communicate with facial expressions and body gestures. Natural non-verbal sounds are allowed and should sound real: laughing, giggling, gasping, sighing, groaning, cheering, coughing. Attached reference images, in order: the Egyptian wedding guests, the bride, Senbi, the groom. 2D hand-drawn stickman cartoon in the exact style of the reference images: thin black outlines, large expressive heads, thin stick arms, flat warm colors, playful documentary-comedy tone, 16:9. Characters, identical in every frame: Senbi the groom: young man, straight black bowl-cut hair with bangs, gold headband with a gold cobra, bare chest, blue-and-gold broad collar, gold bracers, white kilt with a blue-and-gold sash, brown sandals, thin black stick arms. the bride: black bob hair with straight bangs, gold headband with a red gem, white dress, blue-and-gold collar, gold sash, gold arm cuffs, light veil. the guests: Egyptian wedding guests in white linen with blue-and-gold collars and gold headbands, black bob hairstyles, some in white striped headdresses. They wear only short white kilts or simple white dresses: no togas, no draped robes. the musicians: guests in white linen playing harp, frame drum and reed flute. Setting: sunny daytime ancient Egyptian wedding courtyard in Alexandria: flat-roofed sandstone mud-brick buildings, tall Egyptian columns with lotus-bud capitals painted in blue-and-gold bands, hieroglyph-style carvings on the walls, long tables with white cloths and clay jars, orange cloth awnings, and a tall wooden entrance gate at the back-center that opens onto the street. Egyptian architecture only: no Greek or Roman architecture, no triangular pediments, no domes, no red tile roofs, no cypress trees. Lighting: warm bright afternoon sunlight, soft shadows, rich saturated colors. ACTION TIMELINE (8 seconds): 0–2.5 s: Senbi and the bride stand together at the center holding hands while musicians play and guests dance around them. 2.5–5.5 s: banners and flower garlands sway lightly in the breeze, couples spin, children run past. 5.5–8 s: Senbi and the bride exchange a loving look; everything is perfectly joyful. Camera: wide shot of the whole courtyard at eye level; fixed except for an almost imperceptible 5% slow push-in, no tilt or pan. Audio: voice-over narration only (a voice, never shown on screen; no narrator character appears): a British male voice, warm and dry, begins speaking within half a second and says: “For a few perfect minutes, everything was exactly right. Enjoy this part.” The line takes about 4.8 seconds; leave the last second free of speech so the moment can land. Music: light ancient-Mediterranean wedding music (frame drums, reed flute, plucked strings), same theme in every clip, low under the voice. Sound effects: applause, drums, wind in the banners, timed to the action. Ambience: light courtyard ambience: clinking cups, footsteps on stone, a soft breeze, no words. Final reminder: no character says any word; only the voice-over narration speaks (voice only, nobody on screen is the narrator). Natural laughs, gasps and sighs are fine. No text, captions or logos in the frame.</w:t>
       </w:r>
     </w:p>
     <w:p>
@@ -1665,7 +1711,7 @@
           <w:sz w:val="20"/>
           <w:szCs w:val="20"/>
         </w:rPr>
-        <w:t xml:space="preserve">VOICE RULE: only the voice-over narration speaks words; it is a voice only, never a person or character on screen. No character says any word and no one on screen lip-syncs to speech; characters communicate with facial expressions and body gestures. Natural non-verbal sounds are allowed and should sound real: laughing, giggling, gasping, sighing, groaning, cheering, coughing. Attached reference images, in order: the wedding courtyard. 2D hand-drawn stickman cartoon in the exact style of the reference images: thin black outlines, large expressive heads, thin stick arms, flat warm colors, playful documentary-comedy tone, 16:9. Setting: sunny daytime wedding courtyard in ancient Alexandria, sandstone columns with painted blue-and-gold bands, long tables with white cloths and clay jars, orange cloth awnings, and a tall wooden entrance gate at the back-center that opens onto the street. Lighting: warm bright afternoon sunlight, soft shadows, rich saturated colors. ACTION TIMELINE (8 seconds): 0–2 s: a small clay cup stands still on a wedding table, out-of-focus guests dancing behind it. 2–4.5 s: the cup begins to tremble slightly, tiny ripples in the drink. 4.5–8 s: the tremble repeats rhythmically like distant footsteps, building, while the guests behind keep dancing, unaware. Camera: locked-off and perfectly still, extreme close-up of the cup; only the cup vibrates, the camera does not; the framing never changes (no tilt, pan, zoom or rising camera). Audio: voice-over narration only (a voice, never shown on screen; no narrator character appears): a British male voice, warm and dry, begins speaking within half a second and says: “Then a small cup on the table began to tremble. Nobody noticed.” The line takes about 4.8 seconds; leave the last second free of speech so the moment can land. Music: light ancient-Mediterranean wedding music (frame drums, reed flute, plucked strings) with a faint uneasy undertone, same theme in every clip, low under the voice. Sound effects: ceramic cup rattling, faint rumble, timed to the action. Ambience: light courtyard ambience: clinking cups, footsteps on stone, a soft breeze, no words. Final reminder: no character says any word; only the voice-over narration speaks (voice only, nobody on screen is the narrator). Natural laughs, gasps and sighs are fine. No text, captions or logos in the frame.</w:t>
+        <w:t xml:space="preserve">VOICE RULE: only the voice-over narration speaks words; it is a voice only, never a person or character on screen. No character says any word and no one on screen lip-syncs to speech; characters communicate with facial expressions and body gestures. Natural non-verbal sounds are allowed and should sound real: laughing, giggling, gasping, sighing, groaning, cheering, coughing. Attached reference images, in order: the wedding courtyard. 2D hand-drawn stickman cartoon in the exact style of the reference images: thin black outlines, large expressive heads, thin stick arms, flat warm colors, playful documentary-comedy tone, 16:9. Setting: sunny daytime ancient Egyptian wedding courtyard in Alexandria: flat-roofed sandstone mud-brick buildings, tall Egyptian columns with lotus-bud capitals painted in blue-and-gold bands, hieroglyph-style carvings on the walls, long tables with white cloths and clay jars, orange cloth awnings, and a tall wooden entrance gate at the back-center that opens onto the street. Egyptian architecture only: no Greek or Roman architecture, no triangular pediments, no domes, no red tile roofs, no cypress trees. Lighting: warm bright afternoon sunlight, soft shadows, rich saturated colors. ACTION TIMELINE (8 seconds): 0–2 s: a small clay cup stands still on a wedding table, out-of-focus guests dancing behind it. 2–4.5 s: the cup begins to tremble slightly, tiny ripples in the drink. 4.5–8 s: the tremble repeats rhythmically like distant footsteps, building, while the guests behind keep dancing, unaware. Camera: locked-off and perfectly still, extreme close-up of the cup; only the cup vibrates, the camera does not; the framing never changes (no tilt, pan, zoom or rising camera). Audio: voice-over narration only (a voice, never shown on screen; no narrator character appears): a British male voice, warm and dry, begins speaking within half a second and says: “Then a small cup on the table began to tremble. Nobody noticed.” The line takes about 4.8 seconds; leave the last second free of speech so the moment can land. Music: light ancient-Mediterranean wedding music (frame drums, reed flute, plucked strings) with a faint uneasy undertone, same theme in every clip, low under the voice. Sound effects: ceramic cup rattling, faint rumble, timed to the action. Ambience: light courtyard ambience: clinking cups, footsteps on stone, a soft breeze, no words. Final reminder: no character says any word; only the voice-over narration speaks (voice only, nobody on screen is the narrator). Natural laughs, gasps and sighs are fine. No text, captions or logos in the frame.</w:t>
       </w:r>
     </w:p>
     <w:p>
@@ -1738,7 +1784,7 @@
           <w:sz w:val="20"/>
           <w:szCs w:val="20"/>
         </w:rPr>
-        <w:t xml:space="preserve">VOICE RULE: only the voice-over narration speaks words; it is a voice only, never a person or character on screen. No character says any word and no one on screen lip-syncs to speech; characters communicate with facial expressions and body gestures. Natural non-verbal sounds are allowed and should sound real: laughing, giggling, gasping, sighing, groaning, cheering, coughing. Attached reference images, in order: the Egyptian wedding guests, the wedding courtyard. 2D hand-drawn stickman cartoon in the exact style of the reference images: thin black outlines, large expressive heads, thin stick arms, flat warm colors, playful documentary-comedy tone, 16:9. Characters, identical in every frame: the musicians: guests in white linen playing harp, frame drum and reed flute. the guests: Egyptian wedding guests in white linen with blue-and-gold collars and gold headbands, black bob hairstyles, some in white striped headdresses. Setting: sunny daytime wedding courtyard in ancient Alexandria, sandstone columns with painted blue-and-gold bands, long tables with white cloths and clay jars, orange cloth awnings, and a tall wooden entrance gate at the back-center that opens onto the street. Lighting: warm bright afternoon sunlight, soft shadows, rich saturated colors. ACTION TIMELINE (8 seconds): 0–2.5 s: an Egyptian musician plays the reed flute joyfully, eyes closed, the open gate visible behind him. 2.5–5.5 s: he stops abruptly, eyes opening, flute lowered, his expression turning alert. 5.5–8 s: he turns his head toward the gate, brow furrowed, listening, while the dancers behind him dance one more beat and then slow down. Camera: locked-off and perfectly still, eye-level medium shot of the musician with the entrance visible behind him; the framing never changes (no tilt, pan, zoom or rising camera). Audio: voice-over narration only (a voice, never shown on screen; no narrator character appears): a British male voice, warm and dry, begins speaking within half a second and says: “The musician noticed. He stopped. Everyone else danced one more beat, blissfully unaware.” The line takes about 5.2 seconds; leave the last second free of speech so the moment can land. Music: music nearly silent. Sound effects: music and drums cut out, one drum stops, timed to the action. Ambience: light courtyard ambience: clinking cups, footsteps on stone, a soft breeze, no words. Final reminder: no character says any word; only the voice-over narration speaks (voice only, nobody on screen is the narrator). Natural laughs, gasps and sighs are fine. No text, captions or logos in the frame.</w:t>
+        <w:t xml:space="preserve">VOICE RULE: only the voice-over narration speaks words; it is a voice only, never a person or character on screen. No character says any word and no one on screen lip-syncs to speech; characters communicate with facial expressions and body gestures. Natural non-verbal sounds are allowed and should sound real: laughing, giggling, gasping, sighing, groaning, cheering, coughing. Attached reference images, in order: the Egyptian wedding guests, the wedding courtyard. 2D hand-drawn stickman cartoon in the exact style of the reference images: thin black outlines, large expressive heads, thin stick arms, flat warm colors, playful documentary-comedy tone, 16:9. Characters, identical in every frame: the musicians: guests in white linen playing harp, frame drum and reed flute. the guests: Egyptian wedding guests in white linen with blue-and-gold collars and gold headbands, black bob hairstyles, some in white striped headdresses. They wear only short white kilts or simple white dresses: no togas, no draped robes. Setting: sunny daytime ancient Egyptian wedding courtyard in Alexandria: flat-roofed sandstone mud-brick buildings, tall Egyptian columns with lotus-bud capitals painted in blue-and-gold bands, hieroglyph-style carvings on the walls, long tables with white cloths and clay jars, orange cloth awnings, and a tall wooden entrance gate at the back-center that opens onto the street. Egyptian architecture only: no Greek or Roman architecture, no triangular pediments, no domes, no red tile roofs, no cypress trees. Lighting: warm bright afternoon sunlight, soft shadows, rich saturated colors. ACTION TIMELINE (8 seconds): 0–2.5 s: an Egyptian musician plays the reed flute joyfully, eyes closed, the open gate visible behind him. 2.5–5.5 s: he stops abruptly, eyes opening, flute lowered, his expression turning alert. 5.5–8 s: he turns his head toward the gate, brow furrowed, listening, while the dancers behind him dance one more beat and then slow down. Camera: locked-off and perfectly still, eye-level medium shot of the musician with the entrance visible behind him; the framing never changes (no tilt, pan, zoom or rising camera). Audio: voice-over narration only (a voice, never shown on screen; no narrator character appears): a British male voice, warm and dry, begins speaking within half a second and says: “The musician noticed. He stopped. Everyone else danced one more beat, blissfully unaware.” The line takes about 5.2 seconds; leave the last second free of speech so the moment can land. Music: music nearly silent. Sound effects: music and drums cut out, one drum stops, timed to the action. Ambience: light courtyard ambience: clinking cups, footsteps on stone, a soft breeze, no words. Final reminder: no character says any word; only the voice-over narration speaks (voice only, nobody on screen is the narrator). Natural laughs, gasps and sighs are fine. No text, captions or logos in the frame.</w:t>
       </w:r>
     </w:p>
     <w:p>
@@ -1811,7 +1857,7 @@
           <w:sz w:val="20"/>
           <w:szCs w:val="20"/>
         </w:rPr>
-        <w:t xml:space="preserve">VOICE RULE: nobody speaks and no voice of any kind is heard in this clip; it is a sound-effects-only beat. Attached reference images, in order: the Roman soldiers. 2D hand-drawn stickman cartoon in the exact style of the reference images: thin black outlines, large expressive heads, thin stick arms, flat warm colors, playful documentary-comedy tone, 16:9. Characters, identical in every frame: the Roman soldiers: crimson plumed helmets, steel armor, red cloaks, rectangular red shields. Setting: sunlit street of ancient Alexandria outside the wedding house, sandstone walls, palms, market stalls with red and blue awnings. Lighting: warm bright sunlight, soft shadows. ACTION TIMELINE (4 seconds): 0–1 s: empty sunlit stone paving, dust drifting. 1–2 s: the first heavy Roman boot steps into frame from the side, the hem of a red cloak visible, dust puffing. 2–3 s: the second boot follows. 3–4 s: a third step lands; only boots and lower legs are ever visible. Camera: locked-off and perfectly still, fixed ground-level frame on the street; the boots step into frame from the side and the camera never rises; the framing never changes (no tilt, pan, zoom or rising camera). Audio: no narration and no speech. Music: low sustained tension with distant marching drums, almost silent. Sound effects: heavy boot steps with metal clank, timed to each step. Ambience: sunlit street ambience: wind and distant clatter, no words. Final reminder: no voice of any kind in this clip. No text, captions or logos in the frame.</w:t>
+        <w:t xml:space="preserve">VOICE RULE: nobody speaks and no voice of any kind is heard in this clip; it is a sound-effects-only beat. Attached reference images, in order: the Roman soldiers. 2D hand-drawn stickman cartoon in the exact style of the reference images: thin black outlines, large expressive heads, thin stick arms, flat warm colors, playful documentary-comedy tone, 16:9. Characters, identical in every frame: the Roman soldiers: crimson plumed helmets, steel armor, red cloaks, rectangular red shields. Setting: sunlit street of ancient Alexandria outside the wedding house, sandstone walls, palms, market stalls with red and blue awnings. Flat-roofed Egyptian sandstone buildings; no Greek or Roman architecture, no domes. Lighting: warm bright sunlight, soft shadows. ACTION TIMELINE (4 seconds): 0–1 s: empty sunlit stone paving, dust drifting. 1–2 s: the first heavy Roman boot steps into frame from the side, the hem of a red cloak visible, dust puffing. 2–3 s: the second boot follows. 3–4 s: a third step lands; only boots and lower legs are ever visible. Camera: locked-off and perfectly still, fixed ground-level frame on the street; the boots step into frame from the side and the camera never rises; the framing never changes (no tilt, pan, zoom or rising camera). Audio: no narration and no speech. Music: low sustained tension with distant marching drums, almost silent. Sound effects: heavy boot steps with metal clank, timed to each step. Ambience: sunlit street ambience: wind and distant clatter, no words. Final reminder: no voice of any kind in this clip. No text, captions or logos in the frame.</w:t>
       </w:r>
     </w:p>
     <w:p>
@@ -1884,7 +1930,7 @@
           <w:sz w:val="20"/>
           <w:szCs w:val="20"/>
         </w:rPr>
-        <w:t xml:space="preserve">VOICE RULE: only the voice-over narration speaks words; it is a voice only, never a person or character on screen. No character says any word and no one on screen lip-syncs to speech; characters communicate with facial expressions and body gestures. Natural non-verbal sounds are allowed and should sound real: laughing, giggling, gasping, sighing, groaning, cheering, coughing. Attached reference images, in order: the wedding courtyard, Senbi, the groom, the bride. 2D hand-drawn stickman cartoon in the exact style of the reference images: thin black outlines, large expressive heads, thin stick arms, flat warm colors, playful documentary-comedy tone, 16:9. Characters, identical in every frame: Senbi the groom: young man, straight black bowl-cut hair with bangs, gold headband with a gold cobra, bare chest, blue-and-gold broad collar, gold bracers, white kilt with a blue-and-gold sash, brown sandals, thin black stick arms. the bride: black bob hair with straight bangs, gold headband with a red gem, white dress, blue-and-gold collar, gold sash, gold arm cuffs, light veil. the guests: Egyptian wedding guests in white linen with blue-and-gold collars and gold headbands, black bob hairstyles, some in white striped headdresses. Setting: sunny daytime wedding courtyard in ancient Alexandria, sandstone columns with painted blue-and-gold bands, long tables with white cloths and clay jars, orange cloth awnings, and a tall wooden entrance gate at the back-center that opens onto the street. Lighting: warm bright afternoon sunlight, soft shadows, rich saturated colors. ACTION TIMELINE (6 seconds): 0–2 s: guests dance and laugh while Senbi spins happily in the center, arms out. 2–4 s: the bride claps in rhythm beside him. 4–6 s: Senbi keeps spinning, eyes closed in bliss; the gate behind them stays calm. Camera: locked-off and perfectly still, eye-level medium-wide shot of the courtyard; the framing never changes (no tilt, pan, zoom or rising camera). Audio: voice-over narration only (a voice, never shown on screen; no narrator character appears): a British male voice, warm and dry, begins speaking within half a second and says: “Inside, nobody had a clue. Senbi was busy spinning.” The line takes about 3.6 seconds; leave the last second free of speech so the moment can land. Music: light ancient-Mediterranean wedding music (frame drums, reed flute, plucked strings) with a faint uneasy undertone, same theme in every clip, low under the voice. Sound effects: wedding music muffled, faint thump, timed to the action. Ambience: light courtyard ambience: clinking cups, footsteps on stone, a soft breeze, no words. Final reminder: no character says any word; only the voice-over narration speaks (voice only, nobody on screen is the narrator). Natural laughs, gasps and sighs are fine. No text, captions or logos in the frame.</w:t>
+        <w:t xml:space="preserve">VOICE RULE: only the voice-over narration speaks words; it is a voice only, never a person or character on screen. No character says any word and no one on screen lip-syncs to speech; characters communicate with facial expressions and body gestures. Natural non-verbal sounds are allowed and should sound real: laughing, giggling, gasping, sighing, groaning, cheering, coughing. Attached reference images, in order: the wedding courtyard, Senbi, the groom, the bride. 2D hand-drawn stickman cartoon in the exact style of the reference images: thin black outlines, large expressive heads, thin stick arms, flat warm colors, playful documentary-comedy tone, 16:9. Characters, identical in every frame: Senbi the groom: young man, straight black bowl-cut hair with bangs, gold headband with a gold cobra, bare chest, blue-and-gold broad collar, gold bracers, white kilt with a blue-and-gold sash, brown sandals, thin black stick arms. the bride: black bob hair with straight bangs, gold headband with a red gem, white dress, blue-and-gold collar, gold sash, gold arm cuffs, light veil. the guests: Egyptian wedding guests in white linen with blue-and-gold collars and gold headbands, black bob hairstyles, some in white striped headdresses. They wear only short white kilts or simple white dresses: no togas, no draped robes. Setting: sunny daytime ancient Egyptian wedding courtyard in Alexandria: flat-roofed sandstone mud-brick buildings, tall Egyptian columns with lotus-bud capitals painted in blue-and-gold bands, hieroglyph-style carvings on the walls, long tables with white cloths and clay jars, orange cloth awnings, and a tall wooden entrance gate at the back-center that opens onto the street. Egyptian architecture only: no Greek or Roman architecture, no triangular pediments, no domes, no red tile roofs, no cypress trees. Lighting: warm bright afternoon sunlight, soft shadows, rich saturated colors. ACTION TIMELINE (6 seconds): 0–2 s: guests dance and laugh while Senbi spins happily in the center, arms out. 2–4 s: the bride claps in rhythm beside him. 4–6 s: Senbi keeps spinning, eyes closed in bliss; the gate behind them stays calm. Camera: locked-off and perfectly still, eye-level medium-wide shot of the courtyard; the framing never changes (no tilt, pan, zoom or rising camera). Audio: voice-over narration only (a voice, never shown on screen; no narrator character appears): a British male voice, warm and dry, begins speaking within half a second and says: “Inside, nobody had a clue. Senbi was busy spinning.” The line takes about 3.6 seconds; leave the last second free of speech so the moment can land. Music: light ancient-Mediterranean wedding music (frame drums, reed flute, plucked strings) with a faint uneasy undertone, same theme in every clip, low under the voice. Sound effects: wedding music muffled, faint thump, timed to the action. Ambience: light courtyard ambience: clinking cups, footsteps on stone, a soft breeze, no words. Final reminder: no character says any word; only the voice-over narration speaks (voice only, nobody on screen is the narrator). Natural laughs, gasps and sighs are fine. No text, captions or logos in the frame.</w:t>
       </w:r>
     </w:p>
     <w:p>
@@ -1957,7 +2003,7 @@
           <w:sz w:val="20"/>
           <w:szCs w:val="20"/>
         </w:rPr>
-        <w:t xml:space="preserve">VOICE RULE: only the voice-over narration speaks words; it is a voice only, never a person or character on screen. No character says any word and no one on screen lip-syncs to speech; characters communicate with facial expressions and body gestures. Natural non-verbal sounds are allowed and should sound real: laughing, giggling, gasping, sighing, groaning, cheering, coughing. Attached reference images, in order: the Roman soldiers. 2D hand-drawn stickman cartoon in the exact style of the reference images: thin black outlines, large expressive heads, thin stick arms, flat warm colors, playful documentary-comedy tone, 16:9. Characters, identical in every frame: the Roman soldiers: crimson plumed helmets, steel armor, red cloaks, rectangular red shields. Setting: sunlit street of ancient Alexandria outside the wedding house, sandstone walls, palms, market stalls with red and blue awnings. Lighting: warm bright sunlight, soft shadows. ACTION TIMELINE (8 seconds): 0–2.5 s: the street is empty and the sound of boots grows. 2.5–5.5 s: two tired, dusty Roman legionaries walk into frame, shields and spears in hand, shoulders slumped, dust on their armor. 5.5–8 s: they stop in front of the wedding house and look around, then at each other, confused; one scratches under his helmet. Camera: locked-off and perfectly still, eye-level medium-wide shot of the street; the soldiers walk into the frame; the framing never changes (no tilt, pan, zoom or rising camera). Audio: voice-over narration only (a voice, never shown on screen; no narrator character appears): a British male voice, warm and dry, begins speaking within half a second and says: “And then Rome arrived. Tired, dusty, and looking for the right address.” The line takes about 4.8 seconds; leave the last second free of speech so the moment can land. Music: low sustained tension with distant marching drums, almost silent. Sound effects: armor clank, dust, a tired sigh, timed to the action. Ambience: sunlit street ambience: wind and distant clatter, no words. Final reminder: no character says any word; only the voice-over narration speaks (voice only, nobody on screen is the narrator). Natural laughs, gasps and sighs are fine. No text, captions or logos in the frame.</w:t>
+        <w:t xml:space="preserve">VOICE RULE: only the voice-over narration speaks words; it is a voice only, never a person or character on screen. No character says any word and no one on screen lip-syncs to speech; characters communicate with facial expressions and body gestures. Natural non-verbal sounds are allowed and should sound real: laughing, giggling, gasping, sighing, groaning, cheering, coughing. Attached reference images, in order: the Roman soldiers. 2D hand-drawn stickman cartoon in the exact style of the reference images: thin black outlines, large expressive heads, thin stick arms, flat warm colors, playful documentary-comedy tone, 16:9. Characters, identical in every frame: the Roman soldiers: crimson plumed helmets, steel armor, red cloaks, rectangular red shields. Setting: sunlit street of ancient Alexandria outside the wedding house, sandstone walls, palms, market stalls with red and blue awnings. Flat-roofed Egyptian sandstone buildings; no Greek or Roman architecture, no domes. Lighting: warm bright sunlight, soft shadows. ACTION TIMELINE (8 seconds): 0–2.5 s: the street is empty and the sound of boots grows. 2.5–5.5 s: two tired, dusty Roman legionaries walk into frame, shields and spears in hand, shoulders slumped, dust on their armor. 5.5–8 s: they stop in front of the wedding house and look around, then at each other, confused; one scratches under his helmet. Camera: locked-off and perfectly still, eye-level medium-wide shot of the street; the soldiers walk into the frame; the framing never changes (no tilt, pan, zoom or rising camera). Audio: voice-over narration only (a voice, never shown on screen; no narrator character appears): a British male voice, warm and dry, begins speaking within half a second and says: “And then Rome arrived. Tired, dusty, and looking for the right address.” The line takes about 4.8 seconds; leave the last second free of speech so the moment can land. Music: low sustained tension with distant marching drums, almost silent. Sound effects: armor clank, dust, a tired sigh, timed to the action. Ambience: sunlit street ambience: wind and distant clatter, no words. Final reminder: no character says any word; only the voice-over narration speaks (voice only, nobody on screen is the narrator). Natural laughs, gasps and sighs are fine. No text, captions or logos in the frame.</w:t>
       </w:r>
     </w:p>
     <w:p>
@@ -2030,7 +2076,7 @@
           <w:sz w:val="20"/>
           <w:szCs w:val="20"/>
         </w:rPr>
-        <w:t xml:space="preserve">VOICE RULE: only the voice-over narration speaks words; it is a voice only, never a person or character on screen. No character says any word and no one on screen lip-syncs to speech; characters communicate with facial expressions and body gestures. Natural non-verbal sounds are allowed and should sound real: laughing, giggling, gasping, sighing, groaning, cheering, coughing. Attached reference images, in order: the Egyptian wedding guests, the Roman soldiers, the wedding courtyard. 2D hand-drawn stickman cartoon in the exact style of the reference images: thin black outlines, large expressive heads, thin stick arms, flat warm colors, playful documentary-comedy tone, 16:9. Characters, identical in every frame: the guests: Egyptian wedding guests in white linen with blue-and-gold collars and gold headbands, black bob hairstyles, some in white striped headdresses. Setting: sunlit street of ancient Alexandria outside the wedding house, sandstone walls, palms, market stalls with red and blue awnings. Lighting: warm bright sunlight, soft shadows. ACTION TIMELINE (8 seconds): 0–2.5 s: three guests peek out of the doorway at the same time: the left one terrified with wide eyes and hands on cheeks, the center one confused with a tilted head and one raised eyebrow, the right one grinning and clapping softly as if watching entertainers. 2.5–5.5 s: the terrified one ducks back and peeks out again. 5.5–8 s: the grinning one nudges the confused one and points, delighted, while the confused one squints. Camera: locked-off and perfectly still, eye-level medium-wide shot of the doorway with all three guests peeking in the same frame; the framing never changes (no tilt, pan, zoom or rising camera). Audio: voice-over narration only (a voice, never shown on screen; no narrator character appears): a British male voice, warm and dry, begins speaking within half a second and says: “The guests peeked out. One terrified. One confused. One assumed it was entertainment.” The line takes about 5.2 seconds; leave the last second free of speech so the moment can land. Music: music nearly silent. Sound effects: nervous coughs and gasps, no words, timed to the action. Ambience: sunlit street ambience: wind and distant clatter, no words. Final reminder: no character says any word; only the voice-over narration speaks (voice only, nobody on screen is the narrator). Natural laughs, gasps and sighs are fine. No text, captions or logos in the frame.</w:t>
+        <w:t xml:space="preserve">VOICE RULE: only the voice-over narration speaks words; it is a voice only, never a person or character on screen. No character says any word and no one on screen lip-syncs to speech; characters communicate with facial expressions and body gestures. Natural non-verbal sounds are allowed and should sound real: laughing, giggling, gasping, sighing, groaning, cheering, coughing. Attached reference images, in order: the Egyptian wedding guests, the Roman soldiers, the wedding courtyard. 2D hand-drawn stickman cartoon in the exact style of the reference images: thin black outlines, large expressive heads, thin stick arms, flat warm colors, playful documentary-comedy tone, 16:9. Characters, identical in every frame: the guests: Egyptian wedding guests in white linen with blue-and-gold collars and gold headbands, black bob hairstyles, some in white striped headdresses. They wear only short white kilts or simple white dresses: no togas, no draped robes. Setting: sunlit street of ancient Alexandria outside the wedding house, sandstone walls, palms, market stalls with red and blue awnings. Flat-roofed Egyptian sandstone buildings; no Greek or Roman architecture, no domes. Lighting: warm bright sunlight, soft shadows. ACTION TIMELINE (8 seconds): 0–2.5 s: three guests peek out of the doorway at the same time: the left one terrified with wide eyes and hands on cheeks, the center one confused with a tilted head and one raised eyebrow, the right one grinning and clapping softly as if watching entertainers. 2.5–5.5 s: the terrified one ducks back and peeks out again. 5.5–8 s: the grinning one nudges the confused one and points, delighted, while the confused one squints. Camera: locked-off and perfectly still, eye-level medium-wide shot of the doorway with all three guests peeking in the same frame; the framing never changes (no tilt, pan, zoom or rising camera). Audio: voice-over narration only (a voice, never shown on screen; no narrator character appears): a British male voice, warm and dry, begins speaking within half a second and says: “The guests peeked out. One terrified. One confused. One assumed it was entertainment.” The line takes about 5.2 seconds; leave the last second free of speech so the moment can land. Music: music nearly silent. Sound effects: nervous coughs and gasps, no words, timed to the action. Ambience: sunlit street ambience: wind and distant clatter, no words. Final reminder: no character says any word; only the voice-over narration speaks (voice only, nobody on screen is the narrator). Natural laughs, gasps and sighs are fine. No text, captions or logos in the frame.</w:t>
       </w:r>
     </w:p>
     <w:p>
@@ -2103,7 +2149,7 @@
           <w:sz w:val="20"/>
           <w:szCs w:val="20"/>
         </w:rPr>
-        <w:t xml:space="preserve">VOICE RULE: only the voice-over narration speaks words; it is a voice only, never a person or character on screen. No character says any word and no one on screen lip-syncs to speech; characters communicate with facial expressions and body gestures. Natural non-verbal sounds are allowed and should sound real: laughing, giggling, gasping, sighing, groaning, cheering, coughing. Attached reference images, in order: the bride's relatives, the Roman soldiers, the wedding courtyard. 2D hand-drawn stickman cartoon in the exact style of the reference images: thin black outlines, large expressive heads, thin stick arms, flat warm colors, playful documentary-comedy tone, 16:9. Characters, identical in every frame: the uncle: cheerful bearded middle-aged man in plain white linen. the Roman soldiers: crimson plumed helmets, steel armor, red cloaks, rectangular red shields. Setting: sunlit street of ancient Alexandria outside the wedding house, sandstone walls, palms, market stalls with red and blue awnings. Lighting: warm bright sunlight, soft shadows. ACTION TIMELINE (8 seconds): 0–2.5 s: a cheerful, slightly tipsy bearded uncle sways with a clay beer cup in hand, cheeks rosy, two Roman soldiers waiting at the right edge of the frame. 2.5–5.5 s: he strides confidently across the frame toward the soldiers, cup raised in greeting. 5.5–8 s: he arrives and extends the cup with a wide smile. Camera: locked-off and perfectly still, eye-level medium-wide shot; the uncle walks across the frame; the framing never changes (no tilt, pan, zoom or rising camera). Audio: voice-over narration only (a voice, never shown on screen; no narrator character appears): a British male voice, warm and dry, begins speaking within half a second and says: “Then one uncle, a man with absolutely no fear, grabbed a beer.” The line takes about 4.8 seconds; leave the last second free of speech so the moment can land. Music: playful comic percussion over the wedding rhythm, low under the voice. Sound effects: cup clink, timed to the action. Ambience: sunlit street ambience: wind and distant clatter, no words. Final reminder: no character says any word; only the voice-over narration speaks (voice only, nobody on screen is the narrator). Natural laughs, gasps and sighs are fine. No text, captions or logos in the frame.</w:t>
+        <w:t xml:space="preserve">VOICE RULE: only the voice-over narration speaks words; it is a voice only, never a person or character on screen. No character says any word and no one on screen lip-syncs to speech; characters communicate with facial expressions and body gestures. Natural non-verbal sounds are allowed and should sound real: laughing, giggling, gasping, sighing, groaning, cheering, coughing. Attached reference images, in order: the bride's relatives, the Roman soldiers, the wedding courtyard. 2D hand-drawn stickman cartoon in the exact style of the reference images: thin black outlines, large expressive heads, thin stick arms, flat warm colors, playful documentary-comedy tone, 16:9. Characters, identical in every frame: the uncle: cheerful bearded middle-aged man in plain white linen. the Roman soldiers: crimson plumed helmets, steel armor, red cloaks, rectangular red shields. Setting: sunlit street of ancient Alexandria outside the wedding house, sandstone walls, palms, market stalls with red and blue awnings. Flat-roofed Egyptian sandstone buildings; no Greek or Roman architecture, no domes. Lighting: warm bright sunlight, soft shadows. ACTION TIMELINE (8 seconds): 0–2.5 s: a cheerful, slightly tipsy bearded uncle sways with a clay beer cup in hand, cheeks rosy, two Roman soldiers waiting at the right edge of the frame. 2.5–5.5 s: he strides confidently across the frame toward the soldiers, cup raised in greeting. 5.5–8 s: he arrives and extends the cup with a wide smile. Camera: locked-off and perfectly still, eye-level medium-wide shot; the uncle walks across the frame; the framing never changes (no tilt, pan, zoom or rising camera). Audio: voice-over narration only (a voice, never shown on screen; no narrator character appears): a British male voice, warm and dry, begins speaking within half a second and says: “Then one uncle, a man with absolutely no fear, grabbed a beer.” The line takes about 4.8 seconds; leave the last second free of speech so the moment can land. Music: playful comic percussion over the wedding rhythm, low under the voice. Sound effects: cup clink, timed to the action. Ambience: sunlit street ambience: wind and distant clatter, no words. Final reminder: no character says any word; only the voice-over narration speaks (voice only, nobody on screen is the narrator). Natural laughs, gasps and sighs are fine. No text, captions or logos in the frame.</w:t>
       </w:r>
     </w:p>
     <w:p>
@@ -2176,7 +2222,7 @@
           <w:sz w:val="20"/>
           <w:szCs w:val="20"/>
         </w:rPr>
-        <w:t xml:space="preserve">VOICE RULE: only the voice-over narration speaks words; it is a voice only, never a person or character on screen. No character says any word and no one on screen lip-syncs to speech; characters communicate with facial expressions and body gestures. Natural non-verbal sounds are allowed and should sound real: laughing, giggling, gasping, sighing, groaning, cheering, coughing. Attached reference images, in order: the Roman soldiers. 2D hand-drawn stickman cartoon in the exact style of the reference images: thin black outlines, large expressive heads, thin stick arms, flat warm colors, playful documentary-comedy tone, 16:9. Characters, identical in every frame: the Roman soldiers: crimson plumed helmets, steel armor, red cloaks, rectangular red shields. Setting: sunlit street of ancient Alexandria outside the wedding house, sandstone walls, palms, market stalls with red and blue awnings. Lighting: warm bright sunlight, soft shadows. ACTION TIMELINE (8 seconds): 0–2.5 s: the soldier's confused face looks at the beer cup. 2.5–5.5 s: he looks up at the uncle's smiling face off-screen and back to the cup, then cautiously takes it. 5.5–8 s: his eyes slide sideways toward his comrades in a silent plea of 'what do I do?'; he sniffs the cup. Camera: eye-level medium close-up of the soldier; fixed except for an almost imperceptible 5% slow push-in, no tilt or pan. Audio: voice-over narration only (a voice, never shown on screen; no narrator character appears): a British male voice, warm and dry, begins speaking within half a second and says: “The soldier stared at the cup, then the uncle. A trap? Or hospitality?” The line takes about 5.2 seconds; leave the last second free of speech so the moment can land. Music: music nearly silent. Sound effects: tiny gulp, uneasy hum, timed to the action. Ambience: sunlit street ambience: wind and distant clatter, no words. Final reminder: no character says any word; only the voice-over narration speaks (voice only, nobody on screen is the narrator). Natural laughs, gasps and sighs are fine. No text, captions or logos in the frame.</w:t>
+        <w:t xml:space="preserve">VOICE RULE: only the voice-over narration speaks words; it is a voice only, never a person or character on screen. No character says any word and no one on screen lip-syncs to speech; characters communicate with facial expressions and body gestures. Natural non-verbal sounds are allowed and should sound real: laughing, giggling, gasping, sighing, groaning, cheering, coughing. Attached reference images, in order: the Roman soldiers. 2D hand-drawn stickman cartoon in the exact style of the reference images: thin black outlines, large expressive heads, thin stick arms, flat warm colors, playful documentary-comedy tone, 16:9. Characters, identical in every frame: the Roman soldiers: crimson plumed helmets, steel armor, red cloaks, rectangular red shields. Setting: sunlit street of ancient Alexandria outside the wedding house, sandstone walls, palms, market stalls with red and blue awnings. Flat-roofed Egyptian sandstone buildings; no Greek or Roman architecture, no domes. Lighting: warm bright sunlight, soft shadows. ACTION TIMELINE (8 seconds): 0–2.5 s: the soldier's confused face looks at the beer cup. 2.5–5.5 s: he looks up at the uncle's smiling face off-screen and back to the cup, then cautiously takes it. 5.5–8 s: his eyes slide sideways toward his comrades in a silent plea of 'what do I do?'; he sniffs the cup. Camera: eye-level medium close-up of the soldier; fixed except for an almost imperceptible 5% slow push-in, no tilt or pan. Audio: voice-over narration only (a voice, never shown on screen; no narrator character appears): a British male voice, warm and dry, begins speaking within half a second and says: “The soldier stared at the cup, then the uncle. A trap? Or hospitality?” The line takes about 5.2 seconds; leave the last second free of speech so the moment can land. Music: music nearly silent. Sound effects: tiny gulp, uneasy hum, timed to the action. Ambience: sunlit street ambience: wind and distant clatter, no words. Final reminder: no character says any word; only the voice-over narration speaks (voice only, nobody on screen is the narrator). Natural laughs, gasps and sighs are fine. No text, captions or logos in the frame.</w:t>
       </w:r>
     </w:p>
     <w:p>
@@ -2249,7 +2295,7 @@
           <w:sz w:val="20"/>
           <w:szCs w:val="20"/>
         </w:rPr>
-        <w:t xml:space="preserve">VOICE RULE: only the voice-over narration speaks words; it is a voice only, never a person or character on screen. No character says any word and no one on screen lip-syncs to speech; characters communicate with facial expressions and body gestures. Natural non-verbal sounds are allowed and should sound real: laughing, giggling, gasping, sighing, groaning, cheering, coughing. Attached reference images, in order: the Roman soldiers, the wedding courtyard. 2D hand-drawn stickman cartoon in the exact style of the reference images: thin black outlines, large expressive heads, thin stick arms, flat warm colors, playful documentary-comedy tone, 16:9. Characters, identical in every frame: the Roman soldiers: crimson plumed helmets, steel armor, red cloaks, rectangular red shields. Setting: sunny daytime wedding courtyard in ancient Alexandria, sandstone columns with painted blue-and-gold bands, long tables with white cloths and clay jars, orange cloth awnings, and a tall wooden entrance gate at the back-center that opens onto the street. Lighting: warm bright afternoon sunlight, soft shadows, rich saturated colors. ACTION TIMELINE (8 seconds): 0–2.5 s: two Roman soldiers in the foreground scan the area with serious faces, the feast table behind them. 2.5–5.5 s: they turn their heads toward the roast goose, bread and fruit and their expressions soften. 5.5–8 s: one leans slightly forward, nostrils flaring, his stomach growls and the other glances at him. Camera: locked-off and perfectly still, eye-level wide-medium shot: the soldiers in the foreground, the feast table behind them; they turn their heads toward it; the framing never changes (no tilt, pan, zoom or rising camera). Audio: voice-over narration only (a voice, never shown on screen; no narrator character appears): a British male voice, warm and dry, begins speaking within half a second and says: “Then the Romans saw the food. Military discipline lasted about four seconds.” The line takes about 4.8 seconds; leave the last second free of speech so the moment can land. Music: playful comic percussion over the wedding rhythm, low under the voice. Sound effects: stomach growl, sniff, timed to the action. Ambience: light courtyard ambience: clinking cups, footsteps on stone, a soft breeze, no words. Final reminder: no character says any word; only the voice-over narration speaks (voice only, nobody on screen is the narrator). Natural laughs, gasps and sighs are fine. No text, captions or logos in the frame.</w:t>
+        <w:t xml:space="preserve">VOICE RULE: only the voice-over narration speaks words; it is a voice only, never a person or character on screen. No character says any word and no one on screen lip-syncs to speech; characters communicate with facial expressions and body gestures. Natural non-verbal sounds are allowed and should sound real: laughing, giggling, gasping, sighing, groaning, cheering, coughing. Attached reference images, in order: the Roman soldiers, the wedding courtyard. 2D hand-drawn stickman cartoon in the exact style of the reference images: thin black outlines, large expressive heads, thin stick arms, flat warm colors, playful documentary-comedy tone, 16:9. Characters, identical in every frame: the Roman soldiers: crimson plumed helmets, steel armor, red cloaks, rectangular red shields. Setting: sunny daytime ancient Egyptian wedding courtyard in Alexandria: flat-roofed sandstone mud-brick buildings, tall Egyptian columns with lotus-bud capitals painted in blue-and-gold bands, hieroglyph-style carvings on the walls, long tables with white cloths and clay jars, orange cloth awnings, and a tall wooden entrance gate at the back-center that opens onto the street. Egyptian architecture only: no Greek or Roman architecture, no triangular pediments, no domes, no red tile roofs, no cypress trees. Lighting: warm bright afternoon sunlight, soft shadows, rich saturated colors. ACTION TIMELINE (8 seconds): 0–2.5 s: two Roman soldiers in the foreground scan the area with serious faces, the feast table behind them. 2.5–5.5 s: they turn their heads toward the roast goose, bread and fruit and their expressions soften. 5.5–8 s: one leans slightly forward, nostrils flaring, his stomach growls and the other glances at him. Camera: locked-off and perfectly still, eye-level wide-medium shot: the soldiers in the foreground, the feast table behind them; they turn their heads toward it; the framing never changes (no tilt, pan, zoom or rising camera). Audio: voice-over narration only (a voice, never shown on screen; no narrator character appears): a British male voice, warm and dry, begins speaking within half a second and says: “Then the Romans saw the food. Military discipline lasted about four seconds.” The line takes about 4.8 seconds; leave the last second free of speech so the moment can land. Music: playful comic percussion over the wedding rhythm, low under the voice. Sound effects: stomach growl, sniff, timed to the action. Ambience: light courtyard ambience: clinking cups, footsteps on stone, a soft breeze, no words. Final reminder: no character says any word; only the voice-over narration speaks (voice only, nobody on screen is the narrator). Natural laughs, gasps and sighs are fine. No text, captions or logos in the frame.</w:t>
       </w:r>
     </w:p>
     <w:p>
@@ -2322,7 +2368,7 @@
           <w:sz w:val="20"/>
           <w:szCs w:val="20"/>
         </w:rPr>
-        <w:t xml:space="preserve">VOICE RULE: only the voice-over narration speaks words; it is a voice only, never a person or character on screen. No character says any word and no one on screen lip-syncs to speech; characters communicate with facial expressions and body gestures. Natural non-verbal sounds are allowed and should sound real: laughing, giggling, gasping, sighing, groaning, cheering, coughing. Attached reference images, in order: the Roman soldiers, the Egyptian wedding guests, the wedding courtyard. 2D hand-drawn stickman cartoon in the exact style of the reference images: thin black outlines, large expressive heads, thin stick arms, flat warm colors, playful documentary-comedy tone, 16:9. Characters, identical in every frame: the guests: Egyptian wedding guests in white linen with blue-and-gold collars and gold headbands, black bob hairstyles, some in white striped headdresses. the Roman soldiers: crimson plumed helmets, steel armor, red cloaks, rectangular red shields. Setting: sunny daytime wedding courtyard in ancient Alexandria, sandstone columns with painted blue-and-gold bands, long tables with white cloths and clay jars, orange cloth awnings, and a tall wooden entrance gate at the back-center that opens onto the street. Lighting: warm bright afternoon sunlight, soft shadows, rich saturated colors. ACTION TIMELINE (8 seconds): 0–2.5 s: Egyptian guests dance in the courtyard. 2.5–5.5 s: one Roman soldier steps awkwardly onto the dance floor, stiff as a board; the guests freeze and stare. 5.5–8 s: one guest begins to copy his stiff step and the others hesitate, then join in. Camera: locked-off and perfectly still, eye-level wide shot; the framing never changes (no tilt, pan, zoom or rising camera). Audio: voice-over narration only (a voice, never shown on screen; no narrator character appears): a British male voice, warm and dry, begins speaking within half a second and says: “One soldier stepped into the dance. Nobody stopped him. Somehow, it worked.” The line takes about 4.8 seconds; leave the last second free of speech so the moment can land. Music: playful comic percussion over the wedding rhythm, low under the voice. Sound effects: shield tap blending into the rhythm, clapping, timed to the action. Ambience: light courtyard ambience: clinking cups, footsteps on stone, a soft breeze, no words. Final reminder: no character says any word; only the voice-over narration speaks (voice only, nobody on screen is the narrator). Natural laughs, gasps and sighs are fine. No text, captions or logos in the frame.</w:t>
+        <w:t xml:space="preserve">VOICE RULE: only the voice-over narration speaks words; it is a voice only, never a person or character on screen. No character says any word and no one on screen lip-syncs to speech; characters communicate with facial expressions and body gestures. Natural non-verbal sounds are allowed and should sound real: laughing, giggling, gasping, sighing, groaning, cheering, coughing. Attached reference images, in order: the Roman soldiers, the Egyptian wedding guests, the wedding courtyard. 2D hand-drawn stickman cartoon in the exact style of the reference images: thin black outlines, large expressive heads, thin stick arms, flat warm colors, playful documentary-comedy tone, 16:9. Characters, identical in every frame: the guests: Egyptian wedding guests in white linen with blue-and-gold collars and gold headbands, black bob hairstyles, some in white striped headdresses. They wear only short white kilts or simple white dresses: no togas, no draped robes. the Roman soldiers: crimson plumed helmets, steel armor, red cloaks, rectangular red shields. Setting: sunny daytime ancient Egyptian wedding courtyard in Alexandria: flat-roofed sandstone mud-brick buildings, tall Egyptian columns with lotus-bud capitals painted in blue-and-gold bands, hieroglyph-style carvings on the walls, long tables with white cloths and clay jars, orange cloth awnings, and a tall wooden entrance gate at the back-center that opens onto the street. Egyptian architecture only: no Greek or Roman architecture, no triangular pediments, no domes, no red tile roofs, no cypress trees. Lighting: warm bright afternoon sunlight, soft shadows, rich saturated colors. ACTION TIMELINE (8 seconds): 0–2.5 s: Egyptian guests dance in the courtyard. 2.5–5.5 s: one Roman soldier steps awkwardly onto the dance floor, stiff as a board; the guests freeze and stare. 5.5–8 s: one guest begins to copy his stiff step and the others hesitate, then join in. Camera: locked-off and perfectly still, eye-level wide shot; the framing never changes (no tilt, pan, zoom or rising camera). Audio: voice-over narration only (a voice, never shown on screen; no narrator character appears): a British male voice, warm and dry, begins speaking within half a second and says: “One soldier stepped into the dance. Nobody stopped him. Somehow, it worked.” The line takes about 4.8 seconds; leave the last second free of speech so the moment can land. Music: playful comic percussion over the wedding rhythm, low under the voice. Sound effects: shield tap blending into the rhythm, clapping, timed to the action. Ambience: light courtyard ambience: clinking cups, footsteps on stone, a soft breeze, no words. Final reminder: no character says any word; only the voice-over narration speaks (voice only, nobody on screen is the narrator). Natural laughs, gasps and sighs are fine. No text, captions or logos in the frame.</w:t>
       </w:r>
     </w:p>
     <w:p>
@@ -2395,7 +2441,7 @@
           <w:sz w:val="20"/>
           <w:szCs w:val="20"/>
         </w:rPr>
-        <w:t xml:space="preserve">VOICE RULE: only the voice-over narration speaks words; it is a voice only, never a person or character on screen. No character says any word and no one on screen lip-syncs to speech; characters communicate with facial expressions and body gestures. Natural non-verbal sounds are allowed and should sound real: laughing, giggling, gasping, sighing, groaning, cheering, coughing. Attached reference images, in order: the Roman soldiers, the Egyptian wedding guests, the wedding courtyard. 2D hand-drawn stickman cartoon in the exact style of the reference images: thin black outlines, large expressive heads, thin stick arms, flat warm colors, playful documentary-comedy tone, 16:9. Characters, identical in every frame: the Roman soldiers: crimson plumed helmets, steel armor, red cloaks, rectangular red shields. the guests: Egyptian wedding guests in white linen with blue-and-gold collars and gold headbands, black bob hairstyles, some in white striped headdresses. Setting: sunny daytime wedding courtyard in ancient Alexandria, sandstone columns with painted blue-and-gold bands, long tables with white cloths and clay jars, orange cloth awnings, and a tall wooden entrance gate at the back-center that opens onto the street. Lighting: warm bright afternoon sunlight, soft shadows, rich saturated colors. ACTION TIMELINE (6 seconds): 0–2 s: three Roman soldiers in full armor step to the right in a row, stiff but strangely synchronized, capes swaying, Egyptian dancers around them smiling and clapping. 2–4 s: they step to the left in unison. 4–6 s: all three raise one arm together in perfect unison, then stare at each other, confused. Camera: locked-off and perfectly still, eye-level wide shot of the dancing Romans; the framing never changes (no tilt, pan, zoom or rising camera). Audio: voice-over narration only (a voice, never shown on screen; no narrator character appears): a British male voice, warm and dry, begins speaking within half a second and says: “Roman engineering changed the world. Roman dancing did not.” The line takes about 3.6 seconds; leave the last second free of speech so the moment can land. Music: playful comic percussion over the wedding rhythm, low under the voice. Sound effects: armor clanking out of rhythm, timed to the action. Ambience: light courtyard ambience: clinking cups, footsteps on stone, a soft breeze, no words. Final reminder: no character says any word; only the voice-over narration speaks (voice only, nobody on screen is the narrator). Natural laughs, gasps and sighs are fine. No text, captions or logos in the frame.</w:t>
+        <w:t xml:space="preserve">VOICE RULE: only the voice-over narration speaks words; it is a voice only, never a person or character on screen. No character says any word and no one on screen lip-syncs to speech; characters communicate with facial expressions and body gestures. Natural non-verbal sounds are allowed and should sound real: laughing, giggling, gasping, sighing, groaning, cheering, coughing. Attached reference images, in order: the Roman soldiers, the Egyptian wedding guests, the wedding courtyard. 2D hand-drawn stickman cartoon in the exact style of the reference images: thin black outlines, large expressive heads, thin stick arms, flat warm colors, playful documentary-comedy tone, 16:9. Characters, identical in every frame: the Roman soldiers: crimson plumed helmets, steel armor, red cloaks, rectangular red shields. the guests: Egyptian wedding guests in white linen with blue-and-gold collars and gold headbands, black bob hairstyles, some in white striped headdresses. They wear only short white kilts or simple white dresses: no togas, no draped robes. Setting: sunny daytime ancient Egyptian wedding courtyard in Alexandria: flat-roofed sandstone mud-brick buildings, tall Egyptian columns with lotus-bud capitals painted in blue-and-gold bands, hieroglyph-style carvings on the walls, long tables with white cloths and clay jars, orange cloth awnings, and a tall wooden entrance gate at the back-center that opens onto the street. Egyptian architecture only: no Greek or Roman architecture, no triangular pediments, no domes, no red tile roofs, no cypress trees. Lighting: warm bright afternoon sunlight, soft shadows, rich saturated colors. ACTION TIMELINE (6 seconds): 0–2 s: three Roman soldiers in full armor step to the right in a row, stiff but strangely synchronized, capes swaying, Egyptian dancers around them smiling and clapping. 2–4 s: they step to the left in unison. 4–6 s: all three raise one arm together in perfect unison, then stare at each other, confused. Camera: locked-off and perfectly still, eye-level wide shot of the dancing Romans; the framing never changes (no tilt, pan, zoom or rising camera). Audio: voice-over narration only (a voice, never shown on screen; no narrator character appears): a British male voice, warm and dry, begins speaking within half a second and says: “Roman engineering changed the world. Roman dancing did not.” The line takes about 3.6 seconds; leave the last second free of speech so the moment can land. Music: playful comic percussion over the wedding rhythm, low under the voice. Sound effects: armor clanking out of rhythm, timed to the action. Ambience: light courtyard ambience: clinking cups, footsteps on stone, a soft breeze, no words. Final reminder: no character says any word; only the voice-over narration speaks (voice only, nobody on screen is the narrator). Natural laughs, gasps and sighs are fine. No text, captions or logos in the frame.</w:t>
       </w:r>
     </w:p>
     <w:p>
@@ -2468,7 +2514,7 @@
           <w:sz w:val="20"/>
           <w:szCs w:val="20"/>
         </w:rPr>
-        <w:t xml:space="preserve">VOICE RULE: only the voice-over narration speaks words; it is a voice only, never a person or character on screen. No character says any word and no one on screen lip-syncs to speech; characters communicate with facial expressions and body gestures. Natural non-verbal sounds are allowed and should sound real: laughing, giggling, gasping, sighing, groaning, cheering, coughing. Attached reference images, in order: Senbi, the groom, the Roman soldiers, the wedding courtyard. 2D hand-drawn stickman cartoon in the exact style of the reference images: thin black outlines, large expressive heads, thin stick arms, flat warm colors, playful documentary-comedy tone, 16:9. Characters, identical in every frame: Senbi the groom: young man, straight black bowl-cut hair with bangs, gold headband with a gold cobra, bare chest, blue-and-gold broad collar, gold bracers, white kilt with a blue-and-gold sash, brown sandals, thin black stick arms. the Roman soldiers: crimson plumed helmets, steel armor, red cloaks, rectangular red shields. Setting: sunny daytime wedding courtyard in ancient Alexandria, sandstone columns with painted blue-and-gold bands, long tables with white cloths and clay jars, orange cloth awnings, and a tall wooden entrance gate at the back-center that opens onto the street. Lighting: warm bright afternoon sunlight, soft shadows, rich saturated colors. ACTION TIMELINE (8 seconds): 0–2.5 s: Senbi dances proudly beside a Roman soldier, beaming. 2.5–5.5 s: he waves his arm wildly, gesturing for the soldier to follow. 5.5–8 s: the soldier hesitates, then copies Senbi's arm movement stiffly with a flicker of a smile. Camera: locked-off and perfectly still, eye-level medium two-shot; the framing never changes (no tilt, pan, zoom or rising camera). Audio: voice-over narration only (a voice, never shown on screen; no narrator character appears): a British male voice, warm and dry, begins speaking within half a second and says: “Senbi, ever the host, invited one to join. Of course he did.” The line takes about 4.8 seconds; leave the last second free of speech so the moment can land. Music: playful comic percussion over the wedding rhythm, low under the voice. Sound effects: laughter, hand claps, timed to the action. Ambience: light courtyard ambience: clinking cups, footsteps on stone, a soft breeze, no words. Final reminder: no character says any word; only the voice-over narration speaks (voice only, nobody on screen is the narrator). Natural laughs, gasps and sighs are fine. No text, captions or logos in the frame.</w:t>
+        <w:t xml:space="preserve">VOICE RULE: only the voice-over narration speaks words; it is a voice only, never a person or character on screen. No character says any word and no one on screen lip-syncs to speech; characters communicate with facial expressions and body gestures. Natural non-verbal sounds are allowed and should sound real: laughing, giggling, gasping, sighing, groaning, cheering, coughing. Attached reference images, in order: Senbi, the groom, the Roman soldiers, the wedding courtyard. 2D hand-drawn stickman cartoon in the exact style of the reference images: thin black outlines, large expressive heads, thin stick arms, flat warm colors, playful documentary-comedy tone, 16:9. Characters, identical in every frame: Senbi the groom: young man, straight black bowl-cut hair with bangs, gold headband with a gold cobra, bare chest, blue-and-gold broad collar, gold bracers, white kilt with a blue-and-gold sash, brown sandals, thin black stick arms. the Roman soldiers: crimson plumed helmets, steel armor, red cloaks, rectangular red shields. Setting: sunny daytime ancient Egyptian wedding courtyard in Alexandria: flat-roofed sandstone mud-brick buildings, tall Egyptian columns with lotus-bud capitals painted in blue-and-gold bands, hieroglyph-style carvings on the walls, long tables with white cloths and clay jars, orange cloth awnings, and a tall wooden entrance gate at the back-center that opens onto the street. Egyptian architecture only: no Greek or Roman architecture, no triangular pediments, no domes, no red tile roofs, no cypress trees. Lighting: warm bright afternoon sunlight, soft shadows, rich saturated colors. ACTION TIMELINE (8 seconds): 0–2.5 s: Senbi dances proudly beside a Roman soldier, beaming. 2.5–5.5 s: he waves his arm wildly, gesturing for the soldier to follow. 5.5–8 s: the soldier hesitates, then copies Senbi's arm movement stiffly with a flicker of a smile. Camera: locked-off and perfectly still, eye-level medium two-shot; the framing never changes (no tilt, pan, zoom or rising camera). Audio: voice-over narration only (a voice, never shown on screen; no narrator character appears): a British male voice, warm and dry, begins speaking within half a second and says: “Senbi, ever the host, invited one to join. Of course he did.” The line takes about 4.8 seconds; leave the last second free of speech so the moment can land. Music: playful comic percussion over the wedding rhythm, low under the voice. Sound effects: laughter, hand claps, timed to the action. Ambience: light courtyard ambience: clinking cups, footsteps on stone, a soft breeze, no words. Final reminder: no character says any word; only the voice-over narration speaks (voice only, nobody on screen is the narrator). Natural laughs, gasps and sighs are fine. No text, captions or logos in the frame.</w:t>
       </w:r>
     </w:p>
     <w:p>
@@ -2541,7 +2587,7 @@
           <w:sz w:val="20"/>
           <w:szCs w:val="20"/>
         </w:rPr>
-        <w:t xml:space="preserve">VOICE RULE: only the voice-over narration speaks words; it is a voice only, never a person or character on screen. No character says any word and no one on screen lip-syncs to speech; characters communicate with facial expressions and body gestures. Natural non-verbal sounds are allowed and should sound real: laughing, giggling, gasping, sighing, groaning, cheering, coughing. Attached reference images, in order: the bride, Senbi, the groom, the Roman soldiers. 2D hand-drawn stickman cartoon in the exact style of the reference images: thin black outlines, large expressive heads, thin stick arms, flat warm colors, playful documentary-comedy tone, 16:9. Characters, identical in every frame: the bride: black bob hair with straight bangs, gold headband with a red gem, white dress, blue-and-gold collar, gold sash, gold arm cuffs, light veil. Setting: sunny daytime wedding courtyard in ancient Alexandria, sandstone columns with painted blue-and-gold bands, long tables with white cloths and clay jars, orange cloth awnings, and a tall wooden entrance gate at the back-center that opens onto the street. Lighting: warm bright afternoon sunlight, soft shadows, rich saturated colors. ACTION TIMELINE (8 seconds): 0–2.5 s: the bride watches, amused, with polite delight. 2.5–5.5 s: her smile freezes as she sees Senbi dancing with the Romans. 5.5–8 s: she slowly lifts a hand and covers her face, shoulders shaking. Camera: locked-off and perfectly still, eye-level medium close-up of the bride; the framing never changes (no tilt, pan, zoom or rising camera). Audio: voice-over narration only (a voice, never shown on screen; no narrator character appears): a British male voice, warm and dry, begins speaking within half a second and says: “His bride slowly covered her face. This was not in the contract.” The line takes about 4.8 seconds; leave the last second free of speech so the moment can land. Music: playful comic percussion over the wedding rhythm, low under the voice. Sound effects: gasp, muffled laugh, timed to the action. Ambience: light courtyard ambience: clinking cups, footsteps on stone, a soft breeze, no words. Final reminder: no character says any word; only the voice-over narration speaks (voice only, nobody on screen is the narrator). Natural laughs, gasps and sighs are fine. No text, captions or logos in the frame.</w:t>
+        <w:t xml:space="preserve">VOICE RULE: only the voice-over narration speaks words; it is a voice only, never a person or character on screen. No character says any word and no one on screen lip-syncs to speech; characters communicate with facial expressions and body gestures. Natural non-verbal sounds are allowed and should sound real: laughing, giggling, gasping, sighing, groaning, cheering, coughing. Attached reference images, in order: the bride, Senbi, the groom, the Roman soldiers. 2D hand-drawn stickman cartoon in the exact style of the reference images: thin black outlines, large expressive heads, thin stick arms, flat warm colors, playful documentary-comedy tone, 16:9. Characters, identical in every frame: the bride: black bob hair with straight bangs, gold headband with a red gem, white dress, blue-and-gold collar, gold sash, gold arm cuffs, light veil. Setting: sunny daytime ancient Egyptian wedding courtyard in Alexandria: flat-roofed sandstone mud-brick buildings, tall Egyptian columns with lotus-bud capitals painted in blue-and-gold bands, hieroglyph-style carvings on the walls, long tables with white cloths and clay jars, orange cloth awnings, and a tall wooden entrance gate at the back-center that opens onto the street. Egyptian architecture only: no Greek or Roman architecture, no triangular pediments, no domes, no red tile roofs, no cypress trees. Lighting: warm bright afternoon sunlight, soft shadows, rich saturated colors. ACTION TIMELINE (8 seconds): 0–2.5 s: the bride watches, amused, with polite delight. 2.5–5.5 s: her smile freezes as she sees Senbi dancing with the Romans. 5.5–8 s: she slowly lifts a hand and covers her face, shoulders shaking. Camera: locked-off and perfectly still, eye-level medium close-up of the bride; the framing never changes (no tilt, pan, zoom or rising camera). Audio: voice-over narration only (a voice, never shown on screen; no narrator character appears): a British male voice, warm and dry, begins speaking within half a second and says: “His bride slowly covered her face. This was not in the contract.” The line takes about 4.8 seconds; leave the last second free of speech so the moment can land. Music: playful comic percussion over the wedding rhythm, low under the voice. Sound effects: gasp, muffled laugh, timed to the action. Ambience: light courtyard ambience: clinking cups, footsteps on stone, a soft breeze, no words. Final reminder: no character says any word; only the voice-over narration speaks (voice only, nobody on screen is the narrator). Natural laughs, gasps and sighs are fine. No text, captions or logos in the frame.</w:t>
       </w:r>
     </w:p>
     <w:p>
@@ -2614,7 +2660,7 @@
           <w:sz w:val="20"/>
           <w:szCs w:val="20"/>
         </w:rPr>
-        <w:t xml:space="preserve">VOICE RULE: only the voice-over narration speaks words; it is a voice only, never a person or character on screen. No character says any word and no one on screen lip-syncs to speech; characters communicate with facial expressions and body gestures. Natural non-verbal sounds are allowed and should sound real: laughing, giggling, gasping, sighing, groaning, cheering, coughing. Attached reference images, in order: the Egyptian wedding guests, the Roman soldiers, the wedding courtyard. 2D hand-drawn stickman cartoon in the exact style of the reference images: thin black outlines, large expressive heads, thin stick arms, flat warm colors, playful documentary-comedy tone, 16:9. Characters, identical in every frame: Senbi the groom: young man, straight black bowl-cut hair with bangs, gold headband with a gold cobra, bare chest, blue-and-gold broad collar, gold bracers, white kilt with a blue-and-gold sash, brown sandals, thin black stick arms. the guests: Egyptian wedding guests in white linen with blue-and-gold collars and gold headbands, black bob hairstyles, some in white striped headdresses. the Roman soldiers: crimson plumed helmets, steel armor, red cloaks, rectangular red shields. Setting: sunny daytime wedding courtyard in ancient Alexandria, sandstone columns with painted blue-and-gold bands, long tables with white cloths and clay jars, orange cloth awnings, and a tall wooden entrance gate at the back-center that opens onto the street. Lighting: warm bright afternoon sunlight, soft shadows, rich saturated colors. ACTION TIMELINE (8 seconds): 0–2 s: the dance is in full swing. 2–3 s: a sharp military horn blasts. 3–8 s: everyone freezes mid-step, Egyptians and Romans together, in a comic tableau: a soldier on one leg, a guest mid-spin, Senbi with arms raised, eyes darting toward the gate; hold completely still. Camera: locked-off and perfectly still, eye-level wide shot; the framing never changes (no tilt, pan, zoom or rising camera). Audio: voice-over narration only (a voice, never shown on screen; no narrator character appears): a British male voice, warm and dry, begins speaking within half a second and says: “Then a horn cut through the music, and everyone froze mid-step.” The line takes about 4.4 seconds; leave the last second free of speech so the moment can land. Music: music nearly silent. Sound effects: sharp military horn, then silence, timed to the action. Ambience: light courtyard ambience: clinking cups, footsteps on stone, a soft breeze, no words. Final reminder: no character says any word; only the voice-over narration speaks (voice only, nobody on screen is the narrator). Natural laughs, gasps and sighs are fine. No text, captions or logos in the frame.</w:t>
+        <w:t xml:space="preserve">VOICE RULE: only the voice-over narration speaks words; it is a voice only, never a person or character on screen. No character says any word and no one on screen lip-syncs to speech; characters communicate with facial expressions and body gestures. Natural non-verbal sounds are allowed and should sound real: laughing, giggling, gasping, sighing, groaning, cheering, coughing. Attached reference images, in order: the Egyptian wedding guests, the Roman soldiers, the wedding courtyard. 2D hand-drawn stickman cartoon in the exact style of the reference images: thin black outlines, large expressive heads, thin stick arms, flat warm colors, playful documentary-comedy tone, 16:9. Characters, identical in every frame: Senbi the groom: young man, straight black bowl-cut hair with bangs, gold headband with a gold cobra, bare chest, blue-and-gold broad collar, gold bracers, white kilt with a blue-and-gold sash, brown sandals, thin black stick arms. the guests: Egyptian wedding guests in white linen with blue-and-gold collars and gold headbands, black bob hairstyles, some in white striped headdresses. They wear only short white kilts or simple white dresses: no togas, no draped robes. the Roman soldiers: crimson plumed helmets, steel armor, red cloaks, rectangular red shields. Setting: sunny daytime ancient Egyptian wedding courtyard in Alexandria: flat-roofed sandstone mud-brick buildings, tall Egyptian columns with lotus-bud capitals painted in blue-and-gold bands, hieroglyph-style carvings on the walls, long tables with white cloths and clay jars, orange cloth awnings, and a tall wooden entrance gate at the back-center that opens onto the street. Egyptian architecture only: no Greek or Roman architecture, no triangular pediments, no domes, no red tile roofs, no cypress trees. Lighting: warm bright afternoon sunlight, soft shadows, rich saturated colors. ACTION TIMELINE (8 seconds): 0–2 s: the dance is in full swing. 2–3 s: a sharp military horn blasts. 3–8 s: everyone freezes mid-step, Egyptians and Romans together, in a comic tableau: a soldier on one leg, a guest mid-spin, Senbi with arms raised, eyes darting toward the gate; hold completely still. Camera: locked-off and perfectly still, eye-level wide shot; the framing never changes (no tilt, pan, zoom or rising camera). Audio: voice-over narration only (a voice, never shown on screen; no narrator character appears): a British male voice, warm and dry, begins speaking within half a second and says: “Then a horn cut through the music, and everyone froze mid-step.” The line takes about 4.4 seconds; leave the last second free of speech so the moment can land. Music: music nearly silent. Sound effects: sharp military horn, then silence, timed to the action. Ambience: light courtyard ambience: clinking cups, footsteps on stone, a soft breeze, no words. Final reminder: no character says any word; only the voice-over narration speaks (voice only, nobody on screen is the narrator). Natural laughs, gasps and sighs are fine. No text, captions or logos in the frame.</w:t>
       </w:r>
     </w:p>
     <w:p>
@@ -2687,7 +2733,7 @@
           <w:sz w:val="20"/>
           <w:szCs w:val="20"/>
         </w:rPr>
-        <w:t xml:space="preserve">VOICE RULE: only the voice-over narration speaks words; it is a voice only, never a person or character on screen. No character says any word and no one on screen lip-syncs to speech; characters communicate with facial expressions and body gestures. Natural non-verbal sounds are allowed and should sound real: laughing, giggling, gasping, sighing, groaning, cheering, coughing. Attached reference images, in order: the Roman commander, the Roman soldiers, the wedding courtyard. 2D hand-drawn stickman cartoon in the exact style of the reference images: thin black outlines, large expressive heads, thin stick arms, flat warm colors, playful documentary-comedy tone, 16:9. Characters, identical in every frame: the Roman commander: dark curly gray-streaked hair, gold laurel wreath, bronze-and-gold armor, red cloak. the Roman soldiers: crimson plumed helmets, steel armor, red cloaks, rectangular red shields. Setting: sunny daytime wedding courtyard in ancient Alexandria, sandstone columns with painted blue-and-gold bands, long tables with white cloths and clay jars, orange cloth awnings, and a tall wooden entrance gate at the back-center that opens onto the street. Lighting: warm bright afternoon sunlight, soft shadows, rich saturated colors. ACTION TIMELINE (8 seconds): 0–2 s: the tall wooden gate swings fully open. 2–5 s: the Roman commander walks calmly through, scroll in hand, red cloak swaying, while the dancing soldiers step aside. 5–8 s: he stops in the center and the courtyard falls silent, everyone looking at him. Camera: locked-off and perfectly still, fixed, slightly low angle that never tilts, on the commander walking in; the framing never changes (no tilt, pan, zoom or rising camera). Audio: voice-over narration only (a voice, never shown on screen; no narrator character appears): a British male voice, warm and dry, begins speaking within half a second and says: “And in walked the commander. The only adult in the building.” The line takes about 4.4 seconds; leave the last second free of speech so the moment can land. Music: low sustained tension with distant marching drums, almost silent. Sound effects: slow footsteps, cloak rustle, timed to the action. Ambience: light courtyard ambience: clinking cups, footsteps on stone, a soft breeze, no words. Final reminder: no character says any word; only the voice-over narration speaks (voice only, nobody on screen is the narrator). Natural laughs, gasps and sighs are fine. No text, captions or logos in the frame.</w:t>
+        <w:t xml:space="preserve">VOICE RULE: only the voice-over narration speaks words; it is a voice only, never a person or character on screen. No character says any word and no one on screen lip-syncs to speech; characters communicate with facial expressions and body gestures. Natural non-verbal sounds are allowed and should sound real: laughing, giggling, gasping, sighing, groaning, cheering, coughing. Attached reference images, in order: the Roman commander, the Roman soldiers, the wedding courtyard. 2D hand-drawn stickman cartoon in the exact style of the reference images: thin black outlines, large expressive heads, thin stick arms, flat warm colors, playful documentary-comedy tone, 16:9. Characters, identical in every frame: the Roman commander: dark curly gray-streaked hair, gold laurel wreath, bronze-and-gold armor, red cloak. the Roman soldiers: crimson plumed helmets, steel armor, red cloaks, rectangular red shields. Setting: sunny daytime ancient Egyptian wedding courtyard in Alexandria: flat-roofed sandstone mud-brick buildings, tall Egyptian columns with lotus-bud capitals painted in blue-and-gold bands, hieroglyph-style carvings on the walls, long tables with white cloths and clay jars, orange cloth awnings, and a tall wooden entrance gate at the back-center that opens onto the street. Egyptian architecture only: no Greek or Roman architecture, no triangular pediments, no domes, no red tile roofs, no cypress trees. Lighting: warm bright afternoon sunlight, soft shadows, rich saturated colors. ACTION TIMELINE (8 seconds): 0–2 s: the tall wooden gate swings fully open. 2–5 s: the Roman commander walks calmly through, scroll in hand, red cloak swaying, while the dancing soldiers step aside. 5–8 s: he stops in the center and the courtyard falls silent, everyone looking at him. Camera: locked-off and perfectly still, fixed, slightly low angle that never tilts, on the commander walking in; the framing never changes (no tilt, pan, zoom or rising camera). Audio: voice-over narration only (a voice, never shown on screen; no narrator character appears): a British male voice, warm and dry, begins speaking within half a second and says: “And in walked the commander. The only adult in the building.” The line takes about 4.4 seconds; leave the last second free of speech so the moment can land. Music: low sustained tension with distant marching drums, almost silent. Sound effects: slow footsteps, cloak rustle, timed to the action. Ambience: light courtyard ambience: clinking cups, footsteps on stone, a soft breeze, no words. Final reminder: no character says any word; only the voice-over narration speaks (voice only, nobody on screen is the narrator). Natural laughs, gasps and sighs are fine. No text, captions or logos in the frame.</w:t>
       </w:r>
     </w:p>
     <w:p>
@@ -2760,7 +2806,7 @@
           <w:sz w:val="20"/>
           <w:szCs w:val="20"/>
         </w:rPr>
-        <w:t xml:space="preserve">VOICE RULE: only the voice-over narration speaks words; it is a voice only, never a person or character on screen. No character says any word and no one on screen lip-syncs to speech; characters communicate with facial expressions and body gestures. Natural non-verbal sounds are allowed and should sound real: laughing, giggling, gasping, sighing, groaning, cheering, coughing. Attached reference images, in order: the Roman commander, the black cat. 2D hand-drawn stickman cartoon in the exact style of the reference images: thin black outlines, large expressive heads, thin stick arms, flat warm colors, playful documentary-comedy tone, 16:9. Characters, identical in every frame: the Roman commander: dark curly gray-streaked hair, gold laurel wreath, bronze-and-gold armor, red cloak. the cat: black with a small gold collar. Setting: sunny daytime wedding courtyard in ancient Alexandria, sandstone columns with painted blue-and-gold bands, long tables with white cloths and clay jars, orange cloth awnings, and a tall wooden entrance gate at the back-center that opens onto the street. Lighting: warm bright afternoon sunlight, soft shadows, rich saturated colors. ACTION TIMELINE (8 seconds): 0–2.5 s: the commander in the foreground; his eyes land on the black cat on the table behind him. 2.5–5.5 s: the cat stares straight back, unblinking. 5.5–8 s: a muscle in the commander's jaw twitches and he looks away first. Camera: locked-off and perfectly still, eye-level medium two-shot: the commander in the foreground, the cat on the table behind him; no cutting; the framing never changes (no tilt, pan, zoom or rising camera). Audio: voice-over narration only (a voice, never shown on screen; no narrator character appears): a British male voice, warm and dry, begins speaking within half a second and says: “The cat looked back. The cat was not impressed by the Roman Empire.” The line takes about 5.2 seconds; leave the last second free of speech so the moment can land. Music: music nearly silent. Sound effects: cat meow, tiny sting, timed to the action. Ambience: light courtyard ambience: clinking cups, footsteps on stone, a soft breeze, no words. Final reminder: no character says any word; only the voice-over narration speaks (voice only, nobody on screen is the narrator). Natural laughs, gasps and sighs are fine. No text, captions or logos in the frame.</w:t>
+        <w:t xml:space="preserve">VOICE RULE: only the voice-over narration speaks words; it is a voice only, never a person or character on screen. No character says any word and no one on screen lip-syncs to speech; characters communicate with facial expressions and body gestures. Natural non-verbal sounds are allowed and should sound real: laughing, giggling, gasping, sighing, groaning, cheering, coughing. Attached reference images, in order: the Roman commander, the black cat. 2D hand-drawn stickman cartoon in the exact style of the reference images: thin black outlines, large expressive heads, thin stick arms, flat warm colors, playful documentary-comedy tone, 16:9. Characters, identical in every frame: the Roman commander: dark curly gray-streaked hair, gold laurel wreath, bronze-and-gold armor, red cloak. the cat: black with a small gold collar. Setting: sunny daytime ancient Egyptian wedding courtyard in Alexandria: flat-roofed sandstone mud-brick buildings, tall Egyptian columns with lotus-bud capitals painted in blue-and-gold bands, hieroglyph-style carvings on the walls, long tables with white cloths and clay jars, orange cloth awnings, and a tall wooden entrance gate at the back-center that opens onto the street. Egyptian architecture only: no Greek or Roman architecture, no triangular pediments, no domes, no red tile roofs, no cypress trees. Lighting: warm bright afternoon sunlight, soft shadows, rich saturated colors. ACTION TIMELINE (8 seconds): 0–2.5 s: the commander in the foreground; his eyes land on the black cat on the table behind him. 2.5–5.5 s: the cat stares straight back, unblinking. 5.5–8 s: a muscle in the commander's jaw twitches and he looks away first. Camera: locked-off and perfectly still, eye-level medium two-shot: the commander in the foreground, the cat on the table behind him; no cutting; the framing never changes (no tilt, pan, zoom or rising camera). Audio: voice-over narration only (a voice, never shown on screen; no narrator character appears): a British male voice, warm and dry, begins speaking within half a second and says: “The cat looked back. The cat was not impressed by the Roman Empire.” The line takes about 5.2 seconds; leave the last second free of speech so the moment can land. Music: music nearly silent. Sound effects: cat meow, tiny sting, timed to the action. Ambience: light courtyard ambience: clinking cups, footsteps on stone, a soft breeze, no words. Final reminder: no character says any word; only the voice-over narration speaks (voice only, nobody on screen is the narrator). Natural laughs, gasps and sighs are fine. No text, captions or logos in the frame.</w:t>
       </w:r>
     </w:p>
     <w:p>
@@ -2833,7 +2879,7 @@
           <w:sz w:val="20"/>
           <w:szCs w:val="20"/>
         </w:rPr>
-        <w:t xml:space="preserve">VOICE RULE: only the voice-over narration speaks words; it is a voice only, never a person or character on screen. No character says any word and no one on screen lip-syncs to speech; characters communicate with facial expressions and body gestures. Natural non-verbal sounds are allowed and should sound real: laughing, giggling, gasping, sighing, groaning, cheering, coughing. Attached reference images, in order: the Roman commander, the Egyptian wedding guests, Senbi, the groom. 2D hand-drawn stickman cartoon in the exact style of the reference images: thin black outlines, large expressive heads, thin stick arms, flat warm colors, playful documentary-comedy tone, 16:9. Characters, identical in every frame: the Roman commander: dark curly gray-streaked hair, gold laurel wreath, bronze-and-gold armor, red cloak. the guests: Egyptian wedding guests in white linen with blue-and-gold collars and gold headbands, black bob hairstyles, some in white striped headdresses. the Roman soldiers: crimson plumed helmets, steel armor, red cloaks, rectangular red shields. Setting: sunny daytime wedding courtyard in ancient Alexandria, sandstone columns with painted blue-and-gold bands, long tables with white cloths and clay jars, orange cloth awnings, and a tall wooden entrance gate at the back-center that opens onto the street. Lighting: warm bright afternoon sunlight, soft shadows, rich saturated colors. ACTION TIMELINE (8 seconds): 0–2.5 s: the commander at the center lifts the scroll with both hands, Egyptians on his left and Romans on his right standing silent and still. 2.5–5.5 s: he unrolls it slowly, papyrus falling to his waist, only abstract marks on it. 5.5–8 s: he lifts his chin as if about to read; everyone is silent. Camera: locked-off and perfectly still, symmetrical eye-level medium-wide shot; the framing never changes (no tilt, pan, zoom or rising camera). Audio: voice-over narration only (a voice, never shown on screen; no narrator character appears): a British male voice, warm and dry, begins speaking within half a second and says: “He unrolled the scroll. Message received: Egypt has new management.” The line takes about 4.0 seconds; leave the last second free of speech so the moment can land. Music: low sustained tension with distant marching drums, almost silent. Sound effects: scroll unrolling, one dramatic drum hit, timed to the action. Ambience: light courtyard ambience: clinking cups, footsteps on stone, a soft breeze, no words. Final reminder: no character says any word; only the voice-over narration speaks (voice only, nobody on screen is the narrator). Natural laughs, gasps and sighs are fine. No text, captions or logos in the frame.</w:t>
+        <w:t xml:space="preserve">VOICE RULE: only the voice-over narration speaks words; it is a voice only, never a person or character on screen. No character says any word and no one on screen lip-syncs to speech; characters communicate with facial expressions and body gestures. Natural non-verbal sounds are allowed and should sound real: laughing, giggling, gasping, sighing, groaning, cheering, coughing. Attached reference images, in order: the Roman commander, the Egyptian wedding guests, Senbi, the groom. 2D hand-drawn stickman cartoon in the exact style of the reference images: thin black outlines, large expressive heads, thin stick arms, flat warm colors, playful documentary-comedy tone, 16:9. Characters, identical in every frame: the Roman commander: dark curly gray-streaked hair, gold laurel wreath, bronze-and-gold armor, red cloak. the guests: Egyptian wedding guests in white linen with blue-and-gold collars and gold headbands, black bob hairstyles, some in white striped headdresses. They wear only short white kilts or simple white dresses: no togas, no draped robes. the Roman soldiers: crimson plumed helmets, steel armor, red cloaks, rectangular red shields. Setting: sunny daytime ancient Egyptian wedding courtyard in Alexandria: flat-roofed sandstone mud-brick buildings, tall Egyptian columns with lotus-bud capitals painted in blue-and-gold bands, hieroglyph-style carvings on the walls, long tables with white cloths and clay jars, orange cloth awnings, and a tall wooden entrance gate at the back-center that opens onto the street. Egyptian architecture only: no Greek or Roman architecture, no triangular pediments, no domes, no red tile roofs, no cypress trees. Lighting: warm bright afternoon sunlight, soft shadows, rich saturated colors. ACTION TIMELINE (8 seconds): 0–2.5 s: the commander at the center lifts the scroll with both hands, Egyptians on his left and Romans on his right standing silent and still. 2.5–5.5 s: he unrolls it slowly, papyrus falling to his waist, only abstract marks on it. 5.5–8 s: he lifts his chin as if about to read; everyone is silent. Camera: locked-off and perfectly still, symmetrical eye-level medium-wide shot; the framing never changes (no tilt, pan, zoom or rising camera). Audio: voice-over narration only (a voice, never shown on screen; no narrator character appears): a British male voice, warm and dry, begins speaking within half a second and says: “He unrolled the scroll. Message received: Egypt has new management.” The line takes about 4.0 seconds; leave the last second free of speech so the moment can land. Music: low sustained tension with distant marching drums, almost silent. Sound effects: scroll unrolling, one dramatic drum hit, timed to the action. Ambience: light courtyard ambience: clinking cups, footsteps on stone, a soft breeze, no words. Final reminder: no character says any word; only the voice-over narration speaks (voice only, nobody on screen is the narrator). Natural laughs, gasps and sighs are fine. No text, captions or logos in the frame.</w:t>
       </w:r>
     </w:p>
     <w:p>
@@ -2906,7 +2952,7 @@
           <w:sz w:val="20"/>
           <w:szCs w:val="20"/>
         </w:rPr>
-        <w:t xml:space="preserve">VOICE RULE: only the voice-over narration speaks words; it is a voice only, never a person or character on screen. No character says any word and no one on screen lip-syncs to speech; characters communicate with facial expressions and body gestures. Natural non-verbal sounds are allowed and should sound real: laughing, giggling, gasping, sighing, groaning, cheering, coughing. Attached reference images, in order: Senbi, the groom, the bride, the Egyptian wedding guests. 2D hand-drawn stickman cartoon in the exact style of the reference images: thin black outlines, large expressive heads, thin stick arms, flat warm colors, playful documentary-comedy tone, 16:9. Characters, identical in every frame: Senbi the groom: young man, straight black bowl-cut hair with bangs, gold headband with a gold cobra, bare chest, blue-and-gold broad collar, gold bracers, white kilt with a blue-and-gold sash, brown sandals, thin black stick arms. the bride: black bob hair with straight bangs, gold headband with a red gem, white dress, blue-and-gold collar, gold sash, gold arm cuffs, light veil. Setting: sunny daytime wedding courtyard in ancient Alexandria, sandstone columns with painted blue-and-gold bands, long tables with white cloths and clay jars, orange cloth awnings, and a tall wooden entrance gate at the back-center that opens onto the street. Lighting: warm bright afternoon sunlight, soft shadows, rich saturated colors. ACTION TIMELINE (8 seconds): 0–2.5 s: Senbi and the bride look forward, shocked. 2.5–5.5 s: Senbi slowly turns his head toward the bride. 5.5–8 s: the bride turns to him, they exchange a wide-eyed look and Senbi forces a smile. Camera: locked-off and perfectly still, eye-level medium two-shot of Senbi and the bride; the framing never changes (no tilt, pan, zoom or rising camera). Audio: voice-over narration only (a voice, never shown on screen; no narrator character appears): a British male voice, warm and dry, begins speaking within half a second and says: “Senbi looked at his bride. Same question, silently: is the wedding still on?” The line takes about 5.2 seconds; leave the last second free of speech so the moment can land. Music: low sustained tension with distant marching drums, almost silent. Sound effects: nervous breath, single drum, timed to the action. Ambience: light courtyard ambience: clinking cups, footsteps on stone, a soft breeze, no words. Final reminder: no character says any word; only the voice-over narration speaks (voice only, nobody on screen is the narrator). Natural laughs, gasps and sighs are fine. No text, captions or logos in the frame.</w:t>
+        <w:t xml:space="preserve">VOICE RULE: only the voice-over narration speaks words; it is a voice only, never a person or character on screen. No character says any word and no one on screen lip-syncs to speech; characters communicate with facial expressions and body gestures. Natural non-verbal sounds are allowed and should sound real: laughing, giggling, gasping, sighing, groaning, cheering, coughing. Attached reference images, in order: Senbi, the groom, the bride, the Egyptian wedding guests. 2D hand-drawn stickman cartoon in the exact style of the reference images: thin black outlines, large expressive heads, thin stick arms, flat warm colors, playful documentary-comedy tone, 16:9. Characters, identical in every frame: Senbi the groom: young man, straight black bowl-cut hair with bangs, gold headband with a gold cobra, bare chest, blue-and-gold broad collar, gold bracers, white kilt with a blue-and-gold sash, brown sandals, thin black stick arms. the bride: black bob hair with straight bangs, gold headband with a red gem, white dress, blue-and-gold collar, gold sash, gold arm cuffs, light veil. Setting: sunny daytime ancient Egyptian wedding courtyard in Alexandria: flat-roofed sandstone mud-brick buildings, tall Egyptian columns with lotus-bud capitals painted in blue-and-gold bands, hieroglyph-style carvings on the walls, long tables with white cloths and clay jars, orange cloth awnings, and a tall wooden entrance gate at the back-center that opens onto the street. Egyptian architecture only: no Greek or Roman architecture, no triangular pediments, no domes, no red tile roofs, no cypress trees. Lighting: warm bright afternoon sunlight, soft shadows, rich saturated colors. ACTION TIMELINE (8 seconds): 0–2.5 s: Senbi and the bride look forward, shocked. 2.5–5.5 s: Senbi slowly turns his head toward the bride. 5.5–8 s: the bride turns to him, they exchange a wide-eyed look and Senbi forces a smile. Camera: locked-off and perfectly still, eye-level medium two-shot of Senbi and the bride; the framing never changes (no tilt, pan, zoom or rising camera). Audio: voice-over narration only (a voice, never shown on screen; no narrator character appears): a British male voice, warm and dry, begins speaking within half a second and says: “Senbi looked at his bride. Same question, silently: is the wedding still on?” The line takes about 5.2 seconds; leave the last second free of speech so the moment can land. Music: low sustained tension with distant marching drums, almost silent. Sound effects: nervous breath, single drum, timed to the action. Ambience: light courtyard ambience: clinking cups, footsteps on stone, a soft breeze, no words. Final reminder: no character says any word; only the voice-over narration speaks (voice only, nobody on screen is the narrator). Natural laughs, gasps and sighs are fine. No text, captions or logos in the frame.</w:t>
       </w:r>
     </w:p>
     <w:p>
@@ -2979,7 +3025,7 @@
           <w:sz w:val="20"/>
           <w:szCs w:val="20"/>
         </w:rPr>
-        <w:t xml:space="preserve">VOICE RULE: only the voice-over narration speaks words; it is a voice only, never a person or character on screen. No character says any word and no one on screen lip-syncs to speech; characters communicate with facial expressions and body gestures. Natural non-verbal sounds are allowed and should sound real: laughing, giggling, gasping, sighing, groaning, cheering, coughing. Attached reference images, in order: the Alexandria harbor, the Roman soldiers. 2D hand-drawn stickman cartoon in the exact style of the reference images: thin black outlines, large expressive heads, thin stick arms, flat warm colors, playful documentary-comedy tone, 16:9. Characters, identical in every frame: the Roman soldiers: crimson plumed helmets, steel armor, red cloaks, rectangular red shields. Setting: sunlit street of ancient Alexandria outside the wedding house, sandstone walls, palms, market stalls with red and blue awnings. Lighting: warm bright sunlight, soft shadows. ACTION TIMELINE (8 seconds): 0–2.5 s: a few Roman soldiers pass through the street. 2.5–5.5 s: ordinary Egyptians carry baskets, bargain and haul jars as usual. 5.5–8 s: a boy runs across the frame; life goes on. Camera: locked-off and perfectly still, eye-level wide observational shot of Alexandria; the framing never changes (no tilt, pan, zoom or rising camera). Audio: voice-over narration only (a voice, never shown on screen; no narrator character appears): a British male voice, warm and dry, begins speaking within half a second and says: “To be clear: Senbi and his wedding are fiction. The cat, sadly, too.” The line takes about 5.2 seconds; leave the last second free of speech so the moment can land. Music: music nearly silent. Sound effects: calm city ambience, timed to the action. Ambience: sunlit street ambience: wind and distant clatter, no words. Final reminder: no character says any word; only the voice-over narration speaks (voice only, nobody on screen is the narrator). Natural laughs, gasps and sighs are fine. No text, captions or logos in the frame.</w:t>
+        <w:t xml:space="preserve">VOICE RULE: only the voice-over narration speaks words; it is a voice only, never a person or character on screen. No character says any word and no one on screen lip-syncs to speech; characters communicate with facial expressions and body gestures. Natural non-verbal sounds are allowed and should sound real: laughing, giggling, gasping, sighing, groaning, cheering, coughing. Attached reference images, in order: the Alexandria harbor, the Roman soldiers. 2D hand-drawn stickman cartoon in the exact style of the reference images: thin black outlines, large expressive heads, thin stick arms, flat warm colors, playful documentary-comedy tone, 16:9. Characters, identical in every frame: the Roman soldiers: crimson plumed helmets, steel armor, red cloaks, rectangular red shields. Setting: sunlit street of ancient Alexandria outside the wedding house, sandstone walls, palms, market stalls with red and blue awnings. Flat-roofed Egyptian sandstone buildings; no Greek or Roman architecture, no domes. Lighting: warm bright sunlight, soft shadows. ACTION TIMELINE (8 seconds): 0–2.5 s: a few Roman soldiers pass through the street. 2.5–5.5 s: ordinary Egyptians carry baskets, bargain and haul jars as usual. 5.5–8 s: a boy runs across the frame; life goes on. Camera: locked-off and perfectly still, eye-level wide observational shot of Alexandria; the framing never changes (no tilt, pan, zoom or rising camera). Audio: voice-over narration only (a voice, never shown on screen; no narrator character appears): a British male voice, warm and dry, begins speaking within half a second and says: “To be clear: Senbi and his wedding are fiction. The cat, sadly, too.” The line takes about 5.2 seconds; leave the last second free of speech so the moment can land. Music: music nearly silent. Sound effects: calm city ambience, timed to the action. Ambience: sunlit street ambience: wind and distant clatter, no words. Final reminder: no character says any word; only the voice-over narration speaks (voice only, nobody on screen is the narrator). Natural laughs, gasps and sighs are fine. No text, captions or logos in the frame.</w:t>
       </w:r>
     </w:p>
     <w:p>
@@ -3142,7 +3188,7 @@
           <w:sz w:val="20"/>
           <w:szCs w:val="20"/>
         </w:rPr>
-        <w:t xml:space="preserve">VOICE RULE: only the voice-over narration speaks words; it is a voice only, never a person or character on screen. No character says any word and no one on screen lip-syncs to speech; characters communicate with facial expressions and body gestures. Natural non-verbal sounds are allowed and should sound real: laughing, giggling, gasping, sighing, groaning, cheering, coughing. Attached reference images, in order: Senbi, the groom, the bride's relatives. 2D hand-drawn stickman cartoon in the exact style of the reference images: thin black outlines, large expressive heads, thin stick arms, flat warm colors, playful documentary-comedy tone, 16:9. Characters, identical in every frame: Senbi the groom: young man, straight black bowl-cut hair with bangs, gold headband with a gold cobra, bare chest, blue-and-gold broad collar, gold bracers, white kilt with a blue-and-gold sash, brown sandals, thin black stick arms. Setting: sunny daytime wedding courtyard in ancient Alexandria, sandstone columns with painted blue-and-gold bands, long tables with white cloths and clay jars, orange cloth awnings, and a tall wooden entrance gate at the back-center that opens onto the street. Lighting: warm bright afternoon sunlight, soft shadows, rich saturated colors. ACTION TIMELINE (6 seconds): 0–2 s: Senbi looks down at the wooden headrest in his hands, turning it over. 2–4 s: he slowly lifts his gaze toward the Roman commander off-screen to the right. 4–6 s: a tired deadpan stare, a long slow blink, his shoulders drop. Camera: locked-off and perfectly still, eye-level medium close-up with the headrest in Senbi's hands and his face both in frame; the framing never changes (no tilt, pan, zoom or rising camera). Audio: voice-over narration only (a voice, never shown on screen; no narrator character appears): a British male voice, warm and dry, begins speaking within half a second and says: “Headrest, then commander. Neither came with a return policy.” The line takes about 3.6 seconds; leave the last second free of speech so the moment can land. Music: playful comic percussion over the wedding rhythm, low under the voice. Sound effects: wood knock, comic sting, timed to the action. Ambience: light courtyard ambience: clinking cups, footsteps on stone, a soft breeze, no words. Final reminder: no character says any word; only the voice-over narration speaks (voice only, nobody on screen is the narrator). Natural laughs, gasps and sighs are fine. No text, captions or logos in the frame.</w:t>
+        <w:t xml:space="preserve">VOICE RULE: only the voice-over narration speaks words; it is a voice only, never a person or character on screen. No character says any word and no one on screen lip-syncs to speech; characters communicate with facial expressions and body gestures. Natural non-verbal sounds are allowed and should sound real: laughing, giggling, gasping, sighing, groaning, cheering, coughing. Attached reference images, in order: Senbi, the groom, the bride's relatives. 2D hand-drawn stickman cartoon in the exact style of the reference images: thin black outlines, large expressive heads, thin stick arms, flat warm colors, playful documentary-comedy tone, 16:9. Characters, identical in every frame: Senbi the groom: young man, straight black bowl-cut hair with bangs, gold headband with a gold cobra, bare chest, blue-and-gold broad collar, gold bracers, white kilt with a blue-and-gold sash, brown sandals, thin black stick arms. Setting: sunny daytime ancient Egyptian wedding courtyard in Alexandria: flat-roofed sandstone mud-brick buildings, tall Egyptian columns with lotus-bud capitals painted in blue-and-gold bands, hieroglyph-style carvings on the walls, long tables with white cloths and clay jars, orange cloth awnings, and a tall wooden entrance gate at the back-center that opens onto the street. Egyptian architecture only: no Greek or Roman architecture, no triangular pediments, no domes, no red tile roofs, no cypress trees. Lighting: warm bright afternoon sunlight, soft shadows, rich saturated colors. ACTION TIMELINE (6 seconds): 0–2 s: Senbi looks down at the wooden headrest in his hands, turning it over. 2–4 s: he slowly lifts his gaze toward the Roman commander off-screen to the right. 4–6 s: a tired deadpan stare, a long slow blink, his shoulders drop. Camera: locked-off and perfectly still, eye-level medium close-up with the headrest in Senbi's hands and his face both in frame; the framing never changes (no tilt, pan, zoom or rising camera). Audio: voice-over narration only (a voice, never shown on screen; no narrator character appears): a British male voice, warm and dry, begins speaking within half a second and says: “Headrest, then commander. Neither came with a return policy.” The line takes about 3.6 seconds; leave the last second free of speech so the moment can land. Music: playful comic percussion over the wedding rhythm, low under the voice. Sound effects: wood knock, comic sting, timed to the action. Ambience: light courtyard ambience: clinking cups, footsteps on stone, a soft breeze, no words. Final reminder: no character says any word; only the voice-over narration speaks (voice only, nobody on screen is the narrator). Natural laughs, gasps and sighs are fine. No text, captions or logos in the frame.</w:t>
       </w:r>
     </w:p>
     <w:p>
@@ -3215,7 +3261,7 @@
           <w:sz w:val="20"/>
           <w:szCs w:val="20"/>
         </w:rPr>
-        <w:t xml:space="preserve">VOICE RULE: only the voice-over narration speaks words; it is a voice only, never a person or character on screen. No character says any word and no one on screen lip-syncs to speech; characters communicate with facial expressions and body gestures. Natural non-verbal sounds are allowed and should sound real: laughing, giggling, gasping, sighing, groaning, cheering, coughing. Attached reference images, in order: the bride, Senbi, the groom, the wedding courtyard. 2D hand-drawn stickman cartoon in the exact style of the reference images: thin black outlines, large expressive heads, thin stick arms, flat warm colors, playful documentary-comedy tone, 16:9. Characters, identical in every frame: Senbi the groom: young man, straight black bowl-cut hair with bangs, gold headband with a gold cobra, bare chest, blue-and-gold broad collar, gold bracers, white kilt with a blue-and-gold sash, brown sandals, thin black stick arms. the bride: black bob hair with straight bangs, gold headband with a red gem, white dress, blue-and-gold collar, gold sash, gold arm cuffs, light veil. Setting: sunny daytime wedding courtyard in ancient Alexandria, sandstone columns with painted blue-and-gold bands, long tables with white cloths and clay jars, orange cloth awnings, and a tall wooden entrance gate at the back-center that opens onto the street. Lighting: warm bright afternoon sunlight, soft shadows, rich saturated colors. ACTION TIMELINE (6 seconds): 0–2 s: the bride's shoulders begin to shake. 2–4 s: she bursts out laughing, a hand on her chest. 4–6 s: Senbi looks at her, then starts laughing too, tears in his eyes, and they lean on each other. Camera: locked-off and perfectly still, eye-level medium two-shot of Senbi and the bride; the framing never changes (no tilt, pan, zoom or rising camera). Audio: voice-over narration only (a voice, never shown on screen; no narrator character appears): a British male voice, warm and dry, begins speaking within half a second and says: “Senbi thought he was getting married.” The line takes about 2.4 seconds; leave the last second free of speech so the moment can land. Music: warm gentle resolution with the same flute and strings, low under the voice. Sound effects: bride laughter, Senbi laughter, timed to the action. Ambience: light courtyard ambience: clinking cups, footsteps on stone, a soft breeze, no words. Final reminder: no character says any word; only the voice-over narration speaks (voice only, nobody on screen is the narrator). Natural laughs, gasps and sighs are fine. No text, captions or logos in the frame.</w:t>
+        <w:t xml:space="preserve">VOICE RULE: only the voice-over narration speaks words; it is a voice only, never a person or character on screen. No character says any word and no one on screen lip-syncs to speech; characters communicate with facial expressions and body gestures. Natural non-verbal sounds are allowed and should sound real: laughing, giggling, gasping, sighing, groaning, cheering, coughing. Attached reference images, in order: the bride, Senbi, the groom, the wedding courtyard. 2D hand-drawn stickman cartoon in the exact style of the reference images: thin black outlines, large expressive heads, thin stick arms, flat warm colors, playful documentary-comedy tone, 16:9. Characters, identical in every frame: Senbi the groom: young man, straight black bowl-cut hair with bangs, gold headband with a gold cobra, bare chest, blue-and-gold broad collar, gold bracers, white kilt with a blue-and-gold sash, brown sandals, thin black stick arms. the bride: black bob hair with straight bangs, gold headband with a red gem, white dress, blue-and-gold collar, gold sash, gold arm cuffs, light veil. Setting: sunny daytime ancient Egyptian wedding courtyard in Alexandria: flat-roofed sandstone mud-brick buildings, tall Egyptian columns with lotus-bud capitals painted in blue-and-gold bands, hieroglyph-style carvings on the walls, long tables with white cloths and clay jars, orange cloth awnings, and a tall wooden entrance gate at the back-center that opens onto the street. Egyptian architecture only: no Greek or Roman architecture, no triangular pediments, no domes, no red tile roofs, no cypress trees. Lighting: warm bright afternoon sunlight, soft shadows, rich saturated colors. ACTION TIMELINE (6 seconds): 0–2 s: the bride's shoulders begin to shake. 2–4 s: she bursts out laughing, a hand on her chest. 4–6 s: Senbi looks at her, then starts laughing too, tears in his eyes, and they lean on each other. Camera: locked-off and perfectly still, eye-level medium two-shot of Senbi and the bride; the framing never changes (no tilt, pan, zoom or rising camera). Audio: voice-over narration only (a voice, never shown on screen; no narrator character appears): a British male voice, warm and dry, begins speaking within half a second and says: “Senbi thought he was getting married.” The line takes about 2.4 seconds; leave the last second free of speech so the moment can land. Music: warm gentle resolution with the same flute and strings, low under the voice. Sound effects: bride laughter, Senbi laughter, timed to the action. Ambience: light courtyard ambience: clinking cups, footsteps on stone, a soft breeze, no words. Final reminder: no character says any word; only the voice-over narration speaks (voice only, nobody on screen is the narrator). Natural laughs, gasps and sighs are fine. No text, captions or logos in the frame.</w:t>
       </w:r>
     </w:p>
     <w:p>
@@ -3361,7 +3407,7 @@
           <w:sz w:val="20"/>
           <w:szCs w:val="20"/>
         </w:rPr>
-        <w:t xml:space="preserve">VOICE RULE: only the voice-over narration speaks words; it is a voice only, never a person or character on screen. No character says any word and no one on screen lip-syncs to speech; characters communicate with facial expressions and body gestures. Natural non-verbal sounds are allowed and should sound real: laughing, giggling, gasping, sighing, groaning, cheering, coughing. Attached reference images, in order: Senbi, the groom, the bride, the Alexandria harbor. 2D hand-drawn stickman cartoon in the exact style of the reference images: thin black outlines, large expressive heads, thin stick arms, flat warm colors, playful documentary-comedy tone, 16:9. Characters, identical in every frame: Senbi the groom: young man, straight black bowl-cut hair with bangs, gold headband with a gold cobra, bare chest, blue-and-gold broad collar, gold bracers, white kilt with a blue-and-gold sash, brown sandals, thin black stick arms. the bride: black bob hair with straight bangs, gold headband with a red gem, white dress, blue-and-gold collar, gold sash, gold arm cuffs, light veil. the Roman soldiers: crimson plumed helmets, steel armor, red cloaks, rectangular red shields. Setting: sunny daytime wedding courtyard in ancient Alexandria, sandstone columns with painted blue-and-gold bands, long tables with white cloths and clay jars, orange cloth awnings, and a tall wooden entrance gate at the back-center that opens onto the street. Lighting: warm bright afternoon sunlight, soft shadows, rich saturated colors. ACTION TIMELINE (8 seconds): 0–2.5 s: warm evening light over Alexandria, Senbi and the bride in the foreground looking out at the city. 2.5–5.5 s: Roman soldiers are small figures in the distance, lights flickering on in the harbor. 5.5–8 s: the couple lean toward each other; the scene holds and slowly settles. Camera: locked-off and perfectly still, wide shot of Senbi and the bride in the foreground with Alexandria behind them; the framing never changes (no tilt, pan, zoom or rising camera). Audio: voice-over narration only (a voice, never shown on screen; no narrator character appears): a British male voice, warm and dry, begins speaking within half a second and says: “He just hadn't noticed he was also getting a new government.” The line takes about 4.4 seconds; leave the last second free of speech so the moment can land. Music: warm gentle resolution with the same flute and strings, low under the voice. Sound effects: gentle music, silence at the very end, timed to the action. Ambience: light courtyard ambience: clinking cups, footsteps on stone, a soft breeze, no words. Final reminder: no character says any word; only the voice-over narration speaks (voice only, nobody on screen is the narrator). Natural laughs, gasps and sighs are fine. No text, captions or logos in the frame.</w:t>
+        <w:t xml:space="preserve">VOICE RULE: only the voice-over narration speaks words; it is a voice only, never a person or character on screen. No character says any word and no one on screen lip-syncs to speech; characters communicate with facial expressions and body gestures. Natural non-verbal sounds are allowed and should sound real: laughing, giggling, gasping, sighing, groaning, cheering, coughing. Attached reference images, in order: Senbi, the groom, the bride, the Alexandria harbor. 2D hand-drawn stickman cartoon in the exact style of the reference images: thin black outlines, large expressive heads, thin stick arms, flat warm colors, playful documentary-comedy tone, 16:9. Characters, identical in every frame: Senbi the groom: young man, straight black bowl-cut hair with bangs, gold headband with a gold cobra, bare chest, blue-and-gold broad collar, gold bracers, white kilt with a blue-and-gold sash, brown sandals, thin black stick arms. the bride: black bob hair with straight bangs, gold headband with a red gem, white dress, blue-and-gold collar, gold sash, gold arm cuffs, light veil. the Roman soldiers: crimson plumed helmets, steel armor, red cloaks, rectangular red shields. Setting: sunny daytime ancient Egyptian wedding courtyard in Alexandria: flat-roofed sandstone mud-brick buildings, tall Egyptian columns with lotus-bud capitals painted in blue-and-gold bands, hieroglyph-style carvings on the walls, long tables with white cloths and clay jars, orange cloth awnings, and a tall wooden entrance gate at the back-center that opens onto the street. Egyptian architecture only: no Greek or Roman architecture, no triangular pediments, no domes, no red tile roofs, no cypress trees. Lighting: warm bright afternoon sunlight, soft shadows, rich saturated colors. ACTION TIMELINE (8 seconds): 0–2.5 s: warm evening light over Alexandria, Senbi and the bride in the foreground looking out at the city. 2.5–5.5 s: Roman soldiers are small figures in the distance, lights flickering on in the harbor. 5.5–8 s: the couple lean toward each other; the scene holds and slowly settles. Camera: locked-off and perfectly still, wide shot of Senbi and the bride in the foreground with Alexandria behind them; the framing never changes (no tilt, pan, zoom or rising camera). Audio: voice-over narration only (a voice, never shown on screen; no narrator character appears): a British male voice, warm and dry, begins speaking within half a second and says: “He just hadn't noticed he was also getting a new government.” The line takes about 4.4 seconds; leave the last second free of speech so the moment can land. Music: warm gentle resolution with the same flute and strings, low under the voice. Sound effects: gentle music, silence at the very end, timed to the action. Ambience: light courtyard ambience: clinking cups, footsteps on stone, a soft breeze, no words. Final reminder: no character says any word; only the voice-over narration speaks (voice only, nobody on screen is the narrator). Natural laughs, gasps and sighs are fine. No text, captions or logos in the frame.</w:t>
       </w:r>
     </w:p>
     <w:p>

</xml_diff>

<commit_message>
Episode 1 prompts: drop stick-arm wording, use proven style and reference-anchor sentence, keep Senbi's torso
Co-Authored-By: Claude Sonnet 5.5 <noreply@anthropic.com>
Claude-Session: https://claude.ai/code/session_01S29WeDgsXUpbHNWdisiPFj
</commit_message>
<xml_diff>
--- a/The_Last_Day_of_Ancient_Egypt_Ep1_FLOW_PROMPTS_READY.docx
+++ b/The_Last_Day_of_Ancient_Egypt_Ep1_FLOW_PROMPTS_READY.docx
@@ -599,7 +599,7 @@
           <w:sz w:val="20"/>
           <w:szCs w:val="20"/>
         </w:rPr>
-        <w:t xml:space="preserve">VOICE RULE: only the voice-over narration speaks words; it is a voice only, never a person on screen. No character says any word and no one lip-syncs; natural laughs, gasps and sighs are allowed and should sound real. Attached reference images, in order: Senbi, the groom, the bride, the wedding courtyard. 2D hand-drawn stickman cartoon in the exact style of the reference images: thin black outlines, large expressive heads, thin black stick arms and legs, flat warm colors, playful documentary-comedy tone, 16:9. Characters, identical in every frame: Senbi the groom: young man, straight black bowl-cut hair with bangs, gold headband with a gold cobra, bare chest, blue-and-gold broad collar, gold bracers, white kilt with a blue-and-gold sash, brown sandals, thin black stick arms. the bride: black bob hair with straight bangs, gold headband with a red gem, white dress, blue-and-gold collar, gold sash, gold arm cuffs, light veil. the guests: Egyptian wedding guests in white linen with blue-and-gold collars and gold headbands, black bob hairstyles, some in white striped headdresses. They wear only short white kilts or simple white dresses: no togas, no draped robes. Setting: sunny daytime ancient Egyptian wedding courtyard in Alexandria: flat-roofed sandstone mud-brick buildings, tall Egyptian columns with lotus-bud capitals painted in blue-and-gold bands, hieroglyph-style carvings on the walls, long tables with white cloths and clay jars, orange cloth awnings, and a tall wooden entrance gate at the back-center that opens onto the street. Egyptian architecture only: no Greek or Roman architecture, no triangular pediments, no domes, no red tile roofs, no cypress trees. In the open gate, a row of dark armored figures with spears and plumed helmets stands motionless against the bright street, small but clear. Lighting: warm bright afternoon sunlight, soft shadows, rich saturated colors. ACTION TIMELINE (8 seconds): 0–2.5 s: Senbi and the bride dance joyfully in the center of the courtyard, fists pumping, eyes closed, big laughing smiles; guests at the tables clap, one plays a reed flute, another beats a frame drum; the dark figures stand perfectly still in the gate behind them. 2.5–5.5 s: the dance continues, the couple's joy growing. 5.5–8 s: the camera has drifted closer so the laughing couple fills the frame in a medium close-up, Senbi's fist raised, the bride's arms up; the figures remain still in the background. Camera: eye-level, starts as a medium-wide shot and makes one slow, smooth push-in toward the couple, ending in a medium close-up; no tilt, no pan, no rising camera. Audio: voice-over narration only (a voice, never shown on screen; no narrator character appears): a British male voice, warm and dry, begins speaking within half a second and says: “Senbi had planned everything for his wedding. Everything except the Roman army.” Say the first sentence warmly, pause briefly, then say the second sentence dryly and deadpan. The line takes about 5.2 seconds; leave the last second free of speech. Music: light ancient-Mediterranean wedding music (frame drums, reed flute, plucked strings), cheerful, low under the voice. Sound effects: clapping, cups clinking, cheers without words, timed to the action. Ambience: light courtyard ambience: footsteps on stone, a soft breeze, no words. Final reminder: no character says any word; only the voice-over narration speaks (voice only, nobody on screen is the narrator). Natural laughs, gasps and sighs are fine. No text, captions or logos in the frame.</w:t>
+        <w:t xml:space="preserve">VOICE RULE: only the voice-over narration speaks words; it is a voice only, never a person on screen. No character says any word and no one lip-syncs; natural laughs, gasps and sighs are allowed and should sound real. Attached reference images, in order: Senbi, the groom, the bride, the wedding courtyard. 2D hand-drawn Stickman animation, clean thin black outlines, large expressive heads, simple readable stickman proportions, flat warm colors, playful cinematic documentary-comedy tone, 16:9. Use the attached reference images as strict continuity anchors: preserve faces, hair, clothing, colors, proportions and accessories exactly; every character keeps a full body with a visible chest and torso exactly as in the references. Characters, identical in every frame: Senbi the groom: young man with a full body and a visible chest, straight black bowl-cut hair with bangs, gold headband with a gold cobra, blue-and-gold broad collar resting on his bare chest, gold bracers on both wrists, white kilt with a blue-and-gold sash, brown sandals. the bride: black bob hair with straight bangs, gold headband with a red gem, white dress, blue-and-gold collar, gold sash, gold arm cuffs, light veil. the guests: Egyptian wedding guests in white linen with blue-and-gold collars and gold headbands, black bob hairstyles, some in white striped headdresses. They wear only short white kilts or simple white dresses: no togas, no draped robes. Setting: sunny daytime ancient Egyptian wedding courtyard in Alexandria: flat-roofed sandstone mud-brick buildings, tall Egyptian columns with lotus-bud capitals painted in blue-and-gold bands, hieroglyph-style carvings on the walls, long tables with white cloths and clay jars, orange cloth awnings, and a tall wooden entrance gate at the back-center that opens onto the street. Egyptian architecture only: no Greek or Roman architecture, no triangular pediments, no domes, no red tile roofs, no cypress trees. In the open gate, a row of dark armored figures with spears and plumed helmets stands motionless against the bright street, small but clear. Lighting: warm bright afternoon sunlight, soft shadows, rich saturated colors. ACTION TIMELINE (8 seconds): 0–2.5 s: Senbi and the bride dance joyfully in the center of the courtyard, fists pumping, eyes closed, big laughing smiles; guests at the tables clap, one plays a reed flute, another beats a frame drum; the dark figures stand perfectly still in the gate behind them. 2.5–5.5 s: the dance continues, the couple's joy growing. 5.5–8 s: the camera has drifted closer so the laughing couple fills the frame in a medium close-up, Senbi's fist raised, the bride's arms up; the figures remain still in the background. Camera: eye-level, starts as a medium-wide shot and makes one slow, smooth push-in toward the couple, ending in a medium close-up; no tilt, no pan, no rising camera. Audio: voice-over narration only (a voice, never shown on screen; no narrator character appears): a British male voice, warm and dry, begins speaking within half a second and says: “Senbi had planned everything for his wedding. Everything except the Roman army.” Say the first sentence warmly, pause briefly, then say the second sentence dryly and deadpan. The line takes about 5.2 seconds; leave the last second free of speech. Music: light ancient-Mediterranean wedding music (frame drums, reed flute, plucked strings), cheerful, low under the voice. Sound effects: clapping, cups clinking, cheers without words, timed to the action. Ambience: light courtyard ambience: footsteps on stone, a soft breeze, no words. Final reminder: no character says any word; only the voice-over narration speaks (voice only, nobody on screen is the narrator). Natural laughs, gasps and sighs are fine. No text, captions or logos in the frame.</w:t>
       </w:r>
     </w:p>
     <w:p>
@@ -672,7 +672,7 @@
           <w:sz w:val="20"/>
           <w:szCs w:val="20"/>
         </w:rPr>
-        <w:t xml:space="preserve">VOICE RULE: only the voice-over narration speaks words; it is a voice only, never a person or character on screen. No character says any word and no one on screen lip-syncs to speech; characters communicate with facial expressions and body gestures. Natural non-verbal sounds are allowed and should sound real: laughing, giggling, gasping, sighing, groaning, cheering, coughing. Attached reference images, in order: the wedding courtyard, the Egyptian wedding guests. 2D hand-drawn stickman cartoon in the exact style of the reference images: thin black outlines, large expressive heads, thin stick arms, flat warm colors, playful documentary-comedy tone, 16:9. Characters, identical in every frame: the guests: Egyptian wedding guests in white linen with blue-and-gold collars and gold headbands, black bob hairstyles, some in white striped headdresses. They wear only short white kilts or simple white dresses: no togas, no draped robes. Setting: sunny daytime ancient Egyptian wedding courtyard in Alexandria: flat-roofed sandstone mud-brick buildings, tall Egyptian columns with lotus-bud capitals painted in blue-and-gold bands, hieroglyph-style carvings on the walls, long tables with white cloths and clay jars, orange cloth awnings, and a tall wooden entrance gate at the back-center that opens onto the street. Egyptian architecture only: no Greek or Roman architecture, no triangular pediments, no domes, no red tile roofs, no cypress trees. Lighting: warm bright afternoon sunlight, soft shadows, rich saturated colors. ACTION TIMELINE (8 seconds): 0–2 s: guests dance joyfully in the middle of the courtyard, clapping and spinning, kilts and dresses swinging, big happy smiles. 2–3 s: every dancer freezes for half a beat mid-step, smiles still on their faces. 3–5.5 s: one guest slowly turns his head toward the tall gate at the back with a puzzled, alert face while the others unfreeze and keep dancing, unaware. 5.5–8 s: the guest keeps staring at the gate, brow furrowed, then slowly looks back and shrugs it off with a small smile. Camera: locked-off and perfectly still, eye-level medium-wide shot, the dancers fully visible from feet to heads (NOT a feet close-up); the framing never changes (no tilt, pan, zoom or rising camera). Audio: voice-over narration only (a voice, never shown on screen; no narrator character appears): a British male voice, warm and dry, begins speaking within half a second and says: “Then, for half a beat, the dancing stopped. Nobody noticed. Except one guest.” The line takes about 5.2 seconds; leave the last second free of speech so the moment can land. Music: light ancient-Mediterranean wedding music (frame drums, reed flute, plucked strings) with a faint uneasy undertone, same theme in every clip, low under the voice. Sound effects: dancing feet on stone, one tiny pause, faint distant thump, timed to the action. Ambience: light courtyard ambience: clinking cups, footsteps on stone, a soft breeze, no words. Final reminder: no character says any word; only the voice-over narration speaks (voice only, nobody on screen is the narrator). Natural laughs, gasps and sighs are fine. No text, captions or logos in the frame.</w:t>
+        <w:t xml:space="preserve">VOICE RULE: only the voice-over narration speaks words; it is a voice only, never a person or character on screen. No character says any word and no one on screen lip-syncs to speech; characters communicate with facial expressions and body gestures. Natural non-verbal sounds are allowed and should sound real: laughing, giggling, gasping, sighing, groaning, cheering, coughing. Attached reference images, in order: the wedding courtyard, the Egyptian wedding guests. 2D hand-drawn Stickman animation, clean thin black outlines, large expressive heads, simple readable stickman proportions, flat warm colors, playful cinematic documentary-comedy tone, 16:9. Use the attached reference images as strict continuity anchors: preserve faces, hair, clothing, colors, proportions and accessories exactly; every character keeps a full body with a visible chest and torso exactly as in the references. Characters, identical in every frame: the guests: Egyptian wedding guests in white linen with blue-and-gold collars and gold headbands, black bob hairstyles, some in white striped headdresses. They wear only short white kilts or simple white dresses: no togas, no draped robes. Setting: sunny daytime ancient Egyptian wedding courtyard in Alexandria: flat-roofed sandstone mud-brick buildings, tall Egyptian columns with lotus-bud capitals painted in blue-and-gold bands, hieroglyph-style carvings on the walls, long tables with white cloths and clay jars, orange cloth awnings, and a tall wooden entrance gate at the back-center that opens onto the street. Egyptian architecture only: no Greek or Roman architecture, no triangular pediments, no domes, no red tile roofs, no cypress trees. Lighting: warm bright afternoon sunlight, soft shadows, rich saturated colors. ACTION TIMELINE (8 seconds): 0–2 s: guests dance joyfully in the middle of the courtyard, clapping and spinning, kilts and dresses swinging, big happy smiles. 2–3 s: every dancer freezes for half a beat mid-step, smiles still on their faces. 3–5.5 s: one guest slowly turns his head toward the tall gate at the back with a puzzled, alert face while the others unfreeze and keep dancing, unaware. 5.5–8 s: the guest keeps staring at the gate, brow furrowed, then slowly looks back and shrugs it off with a small smile. Camera: locked-off and perfectly still, eye-level medium-wide shot, the dancers fully visible from feet to heads (NOT a feet close-up); the framing never changes (no tilt, pan, zoom or rising camera). Audio: voice-over narration only (a voice, never shown on screen; no narrator character appears): a British male voice, warm and dry, begins speaking within half a second and says: “Then, for half a beat, the dancing stopped. Nobody noticed. Except one guest.” The line takes about 5.2 seconds; leave the last second free of speech so the moment can land. Music: light ancient-Mediterranean wedding music (frame drums, reed flute, plucked strings) with a faint uneasy undertone, same theme in every clip, low under the voice. Sound effects: dancing feet on stone, one tiny pause, faint distant thump, timed to the action. Ambience: light courtyard ambience: clinking cups, footsteps on stone, a soft breeze, no words. Final reminder: no character says any word; only the voice-over narration speaks (voice only, nobody on screen is the narrator). Natural laughs, gasps and sighs are fine. No text, captions or logos in the frame.</w:t>
       </w:r>
     </w:p>
     <w:p>
@@ -818,7 +818,7 @@
           <w:sz w:val="20"/>
           <w:szCs w:val="20"/>
         </w:rPr>
-        <w:t xml:space="preserve">VOICE RULE: only the voice-over narration speaks words; it is a voice only, never a person or character on screen. No character says any word and no one on screen lip-syncs to speech; characters communicate with facial expressions and body gestures. Natural non-verbal sounds are allowed and should sound real: laughing, giggling, gasping, sighing, groaning, cheering, coughing. Attached reference images, in order: the wedding courtyard. 2D hand-drawn stickman cartoon in the exact style of the reference images: thin black outlines, large expressive heads, thin stick arms, flat warm colors, playful documentary-comedy tone, 16:9. Characters, identical in every frame: Senbi the groom: young man, straight black bowl-cut hair with bangs, gold headband with a gold cobra, bare chest, blue-and-gold broad collar, gold bracers, white kilt with a blue-and-gold sash, brown sandals, thin black stick arms. the bride: black bob hair with straight bangs, gold headband with a red gem, white dress, blue-and-gold collar, gold sash, gold arm cuffs, light veil. the guests: Egyptian wedding guests in white linen with blue-and-gold collars and gold headbands, black bob hairstyles, some in white striped headdresses. They wear only short white kilts or simple white dresses: no togas, no draped robes. Setting: sunny daytime ancient Egyptian wedding courtyard in Alexandria: flat-roofed sandstone mud-brick buildings, tall Egyptian columns with lotus-bud capitals painted in blue-and-gold bands, hieroglyph-style carvings on the walls, long tables with white cloths and clay jars, orange cloth awnings, and a tall wooden entrance gate at the back-center that opens onto the street. Egyptian architecture only: no Greek or Roman architecture, no triangular pediments, no domes, no red tile roofs, no cypress trees. Lighting: warm bright afternoon sunlight, soft shadows, rich saturated colors. ACTION TIMELINE (8 seconds): 0–2.5 s: guests dance and clap in a cheerful rhythm, Senbi and the bride dance together in the center, beaming. 2.5–5.5 s: a guest raises a clay cup in a toast and the others clap along; everything looks perfectly normal. 5.5–8 s: the happy scene holds; a little dust floats in the sunlight. Camera: locked-off and perfectly still, eye-level medium-wide shot of the wedding courtyard; the framing never changes (no tilt, pan, zoom or rising camera). Audio: voice-over narration only (a voice, never shown on screen; no narrator character appears): a British male voice, warm and dry, begins speaking within half a second and says: ““Last day of Ancient Egypt”? Relax. Egypt survived. Its queen, less so.” The line takes about 4.8 seconds; leave the last second free of speech so the moment can land. Music: light ancient-Mediterranean wedding music (frame drums, reed flute, plucked strings), same theme in every clip, low under the voice. Sound effects: wedding crowd reactions without any words, one short comic sting, timed to the action. Ambience: light courtyard ambience: clinking cups, footsteps on stone, a soft breeze, no words. Final reminder: no character says any word; only the voice-over narration speaks (voice only, nobody on screen is the narrator). Natural laughs, gasps and sighs are fine. No text, captions or logos in the frame.</w:t>
+        <w:t xml:space="preserve">VOICE RULE: only the voice-over narration speaks words; it is a voice only, never a person or character on screen. No character says any word and no one on screen lip-syncs to speech; characters communicate with facial expressions and body gestures. Natural non-verbal sounds are allowed and should sound real: laughing, giggling, gasping, sighing, groaning, cheering, coughing. Attached reference images, in order: the wedding courtyard. 2D hand-drawn Stickman animation, clean thin black outlines, large expressive heads, simple readable stickman proportions, flat warm colors, playful cinematic documentary-comedy tone, 16:9. Use the attached reference images as strict continuity anchors: preserve faces, hair, clothing, colors, proportions and accessories exactly; every character keeps a full body with a visible chest and torso exactly as in the references. Characters, identical in every frame: Senbi the groom: young man with a full body and a visible chest, straight black bowl-cut hair with bangs, gold headband with a gold cobra, blue-and-gold broad collar resting on his bare chest, gold bracers on both wrists, white kilt with a blue-and-gold sash, brown sandals. the bride: black bob hair with straight bangs, gold headband with a red gem, white dress, blue-and-gold collar, gold sash, gold arm cuffs, light veil. the guests: Egyptian wedding guests in white linen with blue-and-gold collars and gold headbands, black bob hairstyles, some in white striped headdresses. They wear only short white kilts or simple white dresses: no togas, no draped robes. Setting: sunny daytime ancient Egyptian wedding courtyard in Alexandria: flat-roofed sandstone mud-brick buildings, tall Egyptian columns with lotus-bud capitals painted in blue-and-gold bands, hieroglyph-style carvings on the walls, long tables with white cloths and clay jars, orange cloth awnings, and a tall wooden entrance gate at the back-center that opens onto the street. Egyptian architecture only: no Greek or Roman architecture, no triangular pediments, no domes, no red tile roofs, no cypress trees. Lighting: warm bright afternoon sunlight, soft shadows, rich saturated colors. ACTION TIMELINE (8 seconds): 0–2.5 s: guests dance and clap in a cheerful rhythm, Senbi and the bride dance together in the center, beaming. 2.5–5.5 s: a guest raises a clay cup in a toast and the others clap along; everything looks perfectly normal. 5.5–8 s: the happy scene holds; a little dust floats in the sunlight. Camera: locked-off and perfectly still, eye-level medium-wide shot of the wedding courtyard; the framing never changes (no tilt, pan, zoom or rising camera). Audio: voice-over narration only (a voice, never shown on screen; no narrator character appears): a British male voice, warm and dry, begins speaking within half a second and says: ““Last day of Ancient Egypt”? Relax. Egypt survived. Its queen, less so.” The line takes about 4.8 seconds; leave the last second free of speech so the moment can land. Music: light ancient-Mediterranean wedding music (frame drums, reed flute, plucked strings), same theme in every clip, low under the voice. Sound effects: wedding crowd reactions without any words, one short comic sting, timed to the action. Ambience: light courtyard ambience: clinking cups, footsteps on stone, a soft breeze, no words. Final reminder: no character says any word; only the voice-over narration speaks (voice only, nobody on screen is the narrator). Natural laughs, gasps and sighs are fine. No text, captions or logos in the frame.</w:t>
       </w:r>
     </w:p>
     <w:p>
@@ -891,7 +891,7 @@
           <w:sz w:val="20"/>
           <w:szCs w:val="20"/>
         </w:rPr>
-        <w:t xml:space="preserve">VOICE RULE: only the voice-over narration speaks words; it is a voice only, never a person or character on screen. No character says any word and no one on screen lip-syncs to speech; characters communicate with facial expressions and body gestures. Natural non-verbal sounds are allowed and should sound real: laughing, giggling, gasping, sighing, groaning, cheering, coughing. Attached reference images, in order: Senbi, the groom, the wedding courtyard. 2D hand-drawn stickman cartoon in the exact style of the reference images: thin black outlines, large expressive heads, thin stick arms, flat warm colors, playful documentary-comedy tone, 16:9. Characters, identical in every frame: Senbi the groom: young man, straight black bowl-cut hair with bangs, gold headband with a gold cobra, bare chest, blue-and-gold broad collar, gold bracers, white kilt with a blue-and-gold sash, brown sandals, thin black stick arms. Setting: a shaded sandstone alcove beside the wedding courtyard, painted columns, warm daylight. Lighting: warm bright afternoon sunlight, soft shadows, rich saturated colors. ACTION TIMELINE (8 seconds): 0–2.5 s: Senbi stands in front of a bronze mirror on a stand, seen from the side, and straightens his blue-and-gold collar with both hands. 2.5–5.5 s: he tugs his sash neat, then practices a proud, wide smile at his reflection. 5.5–8 s: the smile wobbles into a nervous twitch; he wipes his forehead with the back of his hand and takes a deep breath. Camera: eye-level medium shot of Senbi at the mirror; fixed except for an almost imperceptible 5% slow push-in, no tilt or pan. Audio: voice-over narration only (a voice, never shown on screen; no narrator character appears): a British male voice, warm and dry, begins speaking within half a second and says: “Meet Senbi. He's getting married today, and has checked the mirror forty times.” The line takes about 5.2 seconds; leave the last second free of speech so the moment can land. Music: light ancient-Mediterranean wedding music (frame drums, reed flute, plucked strings), same theme in every clip, low under the voice. Sound effects: small fabric rustle, soft room tone, timed to the action. Ambience: light courtyard ambience: clinking cups, footsteps on stone, a soft breeze, no words. Final reminder: no character says any word; only the voice-over narration speaks (voice only, nobody on screen is the narrator). Natural laughs, gasps and sighs are fine. No text, captions or logos in the frame.</w:t>
+        <w:t xml:space="preserve">VOICE RULE: only the voice-over narration speaks words; it is a voice only, never a person or character on screen. No character says any word and no one on screen lip-syncs to speech; characters communicate with facial expressions and body gestures. Natural non-verbal sounds are allowed and should sound real: laughing, giggling, gasping, sighing, groaning, cheering, coughing. Attached reference images, in order: Senbi, the groom, the wedding courtyard. 2D hand-drawn Stickman animation, clean thin black outlines, large expressive heads, simple readable stickman proportions, flat warm colors, playful cinematic documentary-comedy tone, 16:9. Use the attached reference images as strict continuity anchors: preserve faces, hair, clothing, colors, proportions and accessories exactly; every character keeps a full body with a visible chest and torso exactly as in the references. Characters, identical in every frame: Senbi the groom: young man with a full body and a visible chest, straight black bowl-cut hair with bangs, gold headband with a gold cobra, blue-and-gold broad collar resting on his bare chest, gold bracers on both wrists, white kilt with a blue-and-gold sash, brown sandals. Setting: a shaded sandstone alcove beside the wedding courtyard, painted columns, warm daylight. Lighting: warm bright afternoon sunlight, soft shadows, rich saturated colors. ACTION TIMELINE (8 seconds): 0–2.5 s: Senbi stands in front of a bronze mirror on a stand, seen from the side, and straightens his blue-and-gold collar with both hands. 2.5–5.5 s: he tugs his sash neat, then practices a proud, wide smile at his reflection. 5.5–8 s: the smile wobbles into a nervous twitch; he wipes his forehead with the back of his hand and takes a deep breath. Camera: eye-level medium shot of Senbi at the mirror; fixed except for an almost imperceptible 5% slow push-in, no tilt or pan. Audio: voice-over narration only (a voice, never shown on screen; no narrator character appears): a British male voice, warm and dry, begins speaking within half a second and says: “Meet Senbi. He's getting married today, and has checked the mirror forty times.” The line takes about 5.2 seconds; leave the last second free of speech so the moment can land. Music: light ancient-Mediterranean wedding music (frame drums, reed flute, plucked strings), same theme in every clip, low under the voice. Sound effects: small fabric rustle, soft room tone, timed to the action. Ambience: light courtyard ambience: clinking cups, footsteps on stone, a soft breeze, no words. Final reminder: no character says any word; only the voice-over narration speaks (voice only, nobody on screen is the narrator). Natural laughs, gasps and sighs are fine. No text, captions or logos in the frame.</w:t>
       </w:r>
     </w:p>
     <w:p>
@@ -964,7 +964,7 @@
           <w:sz w:val="20"/>
           <w:szCs w:val="20"/>
         </w:rPr>
-        <w:t xml:space="preserve">VOICE RULE: only the voice-over narration speaks words; it is a voice only, never a person or character on screen. No character says any word and no one on screen lip-syncs to speech; characters communicate with facial expressions and body gestures. Natural non-verbal sounds are allowed and should sound real: laughing, giggling, gasping, sighing, groaning, cheering, coughing. Attached reference images, in order: the bride, the wedding courtyard. 2D hand-drawn stickman cartoon in the exact style of the reference images: thin black outlines, large expressive heads, thin stick arms, flat warm colors, playful documentary-comedy tone, 16:9. Characters, identical in every frame: the bride: black bob hair with straight bangs, gold headband with a red gem, white dress, blue-and-gold collar, gold sash, gold arm cuffs, light veil. Setting: a shaded sandstone alcove beside the wedding courtyard, painted columns, warm daylight. Lighting: warm bright afternoon sunlight, soft shadows, rich saturated colors. ACTION TIMELINE (8 seconds): 0–2.5 s: the bride adjusts her gold headband with the red gem in front of a bronze mirror. 2.5–5.5 s: she touches the corner of her dark eye makeup with a fingertip, tilting her head. 5.5–8 s: she looks herself in the eye, gives a calm confident nod and a small smile, and holds. Camera: eye-level medium shot of the bride at the mirror; fixed except for an almost imperceptible 5% slow push-in, no tilt or pan. Audio: voice-over narration only (a voice, never shown on screen; no narrator character appears): a British male voice, warm and dry, begins speaking within half a second and says: “His bride had been ready for an hour. She was the calm one.” The line takes about 5.2 seconds; leave the last second free of speech so the moment can land. Music: light ancient-Mediterranean wedding music (frame drums, reed flute, plucked strings), same theme in every clip, low under the voice. Sound effects: soft jewelry jingle, timed to the action. Ambience: light courtyard ambience: clinking cups, footsteps on stone, a soft breeze, no words. Final reminder: no character says any word; only the voice-over narration speaks (voice only, nobody on screen is the narrator). Natural laughs, gasps and sighs are fine. No text, captions or logos in the frame.</w:t>
+        <w:t xml:space="preserve">VOICE RULE: only the voice-over narration speaks words; it is a voice only, never a person or character on screen. No character says any word and no one on screen lip-syncs to speech; characters communicate with facial expressions and body gestures. Natural non-verbal sounds are allowed and should sound real: laughing, giggling, gasping, sighing, groaning, cheering, coughing. Attached reference images, in order: the bride, the wedding courtyard. 2D hand-drawn Stickman animation, clean thin black outlines, large expressive heads, simple readable stickman proportions, flat warm colors, playful cinematic documentary-comedy tone, 16:9. Use the attached reference images as strict continuity anchors: preserve faces, hair, clothing, colors, proportions and accessories exactly; every character keeps a full body with a visible chest and torso exactly as in the references. Characters, identical in every frame: the bride: black bob hair with straight bangs, gold headband with a red gem, white dress, blue-and-gold collar, gold sash, gold arm cuffs, light veil. Setting: a shaded sandstone alcove beside the wedding courtyard, painted columns, warm daylight. Lighting: warm bright afternoon sunlight, soft shadows, rich saturated colors. ACTION TIMELINE (8 seconds): 0–2.5 s: the bride adjusts her gold headband with the red gem in front of a bronze mirror. 2.5–5.5 s: she touches the corner of her dark eye makeup with a fingertip, tilting her head. 5.5–8 s: she looks herself in the eye, gives a calm confident nod and a small smile, and holds. Camera: eye-level medium shot of the bride at the mirror; fixed except for an almost imperceptible 5% slow push-in, no tilt or pan. Audio: voice-over narration only (a voice, never shown on screen; no narrator character appears): a British male voice, warm and dry, begins speaking within half a second and says: “His bride had been ready for an hour. She was the calm one.” The line takes about 5.2 seconds; leave the last second free of speech so the moment can land. Music: light ancient-Mediterranean wedding music (frame drums, reed flute, plucked strings), same theme in every clip, low under the voice. Sound effects: soft jewelry jingle, timed to the action. Ambience: light courtyard ambience: clinking cups, footsteps on stone, a soft breeze, no words. Final reminder: no character says any word; only the voice-over narration speaks (voice only, nobody on screen is the narrator). Natural laughs, gasps and sighs are fine. No text, captions or logos in the frame.</w:t>
       </w:r>
     </w:p>
     <w:p>
@@ -1037,7 +1037,7 @@
           <w:sz w:val="20"/>
           <w:szCs w:val="20"/>
         </w:rPr>
-        <w:t xml:space="preserve">VOICE RULE: only the voice-over narration speaks words; it is a voice only, never a person or character on screen. No character says any word and no one on screen lip-syncs to speech; characters communicate with facial expressions and body gestures. Natural non-verbal sounds are allowed and should sound real: laughing, giggling, gasping, sighing, groaning, cheering, coughing. Attached reference images, in order: the bride, the bride's relatives, the wedding courtyard. 2D hand-drawn stickman cartoon in the exact style of the reference images: thin black outlines, large expressive heads, thin stick arms, flat warm colors, playful documentary-comedy tone, 16:9. Characters, identical in every frame: the scribe: older man in plain white linen holding a reed pen. the bride: black bob hair with straight bangs, gold headband with a red gem, white dress, blue-and-gold collar, gold sash, gold arm cuffs, light veil. the bride's father: bearded middle-aged man in a beige tunic with a purple sash. Setting: a shaded sandstone alcove beside the wedding courtyard, painted columns, warm daylight. Lighting: warm bright afternoon sunlight, soft shadows, rich saturated colors. ACTION TIMELINE (8 seconds): 0–2.5 s: a scribe sitting behind a low table unrolls a papyrus with careful hands; the bride stands at the right and her bearded father stands behind her, arms folded. 2.5–5.5 s: the bride leans in and points at one line with a finger while her father nods gravely. 5.5–8 s: the bride straightens up with a small satisfied smile and her father allows himself a tiny proud nod. Camera: locked-off and perfectly still, eye-level medium two-shot: the scribe, the papyrus and the bride all in the same frame; the framing never changes (no tilt, pan, zoom or rising camera). Audio: voice-over narration only (a voice, never shown on screen; no narrator character appears): a British male voice, warm and dry, begins speaking within half a second and says: “Then, paperwork. Real contracts survive: property, money, who owes what. Romance, with receipts.” The line takes about 5.2 seconds; leave the last second free of speech so the moment can land. Music: light ancient-Mediterranean wedding music (frame drums, reed flute, plucked strings), same theme in every clip, low under the voice. Sound effects: papyrus rustle, quill scratching, timed to the action. Ambience: light courtyard ambience: clinking cups, footsteps on stone, a soft breeze, no words. Final reminder: no character says any word; only the voice-over narration speaks (voice only, nobody on screen is the narrator). Natural laughs, gasps and sighs are fine. No text, captions or logos in the frame.</w:t>
+        <w:t xml:space="preserve">VOICE RULE: only the voice-over narration speaks words; it is a voice only, never a person or character on screen. No character says any word and no one on screen lip-syncs to speech; characters communicate with facial expressions and body gestures. Natural non-verbal sounds are allowed and should sound real: laughing, giggling, gasping, sighing, groaning, cheering, coughing. Attached reference images, in order: the bride, the bride's relatives, the wedding courtyard. 2D hand-drawn Stickman animation, clean thin black outlines, large expressive heads, simple readable stickman proportions, flat warm colors, playful cinematic documentary-comedy tone, 16:9. Use the attached reference images as strict continuity anchors: preserve faces, hair, clothing, colors, proportions and accessories exactly; every character keeps a full body with a visible chest and torso exactly as in the references. Characters, identical in every frame: the scribe: older man in plain white linen holding a reed pen. the bride: black bob hair with straight bangs, gold headband with a red gem, white dress, blue-and-gold collar, gold sash, gold arm cuffs, light veil. the bride's father: bearded middle-aged man in a beige tunic with a purple sash. Setting: a shaded sandstone alcove beside the wedding courtyard, painted columns, warm daylight. Lighting: warm bright afternoon sunlight, soft shadows, rich saturated colors. ACTION TIMELINE (8 seconds): 0–2.5 s: a scribe sitting behind a low table unrolls a papyrus with careful hands; the bride stands at the right and her bearded father stands behind her, arms folded. 2.5–5.5 s: the bride leans in and points at one line with a finger while her father nods gravely. 5.5–8 s: the bride straightens up with a small satisfied smile and her father allows himself a tiny proud nod. Camera: locked-off and perfectly still, eye-level medium two-shot: the scribe, the papyrus and the bride all in the same frame; the framing never changes (no tilt, pan, zoom or rising camera). Audio: voice-over narration only (a voice, never shown on screen; no narrator character appears): a British male voice, warm and dry, begins speaking within half a second and says: “Then, paperwork. Real contracts survive: property, money, who owes what. Romance, with receipts.” The line takes about 5.2 seconds; leave the last second free of speech so the moment can land. Music: light ancient-Mediterranean wedding music (frame drums, reed flute, plucked strings), same theme in every clip, low under the voice. Sound effects: papyrus rustle, quill scratching, timed to the action. Ambience: light courtyard ambience: clinking cups, footsteps on stone, a soft breeze, no words. Final reminder: no character says any word; only the voice-over narration speaks (voice only, nobody on screen is the narrator). Natural laughs, gasps and sighs are fine. No text, captions or logos in the frame.</w:t>
       </w:r>
     </w:p>
     <w:p>
@@ -1110,7 +1110,7 @@
           <w:sz w:val="20"/>
           <w:szCs w:val="20"/>
         </w:rPr>
-        <w:t xml:space="preserve">VOICE RULE: only the voice-over narration speaks words; it is a voice only, never a person or character on screen. No character says any word and no one on screen lip-syncs to speech; characters communicate with facial expressions and body gestures. Natural non-verbal sounds are allowed and should sound real: laughing, giggling, gasping, sighing, groaning, cheering, coughing. Attached reference images, in order: the Egyptian wedding guests, the wedding courtyard. 2D hand-drawn stickman cartoon in the exact style of the reference images: thin black outlines, large expressive heads, thin stick arms, flat warm colors, playful documentary-comedy tone, 16:9. Characters, identical in every frame: the guests: Egyptian wedding guests in white linen with blue-and-gold collars and gold headbands, black bob hairstyles, some in white striped headdresses. They wear only short white kilts or simple white dresses: no togas, no draped robes. the older woman: middle-aged woman in white linen with a red-orange sash. Setting: sunny daytime ancient Egyptian wedding courtyard in Alexandria: flat-roofed sandstone mud-brick buildings, tall Egyptian columns with lotus-bud capitals painted in blue-and-gold bands, hieroglyph-style carvings on the walls, long tables with white cloths and clay jars, orange cloth awnings, and a tall wooden entrance gate at the back-center that opens onto the street. Egyptian architecture only: no Greek or Roman architecture, no triangular pediments, no domes, no red tile roofs, no cypress trees. Lighting: warm bright afternoon sunlight, soft shadows, rich saturated colors. ACTION TIMELINE (8 seconds): 0–2.5 s: guests seated on both sides of the long table eat happily and pass bowls of figs, dates and flatbread. 2.5–5.5 s: at the far end one guest tiptoes up, grabs a fig and hides it behind his back with an innocent face. 5.5–8 s: an unimpressed older woman beside him turns, crosses her arms and gives him a flat stare; he freezes with wide eyes. Camera: locked-off and perfectly still, eye-level wide-medium shot of the whole feast table; the sneaky guest stays in frame; the framing never changes (no tilt, pan, zoom or rising camera). Audio: voice-over narration only (a voice, never shown on screen; no narrator character appears): a British male voice, warm and dry, begins speaking within half a second and says: “Bread, figs, roast goose, and beer, basically a food group. Someone was stealing.” The line takes about 5.2 seconds; leave the last second free of speech so the moment can land. Music: light ancient-Mediterranean wedding music (frame drums, reed flute, plucked strings), same theme in every clip, low under the voice. Sound effects: plates, cups, cheerful ambience, no words, timed to the action. Ambience: light courtyard ambience: clinking cups, footsteps on stone, a soft breeze, no words. Final reminder: no character says any word; only the voice-over narration speaks (voice only, nobody on screen is the narrator). Natural laughs, gasps and sighs are fine. No text, captions or logos in the frame.</w:t>
+        <w:t xml:space="preserve">VOICE RULE: only the voice-over narration speaks words; it is a voice only, never a person or character on screen. No character says any word and no one on screen lip-syncs to speech; characters communicate with facial expressions and body gestures. Natural non-verbal sounds are allowed and should sound real: laughing, giggling, gasping, sighing, groaning, cheering, coughing. Attached reference images, in order: the Egyptian wedding guests, the wedding courtyard. 2D hand-drawn Stickman animation, clean thin black outlines, large expressive heads, simple readable stickman proportions, flat warm colors, playful cinematic documentary-comedy tone, 16:9. Use the attached reference images as strict continuity anchors: preserve faces, hair, clothing, colors, proportions and accessories exactly; every character keeps a full body with a visible chest and torso exactly as in the references. Characters, identical in every frame: the guests: Egyptian wedding guests in white linen with blue-and-gold collars and gold headbands, black bob hairstyles, some in white striped headdresses. They wear only short white kilts or simple white dresses: no togas, no draped robes. the older woman: middle-aged woman in white linen with a red-orange sash. Setting: sunny daytime ancient Egyptian wedding courtyard in Alexandria: flat-roofed sandstone mud-brick buildings, tall Egyptian columns with lotus-bud capitals painted in blue-and-gold bands, hieroglyph-style carvings on the walls, long tables with white cloths and clay jars, orange cloth awnings, and a tall wooden entrance gate at the back-center that opens onto the street. Egyptian architecture only: no Greek or Roman architecture, no triangular pediments, no domes, no red tile roofs, no cypress trees. Lighting: warm bright afternoon sunlight, soft shadows, rich saturated colors. ACTION TIMELINE (8 seconds): 0–2.5 s: guests seated on both sides of the long table eat happily and pass bowls of figs, dates and flatbread. 2.5–5.5 s: at the far end one guest tiptoes up, grabs a fig and hides it behind his back with an innocent face. 5.5–8 s: an unimpressed older woman beside him turns, crosses her arms and gives him a flat stare; he freezes with wide eyes. Camera: locked-off and perfectly still, eye-level wide-medium shot of the whole feast table; the sneaky guest stays in frame; the framing never changes (no tilt, pan, zoom or rising camera). Audio: voice-over narration only (a voice, never shown on screen; no narrator character appears): a British male voice, warm and dry, begins speaking within half a second and says: “Bread, figs, roast goose, and beer, basically a food group. Someone was stealing.” The line takes about 5.2 seconds; leave the last second free of speech so the moment can land. Music: light ancient-Mediterranean wedding music (frame drums, reed flute, plucked strings), same theme in every clip, low under the voice. Sound effects: plates, cups, cheerful ambience, no words, timed to the action. Ambience: light courtyard ambience: clinking cups, footsteps on stone, a soft breeze, no words. Final reminder: no character says any word; only the voice-over narration speaks (voice only, nobody on screen is the narrator). Natural laughs, gasps and sighs are fine. No text, captions or logos in the frame.</w:t>
       </w:r>
     </w:p>
     <w:p>
@@ -1183,7 +1183,7 @@
           <w:sz w:val="20"/>
           <w:szCs w:val="20"/>
         </w:rPr>
-        <w:t xml:space="preserve">VOICE RULE: only the voice-over narration speaks words; it is a voice only, never a person or character on screen. No character says any word and no one on screen lip-syncs to speech; characters communicate with facial expressions and body gestures. Natural non-verbal sounds are allowed and should sound real: laughing, giggling, gasping, sighing, groaning, cheering, coughing. Attached reference images, in order: the black cat, the wedding courtyard. 2D hand-drawn stickman cartoon in the exact style of the reference images: thin black outlines, large expressive heads, thin stick arms, flat warm colors, playful documentary-comedy tone, 16:9. Characters, identical in every frame: the cat: black with a small gold collar. the guests: Egyptian wedding guests in white linen with blue-and-gold collars and gold headbands, black bob hairstyles, some in white striped headdresses. They wear only short white kilts or simple white dresses: no togas, no draped robes. Setting: sunny daytime ancient Egyptian wedding courtyard in Alexandria: flat-roofed sandstone mud-brick buildings, tall Egyptian columns with lotus-bud capitals painted in blue-and-gold bands, hieroglyph-style carvings on the walls, long tables with white cloths and clay jars, orange cloth awnings, and a tall wooden entrance gate at the back-center that opens onto the street. Egyptian architecture only: no Greek or Roman architecture, no triangular pediments, no domes, no red tile roofs, no cypress trees. Lighting: warm bright afternoon sunlight, soft shadows, rich saturated colors. ACTION TIMELINE (8 seconds): 0–2.5 s: the black cat sits upright on a red cushion at the head of the feast table, tail curled, gold collar glinting. 2.5–5.5 s: a guest approaches and bows deeply, almost to the floor, with great ceremony. 5.5–8 s: the cat looks away, lifts a paw and licks it; the guest stays bowed, then peeks up hopefully. Camera: locked-off and perfectly still, eye-level medium shot with the cat and the bowing guest both in frame; the framing never changes (no tilt, pan, zoom or rising camera). Audio: voice-over narration only (a voice, never shown on screen; no narrator character appears): a British male voice, warm and dry, begins speaking within half a second and says: “Egyptians adored cats. This one knew it. A guest bowed. The cat shrugged.” The line takes about 5.2 seconds; leave the last second free of speech so the moment can land. Music: playful comic percussion over the wedding rhythm, low under the voice. Sound effects: tiny comic sting, soft cat purr, timed to the action. Ambience: light courtyard ambience: clinking cups, footsteps on stone, a soft breeze, no words. Final reminder: no character says any word; only the voice-over narration speaks (voice only, nobody on screen is the narrator). Natural laughs, gasps and sighs are fine. No text, captions or logos in the frame.</w:t>
+        <w:t xml:space="preserve">VOICE RULE: only the voice-over narration speaks words; it is a voice only, never a person or character on screen. No character says any word and no one on screen lip-syncs to speech; characters communicate with facial expressions and body gestures. Natural non-verbal sounds are allowed and should sound real: laughing, giggling, gasping, sighing, groaning, cheering, coughing. Attached reference images, in order: the black cat, the wedding courtyard. 2D hand-drawn Stickman animation, clean thin black outlines, large expressive heads, simple readable stickman proportions, flat warm colors, playful cinematic documentary-comedy tone, 16:9. Use the attached reference images as strict continuity anchors: preserve faces, hair, clothing, colors, proportions and accessories exactly; every character keeps a full body with a visible chest and torso exactly as in the references. Characters, identical in every frame: the cat: black with a small gold collar. the guests: Egyptian wedding guests in white linen with blue-and-gold collars and gold headbands, black bob hairstyles, some in white striped headdresses. They wear only short white kilts or simple white dresses: no togas, no draped robes. Setting: sunny daytime ancient Egyptian wedding courtyard in Alexandria: flat-roofed sandstone mud-brick buildings, tall Egyptian columns with lotus-bud capitals painted in blue-and-gold bands, hieroglyph-style carvings on the walls, long tables with white cloths and clay jars, orange cloth awnings, and a tall wooden entrance gate at the back-center that opens onto the street. Egyptian architecture only: no Greek or Roman architecture, no triangular pediments, no domes, no red tile roofs, no cypress trees. Lighting: warm bright afternoon sunlight, soft shadows, rich saturated colors. ACTION TIMELINE (8 seconds): 0–2.5 s: the black cat sits upright on a red cushion at the head of the feast table, tail curled, gold collar glinting. 2.5–5.5 s: a guest approaches and bows deeply, almost to the floor, with great ceremony. 5.5–8 s: the cat looks away, lifts a paw and licks it; the guest stays bowed, then peeks up hopefully. Camera: locked-off and perfectly still, eye-level medium shot with the cat and the bowing guest both in frame; the framing never changes (no tilt, pan, zoom or rising camera). Audio: voice-over narration only (a voice, never shown on screen; no narrator character appears): a British male voice, warm and dry, begins speaking within half a second and says: “Egyptians adored cats. This one knew it. A guest bowed. The cat shrugged.” The line takes about 5.2 seconds; leave the last second free of speech so the moment can land. Music: playful comic percussion over the wedding rhythm, low under the voice. Sound effects: tiny comic sting, soft cat purr, timed to the action. Ambience: light courtyard ambience: clinking cups, footsteps on stone, a soft breeze, no words. Final reminder: no character says any word; only the voice-over narration speaks (voice only, nobody on screen is the narrator). Natural laughs, gasps and sighs are fine. No text, captions or logos in the frame.</w:t>
       </w:r>
     </w:p>
     <w:p>
@@ -1256,7 +1256,7 @@
           <w:sz w:val="20"/>
           <w:szCs w:val="20"/>
         </w:rPr>
-        <w:t xml:space="preserve">VOICE RULE: only the voice-over narration speaks words; it is a voice only, never a person or character on screen. No character says any word and no one on screen lip-syncs to speech; characters communicate with facial expressions and body gestures. Natural non-verbal sounds are allowed and should sound real: laughing, giggling, gasping, sighing, groaning, cheering, coughing. Attached reference images, in order: Senbi, the groom, the wedding courtyard. 2D hand-drawn stickman cartoon in the exact style of the reference images: thin black outlines, large expressive heads, thin stick arms, flat warm colors, playful documentary-comedy tone, 16:9. Characters, identical in every frame: Senbi the groom: young man, straight black bowl-cut hair with bangs, gold headband with a gold cobra, bare chest, blue-and-gold broad collar, gold bracers, white kilt with a blue-and-gold sash, brown sandals, thin black stick arms. Setting: sunny daytime ancient Egyptian wedding courtyard in Alexandria: flat-roofed sandstone mud-brick buildings, tall Egyptian columns with lotus-bud capitals painted in blue-and-gold bands, hieroglyph-style carvings on the walls, long tables with white cloths and clay jars, orange cloth awnings, and a tall wooden entrance gate at the back-center that opens onto the street. Egyptian architecture only: no Greek or Roman architecture, no triangular pediments, no domes, no red tile roofs, no cypress trees. Lighting: warm bright afternoon sunlight, soft shadows, rich saturated colors. ACTION TIMELINE (8 seconds): 0–2.5 s: Senbi dances with huge confidence, big arm swings, chin up. 2.5–5.5 s: he loses his balance, arms windmilling, one foot wobbling. 5.5–8 s: he snaps upright and freezes in a proud pose with one arm raised as if the stumble was choreography; his eyes slide sideways to check whether anyone saw. Camera: locked-off and perfectly still, eye-level medium shot of Senbi, full body in frame; the framing never changes (no tilt, pan, zoom or rising camera). Audio: voice-over narration only (a voice, never shown on screen; no narrator character appears): a British male voice, warm and dry, begins speaking within half a second and says: “Senbi nearly fell, recovered, and pretended that was the choreography. Nobody believed him.” The line takes about 5.2 seconds; leave the last second free of speech so the moment can land. Music: playful comic percussion over the wedding rhythm, low under the voice. Sound effects: foot scuff, comic wobble, laughter, timed to the action. Ambience: light courtyard ambience: clinking cups, footsteps on stone, a soft breeze, no words. Final reminder: no character says any word; only the voice-over narration speaks (voice only, nobody on screen is the narrator). Natural laughs, gasps and sighs are fine. No text, captions or logos in the frame.</w:t>
+        <w:t xml:space="preserve">VOICE RULE: only the voice-over narration speaks words; it is a voice only, never a person or character on screen. No character says any word and no one on screen lip-syncs to speech; characters communicate with facial expressions and body gestures. Natural non-verbal sounds are allowed and should sound real: laughing, giggling, gasping, sighing, groaning, cheering, coughing. Attached reference images, in order: Senbi, the groom, the wedding courtyard. 2D hand-drawn Stickman animation, clean thin black outlines, large expressive heads, simple readable stickman proportions, flat warm colors, playful cinematic documentary-comedy tone, 16:9. Use the attached reference images as strict continuity anchors: preserve faces, hair, clothing, colors, proportions and accessories exactly; every character keeps a full body with a visible chest and torso exactly as in the references. Characters, identical in every frame: Senbi the groom: young man with a full body and a visible chest, straight black bowl-cut hair with bangs, gold headband with a gold cobra, blue-and-gold broad collar resting on his bare chest, gold bracers on both wrists, white kilt with a blue-and-gold sash, brown sandals. Setting: sunny daytime ancient Egyptian wedding courtyard in Alexandria: flat-roofed sandstone mud-brick buildings, tall Egyptian columns with lotus-bud capitals painted in blue-and-gold bands, hieroglyph-style carvings on the walls, long tables with white cloths and clay jars, orange cloth awnings, and a tall wooden entrance gate at the back-center that opens onto the street. Egyptian architecture only: no Greek or Roman architecture, no triangular pediments, no domes, no red tile roofs, no cypress trees. Lighting: warm bright afternoon sunlight, soft shadows, rich saturated colors. ACTION TIMELINE (8 seconds): 0–2.5 s: Senbi dances with huge confidence, big arm swings, chin up. 2.5–5.5 s: he loses his balance, arms windmilling, one foot wobbling. 5.5–8 s: he snaps upright and freezes in a proud pose with one arm raised as if the stumble was choreography; his eyes slide sideways to check whether anyone saw. Camera: locked-off and perfectly still, eye-level medium shot of Senbi, full body in frame; the framing never changes (no tilt, pan, zoom or rising camera). Audio: voice-over narration only (a voice, never shown on screen; no narrator character appears): a British male voice, warm and dry, begins speaking within half a second and says: “Senbi nearly fell, recovered, and pretended that was the choreography. Nobody believed him.” The line takes about 5.2 seconds; leave the last second free of speech so the moment can land. Music: playful comic percussion over the wedding rhythm, low under the voice. Sound effects: foot scuff, comic wobble, laughter, timed to the action. Ambience: light courtyard ambience: clinking cups, footsteps on stone, a soft breeze, no words. Final reminder: no character says any word; only the voice-over narration speaks (voice only, nobody on screen is the narrator). Natural laughs, gasps and sighs are fine. No text, captions or logos in the frame.</w:t>
       </w:r>
     </w:p>
     <w:p>
@@ -1329,7 +1329,7 @@
           <w:sz w:val="20"/>
           <w:szCs w:val="20"/>
         </w:rPr>
-        <w:t xml:space="preserve">VOICE RULE: only the voice-over narration speaks words; it is a voice only, never a person or character on screen. No character says any word and no one on screen lip-syncs to speech; characters communicate with facial expressions and body gestures. Natural non-verbal sounds are allowed and should sound real: laughing, giggling, gasping, sighing, groaning, cheering, coughing. Attached reference images, in order: the bride, the wedding courtyard. 2D hand-drawn stickman cartoon in the exact style of the reference images: thin black outlines, large expressive heads, thin stick arms, flat warm colors, playful documentary-comedy tone, 16:9. Characters, identical in every frame: the bride: black bob hair with straight bangs, gold headband with a red gem, white dress, blue-and-gold collar, gold sash, gold arm cuffs, light veil. Setting: sunny daytime ancient Egyptian wedding courtyard in Alexandria: flat-roofed sandstone mud-brick buildings, tall Egyptian columns with lotus-bud capitals painted in blue-and-gold bands, hieroglyph-style carvings on the walls, long tables with white cloths and clay jars, orange cloth awnings, and a tall wooden entrance gate at the back-center that opens onto the street. Egyptian architecture only: no Greek or Roman architecture, no triangular pediments, no domes, no red tile roofs, no cypress trees. Lighting: warm bright afternoon sunlight, soft shadows, rich saturated colors. ACTION TIMELINE (8 seconds): 0–2.5 s: the bride watches, amused, with sparkling eyes. 2.5–5.5 s: she presses her lips together to look composed while her shoulders start to shake. 5.5–8 s: she raises a hand and hides her smile behind it, eyes crinkled, and a small suppressed giggle escapes. Camera: locked-off and perfectly still, eye-level close-up of the bride's face; the framing never changes (no tilt, pan, zoom or rising camera). Audio: voice-over narration only (a voice, never shown on screen; no narrator character appears): a British male voice, warm and dry, begins speaking within half a second and says: “His bride was trying very hard not to laugh. She loved him. Mostly.” The line takes about 5.2 seconds; leave the last second free of speech so the moment can land. Music: light ancient-Mediterranean wedding music (frame drums, reed flute, plucked strings), same theme in every clip, low under the voice. Sound effects: suppressed giggle, timed to the action. Ambience: light courtyard ambience: clinking cups, footsteps on stone, a soft breeze, no words. Final reminder: no character says any word; only the voice-over narration speaks (voice only, nobody on screen is the narrator). Natural laughs, gasps and sighs are fine. No text, captions or logos in the frame.</w:t>
+        <w:t xml:space="preserve">VOICE RULE: only the voice-over narration speaks words; it is a voice only, never a person or character on screen. No character says any word and no one on screen lip-syncs to speech; characters communicate with facial expressions and body gestures. Natural non-verbal sounds are allowed and should sound real: laughing, giggling, gasping, sighing, groaning, cheering, coughing. Attached reference images, in order: the bride, the wedding courtyard. 2D hand-drawn Stickman animation, clean thin black outlines, large expressive heads, simple readable stickman proportions, flat warm colors, playful cinematic documentary-comedy tone, 16:9. Use the attached reference images as strict continuity anchors: preserve faces, hair, clothing, colors, proportions and accessories exactly; every character keeps a full body with a visible chest and torso exactly as in the references. Characters, identical in every frame: the bride: black bob hair with straight bangs, gold headband with a red gem, white dress, blue-and-gold collar, gold sash, gold arm cuffs, light veil. Setting: sunny daytime ancient Egyptian wedding courtyard in Alexandria: flat-roofed sandstone mud-brick buildings, tall Egyptian columns with lotus-bud capitals painted in blue-and-gold bands, hieroglyph-style carvings on the walls, long tables with white cloths and clay jars, orange cloth awnings, and a tall wooden entrance gate at the back-center that opens onto the street. Egyptian architecture only: no Greek or Roman architecture, no triangular pediments, no domes, no red tile roofs, no cypress trees. Lighting: warm bright afternoon sunlight, soft shadows, rich saturated colors. ACTION TIMELINE (8 seconds): 0–2.5 s: the bride watches, amused, with sparkling eyes. 2.5–5.5 s: she presses her lips together to look composed while her shoulders start to shake. 5.5–8 s: she raises a hand and hides her smile behind it, eyes crinkled, and a small suppressed giggle escapes. Camera: locked-off and perfectly still, eye-level close-up of the bride's face; the framing never changes (no tilt, pan, zoom or rising camera). Audio: voice-over narration only (a voice, never shown on screen; no narrator character appears): a British male voice, warm and dry, begins speaking within half a second and says: “His bride was trying very hard not to laugh. She loved him. Mostly.” The line takes about 5.2 seconds; leave the last second free of speech so the moment can land. Music: light ancient-Mediterranean wedding music (frame drums, reed flute, plucked strings), same theme in every clip, low under the voice. Sound effects: suppressed giggle, timed to the action. Ambience: light courtyard ambience: clinking cups, footsteps on stone, a soft breeze, no words. Final reminder: no character says any word; only the voice-over narration speaks (voice only, nobody on screen is the narrator). Natural laughs, gasps and sighs are fine. No text, captions or logos in the frame.</w:t>
       </w:r>
     </w:p>
     <w:p>
@@ -1419,7 +1419,7 @@
           <w:sz w:val="20"/>
           <w:szCs w:val="20"/>
         </w:rPr>
-        <w:t xml:space="preserve">VOICE RULE: only the voice-over narration speaks words; it is a voice only, never a person or character on screen. No character says any word and no one on screen lip-syncs to speech; characters communicate with facial expressions and body gestures. Natural non-verbal sounds are allowed and should sound real: laughing, giggling, gasping, sighing, groaning, cheering, coughing. Attached reference images, in order: the Egyptian wedding guests, the wedding courtyard. 2D hand-drawn stickman cartoon in the exact style of the reference images: thin black outlines, large expressive heads, thin stick arms, flat warm colors, playful documentary-comedy tone, 16:9. Characters, identical in every frame: the older woman: middle-aged woman in white linen with a red-orange sash. Setting: sunny daytime ancient Egyptian wedding courtyard in Alexandria: flat-roofed sandstone mud-brick buildings, tall Egyptian columns with lotus-bud capitals painted in blue-and-gold bands, hieroglyph-style carvings on the walls, long tables with white cloths and clay jars, orange cloth awnings, and a tall wooden entrance gate at the back-center that opens onto the street. Egyptian architecture only: no Greek or Roman architecture, no triangular pediments, no domes, no red tile roofs, no cypress trees. Lighting: warm bright afternoon sunlight, soft shadows, rich saturated colors. ACTION TIMELINE (8 seconds): 0–2.5 s: an older woman at the feast table lifts a spoonful from a dish and inspects it with exaggerated seriousness, squinting. 2.5–5.5 s: she tastes it and chews slowly, eyes narrowed. 5.5–8 s: after a long pause she gives a reluctant nod, lips pursed, as if grudgingly approving. Camera: locked-off and perfectly still, eye-level close-up of the woman's face and the dish; the framing never changes (no tilt, pan, zoom or rising camera). Audio: voice-over narration only (a voice, never shown on screen; no narrator character appears): a British male voice, warm and dry, begins speaking within half a second and says: “One aunt inspected the food like a tax auditor. Verdict: suspicious, but edible.” The line takes about 5.2 seconds; leave the last second free of speech so the moment can land. Music: playful comic percussion over the wedding rhythm, low under the voice. Sound effects: spoon tapping a bowl, suspicious hum, timed to the action. Ambience: light courtyard ambience: clinking cups, footsteps on stone, a soft breeze, no words. Final reminder: no character says any word; only the voice-over narration speaks (voice only, nobody on screen is the narrator). Natural laughs, gasps and sighs are fine. No text, captions or logos in the frame.</w:t>
+        <w:t xml:space="preserve">VOICE RULE: only the voice-over narration speaks words; it is a voice only, never a person or character on screen. No character says any word and no one on screen lip-syncs to speech; characters communicate with facial expressions and body gestures. Natural non-verbal sounds are allowed and should sound real: laughing, giggling, gasping, sighing, groaning, cheering, coughing. Attached reference images, in order: the Egyptian wedding guests, the wedding courtyard. 2D hand-drawn Stickman animation, clean thin black outlines, large expressive heads, simple readable stickman proportions, flat warm colors, playful cinematic documentary-comedy tone, 16:9. Use the attached reference images as strict continuity anchors: preserve faces, hair, clothing, colors, proportions and accessories exactly; every character keeps a full body with a visible chest and torso exactly as in the references. Characters, identical in every frame: the older woman: middle-aged woman in white linen with a red-orange sash. Setting: sunny daytime ancient Egyptian wedding courtyard in Alexandria: flat-roofed sandstone mud-brick buildings, tall Egyptian columns with lotus-bud capitals painted in blue-and-gold bands, hieroglyph-style carvings on the walls, long tables with white cloths and clay jars, orange cloth awnings, and a tall wooden entrance gate at the back-center that opens onto the street. Egyptian architecture only: no Greek or Roman architecture, no triangular pediments, no domes, no red tile roofs, no cypress trees. Lighting: warm bright afternoon sunlight, soft shadows, rich saturated colors. ACTION TIMELINE (8 seconds): 0–2.5 s: an older woman at the feast table lifts a spoonful from a dish and inspects it with exaggerated seriousness, squinting. 2.5–5.5 s: she tastes it and chews slowly, eyes narrowed. 5.5–8 s: after a long pause she gives a reluctant nod, lips pursed, as if grudgingly approving. Camera: locked-off and perfectly still, eye-level close-up of the woman's face and the dish; the framing never changes (no tilt, pan, zoom or rising camera). Audio: voice-over narration only (a voice, never shown on screen; no narrator character appears): a British male voice, warm and dry, begins speaking within half a second and says: “One aunt inspected the food like a tax auditor. Verdict: suspicious, but edible.” The line takes about 5.2 seconds; leave the last second free of speech so the moment can land. Music: playful comic percussion over the wedding rhythm, low under the voice. Sound effects: spoon tapping a bowl, suspicious hum, timed to the action. Ambience: light courtyard ambience: clinking cups, footsteps on stone, a soft breeze, no words. Final reminder: no character says any word; only the voice-over narration speaks (voice only, nobody on screen is the narrator). Natural laughs, gasps and sighs are fine. No text, captions or logos in the frame.</w:t>
       </w:r>
     </w:p>
     <w:p>
@@ -1492,7 +1492,7 @@
           <w:sz w:val="20"/>
           <w:szCs w:val="20"/>
         </w:rPr>
-        <w:t xml:space="preserve">VOICE RULE: only the voice-over narration speaks words; it is a voice only, never a person or character on screen. No character says any word and no one on screen lip-syncs to speech; characters communicate with facial expressions and body gestures. Natural non-verbal sounds are allowed and should sound real: laughing, giggling, gasping, sighing, groaning, cheering, coughing. Attached reference images, in order: Senbi, the groom, the bride's relatives, the wedding courtyard. 2D hand-drawn stickman cartoon in the exact style of the reference images: thin black outlines, large expressive heads, thin stick arms, flat warm colors, playful documentary-comedy tone, 16:9. Characters, identical in every frame: the bride's father: bearded middle-aged man in a beige tunic with a purple sash. Senbi the groom: young man, straight black bowl-cut hair with bangs, gold headband with a gold cobra, bare chest, blue-and-gold broad collar, gold bracers, white kilt with a blue-and-gold sash, brown sandals, thin black stick arms. Setting: sunny daytime ancient Egyptian wedding courtyard in Alexandria: flat-roofed sandstone mud-brick buildings, tall Egyptian columns with lotus-bud capitals painted in blue-and-gold bands, hieroglyph-style carvings on the walls, long tables with white cloths and clay jars, orange cloth awnings, and a tall wooden entrance gate at the back-center that opens onto the street. Egyptian architecture only: no Greek or Roman architecture, no triangular pediments, no domes, no red tile roofs, no cypress trees. Lighting: warm bright afternoon sunlight, soft shadows, rich saturated colors. ACTION TIMELINE (8 seconds): 0–2.5 s: the bride's bearded father steps in, holding a carved wooden headrest proudly in both hands, beaming. 2.5–5.5 s: Senbi accepts it with a polite smile and a nod of thanks. 5.5–8 s: he glances down at the object, his smile tightens and his eyebrows lift in concern while the father keeps beaming. Camera: locked-off and perfectly still, eye-level medium two-shot of Senbi and the father; the framing never changes (no tilt, pan, zoom or rising camera). Audio: voice-over narration only (a voice, never shown on screen; no narrator character appears): a British male voice, warm and dry, begins speaking within half a second and says: “Then, the gift: a wooden headrest. Egyptians really did sleep on these.” The line takes about 4.8 seconds; leave the last second free of speech so the moment can land. Music: light ancient-Mediterranean wedding music (frame drums, reed flute, plucked strings), same theme in every clip, low under the voice. Sound effects: one wooden knock, timed to the action. Ambience: light courtyard ambience: clinking cups, footsteps on stone, a soft breeze, no words. Final reminder: no character says any word; only the voice-over narration speaks (voice only, nobody on screen is the narrator). Natural laughs, gasps and sighs are fine. No text, captions or logos in the frame.</w:t>
+        <w:t xml:space="preserve">VOICE RULE: only the voice-over narration speaks words; it is a voice only, never a person or character on screen. No character says any word and no one on screen lip-syncs to speech; characters communicate with facial expressions and body gestures. Natural non-verbal sounds are allowed and should sound real: laughing, giggling, gasping, sighing, groaning, cheering, coughing. Attached reference images, in order: Senbi, the groom, the bride's relatives, the wedding courtyard. 2D hand-drawn Stickman animation, clean thin black outlines, large expressive heads, simple readable stickman proportions, flat warm colors, playful cinematic documentary-comedy tone, 16:9. Use the attached reference images as strict continuity anchors: preserve faces, hair, clothing, colors, proportions and accessories exactly; every character keeps a full body with a visible chest and torso exactly as in the references. Characters, identical in every frame: the bride's father: bearded middle-aged man in a beige tunic with a purple sash. Senbi the groom: young man with a full body and a visible chest, straight black bowl-cut hair with bangs, gold headband with a gold cobra, blue-and-gold broad collar resting on his bare chest, gold bracers on both wrists, white kilt with a blue-and-gold sash, brown sandals. Setting: sunny daytime ancient Egyptian wedding courtyard in Alexandria: flat-roofed sandstone mud-brick buildings, tall Egyptian columns with lotus-bud capitals painted in blue-and-gold bands, hieroglyph-style carvings on the walls, long tables with white cloths and clay jars, orange cloth awnings, and a tall wooden entrance gate at the back-center that opens onto the street. Egyptian architecture only: no Greek or Roman architecture, no triangular pediments, no domes, no red tile roofs, no cypress trees. Lighting: warm bright afternoon sunlight, soft shadows, rich saturated colors. ACTION TIMELINE (8 seconds): 0–2.5 s: the bride's bearded father steps in, holding a carved wooden headrest proudly in both hands, beaming. 2.5–5.5 s: Senbi accepts it with a polite smile and a nod of thanks. 5.5–8 s: he glances down at the object, his smile tightens and his eyebrows lift in concern while the father keeps beaming. Camera: locked-off and perfectly still, eye-level medium two-shot of Senbi and the father; the framing never changes (no tilt, pan, zoom or rising camera). Audio: voice-over narration only (a voice, never shown on screen; no narrator character appears): a British male voice, warm and dry, begins speaking within half a second and says: “Then, the gift: a wooden headrest. Egyptians really did sleep on these.” The line takes about 4.8 seconds; leave the last second free of speech so the moment can land. Music: light ancient-Mediterranean wedding music (frame drums, reed flute, plucked strings), same theme in every clip, low under the voice. Sound effects: one wooden knock, timed to the action. Ambience: light courtyard ambience: clinking cups, footsteps on stone, a soft breeze, no words. Final reminder: no character says any word; only the voice-over narration speaks (voice only, nobody on screen is the narrator). Natural laughs, gasps and sighs are fine. No text, captions or logos in the frame.</w:t>
       </w:r>
     </w:p>
     <w:p>
@@ -1565,7 +1565,7 @@
           <w:sz w:val="20"/>
           <w:szCs w:val="20"/>
         </w:rPr>
-        <w:t xml:space="preserve">VOICE RULE: only the voice-over narration speaks words; it is a voice only, never a person or character on screen. No character says any word and no one on screen lip-syncs to speech; characters communicate with facial expressions and body gestures. Natural non-verbal sounds are allowed and should sound real: laughing, giggling, gasping, sighing, groaning, cheering, coughing. Attached reference images, in order: Senbi, the groom. 2D hand-drawn stickman cartoon in the exact style of the reference images: thin black outlines, large expressive heads, thin stick arms, flat warm colors, playful documentary-comedy tone, 16:9. Characters, identical in every frame: Senbi the groom: young man, straight black bowl-cut hair with bangs, gold headband with a gold cobra, bare chest, blue-and-gold broad collar, gold bracers, white kilt with a blue-and-gold sash, brown sandals, thin black stick arms. Setting: sunny daytime ancient Egyptian wedding courtyard in Alexandria: flat-roofed sandstone mud-brick buildings, tall Egyptian columns with lotus-bud capitals painted in blue-and-gold bands, hieroglyph-style carvings on the walls, long tables with white cloths and clay jars, orange cloth awnings, and a tall wooden entrance gate at the back-center that opens onto the street. Egyptian architecture only: no Greek or Roman architecture, no triangular pediments, no domes, no red tile roofs, no cypress trees. Lighting: warm bright afternoon sunlight, soft shadows, rich saturated colors. ACTION TIMELINE (8 seconds): 0–2.5 s: Senbi sits on a reed mat and places the wooden headrest under his neck. 2.5–5.5 s: he lowers his head onto it and freezes, eyes wide, mouth a tight line, a bead of sweat on his temple. 5.5–8 s: he gives a stiff thumbs-up to someone off-screen, his forced smile trembling. Camera: locked-off and perfectly still, eye-level medium shot of Senbi with the headrest; the framing never changes (no tilt, pan, zoom or rising camera). Audio: voice-over narration only (a voice, never shown on screen; no narrator character appears): a British male voice, warm and dry, begins speaking within half a second and says: “Senbi lay down. His neck filed a formal complaint. His thumbs-up said otherwise.” The line takes about 5.2 seconds; leave the last second free of speech so the moment can land. Music: playful comic percussion over the wedding rhythm, low under the voice. Sound effects: comic wooden creak, timed to the action. Ambience: light courtyard ambience: clinking cups, footsteps on stone, a soft breeze, no words. Final reminder: no character says any word; only the voice-over narration speaks (voice only, nobody on screen is the narrator). Natural laughs, gasps and sighs are fine. No text, captions or logos in the frame.</w:t>
+        <w:t xml:space="preserve">VOICE RULE: only the voice-over narration speaks words; it is a voice only, never a person or character on screen. No character says any word and no one on screen lip-syncs to speech; characters communicate with facial expressions and body gestures. Natural non-verbal sounds are allowed and should sound real: laughing, giggling, gasping, sighing, groaning, cheering, coughing. Attached reference images, in order: Senbi, the groom. 2D hand-drawn Stickman animation, clean thin black outlines, large expressive heads, simple readable stickman proportions, flat warm colors, playful cinematic documentary-comedy tone, 16:9. Use the attached reference images as strict continuity anchors: preserve faces, hair, clothing, colors, proportions and accessories exactly; every character keeps a full body with a visible chest and torso exactly as in the references. Characters, identical in every frame: Senbi the groom: young man with a full body and a visible chest, straight black bowl-cut hair with bangs, gold headband with a gold cobra, blue-and-gold broad collar resting on his bare chest, gold bracers on both wrists, white kilt with a blue-and-gold sash, brown sandals. Setting: sunny daytime ancient Egyptian wedding courtyard in Alexandria: flat-roofed sandstone mud-brick buildings, tall Egyptian columns with lotus-bud capitals painted in blue-and-gold bands, hieroglyph-style carvings on the walls, long tables with white cloths and clay jars, orange cloth awnings, and a tall wooden entrance gate at the back-center that opens onto the street. Egyptian architecture only: no Greek or Roman architecture, no triangular pediments, no domes, no red tile roofs, no cypress trees. Lighting: warm bright afternoon sunlight, soft shadows, rich saturated colors. ACTION TIMELINE (8 seconds): 0–2.5 s: Senbi sits on a reed mat and places the wooden headrest under his neck. 2.5–5.5 s: he lowers his head onto it and freezes, eyes wide, mouth a tight line, a bead of sweat on his temple. 5.5–8 s: he gives a stiff thumbs-up to someone off-screen, his forced smile trembling. Camera: locked-off and perfectly still, eye-level medium shot of Senbi with the headrest; the framing never changes (no tilt, pan, zoom or rising camera). Audio: voice-over narration only (a voice, never shown on screen; no narrator character appears): a British male voice, warm and dry, begins speaking within half a second and says: “Senbi lay down. His neck filed a formal complaint. His thumbs-up said otherwise.” The line takes about 5.2 seconds; leave the last second free of speech so the moment can land. Music: playful comic percussion over the wedding rhythm, low under the voice. Sound effects: comic wooden creak, timed to the action. Ambience: light courtyard ambience: clinking cups, footsteps on stone, a soft breeze, no words. Final reminder: no character says any word; only the voice-over narration speaks (voice only, nobody on screen is the narrator). Natural laughs, gasps and sighs are fine. No text, captions or logos in the frame.</w:t>
       </w:r>
     </w:p>
     <w:p>
@@ -1638,7 +1638,7 @@
           <w:sz w:val="20"/>
           <w:szCs w:val="20"/>
         </w:rPr>
-        <w:t xml:space="preserve">VOICE RULE: only the voice-over narration speaks words; it is a voice only, never a person or character on screen. No character says any word and no one on screen lip-syncs to speech; characters communicate with facial expressions and body gestures. Natural non-verbal sounds are allowed and should sound real: laughing, giggling, gasping, sighing, groaning, cheering, coughing. Attached reference images, in order: the Egyptian wedding guests, the bride, Senbi, the groom. 2D hand-drawn stickman cartoon in the exact style of the reference images: thin black outlines, large expressive heads, thin stick arms, flat warm colors, playful documentary-comedy tone, 16:9. Characters, identical in every frame: Senbi the groom: young man, straight black bowl-cut hair with bangs, gold headband with a gold cobra, bare chest, blue-and-gold broad collar, gold bracers, white kilt with a blue-and-gold sash, brown sandals, thin black stick arms. the bride: black bob hair with straight bangs, gold headband with a red gem, white dress, blue-and-gold collar, gold sash, gold arm cuffs, light veil. the guests: Egyptian wedding guests in white linen with blue-and-gold collars and gold headbands, black bob hairstyles, some in white striped headdresses. They wear only short white kilts or simple white dresses: no togas, no draped robes. the musicians: guests in white linen playing harp, frame drum and reed flute. Setting: sunny daytime ancient Egyptian wedding courtyard in Alexandria: flat-roofed sandstone mud-brick buildings, tall Egyptian columns with lotus-bud capitals painted in blue-and-gold bands, hieroglyph-style carvings on the walls, long tables with white cloths and clay jars, orange cloth awnings, and a tall wooden entrance gate at the back-center that opens onto the street. Egyptian architecture only: no Greek or Roman architecture, no triangular pediments, no domes, no red tile roofs, no cypress trees. Lighting: warm bright afternoon sunlight, soft shadows, rich saturated colors. ACTION TIMELINE (8 seconds): 0–2.5 s: Senbi and the bride stand together at the center holding hands while musicians play and guests dance around them. 2.5–5.5 s: banners and flower garlands sway lightly in the breeze, couples spin, children run past. 5.5–8 s: Senbi and the bride exchange a loving look; everything is perfectly joyful. Camera: wide shot of the whole courtyard at eye level; fixed except for an almost imperceptible 5% slow push-in, no tilt or pan. Audio: voice-over narration only (a voice, never shown on screen; no narrator character appears): a British male voice, warm and dry, begins speaking within half a second and says: “For a few perfect minutes, everything was exactly right. Enjoy this part.” The line takes about 4.8 seconds; leave the last second free of speech so the moment can land. Music: light ancient-Mediterranean wedding music (frame drums, reed flute, plucked strings), same theme in every clip, low under the voice. Sound effects: applause, drums, wind in the banners, timed to the action. Ambience: light courtyard ambience: clinking cups, footsteps on stone, a soft breeze, no words. Final reminder: no character says any word; only the voice-over narration speaks (voice only, nobody on screen is the narrator). Natural laughs, gasps and sighs are fine. No text, captions or logos in the frame.</w:t>
+        <w:t xml:space="preserve">VOICE RULE: only the voice-over narration speaks words; it is a voice only, never a person or character on screen. No character says any word and no one on screen lip-syncs to speech; characters communicate with facial expressions and body gestures. Natural non-verbal sounds are allowed and should sound real: laughing, giggling, gasping, sighing, groaning, cheering, coughing. Attached reference images, in order: the Egyptian wedding guests, the bride, Senbi, the groom. 2D hand-drawn Stickman animation, clean thin black outlines, large expressive heads, simple readable stickman proportions, flat warm colors, playful cinematic documentary-comedy tone, 16:9. Use the attached reference images as strict continuity anchors: preserve faces, hair, clothing, colors, proportions and accessories exactly; every character keeps a full body with a visible chest and torso exactly as in the references. Characters, identical in every frame: Senbi the groom: young man with a full body and a visible chest, straight black bowl-cut hair with bangs, gold headband with a gold cobra, blue-and-gold broad collar resting on his bare chest, gold bracers on both wrists, white kilt with a blue-and-gold sash, brown sandals. the bride: black bob hair with straight bangs, gold headband with a red gem, white dress, blue-and-gold collar, gold sash, gold arm cuffs, light veil. the guests: Egyptian wedding guests in white linen with blue-and-gold collars and gold headbands, black bob hairstyles, some in white striped headdresses. They wear only short white kilts or simple white dresses: no togas, no draped robes. the musicians: guests in white linen playing harp, frame drum and reed flute. Setting: sunny daytime ancient Egyptian wedding courtyard in Alexandria: flat-roofed sandstone mud-brick buildings, tall Egyptian columns with lotus-bud capitals painted in blue-and-gold bands, hieroglyph-style carvings on the walls, long tables with white cloths and clay jars, orange cloth awnings, and a tall wooden entrance gate at the back-center that opens onto the street. Egyptian architecture only: no Greek or Roman architecture, no triangular pediments, no domes, no red tile roofs, no cypress trees. Lighting: warm bright afternoon sunlight, soft shadows, rich saturated colors. ACTION TIMELINE (8 seconds): 0–2.5 s: Senbi and the bride stand together at the center holding hands while musicians play and guests dance around them. 2.5–5.5 s: banners and flower garlands sway lightly in the breeze, couples spin, children run past. 5.5–8 s: Senbi and the bride exchange a loving look; everything is perfectly joyful. Camera: wide shot of the whole courtyard at eye level; fixed except for an almost imperceptible 5% slow push-in, no tilt or pan. Audio: voice-over narration only (a voice, never shown on screen; no narrator character appears): a British male voice, warm and dry, begins speaking within half a second and says: “For a few perfect minutes, everything was exactly right. Enjoy this part.” The line takes about 4.8 seconds; leave the last second free of speech so the moment can land. Music: light ancient-Mediterranean wedding music (frame drums, reed flute, plucked strings), same theme in every clip, low under the voice. Sound effects: applause, drums, wind in the banners, timed to the action. Ambience: light courtyard ambience: clinking cups, footsteps on stone, a soft breeze, no words. Final reminder: no character says any word; only the voice-over narration speaks (voice only, nobody on screen is the narrator). Natural laughs, gasps and sighs are fine. No text, captions or logos in the frame.</w:t>
       </w:r>
     </w:p>
     <w:p>
@@ -1711,7 +1711,7 @@
           <w:sz w:val="20"/>
           <w:szCs w:val="20"/>
         </w:rPr>
-        <w:t xml:space="preserve">VOICE RULE: only the voice-over narration speaks words; it is a voice only, never a person or character on screen. No character says any word and no one on screen lip-syncs to speech; characters communicate with facial expressions and body gestures. Natural non-verbal sounds are allowed and should sound real: laughing, giggling, gasping, sighing, groaning, cheering, coughing. Attached reference images, in order: the wedding courtyard. 2D hand-drawn stickman cartoon in the exact style of the reference images: thin black outlines, large expressive heads, thin stick arms, flat warm colors, playful documentary-comedy tone, 16:9. Setting: sunny daytime ancient Egyptian wedding courtyard in Alexandria: flat-roofed sandstone mud-brick buildings, tall Egyptian columns with lotus-bud capitals painted in blue-and-gold bands, hieroglyph-style carvings on the walls, long tables with white cloths and clay jars, orange cloth awnings, and a tall wooden entrance gate at the back-center that opens onto the street. Egyptian architecture only: no Greek or Roman architecture, no triangular pediments, no domes, no red tile roofs, no cypress trees. Lighting: warm bright afternoon sunlight, soft shadows, rich saturated colors. ACTION TIMELINE (8 seconds): 0–2 s: a small clay cup stands still on a wedding table, out-of-focus guests dancing behind it. 2–4.5 s: the cup begins to tremble slightly, tiny ripples in the drink. 4.5–8 s: the tremble repeats rhythmically like distant footsteps, building, while the guests behind keep dancing, unaware. Camera: locked-off and perfectly still, extreme close-up of the cup; only the cup vibrates, the camera does not; the framing never changes (no tilt, pan, zoom or rising camera). Audio: voice-over narration only (a voice, never shown on screen; no narrator character appears): a British male voice, warm and dry, begins speaking within half a second and says: “Then a small cup on the table began to tremble. Nobody noticed.” The line takes about 4.8 seconds; leave the last second free of speech so the moment can land. Music: light ancient-Mediterranean wedding music (frame drums, reed flute, plucked strings) with a faint uneasy undertone, same theme in every clip, low under the voice. Sound effects: ceramic cup rattling, faint rumble, timed to the action. Ambience: light courtyard ambience: clinking cups, footsteps on stone, a soft breeze, no words. Final reminder: no character says any word; only the voice-over narration speaks (voice only, nobody on screen is the narrator). Natural laughs, gasps and sighs are fine. No text, captions or logos in the frame.</w:t>
+        <w:t xml:space="preserve">VOICE RULE: only the voice-over narration speaks words; it is a voice only, never a person or character on screen. No character says any word and no one on screen lip-syncs to speech; characters communicate with facial expressions and body gestures. Natural non-verbal sounds are allowed and should sound real: laughing, giggling, gasping, sighing, groaning, cheering, coughing. Attached reference images, in order: the wedding courtyard. 2D hand-drawn Stickman animation, clean thin black outlines, large expressive heads, simple readable stickman proportions, flat warm colors, playful cinematic documentary-comedy tone, 16:9. Use the attached reference images as strict continuity anchors: preserve faces, hair, clothing, colors, proportions and accessories exactly; every character keeps a full body with a visible chest and torso exactly as in the references. Setting: sunny daytime ancient Egyptian wedding courtyard in Alexandria: flat-roofed sandstone mud-brick buildings, tall Egyptian columns with lotus-bud capitals painted in blue-and-gold bands, hieroglyph-style carvings on the walls, long tables with white cloths and clay jars, orange cloth awnings, and a tall wooden entrance gate at the back-center that opens onto the street. Egyptian architecture only: no Greek or Roman architecture, no triangular pediments, no domes, no red tile roofs, no cypress trees. Lighting: warm bright afternoon sunlight, soft shadows, rich saturated colors. ACTION TIMELINE (8 seconds): 0–2 s: a small clay cup stands still on a wedding table, out-of-focus guests dancing behind it. 2–4.5 s: the cup begins to tremble slightly, tiny ripples in the drink. 4.5–8 s: the tremble repeats rhythmically like distant footsteps, building, while the guests behind keep dancing, unaware. Camera: locked-off and perfectly still, extreme close-up of the cup; only the cup vibrates, the camera does not; the framing never changes (no tilt, pan, zoom or rising camera). Audio: voice-over narration only (a voice, never shown on screen; no narrator character appears): a British male voice, warm and dry, begins speaking within half a second and says: “Then a small cup on the table began to tremble. Nobody noticed.” The line takes about 4.8 seconds; leave the last second free of speech so the moment can land. Music: light ancient-Mediterranean wedding music (frame drums, reed flute, plucked strings) with a faint uneasy undertone, same theme in every clip, low under the voice. Sound effects: ceramic cup rattling, faint rumble, timed to the action. Ambience: light courtyard ambience: clinking cups, footsteps on stone, a soft breeze, no words. Final reminder: no character says any word; only the voice-over narration speaks (voice only, nobody on screen is the narrator). Natural laughs, gasps and sighs are fine. No text, captions or logos in the frame.</w:t>
       </w:r>
     </w:p>
     <w:p>
@@ -1784,7 +1784,7 @@
           <w:sz w:val="20"/>
           <w:szCs w:val="20"/>
         </w:rPr>
-        <w:t xml:space="preserve">VOICE RULE: only the voice-over narration speaks words; it is a voice only, never a person or character on screen. No character says any word and no one on screen lip-syncs to speech; characters communicate with facial expressions and body gestures. Natural non-verbal sounds are allowed and should sound real: laughing, giggling, gasping, sighing, groaning, cheering, coughing. Attached reference images, in order: the Egyptian wedding guests, the wedding courtyard. 2D hand-drawn stickman cartoon in the exact style of the reference images: thin black outlines, large expressive heads, thin stick arms, flat warm colors, playful documentary-comedy tone, 16:9. Characters, identical in every frame: the musicians: guests in white linen playing harp, frame drum and reed flute. the guests: Egyptian wedding guests in white linen with blue-and-gold collars and gold headbands, black bob hairstyles, some in white striped headdresses. They wear only short white kilts or simple white dresses: no togas, no draped robes. Setting: sunny daytime ancient Egyptian wedding courtyard in Alexandria: flat-roofed sandstone mud-brick buildings, tall Egyptian columns with lotus-bud capitals painted in blue-and-gold bands, hieroglyph-style carvings on the walls, long tables with white cloths and clay jars, orange cloth awnings, and a tall wooden entrance gate at the back-center that opens onto the street. Egyptian architecture only: no Greek or Roman architecture, no triangular pediments, no domes, no red tile roofs, no cypress trees. Lighting: warm bright afternoon sunlight, soft shadows, rich saturated colors. ACTION TIMELINE (8 seconds): 0–2.5 s: an Egyptian musician plays the reed flute joyfully, eyes closed, the open gate visible behind him. 2.5–5.5 s: he stops abruptly, eyes opening, flute lowered, his expression turning alert. 5.5–8 s: he turns his head toward the gate, brow furrowed, listening, while the dancers behind him dance one more beat and then slow down. Camera: locked-off and perfectly still, eye-level medium shot of the musician with the entrance visible behind him; the framing never changes (no tilt, pan, zoom or rising camera). Audio: voice-over narration only (a voice, never shown on screen; no narrator character appears): a British male voice, warm and dry, begins speaking within half a second and says: “The musician noticed. He stopped. Everyone else danced one more beat, blissfully unaware.” The line takes about 5.2 seconds; leave the last second free of speech so the moment can land. Music: music nearly silent. Sound effects: music and drums cut out, one drum stops, timed to the action. Ambience: light courtyard ambience: clinking cups, footsteps on stone, a soft breeze, no words. Final reminder: no character says any word; only the voice-over narration speaks (voice only, nobody on screen is the narrator). Natural laughs, gasps and sighs are fine. No text, captions or logos in the frame.</w:t>
+        <w:t xml:space="preserve">VOICE RULE: only the voice-over narration speaks words; it is a voice only, never a person or character on screen. No character says any word and no one on screen lip-syncs to speech; characters communicate with facial expressions and body gestures. Natural non-verbal sounds are allowed and should sound real: laughing, giggling, gasping, sighing, groaning, cheering, coughing. Attached reference images, in order: the Egyptian wedding guests, the wedding courtyard. 2D hand-drawn Stickman animation, clean thin black outlines, large expressive heads, simple readable stickman proportions, flat warm colors, playful cinematic documentary-comedy tone, 16:9. Use the attached reference images as strict continuity anchors: preserve faces, hair, clothing, colors, proportions and accessories exactly; every character keeps a full body with a visible chest and torso exactly as in the references. Characters, identical in every frame: the musicians: guests in white linen playing harp, frame drum and reed flute. the guests: Egyptian wedding guests in white linen with blue-and-gold collars and gold headbands, black bob hairstyles, some in white striped headdresses. They wear only short white kilts or simple white dresses: no togas, no draped robes. Setting: sunny daytime ancient Egyptian wedding courtyard in Alexandria: flat-roofed sandstone mud-brick buildings, tall Egyptian columns with lotus-bud capitals painted in blue-and-gold bands, hieroglyph-style carvings on the walls, long tables with white cloths and clay jars, orange cloth awnings, and a tall wooden entrance gate at the back-center that opens onto the street. Egyptian architecture only: no Greek or Roman architecture, no triangular pediments, no domes, no red tile roofs, no cypress trees. Lighting: warm bright afternoon sunlight, soft shadows, rich saturated colors. ACTION TIMELINE (8 seconds): 0–2.5 s: an Egyptian musician plays the reed flute joyfully, eyes closed, the open gate visible behind him. 2.5–5.5 s: he stops abruptly, eyes opening, flute lowered, his expression turning alert. 5.5–8 s: he turns his head toward the gate, brow furrowed, listening, while the dancers behind him dance one more beat and then slow down. Camera: locked-off and perfectly still, eye-level medium shot of the musician with the entrance visible behind him; the framing never changes (no tilt, pan, zoom or rising camera). Audio: voice-over narration only (a voice, never shown on screen; no narrator character appears): a British male voice, warm and dry, begins speaking within half a second and says: “The musician noticed. He stopped. Everyone else danced one more beat, blissfully unaware.” The line takes about 5.2 seconds; leave the last second free of speech so the moment can land. Music: music nearly silent. Sound effects: music and drums cut out, one drum stops, timed to the action. Ambience: light courtyard ambience: clinking cups, footsteps on stone, a soft breeze, no words. Final reminder: no character says any word; only the voice-over narration speaks (voice only, nobody on screen is the narrator). Natural laughs, gasps and sighs are fine. No text, captions or logos in the frame.</w:t>
       </w:r>
     </w:p>
     <w:p>
@@ -1857,7 +1857,7 @@
           <w:sz w:val="20"/>
           <w:szCs w:val="20"/>
         </w:rPr>
-        <w:t xml:space="preserve">VOICE RULE: nobody speaks and no voice of any kind is heard in this clip; it is a sound-effects-only beat. Attached reference images, in order: the Roman soldiers. 2D hand-drawn stickman cartoon in the exact style of the reference images: thin black outlines, large expressive heads, thin stick arms, flat warm colors, playful documentary-comedy tone, 16:9. Characters, identical in every frame: the Roman soldiers: crimson plumed helmets, steel armor, red cloaks, rectangular red shields. Setting: sunlit street of ancient Alexandria outside the wedding house, sandstone walls, palms, market stalls with red and blue awnings. Flat-roofed Egyptian sandstone buildings; no Greek or Roman architecture, no domes. Lighting: warm bright sunlight, soft shadows. ACTION TIMELINE (4 seconds): 0–1 s: empty sunlit stone paving, dust drifting. 1–2 s: the first heavy Roman boot steps into frame from the side, the hem of a red cloak visible, dust puffing. 2–3 s: the second boot follows. 3–4 s: a third step lands; only boots and lower legs are ever visible. Camera: locked-off and perfectly still, fixed ground-level frame on the street; the boots step into frame from the side and the camera never rises; the framing never changes (no tilt, pan, zoom or rising camera). Audio: no narration and no speech. Music: low sustained tension with distant marching drums, almost silent. Sound effects: heavy boot steps with metal clank, timed to each step. Ambience: sunlit street ambience: wind and distant clatter, no words. Final reminder: no voice of any kind in this clip. No text, captions or logos in the frame.</w:t>
+        <w:t xml:space="preserve">VOICE RULE: nobody speaks and no voice of any kind is heard in this clip; it is a sound-effects-only beat. Attached reference images, in order: the Roman soldiers. 2D hand-drawn Stickman animation, clean thin black outlines, large expressive heads, simple readable stickman proportions, flat warm colors, playful cinematic documentary-comedy tone, 16:9. Use the attached reference images as strict continuity anchors: preserve faces, hair, clothing, colors, proportions and accessories exactly; every character keeps a full body with a visible chest and torso exactly as in the references. Characters, identical in every frame: the Roman soldiers: crimson plumed helmets, steel armor, red cloaks, rectangular red shields. Setting: sunlit street of ancient Alexandria outside the wedding house, sandstone walls, palms, market stalls with red and blue awnings. Flat-roofed Egyptian sandstone buildings; no Greek or Roman architecture, no domes. Lighting: warm bright sunlight, soft shadows. ACTION TIMELINE (4 seconds): 0–1 s: empty sunlit stone paving, dust drifting. 1–2 s: the first heavy Roman boot steps into frame from the side, the hem of a red cloak visible, dust puffing. 2–3 s: the second boot follows. 3–4 s: a third step lands; only boots and lower legs are ever visible. Camera: locked-off and perfectly still, fixed ground-level frame on the street; the boots step into frame from the side and the camera never rises; the framing never changes (no tilt, pan, zoom or rising camera). Audio: no narration and no speech. Music: low sustained tension with distant marching drums, almost silent. Sound effects: heavy boot steps with metal clank, timed to each step. Ambience: sunlit street ambience: wind and distant clatter, no words. Final reminder: no voice of any kind in this clip. No text, captions or logos in the frame.</w:t>
       </w:r>
     </w:p>
     <w:p>
@@ -1930,7 +1930,7 @@
           <w:sz w:val="20"/>
           <w:szCs w:val="20"/>
         </w:rPr>
-        <w:t xml:space="preserve">VOICE RULE: only the voice-over narration speaks words; it is a voice only, never a person or character on screen. No character says any word and no one on screen lip-syncs to speech; characters communicate with facial expressions and body gestures. Natural non-verbal sounds are allowed and should sound real: laughing, giggling, gasping, sighing, groaning, cheering, coughing. Attached reference images, in order: the wedding courtyard, Senbi, the groom, the bride. 2D hand-drawn stickman cartoon in the exact style of the reference images: thin black outlines, large expressive heads, thin stick arms, flat warm colors, playful documentary-comedy tone, 16:9. Characters, identical in every frame: Senbi the groom: young man, straight black bowl-cut hair with bangs, gold headband with a gold cobra, bare chest, blue-and-gold broad collar, gold bracers, white kilt with a blue-and-gold sash, brown sandals, thin black stick arms. the bride: black bob hair with straight bangs, gold headband with a red gem, white dress, blue-and-gold collar, gold sash, gold arm cuffs, light veil. the guests: Egyptian wedding guests in white linen with blue-and-gold collars and gold headbands, black bob hairstyles, some in white striped headdresses. They wear only short white kilts or simple white dresses: no togas, no draped robes. Setting: sunny daytime ancient Egyptian wedding courtyard in Alexandria: flat-roofed sandstone mud-brick buildings, tall Egyptian columns with lotus-bud capitals painted in blue-and-gold bands, hieroglyph-style carvings on the walls, long tables with white cloths and clay jars, orange cloth awnings, and a tall wooden entrance gate at the back-center that opens onto the street. Egyptian architecture only: no Greek or Roman architecture, no triangular pediments, no domes, no red tile roofs, no cypress trees. Lighting: warm bright afternoon sunlight, soft shadows, rich saturated colors. ACTION TIMELINE (6 seconds): 0–2 s: guests dance and laugh while Senbi spins happily in the center, arms out. 2–4 s: the bride claps in rhythm beside him. 4–6 s: Senbi keeps spinning, eyes closed in bliss; the gate behind them stays calm. Camera: locked-off and perfectly still, eye-level medium-wide shot of the courtyard; the framing never changes (no tilt, pan, zoom or rising camera). Audio: voice-over narration only (a voice, never shown on screen; no narrator character appears): a British male voice, warm and dry, begins speaking within half a second and says: “Inside, nobody had a clue. Senbi was busy spinning.” The line takes about 3.6 seconds; leave the last second free of speech so the moment can land. Music: light ancient-Mediterranean wedding music (frame drums, reed flute, plucked strings) with a faint uneasy undertone, same theme in every clip, low under the voice. Sound effects: wedding music muffled, faint thump, timed to the action. Ambience: light courtyard ambience: clinking cups, footsteps on stone, a soft breeze, no words. Final reminder: no character says any word; only the voice-over narration speaks (voice only, nobody on screen is the narrator). Natural laughs, gasps and sighs are fine. No text, captions or logos in the frame.</w:t>
+        <w:t xml:space="preserve">VOICE RULE: only the voice-over narration speaks words; it is a voice only, never a person or character on screen. No character says any word and no one on screen lip-syncs to speech; characters communicate with facial expressions and body gestures. Natural non-verbal sounds are allowed and should sound real: laughing, giggling, gasping, sighing, groaning, cheering, coughing. Attached reference images, in order: the wedding courtyard, Senbi, the groom, the bride. 2D hand-drawn Stickman animation, clean thin black outlines, large expressive heads, simple readable stickman proportions, flat warm colors, playful cinematic documentary-comedy tone, 16:9. Use the attached reference images as strict continuity anchors: preserve faces, hair, clothing, colors, proportions and accessories exactly; every character keeps a full body with a visible chest and torso exactly as in the references. Characters, identical in every frame: Senbi the groom: young man with a full body and a visible chest, straight black bowl-cut hair with bangs, gold headband with a gold cobra, blue-and-gold broad collar resting on his bare chest, gold bracers on both wrists, white kilt with a blue-and-gold sash, brown sandals. the bride: black bob hair with straight bangs, gold headband with a red gem, white dress, blue-and-gold collar, gold sash, gold arm cuffs, light veil. the guests: Egyptian wedding guests in white linen with blue-and-gold collars and gold headbands, black bob hairstyles, some in white striped headdresses. They wear only short white kilts or simple white dresses: no togas, no draped robes. Setting: sunny daytime ancient Egyptian wedding courtyard in Alexandria: flat-roofed sandstone mud-brick buildings, tall Egyptian columns with lotus-bud capitals painted in blue-and-gold bands, hieroglyph-style carvings on the walls, long tables with white cloths and clay jars, orange cloth awnings, and a tall wooden entrance gate at the back-center that opens onto the street. Egyptian architecture only: no Greek or Roman architecture, no triangular pediments, no domes, no red tile roofs, no cypress trees. Lighting: warm bright afternoon sunlight, soft shadows, rich saturated colors. ACTION TIMELINE (6 seconds): 0–2 s: guests dance and laugh while Senbi spins happily in the center, arms out. 2–4 s: the bride claps in rhythm beside him. 4–6 s: Senbi keeps spinning, eyes closed in bliss; the gate behind them stays calm. Camera: locked-off and perfectly still, eye-level medium-wide shot of the courtyard; the framing never changes (no tilt, pan, zoom or rising camera). Audio: voice-over narration only (a voice, never shown on screen; no narrator character appears): a British male voice, warm and dry, begins speaking within half a second and says: “Inside, nobody had a clue. Senbi was busy spinning.” The line takes about 3.6 seconds; leave the last second free of speech so the moment can land. Music: light ancient-Mediterranean wedding music (frame drums, reed flute, plucked strings) with a faint uneasy undertone, same theme in every clip, low under the voice. Sound effects: wedding music muffled, faint thump, timed to the action. Ambience: light courtyard ambience: clinking cups, footsteps on stone, a soft breeze, no words. Final reminder: no character says any word; only the voice-over narration speaks (voice only, nobody on screen is the narrator). Natural laughs, gasps and sighs are fine. No text, captions or logos in the frame.</w:t>
       </w:r>
     </w:p>
     <w:p>
@@ -2003,7 +2003,7 @@
           <w:sz w:val="20"/>
           <w:szCs w:val="20"/>
         </w:rPr>
-        <w:t xml:space="preserve">VOICE RULE: only the voice-over narration speaks words; it is a voice only, never a person or character on screen. No character says any word and no one on screen lip-syncs to speech; characters communicate with facial expressions and body gestures. Natural non-verbal sounds are allowed and should sound real: laughing, giggling, gasping, sighing, groaning, cheering, coughing. Attached reference images, in order: the Roman soldiers. 2D hand-drawn stickman cartoon in the exact style of the reference images: thin black outlines, large expressive heads, thin stick arms, flat warm colors, playful documentary-comedy tone, 16:9. Characters, identical in every frame: the Roman soldiers: crimson plumed helmets, steel armor, red cloaks, rectangular red shields. Setting: sunlit street of ancient Alexandria outside the wedding house, sandstone walls, palms, market stalls with red and blue awnings. Flat-roofed Egyptian sandstone buildings; no Greek or Roman architecture, no domes. Lighting: warm bright sunlight, soft shadows. ACTION TIMELINE (8 seconds): 0–2.5 s: the street is empty and the sound of boots grows. 2.5–5.5 s: two tired, dusty Roman legionaries walk into frame, shields and spears in hand, shoulders slumped, dust on their armor. 5.5–8 s: they stop in front of the wedding house and look around, then at each other, confused; one scratches under his helmet. Camera: locked-off and perfectly still, eye-level medium-wide shot of the street; the soldiers walk into the frame; the framing never changes (no tilt, pan, zoom or rising camera). Audio: voice-over narration only (a voice, never shown on screen; no narrator character appears): a British male voice, warm and dry, begins speaking within half a second and says: “And then Rome arrived. Tired, dusty, and looking for the right address.” The line takes about 4.8 seconds; leave the last second free of speech so the moment can land. Music: low sustained tension with distant marching drums, almost silent. Sound effects: armor clank, dust, a tired sigh, timed to the action. Ambience: sunlit street ambience: wind and distant clatter, no words. Final reminder: no character says any word; only the voice-over narration speaks (voice only, nobody on screen is the narrator). Natural laughs, gasps and sighs are fine. No text, captions or logos in the frame.</w:t>
+        <w:t xml:space="preserve">VOICE RULE: only the voice-over narration speaks words; it is a voice only, never a person or character on screen. No character says any word and no one on screen lip-syncs to speech; characters communicate with facial expressions and body gestures. Natural non-verbal sounds are allowed and should sound real: laughing, giggling, gasping, sighing, groaning, cheering, coughing. Attached reference images, in order: the Roman soldiers. 2D hand-drawn Stickman animation, clean thin black outlines, large expressive heads, simple readable stickman proportions, flat warm colors, playful cinematic documentary-comedy tone, 16:9. Use the attached reference images as strict continuity anchors: preserve faces, hair, clothing, colors, proportions and accessories exactly; every character keeps a full body with a visible chest and torso exactly as in the references. Characters, identical in every frame: the Roman soldiers: crimson plumed helmets, steel armor, red cloaks, rectangular red shields. Setting: sunlit street of ancient Alexandria outside the wedding house, sandstone walls, palms, market stalls with red and blue awnings. Flat-roofed Egyptian sandstone buildings; no Greek or Roman architecture, no domes. Lighting: warm bright sunlight, soft shadows. ACTION TIMELINE (8 seconds): 0–2.5 s: the street is empty and the sound of boots grows. 2.5–5.5 s: two tired, dusty Roman legionaries walk into frame, shields and spears in hand, shoulders slumped, dust on their armor. 5.5–8 s: they stop in front of the wedding house and look around, then at each other, confused; one scratches under his helmet. Camera: locked-off and perfectly still, eye-level medium-wide shot of the street; the soldiers walk into the frame; the framing never changes (no tilt, pan, zoom or rising camera). Audio: voice-over narration only (a voice, never shown on screen; no narrator character appears): a British male voice, warm and dry, begins speaking within half a second and says: “And then Rome arrived. Tired, dusty, and looking for the right address.” The line takes about 4.8 seconds; leave the last second free of speech so the moment can land. Music: low sustained tension with distant marching drums, almost silent. Sound effects: armor clank, dust, a tired sigh, timed to the action. Ambience: sunlit street ambience: wind and distant clatter, no words. Final reminder: no character says any word; only the voice-over narration speaks (voice only, nobody on screen is the narrator). Natural laughs, gasps and sighs are fine. No text, captions or logos in the frame.</w:t>
       </w:r>
     </w:p>
     <w:p>
@@ -2076,7 +2076,7 @@
           <w:sz w:val="20"/>
           <w:szCs w:val="20"/>
         </w:rPr>
-        <w:t xml:space="preserve">VOICE RULE: only the voice-over narration speaks words; it is a voice only, never a person or character on screen. No character says any word and no one on screen lip-syncs to speech; characters communicate with facial expressions and body gestures. Natural non-verbal sounds are allowed and should sound real: laughing, giggling, gasping, sighing, groaning, cheering, coughing. Attached reference images, in order: the Egyptian wedding guests, the Roman soldiers, the wedding courtyard. 2D hand-drawn stickman cartoon in the exact style of the reference images: thin black outlines, large expressive heads, thin stick arms, flat warm colors, playful documentary-comedy tone, 16:9. Characters, identical in every frame: the guests: Egyptian wedding guests in white linen with blue-and-gold collars and gold headbands, black bob hairstyles, some in white striped headdresses. They wear only short white kilts or simple white dresses: no togas, no draped robes. Setting: sunlit street of ancient Alexandria outside the wedding house, sandstone walls, palms, market stalls with red and blue awnings. Flat-roofed Egyptian sandstone buildings; no Greek or Roman architecture, no domes. Lighting: warm bright sunlight, soft shadows. ACTION TIMELINE (8 seconds): 0–2.5 s: three guests peek out of the doorway at the same time: the left one terrified with wide eyes and hands on cheeks, the center one confused with a tilted head and one raised eyebrow, the right one grinning and clapping softly as if watching entertainers. 2.5–5.5 s: the terrified one ducks back and peeks out again. 5.5–8 s: the grinning one nudges the confused one and points, delighted, while the confused one squints. Camera: locked-off and perfectly still, eye-level medium-wide shot of the doorway with all three guests peeking in the same frame; the framing never changes (no tilt, pan, zoom or rising camera). Audio: voice-over narration only (a voice, never shown on screen; no narrator character appears): a British male voice, warm and dry, begins speaking within half a second and says: “The guests peeked out. One terrified. One confused. One assumed it was entertainment.” The line takes about 5.2 seconds; leave the last second free of speech so the moment can land. Music: music nearly silent. Sound effects: nervous coughs and gasps, no words, timed to the action. Ambience: sunlit street ambience: wind and distant clatter, no words. Final reminder: no character says any word; only the voice-over narration speaks (voice only, nobody on screen is the narrator). Natural laughs, gasps and sighs are fine. No text, captions or logos in the frame.</w:t>
+        <w:t xml:space="preserve">VOICE RULE: only the voice-over narration speaks words; it is a voice only, never a person or character on screen. No character says any word and no one on screen lip-syncs to speech; characters communicate with facial expressions and body gestures. Natural non-verbal sounds are allowed and should sound real: laughing, giggling, gasping, sighing, groaning, cheering, coughing. Attached reference images, in order: the Egyptian wedding guests, the Roman soldiers, the wedding courtyard. 2D hand-drawn Stickman animation, clean thin black outlines, large expressive heads, simple readable stickman proportions, flat warm colors, playful cinematic documentary-comedy tone, 16:9. Use the attached reference images as strict continuity anchors: preserve faces, hair, clothing, colors, proportions and accessories exactly; every character keeps a full body with a visible chest and torso exactly as in the references. Characters, identical in every frame: the guests: Egyptian wedding guests in white linen with blue-and-gold collars and gold headbands, black bob hairstyles, some in white striped headdresses. They wear only short white kilts or simple white dresses: no togas, no draped robes. Setting: sunlit street of ancient Alexandria outside the wedding house, sandstone walls, palms, market stalls with red and blue awnings. Flat-roofed Egyptian sandstone buildings; no Greek or Roman architecture, no domes. Lighting: warm bright sunlight, soft shadows. ACTION TIMELINE (8 seconds): 0–2.5 s: three guests peek out of the doorway at the same time: the left one terrified with wide eyes and hands on cheeks, the center one confused with a tilted head and one raised eyebrow, the right one grinning and clapping softly as if watching entertainers. 2.5–5.5 s: the terrified one ducks back and peeks out again. 5.5–8 s: the grinning one nudges the confused one and points, delighted, while the confused one squints. Camera: locked-off and perfectly still, eye-level medium-wide shot of the doorway with all three guests peeking in the same frame; the framing never changes (no tilt, pan, zoom or rising camera). Audio: voice-over narration only (a voice, never shown on screen; no narrator character appears): a British male voice, warm and dry, begins speaking within half a second and says: “The guests peeked out. One terrified. One confused. One assumed it was entertainment.” The line takes about 5.2 seconds; leave the last second free of speech so the moment can land. Music: music nearly silent. Sound effects: nervous coughs and gasps, no words, timed to the action. Ambience: sunlit street ambience: wind and distant clatter, no words. Final reminder: no character says any word; only the voice-over narration speaks (voice only, nobody on screen is the narrator). Natural laughs, gasps and sighs are fine. No text, captions or logos in the frame.</w:t>
       </w:r>
     </w:p>
     <w:p>
@@ -2149,7 +2149,7 @@
           <w:sz w:val="20"/>
           <w:szCs w:val="20"/>
         </w:rPr>
-        <w:t xml:space="preserve">VOICE RULE: only the voice-over narration speaks words; it is a voice only, never a person or character on screen. No character says any word and no one on screen lip-syncs to speech; characters communicate with facial expressions and body gestures. Natural non-verbal sounds are allowed and should sound real: laughing, giggling, gasping, sighing, groaning, cheering, coughing. Attached reference images, in order: the bride's relatives, the Roman soldiers, the wedding courtyard. 2D hand-drawn stickman cartoon in the exact style of the reference images: thin black outlines, large expressive heads, thin stick arms, flat warm colors, playful documentary-comedy tone, 16:9. Characters, identical in every frame: the uncle: cheerful bearded middle-aged man in plain white linen. the Roman soldiers: crimson plumed helmets, steel armor, red cloaks, rectangular red shields. Setting: sunlit street of ancient Alexandria outside the wedding house, sandstone walls, palms, market stalls with red and blue awnings. Flat-roofed Egyptian sandstone buildings; no Greek or Roman architecture, no domes. Lighting: warm bright sunlight, soft shadows. ACTION TIMELINE (8 seconds): 0–2.5 s: a cheerful, slightly tipsy bearded uncle sways with a clay beer cup in hand, cheeks rosy, two Roman soldiers waiting at the right edge of the frame. 2.5–5.5 s: he strides confidently across the frame toward the soldiers, cup raised in greeting. 5.5–8 s: he arrives and extends the cup with a wide smile. Camera: locked-off and perfectly still, eye-level medium-wide shot; the uncle walks across the frame; the framing never changes (no tilt, pan, zoom or rising camera). Audio: voice-over narration only (a voice, never shown on screen; no narrator character appears): a British male voice, warm and dry, begins speaking within half a second and says: “Then one uncle, a man with absolutely no fear, grabbed a beer.” The line takes about 4.8 seconds; leave the last second free of speech so the moment can land. Music: playful comic percussion over the wedding rhythm, low under the voice. Sound effects: cup clink, timed to the action. Ambience: sunlit street ambience: wind and distant clatter, no words. Final reminder: no character says any word; only the voice-over narration speaks (voice only, nobody on screen is the narrator). Natural laughs, gasps and sighs are fine. No text, captions or logos in the frame.</w:t>
+        <w:t xml:space="preserve">VOICE RULE: only the voice-over narration speaks words; it is a voice only, never a person or character on screen. No character says any word and no one on screen lip-syncs to speech; characters communicate with facial expressions and body gestures. Natural non-verbal sounds are allowed and should sound real: laughing, giggling, gasping, sighing, groaning, cheering, coughing. Attached reference images, in order: the bride's relatives, the Roman soldiers, the wedding courtyard. 2D hand-drawn Stickman animation, clean thin black outlines, large expressive heads, simple readable stickman proportions, flat warm colors, playful cinematic documentary-comedy tone, 16:9. Use the attached reference images as strict continuity anchors: preserve faces, hair, clothing, colors, proportions and accessories exactly; every character keeps a full body with a visible chest and torso exactly as in the references. Characters, identical in every frame: the uncle: cheerful bearded middle-aged man in plain white linen. the Roman soldiers: crimson plumed helmets, steel armor, red cloaks, rectangular red shields. Setting: sunlit street of ancient Alexandria outside the wedding house, sandstone walls, palms, market stalls with red and blue awnings. Flat-roofed Egyptian sandstone buildings; no Greek or Roman architecture, no domes. Lighting: warm bright sunlight, soft shadows. ACTION TIMELINE (8 seconds): 0–2.5 s: a cheerful, slightly tipsy bearded uncle sways with a clay beer cup in hand, cheeks rosy, two Roman soldiers waiting at the right edge of the frame. 2.5–5.5 s: he strides confidently across the frame toward the soldiers, cup raised in greeting. 5.5–8 s: he arrives and extends the cup with a wide smile. Camera: locked-off and perfectly still, eye-level medium-wide shot; the uncle walks across the frame; the framing never changes (no tilt, pan, zoom or rising camera). Audio: voice-over narration only (a voice, never shown on screen; no narrator character appears): a British male voice, warm and dry, begins speaking within half a second and says: “Then one uncle, a man with absolutely no fear, grabbed a beer.” The line takes about 4.8 seconds; leave the last second free of speech so the moment can land. Music: playful comic percussion over the wedding rhythm, low under the voice. Sound effects: cup clink, timed to the action. Ambience: sunlit street ambience: wind and distant clatter, no words. Final reminder: no character says any word; only the voice-over narration speaks (voice only, nobody on screen is the narrator). Natural laughs, gasps and sighs are fine. No text, captions or logos in the frame.</w:t>
       </w:r>
     </w:p>
     <w:p>
@@ -2222,7 +2222,7 @@
           <w:sz w:val="20"/>
           <w:szCs w:val="20"/>
         </w:rPr>
-        <w:t xml:space="preserve">VOICE RULE: only the voice-over narration speaks words; it is a voice only, never a person or character on screen. No character says any word and no one on screen lip-syncs to speech; characters communicate with facial expressions and body gestures. Natural non-verbal sounds are allowed and should sound real: laughing, giggling, gasping, sighing, groaning, cheering, coughing. Attached reference images, in order: the Roman soldiers. 2D hand-drawn stickman cartoon in the exact style of the reference images: thin black outlines, large expressive heads, thin stick arms, flat warm colors, playful documentary-comedy tone, 16:9. Characters, identical in every frame: the Roman soldiers: crimson plumed helmets, steel armor, red cloaks, rectangular red shields. Setting: sunlit street of ancient Alexandria outside the wedding house, sandstone walls, palms, market stalls with red and blue awnings. Flat-roofed Egyptian sandstone buildings; no Greek or Roman architecture, no domes. Lighting: warm bright sunlight, soft shadows. ACTION TIMELINE (8 seconds): 0–2.5 s: the soldier's confused face looks at the beer cup. 2.5–5.5 s: he looks up at the uncle's smiling face off-screen and back to the cup, then cautiously takes it. 5.5–8 s: his eyes slide sideways toward his comrades in a silent plea of 'what do I do?'; he sniffs the cup. Camera: eye-level medium close-up of the soldier; fixed except for an almost imperceptible 5% slow push-in, no tilt or pan. Audio: voice-over narration only (a voice, never shown on screen; no narrator character appears): a British male voice, warm and dry, begins speaking within half a second and says: “The soldier stared at the cup, then the uncle. A trap? Or hospitality?” The line takes about 5.2 seconds; leave the last second free of speech so the moment can land. Music: music nearly silent. Sound effects: tiny gulp, uneasy hum, timed to the action. Ambience: sunlit street ambience: wind and distant clatter, no words. Final reminder: no character says any word; only the voice-over narration speaks (voice only, nobody on screen is the narrator). Natural laughs, gasps and sighs are fine. No text, captions or logos in the frame.</w:t>
+        <w:t xml:space="preserve">VOICE RULE: only the voice-over narration speaks words; it is a voice only, never a person or character on screen. No character says any word and no one on screen lip-syncs to speech; characters communicate with facial expressions and body gestures. Natural non-verbal sounds are allowed and should sound real: laughing, giggling, gasping, sighing, groaning, cheering, coughing. Attached reference images, in order: the Roman soldiers. 2D hand-drawn Stickman animation, clean thin black outlines, large expressive heads, simple readable stickman proportions, flat warm colors, playful cinematic documentary-comedy tone, 16:9. Use the attached reference images as strict continuity anchors: preserve faces, hair, clothing, colors, proportions and accessories exactly; every character keeps a full body with a visible chest and torso exactly as in the references. Characters, identical in every frame: the Roman soldiers: crimson plumed helmets, steel armor, red cloaks, rectangular red shields. Setting: sunlit street of ancient Alexandria outside the wedding house, sandstone walls, palms, market stalls with red and blue awnings. Flat-roofed Egyptian sandstone buildings; no Greek or Roman architecture, no domes. Lighting: warm bright sunlight, soft shadows. ACTION TIMELINE (8 seconds): 0–2.5 s: the soldier's confused face looks at the beer cup. 2.5–5.5 s: he looks up at the uncle's smiling face off-screen and back to the cup, then cautiously takes it. 5.5–8 s: his eyes slide sideways toward his comrades in a silent plea of 'what do I do?'; he sniffs the cup. Camera: eye-level medium close-up of the soldier; fixed except for an almost imperceptible 5% slow push-in, no tilt or pan. Audio: voice-over narration only (a voice, never shown on screen; no narrator character appears): a British male voice, warm and dry, begins speaking within half a second and says: “The soldier stared at the cup, then the uncle. A trap? Or hospitality?” The line takes about 5.2 seconds; leave the last second free of speech so the moment can land. Music: music nearly silent. Sound effects: tiny gulp, uneasy hum, timed to the action. Ambience: sunlit street ambience: wind and distant clatter, no words. Final reminder: no character says any word; only the voice-over narration speaks (voice only, nobody on screen is the narrator). Natural laughs, gasps and sighs are fine. No text, captions or logos in the frame.</w:t>
       </w:r>
     </w:p>
     <w:p>
@@ -2295,7 +2295,7 @@
           <w:sz w:val="20"/>
           <w:szCs w:val="20"/>
         </w:rPr>
-        <w:t xml:space="preserve">VOICE RULE: only the voice-over narration speaks words; it is a voice only, never a person or character on screen. No character says any word and no one on screen lip-syncs to speech; characters communicate with facial expressions and body gestures. Natural non-verbal sounds are allowed and should sound real: laughing, giggling, gasping, sighing, groaning, cheering, coughing. Attached reference images, in order: the Roman soldiers, the wedding courtyard. 2D hand-drawn stickman cartoon in the exact style of the reference images: thin black outlines, large expressive heads, thin stick arms, flat warm colors, playful documentary-comedy tone, 16:9. Characters, identical in every frame: the Roman soldiers: crimson plumed helmets, steel armor, red cloaks, rectangular red shields. Setting: sunny daytime ancient Egyptian wedding courtyard in Alexandria: flat-roofed sandstone mud-brick buildings, tall Egyptian columns with lotus-bud capitals painted in blue-and-gold bands, hieroglyph-style carvings on the walls, long tables with white cloths and clay jars, orange cloth awnings, and a tall wooden entrance gate at the back-center that opens onto the street. Egyptian architecture only: no Greek or Roman architecture, no triangular pediments, no domes, no red tile roofs, no cypress trees. Lighting: warm bright afternoon sunlight, soft shadows, rich saturated colors. ACTION TIMELINE (8 seconds): 0–2.5 s: two Roman soldiers in the foreground scan the area with serious faces, the feast table behind them. 2.5–5.5 s: they turn their heads toward the roast goose, bread and fruit and their expressions soften. 5.5–8 s: one leans slightly forward, nostrils flaring, his stomach growls and the other glances at him. Camera: locked-off and perfectly still, eye-level wide-medium shot: the soldiers in the foreground, the feast table behind them; they turn their heads toward it; the framing never changes (no tilt, pan, zoom or rising camera). Audio: voice-over narration only (a voice, never shown on screen; no narrator character appears): a British male voice, warm and dry, begins speaking within half a second and says: “Then the Romans saw the food. Military discipline lasted about four seconds.” The line takes about 4.8 seconds; leave the last second free of speech so the moment can land. Music: playful comic percussion over the wedding rhythm, low under the voice. Sound effects: stomach growl, sniff, timed to the action. Ambience: light courtyard ambience: clinking cups, footsteps on stone, a soft breeze, no words. Final reminder: no character says any word; only the voice-over narration speaks (voice only, nobody on screen is the narrator). Natural laughs, gasps and sighs are fine. No text, captions or logos in the frame.</w:t>
+        <w:t xml:space="preserve">VOICE RULE: only the voice-over narration speaks words; it is a voice only, never a person or character on screen. No character says any word and no one on screen lip-syncs to speech; characters communicate with facial expressions and body gestures. Natural non-verbal sounds are allowed and should sound real: laughing, giggling, gasping, sighing, groaning, cheering, coughing. Attached reference images, in order: the Roman soldiers, the wedding courtyard. 2D hand-drawn Stickman animation, clean thin black outlines, large expressive heads, simple readable stickman proportions, flat warm colors, playful cinematic documentary-comedy tone, 16:9. Use the attached reference images as strict continuity anchors: preserve faces, hair, clothing, colors, proportions and accessories exactly; every character keeps a full body with a visible chest and torso exactly as in the references. Characters, identical in every frame: the Roman soldiers: crimson plumed helmets, steel armor, red cloaks, rectangular red shields. Setting: sunny daytime ancient Egyptian wedding courtyard in Alexandria: flat-roofed sandstone mud-brick buildings, tall Egyptian columns with lotus-bud capitals painted in blue-and-gold bands, hieroglyph-style carvings on the walls, long tables with white cloths and clay jars, orange cloth awnings, and a tall wooden entrance gate at the back-center that opens onto the street. Egyptian architecture only: no Greek or Roman architecture, no triangular pediments, no domes, no red tile roofs, no cypress trees. Lighting: warm bright afternoon sunlight, soft shadows, rich saturated colors. ACTION TIMELINE (8 seconds): 0–2.5 s: two Roman soldiers in the foreground scan the area with serious faces, the feast table behind them. 2.5–5.5 s: they turn their heads toward the roast goose, bread and fruit and their expressions soften. 5.5–8 s: one leans slightly forward, nostrils flaring, his stomach growls and the other glances at him. Camera: locked-off and perfectly still, eye-level wide-medium shot: the soldiers in the foreground, the feast table behind them; they turn their heads toward it; the framing never changes (no tilt, pan, zoom or rising camera). Audio: voice-over narration only (a voice, never shown on screen; no narrator character appears): a British male voice, warm and dry, begins speaking within half a second and says: “Then the Romans saw the food. Military discipline lasted about four seconds.” The line takes about 4.8 seconds; leave the last second free of speech so the moment can land. Music: playful comic percussion over the wedding rhythm, low under the voice. Sound effects: stomach growl, sniff, timed to the action. Ambience: light courtyard ambience: clinking cups, footsteps on stone, a soft breeze, no words. Final reminder: no character says any word; only the voice-over narration speaks (voice only, nobody on screen is the narrator). Natural laughs, gasps and sighs are fine. No text, captions or logos in the frame.</w:t>
       </w:r>
     </w:p>
     <w:p>
@@ -2368,7 +2368,7 @@
           <w:sz w:val="20"/>
           <w:szCs w:val="20"/>
         </w:rPr>
-        <w:t xml:space="preserve">VOICE RULE: only the voice-over narration speaks words; it is a voice only, never a person or character on screen. No character says any word and no one on screen lip-syncs to speech; characters communicate with facial expressions and body gestures. Natural non-verbal sounds are allowed and should sound real: laughing, giggling, gasping, sighing, groaning, cheering, coughing. Attached reference images, in order: the Roman soldiers, the Egyptian wedding guests, the wedding courtyard. 2D hand-drawn stickman cartoon in the exact style of the reference images: thin black outlines, large expressive heads, thin stick arms, flat warm colors, playful documentary-comedy tone, 16:9. Characters, identical in every frame: the guests: Egyptian wedding guests in white linen with blue-and-gold collars and gold headbands, black bob hairstyles, some in white striped headdresses. They wear only short white kilts or simple white dresses: no togas, no draped robes. the Roman soldiers: crimson plumed helmets, steel armor, red cloaks, rectangular red shields. Setting: sunny daytime ancient Egyptian wedding courtyard in Alexandria: flat-roofed sandstone mud-brick buildings, tall Egyptian columns with lotus-bud capitals painted in blue-and-gold bands, hieroglyph-style carvings on the walls, long tables with white cloths and clay jars, orange cloth awnings, and a tall wooden entrance gate at the back-center that opens onto the street. Egyptian architecture only: no Greek or Roman architecture, no triangular pediments, no domes, no red tile roofs, no cypress trees. Lighting: warm bright afternoon sunlight, soft shadows, rich saturated colors. ACTION TIMELINE (8 seconds): 0–2.5 s: Egyptian guests dance in the courtyard. 2.5–5.5 s: one Roman soldier steps awkwardly onto the dance floor, stiff as a board; the guests freeze and stare. 5.5–8 s: one guest begins to copy his stiff step and the others hesitate, then join in. Camera: locked-off and perfectly still, eye-level wide shot; the framing never changes (no tilt, pan, zoom or rising camera). Audio: voice-over narration only (a voice, never shown on screen; no narrator character appears): a British male voice, warm and dry, begins speaking within half a second and says: “One soldier stepped into the dance. Nobody stopped him. Somehow, it worked.” The line takes about 4.8 seconds; leave the last second free of speech so the moment can land. Music: playful comic percussion over the wedding rhythm, low under the voice. Sound effects: shield tap blending into the rhythm, clapping, timed to the action. Ambience: light courtyard ambience: clinking cups, footsteps on stone, a soft breeze, no words. Final reminder: no character says any word; only the voice-over narration speaks (voice only, nobody on screen is the narrator). Natural laughs, gasps and sighs are fine. No text, captions or logos in the frame.</w:t>
+        <w:t xml:space="preserve">VOICE RULE: only the voice-over narration speaks words; it is a voice only, never a person or character on screen. No character says any word and no one on screen lip-syncs to speech; characters communicate with facial expressions and body gestures. Natural non-verbal sounds are allowed and should sound real: laughing, giggling, gasping, sighing, groaning, cheering, coughing. Attached reference images, in order: the Roman soldiers, the Egyptian wedding guests, the wedding courtyard. 2D hand-drawn Stickman animation, clean thin black outlines, large expressive heads, simple readable stickman proportions, flat warm colors, playful cinematic documentary-comedy tone, 16:9. Use the attached reference images as strict continuity anchors: preserve faces, hair, clothing, colors, proportions and accessories exactly; every character keeps a full body with a visible chest and torso exactly as in the references. Characters, identical in every frame: the guests: Egyptian wedding guests in white linen with blue-and-gold collars and gold headbands, black bob hairstyles, some in white striped headdresses. They wear only short white kilts or simple white dresses: no togas, no draped robes. the Roman soldiers: crimson plumed helmets, steel armor, red cloaks, rectangular red shields. Setting: sunny daytime ancient Egyptian wedding courtyard in Alexandria: flat-roofed sandstone mud-brick buildings, tall Egyptian columns with lotus-bud capitals painted in blue-and-gold bands, hieroglyph-style carvings on the walls, long tables with white cloths and clay jars, orange cloth awnings, and a tall wooden entrance gate at the back-center that opens onto the street. Egyptian architecture only: no Greek or Roman architecture, no triangular pediments, no domes, no red tile roofs, no cypress trees. Lighting: warm bright afternoon sunlight, soft shadows, rich saturated colors. ACTION TIMELINE (8 seconds): 0–2.5 s: Egyptian guests dance in the courtyard. 2.5–5.5 s: one Roman soldier steps awkwardly onto the dance floor, stiff as a board; the guests freeze and stare. 5.5–8 s: one guest begins to copy his stiff step and the others hesitate, then join in. Camera: locked-off and perfectly still, eye-level wide shot; the framing never changes (no tilt, pan, zoom or rising camera). Audio: voice-over narration only (a voice, never shown on screen; no narrator character appears): a British male voice, warm and dry, begins speaking within half a second and says: “One soldier stepped into the dance. Nobody stopped him. Somehow, it worked.” The line takes about 4.8 seconds; leave the last second free of speech so the moment can land. Music: playful comic percussion over the wedding rhythm, low under the voice. Sound effects: shield tap blending into the rhythm, clapping, timed to the action. Ambience: light courtyard ambience: clinking cups, footsteps on stone, a soft breeze, no words. Final reminder: no character says any word; only the voice-over narration speaks (voice only, nobody on screen is the narrator). Natural laughs, gasps and sighs are fine. No text, captions or logos in the frame.</w:t>
       </w:r>
     </w:p>
     <w:p>
@@ -2441,7 +2441,7 @@
           <w:sz w:val="20"/>
           <w:szCs w:val="20"/>
         </w:rPr>
-        <w:t xml:space="preserve">VOICE RULE: only the voice-over narration speaks words; it is a voice only, never a person or character on screen. No character says any word and no one on screen lip-syncs to speech; characters communicate with facial expressions and body gestures. Natural non-verbal sounds are allowed and should sound real: laughing, giggling, gasping, sighing, groaning, cheering, coughing. Attached reference images, in order: the Roman soldiers, the Egyptian wedding guests, the wedding courtyard. 2D hand-drawn stickman cartoon in the exact style of the reference images: thin black outlines, large expressive heads, thin stick arms, flat warm colors, playful documentary-comedy tone, 16:9. Characters, identical in every frame: the Roman soldiers: crimson plumed helmets, steel armor, red cloaks, rectangular red shields. the guests: Egyptian wedding guests in white linen with blue-and-gold collars and gold headbands, black bob hairstyles, some in white striped headdresses. They wear only short white kilts or simple white dresses: no togas, no draped robes. Setting: sunny daytime ancient Egyptian wedding courtyard in Alexandria: flat-roofed sandstone mud-brick buildings, tall Egyptian columns with lotus-bud capitals painted in blue-and-gold bands, hieroglyph-style carvings on the walls, long tables with white cloths and clay jars, orange cloth awnings, and a tall wooden entrance gate at the back-center that opens onto the street. Egyptian architecture only: no Greek or Roman architecture, no triangular pediments, no domes, no red tile roofs, no cypress trees. Lighting: warm bright afternoon sunlight, soft shadows, rich saturated colors. ACTION TIMELINE (6 seconds): 0–2 s: three Roman soldiers in full armor step to the right in a row, stiff but strangely synchronized, capes swaying, Egyptian dancers around them smiling and clapping. 2–4 s: they step to the left in unison. 4–6 s: all three raise one arm together in perfect unison, then stare at each other, confused. Camera: locked-off and perfectly still, eye-level wide shot of the dancing Romans; the framing never changes (no tilt, pan, zoom or rising camera). Audio: voice-over narration only (a voice, never shown on screen; no narrator character appears): a British male voice, warm and dry, begins speaking within half a second and says: “Roman engineering changed the world. Roman dancing did not.” The line takes about 3.6 seconds; leave the last second free of speech so the moment can land. Music: playful comic percussion over the wedding rhythm, low under the voice. Sound effects: armor clanking out of rhythm, timed to the action. Ambience: light courtyard ambience: clinking cups, footsteps on stone, a soft breeze, no words. Final reminder: no character says any word; only the voice-over narration speaks (voice only, nobody on screen is the narrator). Natural laughs, gasps and sighs are fine. No text, captions or logos in the frame.</w:t>
+        <w:t xml:space="preserve">VOICE RULE: only the voice-over narration speaks words; it is a voice only, never a person or character on screen. No character says any word and no one on screen lip-syncs to speech; characters communicate with facial expressions and body gestures. Natural non-verbal sounds are allowed and should sound real: laughing, giggling, gasping, sighing, groaning, cheering, coughing. Attached reference images, in order: the Roman soldiers, the Egyptian wedding guests, the wedding courtyard. 2D hand-drawn Stickman animation, clean thin black outlines, large expressive heads, simple readable stickman proportions, flat warm colors, playful cinematic documentary-comedy tone, 16:9. Use the attached reference images as strict continuity anchors: preserve faces, hair, clothing, colors, proportions and accessories exactly; every character keeps a full body with a visible chest and torso exactly as in the references. Characters, identical in every frame: the Roman soldiers: crimson plumed helmets, steel armor, red cloaks, rectangular red shields. the guests: Egyptian wedding guests in white linen with blue-and-gold collars and gold headbands, black bob hairstyles, some in white striped headdresses. They wear only short white kilts or simple white dresses: no togas, no draped robes. Setting: sunny daytime ancient Egyptian wedding courtyard in Alexandria: flat-roofed sandstone mud-brick buildings, tall Egyptian columns with lotus-bud capitals painted in blue-and-gold bands, hieroglyph-style carvings on the walls, long tables with white cloths and clay jars, orange cloth awnings, and a tall wooden entrance gate at the back-center that opens onto the street. Egyptian architecture only: no Greek or Roman architecture, no triangular pediments, no domes, no red tile roofs, no cypress trees. Lighting: warm bright afternoon sunlight, soft shadows, rich saturated colors. ACTION TIMELINE (6 seconds): 0–2 s: three Roman soldiers in full armor step to the right in a row, stiff but strangely synchronized, capes swaying, Egyptian dancers around them smiling and clapping. 2–4 s: they step to the left in unison. 4–6 s: all three raise one arm together in perfect unison, then stare at each other, confused. Camera: locked-off and perfectly still, eye-level wide shot of the dancing Romans; the framing never changes (no tilt, pan, zoom or rising camera). Audio: voice-over narration only (a voice, never shown on screen; no narrator character appears): a British male voice, warm and dry, begins speaking within half a second and says: “Roman engineering changed the world. Roman dancing did not.” The line takes about 3.6 seconds; leave the last second free of speech so the moment can land. Music: playful comic percussion over the wedding rhythm, low under the voice. Sound effects: armor clanking out of rhythm, timed to the action. Ambience: light courtyard ambience: clinking cups, footsteps on stone, a soft breeze, no words. Final reminder: no character says any word; only the voice-over narration speaks (voice only, nobody on screen is the narrator). Natural laughs, gasps and sighs are fine. No text, captions or logos in the frame.</w:t>
       </w:r>
     </w:p>
     <w:p>
@@ -2514,7 +2514,7 @@
           <w:sz w:val="20"/>
           <w:szCs w:val="20"/>
         </w:rPr>
-        <w:t xml:space="preserve">VOICE RULE: only the voice-over narration speaks words; it is a voice only, never a person or character on screen. No character says any word and no one on screen lip-syncs to speech; characters communicate with facial expressions and body gestures. Natural non-verbal sounds are allowed and should sound real: laughing, giggling, gasping, sighing, groaning, cheering, coughing. Attached reference images, in order: Senbi, the groom, the Roman soldiers, the wedding courtyard. 2D hand-drawn stickman cartoon in the exact style of the reference images: thin black outlines, large expressive heads, thin stick arms, flat warm colors, playful documentary-comedy tone, 16:9. Characters, identical in every frame: Senbi the groom: young man, straight black bowl-cut hair with bangs, gold headband with a gold cobra, bare chest, blue-and-gold broad collar, gold bracers, white kilt with a blue-and-gold sash, brown sandals, thin black stick arms. the Roman soldiers: crimson plumed helmets, steel armor, red cloaks, rectangular red shields. Setting: sunny daytime ancient Egyptian wedding courtyard in Alexandria: flat-roofed sandstone mud-brick buildings, tall Egyptian columns with lotus-bud capitals painted in blue-and-gold bands, hieroglyph-style carvings on the walls, long tables with white cloths and clay jars, orange cloth awnings, and a tall wooden entrance gate at the back-center that opens onto the street. Egyptian architecture only: no Greek or Roman architecture, no triangular pediments, no domes, no red tile roofs, no cypress trees. Lighting: warm bright afternoon sunlight, soft shadows, rich saturated colors. ACTION TIMELINE (8 seconds): 0–2.5 s: Senbi dances proudly beside a Roman soldier, beaming. 2.5–5.5 s: he waves his arm wildly, gesturing for the soldier to follow. 5.5–8 s: the soldier hesitates, then copies Senbi's arm movement stiffly with a flicker of a smile. Camera: locked-off and perfectly still, eye-level medium two-shot; the framing never changes (no tilt, pan, zoom or rising camera). Audio: voice-over narration only (a voice, never shown on screen; no narrator character appears): a British male voice, warm and dry, begins speaking within half a second and says: “Senbi, ever the host, invited one to join. Of course he did.” The line takes about 4.8 seconds; leave the last second free of speech so the moment can land. Music: playful comic percussion over the wedding rhythm, low under the voice. Sound effects: laughter, hand claps, timed to the action. Ambience: light courtyard ambience: clinking cups, footsteps on stone, a soft breeze, no words. Final reminder: no character says any word; only the voice-over narration speaks (voice only, nobody on screen is the narrator). Natural laughs, gasps and sighs are fine. No text, captions or logos in the frame.</w:t>
+        <w:t xml:space="preserve">VOICE RULE: only the voice-over narration speaks words; it is a voice only, never a person or character on screen. No character says any word and no one on screen lip-syncs to speech; characters communicate with facial expressions and body gestures. Natural non-verbal sounds are allowed and should sound real: laughing, giggling, gasping, sighing, groaning, cheering, coughing. Attached reference images, in order: Senbi, the groom, the Roman soldiers, the wedding courtyard. 2D hand-drawn Stickman animation, clean thin black outlines, large expressive heads, simple readable stickman proportions, flat warm colors, playful cinematic documentary-comedy tone, 16:9. Use the attached reference images as strict continuity anchors: preserve faces, hair, clothing, colors, proportions and accessories exactly; every character keeps a full body with a visible chest and torso exactly as in the references. Characters, identical in every frame: Senbi the groom: young man with a full body and a visible chest, straight black bowl-cut hair with bangs, gold headband with a gold cobra, blue-and-gold broad collar resting on his bare chest, gold bracers on both wrists, white kilt with a blue-and-gold sash, brown sandals. the Roman soldiers: crimson plumed helmets, steel armor, red cloaks, rectangular red shields. Setting: sunny daytime ancient Egyptian wedding courtyard in Alexandria: flat-roofed sandstone mud-brick buildings, tall Egyptian columns with lotus-bud capitals painted in blue-and-gold bands, hieroglyph-style carvings on the walls, long tables with white cloths and clay jars, orange cloth awnings, and a tall wooden entrance gate at the back-center that opens onto the street. Egyptian architecture only: no Greek or Roman architecture, no triangular pediments, no domes, no red tile roofs, no cypress trees. Lighting: warm bright afternoon sunlight, soft shadows, rich saturated colors. ACTION TIMELINE (8 seconds): 0–2.5 s: Senbi dances proudly beside a Roman soldier, beaming. 2.5–5.5 s: he waves his arm wildly, gesturing for the soldier to follow. 5.5–8 s: the soldier hesitates, then copies Senbi's arm movement stiffly with a flicker of a smile. Camera: locked-off and perfectly still, eye-level medium two-shot; the framing never changes (no tilt, pan, zoom or rising camera). Audio: voice-over narration only (a voice, never shown on screen; no narrator character appears): a British male voice, warm and dry, begins speaking within half a second and says: “Senbi, ever the host, invited one to join. Of course he did.” The line takes about 4.8 seconds; leave the last second free of speech so the moment can land. Music: playful comic percussion over the wedding rhythm, low under the voice. Sound effects: laughter, hand claps, timed to the action. Ambience: light courtyard ambience: clinking cups, footsteps on stone, a soft breeze, no words. Final reminder: no character says any word; only the voice-over narration speaks (voice only, nobody on screen is the narrator). Natural laughs, gasps and sighs are fine. No text, captions or logos in the frame.</w:t>
       </w:r>
     </w:p>
     <w:p>
@@ -2587,7 +2587,7 @@
           <w:sz w:val="20"/>
           <w:szCs w:val="20"/>
         </w:rPr>
-        <w:t xml:space="preserve">VOICE RULE: only the voice-over narration speaks words; it is a voice only, never a person or character on screen. No character says any word and no one on screen lip-syncs to speech; characters communicate with facial expressions and body gestures. Natural non-verbal sounds are allowed and should sound real: laughing, giggling, gasping, sighing, groaning, cheering, coughing. Attached reference images, in order: the bride, Senbi, the groom, the Roman soldiers. 2D hand-drawn stickman cartoon in the exact style of the reference images: thin black outlines, large expressive heads, thin stick arms, flat warm colors, playful documentary-comedy tone, 16:9. Characters, identical in every frame: the bride: black bob hair with straight bangs, gold headband with a red gem, white dress, blue-and-gold collar, gold sash, gold arm cuffs, light veil. Setting: sunny daytime ancient Egyptian wedding courtyard in Alexandria: flat-roofed sandstone mud-brick buildings, tall Egyptian columns with lotus-bud capitals painted in blue-and-gold bands, hieroglyph-style carvings on the walls, long tables with white cloths and clay jars, orange cloth awnings, and a tall wooden entrance gate at the back-center that opens onto the street. Egyptian architecture only: no Greek or Roman architecture, no triangular pediments, no domes, no red tile roofs, no cypress trees. Lighting: warm bright afternoon sunlight, soft shadows, rich saturated colors. ACTION TIMELINE (8 seconds): 0–2.5 s: the bride watches, amused, with polite delight. 2.5–5.5 s: her smile freezes as she sees Senbi dancing with the Romans. 5.5–8 s: she slowly lifts a hand and covers her face, shoulders shaking. Camera: locked-off and perfectly still, eye-level medium close-up of the bride; the framing never changes (no tilt, pan, zoom or rising camera). Audio: voice-over narration only (a voice, never shown on screen; no narrator character appears): a British male voice, warm and dry, begins speaking within half a second and says: “His bride slowly covered her face. This was not in the contract.” The line takes about 4.8 seconds; leave the last second free of speech so the moment can land. Music: playful comic percussion over the wedding rhythm, low under the voice. Sound effects: gasp, muffled laugh, timed to the action. Ambience: light courtyard ambience: clinking cups, footsteps on stone, a soft breeze, no words. Final reminder: no character says any word; only the voice-over narration speaks (voice only, nobody on screen is the narrator). Natural laughs, gasps and sighs are fine. No text, captions or logos in the frame.</w:t>
+        <w:t xml:space="preserve">VOICE RULE: only the voice-over narration speaks words; it is a voice only, never a person or character on screen. No character says any word and no one on screen lip-syncs to speech; characters communicate with facial expressions and body gestures. Natural non-verbal sounds are allowed and should sound real: laughing, giggling, gasping, sighing, groaning, cheering, coughing. Attached reference images, in order: the bride, Senbi, the groom, the Roman soldiers. 2D hand-drawn Stickman animation, clean thin black outlines, large expressive heads, simple readable stickman proportions, flat warm colors, playful cinematic documentary-comedy tone, 16:9. Use the attached reference images as strict continuity anchors: preserve faces, hair, clothing, colors, proportions and accessories exactly; every character keeps a full body with a visible chest and torso exactly as in the references. Characters, identical in every frame: the bride: black bob hair with straight bangs, gold headband with a red gem, white dress, blue-and-gold collar, gold sash, gold arm cuffs, light veil. Setting: sunny daytime ancient Egyptian wedding courtyard in Alexandria: flat-roofed sandstone mud-brick buildings, tall Egyptian columns with lotus-bud capitals painted in blue-and-gold bands, hieroglyph-style carvings on the walls, long tables with white cloths and clay jars, orange cloth awnings, and a tall wooden entrance gate at the back-center that opens onto the street. Egyptian architecture only: no Greek or Roman architecture, no triangular pediments, no domes, no red tile roofs, no cypress trees. Lighting: warm bright afternoon sunlight, soft shadows, rich saturated colors. ACTION TIMELINE (8 seconds): 0–2.5 s: the bride watches, amused, with polite delight. 2.5–5.5 s: her smile freezes as she sees Senbi dancing with the Romans. 5.5–8 s: she slowly lifts a hand and covers her face, shoulders shaking. Camera: locked-off and perfectly still, eye-level medium close-up of the bride; the framing never changes (no tilt, pan, zoom or rising camera). Audio: voice-over narration only (a voice, never shown on screen; no narrator character appears): a British male voice, warm and dry, begins speaking within half a second and says: “His bride slowly covered her face. This was not in the contract.” The line takes about 4.8 seconds; leave the last second free of speech so the moment can land. Music: playful comic percussion over the wedding rhythm, low under the voice. Sound effects: gasp, muffled laugh, timed to the action. Ambience: light courtyard ambience: clinking cups, footsteps on stone, a soft breeze, no words. Final reminder: no character says any word; only the voice-over narration speaks (voice only, nobody on screen is the narrator). Natural laughs, gasps and sighs are fine. No text, captions or logos in the frame.</w:t>
       </w:r>
     </w:p>
     <w:p>
@@ -2660,7 +2660,7 @@
           <w:sz w:val="20"/>
           <w:szCs w:val="20"/>
         </w:rPr>
-        <w:t xml:space="preserve">VOICE RULE: only the voice-over narration speaks words; it is a voice only, never a person or character on screen. No character says any word and no one on screen lip-syncs to speech; characters communicate with facial expressions and body gestures. Natural non-verbal sounds are allowed and should sound real: laughing, giggling, gasping, sighing, groaning, cheering, coughing. Attached reference images, in order: the Egyptian wedding guests, the Roman soldiers, the wedding courtyard. 2D hand-drawn stickman cartoon in the exact style of the reference images: thin black outlines, large expressive heads, thin stick arms, flat warm colors, playful documentary-comedy tone, 16:9. Characters, identical in every frame: Senbi the groom: young man, straight black bowl-cut hair with bangs, gold headband with a gold cobra, bare chest, blue-and-gold broad collar, gold bracers, white kilt with a blue-and-gold sash, brown sandals, thin black stick arms. the guests: Egyptian wedding guests in white linen with blue-and-gold collars and gold headbands, black bob hairstyles, some in white striped headdresses. They wear only short white kilts or simple white dresses: no togas, no draped robes. the Roman soldiers: crimson plumed helmets, steel armor, red cloaks, rectangular red shields. Setting: sunny daytime ancient Egyptian wedding courtyard in Alexandria: flat-roofed sandstone mud-brick buildings, tall Egyptian columns with lotus-bud capitals painted in blue-and-gold bands, hieroglyph-style carvings on the walls, long tables with white cloths and clay jars, orange cloth awnings, and a tall wooden entrance gate at the back-center that opens onto the street. Egyptian architecture only: no Greek or Roman architecture, no triangular pediments, no domes, no red tile roofs, no cypress trees. Lighting: warm bright afternoon sunlight, soft shadows, rich saturated colors. ACTION TIMELINE (8 seconds): 0–2 s: the dance is in full swing. 2–3 s: a sharp military horn blasts. 3–8 s: everyone freezes mid-step, Egyptians and Romans together, in a comic tableau: a soldier on one leg, a guest mid-spin, Senbi with arms raised, eyes darting toward the gate; hold completely still. Camera: locked-off and perfectly still, eye-level wide shot; the framing never changes (no tilt, pan, zoom or rising camera). Audio: voice-over narration only (a voice, never shown on screen; no narrator character appears): a British male voice, warm and dry, begins speaking within half a second and says: “Then a horn cut through the music, and everyone froze mid-step.” The line takes about 4.4 seconds; leave the last second free of speech so the moment can land. Music: music nearly silent. Sound effects: sharp military horn, then silence, timed to the action. Ambience: light courtyard ambience: clinking cups, footsteps on stone, a soft breeze, no words. Final reminder: no character says any word; only the voice-over narration speaks (voice only, nobody on screen is the narrator). Natural laughs, gasps and sighs are fine. No text, captions or logos in the frame.</w:t>
+        <w:t xml:space="preserve">VOICE RULE: only the voice-over narration speaks words; it is a voice only, never a person or character on screen. No character says any word and no one on screen lip-syncs to speech; characters communicate with facial expressions and body gestures. Natural non-verbal sounds are allowed and should sound real: laughing, giggling, gasping, sighing, groaning, cheering, coughing. Attached reference images, in order: the Egyptian wedding guests, the Roman soldiers, the wedding courtyard. 2D hand-drawn Stickman animation, clean thin black outlines, large expressive heads, simple readable stickman proportions, flat warm colors, playful cinematic documentary-comedy tone, 16:9. Use the attached reference images as strict continuity anchors: preserve faces, hair, clothing, colors, proportions and accessories exactly; every character keeps a full body with a visible chest and torso exactly as in the references. Characters, identical in every frame: Senbi the groom: young man with a full body and a visible chest, straight black bowl-cut hair with bangs, gold headband with a gold cobra, blue-and-gold broad collar resting on his bare chest, gold bracers on both wrists, white kilt with a blue-and-gold sash, brown sandals. the guests: Egyptian wedding guests in white linen with blue-and-gold collars and gold headbands, black bob hairstyles, some in white striped headdresses. They wear only short white kilts or simple white dresses: no togas, no draped robes. the Roman soldiers: crimson plumed helmets, steel armor, red cloaks, rectangular red shields. Setting: sunny daytime ancient Egyptian wedding courtyard in Alexandria: flat-roofed sandstone mud-brick buildings, tall Egyptian columns with lotus-bud capitals painted in blue-and-gold bands, hieroglyph-style carvings on the walls, long tables with white cloths and clay jars, orange cloth awnings, and a tall wooden entrance gate at the back-center that opens onto the street. Egyptian architecture only: no Greek or Roman architecture, no triangular pediments, no domes, no red tile roofs, no cypress trees. Lighting: warm bright afternoon sunlight, soft shadows, rich saturated colors. ACTION TIMELINE (8 seconds): 0–2 s: the dance is in full swing. 2–3 s: a sharp military horn blasts. 3–8 s: everyone freezes mid-step, Egyptians and Romans together, in a comic tableau: a soldier on one leg, a guest mid-spin, Senbi with arms raised, eyes darting toward the gate; hold completely still. Camera: locked-off and perfectly still, eye-level wide shot; the framing never changes (no tilt, pan, zoom or rising camera). Audio: voice-over narration only (a voice, never shown on screen; no narrator character appears): a British male voice, warm and dry, begins speaking within half a second and says: “Then a horn cut through the music, and everyone froze mid-step.” The line takes about 4.4 seconds; leave the last second free of speech so the moment can land. Music: music nearly silent. Sound effects: sharp military horn, then silence, timed to the action. Ambience: light courtyard ambience: clinking cups, footsteps on stone, a soft breeze, no words. Final reminder: no character says any word; only the voice-over narration speaks (voice only, nobody on screen is the narrator). Natural laughs, gasps and sighs are fine. No text, captions or logos in the frame.</w:t>
       </w:r>
     </w:p>
     <w:p>
@@ -2733,7 +2733,7 @@
           <w:sz w:val="20"/>
           <w:szCs w:val="20"/>
         </w:rPr>
-        <w:t xml:space="preserve">VOICE RULE: only the voice-over narration speaks words; it is a voice only, never a person or character on screen. No character says any word and no one on screen lip-syncs to speech; characters communicate with facial expressions and body gestures. Natural non-verbal sounds are allowed and should sound real: laughing, giggling, gasping, sighing, groaning, cheering, coughing. Attached reference images, in order: the Roman commander, the Roman soldiers, the wedding courtyard. 2D hand-drawn stickman cartoon in the exact style of the reference images: thin black outlines, large expressive heads, thin stick arms, flat warm colors, playful documentary-comedy tone, 16:9. Characters, identical in every frame: the Roman commander: dark curly gray-streaked hair, gold laurel wreath, bronze-and-gold armor, red cloak. the Roman soldiers: crimson plumed helmets, steel armor, red cloaks, rectangular red shields. Setting: sunny daytime ancient Egyptian wedding courtyard in Alexandria: flat-roofed sandstone mud-brick buildings, tall Egyptian columns with lotus-bud capitals painted in blue-and-gold bands, hieroglyph-style carvings on the walls, long tables with white cloths and clay jars, orange cloth awnings, and a tall wooden entrance gate at the back-center that opens onto the street. Egyptian architecture only: no Greek or Roman architecture, no triangular pediments, no domes, no red tile roofs, no cypress trees. Lighting: warm bright afternoon sunlight, soft shadows, rich saturated colors. ACTION TIMELINE (8 seconds): 0–2 s: the tall wooden gate swings fully open. 2–5 s: the Roman commander walks calmly through, scroll in hand, red cloak swaying, while the dancing soldiers step aside. 5–8 s: he stops in the center and the courtyard falls silent, everyone looking at him. Camera: locked-off and perfectly still, fixed, slightly low angle that never tilts, on the commander walking in; the framing never changes (no tilt, pan, zoom or rising camera). Audio: voice-over narration only (a voice, never shown on screen; no narrator character appears): a British male voice, warm and dry, begins speaking within half a second and says: “And in walked the commander. The only adult in the building.” The line takes about 4.4 seconds; leave the last second free of speech so the moment can land. Music: low sustained tension with distant marching drums, almost silent. Sound effects: slow footsteps, cloak rustle, timed to the action. Ambience: light courtyard ambience: clinking cups, footsteps on stone, a soft breeze, no words. Final reminder: no character says any word; only the voice-over narration speaks (voice only, nobody on screen is the narrator). Natural laughs, gasps and sighs are fine. No text, captions or logos in the frame.</w:t>
+        <w:t xml:space="preserve">VOICE RULE: only the voice-over narration speaks words; it is a voice only, never a person or character on screen. No character says any word and no one on screen lip-syncs to speech; characters communicate with facial expressions and body gestures. Natural non-verbal sounds are allowed and should sound real: laughing, giggling, gasping, sighing, groaning, cheering, coughing. Attached reference images, in order: the Roman commander, the Roman soldiers, the wedding courtyard. 2D hand-drawn Stickman animation, clean thin black outlines, large expressive heads, simple readable stickman proportions, flat warm colors, playful cinematic documentary-comedy tone, 16:9. Use the attached reference images as strict continuity anchors: preserve faces, hair, clothing, colors, proportions and accessories exactly; every character keeps a full body with a visible chest and torso exactly as in the references. Characters, identical in every frame: the Roman commander: dark curly gray-streaked hair, gold laurel wreath, bronze-and-gold armor, red cloak. the Roman soldiers: crimson plumed helmets, steel armor, red cloaks, rectangular red shields. Setting: sunny daytime ancient Egyptian wedding courtyard in Alexandria: flat-roofed sandstone mud-brick buildings, tall Egyptian columns with lotus-bud capitals painted in blue-and-gold bands, hieroglyph-style carvings on the walls, long tables with white cloths and clay jars, orange cloth awnings, and a tall wooden entrance gate at the back-center that opens onto the street. Egyptian architecture only: no Greek or Roman architecture, no triangular pediments, no domes, no red tile roofs, no cypress trees. Lighting: warm bright afternoon sunlight, soft shadows, rich saturated colors. ACTION TIMELINE (8 seconds): 0–2 s: the tall wooden gate swings fully open. 2–5 s: the Roman commander walks calmly through, scroll in hand, red cloak swaying, while the dancing soldiers step aside. 5–8 s: he stops in the center and the courtyard falls silent, everyone looking at him. Camera: locked-off and perfectly still, fixed, slightly low angle that never tilts, on the commander walking in; the framing never changes (no tilt, pan, zoom or rising camera). Audio: voice-over narration only (a voice, never shown on screen; no narrator character appears): a British male voice, warm and dry, begins speaking within half a second and says: “And in walked the commander. The only adult in the building.” The line takes about 4.4 seconds; leave the last second free of speech so the moment can land. Music: low sustained tension with distant marching drums, almost silent. Sound effects: slow footsteps, cloak rustle, timed to the action. Ambience: light courtyard ambience: clinking cups, footsteps on stone, a soft breeze, no words. Final reminder: no character says any word; only the voice-over narration speaks (voice only, nobody on screen is the narrator). Natural laughs, gasps and sighs are fine. No text, captions or logos in the frame.</w:t>
       </w:r>
     </w:p>
     <w:p>
@@ -2806,7 +2806,7 @@
           <w:sz w:val="20"/>
           <w:szCs w:val="20"/>
         </w:rPr>
-        <w:t xml:space="preserve">VOICE RULE: only the voice-over narration speaks words; it is a voice only, never a person or character on screen. No character says any word and no one on screen lip-syncs to speech; characters communicate with facial expressions and body gestures. Natural non-verbal sounds are allowed and should sound real: laughing, giggling, gasping, sighing, groaning, cheering, coughing. Attached reference images, in order: the Roman commander, the black cat. 2D hand-drawn stickman cartoon in the exact style of the reference images: thin black outlines, large expressive heads, thin stick arms, flat warm colors, playful documentary-comedy tone, 16:9. Characters, identical in every frame: the Roman commander: dark curly gray-streaked hair, gold laurel wreath, bronze-and-gold armor, red cloak. the cat: black with a small gold collar. Setting: sunny daytime ancient Egyptian wedding courtyard in Alexandria: flat-roofed sandstone mud-brick buildings, tall Egyptian columns with lotus-bud capitals painted in blue-and-gold bands, hieroglyph-style carvings on the walls, long tables with white cloths and clay jars, orange cloth awnings, and a tall wooden entrance gate at the back-center that opens onto the street. Egyptian architecture only: no Greek or Roman architecture, no triangular pediments, no domes, no red tile roofs, no cypress trees. Lighting: warm bright afternoon sunlight, soft shadows, rich saturated colors. ACTION TIMELINE (8 seconds): 0–2.5 s: the commander in the foreground; his eyes land on the black cat on the table behind him. 2.5–5.5 s: the cat stares straight back, unblinking. 5.5–8 s: a muscle in the commander's jaw twitches and he looks away first. Camera: locked-off and perfectly still, eye-level medium two-shot: the commander in the foreground, the cat on the table behind him; no cutting; the framing never changes (no tilt, pan, zoom or rising camera). Audio: voice-over narration only (a voice, never shown on screen; no narrator character appears): a British male voice, warm and dry, begins speaking within half a second and says: “The cat looked back. The cat was not impressed by the Roman Empire.” The line takes about 5.2 seconds; leave the last second free of speech so the moment can land. Music: music nearly silent. Sound effects: cat meow, tiny sting, timed to the action. Ambience: light courtyard ambience: clinking cups, footsteps on stone, a soft breeze, no words. Final reminder: no character says any word; only the voice-over narration speaks (voice only, nobody on screen is the narrator). Natural laughs, gasps and sighs are fine. No text, captions or logos in the frame.</w:t>
+        <w:t xml:space="preserve">VOICE RULE: only the voice-over narration speaks words; it is a voice only, never a person or character on screen. No character says any word and no one on screen lip-syncs to speech; characters communicate with facial expressions and body gestures. Natural non-verbal sounds are allowed and should sound real: laughing, giggling, gasping, sighing, groaning, cheering, coughing. Attached reference images, in order: the Roman commander, the black cat. 2D hand-drawn Stickman animation, clean thin black outlines, large expressive heads, simple readable stickman proportions, flat warm colors, playful cinematic documentary-comedy tone, 16:9. Use the attached reference images as strict continuity anchors: preserve faces, hair, clothing, colors, proportions and accessories exactly; every character keeps a full body with a visible chest and torso exactly as in the references. Characters, identical in every frame: the Roman commander: dark curly gray-streaked hair, gold laurel wreath, bronze-and-gold armor, red cloak. the cat: black with a small gold collar. Setting: sunny daytime ancient Egyptian wedding courtyard in Alexandria: flat-roofed sandstone mud-brick buildings, tall Egyptian columns with lotus-bud capitals painted in blue-and-gold bands, hieroglyph-style carvings on the walls, long tables with white cloths and clay jars, orange cloth awnings, and a tall wooden entrance gate at the back-center that opens onto the street. Egyptian architecture only: no Greek or Roman architecture, no triangular pediments, no domes, no red tile roofs, no cypress trees. Lighting: warm bright afternoon sunlight, soft shadows, rich saturated colors. ACTION TIMELINE (8 seconds): 0–2.5 s: the commander in the foreground; his eyes land on the black cat on the table behind him. 2.5–5.5 s: the cat stares straight back, unblinking. 5.5–8 s: a muscle in the commander's jaw twitches and he looks away first. Camera: locked-off and perfectly still, eye-level medium two-shot: the commander in the foreground, the cat on the table behind him; no cutting; the framing never changes (no tilt, pan, zoom or rising camera). Audio: voice-over narration only (a voice, never shown on screen; no narrator character appears): a British male voice, warm and dry, begins speaking within half a second and says: “The cat looked back. The cat was not impressed by the Roman Empire.” The line takes about 5.2 seconds; leave the last second free of speech so the moment can land. Music: music nearly silent. Sound effects: cat meow, tiny sting, timed to the action. Ambience: light courtyard ambience: clinking cups, footsteps on stone, a soft breeze, no words. Final reminder: no character says any word; only the voice-over narration speaks (voice only, nobody on screen is the narrator). Natural laughs, gasps and sighs are fine. No text, captions or logos in the frame.</w:t>
       </w:r>
     </w:p>
     <w:p>
@@ -2879,7 +2879,7 @@
           <w:sz w:val="20"/>
           <w:szCs w:val="20"/>
         </w:rPr>
-        <w:t xml:space="preserve">VOICE RULE: only the voice-over narration speaks words; it is a voice only, never a person or character on screen. No character says any word and no one on screen lip-syncs to speech; characters communicate with facial expressions and body gestures. Natural non-verbal sounds are allowed and should sound real: laughing, giggling, gasping, sighing, groaning, cheering, coughing. Attached reference images, in order: the Roman commander, the Egyptian wedding guests, Senbi, the groom. 2D hand-drawn stickman cartoon in the exact style of the reference images: thin black outlines, large expressive heads, thin stick arms, flat warm colors, playful documentary-comedy tone, 16:9. Characters, identical in every frame: the Roman commander: dark curly gray-streaked hair, gold laurel wreath, bronze-and-gold armor, red cloak. the guests: Egyptian wedding guests in white linen with blue-and-gold collars and gold headbands, black bob hairstyles, some in white striped headdresses. They wear only short white kilts or simple white dresses: no togas, no draped robes. the Roman soldiers: crimson plumed helmets, steel armor, red cloaks, rectangular red shields. Setting: sunny daytime ancient Egyptian wedding courtyard in Alexandria: flat-roofed sandstone mud-brick buildings, tall Egyptian columns with lotus-bud capitals painted in blue-and-gold bands, hieroglyph-style carvings on the walls, long tables with white cloths and clay jars, orange cloth awnings, and a tall wooden entrance gate at the back-center that opens onto the street. Egyptian architecture only: no Greek or Roman architecture, no triangular pediments, no domes, no red tile roofs, no cypress trees. Lighting: warm bright afternoon sunlight, soft shadows, rich saturated colors. ACTION TIMELINE (8 seconds): 0–2.5 s: the commander at the center lifts the scroll with both hands, Egyptians on his left and Romans on his right standing silent and still. 2.5–5.5 s: he unrolls it slowly, papyrus falling to his waist, only abstract marks on it. 5.5–8 s: he lifts his chin as if about to read; everyone is silent. Camera: locked-off and perfectly still, symmetrical eye-level medium-wide shot; the framing never changes (no tilt, pan, zoom or rising camera). Audio: voice-over narration only (a voice, never shown on screen; no narrator character appears): a British male voice, warm and dry, begins speaking within half a second and says: “He unrolled the scroll. Message received: Egypt has new management.” The line takes about 4.0 seconds; leave the last second free of speech so the moment can land. Music: low sustained tension with distant marching drums, almost silent. Sound effects: scroll unrolling, one dramatic drum hit, timed to the action. Ambience: light courtyard ambience: clinking cups, footsteps on stone, a soft breeze, no words. Final reminder: no character says any word; only the voice-over narration speaks (voice only, nobody on screen is the narrator). Natural laughs, gasps and sighs are fine. No text, captions or logos in the frame.</w:t>
+        <w:t xml:space="preserve">VOICE RULE: only the voice-over narration speaks words; it is a voice only, never a person or character on screen. No character says any word and no one on screen lip-syncs to speech; characters communicate with facial expressions and body gestures. Natural non-verbal sounds are allowed and should sound real: laughing, giggling, gasping, sighing, groaning, cheering, coughing. Attached reference images, in order: the Roman commander, the Egyptian wedding guests, Senbi, the groom. 2D hand-drawn Stickman animation, clean thin black outlines, large expressive heads, simple readable stickman proportions, flat warm colors, playful cinematic documentary-comedy tone, 16:9. Use the attached reference images as strict continuity anchors: preserve faces, hair, clothing, colors, proportions and accessories exactly; every character keeps a full body with a visible chest and torso exactly as in the references. Characters, identical in every frame: the Roman commander: dark curly gray-streaked hair, gold laurel wreath, bronze-and-gold armor, red cloak. the guests: Egyptian wedding guests in white linen with blue-and-gold collars and gold headbands, black bob hairstyles, some in white striped headdresses. They wear only short white kilts or simple white dresses: no togas, no draped robes. the Roman soldiers: crimson plumed helmets, steel armor, red cloaks, rectangular red shields. Setting: sunny daytime ancient Egyptian wedding courtyard in Alexandria: flat-roofed sandstone mud-brick buildings, tall Egyptian columns with lotus-bud capitals painted in blue-and-gold bands, hieroglyph-style carvings on the walls, long tables with white cloths and clay jars, orange cloth awnings, and a tall wooden entrance gate at the back-center that opens onto the street. Egyptian architecture only: no Greek or Roman architecture, no triangular pediments, no domes, no red tile roofs, no cypress trees. Lighting: warm bright afternoon sunlight, soft shadows, rich saturated colors. ACTION TIMELINE (8 seconds): 0–2.5 s: the commander at the center lifts the scroll with both hands, Egyptians on his left and Romans on his right standing silent and still. 2.5–5.5 s: he unrolls it slowly, papyrus falling to his waist, only abstract marks on it. 5.5–8 s: he lifts his chin as if about to read; everyone is silent. Camera: locked-off and perfectly still, symmetrical eye-level medium-wide shot; the framing never changes (no tilt, pan, zoom or rising camera). Audio: voice-over narration only (a voice, never shown on screen; no narrator character appears): a British male voice, warm and dry, begins speaking within half a second and says: “He unrolled the scroll. Message received: Egypt has new management.” The line takes about 4.0 seconds; leave the last second free of speech so the moment can land. Music: low sustained tension with distant marching drums, almost silent. Sound effects: scroll unrolling, one dramatic drum hit, timed to the action. Ambience: light courtyard ambience: clinking cups, footsteps on stone, a soft breeze, no words. Final reminder: no character says any word; only the voice-over narration speaks (voice only, nobody on screen is the narrator). Natural laughs, gasps and sighs are fine. No text, captions or logos in the frame.</w:t>
       </w:r>
     </w:p>
     <w:p>
@@ -2952,7 +2952,7 @@
           <w:sz w:val="20"/>
           <w:szCs w:val="20"/>
         </w:rPr>
-        <w:t xml:space="preserve">VOICE RULE: only the voice-over narration speaks words; it is a voice only, never a person or character on screen. No character says any word and no one on screen lip-syncs to speech; characters communicate with facial expressions and body gestures. Natural non-verbal sounds are allowed and should sound real: laughing, giggling, gasping, sighing, groaning, cheering, coughing. Attached reference images, in order: Senbi, the groom, the bride, the Egyptian wedding guests. 2D hand-drawn stickman cartoon in the exact style of the reference images: thin black outlines, large expressive heads, thin stick arms, flat warm colors, playful documentary-comedy tone, 16:9. Characters, identical in every frame: Senbi the groom: young man, straight black bowl-cut hair with bangs, gold headband with a gold cobra, bare chest, blue-and-gold broad collar, gold bracers, white kilt with a blue-and-gold sash, brown sandals, thin black stick arms. the bride: black bob hair with straight bangs, gold headband with a red gem, white dress, blue-and-gold collar, gold sash, gold arm cuffs, light veil. Setting: sunny daytime ancient Egyptian wedding courtyard in Alexandria: flat-roofed sandstone mud-brick buildings, tall Egyptian columns with lotus-bud capitals painted in blue-and-gold bands, hieroglyph-style carvings on the walls, long tables with white cloths and clay jars, orange cloth awnings, and a tall wooden entrance gate at the back-center that opens onto the street. Egyptian architecture only: no Greek or Roman architecture, no triangular pediments, no domes, no red tile roofs, no cypress trees. Lighting: warm bright afternoon sunlight, soft shadows, rich saturated colors. ACTION TIMELINE (8 seconds): 0–2.5 s: Senbi and the bride look forward, shocked. 2.5–5.5 s: Senbi slowly turns his head toward the bride. 5.5–8 s: the bride turns to him, they exchange a wide-eyed look and Senbi forces a smile. Camera: locked-off and perfectly still, eye-level medium two-shot of Senbi and the bride; the framing never changes (no tilt, pan, zoom or rising camera). Audio: voice-over narration only (a voice, never shown on screen; no narrator character appears): a British male voice, warm and dry, begins speaking within half a second and says: “Senbi looked at his bride. Same question, silently: is the wedding still on?” The line takes about 5.2 seconds; leave the last second free of speech so the moment can land. Music: low sustained tension with distant marching drums, almost silent. Sound effects: nervous breath, single drum, timed to the action. Ambience: light courtyard ambience: clinking cups, footsteps on stone, a soft breeze, no words. Final reminder: no character says any word; only the voice-over narration speaks (voice only, nobody on screen is the narrator). Natural laughs, gasps and sighs are fine. No text, captions or logos in the frame.</w:t>
+        <w:t xml:space="preserve">VOICE RULE: only the voice-over narration speaks words; it is a voice only, never a person or character on screen. No character says any word and no one on screen lip-syncs to speech; characters communicate with facial expressions and body gestures. Natural non-verbal sounds are allowed and should sound real: laughing, giggling, gasping, sighing, groaning, cheering, coughing. Attached reference images, in order: Senbi, the groom, the bride, the Egyptian wedding guests. 2D hand-drawn Stickman animation, clean thin black outlines, large expressive heads, simple readable stickman proportions, flat warm colors, playful cinematic documentary-comedy tone, 16:9. Use the attached reference images as strict continuity anchors: preserve faces, hair, clothing, colors, proportions and accessories exactly; every character keeps a full body with a visible chest and torso exactly as in the references. Characters, identical in every frame: Senbi the groom: young man with a full body and a visible chest, straight black bowl-cut hair with bangs, gold headband with a gold cobra, blue-and-gold broad collar resting on his bare chest, gold bracers on both wrists, white kilt with a blue-and-gold sash, brown sandals. the bride: black bob hair with straight bangs, gold headband with a red gem, white dress, blue-and-gold collar, gold sash, gold arm cuffs, light veil. Setting: sunny daytime ancient Egyptian wedding courtyard in Alexandria: flat-roofed sandstone mud-brick buildings, tall Egyptian columns with lotus-bud capitals painted in blue-and-gold bands, hieroglyph-style carvings on the walls, long tables with white cloths and clay jars, orange cloth awnings, and a tall wooden entrance gate at the back-center that opens onto the street. Egyptian architecture only: no Greek or Roman architecture, no triangular pediments, no domes, no red tile roofs, no cypress trees. Lighting: warm bright afternoon sunlight, soft shadows, rich saturated colors. ACTION TIMELINE (8 seconds): 0–2.5 s: Senbi and the bride look forward, shocked. 2.5–5.5 s: Senbi slowly turns his head toward the bride. 5.5–8 s: the bride turns to him, they exchange a wide-eyed look and Senbi forces a smile. Camera: locked-off and perfectly still, eye-level medium two-shot of Senbi and the bride; the framing never changes (no tilt, pan, zoom or rising camera). Audio: voice-over narration only (a voice, never shown on screen; no narrator character appears): a British male voice, warm and dry, begins speaking within half a second and says: “Senbi looked at his bride. Same question, silently: is the wedding still on?” The line takes about 5.2 seconds; leave the last second free of speech so the moment can land. Music: low sustained tension with distant marching drums, almost silent. Sound effects: nervous breath, single drum, timed to the action. Ambience: light courtyard ambience: clinking cups, footsteps on stone, a soft breeze, no words. Final reminder: no character says any word; only the voice-over narration speaks (voice only, nobody on screen is the narrator). Natural laughs, gasps and sighs are fine. No text, captions or logos in the frame.</w:t>
       </w:r>
     </w:p>
     <w:p>
@@ -3025,7 +3025,7 @@
           <w:sz w:val="20"/>
           <w:szCs w:val="20"/>
         </w:rPr>
-        <w:t xml:space="preserve">VOICE RULE: only the voice-over narration speaks words; it is a voice only, never a person or character on screen. No character says any word and no one on screen lip-syncs to speech; characters communicate with facial expressions and body gestures. Natural non-verbal sounds are allowed and should sound real: laughing, giggling, gasping, sighing, groaning, cheering, coughing. Attached reference images, in order: the Alexandria harbor, the Roman soldiers. 2D hand-drawn stickman cartoon in the exact style of the reference images: thin black outlines, large expressive heads, thin stick arms, flat warm colors, playful documentary-comedy tone, 16:9. Characters, identical in every frame: the Roman soldiers: crimson plumed helmets, steel armor, red cloaks, rectangular red shields. Setting: sunlit street of ancient Alexandria outside the wedding house, sandstone walls, palms, market stalls with red and blue awnings. Flat-roofed Egyptian sandstone buildings; no Greek or Roman architecture, no domes. Lighting: warm bright sunlight, soft shadows. ACTION TIMELINE (8 seconds): 0–2.5 s: a few Roman soldiers pass through the street. 2.5–5.5 s: ordinary Egyptians carry baskets, bargain and haul jars as usual. 5.5–8 s: a boy runs across the frame; life goes on. Camera: locked-off and perfectly still, eye-level wide observational shot of Alexandria; the framing never changes (no tilt, pan, zoom or rising camera). Audio: voice-over narration only (a voice, never shown on screen; no narrator character appears): a British male voice, warm and dry, begins speaking within half a second and says: “To be clear: Senbi and his wedding are fiction. The cat, sadly, too.” The line takes about 5.2 seconds; leave the last second free of speech so the moment can land. Music: music nearly silent. Sound effects: calm city ambience, timed to the action. Ambience: sunlit street ambience: wind and distant clatter, no words. Final reminder: no character says any word; only the voice-over narration speaks (voice only, nobody on screen is the narrator). Natural laughs, gasps and sighs are fine. No text, captions or logos in the frame.</w:t>
+        <w:t xml:space="preserve">VOICE RULE: only the voice-over narration speaks words; it is a voice only, never a person or character on screen. No character says any word and no one on screen lip-syncs to speech; characters communicate with facial expressions and body gestures. Natural non-verbal sounds are allowed and should sound real: laughing, giggling, gasping, sighing, groaning, cheering, coughing. Attached reference images, in order: the Alexandria harbor, the Roman soldiers. 2D hand-drawn Stickman animation, clean thin black outlines, large expressive heads, simple readable stickman proportions, flat warm colors, playful cinematic documentary-comedy tone, 16:9. Use the attached reference images as strict continuity anchors: preserve faces, hair, clothing, colors, proportions and accessories exactly; every character keeps a full body with a visible chest and torso exactly as in the references. Characters, identical in every frame: the Roman soldiers: crimson plumed helmets, steel armor, red cloaks, rectangular red shields. Setting: sunlit street of ancient Alexandria outside the wedding house, sandstone walls, palms, market stalls with red and blue awnings. Flat-roofed Egyptian sandstone buildings; no Greek or Roman architecture, no domes. Lighting: warm bright sunlight, soft shadows. ACTION TIMELINE (8 seconds): 0–2.5 s: a few Roman soldiers pass through the street. 2.5–5.5 s: ordinary Egyptians carry baskets, bargain and haul jars as usual. 5.5–8 s: a boy runs across the frame; life goes on. Camera: locked-off and perfectly still, eye-level wide observational shot of Alexandria; the framing never changes (no tilt, pan, zoom or rising camera). Audio: voice-over narration only (a voice, never shown on screen; no narrator character appears): a British male voice, warm and dry, begins speaking within half a second and says: “To be clear: Senbi and his wedding are fiction. The cat, sadly, too.” The line takes about 5.2 seconds; leave the last second free of speech so the moment can land. Music: music nearly silent. Sound effects: calm city ambience, timed to the action. Ambience: sunlit street ambience: wind and distant clatter, no words. Final reminder: no character says any word; only the voice-over narration speaks (voice only, nobody on screen is the narrator). Natural laughs, gasps and sighs are fine. No text, captions or logos in the frame.</w:t>
       </w:r>
     </w:p>
     <w:p>
@@ -3115,7 +3115,7 @@
           <w:sz w:val="20"/>
           <w:szCs w:val="20"/>
         </w:rPr>
-        <w:t xml:space="preserve">VOICE RULE: only the voice-over narration speaks words; it is a voice only, never a person or character on screen. No character says any word and no one on screen lip-syncs to speech; characters communicate with facial expressions and body gestures. Natural non-verbal sounds are allowed and should sound real: laughing, giggling, gasping, sighing, groaning, cheering, coughing. Attached reference images, in order: the Alexandria harbor, the Roman soldiers. 2D hand-drawn stickman cartoon in the exact style of the reference images: thin black outlines, large expressive heads, thin stick arms, flat warm colors, playful documentary-comedy tone, 16:9. Setting: ancient Alexandria harbor. Lighting: bright clear daylight, sparkling water. ACTION TIMELINE (8 seconds): 0–2.5 s: Roman ships enter the harbor, sails filling with wind. 2.5–5.5 s: soldiers stand on the quay while civilians watch. 5.5–8 s: the lighthouse in the background, a flag fluttering slowly; the wedding is not shown. Camera: wide shot of the Alexandria harbor and city, horizon level; fixed except for an almost imperceptible 5% slow push-in, no tilt or pan. Audio: voice-over narration only (a voice, never shown on screen; no narrator character appears): a British male voice, warm and dry, begins speaking within half a second and says: “The setting is real: in 30 BC, Octavian took Alexandria. Egypt became Roman.” The line takes about 5.2 seconds; leave the last second free of speech so the moment can land. Music: music nearly silent. Sound effects: calm city ambience, timed to the action. Ambience: gulls, lapping water and creaking ropes, no words. Final reminder: no character says any word; only the voice-over narration speaks (voice only, nobody on screen is the narrator). Natural laughs, gasps and sighs are fine. No text, captions or logos in the frame.</w:t>
+        <w:t xml:space="preserve">VOICE RULE: only the voice-over narration speaks words; it is a voice only, never a person or character on screen. No character says any word and no one on screen lip-syncs to speech; characters communicate with facial expressions and body gestures. Natural non-verbal sounds are allowed and should sound real: laughing, giggling, gasping, sighing, groaning, cheering, coughing. Attached reference images, in order: the Alexandria harbor, the Roman soldiers. 2D hand-drawn Stickman animation, clean thin black outlines, large expressive heads, simple readable stickman proportions, flat warm colors, playful cinematic documentary-comedy tone, 16:9. Use the attached reference images as strict continuity anchors: preserve faces, hair, clothing, colors, proportions and accessories exactly; every character keeps a full body with a visible chest and torso exactly as in the references. Setting: ancient Alexandria harbor. Lighting: bright clear daylight, sparkling water. ACTION TIMELINE (8 seconds): 0–2.5 s: Roman ships enter the harbor, sails filling with wind. 2.5–5.5 s: soldiers stand on the quay while civilians watch. 5.5–8 s: the lighthouse in the background, a flag fluttering slowly; the wedding is not shown. Camera: wide shot of the Alexandria harbor and city, horizon level; fixed except for an almost imperceptible 5% slow push-in, no tilt or pan. Audio: voice-over narration only (a voice, never shown on screen; no narrator character appears): a British male voice, warm and dry, begins speaking within half a second and says: “The setting is real: in 30 BC, Octavian took Alexandria. Egypt became Roman.” The line takes about 5.2 seconds; leave the last second free of speech so the moment can land. Music: music nearly silent. Sound effects: calm city ambience, timed to the action. Ambience: gulls, lapping water and creaking ropes, no words. Final reminder: no character says any word; only the voice-over narration speaks (voice only, nobody on screen is the narrator). Natural laughs, gasps and sighs are fine. No text, captions or logos in the frame.</w:t>
       </w:r>
     </w:p>
     <w:p>
@@ -3188,7 +3188,7 @@
           <w:sz w:val="20"/>
           <w:szCs w:val="20"/>
         </w:rPr>
-        <w:t xml:space="preserve">VOICE RULE: only the voice-over narration speaks words; it is a voice only, never a person or character on screen. No character says any word and no one on screen lip-syncs to speech; characters communicate with facial expressions and body gestures. Natural non-verbal sounds are allowed and should sound real: laughing, giggling, gasping, sighing, groaning, cheering, coughing. Attached reference images, in order: Senbi, the groom, the bride's relatives. 2D hand-drawn stickman cartoon in the exact style of the reference images: thin black outlines, large expressive heads, thin stick arms, flat warm colors, playful documentary-comedy tone, 16:9. Characters, identical in every frame: Senbi the groom: young man, straight black bowl-cut hair with bangs, gold headband with a gold cobra, bare chest, blue-and-gold broad collar, gold bracers, white kilt with a blue-and-gold sash, brown sandals, thin black stick arms. Setting: sunny daytime ancient Egyptian wedding courtyard in Alexandria: flat-roofed sandstone mud-brick buildings, tall Egyptian columns with lotus-bud capitals painted in blue-and-gold bands, hieroglyph-style carvings on the walls, long tables with white cloths and clay jars, orange cloth awnings, and a tall wooden entrance gate at the back-center that opens onto the street. Egyptian architecture only: no Greek or Roman architecture, no triangular pediments, no domes, no red tile roofs, no cypress trees. Lighting: warm bright afternoon sunlight, soft shadows, rich saturated colors. ACTION TIMELINE (6 seconds): 0–2 s: Senbi looks down at the wooden headrest in his hands, turning it over. 2–4 s: he slowly lifts his gaze toward the Roman commander off-screen to the right. 4–6 s: a tired deadpan stare, a long slow blink, his shoulders drop. Camera: locked-off and perfectly still, eye-level medium close-up with the headrest in Senbi's hands and his face both in frame; the framing never changes (no tilt, pan, zoom or rising camera). Audio: voice-over narration only (a voice, never shown on screen; no narrator character appears): a British male voice, warm and dry, begins speaking within half a second and says: “Headrest, then commander. Neither came with a return policy.” The line takes about 3.6 seconds; leave the last second free of speech so the moment can land. Music: playful comic percussion over the wedding rhythm, low under the voice. Sound effects: wood knock, comic sting, timed to the action. Ambience: light courtyard ambience: clinking cups, footsteps on stone, a soft breeze, no words. Final reminder: no character says any word; only the voice-over narration speaks (voice only, nobody on screen is the narrator). Natural laughs, gasps and sighs are fine. No text, captions or logos in the frame.</w:t>
+        <w:t xml:space="preserve">VOICE RULE: only the voice-over narration speaks words; it is a voice only, never a person or character on screen. No character says any word and no one on screen lip-syncs to speech; characters communicate with facial expressions and body gestures. Natural non-verbal sounds are allowed and should sound real: laughing, giggling, gasping, sighing, groaning, cheering, coughing. Attached reference images, in order: Senbi, the groom, the bride's relatives. 2D hand-drawn Stickman animation, clean thin black outlines, large expressive heads, simple readable stickman proportions, flat warm colors, playful cinematic documentary-comedy tone, 16:9. Use the attached reference images as strict continuity anchors: preserve faces, hair, clothing, colors, proportions and accessories exactly; every character keeps a full body with a visible chest and torso exactly as in the references. Characters, identical in every frame: Senbi the groom: young man with a full body and a visible chest, straight black bowl-cut hair with bangs, gold headband with a gold cobra, blue-and-gold broad collar resting on his bare chest, gold bracers on both wrists, white kilt with a blue-and-gold sash, brown sandals. Setting: sunny daytime ancient Egyptian wedding courtyard in Alexandria: flat-roofed sandstone mud-brick buildings, tall Egyptian columns with lotus-bud capitals painted in blue-and-gold bands, hieroglyph-style carvings on the walls, long tables with white cloths and clay jars, orange cloth awnings, and a tall wooden entrance gate at the back-center that opens onto the street. Egyptian architecture only: no Greek or Roman architecture, no triangular pediments, no domes, no red tile roofs, no cypress trees. Lighting: warm bright afternoon sunlight, soft shadows, rich saturated colors. ACTION TIMELINE (6 seconds): 0–2 s: Senbi looks down at the wooden headrest in his hands, turning it over. 2–4 s: he slowly lifts his gaze toward the Roman commander off-screen to the right. 4–6 s: a tired deadpan stare, a long slow blink, his shoulders drop. Camera: locked-off and perfectly still, eye-level medium close-up with the headrest in Senbi's hands and his face both in frame; the framing never changes (no tilt, pan, zoom or rising camera). Audio: voice-over narration only (a voice, never shown on screen; no narrator character appears): a British male voice, warm and dry, begins speaking within half a second and says: “Headrest, then commander. Neither came with a return policy.” The line takes about 3.6 seconds; leave the last second free of speech so the moment can land. Music: playful comic percussion over the wedding rhythm, low under the voice. Sound effects: wood knock, comic sting, timed to the action. Ambience: light courtyard ambience: clinking cups, footsteps on stone, a soft breeze, no words. Final reminder: no character says any word; only the voice-over narration speaks (voice only, nobody on screen is the narrator). Natural laughs, gasps and sighs are fine. No text, captions or logos in the frame.</w:t>
       </w:r>
     </w:p>
     <w:p>
@@ -3261,7 +3261,7 @@
           <w:sz w:val="20"/>
           <w:szCs w:val="20"/>
         </w:rPr>
-        <w:t xml:space="preserve">VOICE RULE: only the voice-over narration speaks words; it is a voice only, never a person or character on screen. No character says any word and no one on screen lip-syncs to speech; characters communicate with facial expressions and body gestures. Natural non-verbal sounds are allowed and should sound real: laughing, giggling, gasping, sighing, groaning, cheering, coughing. Attached reference images, in order: the bride, Senbi, the groom, the wedding courtyard. 2D hand-drawn stickman cartoon in the exact style of the reference images: thin black outlines, large expressive heads, thin stick arms, flat warm colors, playful documentary-comedy tone, 16:9. Characters, identical in every frame: Senbi the groom: young man, straight black bowl-cut hair with bangs, gold headband with a gold cobra, bare chest, blue-and-gold broad collar, gold bracers, white kilt with a blue-and-gold sash, brown sandals, thin black stick arms. the bride: black bob hair with straight bangs, gold headband with a red gem, white dress, blue-and-gold collar, gold sash, gold arm cuffs, light veil. Setting: sunny daytime ancient Egyptian wedding courtyard in Alexandria: flat-roofed sandstone mud-brick buildings, tall Egyptian columns with lotus-bud capitals painted in blue-and-gold bands, hieroglyph-style carvings on the walls, long tables with white cloths and clay jars, orange cloth awnings, and a tall wooden entrance gate at the back-center that opens onto the street. Egyptian architecture only: no Greek or Roman architecture, no triangular pediments, no domes, no red tile roofs, no cypress trees. Lighting: warm bright afternoon sunlight, soft shadows, rich saturated colors. ACTION TIMELINE (6 seconds): 0–2 s: the bride's shoulders begin to shake. 2–4 s: she bursts out laughing, a hand on her chest. 4–6 s: Senbi looks at her, then starts laughing too, tears in his eyes, and they lean on each other. Camera: locked-off and perfectly still, eye-level medium two-shot of Senbi and the bride; the framing never changes (no tilt, pan, zoom or rising camera). Audio: voice-over narration only (a voice, never shown on screen; no narrator character appears): a British male voice, warm and dry, begins speaking within half a second and says: “Senbi thought he was getting married.” The line takes about 2.4 seconds; leave the last second free of speech so the moment can land. Music: warm gentle resolution with the same flute and strings, low under the voice. Sound effects: bride laughter, Senbi laughter, timed to the action. Ambience: light courtyard ambience: clinking cups, footsteps on stone, a soft breeze, no words. Final reminder: no character says any word; only the voice-over narration speaks (voice only, nobody on screen is the narrator). Natural laughs, gasps and sighs are fine. No text, captions or logos in the frame.</w:t>
+        <w:t xml:space="preserve">VOICE RULE: only the voice-over narration speaks words; it is a voice only, never a person or character on screen. No character says any word and no one on screen lip-syncs to speech; characters communicate with facial expressions and body gestures. Natural non-verbal sounds are allowed and should sound real: laughing, giggling, gasping, sighing, groaning, cheering, coughing. Attached reference images, in order: the bride, Senbi, the groom, the wedding courtyard. 2D hand-drawn Stickman animation, clean thin black outlines, large expressive heads, simple readable stickman proportions, flat warm colors, playful cinematic documentary-comedy tone, 16:9. Use the attached reference images as strict continuity anchors: preserve faces, hair, clothing, colors, proportions and accessories exactly; every character keeps a full body with a visible chest and torso exactly as in the references. Characters, identical in every frame: Senbi the groom: young man with a full body and a visible chest, straight black bowl-cut hair with bangs, gold headband with a gold cobra, blue-and-gold broad collar resting on his bare chest, gold bracers on both wrists, white kilt with a blue-and-gold sash, brown sandals. the bride: black bob hair with straight bangs, gold headband with a red gem, white dress, blue-and-gold collar, gold sash, gold arm cuffs, light veil. Setting: sunny daytime ancient Egyptian wedding courtyard in Alexandria: flat-roofed sandstone mud-brick buildings, tall Egyptian columns with lotus-bud capitals painted in blue-and-gold bands, hieroglyph-style carvings on the walls, long tables with white cloths and clay jars, orange cloth awnings, and a tall wooden entrance gate at the back-center that opens onto the street. Egyptian architecture only: no Greek or Roman architecture, no triangular pediments, no domes, no red tile roofs, no cypress trees. Lighting: warm bright afternoon sunlight, soft shadows, rich saturated colors. ACTION TIMELINE (6 seconds): 0–2 s: the bride's shoulders begin to shake. 2–4 s: she bursts out laughing, a hand on her chest. 4–6 s: Senbi looks at her, then starts laughing too, tears in his eyes, and they lean on each other. Camera: locked-off and perfectly still, eye-level medium two-shot of Senbi and the bride; the framing never changes (no tilt, pan, zoom or rising camera). Audio: voice-over narration only (a voice, never shown on screen; no narrator character appears): a British male voice, warm and dry, begins speaking within half a second and says: “Senbi thought he was getting married.” The line takes about 2.4 seconds; leave the last second free of speech so the moment can land. Music: warm gentle resolution with the same flute and strings, low under the voice. Sound effects: bride laughter, Senbi laughter, timed to the action. Ambience: light courtyard ambience: clinking cups, footsteps on stone, a soft breeze, no words. Final reminder: no character says any word; only the voice-over narration speaks (voice only, nobody on screen is the narrator). Natural laughs, gasps and sighs are fine. No text, captions or logos in the frame.</w:t>
       </w:r>
     </w:p>
     <w:p>
@@ -3334,7 +3334,7 @@
           <w:sz w:val="20"/>
           <w:szCs w:val="20"/>
         </w:rPr>
-        <w:t xml:space="preserve">VOICE RULE: only the voice-over narration speaks words; it is a voice only, never a person or character on screen. No character says any word and no one on screen lip-syncs to speech; characters communicate with facial expressions and body gestures. Natural non-verbal sounds are allowed and should sound real: laughing, giggling, gasping, sighing, groaning, cheering, coughing. Attached reference images, in order: Senbi, the groom. 2D hand-drawn stickman cartoon in the exact style of the reference images: thin black outlines, large expressive heads, thin stick arms, flat warm colors, playful documentary-comedy tone, 16:9. Characters, identical in every frame: Senbi the groom: young man, straight black bowl-cut hair with bangs, gold headband with a gold cobra, bare chest, blue-and-gold broad collar, gold bracers, white kilt with a blue-and-gold sash, brown sandals, thin black stick arms. Setting: a quiet room of the wedding house at night, warm torchlight, painted columns, cushions on the floor, Senbi alone in the room. Lighting: warm flickering torchlight, deep soft shadows. ACTION TIMELINE (4 seconds): 0–1 s: Senbi lies asleep, neck awkwardly bent on the wooden headrest, mouth slightly open, face scrunched. 1–2 s: distant marching begins. 2–3 s: one eye opens and he listens. 3–4 s: the eye closes again with a tired sigh and he turns his face away. Camera: eye-level medium close-up of Senbi's face; fixed except for an almost imperceptible 5% slow push-in, no tilt or pan. Audio: voice-over narration only (a voice, never shown on screen; no narrator character appears): a British male voice, warm and dry, begins speaking within half a second and says: “He was.” The line takes about 0.8 seconds; leave the last second free of speech so the moment can land. Music: warm gentle resolution with the same flute and strings, low under the voice. Sound effects: distant marching, soft snore, timed to the action. Ambience: quiet night room tone and a crackling torch, no words. Final reminder: no character says any word; only the voice-over narration speaks (voice only, nobody on screen is the narrator). Natural laughs, gasps and sighs are fine. No text, captions or logos in the frame.</w:t>
+        <w:t xml:space="preserve">VOICE RULE: only the voice-over narration speaks words; it is a voice only, never a person or character on screen. No character says any word and no one on screen lip-syncs to speech; characters communicate with facial expressions and body gestures. Natural non-verbal sounds are allowed and should sound real: laughing, giggling, gasping, sighing, groaning, cheering, coughing. Attached reference images, in order: Senbi, the groom. 2D hand-drawn Stickman animation, clean thin black outlines, large expressive heads, simple readable stickman proportions, flat warm colors, playful cinematic documentary-comedy tone, 16:9. Use the attached reference images as strict continuity anchors: preserve faces, hair, clothing, colors, proportions and accessories exactly; every character keeps a full body with a visible chest and torso exactly as in the references. Characters, identical in every frame: Senbi the groom: young man with a full body and a visible chest, straight black bowl-cut hair with bangs, gold headband with a gold cobra, blue-and-gold broad collar resting on his bare chest, gold bracers on both wrists, white kilt with a blue-and-gold sash, brown sandals. Setting: a quiet room of the wedding house at night, warm torchlight, painted columns, cushions on the floor, Senbi alone in the room. Lighting: warm flickering torchlight, deep soft shadows. ACTION TIMELINE (4 seconds): 0–1 s: Senbi lies asleep, neck awkwardly bent on the wooden headrest, mouth slightly open, face scrunched. 1–2 s: distant marching begins. 2–3 s: one eye opens and he listens. 3–4 s: the eye closes again with a tired sigh and he turns his face away. Camera: eye-level medium close-up of Senbi's face; fixed except for an almost imperceptible 5% slow push-in, no tilt or pan. Audio: voice-over narration only (a voice, never shown on screen; no narrator character appears): a British male voice, warm and dry, begins speaking within half a second and says: “He was.” The line takes about 0.8 seconds; leave the last second free of speech so the moment can land. Music: warm gentle resolution with the same flute and strings, low under the voice. Sound effects: distant marching, soft snore, timed to the action. Ambience: quiet night room tone and a crackling torch, no words. Final reminder: no character says any word; only the voice-over narration speaks (voice only, nobody on screen is the narrator). Natural laughs, gasps and sighs are fine. No text, captions or logos in the frame.</w:t>
       </w:r>
     </w:p>
     <w:p>
@@ -3407,7 +3407,7 @@
           <w:sz w:val="20"/>
           <w:szCs w:val="20"/>
         </w:rPr>
-        <w:t xml:space="preserve">VOICE RULE: only the voice-over narration speaks words; it is a voice only, never a person or character on screen. No character says any word and no one on screen lip-syncs to speech; characters communicate with facial expressions and body gestures. Natural non-verbal sounds are allowed and should sound real: laughing, giggling, gasping, sighing, groaning, cheering, coughing. Attached reference images, in order: Senbi, the groom, the bride, the Alexandria harbor. 2D hand-drawn stickman cartoon in the exact style of the reference images: thin black outlines, large expressive heads, thin stick arms, flat warm colors, playful documentary-comedy tone, 16:9. Characters, identical in every frame: Senbi the groom: young man, straight black bowl-cut hair with bangs, gold headband with a gold cobra, bare chest, blue-and-gold broad collar, gold bracers, white kilt with a blue-and-gold sash, brown sandals, thin black stick arms. the bride: black bob hair with straight bangs, gold headband with a red gem, white dress, blue-and-gold collar, gold sash, gold arm cuffs, light veil. the Roman soldiers: crimson plumed helmets, steel armor, red cloaks, rectangular red shields. Setting: sunny daytime ancient Egyptian wedding courtyard in Alexandria: flat-roofed sandstone mud-brick buildings, tall Egyptian columns with lotus-bud capitals painted in blue-and-gold bands, hieroglyph-style carvings on the walls, long tables with white cloths and clay jars, orange cloth awnings, and a tall wooden entrance gate at the back-center that opens onto the street. Egyptian architecture only: no Greek or Roman architecture, no triangular pediments, no domes, no red tile roofs, no cypress trees. Lighting: warm bright afternoon sunlight, soft shadows, rich saturated colors. ACTION TIMELINE (8 seconds): 0–2.5 s: warm evening light over Alexandria, Senbi and the bride in the foreground looking out at the city. 2.5–5.5 s: Roman soldiers are small figures in the distance, lights flickering on in the harbor. 5.5–8 s: the couple lean toward each other; the scene holds and slowly settles. Camera: locked-off and perfectly still, wide shot of Senbi and the bride in the foreground with Alexandria behind them; the framing never changes (no tilt, pan, zoom or rising camera). Audio: voice-over narration only (a voice, never shown on screen; no narrator character appears): a British male voice, warm and dry, begins speaking within half a second and says: “He just hadn't noticed he was also getting a new government.” The line takes about 4.4 seconds; leave the last second free of speech so the moment can land. Music: warm gentle resolution with the same flute and strings, low under the voice. Sound effects: gentle music, silence at the very end, timed to the action. Ambience: light courtyard ambience: clinking cups, footsteps on stone, a soft breeze, no words. Final reminder: no character says any word; only the voice-over narration speaks (voice only, nobody on screen is the narrator). Natural laughs, gasps and sighs are fine. No text, captions or logos in the frame.</w:t>
+        <w:t xml:space="preserve">VOICE RULE: only the voice-over narration speaks words; it is a voice only, never a person or character on screen. No character says any word and no one on screen lip-syncs to speech; characters communicate with facial expressions and body gestures. Natural non-verbal sounds are allowed and should sound real: laughing, giggling, gasping, sighing, groaning, cheering, coughing. Attached reference images, in order: Senbi, the groom, the bride, the Alexandria harbor. 2D hand-drawn Stickman animation, clean thin black outlines, large expressive heads, simple readable stickman proportions, flat warm colors, playful cinematic documentary-comedy tone, 16:9. Use the attached reference images as strict continuity anchors: preserve faces, hair, clothing, colors, proportions and accessories exactly; every character keeps a full body with a visible chest and torso exactly as in the references. Characters, identical in every frame: Senbi the groom: young man with a full body and a visible chest, straight black bowl-cut hair with bangs, gold headband with a gold cobra, blue-and-gold broad collar resting on his bare chest, gold bracers on both wrists, white kilt with a blue-and-gold sash, brown sandals. the bride: black bob hair with straight bangs, gold headband with a red gem, white dress, blue-and-gold collar, gold sash, gold arm cuffs, light veil. the Roman soldiers: crimson plumed helmets, steel armor, red cloaks, rectangular red shields. Setting: sunny daytime ancient Egyptian wedding courtyard in Alexandria: flat-roofed sandstone mud-brick buildings, tall Egyptian columns with lotus-bud capitals painted in blue-and-gold bands, hieroglyph-style carvings on the walls, long tables with white cloths and clay jars, orange cloth awnings, and a tall wooden entrance gate at the back-center that opens onto the street. Egyptian architecture only: no Greek or Roman architecture, no triangular pediments, no domes, no red tile roofs, no cypress trees. Lighting: warm bright afternoon sunlight, soft shadows, rich saturated colors. ACTION TIMELINE (8 seconds): 0–2.5 s: warm evening light over Alexandria, Senbi and the bride in the foreground looking out at the city. 2.5–5.5 s: Roman soldiers are small figures in the distance, lights flickering on in the harbor. 5.5–8 s: the couple lean toward each other; the scene holds and slowly settles. Camera: locked-off and perfectly still, wide shot of Senbi and the bride in the foreground with Alexandria behind them; the framing never changes (no tilt, pan, zoom or rising camera). Audio: voice-over narration only (a voice, never shown on screen; no narrator character appears): a British male voice, warm and dry, begins speaking within half a second and says: “He just hadn't noticed he was also getting a new government.” The line takes about 4.4 seconds; leave the last second free of speech so the moment can land. Music: warm gentle resolution with the same flute and strings, low under the voice. Sound effects: gentle music, silence at the very end, timed to the action. Ambience: light courtyard ambience: clinking cups, footsteps on stone, a soft breeze, no words. Final reminder: no character says any word; only the voice-over narration speaks (voice only, nobody on screen is the narrator). Natural laughs, gasps and sighs are fine. No text, captions or logos in the frame.</w:t>
       </w:r>
     </w:p>
     <w:p>

</xml_diff>

<commit_message>
Episode 1 prompts: use the original reference images, no character descriptions in text
Co-Authored-By: Claude Sonnet 5.5 <noreply@anthropic.com>
Claude-Session: https://claude.ai/code/session_01S29WeDgsXUpbHNWdisiPFj
</commit_message>
<xml_diff>
--- a/The_Last_Day_of_Ancient_Egypt_Ep1_FLOW_PROMPTS_READY.docx
+++ b/The_Last_Day_of_Ancient_Egypt_Ep1_FLOW_PROMPTS_READY.docx
@@ -80,7 +80,7 @@
           <w:sz w:val="21"/>
           <w:szCs w:val="21"/>
         </w:rPr>
-        <w:t xml:space="preserve">CHARACTER LOCK: every prompt describes each character who appears (Senbi, the bride, the commander, the soldiers, the cat, the guests) exactly as they look in the approved Shot 1 and the references, so the designs stay identical in every clip.</w:t>
+        <w:t xml:space="preserve">CHARACTER LOCK: the characters are locked by your reference images (attach them exactly as listed above each prompt) and by the sentence “use the selected reference images as strict continuity anchors”. The prompts do not describe the characters in words, so the text never fights the images.</w:t>
       </w:r>
     </w:p>
     <w:p>
@@ -255,15 +255,15 @@
           <w:sz w:val="21"/>
           <w:szCs w:val="21"/>
         </w:rPr>
-        <w:t xml:space="preserve">Senbi_from_Shot1.png</w:t>
-      </w:r>
-      <w:r>
-        <w:rPr>
-          <w:rFonts w:ascii="Arial" w:cs="Arial" w:eastAsia="Arial" w:hAnsi="Arial"/>
-          <w:sz w:val="21"/>
-          <w:szCs w:val="21"/>
-        </w:rPr>
-        <w:t xml:space="preserve">  —  Senbi the groom (frame from the approved Shot 1)</w:t>
+        <w:t xml:space="preserve">01_Senbi.jpg</w:t>
+      </w:r>
+      <w:r>
+        <w:rPr>
+          <w:rFonts w:ascii="Arial" w:cs="Arial" w:eastAsia="Arial" w:hAnsi="Arial"/>
+          <w:sz w:val="21"/>
+          <w:szCs w:val="21"/>
+        </w:rPr>
+        <w:t xml:space="preserve">  —  Senbi the groom</w:t>
       </w:r>
     </w:p>
     <w:p>
@@ -278,15 +278,15 @@
           <w:sz w:val="21"/>
           <w:szCs w:val="21"/>
         </w:rPr>
-        <w:t xml:space="preserve">Bride_from_Shot1.png</w:t>
-      </w:r>
-      <w:r>
-        <w:rPr>
-          <w:rFonts w:ascii="Arial" w:cs="Arial" w:eastAsia="Arial" w:hAnsi="Arial"/>
-          <w:sz w:val="21"/>
-          <w:szCs w:val="21"/>
-        </w:rPr>
-        <w:t xml:space="preserve">  —  the bride (frame from the approved Shot 1)</w:t>
+        <w:t xml:space="preserve">02_Bride.jpg</w:t>
+      </w:r>
+      <w:r>
+        <w:rPr>
+          <w:rFonts w:ascii="Arial" w:cs="Arial" w:eastAsia="Arial" w:hAnsi="Arial"/>
+          <w:sz w:val="21"/>
+          <w:szCs w:val="21"/>
+        </w:rPr>
+        <w:t xml:space="preserve">  —  the bride</w:t>
       </w:r>
     </w:p>
     <w:p>
@@ -301,15 +301,15 @@
           <w:sz w:val="21"/>
           <w:szCs w:val="21"/>
         </w:rPr>
-        <w:t xml:space="preserve">Courtyard_from_Shot1.png</w:t>
-      </w:r>
-      <w:r>
-        <w:rPr>
-          <w:rFonts w:ascii="Arial" w:cs="Arial" w:eastAsia="Arial" w:hAnsi="Arial"/>
-          <w:sz w:val="21"/>
-          <w:szCs w:val="21"/>
-        </w:rPr>
-        <w:t xml:space="preserve">  —  the wedding courtyard (frame from the approved Shot 1)</w:t>
+        <w:t xml:space="preserve">03_Egyptian_Guests.jpg</w:t>
+      </w:r>
+      <w:r>
+        <w:rPr>
+          <w:rFonts w:ascii="Arial" w:cs="Arial" w:eastAsia="Arial" w:hAnsi="Arial"/>
+          <w:sz w:val="21"/>
+          <w:szCs w:val="21"/>
+        </w:rPr>
+        <w:t xml:space="preserve">  —  the Egyptian guests</w:t>
       </w:r>
     </w:p>
     <w:p>
@@ -324,15 +324,15 @@
           <w:sz w:val="21"/>
           <w:szCs w:val="21"/>
         </w:rPr>
-        <w:t xml:space="preserve">Guests_group.png</w:t>
-      </w:r>
-      <w:r>
-        <w:rPr>
-          <w:rFonts w:ascii="Arial" w:cs="Arial" w:eastAsia="Arial" w:hAnsi="Arial"/>
-          <w:sz w:val="21"/>
-          <w:szCs w:val="21"/>
-        </w:rPr>
-        <w:t xml:space="preserve">  —  the Egyptian wedding guests</w:t>
+        <w:t xml:space="preserve">04_Parents_and_Relatives.jpg</w:t>
+      </w:r>
+      <w:r>
+        <w:rPr>
+          <w:rFonts w:ascii="Arial" w:cs="Arial" w:eastAsia="Arial" w:hAnsi="Arial"/>
+          <w:sz w:val="21"/>
+          <w:szCs w:val="21"/>
+        </w:rPr>
+        <w:t xml:space="preserve">  —  parents and relatives</w:t>
       </w:r>
     </w:p>
     <w:p>
@@ -347,15 +347,15 @@
           <w:sz w:val="21"/>
           <w:szCs w:val="21"/>
         </w:rPr>
-        <w:t xml:space="preserve">Relatives_group.png</w:t>
-      </w:r>
-      <w:r>
-        <w:rPr>
-          <w:rFonts w:ascii="Arial" w:cs="Arial" w:eastAsia="Arial" w:hAnsi="Arial"/>
-          <w:sz w:val="21"/>
-          <w:szCs w:val="21"/>
-        </w:rPr>
-        <w:t xml:space="preserve">  —  the bride's relatives (father, uncle, aunt)</w:t>
+        <w:t xml:space="preserve">05_Roman_Soldiers.jpg</w:t>
+      </w:r>
+      <w:r>
+        <w:rPr>
+          <w:rFonts w:ascii="Arial" w:cs="Arial" w:eastAsia="Arial" w:hAnsi="Arial"/>
+          <w:sz w:val="21"/>
+          <w:szCs w:val="21"/>
+        </w:rPr>
+        <w:t xml:space="preserve">  —  the Roman soldiers</w:t>
       </w:r>
     </w:p>
     <w:p>
@@ -370,15 +370,15 @@
           <w:sz w:val="21"/>
           <w:szCs w:val="21"/>
         </w:rPr>
-        <w:t xml:space="preserve">Roman_soldiers.png</w:t>
-      </w:r>
-      <w:r>
-        <w:rPr>
-          <w:rFonts w:ascii="Arial" w:cs="Arial" w:eastAsia="Arial" w:hAnsi="Arial"/>
-          <w:sz w:val="21"/>
-          <w:szCs w:val="21"/>
-        </w:rPr>
-        <w:t xml:space="preserve">  —  the Roman soldiers</w:t>
+        <w:t xml:space="preserve">06_Roman_Commander.jpg</w:t>
+      </w:r>
+      <w:r>
+        <w:rPr>
+          <w:rFonts w:ascii="Arial" w:cs="Arial" w:eastAsia="Arial" w:hAnsi="Arial"/>
+          <w:sz w:val="21"/>
+          <w:szCs w:val="21"/>
+        </w:rPr>
+        <w:t xml:space="preserve">  —  the Roman commander</w:t>
       </w:r>
     </w:p>
     <w:p>
@@ -393,15 +393,15 @@
           <w:sz w:val="21"/>
           <w:szCs w:val="21"/>
         </w:rPr>
-        <w:t xml:space="preserve">Commander_front.png</w:t>
-      </w:r>
-      <w:r>
-        <w:rPr>
-          <w:rFonts w:ascii="Arial" w:cs="Arial" w:eastAsia="Arial" w:hAnsi="Arial"/>
-          <w:sz w:val="21"/>
-          <w:szCs w:val="21"/>
-        </w:rPr>
-        <w:t xml:space="preserve">  —  the Roman commander</w:t>
+        <w:t xml:space="preserve">07_Animals.jpg</w:t>
+      </w:r>
+      <w:r>
+        <w:rPr>
+          <w:rFonts w:ascii="Arial" w:cs="Arial" w:eastAsia="Arial" w:hAnsi="Arial"/>
+          <w:sz w:val="21"/>
+          <w:szCs w:val="21"/>
+        </w:rPr>
+        <w:t xml:space="preserve">  —  the cat and other animals</w:t>
       </w:r>
     </w:p>
     <w:p>
@@ -416,15 +416,15 @@
           <w:sz w:val="21"/>
           <w:szCs w:val="21"/>
         </w:rPr>
-        <w:t xml:space="preserve">Black_cat.png</w:t>
-      </w:r>
-      <w:r>
-        <w:rPr>
-          <w:rFonts w:ascii="Arial" w:cs="Arial" w:eastAsia="Arial" w:hAnsi="Arial"/>
-          <w:sz w:val="21"/>
-          <w:szCs w:val="21"/>
-        </w:rPr>
-        <w:t xml:space="preserve">  —  the black cat with the gold collar</w:t>
+        <w:t xml:space="preserve">08_Alexandria_City_Overview.jpg</w:t>
+      </w:r>
+      <w:r>
+        <w:rPr>
+          <w:rFonts w:ascii="Arial" w:cs="Arial" w:eastAsia="Arial" w:hAnsi="Arial"/>
+          <w:sz w:val="21"/>
+          <w:szCs w:val="21"/>
+        </w:rPr>
+        <w:t xml:space="preserve">  —  Alexandria city and harbor</w:t>
       </w:r>
     </w:p>
     <w:p>
@@ -439,20 +439,130 @@
           <w:sz w:val="21"/>
           <w:szCs w:val="21"/>
         </w:rPr>
-        <w:t xml:space="preserve">Alexandria_Harbor_from_ref08.png</w:t>
-      </w:r>
-      <w:r>
-        <w:rPr>
-          <w:rFonts w:ascii="Arial" w:cs="Arial" w:eastAsia="Arial" w:hAnsi="Arial"/>
-          <w:sz w:val="21"/>
-          <w:szCs w:val="21"/>
-        </w:rPr>
-        <w:t xml:space="preserve">  —  the Alexandria harbor and lighthouse</w:t>
-      </w:r>
-    </w:p>
-    <w:p>
-      <w:pPr>
-        <w:spacing w:after="200" w:before="80"/>
+        <w:t xml:space="preserve">09_Alexandria_Streets_and_Market.jpg</w:t>
+      </w:r>
+      <w:r>
+        <w:rPr>
+          <w:rFonts w:ascii="Arial" w:cs="Arial" w:eastAsia="Arial" w:hAnsi="Arial"/>
+          <w:sz w:val="21"/>
+          <w:szCs w:val="21"/>
+        </w:rPr>
+        <w:t xml:space="preserve">  —  Alexandria streets and market</w:t>
+      </w:r>
+    </w:p>
+    <w:p>
+      <w:pPr>
+        <w:spacing w:after="50" w:before="0"/>
+      </w:pPr>
+      <w:r>
+        <w:rPr>
+          <w:rFonts w:ascii="Arial" w:cs="Arial" w:eastAsia="Arial" w:hAnsi="Arial"/>
+          <w:b/>
+          <w:bCs/>
+          <w:sz w:val="21"/>
+          <w:szCs w:val="21"/>
+        </w:rPr>
+        <w:t xml:space="preserve">10_Noble_House_Wedding_Location.jpg</w:t>
+      </w:r>
+      <w:r>
+        <w:rPr>
+          <w:rFonts w:ascii="Arial" w:cs="Arial" w:eastAsia="Arial" w:hAnsi="Arial"/>
+          <w:sz w:val="21"/>
+          <w:szCs w:val="21"/>
+        </w:rPr>
+        <w:t xml:space="preserve">  —  the noble house wedding location</w:t>
+      </w:r>
+    </w:p>
+    <w:p>
+      <w:pPr>
+        <w:spacing w:after="50" w:before="0"/>
+      </w:pPr>
+      <w:r>
+        <w:rPr>
+          <w:rFonts w:ascii="Arial" w:cs="Arial" w:eastAsia="Arial" w:hAnsi="Arial"/>
+          <w:b/>
+          <w:bCs/>
+          <w:sz w:val="21"/>
+          <w:szCs w:val="21"/>
+        </w:rPr>
+        <w:t xml:space="preserve">11_Wedding_Courtyard_Day.jpg</w:t>
+      </w:r>
+      <w:r>
+        <w:rPr>
+          <w:rFonts w:ascii="Arial" w:cs="Arial" w:eastAsia="Arial" w:hAnsi="Arial"/>
+          <w:sz w:val="21"/>
+          <w:szCs w:val="21"/>
+        </w:rPr>
+        <w:t xml:space="preserve">  —  the wedding courtyard by day</w:t>
+      </w:r>
+    </w:p>
+    <w:p>
+      <w:pPr>
+        <w:spacing w:after="50" w:before="0"/>
+      </w:pPr>
+      <w:r>
+        <w:rPr>
+          <w:rFonts w:ascii="Arial" w:cs="Arial" w:eastAsia="Arial" w:hAnsi="Arial"/>
+          <w:b/>
+          <w:bCs/>
+          <w:sz w:val="21"/>
+          <w:szCs w:val="21"/>
+        </w:rPr>
+        <w:t xml:space="preserve">12_Interior_Feast_Night.jpg</w:t>
+      </w:r>
+      <w:r>
+        <w:rPr>
+          <w:rFonts w:ascii="Arial" w:cs="Arial" w:eastAsia="Arial" w:hAnsi="Arial"/>
+          <w:sz w:val="21"/>
+          <w:szCs w:val="21"/>
+        </w:rPr>
+        <w:t xml:space="preserve">  —  the interior feast at night</w:t>
+      </w:r>
+    </w:p>
+    <w:p>
+      <w:pPr>
+        <w:spacing w:after="50" w:before="0"/>
+      </w:pPr>
+      <w:r>
+        <w:rPr>
+          <w:rFonts w:ascii="Arial" w:cs="Arial" w:eastAsia="Arial" w:hAnsi="Arial"/>
+          <w:b/>
+          <w:bCs/>
+          <w:sz w:val="21"/>
+          <w:szCs w:val="21"/>
+        </w:rPr>
+        <w:t xml:space="preserve">Use your original images exactly as you uploaded them. </w:t>
+      </w:r>
+      <w:r>
+        <w:rPr>
+          <w:rFonts w:ascii="Arial" w:cs="Arial" w:eastAsia="Arial" w:hAnsi="Arial"/>
+          <w:sz w:val="21"/>
+          <w:szCs w:val="21"/>
+        </w:rPr>
+        <w:t xml:space="preserve">Nothing in this file is cropped, edited or replaced.</w:t>
+      </w:r>
+    </w:p>
+    <w:p>
+      <w:pPr>
+        <w:pStyle w:val="Heading2"/>
+        <w:keepNext/>
+        <w:spacing w:after="60" w:before="260"/>
+      </w:pPr>
+      <w:r>
+        <w:rPr>
+          <w:rFonts w:ascii="Arial" w:cs="Arial" w:eastAsia="Arial" w:hAnsi="Arial"/>
+          <w:b/>
+          <w:bCs/>
+          <w:sz w:val="26"/>
+          <w:szCs w:val="26"/>
+        </w:rPr>
+        <w:t xml:space="preserve">SHOT 01 — Cold open (new hook)</w:t>
+      </w:r>
+    </w:p>
+    <w:p>
+      <w:pPr>
+        <w:keepNext/>
+        <w:spacing w:after="40" w:before="0"/>
       </w:pPr>
       <w:r>
         <w:rPr>
@@ -463,7 +573,109 @@
           <w:sz w:val="19"/>
           <w:szCs w:val="19"/>
         </w:rPr>
-        <w:t xml:space="preserve">Roman_soldiers.png is a small crop from the commander sheet. If you have a cleaner single-soldier image (no captions), use that instead.</w:t>
+        <w:t xml:space="preserve">Two ways to generate Shot 1. OPTION A (best): Frames to Video with Shot1_first_frame.png as the START frame, using the short prompt A below: the image carries the look, the prompt only adds motion and sound. OPTION B: attach 01_Senbi.jpg, 02_Bride.jpg and 11_Wedding_Courtyard_Day.jpg (your original images) and use the long prompt B.</w:t>
+      </w:r>
+    </w:p>
+    <w:p>
+      <w:pPr>
+        <w:keepNext/>
+        <w:spacing w:after="60" w:before="0"/>
+      </w:pPr>
+      <w:r>
+        <w:rPr>
+          <w:rFonts w:ascii="Arial" w:cs="Arial" w:eastAsia="Arial" w:hAnsi="Arial"/>
+          <w:b/>
+          <w:bCs/>
+          <w:sz w:val="21"/>
+          <w:szCs w:val="21"/>
+        </w:rPr>
+        <w:t xml:space="preserve">Attach: </w:t>
+      </w:r>
+      <w:r>
+        <w:rPr>
+          <w:rFonts w:ascii="Arial" w:cs="Arial" w:eastAsia="Arial" w:hAnsi="Arial"/>
+          <w:sz w:val="21"/>
+          <w:szCs w:val="21"/>
+        </w:rPr>
+        <w:t xml:space="preserve">Option A: Shot1_first_frame.png as the start frame.   Option B: 01_Senbi.jpg, 02_Bride.jpg, 11_Wedding_Courtyard_Day.jpg</w:t>
+      </w:r>
+      <w:r>
+        <w:rPr>
+          <w:rFonts w:ascii="Arial" w:cs="Arial" w:eastAsia="Arial" w:hAnsi="Arial"/>
+          <w:b/>
+          <w:bCs/>
+          <w:sz w:val="21"/>
+          <w:szCs w:val="21"/>
+        </w:rPr>
+        <w:t xml:space="preserve">      Duration: </w:t>
+      </w:r>
+      <w:r>
+        <w:rPr>
+          <w:rFonts w:ascii="Arial" w:cs="Arial" w:eastAsia="Arial" w:hAnsi="Arial"/>
+          <w:sz w:val="21"/>
+          <w:szCs w:val="21"/>
+        </w:rPr>
+        <w:t xml:space="preserve">8 sec</w:t>
+      </w:r>
+    </w:p>
+    <w:p>
+      <w:pPr>
+        <w:keepNext/>
+        <w:spacing w:after="40" w:before="120"/>
+      </w:pPr>
+      <w:r>
+        <w:rPr>
+          <w:rFonts w:ascii="Arial" w:cs="Arial" w:eastAsia="Arial" w:hAnsi="Arial"/>
+          <w:b/>
+          <w:bCs/>
+          <w:sz w:val="21"/>
+          <w:szCs w:val="21"/>
+        </w:rPr>
+        <w:t xml:space="preserve">PROMPT A (Frames to Video, start frame attached) — copy all:</w:t>
+      </w:r>
+    </w:p>
+    <w:p>
+      <w:pPr>
+        <w:shd w:fill="F2F2F2" w:val="clear"/>
+        <w:spacing w:after="80"/>
+      </w:pPr>
+      <w:r>
+        <w:rPr>
+          <w:rFonts w:ascii="Arial" w:cs="Arial" w:eastAsia="Arial" w:hAnsi="Arial"/>
+          <w:sz w:val="20"/>
+          <w:szCs w:val="20"/>
+        </w:rPr>
+        <w:t xml:space="preserve">VOICE RULE: only the voice-over narration speaks words; it is a voice only, never a person on screen. No character says any word and no one lip-syncs; natural laughs, gasps and sighs are allowed and should sound real. Keep the starting image exactly as it is: the same two dancers, the same Egyptian courtyard and the same row of dark armored figures standing in the open gate. Do not redraw, restyle or change anything in the scene; only animate it. ACTION TIMELINE (8 seconds): 0–2.5 s: the couple dance joyfully, fists pumping, eyes closed, big laughing smiles; guests at the tables clap, one beats a frame drum; the dark figures in the gate stand perfectly still. 2.5–5.5 s: the dance continues, the couple's joy growing. 5.5–8 s: the camera drifts slightly closer to a medium close-up of the laughing couple while the figures stay still behind them. Camera: one slow, smooth push-in; no tilt, no pan, no rising camera. Audio: voice-over narration only (a voice, never shown on screen): a British male voice, warm and dry, begins speaking within half a second and says: “Senbi had planned everything for his wedding. Everything except the Roman army.” Say the first sentence warmly, pause briefly, then say the second sentence dryly and deadpan. The line takes about 5.2 seconds; leave the last second free of speech. Music: light ancient-Mediterranean wedding music (frame drums, reed flute, plucked strings), cheerful, low under the voice. Sound effects: clapping, cups clinking, cheers without words, timed to the action. Ambience: light courtyard ambience, no words. Final reminder: no character says any word; only the voice-over narration speaks (voice only, nobody on screen is the narrator). Natural laughs, gasps and sighs are fine. No text, captions or logos in the frame.</w:t>
+      </w:r>
+    </w:p>
+    <w:p>
+      <w:pPr>
+        <w:keepNext/>
+        <w:spacing w:after="40" w:before="120"/>
+      </w:pPr>
+      <w:r>
+        <w:rPr>
+          <w:rFonts w:ascii="Arial" w:cs="Arial" w:eastAsia="Arial" w:hAnsi="Arial"/>
+          <w:b/>
+          <w:bCs/>
+          <w:sz w:val="21"/>
+          <w:szCs w:val="21"/>
+        </w:rPr>
+        <w:t xml:space="preserve">PROMPT B (reference images only) — copy all:</w:t>
+      </w:r>
+    </w:p>
+    <w:p>
+      <w:pPr>
+        <w:shd w:fill="F2F2F2" w:val="clear"/>
+        <w:spacing w:after="80"/>
+      </w:pPr>
+      <w:r>
+        <w:rPr>
+          <w:rFonts w:ascii="Arial" w:cs="Arial" w:eastAsia="Arial" w:hAnsi="Arial"/>
+          <w:sz w:val="20"/>
+          <w:szCs w:val="20"/>
+        </w:rPr>
+        <w:t xml:space="preserve">VOICE RULE: only the voice-over narration speaks words; it is a voice only, never a person on screen. No character says any word and no one lip-syncs; natural laughs, gasps and sighs are allowed and should sound real. 2D hand-drawn Stickman animation, clean thin black outlines, large expressive heads, simple readable stickman proportions, flat warm colors, playful cinematic documentary-comedy tone, 16:9. Use the selected reference images as strict continuity anchors: preserve faces, hair, clothing, colors, proportions and accessories exactly; every character keeps a full body with a visible chest and torso exactly as in the references. Setting: the wedding courtyard exactly as in the selected reference image: ancient Egyptian architecture only, sunny daytime. In the open gate, a row of dark armored figures with spears and plumed helmets stands motionless against the bright street, small but clear. Lighting: warm bright afternoon sunlight, soft shadows, rich saturated colors. ACTION TIMELINE (8 seconds): 0–2.5 s: Senbi and the bride dance joyfully in the center of the courtyard, fists pumping, eyes closed, big laughing smiles; guests at the tables clap, one plays a reed flute, another beats a frame drum; the dark figures stand perfectly still in the gate behind them. 2.5–5.5 s: the dance continues, the couple's joy growing. 5.5–8 s: the camera has drifted closer so the laughing couple fills the frame in a medium close-up, Senbi's fist raised, the bride's arms up; the figures remain still in the background. Camera: eye-level, starts as a medium-wide shot and makes one slow, smooth push-in toward the couple, ending in a medium close-up; no tilt, no pan, no rising camera. Audio: voice-over narration only (a voice, never shown on screen; no narrator character appears): a British male voice, warm and dry, begins speaking within half a second and says: “Senbi had planned everything for his wedding. Everything except the Roman army.” Say the first sentence warmly, pause briefly, then say the second sentence dryly and deadpan. The line takes about 5.2 seconds; leave the last second free of speech. Music: light ancient-Mediterranean wedding music (frame drums, reed flute, plucked strings), cheerful, low under the voice. Sound effects: clapping, cups clinking, cheers without words, timed to the action. Ambience: light courtyard ambience: footsteps on stone, a soft breeze, no words. Final reminder: no character says any word; only the voice-over narration speaks (voice only, nobody on screen is the narrator). Natural laughs, gasps and sighs are fine. No text, captions or logos in the frame.</w:t>
       </w:r>
     </w:p>
     <w:p>
@@ -480,7 +692,737 @@
           <w:sz w:val="26"/>
           <w:szCs w:val="26"/>
         </w:rPr>
-        <w:t xml:space="preserve">SHOT 01 — Cold open (new hook)</w:t>
+        <w:t xml:space="preserve">SHOT 02 — The suspicious sound</w:t>
+      </w:r>
+    </w:p>
+    <w:p>
+      <w:pPr>
+        <w:keepNext/>
+        <w:spacing w:after="60" w:before="0"/>
+      </w:pPr>
+      <w:r>
+        <w:rPr>
+          <w:rFonts w:ascii="Arial" w:cs="Arial" w:eastAsia="Arial" w:hAnsi="Arial"/>
+          <w:b/>
+          <w:bCs/>
+          <w:sz w:val="21"/>
+          <w:szCs w:val="21"/>
+        </w:rPr>
+        <w:t xml:space="preserve">Attach: </w:t>
+      </w:r>
+      <w:r>
+        <w:rPr>
+          <w:rFonts w:ascii="Arial" w:cs="Arial" w:eastAsia="Arial" w:hAnsi="Arial"/>
+          <w:sz w:val="21"/>
+          <w:szCs w:val="21"/>
+        </w:rPr>
+        <w:t xml:space="preserve">11_Wedding_Courtyard_Day.jpg, 03_Egyptian_Guests.jpg</w:t>
+      </w:r>
+      <w:r>
+        <w:rPr>
+          <w:rFonts w:ascii="Arial" w:cs="Arial" w:eastAsia="Arial" w:hAnsi="Arial"/>
+          <w:b/>
+          <w:bCs/>
+          <w:sz w:val="21"/>
+          <w:szCs w:val="21"/>
+        </w:rPr>
+        <w:t xml:space="preserve">      Duration: </w:t>
+      </w:r>
+      <w:r>
+        <w:rPr>
+          <w:rFonts w:ascii="Arial" w:cs="Arial" w:eastAsia="Arial" w:hAnsi="Arial"/>
+          <w:sz w:val="21"/>
+          <w:szCs w:val="21"/>
+        </w:rPr>
+        <w:t xml:space="preserve">8 sec</w:t>
+      </w:r>
+    </w:p>
+    <w:p>
+      <w:pPr>
+        <w:shd w:fill="F2F2F2" w:val="clear"/>
+        <w:spacing w:after="80"/>
+      </w:pPr>
+      <w:r>
+        <w:rPr>
+          <w:rFonts w:ascii="Arial" w:cs="Arial" w:eastAsia="Arial" w:hAnsi="Arial"/>
+          <w:sz w:val="20"/>
+          <w:szCs w:val="20"/>
+        </w:rPr>
+        <w:t xml:space="preserve">VOICE RULE: only the voice-over narration speaks words; it is a voice only, never a person or character on screen. No character says any word and no one on screen lip-syncs to speech; characters communicate with facial expressions and body gestures. Natural non-verbal sounds are allowed and should sound real: laughing, giggling, gasping, sighing, groaning, cheering, coughing. 2D hand-drawn Stickman animation, clean thin black outlines, large expressive heads, simple readable stickman proportions, flat warm colors, playful cinematic documentary-comedy tone, 16:9. Use the selected reference images as strict continuity anchors: preserve faces, hair, clothing, colors, proportions and accessories exactly; every character keeps a full body with a visible chest and torso exactly as in the references. Setting: the wedding courtyard exactly as in the selected reference image: ancient Egyptian architecture only, sunny daytime. Lighting: warm bright afternoon sunlight, soft shadows, rich saturated colors. ACTION TIMELINE (8 seconds): 0–2 s: guests dance joyfully in the middle of the courtyard, clapping and spinning, kilts and dresses swinging, big happy smiles. 2–3 s: every dancer freezes for half a beat mid-step, smiles still on their faces. 3–5.5 s: one guest slowly turns his head toward the tall gate at the back with a puzzled, alert face while the others unfreeze and keep dancing, unaware. 5.5–8 s: the guest keeps staring at the gate, brow furrowed, then slowly looks back and shrugs it off with a small smile. Camera: locked-off and perfectly still, eye-level medium-wide shot, the dancers fully visible from feet to heads (NOT a feet close-up); the framing never changes (no tilt, pan, zoom or rising camera). Audio: voice-over narration only (a voice, never shown on screen; no narrator character appears): a British male voice, warm and dry, begins speaking within half a second and says: “Then, for half a beat, the dancing stopped. Nobody noticed. Except one guest.” The line takes about 5.2 seconds; leave the last second free of speech so the moment can land. Music: light ancient-Mediterranean wedding music (frame drums, reed flute, plucked strings) with a faint uneasy undertone, same theme in every clip, low under the voice. Sound effects: dancing feet on stone, one tiny pause, faint distant thump, timed to the action. Ambience: light courtyard ambience: clinking cups, footsteps on stone, a soft breeze, no words. Final reminder: no character says any word; only the voice-over narration speaks (voice only, nobody on screen is the narrator). Natural laughs, gasps and sighs are fine. No text, captions or logos in the frame.</w:t>
+      </w:r>
+    </w:p>
+    <w:p>
+      <w:pPr>
+        <w:pStyle w:val="Heading2"/>
+        <w:keepNext/>
+        <w:spacing w:after="60" w:before="260"/>
+      </w:pPr>
+      <w:r>
+        <w:rPr>
+          <w:rFonts w:ascii="Arial" w:cs="Arial" w:eastAsia="Arial" w:hAnsi="Arial"/>
+          <w:b/>
+          <w:bCs/>
+          <w:sz w:val="26"/>
+          <w:szCs w:val="26"/>
+        </w:rPr>
+        <w:t xml:space="preserve">SHOT 03 — Alexandria reveal</w:t>
+      </w:r>
+    </w:p>
+    <w:p>
+      <w:pPr>
+        <w:keepNext/>
+        <w:spacing w:after="60" w:before="0"/>
+      </w:pPr>
+      <w:r>
+        <w:rPr>
+          <w:rFonts w:ascii="Arial" w:cs="Arial" w:eastAsia="Arial" w:hAnsi="Arial"/>
+          <w:b/>
+          <w:bCs/>
+          <w:sz w:val="21"/>
+          <w:szCs w:val="21"/>
+        </w:rPr>
+        <w:t xml:space="preserve">Attach: </w:t>
+      </w:r>
+      <w:r>
+        <w:rPr>
+          <w:rFonts w:ascii="Arial" w:cs="Arial" w:eastAsia="Arial" w:hAnsi="Arial"/>
+          <w:sz w:val="21"/>
+          <w:szCs w:val="21"/>
+        </w:rPr>
+        <w:t xml:space="preserve">08_Alexandria_City_Overview.jpg</w:t>
+      </w:r>
+      <w:r>
+        <w:rPr>
+          <w:rFonts w:ascii="Arial" w:cs="Arial" w:eastAsia="Arial" w:hAnsi="Arial"/>
+          <w:b/>
+          <w:bCs/>
+          <w:sz w:val="21"/>
+          <w:szCs w:val="21"/>
+        </w:rPr>
+        <w:t xml:space="preserve">      Duration: </w:t>
+      </w:r>
+      <w:r>
+        <w:rPr>
+          <w:rFonts w:ascii="Arial" w:cs="Arial" w:eastAsia="Arial" w:hAnsi="Arial"/>
+          <w:sz w:val="21"/>
+          <w:szCs w:val="21"/>
+        </w:rPr>
+        <w:t xml:space="preserve">8 sec</w:t>
+      </w:r>
+    </w:p>
+    <w:p>
+      <w:pPr>
+        <w:shd w:fill="F2F2F2" w:val="clear"/>
+        <w:spacing w:after="80"/>
+      </w:pPr>
+      <w:r>
+        <w:rPr>
+          <w:rFonts w:ascii="Arial" w:cs="Arial" w:eastAsia="Arial" w:hAnsi="Arial"/>
+          <w:sz w:val="20"/>
+          <w:szCs w:val="20"/>
+        </w:rPr>
+        <w:t xml:space="preserve">VOICE RULE: only the voice-over narration speaks words; it is a voice only, never a person or character on screen. No character says any word and no one on screen lip-syncs to speech; characters communicate with facial expressions and body gestures. Natural non-verbal sounds are allowed and should sound real: laughing, giggling, gasping, sighing, groaning, cheering, coughing. 2D hand-drawn cartoon in the exact style of the reference image: flat warm colors, soft cel shading, playful documentary-comedy tone, 16:9. Setting: ancient Alexandria harbor in bright daylight. Lighting: bright clear daylight, sparkling water. ACTION TIMELINE (8 seconds): 0–2.5 s: sailboats glide slowly across the blue water, sails filling with wind, gulls crossing the sky. 2.5–5.5 s: the great lighthouse stands tall on the right while palms sway gently at the left edge. 5.5–8 s: more sails drift across the harbor, tiny figures on the quays carry baskets and jars, sunlight sparkles on the water. Camera: wide establishing shot, horizon level; fixed except for an almost imperceptible 5% slow push-in, no tilt or pan. Audio: voice-over narration only (a voice, never shown on screen; no narrator character appears): a British male voice, warm and dry, begins speaking within half a second and says: “Alexandria, 30 BC. A huge, busy city, about to have a strange evening.” The line takes about 5.2 seconds; leave the last second free of speech so the moment can land. Music: light ancient-Mediterranean wedding music (frame drums, reed flute, plucked strings), same theme in every clip, low under the voice. Sound effects: gulls, harbor water, distant market clatter, no words, timed to the action. Ambience: gulls, lapping water and creaking ropes, no words. Final reminder: no character says any word; only the voice-over narration speaks (voice only, nobody on screen is the narrator). Natural laughs, gasps and sighs are fine. No text, captions or logos in the frame.</w:t>
+      </w:r>
+    </w:p>
+    <w:p>
+      <w:pPr>
+        <w:pStyle w:val="Heading2"/>
+        <w:keepNext/>
+        <w:spacing w:after="60" w:before="260"/>
+      </w:pPr>
+      <w:r>
+        <w:rPr>
+          <w:rFonts w:ascii="Arial" w:cs="Arial" w:eastAsia="Arial" w:hAnsi="Arial"/>
+          <w:b/>
+          <w:bCs/>
+          <w:sz w:val="26"/>
+          <w:szCs w:val="26"/>
+        </w:rPr>
+        <w:t xml:space="preserve">SHOT 04 — Title joke</w:t>
+      </w:r>
+    </w:p>
+    <w:p>
+      <w:pPr>
+        <w:keepNext/>
+        <w:spacing w:after="60" w:before="0"/>
+      </w:pPr>
+      <w:r>
+        <w:rPr>
+          <w:rFonts w:ascii="Arial" w:cs="Arial" w:eastAsia="Arial" w:hAnsi="Arial"/>
+          <w:b/>
+          <w:bCs/>
+          <w:sz w:val="21"/>
+          <w:szCs w:val="21"/>
+        </w:rPr>
+        <w:t xml:space="preserve">Attach: </w:t>
+      </w:r>
+      <w:r>
+        <w:rPr>
+          <w:rFonts w:ascii="Arial" w:cs="Arial" w:eastAsia="Arial" w:hAnsi="Arial"/>
+          <w:sz w:val="21"/>
+          <w:szCs w:val="21"/>
+        </w:rPr>
+        <w:t xml:space="preserve">11_Wedding_Courtyard_Day.jpg</w:t>
+      </w:r>
+      <w:r>
+        <w:rPr>
+          <w:rFonts w:ascii="Arial" w:cs="Arial" w:eastAsia="Arial" w:hAnsi="Arial"/>
+          <w:b/>
+          <w:bCs/>
+          <w:sz w:val="21"/>
+          <w:szCs w:val="21"/>
+        </w:rPr>
+        <w:t xml:space="preserve">      Duration: </w:t>
+      </w:r>
+      <w:r>
+        <w:rPr>
+          <w:rFonts w:ascii="Arial" w:cs="Arial" w:eastAsia="Arial" w:hAnsi="Arial"/>
+          <w:sz w:val="21"/>
+          <w:szCs w:val="21"/>
+        </w:rPr>
+        <w:t xml:space="preserve">8 sec</w:t>
+      </w:r>
+    </w:p>
+    <w:p>
+      <w:pPr>
+        <w:shd w:fill="F2F2F2" w:val="clear"/>
+        <w:spacing w:after="80"/>
+      </w:pPr>
+      <w:r>
+        <w:rPr>
+          <w:rFonts w:ascii="Arial" w:cs="Arial" w:eastAsia="Arial" w:hAnsi="Arial"/>
+          <w:sz w:val="20"/>
+          <w:szCs w:val="20"/>
+        </w:rPr>
+        <w:t xml:space="preserve">VOICE RULE: only the voice-over narration speaks words; it is a voice only, never a person or character on screen. No character says any word and no one on screen lip-syncs to speech; characters communicate with facial expressions and body gestures. Natural non-verbal sounds are allowed and should sound real: laughing, giggling, gasping, sighing, groaning, cheering, coughing. 2D hand-drawn Stickman animation, clean thin black outlines, large expressive heads, simple readable stickman proportions, flat warm colors, playful cinematic documentary-comedy tone, 16:9. Use the selected reference images as strict continuity anchors: preserve faces, hair, clothing, colors, proportions and accessories exactly; every character keeps a full body with a visible chest and torso exactly as in the references. Setting: the wedding courtyard exactly as in the selected reference image: ancient Egyptian architecture only, sunny daytime. Lighting: warm bright afternoon sunlight, soft shadows, rich saturated colors. ACTION TIMELINE (8 seconds): 0–2.5 s: guests dance and clap in a cheerful rhythm, Senbi and the bride dance together in the center, beaming. 2.5–5.5 s: a guest raises a clay cup in a toast and the others clap along; everything looks perfectly normal. 5.5–8 s: the happy scene holds; a little dust floats in the sunlight. Camera: locked-off and perfectly still, eye-level medium-wide shot of the wedding courtyard; the framing never changes (no tilt, pan, zoom or rising camera). Audio: voice-over narration only (a voice, never shown on screen; no narrator character appears): a British male voice, warm and dry, begins speaking within half a second and says: ““Last day of Ancient Egypt”? Relax. Egypt survived. Its queen, less so.” The line takes about 4.8 seconds; leave the last second free of speech so the moment can land. Music: light ancient-Mediterranean wedding music (frame drums, reed flute, plucked strings), same theme in every clip, low under the voice. Sound effects: wedding crowd reactions without any words, one short comic sting, timed to the action. Ambience: light courtyard ambience: clinking cups, footsteps on stone, a soft breeze, no words. Final reminder: no character says any word; only the voice-over narration speaks (voice only, nobody on screen is the narrator). Natural laughs, gasps and sighs are fine. No text, captions or logos in the frame.</w:t>
+      </w:r>
+    </w:p>
+    <w:p>
+      <w:pPr>
+        <w:pStyle w:val="Heading2"/>
+        <w:keepNext/>
+        <w:spacing w:after="60" w:before="260"/>
+      </w:pPr>
+      <w:r>
+        <w:rPr>
+          <w:rFonts w:ascii="Arial" w:cs="Arial" w:eastAsia="Arial" w:hAnsi="Arial"/>
+          <w:b/>
+          <w:bCs/>
+          <w:sz w:val="26"/>
+          <w:szCs w:val="26"/>
+        </w:rPr>
+        <w:t xml:space="preserve">SHOT 05 — Meet Senbi</w:t>
+      </w:r>
+    </w:p>
+    <w:p>
+      <w:pPr>
+        <w:keepNext/>
+        <w:spacing w:after="60" w:before="0"/>
+      </w:pPr>
+      <w:r>
+        <w:rPr>
+          <w:rFonts w:ascii="Arial" w:cs="Arial" w:eastAsia="Arial" w:hAnsi="Arial"/>
+          <w:b/>
+          <w:bCs/>
+          <w:sz w:val="21"/>
+          <w:szCs w:val="21"/>
+        </w:rPr>
+        <w:t xml:space="preserve">Attach: </w:t>
+      </w:r>
+      <w:r>
+        <w:rPr>
+          <w:rFonts w:ascii="Arial" w:cs="Arial" w:eastAsia="Arial" w:hAnsi="Arial"/>
+          <w:sz w:val="21"/>
+          <w:szCs w:val="21"/>
+        </w:rPr>
+        <w:t xml:space="preserve">01_Senbi.jpg, 10_Noble_House_Wedding_Location.jpg</w:t>
+      </w:r>
+      <w:r>
+        <w:rPr>
+          <w:rFonts w:ascii="Arial" w:cs="Arial" w:eastAsia="Arial" w:hAnsi="Arial"/>
+          <w:b/>
+          <w:bCs/>
+          <w:sz w:val="21"/>
+          <w:szCs w:val="21"/>
+        </w:rPr>
+        <w:t xml:space="preserve">      Duration: </w:t>
+      </w:r>
+      <w:r>
+        <w:rPr>
+          <w:rFonts w:ascii="Arial" w:cs="Arial" w:eastAsia="Arial" w:hAnsi="Arial"/>
+          <w:sz w:val="21"/>
+          <w:szCs w:val="21"/>
+        </w:rPr>
+        <w:t xml:space="preserve">8 sec</w:t>
+      </w:r>
+    </w:p>
+    <w:p>
+      <w:pPr>
+        <w:shd w:fill="F2F2F2" w:val="clear"/>
+        <w:spacing w:after="80"/>
+      </w:pPr>
+      <w:r>
+        <w:rPr>
+          <w:rFonts w:ascii="Arial" w:cs="Arial" w:eastAsia="Arial" w:hAnsi="Arial"/>
+          <w:sz w:val="20"/>
+          <w:szCs w:val="20"/>
+        </w:rPr>
+        <w:t xml:space="preserve">VOICE RULE: only the voice-over narration speaks words; it is a voice only, never a person or character on screen. No character says any word and no one on screen lip-syncs to speech; characters communicate with facial expressions and body gestures. Natural non-verbal sounds are allowed and should sound real: laughing, giggling, gasping, sighing, groaning, cheering, coughing. 2D hand-drawn Stickman animation, clean thin black outlines, large expressive heads, simple readable stickman proportions, flat warm colors, playful cinematic documentary-comedy tone, 16:9. Use the selected reference images as strict continuity anchors: preserve faces, hair, clothing, colors, proportions and accessories exactly; every character keeps a full body with a visible chest and torso exactly as in the references. Setting: a shaded sandstone alcove beside the wedding courtyard, painted columns, warm daylight. Lighting: warm bright afternoon sunlight, soft shadows, rich saturated colors. ACTION TIMELINE (8 seconds): 0–2.5 s: Senbi stands in front of a bronze mirror on a stand, seen from the side, and straightens his blue-and-gold collar with both hands. 2.5–5.5 s: he tugs his sash neat, then practices a proud, wide smile at his reflection. 5.5–8 s: the smile wobbles into a nervous twitch; he wipes his forehead with the back of his hand and takes a deep breath. Camera: eye-level medium shot of Senbi at the mirror; fixed except for an almost imperceptible 5% slow push-in, no tilt or pan. Audio: voice-over narration only (a voice, never shown on screen; no narrator character appears): a British male voice, warm and dry, begins speaking within half a second and says: “Meet Senbi. He's getting married today, and has checked the mirror forty times.” The line takes about 5.2 seconds; leave the last second free of speech so the moment can land. Music: light ancient-Mediterranean wedding music (frame drums, reed flute, plucked strings), same theme in every clip, low under the voice. Sound effects: small fabric rustle, soft room tone, timed to the action. Ambience: light courtyard ambience: clinking cups, footsteps on stone, a soft breeze, no words. Final reminder: no character says any word; only the voice-over narration speaks (voice only, nobody on screen is the narrator). Natural laughs, gasps and sighs are fine. No text, captions or logos in the frame.</w:t>
+      </w:r>
+    </w:p>
+    <w:p>
+      <w:pPr>
+        <w:pStyle w:val="Heading2"/>
+        <w:keepNext/>
+        <w:spacing w:after="60" w:before="260"/>
+      </w:pPr>
+      <w:r>
+        <w:rPr>
+          <w:rFonts w:ascii="Arial" w:cs="Arial" w:eastAsia="Arial" w:hAnsi="Arial"/>
+          <w:b/>
+          <w:bCs/>
+          <w:sz w:val="26"/>
+          <w:szCs w:val="26"/>
+        </w:rPr>
+        <w:t xml:space="preserve">SHOT 07 — Bride reveal</w:t>
+      </w:r>
+    </w:p>
+    <w:p>
+      <w:pPr>
+        <w:keepNext/>
+        <w:spacing w:after="60" w:before="0"/>
+      </w:pPr>
+      <w:r>
+        <w:rPr>
+          <w:rFonts w:ascii="Arial" w:cs="Arial" w:eastAsia="Arial" w:hAnsi="Arial"/>
+          <w:b/>
+          <w:bCs/>
+          <w:sz w:val="21"/>
+          <w:szCs w:val="21"/>
+        </w:rPr>
+        <w:t xml:space="preserve">Attach: </w:t>
+      </w:r>
+      <w:r>
+        <w:rPr>
+          <w:rFonts w:ascii="Arial" w:cs="Arial" w:eastAsia="Arial" w:hAnsi="Arial"/>
+          <w:sz w:val="21"/>
+          <w:szCs w:val="21"/>
+        </w:rPr>
+        <w:t xml:space="preserve">02_Bride.jpg, 10_Noble_House_Wedding_Location.jpg</w:t>
+      </w:r>
+      <w:r>
+        <w:rPr>
+          <w:rFonts w:ascii="Arial" w:cs="Arial" w:eastAsia="Arial" w:hAnsi="Arial"/>
+          <w:b/>
+          <w:bCs/>
+          <w:sz w:val="21"/>
+          <w:szCs w:val="21"/>
+        </w:rPr>
+        <w:t xml:space="preserve">      Duration: </w:t>
+      </w:r>
+      <w:r>
+        <w:rPr>
+          <w:rFonts w:ascii="Arial" w:cs="Arial" w:eastAsia="Arial" w:hAnsi="Arial"/>
+          <w:sz w:val="21"/>
+          <w:szCs w:val="21"/>
+        </w:rPr>
+        <w:t xml:space="preserve">8 sec</w:t>
+      </w:r>
+    </w:p>
+    <w:p>
+      <w:pPr>
+        <w:shd w:fill="F2F2F2" w:val="clear"/>
+        <w:spacing w:after="80"/>
+      </w:pPr>
+      <w:r>
+        <w:rPr>
+          <w:rFonts w:ascii="Arial" w:cs="Arial" w:eastAsia="Arial" w:hAnsi="Arial"/>
+          <w:sz w:val="20"/>
+          <w:szCs w:val="20"/>
+        </w:rPr>
+        <w:t xml:space="preserve">VOICE RULE: only the voice-over narration speaks words; it is a voice only, never a person or character on screen. No character says any word and no one on screen lip-syncs to speech; characters communicate with facial expressions and body gestures. Natural non-verbal sounds are allowed and should sound real: laughing, giggling, gasping, sighing, groaning, cheering, coughing. 2D hand-drawn Stickman animation, clean thin black outlines, large expressive heads, simple readable stickman proportions, flat warm colors, playful cinematic documentary-comedy tone, 16:9. Use the selected reference images as strict continuity anchors: preserve faces, hair, clothing, colors, proportions and accessories exactly; every character keeps a full body with a visible chest and torso exactly as in the references. Setting: a shaded sandstone alcove beside the wedding courtyard, painted columns, warm daylight. Lighting: warm bright afternoon sunlight, soft shadows, rich saturated colors. ACTION TIMELINE (8 seconds): 0–2.5 s: the bride adjusts her gold headband with the red gem in front of a bronze mirror. 2.5–5.5 s: she touches the corner of her dark eye makeup with a fingertip, tilting her head. 5.5–8 s: she looks herself in the eye, gives a calm confident nod and a small smile, and holds. Camera: eye-level medium shot of the bride at the mirror; fixed except for an almost imperceptible 5% slow push-in, no tilt or pan. Audio: voice-over narration only (a voice, never shown on screen; no narrator character appears): a British male voice, warm and dry, begins speaking within half a second and says: “His bride had been ready for an hour. She was the calm one.” The line takes about 5.2 seconds; leave the last second free of speech so the moment can land. Music: light ancient-Mediterranean wedding music (frame drums, reed flute, plucked strings), same theme in every clip, low under the voice. Sound effects: soft jewelry jingle, timed to the action. Ambience: light courtyard ambience: clinking cups, footsteps on stone, a soft breeze, no words. Final reminder: no character says any word; only the voice-over narration speaks (voice only, nobody on screen is the narrator). Natural laughs, gasps and sighs are fine. No text, captions or logos in the frame.</w:t>
+      </w:r>
+    </w:p>
+    <w:p>
+      <w:pPr>
+        <w:pStyle w:val="Heading2"/>
+        <w:keepNext/>
+        <w:spacing w:after="60" w:before="260"/>
+      </w:pPr>
+      <w:r>
+        <w:rPr>
+          <w:rFonts w:ascii="Arial" w:cs="Arial" w:eastAsia="Arial" w:hAnsi="Arial"/>
+          <w:b/>
+          <w:bCs/>
+          <w:sz w:val="26"/>
+          <w:szCs w:val="26"/>
+        </w:rPr>
+        <w:t xml:space="preserve">SHOT 08 — Marriage contract</w:t>
+      </w:r>
+    </w:p>
+    <w:p>
+      <w:pPr>
+        <w:keepNext/>
+        <w:spacing w:after="60" w:before="0"/>
+      </w:pPr>
+      <w:r>
+        <w:rPr>
+          <w:rFonts w:ascii="Arial" w:cs="Arial" w:eastAsia="Arial" w:hAnsi="Arial"/>
+          <w:b/>
+          <w:bCs/>
+          <w:sz w:val="21"/>
+          <w:szCs w:val="21"/>
+        </w:rPr>
+        <w:t xml:space="preserve">Attach: </w:t>
+      </w:r>
+      <w:r>
+        <w:rPr>
+          <w:rFonts w:ascii="Arial" w:cs="Arial" w:eastAsia="Arial" w:hAnsi="Arial"/>
+          <w:sz w:val="21"/>
+          <w:szCs w:val="21"/>
+        </w:rPr>
+        <w:t xml:space="preserve">02_Bride.jpg, 04_Parents_and_Relatives.jpg, 10_Noble_House_Wedding_Location.jpg</w:t>
+      </w:r>
+      <w:r>
+        <w:rPr>
+          <w:rFonts w:ascii="Arial" w:cs="Arial" w:eastAsia="Arial" w:hAnsi="Arial"/>
+          <w:b/>
+          <w:bCs/>
+          <w:sz w:val="21"/>
+          <w:szCs w:val="21"/>
+        </w:rPr>
+        <w:t xml:space="preserve">      Duration: </w:t>
+      </w:r>
+      <w:r>
+        <w:rPr>
+          <w:rFonts w:ascii="Arial" w:cs="Arial" w:eastAsia="Arial" w:hAnsi="Arial"/>
+          <w:sz w:val="21"/>
+          <w:szCs w:val="21"/>
+        </w:rPr>
+        <w:t xml:space="preserve">8 sec</w:t>
+      </w:r>
+    </w:p>
+    <w:p>
+      <w:pPr>
+        <w:shd w:fill="F2F2F2" w:val="clear"/>
+        <w:spacing w:after="80"/>
+      </w:pPr>
+      <w:r>
+        <w:rPr>
+          <w:rFonts w:ascii="Arial" w:cs="Arial" w:eastAsia="Arial" w:hAnsi="Arial"/>
+          <w:sz w:val="20"/>
+          <w:szCs w:val="20"/>
+        </w:rPr>
+        <w:t xml:space="preserve">VOICE RULE: only the voice-over narration speaks words; it is a voice only, never a person or character on screen. No character says any word and no one on screen lip-syncs to speech; characters communicate with facial expressions and body gestures. Natural non-verbal sounds are allowed and should sound real: laughing, giggling, gasping, sighing, groaning, cheering, coughing. 2D hand-drawn Stickman animation, clean thin black outlines, large expressive heads, simple readable stickman proportions, flat warm colors, playful cinematic documentary-comedy tone, 16:9. Use the selected reference images as strict continuity anchors: preserve faces, hair, clothing, colors, proportions and accessories exactly; every character keeps a full body with a visible chest and torso exactly as in the references. Setting: a shaded sandstone alcove beside the wedding courtyard, painted columns, warm daylight. Lighting: warm bright afternoon sunlight, soft shadows, rich saturated colors. ACTION TIMELINE (8 seconds): 0–2.5 s: a scribe sitting behind a low table unrolls a papyrus with careful hands; the bride stands at the right and her bearded father stands behind her, arms folded. 2.5–5.5 s: the bride leans in and points at one line with a finger while her father nods gravely. 5.5–8 s: the bride straightens up with a small satisfied smile and her father allows himself a tiny proud nod. Camera: locked-off and perfectly still, eye-level medium two-shot: the scribe, the papyrus and the bride all in the same frame; the framing never changes (no tilt, pan, zoom or rising camera). Audio: voice-over narration only (a voice, never shown on screen; no narrator character appears): a British male voice, warm and dry, begins speaking within half a second and says: “Then, paperwork. Real contracts survive: property, money, who owes what. Romance, with receipts.” The line takes about 5.2 seconds; leave the last second free of speech so the moment can land. Music: light ancient-Mediterranean wedding music (frame drums, reed flute, plucked strings), same theme in every clip, low under the voice. Sound effects: papyrus rustle, quill scratching, timed to the action. Ambience: light courtyard ambience: clinking cups, footsteps on stone, a soft breeze, no words. Final reminder: no character says any word; only the voice-over narration speaks (voice only, nobody on screen is the narrator). Natural laughs, gasps and sighs are fine. No text, captions or logos in the frame.</w:t>
+      </w:r>
+    </w:p>
+    <w:p>
+      <w:pPr>
+        <w:pStyle w:val="Heading2"/>
+        <w:keepNext/>
+        <w:spacing w:after="60" w:before="260"/>
+      </w:pPr>
+      <w:r>
+        <w:rPr>
+          <w:rFonts w:ascii="Arial" w:cs="Arial" w:eastAsia="Arial" w:hAnsi="Arial"/>
+          <w:b/>
+          <w:bCs/>
+          <w:sz w:val="26"/>
+          <w:szCs w:val="26"/>
+        </w:rPr>
+        <w:t xml:space="preserve">SHOT 09 — The feast</w:t>
+      </w:r>
+    </w:p>
+    <w:p>
+      <w:pPr>
+        <w:keepNext/>
+        <w:spacing w:after="60" w:before="0"/>
+      </w:pPr>
+      <w:r>
+        <w:rPr>
+          <w:rFonts w:ascii="Arial" w:cs="Arial" w:eastAsia="Arial" w:hAnsi="Arial"/>
+          <w:b/>
+          <w:bCs/>
+          <w:sz w:val="21"/>
+          <w:szCs w:val="21"/>
+        </w:rPr>
+        <w:t xml:space="preserve">Attach: </w:t>
+      </w:r>
+      <w:r>
+        <w:rPr>
+          <w:rFonts w:ascii="Arial" w:cs="Arial" w:eastAsia="Arial" w:hAnsi="Arial"/>
+          <w:sz w:val="21"/>
+          <w:szCs w:val="21"/>
+        </w:rPr>
+        <w:t xml:space="preserve">03_Egyptian_Guests.jpg, 11_Wedding_Courtyard_Day.jpg, 12_Interior_Feast_Night.jpg</w:t>
+      </w:r>
+      <w:r>
+        <w:rPr>
+          <w:rFonts w:ascii="Arial" w:cs="Arial" w:eastAsia="Arial" w:hAnsi="Arial"/>
+          <w:b/>
+          <w:bCs/>
+          <w:sz w:val="21"/>
+          <w:szCs w:val="21"/>
+        </w:rPr>
+        <w:t xml:space="preserve">      Duration: </w:t>
+      </w:r>
+      <w:r>
+        <w:rPr>
+          <w:rFonts w:ascii="Arial" w:cs="Arial" w:eastAsia="Arial" w:hAnsi="Arial"/>
+          <w:sz w:val="21"/>
+          <w:szCs w:val="21"/>
+        </w:rPr>
+        <w:t xml:space="preserve">8 sec</w:t>
+      </w:r>
+    </w:p>
+    <w:p>
+      <w:pPr>
+        <w:shd w:fill="F2F2F2" w:val="clear"/>
+        <w:spacing w:after="80"/>
+      </w:pPr>
+      <w:r>
+        <w:rPr>
+          <w:rFonts w:ascii="Arial" w:cs="Arial" w:eastAsia="Arial" w:hAnsi="Arial"/>
+          <w:sz w:val="20"/>
+          <w:szCs w:val="20"/>
+        </w:rPr>
+        <w:t xml:space="preserve">VOICE RULE: only the voice-over narration speaks words; it is a voice only, never a person or character on screen. No character says any word and no one on screen lip-syncs to speech; characters communicate with facial expressions and body gestures. Natural non-verbal sounds are allowed and should sound real: laughing, giggling, gasping, sighing, groaning, cheering, coughing. 2D hand-drawn Stickman animation, clean thin black outlines, large expressive heads, simple readable stickman proportions, flat warm colors, playful cinematic documentary-comedy tone, 16:9. Use the selected reference images as strict continuity anchors: preserve faces, hair, clothing, colors, proportions and accessories exactly; every character keeps a full body with a visible chest and torso exactly as in the references. Setting: the wedding courtyard exactly as in the selected reference image: ancient Egyptian architecture only, sunny daytime. Lighting: warm bright afternoon sunlight, soft shadows, rich saturated colors. ACTION TIMELINE (8 seconds): 0–2.5 s: guests seated on both sides of the long table eat happily and pass bowls of figs, dates and flatbread. 2.5–5.5 s: at the far end one guest tiptoes up, grabs a fig and hides it behind his back with an innocent face. 5.5–8 s: an unimpressed older woman beside him turns, crosses her arms and gives him a flat stare; he freezes with wide eyes. Camera: locked-off and perfectly still, eye-level wide-medium shot of the whole feast table; the sneaky guest stays in frame; the framing never changes (no tilt, pan, zoom or rising camera). Audio: voice-over narration only (a voice, never shown on screen; no narrator character appears): a British male voice, warm and dry, begins speaking within half a second and says: “Bread, figs, roast goose, and beer, basically a food group. Someone was stealing.” The line takes about 5.2 seconds; leave the last second free of speech so the moment can land. Music: light ancient-Mediterranean wedding music (frame drums, reed flute, plucked strings), same theme in every clip, low under the voice. Sound effects: plates, cups, cheerful ambience, no words, timed to the action. Ambience: light courtyard ambience: clinking cups, footsteps on stone, a soft breeze, no words. Final reminder: no character says any word; only the voice-over narration speaks (voice only, nobody on screen is the narrator). Natural laughs, gasps and sighs are fine. No text, captions or logos in the frame.</w:t>
+      </w:r>
+    </w:p>
+    <w:p>
+      <w:pPr>
+        <w:pStyle w:val="Heading2"/>
+        <w:keepNext/>
+        <w:spacing w:after="60" w:before="260"/>
+      </w:pPr>
+      <w:r>
+        <w:rPr>
+          <w:rFonts w:ascii="Arial" w:cs="Arial" w:eastAsia="Arial" w:hAnsi="Arial"/>
+          <w:b/>
+          <w:bCs/>
+          <w:sz w:val="26"/>
+          <w:szCs w:val="26"/>
+        </w:rPr>
+        <w:t xml:space="preserve">SHOT 10 — The cat</w:t>
+      </w:r>
+    </w:p>
+    <w:p>
+      <w:pPr>
+        <w:keepNext/>
+        <w:spacing w:after="60" w:before="0"/>
+      </w:pPr>
+      <w:r>
+        <w:rPr>
+          <w:rFonts w:ascii="Arial" w:cs="Arial" w:eastAsia="Arial" w:hAnsi="Arial"/>
+          <w:b/>
+          <w:bCs/>
+          <w:sz w:val="21"/>
+          <w:szCs w:val="21"/>
+        </w:rPr>
+        <w:t xml:space="preserve">Attach: </w:t>
+      </w:r>
+      <w:r>
+        <w:rPr>
+          <w:rFonts w:ascii="Arial" w:cs="Arial" w:eastAsia="Arial" w:hAnsi="Arial"/>
+          <w:sz w:val="21"/>
+          <w:szCs w:val="21"/>
+        </w:rPr>
+        <w:t xml:space="preserve">07_Animals.jpg, 11_Wedding_Courtyard_Day.jpg</w:t>
+      </w:r>
+      <w:r>
+        <w:rPr>
+          <w:rFonts w:ascii="Arial" w:cs="Arial" w:eastAsia="Arial" w:hAnsi="Arial"/>
+          <w:b/>
+          <w:bCs/>
+          <w:sz w:val="21"/>
+          <w:szCs w:val="21"/>
+        </w:rPr>
+        <w:t xml:space="preserve">      Duration: </w:t>
+      </w:r>
+      <w:r>
+        <w:rPr>
+          <w:rFonts w:ascii="Arial" w:cs="Arial" w:eastAsia="Arial" w:hAnsi="Arial"/>
+          <w:sz w:val="21"/>
+          <w:szCs w:val="21"/>
+        </w:rPr>
+        <w:t xml:space="preserve">8 sec</w:t>
+      </w:r>
+    </w:p>
+    <w:p>
+      <w:pPr>
+        <w:shd w:fill="F2F2F2" w:val="clear"/>
+        <w:spacing w:after="80"/>
+      </w:pPr>
+      <w:r>
+        <w:rPr>
+          <w:rFonts w:ascii="Arial" w:cs="Arial" w:eastAsia="Arial" w:hAnsi="Arial"/>
+          <w:sz w:val="20"/>
+          <w:szCs w:val="20"/>
+        </w:rPr>
+        <w:t xml:space="preserve">VOICE RULE: only the voice-over narration speaks words; it is a voice only, never a person or character on screen. No character says any word and no one on screen lip-syncs to speech; characters communicate with facial expressions and body gestures. Natural non-verbal sounds are allowed and should sound real: laughing, giggling, gasping, sighing, groaning, cheering, coughing. 2D hand-drawn Stickman animation, clean thin black outlines, large expressive heads, simple readable stickman proportions, flat warm colors, playful cinematic documentary-comedy tone, 16:9. Use the selected reference images as strict continuity anchors: preserve faces, hair, clothing, colors, proportions and accessories exactly; every character keeps a full body with a visible chest and torso exactly as in the references. Setting: the wedding courtyard exactly as in the selected reference image: ancient Egyptian architecture only, sunny daytime. Lighting: warm bright afternoon sunlight, soft shadows, rich saturated colors. ACTION TIMELINE (8 seconds): 0–2.5 s: the black cat sits upright on a red cushion at the head of the feast table, tail curled, gold collar glinting. 2.5–5.5 s: a guest approaches and bows deeply, almost to the floor, with great ceremony. 5.5–8 s: the cat looks away, lifts a paw and licks it; the guest stays bowed, then peeks up hopefully. Camera: locked-off and perfectly still, eye-level medium shot with the cat and the bowing guest both in frame; the framing never changes (no tilt, pan, zoom or rising camera). Audio: voice-over narration only (a voice, never shown on screen; no narrator character appears): a British male voice, warm and dry, begins speaking within half a second and says: “Egyptians adored cats. This one knew it. A guest bowed. The cat shrugged.” The line takes about 5.2 seconds; leave the last second free of speech so the moment can land. Music: playful comic percussion over the wedding rhythm, low under the voice. Sound effects: tiny comic sting, soft cat purr, timed to the action. Ambience: light courtyard ambience: clinking cups, footsteps on stone, a soft breeze, no words. Final reminder: no character says any word; only the voice-over narration speaks (voice only, nobody on screen is the narrator). Natural laughs, gasps and sighs are fine. No text, captions or logos in the frame.</w:t>
+      </w:r>
+    </w:p>
+    <w:p>
+      <w:pPr>
+        <w:pStyle w:val="Heading2"/>
+        <w:keepNext/>
+        <w:spacing w:after="60" w:before="260"/>
+      </w:pPr>
+      <w:r>
+        <w:rPr>
+          <w:rFonts w:ascii="Arial" w:cs="Arial" w:eastAsia="Arial" w:hAnsi="Arial"/>
+          <w:b/>
+          <w:bCs/>
+          <w:sz w:val="26"/>
+          <w:szCs w:val="26"/>
+        </w:rPr>
+        <w:t xml:space="preserve">SHOT 12 — Senbi's confidence</w:t>
+      </w:r>
+    </w:p>
+    <w:p>
+      <w:pPr>
+        <w:keepNext/>
+        <w:spacing w:after="60" w:before="0"/>
+      </w:pPr>
+      <w:r>
+        <w:rPr>
+          <w:rFonts w:ascii="Arial" w:cs="Arial" w:eastAsia="Arial" w:hAnsi="Arial"/>
+          <w:b/>
+          <w:bCs/>
+          <w:sz w:val="21"/>
+          <w:szCs w:val="21"/>
+        </w:rPr>
+        <w:t xml:space="preserve">Attach: </w:t>
+      </w:r>
+      <w:r>
+        <w:rPr>
+          <w:rFonts w:ascii="Arial" w:cs="Arial" w:eastAsia="Arial" w:hAnsi="Arial"/>
+          <w:sz w:val="21"/>
+          <w:szCs w:val="21"/>
+        </w:rPr>
+        <w:t xml:space="preserve">01_Senbi.jpg, 11_Wedding_Courtyard_Day.jpg</w:t>
+      </w:r>
+      <w:r>
+        <w:rPr>
+          <w:rFonts w:ascii="Arial" w:cs="Arial" w:eastAsia="Arial" w:hAnsi="Arial"/>
+          <w:b/>
+          <w:bCs/>
+          <w:sz w:val="21"/>
+          <w:szCs w:val="21"/>
+        </w:rPr>
+        <w:t xml:space="preserve">      Duration: </w:t>
+      </w:r>
+      <w:r>
+        <w:rPr>
+          <w:rFonts w:ascii="Arial" w:cs="Arial" w:eastAsia="Arial" w:hAnsi="Arial"/>
+          <w:sz w:val="21"/>
+          <w:szCs w:val="21"/>
+        </w:rPr>
+        <w:t xml:space="preserve">8 sec</w:t>
+      </w:r>
+    </w:p>
+    <w:p>
+      <w:pPr>
+        <w:shd w:fill="F2F2F2" w:val="clear"/>
+        <w:spacing w:after="80"/>
+      </w:pPr>
+      <w:r>
+        <w:rPr>
+          <w:rFonts w:ascii="Arial" w:cs="Arial" w:eastAsia="Arial" w:hAnsi="Arial"/>
+          <w:sz w:val="20"/>
+          <w:szCs w:val="20"/>
+        </w:rPr>
+        <w:t xml:space="preserve">VOICE RULE: only the voice-over narration speaks words; it is a voice only, never a person or character on screen. No character says any word and no one on screen lip-syncs to speech; characters communicate with facial expressions and body gestures. Natural non-verbal sounds are allowed and should sound real: laughing, giggling, gasping, sighing, groaning, cheering, coughing. 2D hand-drawn Stickman animation, clean thin black outlines, large expressive heads, simple readable stickman proportions, flat warm colors, playful cinematic documentary-comedy tone, 16:9. Use the selected reference images as strict continuity anchors: preserve faces, hair, clothing, colors, proportions and accessories exactly; every character keeps a full body with a visible chest and torso exactly as in the references. Setting: the wedding courtyard exactly as in the selected reference image: ancient Egyptian architecture only, sunny daytime. Lighting: warm bright afternoon sunlight, soft shadows, rich saturated colors. ACTION TIMELINE (8 seconds): 0–2.5 s: Senbi dances with huge confidence, big arm swings, chin up. 2.5–5.5 s: he loses his balance, arms windmilling, one foot wobbling. 5.5–8 s: he snaps upright and freezes in a proud pose with one arm raised as if the stumble was choreography; his eyes slide sideways to check whether anyone saw. Camera: locked-off and perfectly still, eye-level medium shot of Senbi, full body in frame; the framing never changes (no tilt, pan, zoom or rising camera). Audio: voice-over narration only (a voice, never shown on screen; no narrator character appears): a British male voice, warm and dry, begins speaking within half a second and says: “Senbi nearly fell, recovered, and pretended that was the choreography. Nobody believed him.” The line takes about 5.2 seconds; leave the last second free of speech so the moment can land. Music: playful comic percussion over the wedding rhythm, low under the voice. Sound effects: foot scuff, comic wobble, laughter, timed to the action. Ambience: light courtyard ambience: clinking cups, footsteps on stone, a soft breeze, no words. Final reminder: no character says any word; only the voice-over narration speaks (voice only, nobody on screen is the narrator). Natural laughs, gasps and sighs are fine. No text, captions or logos in the frame.</w:t>
+      </w:r>
+    </w:p>
+    <w:p>
+      <w:pPr>
+        <w:pStyle w:val="Heading2"/>
+        <w:keepNext/>
+        <w:spacing w:after="60" w:before="260"/>
+      </w:pPr>
+      <w:r>
+        <w:rPr>
+          <w:rFonts w:ascii="Arial" w:cs="Arial" w:eastAsia="Arial" w:hAnsi="Arial"/>
+          <w:b/>
+          <w:bCs/>
+          <w:sz w:val="26"/>
+          <w:szCs w:val="26"/>
+        </w:rPr>
+        <w:t xml:space="preserve">SHOT 13 — Bride reaction</w:t>
+      </w:r>
+    </w:p>
+    <w:p>
+      <w:pPr>
+        <w:keepNext/>
+        <w:spacing w:after="60" w:before="0"/>
+      </w:pPr>
+      <w:r>
+        <w:rPr>
+          <w:rFonts w:ascii="Arial" w:cs="Arial" w:eastAsia="Arial" w:hAnsi="Arial"/>
+          <w:b/>
+          <w:bCs/>
+          <w:sz w:val="21"/>
+          <w:szCs w:val="21"/>
+        </w:rPr>
+        <w:t xml:space="preserve">Attach: </w:t>
+      </w:r>
+      <w:r>
+        <w:rPr>
+          <w:rFonts w:ascii="Arial" w:cs="Arial" w:eastAsia="Arial" w:hAnsi="Arial"/>
+          <w:sz w:val="21"/>
+          <w:szCs w:val="21"/>
+        </w:rPr>
+        <w:t xml:space="preserve">02_Bride.jpg, 11_Wedding_Courtyard_Day.jpg</w:t>
+      </w:r>
+      <w:r>
+        <w:rPr>
+          <w:rFonts w:ascii="Arial" w:cs="Arial" w:eastAsia="Arial" w:hAnsi="Arial"/>
+          <w:b/>
+          <w:bCs/>
+          <w:sz w:val="21"/>
+          <w:szCs w:val="21"/>
+        </w:rPr>
+        <w:t xml:space="preserve">      Duration: </w:t>
+      </w:r>
+      <w:r>
+        <w:rPr>
+          <w:rFonts w:ascii="Arial" w:cs="Arial" w:eastAsia="Arial" w:hAnsi="Arial"/>
+          <w:sz w:val="21"/>
+          <w:szCs w:val="21"/>
+        </w:rPr>
+        <w:t xml:space="preserve">8 sec</w:t>
+      </w:r>
+    </w:p>
+    <w:p>
+      <w:pPr>
+        <w:shd w:fill="F2F2F2" w:val="clear"/>
+        <w:spacing w:after="80"/>
+      </w:pPr>
+      <w:r>
+        <w:rPr>
+          <w:rFonts w:ascii="Arial" w:cs="Arial" w:eastAsia="Arial" w:hAnsi="Arial"/>
+          <w:sz w:val="20"/>
+          <w:szCs w:val="20"/>
+        </w:rPr>
+        <w:t xml:space="preserve">VOICE RULE: only the voice-over narration speaks words; it is a voice only, never a person or character on screen. No character says any word and no one on screen lip-syncs to speech; characters communicate with facial expressions and body gestures. Natural non-verbal sounds are allowed and should sound real: laughing, giggling, gasping, sighing, groaning, cheering, coughing. 2D hand-drawn Stickman animation, clean thin black outlines, large expressive heads, simple readable stickman proportions, flat warm colors, playful cinematic documentary-comedy tone, 16:9. Use the selected reference images as strict continuity anchors: preserve faces, hair, clothing, colors, proportions and accessories exactly; every character keeps a full body with a visible chest and torso exactly as in the references. Setting: the wedding courtyard exactly as in the selected reference image: ancient Egyptian architecture only, sunny daytime. Lighting: warm bright afternoon sunlight, soft shadows, rich saturated colors. ACTION TIMELINE (8 seconds): 0–2.5 s: the bride watches, amused, with sparkling eyes. 2.5–5.5 s: she presses her lips together to look composed while her shoulders start to shake. 5.5–8 s: she raises a hand and hides her smile behind it, eyes crinkled, and a small suppressed giggle escapes. Camera: locked-off and perfectly still, eye-level close-up of the bride's face; the framing never changes (no tilt, pan, zoom or rising camera). Audio: voice-over narration only (a voice, never shown on screen; no narrator character appears): a British male voice, warm and dry, begins speaking within half a second and says: “His bride was trying very hard not to laugh. She loved him. Mostly.” The line takes about 5.2 seconds; leave the last second free of speech so the moment can land. Music: light ancient-Mediterranean wedding music (frame drums, reed flute, plucked strings), same theme in every clip, low under the voice. Sound effects: suppressed giggle, timed to the action. Ambience: light courtyard ambience: clinking cups, footsteps on stone, a soft breeze, no words. Final reminder: no character says any word; only the voice-over narration speaks (voice only, nobody on screen is the narrator). Natural laughs, gasps and sighs are fine. No text, captions or logos in the frame.</w:t>
+      </w:r>
+    </w:p>
+    <w:p>
+      <w:pPr>
+        <w:pStyle w:val="Heading2"/>
+        <w:keepNext/>
+        <w:spacing w:after="60" w:before="260"/>
+      </w:pPr>
+      <w:r>
+        <w:rPr>
+          <w:rFonts w:ascii="Arial" w:cs="Arial" w:eastAsia="Arial" w:hAnsi="Arial"/>
+          <w:b/>
+          <w:bCs/>
+          <w:sz w:val="26"/>
+          <w:szCs w:val="26"/>
+        </w:rPr>
+        <w:t xml:space="preserve">SHOT 15 — Food judge   (optional)</w:t>
       </w:r>
     </w:p>
     <w:p>
@@ -497,7 +1439,7 @@
           <w:sz w:val="19"/>
           <w:szCs w:val="19"/>
         </w:rPr>
-        <w:t xml:space="preserve">Two ways to generate Shot 1. OPTION A (best): Frames to Video with Shot1_first_frame.png as the START frame, using the short prompt A below: the image carries the look, the prompt only adds motion and sound. OPTION B: if you can only attach reference images, attach Senbi_from_Shot1.png, Bride_from_Shot1.png and Courtyard_from_Shot1.png and use the long prompt B.</w:t>
+        <w:t xml:space="preserve">Optional: skip this shot to make the video faster.</w:t>
       </w:r>
     </w:p>
     <w:p>
@@ -521,7 +1463,7 @@
           <w:sz w:val="21"/>
           <w:szCs w:val="21"/>
         </w:rPr>
-        <w:t xml:space="preserve">Shot1_first_frame.png</w:t>
+        <w:t xml:space="preserve">03_Egyptian_Guests.jpg, 11_Wedding_Courtyard_Day.jpg</w:t>
       </w:r>
       <w:r>
         <w:rPr>
@@ -540,22 +1482,6 @@
           <w:szCs w:val="21"/>
         </w:rPr>
         <w:t xml:space="preserve">8 sec</w:t>
-      </w:r>
-    </w:p>
-    <w:p>
-      <w:pPr>
-        <w:keepNext/>
-        <w:spacing w:after="40" w:before="120"/>
-      </w:pPr>
-      <w:r>
-        <w:rPr>
-          <w:rFonts w:ascii="Arial" w:cs="Arial" w:eastAsia="Arial" w:hAnsi="Arial"/>
-          <w:b/>
-          <w:bCs/>
-          <w:sz w:val="21"/>
-          <w:szCs w:val="21"/>
-        </w:rPr>
-        <w:t xml:space="preserve">PROMPT A (Frames to Video, start frame attached) — copy all:</w:t>
       </w:r>
     </w:p>
     <w:p>
@@ -569,23 +1495,66 @@
           <w:sz w:val="20"/>
           <w:szCs w:val="20"/>
         </w:rPr>
-        <w:t xml:space="preserve">VOICE RULE: only the voice-over narration speaks words; it is a voice only, never a person on screen. No character says any word and no one lip-syncs; natural laughs, gasps and sighs are allowed and should sound real. Keep the starting image exactly as it is: the same two dancers, the same Egyptian courtyard and the same row of dark armored figures standing in the open gate. Do not redraw, restyle or change anything in the scene; only animate it. ACTION TIMELINE (8 seconds): 0–2.5 s: the couple dance joyfully, fists pumping, eyes closed, big laughing smiles; guests at the tables clap, one beats a frame drum; the dark figures in the gate stand perfectly still. 2.5–5.5 s: the dance continues, the couple's joy growing. 5.5–8 s: the camera drifts slightly closer to a medium close-up of the laughing couple while the figures stay still behind them. Camera: one slow, smooth push-in; no tilt, no pan, no rising camera. Audio: voice-over narration only (a voice, never shown on screen): a British male voice, warm and dry, begins speaking within half a second and says: “Senbi had planned everything for his wedding. Everything except the Roman army.” Say the first sentence warmly, pause briefly, then say the second sentence dryly and deadpan. The line takes about 5.2 seconds; leave the last second free of speech. Music: light ancient-Mediterranean wedding music (frame drums, reed flute, plucked strings), cheerful, low under the voice. Sound effects: clapping, cups clinking, cheers without words, timed to the action. Ambience: light courtyard ambience, no words. Final reminder: no character says any word; only the voice-over narration speaks (voice only, nobody on screen is the narrator). Natural laughs, gasps and sighs are fine. No text, captions or logos in the frame.</w:t>
-      </w:r>
-    </w:p>
-    <w:p>
-      <w:pPr>
-        <w:keepNext/>
-        <w:spacing w:after="40" w:before="120"/>
-      </w:pPr>
-      <w:r>
-        <w:rPr>
-          <w:rFonts w:ascii="Arial" w:cs="Arial" w:eastAsia="Arial" w:hAnsi="Arial"/>
-          <w:b/>
-          <w:bCs/>
-          <w:sz w:val="21"/>
-          <w:szCs w:val="21"/>
-        </w:rPr>
-        <w:t xml:space="preserve">PROMPT B (reference images only) — copy all:</w:t>
+        <w:t xml:space="preserve">VOICE RULE: only the voice-over narration speaks words; it is a voice only, never a person or character on screen. No character says any word and no one on screen lip-syncs to speech; characters communicate with facial expressions and body gestures. Natural non-verbal sounds are allowed and should sound real: laughing, giggling, gasping, sighing, groaning, cheering, coughing. 2D hand-drawn Stickman animation, clean thin black outlines, large expressive heads, simple readable stickman proportions, flat warm colors, playful cinematic documentary-comedy tone, 16:9. Use the selected reference images as strict continuity anchors: preserve faces, hair, clothing, colors, proportions and accessories exactly; every character keeps a full body with a visible chest and torso exactly as in the references. Setting: the wedding courtyard exactly as in the selected reference image: ancient Egyptian architecture only, sunny daytime. Lighting: warm bright afternoon sunlight, soft shadows, rich saturated colors. ACTION TIMELINE (8 seconds): 0–2.5 s: an older woman at the feast table lifts a spoonful from a dish and inspects it with exaggerated seriousness, squinting. 2.5–5.5 s: she tastes it and chews slowly, eyes narrowed. 5.5–8 s: after a long pause she gives a reluctant nod, lips pursed, as if grudgingly approving. Camera: locked-off and perfectly still, eye-level close-up of the woman's face and the dish; the framing never changes (no tilt, pan, zoom or rising camera). Audio: voice-over narration only (a voice, never shown on screen; no narrator character appears): a British male voice, warm and dry, begins speaking within half a second and says: “One aunt inspected the food like a tax auditor. Verdict: suspicious, but edible.” The line takes about 5.2 seconds; leave the last second free of speech so the moment can land. Music: playful comic percussion over the wedding rhythm, low under the voice. Sound effects: spoon tapping a bowl, suspicious hum, timed to the action. Ambience: light courtyard ambience: clinking cups, footsteps on stone, a soft breeze, no words. Final reminder: no character says any word; only the voice-over narration speaks (voice only, nobody on screen is the narrator). Natural laughs, gasps and sighs are fine. No text, captions or logos in the frame.</w:t>
+      </w:r>
+    </w:p>
+    <w:p>
+      <w:pPr>
+        <w:pStyle w:val="Heading2"/>
+        <w:keepNext/>
+        <w:spacing w:after="60" w:before="260"/>
+      </w:pPr>
+      <w:r>
+        <w:rPr>
+          <w:rFonts w:ascii="Arial" w:cs="Arial" w:eastAsia="Arial" w:hAnsi="Arial"/>
+          <w:b/>
+          <w:bCs/>
+          <w:sz w:val="26"/>
+          <w:szCs w:val="26"/>
+        </w:rPr>
+        <w:t xml:space="preserve">SHOT 16 — Headrest gift</w:t>
+      </w:r>
+    </w:p>
+    <w:p>
+      <w:pPr>
+        <w:keepNext/>
+        <w:spacing w:after="60" w:before="0"/>
+      </w:pPr>
+      <w:r>
+        <w:rPr>
+          <w:rFonts w:ascii="Arial" w:cs="Arial" w:eastAsia="Arial" w:hAnsi="Arial"/>
+          <w:b/>
+          <w:bCs/>
+          <w:sz w:val="21"/>
+          <w:szCs w:val="21"/>
+        </w:rPr>
+        <w:t xml:space="preserve">Attach: </w:t>
+      </w:r>
+      <w:r>
+        <w:rPr>
+          <w:rFonts w:ascii="Arial" w:cs="Arial" w:eastAsia="Arial" w:hAnsi="Arial"/>
+          <w:sz w:val="21"/>
+          <w:szCs w:val="21"/>
+        </w:rPr>
+        <w:t xml:space="preserve">01_Senbi.jpg, 04_Parents_and_Relatives.jpg, 11_Wedding_Courtyard_Day.jpg</w:t>
+      </w:r>
+      <w:r>
+        <w:rPr>
+          <w:rFonts w:ascii="Arial" w:cs="Arial" w:eastAsia="Arial" w:hAnsi="Arial"/>
+          <w:b/>
+          <w:bCs/>
+          <w:sz w:val="21"/>
+          <w:szCs w:val="21"/>
+        </w:rPr>
+        <w:t xml:space="preserve">      Duration: </w:t>
+      </w:r>
+      <w:r>
+        <w:rPr>
+          <w:rFonts w:ascii="Arial" w:cs="Arial" w:eastAsia="Arial" w:hAnsi="Arial"/>
+          <w:sz w:val="21"/>
+          <w:szCs w:val="21"/>
+        </w:rPr>
+        <w:t xml:space="preserve">8 sec</w:t>
       </w:r>
     </w:p>
     <w:p>
@@ -599,7 +1568,7 @@
           <w:sz w:val="20"/>
           <w:szCs w:val="20"/>
         </w:rPr>
-        <w:t xml:space="preserve">VOICE RULE: only the voice-over narration speaks words; it is a voice only, never a person on screen. No character says any word and no one lip-syncs; natural laughs, gasps and sighs are allowed and should sound real. Attached reference images, in order: Senbi, the groom, the bride, the wedding courtyard. 2D hand-drawn Stickman animation, clean thin black outlines, large expressive heads, simple readable stickman proportions, flat warm colors, playful cinematic documentary-comedy tone, 16:9. Use the attached reference images as strict continuity anchors: preserve faces, hair, clothing, colors, proportions and accessories exactly; every character keeps a full body with a visible chest and torso exactly as in the references. Characters, identical in every frame: Senbi the groom: young man with a full body and a visible chest, straight black bowl-cut hair with bangs, gold headband with a gold cobra, blue-and-gold broad collar resting on his bare chest, gold bracers on both wrists, white kilt with a blue-and-gold sash, brown sandals. the bride: black bob hair with straight bangs, gold headband with a red gem, white dress, blue-and-gold collar, gold sash, gold arm cuffs, light veil. the guests: Egyptian wedding guests in white linen with blue-and-gold collars and gold headbands, black bob hairstyles, some in white striped headdresses. They wear only short white kilts or simple white dresses: no togas, no draped robes. Setting: sunny daytime ancient Egyptian wedding courtyard in Alexandria: flat-roofed sandstone mud-brick buildings, tall Egyptian columns with lotus-bud capitals painted in blue-and-gold bands, hieroglyph-style carvings on the walls, long tables with white cloths and clay jars, orange cloth awnings, and a tall wooden entrance gate at the back-center that opens onto the street. Egyptian architecture only: no Greek or Roman architecture, no triangular pediments, no domes, no red tile roofs, no cypress trees. In the open gate, a row of dark armored figures with spears and plumed helmets stands motionless against the bright street, small but clear. Lighting: warm bright afternoon sunlight, soft shadows, rich saturated colors. ACTION TIMELINE (8 seconds): 0–2.5 s: Senbi and the bride dance joyfully in the center of the courtyard, fists pumping, eyes closed, big laughing smiles; guests at the tables clap, one plays a reed flute, another beats a frame drum; the dark figures stand perfectly still in the gate behind them. 2.5–5.5 s: the dance continues, the couple's joy growing. 5.5–8 s: the camera has drifted closer so the laughing couple fills the frame in a medium close-up, Senbi's fist raised, the bride's arms up; the figures remain still in the background. Camera: eye-level, starts as a medium-wide shot and makes one slow, smooth push-in toward the couple, ending in a medium close-up; no tilt, no pan, no rising camera. Audio: voice-over narration only (a voice, never shown on screen; no narrator character appears): a British male voice, warm and dry, begins speaking within half a second and says: “Senbi had planned everything for his wedding. Everything except the Roman army.” Say the first sentence warmly, pause briefly, then say the second sentence dryly and deadpan. The line takes about 5.2 seconds; leave the last second free of speech. Music: light ancient-Mediterranean wedding music (frame drums, reed flute, plucked strings), cheerful, low under the voice. Sound effects: clapping, cups clinking, cheers without words, timed to the action. Ambience: light courtyard ambience: footsteps on stone, a soft breeze, no words. Final reminder: no character says any word; only the voice-over narration speaks (voice only, nobody on screen is the narrator). Natural laughs, gasps and sighs are fine. No text, captions or logos in the frame.</w:t>
+        <w:t xml:space="preserve">VOICE RULE: only the voice-over narration speaks words; it is a voice only, never a person or character on screen. No character says any word and no one on screen lip-syncs to speech; characters communicate with facial expressions and body gestures. Natural non-verbal sounds are allowed and should sound real: laughing, giggling, gasping, sighing, groaning, cheering, coughing. 2D hand-drawn Stickman animation, clean thin black outlines, large expressive heads, simple readable stickman proportions, flat warm colors, playful cinematic documentary-comedy tone, 16:9. Use the selected reference images as strict continuity anchors: preserve faces, hair, clothing, colors, proportions and accessories exactly; every character keeps a full body with a visible chest and torso exactly as in the references. Setting: the wedding courtyard exactly as in the selected reference image: ancient Egyptian architecture only, sunny daytime. Lighting: warm bright afternoon sunlight, soft shadows, rich saturated colors. ACTION TIMELINE (8 seconds): 0–2.5 s: the bride's bearded father steps in, holding a carved wooden headrest proudly in both hands, beaming. 2.5–5.5 s: Senbi accepts it with a polite smile and a nod of thanks. 5.5–8 s: he glances down at the object, his smile tightens and his eyebrows lift in concern while the father keeps beaming. Camera: locked-off and perfectly still, eye-level medium two-shot of Senbi and the father; the framing never changes (no tilt, pan, zoom or rising camera). Audio: voice-over narration only (a voice, never shown on screen; no narrator character appears): a British male voice, warm and dry, begins speaking within half a second and says: “Then, the gift: a wooden headrest. Egyptians really did sleep on these.” The line takes about 4.8 seconds; leave the last second free of speech so the moment can land. Music: light ancient-Mediterranean wedding music (frame drums, reed flute, plucked strings), same theme in every clip, low under the voice. Sound effects: one wooden knock, timed to the action. Ambience: light courtyard ambience: clinking cups, footsteps on stone, a soft breeze, no words. Final reminder: no character says any word; only the voice-over narration speaks (voice only, nobody on screen is the narrator). Natural laughs, gasps and sighs are fine. No text, captions or logos in the frame.</w:t>
       </w:r>
     </w:p>
     <w:p>
@@ -616,7 +1585,7 @@
           <w:sz w:val="26"/>
           <w:szCs w:val="26"/>
         </w:rPr>
-        <w:t xml:space="preserve">SHOT 02 — The suspicious sound</w:t>
+        <w:t xml:space="preserve">SHOT 17 — Trying the headrest</w:t>
       </w:r>
     </w:p>
     <w:p>
@@ -640,7 +1609,7 @@
           <w:sz w:val="21"/>
           <w:szCs w:val="21"/>
         </w:rPr>
-        <w:t xml:space="preserve">Courtyard_from_Shot1.png,  Guests_group.png</w:t>
+        <w:t xml:space="preserve">01_Senbi.jpg</w:t>
       </w:r>
       <w:r>
         <w:rPr>
@@ -672,7 +1641,7 @@
           <w:sz w:val="20"/>
           <w:szCs w:val="20"/>
         </w:rPr>
-        <w:t xml:space="preserve">VOICE RULE: only the voice-over narration speaks words; it is a voice only, never a person or character on screen. No character says any word and no one on screen lip-syncs to speech; characters communicate with facial expressions and body gestures. Natural non-verbal sounds are allowed and should sound real: laughing, giggling, gasping, sighing, groaning, cheering, coughing. Attached reference images, in order: the wedding courtyard, the Egyptian wedding guests. 2D hand-drawn Stickman animation, clean thin black outlines, large expressive heads, simple readable stickman proportions, flat warm colors, playful cinematic documentary-comedy tone, 16:9. Use the attached reference images as strict continuity anchors: preserve faces, hair, clothing, colors, proportions and accessories exactly; every character keeps a full body with a visible chest and torso exactly as in the references. Characters, identical in every frame: the guests: Egyptian wedding guests in white linen with blue-and-gold collars and gold headbands, black bob hairstyles, some in white striped headdresses. They wear only short white kilts or simple white dresses: no togas, no draped robes. Setting: sunny daytime ancient Egyptian wedding courtyard in Alexandria: flat-roofed sandstone mud-brick buildings, tall Egyptian columns with lotus-bud capitals painted in blue-and-gold bands, hieroglyph-style carvings on the walls, long tables with white cloths and clay jars, orange cloth awnings, and a tall wooden entrance gate at the back-center that opens onto the street. Egyptian architecture only: no Greek or Roman architecture, no triangular pediments, no domes, no red tile roofs, no cypress trees. Lighting: warm bright afternoon sunlight, soft shadows, rich saturated colors. ACTION TIMELINE (8 seconds): 0–2 s: guests dance joyfully in the middle of the courtyard, clapping and spinning, kilts and dresses swinging, big happy smiles. 2–3 s: every dancer freezes for half a beat mid-step, smiles still on their faces. 3–5.5 s: one guest slowly turns his head toward the tall gate at the back with a puzzled, alert face while the others unfreeze and keep dancing, unaware. 5.5–8 s: the guest keeps staring at the gate, brow furrowed, then slowly looks back and shrugs it off with a small smile. Camera: locked-off and perfectly still, eye-level medium-wide shot, the dancers fully visible from feet to heads (NOT a feet close-up); the framing never changes (no tilt, pan, zoom or rising camera). Audio: voice-over narration only (a voice, never shown on screen; no narrator character appears): a British male voice, warm and dry, begins speaking within half a second and says: “Then, for half a beat, the dancing stopped. Nobody noticed. Except one guest.” The line takes about 5.2 seconds; leave the last second free of speech so the moment can land. Music: light ancient-Mediterranean wedding music (frame drums, reed flute, plucked strings) with a faint uneasy undertone, same theme in every clip, low under the voice. Sound effects: dancing feet on stone, one tiny pause, faint distant thump, timed to the action. Ambience: light courtyard ambience: clinking cups, footsteps on stone, a soft breeze, no words. Final reminder: no character says any word; only the voice-over narration speaks (voice only, nobody on screen is the narrator). Natural laughs, gasps and sighs are fine. No text, captions or logos in the frame.</w:t>
+        <w:t xml:space="preserve">VOICE RULE: only the voice-over narration speaks words; it is a voice only, never a person or character on screen. No character says any word and no one on screen lip-syncs to speech; characters communicate with facial expressions and body gestures. Natural non-verbal sounds are allowed and should sound real: laughing, giggling, gasping, sighing, groaning, cheering, coughing. 2D hand-drawn Stickman animation, clean thin black outlines, large expressive heads, simple readable stickman proportions, flat warm colors, playful cinematic documentary-comedy tone, 16:9. Use the selected reference images as strict continuity anchors: preserve faces, hair, clothing, colors, proportions and accessories exactly; every character keeps a full body with a visible chest and torso exactly as in the references. Setting: the wedding courtyard exactly as in the selected reference image: ancient Egyptian architecture only, sunny daytime. Lighting: warm bright afternoon sunlight, soft shadows, rich saturated colors. ACTION TIMELINE (8 seconds): 0–2.5 s: Senbi sits on a reed mat and places the wooden headrest under his neck. 2.5–5.5 s: he lowers his head onto it and freezes, eyes wide, mouth a tight line, a bead of sweat on his temple. 5.5–8 s: he gives a stiff thumbs-up to someone off-screen, his forced smile trembling. Camera: locked-off and perfectly still, eye-level medium shot of Senbi with the headrest; the framing never changes (no tilt, pan, zoom or rising camera). Audio: voice-over narration only (a voice, never shown on screen; no narrator character appears): a British male voice, warm and dry, begins speaking within half a second and says: “Senbi lay down. His neck filed a formal complaint. His thumbs-up said otherwise.” The line takes about 5.2 seconds; leave the last second free of speech so the moment can land. Music: playful comic percussion over the wedding rhythm, low under the voice. Sound effects: comic wooden creak, timed to the action. Ambience: light courtyard ambience: clinking cups, footsteps on stone, a soft breeze, no words. Final reminder: no character says any word; only the voice-over narration speaks (voice only, nobody on screen is the narrator). Natural laughs, gasps and sighs are fine. No text, captions or logos in the frame.</w:t>
       </w:r>
     </w:p>
     <w:p>
@@ -689,7 +1658,7 @@
           <w:sz w:val="26"/>
           <w:szCs w:val="26"/>
         </w:rPr>
-        <w:t xml:space="preserve">SHOT 03 — Alexandria reveal</w:t>
+        <w:t xml:space="preserve">SHOT 18 — Wedding peak</w:t>
       </w:r>
     </w:p>
     <w:p>
@@ -713,7 +1682,7 @@
           <w:sz w:val="21"/>
           <w:szCs w:val="21"/>
         </w:rPr>
-        <w:t xml:space="preserve">Alexandria_Harbor_from_ref08.png</w:t>
+        <w:t xml:space="preserve">03_Egyptian_Guests.jpg, 02_Bride.jpg, 01_Senbi.jpg, 11_Wedding_Courtyard_Day.jpg</w:t>
       </w:r>
       <w:r>
         <w:rPr>
@@ -745,7 +1714,7 @@
           <w:sz w:val="20"/>
           <w:szCs w:val="20"/>
         </w:rPr>
-        <w:t xml:space="preserve">VOICE RULE: only the voice-over narration speaks words; it is a voice only, never a person or character on screen. No character says any word and no one on screen lip-syncs to speech; characters communicate with facial expressions and body gestures. Natural non-verbal sounds are allowed and should sound real: laughing, giggling, gasping, sighing, groaning, cheering, coughing. Attached reference images, in order: the Alexandria harbor. 2D hand-drawn cartoon in the exact style of the reference image: flat warm colors, soft cel shading, playful documentary-comedy tone, 16:9. Setting: ancient Alexandria harbor in bright daylight. Lighting: bright clear daylight, sparkling water. ACTION TIMELINE (8 seconds): 0–2.5 s: sailboats glide slowly across the blue water, sails filling with wind, gulls crossing the sky. 2.5–5.5 s: the great lighthouse stands tall on the right while palms sway gently at the left edge. 5.5–8 s: more sails drift across the harbor, tiny figures on the quays carry baskets and jars, sunlight sparkles on the water. Camera: wide establishing shot, horizon level; fixed except for an almost imperceptible 5% slow push-in, no tilt or pan. Audio: voice-over narration only (a voice, never shown on screen; no narrator character appears): a British male voice, warm and dry, begins speaking within half a second and says: “Alexandria, 30 BC. A huge, busy city, about to have a strange evening.” The line takes about 5.2 seconds; leave the last second free of speech so the moment can land. Music: light ancient-Mediterranean wedding music (frame drums, reed flute, plucked strings), same theme in every clip, low under the voice. Sound effects: gulls, harbor water, distant market clatter, no words, timed to the action. Ambience: gulls, lapping water and creaking ropes, no words. Final reminder: no character says any word; only the voice-over narration speaks (voice only, nobody on screen is the narrator). Natural laughs, gasps and sighs are fine. No text, captions or logos in the frame.</w:t>
+        <w:t xml:space="preserve">VOICE RULE: only the voice-over narration speaks words; it is a voice only, never a person or character on screen. No character says any word and no one on screen lip-syncs to speech; characters communicate with facial expressions and body gestures. Natural non-verbal sounds are allowed and should sound real: laughing, giggling, gasping, sighing, groaning, cheering, coughing. 2D hand-drawn Stickman animation, clean thin black outlines, large expressive heads, simple readable stickman proportions, flat warm colors, playful cinematic documentary-comedy tone, 16:9. Use the selected reference images as strict continuity anchors: preserve faces, hair, clothing, colors, proportions and accessories exactly; every character keeps a full body with a visible chest and torso exactly as in the references. Setting: the wedding courtyard exactly as in the selected reference image: ancient Egyptian architecture only, sunny daytime. Lighting: warm bright afternoon sunlight, soft shadows, rich saturated colors. ACTION TIMELINE (8 seconds): 0–2.5 s: Senbi and the bride stand together at the center holding hands while musicians play and guests dance around them. 2.5–5.5 s: banners and flower garlands sway lightly in the breeze, couples spin, children run past. 5.5–8 s: Senbi and the bride exchange a loving look; everything is perfectly joyful. Camera: wide shot of the whole courtyard at eye level; fixed except for an almost imperceptible 5% slow push-in, no tilt or pan. Audio: voice-over narration only (a voice, never shown on screen; no narrator character appears): a British male voice, warm and dry, begins speaking within half a second and says: “For a few perfect minutes, everything was exactly right. Enjoy this part.” The line takes about 4.8 seconds; leave the last second free of speech so the moment can land. Music: light ancient-Mediterranean wedding music (frame drums, reed flute, plucked strings), same theme in every clip, low under the voice. Sound effects: applause, drums, wind in the banners, timed to the action. Ambience: light courtyard ambience: clinking cups, footsteps on stone, a soft breeze, no words. Final reminder: no character says any word; only the voice-over narration speaks (voice only, nobody on screen is the narrator). Natural laughs, gasps and sighs are fine. No text, captions or logos in the frame.</w:t>
       </w:r>
     </w:p>
     <w:p>
@@ -762,7 +1731,7 @@
           <w:sz w:val="26"/>
           <w:szCs w:val="26"/>
         </w:rPr>
-        <w:t xml:space="preserve">SHOT 04 — Title joke</w:t>
+        <w:t xml:space="preserve">SHOT 19 — First warning</w:t>
       </w:r>
     </w:p>
     <w:p>
@@ -786,7 +1755,7 @@
           <w:sz w:val="21"/>
           <w:szCs w:val="21"/>
         </w:rPr>
-        <w:t xml:space="preserve">Courtyard_from_Shot1.png</w:t>
+        <w:t xml:space="preserve">11_Wedding_Courtyard_Day.jpg</w:t>
       </w:r>
       <w:r>
         <w:rPr>
@@ -818,7 +1787,7 @@
           <w:sz w:val="20"/>
           <w:szCs w:val="20"/>
         </w:rPr>
-        <w:t xml:space="preserve">VOICE RULE: only the voice-over narration speaks words; it is a voice only, never a person or character on screen. No character says any word and no one on screen lip-syncs to speech; characters communicate with facial expressions and body gestures. Natural non-verbal sounds are allowed and should sound real: laughing, giggling, gasping, sighing, groaning, cheering, coughing. Attached reference images, in order: the wedding courtyard. 2D hand-drawn Stickman animation, clean thin black outlines, large expressive heads, simple readable stickman proportions, flat warm colors, playful cinematic documentary-comedy tone, 16:9. Use the attached reference images as strict continuity anchors: preserve faces, hair, clothing, colors, proportions and accessories exactly; every character keeps a full body with a visible chest and torso exactly as in the references. Characters, identical in every frame: Senbi the groom: young man with a full body and a visible chest, straight black bowl-cut hair with bangs, gold headband with a gold cobra, blue-and-gold broad collar resting on his bare chest, gold bracers on both wrists, white kilt with a blue-and-gold sash, brown sandals. the bride: black bob hair with straight bangs, gold headband with a red gem, white dress, blue-and-gold collar, gold sash, gold arm cuffs, light veil. the guests: Egyptian wedding guests in white linen with blue-and-gold collars and gold headbands, black bob hairstyles, some in white striped headdresses. They wear only short white kilts or simple white dresses: no togas, no draped robes. Setting: sunny daytime ancient Egyptian wedding courtyard in Alexandria: flat-roofed sandstone mud-brick buildings, tall Egyptian columns with lotus-bud capitals painted in blue-and-gold bands, hieroglyph-style carvings on the walls, long tables with white cloths and clay jars, orange cloth awnings, and a tall wooden entrance gate at the back-center that opens onto the street. Egyptian architecture only: no Greek or Roman architecture, no triangular pediments, no domes, no red tile roofs, no cypress trees. Lighting: warm bright afternoon sunlight, soft shadows, rich saturated colors. ACTION TIMELINE (8 seconds): 0–2.5 s: guests dance and clap in a cheerful rhythm, Senbi and the bride dance together in the center, beaming. 2.5–5.5 s: a guest raises a clay cup in a toast and the others clap along; everything looks perfectly normal. 5.5–8 s: the happy scene holds; a little dust floats in the sunlight. Camera: locked-off and perfectly still, eye-level medium-wide shot of the wedding courtyard; the framing never changes (no tilt, pan, zoom or rising camera). Audio: voice-over narration only (a voice, never shown on screen; no narrator character appears): a British male voice, warm and dry, begins speaking within half a second and says: ““Last day of Ancient Egypt”? Relax. Egypt survived. Its queen, less so.” The line takes about 4.8 seconds; leave the last second free of speech so the moment can land. Music: light ancient-Mediterranean wedding music (frame drums, reed flute, plucked strings), same theme in every clip, low under the voice. Sound effects: wedding crowd reactions without any words, one short comic sting, timed to the action. Ambience: light courtyard ambience: clinking cups, footsteps on stone, a soft breeze, no words. Final reminder: no character says any word; only the voice-over narration speaks (voice only, nobody on screen is the narrator). Natural laughs, gasps and sighs are fine. No text, captions or logos in the frame.</w:t>
+        <w:t xml:space="preserve">VOICE RULE: only the voice-over narration speaks words; it is a voice only, never a person or character on screen. No character says any word and no one on screen lip-syncs to speech; characters communicate with facial expressions and body gestures. Natural non-verbal sounds are allowed and should sound real: laughing, giggling, gasping, sighing, groaning, cheering, coughing. 2D hand-drawn Stickman animation, clean thin black outlines, large expressive heads, simple readable stickman proportions, flat warm colors, playful cinematic documentary-comedy tone, 16:9. Use the selected reference images as strict continuity anchors: preserve faces, hair, clothing, colors, proportions and accessories exactly; every character keeps a full body with a visible chest and torso exactly as in the references. Setting: the wedding courtyard exactly as in the selected reference image: ancient Egyptian architecture only, sunny daytime. Lighting: warm bright afternoon sunlight, soft shadows, rich saturated colors. ACTION TIMELINE (8 seconds): 0–2 s: a small clay cup stands still on a wedding table, out-of-focus guests dancing behind it. 2–4.5 s: the cup begins to tremble slightly, tiny ripples in the drink. 4.5–8 s: the tremble repeats rhythmically like distant footsteps, building, while the guests behind keep dancing, unaware. Camera: locked-off and perfectly still, extreme close-up of the cup; only the cup vibrates, the camera does not; the framing never changes (no tilt, pan, zoom or rising camera). Audio: voice-over narration only (a voice, never shown on screen; no narrator character appears): a British male voice, warm and dry, begins speaking within half a second and says: “Then a small cup on the table began to tremble. Nobody noticed.” The line takes about 4.8 seconds; leave the last second free of speech so the moment can land. Music: light ancient-Mediterranean wedding music (frame drums, reed flute, plucked strings) with a faint uneasy undertone, same theme in every clip, low under the voice. Sound effects: ceramic cup rattling, faint rumble, timed to the action. Ambience: light courtyard ambience: clinking cups, footsteps on stone, a soft breeze, no words. Final reminder: no character says any word; only the voice-over narration speaks (voice only, nobody on screen is the narrator). Natural laughs, gasps and sighs are fine. No text, captions or logos in the frame.</w:t>
       </w:r>
     </w:p>
     <w:p>
@@ -835,7 +1804,7 @@
           <w:sz w:val="26"/>
           <w:szCs w:val="26"/>
         </w:rPr>
-        <w:t xml:space="preserve">SHOT 05 — Meet Senbi</w:t>
+        <w:t xml:space="preserve">SHOT 20 — Musician hears it</w:t>
       </w:r>
     </w:p>
     <w:p>
@@ -859,7 +1828,7 @@
           <w:sz w:val="21"/>
           <w:szCs w:val="21"/>
         </w:rPr>
-        <w:t xml:space="preserve">Senbi_from_Shot1.png,  Courtyard_from_Shot1.png</w:t>
+        <w:t xml:space="preserve">03_Egyptian_Guests.jpg, 11_Wedding_Courtyard_Day.jpg</w:t>
       </w:r>
       <w:r>
         <w:rPr>
@@ -891,7 +1860,7 @@
           <w:sz w:val="20"/>
           <w:szCs w:val="20"/>
         </w:rPr>
-        <w:t xml:space="preserve">VOICE RULE: only the voice-over narration speaks words; it is a voice only, never a person or character on screen. No character says any word and no one on screen lip-syncs to speech; characters communicate with facial expressions and body gestures. Natural non-verbal sounds are allowed and should sound real: laughing, giggling, gasping, sighing, groaning, cheering, coughing. Attached reference images, in order: Senbi, the groom, the wedding courtyard. 2D hand-drawn Stickman animation, clean thin black outlines, large expressive heads, simple readable stickman proportions, flat warm colors, playful cinematic documentary-comedy tone, 16:9. Use the attached reference images as strict continuity anchors: preserve faces, hair, clothing, colors, proportions and accessories exactly; every character keeps a full body with a visible chest and torso exactly as in the references. Characters, identical in every frame: Senbi the groom: young man with a full body and a visible chest, straight black bowl-cut hair with bangs, gold headband with a gold cobra, blue-and-gold broad collar resting on his bare chest, gold bracers on both wrists, white kilt with a blue-and-gold sash, brown sandals. Setting: a shaded sandstone alcove beside the wedding courtyard, painted columns, warm daylight. Lighting: warm bright afternoon sunlight, soft shadows, rich saturated colors. ACTION TIMELINE (8 seconds): 0–2.5 s: Senbi stands in front of a bronze mirror on a stand, seen from the side, and straightens his blue-and-gold collar with both hands. 2.5–5.5 s: he tugs his sash neat, then practices a proud, wide smile at his reflection. 5.5–8 s: the smile wobbles into a nervous twitch; he wipes his forehead with the back of his hand and takes a deep breath. Camera: eye-level medium shot of Senbi at the mirror; fixed except for an almost imperceptible 5% slow push-in, no tilt or pan. Audio: voice-over narration only (a voice, never shown on screen; no narrator character appears): a British male voice, warm and dry, begins speaking within half a second and says: “Meet Senbi. He's getting married today, and has checked the mirror forty times.” The line takes about 5.2 seconds; leave the last second free of speech so the moment can land. Music: light ancient-Mediterranean wedding music (frame drums, reed flute, plucked strings), same theme in every clip, low under the voice. Sound effects: small fabric rustle, soft room tone, timed to the action. Ambience: light courtyard ambience: clinking cups, footsteps on stone, a soft breeze, no words. Final reminder: no character says any word; only the voice-over narration speaks (voice only, nobody on screen is the narrator). Natural laughs, gasps and sighs are fine. No text, captions or logos in the frame.</w:t>
+        <w:t xml:space="preserve">VOICE RULE: only the voice-over narration speaks words; it is a voice only, never a person or character on screen. No character says any word and no one on screen lip-syncs to speech; characters communicate with facial expressions and body gestures. Natural non-verbal sounds are allowed and should sound real: laughing, giggling, gasping, sighing, groaning, cheering, coughing. 2D hand-drawn Stickman animation, clean thin black outlines, large expressive heads, simple readable stickman proportions, flat warm colors, playful cinematic documentary-comedy tone, 16:9. Use the selected reference images as strict continuity anchors: preserve faces, hair, clothing, colors, proportions and accessories exactly; every character keeps a full body with a visible chest and torso exactly as in the references. Setting: the wedding courtyard exactly as in the selected reference image: ancient Egyptian architecture only, sunny daytime. Lighting: warm bright afternoon sunlight, soft shadows, rich saturated colors. ACTION TIMELINE (8 seconds): 0–2.5 s: an Egyptian musician plays the reed flute joyfully, eyes closed, the open gate visible behind him. 2.5–5.5 s: he stops abruptly, eyes opening, flute lowered, his expression turning alert. 5.5–8 s: he turns his head toward the gate, brow furrowed, listening, while the dancers behind him dance one more beat and then slow down. Camera: locked-off and perfectly still, eye-level medium shot of the musician with the entrance visible behind him; the framing never changes (no tilt, pan, zoom or rising camera). Audio: voice-over narration only (a voice, never shown on screen; no narrator character appears): a British male voice, warm and dry, begins speaking within half a second and says: “The musician noticed. He stopped. Everyone else danced one more beat, blissfully unaware.” The line takes about 5.2 seconds; leave the last second free of speech so the moment can land. Music: music nearly silent. Sound effects: music and drums cut out, one drum stops, timed to the action. Ambience: light courtyard ambience: clinking cups, footsteps on stone, a soft breeze, no words. Final reminder: no character says any word; only the voice-over narration speaks (voice only, nobody on screen is the narrator). Natural laughs, gasps and sighs are fine. No text, captions or logos in the frame.</w:t>
       </w:r>
     </w:p>
     <w:p>
@@ -908,7 +1877,7 @@
           <w:sz w:val="26"/>
           <w:szCs w:val="26"/>
         </w:rPr>
-        <w:t xml:space="preserve">SHOT 07 — Bride reveal</w:t>
+        <w:t xml:space="preserve">SHOT 22 — First Roman step</w:t>
       </w:r>
     </w:p>
     <w:p>
@@ -932,7 +1901,7 @@
           <w:sz w:val="21"/>
           <w:szCs w:val="21"/>
         </w:rPr>
-        <w:t xml:space="preserve">Bride_from_Shot1.png,  Courtyard_from_Shot1.png</w:t>
+        <w:t xml:space="preserve">05_Roman_Soldiers.jpg, 09_Alexandria_Streets_and_Market.jpg</w:t>
       </w:r>
       <w:r>
         <w:rPr>
@@ -950,7 +1919,7 @@
           <w:sz w:val="21"/>
           <w:szCs w:val="21"/>
         </w:rPr>
-        <w:t xml:space="preserve">8 sec</w:t>
+        <w:t xml:space="preserve">4 sec</w:t>
       </w:r>
     </w:p>
     <w:p>
@@ -964,7 +1933,7 @@
           <w:sz w:val="20"/>
           <w:szCs w:val="20"/>
         </w:rPr>
-        <w:t xml:space="preserve">VOICE RULE: only the voice-over narration speaks words; it is a voice only, never a person or character on screen. No character says any word and no one on screen lip-syncs to speech; characters communicate with facial expressions and body gestures. Natural non-verbal sounds are allowed and should sound real: laughing, giggling, gasping, sighing, groaning, cheering, coughing. Attached reference images, in order: the bride, the wedding courtyard. 2D hand-drawn Stickman animation, clean thin black outlines, large expressive heads, simple readable stickman proportions, flat warm colors, playful cinematic documentary-comedy tone, 16:9. Use the attached reference images as strict continuity anchors: preserve faces, hair, clothing, colors, proportions and accessories exactly; every character keeps a full body with a visible chest and torso exactly as in the references. Characters, identical in every frame: the bride: black bob hair with straight bangs, gold headband with a red gem, white dress, blue-and-gold collar, gold sash, gold arm cuffs, light veil. Setting: a shaded sandstone alcove beside the wedding courtyard, painted columns, warm daylight. Lighting: warm bright afternoon sunlight, soft shadows, rich saturated colors. ACTION TIMELINE (8 seconds): 0–2.5 s: the bride adjusts her gold headband with the red gem in front of a bronze mirror. 2.5–5.5 s: she touches the corner of her dark eye makeup with a fingertip, tilting her head. 5.5–8 s: she looks herself in the eye, gives a calm confident nod and a small smile, and holds. Camera: eye-level medium shot of the bride at the mirror; fixed except for an almost imperceptible 5% slow push-in, no tilt or pan. Audio: voice-over narration only (a voice, never shown on screen; no narrator character appears): a British male voice, warm and dry, begins speaking within half a second and says: “His bride had been ready for an hour. She was the calm one.” The line takes about 5.2 seconds; leave the last second free of speech so the moment can land. Music: light ancient-Mediterranean wedding music (frame drums, reed flute, plucked strings), same theme in every clip, low under the voice. Sound effects: soft jewelry jingle, timed to the action. Ambience: light courtyard ambience: clinking cups, footsteps on stone, a soft breeze, no words. Final reminder: no character says any word; only the voice-over narration speaks (voice only, nobody on screen is the narrator). Natural laughs, gasps and sighs are fine. No text, captions or logos in the frame.</w:t>
+        <w:t xml:space="preserve">VOICE RULE: nobody speaks and no voice of any kind is heard in this clip; it is a sound-effects-only beat. 2D hand-drawn Stickman animation, clean thin black outlines, large expressive heads, simple readable stickman proportions, flat warm colors, playful cinematic documentary-comedy tone, 16:9. Use the selected reference images as strict continuity anchors: preserve faces, hair, clothing, colors, proportions and accessories exactly; every character keeps a full body with a visible chest and torso exactly as in the references. Setting: an ancient Egyptian street in Alexandria exactly as in the selected reference image, sunny daytime. Lighting: warm bright sunlight, soft shadows. ACTION TIMELINE (4 seconds): 0–1 s: empty sunlit stone paving, dust drifting. 1–2 s: the first heavy Roman boot steps into frame from the side, the hem of a red cloak visible, dust puffing. 2–3 s: the second boot follows. 3–4 s: a third step lands; only boots and lower legs are ever visible. Camera: locked-off and perfectly still, fixed ground-level frame on the street; the boots step into frame from the side and the camera never rises; the framing never changes (no tilt, pan, zoom or rising camera). Audio: no narration and no speech. Music: low sustained tension with distant marching drums, almost silent. Sound effects: heavy boot steps with metal clank, timed to each step. Ambience: sunlit street ambience: wind and distant clatter, no words. Final reminder: no voice of any kind in this clip. No text, captions or logos in the frame.</w:t>
       </w:r>
     </w:p>
     <w:p>
@@ -981,7 +1950,7 @@
           <w:sz w:val="26"/>
           <w:szCs w:val="26"/>
         </w:rPr>
-        <w:t xml:space="preserve">SHOT 08 — Marriage contract</w:t>
+        <w:t xml:space="preserve">SHOT 24 — Wedding oblivious</w:t>
       </w:r>
     </w:p>
     <w:p>
@@ -1005,7 +1974,7 @@
           <w:sz w:val="21"/>
           <w:szCs w:val="21"/>
         </w:rPr>
-        <w:t xml:space="preserve">Bride_from_Shot1.png,  Relatives_group.png,  Courtyard_from_Shot1.png</w:t>
+        <w:t xml:space="preserve">11_Wedding_Courtyard_Day.jpg, 01_Senbi.jpg, 02_Bride.jpg</w:t>
       </w:r>
       <w:r>
         <w:rPr>
@@ -1023,7 +1992,7 @@
           <w:sz w:val="21"/>
           <w:szCs w:val="21"/>
         </w:rPr>
-        <w:t xml:space="preserve">8 sec</w:t>
+        <w:t xml:space="preserve">6 sec</w:t>
       </w:r>
     </w:p>
     <w:p>
@@ -1037,7 +2006,7 @@
           <w:sz w:val="20"/>
           <w:szCs w:val="20"/>
         </w:rPr>
-        <w:t xml:space="preserve">VOICE RULE: only the voice-over narration speaks words; it is a voice only, never a person or character on screen. No character says any word and no one on screen lip-syncs to speech; characters communicate with facial expressions and body gestures. Natural non-verbal sounds are allowed and should sound real: laughing, giggling, gasping, sighing, groaning, cheering, coughing. Attached reference images, in order: the bride, the bride's relatives, the wedding courtyard. 2D hand-drawn Stickman animation, clean thin black outlines, large expressive heads, simple readable stickman proportions, flat warm colors, playful cinematic documentary-comedy tone, 16:9. Use the attached reference images as strict continuity anchors: preserve faces, hair, clothing, colors, proportions and accessories exactly; every character keeps a full body with a visible chest and torso exactly as in the references. Characters, identical in every frame: the scribe: older man in plain white linen holding a reed pen. the bride: black bob hair with straight bangs, gold headband with a red gem, white dress, blue-and-gold collar, gold sash, gold arm cuffs, light veil. the bride's father: bearded middle-aged man in a beige tunic with a purple sash. Setting: a shaded sandstone alcove beside the wedding courtyard, painted columns, warm daylight. Lighting: warm bright afternoon sunlight, soft shadows, rich saturated colors. ACTION TIMELINE (8 seconds): 0–2.5 s: a scribe sitting behind a low table unrolls a papyrus with careful hands; the bride stands at the right and her bearded father stands behind her, arms folded. 2.5–5.5 s: the bride leans in and points at one line with a finger while her father nods gravely. 5.5–8 s: the bride straightens up with a small satisfied smile and her father allows himself a tiny proud nod. Camera: locked-off and perfectly still, eye-level medium two-shot: the scribe, the papyrus and the bride all in the same frame; the framing never changes (no tilt, pan, zoom or rising camera). Audio: voice-over narration only (a voice, never shown on screen; no narrator character appears): a British male voice, warm and dry, begins speaking within half a second and says: “Then, paperwork. Real contracts survive: property, money, who owes what. Romance, with receipts.” The line takes about 5.2 seconds; leave the last second free of speech so the moment can land. Music: light ancient-Mediterranean wedding music (frame drums, reed flute, plucked strings), same theme in every clip, low under the voice. Sound effects: papyrus rustle, quill scratching, timed to the action. Ambience: light courtyard ambience: clinking cups, footsteps on stone, a soft breeze, no words. Final reminder: no character says any word; only the voice-over narration speaks (voice only, nobody on screen is the narrator). Natural laughs, gasps and sighs are fine. No text, captions or logos in the frame.</w:t>
+        <w:t xml:space="preserve">VOICE RULE: only the voice-over narration speaks words; it is a voice only, never a person or character on screen. No character says any word and no one on screen lip-syncs to speech; characters communicate with facial expressions and body gestures. Natural non-verbal sounds are allowed and should sound real: laughing, giggling, gasping, sighing, groaning, cheering, coughing. 2D hand-drawn Stickman animation, clean thin black outlines, large expressive heads, simple readable stickman proportions, flat warm colors, playful cinematic documentary-comedy tone, 16:9. Use the selected reference images as strict continuity anchors: preserve faces, hair, clothing, colors, proportions and accessories exactly; every character keeps a full body with a visible chest and torso exactly as in the references. Setting: the wedding courtyard exactly as in the selected reference image: ancient Egyptian architecture only, sunny daytime. Lighting: warm bright afternoon sunlight, soft shadows, rich saturated colors. ACTION TIMELINE (6 seconds): 0–2 s: guests dance and laugh while Senbi spins happily in the center, arms out. 2–4 s: the bride claps in rhythm beside him. 4–6 s: Senbi keeps spinning, eyes closed in bliss; the gate behind them stays calm. Camera: locked-off and perfectly still, eye-level medium-wide shot of the courtyard; the framing never changes (no tilt, pan, zoom or rising camera). Audio: voice-over narration only (a voice, never shown on screen; no narrator character appears): a British male voice, warm and dry, begins speaking within half a second and says: “Inside, nobody had a clue. Senbi was busy spinning.” The line takes about 3.6 seconds; leave the last second free of speech so the moment can land. Music: light ancient-Mediterranean wedding music (frame drums, reed flute, plucked strings) with a faint uneasy undertone, same theme in every clip, low under the voice. Sound effects: wedding music muffled, faint thump, timed to the action. Ambience: light courtyard ambience: clinking cups, footsteps on stone, a soft breeze, no words. Final reminder: no character says any word; only the voice-over narration speaks (voice only, nobody on screen is the narrator). Natural laughs, gasps and sighs are fine. No text, captions or logos in the frame.</w:t>
       </w:r>
     </w:p>
     <w:p>
@@ -1054,7 +2023,7 @@
           <w:sz w:val="26"/>
           <w:szCs w:val="26"/>
         </w:rPr>
-        <w:t xml:space="preserve">SHOT 09 — The feast</w:t>
+        <w:t xml:space="preserve">SHOT 25 — Roman reveal</w:t>
       </w:r>
     </w:p>
     <w:p>
@@ -1078,7 +2047,7 @@
           <w:sz w:val="21"/>
           <w:szCs w:val="21"/>
         </w:rPr>
-        <w:t xml:space="preserve">Guests_group.png,  Courtyard_from_Shot1.png</w:t>
+        <w:t xml:space="preserve">05_Roman_Soldiers.jpg, 09_Alexandria_Streets_and_Market.jpg</w:t>
       </w:r>
       <w:r>
         <w:rPr>
@@ -1110,7 +2079,7 @@
           <w:sz w:val="20"/>
           <w:szCs w:val="20"/>
         </w:rPr>
-        <w:t xml:space="preserve">VOICE RULE: only the voice-over narration speaks words; it is a voice only, never a person or character on screen. No character says any word and no one on screen lip-syncs to speech; characters communicate with facial expressions and body gestures. Natural non-verbal sounds are allowed and should sound real: laughing, giggling, gasping, sighing, groaning, cheering, coughing. Attached reference images, in order: the Egyptian wedding guests, the wedding courtyard. 2D hand-drawn Stickman animation, clean thin black outlines, large expressive heads, simple readable stickman proportions, flat warm colors, playful cinematic documentary-comedy tone, 16:9. Use the attached reference images as strict continuity anchors: preserve faces, hair, clothing, colors, proportions and accessories exactly; every character keeps a full body with a visible chest and torso exactly as in the references. Characters, identical in every frame: the guests: Egyptian wedding guests in white linen with blue-and-gold collars and gold headbands, black bob hairstyles, some in white striped headdresses. They wear only short white kilts or simple white dresses: no togas, no draped robes. the older woman: middle-aged woman in white linen with a red-orange sash. Setting: sunny daytime ancient Egyptian wedding courtyard in Alexandria: flat-roofed sandstone mud-brick buildings, tall Egyptian columns with lotus-bud capitals painted in blue-and-gold bands, hieroglyph-style carvings on the walls, long tables with white cloths and clay jars, orange cloth awnings, and a tall wooden entrance gate at the back-center that opens onto the street. Egyptian architecture only: no Greek or Roman architecture, no triangular pediments, no domes, no red tile roofs, no cypress trees. Lighting: warm bright afternoon sunlight, soft shadows, rich saturated colors. ACTION TIMELINE (8 seconds): 0–2.5 s: guests seated on both sides of the long table eat happily and pass bowls of figs, dates and flatbread. 2.5–5.5 s: at the far end one guest tiptoes up, grabs a fig and hides it behind his back with an innocent face. 5.5–8 s: an unimpressed older woman beside him turns, crosses her arms and gives him a flat stare; he freezes with wide eyes. Camera: locked-off and perfectly still, eye-level wide-medium shot of the whole feast table; the sneaky guest stays in frame; the framing never changes (no tilt, pan, zoom or rising camera). Audio: voice-over narration only (a voice, never shown on screen; no narrator character appears): a British male voice, warm and dry, begins speaking within half a second and says: “Bread, figs, roast goose, and beer, basically a food group. Someone was stealing.” The line takes about 5.2 seconds; leave the last second free of speech so the moment can land. Music: light ancient-Mediterranean wedding music (frame drums, reed flute, plucked strings), same theme in every clip, low under the voice. Sound effects: plates, cups, cheerful ambience, no words, timed to the action. Ambience: light courtyard ambience: clinking cups, footsteps on stone, a soft breeze, no words. Final reminder: no character says any word; only the voice-over narration speaks (voice only, nobody on screen is the narrator). Natural laughs, gasps and sighs are fine. No text, captions or logos in the frame.</w:t>
+        <w:t xml:space="preserve">VOICE RULE: only the voice-over narration speaks words; it is a voice only, never a person or character on screen. No character says any word and no one on screen lip-syncs to speech; characters communicate with facial expressions and body gestures. Natural non-verbal sounds are allowed and should sound real: laughing, giggling, gasping, sighing, groaning, cheering, coughing. 2D hand-drawn Stickman animation, clean thin black outlines, large expressive heads, simple readable stickman proportions, flat warm colors, playful cinematic documentary-comedy tone, 16:9. Use the selected reference images as strict continuity anchors: preserve faces, hair, clothing, colors, proportions and accessories exactly; every character keeps a full body with a visible chest and torso exactly as in the references. Setting: an ancient Egyptian street in Alexandria exactly as in the selected reference image, sunny daytime. Lighting: warm bright sunlight, soft shadows. ACTION TIMELINE (8 seconds): 0–2.5 s: the street is empty and the sound of boots grows. 2.5–5.5 s: two tired, dusty Roman legionaries walk into frame, shields and spears in hand, shoulders slumped, dust on their armor. 5.5–8 s: they stop in front of the wedding house and look around, then at each other, confused; one scratches under his helmet. Camera: locked-off and perfectly still, eye-level medium-wide shot of the street; the soldiers walk into the frame; the framing never changes (no tilt, pan, zoom or rising camera). Audio: voice-over narration only (a voice, never shown on screen; no narrator character appears): a British male voice, warm and dry, begins speaking within half a second and says: “And then Rome arrived. Tired, dusty, and looking for the right address.” The line takes about 4.8 seconds; leave the last second free of speech so the moment can land. Music: low sustained tension with distant marching drums, almost silent. Sound effects: armor clank, dust, a tired sigh, timed to the action. Ambience: sunlit street ambience: wind and distant clatter, no words. Final reminder: no character says any word; only the voice-over narration speaks (voice only, nobody on screen is the narrator). Natural laughs, gasps and sighs are fine. No text, captions or logos in the frame.</w:t>
       </w:r>
     </w:p>
     <w:p>
@@ -1127,7 +2096,7 @@
           <w:sz w:val="26"/>
           <w:szCs w:val="26"/>
         </w:rPr>
-        <w:t xml:space="preserve">SHOT 10 — The cat</w:t>
+        <w:t xml:space="preserve">SHOT 26 — Egyptians stare</w:t>
       </w:r>
     </w:p>
     <w:p>
@@ -1151,7 +2120,7 @@
           <w:sz w:val="21"/>
           <w:szCs w:val="21"/>
         </w:rPr>
-        <w:t xml:space="preserve">Black_cat.png,  Courtyard_from_Shot1.png</w:t>
+        <w:t xml:space="preserve">03_Egyptian_Guests.jpg, 05_Roman_Soldiers.jpg, 11_Wedding_Courtyard_Day.jpg</w:t>
       </w:r>
       <w:r>
         <w:rPr>
@@ -1183,7 +2152,7 @@
           <w:sz w:val="20"/>
           <w:szCs w:val="20"/>
         </w:rPr>
-        <w:t xml:space="preserve">VOICE RULE: only the voice-over narration speaks words; it is a voice only, never a person or character on screen. No character says any word and no one on screen lip-syncs to speech; characters communicate with facial expressions and body gestures. Natural non-verbal sounds are allowed and should sound real: laughing, giggling, gasping, sighing, groaning, cheering, coughing. Attached reference images, in order: the black cat, the wedding courtyard. 2D hand-drawn Stickman animation, clean thin black outlines, large expressive heads, simple readable stickman proportions, flat warm colors, playful cinematic documentary-comedy tone, 16:9. Use the attached reference images as strict continuity anchors: preserve faces, hair, clothing, colors, proportions and accessories exactly; every character keeps a full body with a visible chest and torso exactly as in the references. Characters, identical in every frame: the cat: black with a small gold collar. the guests: Egyptian wedding guests in white linen with blue-and-gold collars and gold headbands, black bob hairstyles, some in white striped headdresses. They wear only short white kilts or simple white dresses: no togas, no draped robes. Setting: sunny daytime ancient Egyptian wedding courtyard in Alexandria: flat-roofed sandstone mud-brick buildings, tall Egyptian columns with lotus-bud capitals painted in blue-and-gold bands, hieroglyph-style carvings on the walls, long tables with white cloths and clay jars, orange cloth awnings, and a tall wooden entrance gate at the back-center that opens onto the street. Egyptian architecture only: no Greek or Roman architecture, no triangular pediments, no domes, no red tile roofs, no cypress trees. Lighting: warm bright afternoon sunlight, soft shadows, rich saturated colors. ACTION TIMELINE (8 seconds): 0–2.5 s: the black cat sits upright on a red cushion at the head of the feast table, tail curled, gold collar glinting. 2.5–5.5 s: a guest approaches and bows deeply, almost to the floor, with great ceremony. 5.5–8 s: the cat looks away, lifts a paw and licks it; the guest stays bowed, then peeks up hopefully. Camera: locked-off and perfectly still, eye-level medium shot with the cat and the bowing guest both in frame; the framing never changes (no tilt, pan, zoom or rising camera). Audio: voice-over narration only (a voice, never shown on screen; no narrator character appears): a British male voice, warm and dry, begins speaking within half a second and says: “Egyptians adored cats. This one knew it. A guest bowed. The cat shrugged.” The line takes about 5.2 seconds; leave the last second free of speech so the moment can land. Music: playful comic percussion over the wedding rhythm, low under the voice. Sound effects: tiny comic sting, soft cat purr, timed to the action. Ambience: light courtyard ambience: clinking cups, footsteps on stone, a soft breeze, no words. Final reminder: no character says any word; only the voice-over narration speaks (voice only, nobody on screen is the narrator). Natural laughs, gasps and sighs are fine. No text, captions or logos in the frame.</w:t>
+        <w:t xml:space="preserve">VOICE RULE: only the voice-over narration speaks words; it is a voice only, never a person or character on screen. No character says any word and no one on screen lip-syncs to speech; characters communicate with facial expressions and body gestures. Natural non-verbal sounds are allowed and should sound real: laughing, giggling, gasping, sighing, groaning, cheering, coughing. 2D hand-drawn Stickman animation, clean thin black outlines, large expressive heads, simple readable stickman proportions, flat warm colors, playful cinematic documentary-comedy tone, 16:9. Use the selected reference images as strict continuity anchors: preserve faces, hair, clothing, colors, proportions and accessories exactly; every character keeps a full body with a visible chest and torso exactly as in the references. Setting: an ancient Egyptian street in Alexandria exactly as in the selected reference image, sunny daytime. Lighting: warm bright sunlight, soft shadows. ACTION TIMELINE (8 seconds): 0–2.5 s: three guests peek out of the doorway at the same time: the left one terrified with wide eyes and hands on cheeks, the center one confused with a tilted head and one raised eyebrow, the right one grinning and clapping softly as if watching entertainers. 2.5–5.5 s: the terrified one ducks back and peeks out again. 5.5–8 s: the grinning one nudges the confused one and points, delighted, while the confused one squints. Camera: locked-off and perfectly still, eye-level medium-wide shot of the doorway with all three guests peeking in the same frame; the framing never changes (no tilt, pan, zoom or rising camera). Audio: voice-over narration only (a voice, never shown on screen; no narrator character appears): a British male voice, warm and dry, begins speaking within half a second and says: “The guests peeked out. One terrified. One confused. One assumed it was entertainment.” The line takes about 5.2 seconds; leave the last second free of speech so the moment can land. Music: music nearly silent. Sound effects: nervous coughs and gasps, no words, timed to the action. Ambience: sunlit street ambience: wind and distant clatter, no words. Final reminder: no character says any word; only the voice-over narration speaks (voice only, nobody on screen is the narrator). Natural laughs, gasps and sighs are fine. No text, captions or logos in the frame.</w:t>
       </w:r>
     </w:p>
     <w:p>
@@ -1200,7 +2169,7 @@
           <w:sz w:val="26"/>
           <w:szCs w:val="26"/>
         </w:rPr>
-        <w:t xml:space="preserve">SHOT 12 — Senbi's confidence</w:t>
+        <w:t xml:space="preserve">SHOT 27 — Drunk uncle</w:t>
       </w:r>
     </w:p>
     <w:p>
@@ -1224,7 +2193,7 @@
           <w:sz w:val="21"/>
           <w:szCs w:val="21"/>
         </w:rPr>
-        <w:t xml:space="preserve">Senbi_from_Shot1.png,  Courtyard_from_Shot1.png</w:t>
+        <w:t xml:space="preserve">04_Parents_and_Relatives.jpg, 05_Roman_Soldiers.jpg, 11_Wedding_Courtyard_Day.jpg</w:t>
       </w:r>
       <w:r>
         <w:rPr>
@@ -1256,7 +2225,7 @@
           <w:sz w:val="20"/>
           <w:szCs w:val="20"/>
         </w:rPr>
-        <w:t xml:space="preserve">VOICE RULE: only the voice-over narration speaks words; it is a voice only, never a person or character on screen. No character says any word and no one on screen lip-syncs to speech; characters communicate with facial expressions and body gestures. Natural non-verbal sounds are allowed and should sound real: laughing, giggling, gasping, sighing, groaning, cheering, coughing. Attached reference images, in order: Senbi, the groom, the wedding courtyard. 2D hand-drawn Stickman animation, clean thin black outlines, large expressive heads, simple readable stickman proportions, flat warm colors, playful cinematic documentary-comedy tone, 16:9. Use the attached reference images as strict continuity anchors: preserve faces, hair, clothing, colors, proportions and accessories exactly; every character keeps a full body with a visible chest and torso exactly as in the references. Characters, identical in every frame: Senbi the groom: young man with a full body and a visible chest, straight black bowl-cut hair with bangs, gold headband with a gold cobra, blue-and-gold broad collar resting on his bare chest, gold bracers on both wrists, white kilt with a blue-and-gold sash, brown sandals. Setting: sunny daytime ancient Egyptian wedding courtyard in Alexandria: flat-roofed sandstone mud-brick buildings, tall Egyptian columns with lotus-bud capitals painted in blue-and-gold bands, hieroglyph-style carvings on the walls, long tables with white cloths and clay jars, orange cloth awnings, and a tall wooden entrance gate at the back-center that opens onto the street. Egyptian architecture only: no Greek or Roman architecture, no triangular pediments, no domes, no red tile roofs, no cypress trees. Lighting: warm bright afternoon sunlight, soft shadows, rich saturated colors. ACTION TIMELINE (8 seconds): 0–2.5 s: Senbi dances with huge confidence, big arm swings, chin up. 2.5–5.5 s: he loses his balance, arms windmilling, one foot wobbling. 5.5–8 s: he snaps upright and freezes in a proud pose with one arm raised as if the stumble was choreography; his eyes slide sideways to check whether anyone saw. Camera: locked-off and perfectly still, eye-level medium shot of Senbi, full body in frame; the framing never changes (no tilt, pan, zoom or rising camera). Audio: voice-over narration only (a voice, never shown on screen; no narrator character appears): a British male voice, warm and dry, begins speaking within half a second and says: “Senbi nearly fell, recovered, and pretended that was the choreography. Nobody believed him.” The line takes about 5.2 seconds; leave the last second free of speech so the moment can land. Music: playful comic percussion over the wedding rhythm, low under the voice. Sound effects: foot scuff, comic wobble, laughter, timed to the action. Ambience: light courtyard ambience: clinking cups, footsteps on stone, a soft breeze, no words. Final reminder: no character says any word; only the voice-over narration speaks (voice only, nobody on screen is the narrator). Natural laughs, gasps and sighs are fine. No text, captions or logos in the frame.</w:t>
+        <w:t xml:space="preserve">VOICE RULE: only the voice-over narration speaks words; it is a voice only, never a person or character on screen. No character says any word and no one on screen lip-syncs to speech; characters communicate with facial expressions and body gestures. Natural non-verbal sounds are allowed and should sound real: laughing, giggling, gasping, sighing, groaning, cheering, coughing. 2D hand-drawn Stickman animation, clean thin black outlines, large expressive heads, simple readable stickman proportions, flat warm colors, playful cinematic documentary-comedy tone, 16:9. Use the selected reference images as strict continuity anchors: preserve faces, hair, clothing, colors, proportions and accessories exactly; every character keeps a full body with a visible chest and torso exactly as in the references. Setting: an ancient Egyptian street in Alexandria exactly as in the selected reference image, sunny daytime. Lighting: warm bright sunlight, soft shadows. ACTION TIMELINE (8 seconds): 0–2.5 s: a cheerful, slightly tipsy bearded uncle sways with a clay beer cup in hand, cheeks rosy, two Roman soldiers waiting at the right edge of the frame. 2.5–5.5 s: he strides confidently across the frame toward the soldiers, cup raised in greeting. 5.5–8 s: he arrives and extends the cup with a wide smile. Camera: locked-off and perfectly still, eye-level medium-wide shot; the uncle walks across the frame; the framing never changes (no tilt, pan, zoom or rising camera). Audio: voice-over narration only (a voice, never shown on screen; no narrator character appears): a British male voice, warm and dry, begins speaking within half a second and says: “Then one uncle, a man with absolutely no fear, grabbed a beer.” The line takes about 4.8 seconds; leave the last second free of speech so the moment can land. Music: playful comic percussion over the wedding rhythm, low under the voice. Sound effects: cup clink, timed to the action. Ambience: sunlit street ambience: wind and distant clatter, no words. Final reminder: no character says any word; only the voice-over narration speaks (voice only, nobody on screen is the narrator). Natural laughs, gasps and sighs are fine. No text, captions or logos in the frame.</w:t>
       </w:r>
     </w:p>
     <w:p>
@@ -1273,7 +2242,7 @@
           <w:sz w:val="26"/>
           <w:szCs w:val="26"/>
         </w:rPr>
-        <w:t xml:space="preserve">SHOT 13 — Bride reaction</w:t>
+        <w:t xml:space="preserve">SHOT 29 — Roman confusion</w:t>
       </w:r>
     </w:p>
     <w:p>
@@ -1297,7 +2266,7 @@
           <w:sz w:val="21"/>
           <w:szCs w:val="21"/>
         </w:rPr>
-        <w:t xml:space="preserve">Bride_from_Shot1.png,  Courtyard_from_Shot1.png</w:t>
+        <w:t xml:space="preserve">05_Roman_Soldiers.jpg</w:t>
       </w:r>
       <w:r>
         <w:rPr>
@@ -1329,7 +2298,7 @@
           <w:sz w:val="20"/>
           <w:szCs w:val="20"/>
         </w:rPr>
-        <w:t xml:space="preserve">VOICE RULE: only the voice-over narration speaks words; it is a voice only, never a person or character on screen. No character says any word and no one on screen lip-syncs to speech; characters communicate with facial expressions and body gestures. Natural non-verbal sounds are allowed and should sound real: laughing, giggling, gasping, sighing, groaning, cheering, coughing. Attached reference images, in order: the bride, the wedding courtyard. 2D hand-drawn Stickman animation, clean thin black outlines, large expressive heads, simple readable stickman proportions, flat warm colors, playful cinematic documentary-comedy tone, 16:9. Use the attached reference images as strict continuity anchors: preserve faces, hair, clothing, colors, proportions and accessories exactly; every character keeps a full body with a visible chest and torso exactly as in the references. Characters, identical in every frame: the bride: black bob hair with straight bangs, gold headband with a red gem, white dress, blue-and-gold collar, gold sash, gold arm cuffs, light veil. Setting: sunny daytime ancient Egyptian wedding courtyard in Alexandria: flat-roofed sandstone mud-brick buildings, tall Egyptian columns with lotus-bud capitals painted in blue-and-gold bands, hieroglyph-style carvings on the walls, long tables with white cloths and clay jars, orange cloth awnings, and a tall wooden entrance gate at the back-center that opens onto the street. Egyptian architecture only: no Greek or Roman architecture, no triangular pediments, no domes, no red tile roofs, no cypress trees. Lighting: warm bright afternoon sunlight, soft shadows, rich saturated colors. ACTION TIMELINE (8 seconds): 0–2.5 s: the bride watches, amused, with sparkling eyes. 2.5–5.5 s: she presses her lips together to look composed while her shoulders start to shake. 5.5–8 s: she raises a hand and hides her smile behind it, eyes crinkled, and a small suppressed giggle escapes. Camera: locked-off and perfectly still, eye-level close-up of the bride's face; the framing never changes (no tilt, pan, zoom or rising camera). Audio: voice-over narration only (a voice, never shown on screen; no narrator character appears): a British male voice, warm and dry, begins speaking within half a second and says: “His bride was trying very hard not to laugh. She loved him. Mostly.” The line takes about 5.2 seconds; leave the last second free of speech so the moment can land. Music: light ancient-Mediterranean wedding music (frame drums, reed flute, plucked strings), same theme in every clip, low under the voice. Sound effects: suppressed giggle, timed to the action. Ambience: light courtyard ambience: clinking cups, footsteps on stone, a soft breeze, no words. Final reminder: no character says any word; only the voice-over narration speaks (voice only, nobody on screen is the narrator). Natural laughs, gasps and sighs are fine. No text, captions or logos in the frame.</w:t>
+        <w:t xml:space="preserve">VOICE RULE: only the voice-over narration speaks words; it is a voice only, never a person or character on screen. No character says any word and no one on screen lip-syncs to speech; characters communicate with facial expressions and body gestures. Natural non-verbal sounds are allowed and should sound real: laughing, giggling, gasping, sighing, groaning, cheering, coughing. 2D hand-drawn Stickman animation, clean thin black outlines, large expressive heads, simple readable stickman proportions, flat warm colors, playful cinematic documentary-comedy tone, 16:9. Use the selected reference images as strict continuity anchors: preserve faces, hair, clothing, colors, proportions and accessories exactly; every character keeps a full body with a visible chest and torso exactly as in the references. Setting: an ancient Egyptian street in Alexandria exactly as in the selected reference image, sunny daytime. Lighting: warm bright sunlight, soft shadows. ACTION TIMELINE (8 seconds): 0–2.5 s: the soldier's confused face looks at the beer cup. 2.5–5.5 s: he looks up at the uncle's smiling face off-screen and back to the cup, then cautiously takes it. 5.5–8 s: his eyes slide sideways toward his comrades in a silent plea of 'what do I do?'; he sniffs the cup. Camera: eye-level medium close-up of the soldier; fixed except for an almost imperceptible 5% slow push-in, no tilt or pan. Audio: voice-over narration only (a voice, never shown on screen; no narrator character appears): a British male voice, warm and dry, begins speaking within half a second and says: “The soldier stared at the cup, then the uncle. A trap? Or hospitality?” The line takes about 5.2 seconds; leave the last second free of speech so the moment can land. Music: music nearly silent. Sound effects: tiny gulp, uneasy hum, timed to the action. Ambience: sunlit street ambience: wind and distant clatter, no words. Final reminder: no character says any word; only the voice-over narration speaks (voice only, nobody on screen is the narrator). Natural laughs, gasps and sighs are fine. No text, captions or logos in the frame.</w:t>
       </w:r>
     </w:p>
     <w:p>
@@ -1346,7 +2315,810 @@
           <w:sz w:val="26"/>
           <w:szCs w:val="26"/>
         </w:rPr>
-        <w:t xml:space="preserve">SHOT 15 — Food judge   (optional)</w:t>
+        <w:t xml:space="preserve">SHOT 30 — Food wins</w:t>
+      </w:r>
+    </w:p>
+    <w:p>
+      <w:pPr>
+        <w:keepNext/>
+        <w:spacing w:after="60" w:before="0"/>
+      </w:pPr>
+      <w:r>
+        <w:rPr>
+          <w:rFonts w:ascii="Arial" w:cs="Arial" w:eastAsia="Arial" w:hAnsi="Arial"/>
+          <w:b/>
+          <w:bCs/>
+          <w:sz w:val="21"/>
+          <w:szCs w:val="21"/>
+        </w:rPr>
+        <w:t xml:space="preserve">Attach: </w:t>
+      </w:r>
+      <w:r>
+        <w:rPr>
+          <w:rFonts w:ascii="Arial" w:cs="Arial" w:eastAsia="Arial" w:hAnsi="Arial"/>
+          <w:sz w:val="21"/>
+          <w:szCs w:val="21"/>
+        </w:rPr>
+        <w:t xml:space="preserve">05_Roman_Soldiers.jpg, 12_Interior_Feast_Night.jpg, 11_Wedding_Courtyard_Day.jpg</w:t>
+      </w:r>
+      <w:r>
+        <w:rPr>
+          <w:rFonts w:ascii="Arial" w:cs="Arial" w:eastAsia="Arial" w:hAnsi="Arial"/>
+          <w:b/>
+          <w:bCs/>
+          <w:sz w:val="21"/>
+          <w:szCs w:val="21"/>
+        </w:rPr>
+        <w:t xml:space="preserve">      Duration: </w:t>
+      </w:r>
+      <w:r>
+        <w:rPr>
+          <w:rFonts w:ascii="Arial" w:cs="Arial" w:eastAsia="Arial" w:hAnsi="Arial"/>
+          <w:sz w:val="21"/>
+          <w:szCs w:val="21"/>
+        </w:rPr>
+        <w:t xml:space="preserve">8 sec</w:t>
+      </w:r>
+    </w:p>
+    <w:p>
+      <w:pPr>
+        <w:shd w:fill="F2F2F2" w:val="clear"/>
+        <w:spacing w:after="80"/>
+      </w:pPr>
+      <w:r>
+        <w:rPr>
+          <w:rFonts w:ascii="Arial" w:cs="Arial" w:eastAsia="Arial" w:hAnsi="Arial"/>
+          <w:sz w:val="20"/>
+          <w:szCs w:val="20"/>
+        </w:rPr>
+        <w:t xml:space="preserve">VOICE RULE: only the voice-over narration speaks words; it is a voice only, never a person or character on screen. No character says any word and no one on screen lip-syncs to speech; characters communicate with facial expressions and body gestures. Natural non-verbal sounds are allowed and should sound real: laughing, giggling, gasping, sighing, groaning, cheering, coughing. 2D hand-drawn Stickman animation, clean thin black outlines, large expressive heads, simple readable stickman proportions, flat warm colors, playful cinematic documentary-comedy tone, 16:9. Use the selected reference images as strict continuity anchors: preserve faces, hair, clothing, colors, proportions and accessories exactly; every character keeps a full body with a visible chest and torso exactly as in the references. Setting: the wedding courtyard exactly as in the selected reference image: ancient Egyptian architecture only, sunny daytime. Lighting: warm bright afternoon sunlight, soft shadows, rich saturated colors. ACTION TIMELINE (8 seconds): 0–2.5 s: two Roman soldiers in the foreground scan the area with serious faces, the feast table behind them. 2.5–5.5 s: they turn their heads toward the roast goose, bread and fruit and their expressions soften. 5.5–8 s: one leans slightly forward, nostrils flaring, his stomach growls and the other glances at him. Camera: locked-off and perfectly still, eye-level wide-medium shot: the soldiers in the foreground, the feast table behind them; they turn their heads toward it; the framing never changes (no tilt, pan, zoom or rising camera). Audio: voice-over narration only (a voice, never shown on screen; no narrator character appears): a British male voice, warm and dry, begins speaking within half a second and says: “Then the Romans saw the food. Military discipline lasted about four seconds.” The line takes about 4.8 seconds; leave the last second free of speech so the moment can land. Music: playful comic percussion over the wedding rhythm, low under the voice. Sound effects: stomach growl, sniff, timed to the action. Ambience: light courtyard ambience: clinking cups, footsteps on stone, a soft breeze, no words. Final reminder: no character says any word; only the voice-over narration speaks (voice only, nobody on screen is the narrator). Natural laughs, gasps and sighs are fine. No text, captions or logos in the frame.</w:t>
+      </w:r>
+    </w:p>
+    <w:p>
+      <w:pPr>
+        <w:pStyle w:val="Heading2"/>
+        <w:keepNext/>
+        <w:spacing w:after="60" w:before="260"/>
+      </w:pPr>
+      <w:r>
+        <w:rPr>
+          <w:rFonts w:ascii="Arial" w:cs="Arial" w:eastAsia="Arial" w:hAnsi="Arial"/>
+          <w:b/>
+          <w:bCs/>
+          <w:sz w:val="26"/>
+          <w:szCs w:val="26"/>
+        </w:rPr>
+        <w:t xml:space="preserve">SHOT 31 — Accidental party</w:t>
+      </w:r>
+    </w:p>
+    <w:p>
+      <w:pPr>
+        <w:keepNext/>
+        <w:spacing w:after="60" w:before="0"/>
+      </w:pPr>
+      <w:r>
+        <w:rPr>
+          <w:rFonts w:ascii="Arial" w:cs="Arial" w:eastAsia="Arial" w:hAnsi="Arial"/>
+          <w:b/>
+          <w:bCs/>
+          <w:sz w:val="21"/>
+          <w:szCs w:val="21"/>
+        </w:rPr>
+        <w:t xml:space="preserve">Attach: </w:t>
+      </w:r>
+      <w:r>
+        <w:rPr>
+          <w:rFonts w:ascii="Arial" w:cs="Arial" w:eastAsia="Arial" w:hAnsi="Arial"/>
+          <w:sz w:val="21"/>
+          <w:szCs w:val="21"/>
+        </w:rPr>
+        <w:t xml:space="preserve">05_Roman_Soldiers.jpg, 03_Egyptian_Guests.jpg, 11_Wedding_Courtyard_Day.jpg</w:t>
+      </w:r>
+      <w:r>
+        <w:rPr>
+          <w:rFonts w:ascii="Arial" w:cs="Arial" w:eastAsia="Arial" w:hAnsi="Arial"/>
+          <w:b/>
+          <w:bCs/>
+          <w:sz w:val="21"/>
+          <w:szCs w:val="21"/>
+        </w:rPr>
+        <w:t xml:space="preserve">      Duration: </w:t>
+      </w:r>
+      <w:r>
+        <w:rPr>
+          <w:rFonts w:ascii="Arial" w:cs="Arial" w:eastAsia="Arial" w:hAnsi="Arial"/>
+          <w:sz w:val="21"/>
+          <w:szCs w:val="21"/>
+        </w:rPr>
+        <w:t xml:space="preserve">8 sec</w:t>
+      </w:r>
+    </w:p>
+    <w:p>
+      <w:pPr>
+        <w:shd w:fill="F2F2F2" w:val="clear"/>
+        <w:spacing w:after="80"/>
+      </w:pPr>
+      <w:r>
+        <w:rPr>
+          <w:rFonts w:ascii="Arial" w:cs="Arial" w:eastAsia="Arial" w:hAnsi="Arial"/>
+          <w:sz w:val="20"/>
+          <w:szCs w:val="20"/>
+        </w:rPr>
+        <w:t xml:space="preserve">VOICE RULE: only the voice-over narration speaks words; it is a voice only, never a person or character on screen. No character says any word and no one on screen lip-syncs to speech; characters communicate with facial expressions and body gestures. Natural non-verbal sounds are allowed and should sound real: laughing, giggling, gasping, sighing, groaning, cheering, coughing. 2D hand-drawn Stickman animation, clean thin black outlines, large expressive heads, simple readable stickman proportions, flat warm colors, playful cinematic documentary-comedy tone, 16:9. Use the selected reference images as strict continuity anchors: preserve faces, hair, clothing, colors, proportions and accessories exactly; every character keeps a full body with a visible chest and torso exactly as in the references. Setting: the wedding courtyard exactly as in the selected reference image: ancient Egyptian architecture only, sunny daytime. Lighting: warm bright afternoon sunlight, soft shadows, rich saturated colors. ACTION TIMELINE (8 seconds): 0–2.5 s: Egyptian guests dance in the courtyard. 2.5–5.5 s: one Roman soldier steps awkwardly onto the dance floor, stiff as a board; the guests freeze and stare. 5.5–8 s: one guest begins to copy his stiff step and the others hesitate, then join in. Camera: locked-off and perfectly still, eye-level wide shot; the framing never changes (no tilt, pan, zoom or rising camera). Audio: voice-over narration only (a voice, never shown on screen; no narrator character appears): a British male voice, warm and dry, begins speaking within half a second and says: “One soldier stepped into the dance. Nobody stopped him. Somehow, it worked.” The line takes about 4.8 seconds; leave the last second free of speech so the moment can land. Music: playful comic percussion over the wedding rhythm, low under the voice. Sound effects: shield tap blending into the rhythm, clapping, timed to the action. Ambience: light courtyard ambience: clinking cups, footsteps on stone, a soft breeze, no words. Final reminder: no character says any word; only the voice-over narration speaks (voice only, nobody on screen is the narrator). Natural laughs, gasps and sighs are fine. No text, captions or logos in the frame.</w:t>
+      </w:r>
+    </w:p>
+    <w:p>
+      <w:pPr>
+        <w:pStyle w:val="Heading2"/>
+        <w:keepNext/>
+        <w:spacing w:after="60" w:before="260"/>
+      </w:pPr>
+      <w:r>
+        <w:rPr>
+          <w:rFonts w:ascii="Arial" w:cs="Arial" w:eastAsia="Arial" w:hAnsi="Arial"/>
+          <w:b/>
+          <w:bCs/>
+          <w:sz w:val="26"/>
+          <w:szCs w:val="26"/>
+        </w:rPr>
+        <w:t xml:space="preserve">SHOT 32 — Armor dance</w:t>
+      </w:r>
+    </w:p>
+    <w:p>
+      <w:pPr>
+        <w:keepNext/>
+        <w:spacing w:after="60" w:before="0"/>
+      </w:pPr>
+      <w:r>
+        <w:rPr>
+          <w:rFonts w:ascii="Arial" w:cs="Arial" w:eastAsia="Arial" w:hAnsi="Arial"/>
+          <w:b/>
+          <w:bCs/>
+          <w:sz w:val="21"/>
+          <w:szCs w:val="21"/>
+        </w:rPr>
+        <w:t xml:space="preserve">Attach: </w:t>
+      </w:r>
+      <w:r>
+        <w:rPr>
+          <w:rFonts w:ascii="Arial" w:cs="Arial" w:eastAsia="Arial" w:hAnsi="Arial"/>
+          <w:sz w:val="21"/>
+          <w:szCs w:val="21"/>
+        </w:rPr>
+        <w:t xml:space="preserve">05_Roman_Soldiers.jpg, 03_Egyptian_Guests.jpg, 11_Wedding_Courtyard_Day.jpg</w:t>
+      </w:r>
+      <w:r>
+        <w:rPr>
+          <w:rFonts w:ascii="Arial" w:cs="Arial" w:eastAsia="Arial" w:hAnsi="Arial"/>
+          <w:b/>
+          <w:bCs/>
+          <w:sz w:val="21"/>
+          <w:szCs w:val="21"/>
+        </w:rPr>
+        <w:t xml:space="preserve">      Duration: </w:t>
+      </w:r>
+      <w:r>
+        <w:rPr>
+          <w:rFonts w:ascii="Arial" w:cs="Arial" w:eastAsia="Arial" w:hAnsi="Arial"/>
+          <w:sz w:val="21"/>
+          <w:szCs w:val="21"/>
+        </w:rPr>
+        <w:t xml:space="preserve">6 sec</w:t>
+      </w:r>
+    </w:p>
+    <w:p>
+      <w:pPr>
+        <w:shd w:fill="F2F2F2" w:val="clear"/>
+        <w:spacing w:after="80"/>
+      </w:pPr>
+      <w:r>
+        <w:rPr>
+          <w:rFonts w:ascii="Arial" w:cs="Arial" w:eastAsia="Arial" w:hAnsi="Arial"/>
+          <w:sz w:val="20"/>
+          <w:szCs w:val="20"/>
+        </w:rPr>
+        <w:t xml:space="preserve">VOICE RULE: only the voice-over narration speaks words; it is a voice only, never a person or character on screen. No character says any word and no one on screen lip-syncs to speech; characters communicate with facial expressions and body gestures. Natural non-verbal sounds are allowed and should sound real: laughing, giggling, gasping, sighing, groaning, cheering, coughing. 2D hand-drawn Stickman animation, clean thin black outlines, large expressive heads, simple readable stickman proportions, flat warm colors, playful cinematic documentary-comedy tone, 16:9. Use the selected reference images as strict continuity anchors: preserve faces, hair, clothing, colors, proportions and accessories exactly; every character keeps a full body with a visible chest and torso exactly as in the references. Setting: the wedding courtyard exactly as in the selected reference image: ancient Egyptian architecture only, sunny daytime. Lighting: warm bright afternoon sunlight, soft shadows, rich saturated colors. ACTION TIMELINE (6 seconds): 0–2 s: three Roman soldiers in full armor step to the right in a row, stiff but strangely synchronized, capes swaying, Egyptian dancers around them smiling and clapping. 2–4 s: they step to the left in unison. 4–6 s: all three raise one arm together in perfect unison, then stare at each other, confused. Camera: locked-off and perfectly still, eye-level wide shot of the dancing Romans; the framing never changes (no tilt, pan, zoom or rising camera). Audio: voice-over narration only (a voice, never shown on screen; no narrator character appears): a British male voice, warm and dry, begins speaking within half a second and says: “Roman engineering changed the world. Roman dancing did not.” The line takes about 3.6 seconds; leave the last second free of speech so the moment can land. Music: playful comic percussion over the wedding rhythm, low under the voice. Sound effects: armor clanking out of rhythm, timed to the action. Ambience: light courtyard ambience: clinking cups, footsteps on stone, a soft breeze, no words. Final reminder: no character says any word; only the voice-over narration speaks (voice only, nobody on screen is the narrator). Natural laughs, gasps and sighs are fine. No text, captions or logos in the frame.</w:t>
+      </w:r>
+    </w:p>
+    <w:p>
+      <w:pPr>
+        <w:pStyle w:val="Heading2"/>
+        <w:keepNext/>
+        <w:spacing w:after="60" w:before="260"/>
+      </w:pPr>
+      <w:r>
+        <w:rPr>
+          <w:rFonts w:ascii="Arial" w:cs="Arial" w:eastAsia="Arial" w:hAnsi="Arial"/>
+          <w:b/>
+          <w:bCs/>
+          <w:sz w:val="26"/>
+          <w:szCs w:val="26"/>
+        </w:rPr>
+        <w:t xml:space="preserve">SHOT 33 — Senbi joins</w:t>
+      </w:r>
+    </w:p>
+    <w:p>
+      <w:pPr>
+        <w:keepNext/>
+        <w:spacing w:after="60" w:before="0"/>
+      </w:pPr>
+      <w:r>
+        <w:rPr>
+          <w:rFonts w:ascii="Arial" w:cs="Arial" w:eastAsia="Arial" w:hAnsi="Arial"/>
+          <w:b/>
+          <w:bCs/>
+          <w:sz w:val="21"/>
+          <w:szCs w:val="21"/>
+        </w:rPr>
+        <w:t xml:space="preserve">Attach: </w:t>
+      </w:r>
+      <w:r>
+        <w:rPr>
+          <w:rFonts w:ascii="Arial" w:cs="Arial" w:eastAsia="Arial" w:hAnsi="Arial"/>
+          <w:sz w:val="21"/>
+          <w:szCs w:val="21"/>
+        </w:rPr>
+        <w:t xml:space="preserve">01_Senbi.jpg, 05_Roman_Soldiers.jpg, 11_Wedding_Courtyard_Day.jpg</w:t>
+      </w:r>
+      <w:r>
+        <w:rPr>
+          <w:rFonts w:ascii="Arial" w:cs="Arial" w:eastAsia="Arial" w:hAnsi="Arial"/>
+          <w:b/>
+          <w:bCs/>
+          <w:sz w:val="21"/>
+          <w:szCs w:val="21"/>
+        </w:rPr>
+        <w:t xml:space="preserve">      Duration: </w:t>
+      </w:r>
+      <w:r>
+        <w:rPr>
+          <w:rFonts w:ascii="Arial" w:cs="Arial" w:eastAsia="Arial" w:hAnsi="Arial"/>
+          <w:sz w:val="21"/>
+          <w:szCs w:val="21"/>
+        </w:rPr>
+        <w:t xml:space="preserve">8 sec</w:t>
+      </w:r>
+    </w:p>
+    <w:p>
+      <w:pPr>
+        <w:shd w:fill="F2F2F2" w:val="clear"/>
+        <w:spacing w:after="80"/>
+      </w:pPr>
+      <w:r>
+        <w:rPr>
+          <w:rFonts w:ascii="Arial" w:cs="Arial" w:eastAsia="Arial" w:hAnsi="Arial"/>
+          <w:sz w:val="20"/>
+          <w:szCs w:val="20"/>
+        </w:rPr>
+        <w:t xml:space="preserve">VOICE RULE: only the voice-over narration speaks words; it is a voice only, never a person or character on screen. No character says any word and no one on screen lip-syncs to speech; characters communicate with facial expressions and body gestures. Natural non-verbal sounds are allowed and should sound real: laughing, giggling, gasping, sighing, groaning, cheering, coughing. 2D hand-drawn Stickman animation, clean thin black outlines, large expressive heads, simple readable stickman proportions, flat warm colors, playful cinematic documentary-comedy tone, 16:9. Use the selected reference images as strict continuity anchors: preserve faces, hair, clothing, colors, proportions and accessories exactly; every character keeps a full body with a visible chest and torso exactly as in the references. Setting: the wedding courtyard exactly as in the selected reference image: ancient Egyptian architecture only, sunny daytime. Lighting: warm bright afternoon sunlight, soft shadows, rich saturated colors. ACTION TIMELINE (8 seconds): 0–2.5 s: Senbi dances proudly beside a Roman soldier, beaming. 2.5–5.5 s: he waves his arm wildly, gesturing for the soldier to follow. 5.5–8 s: the soldier hesitates, then copies Senbi's arm movement stiffly with a flicker of a smile. Camera: locked-off and perfectly still, eye-level medium two-shot; the framing never changes (no tilt, pan, zoom or rising camera). Audio: voice-over narration only (a voice, never shown on screen; no narrator character appears): a British male voice, warm and dry, begins speaking within half a second and says: “Senbi, ever the host, invited one to join. Of course he did.” The line takes about 4.8 seconds; leave the last second free of speech so the moment can land. Music: playful comic percussion over the wedding rhythm, low under the voice. Sound effects: laughter, hand claps, timed to the action. Ambience: light courtyard ambience: clinking cups, footsteps on stone, a soft breeze, no words. Final reminder: no character says any word; only the voice-over narration speaks (voice only, nobody on screen is the narrator). Natural laughs, gasps and sighs are fine. No text, captions or logos in the frame.</w:t>
+      </w:r>
+    </w:p>
+    <w:p>
+      <w:pPr>
+        <w:pStyle w:val="Heading2"/>
+        <w:keepNext/>
+        <w:spacing w:after="60" w:before="260"/>
+      </w:pPr>
+      <w:r>
+        <w:rPr>
+          <w:rFonts w:ascii="Arial" w:cs="Arial" w:eastAsia="Arial" w:hAnsi="Arial"/>
+          <w:b/>
+          <w:bCs/>
+          <w:sz w:val="26"/>
+          <w:szCs w:val="26"/>
+        </w:rPr>
+        <w:t xml:space="preserve">SHOT 34 — Bride disbelief</w:t>
+      </w:r>
+    </w:p>
+    <w:p>
+      <w:pPr>
+        <w:keepNext/>
+        <w:spacing w:after="60" w:before="0"/>
+      </w:pPr>
+      <w:r>
+        <w:rPr>
+          <w:rFonts w:ascii="Arial" w:cs="Arial" w:eastAsia="Arial" w:hAnsi="Arial"/>
+          <w:b/>
+          <w:bCs/>
+          <w:sz w:val="21"/>
+          <w:szCs w:val="21"/>
+        </w:rPr>
+        <w:t xml:space="preserve">Attach: </w:t>
+      </w:r>
+      <w:r>
+        <w:rPr>
+          <w:rFonts w:ascii="Arial" w:cs="Arial" w:eastAsia="Arial" w:hAnsi="Arial"/>
+          <w:sz w:val="21"/>
+          <w:szCs w:val="21"/>
+        </w:rPr>
+        <w:t xml:space="preserve">02_Bride.jpg, 01_Senbi.jpg, 05_Roman_Soldiers.jpg</w:t>
+      </w:r>
+      <w:r>
+        <w:rPr>
+          <w:rFonts w:ascii="Arial" w:cs="Arial" w:eastAsia="Arial" w:hAnsi="Arial"/>
+          <w:b/>
+          <w:bCs/>
+          <w:sz w:val="21"/>
+          <w:szCs w:val="21"/>
+        </w:rPr>
+        <w:t xml:space="preserve">      Duration: </w:t>
+      </w:r>
+      <w:r>
+        <w:rPr>
+          <w:rFonts w:ascii="Arial" w:cs="Arial" w:eastAsia="Arial" w:hAnsi="Arial"/>
+          <w:sz w:val="21"/>
+          <w:szCs w:val="21"/>
+        </w:rPr>
+        <w:t xml:space="preserve">8 sec</w:t>
+      </w:r>
+    </w:p>
+    <w:p>
+      <w:pPr>
+        <w:shd w:fill="F2F2F2" w:val="clear"/>
+        <w:spacing w:after="80"/>
+      </w:pPr>
+      <w:r>
+        <w:rPr>
+          <w:rFonts w:ascii="Arial" w:cs="Arial" w:eastAsia="Arial" w:hAnsi="Arial"/>
+          <w:sz w:val="20"/>
+          <w:szCs w:val="20"/>
+        </w:rPr>
+        <w:t xml:space="preserve">VOICE RULE: only the voice-over narration speaks words; it is a voice only, never a person or character on screen. No character says any word and no one on screen lip-syncs to speech; characters communicate with facial expressions and body gestures. Natural non-verbal sounds are allowed and should sound real: laughing, giggling, gasping, sighing, groaning, cheering, coughing. 2D hand-drawn Stickman animation, clean thin black outlines, large expressive heads, simple readable stickman proportions, flat warm colors, playful cinematic documentary-comedy tone, 16:9. Use the selected reference images as strict continuity anchors: preserve faces, hair, clothing, colors, proportions and accessories exactly; every character keeps a full body with a visible chest and torso exactly as in the references. Setting: the wedding courtyard exactly as in the selected reference image: ancient Egyptian architecture only, sunny daytime. Lighting: warm bright afternoon sunlight, soft shadows, rich saturated colors. ACTION TIMELINE (8 seconds): 0–2.5 s: the bride watches, amused, with polite delight. 2.5–5.5 s: her smile freezes as she sees Senbi dancing with the Romans. 5.5–8 s: she slowly lifts a hand and covers her face, shoulders shaking. Camera: locked-off and perfectly still, eye-level medium close-up of the bride; the framing never changes (no tilt, pan, zoom or rising camera). Audio: voice-over narration only (a voice, never shown on screen; no narrator character appears): a British male voice, warm and dry, begins speaking within half a second and says: “His bride slowly covered her face. This was not in the contract.” The line takes about 4.8 seconds; leave the last second free of speech so the moment can land. Music: playful comic percussion over the wedding rhythm, low under the voice. Sound effects: gasp, muffled laugh, timed to the action. Ambience: light courtyard ambience: clinking cups, footsteps on stone, a soft breeze, no words. Final reminder: no character says any word; only the voice-over narration speaks (voice only, nobody on screen is the narrator). Natural laughs, gasps and sighs are fine. No text, captions or logos in the frame.</w:t>
+      </w:r>
+    </w:p>
+    <w:p>
+      <w:pPr>
+        <w:pStyle w:val="Heading2"/>
+        <w:keepNext/>
+        <w:spacing w:after="60" w:before="260"/>
+      </w:pPr>
+      <w:r>
+        <w:rPr>
+          <w:rFonts w:ascii="Arial" w:cs="Arial" w:eastAsia="Arial" w:hAnsi="Arial"/>
+          <w:b/>
+          <w:bCs/>
+          <w:sz w:val="26"/>
+          <w:szCs w:val="26"/>
+        </w:rPr>
+        <w:t xml:space="preserve">SHOT 36 — Music stops</w:t>
+      </w:r>
+    </w:p>
+    <w:p>
+      <w:pPr>
+        <w:keepNext/>
+        <w:spacing w:after="60" w:before="0"/>
+      </w:pPr>
+      <w:r>
+        <w:rPr>
+          <w:rFonts w:ascii="Arial" w:cs="Arial" w:eastAsia="Arial" w:hAnsi="Arial"/>
+          <w:b/>
+          <w:bCs/>
+          <w:sz w:val="21"/>
+          <w:szCs w:val="21"/>
+        </w:rPr>
+        <w:t xml:space="preserve">Attach: </w:t>
+      </w:r>
+      <w:r>
+        <w:rPr>
+          <w:rFonts w:ascii="Arial" w:cs="Arial" w:eastAsia="Arial" w:hAnsi="Arial"/>
+          <w:sz w:val="21"/>
+          <w:szCs w:val="21"/>
+        </w:rPr>
+        <w:t xml:space="preserve">03_Egyptian_Guests.jpg, 05_Roman_Soldiers.jpg, 11_Wedding_Courtyard_Day.jpg</w:t>
+      </w:r>
+      <w:r>
+        <w:rPr>
+          <w:rFonts w:ascii="Arial" w:cs="Arial" w:eastAsia="Arial" w:hAnsi="Arial"/>
+          <w:b/>
+          <w:bCs/>
+          <w:sz w:val="21"/>
+          <w:szCs w:val="21"/>
+        </w:rPr>
+        <w:t xml:space="preserve">      Duration: </w:t>
+      </w:r>
+      <w:r>
+        <w:rPr>
+          <w:rFonts w:ascii="Arial" w:cs="Arial" w:eastAsia="Arial" w:hAnsi="Arial"/>
+          <w:sz w:val="21"/>
+          <w:szCs w:val="21"/>
+        </w:rPr>
+        <w:t xml:space="preserve">8 sec</w:t>
+      </w:r>
+    </w:p>
+    <w:p>
+      <w:pPr>
+        <w:shd w:fill="F2F2F2" w:val="clear"/>
+        <w:spacing w:after="80"/>
+      </w:pPr>
+      <w:r>
+        <w:rPr>
+          <w:rFonts w:ascii="Arial" w:cs="Arial" w:eastAsia="Arial" w:hAnsi="Arial"/>
+          <w:sz w:val="20"/>
+          <w:szCs w:val="20"/>
+        </w:rPr>
+        <w:t xml:space="preserve">VOICE RULE: only the voice-over narration speaks words; it is a voice only, never a person or character on screen. No character says any word and no one on screen lip-syncs to speech; characters communicate with facial expressions and body gestures. Natural non-verbal sounds are allowed and should sound real: laughing, giggling, gasping, sighing, groaning, cheering, coughing. 2D hand-drawn Stickman animation, clean thin black outlines, large expressive heads, simple readable stickman proportions, flat warm colors, playful cinematic documentary-comedy tone, 16:9. Use the selected reference images as strict continuity anchors: preserve faces, hair, clothing, colors, proportions and accessories exactly; every character keeps a full body with a visible chest and torso exactly as in the references. Setting: the wedding courtyard exactly as in the selected reference image: ancient Egyptian architecture only, sunny daytime. Lighting: warm bright afternoon sunlight, soft shadows, rich saturated colors. ACTION TIMELINE (8 seconds): 0–2 s: the dance is in full swing. 2–3 s: a sharp military horn blasts. 3–8 s: everyone freezes mid-step, Egyptians and Romans together, in a comic tableau: a soldier on one leg, a guest mid-spin, Senbi with arms raised, eyes darting toward the gate; hold completely still. Camera: locked-off and perfectly still, eye-level wide shot; the framing never changes (no tilt, pan, zoom or rising camera). Audio: voice-over narration only (a voice, never shown on screen; no narrator character appears): a British male voice, warm and dry, begins speaking within half a second and says: “Then a horn cut through the music, and everyone froze mid-step.” The line takes about 4.4 seconds; leave the last second free of speech so the moment can land. Music: music nearly silent. Sound effects: sharp military horn, then silence, timed to the action. Ambience: light courtyard ambience: clinking cups, footsteps on stone, a soft breeze, no words. Final reminder: no character says any word; only the voice-over narration speaks (voice only, nobody on screen is the narrator). Natural laughs, gasps and sighs are fine. No text, captions or logos in the frame.</w:t>
+      </w:r>
+    </w:p>
+    <w:p>
+      <w:pPr>
+        <w:pStyle w:val="Heading2"/>
+        <w:keepNext/>
+        <w:spacing w:after="60" w:before="260"/>
+      </w:pPr>
+      <w:r>
+        <w:rPr>
+          <w:rFonts w:ascii="Arial" w:cs="Arial" w:eastAsia="Arial" w:hAnsi="Arial"/>
+          <w:b/>
+          <w:bCs/>
+          <w:sz w:val="26"/>
+          <w:szCs w:val="26"/>
+        </w:rPr>
+        <w:t xml:space="preserve">SHOT 37 — Commander entrance</w:t>
+      </w:r>
+    </w:p>
+    <w:p>
+      <w:pPr>
+        <w:keepNext/>
+        <w:spacing w:after="60" w:before="0"/>
+      </w:pPr>
+      <w:r>
+        <w:rPr>
+          <w:rFonts w:ascii="Arial" w:cs="Arial" w:eastAsia="Arial" w:hAnsi="Arial"/>
+          <w:b/>
+          <w:bCs/>
+          <w:sz w:val="21"/>
+          <w:szCs w:val="21"/>
+        </w:rPr>
+        <w:t xml:space="preserve">Attach: </w:t>
+      </w:r>
+      <w:r>
+        <w:rPr>
+          <w:rFonts w:ascii="Arial" w:cs="Arial" w:eastAsia="Arial" w:hAnsi="Arial"/>
+          <w:sz w:val="21"/>
+          <w:szCs w:val="21"/>
+        </w:rPr>
+        <w:t xml:space="preserve">06_Roman_Commander.jpg, 05_Roman_Soldiers.jpg, 11_Wedding_Courtyard_Day.jpg</w:t>
+      </w:r>
+      <w:r>
+        <w:rPr>
+          <w:rFonts w:ascii="Arial" w:cs="Arial" w:eastAsia="Arial" w:hAnsi="Arial"/>
+          <w:b/>
+          <w:bCs/>
+          <w:sz w:val="21"/>
+          <w:szCs w:val="21"/>
+        </w:rPr>
+        <w:t xml:space="preserve">      Duration: </w:t>
+      </w:r>
+      <w:r>
+        <w:rPr>
+          <w:rFonts w:ascii="Arial" w:cs="Arial" w:eastAsia="Arial" w:hAnsi="Arial"/>
+          <w:sz w:val="21"/>
+          <w:szCs w:val="21"/>
+        </w:rPr>
+        <w:t xml:space="preserve">8 sec</w:t>
+      </w:r>
+    </w:p>
+    <w:p>
+      <w:pPr>
+        <w:shd w:fill="F2F2F2" w:val="clear"/>
+        <w:spacing w:after="80"/>
+      </w:pPr>
+      <w:r>
+        <w:rPr>
+          <w:rFonts w:ascii="Arial" w:cs="Arial" w:eastAsia="Arial" w:hAnsi="Arial"/>
+          <w:sz w:val="20"/>
+          <w:szCs w:val="20"/>
+        </w:rPr>
+        <w:t xml:space="preserve">VOICE RULE: only the voice-over narration speaks words; it is a voice only, never a person or character on screen. No character says any word and no one on screen lip-syncs to speech; characters communicate with facial expressions and body gestures. Natural non-verbal sounds are allowed and should sound real: laughing, giggling, gasping, sighing, groaning, cheering, coughing. 2D hand-drawn Stickman animation, clean thin black outlines, large expressive heads, simple readable stickman proportions, flat warm colors, playful cinematic documentary-comedy tone, 16:9. Use the selected reference images as strict continuity anchors: preserve faces, hair, clothing, colors, proportions and accessories exactly; every character keeps a full body with a visible chest and torso exactly as in the references. Setting: the wedding courtyard exactly as in the selected reference image: ancient Egyptian architecture only, sunny daytime. Lighting: warm bright afternoon sunlight, soft shadows, rich saturated colors. ACTION TIMELINE (8 seconds): 0–2 s: the tall wooden gate swings fully open. 2–5 s: the Roman commander walks calmly through, scroll in hand, red cloak swaying, while the dancing soldiers step aside. 5–8 s: he stops in the center and the courtyard falls silent, everyone looking at him. Camera: locked-off and perfectly still, fixed, slightly low angle that never tilts, on the commander walking in; the framing never changes (no tilt, pan, zoom or rising camera). Audio: voice-over narration only (a voice, never shown on screen; no narrator character appears): a British male voice, warm and dry, begins speaking within half a second and says: “And in walked the commander. The only adult in the building.” The line takes about 4.4 seconds; leave the last second free of speech so the moment can land. Music: low sustained tension with distant marching drums, almost silent. Sound effects: slow footsteps, cloak rustle, timed to the action. Ambience: light courtyard ambience: clinking cups, footsteps on stone, a soft breeze, no words. Final reminder: no character says any word; only the voice-over narration speaks (voice only, nobody on screen is the narrator). Natural laughs, gasps and sighs are fine. No text, captions or logos in the frame.</w:t>
+      </w:r>
+    </w:p>
+    <w:p>
+      <w:pPr>
+        <w:pStyle w:val="Heading2"/>
+        <w:keepNext/>
+        <w:spacing w:after="60" w:before="260"/>
+      </w:pPr>
+      <w:r>
+        <w:rPr>
+          <w:rFonts w:ascii="Arial" w:cs="Arial" w:eastAsia="Arial" w:hAnsi="Arial"/>
+          <w:b/>
+          <w:bCs/>
+          <w:sz w:val="26"/>
+          <w:szCs w:val="26"/>
+        </w:rPr>
+        <w:t xml:space="preserve">SHOT 39 — Cat stare</w:t>
+      </w:r>
+    </w:p>
+    <w:p>
+      <w:pPr>
+        <w:keepNext/>
+        <w:spacing w:after="60" w:before="0"/>
+      </w:pPr>
+      <w:r>
+        <w:rPr>
+          <w:rFonts w:ascii="Arial" w:cs="Arial" w:eastAsia="Arial" w:hAnsi="Arial"/>
+          <w:b/>
+          <w:bCs/>
+          <w:sz w:val="21"/>
+          <w:szCs w:val="21"/>
+        </w:rPr>
+        <w:t xml:space="preserve">Attach: </w:t>
+      </w:r>
+      <w:r>
+        <w:rPr>
+          <w:rFonts w:ascii="Arial" w:cs="Arial" w:eastAsia="Arial" w:hAnsi="Arial"/>
+          <w:sz w:val="21"/>
+          <w:szCs w:val="21"/>
+        </w:rPr>
+        <w:t xml:space="preserve">06_Roman_Commander.jpg, 07_Animals.jpg</w:t>
+      </w:r>
+      <w:r>
+        <w:rPr>
+          <w:rFonts w:ascii="Arial" w:cs="Arial" w:eastAsia="Arial" w:hAnsi="Arial"/>
+          <w:b/>
+          <w:bCs/>
+          <w:sz w:val="21"/>
+          <w:szCs w:val="21"/>
+        </w:rPr>
+        <w:t xml:space="preserve">      Duration: </w:t>
+      </w:r>
+      <w:r>
+        <w:rPr>
+          <w:rFonts w:ascii="Arial" w:cs="Arial" w:eastAsia="Arial" w:hAnsi="Arial"/>
+          <w:sz w:val="21"/>
+          <w:szCs w:val="21"/>
+        </w:rPr>
+        <w:t xml:space="preserve">8 sec</w:t>
+      </w:r>
+    </w:p>
+    <w:p>
+      <w:pPr>
+        <w:shd w:fill="F2F2F2" w:val="clear"/>
+        <w:spacing w:after="80"/>
+      </w:pPr>
+      <w:r>
+        <w:rPr>
+          <w:rFonts w:ascii="Arial" w:cs="Arial" w:eastAsia="Arial" w:hAnsi="Arial"/>
+          <w:sz w:val="20"/>
+          <w:szCs w:val="20"/>
+        </w:rPr>
+        <w:t xml:space="preserve">VOICE RULE: only the voice-over narration speaks words; it is a voice only, never a person or character on screen. No character says any word and no one on screen lip-syncs to speech; characters communicate with facial expressions and body gestures. Natural non-verbal sounds are allowed and should sound real: laughing, giggling, gasping, sighing, groaning, cheering, coughing. 2D hand-drawn Stickman animation, clean thin black outlines, large expressive heads, simple readable stickman proportions, flat warm colors, playful cinematic documentary-comedy tone, 16:9. Use the selected reference images as strict continuity anchors: preserve faces, hair, clothing, colors, proportions and accessories exactly; every character keeps a full body with a visible chest and torso exactly as in the references. Setting: the wedding courtyard exactly as in the selected reference image: ancient Egyptian architecture only, sunny daytime. Lighting: warm bright afternoon sunlight, soft shadows, rich saturated colors. ACTION TIMELINE (8 seconds): 0–2.5 s: the commander in the foreground; his eyes land on the black cat on the table behind him. 2.5–5.5 s: the cat stares straight back, unblinking. 5.5–8 s: a muscle in the commander's jaw twitches and he looks away first. Camera: locked-off and perfectly still, eye-level medium two-shot: the commander in the foreground, the cat on the table behind him; no cutting; the framing never changes (no tilt, pan, zoom or rising camera). Audio: voice-over narration only (a voice, never shown on screen; no narrator character appears): a British male voice, warm and dry, begins speaking within half a second and says: “The cat looked back. The cat was not impressed by the Roman Empire.” The line takes about 5.2 seconds; leave the last second free of speech so the moment can land. Music: music nearly silent. Sound effects: cat meow, tiny sting, timed to the action. Ambience: light courtyard ambience: clinking cups, footsteps on stone, a soft breeze, no words. Final reminder: no character says any word; only the voice-over narration speaks (voice only, nobody on screen is the narrator). Natural laughs, gasps and sighs are fine. No text, captions or logos in the frame.</w:t>
+      </w:r>
+    </w:p>
+    <w:p>
+      <w:pPr>
+        <w:pStyle w:val="Heading2"/>
+        <w:keepNext/>
+        <w:spacing w:after="60" w:before="260"/>
+      </w:pPr>
+      <w:r>
+        <w:rPr>
+          <w:rFonts w:ascii="Arial" w:cs="Arial" w:eastAsia="Arial" w:hAnsi="Arial"/>
+          <w:b/>
+          <w:bCs/>
+          <w:sz w:val="26"/>
+          <w:szCs w:val="26"/>
+        </w:rPr>
+        <w:t xml:space="preserve">SHOT 40 — Announcement</w:t>
+      </w:r>
+    </w:p>
+    <w:p>
+      <w:pPr>
+        <w:keepNext/>
+        <w:spacing w:after="60" w:before="0"/>
+      </w:pPr>
+      <w:r>
+        <w:rPr>
+          <w:rFonts w:ascii="Arial" w:cs="Arial" w:eastAsia="Arial" w:hAnsi="Arial"/>
+          <w:b/>
+          <w:bCs/>
+          <w:sz w:val="21"/>
+          <w:szCs w:val="21"/>
+        </w:rPr>
+        <w:t xml:space="preserve">Attach: </w:t>
+      </w:r>
+      <w:r>
+        <w:rPr>
+          <w:rFonts w:ascii="Arial" w:cs="Arial" w:eastAsia="Arial" w:hAnsi="Arial"/>
+          <w:sz w:val="21"/>
+          <w:szCs w:val="21"/>
+        </w:rPr>
+        <w:t xml:space="preserve">06_Roman_Commander.jpg, 03_Egyptian_Guests.jpg, 01_Senbi.jpg, 02_Bride.jpg, 11_Wedding_Courtyard_Day.jpg</w:t>
+      </w:r>
+      <w:r>
+        <w:rPr>
+          <w:rFonts w:ascii="Arial" w:cs="Arial" w:eastAsia="Arial" w:hAnsi="Arial"/>
+          <w:b/>
+          <w:bCs/>
+          <w:sz w:val="21"/>
+          <w:szCs w:val="21"/>
+        </w:rPr>
+        <w:t xml:space="preserve">      Duration: </w:t>
+      </w:r>
+      <w:r>
+        <w:rPr>
+          <w:rFonts w:ascii="Arial" w:cs="Arial" w:eastAsia="Arial" w:hAnsi="Arial"/>
+          <w:sz w:val="21"/>
+          <w:szCs w:val="21"/>
+        </w:rPr>
+        <w:t xml:space="preserve">8 sec</w:t>
+      </w:r>
+    </w:p>
+    <w:p>
+      <w:pPr>
+        <w:shd w:fill="F2F2F2" w:val="clear"/>
+        <w:spacing w:after="80"/>
+      </w:pPr>
+      <w:r>
+        <w:rPr>
+          <w:rFonts w:ascii="Arial" w:cs="Arial" w:eastAsia="Arial" w:hAnsi="Arial"/>
+          <w:sz w:val="20"/>
+          <w:szCs w:val="20"/>
+        </w:rPr>
+        <w:t xml:space="preserve">VOICE RULE: only the voice-over narration speaks words; it is a voice only, never a person or character on screen. No character says any word and no one on screen lip-syncs to speech; characters communicate with facial expressions and body gestures. Natural non-verbal sounds are allowed and should sound real: laughing, giggling, gasping, sighing, groaning, cheering, coughing. 2D hand-drawn Stickman animation, clean thin black outlines, large expressive heads, simple readable stickman proportions, flat warm colors, playful cinematic documentary-comedy tone, 16:9. Use the selected reference images as strict continuity anchors: preserve faces, hair, clothing, colors, proportions and accessories exactly; every character keeps a full body with a visible chest and torso exactly as in the references. Setting: the wedding courtyard exactly as in the selected reference image: ancient Egyptian architecture only, sunny daytime. Lighting: warm bright afternoon sunlight, soft shadows, rich saturated colors. ACTION TIMELINE (8 seconds): 0–2.5 s: the commander at the center lifts the scroll with both hands, Egyptians on his left and Romans on his right standing silent and still. 2.5–5.5 s: he unrolls it slowly, papyrus falling to his waist, only abstract marks on it. 5.5–8 s: he lifts his chin as if about to read; everyone is silent. Camera: locked-off and perfectly still, symmetrical eye-level medium-wide shot; the framing never changes (no tilt, pan, zoom or rising camera). Audio: voice-over narration only (a voice, never shown on screen; no narrator character appears): a British male voice, warm and dry, begins speaking within half a second and says: “He unrolled the scroll. Message received: Egypt has new management.” The line takes about 4.0 seconds; leave the last second free of speech so the moment can land. Music: low sustained tension with distant marching drums, almost silent. Sound effects: scroll unrolling, one dramatic drum hit, timed to the action. Ambience: light courtyard ambience: clinking cups, footsteps on stone, a soft breeze, no words. Final reminder: no character says any word; only the voice-over narration speaks (voice only, nobody on screen is the narrator). Natural laughs, gasps and sighs are fine. No text, captions or logos in the frame.</w:t>
+      </w:r>
+    </w:p>
+    <w:p>
+      <w:pPr>
+        <w:pStyle w:val="Heading2"/>
+        <w:keepNext/>
+        <w:spacing w:after="60" w:before="260"/>
+      </w:pPr>
+      <w:r>
+        <w:rPr>
+          <w:rFonts w:ascii="Arial" w:cs="Arial" w:eastAsia="Arial" w:hAnsi="Arial"/>
+          <w:b/>
+          <w:bCs/>
+          <w:sz w:val="26"/>
+          <w:szCs w:val="26"/>
+        </w:rPr>
+        <w:t xml:space="preserve">SHOT 41 — Senbi and bride</w:t>
+      </w:r>
+    </w:p>
+    <w:p>
+      <w:pPr>
+        <w:keepNext/>
+        <w:spacing w:after="60" w:before="0"/>
+      </w:pPr>
+      <w:r>
+        <w:rPr>
+          <w:rFonts w:ascii="Arial" w:cs="Arial" w:eastAsia="Arial" w:hAnsi="Arial"/>
+          <w:b/>
+          <w:bCs/>
+          <w:sz w:val="21"/>
+          <w:szCs w:val="21"/>
+        </w:rPr>
+        <w:t xml:space="preserve">Attach: </w:t>
+      </w:r>
+      <w:r>
+        <w:rPr>
+          <w:rFonts w:ascii="Arial" w:cs="Arial" w:eastAsia="Arial" w:hAnsi="Arial"/>
+          <w:sz w:val="21"/>
+          <w:szCs w:val="21"/>
+        </w:rPr>
+        <w:t xml:space="preserve">01_Senbi.jpg, 02_Bride.jpg, 03_Egyptian_Guests.jpg</w:t>
+      </w:r>
+      <w:r>
+        <w:rPr>
+          <w:rFonts w:ascii="Arial" w:cs="Arial" w:eastAsia="Arial" w:hAnsi="Arial"/>
+          <w:b/>
+          <w:bCs/>
+          <w:sz w:val="21"/>
+          <w:szCs w:val="21"/>
+        </w:rPr>
+        <w:t xml:space="preserve">      Duration: </w:t>
+      </w:r>
+      <w:r>
+        <w:rPr>
+          <w:rFonts w:ascii="Arial" w:cs="Arial" w:eastAsia="Arial" w:hAnsi="Arial"/>
+          <w:sz w:val="21"/>
+          <w:szCs w:val="21"/>
+        </w:rPr>
+        <w:t xml:space="preserve">8 sec</w:t>
+      </w:r>
+    </w:p>
+    <w:p>
+      <w:pPr>
+        <w:shd w:fill="F2F2F2" w:val="clear"/>
+        <w:spacing w:after="80"/>
+      </w:pPr>
+      <w:r>
+        <w:rPr>
+          <w:rFonts w:ascii="Arial" w:cs="Arial" w:eastAsia="Arial" w:hAnsi="Arial"/>
+          <w:sz w:val="20"/>
+          <w:szCs w:val="20"/>
+        </w:rPr>
+        <w:t xml:space="preserve">VOICE RULE: only the voice-over narration speaks words; it is a voice only, never a person or character on screen. No character says any word and no one on screen lip-syncs to speech; characters communicate with facial expressions and body gestures. Natural non-verbal sounds are allowed and should sound real: laughing, giggling, gasping, sighing, groaning, cheering, coughing. 2D hand-drawn Stickman animation, clean thin black outlines, large expressive heads, simple readable stickman proportions, flat warm colors, playful cinematic documentary-comedy tone, 16:9. Use the selected reference images as strict continuity anchors: preserve faces, hair, clothing, colors, proportions and accessories exactly; every character keeps a full body with a visible chest and torso exactly as in the references. Setting: the wedding courtyard exactly as in the selected reference image: ancient Egyptian architecture only, sunny daytime. Lighting: warm bright afternoon sunlight, soft shadows, rich saturated colors. ACTION TIMELINE (8 seconds): 0–2.5 s: Senbi and the bride look forward, shocked. 2.5–5.5 s: Senbi slowly turns his head toward the bride. 5.5–8 s: the bride turns to him, they exchange a wide-eyed look and Senbi forces a smile. Camera: locked-off and perfectly still, eye-level medium two-shot of Senbi and the bride; the framing never changes (no tilt, pan, zoom or rising camera). Audio: voice-over narration only (a voice, never shown on screen; no narrator character appears): a British male voice, warm and dry, begins speaking within half a second and says: “Senbi looked at his bride. Same question, silently: is the wedding still on?” The line takes about 5.2 seconds; leave the last second free of speech so the moment can land. Music: low sustained tension with distant marching drums, almost silent. Sound effects: nervous breath, single drum, timed to the action. Ambience: light courtyard ambience: clinking cups, footsteps on stone, a soft breeze, no words. Final reminder: no character says any word; only the voice-over narration speaks (voice only, nobody on screen is the narrator). Natural laughs, gasps and sighs are fine. No text, captions or logos in the frame.</w:t>
+      </w:r>
+    </w:p>
+    <w:p>
+      <w:pPr>
+        <w:pStyle w:val="Heading2"/>
+        <w:keepNext/>
+        <w:spacing w:after="60" w:before="260"/>
+      </w:pPr>
+      <w:r>
+        <w:rPr>
+          <w:rFonts w:ascii="Arial" w:cs="Arial" w:eastAsia="Arial" w:hAnsi="Arial"/>
+          <w:b/>
+          <w:bCs/>
+          <w:sz w:val="26"/>
+          <w:szCs w:val="26"/>
+        </w:rPr>
+        <w:t xml:space="preserve">SHOT 43 — Clarification</w:t>
+      </w:r>
+    </w:p>
+    <w:p>
+      <w:pPr>
+        <w:keepNext/>
+        <w:spacing w:after="60" w:before="0"/>
+      </w:pPr>
+      <w:r>
+        <w:rPr>
+          <w:rFonts w:ascii="Arial" w:cs="Arial" w:eastAsia="Arial" w:hAnsi="Arial"/>
+          <w:b/>
+          <w:bCs/>
+          <w:sz w:val="21"/>
+          <w:szCs w:val="21"/>
+        </w:rPr>
+        <w:t xml:space="preserve">Attach: </w:t>
+      </w:r>
+      <w:r>
+        <w:rPr>
+          <w:rFonts w:ascii="Arial" w:cs="Arial" w:eastAsia="Arial" w:hAnsi="Arial"/>
+          <w:sz w:val="21"/>
+          <w:szCs w:val="21"/>
+        </w:rPr>
+        <w:t xml:space="preserve">08_Alexandria_City_Overview.jpg, 09_Alexandria_Streets_and_Market.jpg, 05_Roman_Soldiers.jpg</w:t>
+      </w:r>
+      <w:r>
+        <w:rPr>
+          <w:rFonts w:ascii="Arial" w:cs="Arial" w:eastAsia="Arial" w:hAnsi="Arial"/>
+          <w:b/>
+          <w:bCs/>
+          <w:sz w:val="21"/>
+          <w:szCs w:val="21"/>
+        </w:rPr>
+        <w:t xml:space="preserve">      Duration: </w:t>
+      </w:r>
+      <w:r>
+        <w:rPr>
+          <w:rFonts w:ascii="Arial" w:cs="Arial" w:eastAsia="Arial" w:hAnsi="Arial"/>
+          <w:sz w:val="21"/>
+          <w:szCs w:val="21"/>
+        </w:rPr>
+        <w:t xml:space="preserve">8 sec</w:t>
+      </w:r>
+    </w:p>
+    <w:p>
+      <w:pPr>
+        <w:shd w:fill="F2F2F2" w:val="clear"/>
+        <w:spacing w:after="80"/>
+      </w:pPr>
+      <w:r>
+        <w:rPr>
+          <w:rFonts w:ascii="Arial" w:cs="Arial" w:eastAsia="Arial" w:hAnsi="Arial"/>
+          <w:sz w:val="20"/>
+          <w:szCs w:val="20"/>
+        </w:rPr>
+        <w:t xml:space="preserve">VOICE RULE: only the voice-over narration speaks words; it is a voice only, never a person or character on screen. No character says any word and no one on screen lip-syncs to speech; characters communicate with facial expressions and body gestures. Natural non-verbal sounds are allowed and should sound real: laughing, giggling, gasping, sighing, groaning, cheering, coughing. 2D hand-drawn Stickman animation, clean thin black outlines, large expressive heads, simple readable stickman proportions, flat warm colors, playful cinematic documentary-comedy tone, 16:9. Use the selected reference images as strict continuity anchors: preserve faces, hair, clothing, colors, proportions and accessories exactly; every character keeps a full body with a visible chest and torso exactly as in the references. Setting: an ancient Egyptian street in Alexandria exactly as in the selected reference image, sunny daytime. Lighting: warm bright sunlight, soft shadows. ACTION TIMELINE (8 seconds): 0–2.5 s: a few Roman soldiers pass through the street. 2.5–5.5 s: ordinary Egyptians carry baskets, bargain and haul jars as usual. 5.5–8 s: a boy runs across the frame; life goes on. Camera: locked-off and perfectly still, eye-level wide observational shot of Alexandria; the framing never changes (no tilt, pan, zoom or rising camera). Audio: voice-over narration only (a voice, never shown on screen; no narrator character appears): a British male voice, warm and dry, begins speaking within half a second and says: “To be clear: Senbi and his wedding are fiction. The cat, sadly, too.” The line takes about 5.2 seconds; leave the last second free of speech so the moment can land. Music: music nearly silent. Sound effects: calm city ambience, timed to the action. Ambience: sunlit street ambience: wind and distant clatter, no words. Final reminder: no character says any word; only the voice-over narration speaks (voice only, nobody on screen is the narrator). Natural laughs, gasps and sighs are fine. No text, captions or logos in the frame.</w:t>
+      </w:r>
+    </w:p>
+    <w:p>
+      <w:pPr>
+        <w:pStyle w:val="Heading2"/>
+        <w:keepNext/>
+        <w:spacing w:after="60" w:before="260"/>
+      </w:pPr>
+      <w:r>
+        <w:rPr>
+          <w:rFonts w:ascii="Arial" w:cs="Arial" w:eastAsia="Arial" w:hAnsi="Arial"/>
+          <w:b/>
+          <w:bCs/>
+          <w:sz w:val="26"/>
+          <w:szCs w:val="26"/>
+        </w:rPr>
+        <w:t xml:space="preserve">SHOT 44 — Historical anchor   (edit: place after shot 25)</w:t>
       </w:r>
     </w:p>
     <w:p>
@@ -1363,7 +3135,7 @@
           <w:sz w:val="19"/>
           <w:szCs w:val="19"/>
         </w:rPr>
-        <w:t xml:space="preserve">Optional: skip this shot to make the video faster.</w:t>
+        <w:t xml:space="preserve">In the edit, play this shot right after shot 25.</w:t>
       </w:r>
     </w:p>
     <w:p>
@@ -1387,7 +3159,7 @@
           <w:sz w:val="21"/>
           <w:szCs w:val="21"/>
         </w:rPr>
-        <w:t xml:space="preserve">Guests_group.png,  Courtyard_from_Shot1.png</w:t>
+        <w:t xml:space="preserve">08_Alexandria_City_Overview.jpg, 09_Alexandria_Streets_and_Market.jpg, 05_Roman_Soldiers.jpg</w:t>
       </w:r>
       <w:r>
         <w:rPr>
@@ -1419,7 +3191,7 @@
           <w:sz w:val="20"/>
           <w:szCs w:val="20"/>
         </w:rPr>
-        <w:t xml:space="preserve">VOICE RULE: only the voice-over narration speaks words; it is a voice only, never a person or character on screen. No character says any word and no one on screen lip-syncs to speech; characters communicate with facial expressions and body gestures. Natural non-verbal sounds are allowed and should sound real: laughing, giggling, gasping, sighing, groaning, cheering, coughing. Attached reference images, in order: the Egyptian wedding guests, the wedding courtyard. 2D hand-drawn Stickman animation, clean thin black outlines, large expressive heads, simple readable stickman proportions, flat warm colors, playful cinematic documentary-comedy tone, 16:9. Use the attached reference images as strict continuity anchors: preserve faces, hair, clothing, colors, proportions and accessories exactly; every character keeps a full body with a visible chest and torso exactly as in the references. Characters, identical in every frame: the older woman: middle-aged woman in white linen with a red-orange sash. Setting: sunny daytime ancient Egyptian wedding courtyard in Alexandria: flat-roofed sandstone mud-brick buildings, tall Egyptian columns with lotus-bud capitals painted in blue-and-gold bands, hieroglyph-style carvings on the walls, long tables with white cloths and clay jars, orange cloth awnings, and a tall wooden entrance gate at the back-center that opens onto the street. Egyptian architecture only: no Greek or Roman architecture, no triangular pediments, no domes, no red tile roofs, no cypress trees. Lighting: warm bright afternoon sunlight, soft shadows, rich saturated colors. ACTION TIMELINE (8 seconds): 0–2.5 s: an older woman at the feast table lifts a spoonful from a dish and inspects it with exaggerated seriousness, squinting. 2.5–5.5 s: she tastes it and chews slowly, eyes narrowed. 5.5–8 s: after a long pause she gives a reluctant nod, lips pursed, as if grudgingly approving. Camera: locked-off and perfectly still, eye-level close-up of the woman's face and the dish; the framing never changes (no tilt, pan, zoom or rising camera). Audio: voice-over narration only (a voice, never shown on screen; no narrator character appears): a British male voice, warm and dry, begins speaking within half a second and says: “One aunt inspected the food like a tax auditor. Verdict: suspicious, but edible.” The line takes about 5.2 seconds; leave the last second free of speech so the moment can land. Music: playful comic percussion over the wedding rhythm, low under the voice. Sound effects: spoon tapping a bowl, suspicious hum, timed to the action. Ambience: light courtyard ambience: clinking cups, footsteps on stone, a soft breeze, no words. Final reminder: no character says any word; only the voice-over narration speaks (voice only, nobody on screen is the narrator). Natural laughs, gasps and sighs are fine. No text, captions or logos in the frame.</w:t>
+        <w:t xml:space="preserve">VOICE RULE: only the voice-over narration speaks words; it is a voice only, never a person or character on screen. No character says any word and no one on screen lip-syncs to speech; characters communicate with facial expressions and body gestures. Natural non-verbal sounds are allowed and should sound real: laughing, giggling, gasping, sighing, groaning, cheering, coughing. 2D hand-drawn Stickman animation, clean thin black outlines, large expressive heads, simple readable stickman proportions, flat warm colors, playful cinematic documentary-comedy tone, 16:9. Use the selected reference images as strict continuity anchors: preserve faces, hair, clothing, colors, proportions and accessories exactly; every character keeps a full body with a visible chest and torso exactly as in the references. Setting: ancient Alexandria harbor. Lighting: bright clear daylight, sparkling water. ACTION TIMELINE (8 seconds): 0–2.5 s: Roman ships enter the harbor, sails filling with wind. 2.5–5.5 s: soldiers stand on the quay while civilians watch. 5.5–8 s: the lighthouse in the background, a flag fluttering slowly; the wedding is not shown. Camera: wide shot of the Alexandria harbor and city, horizon level; fixed except for an almost imperceptible 5% slow push-in, no tilt or pan. Audio: voice-over narration only (a voice, never shown on screen; no narrator character appears): a British male voice, warm and dry, begins speaking within half a second and says: “The setting is real: in 30 BC, Octavian took Alexandria. Egypt became Roman.” The line takes about 5.2 seconds; leave the last second free of speech so the moment can land. Music: music nearly silent. Sound effects: calm city ambience, timed to the action. Ambience: gulls, lapping water and creaking ropes, no words. Final reminder: no character says any word; only the voice-over narration speaks (voice only, nobody on screen is the narrator). Natural laughs, gasps and sighs are fine. No text, captions or logos in the frame.</w:t>
       </w:r>
     </w:p>
     <w:p>
@@ -1436,7 +3208,7 @@
           <w:sz w:val="26"/>
           <w:szCs w:val="26"/>
         </w:rPr>
-        <w:t xml:space="preserve">SHOT 16 — Headrest gift</w:t>
+        <w:t xml:space="preserve">SHOT 45 — Headrest callback</w:t>
       </w:r>
     </w:p>
     <w:p>
@@ -1460,7 +3232,7 @@
           <w:sz w:val="21"/>
           <w:szCs w:val="21"/>
         </w:rPr>
-        <w:t xml:space="preserve">Senbi_from_Shot1.png,  Relatives_group.png,  Courtyard_from_Shot1.png</w:t>
+        <w:t xml:space="preserve">01_Senbi.jpg, 04_Parents_and_Relatives.jpg</w:t>
       </w:r>
       <w:r>
         <w:rPr>
@@ -1478,7 +3250,7 @@
           <w:sz w:val="21"/>
           <w:szCs w:val="21"/>
         </w:rPr>
-        <w:t xml:space="preserve">8 sec</w:t>
+        <w:t xml:space="preserve">6 sec</w:t>
       </w:r>
     </w:p>
     <w:p>
@@ -1492,7 +3264,7 @@
           <w:sz w:val="20"/>
           <w:szCs w:val="20"/>
         </w:rPr>
-        <w:t xml:space="preserve">VOICE RULE: only the voice-over narration speaks words; it is a voice only, never a person or character on screen. No character says any word and no one on screen lip-syncs to speech; characters communicate with facial expressions and body gestures. Natural non-verbal sounds are allowed and should sound real: laughing, giggling, gasping, sighing, groaning, cheering, coughing. Attached reference images, in order: Senbi, the groom, the bride's relatives, the wedding courtyard. 2D hand-drawn Stickman animation, clean thin black outlines, large expressive heads, simple readable stickman proportions, flat warm colors, playful cinematic documentary-comedy tone, 16:9. Use the attached reference images as strict continuity anchors: preserve faces, hair, clothing, colors, proportions and accessories exactly; every character keeps a full body with a visible chest and torso exactly as in the references. Characters, identical in every frame: the bride's father: bearded middle-aged man in a beige tunic with a purple sash. Senbi the groom: young man with a full body and a visible chest, straight black bowl-cut hair with bangs, gold headband with a gold cobra, blue-and-gold broad collar resting on his bare chest, gold bracers on both wrists, white kilt with a blue-and-gold sash, brown sandals. Setting: sunny daytime ancient Egyptian wedding courtyard in Alexandria: flat-roofed sandstone mud-brick buildings, tall Egyptian columns with lotus-bud capitals painted in blue-and-gold bands, hieroglyph-style carvings on the walls, long tables with white cloths and clay jars, orange cloth awnings, and a tall wooden entrance gate at the back-center that opens onto the street. Egyptian architecture only: no Greek or Roman architecture, no triangular pediments, no domes, no red tile roofs, no cypress trees. Lighting: warm bright afternoon sunlight, soft shadows, rich saturated colors. ACTION TIMELINE (8 seconds): 0–2.5 s: the bride's bearded father steps in, holding a carved wooden headrest proudly in both hands, beaming. 2.5–5.5 s: Senbi accepts it with a polite smile and a nod of thanks. 5.5–8 s: he glances down at the object, his smile tightens and his eyebrows lift in concern while the father keeps beaming. Camera: locked-off and perfectly still, eye-level medium two-shot of Senbi and the father; the framing never changes (no tilt, pan, zoom or rising camera). Audio: voice-over narration only (a voice, never shown on screen; no narrator character appears): a British male voice, warm and dry, begins speaking within half a second and says: “Then, the gift: a wooden headrest. Egyptians really did sleep on these.” The line takes about 4.8 seconds; leave the last second free of speech so the moment can land. Music: light ancient-Mediterranean wedding music (frame drums, reed flute, plucked strings), same theme in every clip, low under the voice. Sound effects: one wooden knock, timed to the action. Ambience: light courtyard ambience: clinking cups, footsteps on stone, a soft breeze, no words. Final reminder: no character says any word; only the voice-over narration speaks (voice only, nobody on screen is the narrator). Natural laughs, gasps and sighs are fine. No text, captions or logos in the frame.</w:t>
+        <w:t xml:space="preserve">VOICE RULE: only the voice-over narration speaks words; it is a voice only, never a person or character on screen. No character says any word and no one on screen lip-syncs to speech; characters communicate with facial expressions and body gestures. Natural non-verbal sounds are allowed and should sound real: laughing, giggling, gasping, sighing, groaning, cheering, coughing. 2D hand-drawn Stickman animation, clean thin black outlines, large expressive heads, simple readable stickman proportions, flat warm colors, playful cinematic documentary-comedy tone, 16:9. Use the selected reference images as strict continuity anchors: preserve faces, hair, clothing, colors, proportions and accessories exactly; every character keeps a full body with a visible chest and torso exactly as in the references. Setting: the wedding courtyard exactly as in the selected reference image: ancient Egyptian architecture only, sunny daytime. Lighting: warm bright afternoon sunlight, soft shadows, rich saturated colors. ACTION TIMELINE (6 seconds): 0–2 s: Senbi looks down at the wooden headrest in his hands, turning it over. 2–4 s: he slowly lifts his gaze toward the Roman commander off-screen to the right. 4–6 s: a tired deadpan stare, a long slow blink, his shoulders drop. Camera: locked-off and perfectly still, eye-level medium close-up with the headrest in Senbi's hands and his face both in frame; the framing never changes (no tilt, pan, zoom or rising camera). Audio: voice-over narration only (a voice, never shown on screen; no narrator character appears): a British male voice, warm and dry, begins speaking within half a second and says: “Headrest, then commander. Neither came with a return policy.” The line takes about 3.6 seconds; leave the last second free of speech so the moment can land. Music: playful comic percussion over the wedding rhythm, low under the voice. Sound effects: wood knock, comic sting, timed to the action. Ambience: light courtyard ambience: clinking cups, footsteps on stone, a soft breeze, no words. Final reminder: no character says any word; only the voice-over narration speaks (voice only, nobody on screen is the narrator). Natural laughs, gasps and sighs are fine. No text, captions or logos in the frame.</w:t>
       </w:r>
     </w:p>
     <w:p>
@@ -1509,7 +3281,7 @@
           <w:sz w:val="26"/>
           <w:szCs w:val="26"/>
         </w:rPr>
-        <w:t xml:space="preserve">SHOT 17 — Trying the headrest</w:t>
+        <w:t xml:space="preserve">SHOT 46 — Bride laughs</w:t>
       </w:r>
     </w:p>
     <w:p>
@@ -1533,7 +3305,7 @@
           <w:sz w:val="21"/>
           <w:szCs w:val="21"/>
         </w:rPr>
-        <w:t xml:space="preserve">Senbi_from_Shot1.png</w:t>
+        <w:t xml:space="preserve">02_Bride.jpg, 01_Senbi.jpg, 11_Wedding_Courtyard_Day.jpg</w:t>
       </w:r>
       <w:r>
         <w:rPr>
@@ -1551,7 +3323,7 @@
           <w:sz w:val="21"/>
           <w:szCs w:val="21"/>
         </w:rPr>
-        <w:t xml:space="preserve">8 sec</w:t>
+        <w:t xml:space="preserve">6 sec</w:t>
       </w:r>
     </w:p>
     <w:p>
@@ -1565,7 +3337,7 @@
           <w:sz w:val="20"/>
           <w:szCs w:val="20"/>
         </w:rPr>
-        <w:t xml:space="preserve">VOICE RULE: only the voice-over narration speaks words; it is a voice only, never a person or character on screen. No character says any word and no one on screen lip-syncs to speech; characters communicate with facial expressions and body gestures. Natural non-verbal sounds are allowed and should sound real: laughing, giggling, gasping, sighing, groaning, cheering, coughing. Attached reference images, in order: Senbi, the groom. 2D hand-drawn Stickman animation, clean thin black outlines, large expressive heads, simple readable stickman proportions, flat warm colors, playful cinematic documentary-comedy tone, 16:9. Use the attached reference images as strict continuity anchors: preserve faces, hair, clothing, colors, proportions and accessories exactly; every character keeps a full body with a visible chest and torso exactly as in the references. Characters, identical in every frame: Senbi the groom: young man with a full body and a visible chest, straight black bowl-cut hair with bangs, gold headband with a gold cobra, blue-and-gold broad collar resting on his bare chest, gold bracers on both wrists, white kilt with a blue-and-gold sash, brown sandals. Setting: sunny daytime ancient Egyptian wedding courtyard in Alexandria: flat-roofed sandstone mud-brick buildings, tall Egyptian columns with lotus-bud capitals painted in blue-and-gold bands, hieroglyph-style carvings on the walls, long tables with white cloths and clay jars, orange cloth awnings, and a tall wooden entrance gate at the back-center that opens onto the street. Egyptian architecture only: no Greek or Roman architecture, no triangular pediments, no domes, no red tile roofs, no cypress trees. Lighting: warm bright afternoon sunlight, soft shadows, rich saturated colors. ACTION TIMELINE (8 seconds): 0–2.5 s: Senbi sits on a reed mat and places the wooden headrest under his neck. 2.5–5.5 s: he lowers his head onto it and freezes, eyes wide, mouth a tight line, a bead of sweat on his temple. 5.5–8 s: he gives a stiff thumbs-up to someone off-screen, his forced smile trembling. Camera: locked-off and perfectly still, eye-level medium shot of Senbi with the headrest; the framing never changes (no tilt, pan, zoom or rising camera). Audio: voice-over narration only (a voice, never shown on screen; no narrator character appears): a British male voice, warm and dry, begins speaking within half a second and says: “Senbi lay down. His neck filed a formal complaint. His thumbs-up said otherwise.” The line takes about 5.2 seconds; leave the last second free of speech so the moment can land. Music: playful comic percussion over the wedding rhythm, low under the voice. Sound effects: comic wooden creak, timed to the action. Ambience: light courtyard ambience: clinking cups, footsteps on stone, a soft breeze, no words. Final reminder: no character says any word; only the voice-over narration speaks (voice only, nobody on screen is the narrator). Natural laughs, gasps and sighs are fine. No text, captions or logos in the frame.</w:t>
+        <w:t xml:space="preserve">VOICE RULE: only the voice-over narration speaks words; it is a voice only, never a person or character on screen. No character says any word and no one on screen lip-syncs to speech; characters communicate with facial expressions and body gestures. Natural non-verbal sounds are allowed and should sound real: laughing, giggling, gasping, sighing, groaning, cheering, coughing. 2D hand-drawn Stickman animation, clean thin black outlines, large expressive heads, simple readable stickman proportions, flat warm colors, playful cinematic documentary-comedy tone, 16:9. Use the selected reference images as strict continuity anchors: preserve faces, hair, clothing, colors, proportions and accessories exactly; every character keeps a full body with a visible chest and torso exactly as in the references. Setting: the wedding courtyard exactly as in the selected reference image: ancient Egyptian architecture only, sunny daytime. Lighting: warm bright afternoon sunlight, soft shadows, rich saturated colors. ACTION TIMELINE (6 seconds): 0–2 s: the bride's shoulders begin to shake. 2–4 s: she bursts out laughing, a hand on her chest. 4–6 s: Senbi looks at her, then starts laughing too, tears in his eyes, and they lean on each other. Camera: locked-off and perfectly still, eye-level medium two-shot of Senbi and the bride; the framing never changes (no tilt, pan, zoom or rising camera). Audio: voice-over narration only (a voice, never shown on screen; no narrator character appears): a British male voice, warm and dry, begins speaking within half a second and says: “Senbi thought he was getting married.” The line takes about 2.4 seconds; leave the last second free of speech so the moment can land. Music: warm gentle resolution with the same flute and strings, low under the voice. Sound effects: bride laughter, Senbi laughter, timed to the action. Ambience: light courtyard ambience: clinking cups, footsteps on stone, a soft breeze, no words. Final reminder: no character says any word; only the voice-over narration speaks (voice only, nobody on screen is the narrator). Natural laughs, gasps and sighs are fine. No text, captions or logos in the frame.</w:t>
       </w:r>
     </w:p>
     <w:p>
@@ -1582,7 +3354,7 @@
           <w:sz w:val="26"/>
           <w:szCs w:val="26"/>
         </w:rPr>
-        <w:t xml:space="preserve">SHOT 18 — Wedding peak</w:t>
+        <w:t xml:space="preserve">SHOT 47 — Final punchline</w:t>
       </w:r>
     </w:p>
     <w:p>
@@ -1606,7 +3378,7 @@
           <w:sz w:val="21"/>
           <w:szCs w:val="21"/>
         </w:rPr>
-        <w:t xml:space="preserve">Guests_group.png,  Bride_from_Shot1.png,  Senbi_from_Shot1.png</w:t>
+        <w:t xml:space="preserve">01_Senbi.jpg, 04_Parents_and_Relatives.jpg</w:t>
       </w:r>
       <w:r>
         <w:rPr>
@@ -1624,7 +3396,7 @@
           <w:sz w:val="21"/>
           <w:szCs w:val="21"/>
         </w:rPr>
-        <w:t xml:space="preserve">8 sec</w:t>
+        <w:t xml:space="preserve">4 sec</w:t>
       </w:r>
     </w:p>
     <w:p>
@@ -1638,7 +3410,7 @@
           <w:sz w:val="20"/>
           <w:szCs w:val="20"/>
         </w:rPr>
-        <w:t xml:space="preserve">VOICE RULE: only the voice-over narration speaks words; it is a voice only, never a person or character on screen. No character says any word and no one on screen lip-syncs to speech; characters communicate with facial expressions and body gestures. Natural non-verbal sounds are allowed and should sound real: laughing, giggling, gasping, sighing, groaning, cheering, coughing. Attached reference images, in order: the Egyptian wedding guests, the bride, Senbi, the groom. 2D hand-drawn Stickman animation, clean thin black outlines, large expressive heads, simple readable stickman proportions, flat warm colors, playful cinematic documentary-comedy tone, 16:9. Use the attached reference images as strict continuity anchors: preserve faces, hair, clothing, colors, proportions and accessories exactly; every character keeps a full body with a visible chest and torso exactly as in the references. Characters, identical in every frame: Senbi the groom: young man with a full body and a visible chest, straight black bowl-cut hair with bangs, gold headband with a gold cobra, blue-and-gold broad collar resting on his bare chest, gold bracers on both wrists, white kilt with a blue-and-gold sash, brown sandals. the bride: black bob hair with straight bangs, gold headband with a red gem, white dress, blue-and-gold collar, gold sash, gold arm cuffs, light veil. the guests: Egyptian wedding guests in white linen with blue-and-gold collars and gold headbands, black bob hairstyles, some in white striped headdresses. They wear only short white kilts or simple white dresses: no togas, no draped robes. the musicians: guests in white linen playing harp, frame drum and reed flute. Setting: sunny daytime ancient Egyptian wedding courtyard in Alexandria: flat-roofed sandstone mud-brick buildings, tall Egyptian columns with lotus-bud capitals painted in blue-and-gold bands, hieroglyph-style carvings on the walls, long tables with white cloths and clay jars, orange cloth awnings, and a tall wooden entrance gate at the back-center that opens onto the street. Egyptian architecture only: no Greek or Roman architecture, no triangular pediments, no domes, no red tile roofs, no cypress trees. Lighting: warm bright afternoon sunlight, soft shadows, rich saturated colors. ACTION TIMELINE (8 seconds): 0–2.5 s: Senbi and the bride stand together at the center holding hands while musicians play and guests dance around them. 2.5–5.5 s: banners and flower garlands sway lightly in the breeze, couples spin, children run past. 5.5–8 s: Senbi and the bride exchange a loving look; everything is perfectly joyful. Camera: wide shot of the whole courtyard at eye level; fixed except for an almost imperceptible 5% slow push-in, no tilt or pan. Audio: voice-over narration only (a voice, never shown on screen; no narrator character appears): a British male voice, warm and dry, begins speaking within half a second and says: “For a few perfect minutes, everything was exactly right. Enjoy this part.” The line takes about 4.8 seconds; leave the last second free of speech so the moment can land. Music: light ancient-Mediterranean wedding music (frame drums, reed flute, plucked strings), same theme in every clip, low under the voice. Sound effects: applause, drums, wind in the banners, timed to the action. Ambience: light courtyard ambience: clinking cups, footsteps on stone, a soft breeze, no words. Final reminder: no character says any word; only the voice-over narration speaks (voice only, nobody on screen is the narrator). Natural laughs, gasps and sighs are fine. No text, captions or logos in the frame.</w:t>
+        <w:t xml:space="preserve">VOICE RULE: only the voice-over narration speaks words; it is a voice only, never a person or character on screen. No character says any word and no one on screen lip-syncs to speech; characters communicate with facial expressions and body gestures. Natural non-verbal sounds are allowed and should sound real: laughing, giggling, gasping, sighing, groaning, cheering, coughing. 2D hand-drawn Stickman animation, clean thin black outlines, large expressive heads, simple readable stickman proportions, flat warm colors, playful cinematic documentary-comedy tone, 16:9. Use the selected reference images as strict continuity anchors: preserve faces, hair, clothing, colors, proportions and accessories exactly; every character keeps a full body with a visible chest and torso exactly as in the references. Setting: a quiet room of the wedding house at night, warm torchlight, painted columns, cushions on the floor, Senbi alone in the room. Lighting: warm flickering torchlight, deep soft shadows. ACTION TIMELINE (4 seconds): 0–1 s: Senbi lies asleep, neck awkwardly bent on the wooden headrest, mouth slightly open, face scrunched. 1–2 s: distant marching begins. 2–3 s: one eye opens and he listens. 3–4 s: the eye closes again with a tired sigh and he turns his face away. Camera: eye-level medium close-up of Senbi's face; fixed except for an almost imperceptible 5% slow push-in, no tilt or pan. Audio: voice-over narration only (a voice, never shown on screen; no narrator character appears): a British male voice, warm and dry, begins speaking within half a second and says: “He was.” The line takes about 0.8 seconds; leave the last second free of speech so the moment can land. Music: warm gentle resolution with the same flute and strings, low under the voice. Sound effects: distant marching, soft snore, timed to the action. Ambience: quiet night room tone and a crackling torch, no words. Final reminder: no character says any word; only the voice-over narration speaks (voice only, nobody on screen is the narrator). Natural laughs, gasps and sighs are fine. No text, captions or logos in the frame.</w:t>
       </w:r>
     </w:p>
     <w:p>
@@ -1655,7 +3427,7 @@
           <w:sz w:val="26"/>
           <w:szCs w:val="26"/>
         </w:rPr>
-        <w:t xml:space="preserve">SHOT 19 — First warning</w:t>
+        <w:t xml:space="preserve">SHOT 48 — Closing curiosity</w:t>
       </w:r>
     </w:p>
     <w:p>
@@ -1679,7 +3451,7 @@
           <w:sz w:val="21"/>
           <w:szCs w:val="21"/>
         </w:rPr>
-        <w:t xml:space="preserve">Courtyard_from_Shot1.png</w:t>
+        <w:t xml:space="preserve">01_Senbi.jpg, 02_Bride.jpg, 08_Alexandria_City_Overview.jpg, 05_Roman_Soldiers.jpg</w:t>
       </w:r>
       <w:r>
         <w:rPr>
@@ -1711,1703 +3483,7 @@
           <w:sz w:val="20"/>
           <w:szCs w:val="20"/>
         </w:rPr>
-        <w:t xml:space="preserve">VOICE RULE: only the voice-over narration speaks words; it is a voice only, never a person or character on screen. No character says any word and no one on screen lip-syncs to speech; characters communicate with facial expressions and body gestures. Natural non-verbal sounds are allowed and should sound real: laughing, giggling, gasping, sighing, groaning, cheering, coughing. Attached reference images, in order: the wedding courtyard. 2D hand-drawn Stickman animation, clean thin black outlines, large expressive heads, simple readable stickman proportions, flat warm colors, playful cinematic documentary-comedy tone, 16:9. Use the attached reference images as strict continuity anchors: preserve faces, hair, clothing, colors, proportions and accessories exactly; every character keeps a full body with a visible chest and torso exactly as in the references. Setting: sunny daytime ancient Egyptian wedding courtyard in Alexandria: flat-roofed sandstone mud-brick buildings, tall Egyptian columns with lotus-bud capitals painted in blue-and-gold bands, hieroglyph-style carvings on the walls, long tables with white cloths and clay jars, orange cloth awnings, and a tall wooden entrance gate at the back-center that opens onto the street. Egyptian architecture only: no Greek or Roman architecture, no triangular pediments, no domes, no red tile roofs, no cypress trees. Lighting: warm bright afternoon sunlight, soft shadows, rich saturated colors. ACTION TIMELINE (8 seconds): 0–2 s: a small clay cup stands still on a wedding table, out-of-focus guests dancing behind it. 2–4.5 s: the cup begins to tremble slightly, tiny ripples in the drink. 4.5–8 s: the tremble repeats rhythmically like distant footsteps, building, while the guests behind keep dancing, unaware. Camera: locked-off and perfectly still, extreme close-up of the cup; only the cup vibrates, the camera does not; the framing never changes (no tilt, pan, zoom or rising camera). Audio: voice-over narration only (a voice, never shown on screen; no narrator character appears): a British male voice, warm and dry, begins speaking within half a second and says: “Then a small cup on the table began to tremble. Nobody noticed.” The line takes about 4.8 seconds; leave the last second free of speech so the moment can land. Music: light ancient-Mediterranean wedding music (frame drums, reed flute, plucked strings) with a faint uneasy undertone, same theme in every clip, low under the voice. Sound effects: ceramic cup rattling, faint rumble, timed to the action. Ambience: light courtyard ambience: clinking cups, footsteps on stone, a soft breeze, no words. Final reminder: no character says any word; only the voice-over narration speaks (voice only, nobody on screen is the narrator). Natural laughs, gasps and sighs are fine. No text, captions or logos in the frame.</w:t>
-      </w:r>
-    </w:p>
-    <w:p>
-      <w:pPr>
-        <w:pStyle w:val="Heading2"/>
-        <w:keepNext/>
-        <w:spacing w:after="60" w:before="260"/>
-      </w:pPr>
-      <w:r>
-        <w:rPr>
-          <w:rFonts w:ascii="Arial" w:cs="Arial" w:eastAsia="Arial" w:hAnsi="Arial"/>
-          <w:b/>
-          <w:bCs/>
-          <w:sz w:val="26"/>
-          <w:szCs w:val="26"/>
-        </w:rPr>
-        <w:t xml:space="preserve">SHOT 20 — Musician hears it</w:t>
-      </w:r>
-    </w:p>
-    <w:p>
-      <w:pPr>
-        <w:keepNext/>
-        <w:spacing w:after="60" w:before="0"/>
-      </w:pPr>
-      <w:r>
-        <w:rPr>
-          <w:rFonts w:ascii="Arial" w:cs="Arial" w:eastAsia="Arial" w:hAnsi="Arial"/>
-          <w:b/>
-          <w:bCs/>
-          <w:sz w:val="21"/>
-          <w:szCs w:val="21"/>
-        </w:rPr>
-        <w:t xml:space="preserve">Attach: </w:t>
-      </w:r>
-      <w:r>
-        <w:rPr>
-          <w:rFonts w:ascii="Arial" w:cs="Arial" w:eastAsia="Arial" w:hAnsi="Arial"/>
-          <w:sz w:val="21"/>
-          <w:szCs w:val="21"/>
-        </w:rPr>
-        <w:t xml:space="preserve">Guests_group.png,  Courtyard_from_Shot1.png</w:t>
-      </w:r>
-      <w:r>
-        <w:rPr>
-          <w:rFonts w:ascii="Arial" w:cs="Arial" w:eastAsia="Arial" w:hAnsi="Arial"/>
-          <w:b/>
-          <w:bCs/>
-          <w:sz w:val="21"/>
-          <w:szCs w:val="21"/>
-        </w:rPr>
-        <w:t xml:space="preserve">      Duration: </w:t>
-      </w:r>
-      <w:r>
-        <w:rPr>
-          <w:rFonts w:ascii="Arial" w:cs="Arial" w:eastAsia="Arial" w:hAnsi="Arial"/>
-          <w:sz w:val="21"/>
-          <w:szCs w:val="21"/>
-        </w:rPr>
-        <w:t xml:space="preserve">8 sec</w:t>
-      </w:r>
-    </w:p>
-    <w:p>
-      <w:pPr>
-        <w:shd w:fill="F2F2F2" w:val="clear"/>
-        <w:spacing w:after="80"/>
-      </w:pPr>
-      <w:r>
-        <w:rPr>
-          <w:rFonts w:ascii="Arial" w:cs="Arial" w:eastAsia="Arial" w:hAnsi="Arial"/>
-          <w:sz w:val="20"/>
-          <w:szCs w:val="20"/>
-        </w:rPr>
-        <w:t xml:space="preserve">VOICE RULE: only the voice-over narration speaks words; it is a voice only, never a person or character on screen. No character says any word and no one on screen lip-syncs to speech; characters communicate with facial expressions and body gestures. Natural non-verbal sounds are allowed and should sound real: laughing, giggling, gasping, sighing, groaning, cheering, coughing. Attached reference images, in order: the Egyptian wedding guests, the wedding courtyard. 2D hand-drawn Stickman animation, clean thin black outlines, large expressive heads, simple readable stickman proportions, flat warm colors, playful cinematic documentary-comedy tone, 16:9. Use the attached reference images as strict continuity anchors: preserve faces, hair, clothing, colors, proportions and accessories exactly; every character keeps a full body with a visible chest and torso exactly as in the references. Characters, identical in every frame: the musicians: guests in white linen playing harp, frame drum and reed flute. the guests: Egyptian wedding guests in white linen with blue-and-gold collars and gold headbands, black bob hairstyles, some in white striped headdresses. They wear only short white kilts or simple white dresses: no togas, no draped robes. Setting: sunny daytime ancient Egyptian wedding courtyard in Alexandria: flat-roofed sandstone mud-brick buildings, tall Egyptian columns with lotus-bud capitals painted in blue-and-gold bands, hieroglyph-style carvings on the walls, long tables with white cloths and clay jars, orange cloth awnings, and a tall wooden entrance gate at the back-center that opens onto the street. Egyptian architecture only: no Greek or Roman architecture, no triangular pediments, no domes, no red tile roofs, no cypress trees. Lighting: warm bright afternoon sunlight, soft shadows, rich saturated colors. ACTION TIMELINE (8 seconds): 0–2.5 s: an Egyptian musician plays the reed flute joyfully, eyes closed, the open gate visible behind him. 2.5–5.5 s: he stops abruptly, eyes opening, flute lowered, his expression turning alert. 5.5–8 s: he turns his head toward the gate, brow furrowed, listening, while the dancers behind him dance one more beat and then slow down. Camera: locked-off and perfectly still, eye-level medium shot of the musician with the entrance visible behind him; the framing never changes (no tilt, pan, zoom or rising camera). Audio: voice-over narration only (a voice, never shown on screen; no narrator character appears): a British male voice, warm and dry, begins speaking within half a second and says: “The musician noticed. He stopped. Everyone else danced one more beat, blissfully unaware.” The line takes about 5.2 seconds; leave the last second free of speech so the moment can land. Music: music nearly silent. Sound effects: music and drums cut out, one drum stops, timed to the action. Ambience: light courtyard ambience: clinking cups, footsteps on stone, a soft breeze, no words. Final reminder: no character says any word; only the voice-over narration speaks (voice only, nobody on screen is the narrator). Natural laughs, gasps and sighs are fine. No text, captions or logos in the frame.</w:t>
-      </w:r>
-    </w:p>
-    <w:p>
-      <w:pPr>
-        <w:pStyle w:val="Heading2"/>
-        <w:keepNext/>
-        <w:spacing w:after="60" w:before="260"/>
-      </w:pPr>
-      <w:r>
-        <w:rPr>
-          <w:rFonts w:ascii="Arial" w:cs="Arial" w:eastAsia="Arial" w:hAnsi="Arial"/>
-          <w:b/>
-          <w:bCs/>
-          <w:sz w:val="26"/>
-          <w:szCs w:val="26"/>
-        </w:rPr>
-        <w:t xml:space="preserve">SHOT 22 — First Roman step</w:t>
-      </w:r>
-    </w:p>
-    <w:p>
-      <w:pPr>
-        <w:keepNext/>
-        <w:spacing w:after="60" w:before="0"/>
-      </w:pPr>
-      <w:r>
-        <w:rPr>
-          <w:rFonts w:ascii="Arial" w:cs="Arial" w:eastAsia="Arial" w:hAnsi="Arial"/>
-          <w:b/>
-          <w:bCs/>
-          <w:sz w:val="21"/>
-          <w:szCs w:val="21"/>
-        </w:rPr>
-        <w:t xml:space="preserve">Attach: </w:t>
-      </w:r>
-      <w:r>
-        <w:rPr>
-          <w:rFonts w:ascii="Arial" w:cs="Arial" w:eastAsia="Arial" w:hAnsi="Arial"/>
-          <w:sz w:val="21"/>
-          <w:szCs w:val="21"/>
-        </w:rPr>
-        <w:t xml:space="preserve">Roman_soldiers.png</w:t>
-      </w:r>
-      <w:r>
-        <w:rPr>
-          <w:rFonts w:ascii="Arial" w:cs="Arial" w:eastAsia="Arial" w:hAnsi="Arial"/>
-          <w:b/>
-          <w:bCs/>
-          <w:sz w:val="21"/>
-          <w:szCs w:val="21"/>
-        </w:rPr>
-        <w:t xml:space="preserve">      Duration: </w:t>
-      </w:r>
-      <w:r>
-        <w:rPr>
-          <w:rFonts w:ascii="Arial" w:cs="Arial" w:eastAsia="Arial" w:hAnsi="Arial"/>
-          <w:sz w:val="21"/>
-          <w:szCs w:val="21"/>
-        </w:rPr>
-        <w:t xml:space="preserve">4 sec</w:t>
-      </w:r>
-    </w:p>
-    <w:p>
-      <w:pPr>
-        <w:shd w:fill="F2F2F2" w:val="clear"/>
-        <w:spacing w:after="80"/>
-      </w:pPr>
-      <w:r>
-        <w:rPr>
-          <w:rFonts w:ascii="Arial" w:cs="Arial" w:eastAsia="Arial" w:hAnsi="Arial"/>
-          <w:sz w:val="20"/>
-          <w:szCs w:val="20"/>
-        </w:rPr>
-        <w:t xml:space="preserve">VOICE RULE: nobody speaks and no voice of any kind is heard in this clip; it is a sound-effects-only beat. Attached reference images, in order: the Roman soldiers. 2D hand-drawn Stickman animation, clean thin black outlines, large expressive heads, simple readable stickman proportions, flat warm colors, playful cinematic documentary-comedy tone, 16:9. Use the attached reference images as strict continuity anchors: preserve faces, hair, clothing, colors, proportions and accessories exactly; every character keeps a full body with a visible chest and torso exactly as in the references. Characters, identical in every frame: the Roman soldiers: crimson plumed helmets, steel armor, red cloaks, rectangular red shields. Setting: sunlit street of ancient Alexandria outside the wedding house, sandstone walls, palms, market stalls with red and blue awnings. Flat-roofed Egyptian sandstone buildings; no Greek or Roman architecture, no domes. Lighting: warm bright sunlight, soft shadows. ACTION TIMELINE (4 seconds): 0–1 s: empty sunlit stone paving, dust drifting. 1–2 s: the first heavy Roman boot steps into frame from the side, the hem of a red cloak visible, dust puffing. 2–3 s: the second boot follows. 3–4 s: a third step lands; only boots and lower legs are ever visible. Camera: locked-off and perfectly still, fixed ground-level frame on the street; the boots step into frame from the side and the camera never rises; the framing never changes (no tilt, pan, zoom or rising camera). Audio: no narration and no speech. Music: low sustained tension with distant marching drums, almost silent. Sound effects: heavy boot steps with metal clank, timed to each step. Ambience: sunlit street ambience: wind and distant clatter, no words. Final reminder: no voice of any kind in this clip. No text, captions or logos in the frame.</w:t>
-      </w:r>
-    </w:p>
-    <w:p>
-      <w:pPr>
-        <w:pStyle w:val="Heading2"/>
-        <w:keepNext/>
-        <w:spacing w:after="60" w:before="260"/>
-      </w:pPr>
-      <w:r>
-        <w:rPr>
-          <w:rFonts w:ascii="Arial" w:cs="Arial" w:eastAsia="Arial" w:hAnsi="Arial"/>
-          <w:b/>
-          <w:bCs/>
-          <w:sz w:val="26"/>
-          <w:szCs w:val="26"/>
-        </w:rPr>
-        <w:t xml:space="preserve">SHOT 24 — Wedding oblivious</w:t>
-      </w:r>
-    </w:p>
-    <w:p>
-      <w:pPr>
-        <w:keepNext/>
-        <w:spacing w:after="60" w:before="0"/>
-      </w:pPr>
-      <w:r>
-        <w:rPr>
-          <w:rFonts w:ascii="Arial" w:cs="Arial" w:eastAsia="Arial" w:hAnsi="Arial"/>
-          <w:b/>
-          <w:bCs/>
-          <w:sz w:val="21"/>
-          <w:szCs w:val="21"/>
-        </w:rPr>
-        <w:t xml:space="preserve">Attach: </w:t>
-      </w:r>
-      <w:r>
-        <w:rPr>
-          <w:rFonts w:ascii="Arial" w:cs="Arial" w:eastAsia="Arial" w:hAnsi="Arial"/>
-          <w:sz w:val="21"/>
-          <w:szCs w:val="21"/>
-        </w:rPr>
-        <w:t xml:space="preserve">Courtyard_from_Shot1.png,  Senbi_from_Shot1.png,  Bride_from_Shot1.png</w:t>
-      </w:r>
-      <w:r>
-        <w:rPr>
-          <w:rFonts w:ascii="Arial" w:cs="Arial" w:eastAsia="Arial" w:hAnsi="Arial"/>
-          <w:b/>
-          <w:bCs/>
-          <w:sz w:val="21"/>
-          <w:szCs w:val="21"/>
-        </w:rPr>
-        <w:t xml:space="preserve">      Duration: </w:t>
-      </w:r>
-      <w:r>
-        <w:rPr>
-          <w:rFonts w:ascii="Arial" w:cs="Arial" w:eastAsia="Arial" w:hAnsi="Arial"/>
-          <w:sz w:val="21"/>
-          <w:szCs w:val="21"/>
-        </w:rPr>
-        <w:t xml:space="preserve">6 sec</w:t>
-      </w:r>
-    </w:p>
-    <w:p>
-      <w:pPr>
-        <w:shd w:fill="F2F2F2" w:val="clear"/>
-        <w:spacing w:after="80"/>
-      </w:pPr>
-      <w:r>
-        <w:rPr>
-          <w:rFonts w:ascii="Arial" w:cs="Arial" w:eastAsia="Arial" w:hAnsi="Arial"/>
-          <w:sz w:val="20"/>
-          <w:szCs w:val="20"/>
-        </w:rPr>
-        <w:t xml:space="preserve">VOICE RULE: only the voice-over narration speaks words; it is a voice only, never a person or character on screen. No character says any word and no one on screen lip-syncs to speech; characters communicate with facial expressions and body gestures. Natural non-verbal sounds are allowed and should sound real: laughing, giggling, gasping, sighing, groaning, cheering, coughing. Attached reference images, in order: the wedding courtyard, Senbi, the groom, the bride. 2D hand-drawn Stickman animation, clean thin black outlines, large expressive heads, simple readable stickman proportions, flat warm colors, playful cinematic documentary-comedy tone, 16:9. Use the attached reference images as strict continuity anchors: preserve faces, hair, clothing, colors, proportions and accessories exactly; every character keeps a full body with a visible chest and torso exactly as in the references. Characters, identical in every frame: Senbi the groom: young man with a full body and a visible chest, straight black bowl-cut hair with bangs, gold headband with a gold cobra, blue-and-gold broad collar resting on his bare chest, gold bracers on both wrists, white kilt with a blue-and-gold sash, brown sandals. the bride: black bob hair with straight bangs, gold headband with a red gem, white dress, blue-and-gold collar, gold sash, gold arm cuffs, light veil. the guests: Egyptian wedding guests in white linen with blue-and-gold collars and gold headbands, black bob hairstyles, some in white striped headdresses. They wear only short white kilts or simple white dresses: no togas, no draped robes. Setting: sunny daytime ancient Egyptian wedding courtyard in Alexandria: flat-roofed sandstone mud-brick buildings, tall Egyptian columns with lotus-bud capitals painted in blue-and-gold bands, hieroglyph-style carvings on the walls, long tables with white cloths and clay jars, orange cloth awnings, and a tall wooden entrance gate at the back-center that opens onto the street. Egyptian architecture only: no Greek or Roman architecture, no triangular pediments, no domes, no red tile roofs, no cypress trees. Lighting: warm bright afternoon sunlight, soft shadows, rich saturated colors. ACTION TIMELINE (6 seconds): 0–2 s: guests dance and laugh while Senbi spins happily in the center, arms out. 2–4 s: the bride claps in rhythm beside him. 4–6 s: Senbi keeps spinning, eyes closed in bliss; the gate behind them stays calm. Camera: locked-off and perfectly still, eye-level medium-wide shot of the courtyard; the framing never changes (no tilt, pan, zoom or rising camera). Audio: voice-over narration only (a voice, never shown on screen; no narrator character appears): a British male voice, warm and dry, begins speaking within half a second and says: “Inside, nobody had a clue. Senbi was busy spinning.” The line takes about 3.6 seconds; leave the last second free of speech so the moment can land. Music: light ancient-Mediterranean wedding music (frame drums, reed flute, plucked strings) with a faint uneasy undertone, same theme in every clip, low under the voice. Sound effects: wedding music muffled, faint thump, timed to the action. Ambience: light courtyard ambience: clinking cups, footsteps on stone, a soft breeze, no words. Final reminder: no character says any word; only the voice-over narration speaks (voice only, nobody on screen is the narrator). Natural laughs, gasps and sighs are fine. No text, captions or logos in the frame.</w:t>
-      </w:r>
-    </w:p>
-    <w:p>
-      <w:pPr>
-        <w:pStyle w:val="Heading2"/>
-        <w:keepNext/>
-        <w:spacing w:after="60" w:before="260"/>
-      </w:pPr>
-      <w:r>
-        <w:rPr>
-          <w:rFonts w:ascii="Arial" w:cs="Arial" w:eastAsia="Arial" w:hAnsi="Arial"/>
-          <w:b/>
-          <w:bCs/>
-          <w:sz w:val="26"/>
-          <w:szCs w:val="26"/>
-        </w:rPr>
-        <w:t xml:space="preserve">SHOT 25 — Roman reveal</w:t>
-      </w:r>
-    </w:p>
-    <w:p>
-      <w:pPr>
-        <w:keepNext/>
-        <w:spacing w:after="60" w:before="0"/>
-      </w:pPr>
-      <w:r>
-        <w:rPr>
-          <w:rFonts w:ascii="Arial" w:cs="Arial" w:eastAsia="Arial" w:hAnsi="Arial"/>
-          <w:b/>
-          <w:bCs/>
-          <w:sz w:val="21"/>
-          <w:szCs w:val="21"/>
-        </w:rPr>
-        <w:t xml:space="preserve">Attach: </w:t>
-      </w:r>
-      <w:r>
-        <w:rPr>
-          <w:rFonts w:ascii="Arial" w:cs="Arial" w:eastAsia="Arial" w:hAnsi="Arial"/>
-          <w:sz w:val="21"/>
-          <w:szCs w:val="21"/>
-        </w:rPr>
-        <w:t xml:space="preserve">Roman_soldiers.png</w:t>
-      </w:r>
-      <w:r>
-        <w:rPr>
-          <w:rFonts w:ascii="Arial" w:cs="Arial" w:eastAsia="Arial" w:hAnsi="Arial"/>
-          <w:b/>
-          <w:bCs/>
-          <w:sz w:val="21"/>
-          <w:szCs w:val="21"/>
-        </w:rPr>
-        <w:t xml:space="preserve">      Duration: </w:t>
-      </w:r>
-      <w:r>
-        <w:rPr>
-          <w:rFonts w:ascii="Arial" w:cs="Arial" w:eastAsia="Arial" w:hAnsi="Arial"/>
-          <w:sz w:val="21"/>
-          <w:szCs w:val="21"/>
-        </w:rPr>
-        <w:t xml:space="preserve">8 sec</w:t>
-      </w:r>
-    </w:p>
-    <w:p>
-      <w:pPr>
-        <w:shd w:fill="F2F2F2" w:val="clear"/>
-        <w:spacing w:after="80"/>
-      </w:pPr>
-      <w:r>
-        <w:rPr>
-          <w:rFonts w:ascii="Arial" w:cs="Arial" w:eastAsia="Arial" w:hAnsi="Arial"/>
-          <w:sz w:val="20"/>
-          <w:szCs w:val="20"/>
-        </w:rPr>
-        <w:t xml:space="preserve">VOICE RULE: only the voice-over narration speaks words; it is a voice only, never a person or character on screen. No character says any word and no one on screen lip-syncs to speech; characters communicate with facial expressions and body gestures. Natural non-verbal sounds are allowed and should sound real: laughing, giggling, gasping, sighing, groaning, cheering, coughing. Attached reference images, in order: the Roman soldiers. 2D hand-drawn Stickman animation, clean thin black outlines, large expressive heads, simple readable stickman proportions, flat warm colors, playful cinematic documentary-comedy tone, 16:9. Use the attached reference images as strict continuity anchors: preserve faces, hair, clothing, colors, proportions and accessories exactly; every character keeps a full body with a visible chest and torso exactly as in the references. Characters, identical in every frame: the Roman soldiers: crimson plumed helmets, steel armor, red cloaks, rectangular red shields. Setting: sunlit street of ancient Alexandria outside the wedding house, sandstone walls, palms, market stalls with red and blue awnings. Flat-roofed Egyptian sandstone buildings; no Greek or Roman architecture, no domes. Lighting: warm bright sunlight, soft shadows. ACTION TIMELINE (8 seconds): 0–2.5 s: the street is empty and the sound of boots grows. 2.5–5.5 s: two tired, dusty Roman legionaries walk into frame, shields and spears in hand, shoulders slumped, dust on their armor. 5.5–8 s: they stop in front of the wedding house and look around, then at each other, confused; one scratches under his helmet. Camera: locked-off and perfectly still, eye-level medium-wide shot of the street; the soldiers walk into the frame; the framing never changes (no tilt, pan, zoom or rising camera). Audio: voice-over narration only (a voice, never shown on screen; no narrator character appears): a British male voice, warm and dry, begins speaking within half a second and says: “And then Rome arrived. Tired, dusty, and looking for the right address.” The line takes about 4.8 seconds; leave the last second free of speech so the moment can land. Music: low sustained tension with distant marching drums, almost silent. Sound effects: armor clank, dust, a tired sigh, timed to the action. Ambience: sunlit street ambience: wind and distant clatter, no words. Final reminder: no character says any word; only the voice-over narration speaks (voice only, nobody on screen is the narrator). Natural laughs, gasps and sighs are fine. No text, captions or logos in the frame.</w:t>
-      </w:r>
-    </w:p>
-    <w:p>
-      <w:pPr>
-        <w:pStyle w:val="Heading2"/>
-        <w:keepNext/>
-        <w:spacing w:after="60" w:before="260"/>
-      </w:pPr>
-      <w:r>
-        <w:rPr>
-          <w:rFonts w:ascii="Arial" w:cs="Arial" w:eastAsia="Arial" w:hAnsi="Arial"/>
-          <w:b/>
-          <w:bCs/>
-          <w:sz w:val="26"/>
-          <w:szCs w:val="26"/>
-        </w:rPr>
-        <w:t xml:space="preserve">SHOT 26 — Egyptians stare</w:t>
-      </w:r>
-    </w:p>
-    <w:p>
-      <w:pPr>
-        <w:keepNext/>
-        <w:spacing w:after="60" w:before="0"/>
-      </w:pPr>
-      <w:r>
-        <w:rPr>
-          <w:rFonts w:ascii="Arial" w:cs="Arial" w:eastAsia="Arial" w:hAnsi="Arial"/>
-          <w:b/>
-          <w:bCs/>
-          <w:sz w:val="21"/>
-          <w:szCs w:val="21"/>
-        </w:rPr>
-        <w:t xml:space="preserve">Attach: </w:t>
-      </w:r>
-      <w:r>
-        <w:rPr>
-          <w:rFonts w:ascii="Arial" w:cs="Arial" w:eastAsia="Arial" w:hAnsi="Arial"/>
-          <w:sz w:val="21"/>
-          <w:szCs w:val="21"/>
-        </w:rPr>
-        <w:t xml:space="preserve">Guests_group.png,  Roman_soldiers.png,  Courtyard_from_Shot1.png</w:t>
-      </w:r>
-      <w:r>
-        <w:rPr>
-          <w:rFonts w:ascii="Arial" w:cs="Arial" w:eastAsia="Arial" w:hAnsi="Arial"/>
-          <w:b/>
-          <w:bCs/>
-          <w:sz w:val="21"/>
-          <w:szCs w:val="21"/>
-        </w:rPr>
-        <w:t xml:space="preserve">      Duration: </w:t>
-      </w:r>
-      <w:r>
-        <w:rPr>
-          <w:rFonts w:ascii="Arial" w:cs="Arial" w:eastAsia="Arial" w:hAnsi="Arial"/>
-          <w:sz w:val="21"/>
-          <w:szCs w:val="21"/>
-        </w:rPr>
-        <w:t xml:space="preserve">8 sec</w:t>
-      </w:r>
-    </w:p>
-    <w:p>
-      <w:pPr>
-        <w:shd w:fill="F2F2F2" w:val="clear"/>
-        <w:spacing w:after="80"/>
-      </w:pPr>
-      <w:r>
-        <w:rPr>
-          <w:rFonts w:ascii="Arial" w:cs="Arial" w:eastAsia="Arial" w:hAnsi="Arial"/>
-          <w:sz w:val="20"/>
-          <w:szCs w:val="20"/>
-        </w:rPr>
-        <w:t xml:space="preserve">VOICE RULE: only the voice-over narration speaks words; it is a voice only, never a person or character on screen. No character says any word and no one on screen lip-syncs to speech; characters communicate with facial expressions and body gestures. Natural non-verbal sounds are allowed and should sound real: laughing, giggling, gasping, sighing, groaning, cheering, coughing. Attached reference images, in order: the Egyptian wedding guests, the Roman soldiers, the wedding courtyard. 2D hand-drawn Stickman animation, clean thin black outlines, large expressive heads, simple readable stickman proportions, flat warm colors, playful cinematic documentary-comedy tone, 16:9. Use the attached reference images as strict continuity anchors: preserve faces, hair, clothing, colors, proportions and accessories exactly; every character keeps a full body with a visible chest and torso exactly as in the references. Characters, identical in every frame: the guests: Egyptian wedding guests in white linen with blue-and-gold collars and gold headbands, black bob hairstyles, some in white striped headdresses. They wear only short white kilts or simple white dresses: no togas, no draped robes. Setting: sunlit street of ancient Alexandria outside the wedding house, sandstone walls, palms, market stalls with red and blue awnings. Flat-roofed Egyptian sandstone buildings; no Greek or Roman architecture, no domes. Lighting: warm bright sunlight, soft shadows. ACTION TIMELINE (8 seconds): 0–2.5 s: three guests peek out of the doorway at the same time: the left one terrified with wide eyes and hands on cheeks, the center one confused with a tilted head and one raised eyebrow, the right one grinning and clapping softly as if watching entertainers. 2.5–5.5 s: the terrified one ducks back and peeks out again. 5.5–8 s: the grinning one nudges the confused one and points, delighted, while the confused one squints. Camera: locked-off and perfectly still, eye-level medium-wide shot of the doorway with all three guests peeking in the same frame; the framing never changes (no tilt, pan, zoom or rising camera). Audio: voice-over narration only (a voice, never shown on screen; no narrator character appears): a British male voice, warm and dry, begins speaking within half a second and says: “The guests peeked out. One terrified. One confused. One assumed it was entertainment.” The line takes about 5.2 seconds; leave the last second free of speech so the moment can land. Music: music nearly silent. Sound effects: nervous coughs and gasps, no words, timed to the action. Ambience: sunlit street ambience: wind and distant clatter, no words. Final reminder: no character says any word; only the voice-over narration speaks (voice only, nobody on screen is the narrator). Natural laughs, gasps and sighs are fine. No text, captions or logos in the frame.</w:t>
-      </w:r>
-    </w:p>
-    <w:p>
-      <w:pPr>
-        <w:pStyle w:val="Heading2"/>
-        <w:keepNext/>
-        <w:spacing w:after="60" w:before="260"/>
-      </w:pPr>
-      <w:r>
-        <w:rPr>
-          <w:rFonts w:ascii="Arial" w:cs="Arial" w:eastAsia="Arial" w:hAnsi="Arial"/>
-          <w:b/>
-          <w:bCs/>
-          <w:sz w:val="26"/>
-          <w:szCs w:val="26"/>
-        </w:rPr>
-        <w:t xml:space="preserve">SHOT 27 — Drunk uncle</w:t>
-      </w:r>
-    </w:p>
-    <w:p>
-      <w:pPr>
-        <w:keepNext/>
-        <w:spacing w:after="60" w:before="0"/>
-      </w:pPr>
-      <w:r>
-        <w:rPr>
-          <w:rFonts w:ascii="Arial" w:cs="Arial" w:eastAsia="Arial" w:hAnsi="Arial"/>
-          <w:b/>
-          <w:bCs/>
-          <w:sz w:val="21"/>
-          <w:szCs w:val="21"/>
-        </w:rPr>
-        <w:t xml:space="preserve">Attach: </w:t>
-      </w:r>
-      <w:r>
-        <w:rPr>
-          <w:rFonts w:ascii="Arial" w:cs="Arial" w:eastAsia="Arial" w:hAnsi="Arial"/>
-          <w:sz w:val="21"/>
-          <w:szCs w:val="21"/>
-        </w:rPr>
-        <w:t xml:space="preserve">Relatives_group.png,  Roman_soldiers.png,  Courtyard_from_Shot1.png</w:t>
-      </w:r>
-      <w:r>
-        <w:rPr>
-          <w:rFonts w:ascii="Arial" w:cs="Arial" w:eastAsia="Arial" w:hAnsi="Arial"/>
-          <w:b/>
-          <w:bCs/>
-          <w:sz w:val="21"/>
-          <w:szCs w:val="21"/>
-        </w:rPr>
-        <w:t xml:space="preserve">      Duration: </w:t>
-      </w:r>
-      <w:r>
-        <w:rPr>
-          <w:rFonts w:ascii="Arial" w:cs="Arial" w:eastAsia="Arial" w:hAnsi="Arial"/>
-          <w:sz w:val="21"/>
-          <w:szCs w:val="21"/>
-        </w:rPr>
-        <w:t xml:space="preserve">8 sec</w:t>
-      </w:r>
-    </w:p>
-    <w:p>
-      <w:pPr>
-        <w:shd w:fill="F2F2F2" w:val="clear"/>
-        <w:spacing w:after="80"/>
-      </w:pPr>
-      <w:r>
-        <w:rPr>
-          <w:rFonts w:ascii="Arial" w:cs="Arial" w:eastAsia="Arial" w:hAnsi="Arial"/>
-          <w:sz w:val="20"/>
-          <w:szCs w:val="20"/>
-        </w:rPr>
-        <w:t xml:space="preserve">VOICE RULE: only the voice-over narration speaks words; it is a voice only, never a person or character on screen. No character says any word and no one on screen lip-syncs to speech; characters communicate with facial expressions and body gestures. Natural non-verbal sounds are allowed and should sound real: laughing, giggling, gasping, sighing, groaning, cheering, coughing. Attached reference images, in order: the bride's relatives, the Roman soldiers, the wedding courtyard. 2D hand-drawn Stickman animation, clean thin black outlines, large expressive heads, simple readable stickman proportions, flat warm colors, playful cinematic documentary-comedy tone, 16:9. Use the attached reference images as strict continuity anchors: preserve faces, hair, clothing, colors, proportions and accessories exactly; every character keeps a full body with a visible chest and torso exactly as in the references. Characters, identical in every frame: the uncle: cheerful bearded middle-aged man in plain white linen. the Roman soldiers: crimson plumed helmets, steel armor, red cloaks, rectangular red shields. Setting: sunlit street of ancient Alexandria outside the wedding house, sandstone walls, palms, market stalls with red and blue awnings. Flat-roofed Egyptian sandstone buildings; no Greek or Roman architecture, no domes. Lighting: warm bright sunlight, soft shadows. ACTION TIMELINE (8 seconds): 0–2.5 s: a cheerful, slightly tipsy bearded uncle sways with a clay beer cup in hand, cheeks rosy, two Roman soldiers waiting at the right edge of the frame. 2.5–5.5 s: he strides confidently across the frame toward the soldiers, cup raised in greeting. 5.5–8 s: he arrives and extends the cup with a wide smile. Camera: locked-off and perfectly still, eye-level medium-wide shot; the uncle walks across the frame; the framing never changes (no tilt, pan, zoom or rising camera). Audio: voice-over narration only (a voice, never shown on screen; no narrator character appears): a British male voice, warm and dry, begins speaking within half a second and says: “Then one uncle, a man with absolutely no fear, grabbed a beer.” The line takes about 4.8 seconds; leave the last second free of speech so the moment can land. Music: playful comic percussion over the wedding rhythm, low under the voice. Sound effects: cup clink, timed to the action. Ambience: sunlit street ambience: wind and distant clatter, no words. Final reminder: no character says any word; only the voice-over narration speaks (voice only, nobody on screen is the narrator). Natural laughs, gasps and sighs are fine. No text, captions or logos in the frame.</w:t>
-      </w:r>
-    </w:p>
-    <w:p>
-      <w:pPr>
-        <w:pStyle w:val="Heading2"/>
-        <w:keepNext/>
-        <w:spacing w:after="60" w:before="260"/>
-      </w:pPr>
-      <w:r>
-        <w:rPr>
-          <w:rFonts w:ascii="Arial" w:cs="Arial" w:eastAsia="Arial" w:hAnsi="Arial"/>
-          <w:b/>
-          <w:bCs/>
-          <w:sz w:val="26"/>
-          <w:szCs w:val="26"/>
-        </w:rPr>
-        <w:t xml:space="preserve">SHOT 29 — Roman confusion</w:t>
-      </w:r>
-    </w:p>
-    <w:p>
-      <w:pPr>
-        <w:keepNext/>
-        <w:spacing w:after="60" w:before="0"/>
-      </w:pPr>
-      <w:r>
-        <w:rPr>
-          <w:rFonts w:ascii="Arial" w:cs="Arial" w:eastAsia="Arial" w:hAnsi="Arial"/>
-          <w:b/>
-          <w:bCs/>
-          <w:sz w:val="21"/>
-          <w:szCs w:val="21"/>
-        </w:rPr>
-        <w:t xml:space="preserve">Attach: </w:t>
-      </w:r>
-      <w:r>
-        <w:rPr>
-          <w:rFonts w:ascii="Arial" w:cs="Arial" w:eastAsia="Arial" w:hAnsi="Arial"/>
-          <w:sz w:val="21"/>
-          <w:szCs w:val="21"/>
-        </w:rPr>
-        <w:t xml:space="preserve">Roman_soldiers.png</w:t>
-      </w:r>
-      <w:r>
-        <w:rPr>
-          <w:rFonts w:ascii="Arial" w:cs="Arial" w:eastAsia="Arial" w:hAnsi="Arial"/>
-          <w:b/>
-          <w:bCs/>
-          <w:sz w:val="21"/>
-          <w:szCs w:val="21"/>
-        </w:rPr>
-        <w:t xml:space="preserve">      Duration: </w:t>
-      </w:r>
-      <w:r>
-        <w:rPr>
-          <w:rFonts w:ascii="Arial" w:cs="Arial" w:eastAsia="Arial" w:hAnsi="Arial"/>
-          <w:sz w:val="21"/>
-          <w:szCs w:val="21"/>
-        </w:rPr>
-        <w:t xml:space="preserve">8 sec</w:t>
-      </w:r>
-    </w:p>
-    <w:p>
-      <w:pPr>
-        <w:shd w:fill="F2F2F2" w:val="clear"/>
-        <w:spacing w:after="80"/>
-      </w:pPr>
-      <w:r>
-        <w:rPr>
-          <w:rFonts w:ascii="Arial" w:cs="Arial" w:eastAsia="Arial" w:hAnsi="Arial"/>
-          <w:sz w:val="20"/>
-          <w:szCs w:val="20"/>
-        </w:rPr>
-        <w:t xml:space="preserve">VOICE RULE: only the voice-over narration speaks words; it is a voice only, never a person or character on screen. No character says any word and no one on screen lip-syncs to speech; characters communicate with facial expressions and body gestures. Natural non-verbal sounds are allowed and should sound real: laughing, giggling, gasping, sighing, groaning, cheering, coughing. Attached reference images, in order: the Roman soldiers. 2D hand-drawn Stickman animation, clean thin black outlines, large expressive heads, simple readable stickman proportions, flat warm colors, playful cinematic documentary-comedy tone, 16:9. Use the attached reference images as strict continuity anchors: preserve faces, hair, clothing, colors, proportions and accessories exactly; every character keeps a full body with a visible chest and torso exactly as in the references. Characters, identical in every frame: the Roman soldiers: crimson plumed helmets, steel armor, red cloaks, rectangular red shields. Setting: sunlit street of ancient Alexandria outside the wedding house, sandstone walls, palms, market stalls with red and blue awnings. Flat-roofed Egyptian sandstone buildings; no Greek or Roman architecture, no domes. Lighting: warm bright sunlight, soft shadows. ACTION TIMELINE (8 seconds): 0–2.5 s: the soldier's confused face looks at the beer cup. 2.5–5.5 s: he looks up at the uncle's smiling face off-screen and back to the cup, then cautiously takes it. 5.5–8 s: his eyes slide sideways toward his comrades in a silent plea of 'what do I do?'; he sniffs the cup. Camera: eye-level medium close-up of the soldier; fixed except for an almost imperceptible 5% slow push-in, no tilt or pan. Audio: voice-over narration only (a voice, never shown on screen; no narrator character appears): a British male voice, warm and dry, begins speaking within half a second and says: “The soldier stared at the cup, then the uncle. A trap? Or hospitality?” The line takes about 5.2 seconds; leave the last second free of speech so the moment can land. Music: music nearly silent. Sound effects: tiny gulp, uneasy hum, timed to the action. Ambience: sunlit street ambience: wind and distant clatter, no words. Final reminder: no character says any word; only the voice-over narration speaks (voice only, nobody on screen is the narrator). Natural laughs, gasps and sighs are fine. No text, captions or logos in the frame.</w:t>
-      </w:r>
-    </w:p>
-    <w:p>
-      <w:pPr>
-        <w:pStyle w:val="Heading2"/>
-        <w:keepNext/>
-        <w:spacing w:after="60" w:before="260"/>
-      </w:pPr>
-      <w:r>
-        <w:rPr>
-          <w:rFonts w:ascii="Arial" w:cs="Arial" w:eastAsia="Arial" w:hAnsi="Arial"/>
-          <w:b/>
-          <w:bCs/>
-          <w:sz w:val="26"/>
-          <w:szCs w:val="26"/>
-        </w:rPr>
-        <w:t xml:space="preserve">SHOT 30 — Food wins</w:t>
-      </w:r>
-    </w:p>
-    <w:p>
-      <w:pPr>
-        <w:keepNext/>
-        <w:spacing w:after="60" w:before="0"/>
-      </w:pPr>
-      <w:r>
-        <w:rPr>
-          <w:rFonts w:ascii="Arial" w:cs="Arial" w:eastAsia="Arial" w:hAnsi="Arial"/>
-          <w:b/>
-          <w:bCs/>
-          <w:sz w:val="21"/>
-          <w:szCs w:val="21"/>
-        </w:rPr>
-        <w:t xml:space="preserve">Attach: </w:t>
-      </w:r>
-      <w:r>
-        <w:rPr>
-          <w:rFonts w:ascii="Arial" w:cs="Arial" w:eastAsia="Arial" w:hAnsi="Arial"/>
-          <w:sz w:val="21"/>
-          <w:szCs w:val="21"/>
-        </w:rPr>
-        <w:t xml:space="preserve">Roman_soldiers.png,  Courtyard_from_Shot1.png</w:t>
-      </w:r>
-      <w:r>
-        <w:rPr>
-          <w:rFonts w:ascii="Arial" w:cs="Arial" w:eastAsia="Arial" w:hAnsi="Arial"/>
-          <w:b/>
-          <w:bCs/>
-          <w:sz w:val="21"/>
-          <w:szCs w:val="21"/>
-        </w:rPr>
-        <w:t xml:space="preserve">      Duration: </w:t>
-      </w:r>
-      <w:r>
-        <w:rPr>
-          <w:rFonts w:ascii="Arial" w:cs="Arial" w:eastAsia="Arial" w:hAnsi="Arial"/>
-          <w:sz w:val="21"/>
-          <w:szCs w:val="21"/>
-        </w:rPr>
-        <w:t xml:space="preserve">8 sec</w:t>
-      </w:r>
-    </w:p>
-    <w:p>
-      <w:pPr>
-        <w:shd w:fill="F2F2F2" w:val="clear"/>
-        <w:spacing w:after="80"/>
-      </w:pPr>
-      <w:r>
-        <w:rPr>
-          <w:rFonts w:ascii="Arial" w:cs="Arial" w:eastAsia="Arial" w:hAnsi="Arial"/>
-          <w:sz w:val="20"/>
-          <w:szCs w:val="20"/>
-        </w:rPr>
-        <w:t xml:space="preserve">VOICE RULE: only the voice-over narration speaks words; it is a voice only, never a person or character on screen. No character says any word and no one on screen lip-syncs to speech; characters communicate with facial expressions and body gestures. Natural non-verbal sounds are allowed and should sound real: laughing, giggling, gasping, sighing, groaning, cheering, coughing. Attached reference images, in order: the Roman soldiers, the wedding courtyard. 2D hand-drawn Stickman animation, clean thin black outlines, large expressive heads, simple readable stickman proportions, flat warm colors, playful cinematic documentary-comedy tone, 16:9. Use the attached reference images as strict continuity anchors: preserve faces, hair, clothing, colors, proportions and accessories exactly; every character keeps a full body with a visible chest and torso exactly as in the references. Characters, identical in every frame: the Roman soldiers: crimson plumed helmets, steel armor, red cloaks, rectangular red shields. Setting: sunny daytime ancient Egyptian wedding courtyard in Alexandria: flat-roofed sandstone mud-brick buildings, tall Egyptian columns with lotus-bud capitals painted in blue-and-gold bands, hieroglyph-style carvings on the walls, long tables with white cloths and clay jars, orange cloth awnings, and a tall wooden entrance gate at the back-center that opens onto the street. Egyptian architecture only: no Greek or Roman architecture, no triangular pediments, no domes, no red tile roofs, no cypress trees. Lighting: warm bright afternoon sunlight, soft shadows, rich saturated colors. ACTION TIMELINE (8 seconds): 0–2.5 s: two Roman soldiers in the foreground scan the area with serious faces, the feast table behind them. 2.5–5.5 s: they turn their heads toward the roast goose, bread and fruit and their expressions soften. 5.5–8 s: one leans slightly forward, nostrils flaring, his stomach growls and the other glances at him. Camera: locked-off and perfectly still, eye-level wide-medium shot: the soldiers in the foreground, the feast table behind them; they turn their heads toward it; the framing never changes (no tilt, pan, zoom or rising camera). Audio: voice-over narration only (a voice, never shown on screen; no narrator character appears): a British male voice, warm and dry, begins speaking within half a second and says: “Then the Romans saw the food. Military discipline lasted about four seconds.” The line takes about 4.8 seconds; leave the last second free of speech so the moment can land. Music: playful comic percussion over the wedding rhythm, low under the voice. Sound effects: stomach growl, sniff, timed to the action. Ambience: light courtyard ambience: clinking cups, footsteps on stone, a soft breeze, no words. Final reminder: no character says any word; only the voice-over narration speaks (voice only, nobody on screen is the narrator). Natural laughs, gasps and sighs are fine. No text, captions or logos in the frame.</w:t>
-      </w:r>
-    </w:p>
-    <w:p>
-      <w:pPr>
-        <w:pStyle w:val="Heading2"/>
-        <w:keepNext/>
-        <w:spacing w:after="60" w:before="260"/>
-      </w:pPr>
-      <w:r>
-        <w:rPr>
-          <w:rFonts w:ascii="Arial" w:cs="Arial" w:eastAsia="Arial" w:hAnsi="Arial"/>
-          <w:b/>
-          <w:bCs/>
-          <w:sz w:val="26"/>
-          <w:szCs w:val="26"/>
-        </w:rPr>
-        <w:t xml:space="preserve">SHOT 31 — Accidental party</w:t>
-      </w:r>
-    </w:p>
-    <w:p>
-      <w:pPr>
-        <w:keepNext/>
-        <w:spacing w:after="60" w:before="0"/>
-      </w:pPr>
-      <w:r>
-        <w:rPr>
-          <w:rFonts w:ascii="Arial" w:cs="Arial" w:eastAsia="Arial" w:hAnsi="Arial"/>
-          <w:b/>
-          <w:bCs/>
-          <w:sz w:val="21"/>
-          <w:szCs w:val="21"/>
-        </w:rPr>
-        <w:t xml:space="preserve">Attach: </w:t>
-      </w:r>
-      <w:r>
-        <w:rPr>
-          <w:rFonts w:ascii="Arial" w:cs="Arial" w:eastAsia="Arial" w:hAnsi="Arial"/>
-          <w:sz w:val="21"/>
-          <w:szCs w:val="21"/>
-        </w:rPr>
-        <w:t xml:space="preserve">Roman_soldiers.png,  Guests_group.png,  Courtyard_from_Shot1.png</w:t>
-      </w:r>
-      <w:r>
-        <w:rPr>
-          <w:rFonts w:ascii="Arial" w:cs="Arial" w:eastAsia="Arial" w:hAnsi="Arial"/>
-          <w:b/>
-          <w:bCs/>
-          <w:sz w:val="21"/>
-          <w:szCs w:val="21"/>
-        </w:rPr>
-        <w:t xml:space="preserve">      Duration: </w:t>
-      </w:r>
-      <w:r>
-        <w:rPr>
-          <w:rFonts w:ascii="Arial" w:cs="Arial" w:eastAsia="Arial" w:hAnsi="Arial"/>
-          <w:sz w:val="21"/>
-          <w:szCs w:val="21"/>
-        </w:rPr>
-        <w:t xml:space="preserve">8 sec</w:t>
-      </w:r>
-    </w:p>
-    <w:p>
-      <w:pPr>
-        <w:shd w:fill="F2F2F2" w:val="clear"/>
-        <w:spacing w:after="80"/>
-      </w:pPr>
-      <w:r>
-        <w:rPr>
-          <w:rFonts w:ascii="Arial" w:cs="Arial" w:eastAsia="Arial" w:hAnsi="Arial"/>
-          <w:sz w:val="20"/>
-          <w:szCs w:val="20"/>
-        </w:rPr>
-        <w:t xml:space="preserve">VOICE RULE: only the voice-over narration speaks words; it is a voice only, never a person or character on screen. No character says any word and no one on screen lip-syncs to speech; characters communicate with facial expressions and body gestures. Natural non-verbal sounds are allowed and should sound real: laughing, giggling, gasping, sighing, groaning, cheering, coughing. Attached reference images, in order: the Roman soldiers, the Egyptian wedding guests, the wedding courtyard. 2D hand-drawn Stickman animation, clean thin black outlines, large expressive heads, simple readable stickman proportions, flat warm colors, playful cinematic documentary-comedy tone, 16:9. Use the attached reference images as strict continuity anchors: preserve faces, hair, clothing, colors, proportions and accessories exactly; every character keeps a full body with a visible chest and torso exactly as in the references. Characters, identical in every frame: the guests: Egyptian wedding guests in white linen with blue-and-gold collars and gold headbands, black bob hairstyles, some in white striped headdresses. They wear only short white kilts or simple white dresses: no togas, no draped robes. the Roman soldiers: crimson plumed helmets, steel armor, red cloaks, rectangular red shields. Setting: sunny daytime ancient Egyptian wedding courtyard in Alexandria: flat-roofed sandstone mud-brick buildings, tall Egyptian columns with lotus-bud capitals painted in blue-and-gold bands, hieroglyph-style carvings on the walls, long tables with white cloths and clay jars, orange cloth awnings, and a tall wooden entrance gate at the back-center that opens onto the street. Egyptian architecture only: no Greek or Roman architecture, no triangular pediments, no domes, no red tile roofs, no cypress trees. Lighting: warm bright afternoon sunlight, soft shadows, rich saturated colors. ACTION TIMELINE (8 seconds): 0–2.5 s: Egyptian guests dance in the courtyard. 2.5–5.5 s: one Roman soldier steps awkwardly onto the dance floor, stiff as a board; the guests freeze and stare. 5.5–8 s: one guest begins to copy his stiff step and the others hesitate, then join in. Camera: locked-off and perfectly still, eye-level wide shot; the framing never changes (no tilt, pan, zoom or rising camera). Audio: voice-over narration only (a voice, never shown on screen; no narrator character appears): a British male voice, warm and dry, begins speaking within half a second and says: “One soldier stepped into the dance. Nobody stopped him. Somehow, it worked.” The line takes about 4.8 seconds; leave the last second free of speech so the moment can land. Music: playful comic percussion over the wedding rhythm, low under the voice. Sound effects: shield tap blending into the rhythm, clapping, timed to the action. Ambience: light courtyard ambience: clinking cups, footsteps on stone, a soft breeze, no words. Final reminder: no character says any word; only the voice-over narration speaks (voice only, nobody on screen is the narrator). Natural laughs, gasps and sighs are fine. No text, captions or logos in the frame.</w:t>
-      </w:r>
-    </w:p>
-    <w:p>
-      <w:pPr>
-        <w:pStyle w:val="Heading2"/>
-        <w:keepNext/>
-        <w:spacing w:after="60" w:before="260"/>
-      </w:pPr>
-      <w:r>
-        <w:rPr>
-          <w:rFonts w:ascii="Arial" w:cs="Arial" w:eastAsia="Arial" w:hAnsi="Arial"/>
-          <w:b/>
-          <w:bCs/>
-          <w:sz w:val="26"/>
-          <w:szCs w:val="26"/>
-        </w:rPr>
-        <w:t xml:space="preserve">SHOT 32 — Armor dance</w:t>
-      </w:r>
-    </w:p>
-    <w:p>
-      <w:pPr>
-        <w:keepNext/>
-        <w:spacing w:after="60" w:before="0"/>
-      </w:pPr>
-      <w:r>
-        <w:rPr>
-          <w:rFonts w:ascii="Arial" w:cs="Arial" w:eastAsia="Arial" w:hAnsi="Arial"/>
-          <w:b/>
-          <w:bCs/>
-          <w:sz w:val="21"/>
-          <w:szCs w:val="21"/>
-        </w:rPr>
-        <w:t xml:space="preserve">Attach: </w:t>
-      </w:r>
-      <w:r>
-        <w:rPr>
-          <w:rFonts w:ascii="Arial" w:cs="Arial" w:eastAsia="Arial" w:hAnsi="Arial"/>
-          <w:sz w:val="21"/>
-          <w:szCs w:val="21"/>
-        </w:rPr>
-        <w:t xml:space="preserve">Roman_soldiers.png,  Guests_group.png,  Courtyard_from_Shot1.png</w:t>
-      </w:r>
-      <w:r>
-        <w:rPr>
-          <w:rFonts w:ascii="Arial" w:cs="Arial" w:eastAsia="Arial" w:hAnsi="Arial"/>
-          <w:b/>
-          <w:bCs/>
-          <w:sz w:val="21"/>
-          <w:szCs w:val="21"/>
-        </w:rPr>
-        <w:t xml:space="preserve">      Duration: </w:t>
-      </w:r>
-      <w:r>
-        <w:rPr>
-          <w:rFonts w:ascii="Arial" w:cs="Arial" w:eastAsia="Arial" w:hAnsi="Arial"/>
-          <w:sz w:val="21"/>
-          <w:szCs w:val="21"/>
-        </w:rPr>
-        <w:t xml:space="preserve">6 sec</w:t>
-      </w:r>
-    </w:p>
-    <w:p>
-      <w:pPr>
-        <w:shd w:fill="F2F2F2" w:val="clear"/>
-        <w:spacing w:after="80"/>
-      </w:pPr>
-      <w:r>
-        <w:rPr>
-          <w:rFonts w:ascii="Arial" w:cs="Arial" w:eastAsia="Arial" w:hAnsi="Arial"/>
-          <w:sz w:val="20"/>
-          <w:szCs w:val="20"/>
-        </w:rPr>
-        <w:t xml:space="preserve">VOICE RULE: only the voice-over narration speaks words; it is a voice only, never a person or character on screen. No character says any word and no one on screen lip-syncs to speech; characters communicate with facial expressions and body gestures. Natural non-verbal sounds are allowed and should sound real: laughing, giggling, gasping, sighing, groaning, cheering, coughing. Attached reference images, in order: the Roman soldiers, the Egyptian wedding guests, the wedding courtyard. 2D hand-drawn Stickman animation, clean thin black outlines, large expressive heads, simple readable stickman proportions, flat warm colors, playful cinematic documentary-comedy tone, 16:9. Use the attached reference images as strict continuity anchors: preserve faces, hair, clothing, colors, proportions and accessories exactly; every character keeps a full body with a visible chest and torso exactly as in the references. Characters, identical in every frame: the Roman soldiers: crimson plumed helmets, steel armor, red cloaks, rectangular red shields. the guests: Egyptian wedding guests in white linen with blue-and-gold collars and gold headbands, black bob hairstyles, some in white striped headdresses. They wear only short white kilts or simple white dresses: no togas, no draped robes. Setting: sunny daytime ancient Egyptian wedding courtyard in Alexandria: flat-roofed sandstone mud-brick buildings, tall Egyptian columns with lotus-bud capitals painted in blue-and-gold bands, hieroglyph-style carvings on the walls, long tables with white cloths and clay jars, orange cloth awnings, and a tall wooden entrance gate at the back-center that opens onto the street. Egyptian architecture only: no Greek or Roman architecture, no triangular pediments, no domes, no red tile roofs, no cypress trees. Lighting: warm bright afternoon sunlight, soft shadows, rich saturated colors. ACTION TIMELINE (6 seconds): 0–2 s: three Roman soldiers in full armor step to the right in a row, stiff but strangely synchronized, capes swaying, Egyptian dancers around them smiling and clapping. 2–4 s: they step to the left in unison. 4–6 s: all three raise one arm together in perfect unison, then stare at each other, confused. Camera: locked-off and perfectly still, eye-level wide shot of the dancing Romans; the framing never changes (no tilt, pan, zoom or rising camera). Audio: voice-over narration only (a voice, never shown on screen; no narrator character appears): a British male voice, warm and dry, begins speaking within half a second and says: “Roman engineering changed the world. Roman dancing did not.” The line takes about 3.6 seconds; leave the last second free of speech so the moment can land. Music: playful comic percussion over the wedding rhythm, low under the voice. Sound effects: armor clanking out of rhythm, timed to the action. Ambience: light courtyard ambience: clinking cups, footsteps on stone, a soft breeze, no words. Final reminder: no character says any word; only the voice-over narration speaks (voice only, nobody on screen is the narrator). Natural laughs, gasps and sighs are fine. No text, captions or logos in the frame.</w:t>
-      </w:r>
-    </w:p>
-    <w:p>
-      <w:pPr>
-        <w:pStyle w:val="Heading2"/>
-        <w:keepNext/>
-        <w:spacing w:after="60" w:before="260"/>
-      </w:pPr>
-      <w:r>
-        <w:rPr>
-          <w:rFonts w:ascii="Arial" w:cs="Arial" w:eastAsia="Arial" w:hAnsi="Arial"/>
-          <w:b/>
-          <w:bCs/>
-          <w:sz w:val="26"/>
-          <w:szCs w:val="26"/>
-        </w:rPr>
-        <w:t xml:space="preserve">SHOT 33 — Senbi joins</w:t>
-      </w:r>
-    </w:p>
-    <w:p>
-      <w:pPr>
-        <w:keepNext/>
-        <w:spacing w:after="60" w:before="0"/>
-      </w:pPr>
-      <w:r>
-        <w:rPr>
-          <w:rFonts w:ascii="Arial" w:cs="Arial" w:eastAsia="Arial" w:hAnsi="Arial"/>
-          <w:b/>
-          <w:bCs/>
-          <w:sz w:val="21"/>
-          <w:szCs w:val="21"/>
-        </w:rPr>
-        <w:t xml:space="preserve">Attach: </w:t>
-      </w:r>
-      <w:r>
-        <w:rPr>
-          <w:rFonts w:ascii="Arial" w:cs="Arial" w:eastAsia="Arial" w:hAnsi="Arial"/>
-          <w:sz w:val="21"/>
-          <w:szCs w:val="21"/>
-        </w:rPr>
-        <w:t xml:space="preserve">Senbi_from_Shot1.png,  Roman_soldiers.png,  Courtyard_from_Shot1.png</w:t>
-      </w:r>
-      <w:r>
-        <w:rPr>
-          <w:rFonts w:ascii="Arial" w:cs="Arial" w:eastAsia="Arial" w:hAnsi="Arial"/>
-          <w:b/>
-          <w:bCs/>
-          <w:sz w:val="21"/>
-          <w:szCs w:val="21"/>
-        </w:rPr>
-        <w:t xml:space="preserve">      Duration: </w:t>
-      </w:r>
-      <w:r>
-        <w:rPr>
-          <w:rFonts w:ascii="Arial" w:cs="Arial" w:eastAsia="Arial" w:hAnsi="Arial"/>
-          <w:sz w:val="21"/>
-          <w:szCs w:val="21"/>
-        </w:rPr>
-        <w:t xml:space="preserve">8 sec</w:t>
-      </w:r>
-    </w:p>
-    <w:p>
-      <w:pPr>
-        <w:shd w:fill="F2F2F2" w:val="clear"/>
-        <w:spacing w:after="80"/>
-      </w:pPr>
-      <w:r>
-        <w:rPr>
-          <w:rFonts w:ascii="Arial" w:cs="Arial" w:eastAsia="Arial" w:hAnsi="Arial"/>
-          <w:sz w:val="20"/>
-          <w:szCs w:val="20"/>
-        </w:rPr>
-        <w:t xml:space="preserve">VOICE RULE: only the voice-over narration speaks words; it is a voice only, never a person or character on screen. No character says any word and no one on screen lip-syncs to speech; characters communicate with facial expressions and body gestures. Natural non-verbal sounds are allowed and should sound real: laughing, giggling, gasping, sighing, groaning, cheering, coughing. Attached reference images, in order: Senbi, the groom, the Roman soldiers, the wedding courtyard. 2D hand-drawn Stickman animation, clean thin black outlines, large expressive heads, simple readable stickman proportions, flat warm colors, playful cinematic documentary-comedy tone, 16:9. Use the attached reference images as strict continuity anchors: preserve faces, hair, clothing, colors, proportions and accessories exactly; every character keeps a full body with a visible chest and torso exactly as in the references. Characters, identical in every frame: Senbi the groom: young man with a full body and a visible chest, straight black bowl-cut hair with bangs, gold headband with a gold cobra, blue-and-gold broad collar resting on his bare chest, gold bracers on both wrists, white kilt with a blue-and-gold sash, brown sandals. the Roman soldiers: crimson plumed helmets, steel armor, red cloaks, rectangular red shields. Setting: sunny daytime ancient Egyptian wedding courtyard in Alexandria: flat-roofed sandstone mud-brick buildings, tall Egyptian columns with lotus-bud capitals painted in blue-and-gold bands, hieroglyph-style carvings on the walls, long tables with white cloths and clay jars, orange cloth awnings, and a tall wooden entrance gate at the back-center that opens onto the street. Egyptian architecture only: no Greek or Roman architecture, no triangular pediments, no domes, no red tile roofs, no cypress trees. Lighting: warm bright afternoon sunlight, soft shadows, rich saturated colors. ACTION TIMELINE (8 seconds): 0–2.5 s: Senbi dances proudly beside a Roman soldier, beaming. 2.5–5.5 s: he waves his arm wildly, gesturing for the soldier to follow. 5.5–8 s: the soldier hesitates, then copies Senbi's arm movement stiffly with a flicker of a smile. Camera: locked-off and perfectly still, eye-level medium two-shot; the framing never changes (no tilt, pan, zoom or rising camera). Audio: voice-over narration only (a voice, never shown on screen; no narrator character appears): a British male voice, warm and dry, begins speaking within half a second and says: “Senbi, ever the host, invited one to join. Of course he did.” The line takes about 4.8 seconds; leave the last second free of speech so the moment can land. Music: playful comic percussion over the wedding rhythm, low under the voice. Sound effects: laughter, hand claps, timed to the action. Ambience: light courtyard ambience: clinking cups, footsteps on stone, a soft breeze, no words. Final reminder: no character says any word; only the voice-over narration speaks (voice only, nobody on screen is the narrator). Natural laughs, gasps and sighs are fine. No text, captions or logos in the frame.</w:t>
-      </w:r>
-    </w:p>
-    <w:p>
-      <w:pPr>
-        <w:pStyle w:val="Heading2"/>
-        <w:keepNext/>
-        <w:spacing w:after="60" w:before="260"/>
-      </w:pPr>
-      <w:r>
-        <w:rPr>
-          <w:rFonts w:ascii="Arial" w:cs="Arial" w:eastAsia="Arial" w:hAnsi="Arial"/>
-          <w:b/>
-          <w:bCs/>
-          <w:sz w:val="26"/>
-          <w:szCs w:val="26"/>
-        </w:rPr>
-        <w:t xml:space="preserve">SHOT 34 — Bride disbelief</w:t>
-      </w:r>
-    </w:p>
-    <w:p>
-      <w:pPr>
-        <w:keepNext/>
-        <w:spacing w:after="60" w:before="0"/>
-      </w:pPr>
-      <w:r>
-        <w:rPr>
-          <w:rFonts w:ascii="Arial" w:cs="Arial" w:eastAsia="Arial" w:hAnsi="Arial"/>
-          <w:b/>
-          <w:bCs/>
-          <w:sz w:val="21"/>
-          <w:szCs w:val="21"/>
-        </w:rPr>
-        <w:t xml:space="preserve">Attach: </w:t>
-      </w:r>
-      <w:r>
-        <w:rPr>
-          <w:rFonts w:ascii="Arial" w:cs="Arial" w:eastAsia="Arial" w:hAnsi="Arial"/>
-          <w:sz w:val="21"/>
-          <w:szCs w:val="21"/>
-        </w:rPr>
-        <w:t xml:space="preserve">Bride_from_Shot1.png,  Senbi_from_Shot1.png,  Roman_soldiers.png</w:t>
-      </w:r>
-      <w:r>
-        <w:rPr>
-          <w:rFonts w:ascii="Arial" w:cs="Arial" w:eastAsia="Arial" w:hAnsi="Arial"/>
-          <w:b/>
-          <w:bCs/>
-          <w:sz w:val="21"/>
-          <w:szCs w:val="21"/>
-        </w:rPr>
-        <w:t xml:space="preserve">      Duration: </w:t>
-      </w:r>
-      <w:r>
-        <w:rPr>
-          <w:rFonts w:ascii="Arial" w:cs="Arial" w:eastAsia="Arial" w:hAnsi="Arial"/>
-          <w:sz w:val="21"/>
-          <w:szCs w:val="21"/>
-        </w:rPr>
-        <w:t xml:space="preserve">8 sec</w:t>
-      </w:r>
-    </w:p>
-    <w:p>
-      <w:pPr>
-        <w:shd w:fill="F2F2F2" w:val="clear"/>
-        <w:spacing w:after="80"/>
-      </w:pPr>
-      <w:r>
-        <w:rPr>
-          <w:rFonts w:ascii="Arial" w:cs="Arial" w:eastAsia="Arial" w:hAnsi="Arial"/>
-          <w:sz w:val="20"/>
-          <w:szCs w:val="20"/>
-        </w:rPr>
-        <w:t xml:space="preserve">VOICE RULE: only the voice-over narration speaks words; it is a voice only, never a person or character on screen. No character says any word and no one on screen lip-syncs to speech; characters communicate with facial expressions and body gestures. Natural non-verbal sounds are allowed and should sound real: laughing, giggling, gasping, sighing, groaning, cheering, coughing. Attached reference images, in order: the bride, Senbi, the groom, the Roman soldiers. 2D hand-drawn Stickman animation, clean thin black outlines, large expressive heads, simple readable stickman proportions, flat warm colors, playful cinematic documentary-comedy tone, 16:9. Use the attached reference images as strict continuity anchors: preserve faces, hair, clothing, colors, proportions and accessories exactly; every character keeps a full body with a visible chest and torso exactly as in the references. Characters, identical in every frame: the bride: black bob hair with straight bangs, gold headband with a red gem, white dress, blue-and-gold collar, gold sash, gold arm cuffs, light veil. Setting: sunny daytime ancient Egyptian wedding courtyard in Alexandria: flat-roofed sandstone mud-brick buildings, tall Egyptian columns with lotus-bud capitals painted in blue-and-gold bands, hieroglyph-style carvings on the walls, long tables with white cloths and clay jars, orange cloth awnings, and a tall wooden entrance gate at the back-center that opens onto the street. Egyptian architecture only: no Greek or Roman architecture, no triangular pediments, no domes, no red tile roofs, no cypress trees. Lighting: warm bright afternoon sunlight, soft shadows, rich saturated colors. ACTION TIMELINE (8 seconds): 0–2.5 s: the bride watches, amused, with polite delight. 2.5–5.5 s: her smile freezes as she sees Senbi dancing with the Romans. 5.5–8 s: she slowly lifts a hand and covers her face, shoulders shaking. Camera: locked-off and perfectly still, eye-level medium close-up of the bride; the framing never changes (no tilt, pan, zoom or rising camera). Audio: voice-over narration only (a voice, never shown on screen; no narrator character appears): a British male voice, warm and dry, begins speaking within half a second and says: “His bride slowly covered her face. This was not in the contract.” The line takes about 4.8 seconds; leave the last second free of speech so the moment can land. Music: playful comic percussion over the wedding rhythm, low under the voice. Sound effects: gasp, muffled laugh, timed to the action. Ambience: light courtyard ambience: clinking cups, footsteps on stone, a soft breeze, no words. Final reminder: no character says any word; only the voice-over narration speaks (voice only, nobody on screen is the narrator). Natural laughs, gasps and sighs are fine. No text, captions or logos in the frame.</w:t>
-      </w:r>
-    </w:p>
-    <w:p>
-      <w:pPr>
-        <w:pStyle w:val="Heading2"/>
-        <w:keepNext/>
-        <w:spacing w:after="60" w:before="260"/>
-      </w:pPr>
-      <w:r>
-        <w:rPr>
-          <w:rFonts w:ascii="Arial" w:cs="Arial" w:eastAsia="Arial" w:hAnsi="Arial"/>
-          <w:b/>
-          <w:bCs/>
-          <w:sz w:val="26"/>
-          <w:szCs w:val="26"/>
-        </w:rPr>
-        <w:t xml:space="preserve">SHOT 36 — Music stops</w:t>
-      </w:r>
-    </w:p>
-    <w:p>
-      <w:pPr>
-        <w:keepNext/>
-        <w:spacing w:after="60" w:before="0"/>
-      </w:pPr>
-      <w:r>
-        <w:rPr>
-          <w:rFonts w:ascii="Arial" w:cs="Arial" w:eastAsia="Arial" w:hAnsi="Arial"/>
-          <w:b/>
-          <w:bCs/>
-          <w:sz w:val="21"/>
-          <w:szCs w:val="21"/>
-        </w:rPr>
-        <w:t xml:space="preserve">Attach: </w:t>
-      </w:r>
-      <w:r>
-        <w:rPr>
-          <w:rFonts w:ascii="Arial" w:cs="Arial" w:eastAsia="Arial" w:hAnsi="Arial"/>
-          <w:sz w:val="21"/>
-          <w:szCs w:val="21"/>
-        </w:rPr>
-        <w:t xml:space="preserve">Guests_group.png,  Roman_soldiers.png,  Courtyard_from_Shot1.png</w:t>
-      </w:r>
-      <w:r>
-        <w:rPr>
-          <w:rFonts w:ascii="Arial" w:cs="Arial" w:eastAsia="Arial" w:hAnsi="Arial"/>
-          <w:b/>
-          <w:bCs/>
-          <w:sz w:val="21"/>
-          <w:szCs w:val="21"/>
-        </w:rPr>
-        <w:t xml:space="preserve">      Duration: </w:t>
-      </w:r>
-      <w:r>
-        <w:rPr>
-          <w:rFonts w:ascii="Arial" w:cs="Arial" w:eastAsia="Arial" w:hAnsi="Arial"/>
-          <w:sz w:val="21"/>
-          <w:szCs w:val="21"/>
-        </w:rPr>
-        <w:t xml:space="preserve">8 sec</w:t>
-      </w:r>
-    </w:p>
-    <w:p>
-      <w:pPr>
-        <w:shd w:fill="F2F2F2" w:val="clear"/>
-        <w:spacing w:after="80"/>
-      </w:pPr>
-      <w:r>
-        <w:rPr>
-          <w:rFonts w:ascii="Arial" w:cs="Arial" w:eastAsia="Arial" w:hAnsi="Arial"/>
-          <w:sz w:val="20"/>
-          <w:szCs w:val="20"/>
-        </w:rPr>
-        <w:t xml:space="preserve">VOICE RULE: only the voice-over narration speaks words; it is a voice only, never a person or character on screen. No character says any word and no one on screen lip-syncs to speech; characters communicate with facial expressions and body gestures. Natural non-verbal sounds are allowed and should sound real: laughing, giggling, gasping, sighing, groaning, cheering, coughing. Attached reference images, in order: the Egyptian wedding guests, the Roman soldiers, the wedding courtyard. 2D hand-drawn Stickman animation, clean thin black outlines, large expressive heads, simple readable stickman proportions, flat warm colors, playful cinematic documentary-comedy tone, 16:9. Use the attached reference images as strict continuity anchors: preserve faces, hair, clothing, colors, proportions and accessories exactly; every character keeps a full body with a visible chest and torso exactly as in the references. Characters, identical in every frame: Senbi the groom: young man with a full body and a visible chest, straight black bowl-cut hair with bangs, gold headband with a gold cobra, blue-and-gold broad collar resting on his bare chest, gold bracers on both wrists, white kilt with a blue-and-gold sash, brown sandals. the guests: Egyptian wedding guests in white linen with blue-and-gold collars and gold headbands, black bob hairstyles, some in white striped headdresses. They wear only short white kilts or simple white dresses: no togas, no draped robes. the Roman soldiers: crimson plumed helmets, steel armor, red cloaks, rectangular red shields. Setting: sunny daytime ancient Egyptian wedding courtyard in Alexandria: flat-roofed sandstone mud-brick buildings, tall Egyptian columns with lotus-bud capitals painted in blue-and-gold bands, hieroglyph-style carvings on the walls, long tables with white cloths and clay jars, orange cloth awnings, and a tall wooden entrance gate at the back-center that opens onto the street. Egyptian architecture only: no Greek or Roman architecture, no triangular pediments, no domes, no red tile roofs, no cypress trees. Lighting: warm bright afternoon sunlight, soft shadows, rich saturated colors. ACTION TIMELINE (8 seconds): 0–2 s: the dance is in full swing. 2–3 s: a sharp military horn blasts. 3–8 s: everyone freezes mid-step, Egyptians and Romans together, in a comic tableau: a soldier on one leg, a guest mid-spin, Senbi with arms raised, eyes darting toward the gate; hold completely still. Camera: locked-off and perfectly still, eye-level wide shot; the framing never changes (no tilt, pan, zoom or rising camera). Audio: voice-over narration only (a voice, never shown on screen; no narrator character appears): a British male voice, warm and dry, begins speaking within half a second and says: “Then a horn cut through the music, and everyone froze mid-step.” The line takes about 4.4 seconds; leave the last second free of speech so the moment can land. Music: music nearly silent. Sound effects: sharp military horn, then silence, timed to the action. Ambience: light courtyard ambience: clinking cups, footsteps on stone, a soft breeze, no words. Final reminder: no character says any word; only the voice-over narration speaks (voice only, nobody on screen is the narrator). Natural laughs, gasps and sighs are fine. No text, captions or logos in the frame.</w:t>
-      </w:r>
-    </w:p>
-    <w:p>
-      <w:pPr>
-        <w:pStyle w:val="Heading2"/>
-        <w:keepNext/>
-        <w:spacing w:after="60" w:before="260"/>
-      </w:pPr>
-      <w:r>
-        <w:rPr>
-          <w:rFonts w:ascii="Arial" w:cs="Arial" w:eastAsia="Arial" w:hAnsi="Arial"/>
-          <w:b/>
-          <w:bCs/>
-          <w:sz w:val="26"/>
-          <w:szCs w:val="26"/>
-        </w:rPr>
-        <w:t xml:space="preserve">SHOT 37 — Commander entrance</w:t>
-      </w:r>
-    </w:p>
-    <w:p>
-      <w:pPr>
-        <w:keepNext/>
-        <w:spacing w:after="60" w:before="0"/>
-      </w:pPr>
-      <w:r>
-        <w:rPr>
-          <w:rFonts w:ascii="Arial" w:cs="Arial" w:eastAsia="Arial" w:hAnsi="Arial"/>
-          <w:b/>
-          <w:bCs/>
-          <w:sz w:val="21"/>
-          <w:szCs w:val="21"/>
-        </w:rPr>
-        <w:t xml:space="preserve">Attach: </w:t>
-      </w:r>
-      <w:r>
-        <w:rPr>
-          <w:rFonts w:ascii="Arial" w:cs="Arial" w:eastAsia="Arial" w:hAnsi="Arial"/>
-          <w:sz w:val="21"/>
-          <w:szCs w:val="21"/>
-        </w:rPr>
-        <w:t xml:space="preserve">Commander_front.png,  Roman_soldiers.png,  Courtyard_from_Shot1.png</w:t>
-      </w:r>
-      <w:r>
-        <w:rPr>
-          <w:rFonts w:ascii="Arial" w:cs="Arial" w:eastAsia="Arial" w:hAnsi="Arial"/>
-          <w:b/>
-          <w:bCs/>
-          <w:sz w:val="21"/>
-          <w:szCs w:val="21"/>
-        </w:rPr>
-        <w:t xml:space="preserve">      Duration: </w:t>
-      </w:r>
-      <w:r>
-        <w:rPr>
-          <w:rFonts w:ascii="Arial" w:cs="Arial" w:eastAsia="Arial" w:hAnsi="Arial"/>
-          <w:sz w:val="21"/>
-          <w:szCs w:val="21"/>
-        </w:rPr>
-        <w:t xml:space="preserve">8 sec</w:t>
-      </w:r>
-    </w:p>
-    <w:p>
-      <w:pPr>
-        <w:shd w:fill="F2F2F2" w:val="clear"/>
-        <w:spacing w:after="80"/>
-      </w:pPr>
-      <w:r>
-        <w:rPr>
-          <w:rFonts w:ascii="Arial" w:cs="Arial" w:eastAsia="Arial" w:hAnsi="Arial"/>
-          <w:sz w:val="20"/>
-          <w:szCs w:val="20"/>
-        </w:rPr>
-        <w:t xml:space="preserve">VOICE RULE: only the voice-over narration speaks words; it is a voice only, never a person or character on screen. No character says any word and no one on screen lip-syncs to speech; characters communicate with facial expressions and body gestures. Natural non-verbal sounds are allowed and should sound real: laughing, giggling, gasping, sighing, groaning, cheering, coughing. Attached reference images, in order: the Roman commander, the Roman soldiers, the wedding courtyard. 2D hand-drawn Stickman animation, clean thin black outlines, large expressive heads, simple readable stickman proportions, flat warm colors, playful cinematic documentary-comedy tone, 16:9. Use the attached reference images as strict continuity anchors: preserve faces, hair, clothing, colors, proportions and accessories exactly; every character keeps a full body with a visible chest and torso exactly as in the references. Characters, identical in every frame: the Roman commander: dark curly gray-streaked hair, gold laurel wreath, bronze-and-gold armor, red cloak. the Roman soldiers: crimson plumed helmets, steel armor, red cloaks, rectangular red shields. Setting: sunny daytime ancient Egyptian wedding courtyard in Alexandria: flat-roofed sandstone mud-brick buildings, tall Egyptian columns with lotus-bud capitals painted in blue-and-gold bands, hieroglyph-style carvings on the walls, long tables with white cloths and clay jars, orange cloth awnings, and a tall wooden entrance gate at the back-center that opens onto the street. Egyptian architecture only: no Greek or Roman architecture, no triangular pediments, no domes, no red tile roofs, no cypress trees. Lighting: warm bright afternoon sunlight, soft shadows, rich saturated colors. ACTION TIMELINE (8 seconds): 0–2 s: the tall wooden gate swings fully open. 2–5 s: the Roman commander walks calmly through, scroll in hand, red cloak swaying, while the dancing soldiers step aside. 5–8 s: he stops in the center and the courtyard falls silent, everyone looking at him. Camera: locked-off and perfectly still, fixed, slightly low angle that never tilts, on the commander walking in; the framing never changes (no tilt, pan, zoom or rising camera). Audio: voice-over narration only (a voice, never shown on screen; no narrator character appears): a British male voice, warm and dry, begins speaking within half a second and says: “And in walked the commander. The only adult in the building.” The line takes about 4.4 seconds; leave the last second free of speech so the moment can land. Music: low sustained tension with distant marching drums, almost silent. Sound effects: slow footsteps, cloak rustle, timed to the action. Ambience: light courtyard ambience: clinking cups, footsteps on stone, a soft breeze, no words. Final reminder: no character says any word; only the voice-over narration speaks (voice only, nobody on screen is the narrator). Natural laughs, gasps and sighs are fine. No text, captions or logos in the frame.</w:t>
-      </w:r>
-    </w:p>
-    <w:p>
-      <w:pPr>
-        <w:pStyle w:val="Heading2"/>
-        <w:keepNext/>
-        <w:spacing w:after="60" w:before="260"/>
-      </w:pPr>
-      <w:r>
-        <w:rPr>
-          <w:rFonts w:ascii="Arial" w:cs="Arial" w:eastAsia="Arial" w:hAnsi="Arial"/>
-          <w:b/>
-          <w:bCs/>
-          <w:sz w:val="26"/>
-          <w:szCs w:val="26"/>
-        </w:rPr>
-        <w:t xml:space="preserve">SHOT 39 — Cat stare</w:t>
-      </w:r>
-    </w:p>
-    <w:p>
-      <w:pPr>
-        <w:keepNext/>
-        <w:spacing w:after="60" w:before="0"/>
-      </w:pPr>
-      <w:r>
-        <w:rPr>
-          <w:rFonts w:ascii="Arial" w:cs="Arial" w:eastAsia="Arial" w:hAnsi="Arial"/>
-          <w:b/>
-          <w:bCs/>
-          <w:sz w:val="21"/>
-          <w:szCs w:val="21"/>
-        </w:rPr>
-        <w:t xml:space="preserve">Attach: </w:t>
-      </w:r>
-      <w:r>
-        <w:rPr>
-          <w:rFonts w:ascii="Arial" w:cs="Arial" w:eastAsia="Arial" w:hAnsi="Arial"/>
-          <w:sz w:val="21"/>
-          <w:szCs w:val="21"/>
-        </w:rPr>
-        <w:t xml:space="preserve">Commander_front.png,  Black_cat.png</w:t>
-      </w:r>
-      <w:r>
-        <w:rPr>
-          <w:rFonts w:ascii="Arial" w:cs="Arial" w:eastAsia="Arial" w:hAnsi="Arial"/>
-          <w:b/>
-          <w:bCs/>
-          <w:sz w:val="21"/>
-          <w:szCs w:val="21"/>
-        </w:rPr>
-        <w:t xml:space="preserve">      Duration: </w:t>
-      </w:r>
-      <w:r>
-        <w:rPr>
-          <w:rFonts w:ascii="Arial" w:cs="Arial" w:eastAsia="Arial" w:hAnsi="Arial"/>
-          <w:sz w:val="21"/>
-          <w:szCs w:val="21"/>
-        </w:rPr>
-        <w:t xml:space="preserve">8 sec</w:t>
-      </w:r>
-    </w:p>
-    <w:p>
-      <w:pPr>
-        <w:shd w:fill="F2F2F2" w:val="clear"/>
-        <w:spacing w:after="80"/>
-      </w:pPr>
-      <w:r>
-        <w:rPr>
-          <w:rFonts w:ascii="Arial" w:cs="Arial" w:eastAsia="Arial" w:hAnsi="Arial"/>
-          <w:sz w:val="20"/>
-          <w:szCs w:val="20"/>
-        </w:rPr>
-        <w:t xml:space="preserve">VOICE RULE: only the voice-over narration speaks words; it is a voice only, never a person or character on screen. No character says any word and no one on screen lip-syncs to speech; characters communicate with facial expressions and body gestures. Natural non-verbal sounds are allowed and should sound real: laughing, giggling, gasping, sighing, groaning, cheering, coughing. Attached reference images, in order: the Roman commander, the black cat. 2D hand-drawn Stickman animation, clean thin black outlines, large expressive heads, simple readable stickman proportions, flat warm colors, playful cinematic documentary-comedy tone, 16:9. Use the attached reference images as strict continuity anchors: preserve faces, hair, clothing, colors, proportions and accessories exactly; every character keeps a full body with a visible chest and torso exactly as in the references. Characters, identical in every frame: the Roman commander: dark curly gray-streaked hair, gold laurel wreath, bronze-and-gold armor, red cloak. the cat: black with a small gold collar. Setting: sunny daytime ancient Egyptian wedding courtyard in Alexandria: flat-roofed sandstone mud-brick buildings, tall Egyptian columns with lotus-bud capitals painted in blue-and-gold bands, hieroglyph-style carvings on the walls, long tables with white cloths and clay jars, orange cloth awnings, and a tall wooden entrance gate at the back-center that opens onto the street. Egyptian architecture only: no Greek or Roman architecture, no triangular pediments, no domes, no red tile roofs, no cypress trees. Lighting: warm bright afternoon sunlight, soft shadows, rich saturated colors. ACTION TIMELINE (8 seconds): 0–2.5 s: the commander in the foreground; his eyes land on the black cat on the table behind him. 2.5–5.5 s: the cat stares straight back, unblinking. 5.5–8 s: a muscle in the commander's jaw twitches and he looks away first. Camera: locked-off and perfectly still, eye-level medium two-shot: the commander in the foreground, the cat on the table behind him; no cutting; the framing never changes (no tilt, pan, zoom or rising camera). Audio: voice-over narration only (a voice, never shown on screen; no narrator character appears): a British male voice, warm and dry, begins speaking within half a second and says: “The cat looked back. The cat was not impressed by the Roman Empire.” The line takes about 5.2 seconds; leave the last second free of speech so the moment can land. Music: music nearly silent. Sound effects: cat meow, tiny sting, timed to the action. Ambience: light courtyard ambience: clinking cups, footsteps on stone, a soft breeze, no words. Final reminder: no character says any word; only the voice-over narration speaks (voice only, nobody on screen is the narrator). Natural laughs, gasps and sighs are fine. No text, captions or logos in the frame.</w:t>
-      </w:r>
-    </w:p>
-    <w:p>
-      <w:pPr>
-        <w:pStyle w:val="Heading2"/>
-        <w:keepNext/>
-        <w:spacing w:after="60" w:before="260"/>
-      </w:pPr>
-      <w:r>
-        <w:rPr>
-          <w:rFonts w:ascii="Arial" w:cs="Arial" w:eastAsia="Arial" w:hAnsi="Arial"/>
-          <w:b/>
-          <w:bCs/>
-          <w:sz w:val="26"/>
-          <w:szCs w:val="26"/>
-        </w:rPr>
-        <w:t xml:space="preserve">SHOT 40 — Announcement</w:t>
-      </w:r>
-    </w:p>
-    <w:p>
-      <w:pPr>
-        <w:keepNext/>
-        <w:spacing w:after="60" w:before="0"/>
-      </w:pPr>
-      <w:r>
-        <w:rPr>
-          <w:rFonts w:ascii="Arial" w:cs="Arial" w:eastAsia="Arial" w:hAnsi="Arial"/>
-          <w:b/>
-          <w:bCs/>
-          <w:sz w:val="21"/>
-          <w:szCs w:val="21"/>
-        </w:rPr>
-        <w:t xml:space="preserve">Attach: </w:t>
-      </w:r>
-      <w:r>
-        <w:rPr>
-          <w:rFonts w:ascii="Arial" w:cs="Arial" w:eastAsia="Arial" w:hAnsi="Arial"/>
-          <w:sz w:val="21"/>
-          <w:szCs w:val="21"/>
-        </w:rPr>
-        <w:t xml:space="preserve">Commander_front.png,  Guests_group.png,  Senbi_from_Shot1.png</w:t>
-      </w:r>
-      <w:r>
-        <w:rPr>
-          <w:rFonts w:ascii="Arial" w:cs="Arial" w:eastAsia="Arial" w:hAnsi="Arial"/>
-          <w:b/>
-          <w:bCs/>
-          <w:sz w:val="21"/>
-          <w:szCs w:val="21"/>
-        </w:rPr>
-        <w:t xml:space="preserve">      Duration: </w:t>
-      </w:r>
-      <w:r>
-        <w:rPr>
-          <w:rFonts w:ascii="Arial" w:cs="Arial" w:eastAsia="Arial" w:hAnsi="Arial"/>
-          <w:sz w:val="21"/>
-          <w:szCs w:val="21"/>
-        </w:rPr>
-        <w:t xml:space="preserve">8 sec</w:t>
-      </w:r>
-    </w:p>
-    <w:p>
-      <w:pPr>
-        <w:shd w:fill="F2F2F2" w:val="clear"/>
-        <w:spacing w:after="80"/>
-      </w:pPr>
-      <w:r>
-        <w:rPr>
-          <w:rFonts w:ascii="Arial" w:cs="Arial" w:eastAsia="Arial" w:hAnsi="Arial"/>
-          <w:sz w:val="20"/>
-          <w:szCs w:val="20"/>
-        </w:rPr>
-        <w:t xml:space="preserve">VOICE RULE: only the voice-over narration speaks words; it is a voice only, never a person or character on screen. No character says any word and no one on screen lip-syncs to speech; characters communicate with facial expressions and body gestures. Natural non-verbal sounds are allowed and should sound real: laughing, giggling, gasping, sighing, groaning, cheering, coughing. Attached reference images, in order: the Roman commander, the Egyptian wedding guests, Senbi, the groom. 2D hand-drawn Stickman animation, clean thin black outlines, large expressive heads, simple readable stickman proportions, flat warm colors, playful cinematic documentary-comedy tone, 16:9. Use the attached reference images as strict continuity anchors: preserve faces, hair, clothing, colors, proportions and accessories exactly; every character keeps a full body with a visible chest and torso exactly as in the references. Characters, identical in every frame: the Roman commander: dark curly gray-streaked hair, gold laurel wreath, bronze-and-gold armor, red cloak. the guests: Egyptian wedding guests in white linen with blue-and-gold collars and gold headbands, black bob hairstyles, some in white striped headdresses. They wear only short white kilts or simple white dresses: no togas, no draped robes. the Roman soldiers: crimson plumed helmets, steel armor, red cloaks, rectangular red shields. Setting: sunny daytime ancient Egyptian wedding courtyard in Alexandria: flat-roofed sandstone mud-brick buildings, tall Egyptian columns with lotus-bud capitals painted in blue-and-gold bands, hieroglyph-style carvings on the walls, long tables with white cloths and clay jars, orange cloth awnings, and a tall wooden entrance gate at the back-center that opens onto the street. Egyptian architecture only: no Greek or Roman architecture, no triangular pediments, no domes, no red tile roofs, no cypress trees. Lighting: warm bright afternoon sunlight, soft shadows, rich saturated colors. ACTION TIMELINE (8 seconds): 0–2.5 s: the commander at the center lifts the scroll with both hands, Egyptians on his left and Romans on his right standing silent and still. 2.5–5.5 s: he unrolls it slowly, papyrus falling to his waist, only abstract marks on it. 5.5–8 s: he lifts his chin as if about to read; everyone is silent. Camera: locked-off and perfectly still, symmetrical eye-level medium-wide shot; the framing never changes (no tilt, pan, zoom or rising camera). Audio: voice-over narration only (a voice, never shown on screen; no narrator character appears): a British male voice, warm and dry, begins speaking within half a second and says: “He unrolled the scroll. Message received: Egypt has new management.” The line takes about 4.0 seconds; leave the last second free of speech so the moment can land. Music: low sustained tension with distant marching drums, almost silent. Sound effects: scroll unrolling, one dramatic drum hit, timed to the action. Ambience: light courtyard ambience: clinking cups, footsteps on stone, a soft breeze, no words. Final reminder: no character says any word; only the voice-over narration speaks (voice only, nobody on screen is the narrator). Natural laughs, gasps and sighs are fine. No text, captions or logos in the frame.</w:t>
-      </w:r>
-    </w:p>
-    <w:p>
-      <w:pPr>
-        <w:pStyle w:val="Heading2"/>
-        <w:keepNext/>
-        <w:spacing w:after="60" w:before="260"/>
-      </w:pPr>
-      <w:r>
-        <w:rPr>
-          <w:rFonts w:ascii="Arial" w:cs="Arial" w:eastAsia="Arial" w:hAnsi="Arial"/>
-          <w:b/>
-          <w:bCs/>
-          <w:sz w:val="26"/>
-          <w:szCs w:val="26"/>
-        </w:rPr>
-        <w:t xml:space="preserve">SHOT 41 — Senbi and bride</w:t>
-      </w:r>
-    </w:p>
-    <w:p>
-      <w:pPr>
-        <w:keepNext/>
-        <w:spacing w:after="60" w:before="0"/>
-      </w:pPr>
-      <w:r>
-        <w:rPr>
-          <w:rFonts w:ascii="Arial" w:cs="Arial" w:eastAsia="Arial" w:hAnsi="Arial"/>
-          <w:b/>
-          <w:bCs/>
-          <w:sz w:val="21"/>
-          <w:szCs w:val="21"/>
-        </w:rPr>
-        <w:t xml:space="preserve">Attach: </w:t>
-      </w:r>
-      <w:r>
-        <w:rPr>
-          <w:rFonts w:ascii="Arial" w:cs="Arial" w:eastAsia="Arial" w:hAnsi="Arial"/>
-          <w:sz w:val="21"/>
-          <w:szCs w:val="21"/>
-        </w:rPr>
-        <w:t xml:space="preserve">Senbi_from_Shot1.png,  Bride_from_Shot1.png,  Guests_group.png</w:t>
-      </w:r>
-      <w:r>
-        <w:rPr>
-          <w:rFonts w:ascii="Arial" w:cs="Arial" w:eastAsia="Arial" w:hAnsi="Arial"/>
-          <w:b/>
-          <w:bCs/>
-          <w:sz w:val="21"/>
-          <w:szCs w:val="21"/>
-        </w:rPr>
-        <w:t xml:space="preserve">      Duration: </w:t>
-      </w:r>
-      <w:r>
-        <w:rPr>
-          <w:rFonts w:ascii="Arial" w:cs="Arial" w:eastAsia="Arial" w:hAnsi="Arial"/>
-          <w:sz w:val="21"/>
-          <w:szCs w:val="21"/>
-        </w:rPr>
-        <w:t xml:space="preserve">8 sec</w:t>
-      </w:r>
-    </w:p>
-    <w:p>
-      <w:pPr>
-        <w:shd w:fill="F2F2F2" w:val="clear"/>
-        <w:spacing w:after="80"/>
-      </w:pPr>
-      <w:r>
-        <w:rPr>
-          <w:rFonts w:ascii="Arial" w:cs="Arial" w:eastAsia="Arial" w:hAnsi="Arial"/>
-          <w:sz w:val="20"/>
-          <w:szCs w:val="20"/>
-        </w:rPr>
-        <w:t xml:space="preserve">VOICE RULE: only the voice-over narration speaks words; it is a voice only, never a person or character on screen. No character says any word and no one on screen lip-syncs to speech; characters communicate with facial expressions and body gestures. Natural non-verbal sounds are allowed and should sound real: laughing, giggling, gasping, sighing, groaning, cheering, coughing. Attached reference images, in order: Senbi, the groom, the bride, the Egyptian wedding guests. 2D hand-drawn Stickman animation, clean thin black outlines, large expressive heads, simple readable stickman proportions, flat warm colors, playful cinematic documentary-comedy tone, 16:9. Use the attached reference images as strict continuity anchors: preserve faces, hair, clothing, colors, proportions and accessories exactly; every character keeps a full body with a visible chest and torso exactly as in the references. Characters, identical in every frame: Senbi the groom: young man with a full body and a visible chest, straight black bowl-cut hair with bangs, gold headband with a gold cobra, blue-and-gold broad collar resting on his bare chest, gold bracers on both wrists, white kilt with a blue-and-gold sash, brown sandals. the bride: black bob hair with straight bangs, gold headband with a red gem, white dress, blue-and-gold collar, gold sash, gold arm cuffs, light veil. Setting: sunny daytime ancient Egyptian wedding courtyard in Alexandria: flat-roofed sandstone mud-brick buildings, tall Egyptian columns with lotus-bud capitals painted in blue-and-gold bands, hieroglyph-style carvings on the walls, long tables with white cloths and clay jars, orange cloth awnings, and a tall wooden entrance gate at the back-center that opens onto the street. Egyptian architecture only: no Greek or Roman architecture, no triangular pediments, no domes, no red tile roofs, no cypress trees. Lighting: warm bright afternoon sunlight, soft shadows, rich saturated colors. ACTION TIMELINE (8 seconds): 0–2.5 s: Senbi and the bride look forward, shocked. 2.5–5.5 s: Senbi slowly turns his head toward the bride. 5.5–8 s: the bride turns to him, they exchange a wide-eyed look and Senbi forces a smile. Camera: locked-off and perfectly still, eye-level medium two-shot of Senbi and the bride; the framing never changes (no tilt, pan, zoom or rising camera). Audio: voice-over narration only (a voice, never shown on screen; no narrator character appears): a British male voice, warm and dry, begins speaking within half a second and says: “Senbi looked at his bride. Same question, silently: is the wedding still on?” The line takes about 5.2 seconds; leave the last second free of speech so the moment can land. Music: low sustained tension with distant marching drums, almost silent. Sound effects: nervous breath, single drum, timed to the action. Ambience: light courtyard ambience: clinking cups, footsteps on stone, a soft breeze, no words. Final reminder: no character says any word; only the voice-over narration speaks (voice only, nobody on screen is the narrator). Natural laughs, gasps and sighs are fine. No text, captions or logos in the frame.</w:t>
-      </w:r>
-    </w:p>
-    <w:p>
-      <w:pPr>
-        <w:pStyle w:val="Heading2"/>
-        <w:keepNext/>
-        <w:spacing w:after="60" w:before="260"/>
-      </w:pPr>
-      <w:r>
-        <w:rPr>
-          <w:rFonts w:ascii="Arial" w:cs="Arial" w:eastAsia="Arial" w:hAnsi="Arial"/>
-          <w:b/>
-          <w:bCs/>
-          <w:sz w:val="26"/>
-          <w:szCs w:val="26"/>
-        </w:rPr>
-        <w:t xml:space="preserve">SHOT 43 — Clarification</w:t>
-      </w:r>
-    </w:p>
-    <w:p>
-      <w:pPr>
-        <w:keepNext/>
-        <w:spacing w:after="60" w:before="0"/>
-      </w:pPr>
-      <w:r>
-        <w:rPr>
-          <w:rFonts w:ascii="Arial" w:cs="Arial" w:eastAsia="Arial" w:hAnsi="Arial"/>
-          <w:b/>
-          <w:bCs/>
-          <w:sz w:val="21"/>
-          <w:szCs w:val="21"/>
-        </w:rPr>
-        <w:t xml:space="preserve">Attach: </w:t>
-      </w:r>
-      <w:r>
-        <w:rPr>
-          <w:rFonts w:ascii="Arial" w:cs="Arial" w:eastAsia="Arial" w:hAnsi="Arial"/>
-          <w:sz w:val="21"/>
-          <w:szCs w:val="21"/>
-        </w:rPr>
-        <w:t xml:space="preserve">Alexandria_Harbor_from_ref08.png,  Roman_soldiers.png</w:t>
-      </w:r>
-      <w:r>
-        <w:rPr>
-          <w:rFonts w:ascii="Arial" w:cs="Arial" w:eastAsia="Arial" w:hAnsi="Arial"/>
-          <w:b/>
-          <w:bCs/>
-          <w:sz w:val="21"/>
-          <w:szCs w:val="21"/>
-        </w:rPr>
-        <w:t xml:space="preserve">      Duration: </w:t>
-      </w:r>
-      <w:r>
-        <w:rPr>
-          <w:rFonts w:ascii="Arial" w:cs="Arial" w:eastAsia="Arial" w:hAnsi="Arial"/>
-          <w:sz w:val="21"/>
-          <w:szCs w:val="21"/>
-        </w:rPr>
-        <w:t xml:space="preserve">8 sec</w:t>
-      </w:r>
-    </w:p>
-    <w:p>
-      <w:pPr>
-        <w:shd w:fill="F2F2F2" w:val="clear"/>
-        <w:spacing w:after="80"/>
-      </w:pPr>
-      <w:r>
-        <w:rPr>
-          <w:rFonts w:ascii="Arial" w:cs="Arial" w:eastAsia="Arial" w:hAnsi="Arial"/>
-          <w:sz w:val="20"/>
-          <w:szCs w:val="20"/>
-        </w:rPr>
-        <w:t xml:space="preserve">VOICE RULE: only the voice-over narration speaks words; it is a voice only, never a person or character on screen. No character says any word and no one on screen lip-syncs to speech; characters communicate with facial expressions and body gestures. Natural non-verbal sounds are allowed and should sound real: laughing, giggling, gasping, sighing, groaning, cheering, coughing. Attached reference images, in order: the Alexandria harbor, the Roman soldiers. 2D hand-drawn Stickman animation, clean thin black outlines, large expressive heads, simple readable stickman proportions, flat warm colors, playful cinematic documentary-comedy tone, 16:9. Use the attached reference images as strict continuity anchors: preserve faces, hair, clothing, colors, proportions and accessories exactly; every character keeps a full body with a visible chest and torso exactly as in the references. Characters, identical in every frame: the Roman soldiers: crimson plumed helmets, steel armor, red cloaks, rectangular red shields. Setting: sunlit street of ancient Alexandria outside the wedding house, sandstone walls, palms, market stalls with red and blue awnings. Flat-roofed Egyptian sandstone buildings; no Greek or Roman architecture, no domes. Lighting: warm bright sunlight, soft shadows. ACTION TIMELINE (8 seconds): 0–2.5 s: a few Roman soldiers pass through the street. 2.5–5.5 s: ordinary Egyptians carry baskets, bargain and haul jars as usual. 5.5–8 s: a boy runs across the frame; life goes on. Camera: locked-off and perfectly still, eye-level wide observational shot of Alexandria; the framing never changes (no tilt, pan, zoom or rising camera). Audio: voice-over narration only (a voice, never shown on screen; no narrator character appears): a British male voice, warm and dry, begins speaking within half a second and says: “To be clear: Senbi and his wedding are fiction. The cat, sadly, too.” The line takes about 5.2 seconds; leave the last second free of speech so the moment can land. Music: music nearly silent. Sound effects: calm city ambience, timed to the action. Ambience: sunlit street ambience: wind and distant clatter, no words. Final reminder: no character says any word; only the voice-over narration speaks (voice only, nobody on screen is the narrator). Natural laughs, gasps and sighs are fine. No text, captions or logos in the frame.</w:t>
-      </w:r>
-    </w:p>
-    <w:p>
-      <w:pPr>
-        <w:pStyle w:val="Heading2"/>
-        <w:keepNext/>
-        <w:spacing w:after="60" w:before="260"/>
-      </w:pPr>
-      <w:r>
-        <w:rPr>
-          <w:rFonts w:ascii="Arial" w:cs="Arial" w:eastAsia="Arial" w:hAnsi="Arial"/>
-          <w:b/>
-          <w:bCs/>
-          <w:sz w:val="26"/>
-          <w:szCs w:val="26"/>
-        </w:rPr>
-        <w:t xml:space="preserve">SHOT 44 — Historical anchor   (edit: place after shot 25)</w:t>
-      </w:r>
-    </w:p>
-    <w:p>
-      <w:pPr>
-        <w:keepNext/>
-        <w:spacing w:after="40" w:before="0"/>
-      </w:pPr>
-      <w:r>
-        <w:rPr>
-          <w:rFonts w:ascii="Arial" w:cs="Arial" w:eastAsia="Arial" w:hAnsi="Arial"/>
-          <w:i/>
-          <w:iCs/>
-          <w:color w:val="555555"/>
-          <w:sz w:val="19"/>
-          <w:szCs w:val="19"/>
-        </w:rPr>
-        <w:t xml:space="preserve">In the edit, play this shot right after shot 25.</w:t>
-      </w:r>
-    </w:p>
-    <w:p>
-      <w:pPr>
-        <w:keepNext/>
-        <w:spacing w:after="60" w:before="0"/>
-      </w:pPr>
-      <w:r>
-        <w:rPr>
-          <w:rFonts w:ascii="Arial" w:cs="Arial" w:eastAsia="Arial" w:hAnsi="Arial"/>
-          <w:b/>
-          <w:bCs/>
-          <w:sz w:val="21"/>
-          <w:szCs w:val="21"/>
-        </w:rPr>
-        <w:t xml:space="preserve">Attach: </w:t>
-      </w:r>
-      <w:r>
-        <w:rPr>
-          <w:rFonts w:ascii="Arial" w:cs="Arial" w:eastAsia="Arial" w:hAnsi="Arial"/>
-          <w:sz w:val="21"/>
-          <w:szCs w:val="21"/>
-        </w:rPr>
-        <w:t xml:space="preserve">Alexandria_Harbor_from_ref08.png,  Roman_soldiers.png</w:t>
-      </w:r>
-      <w:r>
-        <w:rPr>
-          <w:rFonts w:ascii="Arial" w:cs="Arial" w:eastAsia="Arial" w:hAnsi="Arial"/>
-          <w:b/>
-          <w:bCs/>
-          <w:sz w:val="21"/>
-          <w:szCs w:val="21"/>
-        </w:rPr>
-        <w:t xml:space="preserve">      Duration: </w:t>
-      </w:r>
-      <w:r>
-        <w:rPr>
-          <w:rFonts w:ascii="Arial" w:cs="Arial" w:eastAsia="Arial" w:hAnsi="Arial"/>
-          <w:sz w:val="21"/>
-          <w:szCs w:val="21"/>
-        </w:rPr>
-        <w:t xml:space="preserve">8 sec</w:t>
-      </w:r>
-    </w:p>
-    <w:p>
-      <w:pPr>
-        <w:shd w:fill="F2F2F2" w:val="clear"/>
-        <w:spacing w:after="80"/>
-      </w:pPr>
-      <w:r>
-        <w:rPr>
-          <w:rFonts w:ascii="Arial" w:cs="Arial" w:eastAsia="Arial" w:hAnsi="Arial"/>
-          <w:sz w:val="20"/>
-          <w:szCs w:val="20"/>
-        </w:rPr>
-        <w:t xml:space="preserve">VOICE RULE: only the voice-over narration speaks words; it is a voice only, never a person or character on screen. No character says any word and no one on screen lip-syncs to speech; characters communicate with facial expressions and body gestures. Natural non-verbal sounds are allowed and should sound real: laughing, giggling, gasping, sighing, groaning, cheering, coughing. Attached reference images, in order: the Alexandria harbor, the Roman soldiers. 2D hand-drawn Stickman animation, clean thin black outlines, large expressive heads, simple readable stickman proportions, flat warm colors, playful cinematic documentary-comedy tone, 16:9. Use the attached reference images as strict continuity anchors: preserve faces, hair, clothing, colors, proportions and accessories exactly; every character keeps a full body with a visible chest and torso exactly as in the references. Setting: ancient Alexandria harbor. Lighting: bright clear daylight, sparkling water. ACTION TIMELINE (8 seconds): 0–2.5 s: Roman ships enter the harbor, sails filling with wind. 2.5–5.5 s: soldiers stand on the quay while civilians watch. 5.5–8 s: the lighthouse in the background, a flag fluttering slowly; the wedding is not shown. Camera: wide shot of the Alexandria harbor and city, horizon level; fixed except for an almost imperceptible 5% slow push-in, no tilt or pan. Audio: voice-over narration only (a voice, never shown on screen; no narrator character appears): a British male voice, warm and dry, begins speaking within half a second and says: “The setting is real: in 30 BC, Octavian took Alexandria. Egypt became Roman.” The line takes about 5.2 seconds; leave the last second free of speech so the moment can land. Music: music nearly silent. Sound effects: calm city ambience, timed to the action. Ambience: gulls, lapping water and creaking ropes, no words. Final reminder: no character says any word; only the voice-over narration speaks (voice only, nobody on screen is the narrator). Natural laughs, gasps and sighs are fine. No text, captions or logos in the frame.</w:t>
-      </w:r>
-    </w:p>
-    <w:p>
-      <w:pPr>
-        <w:pStyle w:val="Heading2"/>
-        <w:keepNext/>
-        <w:spacing w:after="60" w:before="260"/>
-      </w:pPr>
-      <w:r>
-        <w:rPr>
-          <w:rFonts w:ascii="Arial" w:cs="Arial" w:eastAsia="Arial" w:hAnsi="Arial"/>
-          <w:b/>
-          <w:bCs/>
-          <w:sz w:val="26"/>
-          <w:szCs w:val="26"/>
-        </w:rPr>
-        <w:t xml:space="preserve">SHOT 45 — Headrest callback</w:t>
-      </w:r>
-    </w:p>
-    <w:p>
-      <w:pPr>
-        <w:keepNext/>
-        <w:spacing w:after="60" w:before="0"/>
-      </w:pPr>
-      <w:r>
-        <w:rPr>
-          <w:rFonts w:ascii="Arial" w:cs="Arial" w:eastAsia="Arial" w:hAnsi="Arial"/>
-          <w:b/>
-          <w:bCs/>
-          <w:sz w:val="21"/>
-          <w:szCs w:val="21"/>
-        </w:rPr>
-        <w:t xml:space="preserve">Attach: </w:t>
-      </w:r>
-      <w:r>
-        <w:rPr>
-          <w:rFonts w:ascii="Arial" w:cs="Arial" w:eastAsia="Arial" w:hAnsi="Arial"/>
-          <w:sz w:val="21"/>
-          <w:szCs w:val="21"/>
-        </w:rPr>
-        <w:t xml:space="preserve">Senbi_from_Shot1.png,  Relatives_group.png</w:t>
-      </w:r>
-      <w:r>
-        <w:rPr>
-          <w:rFonts w:ascii="Arial" w:cs="Arial" w:eastAsia="Arial" w:hAnsi="Arial"/>
-          <w:b/>
-          <w:bCs/>
-          <w:sz w:val="21"/>
-          <w:szCs w:val="21"/>
-        </w:rPr>
-        <w:t xml:space="preserve">      Duration: </w:t>
-      </w:r>
-      <w:r>
-        <w:rPr>
-          <w:rFonts w:ascii="Arial" w:cs="Arial" w:eastAsia="Arial" w:hAnsi="Arial"/>
-          <w:sz w:val="21"/>
-          <w:szCs w:val="21"/>
-        </w:rPr>
-        <w:t xml:space="preserve">6 sec</w:t>
-      </w:r>
-    </w:p>
-    <w:p>
-      <w:pPr>
-        <w:shd w:fill="F2F2F2" w:val="clear"/>
-        <w:spacing w:after="80"/>
-      </w:pPr>
-      <w:r>
-        <w:rPr>
-          <w:rFonts w:ascii="Arial" w:cs="Arial" w:eastAsia="Arial" w:hAnsi="Arial"/>
-          <w:sz w:val="20"/>
-          <w:szCs w:val="20"/>
-        </w:rPr>
-        <w:t xml:space="preserve">VOICE RULE: only the voice-over narration speaks words; it is a voice only, never a person or character on screen. No character says any word and no one on screen lip-syncs to speech; characters communicate with facial expressions and body gestures. Natural non-verbal sounds are allowed and should sound real: laughing, giggling, gasping, sighing, groaning, cheering, coughing. Attached reference images, in order: Senbi, the groom, the bride's relatives. 2D hand-drawn Stickman animation, clean thin black outlines, large expressive heads, simple readable stickman proportions, flat warm colors, playful cinematic documentary-comedy tone, 16:9. Use the attached reference images as strict continuity anchors: preserve faces, hair, clothing, colors, proportions and accessories exactly; every character keeps a full body with a visible chest and torso exactly as in the references. Characters, identical in every frame: Senbi the groom: young man with a full body and a visible chest, straight black bowl-cut hair with bangs, gold headband with a gold cobra, blue-and-gold broad collar resting on his bare chest, gold bracers on both wrists, white kilt with a blue-and-gold sash, brown sandals. Setting: sunny daytime ancient Egyptian wedding courtyard in Alexandria: flat-roofed sandstone mud-brick buildings, tall Egyptian columns with lotus-bud capitals painted in blue-and-gold bands, hieroglyph-style carvings on the walls, long tables with white cloths and clay jars, orange cloth awnings, and a tall wooden entrance gate at the back-center that opens onto the street. Egyptian architecture only: no Greek or Roman architecture, no triangular pediments, no domes, no red tile roofs, no cypress trees. Lighting: warm bright afternoon sunlight, soft shadows, rich saturated colors. ACTION TIMELINE (6 seconds): 0–2 s: Senbi looks down at the wooden headrest in his hands, turning it over. 2–4 s: he slowly lifts his gaze toward the Roman commander off-screen to the right. 4–6 s: a tired deadpan stare, a long slow blink, his shoulders drop. Camera: locked-off and perfectly still, eye-level medium close-up with the headrest in Senbi's hands and his face both in frame; the framing never changes (no tilt, pan, zoom or rising camera). Audio: voice-over narration only (a voice, never shown on screen; no narrator character appears): a British male voice, warm and dry, begins speaking within half a second and says: “Headrest, then commander. Neither came with a return policy.” The line takes about 3.6 seconds; leave the last second free of speech so the moment can land. Music: playful comic percussion over the wedding rhythm, low under the voice. Sound effects: wood knock, comic sting, timed to the action. Ambience: light courtyard ambience: clinking cups, footsteps on stone, a soft breeze, no words. Final reminder: no character says any word; only the voice-over narration speaks (voice only, nobody on screen is the narrator). Natural laughs, gasps and sighs are fine. No text, captions or logos in the frame.</w:t>
-      </w:r>
-    </w:p>
-    <w:p>
-      <w:pPr>
-        <w:pStyle w:val="Heading2"/>
-        <w:keepNext/>
-        <w:spacing w:after="60" w:before="260"/>
-      </w:pPr>
-      <w:r>
-        <w:rPr>
-          <w:rFonts w:ascii="Arial" w:cs="Arial" w:eastAsia="Arial" w:hAnsi="Arial"/>
-          <w:b/>
-          <w:bCs/>
-          <w:sz w:val="26"/>
-          <w:szCs w:val="26"/>
-        </w:rPr>
-        <w:t xml:space="preserve">SHOT 46 — Bride laughs</w:t>
-      </w:r>
-    </w:p>
-    <w:p>
-      <w:pPr>
-        <w:keepNext/>
-        <w:spacing w:after="60" w:before="0"/>
-      </w:pPr>
-      <w:r>
-        <w:rPr>
-          <w:rFonts w:ascii="Arial" w:cs="Arial" w:eastAsia="Arial" w:hAnsi="Arial"/>
-          <w:b/>
-          <w:bCs/>
-          <w:sz w:val="21"/>
-          <w:szCs w:val="21"/>
-        </w:rPr>
-        <w:t xml:space="preserve">Attach: </w:t>
-      </w:r>
-      <w:r>
-        <w:rPr>
-          <w:rFonts w:ascii="Arial" w:cs="Arial" w:eastAsia="Arial" w:hAnsi="Arial"/>
-          <w:sz w:val="21"/>
-          <w:szCs w:val="21"/>
-        </w:rPr>
-        <w:t xml:space="preserve">Bride_from_Shot1.png,  Senbi_from_Shot1.png,  Courtyard_from_Shot1.png</w:t>
-      </w:r>
-      <w:r>
-        <w:rPr>
-          <w:rFonts w:ascii="Arial" w:cs="Arial" w:eastAsia="Arial" w:hAnsi="Arial"/>
-          <w:b/>
-          <w:bCs/>
-          <w:sz w:val="21"/>
-          <w:szCs w:val="21"/>
-        </w:rPr>
-        <w:t xml:space="preserve">      Duration: </w:t>
-      </w:r>
-      <w:r>
-        <w:rPr>
-          <w:rFonts w:ascii="Arial" w:cs="Arial" w:eastAsia="Arial" w:hAnsi="Arial"/>
-          <w:sz w:val="21"/>
-          <w:szCs w:val="21"/>
-        </w:rPr>
-        <w:t xml:space="preserve">6 sec</w:t>
-      </w:r>
-    </w:p>
-    <w:p>
-      <w:pPr>
-        <w:shd w:fill="F2F2F2" w:val="clear"/>
-        <w:spacing w:after="80"/>
-      </w:pPr>
-      <w:r>
-        <w:rPr>
-          <w:rFonts w:ascii="Arial" w:cs="Arial" w:eastAsia="Arial" w:hAnsi="Arial"/>
-          <w:sz w:val="20"/>
-          <w:szCs w:val="20"/>
-        </w:rPr>
-        <w:t xml:space="preserve">VOICE RULE: only the voice-over narration speaks words; it is a voice only, never a person or character on screen. No character says any word and no one on screen lip-syncs to speech; characters communicate with facial expressions and body gestures. Natural non-verbal sounds are allowed and should sound real: laughing, giggling, gasping, sighing, groaning, cheering, coughing. Attached reference images, in order: the bride, Senbi, the groom, the wedding courtyard. 2D hand-drawn Stickman animation, clean thin black outlines, large expressive heads, simple readable stickman proportions, flat warm colors, playful cinematic documentary-comedy tone, 16:9. Use the attached reference images as strict continuity anchors: preserve faces, hair, clothing, colors, proportions and accessories exactly; every character keeps a full body with a visible chest and torso exactly as in the references. Characters, identical in every frame: Senbi the groom: young man with a full body and a visible chest, straight black bowl-cut hair with bangs, gold headband with a gold cobra, blue-and-gold broad collar resting on his bare chest, gold bracers on both wrists, white kilt with a blue-and-gold sash, brown sandals. the bride: black bob hair with straight bangs, gold headband with a red gem, white dress, blue-and-gold collar, gold sash, gold arm cuffs, light veil. Setting: sunny daytime ancient Egyptian wedding courtyard in Alexandria: flat-roofed sandstone mud-brick buildings, tall Egyptian columns with lotus-bud capitals painted in blue-and-gold bands, hieroglyph-style carvings on the walls, long tables with white cloths and clay jars, orange cloth awnings, and a tall wooden entrance gate at the back-center that opens onto the street. Egyptian architecture only: no Greek or Roman architecture, no triangular pediments, no domes, no red tile roofs, no cypress trees. Lighting: warm bright afternoon sunlight, soft shadows, rich saturated colors. ACTION TIMELINE (6 seconds): 0–2 s: the bride's shoulders begin to shake. 2–4 s: she bursts out laughing, a hand on her chest. 4–6 s: Senbi looks at her, then starts laughing too, tears in his eyes, and they lean on each other. Camera: locked-off and perfectly still, eye-level medium two-shot of Senbi and the bride; the framing never changes (no tilt, pan, zoom or rising camera). Audio: voice-over narration only (a voice, never shown on screen; no narrator character appears): a British male voice, warm and dry, begins speaking within half a second and says: “Senbi thought he was getting married.” The line takes about 2.4 seconds; leave the last second free of speech so the moment can land. Music: warm gentle resolution with the same flute and strings, low under the voice. Sound effects: bride laughter, Senbi laughter, timed to the action. Ambience: light courtyard ambience: clinking cups, footsteps on stone, a soft breeze, no words. Final reminder: no character says any word; only the voice-over narration speaks (voice only, nobody on screen is the narrator). Natural laughs, gasps and sighs are fine. No text, captions or logos in the frame.</w:t>
-      </w:r>
-    </w:p>
-    <w:p>
-      <w:pPr>
-        <w:pStyle w:val="Heading2"/>
-        <w:keepNext/>
-        <w:spacing w:after="60" w:before="260"/>
-      </w:pPr>
-      <w:r>
-        <w:rPr>
-          <w:rFonts w:ascii="Arial" w:cs="Arial" w:eastAsia="Arial" w:hAnsi="Arial"/>
-          <w:b/>
-          <w:bCs/>
-          <w:sz w:val="26"/>
-          <w:szCs w:val="26"/>
-        </w:rPr>
-        <w:t xml:space="preserve">SHOT 47 — Final punchline</w:t>
-      </w:r>
-    </w:p>
-    <w:p>
-      <w:pPr>
-        <w:keepNext/>
-        <w:spacing w:after="60" w:before="0"/>
-      </w:pPr>
-      <w:r>
-        <w:rPr>
-          <w:rFonts w:ascii="Arial" w:cs="Arial" w:eastAsia="Arial" w:hAnsi="Arial"/>
-          <w:b/>
-          <w:bCs/>
-          <w:sz w:val="21"/>
-          <w:szCs w:val="21"/>
-        </w:rPr>
-        <w:t xml:space="preserve">Attach: </w:t>
-      </w:r>
-      <w:r>
-        <w:rPr>
-          <w:rFonts w:ascii="Arial" w:cs="Arial" w:eastAsia="Arial" w:hAnsi="Arial"/>
-          <w:sz w:val="21"/>
-          <w:szCs w:val="21"/>
-        </w:rPr>
-        <w:t xml:space="preserve">Senbi_from_Shot1.png</w:t>
-      </w:r>
-      <w:r>
-        <w:rPr>
-          <w:rFonts w:ascii="Arial" w:cs="Arial" w:eastAsia="Arial" w:hAnsi="Arial"/>
-          <w:b/>
-          <w:bCs/>
-          <w:sz w:val="21"/>
-          <w:szCs w:val="21"/>
-        </w:rPr>
-        <w:t xml:space="preserve">      Duration: </w:t>
-      </w:r>
-      <w:r>
-        <w:rPr>
-          <w:rFonts w:ascii="Arial" w:cs="Arial" w:eastAsia="Arial" w:hAnsi="Arial"/>
-          <w:sz w:val="21"/>
-          <w:szCs w:val="21"/>
-        </w:rPr>
-        <w:t xml:space="preserve">4 sec</w:t>
-      </w:r>
-    </w:p>
-    <w:p>
-      <w:pPr>
-        <w:shd w:fill="F2F2F2" w:val="clear"/>
-        <w:spacing w:after="80"/>
-      </w:pPr>
-      <w:r>
-        <w:rPr>
-          <w:rFonts w:ascii="Arial" w:cs="Arial" w:eastAsia="Arial" w:hAnsi="Arial"/>
-          <w:sz w:val="20"/>
-          <w:szCs w:val="20"/>
-        </w:rPr>
-        <w:t xml:space="preserve">VOICE RULE: only the voice-over narration speaks words; it is a voice only, never a person or character on screen. No character says any word and no one on screen lip-syncs to speech; characters communicate with facial expressions and body gestures. Natural non-verbal sounds are allowed and should sound real: laughing, giggling, gasping, sighing, groaning, cheering, coughing. Attached reference images, in order: Senbi, the groom. 2D hand-drawn Stickman animation, clean thin black outlines, large expressive heads, simple readable stickman proportions, flat warm colors, playful cinematic documentary-comedy tone, 16:9. Use the attached reference images as strict continuity anchors: preserve faces, hair, clothing, colors, proportions and accessories exactly; every character keeps a full body with a visible chest and torso exactly as in the references. Characters, identical in every frame: Senbi the groom: young man with a full body and a visible chest, straight black bowl-cut hair with bangs, gold headband with a gold cobra, blue-and-gold broad collar resting on his bare chest, gold bracers on both wrists, white kilt with a blue-and-gold sash, brown sandals. Setting: a quiet room of the wedding house at night, warm torchlight, painted columns, cushions on the floor, Senbi alone in the room. Lighting: warm flickering torchlight, deep soft shadows. ACTION TIMELINE (4 seconds): 0–1 s: Senbi lies asleep, neck awkwardly bent on the wooden headrest, mouth slightly open, face scrunched. 1–2 s: distant marching begins. 2–3 s: one eye opens and he listens. 3–4 s: the eye closes again with a tired sigh and he turns his face away. Camera: eye-level medium close-up of Senbi's face; fixed except for an almost imperceptible 5% slow push-in, no tilt or pan. Audio: voice-over narration only (a voice, never shown on screen; no narrator character appears): a British male voice, warm and dry, begins speaking within half a second and says: “He was.” The line takes about 0.8 seconds; leave the last second free of speech so the moment can land. Music: warm gentle resolution with the same flute and strings, low under the voice. Sound effects: distant marching, soft snore, timed to the action. Ambience: quiet night room tone and a crackling torch, no words. Final reminder: no character says any word; only the voice-over narration speaks (voice only, nobody on screen is the narrator). Natural laughs, gasps and sighs are fine. No text, captions or logos in the frame.</w:t>
-      </w:r>
-    </w:p>
-    <w:p>
-      <w:pPr>
-        <w:pStyle w:val="Heading2"/>
-        <w:keepNext/>
-        <w:spacing w:after="60" w:before="260"/>
-      </w:pPr>
-      <w:r>
-        <w:rPr>
-          <w:rFonts w:ascii="Arial" w:cs="Arial" w:eastAsia="Arial" w:hAnsi="Arial"/>
-          <w:b/>
-          <w:bCs/>
-          <w:sz w:val="26"/>
-          <w:szCs w:val="26"/>
-        </w:rPr>
-        <w:t xml:space="preserve">SHOT 48 — Closing curiosity</w:t>
-      </w:r>
-    </w:p>
-    <w:p>
-      <w:pPr>
-        <w:keepNext/>
-        <w:spacing w:after="60" w:before="0"/>
-      </w:pPr>
-      <w:r>
-        <w:rPr>
-          <w:rFonts w:ascii="Arial" w:cs="Arial" w:eastAsia="Arial" w:hAnsi="Arial"/>
-          <w:b/>
-          <w:bCs/>
-          <w:sz w:val="21"/>
-          <w:szCs w:val="21"/>
-        </w:rPr>
-        <w:t xml:space="preserve">Attach: </w:t>
-      </w:r>
-      <w:r>
-        <w:rPr>
-          <w:rFonts w:ascii="Arial" w:cs="Arial" w:eastAsia="Arial" w:hAnsi="Arial"/>
-          <w:sz w:val="21"/>
-          <w:szCs w:val="21"/>
-        </w:rPr>
-        <w:t xml:space="preserve">Senbi_from_Shot1.png,  Bride_from_Shot1.png,  Alexandria_Harbor_from_ref08.png</w:t>
-      </w:r>
-      <w:r>
-        <w:rPr>
-          <w:rFonts w:ascii="Arial" w:cs="Arial" w:eastAsia="Arial" w:hAnsi="Arial"/>
-          <w:b/>
-          <w:bCs/>
-          <w:sz w:val="21"/>
-          <w:szCs w:val="21"/>
-        </w:rPr>
-        <w:t xml:space="preserve">      Duration: </w:t>
-      </w:r>
-      <w:r>
-        <w:rPr>
-          <w:rFonts w:ascii="Arial" w:cs="Arial" w:eastAsia="Arial" w:hAnsi="Arial"/>
-          <w:sz w:val="21"/>
-          <w:szCs w:val="21"/>
-        </w:rPr>
-        <w:t xml:space="preserve">8 sec</w:t>
-      </w:r>
-    </w:p>
-    <w:p>
-      <w:pPr>
-        <w:shd w:fill="F2F2F2" w:val="clear"/>
-        <w:spacing w:after="80"/>
-      </w:pPr>
-      <w:r>
-        <w:rPr>
-          <w:rFonts w:ascii="Arial" w:cs="Arial" w:eastAsia="Arial" w:hAnsi="Arial"/>
-          <w:sz w:val="20"/>
-          <w:szCs w:val="20"/>
-        </w:rPr>
-        <w:t xml:space="preserve">VOICE RULE: only the voice-over narration speaks words; it is a voice only, never a person or character on screen. No character says any word and no one on screen lip-syncs to speech; characters communicate with facial expressions and body gestures. Natural non-verbal sounds are allowed and should sound real: laughing, giggling, gasping, sighing, groaning, cheering, coughing. Attached reference images, in order: Senbi, the groom, the bride, the Alexandria harbor. 2D hand-drawn Stickman animation, clean thin black outlines, large expressive heads, simple readable stickman proportions, flat warm colors, playful cinematic documentary-comedy tone, 16:9. Use the attached reference images as strict continuity anchors: preserve faces, hair, clothing, colors, proportions and accessories exactly; every character keeps a full body with a visible chest and torso exactly as in the references. Characters, identical in every frame: Senbi the groom: young man with a full body and a visible chest, straight black bowl-cut hair with bangs, gold headband with a gold cobra, blue-and-gold broad collar resting on his bare chest, gold bracers on both wrists, white kilt with a blue-and-gold sash, brown sandals. the bride: black bob hair with straight bangs, gold headband with a red gem, white dress, blue-and-gold collar, gold sash, gold arm cuffs, light veil. the Roman soldiers: crimson plumed helmets, steel armor, red cloaks, rectangular red shields. Setting: sunny daytime ancient Egyptian wedding courtyard in Alexandria: flat-roofed sandstone mud-brick buildings, tall Egyptian columns with lotus-bud capitals painted in blue-and-gold bands, hieroglyph-style carvings on the walls, long tables with white cloths and clay jars, orange cloth awnings, and a tall wooden entrance gate at the back-center that opens onto the street. Egyptian architecture only: no Greek or Roman architecture, no triangular pediments, no domes, no red tile roofs, no cypress trees. Lighting: warm bright afternoon sunlight, soft shadows, rich saturated colors. ACTION TIMELINE (8 seconds): 0–2.5 s: warm evening light over Alexandria, Senbi and the bride in the foreground looking out at the city. 2.5–5.5 s: Roman soldiers are small figures in the distance, lights flickering on in the harbor. 5.5–8 s: the couple lean toward each other; the scene holds and slowly settles. Camera: locked-off and perfectly still, wide shot of Senbi and the bride in the foreground with Alexandria behind them; the framing never changes (no tilt, pan, zoom or rising camera). Audio: voice-over narration only (a voice, never shown on screen; no narrator character appears): a British male voice, warm and dry, begins speaking within half a second and says: “He just hadn't noticed he was also getting a new government.” The line takes about 4.4 seconds; leave the last second free of speech so the moment can land. Music: warm gentle resolution with the same flute and strings, low under the voice. Sound effects: gentle music, silence at the very end, timed to the action. Ambience: light courtyard ambience: clinking cups, footsteps on stone, a soft breeze, no words. Final reminder: no character says any word; only the voice-over narration speaks (voice only, nobody on screen is the narrator). Natural laughs, gasps and sighs are fine. No text, captions or logos in the frame.</w:t>
+        <w:t xml:space="preserve">VOICE RULE: only the voice-over narration speaks words; it is a voice only, never a person or character on screen. No character says any word and no one on screen lip-syncs to speech; characters communicate with facial expressions and body gestures. Natural non-verbal sounds are allowed and should sound real: laughing, giggling, gasping, sighing, groaning, cheering, coughing. 2D hand-drawn Stickman animation, clean thin black outlines, large expressive heads, simple readable stickman proportions, flat warm colors, playful cinematic documentary-comedy tone, 16:9. Use the selected reference images as strict continuity anchors: preserve faces, hair, clothing, colors, proportions and accessories exactly; every character keeps a full body with a visible chest and torso exactly as in the references. Setting: the wedding courtyard exactly as in the selected reference image: ancient Egyptian architecture only, sunny daytime. Lighting: warm bright afternoon sunlight, soft shadows, rich saturated colors. ACTION TIMELINE (8 seconds): 0–2.5 s: warm evening light over Alexandria, Senbi and the bride in the foreground looking out at the city. 2.5–5.5 s: Roman soldiers are small figures in the distance, lights flickering on in the harbor. 5.5–8 s: the couple lean toward each other; the scene holds and slowly settles. Camera: locked-off and perfectly still, wide shot of Senbi and the bride in the foreground with Alexandria behind them; the framing never changes (no tilt, pan, zoom or rising camera). Audio: voice-over narration only (a voice, never shown on screen; no narrator character appears): a British male voice, warm and dry, begins speaking within half a second and says: “He just hadn't noticed he was also getting a new government.” The line takes about 4.4 seconds; leave the last second free of speech so the moment can land. Music: warm gentle resolution with the same flute and strings, low under the voice. Sound effects: gentle music, silence at the very end, timed to the action. Ambience: light courtyard ambience: clinking cups, footsteps on stone, a soft breeze, no words. Final reminder: no character says any word; only the voice-over narration speaks (voice only, nobody on screen is the narrator). Natural laughs, gasps and sighs are fine. No text, captions or logos in the frame.</w:t>
       </w:r>
     </w:p>
     <w:p>

</xml_diff>